<commit_message>
Onglets chantier, Moi = mes affaires, traceur depuis l'affaire, NC levée (serveur), import Outlook, hiérarchie
</commit_message>
<xml_diff>
--- a/app/docs/Feuille_de_route_controle_12-10.docx
+++ b/app/docs/Feuille_de_route_controle_12-10.docx
@@ -84,7 +84,7 @@
           <w:sz w:val="20"/>
           <w:szCs w:val="20"/>
         </w:rPr>
-        <w:t xml:space="preserve">Build livré : 12/10/2026 · 9c7d2e (index.html + traceur.html à la racine du dépôt). Avant de tester connecté : passer app/sql/retours_12-10.sql (ci-dessous). Hors connexion, tout se teste avec les personnages de démo.</w:t>
+        <w:t xml:space="preserve">Build livré : 12/10/2026 · 74d0fe (index.html + traceur.html à la racine du dépôt). Avant de tester connecté : passer app/sql/retours_12-10.sql (ci-dessous). Hors connexion, tout se teste avec les personnages de démo.</w:t>
       </w:r>
     </w:p>
     <w:p>
@@ -1234,7 +1234,7 @@
                 <w:sz w:val="19"/>
                 <w:szCs w:val="19"/>
               </w:rPr>
-              <w:t xml:space="preserve">Ouvrir un chantier : bandeau sombre (nom, 571/1743 soudures · 33 %, chef, météo du jour) et 3 facettes : 📐 Plan · 🏕 Vie du chantier (Bureau, conversation, stock, QSE, dossier, export, pointage, profil) · 🔧 Technique (DH, hydro, phasage, modifs, récap, catalogue, ⋯). La barre d'onglets ne montre que les onglets de la facette : 5 au plus, plus de défilement. Sur Plan, la barre disparaît (plein écran).</w:t>
+              <w:t xml:space="preserve">Ouvrir un chantier : bandeau sombre (nom, 571/1743 soudures · 33 %, chef, météo du jour) et 3 facettes : 📐 Plan · 🏕 Vie du chantier (Bureau, conversation, QSE, dossier, export) · 🔧 Technique (DH, hydro, stock, phasage, modifs, ⋯ = récap, liste, catalogue). La barre d'onglets ne montre que les onglets de la facette : 5 ou 6, sans défilement, téléphone compris. Sur Plan, la barre disparaît (plein écran).</w:t>
             </w:r>
           </w:p>
         </w:tc>
@@ -1266,7 +1266,731 @@
                 <w:sz w:val="19"/>
                 <w:szCs w:val="19"/>
               </w:rPr>
-              <w:t xml:space="preserve">C'est ce qui doit régler « la barre d'onglets ne fonctionne pas via mon tel » : à revérifier sur ton téléphone — si ça coince encore, dis-moi quel onglet et quel téléphone.</w:t>
+              <w:t xml:space="preserve">Ta demande du 12/10 soir : Stock passé dans Technique ; Pointage et Profil retirés des onglets du chantier (ci-dessous). C'est ce qui doit régler « la barre d'onglets ne fonctionne pas via mon tel » : à revérifier sur ton téléphone — si ça coince encore, dis-moi quel onglet et quel téléphone.</w:t>
+            </w:r>
+          </w:p>
+        </w:tc>
+        <w:tc>
+          <w:tcPr>
+            <w:tcW w:type="dxa" w:w="1300"/>
+            <w:tcBorders>
+              <w:top w:val="single" w:color="D9D5CB" w:sz="4"/>
+              <w:left w:val="single" w:color="D9D5CB" w:sz="4"/>
+              <w:bottom w:val="single" w:color="D9D5CB" w:sz="4"/>
+              <w:right w:val="single" w:color="D9D5CB" w:sz="4"/>
+            </w:tcBorders>
+            <w:shd w:fill="E6F5EC" w:color="auto" w:val="clear"/>
+            <w:tcMar>
+              <w:top w:type="dxa" w:w="60"/>
+              <w:left w:type="dxa" w:w="90"/>
+              <w:bottom w:type="dxa" w:w="60"/>
+              <w:right w:type="dxa" w:w="90"/>
+            </w:tcMar>
+            <w:vAlign w:val="top"/>
+          </w:tcPr>
+          <w:p>
+            <w:pPr>
+              <w:spacing w:after="40"/>
+            </w:pPr>
+            <w:r>
+              <w:rPr>
+                <w:rFonts w:ascii="Calibri" w:cs="Calibri" w:eastAsia="Calibri" w:hAnsi="Calibri"/>
+                <w:b/>
+                <w:bCs/>
+                <w:color w:val="14213D"/>
+                <w:sz w:val="19"/>
+                <w:szCs w:val="19"/>
+              </w:rPr>
+              <w:t xml:space="preserve">Fait</w:t>
+            </w:r>
+          </w:p>
+        </w:tc>
+        <w:tc>
+          <w:tcPr>
+            <w:tcW w:type="dxa" w:w="3700"/>
+            <w:tcBorders>
+              <w:top w:val="single" w:color="D9D5CB" w:sz="4"/>
+              <w:left w:val="single" w:color="D9D5CB" w:sz="4"/>
+              <w:bottom w:val="single" w:color="D9D5CB" w:sz="4"/>
+              <w:right w:val="single" w:color="D9D5CB" w:sz="4"/>
+            </w:tcBorders>
+            <w:tcMar>
+              <w:top w:type="dxa" w:w="60"/>
+              <w:left w:type="dxa" w:w="90"/>
+              <w:bottom w:type="dxa" w:w="60"/>
+              <w:right w:type="dxa" w:w="90"/>
+            </w:tcMar>
+            <w:vAlign w:val="top"/>
+          </w:tcPr>
+          <w:p>
+            <w:pPr>
+              <w:spacing w:after="40"/>
+            </w:pPr>
+            <w:r>
+              <w:rPr>
+                <w:rFonts w:ascii="Calibri" w:cs="Calibri" w:eastAsia="Calibri" w:hAnsi="Calibri"/>
+                <w:color w:val="14213D"/>
+                <w:sz w:val="20"/>
+                <w:szCs w:val="20"/>
+              </w:rPr>
+              <w:t xml:space="preserve"/>
+            </w:r>
+          </w:p>
+          <w:p>
+            <w:pPr>
+              <w:spacing w:after="40"/>
+            </w:pPr>
+            <w:r>
+              <w:rPr>
+                <w:rFonts w:ascii="Calibri" w:cs="Calibri" w:eastAsia="Calibri" w:hAnsi="Calibri"/>
+                <w:color w:val="14213D"/>
+                <w:sz w:val="20"/>
+                <w:szCs w:val="20"/>
+              </w:rPr>
+              <w:t xml:space="preserve"/>
+            </w:r>
+          </w:p>
+        </w:tc>
+      </w:tr>
+      <w:tr>
+        <w:tc>
+          <w:tcPr>
+            <w:tcW w:type="dxa" w:w="2300"/>
+            <w:tcBorders>
+              <w:top w:val="single" w:color="D9D5CB" w:sz="4"/>
+              <w:left w:val="single" w:color="D9D5CB" w:sz="4"/>
+              <w:bottom w:val="single" w:color="D9D5CB" w:sz="4"/>
+              <w:right w:val="single" w:color="D9D5CB" w:sz="4"/>
+            </w:tcBorders>
+            <w:tcMar>
+              <w:top w:type="dxa" w:w="60"/>
+              <w:left w:type="dxa" w:w="90"/>
+              <w:bottom w:type="dxa" w:w="60"/>
+              <w:right w:type="dxa" w:w="90"/>
+            </w:tcMar>
+            <w:vAlign w:val="top"/>
+          </w:tcPr>
+          <w:p>
+            <w:pPr>
+              <w:spacing w:after="40"/>
+            </w:pPr>
+            <w:r>
+              <w:rPr>
+                <w:rFonts w:ascii="Calibri" w:cs="Calibri" w:eastAsia="Calibri" w:hAnsi="Calibri"/>
+                <w:b/>
+                <w:bCs/>
+                <w:color w:val="14213D"/>
+                <w:sz w:val="20"/>
+                <w:szCs w:val="20"/>
+              </w:rPr>
+              <w:t xml:space="preserve">Encadrant au forfait : pas de pointage dans Moi</w:t>
+            </w:r>
+          </w:p>
+        </w:tc>
+        <w:tc>
+          <w:tcPr>
+            <w:tcW w:type="dxa" w:w="4100"/>
+            <w:tcBorders>
+              <w:top w:val="single" w:color="D9D5CB" w:sz="4"/>
+              <w:left w:val="single" w:color="D9D5CB" w:sz="4"/>
+              <w:bottom w:val="single" w:color="D9D5CB" w:sz="4"/>
+              <w:right w:val="single" w:color="D9D5CB" w:sz="4"/>
+            </w:tcBorders>
+            <w:tcMar>
+              <w:top w:type="dxa" w:w="60"/>
+              <w:left w:type="dxa" w:w="90"/>
+              <w:bottom w:type="dxa" w:w="60"/>
+              <w:right w:type="dxa" w:w="90"/>
+            </w:tcMar>
+            <w:vAlign w:val="top"/>
+          </w:tcPr>
+          <w:p>
+            <w:pPr>
+              <w:spacing w:after="40"/>
+            </w:pPr>
+            <w:r>
+              <w:rPr>
+                <w:rFonts w:ascii="Calibri" w:cs="Calibri" w:eastAsia="Calibri" w:hAnsi="Calibri"/>
+                <w:color w:val="14213D"/>
+                <w:sz w:val="19"/>
+                <w:szCs w:val="19"/>
+              </w:rPr>
+              <w:t xml:space="preserve">Un encadrant (conducteur et au-dessus, forfait cadre) n'a plus de sous-onglet « Pointages » dans Moi : il ne pointe pas, et les pointages de son équipe se valident dans Équipes → Pointages à valider (les raccourcis « Valider les pointages » y mènent). Un opérateur garde « Heures » ; un chef de chantier qui pointe (droit « Pointer sa journée », compte par compte) aussi.</w:t>
+            </w:r>
+          </w:p>
+        </w:tc>
+        <w:tc>
+          <w:tcPr>
+            <w:tcW w:type="dxa" w:w="3700"/>
+            <w:tcBorders>
+              <w:top w:val="single" w:color="D9D5CB" w:sz="4"/>
+              <w:left w:val="single" w:color="D9D5CB" w:sz="4"/>
+              <w:bottom w:val="single" w:color="D9D5CB" w:sz="4"/>
+              <w:right w:val="single" w:color="D9D5CB" w:sz="4"/>
+            </w:tcBorders>
+            <w:tcMar>
+              <w:top w:type="dxa" w:w="60"/>
+              <w:left w:type="dxa" w:w="90"/>
+              <w:bottom w:type="dxa" w:w="60"/>
+              <w:right w:type="dxa" w:w="90"/>
+            </w:tcMar>
+            <w:vAlign w:val="top"/>
+          </w:tcPr>
+          <w:p>
+            <w:pPr>
+              <w:spacing w:after="40"/>
+            </w:pPr>
+            <w:r>
+              <w:rPr>
+                <w:rFonts w:ascii="Calibri" w:cs="Calibri" w:eastAsia="Calibri" w:hAnsi="Calibri"/>
+                <w:color w:val="14213D"/>
+                <w:sz w:val="19"/>
+                <w:szCs w:val="19"/>
+              </w:rPr>
+              <w:t xml:space="preserve">Ta remarque du 12/10 soir sur la capture « Pointages de l'équipe » dans Moi.</w:t>
+            </w:r>
+          </w:p>
+        </w:tc>
+        <w:tc>
+          <w:tcPr>
+            <w:tcW w:type="dxa" w:w="1300"/>
+            <w:tcBorders>
+              <w:top w:val="single" w:color="D9D5CB" w:sz="4"/>
+              <w:left w:val="single" w:color="D9D5CB" w:sz="4"/>
+              <w:bottom w:val="single" w:color="D9D5CB" w:sz="4"/>
+              <w:right w:val="single" w:color="D9D5CB" w:sz="4"/>
+            </w:tcBorders>
+            <w:shd w:fill="E6F5EC" w:color="auto" w:val="clear"/>
+            <w:tcMar>
+              <w:top w:type="dxa" w:w="60"/>
+              <w:left w:type="dxa" w:w="90"/>
+              <w:bottom w:type="dxa" w:w="60"/>
+              <w:right w:type="dxa" w:w="90"/>
+            </w:tcMar>
+            <w:vAlign w:val="top"/>
+          </w:tcPr>
+          <w:p>
+            <w:pPr>
+              <w:spacing w:after="40"/>
+            </w:pPr>
+            <w:r>
+              <w:rPr>
+                <w:rFonts w:ascii="Calibri" w:cs="Calibri" w:eastAsia="Calibri" w:hAnsi="Calibri"/>
+                <w:b/>
+                <w:bCs/>
+                <w:color w:val="14213D"/>
+                <w:sz w:val="19"/>
+                <w:szCs w:val="19"/>
+              </w:rPr>
+              <w:t xml:space="preserve">Fait</w:t>
+            </w:r>
+          </w:p>
+        </w:tc>
+        <w:tc>
+          <w:tcPr>
+            <w:tcW w:type="dxa" w:w="3700"/>
+            <w:tcBorders>
+              <w:top w:val="single" w:color="D9D5CB" w:sz="4"/>
+              <w:left w:val="single" w:color="D9D5CB" w:sz="4"/>
+              <w:bottom w:val="single" w:color="D9D5CB" w:sz="4"/>
+              <w:right w:val="single" w:color="D9D5CB" w:sz="4"/>
+            </w:tcBorders>
+            <w:tcMar>
+              <w:top w:type="dxa" w:w="60"/>
+              <w:left w:type="dxa" w:w="90"/>
+              <w:bottom w:type="dxa" w:w="60"/>
+              <w:right w:type="dxa" w:w="90"/>
+            </w:tcMar>
+            <w:vAlign w:val="top"/>
+          </w:tcPr>
+          <w:p>
+            <w:pPr>
+              <w:spacing w:after="40"/>
+            </w:pPr>
+            <w:r>
+              <w:rPr>
+                <w:rFonts w:ascii="Calibri" w:cs="Calibri" w:eastAsia="Calibri" w:hAnsi="Calibri"/>
+                <w:color w:val="14213D"/>
+                <w:sz w:val="20"/>
+                <w:szCs w:val="20"/>
+              </w:rPr>
+              <w:t xml:space="preserve"/>
+            </w:r>
+          </w:p>
+          <w:p>
+            <w:pPr>
+              <w:spacing w:after="40"/>
+            </w:pPr>
+            <w:r>
+              <w:rPr>
+                <w:rFonts w:ascii="Calibri" w:cs="Calibri" w:eastAsia="Calibri" w:hAnsi="Calibri"/>
+                <w:color w:val="14213D"/>
+                <w:sz w:val="20"/>
+                <w:szCs w:val="20"/>
+              </w:rPr>
+              <w:t xml:space="preserve"/>
+            </w:r>
+          </w:p>
+        </w:tc>
+      </w:tr>
+      <w:tr>
+        <w:tc>
+          <w:tcPr>
+            <w:tcW w:type="dxa" w:w="2300"/>
+            <w:tcBorders>
+              <w:top w:val="single" w:color="D9D5CB" w:sz="4"/>
+              <w:left w:val="single" w:color="D9D5CB" w:sz="4"/>
+              <w:bottom w:val="single" w:color="D9D5CB" w:sz="4"/>
+              <w:right w:val="single" w:color="D9D5CB" w:sz="4"/>
+            </w:tcBorders>
+            <w:tcMar>
+              <w:top w:type="dxa" w:w="60"/>
+              <w:left w:type="dxa" w:w="90"/>
+              <w:bottom w:type="dxa" w:w="60"/>
+              <w:right w:type="dxa" w:w="90"/>
+            </w:tcMar>
+            <w:vAlign w:val="top"/>
+          </w:tcPr>
+          <w:p>
+            <w:pPr>
+              <w:spacing w:after="40"/>
+            </w:pPr>
+            <w:r>
+              <w:rPr>
+                <w:rFonts w:ascii="Calibri" w:cs="Calibri" w:eastAsia="Calibri" w:hAnsi="Calibri"/>
+                <w:b/>
+                <w:bCs/>
+                <w:color w:val="14213D"/>
+                <w:sz w:val="20"/>
+                <w:szCs w:val="20"/>
+              </w:rPr>
+              <w:t xml:space="preserve">Moi = mes affaires, pas de doublon avec Équipes</w:t>
+            </w:r>
+          </w:p>
+        </w:tc>
+        <w:tc>
+          <w:tcPr>
+            <w:tcW w:type="dxa" w:w="4100"/>
+            <w:tcBorders>
+              <w:top w:val="single" w:color="D9D5CB" w:sz="4"/>
+              <w:left w:val="single" w:color="D9D5CB" w:sz="4"/>
+              <w:bottom w:val="single" w:color="D9D5CB" w:sz="4"/>
+              <w:right w:val="single" w:color="D9D5CB" w:sz="4"/>
+            </w:tcBorders>
+            <w:tcMar>
+              <w:top w:type="dxa" w:w="60"/>
+              <w:left w:type="dxa" w:w="90"/>
+              <w:bottom w:type="dxa" w:w="60"/>
+              <w:right w:type="dxa" w:w="90"/>
+            </w:tcMar>
+            <w:vAlign w:val="top"/>
+          </w:tcPr>
+          <w:p>
+            <w:pPr>
+              <w:spacing w:after="40"/>
+            </w:pPr>
+            <w:r>
+              <w:rPr>
+                <w:rFonts w:ascii="Calibri" w:cs="Calibri" w:eastAsia="Calibri" w:hAnsi="Calibri"/>
+                <w:color w:val="14213D"/>
+                <w:sz w:val="19"/>
+                <w:szCs w:val="19"/>
+              </w:rPr>
+              <w:t xml:space="preserve">Moi → Habilitations : seulement les tiennes (celles de l'équipe : Équipes → Habilitations de l'équipe). Moi → Productions : seulement pour un opérateur (les équipes : Équipes → Production des équipes). Moi → Chantiers : seulement pour quelqu'un sans accès à Équipes (sinon Équipes → Mes chantiers). L'accueil de Moi d'un encadrant ou d'un dirigeant ne montre plus l'équipe du jour, les pointages à valider, les demandes, la production des équipes, les chiffres de l'entreprise : tout ça vit dans Équipes et Entreprise. Reste : tes tâches, ta semaine, ton déplacement, ton véhicule, tes notes de frais, tes habilitations, ta fiche, tes récompenses. Les raccourcis « Valider les pointages », « Tout voir trié par urgence », « Voir par personne » renvoient vers Équipes.</w:t>
+            </w:r>
+          </w:p>
+        </w:tc>
+        <w:tc>
+          <w:tcPr>
+            <w:tcW w:type="dxa" w:w="3700"/>
+            <w:tcBorders>
+              <w:top w:val="single" w:color="D9D5CB" w:sz="4"/>
+              <w:left w:val="single" w:color="D9D5CB" w:sz="4"/>
+              <w:bottom w:val="single" w:color="D9D5CB" w:sz="4"/>
+              <w:right w:val="single" w:color="D9D5CB" w:sz="4"/>
+            </w:tcBorders>
+            <w:tcMar>
+              <w:top w:type="dxa" w:w="60"/>
+              <w:left w:type="dxa" w:w="90"/>
+              <w:bottom w:type="dxa" w:w="60"/>
+              <w:right w:type="dxa" w:w="90"/>
+            </w:tcMar>
+            <w:vAlign w:val="top"/>
+          </w:tcPr>
+          <w:p>
+            <w:pPr>
+              <w:spacing w:after="40"/>
+            </w:pPr>
+            <w:r>
+              <w:rPr>
+                <w:rFonts w:ascii="Calibri" w:cs="Calibri" w:eastAsia="Calibri" w:hAnsi="Calibri"/>
+                <w:color w:val="14213D"/>
+                <w:sz w:val="19"/>
+                <w:szCs w:val="19"/>
+              </w:rPr>
+              <w:t xml:space="preserve">Ta remarque du 12/10 soir (capture Habilitations). RH : l'accueil Moi garde les échéances RH, arrivants et fins de contrat — pas de doublon ailleurs.</w:t>
+            </w:r>
+          </w:p>
+        </w:tc>
+        <w:tc>
+          <w:tcPr>
+            <w:tcW w:type="dxa" w:w="1300"/>
+            <w:tcBorders>
+              <w:top w:val="single" w:color="D9D5CB" w:sz="4"/>
+              <w:left w:val="single" w:color="D9D5CB" w:sz="4"/>
+              <w:bottom w:val="single" w:color="D9D5CB" w:sz="4"/>
+              <w:right w:val="single" w:color="D9D5CB" w:sz="4"/>
+            </w:tcBorders>
+            <w:shd w:fill="E6F5EC" w:color="auto" w:val="clear"/>
+            <w:tcMar>
+              <w:top w:type="dxa" w:w="60"/>
+              <w:left w:type="dxa" w:w="90"/>
+              <w:bottom w:type="dxa" w:w="60"/>
+              <w:right w:type="dxa" w:w="90"/>
+            </w:tcMar>
+            <w:vAlign w:val="top"/>
+          </w:tcPr>
+          <w:p>
+            <w:pPr>
+              <w:spacing w:after="40"/>
+            </w:pPr>
+            <w:r>
+              <w:rPr>
+                <w:rFonts w:ascii="Calibri" w:cs="Calibri" w:eastAsia="Calibri" w:hAnsi="Calibri"/>
+                <w:b/>
+                <w:bCs/>
+                <w:color w:val="14213D"/>
+                <w:sz w:val="19"/>
+                <w:szCs w:val="19"/>
+              </w:rPr>
+              <w:t xml:space="preserve">Fait</w:t>
+            </w:r>
+          </w:p>
+        </w:tc>
+        <w:tc>
+          <w:tcPr>
+            <w:tcW w:type="dxa" w:w="3700"/>
+            <w:tcBorders>
+              <w:top w:val="single" w:color="D9D5CB" w:sz="4"/>
+              <w:left w:val="single" w:color="D9D5CB" w:sz="4"/>
+              <w:bottom w:val="single" w:color="D9D5CB" w:sz="4"/>
+              <w:right w:val="single" w:color="D9D5CB" w:sz="4"/>
+            </w:tcBorders>
+            <w:tcMar>
+              <w:top w:type="dxa" w:w="60"/>
+              <w:left w:type="dxa" w:w="90"/>
+              <w:bottom w:type="dxa" w:w="60"/>
+              <w:right w:type="dxa" w:w="90"/>
+            </w:tcMar>
+            <w:vAlign w:val="top"/>
+          </w:tcPr>
+          <w:p>
+            <w:pPr>
+              <w:spacing w:after="40"/>
+            </w:pPr>
+            <w:r>
+              <w:rPr>
+                <w:rFonts w:ascii="Calibri" w:cs="Calibri" w:eastAsia="Calibri" w:hAnsi="Calibri"/>
+                <w:color w:val="14213D"/>
+                <w:sz w:val="20"/>
+                <w:szCs w:val="20"/>
+              </w:rPr>
+              <w:t xml:space="preserve"/>
+            </w:r>
+          </w:p>
+          <w:p>
+            <w:pPr>
+              <w:spacing w:after="40"/>
+            </w:pPr>
+            <w:r>
+              <w:rPr>
+                <w:rFonts w:ascii="Calibri" w:cs="Calibri" w:eastAsia="Calibri" w:hAnsi="Calibri"/>
+                <w:color w:val="14213D"/>
+                <w:sz w:val="20"/>
+                <w:szCs w:val="20"/>
+              </w:rPr>
+              <w:t xml:space="preserve"/>
+            </w:r>
+          </w:p>
+        </w:tc>
+      </w:tr>
+      <w:tr>
+        <w:tc>
+          <w:tcPr>
+            <w:tcW w:type="dxa" w:w="2300"/>
+            <w:tcBorders>
+              <w:top w:val="single" w:color="D9D5CB" w:sz="4"/>
+              <w:left w:val="single" w:color="D9D5CB" w:sz="4"/>
+              <w:bottom w:val="single" w:color="D9D5CB" w:sz="4"/>
+              <w:right w:val="single" w:color="D9D5CB" w:sz="4"/>
+            </w:tcBorders>
+            <w:tcMar>
+              <w:top w:type="dxa" w:w="60"/>
+              <w:left w:type="dxa" w:w="90"/>
+              <w:bottom w:type="dxa" w:w="60"/>
+              <w:right w:type="dxa" w:w="90"/>
+            </w:tcMar>
+            <w:vAlign w:val="top"/>
+          </w:tcPr>
+          <w:p>
+            <w:pPr>
+              <w:spacing w:after="40"/>
+            </w:pPr>
+            <w:r>
+              <w:rPr>
+                <w:rFonts w:ascii="Calibri" w:cs="Calibri" w:eastAsia="Calibri" w:hAnsi="Calibri"/>
+                <w:b/>
+                <w:bCs/>
+                <w:color w:val="14213D"/>
+                <w:sz w:val="20"/>
+                <w:szCs w:val="20"/>
+              </w:rPr>
+              <w:t xml:space="preserve">Traceur : seulement depuis l'affaire et le chantier</w:t>
+            </w:r>
+          </w:p>
+        </w:tc>
+        <w:tc>
+          <w:tcPr>
+            <w:tcW w:type="dxa" w:w="4100"/>
+            <w:tcBorders>
+              <w:top w:val="single" w:color="D9D5CB" w:sz="4"/>
+              <w:left w:val="single" w:color="D9D5CB" w:sz="4"/>
+              <w:bottom w:val="single" w:color="D9D5CB" w:sz="4"/>
+              <w:right w:val="single" w:color="D9D5CB" w:sz="4"/>
+            </w:tcBorders>
+            <w:tcMar>
+              <w:top w:type="dxa" w:w="60"/>
+              <w:left w:type="dxa" w:w="90"/>
+              <w:bottom w:type="dxa" w:w="60"/>
+              <w:right w:type="dxa" w:w="90"/>
+            </w:tcMar>
+            <w:vAlign w:val="top"/>
+          </w:tcPr>
+          <w:p>
+            <w:pPr>
+              <w:spacing w:after="40"/>
+            </w:pPr>
+            <w:r>
+              <w:rPr>
+                <w:rFonts w:ascii="Calibri" w:cs="Calibri" w:eastAsia="Calibri" w:hAnsi="Calibri"/>
+                <w:color w:val="14213D"/>
+                <w:sz w:val="19"/>
+                <w:szCs w:val="19"/>
+              </w:rPr>
+              <w:t xml:space="preserve">Plus de tuile « Traceur » à l'accueil, plus de ligne dans Entreprise → Outils, plus de « Tracer un réseau » dans « Nouveau chantier » (qui ne propose plus que l'import d'un plan). Le traceur s'ouvre : (1) Entreprise → Affaires → fiche → Chantiers liés → « ✎ Dessiner le projet » — et au retour dans l'appli, le chantier tracé est lié à l'affaire tout seul ; (2) dans un chantier tracé → menu → « ✎ Traceur : modifier ce réseau ». Le bouton « créer un réseau » / « nouveau réseau » du chantier a disparu.</w:t>
+            </w:r>
+          </w:p>
+        </w:tc>
+        <w:tc>
+          <w:tcPr>
+            <w:tcW w:type="dxa" w:w="3700"/>
+            <w:tcBorders>
+              <w:top w:val="single" w:color="D9D5CB" w:sz="4"/>
+              <w:left w:val="single" w:color="D9D5CB" w:sz="4"/>
+              <w:bottom w:val="single" w:color="D9D5CB" w:sz="4"/>
+              <w:right w:val="single" w:color="D9D5CB" w:sz="4"/>
+            </w:tcBorders>
+            <w:tcMar>
+              <w:top w:type="dxa" w:w="60"/>
+              <w:left w:type="dxa" w:w="90"/>
+              <w:bottom w:type="dxa" w:w="60"/>
+              <w:right w:type="dxa" w:w="90"/>
+            </w:tcMar>
+            <w:vAlign w:val="top"/>
+          </w:tcPr>
+          <w:p>
+            <w:pPr>
+              <w:spacing w:after="40"/>
+            </w:pPr>
+            <w:r>
+              <w:rPr>
+                <w:rFonts w:ascii="Calibri" w:cs="Calibri" w:eastAsia="Calibri" w:hAnsi="Calibri"/>
+                <w:color w:val="14213D"/>
+                <w:sz w:val="19"/>
+                <w:szCs w:val="19"/>
+              </w:rPr>
+              <w:t xml:space="preserve">Ta demande du 12/10 soir.</w:t>
+            </w:r>
+          </w:p>
+        </w:tc>
+        <w:tc>
+          <w:tcPr>
+            <w:tcW w:type="dxa" w:w="1300"/>
+            <w:tcBorders>
+              <w:top w:val="single" w:color="D9D5CB" w:sz="4"/>
+              <w:left w:val="single" w:color="D9D5CB" w:sz="4"/>
+              <w:bottom w:val="single" w:color="D9D5CB" w:sz="4"/>
+              <w:right w:val="single" w:color="D9D5CB" w:sz="4"/>
+            </w:tcBorders>
+            <w:shd w:fill="E6F5EC" w:color="auto" w:val="clear"/>
+            <w:tcMar>
+              <w:top w:type="dxa" w:w="60"/>
+              <w:left w:type="dxa" w:w="90"/>
+              <w:bottom w:type="dxa" w:w="60"/>
+              <w:right w:type="dxa" w:w="90"/>
+            </w:tcMar>
+            <w:vAlign w:val="top"/>
+          </w:tcPr>
+          <w:p>
+            <w:pPr>
+              <w:spacing w:after="40"/>
+            </w:pPr>
+            <w:r>
+              <w:rPr>
+                <w:rFonts w:ascii="Calibri" w:cs="Calibri" w:eastAsia="Calibri" w:hAnsi="Calibri"/>
+                <w:b/>
+                <w:bCs/>
+                <w:color w:val="14213D"/>
+                <w:sz w:val="19"/>
+                <w:szCs w:val="19"/>
+              </w:rPr>
+              <w:t xml:space="preserve">Fait</w:t>
+            </w:r>
+          </w:p>
+        </w:tc>
+        <w:tc>
+          <w:tcPr>
+            <w:tcW w:type="dxa" w:w="3700"/>
+            <w:tcBorders>
+              <w:top w:val="single" w:color="D9D5CB" w:sz="4"/>
+              <w:left w:val="single" w:color="D9D5CB" w:sz="4"/>
+              <w:bottom w:val="single" w:color="D9D5CB" w:sz="4"/>
+              <w:right w:val="single" w:color="D9D5CB" w:sz="4"/>
+            </w:tcBorders>
+            <w:tcMar>
+              <w:top w:type="dxa" w:w="60"/>
+              <w:left w:type="dxa" w:w="90"/>
+              <w:bottom w:type="dxa" w:w="60"/>
+              <w:right w:type="dxa" w:w="90"/>
+            </w:tcMar>
+            <w:vAlign w:val="top"/>
+          </w:tcPr>
+          <w:p>
+            <w:pPr>
+              <w:spacing w:after="40"/>
+            </w:pPr>
+            <w:r>
+              <w:rPr>
+                <w:rFonts w:ascii="Calibri" w:cs="Calibri" w:eastAsia="Calibri" w:hAnsi="Calibri"/>
+                <w:color w:val="14213D"/>
+                <w:sz w:val="20"/>
+                <w:szCs w:val="20"/>
+              </w:rPr>
+              <w:t xml:space="preserve"/>
+            </w:r>
+          </w:p>
+          <w:p>
+            <w:pPr>
+              <w:spacing w:after="40"/>
+            </w:pPr>
+            <w:r>
+              <w:rPr>
+                <w:rFonts w:ascii="Calibri" w:cs="Calibri" w:eastAsia="Calibri" w:hAnsi="Calibri"/>
+                <w:color w:val="14213D"/>
+                <w:sz w:val="20"/>
+                <w:szCs w:val="20"/>
+              </w:rPr>
+              <w:t xml:space="preserve"/>
+            </w:r>
+          </w:p>
+        </w:tc>
+      </w:tr>
+      <w:tr>
+        <w:tc>
+          <w:tcPr>
+            <w:tcW w:type="dxa" w:w="2300"/>
+            <w:tcBorders>
+              <w:top w:val="single" w:color="D9D5CB" w:sz="4"/>
+              <w:left w:val="single" w:color="D9D5CB" w:sz="4"/>
+              <w:bottom w:val="single" w:color="D9D5CB" w:sz="4"/>
+              <w:right w:val="single" w:color="D9D5CB" w:sz="4"/>
+            </w:tcBorders>
+            <w:tcMar>
+              <w:top w:type="dxa" w:w="60"/>
+              <w:left w:type="dxa" w:w="90"/>
+              <w:bottom w:type="dxa" w:w="60"/>
+              <w:right w:type="dxa" w:w="90"/>
+            </w:tcMar>
+            <w:vAlign w:val="top"/>
+          </w:tcPr>
+          <w:p>
+            <w:pPr>
+              <w:spacing w:after="40"/>
+            </w:pPr>
+            <w:r>
+              <w:rPr>
+                <w:rFonts w:ascii="Calibri" w:cs="Calibri" w:eastAsia="Calibri" w:hAnsi="Calibri"/>
+                <w:b/>
+                <w:bCs/>
+                <w:color w:val="14213D"/>
+                <w:sz w:val="20"/>
+                <w:szCs w:val="20"/>
+              </w:rPr>
+              <w:t xml:space="preserve">Pointage et Profil retirés du chantier</w:t>
+            </w:r>
+          </w:p>
+        </w:tc>
+        <w:tc>
+          <w:tcPr>
+            <w:tcW w:type="dxa" w:w="4100"/>
+            <w:tcBorders>
+              <w:top w:val="single" w:color="D9D5CB" w:sz="4"/>
+              <w:left w:val="single" w:color="D9D5CB" w:sz="4"/>
+              <w:bottom w:val="single" w:color="D9D5CB" w:sz="4"/>
+              <w:right w:val="single" w:color="D9D5CB" w:sz="4"/>
+            </w:tcBorders>
+            <w:tcMar>
+              <w:top w:type="dxa" w:w="60"/>
+              <w:left w:type="dxa" w:w="90"/>
+              <w:bottom w:type="dxa" w:w="60"/>
+              <w:right w:type="dxa" w:w="90"/>
+            </w:tcMar>
+            <w:vAlign w:val="top"/>
+          </w:tcPr>
+          <w:p>
+            <w:pPr>
+              <w:spacing w:after="40"/>
+            </w:pPr>
+            <w:r>
+              <w:rPr>
+                <w:rFonts w:ascii="Calibri" w:cs="Calibri" w:eastAsia="Calibri" w:hAnsi="Calibri"/>
+                <w:color w:val="14213D"/>
+                <w:sz w:val="19"/>
+                <w:szCs w:val="19"/>
+              </w:rPr>
+              <w:t xml:space="preserve">Plus d'onglet Pointage ni Profil dans un chantier, même si l'ancien interrupteur « Nouveautés » était allumé sur l'appareil. Le pointage se fait dans Moi → Heures (début, pause, reprise, fin, validation chef puis conducteur) ; le profil (avatar, fiche, habilitations, documents) dans Moi. Le bouton « Nouveautés » ne propose plus ces deux options.</w:t>
+            </w:r>
+          </w:p>
+        </w:tc>
+        <w:tc>
+          <w:tcPr>
+            <w:tcW w:type="dxa" w:w="3700"/>
+            <w:tcBorders>
+              <w:top w:val="single" w:color="D9D5CB" w:sz="4"/>
+              <w:left w:val="single" w:color="D9D5CB" w:sz="4"/>
+              <w:bottom w:val="single" w:color="D9D5CB" w:sz="4"/>
+              <w:right w:val="single" w:color="D9D5CB" w:sz="4"/>
+            </w:tcBorders>
+            <w:tcMar>
+              <w:top w:type="dxa" w:w="60"/>
+              <w:left w:type="dxa" w:w="90"/>
+              <w:bottom w:type="dxa" w:w="60"/>
+              <w:right w:type="dxa" w:w="90"/>
+            </w:tcMar>
+            <w:vAlign w:val="top"/>
+          </w:tcPr>
+          <w:p>
+            <w:pPr>
+              <w:spacing w:after="40"/>
+            </w:pPr>
+            <w:r>
+              <w:rPr>
+                <w:rFonts w:ascii="Calibri" w:cs="Calibri" w:eastAsia="Calibri" w:hAnsi="Calibri"/>
+                <w:color w:val="14213D"/>
+                <w:sz w:val="19"/>
+                <w:szCs w:val="19"/>
+              </w:rPr>
+              <w:t xml:space="preserve">Rien de supprimé dans le code : les deux vues restent accessibles par lien direct si un jour on en a besoin.</w:t>
             </w:r>
           </w:p>
         </w:tc>
@@ -4248,6 +4972,368 @@
                 <w:sz w:val="20"/>
                 <w:szCs w:val="20"/>
               </w:rPr>
+              <w:t xml:space="preserve">Import depuis Outlook (.ics)</w:t>
+            </w:r>
+          </w:p>
+        </w:tc>
+        <w:tc>
+          <w:tcPr>
+            <w:tcW w:type="dxa" w:w="4100"/>
+            <w:tcBorders>
+              <w:top w:val="single" w:color="D9D5CB" w:sz="4"/>
+              <w:left w:val="single" w:color="D9D5CB" w:sz="4"/>
+              <w:bottom w:val="single" w:color="D9D5CB" w:sz="4"/>
+              <w:right w:val="single" w:color="D9D5CB" w:sz="4"/>
+            </w:tcBorders>
+            <w:tcMar>
+              <w:top w:type="dxa" w:w="60"/>
+              <w:left w:type="dxa" w:w="90"/>
+              <w:bottom w:type="dxa" w:w="60"/>
+              <w:right w:type="dxa" w:w="90"/>
+            </w:tcMar>
+            <w:vAlign w:val="top"/>
+          </w:tcPr>
+          <w:p>
+            <w:pPr>
+              <w:spacing w:after="40"/>
+            </w:pPr>
+            <w:r>
+              <w:rPr>
+                <w:rFonts w:ascii="Calibri" w:cs="Calibri" w:eastAsia="Calibri" w:hAnsi="Calibri"/>
+                <w:color w:val="14213D"/>
+                <w:sz w:val="19"/>
+                <w:szCs w:val="19"/>
+              </w:rPr>
+              <w:t xml:space="preserve">Ma semaine → « ⬆ Importer mon Outlook (.ics) » : dans Outlook, Calendrier → Fichier → Enregistrer le calendrier (période : les semaines à venir) → le fichier ici. Tes invitations et réunions remplissent ta semaine (étiquette « Outlook » ; une réunion dont le lieu ou le titre est un chantier devient une visite de ce chantier ; les annulées sont ignorées). Réimporter met à jour sans doublon (clé = identifiant Outlook).</w:t>
+            </w:r>
+          </w:p>
+        </w:tc>
+        <w:tc>
+          <w:tcPr>
+            <w:tcW w:type="dxa" w:w="3700"/>
+            <w:tcBorders>
+              <w:top w:val="single" w:color="D9D5CB" w:sz="4"/>
+              <w:left w:val="single" w:color="D9D5CB" w:sz="4"/>
+              <w:bottom w:val="single" w:color="D9D5CB" w:sz="4"/>
+              <w:right w:val="single" w:color="D9D5CB" w:sz="4"/>
+            </w:tcBorders>
+            <w:tcMar>
+              <w:top w:type="dxa" w:w="60"/>
+              <w:left w:type="dxa" w:w="90"/>
+              <w:bottom w:type="dxa" w:w="60"/>
+              <w:right w:type="dxa" w:w="90"/>
+            </w:tcMar>
+            <w:vAlign w:val="top"/>
+          </w:tcPr>
+          <w:p>
+            <w:pPr>
+              <w:spacing w:after="40"/>
+            </w:pPr>
+            <w:r>
+              <w:rPr>
+                <w:rFonts w:ascii="Calibri" w:cs="Calibri" w:eastAsia="Calibri" w:hAnsi="Calibri"/>
+                <w:color w:val="14213D"/>
+                <w:sz w:val="19"/>
+                <w:szCs w:val="19"/>
+              </w:rPr>
+              <w:t xml:space="preserve">Ta remarque du 12/10 soir : « plutôt un import depuis Outlook, une invitation dans son agenda qui remplit son planning ». Sans fichier (lien de calendrier publié ou Microsoft Graph), il faut une petite fonction côté serveur : prochaine étape si tu valides le principe.</w:t>
+            </w:r>
+          </w:p>
+        </w:tc>
+        <w:tc>
+          <w:tcPr>
+            <w:tcW w:type="dxa" w:w="1300"/>
+            <w:tcBorders>
+              <w:top w:val="single" w:color="D9D5CB" w:sz="4"/>
+              <w:left w:val="single" w:color="D9D5CB" w:sz="4"/>
+              <w:bottom w:val="single" w:color="D9D5CB" w:sz="4"/>
+              <w:right w:val="single" w:color="D9D5CB" w:sz="4"/>
+            </w:tcBorders>
+            <w:shd w:fill="E6F5EC" w:color="auto" w:val="clear"/>
+            <w:tcMar>
+              <w:top w:type="dxa" w:w="60"/>
+              <w:left w:type="dxa" w:w="90"/>
+              <w:bottom w:type="dxa" w:w="60"/>
+              <w:right w:type="dxa" w:w="90"/>
+            </w:tcMar>
+            <w:vAlign w:val="top"/>
+          </w:tcPr>
+          <w:p>
+            <w:pPr>
+              <w:spacing w:after="40"/>
+            </w:pPr>
+            <w:r>
+              <w:rPr>
+                <w:rFonts w:ascii="Calibri" w:cs="Calibri" w:eastAsia="Calibri" w:hAnsi="Calibri"/>
+                <w:b/>
+                <w:bCs/>
+                <w:color w:val="14213D"/>
+                <w:sz w:val="19"/>
+                <w:szCs w:val="19"/>
+              </w:rPr>
+              <w:t xml:space="preserve">Fait (fichier) · à cadrer (automatique)</w:t>
+            </w:r>
+          </w:p>
+        </w:tc>
+        <w:tc>
+          <w:tcPr>
+            <w:tcW w:type="dxa" w:w="3700"/>
+            <w:tcBorders>
+              <w:top w:val="single" w:color="D9D5CB" w:sz="4"/>
+              <w:left w:val="single" w:color="D9D5CB" w:sz="4"/>
+              <w:bottom w:val="single" w:color="D9D5CB" w:sz="4"/>
+              <w:right w:val="single" w:color="D9D5CB" w:sz="4"/>
+            </w:tcBorders>
+            <w:tcMar>
+              <w:top w:type="dxa" w:w="60"/>
+              <w:left w:type="dxa" w:w="90"/>
+              <w:bottom w:type="dxa" w:w="60"/>
+              <w:right w:type="dxa" w:w="90"/>
+            </w:tcMar>
+            <w:vAlign w:val="top"/>
+          </w:tcPr>
+          <w:p>
+            <w:pPr>
+              <w:spacing w:after="40"/>
+            </w:pPr>
+            <w:r>
+              <w:rPr>
+                <w:rFonts w:ascii="Calibri" w:cs="Calibri" w:eastAsia="Calibri" w:hAnsi="Calibri"/>
+                <w:color w:val="14213D"/>
+                <w:sz w:val="20"/>
+                <w:szCs w:val="20"/>
+              </w:rPr>
+              <w:t xml:space="preserve"/>
+            </w:r>
+          </w:p>
+          <w:p>
+            <w:pPr>
+              <w:spacing w:after="40"/>
+            </w:pPr>
+            <w:r>
+              <w:rPr>
+                <w:rFonts w:ascii="Calibri" w:cs="Calibri" w:eastAsia="Calibri" w:hAnsi="Calibri"/>
+                <w:color w:val="14213D"/>
+                <w:sz w:val="20"/>
+                <w:szCs w:val="20"/>
+              </w:rPr>
+              <w:t xml:space="preserve"/>
+            </w:r>
+          </w:p>
+        </w:tc>
+      </w:tr>
+      <w:tr>
+        <w:tc>
+          <w:tcPr>
+            <w:tcW w:type="dxa" w:w="2300"/>
+            <w:tcBorders>
+              <w:top w:val="single" w:color="D9D5CB" w:sz="4"/>
+              <w:left w:val="single" w:color="D9D5CB" w:sz="4"/>
+              <w:bottom w:val="single" w:color="D9D5CB" w:sz="4"/>
+              <w:right w:val="single" w:color="D9D5CB" w:sz="4"/>
+            </w:tcBorders>
+            <w:tcMar>
+              <w:top w:type="dxa" w:w="60"/>
+              <w:left w:type="dxa" w:w="90"/>
+              <w:bottom w:type="dxa" w:w="60"/>
+              <w:right w:type="dxa" w:w="90"/>
+            </w:tcMar>
+            <w:vAlign w:val="top"/>
+          </w:tcPr>
+          <w:p>
+            <w:pPr>
+              <w:spacing w:after="40"/>
+            </w:pPr>
+            <w:r>
+              <w:rPr>
+                <w:rFonts w:ascii="Calibri" w:cs="Calibri" w:eastAsia="Calibri" w:hAnsi="Calibri"/>
+                <w:b/>
+                <w:bCs/>
+                <w:color w:val="14213D"/>
+                <w:sz w:val="20"/>
+                <w:szCs w:val="20"/>
+              </w:rPr>
+              <w:t xml:space="preserve">La hiérarchie voit la semaine de ceux en dessous</w:t>
+            </w:r>
+          </w:p>
+        </w:tc>
+        <w:tc>
+          <w:tcPr>
+            <w:tcW w:type="dxa" w:w="4100"/>
+            <w:tcBorders>
+              <w:top w:val="single" w:color="D9D5CB" w:sz="4"/>
+              <w:left w:val="single" w:color="D9D5CB" w:sz="4"/>
+              <w:bottom w:val="single" w:color="D9D5CB" w:sz="4"/>
+              <w:right w:val="single" w:color="D9D5CB" w:sz="4"/>
+            </w:tcBorders>
+            <w:tcMar>
+              <w:top w:type="dxa" w:w="60"/>
+              <w:left w:type="dxa" w:w="90"/>
+              <w:bottom w:type="dxa" w:w="60"/>
+              <w:right w:type="dxa" w:w="90"/>
+            </w:tcMar>
+            <w:vAlign w:val="top"/>
+          </w:tcPr>
+          <w:p>
+            <w:pPr>
+              <w:spacing w:after="40"/>
+            </w:pPr>
+            <w:r>
+              <w:rPr>
+                <w:rFonts w:ascii="Calibri" w:cs="Calibri" w:eastAsia="Calibri" w:hAnsi="Calibri"/>
+                <w:color w:val="14213D"/>
+                <w:sz w:val="19"/>
+                <w:szCs w:val="19"/>
+              </w:rPr>
+              <w:t xml:space="preserve">Ma semaine → « 👥 La semaine de » : liste de tout le monde en dessous de toi (par rang de poste : gérant &gt; direction &gt; responsables d'exploitation / opérations &gt; conducteurs &gt; chefs &gt; terrain ; la direction ne se voit pas entre elle ; l'administrateur voit tout). La semaine de l'autre est en lecture seule : ses rendez-vous, ses chantiers planifiés, pas de ＋ ni d'import.</w:t>
+            </w:r>
+          </w:p>
+        </w:tc>
+        <w:tc>
+          <w:tcPr>
+            <w:tcW w:type="dxa" w:w="3700"/>
+            <w:tcBorders>
+              <w:top w:val="single" w:color="D9D5CB" w:sz="4"/>
+              <w:left w:val="single" w:color="D9D5CB" w:sz="4"/>
+              <w:bottom w:val="single" w:color="D9D5CB" w:sz="4"/>
+              <w:right w:val="single" w:color="D9D5CB" w:sz="4"/>
+            </w:tcBorders>
+            <w:tcMar>
+              <w:top w:type="dxa" w:w="60"/>
+              <w:left w:type="dxa" w:w="90"/>
+              <w:bottom w:type="dxa" w:w="60"/>
+              <w:right w:type="dxa" w:w="90"/>
+            </w:tcMar>
+            <w:vAlign w:val="top"/>
+          </w:tcPr>
+          <w:p>
+            <w:pPr>
+              <w:spacing w:after="40"/>
+            </w:pPr>
+            <w:r>
+              <w:rPr>
+                <w:rFonts w:ascii="Calibri" w:cs="Calibri" w:eastAsia="Calibri" w:hAnsi="Calibri"/>
+                <w:color w:val="14213D"/>
+                <w:sz w:val="19"/>
+                <w:szCs w:val="19"/>
+              </w:rPr>
+              <w:t xml:space="preserve">Ta règle du 12/10 soir : « le n+1 voit les plannings perso de tous les gars en dessous de lui ; la gérance tous ses encadrants ; la direction pareil sauf entre eux ». Les supports (RH, commercial, affaires) sont rangés par rang aussi — dis-moi si un poste est mal placé.</w:t>
+            </w:r>
+          </w:p>
+        </w:tc>
+        <w:tc>
+          <w:tcPr>
+            <w:tcW w:type="dxa" w:w="1300"/>
+            <w:tcBorders>
+              <w:top w:val="single" w:color="D9D5CB" w:sz="4"/>
+              <w:left w:val="single" w:color="D9D5CB" w:sz="4"/>
+              <w:bottom w:val="single" w:color="D9D5CB" w:sz="4"/>
+              <w:right w:val="single" w:color="D9D5CB" w:sz="4"/>
+            </w:tcBorders>
+            <w:shd w:fill="E6F5EC" w:color="auto" w:val="clear"/>
+            <w:tcMar>
+              <w:top w:type="dxa" w:w="60"/>
+              <w:left w:type="dxa" w:w="90"/>
+              <w:bottom w:type="dxa" w:w="60"/>
+              <w:right w:type="dxa" w:w="90"/>
+            </w:tcMar>
+            <w:vAlign w:val="top"/>
+          </w:tcPr>
+          <w:p>
+            <w:pPr>
+              <w:spacing w:after="40"/>
+            </w:pPr>
+            <w:r>
+              <w:rPr>
+                <w:rFonts w:ascii="Calibri" w:cs="Calibri" w:eastAsia="Calibri" w:hAnsi="Calibri"/>
+                <w:b/>
+                <w:bCs/>
+                <w:color w:val="14213D"/>
+                <w:sz w:val="19"/>
+                <w:szCs w:val="19"/>
+              </w:rPr>
+              <w:t xml:space="preserve">Fait</w:t>
+            </w:r>
+          </w:p>
+        </w:tc>
+        <w:tc>
+          <w:tcPr>
+            <w:tcW w:type="dxa" w:w="3700"/>
+            <w:tcBorders>
+              <w:top w:val="single" w:color="D9D5CB" w:sz="4"/>
+              <w:left w:val="single" w:color="D9D5CB" w:sz="4"/>
+              <w:bottom w:val="single" w:color="D9D5CB" w:sz="4"/>
+              <w:right w:val="single" w:color="D9D5CB" w:sz="4"/>
+            </w:tcBorders>
+            <w:tcMar>
+              <w:top w:type="dxa" w:w="60"/>
+              <w:left w:type="dxa" w:w="90"/>
+              <w:bottom w:type="dxa" w:w="60"/>
+              <w:right w:type="dxa" w:w="90"/>
+            </w:tcMar>
+            <w:vAlign w:val="top"/>
+          </w:tcPr>
+          <w:p>
+            <w:pPr>
+              <w:spacing w:after="40"/>
+            </w:pPr>
+            <w:r>
+              <w:rPr>
+                <w:rFonts w:ascii="Calibri" w:cs="Calibri" w:eastAsia="Calibri" w:hAnsi="Calibri"/>
+                <w:color w:val="14213D"/>
+                <w:sz w:val="20"/>
+                <w:szCs w:val="20"/>
+              </w:rPr>
+              <w:t xml:space="preserve"/>
+            </w:r>
+          </w:p>
+          <w:p>
+            <w:pPr>
+              <w:spacing w:after="40"/>
+            </w:pPr>
+            <w:r>
+              <w:rPr>
+                <w:rFonts w:ascii="Calibri" w:cs="Calibri" w:eastAsia="Calibri" w:hAnsi="Calibri"/>
+                <w:color w:val="14213D"/>
+                <w:sz w:val="20"/>
+                <w:szCs w:val="20"/>
+              </w:rPr>
+              <w:t xml:space="preserve"/>
+            </w:r>
+          </w:p>
+        </w:tc>
+      </w:tr>
+      <w:tr>
+        <w:tc>
+          <w:tcPr>
+            <w:tcW w:type="dxa" w:w="2300"/>
+            <w:tcBorders>
+              <w:top w:val="single" w:color="D9D5CB" w:sz="4"/>
+              <w:left w:val="single" w:color="D9D5CB" w:sz="4"/>
+              <w:bottom w:val="single" w:color="D9D5CB" w:sz="4"/>
+              <w:right w:val="single" w:color="D9D5CB" w:sz="4"/>
+            </w:tcBorders>
+            <w:tcMar>
+              <w:top w:type="dxa" w:w="60"/>
+              <w:left w:type="dxa" w:w="90"/>
+              <w:bottom w:type="dxa" w:w="60"/>
+              <w:right w:type="dxa" w:w="90"/>
+            </w:tcMar>
+            <w:vAlign w:val="top"/>
+          </w:tcPr>
+          <w:p>
+            <w:pPr>
+              <w:spacing w:after="40"/>
+            </w:pPr>
+            <w:r>
+              <w:rPr>
+                <w:rFonts w:ascii="Calibri" w:cs="Calibri" w:eastAsia="Calibri" w:hAnsi="Calibri"/>
+                <w:b/>
+                <w:bCs/>
+                <w:color w:val="14213D"/>
+                <w:sz w:val="20"/>
+                <w:szCs w:val="20"/>
+              </w:rPr>
               <w:t xml:space="preserve">Export Outlook (.ics)</w:t>
             </w:r>
           </w:p>
@@ -6864,7 +7950,7 @@
                 <w:sz w:val="19"/>
                 <w:szCs w:val="19"/>
               </w:rPr>
-              <w:t xml:space="preserve">Chantier → QSE → bloc « Non-conformités » (ouvertes / levées) → « ✓ Lever » : ce qui a été fait + photo ; qui, quand. Le rapport du contrôle montre la levée sous l'action ; Équipes → Contrôles : « n ouvertes » / « toutes levées ».</w:t>
+              <w:t xml:space="preserve">Chantier → QSE → bloc « Non-conformités » (ouvertes / levées) → « ✓ Lever » : ce qui a été fait (obligatoire, une ligne) + photo ; qui, quand. Le rapport du contrôle montre la levée sous l'action ; Équipes → Contrôles : « n ouvertes » / « toutes levées ».</w:t>
             </w:r>
           </w:p>
         </w:tc>
@@ -6896,7 +7982,7 @@
                 <w:sz w:val="19"/>
                 <w:szCs w:val="19"/>
               </w:rPr>
-              <w:t xml:space="preserve"/>
+              <w:t xml:space="preserve">Ton retour du 12/10 soir (« quand je valide il ne se passe rien ») : connecté, le serveur réunit les contrôles par identifiant et gardait l'ancienne version — la levée était perdue et la NC revenait. Corrigé : le contrôle modifié est horodaté, le serveur garde le plus récent. Si la note est vide, le bouton refuse (message « Dis ce qui a été fait »).</w:t>
             </w:r>
           </w:p>
         </w:tc>
@@ -6931,7 +8017,7 @@
                 <w:sz w:val="19"/>
                 <w:szCs w:val="19"/>
               </w:rPr>
-              <w:t xml:space="preserve">Fait</w:t>
+              <w:t xml:space="preserve">Fait (corrigé)</w:t>
             </w:r>
           </w:p>
         </w:tc>
@@ -7950,7 +9036,7 @@
                 <w:sz w:val="19"/>
                 <w:szCs w:val="19"/>
               </w:rPr>
-              <w:t xml:space="preserve">Voir A (facettes : 5 onglets, plus de défilement).</w:t>
+              <w:t xml:space="preserve">Voir A (facettes : 5 à 6 onglets, plus de défilement, vérifié en émulation iPhone).</w:t>
             </w:r>
           </w:p>
         </w:tc>

</xml_diff>

<commit_message>
Six onglets (Commerce, Parc, Sécurité), accidents v1, Outlook serveur, production par équipe, récap Mes chantiers, communication interne
</commit_message>
<xml_diff>
--- a/app/docs/Feuille_de_route_controle_12-10.docx
+++ b/app/docs/Feuille_de_route_controle_12-10.docx
@@ -29,7 +29,7 @@
           <w:sz w:val="22"/>
           <w:szCs w:val="22"/>
         </w:rPr>
-        <w:t xml:space="preserve">12 octobre 2026 · nouvelle ventilation, « agir comme », raccourci rapide du planning, « ma semaine », et tes commentaires du Word (sections 5 à 9) · une colonne pour tes retours</w:t>
+        <w:t xml:space="preserve">12 octobre 2026 (mis à jour dans la nuit avec tes retours « à la louche » : six onglets, Commerce, Parc, Sécurité, accidents, Outlook serveur) · nouvelle ventilation, « agir comme », raccourci rapide du planning, « ma semaine », tes commentaires du Word (sections 5 à 9) · une colonne pour tes retours</w:t>
       </w:r>
     </w:p>
     <w:p>
@@ -65,7 +65,7 @@
           <w:sz w:val="20"/>
           <w:szCs w:val="20"/>
         </w:rPr>
-        <w:t xml:space="preserve">Même principe que la précédente : tu contrôles ligne par ligne, tu écris dans « Vos commentaires » (OK / à corriger / à changer : quoi), tu me renvoies le fichier. Je corrige à partir de tes commentaires, dans l'ordre du document.</w:t>
+        <w:t xml:space="preserve">Même principe que la précédente : tu contrôles ligne par ligne, tu écris dans « Vos commentaires » (OK / à corriger / à changer : quoi), tu me renvoies le fichier. Je corrige à partir de tes commentaires, dans l'ordre du document. Commence par la section F (tes retours du 12/10 soir) : c'est ce qui a le plus bougé.</w:t>
       </w:r>
     </w:p>
     <w:p>
@@ -84,7 +84,7 @@
           <w:sz w:val="20"/>
           <w:szCs w:val="20"/>
         </w:rPr>
-        <w:t xml:space="preserve">Build livré : 12/10/2026 · 74d0fe (index.html + traceur.html à la racine du dépôt). Avant de tester connecté : passer app/sql/retours_12-10.sql (ci-dessous). Hors connexion, tout se teste avec les personnages de démo.</w:t>
+        <w:t xml:space="preserve">Build livré : 12/10/2026 · f6fd03 (index.html + traceur.html à la racine du dépôt). Avant de tester connecté : passer app/sql/retours_12-10.sql PUIS app/sql/retours_12-10b.sql (ci-dessous), et déployer la fonction serveur outlook-sync (3 minutes, app/supabase/functions/outlook-sync/README.md). Hors connexion, tout se teste avec les personnages de démo.</w:t>
       </w:r>
     </w:p>
     <w:p>
@@ -103,7 +103,7 @@
           <w:sz w:val="20"/>
           <w:szCs w:val="20"/>
         </w:rPr>
-        <w:t xml:space="preserve">Règle gardée : rien d'ancien n'est supprimé ; 43 suites de tests automatiques passent (41 + e2e_prov, e2e_agenda), 7 suites adaptées aux nouveaux noms et aux hubs.</w:t>
+        <w:t xml:space="preserve">Règle gardée : rien d'ancien n'est supprimé ; 44 suites de tests automatiques passent (43 + e2e_onglets, 11 points sur les nouveaux onglets), 9 suites adaptées aux nouveaux noms et aux hubs.</w:t>
       </w:r>
     </w:p>
     <w:p>
@@ -333,6 +333,234 @@
                 <w:szCs w:val="19"/>
               </w:rPr>
               <w:t xml:space="preserve">registre_set accepte trois nouveaux registres : « prov » (personne créée depuis le planning, accès à finaliser — encadrement), « gdx » (exception grands déplacements : détente / pas de détente, par personne et semaine — encadrement), « agenda » (ma semaine de l'encadrant : la personne elle-même ou l'encadrement). Vérification en bas : trois colonnes à « true ». Sans ce SQL, les écritures de ces registres restent en attente sur l'appareil (toast « passe le SQL ») et n'empêchent plus les autres.</w:t>
+            </w:r>
+          </w:p>
+        </w:tc>
+        <w:tc>
+          <w:tcPr>
+            <w:tcW w:type="dxa" w:w="3800"/>
+            <w:tcBorders>
+              <w:top w:val="single" w:color="D9D5CB" w:sz="4"/>
+              <w:left w:val="single" w:color="D9D5CB" w:sz="4"/>
+              <w:bottom w:val="single" w:color="D9D5CB" w:sz="4"/>
+              <w:right w:val="single" w:color="D9D5CB" w:sz="4"/>
+            </w:tcBorders>
+            <w:tcMar>
+              <w:top w:type="dxa" w:w="60"/>
+              <w:left w:type="dxa" w:w="90"/>
+              <w:bottom w:type="dxa" w:w="60"/>
+              <w:right w:type="dxa" w:w="90"/>
+            </w:tcMar>
+            <w:vAlign w:val="top"/>
+          </w:tcPr>
+          <w:p>
+            <w:pPr>
+              <w:spacing w:after="40"/>
+            </w:pPr>
+            <w:r>
+              <w:rPr>
+                <w:rFonts w:ascii="Calibri" w:cs="Calibri" w:eastAsia="Calibri" w:hAnsi="Calibri"/>
+                <w:color w:val="14213D"/>
+                <w:sz w:val="20"/>
+                <w:szCs w:val="20"/>
+              </w:rPr>
+              <w:t xml:space="preserve"/>
+            </w:r>
+          </w:p>
+          <w:p>
+            <w:pPr>
+              <w:spacing w:after="40"/>
+            </w:pPr>
+            <w:r>
+              <w:rPr>
+                <w:rFonts w:ascii="Calibri" w:cs="Calibri" w:eastAsia="Calibri" w:hAnsi="Calibri"/>
+                <w:color w:val="14213D"/>
+                <w:sz w:val="20"/>
+                <w:szCs w:val="20"/>
+              </w:rPr>
+              <w:t xml:space="preserve"/>
+            </w:r>
+          </w:p>
+        </w:tc>
+      </w:tr>
+      <w:tr>
+        <w:tc>
+          <w:tcPr>
+            <w:tcW w:type="dxa" w:w="3200"/>
+            <w:tcBorders>
+              <w:top w:val="single" w:color="D9D5CB" w:sz="4"/>
+              <w:left w:val="single" w:color="D9D5CB" w:sz="4"/>
+              <w:bottom w:val="single" w:color="D9D5CB" w:sz="4"/>
+              <w:right w:val="single" w:color="D9D5CB" w:sz="4"/>
+            </w:tcBorders>
+            <w:tcMar>
+              <w:top w:type="dxa" w:w="60"/>
+              <w:left w:type="dxa" w:w="90"/>
+              <w:bottom w:type="dxa" w:w="60"/>
+              <w:right w:type="dxa" w:w="90"/>
+            </w:tcMar>
+            <w:vAlign w:val="top"/>
+          </w:tcPr>
+          <w:p>
+            <w:pPr>
+              <w:spacing w:after="40"/>
+            </w:pPr>
+            <w:r>
+              <w:rPr>
+                <w:rFonts w:ascii="Calibri" w:cs="Calibri" w:eastAsia="Calibri" w:hAnsi="Calibri"/>
+                <w:b/>
+                <w:bCs/>
+                <w:color w:val="14213D"/>
+                <w:sz w:val="19"/>
+                <w:szCs w:val="19"/>
+              </w:rPr>
+              <w:t xml:space="preserve">app/sql/retours_12-10b.sql</w:t>
+            </w:r>
+          </w:p>
+        </w:tc>
+        <w:tc>
+          <w:tcPr>
+            <w:tcW w:type="dxa" w:w="8100"/>
+            <w:tcBorders>
+              <w:top w:val="single" w:color="D9D5CB" w:sz="4"/>
+              <w:left w:val="single" w:color="D9D5CB" w:sz="4"/>
+              <w:bottom w:val="single" w:color="D9D5CB" w:sz="4"/>
+              <w:right w:val="single" w:color="D9D5CB" w:sz="4"/>
+            </w:tcBorders>
+            <w:tcMar>
+              <w:top w:type="dxa" w:w="60"/>
+              <w:left w:type="dxa" w:w="90"/>
+              <w:bottom w:type="dxa" w:w="60"/>
+              <w:right w:type="dxa" w:w="90"/>
+            </w:tcMar>
+            <w:vAlign w:val="top"/>
+          </w:tcPr>
+          <w:p>
+            <w:pPr>
+              <w:spacing w:after="40"/>
+            </w:pPr>
+            <w:r>
+              <w:rPr>
+                <w:rFonts w:ascii="Calibri" w:cs="Calibri" w:eastAsia="Calibri" w:hAnsi="Calibri"/>
+                <w:color w:val="14213D"/>
+                <w:sz w:val="19"/>
+                <w:szCs w:val="19"/>
+              </w:rPr>
+              <w:t xml:space="preserve">(nuit du 12/10) registre « accident » : toute personne active peut déclarer et corriger SA déclaration ; marquer « traité » = encadrement / bureau (RH, direction, QSE). Fiche personne : la partie « outlook » (lien de calendrier publié) est écrite par la personne elle-même, comme son avatar et son contact d'urgence. Vérification en bas : accident_ok, agenda_ok, outlook_ok à « true ».</w:t>
+            </w:r>
+          </w:p>
+        </w:tc>
+        <w:tc>
+          <w:tcPr>
+            <w:tcW w:type="dxa" w:w="3800"/>
+            <w:tcBorders>
+              <w:top w:val="single" w:color="D9D5CB" w:sz="4"/>
+              <w:left w:val="single" w:color="D9D5CB" w:sz="4"/>
+              <w:bottom w:val="single" w:color="D9D5CB" w:sz="4"/>
+              <w:right w:val="single" w:color="D9D5CB" w:sz="4"/>
+            </w:tcBorders>
+            <w:tcMar>
+              <w:top w:type="dxa" w:w="60"/>
+              <w:left w:type="dxa" w:w="90"/>
+              <w:bottom w:type="dxa" w:w="60"/>
+              <w:right w:type="dxa" w:w="90"/>
+            </w:tcMar>
+            <w:vAlign w:val="top"/>
+          </w:tcPr>
+          <w:p>
+            <w:pPr>
+              <w:spacing w:after="40"/>
+            </w:pPr>
+            <w:r>
+              <w:rPr>
+                <w:rFonts w:ascii="Calibri" w:cs="Calibri" w:eastAsia="Calibri" w:hAnsi="Calibri"/>
+                <w:color w:val="14213D"/>
+                <w:sz w:val="20"/>
+                <w:szCs w:val="20"/>
+              </w:rPr>
+              <w:t xml:space="preserve"/>
+            </w:r>
+          </w:p>
+          <w:p>
+            <w:pPr>
+              <w:spacing w:after="40"/>
+            </w:pPr>
+            <w:r>
+              <w:rPr>
+                <w:rFonts w:ascii="Calibri" w:cs="Calibri" w:eastAsia="Calibri" w:hAnsi="Calibri"/>
+                <w:color w:val="14213D"/>
+                <w:sz w:val="20"/>
+                <w:szCs w:val="20"/>
+              </w:rPr>
+              <w:t xml:space="preserve"/>
+            </w:r>
+          </w:p>
+        </w:tc>
+      </w:tr>
+      <w:tr>
+        <w:tc>
+          <w:tcPr>
+            <w:tcW w:type="dxa" w:w="3200"/>
+            <w:tcBorders>
+              <w:top w:val="single" w:color="D9D5CB" w:sz="4"/>
+              <w:left w:val="single" w:color="D9D5CB" w:sz="4"/>
+              <w:bottom w:val="single" w:color="D9D5CB" w:sz="4"/>
+              <w:right w:val="single" w:color="D9D5CB" w:sz="4"/>
+            </w:tcBorders>
+            <w:tcMar>
+              <w:top w:type="dxa" w:w="60"/>
+              <w:left w:type="dxa" w:w="90"/>
+              <w:bottom w:type="dxa" w:w="60"/>
+              <w:right w:type="dxa" w:w="90"/>
+            </w:tcMar>
+            <w:vAlign w:val="top"/>
+          </w:tcPr>
+          <w:p>
+            <w:pPr>
+              <w:spacing w:after="40"/>
+            </w:pPr>
+            <w:r>
+              <w:rPr>
+                <w:rFonts w:ascii="Calibri" w:cs="Calibri" w:eastAsia="Calibri" w:hAnsi="Calibri"/>
+                <w:b/>
+                <w:bCs/>
+                <w:color w:val="14213D"/>
+                <w:sz w:val="19"/>
+                <w:szCs w:val="19"/>
+              </w:rPr>
+              <w:t xml:space="preserve">app/supabase/functions/outlook-sync/</w:t>
+            </w:r>
+          </w:p>
+        </w:tc>
+        <w:tc>
+          <w:tcPr>
+            <w:tcW w:type="dxa" w:w="8100"/>
+            <w:tcBorders>
+              <w:top w:val="single" w:color="D9D5CB" w:sz="4"/>
+              <w:left w:val="single" w:color="D9D5CB" w:sz="4"/>
+              <w:bottom w:val="single" w:color="D9D5CB" w:sz="4"/>
+              <w:right w:val="single" w:color="D9D5CB" w:sz="4"/>
+            </w:tcBorders>
+            <w:tcMar>
+              <w:top w:type="dxa" w:w="60"/>
+              <w:left w:type="dxa" w:w="90"/>
+              <w:bottom w:type="dxa" w:w="60"/>
+              <w:right w:type="dxa" w:w="90"/>
+            </w:tcMar>
+            <w:vAlign w:val="top"/>
+          </w:tcPr>
+          <w:p>
+            <w:pPr>
+              <w:spacing w:after="40"/>
+            </w:pPr>
+            <w:r>
+              <w:rPr>
+                <w:rFonts w:ascii="Calibri" w:cs="Calibri" w:eastAsia="Calibri" w:hAnsi="Calibri"/>
+                <w:color w:val="14213D"/>
+                <w:sz w:val="19"/>
+                <w:szCs w:val="19"/>
+              </w:rPr>
+              <w:t xml:space="preserve">Fonction serveur « outlook-sync » (validée par toi) : Supabase → Edge Functions → Deploy a new function → via Editor → nom outlook-sync → coller index.ts → Deploy. Elle lit le calendrier Outlook publié de la personne connectée avec SES droits et remplit Ma semaine. Sans elle, le bouton « Synchroniser » dit « la fonction serveur n'est pas déployée » et tout le reste marche.</w:t>
             </w:r>
           </w:p>
         </w:tc>
@@ -659,7 +887,7 @@
                 <w:sz w:val="20"/>
                 <w:szCs w:val="20"/>
               </w:rPr>
-              <w:t xml:space="preserve">Quatre territoires + Entreprise</w:t>
+              <w:t xml:space="preserve">Six onglets (remplace « quatre territoires »)</w:t>
             </w:r>
           </w:p>
         </w:tc>
@@ -691,7 +919,7 @@
                 <w:sz w:val="19"/>
                 <w:szCs w:val="19"/>
               </w:rPr>
-              <w:t xml:space="preserve">Barre du bas : Aujourd'hui · Chantiers · Équipes · Moi · Entreprise (admin aussi Entreprise). Les tuiles de l'accueil portent les mêmes noms. L'onglet Administration n'existe plus : Entreprise → Outils → Administration (et le bouton « Comptes » du menu reste un raccourci).</w:t>
+              <w:t xml:space="preserve">Barre du bas : Aujourd'hui · Chantiers · Moi · Commerce · Parc · Entreprise. Sous Chantiers : Carte · Liste · Équipes &amp; heures · Sécurité. Les tuiles de l'accueil portent les mêmes noms (Sécurité avec le nombre de déclarations d'accident à traiter). L'onglet Administration n'existe plus : Entreprise → Outils → Administration. Toucher un onglet revient toujours à son hub ; une notification va directement à la bonne sous-vue.</w:t>
             </w:r>
           </w:p>
         </w:tc>
@@ -723,7 +951,7 @@
                 <w:sz w:val="19"/>
                 <w:szCs w:val="19"/>
               </w:rPr>
-              <w:t xml:space="preserve">Les droits décident des onglets : un soudeur n'a pas Équipes ; un visiteur n'a pas Entreprise.</w:t>
+              <w:t xml:space="preserve">Ta remarque du 12/10 soir : « Équipes ne devrait pas s'appeler comme ça, ça regroupe tout ce qui touche au chantier ». Les droits décident : un soudeur n'a ni Équipes &amp; heures, ni Sécurité, ni Commerce, ni Parc ; un visiteur n'a pas Entreprise. Détail de chaque onglet : section F.</w:t>
             </w:r>
           </w:p>
         </w:tc>
@@ -736,29 +964,29 @@
               <w:bottom w:val="single" w:color="D9D5CB" w:sz="4"/>
               <w:right w:val="single" w:color="D9D5CB" w:sz="4"/>
             </w:tcBorders>
-            <w:shd w:fill="E6F5EC" w:color="auto" w:val="clear"/>
-            <w:tcMar>
-              <w:top w:type="dxa" w:w="60"/>
-              <w:left w:type="dxa" w:w="90"/>
-              <w:bottom w:type="dxa" w:w="60"/>
-              <w:right w:type="dxa" w:w="90"/>
-            </w:tcMar>
-            <w:vAlign w:val="top"/>
-          </w:tcPr>
-          <w:p>
-            <w:pPr>
-              <w:spacing w:after="40"/>
-            </w:pPr>
-            <w:r>
-              <w:rPr>
-                <w:rFonts w:ascii="Calibri" w:cs="Calibri" w:eastAsia="Calibri" w:hAnsi="Calibri"/>
-                <w:b/>
-                <w:bCs/>
-                <w:color w:val="14213D"/>
-                <w:sz w:val="19"/>
-                <w:szCs w:val="19"/>
-              </w:rPr>
-              <w:t xml:space="preserve">Fait</w:t>
+            <w:shd w:fill="FFF4EE" w:color="auto" w:val="clear"/>
+            <w:tcMar>
+              <w:top w:type="dxa" w:w="60"/>
+              <w:left w:type="dxa" w:w="90"/>
+              <w:bottom w:type="dxa" w:w="60"/>
+              <w:right w:type="dxa" w:w="90"/>
+            </w:tcMar>
+            <w:vAlign w:val="top"/>
+          </w:tcPr>
+          <w:p>
+            <w:pPr>
+              <w:spacing w:after="40"/>
+            </w:pPr>
+            <w:r>
+              <w:rPr>
+                <w:rFonts w:ascii="Calibri" w:cs="Calibri" w:eastAsia="Calibri" w:hAnsi="Calibri"/>
+                <w:b/>
+                <w:bCs/>
+                <w:color w:val="14213D"/>
+                <w:sz w:val="19"/>
+                <w:szCs w:val="19"/>
+              </w:rPr>
+              <w:t xml:space="preserve">Refait</w:t>
             </w:r>
           </w:p>
         </w:tc>
@@ -840,7 +1068,7 @@
                 <w:sz w:val="20"/>
                 <w:szCs w:val="20"/>
               </w:rPr>
-              <w:t xml:space="preserve">Hub Équipes</w:t>
+              <w:t xml:space="preserve">Hub Équipes → « Équipes &amp; heures » et « Sécurité »</w:t>
             </w:r>
           </w:p>
         </w:tc>
@@ -872,7 +1100,7 @@
                 <w:sz w:val="19"/>
                 <w:szCs w:val="19"/>
               </w:rPr>
-              <w:t xml:space="preserve">Équipes : 4 chiffres (placés toute la semaine, pointages à valider, objectifs du jour, contrôles en retard ou habilitations) puis 4 sections : Planning &amp; objectifs (planning, objectifs, Ma semaine, mes chantiers) · Heures (validation, annulations, rapport, production, grands déplacements) · Sécurité (quart d'heure, contrôles, documents) · Gens (habilitations, annuaire). Chaque ligne ouvre la sous-vue, « ‹ Équipes » revient.</w:t>
+              <w:t xml:space="preserve">Chantiers → Équipes &amp; heures : 4 chiffres puis 3 sections : Planning &amp; objectifs (planning, objectifs, Ma semaine) · Heures &amp; paie (pointages à valider, Production par équipe, Variables de paie, grands déplacements, annulations, notes de frais à valider) · Achats &amp; comptes (bons de commande, comptes chantier). Chantiers → Sécurité : quart d'heure, contrôles chantier, déclarer un accident, habilitations de l'équipe. « ‹ Chantiers » revient.</w:t>
             </w:r>
           </w:p>
         </w:tc>
@@ -904,7 +1132,7 @@
                 <w:sz w:val="19"/>
                 <w:szCs w:val="19"/>
               </w:rPr>
-              <w:t xml:space="preserve">Chef de chantier : « Mon planning et mon équipe » à la place du planning.</w:t>
+              <w:t xml:space="preserve">Chef de chantier : « Mon planning et mon équipe » à la place du planning. Plus de « Mes chantiers » ici (doublon du Bureau : section F).</w:t>
             </w:r>
           </w:p>
         </w:tc>
@@ -917,29 +1145,29 @@
               <w:bottom w:val="single" w:color="D9D5CB" w:sz="4"/>
               <w:right w:val="single" w:color="D9D5CB" w:sz="4"/>
             </w:tcBorders>
-            <w:shd w:fill="E6F5EC" w:color="auto" w:val="clear"/>
-            <w:tcMar>
-              <w:top w:type="dxa" w:w="60"/>
-              <w:left w:type="dxa" w:w="90"/>
-              <w:bottom w:type="dxa" w:w="60"/>
-              <w:right w:type="dxa" w:w="90"/>
-            </w:tcMar>
-            <w:vAlign w:val="top"/>
-          </w:tcPr>
-          <w:p>
-            <w:pPr>
-              <w:spacing w:after="40"/>
-            </w:pPr>
-            <w:r>
-              <w:rPr>
-                <w:rFonts w:ascii="Calibri" w:cs="Calibri" w:eastAsia="Calibri" w:hAnsi="Calibri"/>
-                <w:b/>
-                <w:bCs/>
-                <w:color w:val="14213D"/>
-                <w:sz w:val="19"/>
-                <w:szCs w:val="19"/>
-              </w:rPr>
-              <w:t xml:space="preserve">Fait</w:t>
+            <w:shd w:fill="FFF4EE" w:color="auto" w:val="clear"/>
+            <w:tcMar>
+              <w:top w:type="dxa" w:w="60"/>
+              <w:left w:type="dxa" w:w="90"/>
+              <w:bottom w:type="dxa" w:w="60"/>
+              <w:right w:type="dxa" w:w="90"/>
+            </w:tcMar>
+            <w:vAlign w:val="top"/>
+          </w:tcPr>
+          <w:p>
+            <w:pPr>
+              <w:spacing w:after="40"/>
+            </w:pPr>
+            <w:r>
+              <w:rPr>
+                <w:rFonts w:ascii="Calibri" w:cs="Calibri" w:eastAsia="Calibri" w:hAnsi="Calibri"/>
+                <w:b/>
+                <w:bCs/>
+                <w:color w:val="14213D"/>
+                <w:sz w:val="19"/>
+                <w:szCs w:val="19"/>
+              </w:rPr>
+              <w:t xml:space="preserve">Refait</w:t>
             </w:r>
           </w:p>
         </w:tc>
@@ -1021,7 +1249,7 @@
                 <w:sz w:val="20"/>
                 <w:szCs w:val="20"/>
               </w:rPr>
-              <w:t xml:space="preserve">Hub Entreprise</w:t>
+              <w:t xml:space="preserve">Hub Entreprise (réduit)</w:t>
             </w:r>
           </w:p>
         </w:tc>
@@ -1053,7 +1281,7 @@
                 <w:sz w:val="19"/>
                 <w:szCs w:val="19"/>
               </w:rPr>
-              <w:t xml:space="preserve">Entreprise : chiffres (chantiers actifs, avancement, heures, contrôles) puis Pilotage (tableau de bord, contrôles) · Commerce &amp; achats (affaires ; bons de commande, notes de frais &amp; comptes chantier) · Flotte · Documents &amp; RH (documents d'entreprise, annuaire) · Outils (Traceur, Administration). Un terrain voit l'annuaire directement.</w:t>
+              <w:t xml:space="preserve">Entreprise : Annuaire · Documents d'entreprise · Communication interne · Présentation de l'entreprise · Outils (Administration). Tout le reste a déménagé : affaires → Commerce, flotte → Parc, bons / comptes → Chantiers → Équipes &amp; heures, contrôles → Sécurité, tableau de bord → récap sous la carte. Un intérimaire voit l'annuaire directement.</w:t>
             </w:r>
           </w:p>
         </w:tc>
@@ -1085,7 +1313,7 @@
                 <w:sz w:val="19"/>
                 <w:szCs w:val="19"/>
               </w:rPr>
-              <w:t xml:space="preserve">Sous Entreprise, un re-rendu (modale fermée, données reçues) gardait-il la sous-vue ? Non — corrigé ce soir : on ne retombe plus sur le hub.</w:t>
+              <w:t xml:space="preserve">Ta remarque du 12/10 soir : « Entreprise est un fourre-tout ». Détail : section F.</w:t>
             </w:r>
           </w:p>
         </w:tc>
@@ -1098,29 +1326,29 @@
               <w:bottom w:val="single" w:color="D9D5CB" w:sz="4"/>
               <w:right w:val="single" w:color="D9D5CB" w:sz="4"/>
             </w:tcBorders>
-            <w:shd w:fill="E6F5EC" w:color="auto" w:val="clear"/>
-            <w:tcMar>
-              <w:top w:type="dxa" w:w="60"/>
-              <w:left w:type="dxa" w:w="90"/>
-              <w:bottom w:type="dxa" w:w="60"/>
-              <w:right w:type="dxa" w:w="90"/>
-            </w:tcMar>
-            <w:vAlign w:val="top"/>
-          </w:tcPr>
-          <w:p>
-            <w:pPr>
-              <w:spacing w:after="40"/>
-            </w:pPr>
-            <w:r>
-              <w:rPr>
-                <w:rFonts w:ascii="Calibri" w:cs="Calibri" w:eastAsia="Calibri" w:hAnsi="Calibri"/>
-                <w:b/>
-                <w:bCs/>
-                <w:color w:val="14213D"/>
-                <w:sz w:val="19"/>
-                <w:szCs w:val="19"/>
-              </w:rPr>
-              <w:t xml:space="preserve">Fait</w:t>
+            <w:shd w:fill="FFF4EE" w:color="auto" w:val="clear"/>
+            <w:tcMar>
+              <w:top w:type="dxa" w:w="60"/>
+              <w:left w:type="dxa" w:w="90"/>
+              <w:bottom w:type="dxa" w:w="60"/>
+              <w:right w:type="dxa" w:w="90"/>
+            </w:tcMar>
+            <w:vAlign w:val="top"/>
+          </w:tcPr>
+          <w:p>
+            <w:pPr>
+              <w:spacing w:after="40"/>
+            </w:pPr>
+            <w:r>
+              <w:rPr>
+                <w:rFonts w:ascii="Calibri" w:cs="Calibri" w:eastAsia="Calibri" w:hAnsi="Calibri"/>
+                <w:b/>
+                <w:bCs/>
+                <w:color w:val="14213D"/>
+                <w:sz w:val="19"/>
+                <w:szCs w:val="19"/>
+              </w:rPr>
+              <w:t xml:space="preserve">Refait</w:t>
             </w:r>
           </w:p>
         </w:tc>
@@ -1596,7 +1824,7 @@
                 <w:sz w:val="19"/>
                 <w:szCs w:val="19"/>
               </w:rPr>
-              <w:t xml:space="preserve">Moi → Habilitations : seulement les tiennes (celles de l'équipe : Équipes → Habilitations de l'équipe). Moi → Productions : seulement pour un opérateur (les équipes : Équipes → Production des équipes). Moi → Chantiers : seulement pour quelqu'un sans accès à Équipes (sinon Équipes → Mes chantiers). L'accueil de Moi d'un encadrant ou d'un dirigeant ne montre plus l'équipe du jour, les pointages à valider, les demandes, la production des équipes, les chiffres de l'entreprise : tout ça vit dans Équipes et Entreprise. Reste : tes tâches, ta semaine, ton déplacement, ton véhicule, tes notes de frais, tes habilitations, ta fiche, tes récompenses. Les raccourcis « Valider les pointages », « Tout voir trié par urgence », « Voir par personne » renvoient vers Équipes.</w:t>
+              <w:t xml:space="preserve">Moi → Habilitations : seulement les tiennes (celles de l'équipe : Sécurité → Habilitations de l'équipe). Moi → Productions : seulement pour un opérateur (les équipes : Équipes &amp; heures → Production par équipe). Moi → Chantiers : seulement pour quelqu'un sans accès à Équipes &amp; heures (sinon le récap sous la carte). Moi → Notes de frais : pour tout le monde (saisie et suivi des miennes). L'accueil de Moi d'un encadrant ou d'un dirigeant ne montre plus l'équipe du jour, les pointages à valider, les demandes, la production des équipes, les chiffres de l'entreprise : tout ça vit dans Équipes et Entreprise. Reste : tes tâches, ta semaine, ton déplacement, ton véhicule, tes notes de frais, tes habilitations, ta fiche, tes récompenses. Les raccourcis « Valider les pointages », « Tout voir trié par urgence », « Voir par personne » renvoient vers Équipes.</w:t>
             </w:r>
           </w:p>
         </w:tc>
@@ -1777,7 +2005,7 @@
                 <w:sz w:val="19"/>
                 <w:szCs w:val="19"/>
               </w:rPr>
-              <w:t xml:space="preserve">Plus de tuile « Traceur » à l'accueil, plus de ligne dans Entreprise → Outils, plus de « Tracer un réseau » dans « Nouveau chantier » (qui ne propose plus que l'import d'un plan). Le traceur s'ouvre : (1) Entreprise → Affaires → fiche → Chantiers liés → « ✎ Dessiner le projet » — et au retour dans l'appli, le chantier tracé est lié à l'affaire tout seul ; (2) dans un chantier tracé → menu → « ✎ Traceur : modifier ce réseau ». Le bouton « créer un réseau » / « nouveau réseau » du chantier a disparu.</w:t>
+              <w:t xml:space="preserve">Plus de tuile « Traceur » à l'accueil, plus de ligne dans Entreprise → Outils, plus de « Tracer un réseau » dans « Nouveau chantier » (qui ne propose plus que l'import d'un plan). Le traceur s'ouvre : (1) Commerce → fiche de l'affaire → Chantiers liés → « ✎ Dessiner le projet » — et au retour dans l'appli, le chantier tracé est lié à l'affaire tout seul ; (2) dans un chantier tracé → menu → « ✎ Traceur : modifier ce réseau ». Le bouton « créer un réseau » / « nouveau réseau » du chantier a disparu.</w:t>
             </w:r>
           </w:p>
         </w:tc>
@@ -3868,7 +4096,7 @@
                 <w:sz w:val="19"/>
                 <w:szCs w:val="19"/>
               </w:rPr>
-              <w:t xml:space="preserve">Équipes → Planning des équipes → bloc « À placer » → « ＋ Nouvelle personne (intérimaire, embauche) » : prénom, nom, poste (soudeur… chef, conducteur), salarié / intérimaire + agence, e-mail en option (texte qui pousse à le demander), secteur → « Créer et placer ». Elle apparaît aussitôt dans « À placer », sélectionnée : touche un chantier.</w:t>
+              <w:t xml:space="preserve">Chantiers → Équipes &amp; heures → Planning des équipes → bloc « À placer » → « ＋ Nouvelle personne (intérimaire, embauche) » : prénom, nom, poste (soudeur… chef, conducteur), salarié / intérimaire + agence, e-mail en option (texte qui pousse à le demander), secteur → « Créer et placer ». Elle apparaît aussitôt dans « À placer », sélectionnée : touche un chantier.</w:t>
             </w:r>
           </w:p>
         </w:tc>
@@ -4823,7 +5051,7 @@
                 <w:sz w:val="19"/>
                 <w:szCs w:val="19"/>
               </w:rPr>
-              <w:t xml:space="preserve">Équipes → « Ma semaine » (ou Moi → Planning → « Composer ma semaine ») : 5 jours, tes chantiers planifiés en tête de chaque jour, « ＋ » : visite de chantier / réunion / rendez-vous / bureau / autre, chantier, heures, note. Rappel « n de tes chantiers sans visite cette semaine ». Les rendez-vous du jour apparaissent aussi dans Ta semaine (Moi → Planning).</w:t>
+              <w:t xml:space="preserve">Chantiers → Équipes &amp; heures → « Ma semaine » (ou Moi → Planning → « Composer ma semaine ») : 5 jours, tes chantiers planifiés en tête de chaque jour, « ＋ » : visite de chantier / réunion / rendez-vous / bureau / autre, chantier, heures, note. Rappel « n de tes chantiers sans visite cette semaine ». Les rendez-vous du jour apparaissent aussi dans Ta semaine (Moi → Planning).</w:t>
             </w:r>
           </w:p>
         </w:tc>
@@ -5036,7 +5264,7 @@
                 <w:sz w:val="19"/>
                 <w:szCs w:val="19"/>
               </w:rPr>
-              <w:t xml:space="preserve">Ta remarque du 12/10 soir : « plutôt un import depuis Outlook, une invitation dans son agenda qui remplit son planning ». Sans fichier (lien de calendrier publié ou Microsoft Graph), il faut une petite fonction côté serveur : prochaine étape si tu valides le principe.</w:t>
+              <w:t xml:space="preserve">Ta remarque du 12/10 soir : « plutôt un import depuis Outlook, une invitation dans son agenda qui remplit son planning ». L'import automatique (lien publié + fonction serveur, que tu as validé) est dans la section F.</w:t>
             </w:r>
           </w:p>
         </w:tc>
@@ -5071,7 +5299,7 @@
                 <w:sz w:val="19"/>
                 <w:szCs w:val="19"/>
               </w:rPr>
-              <w:t xml:space="preserve">Fait (fichier) · à cadrer (automatique)</w:t>
+              <w:t xml:space="preserve">Fait</w:t>
             </w:r>
           </w:p>
         </w:tc>
@@ -5398,7 +5626,7 @@
                 <w:sz w:val="19"/>
                 <w:szCs w:val="19"/>
               </w:rPr>
-              <w:t xml:space="preserve">Relié « dans les deux sens » avec Outlook = Microsoft Graph (compte Azure de SCR, autorisation de l'informatique) : pas fait, à décider — l'export .ics couvre le besoin immédiat.</w:t>
+              <w:t xml:space="preserve">Le sens Outlook → TRACÉ est automatique (section F) ; le sens TRACÉ → Outlook reste l'export .ics (Microsoft Graph = compte Azure SCR, autorisation IT : pas fait).</w:t>
             </w:r>
           </w:p>
         </w:tc>
@@ -5433,7 +5661,7 @@
                 <w:sz w:val="19"/>
                 <w:szCs w:val="19"/>
               </w:rPr>
-              <w:t xml:space="preserve">Fait (export) · à cadrer (synchro)</w:t>
+              <w:t xml:space="preserve">Fait (export)</w:t>
             </w:r>
           </w:p>
         </w:tc>
@@ -5778,7 +6006,7 @@
                 <w:sz w:val="19"/>
                 <w:szCs w:val="19"/>
               </w:rPr>
-              <w:t xml:space="preserve">Entreprise → Affaires → fiche : « Chargé d'affaires » et « Conducteur de travaux » sont des listes (chargés d'affaires, responsable commercial, directeur technique, responsable d'exploitation, gérant, responsable des opérations, conducteurs ; conducteurs / exploitation / opérations / chefs). Les initiales importées restent lisibles.</w:t>
+              <w:t xml:space="preserve">Commerce → fiche de l'affaire : « Chargé d'affaires » et « Conducteur de travaux » sont des listes (chargés d'affaires, responsable commercial, directeur technique, responsable d'exploitation, gérant, responsable des opérations, conducteurs ; conducteurs / exploitation / opérations / chefs). Les initiales importées restent lisibles.</w:t>
             </w:r>
           </w:p>
         </w:tc>
@@ -5959,7 +6187,7 @@
                 <w:sz w:val="19"/>
                 <w:szCs w:val="19"/>
               </w:rPr>
-              <w:t xml:space="preserve">Affaires → DCE · documents → « 📎 Déposer un fichier » : un zip est gardé tel quel comme « archive d'origine » ; PDF, DPGF, plans reconnus par le nom. Le bouton ne faisait rien avant (bug).</w:t>
+              <w:t xml:space="preserve">Commerce → fiche → DCE · documents → « 📎 Déposer un fichier » : un zip est gardé tel quel comme « archive d'origine » ; PDF, DPGF, plans reconnus par le nom. Le bouton ne faisait rien avant (bug).</w:t>
             </w:r>
           </w:p>
         </w:tc>
@@ -6502,7 +6730,7 @@
                 <w:sz w:val="19"/>
                 <w:szCs w:val="19"/>
               </w:rPr>
-              <w:t xml:space="preserve">Entreprise → Flotte : chaque véhicule est dessiné (fourgon, fourgon-pelle, benne, voiture, engin) avec sa plaque, le logo SCR et le conducteur — dans la liste, en tête de fiche et dans « Mon véhicule » (Moi).</w:t>
+              <w:t xml:space="preserve">Parc → Flotte : chaque véhicule est dessiné (fourgon, fourgon-pelle, benne, voiture, engin) avec sa plaque, le logo SCR et le conducteur — dans la liste, en tête de fiche et dans « Mon véhicule » (Moi).</w:t>
             </w:r>
           </w:p>
         </w:tc>
@@ -6864,7 +7092,7 @@
                 <w:sz w:val="19"/>
                 <w:szCs w:val="19"/>
               </w:rPr>
-              <w:t xml:space="preserve">Flotte → « 📅 Échéances &amp; interventions » : en retard / sous 14 jours / à venir (12 semaines) — contrôle technique, restitution, contrat, vidange au compteur, interventions programmées. Fiche → « 📅 Programmer une intervention » (date, quoi, garage, note) ; « ✓ fait » la passe dans l'historique. Le responsable d'exploitation voit son secteur (agence OUEST…).</w:t>
+              <w:t xml:space="preserve">Parc → Flotte → « 📅 Échéances &amp; interventions » : en retard / sous 14 jours / à venir (12 semaines) — contrôle technique, restitution, contrat, vidange au compteur, interventions programmées. Fiche → « 📅 Programmer une intervention » (date, quoi, garage, note) ; « ✓ fait » la passe dans l'historique. Le responsable d'exploitation voit son secteur (agence OUEST…).</w:t>
             </w:r>
           </w:p>
         </w:tc>
@@ -7226,7 +7454,7 @@
                 <w:sz w:val="19"/>
                 <w:szCs w:val="19"/>
               </w:rPr>
-              <w:t xml:space="preserve">Le cycle des cas 3 et 4 se compte PAR PERSONNE : semaines d'affilée en déplacement (planning), détente la dernière (cas 3 : 2 semaines ; cas 4 : 4). Équipes → Grands déplacements : « S2/4 » ou « 🏠 détente » sur chaque ligne ; l'encadrement pose une exception (🏠 détente cette semaine / ✗ pas de détente / ↺) quand la réalité diffère. Moi → Mon déplacement : « semaine 2 / 4 du cycle, détente dans 2 semaines ».</w:t>
+              <w:t xml:space="preserve">Le cycle des cas 3 et 4 se compte PAR PERSONNE : semaines d'affilée en déplacement (planning), détente la dernière (cas 3 : 2 semaines ; cas 4 : 4). Équipes &amp; heures → Grands déplacements : « S2/4 » ou « 🏠 détente » sur chaque ligne ; l'encadrement pose une exception (🏠 détente cette semaine / ✗ pas de détente / ↺) quand la réalité diffère. Moi → Mon déplacement : « semaine 2 / 4 du cycle, détente dans 2 semaines ».</w:t>
             </w:r>
           </w:p>
         </w:tc>
@@ -7407,7 +7635,7 @@
                 <w:sz w:val="19"/>
                 <w:szCs w:val="19"/>
               </w:rPr>
-              <w:t xml:space="preserve">Équipes → Heures &amp; production → carte « Objectifs de la semaine » : chantier → équipe (avec les prénoms) → jour, estimé, sur le plan (avancement), état (faite / pas faite / à venir).</w:t>
+              <w:t xml:space="preserve">Déplacé dans la nuit : Équipes &amp; heures → Production par équipe (chantier → équipe → personne, objectifs de la semaine sous chaque équipe). Le rapport RH n'a plus de production (ta demande du 12/10 soir).</w:t>
             </w:r>
           </w:p>
         </w:tc>
@@ -7439,7 +7667,7 @@
                 <w:sz w:val="19"/>
                 <w:szCs w:val="19"/>
               </w:rPr>
-              <w:t xml:space="preserve"/>
+              <w:t xml:space="preserve">Voir section F.</w:t>
             </w:r>
           </w:p>
         </w:tc>
@@ -7452,29 +7680,29 @@
               <w:bottom w:val="single" w:color="D9D5CB" w:sz="4"/>
               <w:right w:val="single" w:color="D9D5CB" w:sz="4"/>
             </w:tcBorders>
-            <w:shd w:fill="E6F5EC" w:color="auto" w:val="clear"/>
-            <w:tcMar>
-              <w:top w:type="dxa" w:w="60"/>
-              <w:left w:type="dxa" w:w="90"/>
-              <w:bottom w:type="dxa" w:w="60"/>
-              <w:right w:type="dxa" w:w="90"/>
-            </w:tcMar>
-            <w:vAlign w:val="top"/>
-          </w:tcPr>
-          <w:p>
-            <w:pPr>
-              <w:spacing w:after="40"/>
-            </w:pPr>
-            <w:r>
-              <w:rPr>
-                <w:rFonts w:ascii="Calibri" w:cs="Calibri" w:eastAsia="Calibri" w:hAnsi="Calibri"/>
-                <w:b/>
-                <w:bCs/>
-                <w:color w:val="14213D"/>
-                <w:sz w:val="19"/>
-                <w:szCs w:val="19"/>
-              </w:rPr>
-              <w:t xml:space="preserve">Fait</w:t>
+            <w:shd w:fill="FFF4EE" w:color="auto" w:val="clear"/>
+            <w:tcMar>
+              <w:top w:type="dxa" w:w="60"/>
+              <w:left w:type="dxa" w:w="90"/>
+              <w:bottom w:type="dxa" w:w="60"/>
+              <w:right w:type="dxa" w:w="90"/>
+            </w:tcMar>
+            <w:vAlign w:val="top"/>
+          </w:tcPr>
+          <w:p>
+            <w:pPr>
+              <w:spacing w:after="40"/>
+            </w:pPr>
+            <w:r>
+              <w:rPr>
+                <w:rFonts w:ascii="Calibri" w:cs="Calibri" w:eastAsia="Calibri" w:hAnsi="Calibri"/>
+                <w:b/>
+                <w:bCs/>
+                <w:color w:val="14213D"/>
+                <w:sz w:val="19"/>
+                <w:szCs w:val="19"/>
+              </w:rPr>
+              <w:t xml:space="preserve">Refait</w:t>
             </w:r>
           </w:p>
         </w:tc>
@@ -7588,7 +7816,7 @@
                 <w:sz w:val="19"/>
                 <w:szCs w:val="19"/>
               </w:rPr>
-              <w:t xml:space="preserve">Le périmètre lit la SEMAINE du planning : chef = ses chantiers (fiche) + son équipe-lettre là où un autre est chef ; conducteur = les gens placés sur ses chantiers ; direction = tout. Même règle pour les pointages à valider.</w:t>
+              <w:t xml:space="preserve">Le périmètre lit la SEMAINE du planning : chef = ses chantiers (fiche) + son équipe-lettre là où un autre est chef ; conducteur = les gens placés sur ses chantiers ; direction = tout. Même règle pour les pointages à valider et pour Production par équipe.</w:t>
             </w:r>
           </w:p>
         </w:tc>
@@ -7950,7 +8178,7 @@
                 <w:sz w:val="19"/>
                 <w:szCs w:val="19"/>
               </w:rPr>
-              <w:t xml:space="preserve">Chantier → QSE → bloc « Non-conformités » (ouvertes / levées) → « ✓ Lever » : ce qui a été fait (obligatoire, une ligne) + photo ; qui, quand. Le rapport du contrôle montre la levée sous l'action ; Équipes → Contrôles : « n ouvertes » / « toutes levées ».</w:t>
+              <w:t xml:space="preserve">Chantier → QSE → bloc « Non-conformités » (ouvertes / levées) → « ✓ Lever » : ce qui a été fait (obligatoire, une ligne) + photo ; qui, quand. Le rapport du contrôle montre la levée sous l'action ; Sécurité → Contrôles chantier : « n ouvertes » / « toutes levées ».</w:t>
             </w:r>
           </w:p>
         </w:tc>
@@ -8131,7 +8359,7 @@
                 <w:sz w:val="19"/>
                 <w:szCs w:val="19"/>
               </w:rPr>
-              <w:t xml:space="preserve">Partout « notes de frais » (Moi, validation, Entreprise). Entreprise → Bons de commande, notes de frais &amp; comptes chantier → onglet « Comptes chantier » : par chantier chiffré (marché de l'affaire liée), facturé (situations), soudures faites / chiffrées, heures pointées, main-d'œuvre (45 €/h, hypothèse), dépenses (notes de frais validées + bons), résultat indicatif.</w:t>
+              <w:t xml:space="preserve">Partout « notes de frais ». Chacun saisit les siennes dans Moi → Notes de frais ; l'encadrement valide dans Chantiers → Équipes &amp; heures → Notes de frais à valider. Équipes &amp; heures → Comptes chantier : par chantier chiffré (marché de l'affaire liée), facturé (situations), soudures faites / chiffrées, heures pointées, main-d'œuvre (45 €/h, hypothèse), dépenses (notes de frais validées + bons), résultat indicatif.</w:t>
             </w:r>
           </w:p>
         </w:tc>
@@ -8312,7 +8540,7 @@
                 <w:sz w:val="19"/>
                 <w:szCs w:val="19"/>
               </w:rPr>
-              <w:t xml:space="preserve">Fiche d'un bon : fournisseur, objet, n° d'affaire ou chantier (le minimum), livraison prévue en option, type de dépense (chapitres du chiffrage, location d'engin avec début / fin, sous-traitance…), lignes, impression.</w:t>
+              <w:t xml:space="preserve">Chantiers → Équipes &amp; heures → Bons de commande. Fiche d'un bon : fournisseur, objet, n° d'affaire ou chantier (le minimum), livraison prévue en option, type de dépense (chapitres du chiffrage, location d'engin avec début / fin, sous-traitance…), lignes, impression.</w:t>
             </w:r>
           </w:p>
         </w:tc>
@@ -9104,6 +9332,2590 @@
                 <w:szCs w:val="19"/>
               </w:rPr>
               <w:t xml:space="preserve">À vérifier</w:t>
+            </w:r>
+          </w:p>
+        </w:tc>
+        <w:tc>
+          <w:tcPr>
+            <w:tcW w:type="dxa" w:w="3700"/>
+            <w:tcBorders>
+              <w:top w:val="single" w:color="D9D5CB" w:sz="4"/>
+              <w:left w:val="single" w:color="D9D5CB" w:sz="4"/>
+              <w:bottom w:val="single" w:color="D9D5CB" w:sz="4"/>
+              <w:right w:val="single" w:color="D9D5CB" w:sz="4"/>
+            </w:tcBorders>
+            <w:tcMar>
+              <w:top w:type="dxa" w:w="60"/>
+              <w:left w:type="dxa" w:w="90"/>
+              <w:bottom w:type="dxa" w:w="60"/>
+              <w:right w:type="dxa" w:w="90"/>
+            </w:tcMar>
+            <w:vAlign w:val="top"/>
+          </w:tcPr>
+          <w:p>
+            <w:pPr>
+              <w:spacing w:after="40"/>
+            </w:pPr>
+            <w:r>
+              <w:rPr>
+                <w:rFonts w:ascii="Calibri" w:cs="Calibri" w:eastAsia="Calibri" w:hAnsi="Calibri"/>
+                <w:color w:val="14213D"/>
+                <w:sz w:val="20"/>
+                <w:szCs w:val="20"/>
+              </w:rPr>
+              <w:t xml:space="preserve"/>
+            </w:r>
+          </w:p>
+          <w:p>
+            <w:pPr>
+              <w:spacing w:after="40"/>
+            </w:pPr>
+            <w:r>
+              <w:rPr>
+                <w:rFonts w:ascii="Calibri" w:cs="Calibri" w:eastAsia="Calibri" w:hAnsi="Calibri"/>
+                <w:color w:val="14213D"/>
+                <w:sz w:val="20"/>
+                <w:szCs w:val="20"/>
+              </w:rPr>
+              <w:t xml:space="preserve"/>
+            </w:r>
+          </w:p>
+        </w:tc>
+      </w:tr>
+    </w:tbl>
+    <w:p>
+      <w:pPr>
+        <w:pStyle w:val="Heading1"/>
+        <w:spacing w:after="120" w:before="320"/>
+      </w:pPr>
+      <w:r>
+        <w:rPr>
+          <w:rFonts w:ascii="Calibri" w:cs="Calibri" w:eastAsia="Calibri" w:hAnsi="Calibri"/>
+          <w:b/>
+          <w:bCs/>
+          <w:color w:val="EB6834"/>
+          <w:sz w:val="30"/>
+          <w:szCs w:val="30"/>
+        </w:rPr>
+        <w:t xml:space="preserve">F · Tes retours du 12/10 soir (« à la louche, en survolant »)</w:t>
+      </w:r>
+    </w:p>
+    <w:p>
+      <w:pPr>
+        <w:spacing w:after="80" w:line="264"/>
+      </w:pPr>
+      <w:r>
+        <w:rPr>
+          <w:rFonts w:ascii="Calibri" w:cs="Calibri" w:eastAsia="Calibri" w:hAnsi="Calibri"/>
+          <w:color w:val="6B6B66"/>
+          <w:sz w:val="20"/>
+          <w:szCs w:val="20"/>
+        </w:rPr>
+        <w:t xml:space="preserve">Dans l'ordre de ton message. Tout est codé, testé hors connexion ; à vérifier par toi avec les vrais comptes.</w:t>
+      </w:r>
+    </w:p>
+    <w:tbl>
+      <w:tblPr>
+        <w:tblW w:type="dxa" w:w="15100"/>
+        <w:tblBorders>
+          <w:top w:val="single" w:color="auto" w:sz="4"/>
+          <w:left w:val="single" w:color="auto" w:sz="4"/>
+          <w:bottom w:val="single" w:color="auto" w:sz="4"/>
+          <w:right w:val="single" w:color="auto" w:sz="4"/>
+          <w:insideH w:val="single" w:color="auto" w:sz="4"/>
+          <w:insideV w:val="single" w:color="auto" w:sz="4"/>
+        </w:tblBorders>
+      </w:tblPr>
+      <w:tblGrid>
+        <w:gridCol w:w="2300"/>
+        <w:gridCol w:w="4100"/>
+        <w:gridCol w:w="3700"/>
+        <w:gridCol w:w="1300"/>
+        <w:gridCol w:w="3700"/>
+      </w:tblGrid>
+      <w:tr>
+        <w:trPr>
+          <w:tblHeader/>
+        </w:trPr>
+        <w:tc>
+          <w:tcPr>
+            <w:tcW w:type="dxa" w:w="2300"/>
+            <w:tcBorders>
+              <w:top w:val="single" w:color="D9D5CB" w:sz="4"/>
+              <w:left w:val="single" w:color="D9D5CB" w:sz="4"/>
+              <w:bottom w:val="single" w:color="D9D5CB" w:sz="4"/>
+              <w:right w:val="single" w:color="D9D5CB" w:sz="4"/>
+            </w:tcBorders>
+            <w:shd w:fill="14213D" w:color="auto" w:val="clear"/>
+            <w:tcMar>
+              <w:top w:type="dxa" w:w="60"/>
+              <w:left w:type="dxa" w:w="90"/>
+              <w:bottom w:type="dxa" w:w="60"/>
+              <w:right w:type="dxa" w:w="90"/>
+            </w:tcMar>
+            <w:vAlign w:val="top"/>
+          </w:tcPr>
+          <w:p>
+            <w:pPr>
+              <w:spacing w:after="80" w:line="264"/>
+            </w:pPr>
+            <w:r>
+              <w:rPr>
+                <w:rFonts w:ascii="Calibri" w:cs="Calibri" w:eastAsia="Calibri" w:hAnsi="Calibri"/>
+                <w:b/>
+                <w:bCs/>
+                <w:color w:val="FFFFFF"/>
+                <w:sz w:val="19"/>
+                <w:szCs w:val="19"/>
+              </w:rPr>
+              <w:t xml:space="preserve">Fonctionnalité</w:t>
+            </w:r>
+          </w:p>
+        </w:tc>
+        <w:tc>
+          <w:tcPr>
+            <w:tcW w:type="dxa" w:w="4100"/>
+            <w:tcBorders>
+              <w:top w:val="single" w:color="D9D5CB" w:sz="4"/>
+              <w:left w:val="single" w:color="D9D5CB" w:sz="4"/>
+              <w:bottom w:val="single" w:color="D9D5CB" w:sz="4"/>
+              <w:right w:val="single" w:color="D9D5CB" w:sz="4"/>
+            </w:tcBorders>
+            <w:shd w:fill="14213D" w:color="auto" w:val="clear"/>
+            <w:tcMar>
+              <w:top w:type="dxa" w:w="60"/>
+              <w:left w:type="dxa" w:w="90"/>
+              <w:bottom w:type="dxa" w:w="60"/>
+              <w:right w:type="dxa" w:w="90"/>
+            </w:tcMar>
+            <w:vAlign w:val="top"/>
+          </w:tcPr>
+          <w:p>
+            <w:pPr>
+              <w:spacing w:after="80" w:line="264"/>
+            </w:pPr>
+            <w:r>
+              <w:rPr>
+                <w:rFonts w:ascii="Calibri" w:cs="Calibri" w:eastAsia="Calibri" w:hAnsi="Calibri"/>
+                <w:b/>
+                <w:bCs/>
+                <w:color w:val="FFFFFF"/>
+                <w:sz w:val="19"/>
+                <w:szCs w:val="19"/>
+              </w:rPr>
+              <w:t xml:space="preserve">Où la trouver · comment tester</w:t>
+            </w:r>
+          </w:p>
+        </w:tc>
+        <w:tc>
+          <w:tcPr>
+            <w:tcW w:type="dxa" w:w="3700"/>
+            <w:tcBorders>
+              <w:top w:val="single" w:color="D9D5CB" w:sz="4"/>
+              <w:left w:val="single" w:color="D9D5CB" w:sz="4"/>
+              <w:bottom w:val="single" w:color="D9D5CB" w:sz="4"/>
+              <w:right w:val="single" w:color="D9D5CB" w:sz="4"/>
+            </w:tcBorders>
+            <w:shd w:fill="14213D" w:color="auto" w:val="clear"/>
+            <w:tcMar>
+              <w:top w:type="dxa" w:w="60"/>
+              <w:left w:type="dxa" w:w="90"/>
+              <w:bottom w:type="dxa" w:w="60"/>
+              <w:right w:type="dxa" w:w="90"/>
+            </w:tcMar>
+            <w:vAlign w:val="top"/>
+          </w:tcPr>
+          <w:p>
+            <w:pPr>
+              <w:spacing w:after="80" w:line="264"/>
+            </w:pPr>
+            <w:r>
+              <w:rPr>
+                <w:rFonts w:ascii="Calibri" w:cs="Calibri" w:eastAsia="Calibri" w:hAnsi="Calibri"/>
+                <w:b/>
+                <w:bCs/>
+                <w:color w:val="FFFFFF"/>
+                <w:sz w:val="19"/>
+                <w:szCs w:val="19"/>
+              </w:rPr>
+              <w:t xml:space="preserve">Hypothèses · limites · ce que j'ai tranché</w:t>
+            </w:r>
+          </w:p>
+        </w:tc>
+        <w:tc>
+          <w:tcPr>
+            <w:tcW w:type="dxa" w:w="1300"/>
+            <w:tcBorders>
+              <w:top w:val="single" w:color="D9D5CB" w:sz="4"/>
+              <w:left w:val="single" w:color="D9D5CB" w:sz="4"/>
+              <w:bottom w:val="single" w:color="D9D5CB" w:sz="4"/>
+              <w:right w:val="single" w:color="D9D5CB" w:sz="4"/>
+            </w:tcBorders>
+            <w:shd w:fill="14213D" w:color="auto" w:val="clear"/>
+            <w:tcMar>
+              <w:top w:type="dxa" w:w="60"/>
+              <w:left w:type="dxa" w:w="90"/>
+              <w:bottom w:type="dxa" w:w="60"/>
+              <w:right w:type="dxa" w:w="90"/>
+            </w:tcMar>
+            <w:vAlign w:val="top"/>
+          </w:tcPr>
+          <w:p>
+            <w:pPr>
+              <w:spacing w:after="80" w:line="264"/>
+            </w:pPr>
+            <w:r>
+              <w:rPr>
+                <w:rFonts w:ascii="Calibri" w:cs="Calibri" w:eastAsia="Calibri" w:hAnsi="Calibri"/>
+                <w:b/>
+                <w:bCs/>
+                <w:color w:val="FFFFFF"/>
+                <w:sz w:val="19"/>
+                <w:szCs w:val="19"/>
+              </w:rPr>
+              <w:t xml:space="preserve">Statut</w:t>
+            </w:r>
+          </w:p>
+        </w:tc>
+        <w:tc>
+          <w:tcPr>
+            <w:tcW w:type="dxa" w:w="3700"/>
+            <w:tcBorders>
+              <w:top w:val="single" w:color="D9D5CB" w:sz="4"/>
+              <w:left w:val="single" w:color="D9D5CB" w:sz="4"/>
+              <w:bottom w:val="single" w:color="D9D5CB" w:sz="4"/>
+              <w:right w:val="single" w:color="D9D5CB" w:sz="4"/>
+            </w:tcBorders>
+            <w:shd w:fill="14213D" w:color="auto" w:val="clear"/>
+            <w:tcMar>
+              <w:top w:type="dxa" w:w="60"/>
+              <w:left w:type="dxa" w:w="90"/>
+              <w:bottom w:type="dxa" w:w="60"/>
+              <w:right w:type="dxa" w:w="90"/>
+            </w:tcMar>
+            <w:vAlign w:val="top"/>
+          </w:tcPr>
+          <w:p>
+            <w:pPr>
+              <w:spacing w:after="80" w:line="264"/>
+            </w:pPr>
+            <w:r>
+              <w:rPr>
+                <w:rFonts w:ascii="Calibri" w:cs="Calibri" w:eastAsia="Calibri" w:hAnsi="Calibri"/>
+                <w:b/>
+                <w:bCs/>
+                <w:color w:val="FFFFFF"/>
+                <w:sz w:val="19"/>
+                <w:szCs w:val="19"/>
+              </w:rPr>
+              <w:t xml:space="preserve">Vos commentaires</w:t>
+            </w:r>
+          </w:p>
+        </w:tc>
+      </w:tr>
+      <w:tr>
+        <w:tc>
+          <w:tcPr>
+            <w:tcW w:type="dxa" w:w="2300"/>
+            <w:tcBorders>
+              <w:top w:val="single" w:color="D9D5CB" w:sz="4"/>
+              <w:left w:val="single" w:color="D9D5CB" w:sz="4"/>
+              <w:bottom w:val="single" w:color="D9D5CB" w:sz="4"/>
+              <w:right w:val="single" w:color="D9D5CB" w:sz="4"/>
+            </w:tcBorders>
+            <w:tcMar>
+              <w:top w:type="dxa" w:w="60"/>
+              <w:left w:type="dxa" w:w="90"/>
+              <w:bottom w:type="dxa" w:w="60"/>
+              <w:right w:type="dxa" w:w="90"/>
+            </w:tcMar>
+            <w:vAlign w:val="top"/>
+          </w:tcPr>
+          <w:p>
+            <w:pPr>
+              <w:spacing w:after="40"/>
+            </w:pPr>
+            <w:r>
+              <w:rPr>
+                <w:rFonts w:ascii="Calibri" w:cs="Calibri" w:eastAsia="Calibri" w:hAnsi="Calibri"/>
+                <w:b/>
+                <w:bCs/>
+                <w:color w:val="14213D"/>
+                <w:sz w:val="20"/>
+                <w:szCs w:val="20"/>
+              </w:rPr>
+              <w:t xml:space="preserve">Six onglets, Équipes renommé</w:t>
+            </w:r>
+          </w:p>
+        </w:tc>
+        <w:tc>
+          <w:tcPr>
+            <w:tcW w:type="dxa" w:w="4100"/>
+            <w:tcBorders>
+              <w:top w:val="single" w:color="D9D5CB" w:sz="4"/>
+              <w:left w:val="single" w:color="D9D5CB" w:sz="4"/>
+              <w:bottom w:val="single" w:color="D9D5CB" w:sz="4"/>
+              <w:right w:val="single" w:color="D9D5CB" w:sz="4"/>
+            </w:tcBorders>
+            <w:tcMar>
+              <w:top w:type="dxa" w:w="60"/>
+              <w:left w:type="dxa" w:w="90"/>
+              <w:bottom w:type="dxa" w:w="60"/>
+              <w:right w:type="dxa" w:w="90"/>
+            </w:tcMar>
+            <w:vAlign w:val="top"/>
+          </w:tcPr>
+          <w:p>
+            <w:pPr>
+              <w:spacing w:after="40"/>
+            </w:pPr>
+            <w:r>
+              <w:rPr>
+                <w:rFonts w:ascii="Calibri" w:cs="Calibri" w:eastAsia="Calibri" w:hAnsi="Calibri"/>
+                <w:color w:val="14213D"/>
+                <w:sz w:val="19"/>
+                <w:szCs w:val="19"/>
+              </w:rPr>
+              <w:t xml:space="preserve">Barre du bas : Aujourd'hui · Chantiers · Moi · Commerce · Parc · Entreprise. Chantiers = Carte · Liste · Équipes &amp; heures · Sécurité (sous-onglets, encadrement seulement). Karim (soudeur) : 4 onglets, Carte / Liste seulement.</w:t>
+            </w:r>
+          </w:p>
+        </w:tc>
+        <w:tc>
+          <w:tcPr>
+            <w:tcW w:type="dxa" w:w="3700"/>
+            <w:tcBorders>
+              <w:top w:val="single" w:color="D9D5CB" w:sz="4"/>
+              <w:left w:val="single" w:color="D9D5CB" w:sz="4"/>
+              <w:bottom w:val="single" w:color="D9D5CB" w:sz="4"/>
+              <w:right w:val="single" w:color="D9D5CB" w:sz="4"/>
+            </w:tcBorders>
+            <w:tcMar>
+              <w:top w:type="dxa" w:w="60"/>
+              <w:left w:type="dxa" w:w="90"/>
+              <w:bottom w:type="dxa" w:w="60"/>
+              <w:right w:type="dxa" w:w="90"/>
+            </w:tcMar>
+            <w:vAlign w:val="top"/>
+          </w:tcPr>
+          <w:p>
+            <w:pPr>
+              <w:spacing w:after="40"/>
+            </w:pPr>
+            <w:r>
+              <w:rPr>
+                <w:rFonts w:ascii="Calibri" w:cs="Calibri" w:eastAsia="Calibri" w:hAnsi="Calibri"/>
+                <w:color w:val="14213D"/>
+                <w:sz w:val="19"/>
+                <w:szCs w:val="19"/>
+              </w:rPr>
+              <w:t xml:space="preserve">« Équipes &amp; heures » = tout ce qui touche aux gens sur les chantiers (planning, heures, paie, achats) ; « Sécurité » à part pour que ce soit visible.</w:t>
+            </w:r>
+          </w:p>
+        </w:tc>
+        <w:tc>
+          <w:tcPr>
+            <w:tcW w:type="dxa" w:w="1300"/>
+            <w:tcBorders>
+              <w:top w:val="single" w:color="D9D5CB" w:sz="4"/>
+              <w:left w:val="single" w:color="D9D5CB" w:sz="4"/>
+              <w:bottom w:val="single" w:color="D9D5CB" w:sz="4"/>
+              <w:right w:val="single" w:color="D9D5CB" w:sz="4"/>
+            </w:tcBorders>
+            <w:shd w:fill="E6F5EC" w:color="auto" w:val="clear"/>
+            <w:tcMar>
+              <w:top w:type="dxa" w:w="60"/>
+              <w:left w:type="dxa" w:w="90"/>
+              <w:bottom w:type="dxa" w:w="60"/>
+              <w:right w:type="dxa" w:w="90"/>
+            </w:tcMar>
+            <w:vAlign w:val="top"/>
+          </w:tcPr>
+          <w:p>
+            <w:pPr>
+              <w:spacing w:after="40"/>
+            </w:pPr>
+            <w:r>
+              <w:rPr>
+                <w:rFonts w:ascii="Calibri" w:cs="Calibri" w:eastAsia="Calibri" w:hAnsi="Calibri"/>
+                <w:b/>
+                <w:bCs/>
+                <w:color w:val="14213D"/>
+                <w:sz w:val="19"/>
+                <w:szCs w:val="19"/>
+              </w:rPr>
+              <w:t xml:space="preserve">Fait</w:t>
+            </w:r>
+          </w:p>
+        </w:tc>
+        <w:tc>
+          <w:tcPr>
+            <w:tcW w:type="dxa" w:w="3700"/>
+            <w:tcBorders>
+              <w:top w:val="single" w:color="D9D5CB" w:sz="4"/>
+              <w:left w:val="single" w:color="D9D5CB" w:sz="4"/>
+              <w:bottom w:val="single" w:color="D9D5CB" w:sz="4"/>
+              <w:right w:val="single" w:color="D9D5CB" w:sz="4"/>
+            </w:tcBorders>
+            <w:tcMar>
+              <w:top w:type="dxa" w:w="60"/>
+              <w:left w:type="dxa" w:w="90"/>
+              <w:bottom w:type="dxa" w:w="60"/>
+              <w:right w:type="dxa" w:w="90"/>
+            </w:tcMar>
+            <w:vAlign w:val="top"/>
+          </w:tcPr>
+          <w:p>
+            <w:pPr>
+              <w:spacing w:after="40"/>
+            </w:pPr>
+            <w:r>
+              <w:rPr>
+                <w:rFonts w:ascii="Calibri" w:cs="Calibri" w:eastAsia="Calibri" w:hAnsi="Calibri"/>
+                <w:color w:val="14213D"/>
+                <w:sz w:val="20"/>
+                <w:szCs w:val="20"/>
+              </w:rPr>
+              <w:t xml:space="preserve"/>
+            </w:r>
+          </w:p>
+          <w:p>
+            <w:pPr>
+              <w:spacing w:after="40"/>
+            </w:pPr>
+            <w:r>
+              <w:rPr>
+                <w:rFonts w:ascii="Calibri" w:cs="Calibri" w:eastAsia="Calibri" w:hAnsi="Calibri"/>
+                <w:color w:val="14213D"/>
+                <w:sz w:val="20"/>
+                <w:szCs w:val="20"/>
+              </w:rPr>
+              <w:t xml:space="preserve"/>
+            </w:r>
+          </w:p>
+        </w:tc>
+      </w:tr>
+      <w:tr>
+        <w:tc>
+          <w:tcPr>
+            <w:tcW w:type="dxa" w:w="2300"/>
+            <w:tcBorders>
+              <w:top w:val="single" w:color="D9D5CB" w:sz="4"/>
+              <w:left w:val="single" w:color="D9D5CB" w:sz="4"/>
+              <w:bottom w:val="single" w:color="D9D5CB" w:sz="4"/>
+              <w:right w:val="single" w:color="D9D5CB" w:sz="4"/>
+            </w:tcBorders>
+            <w:tcMar>
+              <w:top w:type="dxa" w:w="60"/>
+              <w:left w:type="dxa" w:w="90"/>
+              <w:bottom w:type="dxa" w:w="60"/>
+              <w:right w:type="dxa" w:w="90"/>
+            </w:tcMar>
+            <w:vAlign w:val="top"/>
+          </w:tcPr>
+          <w:p>
+            <w:pPr>
+              <w:spacing w:after="40"/>
+            </w:pPr>
+            <w:r>
+              <w:rPr>
+                <w:rFonts w:ascii="Calibri" w:cs="Calibri" w:eastAsia="Calibri" w:hAnsi="Calibri"/>
+                <w:b/>
+                <w:bCs/>
+                <w:color w:val="14213D"/>
+                <w:sz w:val="20"/>
+                <w:szCs w:val="20"/>
+              </w:rPr>
+              <w:t xml:space="preserve">Entreprise n'est plus un fourre-tout</w:t>
+            </w:r>
+          </w:p>
+        </w:tc>
+        <w:tc>
+          <w:tcPr>
+            <w:tcW w:type="dxa" w:w="4100"/>
+            <w:tcBorders>
+              <w:top w:val="single" w:color="D9D5CB" w:sz="4"/>
+              <w:left w:val="single" w:color="D9D5CB" w:sz="4"/>
+              <w:bottom w:val="single" w:color="D9D5CB" w:sz="4"/>
+              <w:right w:val="single" w:color="D9D5CB" w:sz="4"/>
+            </w:tcBorders>
+            <w:tcMar>
+              <w:top w:type="dxa" w:w="60"/>
+              <w:left w:type="dxa" w:w="90"/>
+              <w:bottom w:type="dxa" w:w="60"/>
+              <w:right w:type="dxa" w:w="90"/>
+            </w:tcMar>
+            <w:vAlign w:val="top"/>
+          </w:tcPr>
+          <w:p>
+            <w:pPr>
+              <w:spacing w:after="40"/>
+            </w:pPr>
+            <w:r>
+              <w:rPr>
+                <w:rFonts w:ascii="Calibri" w:cs="Calibri" w:eastAsia="Calibri" w:hAnsi="Calibri"/>
+                <w:color w:val="14213D"/>
+                <w:sz w:val="19"/>
+                <w:szCs w:val="19"/>
+              </w:rPr>
+              <w:t xml:space="preserve">Entreprise : Annuaire · Documents d'entreprise · Communication interne · Présentation de l'entreprise · Outils. Les contrôles chantier sont dans Sécurité (plus en double), le tableau de bord des chantiers sous la carte, les bons de commande et comptes chantier dans Équipes &amp; heures, les notes de frais dans Moi, les affaires dans Commerce, la flotte dans Parc.</w:t>
+            </w:r>
+          </w:p>
+        </w:tc>
+        <w:tc>
+          <w:tcPr>
+            <w:tcW w:type="dxa" w:w="3700"/>
+            <w:tcBorders>
+              <w:top w:val="single" w:color="D9D5CB" w:sz="4"/>
+              <w:left w:val="single" w:color="D9D5CB" w:sz="4"/>
+              <w:bottom w:val="single" w:color="D9D5CB" w:sz="4"/>
+              <w:right w:val="single" w:color="D9D5CB" w:sz="4"/>
+            </w:tcBorders>
+            <w:tcMar>
+              <w:top w:type="dxa" w:w="60"/>
+              <w:left w:type="dxa" w:w="90"/>
+              <w:bottom w:type="dxa" w:w="60"/>
+              <w:right w:type="dxa" w:w="90"/>
+            </w:tcMar>
+            <w:vAlign w:val="top"/>
+          </w:tcPr>
+          <w:p>
+            <w:pPr>
+              <w:spacing w:after="40"/>
+            </w:pPr>
+            <w:r>
+              <w:rPr>
+                <w:rFonts w:ascii="Calibri" w:cs="Calibri" w:eastAsia="Calibri" w:hAnsi="Calibri"/>
+                <w:color w:val="14213D"/>
+                <w:sz w:val="19"/>
+                <w:szCs w:val="19"/>
+              </w:rPr>
+              <w:t xml:space="preserve"/>
+            </w:r>
+          </w:p>
+        </w:tc>
+        <w:tc>
+          <w:tcPr>
+            <w:tcW w:type="dxa" w:w="1300"/>
+            <w:tcBorders>
+              <w:top w:val="single" w:color="D9D5CB" w:sz="4"/>
+              <w:left w:val="single" w:color="D9D5CB" w:sz="4"/>
+              <w:bottom w:val="single" w:color="D9D5CB" w:sz="4"/>
+              <w:right w:val="single" w:color="D9D5CB" w:sz="4"/>
+            </w:tcBorders>
+            <w:shd w:fill="E6F5EC" w:color="auto" w:val="clear"/>
+            <w:tcMar>
+              <w:top w:type="dxa" w:w="60"/>
+              <w:left w:type="dxa" w:w="90"/>
+              <w:bottom w:type="dxa" w:w="60"/>
+              <w:right w:type="dxa" w:w="90"/>
+            </w:tcMar>
+            <w:vAlign w:val="top"/>
+          </w:tcPr>
+          <w:p>
+            <w:pPr>
+              <w:spacing w:after="40"/>
+            </w:pPr>
+            <w:r>
+              <w:rPr>
+                <w:rFonts w:ascii="Calibri" w:cs="Calibri" w:eastAsia="Calibri" w:hAnsi="Calibri"/>
+                <w:b/>
+                <w:bCs/>
+                <w:color w:val="14213D"/>
+                <w:sz w:val="19"/>
+                <w:szCs w:val="19"/>
+              </w:rPr>
+              <w:t xml:space="preserve">Fait</w:t>
+            </w:r>
+          </w:p>
+        </w:tc>
+        <w:tc>
+          <w:tcPr>
+            <w:tcW w:type="dxa" w:w="3700"/>
+            <w:tcBorders>
+              <w:top w:val="single" w:color="D9D5CB" w:sz="4"/>
+              <w:left w:val="single" w:color="D9D5CB" w:sz="4"/>
+              <w:bottom w:val="single" w:color="D9D5CB" w:sz="4"/>
+              <w:right w:val="single" w:color="D9D5CB" w:sz="4"/>
+            </w:tcBorders>
+            <w:tcMar>
+              <w:top w:type="dxa" w:w="60"/>
+              <w:left w:type="dxa" w:w="90"/>
+              <w:bottom w:type="dxa" w:w="60"/>
+              <w:right w:type="dxa" w:w="90"/>
+            </w:tcMar>
+            <w:vAlign w:val="top"/>
+          </w:tcPr>
+          <w:p>
+            <w:pPr>
+              <w:spacing w:after="40"/>
+            </w:pPr>
+            <w:r>
+              <w:rPr>
+                <w:rFonts w:ascii="Calibri" w:cs="Calibri" w:eastAsia="Calibri" w:hAnsi="Calibri"/>
+                <w:color w:val="14213D"/>
+                <w:sz w:val="20"/>
+                <w:szCs w:val="20"/>
+              </w:rPr>
+              <w:t xml:space="preserve"/>
+            </w:r>
+          </w:p>
+          <w:p>
+            <w:pPr>
+              <w:spacing w:after="40"/>
+            </w:pPr>
+            <w:r>
+              <w:rPr>
+                <w:rFonts w:ascii="Calibri" w:cs="Calibri" w:eastAsia="Calibri" w:hAnsi="Calibri"/>
+                <w:color w:val="14213D"/>
+                <w:sz w:val="20"/>
+                <w:szCs w:val="20"/>
+              </w:rPr>
+              <w:t xml:space="preserve"/>
+            </w:r>
+          </w:p>
+        </w:tc>
+      </w:tr>
+      <w:tr>
+        <w:tc>
+          <w:tcPr>
+            <w:tcW w:type="dxa" w:w="2300"/>
+            <w:tcBorders>
+              <w:top w:val="single" w:color="D9D5CB" w:sz="4"/>
+              <w:left w:val="single" w:color="D9D5CB" w:sz="4"/>
+              <w:bottom w:val="single" w:color="D9D5CB" w:sz="4"/>
+              <w:right w:val="single" w:color="D9D5CB" w:sz="4"/>
+            </w:tcBorders>
+            <w:tcMar>
+              <w:top w:type="dxa" w:w="60"/>
+              <w:left w:type="dxa" w:w="90"/>
+              <w:bottom w:type="dxa" w:w="60"/>
+              <w:right w:type="dxa" w:w="90"/>
+            </w:tcMar>
+            <w:vAlign w:val="top"/>
+          </w:tcPr>
+          <w:p>
+            <w:pPr>
+              <w:spacing w:after="40"/>
+            </w:pPr>
+            <w:r>
+              <w:rPr>
+                <w:rFonts w:ascii="Calibri" w:cs="Calibri" w:eastAsia="Calibri" w:hAnsi="Calibri"/>
+                <w:b/>
+                <w:bCs/>
+                <w:color w:val="14213D"/>
+                <w:sz w:val="20"/>
+                <w:szCs w:val="20"/>
+              </w:rPr>
+              <w:t xml:space="preserve">Communication interne (publiable)</w:t>
+            </w:r>
+          </w:p>
+        </w:tc>
+        <w:tc>
+          <w:tcPr>
+            <w:tcW w:type="dxa" w:w="4100"/>
+            <w:tcBorders>
+              <w:top w:val="single" w:color="D9D5CB" w:sz="4"/>
+              <w:left w:val="single" w:color="D9D5CB" w:sz="4"/>
+              <w:bottom w:val="single" w:color="D9D5CB" w:sz="4"/>
+              <w:right w:val="single" w:color="D9D5CB" w:sz="4"/>
+            </w:tcBorders>
+            <w:tcMar>
+              <w:top w:type="dxa" w:w="60"/>
+              <w:left w:type="dxa" w:w="90"/>
+              <w:bottom w:type="dxa" w:w="60"/>
+              <w:right w:type="dxa" w:w="90"/>
+            </w:tcMar>
+            <w:vAlign w:val="top"/>
+          </w:tcPr>
+          <w:p>
+            <w:pPr>
+              <w:spacing w:after="40"/>
+            </w:pPr>
+            <w:r>
+              <w:rPr>
+                <w:rFonts w:ascii="Calibri" w:cs="Calibri" w:eastAsia="Calibri" w:hAnsi="Calibri"/>
+                <w:color w:val="14213D"/>
+                <w:sz w:val="19"/>
+                <w:szCs w:val="19"/>
+              </w:rPr>
+              <w:t xml:space="preserve">Entreprise → Communication interne → « Publier une info » (titre, texte, PDF en option) : visible par tout le monde, SANS signature, jamais dans « à lire et signer ». Publie : QSE, RH, direction, administrateur. Présentation de l'entreprise : une page (métier, chiffres, organisation, valeurs) modifiable par la direction, « la page qu'on montre à un nouvel arrivant ».</w:t>
+            </w:r>
+          </w:p>
+        </w:tc>
+        <w:tc>
+          <w:tcPr>
+            <w:tcW w:type="dxa" w:w="3700"/>
+            <w:tcBorders>
+              <w:top w:val="single" w:color="D9D5CB" w:sz="4"/>
+              <w:left w:val="single" w:color="D9D5CB" w:sz="4"/>
+              <w:bottom w:val="single" w:color="D9D5CB" w:sz="4"/>
+              <w:right w:val="single" w:color="D9D5CB" w:sz="4"/>
+            </w:tcBorders>
+            <w:tcMar>
+              <w:top w:type="dxa" w:w="60"/>
+              <w:left w:type="dxa" w:w="90"/>
+              <w:bottom w:type="dxa" w:w="60"/>
+              <w:right w:type="dxa" w:w="90"/>
+            </w:tcMar>
+            <w:vAlign w:val="top"/>
+          </w:tcPr>
+          <w:p>
+            <w:pPr>
+              <w:spacing w:after="40"/>
+            </w:pPr>
+            <w:r>
+              <w:rPr>
+                <w:rFonts w:ascii="Calibri" w:cs="Calibri" w:eastAsia="Calibri" w:hAnsi="Calibri"/>
+                <w:color w:val="14213D"/>
+                <w:sz w:val="19"/>
+                <w:szCs w:val="19"/>
+              </w:rPr>
+              <w:t xml:space="preserve">Les documents à signer (règlement, notes de service, flash info) restent dans Documents d'entreprise.</w:t>
+            </w:r>
+          </w:p>
+        </w:tc>
+        <w:tc>
+          <w:tcPr>
+            <w:tcW w:type="dxa" w:w="1300"/>
+            <w:tcBorders>
+              <w:top w:val="single" w:color="D9D5CB" w:sz="4"/>
+              <w:left w:val="single" w:color="D9D5CB" w:sz="4"/>
+              <w:bottom w:val="single" w:color="D9D5CB" w:sz="4"/>
+              <w:right w:val="single" w:color="D9D5CB" w:sz="4"/>
+            </w:tcBorders>
+            <w:shd w:fill="E6F5EC" w:color="auto" w:val="clear"/>
+            <w:tcMar>
+              <w:top w:type="dxa" w:w="60"/>
+              <w:left w:type="dxa" w:w="90"/>
+              <w:bottom w:type="dxa" w:w="60"/>
+              <w:right w:type="dxa" w:w="90"/>
+            </w:tcMar>
+            <w:vAlign w:val="top"/>
+          </w:tcPr>
+          <w:p>
+            <w:pPr>
+              <w:spacing w:after="40"/>
+            </w:pPr>
+            <w:r>
+              <w:rPr>
+                <w:rFonts w:ascii="Calibri" w:cs="Calibri" w:eastAsia="Calibri" w:hAnsi="Calibri"/>
+                <w:b/>
+                <w:bCs/>
+                <w:color w:val="14213D"/>
+                <w:sz w:val="19"/>
+                <w:szCs w:val="19"/>
+              </w:rPr>
+              <w:t xml:space="preserve">Fait</w:t>
+            </w:r>
+          </w:p>
+        </w:tc>
+        <w:tc>
+          <w:tcPr>
+            <w:tcW w:type="dxa" w:w="3700"/>
+            <w:tcBorders>
+              <w:top w:val="single" w:color="D9D5CB" w:sz="4"/>
+              <w:left w:val="single" w:color="D9D5CB" w:sz="4"/>
+              <w:bottom w:val="single" w:color="D9D5CB" w:sz="4"/>
+              <w:right w:val="single" w:color="D9D5CB" w:sz="4"/>
+            </w:tcBorders>
+            <w:tcMar>
+              <w:top w:type="dxa" w:w="60"/>
+              <w:left w:type="dxa" w:w="90"/>
+              <w:bottom w:type="dxa" w:w="60"/>
+              <w:right w:type="dxa" w:w="90"/>
+            </w:tcMar>
+            <w:vAlign w:val="top"/>
+          </w:tcPr>
+          <w:p>
+            <w:pPr>
+              <w:spacing w:after="40"/>
+            </w:pPr>
+            <w:r>
+              <w:rPr>
+                <w:rFonts w:ascii="Calibri" w:cs="Calibri" w:eastAsia="Calibri" w:hAnsi="Calibri"/>
+                <w:color w:val="14213D"/>
+                <w:sz w:val="20"/>
+                <w:szCs w:val="20"/>
+              </w:rPr>
+              <w:t xml:space="preserve"/>
+            </w:r>
+          </w:p>
+          <w:p>
+            <w:pPr>
+              <w:spacing w:after="40"/>
+            </w:pPr>
+            <w:r>
+              <w:rPr>
+                <w:rFonts w:ascii="Calibri" w:cs="Calibri" w:eastAsia="Calibri" w:hAnsi="Calibri"/>
+                <w:color w:val="14213D"/>
+                <w:sz w:val="20"/>
+                <w:szCs w:val="20"/>
+              </w:rPr>
+              <w:t xml:space="preserve"/>
+            </w:r>
+          </w:p>
+        </w:tc>
+      </w:tr>
+      <w:tr>
+        <w:tc>
+          <w:tcPr>
+            <w:tcW w:type="dxa" w:w="2300"/>
+            <w:tcBorders>
+              <w:top w:val="single" w:color="D9D5CB" w:sz="4"/>
+              <w:left w:val="single" w:color="D9D5CB" w:sz="4"/>
+              <w:bottom w:val="single" w:color="D9D5CB" w:sz="4"/>
+              <w:right w:val="single" w:color="D9D5CB" w:sz="4"/>
+            </w:tcBorders>
+            <w:tcMar>
+              <w:top w:type="dxa" w:w="60"/>
+              <w:left w:type="dxa" w:w="90"/>
+              <w:bottom w:type="dxa" w:w="60"/>
+              <w:right w:type="dxa" w:w="90"/>
+            </w:tcMar>
+            <w:vAlign w:val="top"/>
+          </w:tcPr>
+          <w:p>
+            <w:pPr>
+              <w:spacing w:after="40"/>
+            </w:pPr>
+            <w:r>
+              <w:rPr>
+                <w:rFonts w:ascii="Calibri" w:cs="Calibri" w:eastAsia="Calibri" w:hAnsi="Calibri"/>
+                <w:b/>
+                <w:bCs/>
+                <w:color w:val="14213D"/>
+                <w:sz w:val="20"/>
+                <w:szCs w:val="20"/>
+              </w:rPr>
+              <w:t xml:space="preserve">Doublon « Mes chantiers → tableau de bord » retiré</w:t>
+            </w:r>
+          </w:p>
+        </w:tc>
+        <w:tc>
+          <w:tcPr>
+            <w:tcW w:type="dxa" w:w="4100"/>
+            <w:tcBorders>
+              <w:top w:val="single" w:color="D9D5CB" w:sz="4"/>
+              <w:left w:val="single" w:color="D9D5CB" w:sz="4"/>
+              <w:bottom w:val="single" w:color="D9D5CB" w:sz="4"/>
+              <w:right w:val="single" w:color="D9D5CB" w:sz="4"/>
+            </w:tcBorders>
+            <w:tcMar>
+              <w:top w:type="dxa" w:w="60"/>
+              <w:left w:type="dxa" w:w="90"/>
+              <w:bottom w:type="dxa" w:w="60"/>
+              <w:right w:type="dxa" w:w="90"/>
+            </w:tcMar>
+            <w:vAlign w:val="top"/>
+          </w:tcPr>
+          <w:p>
+            <w:pPr>
+              <w:spacing w:after="40"/>
+            </w:pPr>
+            <w:r>
+              <w:rPr>
+                <w:rFonts w:ascii="Calibri" w:cs="Calibri" w:eastAsia="Calibri" w:hAnsi="Calibri"/>
+                <w:color w:val="14213D"/>
+                <w:sz w:val="19"/>
+                <w:szCs w:val="19"/>
+              </w:rPr>
+              <w:t xml:space="preserve">Chantiers → Carte : sous la carte, « Mes chantiers » = une carte par chantier (% soudé, chef, présents aujourd'hui, objectifs, ✓ n / 16, ce qui coince), les tiens d'abord, les autres repliés. Toucher la carte ENTRE dans le chantier sur le Bureau (même checklist). Plus de bouton « 📊 Tableau de bord » sur les cartes, plus de ligne « Mes chantiers » dans le hub.</w:t>
+            </w:r>
+          </w:p>
+        </w:tc>
+        <w:tc>
+          <w:tcPr>
+            <w:tcW w:type="dxa" w:w="3700"/>
+            <w:tcBorders>
+              <w:top w:val="single" w:color="D9D5CB" w:sz="4"/>
+              <w:left w:val="single" w:color="D9D5CB" w:sz="4"/>
+              <w:bottom w:val="single" w:color="D9D5CB" w:sz="4"/>
+              <w:right w:val="single" w:color="D9D5CB" w:sz="4"/>
+            </w:tcBorders>
+            <w:tcMar>
+              <w:top w:type="dxa" w:w="60"/>
+              <w:left w:type="dxa" w:w="90"/>
+              <w:bottom w:type="dxa" w:w="60"/>
+              <w:right w:type="dxa" w:w="90"/>
+            </w:tcMar>
+            <w:vAlign w:val="top"/>
+          </w:tcPr>
+          <w:p>
+            <w:pPr>
+              <w:spacing w:after="40"/>
+            </w:pPr>
+            <w:r>
+              <w:rPr>
+                <w:rFonts w:ascii="Calibri" w:cs="Calibri" w:eastAsia="Calibri" w:hAnsi="Calibri"/>
+                <w:color w:val="14213D"/>
+                <w:sz w:val="19"/>
+                <w:szCs w:val="19"/>
+              </w:rPr>
+              <w:t xml:space="preserve">Un chantier jamais ouvert sur l'appareil : récap léger (nom, chef, présents) jusqu'à la première ouverture.</w:t>
+            </w:r>
+          </w:p>
+        </w:tc>
+        <w:tc>
+          <w:tcPr>
+            <w:tcW w:type="dxa" w:w="1300"/>
+            <w:tcBorders>
+              <w:top w:val="single" w:color="D9D5CB" w:sz="4"/>
+              <w:left w:val="single" w:color="D9D5CB" w:sz="4"/>
+              <w:bottom w:val="single" w:color="D9D5CB" w:sz="4"/>
+              <w:right w:val="single" w:color="D9D5CB" w:sz="4"/>
+            </w:tcBorders>
+            <w:shd w:fill="E6F5EC" w:color="auto" w:val="clear"/>
+            <w:tcMar>
+              <w:top w:type="dxa" w:w="60"/>
+              <w:left w:type="dxa" w:w="90"/>
+              <w:bottom w:type="dxa" w:w="60"/>
+              <w:right w:type="dxa" w:w="90"/>
+            </w:tcMar>
+            <w:vAlign w:val="top"/>
+          </w:tcPr>
+          <w:p>
+            <w:pPr>
+              <w:spacing w:after="40"/>
+            </w:pPr>
+            <w:r>
+              <w:rPr>
+                <w:rFonts w:ascii="Calibri" w:cs="Calibri" w:eastAsia="Calibri" w:hAnsi="Calibri"/>
+                <w:b/>
+                <w:bCs/>
+                <w:color w:val="14213D"/>
+                <w:sz w:val="19"/>
+                <w:szCs w:val="19"/>
+              </w:rPr>
+              <w:t xml:space="preserve">Fait</w:t>
+            </w:r>
+          </w:p>
+        </w:tc>
+        <w:tc>
+          <w:tcPr>
+            <w:tcW w:type="dxa" w:w="3700"/>
+            <w:tcBorders>
+              <w:top w:val="single" w:color="D9D5CB" w:sz="4"/>
+              <w:left w:val="single" w:color="D9D5CB" w:sz="4"/>
+              <w:bottom w:val="single" w:color="D9D5CB" w:sz="4"/>
+              <w:right w:val="single" w:color="D9D5CB" w:sz="4"/>
+            </w:tcBorders>
+            <w:tcMar>
+              <w:top w:type="dxa" w:w="60"/>
+              <w:left w:type="dxa" w:w="90"/>
+              <w:bottom w:type="dxa" w:w="60"/>
+              <w:right w:type="dxa" w:w="90"/>
+            </w:tcMar>
+            <w:vAlign w:val="top"/>
+          </w:tcPr>
+          <w:p>
+            <w:pPr>
+              <w:spacing w:after="40"/>
+            </w:pPr>
+            <w:r>
+              <w:rPr>
+                <w:rFonts w:ascii="Calibri" w:cs="Calibri" w:eastAsia="Calibri" w:hAnsi="Calibri"/>
+                <w:color w:val="14213D"/>
+                <w:sz w:val="20"/>
+                <w:szCs w:val="20"/>
+              </w:rPr>
+              <w:t xml:space="preserve"/>
+            </w:r>
+          </w:p>
+          <w:p>
+            <w:pPr>
+              <w:spacing w:after="40"/>
+            </w:pPr>
+            <w:r>
+              <w:rPr>
+                <w:rFonts w:ascii="Calibri" w:cs="Calibri" w:eastAsia="Calibri" w:hAnsi="Calibri"/>
+                <w:color w:val="14213D"/>
+                <w:sz w:val="20"/>
+                <w:szCs w:val="20"/>
+              </w:rPr>
+              <w:t xml:space="preserve"/>
+            </w:r>
+          </w:p>
+        </w:tc>
+      </w:tr>
+      <w:tr>
+        <w:tc>
+          <w:tcPr>
+            <w:tcW w:type="dxa" w:w="2300"/>
+            <w:tcBorders>
+              <w:top w:val="single" w:color="D9D5CB" w:sz="4"/>
+              <w:left w:val="single" w:color="D9D5CB" w:sz="4"/>
+              <w:bottom w:val="single" w:color="D9D5CB" w:sz="4"/>
+              <w:right w:val="single" w:color="D9D5CB" w:sz="4"/>
+            </w:tcBorders>
+            <w:tcMar>
+              <w:top w:type="dxa" w:w="60"/>
+              <w:left w:type="dxa" w:w="90"/>
+              <w:bottom w:type="dxa" w:w="60"/>
+              <w:right w:type="dxa" w:w="90"/>
+            </w:tcMar>
+            <w:vAlign w:val="top"/>
+          </w:tcPr>
+          <w:p>
+            <w:pPr>
+              <w:spacing w:after="40"/>
+            </w:pPr>
+            <w:r>
+              <w:rPr>
+                <w:rFonts w:ascii="Calibri" w:cs="Calibri" w:eastAsia="Calibri" w:hAnsi="Calibri"/>
+                <w:b/>
+                <w:bCs/>
+                <w:color w:val="14213D"/>
+                <w:sz w:val="20"/>
+                <w:szCs w:val="20"/>
+              </w:rPr>
+              <w:t xml:space="preserve">Notes de frais dans Moi</w:t>
+            </w:r>
+          </w:p>
+        </w:tc>
+        <w:tc>
+          <w:tcPr>
+            <w:tcW w:type="dxa" w:w="4100"/>
+            <w:tcBorders>
+              <w:top w:val="single" w:color="D9D5CB" w:sz="4"/>
+              <w:left w:val="single" w:color="D9D5CB" w:sz="4"/>
+              <w:bottom w:val="single" w:color="D9D5CB" w:sz="4"/>
+              <w:right w:val="single" w:color="D9D5CB" w:sz="4"/>
+            </w:tcBorders>
+            <w:tcMar>
+              <w:top w:type="dxa" w:w="60"/>
+              <w:left w:type="dxa" w:w="90"/>
+              <w:bottom w:type="dxa" w:w="60"/>
+              <w:right w:type="dxa" w:w="90"/>
+            </w:tcMar>
+            <w:vAlign w:val="top"/>
+          </w:tcPr>
+          <w:p>
+            <w:pPr>
+              <w:spacing w:after="40"/>
+            </w:pPr>
+            <w:r>
+              <w:rPr>
+                <w:rFonts w:ascii="Calibri" w:cs="Calibri" w:eastAsia="Calibri" w:hAnsi="Calibri"/>
+                <w:color w:val="14213D"/>
+                <w:sz w:val="19"/>
+                <w:szCs w:val="19"/>
+              </w:rPr>
+              <w:t xml:space="preserve">Moi → Notes de frais (tout le monde) : mes notes, saisie (montant, nature, chantier, photo du ticket). La validation reste à l'encadrement : notification « n notes de frais à valider » → Équipes &amp; heures → Notes de frais à valider (valider, refuser, rembourser).</w:t>
+            </w:r>
+          </w:p>
+        </w:tc>
+        <w:tc>
+          <w:tcPr>
+            <w:tcW w:type="dxa" w:w="3700"/>
+            <w:tcBorders>
+              <w:top w:val="single" w:color="D9D5CB" w:sz="4"/>
+              <w:left w:val="single" w:color="D9D5CB" w:sz="4"/>
+              <w:bottom w:val="single" w:color="D9D5CB" w:sz="4"/>
+              <w:right w:val="single" w:color="D9D5CB" w:sz="4"/>
+            </w:tcBorders>
+            <w:tcMar>
+              <w:top w:type="dxa" w:w="60"/>
+              <w:left w:type="dxa" w:w="90"/>
+              <w:bottom w:type="dxa" w:w="60"/>
+              <w:right w:type="dxa" w:w="90"/>
+            </w:tcMar>
+            <w:vAlign w:val="top"/>
+          </w:tcPr>
+          <w:p>
+            <w:pPr>
+              <w:spacing w:after="40"/>
+            </w:pPr>
+            <w:r>
+              <w:rPr>
+                <w:rFonts w:ascii="Calibri" w:cs="Calibri" w:eastAsia="Calibri" w:hAnsi="Calibri"/>
+                <w:color w:val="14213D"/>
+                <w:sz w:val="19"/>
+                <w:szCs w:val="19"/>
+              </w:rPr>
+              <w:t xml:space="preserve"/>
+            </w:r>
+          </w:p>
+        </w:tc>
+        <w:tc>
+          <w:tcPr>
+            <w:tcW w:type="dxa" w:w="1300"/>
+            <w:tcBorders>
+              <w:top w:val="single" w:color="D9D5CB" w:sz="4"/>
+              <w:left w:val="single" w:color="D9D5CB" w:sz="4"/>
+              <w:bottom w:val="single" w:color="D9D5CB" w:sz="4"/>
+              <w:right w:val="single" w:color="D9D5CB" w:sz="4"/>
+            </w:tcBorders>
+            <w:shd w:fill="E6F5EC" w:color="auto" w:val="clear"/>
+            <w:tcMar>
+              <w:top w:type="dxa" w:w="60"/>
+              <w:left w:type="dxa" w:w="90"/>
+              <w:bottom w:type="dxa" w:w="60"/>
+              <w:right w:type="dxa" w:w="90"/>
+            </w:tcMar>
+            <w:vAlign w:val="top"/>
+          </w:tcPr>
+          <w:p>
+            <w:pPr>
+              <w:spacing w:after="40"/>
+            </w:pPr>
+            <w:r>
+              <w:rPr>
+                <w:rFonts w:ascii="Calibri" w:cs="Calibri" w:eastAsia="Calibri" w:hAnsi="Calibri"/>
+                <w:b/>
+                <w:bCs/>
+                <w:color w:val="14213D"/>
+                <w:sz w:val="19"/>
+                <w:szCs w:val="19"/>
+              </w:rPr>
+              <w:t xml:space="preserve">Fait</w:t>
+            </w:r>
+          </w:p>
+        </w:tc>
+        <w:tc>
+          <w:tcPr>
+            <w:tcW w:type="dxa" w:w="3700"/>
+            <w:tcBorders>
+              <w:top w:val="single" w:color="D9D5CB" w:sz="4"/>
+              <w:left w:val="single" w:color="D9D5CB" w:sz="4"/>
+              <w:bottom w:val="single" w:color="D9D5CB" w:sz="4"/>
+              <w:right w:val="single" w:color="D9D5CB" w:sz="4"/>
+            </w:tcBorders>
+            <w:tcMar>
+              <w:top w:type="dxa" w:w="60"/>
+              <w:left w:type="dxa" w:w="90"/>
+              <w:bottom w:type="dxa" w:w="60"/>
+              <w:right w:type="dxa" w:w="90"/>
+            </w:tcMar>
+            <w:vAlign w:val="top"/>
+          </w:tcPr>
+          <w:p>
+            <w:pPr>
+              <w:spacing w:after="40"/>
+            </w:pPr>
+            <w:r>
+              <w:rPr>
+                <w:rFonts w:ascii="Calibri" w:cs="Calibri" w:eastAsia="Calibri" w:hAnsi="Calibri"/>
+                <w:color w:val="14213D"/>
+                <w:sz w:val="20"/>
+                <w:szCs w:val="20"/>
+              </w:rPr>
+              <w:t xml:space="preserve"/>
+            </w:r>
+          </w:p>
+          <w:p>
+            <w:pPr>
+              <w:spacing w:after="40"/>
+            </w:pPr>
+            <w:r>
+              <w:rPr>
+                <w:rFonts w:ascii="Calibri" w:cs="Calibri" w:eastAsia="Calibri" w:hAnsi="Calibri"/>
+                <w:color w:val="14213D"/>
+                <w:sz w:val="20"/>
+                <w:szCs w:val="20"/>
+              </w:rPr>
+              <w:t xml:space="preserve"/>
+            </w:r>
+          </w:p>
+        </w:tc>
+      </w:tr>
+      <w:tr>
+        <w:tc>
+          <w:tcPr>
+            <w:tcW w:type="dxa" w:w="2300"/>
+            <w:tcBorders>
+              <w:top w:val="single" w:color="D9D5CB" w:sz="4"/>
+              <w:left w:val="single" w:color="D9D5CB" w:sz="4"/>
+              <w:bottom w:val="single" w:color="D9D5CB" w:sz="4"/>
+              <w:right w:val="single" w:color="D9D5CB" w:sz="4"/>
+            </w:tcBorders>
+            <w:tcMar>
+              <w:top w:type="dxa" w:w="60"/>
+              <w:left w:type="dxa" w:w="90"/>
+              <w:bottom w:type="dxa" w:w="60"/>
+              <w:right w:type="dxa" w:w="90"/>
+            </w:tcMar>
+            <w:vAlign w:val="top"/>
+          </w:tcPr>
+          <w:p>
+            <w:pPr>
+              <w:spacing w:after="40"/>
+            </w:pPr>
+            <w:r>
+              <w:rPr>
+                <w:rFonts w:ascii="Calibri" w:cs="Calibri" w:eastAsia="Calibri" w:hAnsi="Calibri"/>
+                <w:b/>
+                <w:bCs/>
+                <w:color w:val="14213D"/>
+                <w:sz w:val="20"/>
+                <w:szCs w:val="20"/>
+              </w:rPr>
+              <w:t xml:space="preserve">Production par équipe (nouvelle vue)</w:t>
+            </w:r>
+          </w:p>
+        </w:tc>
+        <w:tc>
+          <w:tcPr>
+            <w:tcW w:type="dxa" w:w="4100"/>
+            <w:tcBorders>
+              <w:top w:val="single" w:color="D9D5CB" w:sz="4"/>
+              <w:left w:val="single" w:color="D9D5CB" w:sz="4"/>
+              <w:bottom w:val="single" w:color="D9D5CB" w:sz="4"/>
+              <w:right w:val="single" w:color="D9D5CB" w:sz="4"/>
+            </w:tcBorders>
+            <w:tcMar>
+              <w:top w:type="dxa" w:w="60"/>
+              <w:left w:type="dxa" w:w="90"/>
+              <w:bottom w:type="dxa" w:w="60"/>
+              <w:right w:type="dxa" w:w="90"/>
+            </w:tcMar>
+            <w:vAlign w:val="top"/>
+          </w:tcPr>
+          <w:p>
+            <w:pPr>
+              <w:spacing w:after="40"/>
+            </w:pPr>
+            <w:r>
+              <w:rPr>
+                <w:rFonts w:ascii="Calibri" w:cs="Calibri" w:eastAsia="Calibri" w:hAnsi="Calibri"/>
+                <w:color w:val="14213D"/>
+                <w:sz w:val="19"/>
+                <w:szCs w:val="19"/>
+              </w:rPr>
+              <w:t xml:space="preserve">Équipes &amp; heures → Production par équipe : semaine (◀ ▶, S-2 / passée / cette semaine) → chantier → équipe (lettre du planning, chef en tête, comme au planning et comme pour les objectifs) → personne : heures pointées, production (soudures par DN, manchons, fils), soudures / heure ; total de l'équipe = la somme ; 🎯 objectifs de la semaine (missions, heures estimées, soudures visées, faites) en face du réalisé. Le tuyauteur n'additionne pas (production de son soudeur).</w:t>
+            </w:r>
+          </w:p>
+        </w:tc>
+        <w:tc>
+          <w:tcPr>
+            <w:tcW w:type="dxa" w:w="3700"/>
+            <w:tcBorders>
+              <w:top w:val="single" w:color="D9D5CB" w:sz="4"/>
+              <w:left w:val="single" w:color="D9D5CB" w:sz="4"/>
+              <w:bottom w:val="single" w:color="D9D5CB" w:sz="4"/>
+              <w:right w:val="single" w:color="D9D5CB" w:sz="4"/>
+            </w:tcBorders>
+            <w:tcMar>
+              <w:top w:type="dxa" w:w="60"/>
+              <w:left w:type="dxa" w:w="90"/>
+              <w:bottom w:type="dxa" w:w="60"/>
+              <w:right w:type="dxa" w:w="90"/>
+            </w:tcMar>
+            <w:vAlign w:val="top"/>
+          </w:tcPr>
+          <w:p>
+            <w:pPr>
+              <w:spacing w:after="40"/>
+            </w:pPr>
+            <w:r>
+              <w:rPr>
+                <w:rFonts w:ascii="Calibri" w:cs="Calibri" w:eastAsia="Calibri" w:hAnsi="Calibri"/>
+                <w:color w:val="14213D"/>
+                <w:sz w:val="19"/>
+                <w:szCs w:val="19"/>
+              </w:rPr>
+              <w:t xml:space="preserve">C'est ici qu'on voit « production vs heures ». Demo : Karim placé à Caen → 38 soudures lues dans les fiches.</w:t>
+            </w:r>
+          </w:p>
+        </w:tc>
+        <w:tc>
+          <w:tcPr>
+            <w:tcW w:type="dxa" w:w="1300"/>
+            <w:tcBorders>
+              <w:top w:val="single" w:color="D9D5CB" w:sz="4"/>
+              <w:left w:val="single" w:color="D9D5CB" w:sz="4"/>
+              <w:bottom w:val="single" w:color="D9D5CB" w:sz="4"/>
+              <w:right w:val="single" w:color="D9D5CB" w:sz="4"/>
+            </w:tcBorders>
+            <w:shd w:fill="E6F5EC" w:color="auto" w:val="clear"/>
+            <w:tcMar>
+              <w:top w:type="dxa" w:w="60"/>
+              <w:left w:type="dxa" w:w="90"/>
+              <w:bottom w:type="dxa" w:w="60"/>
+              <w:right w:type="dxa" w:w="90"/>
+            </w:tcMar>
+            <w:vAlign w:val="top"/>
+          </w:tcPr>
+          <w:p>
+            <w:pPr>
+              <w:spacing w:after="40"/>
+            </w:pPr>
+            <w:r>
+              <w:rPr>
+                <w:rFonts w:ascii="Calibri" w:cs="Calibri" w:eastAsia="Calibri" w:hAnsi="Calibri"/>
+                <w:b/>
+                <w:bCs/>
+                <w:color w:val="14213D"/>
+                <w:sz w:val="19"/>
+                <w:szCs w:val="19"/>
+              </w:rPr>
+              <w:t xml:space="preserve">Fait</w:t>
+            </w:r>
+          </w:p>
+        </w:tc>
+        <w:tc>
+          <w:tcPr>
+            <w:tcW w:type="dxa" w:w="3700"/>
+            <w:tcBorders>
+              <w:top w:val="single" w:color="D9D5CB" w:sz="4"/>
+              <w:left w:val="single" w:color="D9D5CB" w:sz="4"/>
+              <w:bottom w:val="single" w:color="D9D5CB" w:sz="4"/>
+              <w:right w:val="single" w:color="D9D5CB" w:sz="4"/>
+            </w:tcBorders>
+            <w:tcMar>
+              <w:top w:type="dxa" w:w="60"/>
+              <w:left w:type="dxa" w:w="90"/>
+              <w:bottom w:type="dxa" w:w="60"/>
+              <w:right w:type="dxa" w:w="90"/>
+            </w:tcMar>
+            <w:vAlign w:val="top"/>
+          </w:tcPr>
+          <w:p>
+            <w:pPr>
+              <w:spacing w:after="40"/>
+            </w:pPr>
+            <w:r>
+              <w:rPr>
+                <w:rFonts w:ascii="Calibri" w:cs="Calibri" w:eastAsia="Calibri" w:hAnsi="Calibri"/>
+                <w:color w:val="14213D"/>
+                <w:sz w:val="20"/>
+                <w:szCs w:val="20"/>
+              </w:rPr>
+              <w:t xml:space="preserve"/>
+            </w:r>
+          </w:p>
+          <w:p>
+            <w:pPr>
+              <w:spacing w:after="40"/>
+            </w:pPr>
+            <w:r>
+              <w:rPr>
+                <w:rFonts w:ascii="Calibri" w:cs="Calibri" w:eastAsia="Calibri" w:hAnsi="Calibri"/>
+                <w:color w:val="14213D"/>
+                <w:sz w:val="20"/>
+                <w:szCs w:val="20"/>
+              </w:rPr>
+              <w:t xml:space="preserve"/>
+            </w:r>
+          </w:p>
+        </w:tc>
+      </w:tr>
+      <w:tr>
+        <w:tc>
+          <w:tcPr>
+            <w:tcW w:type="dxa" w:w="2300"/>
+            <w:tcBorders>
+              <w:top w:val="single" w:color="D9D5CB" w:sz="4"/>
+              <w:left w:val="single" w:color="D9D5CB" w:sz="4"/>
+              <w:bottom w:val="single" w:color="D9D5CB" w:sz="4"/>
+              <w:right w:val="single" w:color="D9D5CB" w:sz="4"/>
+            </w:tcBorders>
+            <w:tcMar>
+              <w:top w:type="dxa" w:w="60"/>
+              <w:left w:type="dxa" w:w="90"/>
+              <w:bottom w:type="dxa" w:w="60"/>
+              <w:right w:type="dxa" w:w="90"/>
+            </w:tcMar>
+            <w:vAlign w:val="top"/>
+          </w:tcPr>
+          <w:p>
+            <w:pPr>
+              <w:spacing w:after="40"/>
+            </w:pPr>
+            <w:r>
+              <w:rPr>
+                <w:rFonts w:ascii="Calibri" w:cs="Calibri" w:eastAsia="Calibri" w:hAnsi="Calibri"/>
+                <w:b/>
+                <w:bCs/>
+                <w:color w:val="14213D"/>
+                <w:sz w:val="20"/>
+                <w:szCs w:val="20"/>
+              </w:rPr>
+              <w:t xml:space="preserve">Variables de paie · rapport RH</w:t>
+            </w:r>
+          </w:p>
+        </w:tc>
+        <w:tc>
+          <w:tcPr>
+            <w:tcW w:type="dxa" w:w="4100"/>
+            <w:tcBorders>
+              <w:top w:val="single" w:color="D9D5CB" w:sz="4"/>
+              <w:left w:val="single" w:color="D9D5CB" w:sz="4"/>
+              <w:bottom w:val="single" w:color="D9D5CB" w:sz="4"/>
+              <w:right w:val="single" w:color="D9D5CB" w:sz="4"/>
+            </w:tcBorders>
+            <w:tcMar>
+              <w:top w:type="dxa" w:w="60"/>
+              <w:left w:type="dxa" w:w="90"/>
+              <w:bottom w:type="dxa" w:w="60"/>
+              <w:right w:type="dxa" w:w="90"/>
+            </w:tcMar>
+            <w:vAlign w:val="top"/>
+          </w:tcPr>
+          <w:p>
+            <w:pPr>
+              <w:spacing w:after="40"/>
+            </w:pPr>
+            <w:r>
+              <w:rPr>
+                <w:rFonts w:ascii="Calibri" w:cs="Calibri" w:eastAsia="Calibri" w:hAnsi="Calibri"/>
+                <w:color w:val="14213D"/>
+                <w:sz w:val="19"/>
+                <w:szCs w:val="19"/>
+              </w:rPr>
+              <w:t xml:space="preserve">Équipes &amp; heures → Variables de paie : la vue définitive pour la paie — heures par personne et par jour, validées / définitives, grands déplacements, exports CSV paie et semaine. Les colonnes Objectif / Production et les stats soudures ont été retirées (elles sont dans Production par équipe).</w:t>
+            </w:r>
+          </w:p>
+        </w:tc>
+        <w:tc>
+          <w:tcPr>
+            <w:tcW w:type="dxa" w:w="3700"/>
+            <w:tcBorders>
+              <w:top w:val="single" w:color="D9D5CB" w:sz="4"/>
+              <w:left w:val="single" w:color="D9D5CB" w:sz="4"/>
+              <w:bottom w:val="single" w:color="D9D5CB" w:sz="4"/>
+              <w:right w:val="single" w:color="D9D5CB" w:sz="4"/>
+            </w:tcBorders>
+            <w:tcMar>
+              <w:top w:type="dxa" w:w="60"/>
+              <w:left w:type="dxa" w:w="90"/>
+              <w:bottom w:type="dxa" w:w="60"/>
+              <w:right w:type="dxa" w:w="90"/>
+            </w:tcMar>
+            <w:vAlign w:val="top"/>
+          </w:tcPr>
+          <w:p>
+            <w:pPr>
+              <w:spacing w:after="40"/>
+            </w:pPr>
+            <w:r>
+              <w:rPr>
+                <w:rFonts w:ascii="Calibri" w:cs="Calibri" w:eastAsia="Calibri" w:hAnsi="Calibri"/>
+                <w:color w:val="14213D"/>
+                <w:sz w:val="19"/>
+                <w:szCs w:val="19"/>
+              </w:rPr>
+              <w:t xml:space="preserve">Sous-titre renommé. La FORME exacte (colonnes, ordre) se cale avec la RH : tu me dis ce qu'elle veut.</w:t>
+            </w:r>
+          </w:p>
+        </w:tc>
+        <w:tc>
+          <w:tcPr>
+            <w:tcW w:type="dxa" w:w="1300"/>
+            <w:tcBorders>
+              <w:top w:val="single" w:color="D9D5CB" w:sz="4"/>
+              <w:left w:val="single" w:color="D9D5CB" w:sz="4"/>
+              <w:bottom w:val="single" w:color="D9D5CB" w:sz="4"/>
+              <w:right w:val="single" w:color="D9D5CB" w:sz="4"/>
+            </w:tcBorders>
+            <w:shd w:fill="E6F5EC" w:color="auto" w:val="clear"/>
+            <w:tcMar>
+              <w:top w:type="dxa" w:w="60"/>
+              <w:left w:type="dxa" w:w="90"/>
+              <w:bottom w:type="dxa" w:w="60"/>
+              <w:right w:type="dxa" w:w="90"/>
+            </w:tcMar>
+            <w:vAlign w:val="top"/>
+          </w:tcPr>
+          <w:p>
+            <w:pPr>
+              <w:spacing w:after="40"/>
+            </w:pPr>
+            <w:r>
+              <w:rPr>
+                <w:rFonts w:ascii="Calibri" w:cs="Calibri" w:eastAsia="Calibri" w:hAnsi="Calibri"/>
+                <w:b/>
+                <w:bCs/>
+                <w:color w:val="14213D"/>
+                <w:sz w:val="19"/>
+                <w:szCs w:val="19"/>
+              </w:rPr>
+              <w:t xml:space="preserve">Fait (forme à caler)</w:t>
+            </w:r>
+          </w:p>
+        </w:tc>
+        <w:tc>
+          <w:tcPr>
+            <w:tcW w:type="dxa" w:w="3700"/>
+            <w:tcBorders>
+              <w:top w:val="single" w:color="D9D5CB" w:sz="4"/>
+              <w:left w:val="single" w:color="D9D5CB" w:sz="4"/>
+              <w:bottom w:val="single" w:color="D9D5CB" w:sz="4"/>
+              <w:right w:val="single" w:color="D9D5CB" w:sz="4"/>
+            </w:tcBorders>
+            <w:tcMar>
+              <w:top w:type="dxa" w:w="60"/>
+              <w:left w:type="dxa" w:w="90"/>
+              <w:bottom w:type="dxa" w:w="60"/>
+              <w:right w:type="dxa" w:w="90"/>
+            </w:tcMar>
+            <w:vAlign w:val="top"/>
+          </w:tcPr>
+          <w:p>
+            <w:pPr>
+              <w:spacing w:after="40"/>
+            </w:pPr>
+            <w:r>
+              <w:rPr>
+                <w:rFonts w:ascii="Calibri" w:cs="Calibri" w:eastAsia="Calibri" w:hAnsi="Calibri"/>
+                <w:color w:val="14213D"/>
+                <w:sz w:val="20"/>
+                <w:szCs w:val="20"/>
+              </w:rPr>
+              <w:t xml:space="preserve"/>
+            </w:r>
+          </w:p>
+          <w:p>
+            <w:pPr>
+              <w:spacing w:after="40"/>
+            </w:pPr>
+            <w:r>
+              <w:rPr>
+                <w:rFonts w:ascii="Calibri" w:cs="Calibri" w:eastAsia="Calibri" w:hAnsi="Calibri"/>
+                <w:color w:val="14213D"/>
+                <w:sz w:val="20"/>
+                <w:szCs w:val="20"/>
+              </w:rPr>
+              <w:t xml:space="preserve"/>
+            </w:r>
+          </w:p>
+        </w:tc>
+      </w:tr>
+      <w:tr>
+        <w:tc>
+          <w:tcPr>
+            <w:tcW w:type="dxa" w:w="2300"/>
+            <w:tcBorders>
+              <w:top w:val="single" w:color="D9D5CB" w:sz="4"/>
+              <w:left w:val="single" w:color="D9D5CB" w:sz="4"/>
+              <w:bottom w:val="single" w:color="D9D5CB" w:sz="4"/>
+              <w:right w:val="single" w:color="D9D5CB" w:sz="4"/>
+            </w:tcBorders>
+            <w:tcMar>
+              <w:top w:type="dxa" w:w="60"/>
+              <w:left w:type="dxa" w:w="90"/>
+              <w:bottom w:type="dxa" w:w="60"/>
+              <w:right w:type="dxa" w:w="90"/>
+            </w:tcMar>
+            <w:vAlign w:val="top"/>
+          </w:tcPr>
+          <w:p>
+            <w:pPr>
+              <w:spacing w:after="40"/>
+            </w:pPr>
+            <w:r>
+              <w:rPr>
+                <w:rFonts w:ascii="Calibri" w:cs="Calibri" w:eastAsia="Calibri" w:hAnsi="Calibri"/>
+                <w:b/>
+                <w:bCs/>
+                <w:color w:val="14213D"/>
+                <w:sz w:val="20"/>
+                <w:szCs w:val="20"/>
+              </w:rPr>
+              <w:t xml:space="preserve">Commerce · un onglet complet</w:t>
+            </w:r>
+          </w:p>
+        </w:tc>
+        <w:tc>
+          <w:tcPr>
+            <w:tcW w:type="dxa" w:w="4100"/>
+            <w:tcBorders>
+              <w:top w:val="single" w:color="D9D5CB" w:sz="4"/>
+              <w:left w:val="single" w:color="D9D5CB" w:sz="4"/>
+              <w:bottom w:val="single" w:color="D9D5CB" w:sz="4"/>
+              <w:right w:val="single" w:color="D9D5CB" w:sz="4"/>
+            </w:tcBorders>
+            <w:tcMar>
+              <w:top w:type="dxa" w:w="60"/>
+              <w:left w:type="dxa" w:w="90"/>
+              <w:bottom w:type="dxa" w:w="60"/>
+              <w:right w:type="dxa" w:w="90"/>
+            </w:tcMar>
+            <w:vAlign w:val="top"/>
+          </w:tcPr>
+          <w:p>
+            <w:pPr>
+              <w:spacing w:after="40"/>
+            </w:pPr>
+            <w:r>
+              <w:rPr>
+                <w:rFonts w:ascii="Calibri" w:cs="Calibri" w:eastAsia="Calibri" w:hAnsi="Calibri"/>
+                <w:color w:val="14213D"/>
+                <w:sz w:val="19"/>
+                <w:szCs w:val="19"/>
+              </w:rPr>
+              <w:t xml:space="preserve">Commerce → 4 segments : 📊 Reporting (récap CA mensuel par secteur, export CSV, et la traçabilité de TOUTES les affaires créées : gagnées / en suspens / perdues, facturé, restant, version du chiffrage) · 📝 Devis &amp; chiffrage (préconsultations et devis = en suspens : création de l'affaire, DCE, chiffrage, offre remise) · 🏗 Dossiers en cours (à débuter + en cours : chantiers liés, facturation) · ✓ Terminés · perdus (la traçabilité reste). Une fiche revient sur son segment.</w:t>
+            </w:r>
+          </w:p>
+        </w:tc>
+        <w:tc>
+          <w:tcPr>
+            <w:tcW w:type="dxa" w:w="3700"/>
+            <w:tcBorders>
+              <w:top w:val="single" w:color="D9D5CB" w:sz="4"/>
+              <w:left w:val="single" w:color="D9D5CB" w:sz="4"/>
+              <w:bottom w:val="single" w:color="D9D5CB" w:sz="4"/>
+              <w:right w:val="single" w:color="D9D5CB" w:sz="4"/>
+            </w:tcBorders>
+            <w:tcMar>
+              <w:top w:type="dxa" w:w="60"/>
+              <w:left w:type="dxa" w:w="90"/>
+              <w:bottom w:type="dxa" w:w="60"/>
+              <w:right w:type="dxa" w:w="90"/>
+            </w:tcMar>
+            <w:vAlign w:val="top"/>
+          </w:tcPr>
+          <w:p>
+            <w:pPr>
+              <w:spacing w:after="40"/>
+            </w:pPr>
+            <w:r>
+              <w:rPr>
+                <w:rFonts w:ascii="Calibri" w:cs="Calibri" w:eastAsia="Calibri" w:hAnsi="Calibri"/>
+                <w:color w:val="14213D"/>
+                <w:sz w:val="19"/>
+                <w:szCs w:val="19"/>
+              </w:rPr>
+              <w:t xml:space="preserve">« ＋ Affaire » partout sauf dans Terminés.</w:t>
+            </w:r>
+          </w:p>
+        </w:tc>
+        <w:tc>
+          <w:tcPr>
+            <w:tcW w:type="dxa" w:w="1300"/>
+            <w:tcBorders>
+              <w:top w:val="single" w:color="D9D5CB" w:sz="4"/>
+              <w:left w:val="single" w:color="D9D5CB" w:sz="4"/>
+              <w:bottom w:val="single" w:color="D9D5CB" w:sz="4"/>
+              <w:right w:val="single" w:color="D9D5CB" w:sz="4"/>
+            </w:tcBorders>
+            <w:shd w:fill="E6F5EC" w:color="auto" w:val="clear"/>
+            <w:tcMar>
+              <w:top w:type="dxa" w:w="60"/>
+              <w:left w:type="dxa" w:w="90"/>
+              <w:bottom w:type="dxa" w:w="60"/>
+              <w:right w:type="dxa" w:w="90"/>
+            </w:tcMar>
+            <w:vAlign w:val="top"/>
+          </w:tcPr>
+          <w:p>
+            <w:pPr>
+              <w:spacing w:after="40"/>
+            </w:pPr>
+            <w:r>
+              <w:rPr>
+                <w:rFonts w:ascii="Calibri" w:cs="Calibri" w:eastAsia="Calibri" w:hAnsi="Calibri"/>
+                <w:b/>
+                <w:bCs/>
+                <w:color w:val="14213D"/>
+                <w:sz w:val="19"/>
+                <w:szCs w:val="19"/>
+              </w:rPr>
+              <w:t xml:space="preserve">Fait</w:t>
+            </w:r>
+          </w:p>
+        </w:tc>
+        <w:tc>
+          <w:tcPr>
+            <w:tcW w:type="dxa" w:w="3700"/>
+            <w:tcBorders>
+              <w:top w:val="single" w:color="D9D5CB" w:sz="4"/>
+              <w:left w:val="single" w:color="D9D5CB" w:sz="4"/>
+              <w:bottom w:val="single" w:color="D9D5CB" w:sz="4"/>
+              <w:right w:val="single" w:color="D9D5CB" w:sz="4"/>
+            </w:tcBorders>
+            <w:tcMar>
+              <w:top w:type="dxa" w:w="60"/>
+              <w:left w:type="dxa" w:w="90"/>
+              <w:bottom w:type="dxa" w:w="60"/>
+              <w:right w:type="dxa" w:w="90"/>
+            </w:tcMar>
+            <w:vAlign w:val="top"/>
+          </w:tcPr>
+          <w:p>
+            <w:pPr>
+              <w:spacing w:after="40"/>
+            </w:pPr>
+            <w:r>
+              <w:rPr>
+                <w:rFonts w:ascii="Calibri" w:cs="Calibri" w:eastAsia="Calibri" w:hAnsi="Calibri"/>
+                <w:color w:val="14213D"/>
+                <w:sz w:val="20"/>
+                <w:szCs w:val="20"/>
+              </w:rPr>
+              <w:t xml:space="preserve"/>
+            </w:r>
+          </w:p>
+          <w:p>
+            <w:pPr>
+              <w:spacing w:after="40"/>
+            </w:pPr>
+            <w:r>
+              <w:rPr>
+                <w:rFonts w:ascii="Calibri" w:cs="Calibri" w:eastAsia="Calibri" w:hAnsi="Calibri"/>
+                <w:color w:val="14213D"/>
+                <w:sz w:val="20"/>
+                <w:szCs w:val="20"/>
+              </w:rPr>
+              <w:t xml:space="preserve"/>
+            </w:r>
+          </w:p>
+        </w:tc>
+      </w:tr>
+      <w:tr>
+        <w:tc>
+          <w:tcPr>
+            <w:tcW w:type="dxa" w:w="2300"/>
+            <w:tcBorders>
+              <w:top w:val="single" w:color="D9D5CB" w:sz="4"/>
+              <w:left w:val="single" w:color="D9D5CB" w:sz="4"/>
+              <w:bottom w:val="single" w:color="D9D5CB" w:sz="4"/>
+              <w:right w:val="single" w:color="D9D5CB" w:sz="4"/>
+            </w:tcBorders>
+            <w:tcMar>
+              <w:top w:type="dxa" w:w="60"/>
+              <w:left w:type="dxa" w:w="90"/>
+              <w:bottom w:type="dxa" w:w="60"/>
+              <w:right w:type="dxa" w:w="90"/>
+            </w:tcMar>
+            <w:vAlign w:val="top"/>
+          </w:tcPr>
+          <w:p>
+            <w:pPr>
+              <w:spacing w:after="40"/>
+            </w:pPr>
+            <w:r>
+              <w:rPr>
+                <w:rFonts w:ascii="Calibri" w:cs="Calibri" w:eastAsia="Calibri" w:hAnsi="Calibri"/>
+                <w:b/>
+                <w:bCs/>
+                <w:color w:val="14213D"/>
+                <w:sz w:val="20"/>
+                <w:szCs w:val="20"/>
+              </w:rPr>
+              <w:t xml:space="preserve">Chiffrage : jusqu'à 10 versions</w:t>
+            </w:r>
+          </w:p>
+        </w:tc>
+        <w:tc>
+          <w:tcPr>
+            <w:tcW w:type="dxa" w:w="4100"/>
+            <w:tcBorders>
+              <w:top w:val="single" w:color="D9D5CB" w:sz="4"/>
+              <w:left w:val="single" w:color="D9D5CB" w:sz="4"/>
+              <w:bottom w:val="single" w:color="D9D5CB" w:sz="4"/>
+              <w:right w:val="single" w:color="D9D5CB" w:sz="4"/>
+            </w:tcBorders>
+            <w:tcMar>
+              <w:top w:type="dxa" w:w="60"/>
+              <w:left w:type="dxa" w:w="90"/>
+              <w:bottom w:type="dxa" w:w="60"/>
+              <w:right w:type="dxa" w:w="90"/>
+            </w:tcMar>
+            <w:vAlign w:val="top"/>
+          </w:tcPr>
+          <w:p>
+            <w:pPr>
+              <w:spacing w:after="40"/>
+            </w:pPr>
+            <w:r>
+              <w:rPr>
+                <w:rFonts w:ascii="Calibri" w:cs="Calibri" w:eastAsia="Calibri" w:hAnsi="Calibri"/>
+                <w:color w:val="14213D"/>
+                <w:sz w:val="19"/>
+                <w:szCs w:val="19"/>
+              </w:rPr>
+              <w:t xml:space="preserve">Fiche → Chiffrage → « ＋ Nouvelle version » : motif (tour de négociation, alignement technique, variante) ; la version en cours est gardée telle quelle avec son propre motif (la v1 = « version initiale »), on repart dessus pour la nouvelle. 10 au maximum (9 gardées + la courante) : au-delà, refus tant qu'on n'en supprime pas une. « ↺ reprendre » une ancienne = nouvelle version. Le reporting montre la version de chaque affaire.</w:t>
+            </w:r>
+          </w:p>
+        </w:tc>
+        <w:tc>
+          <w:tcPr>
+            <w:tcW w:type="dxa" w:w="3700"/>
+            <w:tcBorders>
+              <w:top w:val="single" w:color="D9D5CB" w:sz="4"/>
+              <w:left w:val="single" w:color="D9D5CB" w:sz="4"/>
+              <w:bottom w:val="single" w:color="D9D5CB" w:sz="4"/>
+              <w:right w:val="single" w:color="D9D5CB" w:sz="4"/>
+            </w:tcBorders>
+            <w:tcMar>
+              <w:top w:type="dxa" w:w="60"/>
+              <w:left w:type="dxa" w:w="90"/>
+              <w:bottom w:type="dxa" w:w="60"/>
+              <w:right w:type="dxa" w:w="90"/>
+            </w:tcMar>
+            <w:vAlign w:val="top"/>
+          </w:tcPr>
+          <w:p>
+            <w:pPr>
+              <w:spacing w:after="40"/>
+            </w:pPr>
+            <w:r>
+              <w:rPr>
+                <w:rFonts w:ascii="Calibri" w:cs="Calibri" w:eastAsia="Calibri" w:hAnsi="Calibri"/>
+                <w:color w:val="14213D"/>
+                <w:sz w:val="19"/>
+                <w:szCs w:val="19"/>
+              </w:rPr>
+              <w:t xml:space="preserve">Le contenu du chiffrage (V2B) reste à porter : section « Pas fait ».</w:t>
+            </w:r>
+          </w:p>
+        </w:tc>
+        <w:tc>
+          <w:tcPr>
+            <w:tcW w:type="dxa" w:w="1300"/>
+            <w:tcBorders>
+              <w:top w:val="single" w:color="D9D5CB" w:sz="4"/>
+              <w:left w:val="single" w:color="D9D5CB" w:sz="4"/>
+              <w:bottom w:val="single" w:color="D9D5CB" w:sz="4"/>
+              <w:right w:val="single" w:color="D9D5CB" w:sz="4"/>
+            </w:tcBorders>
+            <w:shd w:fill="E6F5EC" w:color="auto" w:val="clear"/>
+            <w:tcMar>
+              <w:top w:type="dxa" w:w="60"/>
+              <w:left w:type="dxa" w:w="90"/>
+              <w:bottom w:type="dxa" w:w="60"/>
+              <w:right w:type="dxa" w:w="90"/>
+            </w:tcMar>
+            <w:vAlign w:val="top"/>
+          </w:tcPr>
+          <w:p>
+            <w:pPr>
+              <w:spacing w:after="40"/>
+            </w:pPr>
+            <w:r>
+              <w:rPr>
+                <w:rFonts w:ascii="Calibri" w:cs="Calibri" w:eastAsia="Calibri" w:hAnsi="Calibri"/>
+                <w:b/>
+                <w:bCs/>
+                <w:color w:val="14213D"/>
+                <w:sz w:val="19"/>
+                <w:szCs w:val="19"/>
+              </w:rPr>
+              <w:t xml:space="preserve">Fait</w:t>
+            </w:r>
+          </w:p>
+        </w:tc>
+        <w:tc>
+          <w:tcPr>
+            <w:tcW w:type="dxa" w:w="3700"/>
+            <w:tcBorders>
+              <w:top w:val="single" w:color="D9D5CB" w:sz="4"/>
+              <w:left w:val="single" w:color="D9D5CB" w:sz="4"/>
+              <w:bottom w:val="single" w:color="D9D5CB" w:sz="4"/>
+              <w:right w:val="single" w:color="D9D5CB" w:sz="4"/>
+            </w:tcBorders>
+            <w:tcMar>
+              <w:top w:type="dxa" w:w="60"/>
+              <w:left w:type="dxa" w:w="90"/>
+              <w:bottom w:type="dxa" w:w="60"/>
+              <w:right w:type="dxa" w:w="90"/>
+            </w:tcMar>
+            <w:vAlign w:val="top"/>
+          </w:tcPr>
+          <w:p>
+            <w:pPr>
+              <w:spacing w:after="40"/>
+            </w:pPr>
+            <w:r>
+              <w:rPr>
+                <w:rFonts w:ascii="Calibri" w:cs="Calibri" w:eastAsia="Calibri" w:hAnsi="Calibri"/>
+                <w:color w:val="14213D"/>
+                <w:sz w:val="20"/>
+                <w:szCs w:val="20"/>
+              </w:rPr>
+              <w:t xml:space="preserve"/>
+            </w:r>
+          </w:p>
+          <w:p>
+            <w:pPr>
+              <w:spacing w:after="40"/>
+            </w:pPr>
+            <w:r>
+              <w:rPr>
+                <w:rFonts w:ascii="Calibri" w:cs="Calibri" w:eastAsia="Calibri" w:hAnsi="Calibri"/>
+                <w:color w:val="14213D"/>
+                <w:sz w:val="20"/>
+                <w:szCs w:val="20"/>
+              </w:rPr>
+              <w:t xml:space="preserve"/>
+            </w:r>
+          </w:p>
+        </w:tc>
+      </w:tr>
+      <w:tr>
+        <w:tc>
+          <w:tcPr>
+            <w:tcW w:type="dxa" w:w="2300"/>
+            <w:tcBorders>
+              <w:top w:val="single" w:color="D9D5CB" w:sz="4"/>
+              <w:left w:val="single" w:color="D9D5CB" w:sz="4"/>
+              <w:bottom w:val="single" w:color="D9D5CB" w:sz="4"/>
+              <w:right w:val="single" w:color="D9D5CB" w:sz="4"/>
+            </w:tcBorders>
+            <w:tcMar>
+              <w:top w:type="dxa" w:w="60"/>
+              <w:left w:type="dxa" w:w="90"/>
+              <w:bottom w:type="dxa" w:w="60"/>
+              <w:right w:type="dxa" w:w="90"/>
+            </w:tcMar>
+            <w:vAlign w:val="top"/>
+          </w:tcPr>
+          <w:p>
+            <w:pPr>
+              <w:spacing w:after="40"/>
+            </w:pPr>
+            <w:r>
+              <w:rPr>
+                <w:rFonts w:ascii="Calibri" w:cs="Calibri" w:eastAsia="Calibri" w:hAnsi="Calibri"/>
+                <w:b/>
+                <w:bCs/>
+                <w:color w:val="14213D"/>
+                <w:sz w:val="20"/>
+                <w:szCs w:val="20"/>
+              </w:rPr>
+              <w:t xml:space="preserve">Dossiers en cours : tableau de facturation client</w:t>
+            </w:r>
+          </w:p>
+        </w:tc>
+        <w:tc>
+          <w:tcPr>
+            <w:tcW w:type="dxa" w:w="4100"/>
+            <w:tcBorders>
+              <w:top w:val="single" w:color="D9D5CB" w:sz="4"/>
+              <w:left w:val="single" w:color="D9D5CB" w:sz="4"/>
+              <w:bottom w:val="single" w:color="D9D5CB" w:sz="4"/>
+              <w:right w:val="single" w:color="D9D5CB" w:sz="4"/>
+            </w:tcBorders>
+            <w:tcMar>
+              <w:top w:type="dxa" w:w="60"/>
+              <w:left w:type="dxa" w:w="90"/>
+              <w:bottom w:type="dxa" w:w="60"/>
+              <w:right w:type="dxa" w:w="90"/>
+            </w:tcMar>
+            <w:vAlign w:val="top"/>
+          </w:tcPr>
+          <w:p>
+            <w:pPr>
+              <w:spacing w:after="40"/>
+            </w:pPr>
+            <w:r>
+              <w:rPr>
+                <w:rFonts w:ascii="Calibri" w:cs="Calibri" w:eastAsia="Calibri" w:hAnsi="Calibri"/>
+                <w:color w:val="14213D"/>
+                <w:sz w:val="19"/>
+                <w:szCs w:val="19"/>
+              </w:rPr>
+              <w:t xml:space="preserve">Fiche (dossier en cours) → Facturation : carte « Tableau de facturation du chantier · envoyé au client » (dépose l'Excel envoyé au client, versions gardées dans les pièces, catégorie « Facturation · tableau client ») + les situations à renseigner par mois pour que le suivi (facturé, restant) soit à jour.</w:t>
+            </w:r>
+          </w:p>
+        </w:tc>
+        <w:tc>
+          <w:tcPr>
+            <w:tcW w:type="dxa" w:w="3700"/>
+            <w:tcBorders>
+              <w:top w:val="single" w:color="D9D5CB" w:sz="4"/>
+              <w:left w:val="single" w:color="D9D5CB" w:sz="4"/>
+              <w:bottom w:val="single" w:color="D9D5CB" w:sz="4"/>
+              <w:right w:val="single" w:color="D9D5CB" w:sz="4"/>
+            </w:tcBorders>
+            <w:tcMar>
+              <w:top w:type="dxa" w:w="60"/>
+              <w:left w:type="dxa" w:w="90"/>
+              <w:bottom w:type="dxa" w:w="60"/>
+              <w:right w:type="dxa" w:w="90"/>
+            </w:tcMar>
+            <w:vAlign w:val="top"/>
+          </w:tcPr>
+          <w:p>
+            <w:pPr>
+              <w:spacing w:after="40"/>
+            </w:pPr>
+            <w:r>
+              <w:rPr>
+                <w:rFonts w:ascii="Calibri" w:cs="Calibri" w:eastAsia="Calibri" w:hAnsi="Calibri"/>
+                <w:color w:val="14213D"/>
+                <w:sz w:val="19"/>
+                <w:szCs w:val="19"/>
+              </w:rPr>
+              <w:t xml:space="preserve">L'Excel est gardé tel quel (pas relu). Le lire pour remplir les situations tout seul = plus tard, si le tableau a toujours le même format.</w:t>
+            </w:r>
+          </w:p>
+        </w:tc>
+        <w:tc>
+          <w:tcPr>
+            <w:tcW w:type="dxa" w:w="1300"/>
+            <w:tcBorders>
+              <w:top w:val="single" w:color="D9D5CB" w:sz="4"/>
+              <w:left w:val="single" w:color="D9D5CB" w:sz="4"/>
+              <w:bottom w:val="single" w:color="D9D5CB" w:sz="4"/>
+              <w:right w:val="single" w:color="D9D5CB" w:sz="4"/>
+            </w:tcBorders>
+            <w:shd w:fill="E6F5EC" w:color="auto" w:val="clear"/>
+            <w:tcMar>
+              <w:top w:type="dxa" w:w="60"/>
+              <w:left w:type="dxa" w:w="90"/>
+              <w:bottom w:type="dxa" w:w="60"/>
+              <w:right w:type="dxa" w:w="90"/>
+            </w:tcMar>
+            <w:vAlign w:val="top"/>
+          </w:tcPr>
+          <w:p>
+            <w:pPr>
+              <w:spacing w:after="40"/>
+            </w:pPr>
+            <w:r>
+              <w:rPr>
+                <w:rFonts w:ascii="Calibri" w:cs="Calibri" w:eastAsia="Calibri" w:hAnsi="Calibri"/>
+                <w:b/>
+                <w:bCs/>
+                <w:color w:val="14213D"/>
+                <w:sz w:val="19"/>
+                <w:szCs w:val="19"/>
+              </w:rPr>
+              <w:t xml:space="preserve">Fait (v1)</w:t>
+            </w:r>
+          </w:p>
+        </w:tc>
+        <w:tc>
+          <w:tcPr>
+            <w:tcW w:type="dxa" w:w="3700"/>
+            <w:tcBorders>
+              <w:top w:val="single" w:color="D9D5CB" w:sz="4"/>
+              <w:left w:val="single" w:color="D9D5CB" w:sz="4"/>
+              <w:bottom w:val="single" w:color="D9D5CB" w:sz="4"/>
+              <w:right w:val="single" w:color="D9D5CB" w:sz="4"/>
+            </w:tcBorders>
+            <w:tcMar>
+              <w:top w:type="dxa" w:w="60"/>
+              <w:left w:type="dxa" w:w="90"/>
+              <w:bottom w:type="dxa" w:w="60"/>
+              <w:right w:type="dxa" w:w="90"/>
+            </w:tcMar>
+            <w:vAlign w:val="top"/>
+          </w:tcPr>
+          <w:p>
+            <w:pPr>
+              <w:spacing w:after="40"/>
+            </w:pPr>
+            <w:r>
+              <w:rPr>
+                <w:rFonts w:ascii="Calibri" w:cs="Calibri" w:eastAsia="Calibri" w:hAnsi="Calibri"/>
+                <w:color w:val="14213D"/>
+                <w:sz w:val="20"/>
+                <w:szCs w:val="20"/>
+              </w:rPr>
+              <w:t xml:space="preserve"/>
+            </w:r>
+          </w:p>
+          <w:p>
+            <w:pPr>
+              <w:spacing w:after="40"/>
+            </w:pPr>
+            <w:r>
+              <w:rPr>
+                <w:rFonts w:ascii="Calibri" w:cs="Calibri" w:eastAsia="Calibri" w:hAnsi="Calibri"/>
+                <w:color w:val="14213D"/>
+                <w:sz w:val="20"/>
+                <w:szCs w:val="20"/>
+              </w:rPr>
+              <w:t xml:space="preserve"/>
+            </w:r>
+          </w:p>
+        </w:tc>
+      </w:tr>
+      <w:tr>
+        <w:tc>
+          <w:tcPr>
+            <w:tcW w:type="dxa" w:w="2300"/>
+            <w:tcBorders>
+              <w:top w:val="single" w:color="D9D5CB" w:sz="4"/>
+              <w:left w:val="single" w:color="D9D5CB" w:sz="4"/>
+              <w:bottom w:val="single" w:color="D9D5CB" w:sz="4"/>
+              <w:right w:val="single" w:color="D9D5CB" w:sz="4"/>
+            </w:tcBorders>
+            <w:tcMar>
+              <w:top w:type="dxa" w:w="60"/>
+              <w:left w:type="dxa" w:w="90"/>
+              <w:bottom w:type="dxa" w:w="60"/>
+              <w:right w:type="dxa" w:w="90"/>
+            </w:tcMar>
+            <w:vAlign w:val="top"/>
+          </w:tcPr>
+          <w:p>
+            <w:pPr>
+              <w:spacing w:after="40"/>
+            </w:pPr>
+            <w:r>
+              <w:rPr>
+                <w:rFonts w:ascii="Calibri" w:cs="Calibri" w:eastAsia="Calibri" w:hAnsi="Calibri"/>
+                <w:b/>
+                <w:bCs/>
+                <w:color w:val="14213D"/>
+                <w:sz w:val="20"/>
+                <w:szCs w:val="20"/>
+              </w:rPr>
+              <w:t xml:space="preserve">Parc : flotte + magasin + matériel</w:t>
+            </w:r>
+          </w:p>
+        </w:tc>
+        <w:tc>
+          <w:tcPr>
+            <w:tcW w:type="dxa" w:w="4100"/>
+            <w:tcBorders>
+              <w:top w:val="single" w:color="D9D5CB" w:sz="4"/>
+              <w:left w:val="single" w:color="D9D5CB" w:sz="4"/>
+              <w:bottom w:val="single" w:color="D9D5CB" w:sz="4"/>
+              <w:right w:val="single" w:color="D9D5CB" w:sz="4"/>
+            </w:tcBorders>
+            <w:tcMar>
+              <w:top w:type="dxa" w:w="60"/>
+              <w:left w:type="dxa" w:w="90"/>
+              <w:bottom w:type="dxa" w:w="60"/>
+              <w:right w:type="dxa" w:w="90"/>
+            </w:tcMar>
+            <w:vAlign w:val="top"/>
+          </w:tcPr>
+          <w:p>
+            <w:pPr>
+              <w:spacing w:after="40"/>
+            </w:pPr>
+            <w:r>
+              <w:rPr>
+                <w:rFonts w:ascii="Calibri" w:cs="Calibri" w:eastAsia="Calibri" w:hAnsi="Calibri"/>
+                <w:color w:val="14213D"/>
+                <w:sz w:val="19"/>
+                <w:szCs w:val="19"/>
+              </w:rPr>
+              <w:t xml:space="preserve">Parc → Flotte (tout ce qui existait : véhicules dessinés, contrôles, échéances) · Magasin (à cadrer) · Matériel (à cadrer).</w:t>
+            </w:r>
+          </w:p>
+        </w:tc>
+        <w:tc>
+          <w:tcPr>
+            <w:tcW w:type="dxa" w:w="3700"/>
+            <w:tcBorders>
+              <w:top w:val="single" w:color="D9D5CB" w:sz="4"/>
+              <w:left w:val="single" w:color="D9D5CB" w:sz="4"/>
+              <w:bottom w:val="single" w:color="D9D5CB" w:sz="4"/>
+              <w:right w:val="single" w:color="D9D5CB" w:sz="4"/>
+            </w:tcBorders>
+            <w:tcMar>
+              <w:top w:type="dxa" w:w="60"/>
+              <w:left w:type="dxa" w:w="90"/>
+              <w:bottom w:type="dxa" w:w="60"/>
+              <w:right w:type="dxa" w:w="90"/>
+            </w:tcMar>
+            <w:vAlign w:val="top"/>
+          </w:tcPr>
+          <w:p>
+            <w:pPr>
+              <w:spacing w:after="40"/>
+            </w:pPr>
+            <w:r>
+              <w:rPr>
+                <w:rFonts w:ascii="Calibri" w:cs="Calibri" w:eastAsia="Calibri" w:hAnsi="Calibri"/>
+                <w:color w:val="14213D"/>
+                <w:sz w:val="19"/>
+                <w:szCs w:val="19"/>
+              </w:rPr>
+              <w:t xml:space="preserve">Magasin et matériel : des cartes « à cadrer » qui disent ce qu'il faut décider (ce que tient le magasinier aujourd'hui, ce qu'on suit pour le matériel). Je code dès que tu me donnes le périmètre.</w:t>
+            </w:r>
+          </w:p>
+        </w:tc>
+        <w:tc>
+          <w:tcPr>
+            <w:tcW w:type="dxa" w:w="1300"/>
+            <w:tcBorders>
+              <w:top w:val="single" w:color="D9D5CB" w:sz="4"/>
+              <w:left w:val="single" w:color="D9D5CB" w:sz="4"/>
+              <w:bottom w:val="single" w:color="D9D5CB" w:sz="4"/>
+              <w:right w:val="single" w:color="D9D5CB" w:sz="4"/>
+            </w:tcBorders>
+            <w:shd w:fill="E6F5EC" w:color="auto" w:val="clear"/>
+            <w:tcMar>
+              <w:top w:type="dxa" w:w="60"/>
+              <w:left w:type="dxa" w:w="90"/>
+              <w:bottom w:type="dxa" w:w="60"/>
+              <w:right w:type="dxa" w:w="90"/>
+            </w:tcMar>
+            <w:vAlign w:val="top"/>
+          </w:tcPr>
+          <w:p>
+            <w:pPr>
+              <w:spacing w:after="40"/>
+            </w:pPr>
+            <w:r>
+              <w:rPr>
+                <w:rFonts w:ascii="Calibri" w:cs="Calibri" w:eastAsia="Calibri" w:hAnsi="Calibri"/>
+                <w:b/>
+                <w:bCs/>
+                <w:color w:val="14213D"/>
+                <w:sz w:val="19"/>
+                <w:szCs w:val="19"/>
+              </w:rPr>
+              <w:t xml:space="preserve">Fait (flotte) · à cadrer</w:t>
+            </w:r>
+          </w:p>
+        </w:tc>
+        <w:tc>
+          <w:tcPr>
+            <w:tcW w:type="dxa" w:w="3700"/>
+            <w:tcBorders>
+              <w:top w:val="single" w:color="D9D5CB" w:sz="4"/>
+              <w:left w:val="single" w:color="D9D5CB" w:sz="4"/>
+              <w:bottom w:val="single" w:color="D9D5CB" w:sz="4"/>
+              <w:right w:val="single" w:color="D9D5CB" w:sz="4"/>
+            </w:tcBorders>
+            <w:tcMar>
+              <w:top w:type="dxa" w:w="60"/>
+              <w:left w:type="dxa" w:w="90"/>
+              <w:bottom w:type="dxa" w:w="60"/>
+              <w:right w:type="dxa" w:w="90"/>
+            </w:tcMar>
+            <w:vAlign w:val="top"/>
+          </w:tcPr>
+          <w:p>
+            <w:pPr>
+              <w:spacing w:after="40"/>
+            </w:pPr>
+            <w:r>
+              <w:rPr>
+                <w:rFonts w:ascii="Calibri" w:cs="Calibri" w:eastAsia="Calibri" w:hAnsi="Calibri"/>
+                <w:color w:val="14213D"/>
+                <w:sz w:val="20"/>
+                <w:szCs w:val="20"/>
+              </w:rPr>
+              <w:t xml:space="preserve"/>
+            </w:r>
+          </w:p>
+          <w:p>
+            <w:pPr>
+              <w:spacing w:after="40"/>
+            </w:pPr>
+            <w:r>
+              <w:rPr>
+                <w:rFonts w:ascii="Calibri" w:cs="Calibri" w:eastAsia="Calibri" w:hAnsi="Calibri"/>
+                <w:color w:val="14213D"/>
+                <w:sz w:val="20"/>
+                <w:szCs w:val="20"/>
+              </w:rPr>
+              <w:t xml:space="preserve"/>
+            </w:r>
+          </w:p>
+        </w:tc>
+      </w:tr>
+      <w:tr>
+        <w:tc>
+          <w:tcPr>
+            <w:tcW w:type="dxa" w:w="2300"/>
+            <w:tcBorders>
+              <w:top w:val="single" w:color="D9D5CB" w:sz="4"/>
+              <w:left w:val="single" w:color="D9D5CB" w:sz="4"/>
+              <w:bottom w:val="single" w:color="D9D5CB" w:sz="4"/>
+              <w:right w:val="single" w:color="D9D5CB" w:sz="4"/>
+            </w:tcBorders>
+            <w:tcMar>
+              <w:top w:type="dxa" w:w="60"/>
+              <w:left w:type="dxa" w:w="90"/>
+              <w:bottom w:type="dxa" w:w="60"/>
+              <w:right w:type="dxa" w:w="90"/>
+            </w:tcMar>
+            <w:vAlign w:val="top"/>
+          </w:tcPr>
+          <w:p>
+            <w:pPr>
+              <w:spacing w:after="40"/>
+            </w:pPr>
+            <w:r>
+              <w:rPr>
+                <w:rFonts w:ascii="Calibri" w:cs="Calibri" w:eastAsia="Calibri" w:hAnsi="Calibri"/>
+                <w:b/>
+                <w:bCs/>
+                <w:color w:val="14213D"/>
+                <w:sz w:val="20"/>
+                <w:szCs w:val="20"/>
+              </w:rPr>
+              <w:t xml:space="preserve">Sécurité → Déclarer un accident (v1)</w:t>
+            </w:r>
+          </w:p>
+        </w:tc>
+        <w:tc>
+          <w:tcPr>
+            <w:tcW w:type="dxa" w:w="4100"/>
+            <w:tcBorders>
+              <w:top w:val="single" w:color="D9D5CB" w:sz="4"/>
+              <w:left w:val="single" w:color="D9D5CB" w:sz="4"/>
+              <w:bottom w:val="single" w:color="D9D5CB" w:sz="4"/>
+              <w:right w:val="single" w:color="D9D5CB" w:sz="4"/>
+            </w:tcBorders>
+            <w:tcMar>
+              <w:top w:type="dxa" w:w="60"/>
+              <w:left w:type="dxa" w:w="90"/>
+              <w:bottom w:type="dxa" w:w="60"/>
+              <w:right w:type="dxa" w:w="90"/>
+            </w:tcMar>
+            <w:vAlign w:val="top"/>
+          </w:tcPr>
+          <w:p>
+            <w:pPr>
+              <w:spacing w:after="40"/>
+            </w:pPr>
+            <w:r>
+              <w:rPr>
+                <w:rFonts w:ascii="Calibri" w:cs="Calibri" w:eastAsia="Calibri" w:hAnsi="Calibri"/>
+                <w:color w:val="14213D"/>
+                <w:sz w:val="19"/>
+                <w:szCs w:val="19"/>
+              </w:rPr>
+              <w:t xml:space="preserve">Chantiers → Sécurité → Déclarer un accident (aussi : onglet QSE d'un chantier → bouton « ⚠ Déclarer un accident »). Formulaire : type (accident du travail / presque-accident / soin bénin / trajet), date, heure, chantier (prérempli si tu y es placé), lieu précis, personne(s) (chips des gens placés aujourd'hui), circonstances (obligatoires), lésion, arrêt de travail, soins / secours, témoins, photos. La RH, la direction et le QSE ont la notification « n déclaration(s) d'accident à traiter » → liste → « ✓ Traité » quand la déclaration CPAM / le dossier est fait. Chacun voit ses propres déclarations.</w:t>
+            </w:r>
+          </w:p>
+        </w:tc>
+        <w:tc>
+          <w:tcPr>
+            <w:tcW w:type="dxa" w:w="3700"/>
+            <w:tcBorders>
+              <w:top w:val="single" w:color="D9D5CB" w:sz="4"/>
+              <w:left w:val="single" w:color="D9D5CB" w:sz="4"/>
+              <w:bottom w:val="single" w:color="D9D5CB" w:sz="4"/>
+              <w:right w:val="single" w:color="D9D5CB" w:sz="4"/>
+            </w:tcBorders>
+            <w:tcMar>
+              <w:top w:type="dxa" w:w="60"/>
+              <w:left w:type="dxa" w:w="90"/>
+              <w:bottom w:type="dxa" w:w="60"/>
+              <w:right w:type="dxa" w:w="90"/>
+            </w:tcMar>
+            <w:vAlign w:val="top"/>
+          </w:tcPr>
+          <w:p>
+            <w:pPr>
+              <w:spacing w:after="40"/>
+            </w:pPr>
+            <w:r>
+              <w:rPr>
+                <w:rFonts w:ascii="Calibri" w:cs="Calibri" w:eastAsia="Calibri" w:hAnsi="Calibri"/>
+                <w:color w:val="14213D"/>
+                <w:sz w:val="19"/>
+                <w:szCs w:val="19"/>
+              </w:rPr>
+              <w:t xml:space="preserve">Les champs sont ma proposition : tu demandes à la RH ce qu'il lui faut (déclaration en 48 h) et je recale. Pas d'envoi d'e-mail automatique (à décider : à qui).</w:t>
+            </w:r>
+          </w:p>
+        </w:tc>
+        <w:tc>
+          <w:tcPr>
+            <w:tcW w:type="dxa" w:w="1300"/>
+            <w:tcBorders>
+              <w:top w:val="single" w:color="D9D5CB" w:sz="4"/>
+              <w:left w:val="single" w:color="D9D5CB" w:sz="4"/>
+              <w:bottom w:val="single" w:color="D9D5CB" w:sz="4"/>
+              <w:right w:val="single" w:color="D9D5CB" w:sz="4"/>
+            </w:tcBorders>
+            <w:shd w:fill="E6F5EC" w:color="auto" w:val="clear"/>
+            <w:tcMar>
+              <w:top w:type="dxa" w:w="60"/>
+              <w:left w:type="dxa" w:w="90"/>
+              <w:bottom w:type="dxa" w:w="60"/>
+              <w:right w:type="dxa" w:w="90"/>
+            </w:tcMar>
+            <w:vAlign w:val="top"/>
+          </w:tcPr>
+          <w:p>
+            <w:pPr>
+              <w:spacing w:after="40"/>
+            </w:pPr>
+            <w:r>
+              <w:rPr>
+                <w:rFonts w:ascii="Calibri" w:cs="Calibri" w:eastAsia="Calibri" w:hAnsi="Calibri"/>
+                <w:b/>
+                <w:bCs/>
+                <w:color w:val="14213D"/>
+                <w:sz w:val="19"/>
+                <w:szCs w:val="19"/>
+              </w:rPr>
+              <w:t xml:space="preserve">Fait (v1, à caler RH)</w:t>
+            </w:r>
+          </w:p>
+        </w:tc>
+        <w:tc>
+          <w:tcPr>
+            <w:tcW w:type="dxa" w:w="3700"/>
+            <w:tcBorders>
+              <w:top w:val="single" w:color="D9D5CB" w:sz="4"/>
+              <w:left w:val="single" w:color="D9D5CB" w:sz="4"/>
+              <w:bottom w:val="single" w:color="D9D5CB" w:sz="4"/>
+              <w:right w:val="single" w:color="D9D5CB" w:sz="4"/>
+            </w:tcBorders>
+            <w:tcMar>
+              <w:top w:type="dxa" w:w="60"/>
+              <w:left w:type="dxa" w:w="90"/>
+              <w:bottom w:type="dxa" w:w="60"/>
+              <w:right w:type="dxa" w:w="90"/>
+            </w:tcMar>
+            <w:vAlign w:val="top"/>
+          </w:tcPr>
+          <w:p>
+            <w:pPr>
+              <w:spacing w:after="40"/>
+            </w:pPr>
+            <w:r>
+              <w:rPr>
+                <w:rFonts w:ascii="Calibri" w:cs="Calibri" w:eastAsia="Calibri" w:hAnsi="Calibri"/>
+                <w:color w:val="14213D"/>
+                <w:sz w:val="20"/>
+                <w:szCs w:val="20"/>
+              </w:rPr>
+              <w:t xml:space="preserve"/>
+            </w:r>
+          </w:p>
+          <w:p>
+            <w:pPr>
+              <w:spacing w:after="40"/>
+            </w:pPr>
+            <w:r>
+              <w:rPr>
+                <w:rFonts w:ascii="Calibri" w:cs="Calibri" w:eastAsia="Calibri" w:hAnsi="Calibri"/>
+                <w:color w:val="14213D"/>
+                <w:sz w:val="20"/>
+                <w:szCs w:val="20"/>
+              </w:rPr>
+              <w:t xml:space="preserve"/>
+            </w:r>
+          </w:p>
+        </w:tc>
+      </w:tr>
+      <w:tr>
+        <w:tc>
+          <w:tcPr>
+            <w:tcW w:type="dxa" w:w="2300"/>
+            <w:tcBorders>
+              <w:top w:val="single" w:color="D9D5CB" w:sz="4"/>
+              <w:left w:val="single" w:color="D9D5CB" w:sz="4"/>
+              <w:bottom w:val="single" w:color="D9D5CB" w:sz="4"/>
+              <w:right w:val="single" w:color="D9D5CB" w:sz="4"/>
+            </w:tcBorders>
+            <w:tcMar>
+              <w:top w:type="dxa" w:w="60"/>
+              <w:left w:type="dxa" w:w="90"/>
+              <w:bottom w:type="dxa" w:w="60"/>
+              <w:right w:type="dxa" w:w="90"/>
+            </w:tcMar>
+            <w:vAlign w:val="top"/>
+          </w:tcPr>
+          <w:p>
+            <w:pPr>
+              <w:spacing w:after="40"/>
+            </w:pPr>
+            <w:r>
+              <w:rPr>
+                <w:rFonts w:ascii="Calibri" w:cs="Calibri" w:eastAsia="Calibri" w:hAnsi="Calibri"/>
+                <w:b/>
+                <w:bCs/>
+                <w:color w:val="14213D"/>
+                <w:sz w:val="20"/>
+                <w:szCs w:val="20"/>
+              </w:rPr>
+              <w:t xml:space="preserve">Outlook automatique (fonction serveur)</w:t>
+            </w:r>
+          </w:p>
+        </w:tc>
+        <w:tc>
+          <w:tcPr>
+            <w:tcW w:type="dxa" w:w="4100"/>
+            <w:tcBorders>
+              <w:top w:val="single" w:color="D9D5CB" w:sz="4"/>
+              <w:left w:val="single" w:color="D9D5CB" w:sz="4"/>
+              <w:bottom w:val="single" w:color="D9D5CB" w:sz="4"/>
+              <w:right w:val="single" w:color="D9D5CB" w:sz="4"/>
+            </w:tcBorders>
+            <w:tcMar>
+              <w:top w:type="dxa" w:w="60"/>
+              <w:left w:type="dxa" w:w="90"/>
+              <w:bottom w:type="dxa" w:w="60"/>
+              <w:right w:type="dxa" w:w="90"/>
+            </w:tcMar>
+            <w:vAlign w:val="top"/>
+          </w:tcPr>
+          <w:p>
+            <w:pPr>
+              <w:spacing w:after="40"/>
+            </w:pPr>
+            <w:r>
+              <w:rPr>
+                <w:rFonts w:ascii="Calibri" w:cs="Calibri" w:eastAsia="Calibri" w:hAnsi="Calibri"/>
+                <w:color w:val="14213D"/>
+                <w:sz w:val="19"/>
+                <w:szCs w:val="19"/>
+              </w:rPr>
+              <w:t xml:space="preserve">Ma semaine → carte « 🔗 Relié à Outlook » : mode d'emploi (Outlook web → Paramètres → Calendrier → Calendriers partagés → Publier un calendrier → copier le lien ICS) → « Coller mon lien de calendrier » → synchro immédiate, puis automatique à chaque ouverture de Ma semaine si la dernière date de plus de 2 h ; « Synchroniser maintenant » ; « Délier ». Les réunions deviennent des lignes de ta semaine (chantier reconnu, type deviné), mises à jour si elles changent, retirées si tu les supprimes dans Outlook.</w:t>
+            </w:r>
+          </w:p>
+        </w:tc>
+        <w:tc>
+          <w:tcPr>
+            <w:tcW w:type="dxa" w:w="3700"/>
+            <w:tcBorders>
+              <w:top w:val="single" w:color="D9D5CB" w:sz="4"/>
+              <w:left w:val="single" w:color="D9D5CB" w:sz="4"/>
+              <w:bottom w:val="single" w:color="D9D5CB" w:sz="4"/>
+              <w:right w:val="single" w:color="D9D5CB" w:sz="4"/>
+            </w:tcBorders>
+            <w:tcMar>
+              <w:top w:type="dxa" w:w="60"/>
+              <w:left w:type="dxa" w:w="90"/>
+              <w:bottom w:type="dxa" w:w="60"/>
+              <w:right w:type="dxa" w:w="90"/>
+            </w:tcMar>
+            <w:vAlign w:val="top"/>
+          </w:tcPr>
+          <w:p>
+            <w:pPr>
+              <w:spacing w:after="40"/>
+            </w:pPr>
+            <w:r>
+              <w:rPr>
+                <w:rFonts w:ascii="Calibri" w:cs="Calibri" w:eastAsia="Calibri" w:hAnsi="Calibri"/>
+                <w:color w:val="14213D"/>
+                <w:sz w:val="19"/>
+                <w:szCs w:val="19"/>
+              </w:rPr>
+              <w:t xml:space="preserve">Il faut déployer la fonction UNE fois (README, 3 minutes, pas de ligne de commande, pas de secret). Chaque encadrant publie son calendrier une fois. Le lien publié donne la lecture de l'agenda : il est gardé dans la fiche personne (comptes actifs).</w:t>
+            </w:r>
+          </w:p>
+        </w:tc>
+        <w:tc>
+          <w:tcPr>
+            <w:tcW w:type="dxa" w:w="1300"/>
+            <w:tcBorders>
+              <w:top w:val="single" w:color="D9D5CB" w:sz="4"/>
+              <w:left w:val="single" w:color="D9D5CB" w:sz="4"/>
+              <w:bottom w:val="single" w:color="D9D5CB" w:sz="4"/>
+              <w:right w:val="single" w:color="D9D5CB" w:sz="4"/>
+            </w:tcBorders>
+            <w:shd w:fill="E6F5EC" w:color="auto" w:val="clear"/>
+            <w:tcMar>
+              <w:top w:type="dxa" w:w="60"/>
+              <w:left w:type="dxa" w:w="90"/>
+              <w:bottom w:type="dxa" w:w="60"/>
+              <w:right w:type="dxa" w:w="90"/>
+            </w:tcMar>
+            <w:vAlign w:val="top"/>
+          </w:tcPr>
+          <w:p>
+            <w:pPr>
+              <w:spacing w:after="40"/>
+            </w:pPr>
+            <w:r>
+              <w:rPr>
+                <w:rFonts w:ascii="Calibri" w:cs="Calibri" w:eastAsia="Calibri" w:hAnsi="Calibri"/>
+                <w:b/>
+                <w:bCs/>
+                <w:color w:val="14213D"/>
+                <w:sz w:val="19"/>
+                <w:szCs w:val="19"/>
+              </w:rPr>
+              <w:t xml:space="preserve">Fait (à déployer)</w:t>
             </w:r>
           </w:p>
         </w:tc>
@@ -9226,7 +12038,83 @@
           <w:sz w:val="20"/>
           <w:szCs w:val="20"/>
         </w:rPr>
-        <w:t xml:space="preserve">Outlook dans les deux sens (Microsoft Graph, compte Azure SCR, autorisation IT) : à décider ; l'export .ics marche tout de suite.</w:t>
+        <w:t xml:space="preserve">Outlook dans le sens TRACÉ → Outlook (Microsoft Graph, compte Azure SCR, autorisation IT) : à décider ; l'export .ics marche tout de suite.</w:t>
+      </w:r>
+    </w:p>
+    <w:p>
+      <w:pPr>
+        <w:pStyle w:val="ListParagraph"/>
+        <w:numPr>
+          <w:ilvl w:val="0"/>
+          <w:numId w:val="2"/>
+        </w:numPr>
+        <w:spacing w:after="40"/>
+      </w:pPr>
+      <w:r>
+        <w:rPr>
+          <w:rFonts w:ascii="Calibri" w:cs="Calibri" w:eastAsia="Calibri" w:hAnsi="Calibri"/>
+          <w:color w:val="14213D"/>
+          <w:sz w:val="20"/>
+          <w:szCs w:val="20"/>
+        </w:rPr>
+        <w:t xml:space="preserve">Accident : les champs définitifs (RH), l'e-mail automatique (à qui ?), le registre des accidents bénins imprimable — après ton retour de la RH.</w:t>
+      </w:r>
+    </w:p>
+    <w:p>
+      <w:pPr>
+        <w:pStyle w:val="ListParagraph"/>
+        <w:numPr>
+          <w:ilvl w:val="0"/>
+          <w:numId w:val="2"/>
+        </w:numPr>
+        <w:spacing w:after="40"/>
+      </w:pPr>
+      <w:r>
+        <w:rPr>
+          <w:rFonts w:ascii="Calibri" w:cs="Calibri" w:eastAsia="Calibri" w:hAnsi="Calibri"/>
+          <w:color w:val="14213D"/>
+          <w:sz w:val="20"/>
+          <w:szCs w:val="20"/>
+        </w:rPr>
+        <w:t xml:space="preserve">Variables de paie : la forme exacte du rapport (RH).</w:t>
+      </w:r>
+    </w:p>
+    <w:p>
+      <w:pPr>
+        <w:pStyle w:val="ListParagraph"/>
+        <w:numPr>
+          <w:ilvl w:val="0"/>
+          <w:numId w:val="2"/>
+        </w:numPr>
+        <w:spacing w:after="40"/>
+      </w:pPr>
+      <w:r>
+        <w:rPr>
+          <w:rFonts w:ascii="Calibri" w:cs="Calibri" w:eastAsia="Calibri" w:hAnsi="Calibri"/>
+          <w:color w:val="14213D"/>
+          <w:sz w:val="20"/>
+          <w:szCs w:val="20"/>
+        </w:rPr>
+        <w:t xml:space="preserve">Magasin et matériel (Parc) : périmètre à cadrer avec toi / le magasinier.</w:t>
+      </w:r>
+    </w:p>
+    <w:p>
+      <w:pPr>
+        <w:pStyle w:val="ListParagraph"/>
+        <w:numPr>
+          <w:ilvl w:val="0"/>
+          <w:numId w:val="2"/>
+        </w:numPr>
+        <w:spacing w:after="40"/>
+      </w:pPr>
+      <w:r>
+        <w:rPr>
+          <w:rFonts w:ascii="Calibri" w:cs="Calibri" w:eastAsia="Calibri" w:hAnsi="Calibri"/>
+          <w:color w:val="14213D"/>
+          <w:sz w:val="20"/>
+          <w:szCs w:val="20"/>
+        </w:rPr>
+        <w:t xml:space="preserve">Lecture automatique du tableau de facturation Excel : si le format est stable.</w:t>
       </w:r>
     </w:p>
     <w:p>
@@ -9319,7 +12207,7 @@
           <w:sz w:val="20"/>
           <w:szCs w:val="20"/>
         </w:rPr>
-        <w:t xml:space="preserve">Résumé : Ventilation (hubs, facettes, ＋ Poser), agir comme, raccourci planning, ma semaine (.ics), retours Word 5-9</w:t>
+        <w:t xml:space="preserve">Résumé : Six onglets (Commerce, Parc, Sécurité), accidents v1, Outlook serveur, production par équipe, récap Mes chantiers, communication interne</w:t>
       </w:r>
     </w:p>
     <w:p>
@@ -9338,7 +12226,7 @@
           <w:sz w:val="20"/>
           <w:szCs w:val="20"/>
         </w:rPr>
-        <w:t xml:space="preserve">Description : nouvelle ventilation portée (4 territoires, hubs Équipes / Entreprise, en-tête + facettes du chantier, FAB ＋ Poser, calque objectifs, Bureau) ; ✍ agir comme (admin, via tracé, signatures personnelles) ; ＋ nouvelle personne depuis le planning (prov, finalisation admin, re-clé du planning) ; Ma semaine + export .ics ; chargés d'affaires en liste, DCE (zip d'origine, notes de lecture), flotte (dessins, photos, échéances), adresses, GD par personne (détentes, exceptions), rapport objectifs chantier → équipe → jour, NC levées tracées, notes de frais, comptes chantier v1, bons (type de dépense) ; sql/retours_12-10.sql ; 43 suites.</w:t>
+        <w:t xml:space="preserve">Description : retours du 12/10 soir — six onglets (Aujourd'hui · Chantiers [Carte / Liste / Équipes &amp; heures / Sécurité] · Moi · Commerce · Parc · Entreprise), Entreprise réduit (annuaire, documents, communication interne publiable, présentation), récap Mes chantiers sous la carte → Bureau (doublon retiré), notes de frais dans Moi, Production par équipe (planning → équipe → personne, objectifs), Variables de paie (rapport RH sans production), Commerce (reporting + traçabilité, devis &amp; chiffrage avec 10 versions, dossiers en cours + tableau de facturation client, terminés), Parc (flotte, magasin / matériel à cadrer), Sécurité → déclarer un accident v1 (+ bouton QSE du chantier, notification RH, traité), Outlook automatique (Edge Function outlook-sync + lien publié, synchro 2 h) ; sql/retours_12-10b.sql ; e2e_onglets ; 44 suites.</w:t>
       </w:r>
     </w:p>
     <w:sectPr>

</xml_diff>

<commit_message>
Navigateur de semaine, ticket de note de frais en photo, photo du véhicule, onglet SCR, → Outlook, maquette chiffrage A→Z
</commit_message>
<xml_diff>
--- a/app/docs/Feuille_de_route_controle_12-10.docx
+++ b/app/docs/Feuille_de_route_controle_12-10.docx
@@ -65,7 +65,7 @@
           <w:sz w:val="20"/>
           <w:szCs w:val="20"/>
         </w:rPr>
-        <w:t xml:space="preserve">Même principe que la précédente : tu contrôles ligne par ligne, tu écris dans « Vos commentaires » (OK / à corriger / à changer : quoi), tu me renvoies le fichier. Je corrige à partir de tes commentaires, dans l'ordre du document. Commence par la section F (tes retours du 12/10 soir) : c'est ce qui a le plus bougé.</w:t>
+        <w:t xml:space="preserve">Même principe que la précédente : tu contrôles ligne par ligne, tu écris dans « Vos commentaires » (OK / à corriger / à changer : quoi), tu me renvoies le fichier. Je corrige à partir de tes commentaires, dans l'ordre du document. Commence par la section G (ce qui a bougé pendant la nuit, dont la maquette du chiffrage à regarder ensemble), puis F (tes retours du 12/10 soir).</w:t>
       </w:r>
     </w:p>
     <w:p>
@@ -84,7 +84,7 @@
           <w:sz w:val="20"/>
           <w:szCs w:val="20"/>
         </w:rPr>
-        <w:t xml:space="preserve">Build livré : 12/10/2026 · f6fd03 (index.html + traceur.html à la racine du dépôt). Avant de tester connecté : passer app/sql/retours_12-10.sql PUIS app/sql/retours_12-10b.sql (ci-dessous), et déployer la fonction serveur outlook-sync (3 minutes, app/supabase/functions/outlook-sync/README.md). Hors connexion, tout se teste avec les personnages de démo.</w:t>
+        <w:t xml:space="preserve">Build livré : 13/10/2026 · d68daa (index.html + traceur.html + maquette-chiffrage.html à la racine du dépôt). SQL retours_12-10.sql et retours_12-10b.sql passés, fonction outlook-sync déployée et vérifiée par toi le 12/10 au soir (« ça fonctionne parfaitement »). Hors connexion, tout se teste avec les personnages de démo.</w:t>
       </w:r>
     </w:p>
     <w:p>
@@ -103,7 +103,7 @@
           <w:sz w:val="20"/>
           <w:szCs w:val="20"/>
         </w:rPr>
-        <w:t xml:space="preserve">Règle gardée : rien d'ancien n'est supprimé ; 44 suites de tests automatiques passent (43 + e2e_onglets, 11 points sur les nouveaux onglets), 9 suites adaptées aux nouveaux noms et aux hubs.</w:t>
+        <w:t xml:space="preserve">Règle gardée : rien d'ancien n'est supprimé ; 44 suites de tests automatiques passent (e2e_onglets = 14 points sur les nouveaux onglets et la nuit), 9 suites adaptées aux nouveaux noms et aux hubs.</w:t>
       </w:r>
     </w:p>
     <w:p>
@@ -11916,6 +11916,1504 @@
                 <w:szCs w:val="19"/>
               </w:rPr>
               <w:t xml:space="preserve">Fait (à déployer)</w:t>
+            </w:r>
+          </w:p>
+        </w:tc>
+        <w:tc>
+          <w:tcPr>
+            <w:tcW w:type="dxa" w:w="3700"/>
+            <w:tcBorders>
+              <w:top w:val="single" w:color="D9D5CB" w:sz="4"/>
+              <w:left w:val="single" w:color="D9D5CB" w:sz="4"/>
+              <w:bottom w:val="single" w:color="D9D5CB" w:sz="4"/>
+              <w:right w:val="single" w:color="D9D5CB" w:sz="4"/>
+            </w:tcBorders>
+            <w:tcMar>
+              <w:top w:type="dxa" w:w="60"/>
+              <w:left w:type="dxa" w:w="90"/>
+              <w:bottom w:type="dxa" w:w="60"/>
+              <w:right w:type="dxa" w:w="90"/>
+            </w:tcMar>
+            <w:vAlign w:val="top"/>
+          </w:tcPr>
+          <w:p>
+            <w:pPr>
+              <w:spacing w:after="40"/>
+            </w:pPr>
+            <w:r>
+              <w:rPr>
+                <w:rFonts w:ascii="Calibri" w:cs="Calibri" w:eastAsia="Calibri" w:hAnsi="Calibri"/>
+                <w:color w:val="14213D"/>
+                <w:sz w:val="20"/>
+                <w:szCs w:val="20"/>
+              </w:rPr>
+              <w:t xml:space="preserve"/>
+            </w:r>
+          </w:p>
+          <w:p>
+            <w:pPr>
+              <w:spacing w:after="40"/>
+            </w:pPr>
+            <w:r>
+              <w:rPr>
+                <w:rFonts w:ascii="Calibri" w:cs="Calibri" w:eastAsia="Calibri" w:hAnsi="Calibri"/>
+                <w:color w:val="14213D"/>
+                <w:sz w:val="20"/>
+                <w:szCs w:val="20"/>
+              </w:rPr>
+              <w:t xml:space="preserve"/>
+            </w:r>
+          </w:p>
+        </w:tc>
+      </w:tr>
+    </w:tbl>
+    <w:p>
+      <w:pPr>
+        <w:pStyle w:val="Heading1"/>
+        <w:spacing w:after="120" w:before="320"/>
+      </w:pPr>
+      <w:r>
+        <w:rPr>
+          <w:rFonts w:ascii="Calibri" w:cs="Calibri" w:eastAsia="Calibri" w:hAnsi="Calibri"/>
+          <w:b/>
+          <w:bCs/>
+          <w:color w:val="EB6834"/>
+          <w:sz w:val="30"/>
+          <w:szCs w:val="30"/>
+        </w:rPr>
+        <w:t xml:space="preserve">G · Pendant la nuit du 12 au 13/10 (tes retours en direct)</w:t>
+      </w:r>
+    </w:p>
+    <w:p>
+      <w:pPr>
+        <w:spacing w:after="80" w:line="264"/>
+      </w:pPr>
+      <w:r>
+        <w:rPr>
+          <w:rFonts w:ascii="Calibri" w:cs="Calibri" w:eastAsia="Calibri" w:hAnsi="Calibri"/>
+          <w:color w:val="6B6B66"/>
+          <w:sz w:val="20"/>
+          <w:szCs w:val="20"/>
+        </w:rPr>
+        <w:t xml:space="preserve">Ce que tu as dit après avoir relié Outlook, dans l'ordre. À vérifier connecté avec ton compte.</w:t>
+      </w:r>
+    </w:p>
+    <w:tbl>
+      <w:tblPr>
+        <w:tblW w:type="dxa" w:w="15100"/>
+        <w:tblBorders>
+          <w:top w:val="single" w:color="auto" w:sz="4"/>
+          <w:left w:val="single" w:color="auto" w:sz="4"/>
+          <w:bottom w:val="single" w:color="auto" w:sz="4"/>
+          <w:right w:val="single" w:color="auto" w:sz="4"/>
+          <w:insideH w:val="single" w:color="auto" w:sz="4"/>
+          <w:insideV w:val="single" w:color="auto" w:sz="4"/>
+        </w:tblBorders>
+      </w:tblPr>
+      <w:tblGrid>
+        <w:gridCol w:w="2300"/>
+        <w:gridCol w:w="4100"/>
+        <w:gridCol w:w="3700"/>
+        <w:gridCol w:w="1300"/>
+        <w:gridCol w:w="3700"/>
+      </w:tblGrid>
+      <w:tr>
+        <w:trPr>
+          <w:tblHeader/>
+        </w:trPr>
+        <w:tc>
+          <w:tcPr>
+            <w:tcW w:type="dxa" w:w="2300"/>
+            <w:tcBorders>
+              <w:top w:val="single" w:color="D9D5CB" w:sz="4"/>
+              <w:left w:val="single" w:color="D9D5CB" w:sz="4"/>
+              <w:bottom w:val="single" w:color="D9D5CB" w:sz="4"/>
+              <w:right w:val="single" w:color="D9D5CB" w:sz="4"/>
+            </w:tcBorders>
+            <w:shd w:fill="14213D" w:color="auto" w:val="clear"/>
+            <w:tcMar>
+              <w:top w:type="dxa" w:w="60"/>
+              <w:left w:type="dxa" w:w="90"/>
+              <w:bottom w:type="dxa" w:w="60"/>
+              <w:right w:type="dxa" w:w="90"/>
+            </w:tcMar>
+            <w:vAlign w:val="top"/>
+          </w:tcPr>
+          <w:p>
+            <w:pPr>
+              <w:spacing w:after="80" w:line="264"/>
+            </w:pPr>
+            <w:r>
+              <w:rPr>
+                <w:rFonts w:ascii="Calibri" w:cs="Calibri" w:eastAsia="Calibri" w:hAnsi="Calibri"/>
+                <w:b/>
+                <w:bCs/>
+                <w:color w:val="FFFFFF"/>
+                <w:sz w:val="19"/>
+                <w:szCs w:val="19"/>
+              </w:rPr>
+              <w:t xml:space="preserve">Fonctionnalité</w:t>
+            </w:r>
+          </w:p>
+        </w:tc>
+        <w:tc>
+          <w:tcPr>
+            <w:tcW w:type="dxa" w:w="4100"/>
+            <w:tcBorders>
+              <w:top w:val="single" w:color="D9D5CB" w:sz="4"/>
+              <w:left w:val="single" w:color="D9D5CB" w:sz="4"/>
+              <w:bottom w:val="single" w:color="D9D5CB" w:sz="4"/>
+              <w:right w:val="single" w:color="D9D5CB" w:sz="4"/>
+            </w:tcBorders>
+            <w:shd w:fill="14213D" w:color="auto" w:val="clear"/>
+            <w:tcMar>
+              <w:top w:type="dxa" w:w="60"/>
+              <w:left w:type="dxa" w:w="90"/>
+              <w:bottom w:type="dxa" w:w="60"/>
+              <w:right w:type="dxa" w:w="90"/>
+            </w:tcMar>
+            <w:vAlign w:val="top"/>
+          </w:tcPr>
+          <w:p>
+            <w:pPr>
+              <w:spacing w:after="80" w:line="264"/>
+            </w:pPr>
+            <w:r>
+              <w:rPr>
+                <w:rFonts w:ascii="Calibri" w:cs="Calibri" w:eastAsia="Calibri" w:hAnsi="Calibri"/>
+                <w:b/>
+                <w:bCs/>
+                <w:color w:val="FFFFFF"/>
+                <w:sz w:val="19"/>
+                <w:szCs w:val="19"/>
+              </w:rPr>
+              <w:t xml:space="preserve">Où la trouver · comment tester</w:t>
+            </w:r>
+          </w:p>
+        </w:tc>
+        <w:tc>
+          <w:tcPr>
+            <w:tcW w:type="dxa" w:w="3700"/>
+            <w:tcBorders>
+              <w:top w:val="single" w:color="D9D5CB" w:sz="4"/>
+              <w:left w:val="single" w:color="D9D5CB" w:sz="4"/>
+              <w:bottom w:val="single" w:color="D9D5CB" w:sz="4"/>
+              <w:right w:val="single" w:color="D9D5CB" w:sz="4"/>
+            </w:tcBorders>
+            <w:shd w:fill="14213D" w:color="auto" w:val="clear"/>
+            <w:tcMar>
+              <w:top w:type="dxa" w:w="60"/>
+              <w:left w:type="dxa" w:w="90"/>
+              <w:bottom w:type="dxa" w:w="60"/>
+              <w:right w:type="dxa" w:w="90"/>
+            </w:tcMar>
+            <w:vAlign w:val="top"/>
+          </w:tcPr>
+          <w:p>
+            <w:pPr>
+              <w:spacing w:after="80" w:line="264"/>
+            </w:pPr>
+            <w:r>
+              <w:rPr>
+                <w:rFonts w:ascii="Calibri" w:cs="Calibri" w:eastAsia="Calibri" w:hAnsi="Calibri"/>
+                <w:b/>
+                <w:bCs/>
+                <w:color w:val="FFFFFF"/>
+                <w:sz w:val="19"/>
+                <w:szCs w:val="19"/>
+              </w:rPr>
+              <w:t xml:space="preserve">Hypothèses · limites · ce que j'ai tranché</w:t>
+            </w:r>
+          </w:p>
+        </w:tc>
+        <w:tc>
+          <w:tcPr>
+            <w:tcW w:type="dxa" w:w="1300"/>
+            <w:tcBorders>
+              <w:top w:val="single" w:color="D9D5CB" w:sz="4"/>
+              <w:left w:val="single" w:color="D9D5CB" w:sz="4"/>
+              <w:bottom w:val="single" w:color="D9D5CB" w:sz="4"/>
+              <w:right w:val="single" w:color="D9D5CB" w:sz="4"/>
+            </w:tcBorders>
+            <w:shd w:fill="14213D" w:color="auto" w:val="clear"/>
+            <w:tcMar>
+              <w:top w:type="dxa" w:w="60"/>
+              <w:left w:type="dxa" w:w="90"/>
+              <w:bottom w:type="dxa" w:w="60"/>
+              <w:right w:type="dxa" w:w="90"/>
+            </w:tcMar>
+            <w:vAlign w:val="top"/>
+          </w:tcPr>
+          <w:p>
+            <w:pPr>
+              <w:spacing w:after="80" w:line="264"/>
+            </w:pPr>
+            <w:r>
+              <w:rPr>
+                <w:rFonts w:ascii="Calibri" w:cs="Calibri" w:eastAsia="Calibri" w:hAnsi="Calibri"/>
+                <w:b/>
+                <w:bCs/>
+                <w:color w:val="FFFFFF"/>
+                <w:sz w:val="19"/>
+                <w:szCs w:val="19"/>
+              </w:rPr>
+              <w:t xml:space="preserve">Statut</w:t>
+            </w:r>
+          </w:p>
+        </w:tc>
+        <w:tc>
+          <w:tcPr>
+            <w:tcW w:type="dxa" w:w="3700"/>
+            <w:tcBorders>
+              <w:top w:val="single" w:color="D9D5CB" w:sz="4"/>
+              <w:left w:val="single" w:color="D9D5CB" w:sz="4"/>
+              <w:bottom w:val="single" w:color="D9D5CB" w:sz="4"/>
+              <w:right w:val="single" w:color="D9D5CB" w:sz="4"/>
+            </w:tcBorders>
+            <w:shd w:fill="14213D" w:color="auto" w:val="clear"/>
+            <w:tcMar>
+              <w:top w:type="dxa" w:w="60"/>
+              <w:left w:type="dxa" w:w="90"/>
+              <w:bottom w:type="dxa" w:w="60"/>
+              <w:right w:type="dxa" w:w="90"/>
+            </w:tcMar>
+            <w:vAlign w:val="top"/>
+          </w:tcPr>
+          <w:p>
+            <w:pPr>
+              <w:spacing w:after="80" w:line="264"/>
+            </w:pPr>
+            <w:r>
+              <w:rPr>
+                <w:rFonts w:ascii="Calibri" w:cs="Calibri" w:eastAsia="Calibri" w:hAnsi="Calibri"/>
+                <w:b/>
+                <w:bCs/>
+                <w:color w:val="FFFFFF"/>
+                <w:sz w:val="19"/>
+                <w:szCs w:val="19"/>
+              </w:rPr>
+              <w:t xml:space="preserve">Vos commentaires</w:t>
+            </w:r>
+          </w:p>
+        </w:tc>
+      </w:tr>
+      <w:tr>
+        <w:tc>
+          <w:tcPr>
+            <w:tcW w:type="dxa" w:w="2300"/>
+            <w:tcBorders>
+              <w:top w:val="single" w:color="D9D5CB" w:sz="4"/>
+              <w:left w:val="single" w:color="D9D5CB" w:sz="4"/>
+              <w:bottom w:val="single" w:color="D9D5CB" w:sz="4"/>
+              <w:right w:val="single" w:color="D9D5CB" w:sz="4"/>
+            </w:tcBorders>
+            <w:tcMar>
+              <w:top w:type="dxa" w:w="60"/>
+              <w:left w:type="dxa" w:w="90"/>
+              <w:bottom w:type="dxa" w:w="60"/>
+              <w:right w:type="dxa" w:w="90"/>
+            </w:tcMar>
+            <w:vAlign w:val="top"/>
+          </w:tcPr>
+          <w:p>
+            <w:pPr>
+              <w:spacing w:after="40"/>
+            </w:pPr>
+            <w:r>
+              <w:rPr>
+                <w:rFonts w:ascii="Calibri" w:cs="Calibri" w:eastAsia="Calibri" w:hAnsi="Calibri"/>
+                <w:b/>
+                <w:bCs/>
+                <w:color w:val="14213D"/>
+                <w:sz w:val="20"/>
+                <w:szCs w:val="20"/>
+              </w:rPr>
+              <w:t xml:space="preserve">Outlook relié : import / export de fichier</w:t>
+            </w:r>
+          </w:p>
+        </w:tc>
+        <w:tc>
+          <w:tcPr>
+            <w:tcW w:type="dxa" w:w="4100"/>
+            <w:tcBorders>
+              <w:top w:val="single" w:color="D9D5CB" w:sz="4"/>
+              <w:left w:val="single" w:color="D9D5CB" w:sz="4"/>
+              <w:bottom w:val="single" w:color="D9D5CB" w:sz="4"/>
+              <w:right w:val="single" w:color="D9D5CB" w:sz="4"/>
+            </w:tcBorders>
+            <w:tcMar>
+              <w:top w:type="dxa" w:w="60"/>
+              <w:left w:type="dxa" w:w="90"/>
+              <w:bottom w:type="dxa" w:w="60"/>
+              <w:right w:type="dxa" w:w="90"/>
+            </w:tcMar>
+            <w:vAlign w:val="top"/>
+          </w:tcPr>
+          <w:p>
+            <w:pPr>
+              <w:spacing w:after="40"/>
+            </w:pPr>
+            <w:r>
+              <w:rPr>
+                <w:rFonts w:ascii="Calibri" w:cs="Calibri" w:eastAsia="Calibri" w:hAnsi="Calibri"/>
+                <w:color w:val="14213D"/>
+                <w:sz w:val="19"/>
+                <w:szCs w:val="19"/>
+              </w:rPr>
+              <w:t xml:space="preserve">Quand ton lien est relié, le bouton « Importer un fichier » disparaît (il ne servait qu'à ceux sans lien publié). « Exporter la semaine vers Outlook (.ics) » reste : c'est le sens TRACÉ → Outlook pour toute la semaine (tes entrées + journées chantier).</w:t>
+            </w:r>
+          </w:p>
+        </w:tc>
+        <w:tc>
+          <w:tcPr>
+            <w:tcW w:type="dxa" w:w="3700"/>
+            <w:tcBorders>
+              <w:top w:val="single" w:color="D9D5CB" w:sz="4"/>
+              <w:left w:val="single" w:color="D9D5CB" w:sz="4"/>
+              <w:bottom w:val="single" w:color="D9D5CB" w:sz="4"/>
+              <w:right w:val="single" w:color="D9D5CB" w:sz="4"/>
+            </w:tcBorders>
+            <w:tcMar>
+              <w:top w:type="dxa" w:w="60"/>
+              <w:left w:type="dxa" w:w="90"/>
+              <w:bottom w:type="dxa" w:w="60"/>
+              <w:right w:type="dxa" w:w="90"/>
+            </w:tcMar>
+            <w:vAlign w:val="top"/>
+          </w:tcPr>
+          <w:p>
+            <w:pPr>
+              <w:spacing w:after="40"/>
+            </w:pPr>
+            <w:r>
+              <w:rPr>
+                <w:rFonts w:ascii="Calibri" w:cs="Calibri" w:eastAsia="Calibri" w:hAnsi="Calibri"/>
+                <w:color w:val="14213D"/>
+                <w:sz w:val="19"/>
+                <w:szCs w:val="19"/>
+              </w:rPr>
+              <w:t xml:space="preserve">Deux sens : Outlook → TRACÉ automatique (lien publié + fonction serveur) ; TRACÉ → Outlook par fichier .ics (voir ligne suivante).</w:t>
+            </w:r>
+          </w:p>
+        </w:tc>
+        <w:tc>
+          <w:tcPr>
+            <w:tcW w:type="dxa" w:w="1300"/>
+            <w:tcBorders>
+              <w:top w:val="single" w:color="D9D5CB" w:sz="4"/>
+              <w:left w:val="single" w:color="D9D5CB" w:sz="4"/>
+              <w:bottom w:val="single" w:color="D9D5CB" w:sz="4"/>
+              <w:right w:val="single" w:color="D9D5CB" w:sz="4"/>
+            </w:tcBorders>
+            <w:shd w:fill="E6F5EC" w:color="auto" w:val="clear"/>
+            <w:tcMar>
+              <w:top w:type="dxa" w:w="60"/>
+              <w:left w:type="dxa" w:w="90"/>
+              <w:bottom w:type="dxa" w:w="60"/>
+              <w:right w:type="dxa" w:w="90"/>
+            </w:tcMar>
+            <w:vAlign w:val="top"/>
+          </w:tcPr>
+          <w:p>
+            <w:pPr>
+              <w:spacing w:after="40"/>
+            </w:pPr>
+            <w:r>
+              <w:rPr>
+                <w:rFonts w:ascii="Calibri" w:cs="Calibri" w:eastAsia="Calibri" w:hAnsi="Calibri"/>
+                <w:b/>
+                <w:bCs/>
+                <w:color w:val="14213D"/>
+                <w:sz w:val="19"/>
+                <w:szCs w:val="19"/>
+              </w:rPr>
+              <w:t xml:space="preserve">Fait</w:t>
+            </w:r>
+          </w:p>
+        </w:tc>
+        <w:tc>
+          <w:tcPr>
+            <w:tcW w:type="dxa" w:w="3700"/>
+            <w:tcBorders>
+              <w:top w:val="single" w:color="D9D5CB" w:sz="4"/>
+              <w:left w:val="single" w:color="D9D5CB" w:sz="4"/>
+              <w:bottom w:val="single" w:color="D9D5CB" w:sz="4"/>
+              <w:right w:val="single" w:color="D9D5CB" w:sz="4"/>
+            </w:tcBorders>
+            <w:tcMar>
+              <w:top w:type="dxa" w:w="60"/>
+              <w:left w:type="dxa" w:w="90"/>
+              <w:bottom w:type="dxa" w:w="60"/>
+              <w:right w:type="dxa" w:w="90"/>
+            </w:tcMar>
+            <w:vAlign w:val="top"/>
+          </w:tcPr>
+          <w:p>
+            <w:pPr>
+              <w:spacing w:after="40"/>
+            </w:pPr>
+            <w:r>
+              <w:rPr>
+                <w:rFonts w:ascii="Calibri" w:cs="Calibri" w:eastAsia="Calibri" w:hAnsi="Calibri"/>
+                <w:color w:val="14213D"/>
+                <w:sz w:val="20"/>
+                <w:szCs w:val="20"/>
+              </w:rPr>
+              <w:t xml:space="preserve"/>
+            </w:r>
+          </w:p>
+          <w:p>
+            <w:pPr>
+              <w:spacing w:after="40"/>
+            </w:pPr>
+            <w:r>
+              <w:rPr>
+                <w:rFonts w:ascii="Calibri" w:cs="Calibri" w:eastAsia="Calibri" w:hAnsi="Calibri"/>
+                <w:color w:val="14213D"/>
+                <w:sz w:val="20"/>
+                <w:szCs w:val="20"/>
+              </w:rPr>
+              <w:t xml:space="preserve"/>
+            </w:r>
+          </w:p>
+        </w:tc>
+      </w:tr>
+      <w:tr>
+        <w:tc>
+          <w:tcPr>
+            <w:tcW w:type="dxa" w:w="2300"/>
+            <w:tcBorders>
+              <w:top w:val="single" w:color="D9D5CB" w:sz="4"/>
+              <w:left w:val="single" w:color="D9D5CB" w:sz="4"/>
+              <w:bottom w:val="single" w:color="D9D5CB" w:sz="4"/>
+              <w:right w:val="single" w:color="D9D5CB" w:sz="4"/>
+            </w:tcBorders>
+            <w:tcMar>
+              <w:top w:type="dxa" w:w="60"/>
+              <w:left w:type="dxa" w:w="90"/>
+              <w:bottom w:type="dxa" w:w="60"/>
+              <w:right w:type="dxa" w:w="90"/>
+            </w:tcMar>
+            <w:vAlign w:val="top"/>
+          </w:tcPr>
+          <w:p>
+            <w:pPr>
+              <w:spacing w:after="40"/>
+            </w:pPr>
+            <w:r>
+              <w:rPr>
+                <w:rFonts w:ascii="Calibri" w:cs="Calibri" w:eastAsia="Calibri" w:hAnsi="Calibri"/>
+                <w:b/>
+                <w:bCs/>
+                <w:color w:val="14213D"/>
+                <w:sz w:val="20"/>
+                <w:szCs w:val="20"/>
+              </w:rPr>
+              <w:t xml:space="preserve">Créer un rendez-vous dans l'appli, à côté de ceux d'Outlook</w:t>
+            </w:r>
+          </w:p>
+        </w:tc>
+        <w:tc>
+          <w:tcPr>
+            <w:tcW w:type="dxa" w:w="4100"/>
+            <w:tcBorders>
+              <w:top w:val="single" w:color="D9D5CB" w:sz="4"/>
+              <w:left w:val="single" w:color="D9D5CB" w:sz="4"/>
+              <w:bottom w:val="single" w:color="D9D5CB" w:sz="4"/>
+              <w:right w:val="single" w:color="D9D5CB" w:sz="4"/>
+            </w:tcBorders>
+            <w:tcMar>
+              <w:top w:type="dxa" w:w="60"/>
+              <w:left w:type="dxa" w:w="90"/>
+              <w:bottom w:type="dxa" w:w="60"/>
+              <w:right w:type="dxa" w:w="90"/>
+            </w:tcMar>
+            <w:vAlign w:val="top"/>
+          </w:tcPr>
+          <w:p>
+            <w:pPr>
+              <w:spacing w:after="40"/>
+            </w:pPr>
+            <w:r>
+              <w:rPr>
+                <w:rFonts w:ascii="Calibri" w:cs="Calibri" w:eastAsia="Calibri" w:hAnsi="Calibri"/>
+                <w:color w:val="14213D"/>
+                <w:sz w:val="19"/>
+                <w:szCs w:val="19"/>
+              </w:rPr>
+              <w:t xml:space="preserve">Oui : ＋ sur un jour = une ligne à toi, qui reste à côté des lignes Outlook (la synchro ne touche jamais ce que tu as créé à la main). Pour l'avoir AUSSI dans Outlook : « → Outlook » sur la ligne → un fichier .ics d'un seul rendez-vous → double-clic → Enregistrer et fermer. Pas de doublon à la synchro suivante (l'appli reconnaît ses propres rendez-vous).</w:t>
+            </w:r>
+          </w:p>
+        </w:tc>
+        <w:tc>
+          <w:tcPr>
+            <w:tcW w:type="dxa" w:w="3700"/>
+            <w:tcBorders>
+              <w:top w:val="single" w:color="D9D5CB" w:sz="4"/>
+              <w:left w:val="single" w:color="D9D5CB" w:sz="4"/>
+              <w:bottom w:val="single" w:color="D9D5CB" w:sz="4"/>
+              <w:right w:val="single" w:color="D9D5CB" w:sz="4"/>
+            </w:tcBorders>
+            <w:tcMar>
+              <w:top w:type="dxa" w:w="60"/>
+              <w:left w:type="dxa" w:w="90"/>
+              <w:bottom w:type="dxa" w:w="60"/>
+              <w:right w:type="dxa" w:w="90"/>
+            </w:tcMar>
+            <w:vAlign w:val="top"/>
+          </w:tcPr>
+          <w:p>
+            <w:pPr>
+              <w:spacing w:after="40"/>
+            </w:pPr>
+            <w:r>
+              <w:rPr>
+                <w:rFonts w:ascii="Calibri" w:cs="Calibri" w:eastAsia="Calibri" w:hAnsi="Calibri"/>
+                <w:color w:val="14213D"/>
+                <w:sz w:val="19"/>
+                <w:szCs w:val="19"/>
+              </w:rPr>
+              <w:t xml:space="preserve">L'écriture directe dans ton Outlook sans fichier = Microsoft Graph (compte Azure SCR, autorisation IT) : à décider, pas fait.</w:t>
+            </w:r>
+          </w:p>
+        </w:tc>
+        <w:tc>
+          <w:tcPr>
+            <w:tcW w:type="dxa" w:w="1300"/>
+            <w:tcBorders>
+              <w:top w:val="single" w:color="D9D5CB" w:sz="4"/>
+              <w:left w:val="single" w:color="D9D5CB" w:sz="4"/>
+              <w:bottom w:val="single" w:color="D9D5CB" w:sz="4"/>
+              <w:right w:val="single" w:color="D9D5CB" w:sz="4"/>
+            </w:tcBorders>
+            <w:shd w:fill="E6F5EC" w:color="auto" w:val="clear"/>
+            <w:tcMar>
+              <w:top w:type="dxa" w:w="60"/>
+              <w:left w:type="dxa" w:w="90"/>
+              <w:bottom w:type="dxa" w:w="60"/>
+              <w:right w:type="dxa" w:w="90"/>
+            </w:tcMar>
+            <w:vAlign w:val="top"/>
+          </w:tcPr>
+          <w:p>
+            <w:pPr>
+              <w:spacing w:after="40"/>
+            </w:pPr>
+            <w:r>
+              <w:rPr>
+                <w:rFonts w:ascii="Calibri" w:cs="Calibri" w:eastAsia="Calibri" w:hAnsi="Calibri"/>
+                <w:b/>
+                <w:bCs/>
+                <w:color w:val="14213D"/>
+                <w:sz w:val="19"/>
+                <w:szCs w:val="19"/>
+              </w:rPr>
+              <w:t xml:space="preserve">Fait</w:t>
+            </w:r>
+          </w:p>
+        </w:tc>
+        <w:tc>
+          <w:tcPr>
+            <w:tcW w:type="dxa" w:w="3700"/>
+            <w:tcBorders>
+              <w:top w:val="single" w:color="D9D5CB" w:sz="4"/>
+              <w:left w:val="single" w:color="D9D5CB" w:sz="4"/>
+              <w:bottom w:val="single" w:color="D9D5CB" w:sz="4"/>
+              <w:right w:val="single" w:color="D9D5CB" w:sz="4"/>
+            </w:tcBorders>
+            <w:tcMar>
+              <w:top w:type="dxa" w:w="60"/>
+              <w:left w:type="dxa" w:w="90"/>
+              <w:bottom w:type="dxa" w:w="60"/>
+              <w:right w:type="dxa" w:w="90"/>
+            </w:tcMar>
+            <w:vAlign w:val="top"/>
+          </w:tcPr>
+          <w:p>
+            <w:pPr>
+              <w:spacing w:after="40"/>
+            </w:pPr>
+            <w:r>
+              <w:rPr>
+                <w:rFonts w:ascii="Calibri" w:cs="Calibri" w:eastAsia="Calibri" w:hAnsi="Calibri"/>
+                <w:color w:val="14213D"/>
+                <w:sz w:val="20"/>
+                <w:szCs w:val="20"/>
+              </w:rPr>
+              <w:t xml:space="preserve"/>
+            </w:r>
+          </w:p>
+          <w:p>
+            <w:pPr>
+              <w:spacing w:after="40"/>
+            </w:pPr>
+            <w:r>
+              <w:rPr>
+                <w:rFonts w:ascii="Calibri" w:cs="Calibri" w:eastAsia="Calibri" w:hAnsi="Calibri"/>
+                <w:color w:val="14213D"/>
+                <w:sz w:val="20"/>
+                <w:szCs w:val="20"/>
+              </w:rPr>
+              <w:t xml:space="preserve"/>
+            </w:r>
+          </w:p>
+        </w:tc>
+      </w:tr>
+      <w:tr>
+        <w:tc>
+          <w:tcPr>
+            <w:tcW w:type="dxa" w:w="2300"/>
+            <w:tcBorders>
+              <w:top w:val="single" w:color="D9D5CB" w:sz="4"/>
+              <w:left w:val="single" w:color="D9D5CB" w:sz="4"/>
+              <w:bottom w:val="single" w:color="D9D5CB" w:sz="4"/>
+              <w:right w:val="single" w:color="D9D5CB" w:sz="4"/>
+            </w:tcBorders>
+            <w:tcMar>
+              <w:top w:type="dxa" w:w="60"/>
+              <w:left w:type="dxa" w:w="90"/>
+              <w:bottom w:type="dxa" w:w="60"/>
+              <w:right w:type="dxa" w:w="90"/>
+            </w:tcMar>
+            <w:vAlign w:val="top"/>
+          </w:tcPr>
+          <w:p>
+            <w:pPr>
+              <w:spacing w:after="40"/>
+            </w:pPr>
+            <w:r>
+              <w:rPr>
+                <w:rFonts w:ascii="Calibri" w:cs="Calibri" w:eastAsia="Calibri" w:hAnsi="Calibri"/>
+                <w:b/>
+                <w:bCs/>
+                <w:color w:val="14213D"/>
+                <w:sz w:val="20"/>
+                <w:szCs w:val="20"/>
+              </w:rPr>
+              <w:t xml:space="preserve">Navigateur de semaine, plus moderne</w:t>
+            </w:r>
+          </w:p>
+        </w:tc>
+        <w:tc>
+          <w:tcPr>
+            <w:tcW w:type="dxa" w:w="4100"/>
+            <w:tcBorders>
+              <w:top w:val="single" w:color="D9D5CB" w:sz="4"/>
+              <w:left w:val="single" w:color="D9D5CB" w:sz="4"/>
+              <w:bottom w:val="single" w:color="D9D5CB" w:sz="4"/>
+              <w:right w:val="single" w:color="D9D5CB" w:sz="4"/>
+            </w:tcBorders>
+            <w:tcMar>
+              <w:top w:type="dxa" w:w="60"/>
+              <w:left w:type="dxa" w:w="90"/>
+              <w:bottom w:type="dxa" w:w="60"/>
+              <w:right w:type="dxa" w:w="90"/>
+            </w:tcMar>
+            <w:vAlign w:val="top"/>
+          </w:tcPr>
+          <w:p>
+            <w:pPr>
+              <w:spacing w:after="40"/>
+            </w:pPr>
+            <w:r>
+              <w:rPr>
+                <w:rFonts w:ascii="Calibri" w:cs="Calibri" w:eastAsia="Calibri" w:hAnsi="Calibri"/>
+                <w:color w:val="14213D"/>
+                <w:sz w:val="19"/>
+                <w:szCs w:val="19"/>
+              </w:rPr>
+              <w:t xml:space="preserve">Ma semaine, Production par équipe, Planning équipe : bandeau ‹ Semaine 41 · 5 – 9 oct. 2026 · cette semaine › avec les 5 jours en pastilles (aujourd'hui en orange, points = rendez-vous / chantiers planifiés / personnes placées), « ↺ Cette semaine » dès qu'on s'éloigne. Toucher un jour dans Ma semaine fait défiler jusqu'à sa carte. Glisser vers la gauche / la droite (sur le bandeau ou sur les cartes des jours) change de semaine.</w:t>
+            </w:r>
+          </w:p>
+        </w:tc>
+        <w:tc>
+          <w:tcPr>
+            <w:tcW w:type="dxa" w:w="3700"/>
+            <w:tcBorders>
+              <w:top w:val="single" w:color="D9D5CB" w:sz="4"/>
+              <w:left w:val="single" w:color="D9D5CB" w:sz="4"/>
+              <w:bottom w:val="single" w:color="D9D5CB" w:sz="4"/>
+              <w:right w:val="single" w:color="D9D5CB" w:sz="4"/>
+            </w:tcBorders>
+            <w:tcMar>
+              <w:top w:type="dxa" w:w="60"/>
+              <w:left w:type="dxa" w:w="90"/>
+              <w:bottom w:type="dxa" w:w="60"/>
+              <w:right w:type="dxa" w:w="90"/>
+            </w:tcMar>
+            <w:vAlign w:val="top"/>
+          </w:tcPr>
+          <w:p>
+            <w:pPr>
+              <w:spacing w:after="40"/>
+            </w:pPr>
+            <w:r>
+              <w:rPr>
+                <w:rFonts w:ascii="Calibri" w:cs="Calibri" w:eastAsia="Calibri" w:hAnsi="Calibri"/>
+                <w:color w:val="14213D"/>
+                <w:sz w:val="19"/>
+                <w:szCs w:val="19"/>
+              </w:rPr>
+              <w:t xml:space="preserve">Objectifs des équipes garde son bandeau avec les jours cliquables (sélection d'un jour) ; dis-moi si tu le veux aussi.</w:t>
+            </w:r>
+          </w:p>
+        </w:tc>
+        <w:tc>
+          <w:tcPr>
+            <w:tcW w:type="dxa" w:w="1300"/>
+            <w:tcBorders>
+              <w:top w:val="single" w:color="D9D5CB" w:sz="4"/>
+              <w:left w:val="single" w:color="D9D5CB" w:sz="4"/>
+              <w:bottom w:val="single" w:color="D9D5CB" w:sz="4"/>
+              <w:right w:val="single" w:color="D9D5CB" w:sz="4"/>
+            </w:tcBorders>
+            <w:shd w:fill="E6F5EC" w:color="auto" w:val="clear"/>
+            <w:tcMar>
+              <w:top w:type="dxa" w:w="60"/>
+              <w:left w:type="dxa" w:w="90"/>
+              <w:bottom w:type="dxa" w:w="60"/>
+              <w:right w:type="dxa" w:w="90"/>
+            </w:tcMar>
+            <w:vAlign w:val="top"/>
+          </w:tcPr>
+          <w:p>
+            <w:pPr>
+              <w:spacing w:after="40"/>
+            </w:pPr>
+            <w:r>
+              <w:rPr>
+                <w:rFonts w:ascii="Calibri" w:cs="Calibri" w:eastAsia="Calibri" w:hAnsi="Calibri"/>
+                <w:b/>
+                <w:bCs/>
+                <w:color w:val="14213D"/>
+                <w:sz w:val="19"/>
+                <w:szCs w:val="19"/>
+              </w:rPr>
+              <w:t xml:space="preserve">Fait</w:t>
+            </w:r>
+          </w:p>
+        </w:tc>
+        <w:tc>
+          <w:tcPr>
+            <w:tcW w:type="dxa" w:w="3700"/>
+            <w:tcBorders>
+              <w:top w:val="single" w:color="D9D5CB" w:sz="4"/>
+              <w:left w:val="single" w:color="D9D5CB" w:sz="4"/>
+              <w:bottom w:val="single" w:color="D9D5CB" w:sz="4"/>
+              <w:right w:val="single" w:color="D9D5CB" w:sz="4"/>
+            </w:tcBorders>
+            <w:tcMar>
+              <w:top w:type="dxa" w:w="60"/>
+              <w:left w:type="dxa" w:w="90"/>
+              <w:bottom w:type="dxa" w:w="60"/>
+              <w:right w:type="dxa" w:w="90"/>
+            </w:tcMar>
+            <w:vAlign w:val="top"/>
+          </w:tcPr>
+          <w:p>
+            <w:pPr>
+              <w:spacing w:after="40"/>
+            </w:pPr>
+            <w:r>
+              <w:rPr>
+                <w:rFonts w:ascii="Calibri" w:cs="Calibri" w:eastAsia="Calibri" w:hAnsi="Calibri"/>
+                <w:color w:val="14213D"/>
+                <w:sz w:val="20"/>
+                <w:szCs w:val="20"/>
+              </w:rPr>
+              <w:t xml:space="preserve"/>
+            </w:r>
+          </w:p>
+          <w:p>
+            <w:pPr>
+              <w:spacing w:after="40"/>
+            </w:pPr>
+            <w:r>
+              <w:rPr>
+                <w:rFonts w:ascii="Calibri" w:cs="Calibri" w:eastAsia="Calibri" w:hAnsi="Calibri"/>
+                <w:color w:val="14213D"/>
+                <w:sz w:val="20"/>
+                <w:szCs w:val="20"/>
+              </w:rPr>
+              <w:t xml:space="preserve"/>
+            </w:r>
+          </w:p>
+        </w:tc>
+      </w:tr>
+      <w:tr>
+        <w:tc>
+          <w:tcPr>
+            <w:tcW w:type="dxa" w:w="2300"/>
+            <w:tcBorders>
+              <w:top w:val="single" w:color="D9D5CB" w:sz="4"/>
+              <w:left w:val="single" w:color="D9D5CB" w:sz="4"/>
+              <w:bottom w:val="single" w:color="D9D5CB" w:sz="4"/>
+              <w:right w:val="single" w:color="D9D5CB" w:sz="4"/>
+            </w:tcBorders>
+            <w:tcMar>
+              <w:top w:type="dxa" w:w="60"/>
+              <w:left w:type="dxa" w:w="90"/>
+              <w:bottom w:type="dxa" w:w="60"/>
+              <w:right w:type="dxa" w:w="90"/>
+            </w:tcMar>
+            <w:vAlign w:val="top"/>
+          </w:tcPr>
+          <w:p>
+            <w:pPr>
+              <w:spacing w:after="40"/>
+            </w:pPr>
+            <w:r>
+              <w:rPr>
+                <w:rFonts w:ascii="Calibri" w:cs="Calibri" w:eastAsia="Calibri" w:hAnsi="Calibri"/>
+                <w:b/>
+                <w:bCs/>
+                <w:color w:val="14213D"/>
+                <w:sz w:val="20"/>
+                <w:szCs w:val="20"/>
+              </w:rPr>
+              <w:t xml:space="preserve">Note de frais : le ticket en photo</w:t>
+            </w:r>
+          </w:p>
+        </w:tc>
+        <w:tc>
+          <w:tcPr>
+            <w:tcW w:type="dxa" w:w="4100"/>
+            <w:tcBorders>
+              <w:top w:val="single" w:color="D9D5CB" w:sz="4"/>
+              <w:left w:val="single" w:color="D9D5CB" w:sz="4"/>
+              <w:bottom w:val="single" w:color="D9D5CB" w:sz="4"/>
+              <w:right w:val="single" w:color="D9D5CB" w:sz="4"/>
+            </w:tcBorders>
+            <w:tcMar>
+              <w:top w:type="dxa" w:w="60"/>
+              <w:left w:type="dxa" w:w="90"/>
+              <w:bottom w:type="dxa" w:w="60"/>
+              <w:right w:type="dxa" w:w="90"/>
+            </w:tcMar>
+            <w:vAlign w:val="top"/>
+          </w:tcPr>
+          <w:p>
+            <w:pPr>
+              <w:spacing w:after="40"/>
+            </w:pPr>
+            <w:r>
+              <w:rPr>
+                <w:rFonts w:ascii="Calibri" w:cs="Calibri" w:eastAsia="Calibri" w:hAnsi="Calibri"/>
+                <w:color w:val="14213D"/>
+                <w:sz w:val="19"/>
+                <w:szCs w:val="19"/>
+              </w:rPr>
+              <w:t xml:space="preserve">Moi → Notes de frais → ➕ : « 📷 Prendre en photo » (ouvre l'appareil photo) ou « 📎 Importer » (photo de la galerie, PDF). Vignettes avant d'enregistrer, retirables. Refus si aucun ticket, sauf mention « ticket remis au chef » dans le champ lien. Le valideur (Équipes &amp; heures → Notes de frais à valider) voit les vignettes et clique pour agrandir ; « sans ticket » est signalé.</w:t>
+            </w:r>
+          </w:p>
+        </w:tc>
+        <w:tc>
+          <w:tcPr>
+            <w:tcW w:type="dxa" w:w="3700"/>
+            <w:tcBorders>
+              <w:top w:val="single" w:color="D9D5CB" w:sz="4"/>
+              <w:left w:val="single" w:color="D9D5CB" w:sz="4"/>
+              <w:bottom w:val="single" w:color="D9D5CB" w:sz="4"/>
+              <w:right w:val="single" w:color="D9D5CB" w:sz="4"/>
+            </w:tcBorders>
+            <w:tcMar>
+              <w:top w:type="dxa" w:w="60"/>
+              <w:left w:type="dxa" w:w="90"/>
+              <w:bottom w:type="dxa" w:w="60"/>
+              <w:right w:type="dxa" w:w="90"/>
+            </w:tcMar>
+            <w:vAlign w:val="top"/>
+          </w:tcPr>
+          <w:p>
+            <w:pPr>
+              <w:spacing w:after="40"/>
+            </w:pPr>
+            <w:r>
+              <w:rPr>
+                <w:rFonts w:ascii="Calibri" w:cs="Calibri" w:eastAsia="Calibri" w:hAnsi="Calibri"/>
+                <w:color w:val="14213D"/>
+                <w:sz w:val="19"/>
+                <w:szCs w:val="19"/>
+              </w:rPr>
+              <w:t xml:space="preserve">Photos compressées, envoyées au stockage quand connecté (sinon gardées dans la note, envoyées plus tard). PDF 8 Mo max.</w:t>
+            </w:r>
+          </w:p>
+        </w:tc>
+        <w:tc>
+          <w:tcPr>
+            <w:tcW w:type="dxa" w:w="1300"/>
+            <w:tcBorders>
+              <w:top w:val="single" w:color="D9D5CB" w:sz="4"/>
+              <w:left w:val="single" w:color="D9D5CB" w:sz="4"/>
+              <w:bottom w:val="single" w:color="D9D5CB" w:sz="4"/>
+              <w:right w:val="single" w:color="D9D5CB" w:sz="4"/>
+            </w:tcBorders>
+            <w:shd w:fill="E6F5EC" w:color="auto" w:val="clear"/>
+            <w:tcMar>
+              <w:top w:type="dxa" w:w="60"/>
+              <w:left w:type="dxa" w:w="90"/>
+              <w:bottom w:type="dxa" w:w="60"/>
+              <w:right w:type="dxa" w:w="90"/>
+            </w:tcMar>
+            <w:vAlign w:val="top"/>
+          </w:tcPr>
+          <w:p>
+            <w:pPr>
+              <w:spacing w:after="40"/>
+            </w:pPr>
+            <w:r>
+              <w:rPr>
+                <w:rFonts w:ascii="Calibri" w:cs="Calibri" w:eastAsia="Calibri" w:hAnsi="Calibri"/>
+                <w:b/>
+                <w:bCs/>
+                <w:color w:val="14213D"/>
+                <w:sz w:val="19"/>
+                <w:szCs w:val="19"/>
+              </w:rPr>
+              <w:t xml:space="preserve">Fait</w:t>
+            </w:r>
+          </w:p>
+        </w:tc>
+        <w:tc>
+          <w:tcPr>
+            <w:tcW w:type="dxa" w:w="3700"/>
+            <w:tcBorders>
+              <w:top w:val="single" w:color="D9D5CB" w:sz="4"/>
+              <w:left w:val="single" w:color="D9D5CB" w:sz="4"/>
+              <w:bottom w:val="single" w:color="D9D5CB" w:sz="4"/>
+              <w:right w:val="single" w:color="D9D5CB" w:sz="4"/>
+            </w:tcBorders>
+            <w:tcMar>
+              <w:top w:type="dxa" w:w="60"/>
+              <w:left w:type="dxa" w:w="90"/>
+              <w:bottom w:type="dxa" w:w="60"/>
+              <w:right w:type="dxa" w:w="90"/>
+            </w:tcMar>
+            <w:vAlign w:val="top"/>
+          </w:tcPr>
+          <w:p>
+            <w:pPr>
+              <w:spacing w:after="40"/>
+            </w:pPr>
+            <w:r>
+              <w:rPr>
+                <w:rFonts w:ascii="Calibri" w:cs="Calibri" w:eastAsia="Calibri" w:hAnsi="Calibri"/>
+                <w:color w:val="14213D"/>
+                <w:sz w:val="20"/>
+                <w:szCs w:val="20"/>
+              </w:rPr>
+              <w:t xml:space="preserve"/>
+            </w:r>
+          </w:p>
+          <w:p>
+            <w:pPr>
+              <w:spacing w:after="40"/>
+            </w:pPr>
+            <w:r>
+              <w:rPr>
+                <w:rFonts w:ascii="Calibri" w:cs="Calibri" w:eastAsia="Calibri" w:hAnsi="Calibri"/>
+                <w:color w:val="14213D"/>
+                <w:sz w:val="20"/>
+                <w:szCs w:val="20"/>
+              </w:rPr>
+              <w:t xml:space="preserve"/>
+            </w:r>
+          </w:p>
+        </w:tc>
+      </w:tr>
+      <w:tr>
+        <w:tc>
+          <w:tcPr>
+            <w:tcW w:type="dxa" w:w="2300"/>
+            <w:tcBorders>
+              <w:top w:val="single" w:color="D9D5CB" w:sz="4"/>
+              <w:left w:val="single" w:color="D9D5CB" w:sz="4"/>
+              <w:bottom w:val="single" w:color="D9D5CB" w:sz="4"/>
+              <w:right w:val="single" w:color="D9D5CB" w:sz="4"/>
+            </w:tcBorders>
+            <w:tcMar>
+              <w:top w:type="dxa" w:w="60"/>
+              <w:left w:type="dxa" w:w="90"/>
+              <w:bottom w:type="dxa" w:w="60"/>
+              <w:right w:type="dxa" w:w="90"/>
+            </w:tcMar>
+            <w:vAlign w:val="top"/>
+          </w:tcPr>
+          <w:p>
+            <w:pPr>
+              <w:spacing w:after="40"/>
+            </w:pPr>
+            <w:r>
+              <w:rPr>
+                <w:rFonts w:ascii="Calibri" w:cs="Calibri" w:eastAsia="Calibri" w:hAnsi="Calibri"/>
+                <w:b/>
+                <w:bCs/>
+                <w:color w:val="14213D"/>
+                <w:sz w:val="20"/>
+                <w:szCs w:val="20"/>
+              </w:rPr>
+              <w:t xml:space="preserve">Véhicules : « ça devait être le vrai modèle »</w:t>
+            </w:r>
+          </w:p>
+        </w:tc>
+        <w:tc>
+          <w:tcPr>
+            <w:tcW w:type="dxa" w:w="4100"/>
+            <w:tcBorders>
+              <w:top w:val="single" w:color="D9D5CB" w:sz="4"/>
+              <w:left w:val="single" w:color="D9D5CB" w:sz="4"/>
+              <w:bottom w:val="single" w:color="D9D5CB" w:sz="4"/>
+              <w:right w:val="single" w:color="D9D5CB" w:sz="4"/>
+            </w:tcBorders>
+            <w:tcMar>
+              <w:top w:type="dxa" w:w="60"/>
+              <w:left w:type="dxa" w:w="90"/>
+              <w:bottom w:type="dxa" w:w="60"/>
+              <w:right w:type="dxa" w:w="90"/>
+            </w:tcMar>
+            <w:vAlign w:val="top"/>
+          </w:tcPr>
+          <w:p>
+            <w:pPr>
+              <w:spacing w:after="40"/>
+            </w:pPr>
+            <w:r>
+              <w:rPr>
+                <w:rFonts w:ascii="Calibri" w:cs="Calibri" w:eastAsia="Calibri" w:hAnsi="Calibri"/>
+                <w:color w:val="14213D"/>
+                <w:sz w:val="19"/>
+                <w:szCs w:val="19"/>
+              </w:rPr>
+              <w:t xml:space="preserve">Je ne dessine pas un Sprinter comme un Sprinter : reproduire le dessin d'un modèle de marque n'est pas permis. À la place : Parc → fiche du véhicule → « 📷 Photo du véhicule » (ou importer) → la vraie photo remplace le dessin partout (liste, fiche, Mon véhicule), avec la plaque. Le dessin par type reste tant qu'il n'y a pas de photo.</w:t>
+            </w:r>
+          </w:p>
+        </w:tc>
+        <w:tc>
+          <w:tcPr>
+            <w:tcW w:type="dxa" w:w="3700"/>
+            <w:tcBorders>
+              <w:top w:val="single" w:color="D9D5CB" w:sz="4"/>
+              <w:left w:val="single" w:color="D9D5CB" w:sz="4"/>
+              <w:bottom w:val="single" w:color="D9D5CB" w:sz="4"/>
+              <w:right w:val="single" w:color="D9D5CB" w:sz="4"/>
+            </w:tcBorders>
+            <w:tcMar>
+              <w:top w:type="dxa" w:w="60"/>
+              <w:left w:type="dxa" w:w="90"/>
+              <w:bottom w:type="dxa" w:w="60"/>
+              <w:right w:type="dxa" w:w="90"/>
+            </w:tcMar>
+            <w:vAlign w:val="top"/>
+          </w:tcPr>
+          <w:p>
+            <w:pPr>
+              <w:spacing w:after="40"/>
+            </w:pPr>
+            <w:r>
+              <w:rPr>
+                <w:rFonts w:ascii="Calibri" w:cs="Calibri" w:eastAsia="Calibri" w:hAnsi="Calibri"/>
+                <w:color w:val="14213D"/>
+                <w:sz w:val="19"/>
+                <w:szCs w:val="19"/>
+              </w:rPr>
+              <w:t xml:space="preserve">Une photo par véhicule, remplaçable, retirable. Les photos des contrôles visuels (4 faces, accrocs) restent sur le contrôle.</w:t>
+            </w:r>
+          </w:p>
+        </w:tc>
+        <w:tc>
+          <w:tcPr>
+            <w:tcW w:type="dxa" w:w="1300"/>
+            <w:tcBorders>
+              <w:top w:val="single" w:color="D9D5CB" w:sz="4"/>
+              <w:left w:val="single" w:color="D9D5CB" w:sz="4"/>
+              <w:bottom w:val="single" w:color="D9D5CB" w:sz="4"/>
+              <w:right w:val="single" w:color="D9D5CB" w:sz="4"/>
+            </w:tcBorders>
+            <w:shd w:fill="E6F5EC" w:color="auto" w:val="clear"/>
+            <w:tcMar>
+              <w:top w:type="dxa" w:w="60"/>
+              <w:left w:type="dxa" w:w="90"/>
+              <w:bottom w:type="dxa" w:w="60"/>
+              <w:right w:type="dxa" w:w="90"/>
+            </w:tcMar>
+            <w:vAlign w:val="top"/>
+          </w:tcPr>
+          <w:p>
+            <w:pPr>
+              <w:spacing w:after="40"/>
+            </w:pPr>
+            <w:r>
+              <w:rPr>
+                <w:rFonts w:ascii="Calibri" w:cs="Calibri" w:eastAsia="Calibri" w:hAnsi="Calibri"/>
+                <w:b/>
+                <w:bCs/>
+                <w:color w:val="14213D"/>
+                <w:sz w:val="19"/>
+                <w:szCs w:val="19"/>
+              </w:rPr>
+              <w:t xml:space="preserve">Fait</w:t>
+            </w:r>
+          </w:p>
+        </w:tc>
+        <w:tc>
+          <w:tcPr>
+            <w:tcW w:type="dxa" w:w="3700"/>
+            <w:tcBorders>
+              <w:top w:val="single" w:color="D9D5CB" w:sz="4"/>
+              <w:left w:val="single" w:color="D9D5CB" w:sz="4"/>
+              <w:bottom w:val="single" w:color="D9D5CB" w:sz="4"/>
+              <w:right w:val="single" w:color="D9D5CB" w:sz="4"/>
+            </w:tcBorders>
+            <w:tcMar>
+              <w:top w:type="dxa" w:w="60"/>
+              <w:left w:type="dxa" w:w="90"/>
+              <w:bottom w:type="dxa" w:w="60"/>
+              <w:right w:type="dxa" w:w="90"/>
+            </w:tcMar>
+            <w:vAlign w:val="top"/>
+          </w:tcPr>
+          <w:p>
+            <w:pPr>
+              <w:spacing w:after="40"/>
+            </w:pPr>
+            <w:r>
+              <w:rPr>
+                <w:rFonts w:ascii="Calibri" w:cs="Calibri" w:eastAsia="Calibri" w:hAnsi="Calibri"/>
+                <w:color w:val="14213D"/>
+                <w:sz w:val="20"/>
+                <w:szCs w:val="20"/>
+              </w:rPr>
+              <w:t xml:space="preserve"/>
+            </w:r>
+          </w:p>
+          <w:p>
+            <w:pPr>
+              <w:spacing w:after="40"/>
+            </w:pPr>
+            <w:r>
+              <w:rPr>
+                <w:rFonts w:ascii="Calibri" w:cs="Calibri" w:eastAsia="Calibri" w:hAnsi="Calibri"/>
+                <w:color w:val="14213D"/>
+                <w:sz w:val="20"/>
+                <w:szCs w:val="20"/>
+              </w:rPr>
+              <w:t xml:space="preserve"/>
+            </w:r>
+          </w:p>
+        </w:tc>
+      </w:tr>
+      <w:tr>
+        <w:tc>
+          <w:tcPr>
+            <w:tcW w:type="dxa" w:w="2300"/>
+            <w:tcBorders>
+              <w:top w:val="single" w:color="D9D5CB" w:sz="4"/>
+              <w:left w:val="single" w:color="D9D5CB" w:sz="4"/>
+              <w:bottom w:val="single" w:color="D9D5CB" w:sz="4"/>
+              <w:right w:val="single" w:color="D9D5CB" w:sz="4"/>
+            </w:tcBorders>
+            <w:tcMar>
+              <w:top w:type="dxa" w:w="60"/>
+              <w:left w:type="dxa" w:w="90"/>
+              <w:bottom w:type="dxa" w:w="60"/>
+              <w:right w:type="dxa" w:w="90"/>
+            </w:tcMar>
+            <w:vAlign w:val="top"/>
+          </w:tcPr>
+          <w:p>
+            <w:pPr>
+              <w:spacing w:after="40"/>
+            </w:pPr>
+            <w:r>
+              <w:rPr>
+                <w:rFonts w:ascii="Calibri" w:cs="Calibri" w:eastAsia="Calibri" w:hAnsi="Calibri"/>
+                <w:b/>
+                <w:bCs/>
+                <w:color w:val="14213D"/>
+                <w:sz w:val="20"/>
+                <w:szCs w:val="20"/>
+              </w:rPr>
+              <w:t xml:space="preserve">« Entreprise » → « SCR »</w:t>
+            </w:r>
+          </w:p>
+        </w:tc>
+        <w:tc>
+          <w:tcPr>
+            <w:tcW w:type="dxa" w:w="4100"/>
+            <w:tcBorders>
+              <w:top w:val="single" w:color="D9D5CB" w:sz="4"/>
+              <w:left w:val="single" w:color="D9D5CB" w:sz="4"/>
+              <w:bottom w:val="single" w:color="D9D5CB" w:sz="4"/>
+              <w:right w:val="single" w:color="D9D5CB" w:sz="4"/>
+            </w:tcBorders>
+            <w:tcMar>
+              <w:top w:type="dxa" w:w="60"/>
+              <w:left w:type="dxa" w:w="90"/>
+              <w:bottom w:type="dxa" w:w="60"/>
+              <w:right w:type="dxa" w:w="90"/>
+            </w:tcMar>
+            <w:vAlign w:val="top"/>
+          </w:tcPr>
+          <w:p>
+            <w:pPr>
+              <w:spacing w:after="40"/>
+            </w:pPr>
+            <w:r>
+              <w:rPr>
+                <w:rFonts w:ascii="Calibri" w:cs="Calibri" w:eastAsia="Calibri" w:hAnsi="Calibri"/>
+                <w:color w:val="14213D"/>
+                <w:sz w:val="19"/>
+                <w:szCs w:val="19"/>
+              </w:rPr>
+              <w:t xml:space="preserve">Tu proposais « Notre équipe ». J'ai mis « SCR » : l'onglet de la boîte — annuaire (notre équipe), documents, communication interne, présentation, administration. « Notre équipe » collait pour l'annuaire mais pas pour les documents ni l'administration. Onglet, tuile, titre et hub renommés.</w:t>
+            </w:r>
+          </w:p>
+        </w:tc>
+        <w:tc>
+          <w:tcPr>
+            <w:tcW w:type="dxa" w:w="3700"/>
+            <w:tcBorders>
+              <w:top w:val="single" w:color="D9D5CB" w:sz="4"/>
+              <w:left w:val="single" w:color="D9D5CB" w:sz="4"/>
+              <w:bottom w:val="single" w:color="D9D5CB" w:sz="4"/>
+              <w:right w:val="single" w:color="D9D5CB" w:sz="4"/>
+            </w:tcBorders>
+            <w:tcMar>
+              <w:top w:type="dxa" w:w="60"/>
+              <w:left w:type="dxa" w:w="90"/>
+              <w:bottom w:type="dxa" w:w="60"/>
+              <w:right w:type="dxa" w:w="90"/>
+            </w:tcMar>
+            <w:vAlign w:val="top"/>
+          </w:tcPr>
+          <w:p>
+            <w:pPr>
+              <w:spacing w:after="40"/>
+            </w:pPr>
+            <w:r>
+              <w:rPr>
+                <w:rFonts w:ascii="Calibri" w:cs="Calibri" w:eastAsia="Calibri" w:hAnsi="Calibri"/>
+                <w:color w:val="14213D"/>
+                <w:sz w:val="19"/>
+                <w:szCs w:val="19"/>
+              </w:rPr>
+              <w:t xml:space="preserve">Si tu préfères « Notre équipe » ou « Chez SCR », c'est une ligne.</w:t>
+            </w:r>
+          </w:p>
+        </w:tc>
+        <w:tc>
+          <w:tcPr>
+            <w:tcW w:type="dxa" w:w="1300"/>
+            <w:tcBorders>
+              <w:top w:val="single" w:color="D9D5CB" w:sz="4"/>
+              <w:left w:val="single" w:color="D9D5CB" w:sz="4"/>
+              <w:bottom w:val="single" w:color="D9D5CB" w:sz="4"/>
+              <w:right w:val="single" w:color="D9D5CB" w:sz="4"/>
+            </w:tcBorders>
+            <w:shd w:fill="E6F5EC" w:color="auto" w:val="clear"/>
+            <w:tcMar>
+              <w:top w:type="dxa" w:w="60"/>
+              <w:left w:type="dxa" w:w="90"/>
+              <w:bottom w:type="dxa" w:w="60"/>
+              <w:right w:type="dxa" w:w="90"/>
+            </w:tcMar>
+            <w:vAlign w:val="top"/>
+          </w:tcPr>
+          <w:p>
+            <w:pPr>
+              <w:spacing w:after="40"/>
+            </w:pPr>
+            <w:r>
+              <w:rPr>
+                <w:rFonts w:ascii="Calibri" w:cs="Calibri" w:eastAsia="Calibri" w:hAnsi="Calibri"/>
+                <w:b/>
+                <w:bCs/>
+                <w:color w:val="14213D"/>
+                <w:sz w:val="19"/>
+                <w:szCs w:val="19"/>
+              </w:rPr>
+              <w:t xml:space="preserve">Fait (à valider)</w:t>
+            </w:r>
+          </w:p>
+        </w:tc>
+        <w:tc>
+          <w:tcPr>
+            <w:tcW w:type="dxa" w:w="3700"/>
+            <w:tcBorders>
+              <w:top w:val="single" w:color="D9D5CB" w:sz="4"/>
+              <w:left w:val="single" w:color="D9D5CB" w:sz="4"/>
+              <w:bottom w:val="single" w:color="D9D5CB" w:sz="4"/>
+              <w:right w:val="single" w:color="D9D5CB" w:sz="4"/>
+            </w:tcBorders>
+            <w:tcMar>
+              <w:top w:type="dxa" w:w="60"/>
+              <w:left w:type="dxa" w:w="90"/>
+              <w:bottom w:type="dxa" w:w="60"/>
+              <w:right w:type="dxa" w:w="90"/>
+            </w:tcMar>
+            <w:vAlign w:val="top"/>
+          </w:tcPr>
+          <w:p>
+            <w:pPr>
+              <w:spacing w:after="40"/>
+            </w:pPr>
+            <w:r>
+              <w:rPr>
+                <w:rFonts w:ascii="Calibri" w:cs="Calibri" w:eastAsia="Calibri" w:hAnsi="Calibri"/>
+                <w:color w:val="14213D"/>
+                <w:sz w:val="20"/>
+                <w:szCs w:val="20"/>
+              </w:rPr>
+              <w:t xml:space="preserve"/>
+            </w:r>
+          </w:p>
+          <w:p>
+            <w:pPr>
+              <w:spacing w:after="40"/>
+            </w:pPr>
+            <w:r>
+              <w:rPr>
+                <w:rFonts w:ascii="Calibri" w:cs="Calibri" w:eastAsia="Calibri" w:hAnsi="Calibri"/>
+                <w:color w:val="14213D"/>
+                <w:sz w:val="20"/>
+                <w:szCs w:val="20"/>
+              </w:rPr>
+              <w:t xml:space="preserve"/>
+            </w:r>
+          </w:p>
+        </w:tc>
+      </w:tr>
+      <w:tr>
+        <w:tc>
+          <w:tcPr>
+            <w:tcW w:type="dxa" w:w="2300"/>
+            <w:tcBorders>
+              <w:top w:val="single" w:color="D9D5CB" w:sz="4"/>
+              <w:left w:val="single" w:color="D9D5CB" w:sz="4"/>
+              <w:bottom w:val="single" w:color="D9D5CB" w:sz="4"/>
+              <w:right w:val="single" w:color="D9D5CB" w:sz="4"/>
+            </w:tcBorders>
+            <w:tcMar>
+              <w:top w:type="dxa" w:w="60"/>
+              <w:left w:type="dxa" w:w="90"/>
+              <w:bottom w:type="dxa" w:w="60"/>
+              <w:right w:type="dxa" w:w="90"/>
+            </w:tcMar>
+            <w:vAlign w:val="top"/>
+          </w:tcPr>
+          <w:p>
+            <w:pPr>
+              <w:spacing w:after="40"/>
+            </w:pPr>
+            <w:r>
+              <w:rPr>
+                <w:rFonts w:ascii="Calibri" w:cs="Calibri" w:eastAsia="Calibri" w:hAnsi="Calibri"/>
+                <w:b/>
+                <w:bCs/>
+                <w:color w:val="14213D"/>
+                <w:sz w:val="20"/>
+                <w:szCs w:val="20"/>
+              </w:rPr>
+              <w:t xml:space="preserve">Maquette Commerce : le chiffrage de A à Z</w:t>
+            </w:r>
+          </w:p>
+        </w:tc>
+        <w:tc>
+          <w:tcPr>
+            <w:tcW w:type="dxa" w:w="4100"/>
+            <w:tcBorders>
+              <w:top w:val="single" w:color="D9D5CB" w:sz="4"/>
+              <w:left w:val="single" w:color="D9D5CB" w:sz="4"/>
+              <w:bottom w:val="single" w:color="D9D5CB" w:sz="4"/>
+              <w:right w:val="single" w:color="D9D5CB" w:sz="4"/>
+            </w:tcBorders>
+            <w:tcMar>
+              <w:top w:type="dxa" w:w="60"/>
+              <w:left w:type="dxa" w:w="90"/>
+              <w:bottom w:type="dxa" w:w="60"/>
+              <w:right w:type="dxa" w:w="90"/>
+            </w:tcMar>
+            <w:vAlign w:val="top"/>
+          </w:tcPr>
+          <w:p>
+            <w:pPr>
+              <w:spacing w:after="40"/>
+            </w:pPr>
+            <w:r>
+              <w:rPr>
+                <w:rFonts w:ascii="Calibri" w:cs="Calibri" w:eastAsia="Calibri" w:hAnsi="Calibri"/>
+                <w:color w:val="14213D"/>
+                <w:sz w:val="19"/>
+                <w:szCs w:val="19"/>
+              </w:rPr>
+              <w:t xml:space="preserve">maquette-chiffrage.html à la racine du dépôt (double-clic, ou en ligne après ton push). Six étapes : 1 Dossier (import du DCE, pièces reconnues, consultation lue dans le RC, tâches posées) · 2 Lecture des pièces (CCTP avec passages surlignés → notes « chiffrage / mémoire / risque / question MOE », quantités repérées) · 3 Chiffrage V2B (hypothèses, zones, table par DN, chapitres, récap vente avec marge et RCFA, versions — les cases orange recalculent tout) · 4 Mémoire technique (plan selon les critères du RC, blocs SCR réutilisés, variables remplies depuis le chiffrage) · 5 DPGF (le bordereau du client rempli depuis le chiffrage, répartition, écart, export dans son Excel) · 6 Offre (pièces, remise, négociation, reporting).</w:t>
+            </w:r>
+          </w:p>
+        </w:tc>
+        <w:tc>
+          <w:tcPr>
+            <w:tcW w:type="dxa" w:w="3700"/>
+            <w:tcBorders>
+              <w:top w:val="single" w:color="D9D5CB" w:sz="4"/>
+              <w:left w:val="single" w:color="D9D5CB" w:sz="4"/>
+              <w:bottom w:val="single" w:color="D9D5CB" w:sz="4"/>
+              <w:right w:val="single" w:color="D9D5CB" w:sz="4"/>
+            </w:tcBorders>
+            <w:tcMar>
+              <w:top w:type="dxa" w:w="60"/>
+              <w:left w:type="dxa" w:w="90"/>
+              <w:bottom w:type="dxa" w:w="60"/>
+              <w:right w:type="dxa" w:w="90"/>
+            </w:tcMar>
+            <w:vAlign w:val="top"/>
+          </w:tcPr>
+          <w:p>
+            <w:pPr>
+              <w:spacing w:after="40"/>
+            </w:pPr>
+            <w:r>
+              <w:rPr>
+                <w:rFonts w:ascii="Calibri" w:cs="Calibri" w:eastAsia="Calibri" w:hAnsi="Calibri"/>
+                <w:color w:val="14213D"/>
+                <w:sz w:val="19"/>
+                <w:szCs w:val="19"/>
+              </w:rPr>
+              <w:t xml:space="preserve">C'est une maquette pour qu'on décide ensemble le 13/10 : ce qui manque, ce qui est en trop, dans quel ordre on code (mon avis : 3 Chiffrage d'abord, puis 5 DPGF, puis 2 Lecture, puis 4 Mémoire). Les chiffres sont une démo (Lorient — Kerentrech, DALKIA) calés sur ta méthode.</w:t>
+            </w:r>
+          </w:p>
+        </w:tc>
+        <w:tc>
+          <w:tcPr>
+            <w:tcW w:type="dxa" w:w="1300"/>
+            <w:tcBorders>
+              <w:top w:val="single" w:color="D9D5CB" w:sz="4"/>
+              <w:left w:val="single" w:color="D9D5CB" w:sz="4"/>
+              <w:bottom w:val="single" w:color="D9D5CB" w:sz="4"/>
+              <w:right w:val="single" w:color="D9D5CB" w:sz="4"/>
+            </w:tcBorders>
+            <w:shd w:fill="FFF4EE" w:color="auto" w:val="clear"/>
+            <w:tcMar>
+              <w:top w:type="dxa" w:w="60"/>
+              <w:left w:type="dxa" w:w="90"/>
+              <w:bottom w:type="dxa" w:w="60"/>
+              <w:right w:type="dxa" w:w="90"/>
+            </w:tcMar>
+            <w:vAlign w:val="top"/>
+          </w:tcPr>
+          <w:p>
+            <w:pPr>
+              <w:spacing w:after="40"/>
+            </w:pPr>
+            <w:r>
+              <w:rPr>
+                <w:rFonts w:ascii="Calibri" w:cs="Calibri" w:eastAsia="Calibri" w:hAnsi="Calibri"/>
+                <w:b/>
+                <w:bCs/>
+                <w:color w:val="14213D"/>
+                <w:sz w:val="19"/>
+                <w:szCs w:val="19"/>
+              </w:rPr>
+              <w:t xml:space="preserve">Maquette</w:t>
             </w:r>
           </w:p>
         </w:tc>
@@ -12207,7 +13705,7 @@
           <w:sz w:val="20"/>
           <w:szCs w:val="20"/>
         </w:rPr>
-        <w:t xml:space="preserve">Résumé : Six onglets (Commerce, Parc, Sécurité), accidents v1, Outlook serveur, production par équipe, récap Mes chantiers, communication interne</w:t>
+        <w:t xml:space="preserve">Résumé : Navigateur de semaine, ticket de note de frais en photo, photo du véhicule, onglet SCR, → Outlook, maquette chiffrage A→Z</w:t>
       </w:r>
     </w:p>
     <w:p>
@@ -12226,7 +13724,7 @@
           <w:sz w:val="20"/>
           <w:szCs w:val="20"/>
         </w:rPr>
-        <w:t xml:space="preserve">Description : retours du 12/10 soir — six onglets (Aujourd'hui · Chantiers [Carte / Liste / Équipes &amp; heures / Sécurité] · Moi · Commerce · Parc · Entreprise), Entreprise réduit (annuaire, documents, communication interne publiable, présentation), récap Mes chantiers sous la carte → Bureau (doublon retiré), notes de frais dans Moi, Production par équipe (planning → équipe → personne, objectifs), Variables de paie (rapport RH sans production), Commerce (reporting + traçabilité, devis &amp; chiffrage avec 10 versions, dossiers en cours + tableau de facturation client, terminés), Parc (flotte, magasin / matériel à cadrer), Sécurité → déclarer un accident v1 (+ bouton QSE du chantier, notification RH, traité), Outlook automatique (Edge Function outlook-sync + lien publié, synchro 2 h) ; sql/retours_12-10b.sql ; e2e_onglets ; 44 suites.</w:t>
+        <w:t xml:space="preserve">Description : nuit du 12 au 13/10 — navigateur de semaine (Ma semaine, Production par équipe, Planning : jours, aujourd'hui, points, ↺, glisser) ; Outlook : import caché quand relié, « → Outlook » par rendez-vous (.ics) ; note de frais : ticket en photo / import PDF, obligatoire ; flotte : photo du vrai véhicule ; Entreprise → SCR ; maquette-chiffrage.html (dossier → lecture → chiffrage V2B → mémoire → DPGF → offre) ; e2e_onglets 14 points, 44 suites. Livraison précédente (même commit si pas encore poussée) : retours du 12/10 soir — six onglets (Aujourd'hui · Chantiers [Carte / Liste / Équipes &amp; heures / Sécurité] · Moi · Commerce · Parc · Entreprise), Entreprise réduit (annuaire, documents, communication interne publiable, présentation), récap Mes chantiers sous la carte → Bureau (doublon retiré), notes de frais dans Moi, Production par équipe (planning → équipe → personne, objectifs), Variables de paie (rapport RH sans production), Commerce (reporting + traçabilité, devis &amp; chiffrage avec 10 versions, dossiers en cours + tableau de facturation client, terminés), Parc (flotte, magasin / matériel à cadrer), Sécurité → déclarer un accident v1 (+ bouton QSE du chantier, notification RH, traité), Outlook automatique (Edge Function outlook-sync + lien publié, synchro 2 h) ; sql/retours_12-10b.sql ; e2e_onglets ; 44 suites.</w:t>
       </w:r>
     </w:p>
     <w:sectPr>

</xml_diff>

<commit_message>
Commerce : le dossier de A à Z (dossier, lecture multi-destinations, mémoire, DPGF .xlsx, offre)
</commit_message>
<xml_diff>
--- a/app/docs/Feuille_de_route_controle_12-10.docx
+++ b/app/docs/Feuille_de_route_controle_12-10.docx
@@ -65,7 +65,7 @@
           <w:sz w:val="20"/>
           <w:szCs w:val="20"/>
         </w:rPr>
-        <w:t xml:space="preserve">Même principe que la précédente : tu contrôles ligne par ligne, tu écris dans « Vos commentaires » (OK / à corriger / à changer : quoi), tu me renvoies le fichier. Je corrige à partir de tes commentaires, dans l'ordre du document. Commence par la section G (ce qui a bougé pendant la nuit, dont la maquette du chiffrage à regarder ensemble), puis F (tes retours du 12/10 soir).</w:t>
+        <w:t xml:space="preserve">Même principe que la précédente : tu contrôles ligne par ligne, tu écris dans « Vos commentaires » (OK / à corriger / à changer : quoi), tu me renvoies le fichier. Je corrige à partir de tes commentaires, dans l'ordre du document. Commence par la section H (Commerce : le dossier de A à Z, codé ce matin d'après la maquette que tu as validée), puis G (la nuit) et F (tes retours du 12/10 soir).</w:t>
       </w:r>
     </w:p>
     <w:p>
@@ -84,7 +84,7 @@
           <w:sz w:val="20"/>
           <w:szCs w:val="20"/>
         </w:rPr>
-        <w:t xml:space="preserve">Build livré : 13/10/2026 · d68daa (index.html + traceur.html + maquette-chiffrage.html à la racine du dépôt). SQL retours_12-10.sql et retours_12-10b.sql passés, fonction outlook-sync déployée et vérifiée par toi le 12/10 au soir (« ça fonctionne parfaitement »). Hors connexion, tout se teste avec les personnages de démo.</w:t>
+        <w:t xml:space="preserve">Build livré : 13/10/2026 · f1e129 (index.html + traceur.html + maquette-chiffrage.html à la racine du dépôt). SQL retours_12-10.sql et retours_12-10b.sql passés, fonction outlook-sync déployée et vérifiée par toi le 12/10 au soir (« ça fonctionne parfaitement »). Hors connexion, tout se teste avec les personnages de démo.</w:t>
       </w:r>
     </w:p>
     <w:p>
@@ -103,7 +103,7 @@
           <w:sz w:val="20"/>
           <w:szCs w:val="20"/>
         </w:rPr>
-        <w:t xml:space="preserve">Règle gardée : rien d'ancien n'est supprimé ; 44 suites de tests automatiques passent (e2e_onglets = 14 points sur les nouveaux onglets et la nuit), 9 suites adaptées aux nouveaux noms et aux hubs.</w:t>
+        <w:t xml:space="preserve">Règle gardée : rien d'ancien n'est supprimé ; 46 suites de tests automatiques passent (e2e_onglets = 14 points, e2e_commerce = 8 points sur le dossier de A à Z), 10 suites adaptées aux nouveaux noms et aux hubs.</w:t>
       </w:r>
     </w:p>
     <w:p>
@@ -11916,6 +11916,1685 @@
                 <w:szCs w:val="19"/>
               </w:rPr>
               <w:t xml:space="preserve">Fait (à déployer)</w:t>
+            </w:r>
+          </w:p>
+        </w:tc>
+        <w:tc>
+          <w:tcPr>
+            <w:tcW w:type="dxa" w:w="3700"/>
+            <w:tcBorders>
+              <w:top w:val="single" w:color="D9D5CB" w:sz="4"/>
+              <w:left w:val="single" w:color="D9D5CB" w:sz="4"/>
+              <w:bottom w:val="single" w:color="D9D5CB" w:sz="4"/>
+              <w:right w:val="single" w:color="D9D5CB" w:sz="4"/>
+            </w:tcBorders>
+            <w:tcMar>
+              <w:top w:type="dxa" w:w="60"/>
+              <w:left w:type="dxa" w:w="90"/>
+              <w:bottom w:type="dxa" w:w="60"/>
+              <w:right w:type="dxa" w:w="90"/>
+            </w:tcMar>
+            <w:vAlign w:val="top"/>
+          </w:tcPr>
+          <w:p>
+            <w:pPr>
+              <w:spacing w:after="40"/>
+            </w:pPr>
+            <w:r>
+              <w:rPr>
+                <w:rFonts w:ascii="Calibri" w:cs="Calibri" w:eastAsia="Calibri" w:hAnsi="Calibri"/>
+                <w:color w:val="14213D"/>
+                <w:sz w:val="20"/>
+                <w:szCs w:val="20"/>
+              </w:rPr>
+              <w:t xml:space="preserve"/>
+            </w:r>
+          </w:p>
+          <w:p>
+            <w:pPr>
+              <w:spacing w:after="40"/>
+            </w:pPr>
+            <w:r>
+              <w:rPr>
+                <w:rFonts w:ascii="Calibri" w:cs="Calibri" w:eastAsia="Calibri" w:hAnsi="Calibri"/>
+                <w:color w:val="14213D"/>
+                <w:sz w:val="20"/>
+                <w:szCs w:val="20"/>
+              </w:rPr>
+              <w:t xml:space="preserve"/>
+            </w:r>
+          </w:p>
+        </w:tc>
+      </w:tr>
+    </w:tbl>
+    <w:p>
+      <w:pPr>
+        <w:pStyle w:val="Heading1"/>
+        <w:spacing w:after="120" w:before="320"/>
+      </w:pPr>
+      <w:r>
+        <w:rPr>
+          <w:rFonts w:ascii="Calibri" w:cs="Calibri" w:eastAsia="Calibri" w:hAnsi="Calibri"/>
+          <w:b/>
+          <w:bCs/>
+          <w:color w:val="EB6834"/>
+          <w:sz w:val="30"/>
+          <w:szCs w:val="30"/>
+        </w:rPr>
+        <w:t xml:space="preserve">H · Commerce : le dossier de A à Z (codé le 13/10 au matin, d'après la maquette)</w:t>
+      </w:r>
+    </w:p>
+    <w:p>
+      <w:pPr>
+        <w:spacing w:after="80" w:line="264"/>
+      </w:pPr>
+      <w:r>
+        <w:rPr>
+          <w:rFonts w:ascii="Calibri" w:cs="Calibri" w:eastAsia="Calibri" w:hAnsi="Calibri"/>
+          <w:color w:val="6B6B66"/>
+          <w:sz w:val="20"/>
+          <w:szCs w:val="20"/>
+        </w:rPr>
+        <w:t xml:space="preserve">« J'adore la maquette ; code ça en attendant. » Dans Commerce → une affaire → la fiche a maintenant les six étapes de la maquette. Tout se teste hors connexion ; connecté, tout part au serveur dans l'affaire (pas de SQL à passer : les blocs SCR sont des « documents » sans signature).</w:t>
+      </w:r>
+    </w:p>
+    <w:tbl>
+      <w:tblPr>
+        <w:tblW w:type="dxa" w:w="15100"/>
+        <w:tblBorders>
+          <w:top w:val="single" w:color="auto" w:sz="4"/>
+          <w:left w:val="single" w:color="auto" w:sz="4"/>
+          <w:bottom w:val="single" w:color="auto" w:sz="4"/>
+          <w:right w:val="single" w:color="auto" w:sz="4"/>
+          <w:insideH w:val="single" w:color="auto" w:sz="4"/>
+          <w:insideV w:val="single" w:color="auto" w:sz="4"/>
+        </w:tblBorders>
+      </w:tblPr>
+      <w:tblGrid>
+        <w:gridCol w:w="2300"/>
+        <w:gridCol w:w="4100"/>
+        <w:gridCol w:w="3700"/>
+        <w:gridCol w:w="1300"/>
+        <w:gridCol w:w="3700"/>
+      </w:tblGrid>
+      <w:tr>
+        <w:trPr>
+          <w:tblHeader/>
+        </w:trPr>
+        <w:tc>
+          <w:tcPr>
+            <w:tcW w:type="dxa" w:w="2300"/>
+            <w:tcBorders>
+              <w:top w:val="single" w:color="D9D5CB" w:sz="4"/>
+              <w:left w:val="single" w:color="D9D5CB" w:sz="4"/>
+              <w:bottom w:val="single" w:color="D9D5CB" w:sz="4"/>
+              <w:right w:val="single" w:color="D9D5CB" w:sz="4"/>
+            </w:tcBorders>
+            <w:shd w:fill="14213D" w:color="auto" w:val="clear"/>
+            <w:tcMar>
+              <w:top w:type="dxa" w:w="60"/>
+              <w:left w:type="dxa" w:w="90"/>
+              <w:bottom w:type="dxa" w:w="60"/>
+              <w:right w:type="dxa" w:w="90"/>
+            </w:tcMar>
+            <w:vAlign w:val="top"/>
+          </w:tcPr>
+          <w:p>
+            <w:pPr>
+              <w:spacing w:after="80" w:line="264"/>
+            </w:pPr>
+            <w:r>
+              <w:rPr>
+                <w:rFonts w:ascii="Calibri" w:cs="Calibri" w:eastAsia="Calibri" w:hAnsi="Calibri"/>
+                <w:b/>
+                <w:bCs/>
+                <w:color w:val="FFFFFF"/>
+                <w:sz w:val="19"/>
+                <w:szCs w:val="19"/>
+              </w:rPr>
+              <w:t xml:space="preserve">Fonctionnalité</w:t>
+            </w:r>
+          </w:p>
+        </w:tc>
+        <w:tc>
+          <w:tcPr>
+            <w:tcW w:type="dxa" w:w="4100"/>
+            <w:tcBorders>
+              <w:top w:val="single" w:color="D9D5CB" w:sz="4"/>
+              <w:left w:val="single" w:color="D9D5CB" w:sz="4"/>
+              <w:bottom w:val="single" w:color="D9D5CB" w:sz="4"/>
+              <w:right w:val="single" w:color="D9D5CB" w:sz="4"/>
+            </w:tcBorders>
+            <w:shd w:fill="14213D" w:color="auto" w:val="clear"/>
+            <w:tcMar>
+              <w:top w:type="dxa" w:w="60"/>
+              <w:left w:type="dxa" w:w="90"/>
+              <w:bottom w:type="dxa" w:w="60"/>
+              <w:right w:type="dxa" w:w="90"/>
+            </w:tcMar>
+            <w:vAlign w:val="top"/>
+          </w:tcPr>
+          <w:p>
+            <w:pPr>
+              <w:spacing w:after="80" w:line="264"/>
+            </w:pPr>
+            <w:r>
+              <w:rPr>
+                <w:rFonts w:ascii="Calibri" w:cs="Calibri" w:eastAsia="Calibri" w:hAnsi="Calibri"/>
+                <w:b/>
+                <w:bCs/>
+                <w:color w:val="FFFFFF"/>
+                <w:sz w:val="19"/>
+                <w:szCs w:val="19"/>
+              </w:rPr>
+              <w:t xml:space="preserve">Où la trouver · comment tester</w:t>
+            </w:r>
+          </w:p>
+        </w:tc>
+        <w:tc>
+          <w:tcPr>
+            <w:tcW w:type="dxa" w:w="3700"/>
+            <w:tcBorders>
+              <w:top w:val="single" w:color="D9D5CB" w:sz="4"/>
+              <w:left w:val="single" w:color="D9D5CB" w:sz="4"/>
+              <w:bottom w:val="single" w:color="D9D5CB" w:sz="4"/>
+              <w:right w:val="single" w:color="D9D5CB" w:sz="4"/>
+            </w:tcBorders>
+            <w:shd w:fill="14213D" w:color="auto" w:val="clear"/>
+            <w:tcMar>
+              <w:top w:type="dxa" w:w="60"/>
+              <w:left w:type="dxa" w:w="90"/>
+              <w:bottom w:type="dxa" w:w="60"/>
+              <w:right w:type="dxa" w:w="90"/>
+            </w:tcMar>
+            <w:vAlign w:val="top"/>
+          </w:tcPr>
+          <w:p>
+            <w:pPr>
+              <w:spacing w:after="80" w:line="264"/>
+            </w:pPr>
+            <w:r>
+              <w:rPr>
+                <w:rFonts w:ascii="Calibri" w:cs="Calibri" w:eastAsia="Calibri" w:hAnsi="Calibri"/>
+                <w:b/>
+                <w:bCs/>
+                <w:color w:val="FFFFFF"/>
+                <w:sz w:val="19"/>
+                <w:szCs w:val="19"/>
+              </w:rPr>
+              <w:t xml:space="preserve">Hypothèses · limites · ce que j'ai tranché</w:t>
+            </w:r>
+          </w:p>
+        </w:tc>
+        <w:tc>
+          <w:tcPr>
+            <w:tcW w:type="dxa" w:w="1300"/>
+            <w:tcBorders>
+              <w:top w:val="single" w:color="D9D5CB" w:sz="4"/>
+              <w:left w:val="single" w:color="D9D5CB" w:sz="4"/>
+              <w:bottom w:val="single" w:color="D9D5CB" w:sz="4"/>
+              <w:right w:val="single" w:color="D9D5CB" w:sz="4"/>
+            </w:tcBorders>
+            <w:shd w:fill="14213D" w:color="auto" w:val="clear"/>
+            <w:tcMar>
+              <w:top w:type="dxa" w:w="60"/>
+              <w:left w:type="dxa" w:w="90"/>
+              <w:bottom w:type="dxa" w:w="60"/>
+              <w:right w:type="dxa" w:w="90"/>
+            </w:tcMar>
+            <w:vAlign w:val="top"/>
+          </w:tcPr>
+          <w:p>
+            <w:pPr>
+              <w:spacing w:after="80" w:line="264"/>
+            </w:pPr>
+            <w:r>
+              <w:rPr>
+                <w:rFonts w:ascii="Calibri" w:cs="Calibri" w:eastAsia="Calibri" w:hAnsi="Calibri"/>
+                <w:b/>
+                <w:bCs/>
+                <w:color w:val="FFFFFF"/>
+                <w:sz w:val="19"/>
+                <w:szCs w:val="19"/>
+              </w:rPr>
+              <w:t xml:space="preserve">Statut</w:t>
+            </w:r>
+          </w:p>
+        </w:tc>
+        <w:tc>
+          <w:tcPr>
+            <w:tcW w:type="dxa" w:w="3700"/>
+            <w:tcBorders>
+              <w:top w:val="single" w:color="D9D5CB" w:sz="4"/>
+              <w:left w:val="single" w:color="D9D5CB" w:sz="4"/>
+              <w:bottom w:val="single" w:color="D9D5CB" w:sz="4"/>
+              <w:right w:val="single" w:color="D9D5CB" w:sz="4"/>
+            </w:tcBorders>
+            <w:shd w:fill="14213D" w:color="auto" w:val="clear"/>
+            <w:tcMar>
+              <w:top w:type="dxa" w:w="60"/>
+              <w:left w:type="dxa" w:w="90"/>
+              <w:bottom w:type="dxa" w:w="60"/>
+              <w:right w:type="dxa" w:w="90"/>
+            </w:tcMar>
+            <w:vAlign w:val="top"/>
+          </w:tcPr>
+          <w:p>
+            <w:pPr>
+              <w:spacing w:after="80" w:line="264"/>
+            </w:pPr>
+            <w:r>
+              <w:rPr>
+                <w:rFonts w:ascii="Calibri" w:cs="Calibri" w:eastAsia="Calibri" w:hAnsi="Calibri"/>
+                <w:b/>
+                <w:bCs/>
+                <w:color w:val="FFFFFF"/>
+                <w:sz w:val="19"/>
+                <w:szCs w:val="19"/>
+              </w:rPr>
+              <w:t xml:space="preserve">Vos commentaires</w:t>
+            </w:r>
+          </w:p>
+        </w:tc>
+      </w:tr>
+      <w:tr>
+        <w:tc>
+          <w:tcPr>
+            <w:tcW w:type="dxa" w:w="2300"/>
+            <w:tcBorders>
+              <w:top w:val="single" w:color="D9D5CB" w:sz="4"/>
+              <w:left w:val="single" w:color="D9D5CB" w:sz="4"/>
+              <w:bottom w:val="single" w:color="D9D5CB" w:sz="4"/>
+              <w:right w:val="single" w:color="D9D5CB" w:sz="4"/>
+            </w:tcBorders>
+            <w:tcMar>
+              <w:top w:type="dxa" w:w="60"/>
+              <w:left w:type="dxa" w:w="90"/>
+              <w:bottom w:type="dxa" w:w="60"/>
+              <w:right w:type="dxa" w:w="90"/>
+            </w:tcMar>
+            <w:vAlign w:val="top"/>
+          </w:tcPr>
+          <w:p>
+            <w:pPr>
+              <w:spacing w:after="40"/>
+            </w:pPr>
+            <w:r>
+              <w:rPr>
+                <w:rFonts w:ascii="Calibri" w:cs="Calibri" w:eastAsia="Calibri" w:hAnsi="Calibri"/>
+                <w:b/>
+                <w:bCs/>
+                <w:color w:val="14213D"/>
+                <w:sz w:val="20"/>
+                <w:szCs w:val="20"/>
+              </w:rPr>
+              <w:t xml:space="preserve">Les six étapes dans la fiche</w:t>
+            </w:r>
+          </w:p>
+        </w:tc>
+        <w:tc>
+          <w:tcPr>
+            <w:tcW w:type="dxa" w:w="4100"/>
+            <w:tcBorders>
+              <w:top w:val="single" w:color="D9D5CB" w:sz="4"/>
+              <w:left w:val="single" w:color="D9D5CB" w:sz="4"/>
+              <w:bottom w:val="single" w:color="D9D5CB" w:sz="4"/>
+              <w:right w:val="single" w:color="D9D5CB" w:sz="4"/>
+            </w:tcBorders>
+            <w:tcMar>
+              <w:top w:type="dxa" w:w="60"/>
+              <w:left w:type="dxa" w:w="90"/>
+              <w:bottom w:type="dxa" w:w="60"/>
+              <w:right w:type="dxa" w:w="90"/>
+            </w:tcMar>
+            <w:vAlign w:val="top"/>
+          </w:tcPr>
+          <w:p>
+            <w:pPr>
+              <w:spacing w:after="40"/>
+            </w:pPr>
+            <w:r>
+              <w:rPr>
+                <w:rFonts w:ascii="Calibri" w:cs="Calibri" w:eastAsia="Calibri" w:hAnsi="Calibri"/>
+                <w:color w:val="14213D"/>
+                <w:sz w:val="19"/>
+                <w:szCs w:val="19"/>
+              </w:rPr>
+              <w:t xml:space="preserve">Commerce → fiche d'une affaire : Fiche · 1 Dossier · 2 Lecture · 3 Chiffrage · 4 Mémoire · 5 DPGF · 6 Offre · Facturation · Chantiers liés. Une étape finie porte ✓ (dossier : des pièces + une date de remise ; lecture : des notes ou des quantités ; chiffrage : un prix ; mémoire : toutes les sections prêtes ; DPGF : total = prix de vente ; offre : remise).</w:t>
+            </w:r>
+          </w:p>
+        </w:tc>
+        <w:tc>
+          <w:tcPr>
+            <w:tcW w:type="dxa" w:w="3700"/>
+            <w:tcBorders>
+              <w:top w:val="single" w:color="D9D5CB" w:sz="4"/>
+              <w:left w:val="single" w:color="D9D5CB" w:sz="4"/>
+              <w:bottom w:val="single" w:color="D9D5CB" w:sz="4"/>
+              <w:right w:val="single" w:color="D9D5CB" w:sz="4"/>
+            </w:tcBorders>
+            <w:tcMar>
+              <w:top w:type="dxa" w:w="60"/>
+              <w:left w:type="dxa" w:w="90"/>
+              <w:bottom w:type="dxa" w:w="60"/>
+              <w:right w:type="dxa" w:w="90"/>
+            </w:tcMar>
+            <w:vAlign w:val="top"/>
+          </w:tcPr>
+          <w:p>
+            <w:pPr>
+              <w:spacing w:after="40"/>
+            </w:pPr>
+            <w:r>
+              <w:rPr>
+                <w:rFonts w:ascii="Calibri" w:cs="Calibri" w:eastAsia="Calibri" w:hAnsi="Calibri"/>
+                <w:color w:val="14213D"/>
+                <w:sz w:val="19"/>
+                <w:szCs w:val="19"/>
+              </w:rPr>
+              <w:t xml:space="preserve">L'ancien onglet « DCE · documents » est dans 1 · Dossier. Rien de supprimé : chiffrage, facturation, chantiers liés inchangés.</w:t>
+            </w:r>
+          </w:p>
+        </w:tc>
+        <w:tc>
+          <w:tcPr>
+            <w:tcW w:type="dxa" w:w="1300"/>
+            <w:tcBorders>
+              <w:top w:val="single" w:color="D9D5CB" w:sz="4"/>
+              <w:left w:val="single" w:color="D9D5CB" w:sz="4"/>
+              <w:bottom w:val="single" w:color="D9D5CB" w:sz="4"/>
+              <w:right w:val="single" w:color="D9D5CB" w:sz="4"/>
+            </w:tcBorders>
+            <w:shd w:fill="E6F5EC" w:color="auto" w:val="clear"/>
+            <w:tcMar>
+              <w:top w:type="dxa" w:w="60"/>
+              <w:left w:type="dxa" w:w="90"/>
+              <w:bottom w:type="dxa" w:w="60"/>
+              <w:right w:type="dxa" w:w="90"/>
+            </w:tcMar>
+            <w:vAlign w:val="top"/>
+          </w:tcPr>
+          <w:p>
+            <w:pPr>
+              <w:spacing w:after="40"/>
+            </w:pPr>
+            <w:r>
+              <w:rPr>
+                <w:rFonts w:ascii="Calibri" w:cs="Calibri" w:eastAsia="Calibri" w:hAnsi="Calibri"/>
+                <w:b/>
+                <w:bCs/>
+                <w:color w:val="14213D"/>
+                <w:sz w:val="19"/>
+                <w:szCs w:val="19"/>
+              </w:rPr>
+              <w:t xml:space="preserve">Fait</w:t>
+            </w:r>
+          </w:p>
+        </w:tc>
+        <w:tc>
+          <w:tcPr>
+            <w:tcW w:type="dxa" w:w="3700"/>
+            <w:tcBorders>
+              <w:top w:val="single" w:color="D9D5CB" w:sz="4"/>
+              <w:left w:val="single" w:color="D9D5CB" w:sz="4"/>
+              <w:bottom w:val="single" w:color="D9D5CB" w:sz="4"/>
+              <w:right w:val="single" w:color="D9D5CB" w:sz="4"/>
+            </w:tcBorders>
+            <w:tcMar>
+              <w:top w:type="dxa" w:w="60"/>
+              <w:left w:type="dxa" w:w="90"/>
+              <w:bottom w:type="dxa" w:w="60"/>
+              <w:right w:type="dxa" w:w="90"/>
+            </w:tcMar>
+            <w:vAlign w:val="top"/>
+          </w:tcPr>
+          <w:p>
+            <w:pPr>
+              <w:spacing w:after="40"/>
+            </w:pPr>
+            <w:r>
+              <w:rPr>
+                <w:rFonts w:ascii="Calibri" w:cs="Calibri" w:eastAsia="Calibri" w:hAnsi="Calibri"/>
+                <w:color w:val="14213D"/>
+                <w:sz w:val="20"/>
+                <w:szCs w:val="20"/>
+              </w:rPr>
+              <w:t xml:space="preserve"/>
+            </w:r>
+          </w:p>
+          <w:p>
+            <w:pPr>
+              <w:spacing w:after="40"/>
+            </w:pPr>
+            <w:r>
+              <w:rPr>
+                <w:rFonts w:ascii="Calibri" w:cs="Calibri" w:eastAsia="Calibri" w:hAnsi="Calibri"/>
+                <w:color w:val="14213D"/>
+                <w:sz w:val="20"/>
+                <w:szCs w:val="20"/>
+              </w:rPr>
+              <w:t xml:space="preserve"/>
+            </w:r>
+          </w:p>
+        </w:tc>
+      </w:tr>
+      <w:tr>
+        <w:tc>
+          <w:tcPr>
+            <w:tcW w:type="dxa" w:w="2300"/>
+            <w:tcBorders>
+              <w:top w:val="single" w:color="D9D5CB" w:sz="4"/>
+              <w:left w:val="single" w:color="D9D5CB" w:sz="4"/>
+              <w:bottom w:val="single" w:color="D9D5CB" w:sz="4"/>
+              <w:right w:val="single" w:color="D9D5CB" w:sz="4"/>
+            </w:tcBorders>
+            <w:tcMar>
+              <w:top w:type="dxa" w:w="60"/>
+              <w:left w:type="dxa" w:w="90"/>
+              <w:bottom w:type="dxa" w:w="60"/>
+              <w:right w:type="dxa" w:w="90"/>
+            </w:tcMar>
+            <w:vAlign w:val="top"/>
+          </w:tcPr>
+          <w:p>
+            <w:pPr>
+              <w:spacing w:after="40"/>
+            </w:pPr>
+            <w:r>
+              <w:rPr>
+                <w:rFonts w:ascii="Calibri" w:cs="Calibri" w:eastAsia="Calibri" w:hAnsi="Calibri"/>
+                <w:b/>
+                <w:bCs/>
+                <w:color w:val="14213D"/>
+                <w:sz w:val="20"/>
+                <w:szCs w:val="20"/>
+              </w:rPr>
+              <w:t xml:space="preserve">1 · Dossier</w:t>
+            </w:r>
+          </w:p>
+        </w:tc>
+        <w:tc>
+          <w:tcPr>
+            <w:tcW w:type="dxa" w:w="4100"/>
+            <w:tcBorders>
+              <w:top w:val="single" w:color="D9D5CB" w:sz="4"/>
+              <w:left w:val="single" w:color="D9D5CB" w:sz="4"/>
+              <w:bottom w:val="single" w:color="D9D5CB" w:sz="4"/>
+              <w:right w:val="single" w:color="D9D5CB" w:sz="4"/>
+            </w:tcBorders>
+            <w:tcMar>
+              <w:top w:type="dxa" w:w="60"/>
+              <w:left w:type="dxa" w:w="90"/>
+              <w:bottom w:type="dxa" w:w="60"/>
+              <w:right w:type="dxa" w:w="90"/>
+            </w:tcMar>
+            <w:vAlign w:val="top"/>
+          </w:tcPr>
+          <w:p>
+            <w:pPr>
+              <w:spacing w:after="40"/>
+            </w:pPr>
+            <w:r>
+              <w:rPr>
+                <w:rFonts w:ascii="Calibri" w:cs="Calibri" w:eastAsia="Calibri" w:hAnsi="Calibri"/>
+                <w:color w:val="14213D"/>
+                <w:sz w:val="19"/>
+                <w:szCs w:val="19"/>
+              </w:rPr>
+              <w:t xml:space="preserve">La consultation (maître d'ouvrage, MOE, procédure, lot, variantes, visite de site, date limite des questions, remise et heure, délai, critères, plateforme) — une fois renseignée, tout le dossier s'en sert (J-n, tâches, offre). Les tâches se posent toutes seules sur les dates (visite, lecture, questions, chiffrage J-4, mémoire J-2, remise), cochables, en retard en rouge. Puis les pièces du DCE comme avant (dépôt, zip d'origine, catégories).</w:t>
+            </w:r>
+          </w:p>
+        </w:tc>
+        <w:tc>
+          <w:tcPr>
+            <w:tcW w:type="dxa" w:w="3700"/>
+            <w:tcBorders>
+              <w:top w:val="single" w:color="D9D5CB" w:sz="4"/>
+              <w:left w:val="single" w:color="D9D5CB" w:sz="4"/>
+              <w:bottom w:val="single" w:color="D9D5CB" w:sz="4"/>
+              <w:right w:val="single" w:color="D9D5CB" w:sz="4"/>
+            </w:tcBorders>
+            <w:tcMar>
+              <w:top w:type="dxa" w:w="60"/>
+              <w:left w:type="dxa" w:w="90"/>
+              <w:bottom w:type="dxa" w:w="60"/>
+              <w:right w:type="dxa" w:w="90"/>
+            </w:tcMar>
+            <w:vAlign w:val="top"/>
+          </w:tcPr>
+          <w:p>
+            <w:pPr>
+              <w:spacing w:after="40"/>
+            </w:pPr>
+            <w:r>
+              <w:rPr>
+                <w:rFonts w:ascii="Calibri" w:cs="Calibri" w:eastAsia="Calibri" w:hAnsi="Calibri"/>
+                <w:color w:val="14213D"/>
+                <w:sz w:val="19"/>
+                <w:szCs w:val="19"/>
+              </w:rPr>
+              <w:t xml:space="preserve">Le chargé d'affaires reçoit « Offre … à remettre ven. 23/10 (J-2) » dans Aujourd'hui dès J-3, puis « aujourd'hui », puis « dépassée » ; ça ouvre l'étape Offre.</w:t>
+            </w:r>
+          </w:p>
+        </w:tc>
+        <w:tc>
+          <w:tcPr>
+            <w:tcW w:type="dxa" w:w="1300"/>
+            <w:tcBorders>
+              <w:top w:val="single" w:color="D9D5CB" w:sz="4"/>
+              <w:left w:val="single" w:color="D9D5CB" w:sz="4"/>
+              <w:bottom w:val="single" w:color="D9D5CB" w:sz="4"/>
+              <w:right w:val="single" w:color="D9D5CB" w:sz="4"/>
+            </w:tcBorders>
+            <w:shd w:fill="E6F5EC" w:color="auto" w:val="clear"/>
+            <w:tcMar>
+              <w:top w:type="dxa" w:w="60"/>
+              <w:left w:type="dxa" w:w="90"/>
+              <w:bottom w:type="dxa" w:w="60"/>
+              <w:right w:type="dxa" w:w="90"/>
+            </w:tcMar>
+            <w:vAlign w:val="top"/>
+          </w:tcPr>
+          <w:p>
+            <w:pPr>
+              <w:spacing w:after="40"/>
+            </w:pPr>
+            <w:r>
+              <w:rPr>
+                <w:rFonts w:ascii="Calibri" w:cs="Calibri" w:eastAsia="Calibri" w:hAnsi="Calibri"/>
+                <w:b/>
+                <w:bCs/>
+                <w:color w:val="14213D"/>
+                <w:sz w:val="19"/>
+                <w:szCs w:val="19"/>
+              </w:rPr>
+              <w:t xml:space="preserve">Fait</w:t>
+            </w:r>
+          </w:p>
+        </w:tc>
+        <w:tc>
+          <w:tcPr>
+            <w:tcW w:type="dxa" w:w="3700"/>
+            <w:tcBorders>
+              <w:top w:val="single" w:color="D9D5CB" w:sz="4"/>
+              <w:left w:val="single" w:color="D9D5CB" w:sz="4"/>
+              <w:bottom w:val="single" w:color="D9D5CB" w:sz="4"/>
+              <w:right w:val="single" w:color="D9D5CB" w:sz="4"/>
+            </w:tcBorders>
+            <w:tcMar>
+              <w:top w:type="dxa" w:w="60"/>
+              <w:left w:type="dxa" w:w="90"/>
+              <w:bottom w:type="dxa" w:w="60"/>
+              <w:right w:type="dxa" w:w="90"/>
+            </w:tcMar>
+            <w:vAlign w:val="top"/>
+          </w:tcPr>
+          <w:p>
+            <w:pPr>
+              <w:spacing w:after="40"/>
+            </w:pPr>
+            <w:r>
+              <w:rPr>
+                <w:rFonts w:ascii="Calibri" w:cs="Calibri" w:eastAsia="Calibri" w:hAnsi="Calibri"/>
+                <w:color w:val="14213D"/>
+                <w:sz w:val="20"/>
+                <w:szCs w:val="20"/>
+              </w:rPr>
+              <w:t xml:space="preserve"/>
+            </w:r>
+          </w:p>
+          <w:p>
+            <w:pPr>
+              <w:spacing w:after="40"/>
+            </w:pPr>
+            <w:r>
+              <w:rPr>
+                <w:rFonts w:ascii="Calibri" w:cs="Calibri" w:eastAsia="Calibri" w:hAnsi="Calibri"/>
+                <w:color w:val="14213D"/>
+                <w:sz w:val="20"/>
+                <w:szCs w:val="20"/>
+              </w:rPr>
+              <w:t xml:space="preserve"/>
+            </w:r>
+          </w:p>
+        </w:tc>
+      </w:tr>
+      <w:tr>
+        <w:tc>
+          <w:tcPr>
+            <w:tcW w:type="dxa" w:w="2300"/>
+            <w:tcBorders>
+              <w:top w:val="single" w:color="D9D5CB" w:sz="4"/>
+              <w:left w:val="single" w:color="D9D5CB" w:sz="4"/>
+              <w:bottom w:val="single" w:color="D9D5CB" w:sz="4"/>
+              <w:right w:val="single" w:color="D9D5CB" w:sz="4"/>
+            </w:tcBorders>
+            <w:tcMar>
+              <w:top w:type="dxa" w:w="60"/>
+              <w:left w:type="dxa" w:w="90"/>
+              <w:bottom w:type="dxa" w:w="60"/>
+              <w:right w:type="dxa" w:w="90"/>
+            </w:tcMar>
+            <w:vAlign w:val="top"/>
+          </w:tcPr>
+          <w:p>
+            <w:pPr>
+              <w:spacing w:after="40"/>
+            </w:pPr>
+            <w:r>
+              <w:rPr>
+                <w:rFonts w:ascii="Calibri" w:cs="Calibri" w:eastAsia="Calibri" w:hAnsi="Calibri"/>
+                <w:b/>
+                <w:bCs/>
+                <w:color w:val="14213D"/>
+                <w:sz w:val="20"/>
+                <w:szCs w:val="20"/>
+              </w:rPr>
+              <w:t xml:space="preserve">2 · Lecture : notes à PLUSIEURS destinations</w:t>
+            </w:r>
+          </w:p>
+        </w:tc>
+        <w:tc>
+          <w:tcPr>
+            <w:tcW w:type="dxa" w:w="4100"/>
+            <w:tcBorders>
+              <w:top w:val="single" w:color="D9D5CB" w:sz="4"/>
+              <w:left w:val="single" w:color="D9D5CB" w:sz="4"/>
+              <w:bottom w:val="single" w:color="D9D5CB" w:sz="4"/>
+              <w:right w:val="single" w:color="D9D5CB" w:sz="4"/>
+            </w:tcBorders>
+            <w:tcMar>
+              <w:top w:type="dxa" w:w="60"/>
+              <w:left w:type="dxa" w:w="90"/>
+              <w:bottom w:type="dxa" w:w="60"/>
+              <w:right w:type="dxa" w:w="90"/>
+            </w:tcMar>
+            <w:vAlign w:val="top"/>
+          </w:tcPr>
+          <w:p>
+            <w:pPr>
+              <w:spacing w:after="40"/>
+            </w:pPr>
+            <w:r>
+              <w:rPr>
+                <w:rFonts w:ascii="Calibri" w:cs="Calibri" w:eastAsia="Calibri" w:hAnsi="Calibri"/>
+                <w:color w:val="14213D"/>
+                <w:sz w:val="19"/>
+                <w:szCs w:val="19"/>
+              </w:rPr>
+              <w:t xml:space="preserve">✎ Note sur une pièce : page / article, extrait, ta note, et des CASES à cocher — chiffrage (coché d'avance), mémoire technique, risque, question MOE, info : « série 2 imposée » part à la fois au chiffrage ET au mémoire. Filtres par destination. La note s'affiche en tête du chiffrage (chiffrage + risques) ET en tête du mémoire, avec « aussi → … » ; chacune se coche « prise en compte » séparément dans chaque étape.</w:t>
+            </w:r>
+          </w:p>
+        </w:tc>
+        <w:tc>
+          <w:tcPr>
+            <w:tcW w:type="dxa" w:w="3700"/>
+            <w:tcBorders>
+              <w:top w:val="single" w:color="D9D5CB" w:sz="4"/>
+              <w:left w:val="single" w:color="D9D5CB" w:sz="4"/>
+              <w:bottom w:val="single" w:color="D9D5CB" w:sz="4"/>
+              <w:right w:val="single" w:color="D9D5CB" w:sz="4"/>
+            </w:tcBorders>
+            <w:tcMar>
+              <w:top w:type="dxa" w:w="60"/>
+              <w:left w:type="dxa" w:w="90"/>
+              <w:bottom w:type="dxa" w:w="60"/>
+              <w:right w:type="dxa" w:w="90"/>
+            </w:tcMar>
+            <w:vAlign w:val="top"/>
+          </w:tcPr>
+          <w:p>
+            <w:pPr>
+              <w:spacing w:after="40"/>
+            </w:pPr>
+            <w:r>
+              <w:rPr>
+                <w:rFonts w:ascii="Calibri" w:cs="Calibri" w:eastAsia="Calibri" w:hAnsi="Calibri"/>
+                <w:color w:val="14213D"/>
+                <w:sz w:val="19"/>
+                <w:szCs w:val="19"/>
+              </w:rPr>
+              <w:t xml:space="preserve">Ta demande d'hier soir. L'import PDF avec surlignage direct dans la page reste la v2.</w:t>
+            </w:r>
+          </w:p>
+        </w:tc>
+        <w:tc>
+          <w:tcPr>
+            <w:tcW w:type="dxa" w:w="1300"/>
+            <w:tcBorders>
+              <w:top w:val="single" w:color="D9D5CB" w:sz="4"/>
+              <w:left w:val="single" w:color="D9D5CB" w:sz="4"/>
+              <w:bottom w:val="single" w:color="D9D5CB" w:sz="4"/>
+              <w:right w:val="single" w:color="D9D5CB" w:sz="4"/>
+            </w:tcBorders>
+            <w:shd w:fill="E6F5EC" w:color="auto" w:val="clear"/>
+            <w:tcMar>
+              <w:top w:type="dxa" w:w="60"/>
+              <w:left w:type="dxa" w:w="90"/>
+              <w:bottom w:type="dxa" w:w="60"/>
+              <w:right w:type="dxa" w:w="90"/>
+            </w:tcMar>
+            <w:vAlign w:val="top"/>
+          </w:tcPr>
+          <w:p>
+            <w:pPr>
+              <w:spacing w:after="40"/>
+            </w:pPr>
+            <w:r>
+              <w:rPr>
+                <w:rFonts w:ascii="Calibri" w:cs="Calibri" w:eastAsia="Calibri" w:hAnsi="Calibri"/>
+                <w:b/>
+                <w:bCs/>
+                <w:color w:val="14213D"/>
+                <w:sz w:val="19"/>
+                <w:szCs w:val="19"/>
+              </w:rPr>
+              <w:t xml:space="preserve">Fait</w:t>
+            </w:r>
+          </w:p>
+        </w:tc>
+        <w:tc>
+          <w:tcPr>
+            <w:tcW w:type="dxa" w:w="3700"/>
+            <w:tcBorders>
+              <w:top w:val="single" w:color="D9D5CB" w:sz="4"/>
+              <w:left w:val="single" w:color="D9D5CB" w:sz="4"/>
+              <w:bottom w:val="single" w:color="D9D5CB" w:sz="4"/>
+              <w:right w:val="single" w:color="D9D5CB" w:sz="4"/>
+            </w:tcBorders>
+            <w:tcMar>
+              <w:top w:type="dxa" w:w="60"/>
+              <w:left w:type="dxa" w:w="90"/>
+              <w:bottom w:type="dxa" w:w="60"/>
+              <w:right w:type="dxa" w:w="90"/>
+            </w:tcMar>
+            <w:vAlign w:val="top"/>
+          </w:tcPr>
+          <w:p>
+            <w:pPr>
+              <w:spacing w:after="40"/>
+            </w:pPr>
+            <w:r>
+              <w:rPr>
+                <w:rFonts w:ascii="Calibri" w:cs="Calibri" w:eastAsia="Calibri" w:hAnsi="Calibri"/>
+                <w:color w:val="14213D"/>
+                <w:sz w:val="20"/>
+                <w:szCs w:val="20"/>
+              </w:rPr>
+              <w:t xml:space="preserve"/>
+            </w:r>
+          </w:p>
+          <w:p>
+            <w:pPr>
+              <w:spacing w:after="40"/>
+            </w:pPr>
+            <w:r>
+              <w:rPr>
+                <w:rFonts w:ascii="Calibri" w:cs="Calibri" w:eastAsia="Calibri" w:hAnsi="Calibri"/>
+                <w:color w:val="14213D"/>
+                <w:sz w:val="20"/>
+                <w:szCs w:val="20"/>
+              </w:rPr>
+              <w:t xml:space="preserve"/>
+            </w:r>
+          </w:p>
+        </w:tc>
+      </w:tr>
+      <w:tr>
+        <w:tc>
+          <w:tcPr>
+            <w:tcW w:type="dxa" w:w="2300"/>
+            <w:tcBorders>
+              <w:top w:val="single" w:color="D9D5CB" w:sz="4"/>
+              <w:left w:val="single" w:color="D9D5CB" w:sz="4"/>
+              <w:bottom w:val="single" w:color="D9D5CB" w:sz="4"/>
+              <w:right w:val="single" w:color="D9D5CB" w:sz="4"/>
+            </w:tcBorders>
+            <w:tcMar>
+              <w:top w:type="dxa" w:w="60"/>
+              <w:left w:type="dxa" w:w="90"/>
+              <w:bottom w:type="dxa" w:w="60"/>
+              <w:right w:type="dxa" w:w="90"/>
+            </w:tcMar>
+            <w:vAlign w:val="top"/>
+          </w:tcPr>
+          <w:p>
+            <w:pPr>
+              <w:spacing w:after="40"/>
+            </w:pPr>
+            <w:r>
+              <w:rPr>
+                <w:rFonts w:ascii="Calibri" w:cs="Calibri" w:eastAsia="Calibri" w:hAnsi="Calibri"/>
+                <w:b/>
+                <w:bCs/>
+                <w:color w:val="14213D"/>
+                <w:sz w:val="20"/>
+                <w:szCs w:val="20"/>
+              </w:rPr>
+              <w:t xml:space="preserve">2 · Quantités repérées → chiffrage</w:t>
+            </w:r>
+          </w:p>
+        </w:tc>
+        <w:tc>
+          <w:tcPr>
+            <w:tcW w:type="dxa" w:w="4100"/>
+            <w:tcBorders>
+              <w:top w:val="single" w:color="D9D5CB" w:sz="4"/>
+              <w:left w:val="single" w:color="D9D5CB" w:sz="4"/>
+              <w:bottom w:val="single" w:color="D9D5CB" w:sz="4"/>
+              <w:right w:val="single" w:color="D9D5CB" w:sz="4"/>
+            </w:tcBorders>
+            <w:tcMar>
+              <w:top w:type="dxa" w:w="60"/>
+              <w:left w:type="dxa" w:w="90"/>
+              <w:bottom w:type="dxa" w:w="60"/>
+              <w:right w:type="dxa" w:w="90"/>
+            </w:tcMar>
+            <w:vAlign w:val="top"/>
+          </w:tcPr>
+          <w:p>
+            <w:pPr>
+              <w:spacing w:after="40"/>
+            </w:pPr>
+            <w:r>
+              <w:rPr>
+                <w:rFonts w:ascii="Calibri" w:cs="Calibri" w:eastAsia="Calibri" w:hAnsi="Calibri"/>
+                <w:color w:val="14213D"/>
+                <w:sz w:val="19"/>
+                <w:szCs w:val="19"/>
+              </w:rPr>
+              <w:t xml:space="preserve">Sous les notes : ml de tranchée, sous-stations, coudes, tés, réductions, vannes, et un tableau par DN (soudures, ml, manchons = soudures). « → Préremplir le chiffrage » crée la zone « Quantités repérées » du chiffrage avec ces DN — le prix de vente sort tout de suite (méthode V2B). Si le tracé est lié, « ✎ Vérifier avec le tracé ».</w:t>
+            </w:r>
+          </w:p>
+        </w:tc>
+        <w:tc>
+          <w:tcPr>
+            <w:tcW w:type="dxa" w:w="3700"/>
+            <w:tcBorders>
+              <w:top w:val="single" w:color="D9D5CB" w:sz="4"/>
+              <w:left w:val="single" w:color="D9D5CB" w:sz="4"/>
+              <w:bottom w:val="single" w:color="D9D5CB" w:sz="4"/>
+              <w:right w:val="single" w:color="D9D5CB" w:sz="4"/>
+            </w:tcBorders>
+            <w:tcMar>
+              <w:top w:type="dxa" w:w="60"/>
+              <w:left w:type="dxa" w:w="90"/>
+              <w:bottom w:type="dxa" w:w="60"/>
+              <w:right w:type="dxa" w:w="90"/>
+            </w:tcMar>
+            <w:vAlign w:val="top"/>
+          </w:tcPr>
+          <w:p>
+            <w:pPr>
+              <w:spacing w:after="40"/>
+            </w:pPr>
+            <w:r>
+              <w:rPr>
+                <w:rFonts w:ascii="Calibri" w:cs="Calibri" w:eastAsia="Calibri" w:hAnsi="Calibri"/>
+                <w:color w:val="14213D"/>
+                <w:sz w:val="19"/>
+                <w:szCs w:val="19"/>
+              </w:rPr>
+              <w:t xml:space="preserve">Démo : DN 250 × 304 + DN 150 × 96 → 400 soudures, 192 k€ de vente avec la base SCR.</w:t>
+            </w:r>
+          </w:p>
+        </w:tc>
+        <w:tc>
+          <w:tcPr>
+            <w:tcW w:type="dxa" w:w="1300"/>
+            <w:tcBorders>
+              <w:top w:val="single" w:color="D9D5CB" w:sz="4"/>
+              <w:left w:val="single" w:color="D9D5CB" w:sz="4"/>
+              <w:bottom w:val="single" w:color="D9D5CB" w:sz="4"/>
+              <w:right w:val="single" w:color="D9D5CB" w:sz="4"/>
+            </w:tcBorders>
+            <w:shd w:fill="E6F5EC" w:color="auto" w:val="clear"/>
+            <w:tcMar>
+              <w:top w:type="dxa" w:w="60"/>
+              <w:left w:type="dxa" w:w="90"/>
+              <w:bottom w:type="dxa" w:w="60"/>
+              <w:right w:type="dxa" w:w="90"/>
+            </w:tcMar>
+            <w:vAlign w:val="top"/>
+          </w:tcPr>
+          <w:p>
+            <w:pPr>
+              <w:spacing w:after="40"/>
+            </w:pPr>
+            <w:r>
+              <w:rPr>
+                <w:rFonts w:ascii="Calibri" w:cs="Calibri" w:eastAsia="Calibri" w:hAnsi="Calibri"/>
+                <w:b/>
+                <w:bCs/>
+                <w:color w:val="14213D"/>
+                <w:sz w:val="19"/>
+                <w:szCs w:val="19"/>
+              </w:rPr>
+              <w:t xml:space="preserve">Fait</w:t>
+            </w:r>
+          </w:p>
+        </w:tc>
+        <w:tc>
+          <w:tcPr>
+            <w:tcW w:type="dxa" w:w="3700"/>
+            <w:tcBorders>
+              <w:top w:val="single" w:color="D9D5CB" w:sz="4"/>
+              <w:left w:val="single" w:color="D9D5CB" w:sz="4"/>
+              <w:bottom w:val="single" w:color="D9D5CB" w:sz="4"/>
+              <w:right w:val="single" w:color="D9D5CB" w:sz="4"/>
+            </w:tcBorders>
+            <w:tcMar>
+              <w:top w:type="dxa" w:w="60"/>
+              <w:left w:type="dxa" w:w="90"/>
+              <w:bottom w:type="dxa" w:w="60"/>
+              <w:right w:type="dxa" w:w="90"/>
+            </w:tcMar>
+            <w:vAlign w:val="top"/>
+          </w:tcPr>
+          <w:p>
+            <w:pPr>
+              <w:spacing w:after="40"/>
+            </w:pPr>
+            <w:r>
+              <w:rPr>
+                <w:rFonts w:ascii="Calibri" w:cs="Calibri" w:eastAsia="Calibri" w:hAnsi="Calibri"/>
+                <w:color w:val="14213D"/>
+                <w:sz w:val="20"/>
+                <w:szCs w:val="20"/>
+              </w:rPr>
+              <w:t xml:space="preserve"/>
+            </w:r>
+          </w:p>
+          <w:p>
+            <w:pPr>
+              <w:spacing w:after="40"/>
+            </w:pPr>
+            <w:r>
+              <w:rPr>
+                <w:rFonts w:ascii="Calibri" w:cs="Calibri" w:eastAsia="Calibri" w:hAnsi="Calibri"/>
+                <w:color w:val="14213D"/>
+                <w:sz w:val="20"/>
+                <w:szCs w:val="20"/>
+              </w:rPr>
+              <w:t xml:space="preserve"/>
+            </w:r>
+          </w:p>
+        </w:tc>
+      </w:tr>
+      <w:tr>
+        <w:tc>
+          <w:tcPr>
+            <w:tcW w:type="dxa" w:w="2300"/>
+            <w:tcBorders>
+              <w:top w:val="single" w:color="D9D5CB" w:sz="4"/>
+              <w:left w:val="single" w:color="D9D5CB" w:sz="4"/>
+              <w:bottom w:val="single" w:color="D9D5CB" w:sz="4"/>
+              <w:right w:val="single" w:color="D9D5CB" w:sz="4"/>
+            </w:tcBorders>
+            <w:tcMar>
+              <w:top w:type="dxa" w:w="60"/>
+              <w:left w:type="dxa" w:w="90"/>
+              <w:bottom w:type="dxa" w:w="60"/>
+              <w:right w:type="dxa" w:w="90"/>
+            </w:tcMar>
+            <w:vAlign w:val="top"/>
+          </w:tcPr>
+          <w:p>
+            <w:pPr>
+              <w:spacing w:after="40"/>
+            </w:pPr>
+            <w:r>
+              <w:rPr>
+                <w:rFonts w:ascii="Calibri" w:cs="Calibri" w:eastAsia="Calibri" w:hAnsi="Calibri"/>
+                <w:b/>
+                <w:bCs/>
+                <w:color w:val="14213D"/>
+                <w:sz w:val="20"/>
+                <w:szCs w:val="20"/>
+              </w:rPr>
+              <w:t xml:space="preserve">4 · Mémoire technique</w:t>
+            </w:r>
+          </w:p>
+        </w:tc>
+        <w:tc>
+          <w:tcPr>
+            <w:tcW w:type="dxa" w:w="4100"/>
+            <w:tcBorders>
+              <w:top w:val="single" w:color="D9D5CB" w:sz="4"/>
+              <w:left w:val="single" w:color="D9D5CB" w:sz="4"/>
+              <w:bottom w:val="single" w:color="D9D5CB" w:sz="4"/>
+              <w:right w:val="single" w:color="D9D5CB" w:sz="4"/>
+            </w:tcBorders>
+            <w:tcMar>
+              <w:top w:type="dxa" w:w="60"/>
+              <w:left w:type="dxa" w:w="90"/>
+              <w:bottom w:type="dxa" w:w="60"/>
+              <w:right w:type="dxa" w:w="90"/>
+            </w:tcMar>
+            <w:vAlign w:val="top"/>
+          </w:tcPr>
+          <w:p>
+            <w:pPr>
+              <w:spacing w:after="40"/>
+            </w:pPr>
+            <w:r>
+              <w:rPr>
+                <w:rFonts w:ascii="Calibri" w:cs="Calibri" w:eastAsia="Calibri" w:hAnsi="Calibri"/>
+                <w:color w:val="14213D"/>
+                <w:sz w:val="19"/>
+                <w:szCs w:val="19"/>
+              </w:rPr>
+              <w:t xml:space="preserve">« Créer le plan type SCR » : 10 sections (présentation, compréhension du projet, méthodo soudage / manchonnage, moyens humains, moyens matériels, qualité, sécurité, planning, environnement, références) avec un état prête / à adapter / à écrire. Chaque section : titre, état, texte. « ⟳ Paragraphe depuis le chiffrage » insère les chiffres (soudures, ml, DN, jours de soudage et de manchonnage, équipe, délai). « 💾 Garder comme bloc SCR » range une section dans la bibliothèque ; « 📚 Insérer un bloc SCR » la réutilise dans une autre section ou un autre dossier. ↑ ↓ ＋ ✕, « ✓ Prête ». « 🖨 Imprimer / PDF » et « ⬇ Word (.doc) » avec page de garde SCR.</w:t>
+            </w:r>
+          </w:p>
+        </w:tc>
+        <w:tc>
+          <w:tcPr>
+            <w:tcW w:type="dxa" w:w="3700"/>
+            <w:tcBorders>
+              <w:top w:val="single" w:color="D9D5CB" w:sz="4"/>
+              <w:left w:val="single" w:color="D9D5CB" w:sz="4"/>
+              <w:bottom w:val="single" w:color="D9D5CB" w:sz="4"/>
+              <w:right w:val="single" w:color="D9D5CB" w:sz="4"/>
+            </w:tcBorders>
+            <w:tcMar>
+              <w:top w:type="dxa" w:w="60"/>
+              <w:left w:type="dxa" w:w="90"/>
+              <w:bottom w:type="dxa" w:w="60"/>
+              <w:right w:type="dxa" w:w="90"/>
+            </w:tcMar>
+            <w:vAlign w:val="top"/>
+          </w:tcPr>
+          <w:p>
+            <w:pPr>
+              <w:spacing w:after="40"/>
+            </w:pPr>
+            <w:r>
+              <w:rPr>
+                <w:rFonts w:ascii="Calibri" w:cs="Calibri" w:eastAsia="Calibri" w:hAnsi="Calibri"/>
+                <w:color w:val="14213D"/>
+                <w:sz w:val="19"/>
+                <w:szCs w:val="19"/>
+              </w:rPr>
+              <w:t xml:space="preserve">La bibliothèque est vide au départ : tes textes validés (présentation SCR, méthodos, QSE) sont à y mettre une fois — je peux les rédiger si tu me donnes un mémoire gagné. Le .doc s'ouvre dans Word ; les photos et le modèle de mise en page = v2.</w:t>
+            </w:r>
+          </w:p>
+        </w:tc>
+        <w:tc>
+          <w:tcPr>
+            <w:tcW w:type="dxa" w:w="1300"/>
+            <w:tcBorders>
+              <w:top w:val="single" w:color="D9D5CB" w:sz="4"/>
+              <w:left w:val="single" w:color="D9D5CB" w:sz="4"/>
+              <w:bottom w:val="single" w:color="D9D5CB" w:sz="4"/>
+              <w:right w:val="single" w:color="D9D5CB" w:sz="4"/>
+            </w:tcBorders>
+            <w:shd w:fill="E6F5EC" w:color="auto" w:val="clear"/>
+            <w:tcMar>
+              <w:top w:type="dxa" w:w="60"/>
+              <w:left w:type="dxa" w:w="90"/>
+              <w:bottom w:type="dxa" w:w="60"/>
+              <w:right w:type="dxa" w:w="90"/>
+            </w:tcMar>
+            <w:vAlign w:val="top"/>
+          </w:tcPr>
+          <w:p>
+            <w:pPr>
+              <w:spacing w:after="40"/>
+            </w:pPr>
+            <w:r>
+              <w:rPr>
+                <w:rFonts w:ascii="Calibri" w:cs="Calibri" w:eastAsia="Calibri" w:hAnsi="Calibri"/>
+                <w:b/>
+                <w:bCs/>
+                <w:color w:val="14213D"/>
+                <w:sz w:val="19"/>
+                <w:szCs w:val="19"/>
+              </w:rPr>
+              <w:t xml:space="preserve">Fait (v1)</w:t>
+            </w:r>
+          </w:p>
+        </w:tc>
+        <w:tc>
+          <w:tcPr>
+            <w:tcW w:type="dxa" w:w="3700"/>
+            <w:tcBorders>
+              <w:top w:val="single" w:color="D9D5CB" w:sz="4"/>
+              <w:left w:val="single" w:color="D9D5CB" w:sz="4"/>
+              <w:bottom w:val="single" w:color="D9D5CB" w:sz="4"/>
+              <w:right w:val="single" w:color="D9D5CB" w:sz="4"/>
+            </w:tcBorders>
+            <w:tcMar>
+              <w:top w:type="dxa" w:w="60"/>
+              <w:left w:type="dxa" w:w="90"/>
+              <w:bottom w:type="dxa" w:w="60"/>
+              <w:right w:type="dxa" w:w="90"/>
+            </w:tcMar>
+            <w:vAlign w:val="top"/>
+          </w:tcPr>
+          <w:p>
+            <w:pPr>
+              <w:spacing w:after="40"/>
+            </w:pPr>
+            <w:r>
+              <w:rPr>
+                <w:rFonts w:ascii="Calibri" w:cs="Calibri" w:eastAsia="Calibri" w:hAnsi="Calibri"/>
+                <w:color w:val="14213D"/>
+                <w:sz w:val="20"/>
+                <w:szCs w:val="20"/>
+              </w:rPr>
+              <w:t xml:space="preserve"/>
+            </w:r>
+          </w:p>
+          <w:p>
+            <w:pPr>
+              <w:spacing w:after="40"/>
+            </w:pPr>
+            <w:r>
+              <w:rPr>
+                <w:rFonts w:ascii="Calibri" w:cs="Calibri" w:eastAsia="Calibri" w:hAnsi="Calibri"/>
+                <w:color w:val="14213D"/>
+                <w:sz w:val="20"/>
+                <w:szCs w:val="20"/>
+              </w:rPr>
+              <w:t xml:space="preserve"/>
+            </w:r>
+          </w:p>
+        </w:tc>
+      </w:tr>
+      <w:tr>
+        <w:tc>
+          <w:tcPr>
+            <w:tcW w:type="dxa" w:w="2300"/>
+            <w:tcBorders>
+              <w:top w:val="single" w:color="D9D5CB" w:sz="4"/>
+              <w:left w:val="single" w:color="D9D5CB" w:sz="4"/>
+              <w:bottom w:val="single" w:color="D9D5CB" w:sz="4"/>
+              <w:right w:val="single" w:color="D9D5CB" w:sz="4"/>
+            </w:tcBorders>
+            <w:tcMar>
+              <w:top w:type="dxa" w:w="60"/>
+              <w:left w:type="dxa" w:w="90"/>
+              <w:bottom w:type="dxa" w:w="60"/>
+              <w:right w:type="dxa" w:w="90"/>
+            </w:tcMar>
+            <w:vAlign w:val="top"/>
+          </w:tcPr>
+          <w:p>
+            <w:pPr>
+              <w:spacing w:after="40"/>
+            </w:pPr>
+            <w:r>
+              <w:rPr>
+                <w:rFonts w:ascii="Calibri" w:cs="Calibri" w:eastAsia="Calibri" w:hAnsi="Calibri"/>
+                <w:b/>
+                <w:bCs/>
+                <w:color w:val="14213D"/>
+                <w:sz w:val="20"/>
+                <w:szCs w:val="20"/>
+              </w:rPr>
+              <w:t xml:space="preserve">5 · DPGF : l'Excel du client, rempli depuis le chiffrage</w:t>
+            </w:r>
+          </w:p>
+        </w:tc>
+        <w:tc>
+          <w:tcPr>
+            <w:tcW w:type="dxa" w:w="4100"/>
+            <w:tcBorders>
+              <w:top w:val="single" w:color="D9D5CB" w:sz="4"/>
+              <w:left w:val="single" w:color="D9D5CB" w:sz="4"/>
+              <w:bottom w:val="single" w:color="D9D5CB" w:sz="4"/>
+              <w:right w:val="single" w:color="D9D5CB" w:sz="4"/>
+            </w:tcBorders>
+            <w:tcMar>
+              <w:top w:type="dxa" w:w="60"/>
+              <w:left w:type="dxa" w:w="90"/>
+              <w:bottom w:type="dxa" w:w="60"/>
+              <w:right w:type="dxa" w:w="90"/>
+            </w:tcMar>
+            <w:vAlign w:val="top"/>
+          </w:tcPr>
+          <w:p>
+            <w:pPr>
+              <w:spacing w:after="40"/>
+            </w:pPr>
+            <w:r>
+              <w:rPr>
+                <w:rFonts w:ascii="Calibri" w:cs="Calibri" w:eastAsia="Calibri" w:hAnsi="Calibri"/>
+                <w:color w:val="14213D"/>
+                <w:sz w:val="19"/>
+                <w:szCs w:val="19"/>
+              </w:rPr>
+              <w:t xml:space="preserve">« 📎 Fichier DPGF (.xlsx) » : le fichier du MOE tel quel est lu dans l'appli (sans bibliothèque) : n°, désignation, unité, quantité, chapitres gardés. Ou collage depuis Excel. « ⚖ Répartir le prix de vente sur les lignes » (au prorata, reste sur la ligne à la plus petite quantité : exact au centime), « Arrondir à l'euro » (le total reste juste), PU modifiables un par un, écart affiché en permanence, source devinée par ligne (tubes &amp; soudure, manchons, contrôles, pièces, forfait), contrôles avant export, « ⬇ CSV (Excel) », impression, réimport.</w:t>
+            </w:r>
+          </w:p>
+        </w:tc>
+        <w:tc>
+          <w:tcPr>
+            <w:tcW w:type="dxa" w:w="3700"/>
+            <w:tcBorders>
+              <w:top w:val="single" w:color="D9D5CB" w:sz="4"/>
+              <w:left w:val="single" w:color="D9D5CB" w:sz="4"/>
+              <w:bottom w:val="single" w:color="D9D5CB" w:sz="4"/>
+              <w:right w:val="single" w:color="D9D5CB" w:sz="4"/>
+            </w:tcBorders>
+            <w:tcMar>
+              <w:top w:type="dxa" w:w="60"/>
+              <w:left w:type="dxa" w:w="90"/>
+              <w:bottom w:type="dxa" w:w="60"/>
+              <w:right w:type="dxa" w:w="90"/>
+            </w:tcMar>
+            <w:vAlign w:val="top"/>
+          </w:tcPr>
+          <w:p>
+            <w:pPr>
+              <w:spacing w:after="40"/>
+            </w:pPr>
+            <w:r>
+              <w:rPr>
+                <w:rFonts w:ascii="Calibri" w:cs="Calibri" w:eastAsia="Calibri" w:hAnsi="Calibri"/>
+                <w:color w:val="14213D"/>
+                <w:sz w:val="19"/>
+                <w:szCs w:val="19"/>
+              </w:rPr>
+              <w:t xml:space="preserve">L'écriture des PU DIRECTEMENT dans le .xlsx du client (mise en forme conservée) : étape suivante — aujourd'hui on recopie depuis le CSV. Après attribution, ce bordereau devient le tableau de facturation.</w:t>
+            </w:r>
+          </w:p>
+        </w:tc>
+        <w:tc>
+          <w:tcPr>
+            <w:tcW w:type="dxa" w:w="1300"/>
+            <w:tcBorders>
+              <w:top w:val="single" w:color="D9D5CB" w:sz="4"/>
+              <w:left w:val="single" w:color="D9D5CB" w:sz="4"/>
+              <w:bottom w:val="single" w:color="D9D5CB" w:sz="4"/>
+              <w:right w:val="single" w:color="D9D5CB" w:sz="4"/>
+            </w:tcBorders>
+            <w:shd w:fill="E6F5EC" w:color="auto" w:val="clear"/>
+            <w:tcMar>
+              <w:top w:type="dxa" w:w="60"/>
+              <w:left w:type="dxa" w:w="90"/>
+              <w:bottom w:type="dxa" w:w="60"/>
+              <w:right w:type="dxa" w:w="90"/>
+            </w:tcMar>
+            <w:vAlign w:val="top"/>
+          </w:tcPr>
+          <w:p>
+            <w:pPr>
+              <w:spacing w:after="40"/>
+            </w:pPr>
+            <w:r>
+              <w:rPr>
+                <w:rFonts w:ascii="Calibri" w:cs="Calibri" w:eastAsia="Calibri" w:hAnsi="Calibri"/>
+                <w:b/>
+                <w:bCs/>
+                <w:color w:val="14213D"/>
+                <w:sz w:val="19"/>
+                <w:szCs w:val="19"/>
+              </w:rPr>
+              <w:t xml:space="preserve">Fait (v1)</w:t>
+            </w:r>
+          </w:p>
+        </w:tc>
+        <w:tc>
+          <w:tcPr>
+            <w:tcW w:type="dxa" w:w="3700"/>
+            <w:tcBorders>
+              <w:top w:val="single" w:color="D9D5CB" w:sz="4"/>
+              <w:left w:val="single" w:color="D9D5CB" w:sz="4"/>
+              <w:bottom w:val="single" w:color="D9D5CB" w:sz="4"/>
+              <w:right w:val="single" w:color="D9D5CB" w:sz="4"/>
+            </w:tcBorders>
+            <w:tcMar>
+              <w:top w:type="dxa" w:w="60"/>
+              <w:left w:type="dxa" w:w="90"/>
+              <w:bottom w:type="dxa" w:w="60"/>
+              <w:right w:type="dxa" w:w="90"/>
+            </w:tcMar>
+            <w:vAlign w:val="top"/>
+          </w:tcPr>
+          <w:p>
+            <w:pPr>
+              <w:spacing w:after="40"/>
+            </w:pPr>
+            <w:r>
+              <w:rPr>
+                <w:rFonts w:ascii="Calibri" w:cs="Calibri" w:eastAsia="Calibri" w:hAnsi="Calibri"/>
+                <w:color w:val="14213D"/>
+                <w:sz w:val="20"/>
+                <w:szCs w:val="20"/>
+              </w:rPr>
+              <w:t xml:space="preserve"/>
+            </w:r>
+          </w:p>
+          <w:p>
+            <w:pPr>
+              <w:spacing w:after="40"/>
+            </w:pPr>
+            <w:r>
+              <w:rPr>
+                <w:rFonts w:ascii="Calibri" w:cs="Calibri" w:eastAsia="Calibri" w:hAnsi="Calibri"/>
+                <w:color w:val="14213D"/>
+                <w:sz w:val="20"/>
+                <w:szCs w:val="20"/>
+              </w:rPr>
+              <w:t xml:space="preserve"/>
+            </w:r>
+          </w:p>
+        </w:tc>
+      </w:tr>
+      <w:tr>
+        <w:tc>
+          <w:tcPr>
+            <w:tcW w:type="dxa" w:w="2300"/>
+            <w:tcBorders>
+              <w:top w:val="single" w:color="D9D5CB" w:sz="4"/>
+              <w:left w:val="single" w:color="D9D5CB" w:sz="4"/>
+              <w:bottom w:val="single" w:color="D9D5CB" w:sz="4"/>
+              <w:right w:val="single" w:color="D9D5CB" w:sz="4"/>
+            </w:tcBorders>
+            <w:tcMar>
+              <w:top w:type="dxa" w:w="60"/>
+              <w:left w:type="dxa" w:w="90"/>
+              <w:bottom w:type="dxa" w:w="60"/>
+              <w:right w:type="dxa" w:w="90"/>
+            </w:tcMar>
+            <w:vAlign w:val="top"/>
+          </w:tcPr>
+          <w:p>
+            <w:pPr>
+              <w:spacing w:after="40"/>
+            </w:pPr>
+            <w:r>
+              <w:rPr>
+                <w:rFonts w:ascii="Calibri" w:cs="Calibri" w:eastAsia="Calibri" w:hAnsi="Calibri"/>
+                <w:b/>
+                <w:bCs/>
+                <w:color w:val="14213D"/>
+                <w:sz w:val="20"/>
+                <w:szCs w:val="20"/>
+              </w:rPr>
+              <w:t xml:space="preserve">6 · Offre</w:t>
+            </w:r>
+          </w:p>
+        </w:tc>
+        <w:tc>
+          <w:tcPr>
+            <w:tcW w:type="dxa" w:w="4100"/>
+            <w:tcBorders>
+              <w:top w:val="single" w:color="D9D5CB" w:sz="4"/>
+              <w:left w:val="single" w:color="D9D5CB" w:sz="4"/>
+              <w:bottom w:val="single" w:color="D9D5CB" w:sz="4"/>
+              <w:right w:val="single" w:color="D9D5CB" w:sz="4"/>
+            </w:tcBorders>
+            <w:tcMar>
+              <w:top w:type="dxa" w:w="60"/>
+              <w:left w:type="dxa" w:w="90"/>
+              <w:bottom w:type="dxa" w:w="60"/>
+              <w:right w:type="dxa" w:w="90"/>
+            </w:tcMar>
+            <w:vAlign w:val="top"/>
+          </w:tcPr>
+          <w:p>
+            <w:pPr>
+              <w:spacing w:after="40"/>
+            </w:pPr>
+            <w:r>
+              <w:rPr>
+                <w:rFonts w:ascii="Calibri" w:cs="Calibri" w:eastAsia="Calibri" w:hAnsi="Calibri"/>
+                <w:color w:val="14213D"/>
+                <w:sz w:val="19"/>
+                <w:szCs w:val="19"/>
+              </w:rPr>
+              <w:t xml:space="preserve">Pièces à remettre cochables (AE, DPGF, mémoire, planning, attestations, variante) avec les alertes (sections pas prêtes, écart DPGF). « 📤 Marquer l'offre remise » : date tracée, montant du devis = prix de vente, préconsultation → devis. Après : « ＋ Nouvelle version » (négociation), « 🏆 Gagnée → à débuter » (dossier en cours), « ✗ Perdue » (motif, prix du gagnant). Les versions du chiffrage listées.</w:t>
+            </w:r>
+          </w:p>
+        </w:tc>
+        <w:tc>
+          <w:tcPr>
+            <w:tcW w:type="dxa" w:w="3700"/>
+            <w:tcBorders>
+              <w:top w:val="single" w:color="D9D5CB" w:sz="4"/>
+              <w:left w:val="single" w:color="D9D5CB" w:sz="4"/>
+              <w:bottom w:val="single" w:color="D9D5CB" w:sz="4"/>
+              <w:right w:val="single" w:color="D9D5CB" w:sz="4"/>
+            </w:tcBorders>
+            <w:tcMar>
+              <w:top w:type="dxa" w:w="60"/>
+              <w:left w:type="dxa" w:w="90"/>
+              <w:bottom w:type="dxa" w:w="60"/>
+              <w:right w:type="dxa" w:w="90"/>
+            </w:tcMar>
+            <w:vAlign w:val="top"/>
+          </w:tcPr>
+          <w:p>
+            <w:pPr>
+              <w:spacing w:after="40"/>
+            </w:pPr>
+            <w:r>
+              <w:rPr>
+                <w:rFonts w:ascii="Calibri" w:cs="Calibri" w:eastAsia="Calibri" w:hAnsi="Calibri"/>
+                <w:color w:val="14213D"/>
+                <w:sz w:val="19"/>
+                <w:szCs w:val="19"/>
+              </w:rPr>
+              <w:t xml:space="preserve">Le Reporting s'en sert (créée, remise, montant, marge, versions, chargé).</w:t>
+            </w:r>
+          </w:p>
+        </w:tc>
+        <w:tc>
+          <w:tcPr>
+            <w:tcW w:type="dxa" w:w="1300"/>
+            <w:tcBorders>
+              <w:top w:val="single" w:color="D9D5CB" w:sz="4"/>
+              <w:left w:val="single" w:color="D9D5CB" w:sz="4"/>
+              <w:bottom w:val="single" w:color="D9D5CB" w:sz="4"/>
+              <w:right w:val="single" w:color="D9D5CB" w:sz="4"/>
+            </w:tcBorders>
+            <w:shd w:fill="E6F5EC" w:color="auto" w:val="clear"/>
+            <w:tcMar>
+              <w:top w:type="dxa" w:w="60"/>
+              <w:left w:type="dxa" w:w="90"/>
+              <w:bottom w:type="dxa" w:w="60"/>
+              <w:right w:type="dxa" w:w="90"/>
+            </w:tcMar>
+            <w:vAlign w:val="top"/>
+          </w:tcPr>
+          <w:p>
+            <w:pPr>
+              <w:spacing w:after="40"/>
+            </w:pPr>
+            <w:r>
+              <w:rPr>
+                <w:rFonts w:ascii="Calibri" w:cs="Calibri" w:eastAsia="Calibri" w:hAnsi="Calibri"/>
+                <w:b/>
+                <w:bCs/>
+                <w:color w:val="14213D"/>
+                <w:sz w:val="19"/>
+                <w:szCs w:val="19"/>
+              </w:rPr>
+              <w:t xml:space="preserve">Fait</w:t>
+            </w:r>
+          </w:p>
+        </w:tc>
+        <w:tc>
+          <w:tcPr>
+            <w:tcW w:type="dxa" w:w="3700"/>
+            <w:tcBorders>
+              <w:top w:val="single" w:color="D9D5CB" w:sz="4"/>
+              <w:left w:val="single" w:color="D9D5CB" w:sz="4"/>
+              <w:bottom w:val="single" w:color="D9D5CB" w:sz="4"/>
+              <w:right w:val="single" w:color="D9D5CB" w:sz="4"/>
+            </w:tcBorders>
+            <w:tcMar>
+              <w:top w:type="dxa" w:w="60"/>
+              <w:left w:type="dxa" w:w="90"/>
+              <w:bottom w:type="dxa" w:w="60"/>
+              <w:right w:type="dxa" w:w="90"/>
+            </w:tcMar>
+            <w:vAlign w:val="top"/>
+          </w:tcPr>
+          <w:p>
+            <w:pPr>
+              <w:spacing w:after="40"/>
+            </w:pPr>
+            <w:r>
+              <w:rPr>
+                <w:rFonts w:ascii="Calibri" w:cs="Calibri" w:eastAsia="Calibri" w:hAnsi="Calibri"/>
+                <w:color w:val="14213D"/>
+                <w:sz w:val="20"/>
+                <w:szCs w:val="20"/>
+              </w:rPr>
+              <w:t xml:space="preserve"/>
+            </w:r>
+          </w:p>
+          <w:p>
+            <w:pPr>
+              <w:spacing w:after="40"/>
+            </w:pPr>
+            <w:r>
+              <w:rPr>
+                <w:rFonts w:ascii="Calibri" w:cs="Calibri" w:eastAsia="Calibri" w:hAnsi="Calibri"/>
+                <w:color w:val="14213D"/>
+                <w:sz w:val="20"/>
+                <w:szCs w:val="20"/>
+              </w:rPr>
+              <w:t xml:space="preserve"/>
+            </w:r>
+          </w:p>
+        </w:tc>
+      </w:tr>
+      <w:tr>
+        <w:tc>
+          <w:tcPr>
+            <w:tcW w:type="dxa" w:w="2300"/>
+            <w:tcBorders>
+              <w:top w:val="single" w:color="D9D5CB" w:sz="4"/>
+              <w:left w:val="single" w:color="D9D5CB" w:sz="4"/>
+              <w:bottom w:val="single" w:color="D9D5CB" w:sz="4"/>
+              <w:right w:val="single" w:color="D9D5CB" w:sz="4"/>
+            </w:tcBorders>
+            <w:tcMar>
+              <w:top w:type="dxa" w:w="60"/>
+              <w:left w:type="dxa" w:w="90"/>
+              <w:bottom w:type="dxa" w:w="60"/>
+              <w:right w:type="dxa" w:w="90"/>
+            </w:tcMar>
+            <w:vAlign w:val="top"/>
+          </w:tcPr>
+          <w:p>
+            <w:pPr>
+              <w:spacing w:after="40"/>
+            </w:pPr>
+            <w:r>
+              <w:rPr>
+                <w:rFonts w:ascii="Calibri" w:cs="Calibri" w:eastAsia="Calibri" w:hAnsi="Calibri"/>
+                <w:b/>
+                <w:bCs/>
+                <w:color w:val="14213D"/>
+                <w:sz w:val="20"/>
+                <w:szCs w:val="20"/>
+              </w:rPr>
+              <w:t xml:space="preserve">Ce que je n'ai pas fait</w:t>
+            </w:r>
+          </w:p>
+        </w:tc>
+        <w:tc>
+          <w:tcPr>
+            <w:tcW w:type="dxa" w:w="4100"/>
+            <w:tcBorders>
+              <w:top w:val="single" w:color="D9D5CB" w:sz="4"/>
+              <w:left w:val="single" w:color="D9D5CB" w:sz="4"/>
+              <w:bottom w:val="single" w:color="D9D5CB" w:sz="4"/>
+              <w:right w:val="single" w:color="D9D5CB" w:sz="4"/>
+            </w:tcBorders>
+            <w:tcMar>
+              <w:top w:type="dxa" w:w="60"/>
+              <w:left w:type="dxa" w:w="90"/>
+              <w:bottom w:type="dxa" w:w="60"/>
+              <w:right w:type="dxa" w:w="90"/>
+            </w:tcMar>
+            <w:vAlign w:val="top"/>
+          </w:tcPr>
+          <w:p>
+            <w:pPr>
+              <w:spacing w:after="40"/>
+            </w:pPr>
+            <w:r>
+              <w:rPr>
+                <w:rFonts w:ascii="Calibri" w:cs="Calibri" w:eastAsia="Calibri" w:hAnsi="Calibri"/>
+                <w:color w:val="14213D"/>
+                <w:sz w:val="19"/>
+                <w:szCs w:val="19"/>
+              </w:rPr>
+              <w:t xml:space="preserve">Surlignage dans le PDF ; calepinage automatique depuis le tracé ; courrier de questions au MOE généré ; blocs SCR de départ ; écriture dans le .xlsx du client ; planning d'exécution généré depuis les cadences.</w:t>
+            </w:r>
+          </w:p>
+        </w:tc>
+        <w:tc>
+          <w:tcPr>
+            <w:tcW w:type="dxa" w:w="3700"/>
+            <w:tcBorders>
+              <w:top w:val="single" w:color="D9D5CB" w:sz="4"/>
+              <w:left w:val="single" w:color="D9D5CB" w:sz="4"/>
+              <w:bottom w:val="single" w:color="D9D5CB" w:sz="4"/>
+              <w:right w:val="single" w:color="D9D5CB" w:sz="4"/>
+            </w:tcBorders>
+            <w:tcMar>
+              <w:top w:type="dxa" w:w="60"/>
+              <w:left w:type="dxa" w:w="90"/>
+              <w:bottom w:type="dxa" w:w="60"/>
+              <w:right w:type="dxa" w:w="90"/>
+            </w:tcMar>
+            <w:vAlign w:val="top"/>
+          </w:tcPr>
+          <w:p>
+            <w:pPr>
+              <w:spacing w:after="40"/>
+            </w:pPr>
+            <w:r>
+              <w:rPr>
+                <w:rFonts w:ascii="Calibri" w:cs="Calibri" w:eastAsia="Calibri" w:hAnsi="Calibri"/>
+                <w:color w:val="14213D"/>
+                <w:sz w:val="19"/>
+                <w:szCs w:val="19"/>
+              </w:rPr>
+              <w:t xml:space="preserve">À trancher ensemble après ton test.</w:t>
+            </w:r>
+          </w:p>
+        </w:tc>
+        <w:tc>
+          <w:tcPr>
+            <w:tcW w:type="dxa" w:w="1300"/>
+            <w:tcBorders>
+              <w:top w:val="single" w:color="D9D5CB" w:sz="4"/>
+              <w:left w:val="single" w:color="D9D5CB" w:sz="4"/>
+              <w:bottom w:val="single" w:color="D9D5CB" w:sz="4"/>
+              <w:right w:val="single" w:color="D9D5CB" w:sz="4"/>
+            </w:tcBorders>
+            <w:shd w:fill="FFF4EE" w:color="auto" w:val="clear"/>
+            <w:tcMar>
+              <w:top w:type="dxa" w:w="60"/>
+              <w:left w:type="dxa" w:w="90"/>
+              <w:bottom w:type="dxa" w:w="60"/>
+              <w:right w:type="dxa" w:w="90"/>
+            </w:tcMar>
+            <w:vAlign w:val="top"/>
+          </w:tcPr>
+          <w:p>
+            <w:pPr>
+              <w:spacing w:after="40"/>
+            </w:pPr>
+            <w:r>
+              <w:rPr>
+                <w:rFonts w:ascii="Calibri" w:cs="Calibri" w:eastAsia="Calibri" w:hAnsi="Calibri"/>
+                <w:b/>
+                <w:bCs/>
+                <w:color w:val="14213D"/>
+                <w:sz w:val="19"/>
+                <w:szCs w:val="19"/>
+              </w:rPr>
+              <w:t xml:space="preserve">—</w:t>
             </w:r>
           </w:p>
         </w:tc>
@@ -13705,7 +15384,7 @@
           <w:sz w:val="20"/>
           <w:szCs w:val="20"/>
         </w:rPr>
-        <w:t xml:space="preserve">Résumé : Navigateur de semaine, ticket de note de frais en photo, photo du véhicule, onglet SCR, → Outlook, maquette chiffrage A→Z</w:t>
+        <w:t xml:space="preserve">Résumé : Commerce de A à Z (dossier, lecture multi-destinations, mémoire, DPGF .xlsx, offre), navigateur de semaine, ticket en photo, photo véhicule, onglet SCR</w:t>
       </w:r>
     </w:p>
     <w:p>
@@ -13724,7 +15403,7 @@
           <w:sz w:val="20"/>
           <w:szCs w:val="20"/>
         </w:rPr>
-        <w:t xml:space="preserve">Description : nuit du 12 au 13/10 — navigateur de semaine (Ma semaine, Production par équipe, Planning : jours, aujourd'hui, points, ↺, glisser) ; Outlook : import caché quand relié, « → Outlook » par rendez-vous (.ics) ; note de frais : ticket en photo / import PDF, obligatoire ; flotte : photo du vrai véhicule ; Entreprise → SCR ; maquette-chiffrage.html (dossier → lecture → chiffrage V2B → mémoire → DPGF → offre) ; e2e_onglets 14 points, 44 suites. Livraison précédente (même commit si pas encore poussée) : retours du 12/10 soir — six onglets (Aujourd'hui · Chantiers [Carte / Liste / Équipes &amp; heures / Sécurité] · Moi · Commerce · Parc · Entreprise), Entreprise réduit (annuaire, documents, communication interne publiable, présentation), récap Mes chantiers sous la carte → Bureau (doublon retiré), notes de frais dans Moi, Production par équipe (planning → équipe → personne, objectifs), Variables de paie (rapport RH sans production), Commerce (reporting + traçabilité, devis &amp; chiffrage avec 10 versions, dossiers en cours + tableau de facturation client, terminés), Parc (flotte, magasin / matériel à cadrer), Sécurité → déclarer un accident v1 (+ bouton QSE du chantier, notification RH, traité), Outlook automatique (Edge Function outlook-sync + lien publié, synchro 2 h) ; sql/retours_12-10b.sql ; e2e_onglets ; 44 suites.</w:t>
+        <w:t xml:space="preserve">Description : 13/10 matin — Commerce : le dossier de A à Z codé d'après la maquette (commerce.js : consultation + tâches, notes de lecture à plusieurs destinations cochables, quantités repérées → chiffrage, mémoire technique (plan SCR, variables du chiffrage, blocs réutilisables, .doc), DPGF (.xlsx du client lu sans bibliothèque, répartition exacte, CSV), offre (pièces, remise, gagnée / perdue), notification J-3) ; e2e_commerce ; 46 suites. Nuit du 12 au 13/10 — navigateur de semaine (Ma semaine, Production par équipe, Planning : jours, aujourd'hui, points, ↺, glisser) ; Outlook : import caché quand relié, « → Outlook » par rendez-vous (.ics) ; note de frais : ticket en photo / import PDF, obligatoire ; flotte : photo du vrai véhicule ; Entreprise → SCR ; maquette-chiffrage.html (dossier → lecture → chiffrage V2B → mémoire → DPGF → offre) ; e2e_onglets 14 points, 44 suites. Livraison précédente (même commit si pas encore poussée) : retours du 12/10 soir — six onglets (Aujourd'hui · Chantiers [Carte / Liste / Équipes &amp; heures / Sécurité] · Moi · Commerce · Parc · Entreprise), Entreprise réduit (annuaire, documents, communication interne publiable, présentation), récap Mes chantiers sous la carte → Bureau (doublon retiré), notes de frais dans Moi, Production par équipe (planning → équipe → personne, objectifs), Variables de paie (rapport RH sans production), Commerce (reporting + traçabilité, devis &amp; chiffrage avec 10 versions, dossiers en cours + tableau de facturation client, terminés), Parc (flotte, magasin / matériel à cadrer), Sécurité → déclarer un accident v1 (+ bouton QSE du chantier, notification RH, traité), Outlook automatique (Edge Function outlook-sync + lien publié, synchro 2 h) ; sql/retours_12-10b.sql ; e2e_onglets ; 44 suites.</w:t>
       </w:r>
     </w:p>
     <w:sectPr>

</xml_diff>

<commit_message>
Onglet Fourniture (commande, livré, reste, zones à livrer, camions datés) + adresses, détente automatique, contrôle GD, plein écran
</commit_message>
<xml_diff>
--- a/app/docs/Feuille_de_route_controle_12-10.docx
+++ b/app/docs/Feuille_de_route_controle_12-10.docx
@@ -29,7 +29,7 @@
           <w:sz w:val="22"/>
           <w:szCs w:val="22"/>
         </w:rPr>
-        <w:t xml:space="preserve">12 octobre 2026 (mis à jour dans la nuit avec tes retours « à la louche » : six onglets, Commerce, Parc, Sécurité, accidents, Outlook serveur) · nouvelle ventilation, « agir comme », raccourci rapide du planning, « ma semaine », tes commentaires du Word (sections 5 à 9) · une colonne pour tes retours</w:t>
+        <w:t xml:space="preserve">12 octobre 2026 · mise à jour du 13/10 : onglet FOURNITURE (commande, livré, reste, zones à livrer, camions datés) et tes retours de la feuille du 09-10 (adresses, détente automatique, contrôle des grands déplacements, plein écran, trame d'accueil) · puis la nuit du 12/10 : six onglets, Commerce, Parc, Sécurité, accidents, Outlook serveur · nouvelle ventilation, « agir comme », raccourci rapide du planning, « ma semaine », tes commentaires du Word (sections 5 à 9) · une colonne pour tes retours</w:t>
       </w:r>
     </w:p>
     <w:p>
@@ -65,7 +65,7 @@
           <w:sz w:val="20"/>
           <w:szCs w:val="20"/>
         </w:rPr>
-        <w:t xml:space="preserve">Même principe que la précédente : tu contrôles ligne par ligne, tu écris dans « Vos commentaires » (OK / à corriger / à changer : quoi), tu me renvoies le fichier. Je corrige à partir de tes commentaires, dans l'ordre du document. Commence par la section H (Commerce : le dossier de A à Z, codé ce matin d'après la maquette que tu as validée), puis G (la nuit) et F (tes retours du 12/10 soir).</w:t>
+        <w:t xml:space="preserve">Même principe que la précédente : tu contrôles ligne par ligne, tu écris dans « Vos commentaires » (OK / à corriger / à changer : quoi), tu me renvoies le fichier. Je corrige à partir de tes commentaires, dans l'ordre du document. Commence par la section I (l'onglet Fourniture, nouveau), puis J (tes retours de la feuille du 09-10 : c'est la seule feuille à suivre désormais — l'ancienne n'est plus livrée), puis H (Commerce de A à Z), G (la nuit) et F (tes retours du 12/10 soir).</w:t>
       </w:r>
     </w:p>
     <w:p>
@@ -84,7 +84,7 @@
           <w:sz w:val="20"/>
           <w:szCs w:val="20"/>
         </w:rPr>
-        <w:t xml:space="preserve">Build livré : 13/10/2026 · f1e129 (index.html + traceur.html + maquette-chiffrage.html à la racine du dépôt). SQL retours_12-10.sql et retours_12-10b.sql passés, fonction outlook-sync déployée et vérifiée par toi le 12/10 au soir (« ça fonctionne parfaitement »). Hors connexion, tout se teste avec les personnages de démo.</w:t>
+        <w:t xml:space="preserve">Build livré : 13/10/2026 · df963c (index.html + traceur.html à la racine du dépôt). Nouveau SQL à passer : retours_13-10.sql (onglet Fourniture, voir ci-dessous). SQL retours_12-10.sql et retours_12-10b.sql passés, fonction outlook-sync déployée et vérifiée par toi le 12/10 au soir (« ça fonctionne parfaitement »). Hors connexion, tout se teste avec les personnages de démo.</w:t>
       </w:r>
     </w:p>
     <w:p>
@@ -103,7 +103,7 @@
           <w:sz w:val="20"/>
           <w:szCs w:val="20"/>
         </w:rPr>
-        <w:t xml:space="preserve">Règle gardée : rien d'ancien n'est supprimé ; 46 suites de tests automatiques passent (e2e_onglets = 14 points, e2e_commerce = 8 points sur le dossier de A à Z), 10 suites adaptées aux nouveaux noms et aux hubs.</w:t>
+        <w:t xml:space="preserve">Règle gardée : rien d'ancien n'est supprimé ; 47 suites de tests automatiques passent, dont deux nouvelles : e2e_fourniture (11 points : commande collée, comparatif, pièces en plus, livré lu dans Stock, zone entourée au doigt, zone du phasage, camions datés, annonce et pointage dans Stock, droits, téléphone, lecteur de lignes PDF, zones qui se chevauchent) et e2e_retours13 (n° d'affaire, plein écran, repas, adresses, détente automatique sur 5 semaines, accords, vue par personne, CSV).</w:t>
       </w:r>
     </w:p>
     <w:p>
@@ -265,6 +265,120 @@
                 <w:szCs w:val="19"/>
               </w:rPr>
               <w:t xml:space="preserve">Vos commentaires</w:t>
+            </w:r>
+          </w:p>
+        </w:tc>
+      </w:tr>
+      <w:tr>
+        <w:tc>
+          <w:tcPr>
+            <w:tcW w:type="dxa" w:w="3200"/>
+            <w:tcBorders>
+              <w:top w:val="single" w:color="D9D5CB" w:sz="4"/>
+              <w:left w:val="single" w:color="D9D5CB" w:sz="4"/>
+              <w:bottom w:val="single" w:color="D9D5CB" w:sz="4"/>
+              <w:right w:val="single" w:color="D9D5CB" w:sz="4"/>
+            </w:tcBorders>
+            <w:tcMar>
+              <w:top w:type="dxa" w:w="60"/>
+              <w:left w:type="dxa" w:w="90"/>
+              <w:bottom w:type="dxa" w:w="60"/>
+              <w:right w:type="dxa" w:w="90"/>
+            </w:tcMar>
+            <w:vAlign w:val="top"/>
+          </w:tcPr>
+          <w:p>
+            <w:pPr>
+              <w:spacing w:after="40"/>
+            </w:pPr>
+            <w:r>
+              <w:rPr>
+                <w:rFonts w:ascii="Calibri" w:cs="Calibri" w:eastAsia="Calibri" w:hAnsi="Calibri"/>
+                <w:b/>
+                <w:bCs/>
+                <w:color w:val="14213D"/>
+                <w:sz w:val="19"/>
+                <w:szCs w:val="19"/>
+              </w:rPr>
+              <w:t xml:space="preserve">app/sql/retours_13-10.sql (NOUVEAU — à passer)</w:t>
+            </w:r>
+          </w:p>
+        </w:tc>
+        <w:tc>
+          <w:tcPr>
+            <w:tcW w:type="dxa" w:w="8100"/>
+            <w:tcBorders>
+              <w:top w:val="single" w:color="D9D5CB" w:sz="4"/>
+              <w:left w:val="single" w:color="D9D5CB" w:sz="4"/>
+              <w:bottom w:val="single" w:color="D9D5CB" w:sz="4"/>
+              <w:right w:val="single" w:color="D9D5CB" w:sz="4"/>
+            </w:tcBorders>
+            <w:tcMar>
+              <w:top w:type="dxa" w:w="60"/>
+              <w:left w:type="dxa" w:w="90"/>
+              <w:bottom w:type="dxa" w:w="60"/>
+              <w:right w:type="dxa" w:w="90"/>
+            </w:tcMar>
+            <w:vAlign w:val="top"/>
+          </w:tcPr>
+          <w:p>
+            <w:pPr>
+              <w:spacing w:after="40"/>
+            </w:pPr>
+            <w:r>
+              <w:rPr>
+                <w:rFonts w:ascii="Calibri" w:cs="Calibri" w:eastAsia="Calibri" w:hAnsi="Calibri"/>
+                <w:color w:val="14213D"/>
+                <w:sz w:val="19"/>
+                <w:szCs w:val="19"/>
+              </w:rPr>
+              <w:t xml:space="preserve">Onglet Fourniture : la fonction site_set_part accepte une partie de plus, « fourniture » (commande importée, pièces en plus, zones à livrer, hypothèses camions), écrite par l'encadrement (chef / bureau). Deux tablettes ne s'écrasent pas : commandes, pièces en plus et zones sont réunies par identifiant (la plus récente gagne, une suppression tient). Testé sur une base Postgres locale. Vérification en bas : « site_set_part | jsonb ». Sans ce SQL, la fourniture reste sur l'appareil avec le bandeau « pas enregistré sur le serveur ».</w:t>
+            </w:r>
+          </w:p>
+        </w:tc>
+        <w:tc>
+          <w:tcPr>
+            <w:tcW w:type="dxa" w:w="3800"/>
+            <w:tcBorders>
+              <w:top w:val="single" w:color="D9D5CB" w:sz="4"/>
+              <w:left w:val="single" w:color="D9D5CB" w:sz="4"/>
+              <w:bottom w:val="single" w:color="D9D5CB" w:sz="4"/>
+              <w:right w:val="single" w:color="D9D5CB" w:sz="4"/>
+            </w:tcBorders>
+            <w:tcMar>
+              <w:top w:type="dxa" w:w="60"/>
+              <w:left w:type="dxa" w:w="90"/>
+              <w:bottom w:type="dxa" w:w="60"/>
+              <w:right w:type="dxa" w:w="90"/>
+            </w:tcMar>
+            <w:vAlign w:val="top"/>
+          </w:tcPr>
+          <w:p>
+            <w:pPr>
+              <w:spacing w:after="40"/>
+            </w:pPr>
+            <w:r>
+              <w:rPr>
+                <w:rFonts w:ascii="Calibri" w:cs="Calibri" w:eastAsia="Calibri" w:hAnsi="Calibri"/>
+                <w:color w:val="14213D"/>
+                <w:sz w:val="20"/>
+                <w:szCs w:val="20"/>
+              </w:rPr>
+              <w:t xml:space="preserve"/>
+            </w:r>
+          </w:p>
+          <w:p>
+            <w:pPr>
+              <w:spacing w:after="40"/>
+            </w:pPr>
+            <w:r>
+              <w:rPr>
+                <w:rFonts w:ascii="Calibri" w:cs="Calibri" w:eastAsia="Calibri" w:hAnsi="Calibri"/>
+                <w:color w:val="14213D"/>
+                <w:sz w:val="20"/>
+                <w:szCs w:val="20"/>
+              </w:rPr>
+              <w:t xml:space="preserve"/>
             </w:r>
           </w:p>
         </w:tc>
@@ -11981,6 +12095,3712 @@
           <w:sz w:val="30"/>
           <w:szCs w:val="30"/>
         </w:rPr>
+        <w:t xml:space="preserve">I · Onglet FOURNITURE (fourniture et pose) — nouveau</w:t>
+      </w:r>
+    </w:p>
+    <w:p>
+      <w:pPr>
+        <w:spacing w:after="80" w:line="264"/>
+      </w:pPr>
+      <w:r>
+        <w:rPr>
+          <w:rFonts w:ascii="Calibri" w:cs="Calibri" w:eastAsia="Calibri" w:hAnsi="Calibri"/>
+          <w:color w:val="6B6B66"/>
+          <w:sz w:val="20"/>
+          <w:szCs w:val="20"/>
+        </w:rPr>
+        <w:t xml:space="preserve">« Un onglet pure fourniture : le suivi du livré, du restant, s'il y a des modifs, les pièces en plus ; les pièces du tracé initial ; importer la commande de tubes → comparatif permanent ; entourer une zone → tout ce qu'il faut prévoir en livraison ou en commande ; un plan avec le planning des tronçons entourés, quels camions ça crée et à quelle date. » Doublon avec Stock : NON — Stock reste le physique (camions reçus, pointage, zones de déchargement, prélèvements) ; Fourniture lit Stock et ne fait que le suivi de commande. Un camion planifié dans Fourniture devient une livraison prévue de Stock : rien n'est saisi deux fois.</w:t>
+      </w:r>
+    </w:p>
+    <w:tbl>
+      <w:tblPr>
+        <w:tblW w:type="dxa" w:w="15100"/>
+        <w:tblBorders>
+          <w:top w:val="single" w:color="auto" w:sz="4"/>
+          <w:left w:val="single" w:color="auto" w:sz="4"/>
+          <w:bottom w:val="single" w:color="auto" w:sz="4"/>
+          <w:right w:val="single" w:color="auto" w:sz="4"/>
+          <w:insideH w:val="single" w:color="auto" w:sz="4"/>
+          <w:insideV w:val="single" w:color="auto" w:sz="4"/>
+        </w:tblBorders>
+      </w:tblPr>
+      <w:tblGrid>
+        <w:gridCol w:w="2300"/>
+        <w:gridCol w:w="4100"/>
+        <w:gridCol w:w="3700"/>
+        <w:gridCol w:w="1300"/>
+        <w:gridCol w:w="3700"/>
+      </w:tblGrid>
+      <w:tr>
+        <w:trPr>
+          <w:tblHeader/>
+        </w:trPr>
+        <w:tc>
+          <w:tcPr>
+            <w:tcW w:type="dxa" w:w="2300"/>
+            <w:tcBorders>
+              <w:top w:val="single" w:color="D9D5CB" w:sz="4"/>
+              <w:left w:val="single" w:color="D9D5CB" w:sz="4"/>
+              <w:bottom w:val="single" w:color="D9D5CB" w:sz="4"/>
+              <w:right w:val="single" w:color="D9D5CB" w:sz="4"/>
+            </w:tcBorders>
+            <w:shd w:fill="14213D" w:color="auto" w:val="clear"/>
+            <w:tcMar>
+              <w:top w:type="dxa" w:w="60"/>
+              <w:left w:type="dxa" w:w="90"/>
+              <w:bottom w:type="dxa" w:w="60"/>
+              <w:right w:type="dxa" w:w="90"/>
+            </w:tcMar>
+            <w:vAlign w:val="top"/>
+          </w:tcPr>
+          <w:p>
+            <w:pPr>
+              <w:spacing w:after="80" w:line="264"/>
+            </w:pPr>
+            <w:r>
+              <w:rPr>
+                <w:rFonts w:ascii="Calibri" w:cs="Calibri" w:eastAsia="Calibri" w:hAnsi="Calibri"/>
+                <w:b/>
+                <w:bCs/>
+                <w:color w:val="FFFFFF"/>
+                <w:sz w:val="19"/>
+                <w:szCs w:val="19"/>
+              </w:rPr>
+              <w:t xml:space="preserve">Fonctionnalité</w:t>
+            </w:r>
+          </w:p>
+        </w:tc>
+        <w:tc>
+          <w:tcPr>
+            <w:tcW w:type="dxa" w:w="4100"/>
+            <w:tcBorders>
+              <w:top w:val="single" w:color="D9D5CB" w:sz="4"/>
+              <w:left w:val="single" w:color="D9D5CB" w:sz="4"/>
+              <w:bottom w:val="single" w:color="D9D5CB" w:sz="4"/>
+              <w:right w:val="single" w:color="D9D5CB" w:sz="4"/>
+            </w:tcBorders>
+            <w:shd w:fill="14213D" w:color="auto" w:val="clear"/>
+            <w:tcMar>
+              <w:top w:type="dxa" w:w="60"/>
+              <w:left w:type="dxa" w:w="90"/>
+              <w:bottom w:type="dxa" w:w="60"/>
+              <w:right w:type="dxa" w:w="90"/>
+            </w:tcMar>
+            <w:vAlign w:val="top"/>
+          </w:tcPr>
+          <w:p>
+            <w:pPr>
+              <w:spacing w:after="80" w:line="264"/>
+            </w:pPr>
+            <w:r>
+              <w:rPr>
+                <w:rFonts w:ascii="Calibri" w:cs="Calibri" w:eastAsia="Calibri" w:hAnsi="Calibri"/>
+                <w:b/>
+                <w:bCs/>
+                <w:color w:val="FFFFFF"/>
+                <w:sz w:val="19"/>
+                <w:szCs w:val="19"/>
+              </w:rPr>
+              <w:t xml:space="preserve">Où la trouver · comment tester</w:t>
+            </w:r>
+          </w:p>
+        </w:tc>
+        <w:tc>
+          <w:tcPr>
+            <w:tcW w:type="dxa" w:w="3700"/>
+            <w:tcBorders>
+              <w:top w:val="single" w:color="D9D5CB" w:sz="4"/>
+              <w:left w:val="single" w:color="D9D5CB" w:sz="4"/>
+              <w:bottom w:val="single" w:color="D9D5CB" w:sz="4"/>
+              <w:right w:val="single" w:color="D9D5CB" w:sz="4"/>
+            </w:tcBorders>
+            <w:shd w:fill="14213D" w:color="auto" w:val="clear"/>
+            <w:tcMar>
+              <w:top w:type="dxa" w:w="60"/>
+              <w:left w:type="dxa" w:w="90"/>
+              <w:bottom w:type="dxa" w:w="60"/>
+              <w:right w:type="dxa" w:w="90"/>
+            </w:tcMar>
+            <w:vAlign w:val="top"/>
+          </w:tcPr>
+          <w:p>
+            <w:pPr>
+              <w:spacing w:after="80" w:line="264"/>
+            </w:pPr>
+            <w:r>
+              <w:rPr>
+                <w:rFonts w:ascii="Calibri" w:cs="Calibri" w:eastAsia="Calibri" w:hAnsi="Calibri"/>
+                <w:b/>
+                <w:bCs/>
+                <w:color w:val="FFFFFF"/>
+                <w:sz w:val="19"/>
+                <w:szCs w:val="19"/>
+              </w:rPr>
+              <w:t xml:space="preserve">Hypothèses · limites · ce que j'ai tranché</w:t>
+            </w:r>
+          </w:p>
+        </w:tc>
+        <w:tc>
+          <w:tcPr>
+            <w:tcW w:type="dxa" w:w="1300"/>
+            <w:tcBorders>
+              <w:top w:val="single" w:color="D9D5CB" w:sz="4"/>
+              <w:left w:val="single" w:color="D9D5CB" w:sz="4"/>
+              <w:bottom w:val="single" w:color="D9D5CB" w:sz="4"/>
+              <w:right w:val="single" w:color="D9D5CB" w:sz="4"/>
+            </w:tcBorders>
+            <w:shd w:fill="14213D" w:color="auto" w:val="clear"/>
+            <w:tcMar>
+              <w:top w:type="dxa" w:w="60"/>
+              <w:left w:type="dxa" w:w="90"/>
+              <w:bottom w:type="dxa" w:w="60"/>
+              <w:right w:type="dxa" w:w="90"/>
+            </w:tcMar>
+            <w:vAlign w:val="top"/>
+          </w:tcPr>
+          <w:p>
+            <w:pPr>
+              <w:spacing w:after="80" w:line="264"/>
+            </w:pPr>
+            <w:r>
+              <w:rPr>
+                <w:rFonts w:ascii="Calibri" w:cs="Calibri" w:eastAsia="Calibri" w:hAnsi="Calibri"/>
+                <w:b/>
+                <w:bCs/>
+                <w:color w:val="FFFFFF"/>
+                <w:sz w:val="19"/>
+                <w:szCs w:val="19"/>
+              </w:rPr>
+              <w:t xml:space="preserve">Statut</w:t>
+            </w:r>
+          </w:p>
+        </w:tc>
+        <w:tc>
+          <w:tcPr>
+            <w:tcW w:type="dxa" w:w="3700"/>
+            <w:tcBorders>
+              <w:top w:val="single" w:color="D9D5CB" w:sz="4"/>
+              <w:left w:val="single" w:color="D9D5CB" w:sz="4"/>
+              <w:bottom w:val="single" w:color="D9D5CB" w:sz="4"/>
+              <w:right w:val="single" w:color="D9D5CB" w:sz="4"/>
+            </w:tcBorders>
+            <w:shd w:fill="14213D" w:color="auto" w:val="clear"/>
+            <w:tcMar>
+              <w:top w:type="dxa" w:w="60"/>
+              <w:left w:type="dxa" w:w="90"/>
+              <w:bottom w:type="dxa" w:w="60"/>
+              <w:right w:type="dxa" w:w="90"/>
+            </w:tcMar>
+            <w:vAlign w:val="top"/>
+          </w:tcPr>
+          <w:p>
+            <w:pPr>
+              <w:spacing w:after="80" w:line="264"/>
+            </w:pPr>
+            <w:r>
+              <w:rPr>
+                <w:rFonts w:ascii="Calibri" w:cs="Calibri" w:eastAsia="Calibri" w:hAnsi="Calibri"/>
+                <w:b/>
+                <w:bCs/>
+                <w:color w:val="FFFFFF"/>
+                <w:sz w:val="19"/>
+                <w:szCs w:val="19"/>
+              </w:rPr>
+              <w:t xml:space="preserve">Vos commentaires</w:t>
+            </w:r>
+          </w:p>
+        </w:tc>
+      </w:tr>
+      <w:tr>
+        <w:tc>
+          <w:tcPr>
+            <w:tcW w:type="dxa" w:w="2300"/>
+            <w:tcBorders>
+              <w:top w:val="single" w:color="D9D5CB" w:sz="4"/>
+              <w:left w:val="single" w:color="D9D5CB" w:sz="4"/>
+              <w:bottom w:val="single" w:color="D9D5CB" w:sz="4"/>
+              <w:right w:val="single" w:color="D9D5CB" w:sz="4"/>
+            </w:tcBorders>
+            <w:tcMar>
+              <w:top w:type="dxa" w:w="60"/>
+              <w:left w:type="dxa" w:w="90"/>
+              <w:bottom w:type="dxa" w:w="60"/>
+              <w:right w:type="dxa" w:w="90"/>
+            </w:tcMar>
+            <w:vAlign w:val="top"/>
+          </w:tcPr>
+          <w:p>
+            <w:pPr>
+              <w:spacing w:after="40"/>
+            </w:pPr>
+            <w:r>
+              <w:rPr>
+                <w:rFonts w:ascii="Calibri" w:cs="Calibri" w:eastAsia="Calibri" w:hAnsi="Calibri"/>
+                <w:b/>
+                <w:bCs/>
+                <w:color w:val="14213D"/>
+                <w:sz w:val="20"/>
+                <w:szCs w:val="20"/>
+              </w:rPr>
+              <w:t xml:space="preserve">Où le trouver</w:t>
+            </w:r>
+          </w:p>
+        </w:tc>
+        <w:tc>
+          <w:tcPr>
+            <w:tcW w:type="dxa" w:w="4100"/>
+            <w:tcBorders>
+              <w:top w:val="single" w:color="D9D5CB" w:sz="4"/>
+              <w:left w:val="single" w:color="D9D5CB" w:sz="4"/>
+              <w:bottom w:val="single" w:color="D9D5CB" w:sz="4"/>
+              <w:right w:val="single" w:color="D9D5CB" w:sz="4"/>
+            </w:tcBorders>
+            <w:tcMar>
+              <w:top w:type="dxa" w:w="60"/>
+              <w:left w:type="dxa" w:w="90"/>
+              <w:bottom w:type="dxa" w:w="60"/>
+              <w:right w:type="dxa" w:w="90"/>
+            </w:tcMar>
+            <w:vAlign w:val="top"/>
+          </w:tcPr>
+          <w:p>
+            <w:pPr>
+              <w:spacing w:after="40"/>
+            </w:pPr>
+            <w:r>
+              <w:rPr>
+                <w:rFonts w:ascii="Calibri" w:cs="Calibri" w:eastAsia="Calibri" w:hAnsi="Calibri"/>
+                <w:color w:val="14213D"/>
+                <w:sz w:val="19"/>
+                <w:szCs w:val="19"/>
+              </w:rPr>
+              <w:t xml:space="preserve">Un chantier → 🔧 Technique → onglet « Fourniture » (entre Stock et Phasage), visible par l'encadrement (droit stock ou phasage). Aussi dans le Bureau du chantier et dans « ＋ Poser » sur le plan (📦 Zone à livrer).</w:t>
+            </w:r>
+          </w:p>
+        </w:tc>
+        <w:tc>
+          <w:tcPr>
+            <w:tcW w:type="dxa" w:w="3700"/>
+            <w:tcBorders>
+              <w:top w:val="single" w:color="D9D5CB" w:sz="4"/>
+              <w:left w:val="single" w:color="D9D5CB" w:sz="4"/>
+              <w:bottom w:val="single" w:color="D9D5CB" w:sz="4"/>
+              <w:right w:val="single" w:color="D9D5CB" w:sz="4"/>
+            </w:tcBorders>
+            <w:tcMar>
+              <w:top w:type="dxa" w:w="60"/>
+              <w:left w:type="dxa" w:w="90"/>
+              <w:bottom w:type="dxa" w:w="60"/>
+              <w:right w:type="dxa" w:w="90"/>
+            </w:tcMar>
+            <w:vAlign w:val="top"/>
+          </w:tcPr>
+          <w:p>
+            <w:pPr>
+              <w:spacing w:after="40"/>
+            </w:pPr>
+            <w:r>
+              <w:rPr>
+                <w:rFonts w:ascii="Calibri" w:cs="Calibri" w:eastAsia="Calibri" w:hAnsi="Calibri"/>
+                <w:color w:val="14213D"/>
+                <w:sz w:val="19"/>
+                <w:szCs w:val="19"/>
+              </w:rPr>
+              <w:t xml:space="preserve">Soudeurs et manchonneurs ne le voient pas. Sur téléphone, les 7 onglets tiennent sans défiler (vérifié à 390 px).</w:t>
+            </w:r>
+          </w:p>
+        </w:tc>
+        <w:tc>
+          <w:tcPr>
+            <w:tcW w:type="dxa" w:w="1300"/>
+            <w:tcBorders>
+              <w:top w:val="single" w:color="D9D5CB" w:sz="4"/>
+              <w:left w:val="single" w:color="D9D5CB" w:sz="4"/>
+              <w:bottom w:val="single" w:color="D9D5CB" w:sz="4"/>
+              <w:right w:val="single" w:color="D9D5CB" w:sz="4"/>
+            </w:tcBorders>
+            <w:shd w:fill="E6F5EC" w:color="auto" w:val="clear"/>
+            <w:tcMar>
+              <w:top w:type="dxa" w:w="60"/>
+              <w:left w:type="dxa" w:w="90"/>
+              <w:bottom w:type="dxa" w:w="60"/>
+              <w:right w:type="dxa" w:w="90"/>
+            </w:tcMar>
+            <w:vAlign w:val="top"/>
+          </w:tcPr>
+          <w:p>
+            <w:pPr>
+              <w:spacing w:after="40"/>
+            </w:pPr>
+            <w:r>
+              <w:rPr>
+                <w:rFonts w:ascii="Calibri" w:cs="Calibri" w:eastAsia="Calibri" w:hAnsi="Calibri"/>
+                <w:b/>
+                <w:bCs/>
+                <w:color w:val="14213D"/>
+                <w:sz w:val="19"/>
+                <w:szCs w:val="19"/>
+              </w:rPr>
+              <w:t xml:space="preserve">Fait</w:t>
+            </w:r>
+          </w:p>
+        </w:tc>
+        <w:tc>
+          <w:tcPr>
+            <w:tcW w:type="dxa" w:w="3700"/>
+            <w:tcBorders>
+              <w:top w:val="single" w:color="D9D5CB" w:sz="4"/>
+              <w:left w:val="single" w:color="D9D5CB" w:sz="4"/>
+              <w:bottom w:val="single" w:color="D9D5CB" w:sz="4"/>
+              <w:right w:val="single" w:color="D9D5CB" w:sz="4"/>
+            </w:tcBorders>
+            <w:tcMar>
+              <w:top w:type="dxa" w:w="60"/>
+              <w:left w:type="dxa" w:w="90"/>
+              <w:bottom w:type="dxa" w:w="60"/>
+              <w:right w:type="dxa" w:w="90"/>
+            </w:tcMar>
+            <w:vAlign w:val="top"/>
+          </w:tcPr>
+          <w:p>
+            <w:pPr>
+              <w:spacing w:after="40"/>
+            </w:pPr>
+            <w:r>
+              <w:rPr>
+                <w:rFonts w:ascii="Calibri" w:cs="Calibri" w:eastAsia="Calibri" w:hAnsi="Calibri"/>
+                <w:color w:val="14213D"/>
+                <w:sz w:val="20"/>
+                <w:szCs w:val="20"/>
+              </w:rPr>
+              <w:t xml:space="preserve"/>
+            </w:r>
+          </w:p>
+          <w:p>
+            <w:pPr>
+              <w:spacing w:after="40"/>
+            </w:pPr>
+            <w:r>
+              <w:rPr>
+                <w:rFonts w:ascii="Calibri" w:cs="Calibri" w:eastAsia="Calibri" w:hAnsi="Calibri"/>
+                <w:color w:val="14213D"/>
+                <w:sz w:val="20"/>
+                <w:szCs w:val="20"/>
+              </w:rPr>
+              <w:t xml:space="preserve"/>
+            </w:r>
+          </w:p>
+        </w:tc>
+      </w:tr>
+      <w:tr>
+        <w:tc>
+          <w:tcPr>
+            <w:tcW w:type="dxa" w:w="2300"/>
+            <w:tcBorders>
+              <w:top w:val="single" w:color="D9D5CB" w:sz="4"/>
+              <w:left w:val="single" w:color="D9D5CB" w:sz="4"/>
+              <w:bottom w:val="single" w:color="D9D5CB" w:sz="4"/>
+              <w:right w:val="single" w:color="D9D5CB" w:sz="4"/>
+            </w:tcBorders>
+            <w:tcMar>
+              <w:top w:type="dxa" w:w="60"/>
+              <w:left w:type="dxa" w:w="90"/>
+              <w:bottom w:type="dxa" w:w="60"/>
+              <w:right w:type="dxa" w:w="90"/>
+            </w:tcMar>
+            <w:vAlign w:val="top"/>
+          </w:tcPr>
+          <w:p>
+            <w:pPr>
+              <w:spacing w:after="40"/>
+            </w:pPr>
+            <w:r>
+              <w:rPr>
+                <w:rFonts w:ascii="Calibri" w:cs="Calibri" w:eastAsia="Calibri" w:hAnsi="Calibri"/>
+                <w:b/>
+                <w:bCs/>
+                <w:color w:val="14213D"/>
+                <w:sz w:val="20"/>
+                <w:szCs w:val="20"/>
+              </w:rPr>
+              <w:t xml:space="preserve">Tracé initial figé</w:t>
+            </w:r>
+          </w:p>
+        </w:tc>
+        <w:tc>
+          <w:tcPr>
+            <w:tcW w:type="dxa" w:w="4100"/>
+            <w:tcBorders>
+              <w:top w:val="single" w:color="D9D5CB" w:sz="4"/>
+              <w:left w:val="single" w:color="D9D5CB" w:sz="4"/>
+              <w:bottom w:val="single" w:color="D9D5CB" w:sz="4"/>
+              <w:right w:val="single" w:color="D9D5CB" w:sz="4"/>
+            </w:tcBorders>
+            <w:tcMar>
+              <w:top w:type="dxa" w:w="60"/>
+              <w:left w:type="dxa" w:w="90"/>
+              <w:bottom w:type="dxa" w:w="60"/>
+              <w:right w:type="dxa" w:w="90"/>
+            </w:tcMar>
+            <w:vAlign w:val="top"/>
+          </w:tcPr>
+          <w:p>
+            <w:pPr>
+              <w:spacing w:after="40"/>
+            </w:pPr>
+            <w:r>
+              <w:rPr>
+                <w:rFonts w:ascii="Calibri" w:cs="Calibri" w:eastAsia="Calibri" w:hAnsi="Calibri"/>
+                <w:color w:val="14213D"/>
+                <w:sz w:val="19"/>
+                <w:szCs w:val="19"/>
+              </w:rPr>
+              <w:t xml:space="preserve">À la première ouverture, le tracé du jour est figé comme « initial » (ou le détail par pièce du tracé marché quand il existe : il est désormais enregistré à chaque photographie du marché). Ensuite : colonne « modifs » = tracé actuel − initial, par référence. « Re-figer le tracé initial » (avec confirmation, l'ancien gardé).</w:t>
+            </w:r>
+          </w:p>
+        </w:tc>
+        <w:tc>
+          <w:tcPr>
+            <w:tcW w:type="dxa" w:w="3700"/>
+            <w:tcBorders>
+              <w:top w:val="single" w:color="D9D5CB" w:sz="4"/>
+              <w:left w:val="single" w:color="D9D5CB" w:sz="4"/>
+              <w:bottom w:val="single" w:color="D9D5CB" w:sz="4"/>
+              <w:right w:val="single" w:color="D9D5CB" w:sz="4"/>
+            </w:tcBorders>
+            <w:tcMar>
+              <w:top w:type="dxa" w:w="60"/>
+              <w:left w:type="dxa" w:w="90"/>
+              <w:bottom w:type="dxa" w:w="60"/>
+              <w:right w:type="dxa" w:w="90"/>
+            </w:tcMar>
+            <w:vAlign w:val="top"/>
+          </w:tcPr>
+          <w:p>
+            <w:pPr>
+              <w:spacing w:after="40"/>
+            </w:pPr>
+            <w:r>
+              <w:rPr>
+                <w:rFonts w:ascii="Calibri" w:cs="Calibri" w:eastAsia="Calibri" w:hAnsi="Calibri"/>
+                <w:color w:val="14213D"/>
+                <w:sz w:val="19"/>
+                <w:szCs w:val="19"/>
+              </w:rPr>
+              <w:t xml:space="preserve">Les tracés marchés figés AVANT aujourd'hui n'ont pas le détail par pièce : pour eux, l'initial = le tracé du jour de la 1re ouverture (dit en tête de l'onglet).</w:t>
+            </w:r>
+          </w:p>
+        </w:tc>
+        <w:tc>
+          <w:tcPr>
+            <w:tcW w:type="dxa" w:w="1300"/>
+            <w:tcBorders>
+              <w:top w:val="single" w:color="D9D5CB" w:sz="4"/>
+              <w:left w:val="single" w:color="D9D5CB" w:sz="4"/>
+              <w:bottom w:val="single" w:color="D9D5CB" w:sz="4"/>
+              <w:right w:val="single" w:color="D9D5CB" w:sz="4"/>
+            </w:tcBorders>
+            <w:shd w:fill="E6F5EC" w:color="auto" w:val="clear"/>
+            <w:tcMar>
+              <w:top w:type="dxa" w:w="60"/>
+              <w:left w:type="dxa" w:w="90"/>
+              <w:bottom w:type="dxa" w:w="60"/>
+              <w:right w:type="dxa" w:w="90"/>
+            </w:tcMar>
+            <w:vAlign w:val="top"/>
+          </w:tcPr>
+          <w:p>
+            <w:pPr>
+              <w:spacing w:after="40"/>
+            </w:pPr>
+            <w:r>
+              <w:rPr>
+                <w:rFonts w:ascii="Calibri" w:cs="Calibri" w:eastAsia="Calibri" w:hAnsi="Calibri"/>
+                <w:b/>
+                <w:bCs/>
+                <w:color w:val="14213D"/>
+                <w:sz w:val="19"/>
+                <w:szCs w:val="19"/>
+              </w:rPr>
+              <w:t xml:space="preserve">Fait</w:t>
+            </w:r>
+          </w:p>
+        </w:tc>
+        <w:tc>
+          <w:tcPr>
+            <w:tcW w:type="dxa" w:w="3700"/>
+            <w:tcBorders>
+              <w:top w:val="single" w:color="D9D5CB" w:sz="4"/>
+              <w:left w:val="single" w:color="D9D5CB" w:sz="4"/>
+              <w:bottom w:val="single" w:color="D9D5CB" w:sz="4"/>
+              <w:right w:val="single" w:color="D9D5CB" w:sz="4"/>
+            </w:tcBorders>
+            <w:tcMar>
+              <w:top w:type="dxa" w:w="60"/>
+              <w:left w:type="dxa" w:w="90"/>
+              <w:bottom w:type="dxa" w:w="60"/>
+              <w:right w:type="dxa" w:w="90"/>
+            </w:tcMar>
+            <w:vAlign w:val="top"/>
+          </w:tcPr>
+          <w:p>
+            <w:pPr>
+              <w:spacing w:after="40"/>
+            </w:pPr>
+            <w:r>
+              <w:rPr>
+                <w:rFonts w:ascii="Calibri" w:cs="Calibri" w:eastAsia="Calibri" w:hAnsi="Calibri"/>
+                <w:color w:val="14213D"/>
+                <w:sz w:val="20"/>
+                <w:szCs w:val="20"/>
+              </w:rPr>
+              <w:t xml:space="preserve"/>
+            </w:r>
+          </w:p>
+          <w:p>
+            <w:pPr>
+              <w:spacing w:after="40"/>
+            </w:pPr>
+            <w:r>
+              <w:rPr>
+                <w:rFonts w:ascii="Calibri" w:cs="Calibri" w:eastAsia="Calibri" w:hAnsi="Calibri"/>
+                <w:color w:val="14213D"/>
+                <w:sz w:val="20"/>
+                <w:szCs w:val="20"/>
+              </w:rPr>
+              <w:t xml:space="preserve"/>
+            </w:r>
+          </w:p>
+        </w:tc>
+      </w:tr>
+      <w:tr>
+        <w:tc>
+          <w:tcPr>
+            <w:tcW w:type="dxa" w:w="2300"/>
+            <w:tcBorders>
+              <w:top w:val="single" w:color="D9D5CB" w:sz="4"/>
+              <w:left w:val="single" w:color="D9D5CB" w:sz="4"/>
+              <w:bottom w:val="single" w:color="D9D5CB" w:sz="4"/>
+              <w:right w:val="single" w:color="D9D5CB" w:sz="4"/>
+            </w:tcBorders>
+            <w:tcMar>
+              <w:top w:type="dxa" w:w="60"/>
+              <w:left w:type="dxa" w:w="90"/>
+              <w:bottom w:type="dxa" w:w="60"/>
+              <w:right w:type="dxa" w:w="90"/>
+            </w:tcMar>
+            <w:vAlign w:val="top"/>
+          </w:tcPr>
+          <w:p>
+            <w:pPr>
+              <w:spacing w:after="40"/>
+            </w:pPr>
+            <w:r>
+              <w:rPr>
+                <w:rFonts w:ascii="Calibri" w:cs="Calibri" w:eastAsia="Calibri" w:hAnsi="Calibri"/>
+                <w:b/>
+                <w:bCs/>
+                <w:color w:val="14213D"/>
+                <w:sz w:val="20"/>
+                <w:szCs w:val="20"/>
+              </w:rPr>
+              <w:t xml:space="preserve">Importer la commande</w:t>
+            </w:r>
+          </w:p>
+        </w:tc>
+        <w:tc>
+          <w:tcPr>
+            <w:tcW w:type="dxa" w:w="4100"/>
+            <w:tcBorders>
+              <w:top w:val="single" w:color="D9D5CB" w:sz="4"/>
+              <w:left w:val="single" w:color="D9D5CB" w:sz="4"/>
+              <w:bottom w:val="single" w:color="D9D5CB" w:sz="4"/>
+              <w:right w:val="single" w:color="D9D5CB" w:sz="4"/>
+            </w:tcBorders>
+            <w:tcMar>
+              <w:top w:type="dxa" w:w="60"/>
+              <w:left w:type="dxa" w:w="90"/>
+              <w:bottom w:type="dxa" w:w="60"/>
+              <w:right w:type="dxa" w:w="90"/>
+            </w:tcMar>
+            <w:vAlign w:val="top"/>
+          </w:tcPr>
+          <w:p>
+            <w:pPr>
+              <w:spacing w:after="40"/>
+            </w:pPr>
+            <w:r>
+              <w:rPr>
+                <w:rFonts w:ascii="Calibri" w:cs="Calibri" w:eastAsia="Calibri" w:hAnsi="Calibri"/>
+                <w:color w:val="14213D"/>
+                <w:sz w:val="19"/>
+                <w:szCs w:val="19"/>
+              </w:rPr>
+              <w:t xml:space="preserve">« 📥 Importer une commande » : fichier Excel (.xlsx, lu sans bibliothèque), CSV, PDF avec du texte (accusé de réception), ou coller depuis Excel ; ou saisir ligne à ligne. Chaque ligne lue est montrée (pièce, DN, DN 2 / angle, quantité) et corrigeable avant d'entrer ; les lignes non reconnues sont listées. N° de commande, date, plusieurs commandes possibles.</w:t>
+            </w:r>
+          </w:p>
+        </w:tc>
+        <w:tc>
+          <w:tcPr>
+            <w:tcW w:type="dxa" w:w="3700"/>
+            <w:tcBorders>
+              <w:top w:val="single" w:color="D9D5CB" w:sz="4"/>
+              <w:left w:val="single" w:color="D9D5CB" w:sz="4"/>
+              <w:bottom w:val="single" w:color="D9D5CB" w:sz="4"/>
+              <w:right w:val="single" w:color="D9D5CB" w:sz="4"/>
+            </w:tcBorders>
+            <w:tcMar>
+              <w:top w:type="dxa" w:w="60"/>
+              <w:left w:type="dxa" w:w="90"/>
+              <w:bottom w:type="dxa" w:w="60"/>
+              <w:right w:type="dxa" w:w="90"/>
+            </w:tcMar>
+            <w:vAlign w:val="top"/>
+          </w:tcPr>
+          <w:p>
+            <w:pPr>
+              <w:spacing w:after="40"/>
+            </w:pPr>
+            <w:r>
+              <w:rPr>
+                <w:rFonts w:ascii="Calibri" w:cs="Calibri" w:eastAsia="Calibri" w:hAnsi="Calibri"/>
+                <w:color w:val="14213D"/>
+                <w:sz w:val="19"/>
+                <w:szCs w:val="19"/>
+              </w:rPr>
+              <w:t xml:space="preserve">Reconnus : codes AXIOM ([R-200/315-12]…), « DN 100 », « 114,3/200 » (Ø acier/gaine → DN), « 100/225 », coudes et leur angle, tés et réductions (2 DN), manchons, mousse, vannes, kits fin de ligne, courbes acier, by-pass ; « 84 ml » de tube → 7 barres ; prix et dates jamais pris pour une quantité ou un DN. Un PDF scanné n'a pas de texte : saisie ou Excel du fournisseur.</w:t>
+            </w:r>
+          </w:p>
+        </w:tc>
+        <w:tc>
+          <w:tcPr>
+            <w:tcW w:type="dxa" w:w="1300"/>
+            <w:tcBorders>
+              <w:top w:val="single" w:color="D9D5CB" w:sz="4"/>
+              <w:left w:val="single" w:color="D9D5CB" w:sz="4"/>
+              <w:bottom w:val="single" w:color="D9D5CB" w:sz="4"/>
+              <w:right w:val="single" w:color="D9D5CB" w:sz="4"/>
+            </w:tcBorders>
+            <w:shd w:fill="E6F5EC" w:color="auto" w:val="clear"/>
+            <w:tcMar>
+              <w:top w:type="dxa" w:w="60"/>
+              <w:left w:type="dxa" w:w="90"/>
+              <w:bottom w:type="dxa" w:w="60"/>
+              <w:right w:type="dxa" w:w="90"/>
+            </w:tcMar>
+            <w:vAlign w:val="top"/>
+          </w:tcPr>
+          <w:p>
+            <w:pPr>
+              <w:spacing w:after="40"/>
+            </w:pPr>
+            <w:r>
+              <w:rPr>
+                <w:rFonts w:ascii="Calibri" w:cs="Calibri" w:eastAsia="Calibri" w:hAnsi="Calibri"/>
+                <w:b/>
+                <w:bCs/>
+                <w:color w:val="14213D"/>
+                <w:sz w:val="19"/>
+                <w:szCs w:val="19"/>
+              </w:rPr>
+              <w:t xml:space="preserve">Fait</w:t>
+            </w:r>
+          </w:p>
+        </w:tc>
+        <w:tc>
+          <w:tcPr>
+            <w:tcW w:type="dxa" w:w="3700"/>
+            <w:tcBorders>
+              <w:top w:val="single" w:color="D9D5CB" w:sz="4"/>
+              <w:left w:val="single" w:color="D9D5CB" w:sz="4"/>
+              <w:bottom w:val="single" w:color="D9D5CB" w:sz="4"/>
+              <w:right w:val="single" w:color="D9D5CB" w:sz="4"/>
+            </w:tcBorders>
+            <w:tcMar>
+              <w:top w:type="dxa" w:w="60"/>
+              <w:left w:type="dxa" w:w="90"/>
+              <w:bottom w:type="dxa" w:w="60"/>
+              <w:right w:type="dxa" w:w="90"/>
+            </w:tcMar>
+            <w:vAlign w:val="top"/>
+          </w:tcPr>
+          <w:p>
+            <w:pPr>
+              <w:spacing w:after="40"/>
+            </w:pPr>
+            <w:r>
+              <w:rPr>
+                <w:rFonts w:ascii="Calibri" w:cs="Calibri" w:eastAsia="Calibri" w:hAnsi="Calibri"/>
+                <w:color w:val="14213D"/>
+                <w:sz w:val="20"/>
+                <w:szCs w:val="20"/>
+              </w:rPr>
+              <w:t xml:space="preserve"/>
+            </w:r>
+          </w:p>
+          <w:p>
+            <w:pPr>
+              <w:spacing w:after="40"/>
+            </w:pPr>
+            <w:r>
+              <w:rPr>
+                <w:rFonts w:ascii="Calibri" w:cs="Calibri" w:eastAsia="Calibri" w:hAnsi="Calibri"/>
+                <w:color w:val="14213D"/>
+                <w:sz w:val="20"/>
+                <w:szCs w:val="20"/>
+              </w:rPr>
+              <w:t xml:space="preserve"/>
+            </w:r>
+          </w:p>
+        </w:tc>
+      </w:tr>
+      <w:tr>
+        <w:tc>
+          <w:tcPr>
+            <w:tcW w:type="dxa" w:w="2300"/>
+            <w:tcBorders>
+              <w:top w:val="single" w:color="D9D5CB" w:sz="4"/>
+              <w:left w:val="single" w:color="D9D5CB" w:sz="4"/>
+              <w:bottom w:val="single" w:color="D9D5CB" w:sz="4"/>
+              <w:right w:val="single" w:color="D9D5CB" w:sz="4"/>
+            </w:tcBorders>
+            <w:tcMar>
+              <w:top w:type="dxa" w:w="60"/>
+              <w:left w:type="dxa" w:w="90"/>
+              <w:bottom w:type="dxa" w:w="60"/>
+              <w:right w:type="dxa" w:w="90"/>
+            </w:tcMar>
+            <w:vAlign w:val="top"/>
+          </w:tcPr>
+          <w:p>
+            <w:pPr>
+              <w:spacing w:after="40"/>
+            </w:pPr>
+            <w:r>
+              <w:rPr>
+                <w:rFonts w:ascii="Calibri" w:cs="Calibri" w:eastAsia="Calibri" w:hAnsi="Calibri"/>
+                <w:b/>
+                <w:bCs/>
+                <w:color w:val="14213D"/>
+                <w:sz w:val="20"/>
+                <w:szCs w:val="20"/>
+              </w:rPr>
+              <w:t xml:space="preserve">Comparatif permanent</w:t>
+            </w:r>
+          </w:p>
+        </w:tc>
+        <w:tc>
+          <w:tcPr>
+            <w:tcW w:type="dxa" w:w="4100"/>
+            <w:tcBorders>
+              <w:top w:val="single" w:color="D9D5CB" w:sz="4"/>
+              <w:left w:val="single" w:color="D9D5CB" w:sz="4"/>
+              <w:bottom w:val="single" w:color="D9D5CB" w:sz="4"/>
+              <w:right w:val="single" w:color="D9D5CB" w:sz="4"/>
+            </w:tcBorders>
+            <w:tcMar>
+              <w:top w:type="dxa" w:w="60"/>
+              <w:left w:type="dxa" w:w="90"/>
+              <w:bottom w:type="dxa" w:w="60"/>
+              <w:right w:type="dxa" w:w="90"/>
+            </w:tcMar>
+            <w:vAlign w:val="top"/>
+          </w:tcPr>
+          <w:p>
+            <w:pPr>
+              <w:spacing w:after="40"/>
+            </w:pPr>
+            <w:r>
+              <w:rPr>
+                <w:rFonts w:ascii="Calibri" w:cs="Calibri" w:eastAsia="Calibri" w:hAnsi="Calibri"/>
+                <w:color w:val="14213D"/>
+                <w:sz w:val="19"/>
+                <w:szCs w:val="19"/>
+              </w:rPr>
+              <w:t xml:space="preserve">Tableau par référence : initial · modifs · en plus · besoin · commandé · livré · attendu · reste à livrer · à commander (rouge) ou surplus (jaune). Filtres Tout / Écarts / À commander / Reste à livrer, CSV. En tête : besoin, commandé, livré, reste à livrer, à commander, surplus.</w:t>
+            </w:r>
+          </w:p>
+        </w:tc>
+        <w:tc>
+          <w:tcPr>
+            <w:tcW w:type="dxa" w:w="3700"/>
+            <w:tcBorders>
+              <w:top w:val="single" w:color="D9D5CB" w:sz="4"/>
+              <w:left w:val="single" w:color="D9D5CB" w:sz="4"/>
+              <w:bottom w:val="single" w:color="D9D5CB" w:sz="4"/>
+              <w:right w:val="single" w:color="D9D5CB" w:sz="4"/>
+            </w:tcBorders>
+            <w:tcMar>
+              <w:top w:type="dxa" w:w="60"/>
+              <w:left w:type="dxa" w:w="90"/>
+              <w:bottom w:type="dxa" w:w="60"/>
+              <w:right w:type="dxa" w:w="90"/>
+            </w:tcMar>
+            <w:vAlign w:val="top"/>
+          </w:tcPr>
+          <w:p>
+            <w:pPr>
+              <w:spacing w:after="40"/>
+            </w:pPr>
+            <w:r>
+              <w:rPr>
+                <w:rFonts w:ascii="Calibri" w:cs="Calibri" w:eastAsia="Calibri" w:hAnsi="Calibri"/>
+                <w:color w:val="14213D"/>
+                <w:sz w:val="19"/>
+                <w:szCs w:val="19"/>
+              </w:rPr>
+              <w:t xml:space="preserve">Livré = camions pointés dans Stock ; attendu = camions annoncés pas encore pointés. Barres comptées comme le Stock (un élément « tube » = une barre, manchettes exclues) ; manchons et mousse = 1 par soudure.</w:t>
+            </w:r>
+          </w:p>
+        </w:tc>
+        <w:tc>
+          <w:tcPr>
+            <w:tcW w:type="dxa" w:w="1300"/>
+            <w:tcBorders>
+              <w:top w:val="single" w:color="D9D5CB" w:sz="4"/>
+              <w:left w:val="single" w:color="D9D5CB" w:sz="4"/>
+              <w:bottom w:val="single" w:color="D9D5CB" w:sz="4"/>
+              <w:right w:val="single" w:color="D9D5CB" w:sz="4"/>
+            </w:tcBorders>
+            <w:shd w:fill="E6F5EC" w:color="auto" w:val="clear"/>
+            <w:tcMar>
+              <w:top w:type="dxa" w:w="60"/>
+              <w:left w:type="dxa" w:w="90"/>
+              <w:bottom w:type="dxa" w:w="60"/>
+              <w:right w:type="dxa" w:w="90"/>
+            </w:tcMar>
+            <w:vAlign w:val="top"/>
+          </w:tcPr>
+          <w:p>
+            <w:pPr>
+              <w:spacing w:after="40"/>
+            </w:pPr>
+            <w:r>
+              <w:rPr>
+                <w:rFonts w:ascii="Calibri" w:cs="Calibri" w:eastAsia="Calibri" w:hAnsi="Calibri"/>
+                <w:b/>
+                <w:bCs/>
+                <w:color w:val="14213D"/>
+                <w:sz w:val="19"/>
+                <w:szCs w:val="19"/>
+              </w:rPr>
+              <w:t xml:space="preserve">Fait</w:t>
+            </w:r>
+          </w:p>
+        </w:tc>
+        <w:tc>
+          <w:tcPr>
+            <w:tcW w:type="dxa" w:w="3700"/>
+            <w:tcBorders>
+              <w:top w:val="single" w:color="D9D5CB" w:sz="4"/>
+              <w:left w:val="single" w:color="D9D5CB" w:sz="4"/>
+              <w:bottom w:val="single" w:color="D9D5CB" w:sz="4"/>
+              <w:right w:val="single" w:color="D9D5CB" w:sz="4"/>
+            </w:tcBorders>
+            <w:tcMar>
+              <w:top w:type="dxa" w:w="60"/>
+              <w:left w:type="dxa" w:w="90"/>
+              <w:bottom w:type="dxa" w:w="60"/>
+              <w:right w:type="dxa" w:w="90"/>
+            </w:tcMar>
+            <w:vAlign w:val="top"/>
+          </w:tcPr>
+          <w:p>
+            <w:pPr>
+              <w:spacing w:after="40"/>
+            </w:pPr>
+            <w:r>
+              <w:rPr>
+                <w:rFonts w:ascii="Calibri" w:cs="Calibri" w:eastAsia="Calibri" w:hAnsi="Calibri"/>
+                <w:color w:val="14213D"/>
+                <w:sz w:val="20"/>
+                <w:szCs w:val="20"/>
+              </w:rPr>
+              <w:t xml:space="preserve"/>
+            </w:r>
+          </w:p>
+          <w:p>
+            <w:pPr>
+              <w:spacing w:after="40"/>
+            </w:pPr>
+            <w:r>
+              <w:rPr>
+                <w:rFonts w:ascii="Calibri" w:cs="Calibri" w:eastAsia="Calibri" w:hAnsi="Calibri"/>
+                <w:color w:val="14213D"/>
+                <w:sz w:val="20"/>
+                <w:szCs w:val="20"/>
+              </w:rPr>
+              <w:t xml:space="preserve"/>
+            </w:r>
+          </w:p>
+        </w:tc>
+      </w:tr>
+      <w:tr>
+        <w:tc>
+          <w:tcPr>
+            <w:tcW w:type="dxa" w:w="2300"/>
+            <w:tcBorders>
+              <w:top w:val="single" w:color="D9D5CB" w:sz="4"/>
+              <w:left w:val="single" w:color="D9D5CB" w:sz="4"/>
+              <w:bottom w:val="single" w:color="D9D5CB" w:sz="4"/>
+              <w:right w:val="single" w:color="D9D5CB" w:sz="4"/>
+            </w:tcBorders>
+            <w:tcMar>
+              <w:top w:type="dxa" w:w="60"/>
+              <w:left w:type="dxa" w:w="90"/>
+              <w:bottom w:type="dxa" w:w="60"/>
+              <w:right w:type="dxa" w:w="90"/>
+            </w:tcMar>
+            <w:vAlign w:val="top"/>
+          </w:tcPr>
+          <w:p>
+            <w:pPr>
+              <w:spacing w:after="40"/>
+            </w:pPr>
+            <w:r>
+              <w:rPr>
+                <w:rFonts w:ascii="Calibri" w:cs="Calibri" w:eastAsia="Calibri" w:hAnsi="Calibri"/>
+                <w:b/>
+                <w:bCs/>
+                <w:color w:val="14213D"/>
+                <w:sz w:val="20"/>
+                <w:szCs w:val="20"/>
+              </w:rPr>
+              <w:t xml:space="preserve">Pièces en plus</w:t>
+            </w:r>
+          </w:p>
+        </w:tc>
+        <w:tc>
+          <w:tcPr>
+            <w:tcW w:type="dxa" w:w="4100"/>
+            <w:tcBorders>
+              <w:top w:val="single" w:color="D9D5CB" w:sz="4"/>
+              <w:left w:val="single" w:color="D9D5CB" w:sz="4"/>
+              <w:bottom w:val="single" w:color="D9D5CB" w:sz="4"/>
+              <w:right w:val="single" w:color="D9D5CB" w:sz="4"/>
+            </w:tcBorders>
+            <w:tcMar>
+              <w:top w:type="dxa" w:w="60"/>
+              <w:left w:type="dxa" w:w="90"/>
+              <w:bottom w:type="dxa" w:w="60"/>
+              <w:right w:type="dxa" w:w="90"/>
+            </w:tcMar>
+            <w:vAlign w:val="top"/>
+          </w:tcPr>
+          <w:p>
+            <w:pPr>
+              <w:spacing w:after="40"/>
+            </w:pPr>
+            <w:r>
+              <w:rPr>
+                <w:rFonts w:ascii="Calibri" w:cs="Calibri" w:eastAsia="Calibri" w:hAnsi="Calibri"/>
+                <w:color w:val="14213D"/>
+                <w:sz w:val="19"/>
+                <w:szCs w:val="19"/>
+              </w:rPr>
+              <w:t xml:space="preserve">Carte « Pièces en plus » → ＋ : pièce, DN, quantité, motif (casse, chutes et coupes, réserve, modif terrain pas encore dessinée, autre) → ajouté au besoin. Retirable.</w:t>
+            </w:r>
+          </w:p>
+        </w:tc>
+        <w:tc>
+          <w:tcPr>
+            <w:tcW w:type="dxa" w:w="3700"/>
+            <w:tcBorders>
+              <w:top w:val="single" w:color="D9D5CB" w:sz="4"/>
+              <w:left w:val="single" w:color="D9D5CB" w:sz="4"/>
+              <w:bottom w:val="single" w:color="D9D5CB" w:sz="4"/>
+              <w:right w:val="single" w:color="D9D5CB" w:sz="4"/>
+            </w:tcBorders>
+            <w:tcMar>
+              <w:top w:type="dxa" w:w="60"/>
+              <w:left w:type="dxa" w:w="90"/>
+              <w:bottom w:type="dxa" w:w="60"/>
+              <w:right w:type="dxa" w:w="90"/>
+            </w:tcMar>
+            <w:vAlign w:val="top"/>
+          </w:tcPr>
+          <w:p>
+            <w:pPr>
+              <w:spacing w:after="40"/>
+            </w:pPr>
+            <w:r>
+              <w:rPr>
+                <w:rFonts w:ascii="Calibri" w:cs="Calibri" w:eastAsia="Calibri" w:hAnsi="Calibri"/>
+                <w:color w:val="14213D"/>
+                <w:sz w:val="19"/>
+                <w:szCs w:val="19"/>
+              </w:rPr>
+              <w:t xml:space="preserve">Historique : qui, quand, pourquoi.</w:t>
+            </w:r>
+          </w:p>
+        </w:tc>
+        <w:tc>
+          <w:tcPr>
+            <w:tcW w:type="dxa" w:w="1300"/>
+            <w:tcBorders>
+              <w:top w:val="single" w:color="D9D5CB" w:sz="4"/>
+              <w:left w:val="single" w:color="D9D5CB" w:sz="4"/>
+              <w:bottom w:val="single" w:color="D9D5CB" w:sz="4"/>
+              <w:right w:val="single" w:color="D9D5CB" w:sz="4"/>
+            </w:tcBorders>
+            <w:shd w:fill="E6F5EC" w:color="auto" w:val="clear"/>
+            <w:tcMar>
+              <w:top w:type="dxa" w:w="60"/>
+              <w:left w:type="dxa" w:w="90"/>
+              <w:bottom w:type="dxa" w:w="60"/>
+              <w:right w:type="dxa" w:w="90"/>
+            </w:tcMar>
+            <w:vAlign w:val="top"/>
+          </w:tcPr>
+          <w:p>
+            <w:pPr>
+              <w:spacing w:after="40"/>
+            </w:pPr>
+            <w:r>
+              <w:rPr>
+                <w:rFonts w:ascii="Calibri" w:cs="Calibri" w:eastAsia="Calibri" w:hAnsi="Calibri"/>
+                <w:b/>
+                <w:bCs/>
+                <w:color w:val="14213D"/>
+                <w:sz w:val="19"/>
+                <w:szCs w:val="19"/>
+              </w:rPr>
+              <w:t xml:space="preserve">Fait</w:t>
+            </w:r>
+          </w:p>
+        </w:tc>
+        <w:tc>
+          <w:tcPr>
+            <w:tcW w:type="dxa" w:w="3700"/>
+            <w:tcBorders>
+              <w:top w:val="single" w:color="D9D5CB" w:sz="4"/>
+              <w:left w:val="single" w:color="D9D5CB" w:sz="4"/>
+              <w:bottom w:val="single" w:color="D9D5CB" w:sz="4"/>
+              <w:right w:val="single" w:color="D9D5CB" w:sz="4"/>
+            </w:tcBorders>
+            <w:tcMar>
+              <w:top w:type="dxa" w:w="60"/>
+              <w:left w:type="dxa" w:w="90"/>
+              <w:bottom w:type="dxa" w:w="60"/>
+              <w:right w:type="dxa" w:w="90"/>
+            </w:tcMar>
+            <w:vAlign w:val="top"/>
+          </w:tcPr>
+          <w:p>
+            <w:pPr>
+              <w:spacing w:after="40"/>
+            </w:pPr>
+            <w:r>
+              <w:rPr>
+                <w:rFonts w:ascii="Calibri" w:cs="Calibri" w:eastAsia="Calibri" w:hAnsi="Calibri"/>
+                <w:color w:val="14213D"/>
+                <w:sz w:val="20"/>
+                <w:szCs w:val="20"/>
+              </w:rPr>
+              <w:t xml:space="preserve"/>
+            </w:r>
+          </w:p>
+          <w:p>
+            <w:pPr>
+              <w:spacing w:after="40"/>
+            </w:pPr>
+            <w:r>
+              <w:rPr>
+                <w:rFonts w:ascii="Calibri" w:cs="Calibri" w:eastAsia="Calibri" w:hAnsi="Calibri"/>
+                <w:color w:val="14213D"/>
+                <w:sz w:val="20"/>
+                <w:szCs w:val="20"/>
+              </w:rPr>
+              <w:t xml:space="preserve"/>
+            </w:r>
+          </w:p>
+        </w:tc>
+      </w:tr>
+      <w:tr>
+        <w:tc>
+          <w:tcPr>
+            <w:tcW w:type="dxa" w:w="2300"/>
+            <w:tcBorders>
+              <w:top w:val="single" w:color="D9D5CB" w:sz="4"/>
+              <w:left w:val="single" w:color="D9D5CB" w:sz="4"/>
+              <w:bottom w:val="single" w:color="D9D5CB" w:sz="4"/>
+              <w:right w:val="single" w:color="D9D5CB" w:sz="4"/>
+            </w:tcBorders>
+            <w:tcMar>
+              <w:top w:type="dxa" w:w="60"/>
+              <w:left w:type="dxa" w:w="90"/>
+              <w:bottom w:type="dxa" w:w="60"/>
+              <w:right w:type="dxa" w:w="90"/>
+            </w:tcMar>
+            <w:vAlign w:val="top"/>
+          </w:tcPr>
+          <w:p>
+            <w:pPr>
+              <w:spacing w:after="40"/>
+            </w:pPr>
+            <w:r>
+              <w:rPr>
+                <w:rFonts w:ascii="Calibri" w:cs="Calibri" w:eastAsia="Calibri" w:hAnsi="Calibri"/>
+                <w:b/>
+                <w:bCs/>
+                <w:color w:val="14213D"/>
+                <w:sz w:val="20"/>
+                <w:szCs w:val="20"/>
+              </w:rPr>
+              <w:t xml:space="preserve">Entourer une zone sur le plan</w:t>
+            </w:r>
+          </w:p>
+        </w:tc>
+        <w:tc>
+          <w:tcPr>
+            <w:tcW w:type="dxa" w:w="4100"/>
+            <w:tcBorders>
+              <w:top w:val="single" w:color="D9D5CB" w:sz="4"/>
+              <w:left w:val="single" w:color="D9D5CB" w:sz="4"/>
+              <w:bottom w:val="single" w:color="D9D5CB" w:sz="4"/>
+              <w:right w:val="single" w:color="D9D5CB" w:sz="4"/>
+            </w:tcBorders>
+            <w:tcMar>
+              <w:top w:type="dxa" w:w="60"/>
+              <w:left w:type="dxa" w:w="90"/>
+              <w:bottom w:type="dxa" w:w="60"/>
+              <w:right w:type="dxa" w:w="90"/>
+            </w:tcMar>
+            <w:vAlign w:val="top"/>
+          </w:tcPr>
+          <w:p>
+            <w:pPr>
+              <w:spacing w:after="40"/>
+            </w:pPr>
+            <w:r>
+              <w:rPr>
+                <w:rFonts w:ascii="Calibri" w:cs="Calibri" w:eastAsia="Calibri" w:hAnsi="Calibri"/>
+                <w:color w:val="14213D"/>
+                <w:sz w:val="19"/>
+                <w:szCs w:val="19"/>
+              </w:rPr>
+              <w:t xml:space="preserve">« ⭕ Entourer une zone » (ou ＋ Poser → 📦 Zone à livrer) : un point à chaque toucher autour de la partie à souder (zoome / déplace entre deux points), « ✓ Fermer » ou toucher le 1er point → nom + date de début de soudage → la LISTE de la zone : reste à poser, déjà sur chantier, annoncé, à faire livrer (sur la commande), à commander — et les camions. CSV de la liste.</w:t>
+            </w:r>
+          </w:p>
+        </w:tc>
+        <w:tc>
+          <w:tcPr>
+            <w:tcW w:type="dxa" w:w="3700"/>
+            <w:tcBorders>
+              <w:top w:val="single" w:color="D9D5CB" w:sz="4"/>
+              <w:left w:val="single" w:color="D9D5CB" w:sz="4"/>
+              <w:bottom w:val="single" w:color="D9D5CB" w:sz="4"/>
+              <w:right w:val="single" w:color="D9D5CB" w:sz="4"/>
+            </w:tcBorders>
+            <w:tcMar>
+              <w:top w:type="dxa" w:w="60"/>
+              <w:left w:type="dxa" w:w="90"/>
+              <w:bottom w:type="dxa" w:w="60"/>
+              <w:right w:type="dxa" w:w="90"/>
+            </w:tcMar>
+            <w:vAlign w:val="top"/>
+          </w:tcPr>
+          <w:p>
+            <w:pPr>
+              <w:spacing w:after="40"/>
+            </w:pPr>
+            <w:r>
+              <w:rPr>
+                <w:rFonts w:ascii="Calibri" w:cs="Calibri" w:eastAsia="Calibri" w:hAnsi="Calibri"/>
+                <w:color w:val="14213D"/>
+                <w:sz w:val="19"/>
+                <w:szCs w:val="19"/>
+              </w:rPr>
+              <w:t xml:space="preserve">Point par point plutôt qu'à main levée : sur téléphone, le doigt sert aussi à déplacer le plan. Si deux zones se chevauchent, la plus tardive le signale en rouge (« n pièces comptées deux fois ») : redessine-la.</w:t>
+            </w:r>
+          </w:p>
+        </w:tc>
+        <w:tc>
+          <w:tcPr>
+            <w:tcW w:type="dxa" w:w="1300"/>
+            <w:tcBorders>
+              <w:top w:val="single" w:color="D9D5CB" w:sz="4"/>
+              <w:left w:val="single" w:color="D9D5CB" w:sz="4"/>
+              <w:bottom w:val="single" w:color="D9D5CB" w:sz="4"/>
+              <w:right w:val="single" w:color="D9D5CB" w:sz="4"/>
+            </w:tcBorders>
+            <w:shd w:fill="E6F5EC" w:color="auto" w:val="clear"/>
+            <w:tcMar>
+              <w:top w:type="dxa" w:w="60"/>
+              <w:left w:type="dxa" w:w="90"/>
+              <w:bottom w:type="dxa" w:w="60"/>
+              <w:right w:type="dxa" w:w="90"/>
+            </w:tcMar>
+            <w:vAlign w:val="top"/>
+          </w:tcPr>
+          <w:p>
+            <w:pPr>
+              <w:spacing w:after="40"/>
+            </w:pPr>
+            <w:r>
+              <w:rPr>
+                <w:rFonts w:ascii="Calibri" w:cs="Calibri" w:eastAsia="Calibri" w:hAnsi="Calibri"/>
+                <w:b/>
+                <w:bCs/>
+                <w:color w:val="14213D"/>
+                <w:sz w:val="19"/>
+                <w:szCs w:val="19"/>
+              </w:rPr>
+              <w:t xml:space="preserve">Fait</w:t>
+            </w:r>
+          </w:p>
+        </w:tc>
+        <w:tc>
+          <w:tcPr>
+            <w:tcW w:type="dxa" w:w="3700"/>
+            <w:tcBorders>
+              <w:top w:val="single" w:color="D9D5CB" w:sz="4"/>
+              <w:left w:val="single" w:color="D9D5CB" w:sz="4"/>
+              <w:bottom w:val="single" w:color="D9D5CB" w:sz="4"/>
+              <w:right w:val="single" w:color="D9D5CB" w:sz="4"/>
+            </w:tcBorders>
+            <w:tcMar>
+              <w:top w:type="dxa" w:w="60"/>
+              <w:left w:type="dxa" w:w="90"/>
+              <w:bottom w:type="dxa" w:w="60"/>
+              <w:right w:type="dxa" w:w="90"/>
+            </w:tcMar>
+            <w:vAlign w:val="top"/>
+          </w:tcPr>
+          <w:p>
+            <w:pPr>
+              <w:spacing w:after="40"/>
+            </w:pPr>
+            <w:r>
+              <w:rPr>
+                <w:rFonts w:ascii="Calibri" w:cs="Calibri" w:eastAsia="Calibri" w:hAnsi="Calibri"/>
+                <w:color w:val="14213D"/>
+                <w:sz w:val="20"/>
+                <w:szCs w:val="20"/>
+              </w:rPr>
+              <w:t xml:space="preserve"/>
+            </w:r>
+          </w:p>
+          <w:p>
+            <w:pPr>
+              <w:spacing w:after="40"/>
+            </w:pPr>
+            <w:r>
+              <w:rPr>
+                <w:rFonts w:ascii="Calibri" w:cs="Calibri" w:eastAsia="Calibri" w:hAnsi="Calibri"/>
+                <w:color w:val="14213D"/>
+                <w:sz w:val="20"/>
+                <w:szCs w:val="20"/>
+              </w:rPr>
+              <w:t xml:space="preserve"/>
+            </w:r>
+          </w:p>
+        </w:tc>
+      </w:tr>
+      <w:tr>
+        <w:tc>
+          <w:tcPr>
+            <w:tcW w:type="dxa" w:w="2300"/>
+            <w:tcBorders>
+              <w:top w:val="single" w:color="D9D5CB" w:sz="4"/>
+              <w:left w:val="single" w:color="D9D5CB" w:sz="4"/>
+              <w:bottom w:val="single" w:color="D9D5CB" w:sz="4"/>
+              <w:right w:val="single" w:color="D9D5CB" w:sz="4"/>
+            </w:tcBorders>
+            <w:tcMar>
+              <w:top w:type="dxa" w:w="60"/>
+              <w:left w:type="dxa" w:w="90"/>
+              <w:bottom w:type="dxa" w:w="60"/>
+              <w:right w:type="dxa" w:w="90"/>
+            </w:tcMar>
+            <w:vAlign w:val="top"/>
+          </w:tcPr>
+          <w:p>
+            <w:pPr>
+              <w:spacing w:after="40"/>
+            </w:pPr>
+            <w:r>
+              <w:rPr>
+                <w:rFonts w:ascii="Calibri" w:cs="Calibri" w:eastAsia="Calibri" w:hAnsi="Calibri"/>
+                <w:b/>
+                <w:bCs/>
+                <w:color w:val="14213D"/>
+                <w:sz w:val="20"/>
+                <w:szCs w:val="20"/>
+              </w:rPr>
+              <w:t xml:space="preserve">Zones depuis le phasage</w:t>
+            </w:r>
+          </w:p>
+        </w:tc>
+        <w:tc>
+          <w:tcPr>
+            <w:tcW w:type="dxa" w:w="4100"/>
+            <w:tcBorders>
+              <w:top w:val="single" w:color="D9D5CB" w:sz="4"/>
+              <w:left w:val="single" w:color="D9D5CB" w:sz="4"/>
+              <w:bottom w:val="single" w:color="D9D5CB" w:sz="4"/>
+              <w:right w:val="single" w:color="D9D5CB" w:sz="4"/>
+            </w:tcBorders>
+            <w:tcMar>
+              <w:top w:type="dxa" w:w="60"/>
+              <w:left w:type="dxa" w:w="90"/>
+              <w:bottom w:type="dxa" w:w="60"/>
+              <w:right w:type="dxa" w:w="90"/>
+            </w:tcMar>
+            <w:vAlign w:val="top"/>
+          </w:tcPr>
+          <w:p>
+            <w:pPr>
+              <w:spacing w:after="40"/>
+            </w:pPr>
+            <w:r>
+              <w:rPr>
+                <w:rFonts w:ascii="Calibri" w:cs="Calibri" w:eastAsia="Calibri" w:hAnsi="Calibri"/>
+                <w:color w:val="14213D"/>
+                <w:sz w:val="19"/>
+                <w:szCs w:val="19"/>
+              </w:rPr>
+              <w:t xml:space="preserve">« 📅 Reprendre les phases du phasage » : chaque phase d'exécution devient une zone (ses tronçons par PK, sa date de soudage). Changer la date dans la zone la remplace ; sinon elle suit le phasage.</w:t>
+            </w:r>
+          </w:p>
+        </w:tc>
+        <w:tc>
+          <w:tcPr>
+            <w:tcW w:type="dxa" w:w="3700"/>
+            <w:tcBorders>
+              <w:top w:val="single" w:color="D9D5CB" w:sz="4"/>
+              <w:left w:val="single" w:color="D9D5CB" w:sz="4"/>
+              <w:bottom w:val="single" w:color="D9D5CB" w:sz="4"/>
+              <w:right w:val="single" w:color="D9D5CB" w:sz="4"/>
+            </w:tcBorders>
+            <w:tcMar>
+              <w:top w:type="dxa" w:w="60"/>
+              <w:left w:type="dxa" w:w="90"/>
+              <w:bottom w:type="dxa" w:w="60"/>
+              <w:right w:type="dxa" w:w="90"/>
+            </w:tcMar>
+            <w:vAlign w:val="top"/>
+          </w:tcPr>
+          <w:p>
+            <w:pPr>
+              <w:spacing w:after="40"/>
+            </w:pPr>
+            <w:r>
+              <w:rPr>
+                <w:rFonts w:ascii="Calibri" w:cs="Calibri" w:eastAsia="Calibri" w:hAnsi="Calibri"/>
+                <w:color w:val="14213D"/>
+                <w:sz w:val="19"/>
+                <w:szCs w:val="19"/>
+              </w:rPr>
+              <w:t xml:space="preserve">Le calcul se fait dans l'ordre des dates : le stock du chantier va d'abord aux zones les plus proches, puis les camions annoncés, puis le reste de la commande, puis « à commander ».</w:t>
+            </w:r>
+          </w:p>
+        </w:tc>
+        <w:tc>
+          <w:tcPr>
+            <w:tcW w:type="dxa" w:w="1300"/>
+            <w:tcBorders>
+              <w:top w:val="single" w:color="D9D5CB" w:sz="4"/>
+              <w:left w:val="single" w:color="D9D5CB" w:sz="4"/>
+              <w:bottom w:val="single" w:color="D9D5CB" w:sz="4"/>
+              <w:right w:val="single" w:color="D9D5CB" w:sz="4"/>
+            </w:tcBorders>
+            <w:shd w:fill="E6F5EC" w:color="auto" w:val="clear"/>
+            <w:tcMar>
+              <w:top w:type="dxa" w:w="60"/>
+              <w:left w:type="dxa" w:w="90"/>
+              <w:bottom w:type="dxa" w:w="60"/>
+              <w:right w:type="dxa" w:w="90"/>
+            </w:tcMar>
+            <w:vAlign w:val="top"/>
+          </w:tcPr>
+          <w:p>
+            <w:pPr>
+              <w:spacing w:after="40"/>
+            </w:pPr>
+            <w:r>
+              <w:rPr>
+                <w:rFonts w:ascii="Calibri" w:cs="Calibri" w:eastAsia="Calibri" w:hAnsi="Calibri"/>
+                <w:b/>
+                <w:bCs/>
+                <w:color w:val="14213D"/>
+                <w:sz w:val="19"/>
+                <w:szCs w:val="19"/>
+              </w:rPr>
+              <w:t xml:space="preserve">Fait</w:t>
+            </w:r>
+          </w:p>
+        </w:tc>
+        <w:tc>
+          <w:tcPr>
+            <w:tcW w:type="dxa" w:w="3700"/>
+            <w:tcBorders>
+              <w:top w:val="single" w:color="D9D5CB" w:sz="4"/>
+              <w:left w:val="single" w:color="D9D5CB" w:sz="4"/>
+              <w:bottom w:val="single" w:color="D9D5CB" w:sz="4"/>
+              <w:right w:val="single" w:color="D9D5CB" w:sz="4"/>
+            </w:tcBorders>
+            <w:tcMar>
+              <w:top w:type="dxa" w:w="60"/>
+              <w:left w:type="dxa" w:w="90"/>
+              <w:bottom w:type="dxa" w:w="60"/>
+              <w:right w:type="dxa" w:w="90"/>
+            </w:tcMar>
+            <w:vAlign w:val="top"/>
+          </w:tcPr>
+          <w:p>
+            <w:pPr>
+              <w:spacing w:after="40"/>
+            </w:pPr>
+            <w:r>
+              <w:rPr>
+                <w:rFonts w:ascii="Calibri" w:cs="Calibri" w:eastAsia="Calibri" w:hAnsi="Calibri"/>
+                <w:color w:val="14213D"/>
+                <w:sz w:val="20"/>
+                <w:szCs w:val="20"/>
+              </w:rPr>
+              <w:t xml:space="preserve"/>
+            </w:r>
+          </w:p>
+          <w:p>
+            <w:pPr>
+              <w:spacing w:after="40"/>
+            </w:pPr>
+            <w:r>
+              <w:rPr>
+                <w:rFonts w:ascii="Calibri" w:cs="Calibri" w:eastAsia="Calibri" w:hAnsi="Calibri"/>
+                <w:color w:val="14213D"/>
+                <w:sz w:val="20"/>
+                <w:szCs w:val="20"/>
+              </w:rPr>
+              <w:t xml:space="preserve"/>
+            </w:r>
+          </w:p>
+        </w:tc>
+      </w:tr>
+      <w:tr>
+        <w:tc>
+          <w:tcPr>
+            <w:tcW w:type="dxa" w:w="2300"/>
+            <w:tcBorders>
+              <w:top w:val="single" w:color="D9D5CB" w:sz="4"/>
+              <w:left w:val="single" w:color="D9D5CB" w:sz="4"/>
+              <w:bottom w:val="single" w:color="D9D5CB" w:sz="4"/>
+              <w:right w:val="single" w:color="D9D5CB" w:sz="4"/>
+            </w:tcBorders>
+            <w:tcMar>
+              <w:top w:type="dxa" w:w="60"/>
+              <w:left w:type="dxa" w:w="90"/>
+              <w:bottom w:type="dxa" w:w="60"/>
+              <w:right w:type="dxa" w:w="90"/>
+            </w:tcMar>
+            <w:vAlign w:val="top"/>
+          </w:tcPr>
+          <w:p>
+            <w:pPr>
+              <w:spacing w:after="40"/>
+            </w:pPr>
+            <w:r>
+              <w:rPr>
+                <w:rFonts w:ascii="Calibri" w:cs="Calibri" w:eastAsia="Calibri" w:hAnsi="Calibri"/>
+                <w:b/>
+                <w:bCs/>
+                <w:color w:val="14213D"/>
+                <w:sz w:val="20"/>
+                <w:szCs w:val="20"/>
+              </w:rPr>
+              <w:t xml:space="preserve">Camions et dates</w:t>
+            </w:r>
+          </w:p>
+        </w:tc>
+        <w:tc>
+          <w:tcPr>
+            <w:tcW w:type="dxa" w:w="4100"/>
+            <w:tcBorders>
+              <w:top w:val="single" w:color="D9D5CB" w:sz="4"/>
+              <w:left w:val="single" w:color="D9D5CB" w:sz="4"/>
+              <w:bottom w:val="single" w:color="D9D5CB" w:sz="4"/>
+              <w:right w:val="single" w:color="D9D5CB" w:sz="4"/>
+            </w:tcBorders>
+            <w:tcMar>
+              <w:top w:type="dxa" w:w="60"/>
+              <w:left w:type="dxa" w:w="90"/>
+              <w:bottom w:type="dxa" w:w="60"/>
+              <w:right w:type="dxa" w:w="90"/>
+            </w:tcMar>
+            <w:vAlign w:val="top"/>
+          </w:tcPr>
+          <w:p>
+            <w:pPr>
+              <w:spacing w:after="40"/>
+            </w:pPr>
+            <w:r>
+              <w:rPr>
+                <w:rFonts w:ascii="Calibri" w:cs="Calibri" w:eastAsia="Calibri" w:hAnsi="Calibri"/>
+                <w:color w:val="14213D"/>
+                <w:sz w:val="19"/>
+                <w:szCs w:val="19"/>
+              </w:rPr>
+              <w:t xml:space="preserve">Par zone : camions proposés (semi plateau 13,6 m), remplissage %, poids, contenu (barres DN… ×n, coudes, manchons…), « dont à commander ». Date = début de la zone − 2 jours ouvrés (fériés compris). Planning des camions par semaine ; mini-plan des zones avec date et nombre de camions ; zones dessinées en pointillés sur le plan (case « Zones de fourniture » dans 👁).</w:t>
+            </w:r>
+          </w:p>
+        </w:tc>
+        <w:tc>
+          <w:tcPr>
+            <w:tcW w:type="dxa" w:w="3700"/>
+            <w:tcBorders>
+              <w:top w:val="single" w:color="D9D5CB" w:sz="4"/>
+              <w:left w:val="single" w:color="D9D5CB" w:sz="4"/>
+              <w:bottom w:val="single" w:color="D9D5CB" w:sz="4"/>
+              <w:right w:val="single" w:color="D9D5CB" w:sz="4"/>
+            </w:tcBorders>
+            <w:tcMar>
+              <w:top w:type="dxa" w:w="60"/>
+              <w:left w:type="dxa" w:w="90"/>
+              <w:bottom w:type="dxa" w:w="60"/>
+              <w:right w:type="dxa" w:w="90"/>
+            </w:tcMar>
+            <w:vAlign w:val="top"/>
+          </w:tcPr>
+          <w:p>
+            <w:pPr>
+              <w:spacing w:after="40"/>
+            </w:pPr>
+            <w:r>
+              <w:rPr>
+                <w:rFonts w:ascii="Calibri" w:cs="Calibri" w:eastAsia="Calibri" w:hAnsi="Calibri"/>
+                <w:color w:val="14213D"/>
+                <w:sz w:val="19"/>
+                <w:szCs w:val="19"/>
+              </w:rPr>
+              <w:t xml:space="preserve">Hypothèses éditables (carte Hypothèses) : délai, plateau, largeur 2,40 m, hauteur de chargement 2,50 m, 24 t ; barres rangées (largeur ÷ Ø gaine) × (hauteur ÷ Ø gaine) limitées par le poids estimé (acier + mousse + gaine) ; pièce de forme = 0,3 barre ; petites fournitures avec le 1er camion. Ordres de grandeur — le fournisseur confirme.</w:t>
+            </w:r>
+          </w:p>
+        </w:tc>
+        <w:tc>
+          <w:tcPr>
+            <w:tcW w:type="dxa" w:w="1300"/>
+            <w:tcBorders>
+              <w:top w:val="single" w:color="D9D5CB" w:sz="4"/>
+              <w:left w:val="single" w:color="D9D5CB" w:sz="4"/>
+              <w:bottom w:val="single" w:color="D9D5CB" w:sz="4"/>
+              <w:right w:val="single" w:color="D9D5CB" w:sz="4"/>
+            </w:tcBorders>
+            <w:shd w:fill="E6F5EC" w:color="auto" w:val="clear"/>
+            <w:tcMar>
+              <w:top w:type="dxa" w:w="60"/>
+              <w:left w:type="dxa" w:w="90"/>
+              <w:bottom w:type="dxa" w:w="60"/>
+              <w:right w:type="dxa" w:w="90"/>
+            </w:tcMar>
+            <w:vAlign w:val="top"/>
+          </w:tcPr>
+          <w:p>
+            <w:pPr>
+              <w:spacing w:after="40"/>
+            </w:pPr>
+            <w:r>
+              <w:rPr>
+                <w:rFonts w:ascii="Calibri" w:cs="Calibri" w:eastAsia="Calibri" w:hAnsi="Calibri"/>
+                <w:b/>
+                <w:bCs/>
+                <w:color w:val="14213D"/>
+                <w:sz w:val="19"/>
+                <w:szCs w:val="19"/>
+              </w:rPr>
+              <w:t xml:space="preserve">Fait</w:t>
+            </w:r>
+          </w:p>
+        </w:tc>
+        <w:tc>
+          <w:tcPr>
+            <w:tcW w:type="dxa" w:w="3700"/>
+            <w:tcBorders>
+              <w:top w:val="single" w:color="D9D5CB" w:sz="4"/>
+              <w:left w:val="single" w:color="D9D5CB" w:sz="4"/>
+              <w:bottom w:val="single" w:color="D9D5CB" w:sz="4"/>
+              <w:right w:val="single" w:color="D9D5CB" w:sz="4"/>
+            </w:tcBorders>
+            <w:tcMar>
+              <w:top w:type="dxa" w:w="60"/>
+              <w:left w:type="dxa" w:w="90"/>
+              <w:bottom w:type="dxa" w:w="60"/>
+              <w:right w:type="dxa" w:w="90"/>
+            </w:tcMar>
+            <w:vAlign w:val="top"/>
+          </w:tcPr>
+          <w:p>
+            <w:pPr>
+              <w:spacing w:after="40"/>
+            </w:pPr>
+            <w:r>
+              <w:rPr>
+                <w:rFonts w:ascii="Calibri" w:cs="Calibri" w:eastAsia="Calibri" w:hAnsi="Calibri"/>
+                <w:color w:val="14213D"/>
+                <w:sz w:val="20"/>
+                <w:szCs w:val="20"/>
+              </w:rPr>
+              <w:t xml:space="preserve"/>
+            </w:r>
+          </w:p>
+          <w:p>
+            <w:pPr>
+              <w:spacing w:after="40"/>
+            </w:pPr>
+            <w:r>
+              <w:rPr>
+                <w:rFonts w:ascii="Calibri" w:cs="Calibri" w:eastAsia="Calibri" w:hAnsi="Calibri"/>
+                <w:color w:val="14213D"/>
+                <w:sz w:val="20"/>
+                <w:szCs w:val="20"/>
+              </w:rPr>
+              <w:t xml:space="preserve"/>
+            </w:r>
+          </w:p>
+        </w:tc>
+      </w:tr>
+      <w:tr>
+        <w:tc>
+          <w:tcPr>
+            <w:tcW w:type="dxa" w:w="2300"/>
+            <w:tcBorders>
+              <w:top w:val="single" w:color="D9D5CB" w:sz="4"/>
+              <w:left w:val="single" w:color="D9D5CB" w:sz="4"/>
+              <w:bottom w:val="single" w:color="D9D5CB" w:sz="4"/>
+              <w:right w:val="single" w:color="D9D5CB" w:sz="4"/>
+            </w:tcBorders>
+            <w:tcMar>
+              <w:top w:type="dxa" w:w="60"/>
+              <w:left w:type="dxa" w:w="90"/>
+              <w:bottom w:type="dxa" w:w="60"/>
+              <w:right w:type="dxa" w:w="90"/>
+            </w:tcMar>
+            <w:vAlign w:val="top"/>
+          </w:tcPr>
+          <w:p>
+            <w:pPr>
+              <w:spacing w:after="40"/>
+            </w:pPr>
+            <w:r>
+              <w:rPr>
+                <w:rFonts w:ascii="Calibri" w:cs="Calibri" w:eastAsia="Calibri" w:hAnsi="Calibri"/>
+                <w:b/>
+                <w:bCs/>
+                <w:color w:val="14213D"/>
+                <w:sz w:val="20"/>
+                <w:szCs w:val="20"/>
+              </w:rPr>
+              <w:t xml:space="preserve">→ Stock : annoncer un camion</w:t>
+            </w:r>
+          </w:p>
+        </w:tc>
+        <w:tc>
+          <w:tcPr>
+            <w:tcW w:type="dxa" w:w="4100"/>
+            <w:tcBorders>
+              <w:top w:val="single" w:color="D9D5CB" w:sz="4"/>
+              <w:left w:val="single" w:color="D9D5CB" w:sz="4"/>
+              <w:bottom w:val="single" w:color="D9D5CB" w:sz="4"/>
+              <w:right w:val="single" w:color="D9D5CB" w:sz="4"/>
+            </w:tcBorders>
+            <w:tcMar>
+              <w:top w:type="dxa" w:w="60"/>
+              <w:left w:type="dxa" w:w="90"/>
+              <w:bottom w:type="dxa" w:w="60"/>
+              <w:right w:type="dxa" w:w="90"/>
+            </w:tcMar>
+            <w:vAlign w:val="top"/>
+          </w:tcPr>
+          <w:p>
+            <w:pPr>
+              <w:spacing w:after="40"/>
+            </w:pPr>
+            <w:r>
+              <w:rPr>
+                <w:rFonts w:ascii="Calibri" w:cs="Calibri" w:eastAsia="Calibri" w:hAnsi="Calibri"/>
+                <w:color w:val="14213D"/>
+                <w:sz w:val="19"/>
+                <w:szCs w:val="19"/>
+              </w:rPr>
+              <w:t xml:space="preserve">Sur un camion : « → Stock » (ou dans la zone : « Annoncer les n camions dans Stock ») → livraison PRÉVUE dans l'onglet Stock (même registre). Zone de déchargement : tout de suite ou « à choisir à l'arrivée ». À l'arrivée, Stock → « 📦 Camion arrivé » : la zone se choisit (ou une nouvelle à poser), photo, réel vs prévu → en stock → remonte dans Fourniture en « livré ».</w:t>
+            </w:r>
+          </w:p>
+        </w:tc>
+        <w:tc>
+          <w:tcPr>
+            <w:tcW w:type="dxa" w:w="3700"/>
+            <w:tcBorders>
+              <w:top w:val="single" w:color="D9D5CB" w:sz="4"/>
+              <w:left w:val="single" w:color="D9D5CB" w:sz="4"/>
+              <w:bottom w:val="single" w:color="D9D5CB" w:sz="4"/>
+              <w:right w:val="single" w:color="D9D5CB" w:sz="4"/>
+            </w:tcBorders>
+            <w:tcMar>
+              <w:top w:type="dxa" w:w="60"/>
+              <w:left w:type="dxa" w:w="90"/>
+              <w:bottom w:type="dxa" w:w="60"/>
+              <w:right w:type="dxa" w:w="90"/>
+            </w:tcMar>
+            <w:vAlign w:val="top"/>
+          </w:tcPr>
+          <w:p>
+            <w:pPr>
+              <w:spacing w:after="40"/>
+            </w:pPr>
+            <w:r>
+              <w:rPr>
+                <w:rFonts w:ascii="Calibri" w:cs="Calibri" w:eastAsia="Calibri" w:hAnsi="Calibri"/>
+                <w:color w:val="14213D"/>
+                <w:sz w:val="19"/>
+                <w:szCs w:val="19"/>
+              </w:rPr>
+              <w:t xml:space="preserve">Un avertissement si le camion contient des pièces pas encore commandées. Pièces déchargées sans zone (pose de zone abandonnée) : signalées dans Stock avec « 📍 Poser leur zone ».</w:t>
+            </w:r>
+          </w:p>
+        </w:tc>
+        <w:tc>
+          <w:tcPr>
+            <w:tcW w:type="dxa" w:w="1300"/>
+            <w:tcBorders>
+              <w:top w:val="single" w:color="D9D5CB" w:sz="4"/>
+              <w:left w:val="single" w:color="D9D5CB" w:sz="4"/>
+              <w:bottom w:val="single" w:color="D9D5CB" w:sz="4"/>
+              <w:right w:val="single" w:color="D9D5CB" w:sz="4"/>
+            </w:tcBorders>
+            <w:shd w:fill="E6F5EC" w:color="auto" w:val="clear"/>
+            <w:tcMar>
+              <w:top w:type="dxa" w:w="60"/>
+              <w:left w:type="dxa" w:w="90"/>
+              <w:bottom w:type="dxa" w:w="60"/>
+              <w:right w:type="dxa" w:w="90"/>
+            </w:tcMar>
+            <w:vAlign w:val="top"/>
+          </w:tcPr>
+          <w:p>
+            <w:pPr>
+              <w:spacing w:after="40"/>
+            </w:pPr>
+            <w:r>
+              <w:rPr>
+                <w:rFonts w:ascii="Calibri" w:cs="Calibri" w:eastAsia="Calibri" w:hAnsi="Calibri"/>
+                <w:b/>
+                <w:bCs/>
+                <w:color w:val="14213D"/>
+                <w:sz w:val="19"/>
+                <w:szCs w:val="19"/>
+              </w:rPr>
+              <w:t xml:space="preserve">Fait</w:t>
+            </w:r>
+          </w:p>
+        </w:tc>
+        <w:tc>
+          <w:tcPr>
+            <w:tcW w:type="dxa" w:w="3700"/>
+            <w:tcBorders>
+              <w:top w:val="single" w:color="D9D5CB" w:sz="4"/>
+              <w:left w:val="single" w:color="D9D5CB" w:sz="4"/>
+              <w:bottom w:val="single" w:color="D9D5CB" w:sz="4"/>
+              <w:right w:val="single" w:color="D9D5CB" w:sz="4"/>
+            </w:tcBorders>
+            <w:tcMar>
+              <w:top w:type="dxa" w:w="60"/>
+              <w:left w:type="dxa" w:w="90"/>
+              <w:bottom w:type="dxa" w:w="60"/>
+              <w:right w:type="dxa" w:w="90"/>
+            </w:tcMar>
+            <w:vAlign w:val="top"/>
+          </w:tcPr>
+          <w:p>
+            <w:pPr>
+              <w:spacing w:after="40"/>
+            </w:pPr>
+            <w:r>
+              <w:rPr>
+                <w:rFonts w:ascii="Calibri" w:cs="Calibri" w:eastAsia="Calibri" w:hAnsi="Calibri"/>
+                <w:color w:val="14213D"/>
+                <w:sz w:val="20"/>
+                <w:szCs w:val="20"/>
+              </w:rPr>
+              <w:t xml:space="preserve"/>
+            </w:r>
+          </w:p>
+          <w:p>
+            <w:pPr>
+              <w:spacing w:after="40"/>
+            </w:pPr>
+            <w:r>
+              <w:rPr>
+                <w:rFonts w:ascii="Calibri" w:cs="Calibri" w:eastAsia="Calibri" w:hAnsi="Calibri"/>
+                <w:color w:val="14213D"/>
+                <w:sz w:val="20"/>
+                <w:szCs w:val="20"/>
+              </w:rPr>
+              <w:t xml:space="preserve"/>
+            </w:r>
+          </w:p>
+        </w:tc>
+      </w:tr>
+    </w:tbl>
+    <w:p>
+      <w:pPr>
+        <w:pStyle w:val="Heading1"/>
+        <w:spacing w:after="120" w:before="320"/>
+      </w:pPr>
+      <w:r>
+        <w:rPr>
+          <w:rFonts w:ascii="Calibri" w:cs="Calibri" w:eastAsia="Calibri" w:hAnsi="Calibri"/>
+          <w:b/>
+          <w:bCs/>
+          <w:color w:val="EB6834"/>
+          <w:sz w:val="30"/>
+          <w:szCs w:val="30"/>
+        </w:rPr>
+        <w:t xml:space="preserve">J · Tes retours de la feuille du 09-10 (pris en compte — cette feuille-ci est désormais la seule)</w:t>
+      </w:r>
+    </w:p>
+    <w:tbl>
+      <w:tblPr>
+        <w:tblW w:type="dxa" w:w="15100"/>
+        <w:tblBorders>
+          <w:top w:val="single" w:color="auto" w:sz="4"/>
+          <w:left w:val="single" w:color="auto" w:sz="4"/>
+          <w:bottom w:val="single" w:color="auto" w:sz="4"/>
+          <w:right w:val="single" w:color="auto" w:sz="4"/>
+          <w:insideH w:val="single" w:color="auto" w:sz="4"/>
+          <w:insideV w:val="single" w:color="auto" w:sz="4"/>
+        </w:tblBorders>
+      </w:tblPr>
+      <w:tblGrid>
+        <w:gridCol w:w="2300"/>
+        <w:gridCol w:w="4100"/>
+        <w:gridCol w:w="3700"/>
+        <w:gridCol w:w="1300"/>
+        <w:gridCol w:w="3700"/>
+      </w:tblGrid>
+      <w:tr>
+        <w:trPr>
+          <w:tblHeader/>
+        </w:trPr>
+        <w:tc>
+          <w:tcPr>
+            <w:tcW w:type="dxa" w:w="2300"/>
+            <w:tcBorders>
+              <w:top w:val="single" w:color="D9D5CB" w:sz="4"/>
+              <w:left w:val="single" w:color="D9D5CB" w:sz="4"/>
+              <w:bottom w:val="single" w:color="D9D5CB" w:sz="4"/>
+              <w:right w:val="single" w:color="D9D5CB" w:sz="4"/>
+            </w:tcBorders>
+            <w:shd w:fill="14213D" w:color="auto" w:val="clear"/>
+            <w:tcMar>
+              <w:top w:type="dxa" w:w="60"/>
+              <w:left w:type="dxa" w:w="90"/>
+              <w:bottom w:type="dxa" w:w="60"/>
+              <w:right w:type="dxa" w:w="90"/>
+            </w:tcMar>
+            <w:vAlign w:val="top"/>
+          </w:tcPr>
+          <w:p>
+            <w:pPr>
+              <w:spacing w:after="80" w:line="264"/>
+            </w:pPr>
+            <w:r>
+              <w:rPr>
+                <w:rFonts w:ascii="Calibri" w:cs="Calibri" w:eastAsia="Calibri" w:hAnsi="Calibri"/>
+                <w:b/>
+                <w:bCs/>
+                <w:color w:val="FFFFFF"/>
+                <w:sz w:val="19"/>
+                <w:szCs w:val="19"/>
+              </w:rPr>
+              <w:t xml:space="preserve">Fonctionnalité</w:t>
+            </w:r>
+          </w:p>
+        </w:tc>
+        <w:tc>
+          <w:tcPr>
+            <w:tcW w:type="dxa" w:w="4100"/>
+            <w:tcBorders>
+              <w:top w:val="single" w:color="D9D5CB" w:sz="4"/>
+              <w:left w:val="single" w:color="D9D5CB" w:sz="4"/>
+              <w:bottom w:val="single" w:color="D9D5CB" w:sz="4"/>
+              <w:right w:val="single" w:color="D9D5CB" w:sz="4"/>
+            </w:tcBorders>
+            <w:shd w:fill="14213D" w:color="auto" w:val="clear"/>
+            <w:tcMar>
+              <w:top w:type="dxa" w:w="60"/>
+              <w:left w:type="dxa" w:w="90"/>
+              <w:bottom w:type="dxa" w:w="60"/>
+              <w:right w:type="dxa" w:w="90"/>
+            </w:tcMar>
+            <w:vAlign w:val="top"/>
+          </w:tcPr>
+          <w:p>
+            <w:pPr>
+              <w:spacing w:after="80" w:line="264"/>
+            </w:pPr>
+            <w:r>
+              <w:rPr>
+                <w:rFonts w:ascii="Calibri" w:cs="Calibri" w:eastAsia="Calibri" w:hAnsi="Calibri"/>
+                <w:b/>
+                <w:bCs/>
+                <w:color w:val="FFFFFF"/>
+                <w:sz w:val="19"/>
+                <w:szCs w:val="19"/>
+              </w:rPr>
+              <w:t xml:space="preserve">Où la trouver · comment tester</w:t>
+            </w:r>
+          </w:p>
+        </w:tc>
+        <w:tc>
+          <w:tcPr>
+            <w:tcW w:type="dxa" w:w="3700"/>
+            <w:tcBorders>
+              <w:top w:val="single" w:color="D9D5CB" w:sz="4"/>
+              <w:left w:val="single" w:color="D9D5CB" w:sz="4"/>
+              <w:bottom w:val="single" w:color="D9D5CB" w:sz="4"/>
+              <w:right w:val="single" w:color="D9D5CB" w:sz="4"/>
+            </w:tcBorders>
+            <w:shd w:fill="14213D" w:color="auto" w:val="clear"/>
+            <w:tcMar>
+              <w:top w:type="dxa" w:w="60"/>
+              <w:left w:type="dxa" w:w="90"/>
+              <w:bottom w:type="dxa" w:w="60"/>
+              <w:right w:type="dxa" w:w="90"/>
+            </w:tcMar>
+            <w:vAlign w:val="top"/>
+          </w:tcPr>
+          <w:p>
+            <w:pPr>
+              <w:spacing w:after="80" w:line="264"/>
+            </w:pPr>
+            <w:r>
+              <w:rPr>
+                <w:rFonts w:ascii="Calibri" w:cs="Calibri" w:eastAsia="Calibri" w:hAnsi="Calibri"/>
+                <w:b/>
+                <w:bCs/>
+                <w:color w:val="FFFFFF"/>
+                <w:sz w:val="19"/>
+                <w:szCs w:val="19"/>
+              </w:rPr>
+              <w:t xml:space="preserve">Hypothèses · limites · ce que j'ai tranché</w:t>
+            </w:r>
+          </w:p>
+        </w:tc>
+        <w:tc>
+          <w:tcPr>
+            <w:tcW w:type="dxa" w:w="1300"/>
+            <w:tcBorders>
+              <w:top w:val="single" w:color="D9D5CB" w:sz="4"/>
+              <w:left w:val="single" w:color="D9D5CB" w:sz="4"/>
+              <w:bottom w:val="single" w:color="D9D5CB" w:sz="4"/>
+              <w:right w:val="single" w:color="D9D5CB" w:sz="4"/>
+            </w:tcBorders>
+            <w:shd w:fill="14213D" w:color="auto" w:val="clear"/>
+            <w:tcMar>
+              <w:top w:type="dxa" w:w="60"/>
+              <w:left w:type="dxa" w:w="90"/>
+              <w:bottom w:type="dxa" w:w="60"/>
+              <w:right w:type="dxa" w:w="90"/>
+            </w:tcMar>
+            <w:vAlign w:val="top"/>
+          </w:tcPr>
+          <w:p>
+            <w:pPr>
+              <w:spacing w:after="80" w:line="264"/>
+            </w:pPr>
+            <w:r>
+              <w:rPr>
+                <w:rFonts w:ascii="Calibri" w:cs="Calibri" w:eastAsia="Calibri" w:hAnsi="Calibri"/>
+                <w:b/>
+                <w:bCs/>
+                <w:color w:val="FFFFFF"/>
+                <w:sz w:val="19"/>
+                <w:szCs w:val="19"/>
+              </w:rPr>
+              <w:t xml:space="preserve">Statut</w:t>
+            </w:r>
+          </w:p>
+        </w:tc>
+        <w:tc>
+          <w:tcPr>
+            <w:tcW w:type="dxa" w:w="3700"/>
+            <w:tcBorders>
+              <w:top w:val="single" w:color="D9D5CB" w:sz="4"/>
+              <w:left w:val="single" w:color="D9D5CB" w:sz="4"/>
+              <w:bottom w:val="single" w:color="D9D5CB" w:sz="4"/>
+              <w:right w:val="single" w:color="D9D5CB" w:sz="4"/>
+            </w:tcBorders>
+            <w:shd w:fill="14213D" w:color="auto" w:val="clear"/>
+            <w:tcMar>
+              <w:top w:type="dxa" w:w="60"/>
+              <w:left w:type="dxa" w:w="90"/>
+              <w:bottom w:type="dxa" w:w="60"/>
+              <w:right w:type="dxa" w:w="90"/>
+            </w:tcMar>
+            <w:vAlign w:val="top"/>
+          </w:tcPr>
+          <w:p>
+            <w:pPr>
+              <w:spacing w:after="80" w:line="264"/>
+            </w:pPr>
+            <w:r>
+              <w:rPr>
+                <w:rFonts w:ascii="Calibri" w:cs="Calibri" w:eastAsia="Calibri" w:hAnsi="Calibri"/>
+                <w:b/>
+                <w:bCs/>
+                <w:color w:val="FFFFFF"/>
+                <w:sz w:val="19"/>
+                <w:szCs w:val="19"/>
+              </w:rPr>
+              <w:t xml:space="preserve">Vos commentaires</w:t>
+            </w:r>
+          </w:p>
+        </w:tc>
+      </w:tr>
+      <w:tr>
+        <w:tc>
+          <w:tcPr>
+            <w:tcW w:type="dxa" w:w="2300"/>
+            <w:tcBorders>
+              <w:top w:val="single" w:color="D9D5CB" w:sz="4"/>
+              <w:left w:val="single" w:color="D9D5CB" w:sz="4"/>
+              <w:bottom w:val="single" w:color="D9D5CB" w:sz="4"/>
+              <w:right w:val="single" w:color="D9D5CB" w:sz="4"/>
+            </w:tcBorders>
+            <w:tcMar>
+              <w:top w:type="dxa" w:w="60"/>
+              <w:left w:type="dxa" w:w="90"/>
+              <w:bottom w:type="dxa" w:w="60"/>
+              <w:right w:type="dxa" w:w="90"/>
+            </w:tcMar>
+            <w:vAlign w:val="top"/>
+          </w:tcPr>
+          <w:p>
+            <w:pPr>
+              <w:spacing w:after="40"/>
+            </w:pPr>
+            <w:r>
+              <w:rPr>
+                <w:rFonts w:ascii="Calibri" w:cs="Calibri" w:eastAsia="Calibri" w:hAnsi="Calibri"/>
+                <w:b/>
+                <w:bCs/>
+                <w:color w:val="14213D"/>
+                <w:sz w:val="20"/>
+                <w:szCs w:val="20"/>
+              </w:rPr>
+              <w:t xml:space="preserve">Documents : lien pour ouvrir en plein écran</w:t>
+            </w:r>
+          </w:p>
+        </w:tc>
+        <w:tc>
+          <w:tcPr>
+            <w:tcW w:type="dxa" w:w="4100"/>
+            <w:tcBorders>
+              <w:top w:val="single" w:color="D9D5CB" w:sz="4"/>
+              <w:left w:val="single" w:color="D9D5CB" w:sz="4"/>
+              <w:bottom w:val="single" w:color="D9D5CB" w:sz="4"/>
+              <w:right w:val="single" w:color="D9D5CB" w:sz="4"/>
+            </w:tcBorders>
+            <w:tcMar>
+              <w:top w:type="dxa" w:w="60"/>
+              <w:left w:type="dxa" w:w="90"/>
+              <w:bottom w:type="dxa" w:w="60"/>
+              <w:right w:type="dxa" w:w="90"/>
+            </w:tcMar>
+            <w:vAlign w:val="top"/>
+          </w:tcPr>
+          <w:p>
+            <w:pPr>
+              <w:spacing w:after="40"/>
+            </w:pPr>
+            <w:r>
+              <w:rPr>
+                <w:rFonts w:ascii="Calibri" w:cs="Calibri" w:eastAsia="Calibri" w:hAnsi="Calibri"/>
+                <w:color w:val="14213D"/>
+                <w:sz w:val="19"/>
+                <w:szCs w:val="19"/>
+              </w:rPr>
+              <w:t xml:space="preserve">Moi → Documents → un document (PDF ou texte) → « ⤢ Plein écran » en haut à droite ; « ✕ Réduire » pour revenir. Le lien ↗ (nouvel onglet) reste pour les PDF.</w:t>
+            </w:r>
+          </w:p>
+        </w:tc>
+        <w:tc>
+          <w:tcPr>
+            <w:tcW w:type="dxa" w:w="3700"/>
+            <w:tcBorders>
+              <w:top w:val="single" w:color="D9D5CB" w:sz="4"/>
+              <w:left w:val="single" w:color="D9D5CB" w:sz="4"/>
+              <w:bottom w:val="single" w:color="D9D5CB" w:sz="4"/>
+              <w:right w:val="single" w:color="D9D5CB" w:sz="4"/>
+            </w:tcBorders>
+            <w:tcMar>
+              <w:top w:type="dxa" w:w="60"/>
+              <w:left w:type="dxa" w:w="90"/>
+              <w:bottom w:type="dxa" w:w="60"/>
+              <w:right w:type="dxa" w:w="90"/>
+            </w:tcMar>
+            <w:vAlign w:val="top"/>
+          </w:tcPr>
+          <w:p>
+            <w:pPr>
+              <w:spacing w:after="40"/>
+            </w:pPr>
+            <w:r>
+              <w:rPr>
+                <w:rFonts w:ascii="Calibri" w:cs="Calibri" w:eastAsia="Calibri" w:hAnsi="Calibri"/>
+                <w:color w:val="14213D"/>
+                <w:sz w:val="19"/>
+                <w:szCs w:val="19"/>
+              </w:rPr>
+              <w:t xml:space="preserve">La fermeture remet toujours la fenêtre normale.</w:t>
+            </w:r>
+          </w:p>
+        </w:tc>
+        <w:tc>
+          <w:tcPr>
+            <w:tcW w:type="dxa" w:w="1300"/>
+            <w:tcBorders>
+              <w:top w:val="single" w:color="D9D5CB" w:sz="4"/>
+              <w:left w:val="single" w:color="D9D5CB" w:sz="4"/>
+              <w:bottom w:val="single" w:color="D9D5CB" w:sz="4"/>
+              <w:right w:val="single" w:color="D9D5CB" w:sz="4"/>
+            </w:tcBorders>
+            <w:shd w:fill="E6F5EC" w:color="auto" w:val="clear"/>
+            <w:tcMar>
+              <w:top w:type="dxa" w:w="60"/>
+              <w:left w:type="dxa" w:w="90"/>
+              <w:bottom w:type="dxa" w:w="60"/>
+              <w:right w:type="dxa" w:w="90"/>
+            </w:tcMar>
+            <w:vAlign w:val="top"/>
+          </w:tcPr>
+          <w:p>
+            <w:pPr>
+              <w:spacing w:after="40"/>
+            </w:pPr>
+            <w:r>
+              <w:rPr>
+                <w:rFonts w:ascii="Calibri" w:cs="Calibri" w:eastAsia="Calibri" w:hAnsi="Calibri"/>
+                <w:b/>
+                <w:bCs/>
+                <w:color w:val="14213D"/>
+                <w:sz w:val="19"/>
+                <w:szCs w:val="19"/>
+              </w:rPr>
+              <w:t xml:space="preserve">Fait</w:t>
+            </w:r>
+          </w:p>
+        </w:tc>
+        <w:tc>
+          <w:tcPr>
+            <w:tcW w:type="dxa" w:w="3700"/>
+            <w:tcBorders>
+              <w:top w:val="single" w:color="D9D5CB" w:sz="4"/>
+              <w:left w:val="single" w:color="D9D5CB" w:sz="4"/>
+              <w:bottom w:val="single" w:color="D9D5CB" w:sz="4"/>
+              <w:right w:val="single" w:color="D9D5CB" w:sz="4"/>
+            </w:tcBorders>
+            <w:tcMar>
+              <w:top w:type="dxa" w:w="60"/>
+              <w:left w:type="dxa" w:w="90"/>
+              <w:bottom w:type="dxa" w:w="60"/>
+              <w:right w:type="dxa" w:w="90"/>
+            </w:tcMar>
+            <w:vAlign w:val="top"/>
+          </w:tcPr>
+          <w:p>
+            <w:pPr>
+              <w:spacing w:after="40"/>
+            </w:pPr>
+            <w:r>
+              <w:rPr>
+                <w:rFonts w:ascii="Calibri" w:cs="Calibri" w:eastAsia="Calibri" w:hAnsi="Calibri"/>
+                <w:color w:val="14213D"/>
+                <w:sz w:val="20"/>
+                <w:szCs w:val="20"/>
+              </w:rPr>
+              <w:t xml:space="preserve"/>
+            </w:r>
+          </w:p>
+          <w:p>
+            <w:pPr>
+              <w:spacing w:after="40"/>
+            </w:pPr>
+            <w:r>
+              <w:rPr>
+                <w:rFonts w:ascii="Calibri" w:cs="Calibri" w:eastAsia="Calibri" w:hAnsi="Calibri"/>
+                <w:color w:val="14213D"/>
+                <w:sz w:val="20"/>
+                <w:szCs w:val="20"/>
+              </w:rPr>
+              <w:t xml:space="preserve"/>
+            </w:r>
+          </w:p>
+        </w:tc>
+      </w:tr>
+      <w:tr>
+        <w:tc>
+          <w:tcPr>
+            <w:tcW w:type="dxa" w:w="2300"/>
+            <w:tcBorders>
+              <w:top w:val="single" w:color="D9D5CB" w:sz="4"/>
+              <w:left w:val="single" w:color="D9D5CB" w:sz="4"/>
+              <w:bottom w:val="single" w:color="D9D5CB" w:sz="4"/>
+              <w:right w:val="single" w:color="D9D5CB" w:sz="4"/>
+            </w:tcBorders>
+            <w:tcMar>
+              <w:top w:type="dxa" w:w="60"/>
+              <w:left w:type="dxa" w:w="90"/>
+              <w:bottom w:type="dxa" w:w="60"/>
+              <w:right w:type="dxa" w:w="90"/>
+            </w:tcMar>
+            <w:vAlign w:val="top"/>
+          </w:tcPr>
+          <w:p>
+            <w:pPr>
+              <w:spacing w:after="40"/>
+            </w:pPr>
+            <w:r>
+              <w:rPr>
+                <w:rFonts w:ascii="Calibri" w:cs="Calibri" w:eastAsia="Calibri" w:hAnsi="Calibri"/>
+                <w:b/>
+                <w:bCs/>
+                <w:color w:val="14213D"/>
+                <w:sz w:val="20"/>
+                <w:szCs w:val="20"/>
+              </w:rPr>
+              <w:t xml:space="preserve">Prévention : rien sur les repas</w:t>
+            </w:r>
+          </w:p>
+        </w:tc>
+        <w:tc>
+          <w:tcPr>
+            <w:tcW w:type="dxa" w:w="4100"/>
+            <w:tcBorders>
+              <w:top w:val="single" w:color="D9D5CB" w:sz="4"/>
+              <w:left w:val="single" w:color="D9D5CB" w:sz="4"/>
+              <w:bottom w:val="single" w:color="D9D5CB" w:sz="4"/>
+              <w:right w:val="single" w:color="D9D5CB" w:sz="4"/>
+            </w:tcBorders>
+            <w:tcMar>
+              <w:top w:type="dxa" w:w="60"/>
+              <w:left w:type="dxa" w:w="90"/>
+              <w:bottom w:type="dxa" w:w="60"/>
+              <w:right w:type="dxa" w:w="90"/>
+            </w:tcMar>
+            <w:vAlign w:val="top"/>
+          </w:tcPr>
+          <w:p>
+            <w:pPr>
+              <w:spacing w:after="40"/>
+            </w:pPr>
+            <w:r>
+              <w:rPr>
+                <w:rFonts w:ascii="Calibri" w:cs="Calibri" w:eastAsia="Calibri" w:hAnsi="Calibri"/>
+                <w:color w:val="14213D"/>
+                <w:sz w:val="19"/>
+                <w:szCs w:val="19"/>
+              </w:rPr>
+              <w:t xml:space="preserve">Accueil chantier → prévention → hygiène : sanitaires, eau, savon, essuie-mains — plus aucune mention des repas.</w:t>
+            </w:r>
+          </w:p>
+        </w:tc>
+        <w:tc>
+          <w:tcPr>
+            <w:tcW w:type="dxa" w:w="3700"/>
+            <w:tcBorders>
+              <w:top w:val="single" w:color="D9D5CB" w:sz="4"/>
+              <w:left w:val="single" w:color="D9D5CB" w:sz="4"/>
+              <w:bottom w:val="single" w:color="D9D5CB" w:sz="4"/>
+              <w:right w:val="single" w:color="D9D5CB" w:sz="4"/>
+            </w:tcBorders>
+            <w:tcMar>
+              <w:top w:type="dxa" w:w="60"/>
+              <w:left w:type="dxa" w:w="90"/>
+              <w:bottom w:type="dxa" w:w="60"/>
+              <w:right w:type="dxa" w:w="90"/>
+            </w:tcMar>
+            <w:vAlign w:val="top"/>
+          </w:tcPr>
+          <w:p>
+            <w:pPr>
+              <w:spacing w:after="40"/>
+            </w:pPr>
+            <w:r>
+              <w:rPr>
+                <w:rFonts w:ascii="Calibri" w:cs="Calibri" w:eastAsia="Calibri" w:hAnsi="Calibri"/>
+                <w:color w:val="14213D"/>
+                <w:sz w:val="19"/>
+                <w:szCs w:val="19"/>
+              </w:rPr>
+              <w:t xml:space="preserve">—</w:t>
+            </w:r>
+          </w:p>
+        </w:tc>
+        <w:tc>
+          <w:tcPr>
+            <w:tcW w:type="dxa" w:w="1300"/>
+            <w:tcBorders>
+              <w:top w:val="single" w:color="D9D5CB" w:sz="4"/>
+              <w:left w:val="single" w:color="D9D5CB" w:sz="4"/>
+              <w:bottom w:val="single" w:color="D9D5CB" w:sz="4"/>
+              <w:right w:val="single" w:color="D9D5CB" w:sz="4"/>
+            </w:tcBorders>
+            <w:shd w:fill="E6F5EC" w:color="auto" w:val="clear"/>
+            <w:tcMar>
+              <w:top w:type="dxa" w:w="60"/>
+              <w:left w:type="dxa" w:w="90"/>
+              <w:bottom w:type="dxa" w:w="60"/>
+              <w:right w:type="dxa" w:w="90"/>
+            </w:tcMar>
+            <w:vAlign w:val="top"/>
+          </w:tcPr>
+          <w:p>
+            <w:pPr>
+              <w:spacing w:after="40"/>
+            </w:pPr>
+            <w:r>
+              <w:rPr>
+                <w:rFonts w:ascii="Calibri" w:cs="Calibri" w:eastAsia="Calibri" w:hAnsi="Calibri"/>
+                <w:b/>
+                <w:bCs/>
+                <w:color w:val="14213D"/>
+                <w:sz w:val="19"/>
+                <w:szCs w:val="19"/>
+              </w:rPr>
+              <w:t xml:space="preserve">Fait</w:t>
+            </w:r>
+          </w:p>
+        </w:tc>
+        <w:tc>
+          <w:tcPr>
+            <w:tcW w:type="dxa" w:w="3700"/>
+            <w:tcBorders>
+              <w:top w:val="single" w:color="D9D5CB" w:sz="4"/>
+              <w:left w:val="single" w:color="D9D5CB" w:sz="4"/>
+              <w:bottom w:val="single" w:color="D9D5CB" w:sz="4"/>
+              <w:right w:val="single" w:color="D9D5CB" w:sz="4"/>
+            </w:tcBorders>
+            <w:tcMar>
+              <w:top w:type="dxa" w:w="60"/>
+              <w:left w:type="dxa" w:w="90"/>
+              <w:bottom w:type="dxa" w:w="60"/>
+              <w:right w:type="dxa" w:w="90"/>
+            </w:tcMar>
+            <w:vAlign w:val="top"/>
+          </w:tcPr>
+          <w:p>
+            <w:pPr>
+              <w:spacing w:after="40"/>
+            </w:pPr>
+            <w:r>
+              <w:rPr>
+                <w:rFonts w:ascii="Calibri" w:cs="Calibri" w:eastAsia="Calibri" w:hAnsi="Calibri"/>
+                <w:color w:val="14213D"/>
+                <w:sz w:val="20"/>
+                <w:szCs w:val="20"/>
+              </w:rPr>
+              <w:t xml:space="preserve"/>
+            </w:r>
+          </w:p>
+          <w:p>
+            <w:pPr>
+              <w:spacing w:after="40"/>
+            </w:pPr>
+            <w:r>
+              <w:rPr>
+                <w:rFonts w:ascii="Calibri" w:cs="Calibri" w:eastAsia="Calibri" w:hAnsi="Calibri"/>
+                <w:color w:val="14213D"/>
+                <w:sz w:val="20"/>
+                <w:szCs w:val="20"/>
+              </w:rPr>
+              <w:t xml:space="preserve"/>
+            </w:r>
+          </w:p>
+        </w:tc>
+      </w:tr>
+      <w:tr>
+        <w:tc>
+          <w:tcPr>
+            <w:tcW w:type="dxa" w:w="2300"/>
+            <w:tcBorders>
+              <w:top w:val="single" w:color="D9D5CB" w:sz="4"/>
+              <w:left w:val="single" w:color="D9D5CB" w:sz="4"/>
+              <w:bottom w:val="single" w:color="D9D5CB" w:sz="4"/>
+              <w:right w:val="single" w:color="D9D5CB" w:sz="4"/>
+            </w:tcBorders>
+            <w:tcMar>
+              <w:top w:type="dxa" w:w="60"/>
+              <w:left w:type="dxa" w:w="90"/>
+              <w:bottom w:type="dxa" w:w="60"/>
+              <w:right w:type="dxa" w:w="90"/>
+            </w:tcMar>
+            <w:vAlign w:val="top"/>
+          </w:tcPr>
+          <w:p>
+            <w:pPr>
+              <w:spacing w:after="40"/>
+            </w:pPr>
+            <w:r>
+              <w:rPr>
+                <w:rFonts w:ascii="Calibri" w:cs="Calibri" w:eastAsia="Calibri" w:hAnsi="Calibri"/>
+                <w:b/>
+                <w:bCs/>
+                <w:color w:val="14213D"/>
+                <w:sz w:val="20"/>
+                <w:szCs w:val="20"/>
+              </w:rPr>
+              <w:t xml:space="preserve">Adresses qui ne marchaient pas</w:t>
+            </w:r>
+          </w:p>
+        </w:tc>
+        <w:tc>
+          <w:tcPr>
+            <w:tcW w:type="dxa" w:w="4100"/>
+            <w:tcBorders>
+              <w:top w:val="single" w:color="D9D5CB" w:sz="4"/>
+              <w:left w:val="single" w:color="D9D5CB" w:sz="4"/>
+              <w:bottom w:val="single" w:color="D9D5CB" w:sz="4"/>
+              <w:right w:val="single" w:color="D9D5CB" w:sz="4"/>
+            </w:tcBorders>
+            <w:tcMar>
+              <w:top w:type="dxa" w:w="60"/>
+              <w:left w:type="dxa" w:w="90"/>
+              <w:bottom w:type="dxa" w:w="60"/>
+              <w:right w:type="dxa" w:w="90"/>
+            </w:tcMar>
+            <w:vAlign w:val="top"/>
+          </w:tcPr>
+          <w:p>
+            <w:pPr>
+              <w:spacing w:after="40"/>
+            </w:pPr>
+            <w:r>
+              <w:rPr>
+                <w:rFonts w:ascii="Calibri" w:cs="Calibri" w:eastAsia="Calibri" w:hAnsi="Calibri"/>
+                <w:color w:val="14213D"/>
+                <w:sz w:val="19"/>
+                <w:szCs w:val="19"/>
+              </w:rPr>
+              <w:t xml:space="preserve">Chantiers → Équipes &amp; heures → Grands déplacements : chaque adresse se localise par CODE POSTAL + ville. « ⚠ introuvable — vérifie le code postal et la ville » si rien n'est trouvé (fiche RH à corriger).</w:t>
+            </w:r>
+          </w:p>
+        </w:tc>
+        <w:tc>
+          <w:tcPr>
+            <w:tcW w:type="dxa" w:w="3700"/>
+            <w:tcBorders>
+              <w:top w:val="single" w:color="D9D5CB" w:sz="4"/>
+              <w:left w:val="single" w:color="D9D5CB" w:sz="4"/>
+              <w:bottom w:val="single" w:color="D9D5CB" w:sz="4"/>
+              <w:right w:val="single" w:color="D9D5CB" w:sz="4"/>
+            </w:tcBorders>
+            <w:tcMar>
+              <w:top w:type="dxa" w:w="60"/>
+              <w:left w:type="dxa" w:w="90"/>
+              <w:bottom w:type="dxa" w:w="60"/>
+              <w:right w:type="dxa" w:w="90"/>
+            </w:tcMar>
+            <w:vAlign w:val="top"/>
+          </w:tcPr>
+          <w:p>
+            <w:pPr>
+              <w:spacing w:after="40"/>
+            </w:pPr>
+            <w:r>
+              <w:rPr>
+                <w:rFonts w:ascii="Calibri" w:cs="Calibri" w:eastAsia="Calibri" w:hAnsi="Calibri"/>
+                <w:color w:val="14213D"/>
+                <w:sz w:val="19"/>
+                <w:szCs w:val="19"/>
+              </w:rPr>
+              <w:t xml:space="preserve">Deux causes corrigées : (1) recherche par nom seul (villes en majuscules sans tirets, ST / STE, CEDEX, homonymes) → service IGN (Géoplateforme, ex-API Adresse) avec le code postal, puis la liste des communes du code postal, puis le nom ; (2) un bug : quand plusieurs adresses étaient à chercher en même temps, seules les dernières l'étaient, les autres restaient « localisation en cours » 10 min. Corrigé (file d'attente).</w:t>
+            </w:r>
+          </w:p>
+        </w:tc>
+        <w:tc>
+          <w:tcPr>
+            <w:tcW w:type="dxa" w:w="1300"/>
+            <w:tcBorders>
+              <w:top w:val="single" w:color="D9D5CB" w:sz="4"/>
+              <w:left w:val="single" w:color="D9D5CB" w:sz="4"/>
+              <w:bottom w:val="single" w:color="D9D5CB" w:sz="4"/>
+              <w:right w:val="single" w:color="D9D5CB" w:sz="4"/>
+            </w:tcBorders>
+            <w:shd w:fill="E6F5EC" w:color="auto" w:val="clear"/>
+            <w:tcMar>
+              <w:top w:type="dxa" w:w="60"/>
+              <w:left w:type="dxa" w:w="90"/>
+              <w:bottom w:type="dxa" w:w="60"/>
+              <w:right w:type="dxa" w:w="90"/>
+            </w:tcMar>
+            <w:vAlign w:val="top"/>
+          </w:tcPr>
+          <w:p>
+            <w:pPr>
+              <w:spacing w:after="40"/>
+            </w:pPr>
+            <w:r>
+              <w:rPr>
+                <w:rFonts w:ascii="Calibri" w:cs="Calibri" w:eastAsia="Calibri" w:hAnsi="Calibri"/>
+                <w:b/>
+                <w:bCs/>
+                <w:color w:val="14213D"/>
+                <w:sz w:val="19"/>
+                <w:szCs w:val="19"/>
+              </w:rPr>
+              <w:t xml:space="preserve">Fait</w:t>
+            </w:r>
+          </w:p>
+        </w:tc>
+        <w:tc>
+          <w:tcPr>
+            <w:tcW w:type="dxa" w:w="3700"/>
+            <w:tcBorders>
+              <w:top w:val="single" w:color="D9D5CB" w:sz="4"/>
+              <w:left w:val="single" w:color="D9D5CB" w:sz="4"/>
+              <w:bottom w:val="single" w:color="D9D5CB" w:sz="4"/>
+              <w:right w:val="single" w:color="D9D5CB" w:sz="4"/>
+            </w:tcBorders>
+            <w:tcMar>
+              <w:top w:type="dxa" w:w="60"/>
+              <w:left w:type="dxa" w:w="90"/>
+              <w:bottom w:type="dxa" w:w="60"/>
+              <w:right w:type="dxa" w:w="90"/>
+            </w:tcMar>
+            <w:vAlign w:val="top"/>
+          </w:tcPr>
+          <w:p>
+            <w:pPr>
+              <w:spacing w:after="40"/>
+            </w:pPr>
+            <w:r>
+              <w:rPr>
+                <w:rFonts w:ascii="Calibri" w:cs="Calibri" w:eastAsia="Calibri" w:hAnsi="Calibri"/>
+                <w:color w:val="14213D"/>
+                <w:sz w:val="20"/>
+                <w:szCs w:val="20"/>
+              </w:rPr>
+              <w:t xml:space="preserve"/>
+            </w:r>
+          </w:p>
+          <w:p>
+            <w:pPr>
+              <w:spacing w:after="40"/>
+            </w:pPr>
+            <w:r>
+              <w:rPr>
+                <w:rFonts w:ascii="Calibri" w:cs="Calibri" w:eastAsia="Calibri" w:hAnsi="Calibri"/>
+                <w:color w:val="14213D"/>
+                <w:sz w:val="20"/>
+                <w:szCs w:val="20"/>
+              </w:rPr>
+              <w:t xml:space="preserve"/>
+            </w:r>
+          </w:p>
+        </w:tc>
+      </w:tr>
+      <w:tr>
+        <w:tc>
+          <w:tcPr>
+            <w:tcW w:type="dxa" w:w="2300"/>
+            <w:tcBorders>
+              <w:top w:val="single" w:color="D9D5CB" w:sz="4"/>
+              <w:left w:val="single" w:color="D9D5CB" w:sz="4"/>
+              <w:bottom w:val="single" w:color="D9D5CB" w:sz="4"/>
+              <w:right w:val="single" w:color="D9D5CB" w:sz="4"/>
+            </w:tcBorders>
+            <w:tcMar>
+              <w:top w:type="dxa" w:w="60"/>
+              <w:left w:type="dxa" w:w="90"/>
+              <w:bottom w:type="dxa" w:w="60"/>
+              <w:right w:type="dxa" w:w="90"/>
+            </w:tcMar>
+            <w:vAlign w:val="top"/>
+          </w:tcPr>
+          <w:p>
+            <w:pPr>
+              <w:spacing w:after="40"/>
+            </w:pPr>
+            <w:r>
+              <w:rPr>
+                <w:rFonts w:ascii="Calibri" w:cs="Calibri" w:eastAsia="Calibri" w:hAnsi="Calibri"/>
+                <w:b/>
+                <w:bCs/>
+                <w:color w:val="14213D"/>
+                <w:sz w:val="20"/>
+                <w:szCs w:val="20"/>
+              </w:rPr>
+              <w:t xml:space="preserve">La détente se déclenche seule</w:t>
+            </w:r>
+          </w:p>
+        </w:tc>
+        <w:tc>
+          <w:tcPr>
+            <w:tcW w:type="dxa" w:w="4100"/>
+            <w:tcBorders>
+              <w:top w:val="single" w:color="D9D5CB" w:sz="4"/>
+              <w:left w:val="single" w:color="D9D5CB" w:sz="4"/>
+              <w:bottom w:val="single" w:color="D9D5CB" w:sz="4"/>
+              <w:right w:val="single" w:color="D9D5CB" w:sz="4"/>
+            </w:tcBorders>
+            <w:tcMar>
+              <w:top w:type="dxa" w:w="60"/>
+              <w:left w:type="dxa" w:w="90"/>
+              <w:bottom w:type="dxa" w:w="60"/>
+              <w:right w:type="dxa" w:w="90"/>
+            </w:tcMar>
+            <w:vAlign w:val="top"/>
+          </w:tcPr>
+          <w:p>
+            <w:pPr>
+              <w:spacing w:after="40"/>
+            </w:pPr>
+            <w:r>
+              <w:rPr>
+                <w:rFonts w:ascii="Calibri" w:cs="Calibri" w:eastAsia="Calibri" w:hAnsi="Calibri"/>
+                <w:color w:val="14213D"/>
+                <w:sz w:val="19"/>
+                <w:szCs w:val="19"/>
+              </w:rPr>
+              <w:t xml:space="preserve">Grands déplacements, cas 3 (250 à 500 km) : 1 semaine sur 2 en détente, retour vendredi ; cas 4 (&gt; 500 km) : 1 sur 4, retour jeudi — compté par personne sur le planning, sans rien saisir. Étiquette « S1/2 », « 🏠 détente » ; l'exception (🏠 / ✗) ne sert que si la réalité diffère, « ↺ auto » revient à la règle.</w:t>
+            </w:r>
+          </w:p>
+        </w:tc>
+        <w:tc>
+          <w:tcPr>
+            <w:tcW w:type="dxa" w:w="3700"/>
+            <w:tcBorders>
+              <w:top w:val="single" w:color="D9D5CB" w:sz="4"/>
+              <w:left w:val="single" w:color="D9D5CB" w:sz="4"/>
+              <w:bottom w:val="single" w:color="D9D5CB" w:sz="4"/>
+              <w:right w:val="single" w:color="D9D5CB" w:sz="4"/>
+            </w:tcBorders>
+            <w:tcMar>
+              <w:top w:type="dxa" w:w="60"/>
+              <w:left w:type="dxa" w:w="90"/>
+              <w:bottom w:type="dxa" w:w="60"/>
+              <w:right w:type="dxa" w:w="90"/>
+            </w:tcMar>
+            <w:vAlign w:val="top"/>
+          </w:tcPr>
+          <w:p>
+            <w:pPr>
+              <w:spacing w:after="40"/>
+            </w:pPr>
+            <w:r>
+              <w:rPr>
+                <w:rFonts w:ascii="Calibri" w:cs="Calibri" w:eastAsia="Calibri" w:hAnsi="Calibri"/>
+                <w:color w:val="14213D"/>
+                <w:sz w:val="19"/>
+                <w:szCs w:val="19"/>
+              </w:rPr>
+              <w:t xml:space="preserve">Bug corrigé : après le premier cycle, plus aucune détente ne tombait (test sur 5 semaines d'affilée : 1 · détente · 1 · détente · 1). Départ du déplacement inconnu (plus de 6 mois) : rythme calé sur le calendrier, l'exception le recale.</w:t>
+            </w:r>
+          </w:p>
+        </w:tc>
+        <w:tc>
+          <w:tcPr>
+            <w:tcW w:type="dxa" w:w="1300"/>
+            <w:tcBorders>
+              <w:top w:val="single" w:color="D9D5CB" w:sz="4"/>
+              <w:left w:val="single" w:color="D9D5CB" w:sz="4"/>
+              <w:bottom w:val="single" w:color="D9D5CB" w:sz="4"/>
+              <w:right w:val="single" w:color="D9D5CB" w:sz="4"/>
+            </w:tcBorders>
+            <w:shd w:fill="E6F5EC" w:color="auto" w:val="clear"/>
+            <w:tcMar>
+              <w:top w:type="dxa" w:w="60"/>
+              <w:left w:type="dxa" w:w="90"/>
+              <w:bottom w:type="dxa" w:w="60"/>
+              <w:right w:type="dxa" w:w="90"/>
+            </w:tcMar>
+            <w:vAlign w:val="top"/>
+          </w:tcPr>
+          <w:p>
+            <w:pPr>
+              <w:spacing w:after="40"/>
+            </w:pPr>
+            <w:r>
+              <w:rPr>
+                <w:rFonts w:ascii="Calibri" w:cs="Calibri" w:eastAsia="Calibri" w:hAnsi="Calibri"/>
+                <w:b/>
+                <w:bCs/>
+                <w:color w:val="14213D"/>
+                <w:sz w:val="19"/>
+                <w:szCs w:val="19"/>
+              </w:rPr>
+              <w:t xml:space="preserve">Fait</w:t>
+            </w:r>
+          </w:p>
+        </w:tc>
+        <w:tc>
+          <w:tcPr>
+            <w:tcW w:type="dxa" w:w="3700"/>
+            <w:tcBorders>
+              <w:top w:val="single" w:color="D9D5CB" w:sz="4"/>
+              <w:left w:val="single" w:color="D9D5CB" w:sz="4"/>
+              <w:bottom w:val="single" w:color="D9D5CB" w:sz="4"/>
+              <w:right w:val="single" w:color="D9D5CB" w:sz="4"/>
+            </w:tcBorders>
+            <w:tcMar>
+              <w:top w:type="dxa" w:w="60"/>
+              <w:left w:type="dxa" w:w="90"/>
+              <w:bottom w:type="dxa" w:w="60"/>
+              <w:right w:type="dxa" w:w="90"/>
+            </w:tcMar>
+            <w:vAlign w:val="top"/>
+          </w:tcPr>
+          <w:p>
+            <w:pPr>
+              <w:spacing w:after="40"/>
+            </w:pPr>
+            <w:r>
+              <w:rPr>
+                <w:rFonts w:ascii="Calibri" w:cs="Calibri" w:eastAsia="Calibri" w:hAnsi="Calibri"/>
+                <w:color w:val="14213D"/>
+                <w:sz w:val="20"/>
+                <w:szCs w:val="20"/>
+              </w:rPr>
+              <w:t xml:space="preserve"/>
+            </w:r>
+          </w:p>
+          <w:p>
+            <w:pPr>
+              <w:spacing w:after="40"/>
+            </w:pPr>
+            <w:r>
+              <w:rPr>
+                <w:rFonts w:ascii="Calibri" w:cs="Calibri" w:eastAsia="Calibri" w:hAnsi="Calibri"/>
+                <w:color w:val="14213D"/>
+                <w:sz w:val="20"/>
+                <w:szCs w:val="20"/>
+              </w:rPr>
+              <w:t xml:space="preserve"/>
+            </w:r>
+          </w:p>
+        </w:tc>
+      </w:tr>
+      <w:tr>
+        <w:tc>
+          <w:tcPr>
+            <w:tcW w:type="dxa" w:w="2300"/>
+            <w:tcBorders>
+              <w:top w:val="single" w:color="D9D5CB" w:sz="4"/>
+              <w:left w:val="single" w:color="D9D5CB" w:sz="4"/>
+              <w:bottom w:val="single" w:color="D9D5CB" w:sz="4"/>
+              <w:right w:val="single" w:color="D9D5CB" w:sz="4"/>
+            </w:tcBorders>
+            <w:tcMar>
+              <w:top w:type="dxa" w:w="60"/>
+              <w:left w:type="dxa" w:w="90"/>
+              <w:bottom w:type="dxa" w:w="60"/>
+              <w:right w:type="dxa" w:w="90"/>
+            </w:tcMar>
+            <w:vAlign w:val="top"/>
+          </w:tcPr>
+          <w:p>
+            <w:pPr>
+              <w:spacing w:after="40"/>
+            </w:pPr>
+            <w:r>
+              <w:rPr>
+                <w:rFonts w:ascii="Calibri" w:cs="Calibri" w:eastAsia="Calibri" w:hAnsi="Calibri"/>
+                <w:b/>
+                <w:bCs/>
+                <w:color w:val="14213D"/>
+                <w:sz w:val="20"/>
+                <w:szCs w:val="20"/>
+              </w:rPr>
+              <w:t xml:space="preserve">Grands déplacements = la compil et le lieu de contrôle</w:t>
+            </w:r>
+          </w:p>
+        </w:tc>
+        <w:tc>
+          <w:tcPr>
+            <w:tcW w:type="dxa" w:w="4100"/>
+            <w:tcBorders>
+              <w:top w:val="single" w:color="D9D5CB" w:sz="4"/>
+              <w:left w:val="single" w:color="D9D5CB" w:sz="4"/>
+              <w:bottom w:val="single" w:color="D9D5CB" w:sz="4"/>
+              <w:right w:val="single" w:color="D9D5CB" w:sz="4"/>
+            </w:tcBorders>
+            <w:tcMar>
+              <w:top w:type="dxa" w:w="60"/>
+              <w:left w:type="dxa" w:w="90"/>
+              <w:bottom w:type="dxa" w:w="60"/>
+              <w:right w:type="dxa" w:w="90"/>
+            </w:tcMar>
+            <w:vAlign w:val="top"/>
+          </w:tcPr>
+          <w:p>
+            <w:pPr>
+              <w:spacing w:after="40"/>
+            </w:pPr>
+            <w:r>
+              <w:rPr>
+                <w:rFonts w:ascii="Calibri" w:cs="Calibri" w:eastAsia="Calibri" w:hAnsi="Calibri"/>
+                <w:color w:val="14213D"/>
+                <w:sz w:val="19"/>
+                <w:szCs w:val="19"/>
+              </w:rPr>
+              <w:t xml:space="preserve">Chantiers → Équipes &amp; heures → Grands déplacements : « 🗓 Par semaine » (tout le monde, « ✓ Accorder » par personne ou « Accorder les n de la semaine ») ou « 👤 Par personne · mois » (choisir un gars, ‹ › mois) : ses chantiers semaine par semaine, cas, cycle, nuitées, repas, indemnités, l'accord (qui, quand), totaux du mois, CSV ; les mois précédents = l'historique.</w:t>
+            </w:r>
+          </w:p>
+        </w:tc>
+        <w:tc>
+          <w:tcPr>
+            <w:tcW w:type="dxa" w:w="3700"/>
+            <w:tcBorders>
+              <w:top w:val="single" w:color="D9D5CB" w:sz="4"/>
+              <w:left w:val="single" w:color="D9D5CB" w:sz="4"/>
+              <w:bottom w:val="single" w:color="D9D5CB" w:sz="4"/>
+              <w:right w:val="single" w:color="D9D5CB" w:sz="4"/>
+            </w:tcBorders>
+            <w:tcMar>
+              <w:top w:type="dxa" w:w="60"/>
+              <w:left w:type="dxa" w:w="90"/>
+              <w:bottom w:type="dxa" w:w="60"/>
+              <w:right w:type="dxa" w:w="90"/>
+            </w:tcMar>
+            <w:vAlign w:val="top"/>
+          </w:tcPr>
+          <w:p>
+            <w:pPr>
+              <w:spacing w:after="40"/>
+            </w:pPr>
+            <w:r>
+              <w:rPr>
+                <w:rFonts w:ascii="Calibri" w:cs="Calibri" w:eastAsia="Calibri" w:hAnsi="Calibri"/>
+                <w:color w:val="14213D"/>
+                <w:sz w:val="19"/>
+                <w:szCs w:val="19"/>
+              </w:rPr>
+              <w:t xml:space="preserve">Une semaine accordée garde ses chiffres même si le planning change ; l'écart s'affiche (« ⚠ planning changé » + le recalcul) et « ↻ » ré-accorde, « ✕ » retire.</w:t>
+            </w:r>
+          </w:p>
+        </w:tc>
+        <w:tc>
+          <w:tcPr>
+            <w:tcW w:type="dxa" w:w="1300"/>
+            <w:tcBorders>
+              <w:top w:val="single" w:color="D9D5CB" w:sz="4"/>
+              <w:left w:val="single" w:color="D9D5CB" w:sz="4"/>
+              <w:bottom w:val="single" w:color="D9D5CB" w:sz="4"/>
+              <w:right w:val="single" w:color="D9D5CB" w:sz="4"/>
+            </w:tcBorders>
+            <w:shd w:fill="E6F5EC" w:color="auto" w:val="clear"/>
+            <w:tcMar>
+              <w:top w:type="dxa" w:w="60"/>
+              <w:left w:type="dxa" w:w="90"/>
+              <w:bottom w:type="dxa" w:w="60"/>
+              <w:right w:type="dxa" w:w="90"/>
+            </w:tcMar>
+            <w:vAlign w:val="top"/>
+          </w:tcPr>
+          <w:p>
+            <w:pPr>
+              <w:spacing w:after="40"/>
+            </w:pPr>
+            <w:r>
+              <w:rPr>
+                <w:rFonts w:ascii="Calibri" w:cs="Calibri" w:eastAsia="Calibri" w:hAnsi="Calibri"/>
+                <w:b/>
+                <w:bCs/>
+                <w:color w:val="14213D"/>
+                <w:sz w:val="19"/>
+                <w:szCs w:val="19"/>
+              </w:rPr>
+              <w:t xml:space="preserve">Fait</w:t>
+            </w:r>
+          </w:p>
+        </w:tc>
+        <w:tc>
+          <w:tcPr>
+            <w:tcW w:type="dxa" w:w="3700"/>
+            <w:tcBorders>
+              <w:top w:val="single" w:color="D9D5CB" w:sz="4"/>
+              <w:left w:val="single" w:color="D9D5CB" w:sz="4"/>
+              <w:bottom w:val="single" w:color="D9D5CB" w:sz="4"/>
+              <w:right w:val="single" w:color="D9D5CB" w:sz="4"/>
+            </w:tcBorders>
+            <w:tcMar>
+              <w:top w:type="dxa" w:w="60"/>
+              <w:left w:type="dxa" w:w="90"/>
+              <w:bottom w:type="dxa" w:w="60"/>
+              <w:right w:type="dxa" w:w="90"/>
+            </w:tcMar>
+            <w:vAlign w:val="top"/>
+          </w:tcPr>
+          <w:p>
+            <w:pPr>
+              <w:spacing w:after="40"/>
+            </w:pPr>
+            <w:r>
+              <w:rPr>
+                <w:rFonts w:ascii="Calibri" w:cs="Calibri" w:eastAsia="Calibri" w:hAnsi="Calibri"/>
+                <w:color w:val="14213D"/>
+                <w:sz w:val="20"/>
+                <w:szCs w:val="20"/>
+              </w:rPr>
+              <w:t xml:space="preserve"/>
+            </w:r>
+          </w:p>
+          <w:p>
+            <w:pPr>
+              <w:spacing w:after="40"/>
+            </w:pPr>
+            <w:r>
+              <w:rPr>
+                <w:rFonts w:ascii="Calibri" w:cs="Calibri" w:eastAsia="Calibri" w:hAnsi="Calibri"/>
+                <w:color w:val="14213D"/>
+                <w:sz w:val="20"/>
+                <w:szCs w:val="20"/>
+              </w:rPr>
+              <w:t xml:space="preserve"/>
+            </w:r>
+          </w:p>
+        </w:tc>
+      </w:tr>
+      <w:tr>
+        <w:tc>
+          <w:tcPr>
+            <w:tcW w:type="dxa" w:w="2300"/>
+            <w:tcBorders>
+              <w:top w:val="single" w:color="D9D5CB" w:sz="4"/>
+              <w:left w:val="single" w:color="D9D5CB" w:sz="4"/>
+              <w:bottom w:val="single" w:color="D9D5CB" w:sz="4"/>
+              <w:right w:val="single" w:color="D9D5CB" w:sz="4"/>
+            </w:tcBorders>
+            <w:tcMar>
+              <w:top w:type="dxa" w:w="60"/>
+              <w:left w:type="dxa" w:w="90"/>
+              <w:bottom w:type="dxa" w:w="60"/>
+              <w:right w:type="dxa" w:w="90"/>
+            </w:tcMar>
+            <w:vAlign w:val="top"/>
+          </w:tcPr>
+          <w:p>
+            <w:pPr>
+              <w:spacing w:after="40"/>
+            </w:pPr>
+            <w:r>
+              <w:rPr>
+                <w:rFonts w:ascii="Calibri" w:cs="Calibri" w:eastAsia="Calibri" w:hAnsi="Calibri"/>
+                <w:b/>
+                <w:bCs/>
+                <w:color w:val="14213D"/>
+                <w:sz w:val="20"/>
+                <w:szCs w:val="20"/>
+              </w:rPr>
+              <w:t xml:space="preserve">Trame accueil nouvel arrivant</w:t>
+            </w:r>
+          </w:p>
+        </w:tc>
+        <w:tc>
+          <w:tcPr>
+            <w:tcW w:type="dxa" w:w="4100"/>
+            <w:tcBorders>
+              <w:top w:val="single" w:color="D9D5CB" w:sz="4"/>
+              <w:left w:val="single" w:color="D9D5CB" w:sz="4"/>
+              <w:bottom w:val="single" w:color="D9D5CB" w:sz="4"/>
+              <w:right w:val="single" w:color="D9D5CB" w:sz="4"/>
+            </w:tcBorders>
+            <w:tcMar>
+              <w:top w:type="dxa" w:w="60"/>
+              <w:left w:type="dxa" w:w="90"/>
+              <w:bottom w:type="dxa" w:w="60"/>
+              <w:right w:type="dxa" w:w="90"/>
+            </w:tcMar>
+            <w:vAlign w:val="top"/>
+          </w:tcPr>
+          <w:p>
+            <w:pPr>
+              <w:spacing w:after="40"/>
+            </w:pPr>
+            <w:r>
+              <w:rPr>
+                <w:rFonts w:ascii="Calibri" w:cs="Calibri" w:eastAsia="Calibri" w:hAnsi="Calibri"/>
+                <w:color w:val="14213D"/>
+                <w:sz w:val="19"/>
+                <w:szCs w:val="19"/>
+              </w:rPr>
+              <w:t xml:space="preserve">app/docs/Trame_accueil_nouvel_arrivant.docx (2 pages A4) : identité et affectation, 16 points en 5 parties (entreprise, documents remis, sécurité, véhicule, TRACÉ) Fait / Non fait / Commentaire, EPI remis (taille, date, signature), habilitations vérifiées, intérim / CDD sur poste à risques (formation renforcée, L4154-2), signatures (arrivant, SCR, agence), point à 1 mois.</w:t>
+            </w:r>
+          </w:p>
+        </w:tc>
+        <w:tc>
+          <w:tcPr>
+            <w:tcW w:type="dxa" w:w="3700"/>
+            <w:tcBorders>
+              <w:top w:val="single" w:color="D9D5CB" w:sz="4"/>
+              <w:left w:val="single" w:color="D9D5CB" w:sz="4"/>
+              <w:bottom w:val="single" w:color="D9D5CB" w:sz="4"/>
+              <w:right w:val="single" w:color="D9D5CB" w:sz="4"/>
+            </w:tcBorders>
+            <w:tcMar>
+              <w:top w:type="dxa" w:w="60"/>
+              <w:left w:type="dxa" w:w="90"/>
+              <w:bottom w:type="dxa" w:w="60"/>
+              <w:right w:type="dxa" w:w="90"/>
+            </w:tcMar>
+            <w:vAlign w:val="top"/>
+          </w:tcPr>
+          <w:p>
+            <w:pPr>
+              <w:spacing w:after="40"/>
+            </w:pPr>
+            <w:r>
+              <w:rPr>
+                <w:rFonts w:ascii="Calibri" w:cs="Calibri" w:eastAsia="Calibri" w:hAnsi="Calibri"/>
+                <w:color w:val="14213D"/>
+                <w:sz w:val="19"/>
+                <w:szCs w:val="19"/>
+              </w:rPr>
+              <w:t xml:space="preserve">Trame v1 à valider par la RH / le QSE (postes à risques à lister). Le même contenu se coche et se signe dans l'appli (Documents d'entreprise → Accueil sécurité nouvel arrivant).</w:t>
+            </w:r>
+          </w:p>
+        </w:tc>
+        <w:tc>
+          <w:tcPr>
+            <w:tcW w:type="dxa" w:w="1300"/>
+            <w:tcBorders>
+              <w:top w:val="single" w:color="D9D5CB" w:sz="4"/>
+              <w:left w:val="single" w:color="D9D5CB" w:sz="4"/>
+              <w:bottom w:val="single" w:color="D9D5CB" w:sz="4"/>
+              <w:right w:val="single" w:color="D9D5CB" w:sz="4"/>
+            </w:tcBorders>
+            <w:shd w:fill="E6F5EC" w:color="auto" w:val="clear"/>
+            <w:tcMar>
+              <w:top w:type="dxa" w:w="60"/>
+              <w:left w:type="dxa" w:w="90"/>
+              <w:bottom w:type="dxa" w:w="60"/>
+              <w:right w:type="dxa" w:w="90"/>
+            </w:tcMar>
+            <w:vAlign w:val="top"/>
+          </w:tcPr>
+          <w:p>
+            <w:pPr>
+              <w:spacing w:after="40"/>
+            </w:pPr>
+            <w:r>
+              <w:rPr>
+                <w:rFonts w:ascii="Calibri" w:cs="Calibri" w:eastAsia="Calibri" w:hAnsi="Calibri"/>
+                <w:b/>
+                <w:bCs/>
+                <w:color w:val="14213D"/>
+                <w:sz w:val="19"/>
+                <w:szCs w:val="19"/>
+              </w:rPr>
+              <w:t xml:space="preserve">Fait</w:t>
+            </w:r>
+          </w:p>
+        </w:tc>
+        <w:tc>
+          <w:tcPr>
+            <w:tcW w:type="dxa" w:w="3700"/>
+            <w:tcBorders>
+              <w:top w:val="single" w:color="D9D5CB" w:sz="4"/>
+              <w:left w:val="single" w:color="D9D5CB" w:sz="4"/>
+              <w:bottom w:val="single" w:color="D9D5CB" w:sz="4"/>
+              <w:right w:val="single" w:color="D9D5CB" w:sz="4"/>
+            </w:tcBorders>
+            <w:tcMar>
+              <w:top w:type="dxa" w:w="60"/>
+              <w:left w:type="dxa" w:w="90"/>
+              <w:bottom w:type="dxa" w:w="60"/>
+              <w:right w:type="dxa" w:w="90"/>
+            </w:tcMar>
+            <w:vAlign w:val="top"/>
+          </w:tcPr>
+          <w:p>
+            <w:pPr>
+              <w:spacing w:after="40"/>
+            </w:pPr>
+            <w:r>
+              <w:rPr>
+                <w:rFonts w:ascii="Calibri" w:cs="Calibri" w:eastAsia="Calibri" w:hAnsi="Calibri"/>
+                <w:color w:val="14213D"/>
+                <w:sz w:val="20"/>
+                <w:szCs w:val="20"/>
+              </w:rPr>
+              <w:t xml:space="preserve"/>
+            </w:r>
+          </w:p>
+          <w:p>
+            <w:pPr>
+              <w:spacing w:after="40"/>
+            </w:pPr>
+            <w:r>
+              <w:rPr>
+                <w:rFonts w:ascii="Calibri" w:cs="Calibri" w:eastAsia="Calibri" w:hAnsi="Calibri"/>
+                <w:color w:val="14213D"/>
+                <w:sz w:val="20"/>
+                <w:szCs w:val="20"/>
+              </w:rPr>
+              <w:t xml:space="preserve"/>
+            </w:r>
+          </w:p>
+        </w:tc>
+      </w:tr>
+      <w:tr>
+        <w:tc>
+          <w:tcPr>
+            <w:tcW w:type="dxa" w:w="2300"/>
+            <w:tcBorders>
+              <w:top w:val="single" w:color="D9D5CB" w:sz="4"/>
+              <w:left w:val="single" w:color="D9D5CB" w:sz="4"/>
+              <w:bottom w:val="single" w:color="D9D5CB" w:sz="4"/>
+              <w:right w:val="single" w:color="D9D5CB" w:sz="4"/>
+            </w:tcBorders>
+            <w:tcMar>
+              <w:top w:type="dxa" w:w="60"/>
+              <w:left w:type="dxa" w:w="90"/>
+              <w:bottom w:type="dxa" w:w="60"/>
+              <w:right w:type="dxa" w:w="90"/>
+            </w:tcMar>
+            <w:vAlign w:val="top"/>
+          </w:tcPr>
+          <w:p>
+            <w:pPr>
+              <w:spacing w:after="40"/>
+            </w:pPr>
+            <w:r>
+              <w:rPr>
+                <w:rFonts w:ascii="Calibri" w:cs="Calibri" w:eastAsia="Calibri" w:hAnsi="Calibri"/>
+                <w:b/>
+                <w:bCs/>
+                <w:color w:val="14213D"/>
+                <w:sz w:val="20"/>
+                <w:szCs w:val="20"/>
+              </w:rPr>
+              <w:t xml:space="preserve">N° d'affaire : 02, 03…</w:t>
+            </w:r>
+          </w:p>
+        </w:tc>
+        <w:tc>
+          <w:tcPr>
+            <w:tcW w:type="dxa" w:w="4100"/>
+            <w:tcBorders>
+              <w:top w:val="single" w:color="D9D5CB" w:sz="4"/>
+              <w:left w:val="single" w:color="D9D5CB" w:sz="4"/>
+              <w:bottom w:val="single" w:color="D9D5CB" w:sz="4"/>
+              <w:right w:val="single" w:color="D9D5CB" w:sz="4"/>
+            </w:tcBorders>
+            <w:tcMar>
+              <w:top w:type="dxa" w:w="60"/>
+              <w:left w:type="dxa" w:w="90"/>
+              <w:bottom w:type="dxa" w:w="60"/>
+              <w:right w:type="dxa" w:w="90"/>
+            </w:tcMar>
+            <w:vAlign w:val="top"/>
+          </w:tcPr>
+          <w:p>
+            <w:pPr>
+              <w:spacing w:after="40"/>
+            </w:pPr>
+            <w:r>
+              <w:rPr>
+                <w:rFonts w:ascii="Calibri" w:cs="Calibri" w:eastAsia="Calibri" w:hAnsi="Calibri"/>
+                <w:color w:val="14213D"/>
+                <w:sz w:val="19"/>
+                <w:szCs w:val="19"/>
+              </w:rPr>
+              <w:t xml:space="preserve">Commerce → ＋ Nouvelle affaire : le numéro proposé suit (O2610-01, puis O2610-02, puis O2610-03) ; secteur IDF → I2610-01.</w:t>
+            </w:r>
+          </w:p>
+        </w:tc>
+        <w:tc>
+          <w:tcPr>
+            <w:tcW w:type="dxa" w:w="3700"/>
+            <w:tcBorders>
+              <w:top w:val="single" w:color="D9D5CB" w:sz="4"/>
+              <w:left w:val="single" w:color="D9D5CB" w:sz="4"/>
+              <w:bottom w:val="single" w:color="D9D5CB" w:sz="4"/>
+              <w:right w:val="single" w:color="D9D5CB" w:sz="4"/>
+            </w:tcBorders>
+            <w:tcMar>
+              <w:top w:type="dxa" w:w="60"/>
+              <w:left w:type="dxa" w:w="90"/>
+              <w:bottom w:type="dxa" w:w="60"/>
+              <w:right w:type="dxa" w:w="90"/>
+            </w:tcMar>
+            <w:vAlign w:val="top"/>
+          </w:tcPr>
+          <w:p>
+            <w:pPr>
+              <w:spacing w:after="40"/>
+            </w:pPr>
+            <w:r>
+              <w:rPr>
+                <w:rFonts w:ascii="Calibri" w:cs="Calibri" w:eastAsia="Calibri" w:hAnsi="Calibri"/>
+                <w:color w:val="14213D"/>
+                <w:sz w:val="19"/>
+                <w:szCs w:val="19"/>
+              </w:rPr>
+              <w:t xml:space="preserve">Vérifié par un test automatique.</w:t>
+            </w:r>
+          </w:p>
+        </w:tc>
+        <w:tc>
+          <w:tcPr>
+            <w:tcW w:type="dxa" w:w="1300"/>
+            <w:tcBorders>
+              <w:top w:val="single" w:color="D9D5CB" w:sz="4"/>
+              <w:left w:val="single" w:color="D9D5CB" w:sz="4"/>
+              <w:bottom w:val="single" w:color="D9D5CB" w:sz="4"/>
+              <w:right w:val="single" w:color="D9D5CB" w:sz="4"/>
+            </w:tcBorders>
+            <w:shd w:fill="E6F5EC" w:color="auto" w:val="clear"/>
+            <w:tcMar>
+              <w:top w:type="dxa" w:w="60"/>
+              <w:left w:type="dxa" w:w="90"/>
+              <w:bottom w:type="dxa" w:w="60"/>
+              <w:right w:type="dxa" w:w="90"/>
+            </w:tcMar>
+            <w:vAlign w:val="top"/>
+          </w:tcPr>
+          <w:p>
+            <w:pPr>
+              <w:spacing w:after="40"/>
+            </w:pPr>
+            <w:r>
+              <w:rPr>
+                <w:rFonts w:ascii="Calibri" w:cs="Calibri" w:eastAsia="Calibri" w:hAnsi="Calibri"/>
+                <w:b/>
+                <w:bCs/>
+                <w:color w:val="14213D"/>
+                <w:sz w:val="19"/>
+                <w:szCs w:val="19"/>
+              </w:rPr>
+              <w:t xml:space="preserve">Fait</w:t>
+            </w:r>
+          </w:p>
+        </w:tc>
+        <w:tc>
+          <w:tcPr>
+            <w:tcW w:type="dxa" w:w="3700"/>
+            <w:tcBorders>
+              <w:top w:val="single" w:color="D9D5CB" w:sz="4"/>
+              <w:left w:val="single" w:color="D9D5CB" w:sz="4"/>
+              <w:bottom w:val="single" w:color="D9D5CB" w:sz="4"/>
+              <w:right w:val="single" w:color="D9D5CB" w:sz="4"/>
+            </w:tcBorders>
+            <w:tcMar>
+              <w:top w:type="dxa" w:w="60"/>
+              <w:left w:type="dxa" w:w="90"/>
+              <w:bottom w:type="dxa" w:w="60"/>
+              <w:right w:type="dxa" w:w="90"/>
+            </w:tcMar>
+            <w:vAlign w:val="top"/>
+          </w:tcPr>
+          <w:p>
+            <w:pPr>
+              <w:spacing w:after="40"/>
+            </w:pPr>
+            <w:r>
+              <w:rPr>
+                <w:rFonts w:ascii="Calibri" w:cs="Calibri" w:eastAsia="Calibri" w:hAnsi="Calibri"/>
+                <w:color w:val="14213D"/>
+                <w:sz w:val="20"/>
+                <w:szCs w:val="20"/>
+              </w:rPr>
+              <w:t xml:space="preserve"/>
+            </w:r>
+          </w:p>
+          <w:p>
+            <w:pPr>
+              <w:spacing w:after="40"/>
+            </w:pPr>
+            <w:r>
+              <w:rPr>
+                <w:rFonts w:ascii="Calibri" w:cs="Calibri" w:eastAsia="Calibri" w:hAnsi="Calibri"/>
+                <w:color w:val="14213D"/>
+                <w:sz w:val="20"/>
+                <w:szCs w:val="20"/>
+              </w:rPr>
+              <w:t xml:space="preserve"/>
+            </w:r>
+          </w:p>
+        </w:tc>
+      </w:tr>
+      <w:tr>
+        <w:tc>
+          <w:tcPr>
+            <w:tcW w:type="dxa" w:w="2300"/>
+            <w:tcBorders>
+              <w:top w:val="single" w:color="D9D5CB" w:sz="4"/>
+              <w:left w:val="single" w:color="D9D5CB" w:sz="4"/>
+              <w:bottom w:val="single" w:color="D9D5CB" w:sz="4"/>
+              <w:right w:val="single" w:color="D9D5CB" w:sz="4"/>
+            </w:tcBorders>
+            <w:tcMar>
+              <w:top w:type="dxa" w:w="60"/>
+              <w:left w:type="dxa" w:w="90"/>
+              <w:bottom w:type="dxa" w:w="60"/>
+              <w:right w:type="dxa" w:w="90"/>
+            </w:tcMar>
+            <w:vAlign w:val="top"/>
+          </w:tcPr>
+          <w:p>
+            <w:pPr>
+              <w:spacing w:after="40"/>
+            </w:pPr>
+            <w:r>
+              <w:rPr>
+                <w:rFonts w:ascii="Calibri" w:cs="Calibri" w:eastAsia="Calibri" w:hAnsi="Calibri"/>
+                <w:b/>
+                <w:bCs/>
+                <w:color w:val="14213D"/>
+                <w:sz w:val="20"/>
+                <w:szCs w:val="20"/>
+              </w:rPr>
+              <w:t xml:space="preserve">Reporté de la feuille du 09-10 : bons de commande</w:t>
+            </w:r>
+          </w:p>
+        </w:tc>
+        <w:tc>
+          <w:tcPr>
+            <w:tcW w:type="dxa" w:w="4100"/>
+            <w:tcBorders>
+              <w:top w:val="single" w:color="D9D5CB" w:sz="4"/>
+              <w:left w:val="single" w:color="D9D5CB" w:sz="4"/>
+              <w:bottom w:val="single" w:color="D9D5CB" w:sz="4"/>
+              <w:right w:val="single" w:color="D9D5CB" w:sz="4"/>
+            </w:tcBorders>
+            <w:tcMar>
+              <w:top w:type="dxa" w:w="60"/>
+              <w:left w:type="dxa" w:w="90"/>
+              <w:bottom w:type="dxa" w:w="60"/>
+              <w:right w:type="dxa" w:w="90"/>
+            </w:tcMar>
+            <w:vAlign w:val="top"/>
+          </w:tcPr>
+          <w:p>
+            <w:pPr>
+              <w:spacing w:after="40"/>
+            </w:pPr>
+            <w:r>
+              <w:rPr>
+                <w:rFonts w:ascii="Calibri" w:cs="Calibri" w:eastAsia="Calibri" w:hAnsi="Calibri"/>
+                <w:color w:val="14213D"/>
+                <w:sz w:val="19"/>
+                <w:szCs w:val="19"/>
+              </w:rPr>
+              <w:t xml:space="preserve">Chantiers → Équipes &amp; heures → Achats &amp; comptes → Bons de commande : créer, imprimer, suivre. À TESTER (tu ne l'avais pas encore fait).</w:t>
+            </w:r>
+          </w:p>
+        </w:tc>
+        <w:tc>
+          <w:tcPr>
+            <w:tcW w:type="dxa" w:w="3700"/>
+            <w:tcBorders>
+              <w:top w:val="single" w:color="D9D5CB" w:sz="4"/>
+              <w:left w:val="single" w:color="D9D5CB" w:sz="4"/>
+              <w:bottom w:val="single" w:color="D9D5CB" w:sz="4"/>
+              <w:right w:val="single" w:color="D9D5CB" w:sz="4"/>
+            </w:tcBorders>
+            <w:tcMar>
+              <w:top w:type="dxa" w:w="60"/>
+              <w:left w:type="dxa" w:w="90"/>
+              <w:bottom w:type="dxa" w:w="60"/>
+              <w:right w:type="dxa" w:w="90"/>
+            </w:tcMar>
+            <w:vAlign w:val="top"/>
+          </w:tcPr>
+          <w:p>
+            <w:pPr>
+              <w:spacing w:after="40"/>
+            </w:pPr>
+            <w:r>
+              <w:rPr>
+                <w:rFonts w:ascii="Calibri" w:cs="Calibri" w:eastAsia="Calibri" w:hAnsi="Calibri"/>
+                <w:color w:val="14213D"/>
+                <w:sz w:val="19"/>
+                <w:szCs w:val="19"/>
+              </w:rPr>
+              <w:t xml:space="preserve">À recaler sur tes vrais bons (envoie-m'en un).</w:t>
+            </w:r>
+          </w:p>
+        </w:tc>
+        <w:tc>
+          <w:tcPr>
+            <w:tcW w:type="dxa" w:w="1300"/>
+            <w:tcBorders>
+              <w:top w:val="single" w:color="D9D5CB" w:sz="4"/>
+              <w:left w:val="single" w:color="D9D5CB" w:sz="4"/>
+              <w:bottom w:val="single" w:color="D9D5CB" w:sz="4"/>
+              <w:right w:val="single" w:color="D9D5CB" w:sz="4"/>
+            </w:tcBorders>
+            <w:shd w:fill="FFF4EE" w:color="auto" w:val="clear"/>
+            <w:tcMar>
+              <w:top w:type="dxa" w:w="60"/>
+              <w:left w:type="dxa" w:w="90"/>
+              <w:bottom w:type="dxa" w:w="60"/>
+              <w:right w:type="dxa" w:w="90"/>
+            </w:tcMar>
+            <w:vAlign w:val="top"/>
+          </w:tcPr>
+          <w:p>
+            <w:pPr>
+              <w:spacing w:after="40"/>
+            </w:pPr>
+            <w:r>
+              <w:rPr>
+                <w:rFonts w:ascii="Calibri" w:cs="Calibri" w:eastAsia="Calibri" w:hAnsi="Calibri"/>
+                <w:b/>
+                <w:bCs/>
+                <w:color w:val="14213D"/>
+                <w:sz w:val="19"/>
+                <w:szCs w:val="19"/>
+              </w:rPr>
+              <w:t xml:space="preserve">À tester</w:t>
+            </w:r>
+          </w:p>
+        </w:tc>
+        <w:tc>
+          <w:tcPr>
+            <w:tcW w:type="dxa" w:w="3700"/>
+            <w:tcBorders>
+              <w:top w:val="single" w:color="D9D5CB" w:sz="4"/>
+              <w:left w:val="single" w:color="D9D5CB" w:sz="4"/>
+              <w:bottom w:val="single" w:color="D9D5CB" w:sz="4"/>
+              <w:right w:val="single" w:color="D9D5CB" w:sz="4"/>
+            </w:tcBorders>
+            <w:tcMar>
+              <w:top w:type="dxa" w:w="60"/>
+              <w:left w:type="dxa" w:w="90"/>
+              <w:bottom w:type="dxa" w:w="60"/>
+              <w:right w:type="dxa" w:w="90"/>
+            </w:tcMar>
+            <w:vAlign w:val="top"/>
+          </w:tcPr>
+          <w:p>
+            <w:pPr>
+              <w:spacing w:after="40"/>
+            </w:pPr>
+            <w:r>
+              <w:rPr>
+                <w:rFonts w:ascii="Calibri" w:cs="Calibri" w:eastAsia="Calibri" w:hAnsi="Calibri"/>
+                <w:color w:val="14213D"/>
+                <w:sz w:val="20"/>
+                <w:szCs w:val="20"/>
+              </w:rPr>
+              <w:t xml:space="preserve"/>
+            </w:r>
+          </w:p>
+          <w:p>
+            <w:pPr>
+              <w:spacing w:after="40"/>
+            </w:pPr>
+            <w:r>
+              <w:rPr>
+                <w:rFonts w:ascii="Calibri" w:cs="Calibri" w:eastAsia="Calibri" w:hAnsi="Calibri"/>
+                <w:color w:val="14213D"/>
+                <w:sz w:val="20"/>
+                <w:szCs w:val="20"/>
+              </w:rPr>
+              <w:t xml:space="preserve"/>
+            </w:r>
+          </w:p>
+        </w:tc>
+      </w:tr>
+      <w:tr>
+        <w:tc>
+          <w:tcPr>
+            <w:tcW w:type="dxa" w:w="2300"/>
+            <w:tcBorders>
+              <w:top w:val="single" w:color="D9D5CB" w:sz="4"/>
+              <w:left w:val="single" w:color="D9D5CB" w:sz="4"/>
+              <w:bottom w:val="single" w:color="D9D5CB" w:sz="4"/>
+              <w:right w:val="single" w:color="D9D5CB" w:sz="4"/>
+            </w:tcBorders>
+            <w:tcMar>
+              <w:top w:type="dxa" w:w="60"/>
+              <w:left w:type="dxa" w:w="90"/>
+              <w:bottom w:type="dxa" w:w="60"/>
+              <w:right w:type="dxa" w:w="90"/>
+            </w:tcMar>
+            <w:vAlign w:val="top"/>
+          </w:tcPr>
+          <w:p>
+            <w:pPr>
+              <w:spacing w:after="40"/>
+            </w:pPr>
+            <w:r>
+              <w:rPr>
+                <w:rFonts w:ascii="Calibri" w:cs="Calibri" w:eastAsia="Calibri" w:hAnsi="Calibri"/>
+                <w:b/>
+                <w:bCs/>
+                <w:color w:val="14213D"/>
+                <w:sz w:val="20"/>
+                <w:szCs w:val="20"/>
+              </w:rPr>
+              <w:t xml:space="preserve">Reporté de la feuille du 09-10 : notes de frais</w:t>
+            </w:r>
+          </w:p>
+        </w:tc>
+        <w:tc>
+          <w:tcPr>
+            <w:tcW w:type="dxa" w:w="4100"/>
+            <w:tcBorders>
+              <w:top w:val="single" w:color="D9D5CB" w:sz="4"/>
+              <w:left w:val="single" w:color="D9D5CB" w:sz="4"/>
+              <w:bottom w:val="single" w:color="D9D5CB" w:sz="4"/>
+              <w:right w:val="single" w:color="D9D5CB" w:sz="4"/>
+            </w:tcBorders>
+            <w:tcMar>
+              <w:top w:type="dxa" w:w="60"/>
+              <w:left w:type="dxa" w:w="90"/>
+              <w:bottom w:type="dxa" w:w="60"/>
+              <w:right w:type="dxa" w:w="90"/>
+            </w:tcMar>
+            <w:vAlign w:val="top"/>
+          </w:tcPr>
+          <w:p>
+            <w:pPr>
+              <w:spacing w:after="40"/>
+            </w:pPr>
+            <w:r>
+              <w:rPr>
+                <w:rFonts w:ascii="Calibri" w:cs="Calibri" w:eastAsia="Calibri" w:hAnsi="Calibri"/>
+                <w:color w:val="14213D"/>
+                <w:sz w:val="19"/>
+                <w:szCs w:val="19"/>
+              </w:rPr>
+              <w:t xml:space="preserve">Moi → Notes de frais → ➕ : ticket en photo ou importé, envoi ; Chantiers → Équipes &amp; heures → Notes de frais à valider (valider, refuser, rembourser). À TESTER.</w:t>
+            </w:r>
+          </w:p>
+        </w:tc>
+        <w:tc>
+          <w:tcPr>
+            <w:tcW w:type="dxa" w:w="3700"/>
+            <w:tcBorders>
+              <w:top w:val="single" w:color="D9D5CB" w:sz="4"/>
+              <w:left w:val="single" w:color="D9D5CB" w:sz="4"/>
+              <w:bottom w:val="single" w:color="D9D5CB" w:sz="4"/>
+              <w:right w:val="single" w:color="D9D5CB" w:sz="4"/>
+            </w:tcBorders>
+            <w:tcMar>
+              <w:top w:type="dxa" w:w="60"/>
+              <w:left w:type="dxa" w:w="90"/>
+              <w:bottom w:type="dxa" w:w="60"/>
+              <w:right w:type="dxa" w:w="90"/>
+            </w:tcMar>
+            <w:vAlign w:val="top"/>
+          </w:tcPr>
+          <w:p>
+            <w:pPr>
+              <w:spacing w:after="40"/>
+            </w:pPr>
+            <w:r>
+              <w:rPr>
+                <w:rFonts w:ascii="Calibri" w:cs="Calibri" w:eastAsia="Calibri" w:hAnsi="Calibri"/>
+                <w:color w:val="14213D"/>
+                <w:sz w:val="19"/>
+                <w:szCs w:val="19"/>
+              </w:rPr>
+              <w:t xml:space="preserve">—</w:t>
+            </w:r>
+          </w:p>
+        </w:tc>
+        <w:tc>
+          <w:tcPr>
+            <w:tcW w:type="dxa" w:w="1300"/>
+            <w:tcBorders>
+              <w:top w:val="single" w:color="D9D5CB" w:sz="4"/>
+              <w:left w:val="single" w:color="D9D5CB" w:sz="4"/>
+              <w:bottom w:val="single" w:color="D9D5CB" w:sz="4"/>
+              <w:right w:val="single" w:color="D9D5CB" w:sz="4"/>
+            </w:tcBorders>
+            <w:shd w:fill="FFF4EE" w:color="auto" w:val="clear"/>
+            <w:tcMar>
+              <w:top w:type="dxa" w:w="60"/>
+              <w:left w:type="dxa" w:w="90"/>
+              <w:bottom w:type="dxa" w:w="60"/>
+              <w:right w:type="dxa" w:w="90"/>
+            </w:tcMar>
+            <w:vAlign w:val="top"/>
+          </w:tcPr>
+          <w:p>
+            <w:pPr>
+              <w:spacing w:after="40"/>
+            </w:pPr>
+            <w:r>
+              <w:rPr>
+                <w:rFonts w:ascii="Calibri" w:cs="Calibri" w:eastAsia="Calibri" w:hAnsi="Calibri"/>
+                <w:b/>
+                <w:bCs/>
+                <w:color w:val="14213D"/>
+                <w:sz w:val="19"/>
+                <w:szCs w:val="19"/>
+              </w:rPr>
+              <w:t xml:space="preserve">À tester</w:t>
+            </w:r>
+          </w:p>
+        </w:tc>
+        <w:tc>
+          <w:tcPr>
+            <w:tcW w:type="dxa" w:w="3700"/>
+            <w:tcBorders>
+              <w:top w:val="single" w:color="D9D5CB" w:sz="4"/>
+              <w:left w:val="single" w:color="D9D5CB" w:sz="4"/>
+              <w:bottom w:val="single" w:color="D9D5CB" w:sz="4"/>
+              <w:right w:val="single" w:color="D9D5CB" w:sz="4"/>
+            </w:tcBorders>
+            <w:tcMar>
+              <w:top w:type="dxa" w:w="60"/>
+              <w:left w:type="dxa" w:w="90"/>
+              <w:bottom w:type="dxa" w:w="60"/>
+              <w:right w:type="dxa" w:w="90"/>
+            </w:tcMar>
+            <w:vAlign w:val="top"/>
+          </w:tcPr>
+          <w:p>
+            <w:pPr>
+              <w:spacing w:after="40"/>
+            </w:pPr>
+            <w:r>
+              <w:rPr>
+                <w:rFonts w:ascii="Calibri" w:cs="Calibri" w:eastAsia="Calibri" w:hAnsi="Calibri"/>
+                <w:color w:val="14213D"/>
+                <w:sz w:val="20"/>
+                <w:szCs w:val="20"/>
+              </w:rPr>
+              <w:t xml:space="preserve"/>
+            </w:r>
+          </w:p>
+          <w:p>
+            <w:pPr>
+              <w:spacing w:after="40"/>
+            </w:pPr>
+            <w:r>
+              <w:rPr>
+                <w:rFonts w:ascii="Calibri" w:cs="Calibri" w:eastAsia="Calibri" w:hAnsi="Calibri"/>
+                <w:color w:val="14213D"/>
+                <w:sz w:val="20"/>
+                <w:szCs w:val="20"/>
+              </w:rPr>
+              <w:t xml:space="preserve"/>
+            </w:r>
+          </w:p>
+        </w:tc>
+      </w:tr>
+    </w:tbl>
+    <w:p>
+      <w:pPr>
+        <w:pStyle w:val="Heading1"/>
+        <w:spacing w:after="120" w:before="320"/>
+      </w:pPr>
+      <w:r>
+        <w:rPr>
+          <w:rFonts w:ascii="Calibri" w:cs="Calibri" w:eastAsia="Calibri" w:hAnsi="Calibri"/>
+          <w:b/>
+          <w:bCs/>
+          <w:color w:val="EB6834"/>
+          <w:sz w:val="30"/>
+          <w:szCs w:val="30"/>
+        </w:rPr>
         <w:t xml:space="preserve">H · Commerce : le dossier de A à Z (codé le 13/10 au matin, d'après la maquette)</w:t>
       </w:r>
     </w:p>
@@ -15159,6 +18979,25 @@
           <w:szCs w:val="30"/>
         </w:rPr>
         <w:t xml:space="preserve">Pas fait · à trancher</w:t>
+      </w:r>
+    </w:p>
+    <w:p>
+      <w:pPr>
+        <w:pStyle w:val="ListParagraph"/>
+        <w:numPr>
+          <w:ilvl w:val="0"/>
+          <w:numId w:val="2"/>
+        </w:numPr>
+        <w:spacing w:after="40"/>
+      </w:pPr>
+      <w:r>
+        <w:rPr>
+          <w:rFonts w:ascii="Calibri" w:cs="Calibri" w:eastAsia="Calibri" w:hAnsi="Calibri"/>
+          <w:color w:val="14213D"/>
+          <w:sz w:val="20"/>
+          <w:szCs w:val="20"/>
+        </w:rPr>
+        <w:t xml:space="preserve">Fourniture : regrouper dans un même camion des zones proches dans le temps ; capacités par DN données par TON fournisseur (à saisir si tu les as) ; écart commande ↔ BL fournisseur ligne à ligne ; zone dessinée à main levée.</w:t>
       </w:r>
     </w:p>
     <w:p>
@@ -15384,7 +19223,7 @@
           <w:sz w:val="20"/>
           <w:szCs w:val="20"/>
         </w:rPr>
-        <w:t xml:space="preserve">Résumé : Commerce de A à Z (dossier, lecture multi-destinations, mémoire, DPGF .xlsx, offre), navigateur de semaine, ticket en photo, photo véhicule, onglet SCR</w:t>
+        <w:t xml:space="preserve">Résumé : Onglet Fourniture (commande, livré, reste, zones à livrer, camions datés) + adresses, détente automatique, contrôle GD, plein écran</w:t>
       </w:r>
     </w:p>
     <w:p>
@@ -15403,7 +19242,7 @@
           <w:sz w:val="20"/>
           <w:szCs w:val="20"/>
         </w:rPr>
-        <w:t xml:space="preserve">Description : 13/10 matin — Commerce : le dossier de A à Z codé d'après la maquette (commerce.js : consultation + tâches, notes de lecture à plusieurs destinations cochables, quantités repérées → chiffrage, mémoire technique (plan SCR, variables du chiffrage, blocs réutilisables, .doc), DPGF (.xlsx du client lu sans bibliothèque, répartition exacte, CSV), offre (pièces, remise, gagnée / perdue), notification J-3) ; e2e_commerce ; 46 suites. Nuit du 12 au 13/10 — navigateur de semaine (Ma semaine, Production par équipe, Planning : jours, aujourd'hui, points, ↺, glisser) ; Outlook : import caché quand relié, « → Outlook » par rendez-vous (.ics) ; note de frais : ticket en photo / import PDF, obligatoire ; flotte : photo du vrai véhicule ; Entreprise → SCR ; maquette-chiffrage.html (dossier → lecture → chiffrage V2B → mémoire → DPGF → offre) ; e2e_onglets 14 points, 44 suites. Livraison précédente (même commit si pas encore poussée) : retours du 12/10 soir — six onglets (Aujourd'hui · Chantiers [Carte / Liste / Équipes &amp; heures / Sécurité] · Moi · Commerce · Parc · Entreprise), Entreprise réduit (annuaire, documents, communication interne publiable, présentation), récap Mes chantiers sous la carte → Bureau (doublon retiré), notes de frais dans Moi, Production par équipe (planning → équipe → personne, objectifs), Variables de paie (rapport RH sans production), Commerce (reporting + traçabilité, devis &amp; chiffrage avec 10 versions, dossiers en cours + tableau de facturation client, terminés), Parc (flotte, magasin / matériel à cadrer), Sécurité → déclarer un accident v1 (+ bouton QSE du chantier, notification RH, traité), Outlook automatique (Edge Function outlook-sync + lien publié, synchro 2 h) ; sql/retours_12-10b.sql ; e2e_onglets ; 44 suites.</w:t>
+        <w:t xml:space="preserve">Description : 13/10 — Onglet Fourniture (fourniture.js) : tracé initial figé, commande importée (Excel / CSV / PDF / collage, relue), comparatif initial · modifs · en plus · besoin · commandé · livré · attendu · reste à livrer · à commander, pièces en plus, zones entourées sur le plan ou reprises du phasage → liste à livrer / à commander + camions datés, annonce dans Stock (zone choisie à l'arrivée), SQL retours_13-10.sql (site_set_part v7). Retours feuille 09-10 : géocodage code postal + ville (IGN) et file d'attente corrigée, détente automatique corrigée (cycle), grands déplacements par personne · mois avec accords figés, plein écran des documents, plus de repas en prévention, trame d'accueil nouvel arrivant. Tests e2e_fourniture, e2e_retours13.</w:t>
       </w:r>
     </w:p>
     <w:sectPr>

</xml_diff>

<commit_message>
Commerce v2 — dossier déballé, lecture des pièces avec surlignage, chiffrage complet (classeur 26.08), paniers, base de prix, DPGF traduite et réécrite dans l’Excel, blocs du mémoire
</commit_message>
<xml_diff>
--- a/app/docs/Feuille_de_route_controle_12-10.docx
+++ b/app/docs/Feuille_de_route_controle_12-10.docx
@@ -29,7 +29,7 @@
           <w:sz w:val="22"/>
           <w:szCs w:val="22"/>
         </w:rPr>
-        <w:t xml:space="preserve">12 octobre 2026 · mise à jour du 13/10 : onglet FOURNITURE (commande, livré, reste, zones à livrer, camions datés) et tes retours de la feuille du 09-10 (adresses, détente automatique, contrôle des grands déplacements, plein écran, trame d'accueil) · puis la nuit du 12/10 : six onglets, Commerce, Parc, Sécurité, accidents, Outlook serveur · nouvelle ventilation, « agir comme », raccourci rapide du planning, « ma semaine », tes commentaires du Word (sections 5 à 9) · une colonne pour tes retours</w:t>
+        <w:t xml:space="preserve">12 octobre 2026 · mise à jour du 13/10 après-midi : COMMERCE v2 (dossier déballé, lecture des pièces avec surlignage, chiffrage complet d'après ton classeur du 26.08, paniers, base de prix, DPGF traduite et réécrite dans l'Excel du client, blocs du mémoire) · le matin : onglet FOURNITURE (commande, livré, reste, zones à livrer, camions datés) et tes retours de la feuille du 09-10 (adresses, détente automatique, contrôle des grands déplacements, plein écran, trame d'accueil) · puis la nuit du 12/10 : six onglets, Commerce, Parc, Sécurité, accidents, Outlook serveur · nouvelle ventilation, « agir comme », raccourci rapide du planning, « ma semaine », tes commentaires du Word (sections 5 à 9) · une colonne pour tes retours</w:t>
       </w:r>
     </w:p>
     <w:p>
@@ -65,7 +65,7 @@
           <w:sz w:val="20"/>
           <w:szCs w:val="20"/>
         </w:rPr>
-        <w:t xml:space="preserve">Même principe que la précédente : tu contrôles ligne par ligne, tu écris dans « Vos commentaires » (OK / à corriger / à changer : quoi), tu me renvoies le fichier. Je corrige à partir de tes commentaires, dans l'ordre du document. Commence par la section I (l'onglet Fourniture, nouveau), puis J (tes retours de la feuille du 09-10 : c'est la seule feuille à suivre désormais — l'ancienne n'est plus livrée), puis H (Commerce de A à Z), G (la nuit) et F (tes retours du 12/10 soir).</w:t>
+        <w:t xml:space="preserve">Même principe que la précédente : tu contrôles ligne par ligne, tu écris dans « Vos commentaires » (OK / à corriger / à changer : quoi), tu me renvoies le fichier. Je corrige à partir de tes commentaires, dans l'ordre du document. Commence par la section K (Commerce v2 : dossier, lecture, chiffrage, DPGF, mémoire — c'est ta demande de l'après-midi), puis I (l'onglet Fourniture), puis J (tes retours de la feuille du 09-10 : c'est la seule feuille à suivre désormais — l'ancienne n'est plus livrée), puis H (Commerce de A à Z), G (la nuit) et F (tes retours du 12/10 soir).</w:t>
       </w:r>
     </w:p>
     <w:p>
@@ -84,7 +84,7 @@
           <w:sz w:val="20"/>
           <w:szCs w:val="20"/>
         </w:rPr>
-        <w:t xml:space="preserve">Build livré : 13/10/2026 · df963c (index.html + traceur.html à la racine du dépôt). Nouveau SQL à passer : retours_13-10.sql (onglet Fourniture, voir ci-dessous). SQL retours_12-10.sql et retours_12-10b.sql passés, fonction outlook-sync déployée et vérifiée par toi le 12/10 au soir (« ça fonctionne parfaitement »). Hors connexion, tout se teste avec les personnages de démo.</w:t>
+        <w:t xml:space="preserve">Build livré : 13/10/2026 · 61e3fc (index.html + traceur.html à la racine du dépôt). Nouveaux SQL à passer : retours_13-10b.sql (base de prix et paniers : registres « prix » et « panier », lecture réservée à l'encadrement / bureau), blocs_memoire_scr.sql (ton mémoire O2410-10 découpé en 10 blocs réutilisables) et, si pas encore fait, retours_13-10.sql (onglet Fourniture). SQL retours_12-10.sql et retours_12-10b.sql passés, fonction outlook-sync déployée et vérifiée par toi le 12/10 au soir (« ça fonctionne parfaitement »). Hors connexion, tout se teste avec les personnages de démo.</w:t>
       </w:r>
     </w:p>
     <w:p>
@@ -103,7 +103,7 @@
           <w:sz w:val="20"/>
           <w:szCs w:val="20"/>
         </w:rPr>
-        <w:t xml:space="preserve">Règle gardée : rien d'ancien n'est supprimé ; 47 suites de tests automatiques passent, dont deux nouvelles : e2e_fourniture (11 points : commande collée, comparatif, pièces en plus, livré lu dans Stock, zone entourée au doigt, zone du phasage, camions datés, annonce et pointage dans Stock, droits, téléphone, lecteur de lignes PDF, zones qui se chevauchent) et e2e_retours13 (n° d'affaire, plein écran, repas, adresses, détente automatique sur 5 semaines, accords, vue par personne, CSV).</w:t>
+        <w:t xml:space="preserve">Règle gardée : rien d'ancien n'est supprimé ; 48 suites de tests automatiques passent, dont e2e_commerce2 (8 étapes : import du classeur, zone et table des DN, SST / purges / contrôles / hydraulique / panier libre, récap et base de prix, dossier déballé, lecture PDF avec surlignage, Word et points techniques, DPGF réécrite dans l'Excel) et deux de la veille : e2e_fourniture (11 points : commande collée, comparatif, pièces en plus, livré lu dans Stock, zone entourée au doigt, zone du phasage, camions datés, annonce et pointage dans Stock, droits, téléphone, lecteur de lignes PDF, zones qui se chevauchent) et e2e_retours13 (n° d'affaire, plein écran, repas, adresses, détente automatique sur 5 semaines, accords, vue par personne, CSV).</w:t>
       </w:r>
     </w:p>
     <w:p>
@@ -300,7 +300,235 @@
                 <w:sz w:val="19"/>
                 <w:szCs w:val="19"/>
               </w:rPr>
-              <w:t xml:space="preserve">app/sql/retours_13-10.sql (NOUVEAU — à passer)</w:t>
+              <w:t xml:space="preserve">app/sql/retours_13-10b.sql (NOUVEAU — à passer)</w:t>
+            </w:r>
+          </w:p>
+        </w:tc>
+        <w:tc>
+          <w:tcPr>
+            <w:tcW w:type="dxa" w:w="8100"/>
+            <w:tcBorders>
+              <w:top w:val="single" w:color="D9D5CB" w:sz="4"/>
+              <w:left w:val="single" w:color="D9D5CB" w:sz="4"/>
+              <w:bottom w:val="single" w:color="D9D5CB" w:sz="4"/>
+              <w:right w:val="single" w:color="D9D5CB" w:sz="4"/>
+            </w:tcBorders>
+            <w:tcMar>
+              <w:top w:type="dxa" w:w="60"/>
+              <w:left w:type="dxa" w:w="90"/>
+              <w:bottom w:type="dxa" w:w="60"/>
+              <w:right w:type="dxa" w:w="90"/>
+            </w:tcMar>
+            <w:vAlign w:val="top"/>
+          </w:tcPr>
+          <w:p>
+            <w:pPr>
+              <w:spacing w:after="40"/>
+            </w:pPr>
+            <w:r>
+              <w:rPr>
+                <w:rFonts w:ascii="Calibri" w:cs="Calibri" w:eastAsia="Calibri" w:hAnsi="Calibri"/>
+                <w:color w:val="14213D"/>
+                <w:sz w:val="19"/>
+                <w:szCs w:val="19"/>
+              </w:rPr>
+              <w:t xml:space="preserve">registre_set accepte deux registres de plus : « prix » (la base de prix SCR importée depuis ton classeur de chiffrage, une seule ligne « base ») et « panier » (les paniers libres SCR). Écriture : encadrement / bureau. LECTURE : prix et paniers ne sont lisibles que par l'encadrement / bureau (un soudeur connecté ne peut pas les lire par l'API) ; les autres registres ne changent pas. Testé sur une base Postgres locale (soudeur refusé en écriture et aveugle en lecture, bureau OK). Sans ce SQL : la base importée reste sur l'appareil (toast « passe le SQL »), le chiffrage marche quand même sur cet appareil.</w:t>
+            </w:r>
+          </w:p>
+        </w:tc>
+        <w:tc>
+          <w:tcPr>
+            <w:tcW w:type="dxa" w:w="3800"/>
+            <w:tcBorders>
+              <w:top w:val="single" w:color="D9D5CB" w:sz="4"/>
+              <w:left w:val="single" w:color="D9D5CB" w:sz="4"/>
+              <w:bottom w:val="single" w:color="D9D5CB" w:sz="4"/>
+              <w:right w:val="single" w:color="D9D5CB" w:sz="4"/>
+            </w:tcBorders>
+            <w:tcMar>
+              <w:top w:type="dxa" w:w="60"/>
+              <w:left w:type="dxa" w:w="90"/>
+              <w:bottom w:type="dxa" w:w="60"/>
+              <w:right w:type="dxa" w:w="90"/>
+            </w:tcMar>
+            <w:vAlign w:val="top"/>
+          </w:tcPr>
+          <w:p>
+            <w:pPr>
+              <w:spacing w:after="40"/>
+            </w:pPr>
+            <w:r>
+              <w:rPr>
+                <w:rFonts w:ascii="Calibri" w:cs="Calibri" w:eastAsia="Calibri" w:hAnsi="Calibri"/>
+                <w:color w:val="14213D"/>
+                <w:sz w:val="20"/>
+                <w:szCs w:val="20"/>
+              </w:rPr>
+              <w:t xml:space="preserve"/>
+            </w:r>
+          </w:p>
+          <w:p>
+            <w:pPr>
+              <w:spacing w:after="40"/>
+            </w:pPr>
+            <w:r>
+              <w:rPr>
+                <w:rFonts w:ascii="Calibri" w:cs="Calibri" w:eastAsia="Calibri" w:hAnsi="Calibri"/>
+                <w:color w:val="14213D"/>
+                <w:sz w:val="20"/>
+                <w:szCs w:val="20"/>
+              </w:rPr>
+              <w:t xml:space="preserve"/>
+            </w:r>
+          </w:p>
+        </w:tc>
+      </w:tr>
+      <w:tr>
+        <w:tc>
+          <w:tcPr>
+            <w:tcW w:type="dxa" w:w="3200"/>
+            <w:tcBorders>
+              <w:top w:val="single" w:color="D9D5CB" w:sz="4"/>
+              <w:left w:val="single" w:color="D9D5CB" w:sz="4"/>
+              <w:bottom w:val="single" w:color="D9D5CB" w:sz="4"/>
+              <w:right w:val="single" w:color="D9D5CB" w:sz="4"/>
+            </w:tcBorders>
+            <w:tcMar>
+              <w:top w:type="dxa" w:w="60"/>
+              <w:left w:type="dxa" w:w="90"/>
+              <w:bottom w:type="dxa" w:w="60"/>
+              <w:right w:type="dxa" w:w="90"/>
+            </w:tcMar>
+            <w:vAlign w:val="top"/>
+          </w:tcPr>
+          <w:p>
+            <w:pPr>
+              <w:spacing w:after="40"/>
+            </w:pPr>
+            <w:r>
+              <w:rPr>
+                <w:rFonts w:ascii="Calibri" w:cs="Calibri" w:eastAsia="Calibri" w:hAnsi="Calibri"/>
+                <w:b/>
+                <w:bCs/>
+                <w:color w:val="14213D"/>
+                <w:sz w:val="19"/>
+                <w:szCs w:val="19"/>
+              </w:rPr>
+              <w:t xml:space="preserve">app/sql/blocs_memoire_scr.sql (NOUVEAU — à passer si tu veux les blocs)</w:t>
+            </w:r>
+          </w:p>
+        </w:tc>
+        <w:tc>
+          <w:tcPr>
+            <w:tcW w:type="dxa" w:w="8100"/>
+            <w:tcBorders>
+              <w:top w:val="single" w:color="D9D5CB" w:sz="4"/>
+              <w:left w:val="single" w:color="D9D5CB" w:sz="4"/>
+              <w:bottom w:val="single" w:color="D9D5CB" w:sz="4"/>
+              <w:right w:val="single" w:color="D9D5CB" w:sz="4"/>
+            </w:tcBorders>
+            <w:tcMar>
+              <w:top w:type="dxa" w:w="60"/>
+              <w:left w:type="dxa" w:w="90"/>
+              <w:bottom w:type="dxa" w:w="60"/>
+              <w:right w:type="dxa" w:w="90"/>
+            </w:tcMar>
+            <w:vAlign w:val="top"/>
+          </w:tcPr>
+          <w:p>
+            <w:pPr>
+              <w:spacing w:after="40"/>
+            </w:pPr>
+            <w:r>
+              <w:rPr>
+                <w:rFonts w:ascii="Calibri" w:cs="Calibri" w:eastAsia="Calibri" w:hAnsi="Calibri"/>
+                <w:color w:val="14213D"/>
+                <w:sz w:val="19"/>
+                <w:szCs w:val="19"/>
+              </w:rPr>
+              <w:t xml:space="preserve">Ton mémoire technique O2410-10 découpé en 10 blocs (présentation de l'entreprise, préambule technique et commercial, documents de référence, méthodologie de réalisation, HSE…) dans la bibliothèque du mémoire (registre « doc », kind « bloc »). Ré-exécutable : un bloc déjà modifié dans l'appli n'est pas écrasé. Les titres sans texte (organigramme, références en images) ne font pas de bloc.</w:t>
+            </w:r>
+          </w:p>
+        </w:tc>
+        <w:tc>
+          <w:tcPr>
+            <w:tcW w:type="dxa" w:w="3800"/>
+            <w:tcBorders>
+              <w:top w:val="single" w:color="D9D5CB" w:sz="4"/>
+              <w:left w:val="single" w:color="D9D5CB" w:sz="4"/>
+              <w:bottom w:val="single" w:color="D9D5CB" w:sz="4"/>
+              <w:right w:val="single" w:color="D9D5CB" w:sz="4"/>
+            </w:tcBorders>
+            <w:tcMar>
+              <w:top w:type="dxa" w:w="60"/>
+              <w:left w:type="dxa" w:w="90"/>
+              <w:bottom w:type="dxa" w:w="60"/>
+              <w:right w:type="dxa" w:w="90"/>
+            </w:tcMar>
+            <w:vAlign w:val="top"/>
+          </w:tcPr>
+          <w:p>
+            <w:pPr>
+              <w:spacing w:after="40"/>
+            </w:pPr>
+            <w:r>
+              <w:rPr>
+                <w:rFonts w:ascii="Calibri" w:cs="Calibri" w:eastAsia="Calibri" w:hAnsi="Calibri"/>
+                <w:color w:val="14213D"/>
+                <w:sz w:val="20"/>
+                <w:szCs w:val="20"/>
+              </w:rPr>
+              <w:t xml:space="preserve"/>
+            </w:r>
+          </w:p>
+          <w:p>
+            <w:pPr>
+              <w:spacing w:after="40"/>
+            </w:pPr>
+            <w:r>
+              <w:rPr>
+                <w:rFonts w:ascii="Calibri" w:cs="Calibri" w:eastAsia="Calibri" w:hAnsi="Calibri"/>
+                <w:color w:val="14213D"/>
+                <w:sz w:val="20"/>
+                <w:szCs w:val="20"/>
+              </w:rPr>
+              <w:t xml:space="preserve"/>
+            </w:r>
+          </w:p>
+        </w:tc>
+      </w:tr>
+      <w:tr>
+        <w:tc>
+          <w:tcPr>
+            <w:tcW w:type="dxa" w:w="3200"/>
+            <w:tcBorders>
+              <w:top w:val="single" w:color="D9D5CB" w:sz="4"/>
+              <w:left w:val="single" w:color="D9D5CB" w:sz="4"/>
+              <w:bottom w:val="single" w:color="D9D5CB" w:sz="4"/>
+              <w:right w:val="single" w:color="D9D5CB" w:sz="4"/>
+            </w:tcBorders>
+            <w:tcMar>
+              <w:top w:type="dxa" w:w="60"/>
+              <w:left w:type="dxa" w:w="90"/>
+              <w:bottom w:type="dxa" w:w="60"/>
+              <w:right w:type="dxa" w:w="90"/>
+            </w:tcMar>
+            <w:vAlign w:val="top"/>
+          </w:tcPr>
+          <w:p>
+            <w:pPr>
+              <w:spacing w:after="40"/>
+            </w:pPr>
+            <w:r>
+              <w:rPr>
+                <w:rFonts w:ascii="Calibri" w:cs="Calibri" w:eastAsia="Calibri" w:hAnsi="Calibri"/>
+                <w:b/>
+                <w:bCs/>
+                <w:color w:val="14213D"/>
+                <w:sz w:val="19"/>
+                <w:szCs w:val="19"/>
+              </w:rPr>
+              <w:t xml:space="preserve">app/sql/retours_13-10.sql (matin — à passer si pas fait)</w:t>
             </w:r>
           </w:p>
         </w:tc>
@@ -12095,6 +12323,2771 @@
           <w:sz w:val="30"/>
           <w:szCs w:val="30"/>
         </w:rPr>
+        <w:t xml:space="preserve">K · COMMERCE v2 — dossier, lecture des pièces, chiffrage complet, DPGF, mémoire (ta demande de l'après-midi)</w:t>
+      </w:r>
+    </w:p>
+    <w:p>
+      <w:pPr>
+        <w:spacing w:after="80" w:line="264"/>
+      </w:pPr>
+      <w:r>
+        <w:rPr>
+          <w:rFonts w:ascii="Calibri" w:cs="Calibri" w:eastAsia="Calibri" w:hAnsi="Calibri"/>
+          <w:color w:val="6B6B66"/>
+          <w:sz w:val="20"/>
+          <w:szCs w:val="20"/>
+        </w:rPr>
+        <w:t xml:space="preserve">« Je suis un peu déçu, la maquette vendait beaucoup plus du rêve » : le zip n'était qu'un lien, pas de visionneuse, chiffrage V2B trop pauvre. Référence : ton classeur « Tableau chiffrage vierge 26.08.2026 » (V42), lu en entier (notice comprise) et porté en moteur de prix. Ni le classeur ni tes prix ne sont dans le dépôt (il est public) : la base de prix s'importe une fois depuis le .xlsm et vit sur le serveur (registre « prix ») et sur les appareils du bureau.</w:t>
+      </w:r>
+    </w:p>
+    <w:tbl>
+      <w:tblPr>
+        <w:tblW w:type="dxa" w:w="15100"/>
+        <w:tblBorders>
+          <w:top w:val="single" w:color="auto" w:sz="4"/>
+          <w:left w:val="single" w:color="auto" w:sz="4"/>
+          <w:bottom w:val="single" w:color="auto" w:sz="4"/>
+          <w:right w:val="single" w:color="auto" w:sz="4"/>
+          <w:insideH w:val="single" w:color="auto" w:sz="4"/>
+          <w:insideV w:val="single" w:color="auto" w:sz="4"/>
+        </w:tblBorders>
+      </w:tblPr>
+      <w:tblGrid>
+        <w:gridCol w:w="2300"/>
+        <w:gridCol w:w="4100"/>
+        <w:gridCol w:w="3700"/>
+        <w:gridCol w:w="1300"/>
+        <w:gridCol w:w="3700"/>
+      </w:tblGrid>
+      <w:tr>
+        <w:trPr>
+          <w:tblHeader/>
+        </w:trPr>
+        <w:tc>
+          <w:tcPr>
+            <w:tcW w:type="dxa" w:w="2300"/>
+            <w:tcBorders>
+              <w:top w:val="single" w:color="D9D5CB" w:sz="4"/>
+              <w:left w:val="single" w:color="D9D5CB" w:sz="4"/>
+              <w:bottom w:val="single" w:color="D9D5CB" w:sz="4"/>
+              <w:right w:val="single" w:color="D9D5CB" w:sz="4"/>
+            </w:tcBorders>
+            <w:shd w:fill="14213D" w:color="auto" w:val="clear"/>
+            <w:tcMar>
+              <w:top w:type="dxa" w:w="60"/>
+              <w:left w:type="dxa" w:w="90"/>
+              <w:bottom w:type="dxa" w:w="60"/>
+              <w:right w:type="dxa" w:w="90"/>
+            </w:tcMar>
+            <w:vAlign w:val="top"/>
+          </w:tcPr>
+          <w:p>
+            <w:pPr>
+              <w:spacing w:after="80" w:line="264"/>
+            </w:pPr>
+            <w:r>
+              <w:rPr>
+                <w:rFonts w:ascii="Calibri" w:cs="Calibri" w:eastAsia="Calibri" w:hAnsi="Calibri"/>
+                <w:b/>
+                <w:bCs/>
+                <w:color w:val="FFFFFF"/>
+                <w:sz w:val="19"/>
+                <w:szCs w:val="19"/>
+              </w:rPr>
+              <w:t xml:space="preserve">Fonctionnalité</w:t>
+            </w:r>
+          </w:p>
+        </w:tc>
+        <w:tc>
+          <w:tcPr>
+            <w:tcW w:type="dxa" w:w="4100"/>
+            <w:tcBorders>
+              <w:top w:val="single" w:color="D9D5CB" w:sz="4"/>
+              <w:left w:val="single" w:color="D9D5CB" w:sz="4"/>
+              <w:bottom w:val="single" w:color="D9D5CB" w:sz="4"/>
+              <w:right w:val="single" w:color="D9D5CB" w:sz="4"/>
+            </w:tcBorders>
+            <w:shd w:fill="14213D" w:color="auto" w:val="clear"/>
+            <w:tcMar>
+              <w:top w:type="dxa" w:w="60"/>
+              <w:left w:type="dxa" w:w="90"/>
+              <w:bottom w:type="dxa" w:w="60"/>
+              <w:right w:type="dxa" w:w="90"/>
+            </w:tcMar>
+            <w:vAlign w:val="top"/>
+          </w:tcPr>
+          <w:p>
+            <w:pPr>
+              <w:spacing w:after="80" w:line="264"/>
+            </w:pPr>
+            <w:r>
+              <w:rPr>
+                <w:rFonts w:ascii="Calibri" w:cs="Calibri" w:eastAsia="Calibri" w:hAnsi="Calibri"/>
+                <w:b/>
+                <w:bCs/>
+                <w:color w:val="FFFFFF"/>
+                <w:sz w:val="19"/>
+                <w:szCs w:val="19"/>
+              </w:rPr>
+              <w:t xml:space="preserve">Où la trouver · comment tester</w:t>
+            </w:r>
+          </w:p>
+        </w:tc>
+        <w:tc>
+          <w:tcPr>
+            <w:tcW w:type="dxa" w:w="3700"/>
+            <w:tcBorders>
+              <w:top w:val="single" w:color="D9D5CB" w:sz="4"/>
+              <w:left w:val="single" w:color="D9D5CB" w:sz="4"/>
+              <w:bottom w:val="single" w:color="D9D5CB" w:sz="4"/>
+              <w:right w:val="single" w:color="D9D5CB" w:sz="4"/>
+            </w:tcBorders>
+            <w:shd w:fill="14213D" w:color="auto" w:val="clear"/>
+            <w:tcMar>
+              <w:top w:type="dxa" w:w="60"/>
+              <w:left w:type="dxa" w:w="90"/>
+              <w:bottom w:type="dxa" w:w="60"/>
+              <w:right w:type="dxa" w:w="90"/>
+            </w:tcMar>
+            <w:vAlign w:val="top"/>
+          </w:tcPr>
+          <w:p>
+            <w:pPr>
+              <w:spacing w:after="80" w:line="264"/>
+            </w:pPr>
+            <w:r>
+              <w:rPr>
+                <w:rFonts w:ascii="Calibri" w:cs="Calibri" w:eastAsia="Calibri" w:hAnsi="Calibri"/>
+                <w:b/>
+                <w:bCs/>
+                <w:color w:val="FFFFFF"/>
+                <w:sz w:val="19"/>
+                <w:szCs w:val="19"/>
+              </w:rPr>
+              <w:t xml:space="preserve">Hypothèses · limites · ce que j'ai tranché</w:t>
+            </w:r>
+          </w:p>
+        </w:tc>
+        <w:tc>
+          <w:tcPr>
+            <w:tcW w:type="dxa" w:w="1300"/>
+            <w:tcBorders>
+              <w:top w:val="single" w:color="D9D5CB" w:sz="4"/>
+              <w:left w:val="single" w:color="D9D5CB" w:sz="4"/>
+              <w:bottom w:val="single" w:color="D9D5CB" w:sz="4"/>
+              <w:right w:val="single" w:color="D9D5CB" w:sz="4"/>
+            </w:tcBorders>
+            <w:shd w:fill="14213D" w:color="auto" w:val="clear"/>
+            <w:tcMar>
+              <w:top w:type="dxa" w:w="60"/>
+              <w:left w:type="dxa" w:w="90"/>
+              <w:bottom w:type="dxa" w:w="60"/>
+              <w:right w:type="dxa" w:w="90"/>
+            </w:tcMar>
+            <w:vAlign w:val="top"/>
+          </w:tcPr>
+          <w:p>
+            <w:pPr>
+              <w:spacing w:after="80" w:line="264"/>
+            </w:pPr>
+            <w:r>
+              <w:rPr>
+                <w:rFonts w:ascii="Calibri" w:cs="Calibri" w:eastAsia="Calibri" w:hAnsi="Calibri"/>
+                <w:b/>
+                <w:bCs/>
+                <w:color w:val="FFFFFF"/>
+                <w:sz w:val="19"/>
+                <w:szCs w:val="19"/>
+              </w:rPr>
+              <w:t xml:space="preserve">Statut</w:t>
+            </w:r>
+          </w:p>
+        </w:tc>
+        <w:tc>
+          <w:tcPr>
+            <w:tcW w:type="dxa" w:w="3700"/>
+            <w:tcBorders>
+              <w:top w:val="single" w:color="D9D5CB" w:sz="4"/>
+              <w:left w:val="single" w:color="D9D5CB" w:sz="4"/>
+              <w:bottom w:val="single" w:color="D9D5CB" w:sz="4"/>
+              <w:right w:val="single" w:color="D9D5CB" w:sz="4"/>
+            </w:tcBorders>
+            <w:shd w:fill="14213D" w:color="auto" w:val="clear"/>
+            <w:tcMar>
+              <w:top w:type="dxa" w:w="60"/>
+              <w:left w:type="dxa" w:w="90"/>
+              <w:bottom w:type="dxa" w:w="60"/>
+              <w:right w:type="dxa" w:w="90"/>
+            </w:tcMar>
+            <w:vAlign w:val="top"/>
+          </w:tcPr>
+          <w:p>
+            <w:pPr>
+              <w:spacing w:after="80" w:line="264"/>
+            </w:pPr>
+            <w:r>
+              <w:rPr>
+                <w:rFonts w:ascii="Calibri" w:cs="Calibri" w:eastAsia="Calibri" w:hAnsi="Calibri"/>
+                <w:b/>
+                <w:bCs/>
+                <w:color w:val="FFFFFF"/>
+                <w:sz w:val="19"/>
+                <w:szCs w:val="19"/>
+              </w:rPr>
+              <w:t xml:space="preserve">Vos commentaires</w:t>
+            </w:r>
+          </w:p>
+        </w:tc>
+      </w:tr>
+      <w:tr>
+        <w:tc>
+          <w:tcPr>
+            <w:tcW w:type="dxa" w:w="2300"/>
+            <w:tcBorders>
+              <w:top w:val="single" w:color="D9D5CB" w:sz="4"/>
+              <w:left w:val="single" w:color="D9D5CB" w:sz="4"/>
+              <w:bottom w:val="single" w:color="D9D5CB" w:sz="4"/>
+              <w:right w:val="single" w:color="D9D5CB" w:sz="4"/>
+            </w:tcBorders>
+            <w:tcMar>
+              <w:top w:type="dxa" w:w="60"/>
+              <w:left w:type="dxa" w:w="90"/>
+              <w:bottom w:type="dxa" w:w="60"/>
+              <w:right w:type="dxa" w:w="90"/>
+            </w:tcMar>
+            <w:vAlign w:val="top"/>
+          </w:tcPr>
+          <w:p>
+            <w:pPr>
+              <w:spacing w:after="40"/>
+            </w:pPr>
+            <w:r>
+              <w:rPr>
+                <w:rFonts w:ascii="Calibri" w:cs="Calibri" w:eastAsia="Calibri" w:hAnsi="Calibri"/>
+                <w:b/>
+                <w:bCs/>
+                <w:color w:val="14213D"/>
+                <w:sz w:val="20"/>
+                <w:szCs w:val="20"/>
+              </w:rPr>
+              <w:t xml:space="preserve">Base de prix : importer ton classeur</w:t>
+            </w:r>
+          </w:p>
+        </w:tc>
+        <w:tc>
+          <w:tcPr>
+            <w:tcW w:type="dxa" w:w="4100"/>
+            <w:tcBorders>
+              <w:top w:val="single" w:color="D9D5CB" w:sz="4"/>
+              <w:left w:val="single" w:color="D9D5CB" w:sz="4"/>
+              <w:bottom w:val="single" w:color="D9D5CB" w:sz="4"/>
+              <w:right w:val="single" w:color="D9D5CB" w:sz="4"/>
+            </w:tcBorders>
+            <w:tcMar>
+              <w:top w:type="dxa" w:w="60"/>
+              <w:left w:type="dxa" w:w="90"/>
+              <w:bottom w:type="dxa" w:w="60"/>
+              <w:right w:type="dxa" w:w="90"/>
+            </w:tcMar>
+            <w:vAlign w:val="top"/>
+          </w:tcPr>
+          <w:p>
+            <w:pPr>
+              <w:spacing w:after="40"/>
+            </w:pPr>
+            <w:r>
+              <w:rPr>
+                <w:rFonts w:ascii="Calibri" w:cs="Calibri" w:eastAsia="Calibri" w:hAnsi="Calibri"/>
+                <w:color w:val="14213D"/>
+                <w:sz w:val="19"/>
+                <w:szCs w:val="19"/>
+              </w:rPr>
+              <w:t xml:space="preserve">Commerce → affaire → 3 · Chiffrage → bandeau « Importer le classeur de chiffrage (.xlsm) » (ou ⚙ Base de prix → Import). Lit Base MO (taux par poste, équipes S / S+T / S+T+P / M / M+M / OS, cadences par DN soudure et manchons thermo / électro × iso 1-2-3 × 1 ou 2 manchonneurs, minutes d'autocontrôle, coussins, DOE / carnet / plan iso), Base FO (toutes les tables FO_* et ~110 paramètres FO_*), Base Opération (paniers par DN : purge, vidanges, 7 SST, 4 raccordements, by-pass / fonds bombés, extrusion, déchargement, calo, colliers, découpe, by-pass sur purge) et la date du suivi d'actualisation. Toast « Base de prix importée : V42 · 18 DN · 14 paniers · 110 paramètres ».</w:t>
+            </w:r>
+          </w:p>
+        </w:tc>
+        <w:tc>
+          <w:tcPr>
+            <w:tcW w:type="dxa" w:w="3700"/>
+            <w:tcBorders>
+              <w:top w:val="single" w:color="D9D5CB" w:sz="4"/>
+              <w:left w:val="single" w:color="D9D5CB" w:sz="4"/>
+              <w:bottom w:val="single" w:color="D9D5CB" w:sz="4"/>
+              <w:right w:val="single" w:color="D9D5CB" w:sz="4"/>
+            </w:tcBorders>
+            <w:tcMar>
+              <w:top w:type="dxa" w:w="60"/>
+              <w:left w:type="dxa" w:w="90"/>
+              <w:bottom w:type="dxa" w:w="60"/>
+              <w:right w:type="dxa" w:w="90"/>
+            </w:tcMar>
+            <w:vAlign w:val="top"/>
+          </w:tcPr>
+          <w:p>
+            <w:pPr>
+              <w:spacing w:after="40"/>
+            </w:pPr>
+            <w:r>
+              <w:rPr>
+                <w:rFonts w:ascii="Calibri" w:cs="Calibri" w:eastAsia="Calibri" w:hAnsi="Calibri"/>
+                <w:color w:val="14213D"/>
+                <w:sz w:val="19"/>
+                <w:szCs w:val="19"/>
+              </w:rPr>
+              <w:t xml:space="preserve">Vérifié en Node sur ton vrai classeur, prix pour prix : SST BS PN25 DN50 = 971 €, PAP PN40 DN50 = 1 837, boîtiers 108, by-pass sur purge 554,52, insertion de tés DN20 = 3 420, piquage DN32 = 2 126,28, extrusion Ø110 manchons 572 / PEC 1 508, forfait radio 120 km = 1 260 et 600 km = 3 730, film DN100 = 115, vidange gravité DN50 = 893,16, purge DN32 = 1 466,23 (808,83 sans purgeur ni tés). Les heures d'un panier = k × heures/jour ÷ cadence et les fournitures = les VLOOKUP de ton classeur relus : changer un taux ou un prix dans la base se répercute dans tous les paniers. Réimporter remplace tout, sauf tes écrasements à la main.</w:t>
+            </w:r>
+          </w:p>
+        </w:tc>
+        <w:tc>
+          <w:tcPr>
+            <w:tcW w:type="dxa" w:w="1300"/>
+            <w:tcBorders>
+              <w:top w:val="single" w:color="D9D5CB" w:sz="4"/>
+              <w:left w:val="single" w:color="D9D5CB" w:sz="4"/>
+              <w:bottom w:val="single" w:color="D9D5CB" w:sz="4"/>
+              <w:right w:val="single" w:color="D9D5CB" w:sz="4"/>
+            </w:tcBorders>
+            <w:shd w:fill="E6F5EC" w:color="auto" w:val="clear"/>
+            <w:tcMar>
+              <w:top w:type="dxa" w:w="60"/>
+              <w:left w:type="dxa" w:w="90"/>
+              <w:bottom w:type="dxa" w:w="60"/>
+              <w:right w:type="dxa" w:w="90"/>
+            </w:tcMar>
+            <w:vAlign w:val="top"/>
+          </w:tcPr>
+          <w:p>
+            <w:pPr>
+              <w:spacing w:after="40"/>
+            </w:pPr>
+            <w:r>
+              <w:rPr>
+                <w:rFonts w:ascii="Calibri" w:cs="Calibri" w:eastAsia="Calibri" w:hAnsi="Calibri"/>
+                <w:b/>
+                <w:bCs/>
+                <w:color w:val="14213D"/>
+                <w:sz w:val="19"/>
+                <w:szCs w:val="19"/>
+              </w:rPr>
+              <w:t xml:space="preserve">Fait</w:t>
+            </w:r>
+          </w:p>
+        </w:tc>
+        <w:tc>
+          <w:tcPr>
+            <w:tcW w:type="dxa" w:w="3700"/>
+            <w:tcBorders>
+              <w:top w:val="single" w:color="D9D5CB" w:sz="4"/>
+              <w:left w:val="single" w:color="D9D5CB" w:sz="4"/>
+              <w:bottom w:val="single" w:color="D9D5CB" w:sz="4"/>
+              <w:right w:val="single" w:color="D9D5CB" w:sz="4"/>
+            </w:tcBorders>
+            <w:tcMar>
+              <w:top w:type="dxa" w:w="60"/>
+              <w:left w:type="dxa" w:w="90"/>
+              <w:bottom w:type="dxa" w:w="60"/>
+              <w:right w:type="dxa" w:w="90"/>
+            </w:tcMar>
+            <w:vAlign w:val="top"/>
+          </w:tcPr>
+          <w:p>
+            <w:pPr>
+              <w:spacing w:after="40"/>
+            </w:pPr>
+            <w:r>
+              <w:rPr>
+                <w:rFonts w:ascii="Calibri" w:cs="Calibri" w:eastAsia="Calibri" w:hAnsi="Calibri"/>
+                <w:color w:val="14213D"/>
+                <w:sz w:val="20"/>
+                <w:szCs w:val="20"/>
+              </w:rPr>
+              <w:t xml:space="preserve"/>
+            </w:r>
+          </w:p>
+          <w:p>
+            <w:pPr>
+              <w:spacing w:after="40"/>
+            </w:pPr>
+            <w:r>
+              <w:rPr>
+                <w:rFonts w:ascii="Calibri" w:cs="Calibri" w:eastAsia="Calibri" w:hAnsi="Calibri"/>
+                <w:color w:val="14213D"/>
+                <w:sz w:val="20"/>
+                <w:szCs w:val="20"/>
+              </w:rPr>
+              <w:t xml:space="preserve"/>
+            </w:r>
+          </w:p>
+        </w:tc>
+      </w:tr>
+      <w:tr>
+        <w:tc>
+          <w:tcPr>
+            <w:tcW w:type="dxa" w:w="2300"/>
+            <w:tcBorders>
+              <w:top w:val="single" w:color="D9D5CB" w:sz="4"/>
+              <w:left w:val="single" w:color="D9D5CB" w:sz="4"/>
+              <w:bottom w:val="single" w:color="D9D5CB" w:sz="4"/>
+              <w:right w:val="single" w:color="D9D5CB" w:sz="4"/>
+            </w:tcBorders>
+            <w:tcMar>
+              <w:top w:type="dxa" w:w="60"/>
+              <w:left w:type="dxa" w:w="90"/>
+              <w:bottom w:type="dxa" w:w="60"/>
+              <w:right w:type="dxa" w:w="90"/>
+            </w:tcMar>
+            <w:vAlign w:val="top"/>
+          </w:tcPr>
+          <w:p>
+            <w:pPr>
+              <w:spacing w:after="40"/>
+            </w:pPr>
+            <w:r>
+              <w:rPr>
+                <w:rFonts w:ascii="Calibri" w:cs="Calibri" w:eastAsia="Calibri" w:hAnsi="Calibri"/>
+                <w:b/>
+                <w:bCs/>
+                <w:color w:val="14213D"/>
+                <w:sz w:val="20"/>
+                <w:szCs w:val="20"/>
+              </w:rPr>
+              <w:t xml:space="preserve">Base de prix : éditable dans l'appli</w:t>
+            </w:r>
+          </w:p>
+        </w:tc>
+        <w:tc>
+          <w:tcPr>
+            <w:tcW w:type="dxa" w:w="4100"/>
+            <w:tcBorders>
+              <w:top w:val="single" w:color="D9D5CB" w:sz="4"/>
+              <w:left w:val="single" w:color="D9D5CB" w:sz="4"/>
+              <w:bottom w:val="single" w:color="D9D5CB" w:sz="4"/>
+              <w:right w:val="single" w:color="D9D5CB" w:sz="4"/>
+            </w:tcBorders>
+            <w:tcMar>
+              <w:top w:type="dxa" w:w="60"/>
+              <w:left w:type="dxa" w:w="90"/>
+              <w:bottom w:type="dxa" w:w="60"/>
+              <w:right w:type="dxa" w:w="90"/>
+            </w:tcMar>
+            <w:vAlign w:val="top"/>
+          </w:tcPr>
+          <w:p>
+            <w:pPr>
+              <w:spacing w:after="40"/>
+            </w:pPr>
+            <w:r>
+              <w:rPr>
+                <w:rFonts w:ascii="Calibri" w:cs="Calibri" w:eastAsia="Calibri" w:hAnsi="Calibri"/>
+                <w:color w:val="14213D"/>
+                <w:sz w:val="19"/>
+                <w:szCs w:val="19"/>
+              </w:rPr>
+              <w:t xml:space="preserve">3 · Chiffrage → ⚙ Base de prix : Main-d'œuvre (taux par poste, composition des équipes, cadences par DN), Fournitures (une table nommée à la fois, cases modifiables), Sous-traitance (forfaits par distance, films par tranche de DN, paramètres hydrauliques), Paramètres (filtre texte), Import (version, date, qui a importé / modifié).</w:t>
+            </w:r>
+          </w:p>
+        </w:tc>
+        <w:tc>
+          <w:tcPr>
+            <w:tcW w:type="dxa" w:w="3700"/>
+            <w:tcBorders>
+              <w:top w:val="single" w:color="D9D5CB" w:sz="4"/>
+              <w:left w:val="single" w:color="D9D5CB" w:sz="4"/>
+              <w:bottom w:val="single" w:color="D9D5CB" w:sz="4"/>
+              <w:right w:val="single" w:color="D9D5CB" w:sz="4"/>
+            </w:tcBorders>
+            <w:tcMar>
+              <w:top w:type="dxa" w:w="60"/>
+              <w:left w:type="dxa" w:w="90"/>
+              <w:bottom w:type="dxa" w:w="60"/>
+              <w:right w:type="dxa" w:w="90"/>
+            </w:tcMar>
+            <w:vAlign w:val="top"/>
+          </w:tcPr>
+          <w:p>
+            <w:pPr>
+              <w:spacing w:after="40"/>
+            </w:pPr>
+            <w:r>
+              <w:rPr>
+                <w:rFonts w:ascii="Calibri" w:cs="Calibri" w:eastAsia="Calibri" w:hAnsi="Calibri"/>
+                <w:color w:val="14213D"/>
+                <w:sz w:val="19"/>
+                <w:szCs w:val="19"/>
+              </w:rPr>
+              <w:t xml:space="preserve">Une valeur modifiée est enregistrée dans le registre (serveur si connecté, sinon rejouée) et tout le chiffrage se recalcule. Taux soudeur 64 → 70 : le prix du pouce bouge partout.</w:t>
+            </w:r>
+          </w:p>
+        </w:tc>
+        <w:tc>
+          <w:tcPr>
+            <w:tcW w:type="dxa" w:w="1300"/>
+            <w:tcBorders>
+              <w:top w:val="single" w:color="D9D5CB" w:sz="4"/>
+              <w:left w:val="single" w:color="D9D5CB" w:sz="4"/>
+              <w:bottom w:val="single" w:color="D9D5CB" w:sz="4"/>
+              <w:right w:val="single" w:color="D9D5CB" w:sz="4"/>
+            </w:tcBorders>
+            <w:shd w:fill="E6F5EC" w:color="auto" w:val="clear"/>
+            <w:tcMar>
+              <w:top w:type="dxa" w:w="60"/>
+              <w:left w:type="dxa" w:w="90"/>
+              <w:bottom w:type="dxa" w:w="60"/>
+              <w:right w:type="dxa" w:w="90"/>
+            </w:tcMar>
+            <w:vAlign w:val="top"/>
+          </w:tcPr>
+          <w:p>
+            <w:pPr>
+              <w:spacing w:after="40"/>
+            </w:pPr>
+            <w:r>
+              <w:rPr>
+                <w:rFonts w:ascii="Calibri" w:cs="Calibri" w:eastAsia="Calibri" w:hAnsi="Calibri"/>
+                <w:b/>
+                <w:bCs/>
+                <w:color w:val="14213D"/>
+                <w:sz w:val="19"/>
+                <w:szCs w:val="19"/>
+              </w:rPr>
+              <w:t xml:space="preserve">Fait</w:t>
+            </w:r>
+          </w:p>
+        </w:tc>
+        <w:tc>
+          <w:tcPr>
+            <w:tcW w:type="dxa" w:w="3700"/>
+            <w:tcBorders>
+              <w:top w:val="single" w:color="D9D5CB" w:sz="4"/>
+              <w:left w:val="single" w:color="D9D5CB" w:sz="4"/>
+              <w:bottom w:val="single" w:color="D9D5CB" w:sz="4"/>
+              <w:right w:val="single" w:color="D9D5CB" w:sz="4"/>
+            </w:tcBorders>
+            <w:tcMar>
+              <w:top w:type="dxa" w:w="60"/>
+              <w:left w:type="dxa" w:w="90"/>
+              <w:bottom w:type="dxa" w:w="60"/>
+              <w:right w:type="dxa" w:w="90"/>
+            </w:tcMar>
+            <w:vAlign w:val="top"/>
+          </w:tcPr>
+          <w:p>
+            <w:pPr>
+              <w:spacing w:after="40"/>
+            </w:pPr>
+            <w:r>
+              <w:rPr>
+                <w:rFonts w:ascii="Calibri" w:cs="Calibri" w:eastAsia="Calibri" w:hAnsi="Calibri"/>
+                <w:color w:val="14213D"/>
+                <w:sz w:val="20"/>
+                <w:szCs w:val="20"/>
+              </w:rPr>
+              <w:t xml:space="preserve"/>
+            </w:r>
+          </w:p>
+          <w:p>
+            <w:pPr>
+              <w:spacing w:after="40"/>
+            </w:pPr>
+            <w:r>
+              <w:rPr>
+                <w:rFonts w:ascii="Calibri" w:cs="Calibri" w:eastAsia="Calibri" w:hAnsi="Calibri"/>
+                <w:color w:val="14213D"/>
+                <w:sz w:val="20"/>
+                <w:szCs w:val="20"/>
+              </w:rPr>
+              <w:t xml:space="preserve"/>
+            </w:r>
+          </w:p>
+        </w:tc>
+      </w:tr>
+      <w:tr>
+        <w:tc>
+          <w:tcPr>
+            <w:tcW w:type="dxa" w:w="2300"/>
+            <w:tcBorders>
+              <w:top w:val="single" w:color="D9D5CB" w:sz="4"/>
+              <w:left w:val="single" w:color="D9D5CB" w:sz="4"/>
+              <w:bottom w:val="single" w:color="D9D5CB" w:sz="4"/>
+              <w:right w:val="single" w:color="D9D5CB" w:sz="4"/>
+            </w:tcBorders>
+            <w:tcMar>
+              <w:top w:type="dxa" w:w="60"/>
+              <w:left w:type="dxa" w:w="90"/>
+              <w:bottom w:type="dxa" w:w="60"/>
+              <w:right w:type="dxa" w:w="90"/>
+            </w:tcMar>
+            <w:vAlign w:val="top"/>
+          </w:tcPr>
+          <w:p>
+            <w:pPr>
+              <w:spacing w:after="40"/>
+            </w:pPr>
+            <w:r>
+              <w:rPr>
+                <w:rFonts w:ascii="Calibri" w:cs="Calibri" w:eastAsia="Calibri" w:hAnsi="Calibri"/>
+                <w:b/>
+                <w:bCs/>
+                <w:color w:val="14213D"/>
+                <w:sz w:val="20"/>
+                <w:szCs w:val="20"/>
+              </w:rPr>
+              <w:t xml:space="preserve">Chiffrage : une zone = un onglet, comme ton classeur</w:t>
+            </w:r>
+          </w:p>
+        </w:tc>
+        <w:tc>
+          <w:tcPr>
+            <w:tcW w:type="dxa" w:w="4100"/>
+            <w:tcBorders>
+              <w:top w:val="single" w:color="D9D5CB" w:sz="4"/>
+              <w:left w:val="single" w:color="D9D5CB" w:sz="4"/>
+              <w:bottom w:val="single" w:color="D9D5CB" w:sz="4"/>
+              <w:right w:val="single" w:color="D9D5CB" w:sz="4"/>
+            </w:tcBorders>
+            <w:tcMar>
+              <w:top w:type="dxa" w:w="60"/>
+              <w:left w:type="dxa" w:w="90"/>
+              <w:bottom w:type="dxa" w:w="60"/>
+              <w:right w:type="dxa" w:w="90"/>
+            </w:tcMar>
+            <w:vAlign w:val="top"/>
+          </w:tcPr>
+          <w:p>
+            <w:pPr>
+              <w:spacing w:after="40"/>
+            </w:pPr>
+            <w:r>
+              <w:rPr>
+                <w:rFonts w:ascii="Calibri" w:cs="Calibri" w:eastAsia="Calibri" w:hAnsi="Calibri"/>
+                <w:color w:val="14213D"/>
+                <w:sz w:val="19"/>
+                <w:szCs w:val="19"/>
+              </w:rPr>
+              <w:t xml:space="preserve">3 · Chiffrage : chips « Zone 1 · 55 k€ », ➕ zone, Dupliquer, Retirer. Une zone = cartes repliables (▸ / ▾, interrupteur, sous-total à droite) : Chantier et période (dates, type, isolation, WC / conteneur / benne / pelle / amené-repli / transfert / bardage / DOE / carnet) · Équipes, manchons, autocontrôle · Table des DN (soudures, ml, antenne / feeder, cadence, € / pouce, soudure €, € / manchon, manchons €, jours) · Purges · Vidanges · Vannes préisolées · SST (type selon le DN) · Raccordement · Contrôles CND (radio / US / ressuage : % antennes, % feeders, films par vacation, raccordements, km) · Hydraulique (3 zones de cubatures DN × ml ; épreuve, rinçage, passivation, eau adoucie, conservation ; devis sous-traité possible) · Extrusion · Nuit · Boulet mousse · Aérien (supports, calo, pose, acier nu) · Dépose · Fonçage (ml, jours, colliers, radio) · Fourniture préisolée · Fournitures et prestations diverses (panier sur mesure avec les pièces de la base au prix du DN) · Paniers libres.</w:t>
+            </w:r>
+          </w:p>
+        </w:tc>
+        <w:tc>
+          <w:tcPr>
+            <w:tcW w:type="dxa" w:w="3700"/>
+            <w:tcBorders>
+              <w:top w:val="single" w:color="D9D5CB" w:sz="4"/>
+              <w:left w:val="single" w:color="D9D5CB" w:sz="4"/>
+              <w:bottom w:val="single" w:color="D9D5CB" w:sz="4"/>
+              <w:right w:val="single" w:color="D9D5CB" w:sz="4"/>
+            </w:tcBorders>
+            <w:tcMar>
+              <w:top w:type="dxa" w:w="60"/>
+              <w:left w:type="dxa" w:w="90"/>
+              <w:bottom w:type="dxa" w:w="60"/>
+              <w:right w:type="dxa" w:w="90"/>
+            </w:tcMar>
+            <w:vAlign w:val="top"/>
+          </w:tcPr>
+          <w:p>
+            <w:pPr>
+              <w:spacing w:after="40"/>
+            </w:pPr>
+            <w:r>
+              <w:rPr>
+                <w:rFonts w:ascii="Calibri" w:cs="Calibri" w:eastAsia="Calibri" w:hAnsi="Calibri"/>
+                <w:color w:val="14213D"/>
+                <w:sz w:val="19"/>
+                <w:szCs w:val="19"/>
+              </w:rPr>
+              <w:t xml:space="preserve">Mêmes formules que les onglets « Soudure » du classeur (prix du pouce = coût / jour équipe ÷ (cadence × pouce), manchon = coût / jour ÷ cadence ajustée des contrôles, purges déportées 4 soudures / paire, étiquettes, DOE, nuit = nuits × coût nuit − jours × coût jour…). Tout est modifiable à la main : rien n'est figé par le préremplissage. Sur téléphone : une colonne, ça reste lisible.</w:t>
+            </w:r>
+          </w:p>
+        </w:tc>
+        <w:tc>
+          <w:tcPr>
+            <w:tcW w:type="dxa" w:w="1300"/>
+            <w:tcBorders>
+              <w:top w:val="single" w:color="D9D5CB" w:sz="4"/>
+              <w:left w:val="single" w:color="D9D5CB" w:sz="4"/>
+              <w:bottom w:val="single" w:color="D9D5CB" w:sz="4"/>
+              <w:right w:val="single" w:color="D9D5CB" w:sz="4"/>
+            </w:tcBorders>
+            <w:shd w:fill="E6F5EC" w:color="auto" w:val="clear"/>
+            <w:tcMar>
+              <w:top w:type="dxa" w:w="60"/>
+              <w:left w:type="dxa" w:w="90"/>
+              <w:bottom w:type="dxa" w:w="60"/>
+              <w:right w:type="dxa" w:w="90"/>
+            </w:tcMar>
+            <w:vAlign w:val="top"/>
+          </w:tcPr>
+          <w:p>
+            <w:pPr>
+              <w:spacing w:after="40"/>
+            </w:pPr>
+            <w:r>
+              <w:rPr>
+                <w:rFonts w:ascii="Calibri" w:cs="Calibri" w:eastAsia="Calibri" w:hAnsi="Calibri"/>
+                <w:b/>
+                <w:bCs/>
+                <w:color w:val="14213D"/>
+                <w:sz w:val="19"/>
+                <w:szCs w:val="19"/>
+              </w:rPr>
+              <w:t xml:space="preserve">Fait</w:t>
+            </w:r>
+          </w:p>
+        </w:tc>
+        <w:tc>
+          <w:tcPr>
+            <w:tcW w:type="dxa" w:w="3700"/>
+            <w:tcBorders>
+              <w:top w:val="single" w:color="D9D5CB" w:sz="4"/>
+              <w:left w:val="single" w:color="D9D5CB" w:sz="4"/>
+              <w:bottom w:val="single" w:color="D9D5CB" w:sz="4"/>
+              <w:right w:val="single" w:color="D9D5CB" w:sz="4"/>
+            </w:tcBorders>
+            <w:tcMar>
+              <w:top w:type="dxa" w:w="60"/>
+              <w:left w:type="dxa" w:w="90"/>
+              <w:bottom w:type="dxa" w:w="60"/>
+              <w:right w:type="dxa" w:w="90"/>
+            </w:tcMar>
+            <w:vAlign w:val="top"/>
+          </w:tcPr>
+          <w:p>
+            <w:pPr>
+              <w:spacing w:after="40"/>
+            </w:pPr>
+            <w:r>
+              <w:rPr>
+                <w:rFonts w:ascii="Calibri" w:cs="Calibri" w:eastAsia="Calibri" w:hAnsi="Calibri"/>
+                <w:color w:val="14213D"/>
+                <w:sz w:val="20"/>
+                <w:szCs w:val="20"/>
+              </w:rPr>
+              <w:t xml:space="preserve"/>
+            </w:r>
+          </w:p>
+          <w:p>
+            <w:pPr>
+              <w:spacing w:after="40"/>
+            </w:pPr>
+            <w:r>
+              <w:rPr>
+                <w:rFonts w:ascii="Calibri" w:cs="Calibri" w:eastAsia="Calibri" w:hAnsi="Calibri"/>
+                <w:color w:val="14213D"/>
+                <w:sz w:val="20"/>
+                <w:szCs w:val="20"/>
+              </w:rPr>
+              <w:t xml:space="preserve"/>
+            </w:r>
+          </w:p>
+        </w:tc>
+      </w:tr>
+      <w:tr>
+        <w:tc>
+          <w:tcPr>
+            <w:tcW w:type="dxa" w:w="2300"/>
+            <w:tcBorders>
+              <w:top w:val="single" w:color="D9D5CB" w:sz="4"/>
+              <w:left w:val="single" w:color="D9D5CB" w:sz="4"/>
+              <w:bottom w:val="single" w:color="D9D5CB" w:sz="4"/>
+              <w:right w:val="single" w:color="D9D5CB" w:sz="4"/>
+            </w:tcBorders>
+            <w:tcMar>
+              <w:top w:type="dxa" w:w="60"/>
+              <w:left w:type="dxa" w:w="90"/>
+              <w:bottom w:type="dxa" w:w="60"/>
+              <w:right w:type="dxa" w:w="90"/>
+            </w:tcMar>
+            <w:vAlign w:val="top"/>
+          </w:tcPr>
+          <w:p>
+            <w:pPr>
+              <w:spacing w:after="40"/>
+            </w:pPr>
+            <w:r>
+              <w:rPr>
+                <w:rFonts w:ascii="Calibri" w:cs="Calibri" w:eastAsia="Calibri" w:hAnsi="Calibri"/>
+                <w:b/>
+                <w:bCs/>
+                <w:color w:val="14213D"/>
+                <w:sz w:val="20"/>
+                <w:szCs w:val="20"/>
+              </w:rPr>
+              <w:t xml:space="preserve">Récap des zones et vue par catégorie</w:t>
+            </w:r>
+          </w:p>
+        </w:tc>
+        <w:tc>
+          <w:tcPr>
+            <w:tcW w:type="dxa" w:w="4100"/>
+            <w:tcBorders>
+              <w:top w:val="single" w:color="D9D5CB" w:sz="4"/>
+              <w:left w:val="single" w:color="D9D5CB" w:sz="4"/>
+              <w:bottom w:val="single" w:color="D9D5CB" w:sz="4"/>
+              <w:right w:val="single" w:color="D9D5CB" w:sz="4"/>
+            </w:tcBorders>
+            <w:tcMar>
+              <w:top w:type="dxa" w:w="60"/>
+              <w:left w:type="dxa" w:w="90"/>
+              <w:bottom w:type="dxa" w:w="60"/>
+              <w:right w:type="dxa" w:w="90"/>
+            </w:tcMar>
+            <w:vAlign w:val="top"/>
+          </w:tcPr>
+          <w:p>
+            <w:pPr>
+              <w:spacing w:after="40"/>
+            </w:pPr>
+            <w:r>
+              <w:rPr>
+                <w:rFonts w:ascii="Calibri" w:cs="Calibri" w:eastAsia="Calibri" w:hAnsi="Calibri"/>
+                <w:color w:val="14213D"/>
+                <w:sz w:val="19"/>
+                <w:szCs w:val="19"/>
+              </w:rPr>
+              <w:t xml:space="preserve">3 · Chiffrage → Σ Récap : les postes chiffrés (ou « les 39 postes du Récap ») × zones, achat, vente, € / ml, case « hors » (poste hors prix au ml : fourniture préisolée, dépose…), marge (%) et RCFA (%) modifiables (RCFA vide = selon le client : Coriance 5, Engie 4, Dalkia 3…), prix d'achat, marge €, RCFA €, prix de vente HT, € / ml et € / ml hors postes « hors », coefficient. Par catégorie : main-d'œuvre / fournitures / sous-traitance / location-frais, barres et tableau. 🖨 fiche de chiffrage (zones + récap), ⬇ CSV.</w:t>
+            </w:r>
+          </w:p>
+        </w:tc>
+        <w:tc>
+          <w:tcPr>
+            <w:tcW w:type="dxa" w:w="3700"/>
+            <w:tcBorders>
+              <w:top w:val="single" w:color="D9D5CB" w:sz="4"/>
+              <w:left w:val="single" w:color="D9D5CB" w:sz="4"/>
+              <w:bottom w:val="single" w:color="D9D5CB" w:sz="4"/>
+              <w:right w:val="single" w:color="D9D5CB" w:sz="4"/>
+            </w:tcBorders>
+            <w:tcMar>
+              <w:top w:type="dxa" w:w="60"/>
+              <w:left w:type="dxa" w:w="90"/>
+              <w:bottom w:type="dxa" w:w="60"/>
+              <w:right w:type="dxa" w:w="90"/>
+            </w:tcMar>
+            <w:vAlign w:val="top"/>
+          </w:tcPr>
+          <w:p>
+            <w:pPr>
+              <w:spacing w:after="40"/>
+            </w:pPr>
+            <w:r>
+              <w:rPr>
+                <w:rFonts w:ascii="Calibri" w:cs="Calibri" w:eastAsia="Calibri" w:hAnsi="Calibri"/>
+                <w:color w:val="14213D"/>
+                <w:sz w:val="19"/>
+                <w:szCs w:val="19"/>
+              </w:rPr>
+              <w:t xml:space="preserve">Vente = achat ÷ (1 − (RCFA + marge)), marge 12,5 % par défaut, comme ton Récap Prix. L'en-tête de la fiche affaire montre le prix de vente HT ; l'offre, la DPGF et le mémoire lisent ce total.</w:t>
+            </w:r>
+          </w:p>
+        </w:tc>
+        <w:tc>
+          <w:tcPr>
+            <w:tcW w:type="dxa" w:w="1300"/>
+            <w:tcBorders>
+              <w:top w:val="single" w:color="D9D5CB" w:sz="4"/>
+              <w:left w:val="single" w:color="D9D5CB" w:sz="4"/>
+              <w:bottom w:val="single" w:color="D9D5CB" w:sz="4"/>
+              <w:right w:val="single" w:color="D9D5CB" w:sz="4"/>
+            </w:tcBorders>
+            <w:shd w:fill="E6F5EC" w:color="auto" w:val="clear"/>
+            <w:tcMar>
+              <w:top w:type="dxa" w:w="60"/>
+              <w:left w:type="dxa" w:w="90"/>
+              <w:bottom w:type="dxa" w:w="60"/>
+              <w:right w:type="dxa" w:w="90"/>
+            </w:tcMar>
+            <w:vAlign w:val="top"/>
+          </w:tcPr>
+          <w:p>
+            <w:pPr>
+              <w:spacing w:after="40"/>
+            </w:pPr>
+            <w:r>
+              <w:rPr>
+                <w:rFonts w:ascii="Calibri" w:cs="Calibri" w:eastAsia="Calibri" w:hAnsi="Calibri"/>
+                <w:b/>
+                <w:bCs/>
+                <w:color w:val="14213D"/>
+                <w:sz w:val="19"/>
+                <w:szCs w:val="19"/>
+              </w:rPr>
+              <w:t xml:space="preserve">Fait</w:t>
+            </w:r>
+          </w:p>
+        </w:tc>
+        <w:tc>
+          <w:tcPr>
+            <w:tcW w:type="dxa" w:w="3700"/>
+            <w:tcBorders>
+              <w:top w:val="single" w:color="D9D5CB" w:sz="4"/>
+              <w:left w:val="single" w:color="D9D5CB" w:sz="4"/>
+              <w:bottom w:val="single" w:color="D9D5CB" w:sz="4"/>
+              <w:right w:val="single" w:color="D9D5CB" w:sz="4"/>
+            </w:tcBorders>
+            <w:tcMar>
+              <w:top w:type="dxa" w:w="60"/>
+              <w:left w:type="dxa" w:w="90"/>
+              <w:bottom w:type="dxa" w:w="60"/>
+              <w:right w:type="dxa" w:w="90"/>
+            </w:tcMar>
+            <w:vAlign w:val="top"/>
+          </w:tcPr>
+          <w:p>
+            <w:pPr>
+              <w:spacing w:after="40"/>
+            </w:pPr>
+            <w:r>
+              <w:rPr>
+                <w:rFonts w:ascii="Calibri" w:cs="Calibri" w:eastAsia="Calibri" w:hAnsi="Calibri"/>
+                <w:color w:val="14213D"/>
+                <w:sz w:val="20"/>
+                <w:szCs w:val="20"/>
+              </w:rPr>
+              <w:t xml:space="preserve"/>
+            </w:r>
+          </w:p>
+          <w:p>
+            <w:pPr>
+              <w:spacing w:after="40"/>
+            </w:pPr>
+            <w:r>
+              <w:rPr>
+                <w:rFonts w:ascii="Calibri" w:cs="Calibri" w:eastAsia="Calibri" w:hAnsi="Calibri"/>
+                <w:color w:val="14213D"/>
+                <w:sz w:val="20"/>
+                <w:szCs w:val="20"/>
+              </w:rPr>
+              <w:t xml:space="preserve"/>
+            </w:r>
+          </w:p>
+        </w:tc>
+      </w:tr>
+      <w:tr>
+        <w:tc>
+          <w:tcPr>
+            <w:tcW w:type="dxa" w:w="2300"/>
+            <w:tcBorders>
+              <w:top w:val="single" w:color="D9D5CB" w:sz="4"/>
+              <w:left w:val="single" w:color="D9D5CB" w:sz="4"/>
+              <w:bottom w:val="single" w:color="D9D5CB" w:sz="4"/>
+              <w:right w:val="single" w:color="D9D5CB" w:sz="4"/>
+            </w:tcBorders>
+            <w:tcMar>
+              <w:top w:type="dxa" w:w="60"/>
+              <w:left w:type="dxa" w:w="90"/>
+              <w:bottom w:type="dxa" w:w="60"/>
+              <w:right w:type="dxa" w:w="90"/>
+            </w:tcMar>
+            <w:vAlign w:val="top"/>
+          </w:tcPr>
+          <w:p>
+            <w:pPr>
+              <w:spacing w:after="40"/>
+            </w:pPr>
+            <w:r>
+              <w:rPr>
+                <w:rFonts w:ascii="Calibri" w:cs="Calibri" w:eastAsia="Calibri" w:hAnsi="Calibri"/>
+                <w:b/>
+                <w:bCs/>
+                <w:color w:val="14213D"/>
+                <w:sz w:val="20"/>
+                <w:szCs w:val="20"/>
+              </w:rPr>
+              <w:t xml:space="preserve">Paniers : MO + fourniture, par DN</w:t>
+            </w:r>
+          </w:p>
+        </w:tc>
+        <w:tc>
+          <w:tcPr>
+            <w:tcW w:type="dxa" w:w="4100"/>
+            <w:tcBorders>
+              <w:top w:val="single" w:color="D9D5CB" w:sz="4"/>
+              <w:left w:val="single" w:color="D9D5CB" w:sz="4"/>
+              <w:bottom w:val="single" w:color="D9D5CB" w:sz="4"/>
+              <w:right w:val="single" w:color="D9D5CB" w:sz="4"/>
+            </w:tcBorders>
+            <w:tcMar>
+              <w:top w:type="dxa" w:w="60"/>
+              <w:left w:type="dxa" w:w="90"/>
+              <w:bottom w:type="dxa" w:w="60"/>
+              <w:right w:type="dxa" w:w="90"/>
+            </w:tcMar>
+            <w:vAlign w:val="top"/>
+          </w:tcPr>
+          <w:p>
+            <w:pPr>
+              <w:spacing w:after="40"/>
+            </w:pPr>
+            <w:r>
+              <w:rPr>
+                <w:rFonts w:ascii="Calibri" w:cs="Calibri" w:eastAsia="Calibri" w:hAnsi="Calibri"/>
+                <w:color w:val="14213D"/>
+                <w:sz w:val="19"/>
+                <w:szCs w:val="19"/>
+              </w:rPr>
+              <w:t xml:space="preserve">3 · Chiffrage → 🧺 Paniers : chips des paniers du classeur (PURGE, VIDANGE…, SST — VANNES BS PN25…, RACCORDEMENT…) → DN → « 971 € · SST BS PN25 · DN 50 · la paire · dont 300 € de MO et 671 € de fourniture », détail MO (équipe, heures, taux) et fournitures (pièce, qté, PU), tableau de tous les DN. Heures et pièces écrasables (étiquette « écrasé », « ↺ revenir aux valeurs du classeur »). En bas : by-pass / fonds bombés, extrusion, déchargement, boîtiers, by-pass sur purge.</w:t>
+            </w:r>
+          </w:p>
+        </w:tc>
+        <w:tc>
+          <w:tcPr>
+            <w:tcW w:type="dxa" w:w="3700"/>
+            <w:tcBorders>
+              <w:top w:val="single" w:color="D9D5CB" w:sz="4"/>
+              <w:left w:val="single" w:color="D9D5CB" w:sz="4"/>
+              <w:bottom w:val="single" w:color="D9D5CB" w:sz="4"/>
+              <w:right w:val="single" w:color="D9D5CB" w:sz="4"/>
+            </w:tcBorders>
+            <w:tcMar>
+              <w:top w:type="dxa" w:w="60"/>
+              <w:left w:type="dxa" w:w="90"/>
+              <w:bottom w:type="dxa" w:w="60"/>
+              <w:right w:type="dxa" w:w="90"/>
+            </w:tcMar>
+            <w:vAlign w:val="top"/>
+          </w:tcPr>
+          <w:p>
+            <w:pPr>
+              <w:spacing w:after="40"/>
+            </w:pPr>
+            <w:r>
+              <w:rPr>
+                <w:rFonts w:ascii="Calibri" w:cs="Calibri" w:eastAsia="Calibri" w:hAnsi="Calibri"/>
+                <w:color w:val="14213D"/>
+                <w:sz w:val="19"/>
+                <w:szCs w:val="19"/>
+              </w:rPr>
+              <w:t xml:space="preserve">C'est exactement « une sous-station en 50 c'est XXX € dont XX de MO et XX de fourniture ». Les écrasements sont gardés au prochain import du classeur.</w:t>
+            </w:r>
+          </w:p>
+        </w:tc>
+        <w:tc>
+          <w:tcPr>
+            <w:tcW w:type="dxa" w:w="1300"/>
+            <w:tcBorders>
+              <w:top w:val="single" w:color="D9D5CB" w:sz="4"/>
+              <w:left w:val="single" w:color="D9D5CB" w:sz="4"/>
+              <w:bottom w:val="single" w:color="D9D5CB" w:sz="4"/>
+              <w:right w:val="single" w:color="D9D5CB" w:sz="4"/>
+            </w:tcBorders>
+            <w:shd w:fill="E6F5EC" w:color="auto" w:val="clear"/>
+            <w:tcMar>
+              <w:top w:type="dxa" w:w="60"/>
+              <w:left w:type="dxa" w:w="90"/>
+              <w:bottom w:type="dxa" w:w="60"/>
+              <w:right w:type="dxa" w:w="90"/>
+            </w:tcMar>
+            <w:vAlign w:val="top"/>
+          </w:tcPr>
+          <w:p>
+            <w:pPr>
+              <w:spacing w:after="40"/>
+            </w:pPr>
+            <w:r>
+              <w:rPr>
+                <w:rFonts w:ascii="Calibri" w:cs="Calibri" w:eastAsia="Calibri" w:hAnsi="Calibri"/>
+                <w:b/>
+                <w:bCs/>
+                <w:color w:val="14213D"/>
+                <w:sz w:val="19"/>
+                <w:szCs w:val="19"/>
+              </w:rPr>
+              <w:t xml:space="preserve">Fait</w:t>
+            </w:r>
+          </w:p>
+        </w:tc>
+        <w:tc>
+          <w:tcPr>
+            <w:tcW w:type="dxa" w:w="3700"/>
+            <w:tcBorders>
+              <w:top w:val="single" w:color="D9D5CB" w:sz="4"/>
+              <w:left w:val="single" w:color="D9D5CB" w:sz="4"/>
+              <w:bottom w:val="single" w:color="D9D5CB" w:sz="4"/>
+              <w:right w:val="single" w:color="D9D5CB" w:sz="4"/>
+            </w:tcBorders>
+            <w:tcMar>
+              <w:top w:type="dxa" w:w="60"/>
+              <w:left w:type="dxa" w:w="90"/>
+              <w:bottom w:type="dxa" w:w="60"/>
+              <w:right w:type="dxa" w:w="90"/>
+            </w:tcMar>
+            <w:vAlign w:val="top"/>
+          </w:tcPr>
+          <w:p>
+            <w:pPr>
+              <w:spacing w:after="40"/>
+            </w:pPr>
+            <w:r>
+              <w:rPr>
+                <w:rFonts w:ascii="Calibri" w:cs="Calibri" w:eastAsia="Calibri" w:hAnsi="Calibri"/>
+                <w:color w:val="14213D"/>
+                <w:sz w:val="20"/>
+                <w:szCs w:val="20"/>
+              </w:rPr>
+              <w:t xml:space="preserve"/>
+            </w:r>
+          </w:p>
+          <w:p>
+            <w:pPr>
+              <w:spacing w:after="40"/>
+            </w:pPr>
+            <w:r>
+              <w:rPr>
+                <w:rFonts w:ascii="Calibri" w:cs="Calibri" w:eastAsia="Calibri" w:hAnsi="Calibri"/>
+                <w:color w:val="14213D"/>
+                <w:sz w:val="20"/>
+                <w:szCs w:val="20"/>
+              </w:rPr>
+              <w:t xml:space="preserve"/>
+            </w:r>
+          </w:p>
+        </w:tc>
+      </w:tr>
+      <w:tr>
+        <w:tc>
+          <w:tcPr>
+            <w:tcW w:type="dxa" w:w="2300"/>
+            <w:tcBorders>
+              <w:top w:val="single" w:color="D9D5CB" w:sz="4"/>
+              <w:left w:val="single" w:color="D9D5CB" w:sz="4"/>
+              <w:bottom w:val="single" w:color="D9D5CB" w:sz="4"/>
+              <w:right w:val="single" w:color="D9D5CB" w:sz="4"/>
+            </w:tcBorders>
+            <w:tcMar>
+              <w:top w:type="dxa" w:w="60"/>
+              <w:left w:type="dxa" w:w="90"/>
+              <w:bottom w:type="dxa" w:w="60"/>
+              <w:right w:type="dxa" w:w="90"/>
+            </w:tcMar>
+            <w:vAlign w:val="top"/>
+          </w:tcPr>
+          <w:p>
+            <w:pPr>
+              <w:spacing w:after="40"/>
+            </w:pPr>
+            <w:r>
+              <w:rPr>
+                <w:rFonts w:ascii="Calibri" w:cs="Calibri" w:eastAsia="Calibri" w:hAnsi="Calibri"/>
+                <w:b/>
+                <w:bCs/>
+                <w:color w:val="14213D"/>
+                <w:sz w:val="20"/>
+                <w:szCs w:val="20"/>
+              </w:rPr>
+              <w:t xml:space="preserve">Paniers libres (spécifiques)</w:t>
+            </w:r>
+          </w:p>
+        </w:tc>
+        <w:tc>
+          <w:tcPr>
+            <w:tcW w:type="dxa" w:w="4100"/>
+            <w:tcBorders>
+              <w:top w:val="single" w:color="D9D5CB" w:sz="4"/>
+              <w:left w:val="single" w:color="D9D5CB" w:sz="4"/>
+              <w:bottom w:val="single" w:color="D9D5CB" w:sz="4"/>
+              <w:right w:val="single" w:color="D9D5CB" w:sz="4"/>
+            </w:tcBorders>
+            <w:tcMar>
+              <w:top w:type="dxa" w:w="60"/>
+              <w:left w:type="dxa" w:w="90"/>
+              <w:bottom w:type="dxa" w:w="60"/>
+              <w:right w:type="dxa" w:w="90"/>
+            </w:tcMar>
+            <w:vAlign w:val="top"/>
+          </w:tcPr>
+          <w:p>
+            <w:pPr>
+              <w:spacing w:after="40"/>
+            </w:pPr>
+            <w:r>
+              <w:rPr>
+                <w:rFonts w:ascii="Calibri" w:cs="Calibri" w:eastAsia="Calibri" w:hAnsi="Calibri"/>
+                <w:color w:val="14213D"/>
+                <w:sz w:val="19"/>
+                <w:szCs w:val="19"/>
+              </w:rPr>
+              <w:t xml:space="preserve">Dans une zone → carte « Paniers libres » : ＋ Panier libre → nom, × quantité, lignes MO (équipe, heures ou jours), Fourniture (désignation, qté, PU) et Sous-traitance (montant), notes ; total, l'unité, part MO / fourniture / sous-traitance. « 💾 panier SCR » le garde dans la base ; « ↓ Ajouter depuis la base » en copie un (la base reste intacte). 🧺 Paniers → « Paniers libres SCR » : liste, ✎, ✕, ＋ Nouveau.</w:t>
+            </w:r>
+          </w:p>
+        </w:tc>
+        <w:tc>
+          <w:tcPr>
+            <w:tcW w:type="dxa" w:w="3700"/>
+            <w:tcBorders>
+              <w:top w:val="single" w:color="D9D5CB" w:sz="4"/>
+              <w:left w:val="single" w:color="D9D5CB" w:sz="4"/>
+              <w:bottom w:val="single" w:color="D9D5CB" w:sz="4"/>
+              <w:right w:val="single" w:color="D9D5CB" w:sz="4"/>
+            </w:tcBorders>
+            <w:tcMar>
+              <w:top w:type="dxa" w:w="60"/>
+              <w:left w:type="dxa" w:w="90"/>
+              <w:bottom w:type="dxa" w:w="60"/>
+              <w:right w:type="dxa" w:w="90"/>
+            </w:tcMar>
+            <w:vAlign w:val="top"/>
+          </w:tcPr>
+          <w:p>
+            <w:pPr>
+              <w:spacing w:after="40"/>
+            </w:pPr>
+            <w:r>
+              <w:rPr>
+                <w:rFonts w:ascii="Calibri" w:cs="Calibri" w:eastAsia="Calibri" w:hAnsi="Calibri"/>
+                <w:color w:val="14213D"/>
+                <w:sz w:val="19"/>
+                <w:szCs w:val="19"/>
+              </w:rPr>
+              <w:t xml:space="preserve">Registre « panier » (serveur, encadrement / bureau). Un panier copié dans une affaire ne bouge plus si la base change — voulu.</w:t>
+            </w:r>
+          </w:p>
+        </w:tc>
+        <w:tc>
+          <w:tcPr>
+            <w:tcW w:type="dxa" w:w="1300"/>
+            <w:tcBorders>
+              <w:top w:val="single" w:color="D9D5CB" w:sz="4"/>
+              <w:left w:val="single" w:color="D9D5CB" w:sz="4"/>
+              <w:bottom w:val="single" w:color="D9D5CB" w:sz="4"/>
+              <w:right w:val="single" w:color="D9D5CB" w:sz="4"/>
+            </w:tcBorders>
+            <w:shd w:fill="E6F5EC" w:color="auto" w:val="clear"/>
+            <w:tcMar>
+              <w:top w:type="dxa" w:w="60"/>
+              <w:left w:type="dxa" w:w="90"/>
+              <w:bottom w:type="dxa" w:w="60"/>
+              <w:right w:type="dxa" w:w="90"/>
+            </w:tcMar>
+            <w:vAlign w:val="top"/>
+          </w:tcPr>
+          <w:p>
+            <w:pPr>
+              <w:spacing w:after="40"/>
+            </w:pPr>
+            <w:r>
+              <w:rPr>
+                <w:rFonts w:ascii="Calibri" w:cs="Calibri" w:eastAsia="Calibri" w:hAnsi="Calibri"/>
+                <w:b/>
+                <w:bCs/>
+                <w:color w:val="14213D"/>
+                <w:sz w:val="19"/>
+                <w:szCs w:val="19"/>
+              </w:rPr>
+              <w:t xml:space="preserve">Fait</w:t>
+            </w:r>
+          </w:p>
+        </w:tc>
+        <w:tc>
+          <w:tcPr>
+            <w:tcW w:type="dxa" w:w="3700"/>
+            <w:tcBorders>
+              <w:top w:val="single" w:color="D9D5CB" w:sz="4"/>
+              <w:left w:val="single" w:color="D9D5CB" w:sz="4"/>
+              <w:bottom w:val="single" w:color="D9D5CB" w:sz="4"/>
+              <w:right w:val="single" w:color="D9D5CB" w:sz="4"/>
+            </w:tcBorders>
+            <w:tcMar>
+              <w:top w:type="dxa" w:w="60"/>
+              <w:left w:type="dxa" w:w="90"/>
+              <w:bottom w:type="dxa" w:w="60"/>
+              <w:right w:type="dxa" w:w="90"/>
+            </w:tcMar>
+            <w:vAlign w:val="top"/>
+          </w:tcPr>
+          <w:p>
+            <w:pPr>
+              <w:spacing w:after="40"/>
+            </w:pPr>
+            <w:r>
+              <w:rPr>
+                <w:rFonts w:ascii="Calibri" w:cs="Calibri" w:eastAsia="Calibri" w:hAnsi="Calibri"/>
+                <w:color w:val="14213D"/>
+                <w:sz w:val="20"/>
+                <w:szCs w:val="20"/>
+              </w:rPr>
+              <w:t xml:space="preserve"/>
+            </w:r>
+          </w:p>
+          <w:p>
+            <w:pPr>
+              <w:spacing w:after="40"/>
+            </w:pPr>
+            <w:r>
+              <w:rPr>
+                <w:rFonts w:ascii="Calibri" w:cs="Calibri" w:eastAsia="Calibri" w:hAnsi="Calibri"/>
+                <w:color w:val="14213D"/>
+                <w:sz w:val="20"/>
+                <w:szCs w:val="20"/>
+              </w:rPr>
+              <w:t xml:space="preserve"/>
+            </w:r>
+          </w:p>
+        </w:tc>
+      </w:tr>
+      <w:tr>
+        <w:tc>
+          <w:tcPr>
+            <w:tcW w:type="dxa" w:w="2300"/>
+            <w:tcBorders>
+              <w:top w:val="single" w:color="D9D5CB" w:sz="4"/>
+              <w:left w:val="single" w:color="D9D5CB" w:sz="4"/>
+              <w:bottom w:val="single" w:color="D9D5CB" w:sz="4"/>
+              <w:right w:val="single" w:color="D9D5CB" w:sz="4"/>
+            </w:tcBorders>
+            <w:tcMar>
+              <w:top w:type="dxa" w:w="60"/>
+              <w:left w:type="dxa" w:w="90"/>
+              <w:bottom w:type="dxa" w:w="60"/>
+              <w:right w:type="dxa" w:w="90"/>
+            </w:tcMar>
+            <w:vAlign w:val="top"/>
+          </w:tcPr>
+          <w:p>
+            <w:pPr>
+              <w:spacing w:after="40"/>
+            </w:pPr>
+            <w:r>
+              <w:rPr>
+                <w:rFonts w:ascii="Calibri" w:cs="Calibri" w:eastAsia="Calibri" w:hAnsi="Calibri"/>
+                <w:b/>
+                <w:bCs/>
+                <w:color w:val="14213D"/>
+                <w:sz w:val="20"/>
+                <w:szCs w:val="20"/>
+              </w:rPr>
+              <w:t xml:space="preserve">Tracé → comparer, pas préremplir</w:t>
+            </w:r>
+          </w:p>
+        </w:tc>
+        <w:tc>
+          <w:tcPr>
+            <w:tcW w:type="dxa" w:w="4100"/>
+            <w:tcBorders>
+              <w:top w:val="single" w:color="D9D5CB" w:sz="4"/>
+              <w:left w:val="single" w:color="D9D5CB" w:sz="4"/>
+              <w:bottom w:val="single" w:color="D9D5CB" w:sz="4"/>
+              <w:right w:val="single" w:color="D9D5CB" w:sz="4"/>
+            </w:tcBorders>
+            <w:tcMar>
+              <w:top w:type="dxa" w:w="60"/>
+              <w:left w:type="dxa" w:w="90"/>
+              <w:bottom w:type="dxa" w:w="60"/>
+              <w:right w:type="dxa" w:w="90"/>
+            </w:tcMar>
+            <w:vAlign w:val="top"/>
+          </w:tcPr>
+          <w:p>
+            <w:pPr>
+              <w:spacing w:after="40"/>
+            </w:pPr>
+            <w:r>
+              <w:rPr>
+                <w:rFonts w:ascii="Calibri" w:cs="Calibri" w:eastAsia="Calibri" w:hAnsi="Calibri"/>
+                <w:color w:val="14213D"/>
+                <w:sz w:val="19"/>
+                <w:szCs w:val="19"/>
+              </w:rPr>
+              <w:t xml:space="preserve">Zone → Table des DN → « ⇄ Comparer avec le tracé » (il faut un chantier lié : onglet Tracé &amp; chantiers) : chantier, phase du phasage (sinon tout le tracé) → par DN : soudures et ml du tracé, les nôtres, l'écart (vert si ≤ 5 %), « ← prendre » par DN ou « ← tout prendre » (remplace la table).</w:t>
+            </w:r>
+          </w:p>
+        </w:tc>
+        <w:tc>
+          <w:tcPr>
+            <w:tcW w:type="dxa" w:w="3700"/>
+            <w:tcBorders>
+              <w:top w:val="single" w:color="D9D5CB" w:sz="4"/>
+              <w:left w:val="single" w:color="D9D5CB" w:sz="4"/>
+              <w:bottom w:val="single" w:color="D9D5CB" w:sz="4"/>
+              <w:right w:val="single" w:color="D9D5CB" w:sz="4"/>
+            </w:tcBorders>
+            <w:tcMar>
+              <w:top w:type="dxa" w:w="60"/>
+              <w:left w:type="dxa" w:w="90"/>
+              <w:bottom w:type="dxa" w:w="60"/>
+              <w:right w:type="dxa" w:w="90"/>
+            </w:tcMar>
+            <w:vAlign w:val="top"/>
+          </w:tcPr>
+          <w:p>
+            <w:pPr>
+              <w:spacing w:after="40"/>
+            </w:pPr>
+            <w:r>
+              <w:rPr>
+                <w:rFonts w:ascii="Calibri" w:cs="Calibri" w:eastAsia="Calibri" w:hAnsi="Calibri"/>
+                <w:color w:val="14213D"/>
+                <w:sz w:val="19"/>
+                <w:szCs w:val="19"/>
+              </w:rPr>
+              <w:t xml:space="preserve">Les phases du phasage du chantier (Chantiers → Phasage) sont la façon de rattacher des tronçons à des zones. Le tracé d'un chantier non ouvert sur l'appareil ne donne rien (ouvre-le une fois).</w:t>
+            </w:r>
+          </w:p>
+        </w:tc>
+        <w:tc>
+          <w:tcPr>
+            <w:tcW w:type="dxa" w:w="1300"/>
+            <w:tcBorders>
+              <w:top w:val="single" w:color="D9D5CB" w:sz="4"/>
+              <w:left w:val="single" w:color="D9D5CB" w:sz="4"/>
+              <w:bottom w:val="single" w:color="D9D5CB" w:sz="4"/>
+              <w:right w:val="single" w:color="D9D5CB" w:sz="4"/>
+            </w:tcBorders>
+            <w:shd w:fill="E6F5EC" w:color="auto" w:val="clear"/>
+            <w:tcMar>
+              <w:top w:type="dxa" w:w="60"/>
+              <w:left w:type="dxa" w:w="90"/>
+              <w:bottom w:type="dxa" w:w="60"/>
+              <w:right w:type="dxa" w:w="90"/>
+            </w:tcMar>
+            <w:vAlign w:val="top"/>
+          </w:tcPr>
+          <w:p>
+            <w:pPr>
+              <w:spacing w:after="40"/>
+            </w:pPr>
+            <w:r>
+              <w:rPr>
+                <w:rFonts w:ascii="Calibri" w:cs="Calibri" w:eastAsia="Calibri" w:hAnsi="Calibri"/>
+                <w:b/>
+                <w:bCs/>
+                <w:color w:val="14213D"/>
+                <w:sz w:val="19"/>
+                <w:szCs w:val="19"/>
+              </w:rPr>
+              <w:t xml:space="preserve">Fait</w:t>
+            </w:r>
+          </w:p>
+        </w:tc>
+        <w:tc>
+          <w:tcPr>
+            <w:tcW w:type="dxa" w:w="3700"/>
+            <w:tcBorders>
+              <w:top w:val="single" w:color="D9D5CB" w:sz="4"/>
+              <w:left w:val="single" w:color="D9D5CB" w:sz="4"/>
+              <w:bottom w:val="single" w:color="D9D5CB" w:sz="4"/>
+              <w:right w:val="single" w:color="D9D5CB" w:sz="4"/>
+            </w:tcBorders>
+            <w:tcMar>
+              <w:top w:type="dxa" w:w="60"/>
+              <w:left w:type="dxa" w:w="90"/>
+              <w:bottom w:type="dxa" w:w="60"/>
+              <w:right w:type="dxa" w:w="90"/>
+            </w:tcMar>
+            <w:vAlign w:val="top"/>
+          </w:tcPr>
+          <w:p>
+            <w:pPr>
+              <w:spacing w:after="40"/>
+            </w:pPr>
+            <w:r>
+              <w:rPr>
+                <w:rFonts w:ascii="Calibri" w:cs="Calibri" w:eastAsia="Calibri" w:hAnsi="Calibri"/>
+                <w:color w:val="14213D"/>
+                <w:sz w:val="20"/>
+                <w:szCs w:val="20"/>
+              </w:rPr>
+              <w:t xml:space="preserve"/>
+            </w:r>
+          </w:p>
+          <w:p>
+            <w:pPr>
+              <w:spacing w:after="40"/>
+            </w:pPr>
+            <w:r>
+              <w:rPr>
+                <w:rFonts w:ascii="Calibri" w:cs="Calibri" w:eastAsia="Calibri" w:hAnsi="Calibri"/>
+                <w:color w:val="14213D"/>
+                <w:sz w:val="20"/>
+                <w:szCs w:val="20"/>
+              </w:rPr>
+              <w:t xml:space="preserve"/>
+            </w:r>
+          </w:p>
+        </w:tc>
+      </w:tr>
+      <w:tr>
+        <w:tc>
+          <w:tcPr>
+            <w:tcW w:type="dxa" w:w="2300"/>
+            <w:tcBorders>
+              <w:top w:val="single" w:color="D9D5CB" w:sz="4"/>
+              <w:left w:val="single" w:color="D9D5CB" w:sz="4"/>
+              <w:bottom w:val="single" w:color="D9D5CB" w:sz="4"/>
+              <w:right w:val="single" w:color="D9D5CB" w:sz="4"/>
+            </w:tcBorders>
+            <w:tcMar>
+              <w:top w:type="dxa" w:w="60"/>
+              <w:left w:type="dxa" w:w="90"/>
+              <w:bottom w:type="dxa" w:w="60"/>
+              <w:right w:type="dxa" w:w="90"/>
+            </w:tcMar>
+            <w:vAlign w:val="top"/>
+          </w:tcPr>
+          <w:p>
+            <w:pPr>
+              <w:spacing w:after="40"/>
+            </w:pPr>
+            <w:r>
+              <w:rPr>
+                <w:rFonts w:ascii="Calibri" w:cs="Calibri" w:eastAsia="Calibri" w:hAnsi="Calibri"/>
+                <w:b/>
+                <w:bCs/>
+                <w:color w:val="14213D"/>
+                <w:sz w:val="20"/>
+                <w:szCs w:val="20"/>
+              </w:rPr>
+              <w:t xml:space="preserve">Dossier : le zip déballé</w:t>
+            </w:r>
+          </w:p>
+        </w:tc>
+        <w:tc>
+          <w:tcPr>
+            <w:tcW w:type="dxa" w:w="4100"/>
+            <w:tcBorders>
+              <w:top w:val="single" w:color="D9D5CB" w:sz="4"/>
+              <w:left w:val="single" w:color="D9D5CB" w:sz="4"/>
+              <w:bottom w:val="single" w:color="D9D5CB" w:sz="4"/>
+              <w:right w:val="single" w:color="D9D5CB" w:sz="4"/>
+            </w:tcBorders>
+            <w:tcMar>
+              <w:top w:type="dxa" w:w="60"/>
+              <w:left w:type="dxa" w:w="90"/>
+              <w:bottom w:type="dxa" w:w="60"/>
+              <w:right w:type="dxa" w:w="90"/>
+            </w:tcMar>
+            <w:vAlign w:val="top"/>
+          </w:tcPr>
+          <w:p>
+            <w:pPr>
+              <w:spacing w:after="40"/>
+            </w:pPr>
+            <w:r>
+              <w:rPr>
+                <w:rFonts w:ascii="Calibri" w:cs="Calibri" w:eastAsia="Calibri" w:hAnsi="Calibri"/>
+                <w:color w:val="14213D"/>
+                <w:sz w:val="19"/>
+                <w:szCs w:val="19"/>
+              </w:rPr>
+              <w:t xml:space="preserve">1 · Dossier → « 📎 Déposer le DCE (zip) ou des pièces » : le zip est déballé (zips imbriqués compris, __MACOSX ignoré), une pièce par fichier, classée par le dossier du zip puis le nom (CCTP, DPGF / BPU, CCAP, RC, AE, Plans, Profils en long, PPSPS, mémoire cadre, planning, courrier, devis, autre — catégorie modifiable), gardée sur l'appareil (IndexedDB) et envoyée au stockage si connecté (☁ / 📱), archive d'origine gardée ; « 📖 Lire », « ⇪ v2 » (nouvelle version : l'ancienne passe dans « anciennes versions », ses notes restent, étiquette v2), ✕. « ✉ Mail · précision · alignement technique » : titre, date, de, texte collé → pièce lisible et annotable. Lien (Drive, SharePoint) : formulaire replié.</w:t>
+            </w:r>
+          </w:p>
+        </w:tc>
+        <w:tc>
+          <w:tcPr>
+            <w:tcW w:type="dxa" w:w="3700"/>
+            <w:tcBorders>
+              <w:top w:val="single" w:color="D9D5CB" w:sz="4"/>
+              <w:left w:val="single" w:color="D9D5CB" w:sz="4"/>
+              <w:bottom w:val="single" w:color="D9D5CB" w:sz="4"/>
+              <w:right w:val="single" w:color="D9D5CB" w:sz="4"/>
+            </w:tcBorders>
+            <w:tcMar>
+              <w:top w:type="dxa" w:w="60"/>
+              <w:left w:type="dxa" w:w="90"/>
+              <w:bottom w:type="dxa" w:w="60"/>
+              <w:right w:type="dxa" w:w="90"/>
+            </w:tcMar>
+            <w:vAlign w:val="top"/>
+          </w:tcPr>
+          <w:p>
+            <w:pPr>
+              <w:spacing w:after="40"/>
+            </w:pPr>
+            <w:r>
+              <w:rPr>
+                <w:rFonts w:ascii="Calibri" w:cs="Calibri" w:eastAsia="Calibri" w:hAnsi="Calibri"/>
+                <w:color w:val="14213D"/>
+                <w:sz w:val="19"/>
+                <w:szCs w:val="19"/>
+              </w:rPr>
+              <w:t xml:space="preserve">Limite : 120 Mo par fichier déposé, 50 Mo par pièce envoyée au serveur (au-delà elle reste sur l'appareil). Hors connexion, tout reste sur l'appareil : redépose connecté pour partager (indicateur 📱).</w:t>
+            </w:r>
+          </w:p>
+        </w:tc>
+        <w:tc>
+          <w:tcPr>
+            <w:tcW w:type="dxa" w:w="1300"/>
+            <w:tcBorders>
+              <w:top w:val="single" w:color="D9D5CB" w:sz="4"/>
+              <w:left w:val="single" w:color="D9D5CB" w:sz="4"/>
+              <w:bottom w:val="single" w:color="D9D5CB" w:sz="4"/>
+              <w:right w:val="single" w:color="D9D5CB" w:sz="4"/>
+            </w:tcBorders>
+            <w:shd w:fill="E6F5EC" w:color="auto" w:val="clear"/>
+            <w:tcMar>
+              <w:top w:type="dxa" w:w="60"/>
+              <w:left w:type="dxa" w:w="90"/>
+              <w:bottom w:type="dxa" w:w="60"/>
+              <w:right w:type="dxa" w:w="90"/>
+            </w:tcMar>
+            <w:vAlign w:val="top"/>
+          </w:tcPr>
+          <w:p>
+            <w:pPr>
+              <w:spacing w:after="40"/>
+            </w:pPr>
+            <w:r>
+              <w:rPr>
+                <w:rFonts w:ascii="Calibri" w:cs="Calibri" w:eastAsia="Calibri" w:hAnsi="Calibri"/>
+                <w:b/>
+                <w:bCs/>
+                <w:color w:val="14213D"/>
+                <w:sz w:val="19"/>
+                <w:szCs w:val="19"/>
+              </w:rPr>
+              <w:t xml:space="preserve">Fait</w:t>
+            </w:r>
+          </w:p>
+        </w:tc>
+        <w:tc>
+          <w:tcPr>
+            <w:tcW w:type="dxa" w:w="3700"/>
+            <w:tcBorders>
+              <w:top w:val="single" w:color="D9D5CB" w:sz="4"/>
+              <w:left w:val="single" w:color="D9D5CB" w:sz="4"/>
+              <w:bottom w:val="single" w:color="D9D5CB" w:sz="4"/>
+              <w:right w:val="single" w:color="D9D5CB" w:sz="4"/>
+            </w:tcBorders>
+            <w:tcMar>
+              <w:top w:type="dxa" w:w="60"/>
+              <w:left w:type="dxa" w:w="90"/>
+              <w:bottom w:type="dxa" w:w="60"/>
+              <w:right w:type="dxa" w:w="90"/>
+            </w:tcMar>
+            <w:vAlign w:val="top"/>
+          </w:tcPr>
+          <w:p>
+            <w:pPr>
+              <w:spacing w:after="40"/>
+            </w:pPr>
+            <w:r>
+              <w:rPr>
+                <w:rFonts w:ascii="Calibri" w:cs="Calibri" w:eastAsia="Calibri" w:hAnsi="Calibri"/>
+                <w:color w:val="14213D"/>
+                <w:sz w:val="20"/>
+                <w:szCs w:val="20"/>
+              </w:rPr>
+              <w:t xml:space="preserve"/>
+            </w:r>
+          </w:p>
+          <w:p>
+            <w:pPr>
+              <w:spacing w:after="40"/>
+            </w:pPr>
+            <w:r>
+              <w:rPr>
+                <w:rFonts w:ascii="Calibri" w:cs="Calibri" w:eastAsia="Calibri" w:hAnsi="Calibri"/>
+                <w:color w:val="14213D"/>
+                <w:sz w:val="20"/>
+                <w:szCs w:val="20"/>
+              </w:rPr>
+              <w:t xml:space="preserve"/>
+            </w:r>
+          </w:p>
+        </w:tc>
+      </w:tr>
+      <w:tr>
+        <w:tc>
+          <w:tcPr>
+            <w:tcW w:type="dxa" w:w="2300"/>
+            <w:tcBorders>
+              <w:top w:val="single" w:color="D9D5CB" w:sz="4"/>
+              <w:left w:val="single" w:color="D9D5CB" w:sz="4"/>
+              <w:bottom w:val="single" w:color="D9D5CB" w:sz="4"/>
+              <w:right w:val="single" w:color="D9D5CB" w:sz="4"/>
+            </w:tcBorders>
+            <w:tcMar>
+              <w:top w:type="dxa" w:w="60"/>
+              <w:left w:type="dxa" w:w="90"/>
+              <w:bottom w:type="dxa" w:w="60"/>
+              <w:right w:type="dxa" w:w="90"/>
+            </w:tcMar>
+            <w:vAlign w:val="top"/>
+          </w:tcPr>
+          <w:p>
+            <w:pPr>
+              <w:spacing w:after="40"/>
+            </w:pPr>
+            <w:r>
+              <w:rPr>
+                <w:rFonts w:ascii="Calibri" w:cs="Calibri" w:eastAsia="Calibri" w:hAnsi="Calibri"/>
+                <w:b/>
+                <w:bCs/>
+                <w:color w:val="14213D"/>
+                <w:sz w:val="20"/>
+                <w:szCs w:val="20"/>
+              </w:rPr>
+              <w:t xml:space="preserve">Lecture : la pièce ouverte, surlignée, notée</w:t>
+            </w:r>
+          </w:p>
+        </w:tc>
+        <w:tc>
+          <w:tcPr>
+            <w:tcW w:type="dxa" w:w="4100"/>
+            <w:tcBorders>
+              <w:top w:val="single" w:color="D9D5CB" w:sz="4"/>
+              <w:left w:val="single" w:color="D9D5CB" w:sz="4"/>
+              <w:bottom w:val="single" w:color="D9D5CB" w:sz="4"/>
+              <w:right w:val="single" w:color="D9D5CB" w:sz="4"/>
+            </w:tcBorders>
+            <w:tcMar>
+              <w:top w:type="dxa" w:w="60"/>
+              <w:left w:type="dxa" w:w="90"/>
+              <w:bottom w:type="dxa" w:w="60"/>
+              <w:right w:type="dxa" w:w="90"/>
+            </w:tcMar>
+            <w:vAlign w:val="top"/>
+          </w:tcPr>
+          <w:p>
+            <w:pPr>
+              <w:spacing w:after="40"/>
+            </w:pPr>
+            <w:r>
+              <w:rPr>
+                <w:rFonts w:ascii="Calibri" w:cs="Calibri" w:eastAsia="Calibri" w:hAnsi="Calibri"/>
+                <w:color w:val="14213D"/>
+                <w:sz w:val="19"/>
+                <w:szCs w:val="19"/>
+              </w:rPr>
+              <w:t xml:space="preserve">2 · Lecture : onglets par pièce (« Plans (6) » groupés), la pièce à gauche (PDF : pages avec texte sélectionnable, « 2 pages », − / + zoom, ⤓ ; Word : paragraphes et titres ; Excel : grille ; image ; mail). Sélectionne un passage → popover : page et article détectés (« p. 1 · art. 4.5 »), extrait, destinations (→ chiffrage par défaut, → mémoire, ⚠ risque, ? question MOE, ℹ info), ta note, « Ajouter ». Le passage reste surligné (jaune chiffrage, vert mémoire, rouge risque, bleu question) ; survol d'une note = le passage s'encadre et inversement ; clic sur « p. 1 · art. 4.5 » = on y va. À droite : les notes de la pièce (ou de toutes), filtres par destination avec compteurs, ✕, « ✎ Note sans surlignage ». Les notes continuent d'arriver en tête du chiffrage / mémoire / questions et se cochent là-bas.</w:t>
+            </w:r>
+          </w:p>
+        </w:tc>
+        <w:tc>
+          <w:tcPr>
+            <w:tcW w:type="dxa" w:w="3700"/>
+            <w:tcBorders>
+              <w:top w:val="single" w:color="D9D5CB" w:sz="4"/>
+              <w:left w:val="single" w:color="D9D5CB" w:sz="4"/>
+              <w:bottom w:val="single" w:color="D9D5CB" w:sz="4"/>
+              <w:right w:val="single" w:color="D9D5CB" w:sz="4"/>
+            </w:tcBorders>
+            <w:tcMar>
+              <w:top w:type="dxa" w:w="60"/>
+              <w:left w:type="dxa" w:w="90"/>
+              <w:bottom w:type="dxa" w:w="60"/>
+              <w:right w:type="dxa" w:w="90"/>
+            </w:tcMar>
+            <w:vAlign w:val="top"/>
+          </w:tcPr>
+          <w:p>
+            <w:pPr>
+              <w:spacing w:after="40"/>
+            </w:pPr>
+            <w:r>
+              <w:rPr>
+                <w:rFonts w:ascii="Calibri" w:cs="Calibri" w:eastAsia="Calibri" w:hAnsi="Calibri"/>
+                <w:color w:val="14213D"/>
+                <w:sz w:val="19"/>
+                <w:szCs w:val="19"/>
+              </w:rPr>
+              <w:t xml:space="preserve">Même visuel que ta capture (photo 1). Le PDF est lu par pdf.js (chargé depuis cdnjs à l'ouverture : il faut le réseau la première fois). L'article est détecté sur les titres numérotés (4.2 —, 2., Article 3) en remontant dans la page puis les précédentes — modifiable dans le popover. Pas d'annotation à main levée sur les plans (texte seulement).</w:t>
+            </w:r>
+          </w:p>
+        </w:tc>
+        <w:tc>
+          <w:tcPr>
+            <w:tcW w:type="dxa" w:w="1300"/>
+            <w:tcBorders>
+              <w:top w:val="single" w:color="D9D5CB" w:sz="4"/>
+              <w:left w:val="single" w:color="D9D5CB" w:sz="4"/>
+              <w:bottom w:val="single" w:color="D9D5CB" w:sz="4"/>
+              <w:right w:val="single" w:color="D9D5CB" w:sz="4"/>
+            </w:tcBorders>
+            <w:shd w:fill="E6F5EC" w:color="auto" w:val="clear"/>
+            <w:tcMar>
+              <w:top w:type="dxa" w:w="60"/>
+              <w:left w:type="dxa" w:w="90"/>
+              <w:bottom w:type="dxa" w:w="60"/>
+              <w:right w:type="dxa" w:w="90"/>
+            </w:tcMar>
+            <w:vAlign w:val="top"/>
+          </w:tcPr>
+          <w:p>
+            <w:pPr>
+              <w:spacing w:after="40"/>
+            </w:pPr>
+            <w:r>
+              <w:rPr>
+                <w:rFonts w:ascii="Calibri" w:cs="Calibri" w:eastAsia="Calibri" w:hAnsi="Calibri"/>
+                <w:b/>
+                <w:bCs/>
+                <w:color w:val="14213D"/>
+                <w:sz w:val="19"/>
+                <w:szCs w:val="19"/>
+              </w:rPr>
+              <w:t xml:space="preserve">Fait</w:t>
+            </w:r>
+          </w:p>
+        </w:tc>
+        <w:tc>
+          <w:tcPr>
+            <w:tcW w:type="dxa" w:w="3700"/>
+            <w:tcBorders>
+              <w:top w:val="single" w:color="D9D5CB" w:sz="4"/>
+              <w:left w:val="single" w:color="D9D5CB" w:sz="4"/>
+              <w:bottom w:val="single" w:color="D9D5CB" w:sz="4"/>
+              <w:right w:val="single" w:color="D9D5CB" w:sz="4"/>
+            </w:tcBorders>
+            <w:tcMar>
+              <w:top w:type="dxa" w:w="60"/>
+              <w:left w:type="dxa" w:w="90"/>
+              <w:bottom w:type="dxa" w:w="60"/>
+              <w:right w:type="dxa" w:w="90"/>
+            </w:tcMar>
+            <w:vAlign w:val="top"/>
+          </w:tcPr>
+          <w:p>
+            <w:pPr>
+              <w:spacing w:after="40"/>
+            </w:pPr>
+            <w:r>
+              <w:rPr>
+                <w:rFonts w:ascii="Calibri" w:cs="Calibri" w:eastAsia="Calibri" w:hAnsi="Calibri"/>
+                <w:color w:val="14213D"/>
+                <w:sz w:val="20"/>
+                <w:szCs w:val="20"/>
+              </w:rPr>
+              <w:t xml:space="preserve"/>
+            </w:r>
+          </w:p>
+          <w:p>
+            <w:pPr>
+              <w:spacing w:after="40"/>
+            </w:pPr>
+            <w:r>
+              <w:rPr>
+                <w:rFonts w:ascii="Calibri" w:cs="Calibri" w:eastAsia="Calibri" w:hAnsi="Calibri"/>
+                <w:color w:val="14213D"/>
+                <w:sz w:val="20"/>
+                <w:szCs w:val="20"/>
+              </w:rPr>
+              <w:t xml:space="preserve"/>
+            </w:r>
+          </w:p>
+        </w:tc>
+      </w:tr>
+      <w:tr>
+        <w:tc>
+          <w:tcPr>
+            <w:tcW w:type="dxa" w:w="2300"/>
+            <w:tcBorders>
+              <w:top w:val="single" w:color="D9D5CB" w:sz="4"/>
+              <w:left w:val="single" w:color="D9D5CB" w:sz="4"/>
+              <w:bottom w:val="single" w:color="D9D5CB" w:sz="4"/>
+              <w:right w:val="single" w:color="D9D5CB" w:sz="4"/>
+            </w:tcBorders>
+            <w:tcMar>
+              <w:top w:type="dxa" w:w="60"/>
+              <w:left w:type="dxa" w:w="90"/>
+              <w:bottom w:type="dxa" w:w="60"/>
+              <w:right w:type="dxa" w:w="90"/>
+            </w:tcMar>
+            <w:vAlign w:val="top"/>
+          </w:tcPr>
+          <w:p>
+            <w:pPr>
+              <w:spacing w:after="40"/>
+            </w:pPr>
+            <w:r>
+              <w:rPr>
+                <w:rFonts w:ascii="Calibri" w:cs="Calibri" w:eastAsia="Calibri" w:hAnsi="Calibri"/>
+                <w:b/>
+                <w:bCs/>
+                <w:color w:val="14213D"/>
+                <w:sz w:val="20"/>
+                <w:szCs w:val="20"/>
+              </w:rPr>
+              <w:t xml:space="preserve">Points techniques → préremplir le chiffrage</w:t>
+            </w:r>
+          </w:p>
+        </w:tc>
+        <w:tc>
+          <w:tcPr>
+            <w:tcW w:type="dxa" w:w="4100"/>
+            <w:tcBorders>
+              <w:top w:val="single" w:color="D9D5CB" w:sz="4"/>
+              <w:left w:val="single" w:color="D9D5CB" w:sz="4"/>
+              <w:bottom w:val="single" w:color="D9D5CB" w:sz="4"/>
+              <w:right w:val="single" w:color="D9D5CB" w:sz="4"/>
+            </w:tcBorders>
+            <w:tcMar>
+              <w:top w:type="dxa" w:w="60"/>
+              <w:left w:type="dxa" w:w="90"/>
+              <w:bottom w:type="dxa" w:w="60"/>
+              <w:right w:type="dxa" w:w="90"/>
+            </w:tcMar>
+            <w:vAlign w:val="top"/>
+          </w:tcPr>
+          <w:p>
+            <w:pPr>
+              <w:spacing w:after="40"/>
+            </w:pPr>
+            <w:r>
+              <w:rPr>
+                <w:rFonts w:ascii="Calibri" w:cs="Calibri" w:eastAsia="Calibri" w:hAnsi="Calibri"/>
+                <w:color w:val="14213D"/>
+                <w:sz w:val="19"/>
+                <w:szCs w:val="19"/>
+              </w:rPr>
+              <w:t xml:space="preserve">2 · Lecture → carte « Points techniques » : dates, manchons, isolation, km, pelle / benne / conteneur / WC / DOE / carnet, puis à cocher : purges (DN, paires, purgeur auto, déportées), vidanges (type, DN, paires), vannes préisolées, SST (type selon le DN, paires), extrusion, raccordement, radio / US / ressuage (% des soudures, films par vacation), essai hydraulique (tronçons avec cubatures), eau adoucie, rinçage, passivation, conservation, boulet mousse, aérien (supports, calo, lignes), fonçage (ml, jours, radio). Les DN viennent de « Quantités repérées » (+ cases antenne / feeder). « → Préremplir le chiffrage » crée la zone « Étude 1 » (ou la remplace, avec confirmation) et ouvre le chiffrage.</w:t>
+            </w:r>
+          </w:p>
+        </w:tc>
+        <w:tc>
+          <w:tcPr>
+            <w:tcW w:type="dxa" w:w="3700"/>
+            <w:tcBorders>
+              <w:top w:val="single" w:color="D9D5CB" w:sz="4"/>
+              <w:left w:val="single" w:color="D9D5CB" w:sz="4"/>
+              <w:bottom w:val="single" w:color="D9D5CB" w:sz="4"/>
+              <w:right w:val="single" w:color="D9D5CB" w:sz="4"/>
+            </w:tcBorders>
+            <w:tcMar>
+              <w:top w:type="dxa" w:w="60"/>
+              <w:left w:type="dxa" w:w="90"/>
+              <w:bottom w:type="dxa" w:w="60"/>
+              <w:right w:type="dxa" w:w="90"/>
+            </w:tcMar>
+            <w:vAlign w:val="top"/>
+          </w:tcPr>
+          <w:p>
+            <w:pPr>
+              <w:spacing w:after="40"/>
+            </w:pPr>
+            <w:r>
+              <w:rPr>
+                <w:rFonts w:ascii="Calibri" w:cs="Calibri" w:eastAsia="Calibri" w:hAnsi="Calibri"/>
+                <w:color w:val="14213D"/>
+                <w:sz w:val="19"/>
+                <w:szCs w:val="19"/>
+              </w:rPr>
+              <w:t xml:space="preserve">Tout reste modifiable dans le chiffrage ; le préremplissage n'écrase jamais les autres zones.</w:t>
+            </w:r>
+          </w:p>
+        </w:tc>
+        <w:tc>
+          <w:tcPr>
+            <w:tcW w:type="dxa" w:w="1300"/>
+            <w:tcBorders>
+              <w:top w:val="single" w:color="D9D5CB" w:sz="4"/>
+              <w:left w:val="single" w:color="D9D5CB" w:sz="4"/>
+              <w:bottom w:val="single" w:color="D9D5CB" w:sz="4"/>
+              <w:right w:val="single" w:color="D9D5CB" w:sz="4"/>
+            </w:tcBorders>
+            <w:shd w:fill="E6F5EC" w:color="auto" w:val="clear"/>
+            <w:tcMar>
+              <w:top w:type="dxa" w:w="60"/>
+              <w:left w:type="dxa" w:w="90"/>
+              <w:bottom w:type="dxa" w:w="60"/>
+              <w:right w:type="dxa" w:w="90"/>
+            </w:tcMar>
+            <w:vAlign w:val="top"/>
+          </w:tcPr>
+          <w:p>
+            <w:pPr>
+              <w:spacing w:after="40"/>
+            </w:pPr>
+            <w:r>
+              <w:rPr>
+                <w:rFonts w:ascii="Calibri" w:cs="Calibri" w:eastAsia="Calibri" w:hAnsi="Calibri"/>
+                <w:b/>
+                <w:bCs/>
+                <w:color w:val="14213D"/>
+                <w:sz w:val="19"/>
+                <w:szCs w:val="19"/>
+              </w:rPr>
+              <w:t xml:space="preserve">Fait</w:t>
+            </w:r>
+          </w:p>
+        </w:tc>
+        <w:tc>
+          <w:tcPr>
+            <w:tcW w:type="dxa" w:w="3700"/>
+            <w:tcBorders>
+              <w:top w:val="single" w:color="D9D5CB" w:sz="4"/>
+              <w:left w:val="single" w:color="D9D5CB" w:sz="4"/>
+              <w:bottom w:val="single" w:color="D9D5CB" w:sz="4"/>
+              <w:right w:val="single" w:color="D9D5CB" w:sz="4"/>
+            </w:tcBorders>
+            <w:tcMar>
+              <w:top w:type="dxa" w:w="60"/>
+              <w:left w:type="dxa" w:w="90"/>
+              <w:bottom w:type="dxa" w:w="60"/>
+              <w:right w:type="dxa" w:w="90"/>
+            </w:tcMar>
+            <w:vAlign w:val="top"/>
+          </w:tcPr>
+          <w:p>
+            <w:pPr>
+              <w:spacing w:after="40"/>
+            </w:pPr>
+            <w:r>
+              <w:rPr>
+                <w:rFonts w:ascii="Calibri" w:cs="Calibri" w:eastAsia="Calibri" w:hAnsi="Calibri"/>
+                <w:color w:val="14213D"/>
+                <w:sz w:val="20"/>
+                <w:szCs w:val="20"/>
+              </w:rPr>
+              <w:t xml:space="preserve"/>
+            </w:r>
+          </w:p>
+          <w:p>
+            <w:pPr>
+              <w:spacing w:after="40"/>
+            </w:pPr>
+            <w:r>
+              <w:rPr>
+                <w:rFonts w:ascii="Calibri" w:cs="Calibri" w:eastAsia="Calibri" w:hAnsi="Calibri"/>
+                <w:color w:val="14213D"/>
+                <w:sz w:val="20"/>
+                <w:szCs w:val="20"/>
+              </w:rPr>
+              <w:t xml:space="preserve"/>
+            </w:r>
+          </w:p>
+        </w:tc>
+      </w:tr>
+      <w:tr>
+        <w:tc>
+          <w:tcPr>
+            <w:tcW w:type="dxa" w:w="2300"/>
+            <w:tcBorders>
+              <w:top w:val="single" w:color="D9D5CB" w:sz="4"/>
+              <w:left w:val="single" w:color="D9D5CB" w:sz="4"/>
+              <w:bottom w:val="single" w:color="D9D5CB" w:sz="4"/>
+              <w:right w:val="single" w:color="D9D5CB" w:sz="4"/>
+            </w:tcBorders>
+            <w:tcMar>
+              <w:top w:type="dxa" w:w="60"/>
+              <w:left w:type="dxa" w:w="90"/>
+              <w:bottom w:type="dxa" w:w="60"/>
+              <w:right w:type="dxa" w:w="90"/>
+            </w:tcMar>
+            <w:vAlign w:val="top"/>
+          </w:tcPr>
+          <w:p>
+            <w:pPr>
+              <w:spacing w:after="40"/>
+            </w:pPr>
+            <w:r>
+              <w:rPr>
+                <w:rFonts w:ascii="Calibri" w:cs="Calibri" w:eastAsia="Calibri" w:hAnsi="Calibri"/>
+                <w:b/>
+                <w:bCs/>
+                <w:color w:val="14213D"/>
+                <w:sz w:val="20"/>
+                <w:szCs w:val="20"/>
+              </w:rPr>
+              <w:t xml:space="preserve">DPGF : traduire notre prix, remplir l'Excel du client</w:t>
+            </w:r>
+          </w:p>
+        </w:tc>
+        <w:tc>
+          <w:tcPr>
+            <w:tcW w:type="dxa" w:w="4100"/>
+            <w:tcBorders>
+              <w:top w:val="single" w:color="D9D5CB" w:sz="4"/>
+              <w:left w:val="single" w:color="D9D5CB" w:sz="4"/>
+              <w:bottom w:val="single" w:color="D9D5CB" w:sz="4"/>
+              <w:right w:val="single" w:color="D9D5CB" w:sz="4"/>
+            </w:tcBorders>
+            <w:tcMar>
+              <w:top w:type="dxa" w:w="60"/>
+              <w:left w:type="dxa" w:w="90"/>
+              <w:bottom w:type="dxa" w:w="60"/>
+              <w:right w:type="dxa" w:w="90"/>
+            </w:tcMar>
+            <w:vAlign w:val="top"/>
+          </w:tcPr>
+          <w:p>
+            <w:pPr>
+              <w:spacing w:after="40"/>
+            </w:pPr>
+            <w:r>
+              <w:rPr>
+                <w:rFonts w:ascii="Calibri" w:cs="Calibri" w:eastAsia="Calibri" w:hAnsi="Calibri"/>
+                <w:color w:val="14213D"/>
+                <w:sz w:val="19"/>
+                <w:szCs w:val="19"/>
+              </w:rPr>
+              <w:t xml:space="preserve">5 · DPGF → importer le .xlsx du client (le fichier est gardé sur l'appareil) → carte « Traduire notre prix dans la DPGF » : par ligne, « ＋ source » (zone › poste ou panier libre, part en %), interrupteur « au ml » (la ligne se partage le reste des postes non affectés au prorata de sa quantité), montant et PU proposé ; en haut : prix à traduire, affecté, reste ventilé au ml, postes non affectés. « → Appliquer ces PU au bordereau » (total = prix de vente au centime), puis « ⬇ Excel du client rempli (.xlsx) » : les PU (et la colonne total si elle existe) réécrits dans SON fichier, mise en forme conservée, totaux recalculés à l'ouverture.</w:t>
+            </w:r>
+          </w:p>
+        </w:tc>
+        <w:tc>
+          <w:tcPr>
+            <w:tcW w:type="dxa" w:w="3700"/>
+            <w:tcBorders>
+              <w:top w:val="single" w:color="D9D5CB" w:sz="4"/>
+              <w:left w:val="single" w:color="D9D5CB" w:sz="4"/>
+              <w:bottom w:val="single" w:color="D9D5CB" w:sz="4"/>
+              <w:right w:val="single" w:color="D9D5CB" w:sz="4"/>
+            </w:tcBorders>
+            <w:tcMar>
+              <w:top w:type="dxa" w:w="60"/>
+              <w:left w:type="dxa" w:w="90"/>
+              <w:bottom w:type="dxa" w:w="60"/>
+              <w:right w:type="dxa" w:w="90"/>
+            </w:tcMar>
+            <w:vAlign w:val="top"/>
+          </w:tcPr>
+          <w:p>
+            <w:pPr>
+              <w:spacing w:after="40"/>
+            </w:pPr>
+            <w:r>
+              <w:rPr>
+                <w:rFonts w:ascii="Calibri" w:cs="Calibri" w:eastAsia="Calibri" w:hAnsi="Calibri"/>
+                <w:color w:val="14213D"/>
+                <w:sz w:val="19"/>
+                <w:szCs w:val="19"/>
+              </w:rPr>
+              <w:t xml:space="preserve">Si le fichier du client n'a pas de colonne PU, elle est ajoutée après la quantité (« PU HT (SCR) »). La répartition au prorata, l'arrondi, le PU à la main et le CSV restent. Le collage depuis Excel n'a pas de fichier à réécrire (export CSV).</w:t>
+            </w:r>
+          </w:p>
+        </w:tc>
+        <w:tc>
+          <w:tcPr>
+            <w:tcW w:type="dxa" w:w="1300"/>
+            <w:tcBorders>
+              <w:top w:val="single" w:color="D9D5CB" w:sz="4"/>
+              <w:left w:val="single" w:color="D9D5CB" w:sz="4"/>
+              <w:bottom w:val="single" w:color="D9D5CB" w:sz="4"/>
+              <w:right w:val="single" w:color="D9D5CB" w:sz="4"/>
+            </w:tcBorders>
+            <w:shd w:fill="E6F5EC" w:color="auto" w:val="clear"/>
+            <w:tcMar>
+              <w:top w:type="dxa" w:w="60"/>
+              <w:left w:type="dxa" w:w="90"/>
+              <w:bottom w:type="dxa" w:w="60"/>
+              <w:right w:type="dxa" w:w="90"/>
+            </w:tcMar>
+            <w:vAlign w:val="top"/>
+          </w:tcPr>
+          <w:p>
+            <w:pPr>
+              <w:spacing w:after="40"/>
+            </w:pPr>
+            <w:r>
+              <w:rPr>
+                <w:rFonts w:ascii="Calibri" w:cs="Calibri" w:eastAsia="Calibri" w:hAnsi="Calibri"/>
+                <w:b/>
+                <w:bCs/>
+                <w:color w:val="14213D"/>
+                <w:sz w:val="19"/>
+                <w:szCs w:val="19"/>
+              </w:rPr>
+              <w:t xml:space="preserve">Fait</w:t>
+            </w:r>
+          </w:p>
+        </w:tc>
+        <w:tc>
+          <w:tcPr>
+            <w:tcW w:type="dxa" w:w="3700"/>
+            <w:tcBorders>
+              <w:top w:val="single" w:color="D9D5CB" w:sz="4"/>
+              <w:left w:val="single" w:color="D9D5CB" w:sz="4"/>
+              <w:bottom w:val="single" w:color="D9D5CB" w:sz="4"/>
+              <w:right w:val="single" w:color="D9D5CB" w:sz="4"/>
+            </w:tcBorders>
+            <w:tcMar>
+              <w:top w:type="dxa" w:w="60"/>
+              <w:left w:type="dxa" w:w="90"/>
+              <w:bottom w:type="dxa" w:w="60"/>
+              <w:right w:type="dxa" w:w="90"/>
+            </w:tcMar>
+            <w:vAlign w:val="top"/>
+          </w:tcPr>
+          <w:p>
+            <w:pPr>
+              <w:spacing w:after="40"/>
+            </w:pPr>
+            <w:r>
+              <w:rPr>
+                <w:rFonts w:ascii="Calibri" w:cs="Calibri" w:eastAsia="Calibri" w:hAnsi="Calibri"/>
+                <w:color w:val="14213D"/>
+                <w:sz w:val="20"/>
+                <w:szCs w:val="20"/>
+              </w:rPr>
+              <w:t xml:space="preserve"/>
+            </w:r>
+          </w:p>
+          <w:p>
+            <w:pPr>
+              <w:spacing w:after="40"/>
+            </w:pPr>
+            <w:r>
+              <w:rPr>
+                <w:rFonts w:ascii="Calibri" w:cs="Calibri" w:eastAsia="Calibri" w:hAnsi="Calibri"/>
+                <w:color w:val="14213D"/>
+                <w:sz w:val="20"/>
+                <w:szCs w:val="20"/>
+              </w:rPr>
+              <w:t xml:space="preserve"/>
+            </w:r>
+          </w:p>
+        </w:tc>
+      </w:tr>
+      <w:tr>
+        <w:tc>
+          <w:tcPr>
+            <w:tcW w:type="dxa" w:w="2300"/>
+            <w:tcBorders>
+              <w:top w:val="single" w:color="D9D5CB" w:sz="4"/>
+              <w:left w:val="single" w:color="D9D5CB" w:sz="4"/>
+              <w:bottom w:val="single" w:color="D9D5CB" w:sz="4"/>
+              <w:right w:val="single" w:color="D9D5CB" w:sz="4"/>
+            </w:tcBorders>
+            <w:tcMar>
+              <w:top w:type="dxa" w:w="60"/>
+              <w:left w:type="dxa" w:w="90"/>
+              <w:bottom w:type="dxa" w:w="60"/>
+              <w:right w:type="dxa" w:w="90"/>
+            </w:tcMar>
+            <w:vAlign w:val="top"/>
+          </w:tcPr>
+          <w:p>
+            <w:pPr>
+              <w:spacing w:after="40"/>
+            </w:pPr>
+            <w:r>
+              <w:rPr>
+                <w:rFonts w:ascii="Calibri" w:cs="Calibri" w:eastAsia="Calibri" w:hAnsi="Calibri"/>
+                <w:b/>
+                <w:bCs/>
+                <w:color w:val="14213D"/>
+                <w:sz w:val="20"/>
+                <w:szCs w:val="20"/>
+              </w:rPr>
+              <w:t xml:space="preserve">Mémoire : blocs à cocher, modifiables pour l'affaire</w:t>
+            </w:r>
+          </w:p>
+        </w:tc>
+        <w:tc>
+          <w:tcPr>
+            <w:tcW w:type="dxa" w:w="4100"/>
+            <w:tcBorders>
+              <w:top w:val="single" w:color="D9D5CB" w:sz="4"/>
+              <w:left w:val="single" w:color="D9D5CB" w:sz="4"/>
+              <w:bottom w:val="single" w:color="D9D5CB" w:sz="4"/>
+              <w:right w:val="single" w:color="D9D5CB" w:sz="4"/>
+            </w:tcBorders>
+            <w:tcMar>
+              <w:top w:type="dxa" w:w="60"/>
+              <w:left w:type="dxa" w:w="90"/>
+              <w:bottom w:type="dxa" w:w="60"/>
+              <w:right w:type="dxa" w:w="90"/>
+            </w:tcMar>
+            <w:vAlign w:val="top"/>
+          </w:tcPr>
+          <w:p>
+            <w:pPr>
+              <w:spacing w:after="40"/>
+            </w:pPr>
+            <w:r>
+              <w:rPr>
+                <w:rFonts w:ascii="Calibri" w:cs="Calibri" w:eastAsia="Calibri" w:hAnsi="Calibri"/>
+                <w:color w:val="14213D"/>
+                <w:sz w:val="19"/>
+                <w:szCs w:val="19"/>
+              </w:rPr>
+              <w:t xml:space="preserve">4 · Mémoire → section → « Blocs SCR dans cette section » : coche un bloc = sa copie s'ajoute au texte (modifiable ici, le bloc de la base ne bouge pas) ; décoche = le texte est retiré s'il est intact. Bibliothèque : ✎ modifier, ＋ nouveau, ✕ ; « 💾 Garder comme bloc SCR » depuis une section. SQL blocs_memoire_scr.sql = ton mémoire O2410-10 en 10 blocs.</w:t>
+            </w:r>
+          </w:p>
+        </w:tc>
+        <w:tc>
+          <w:tcPr>
+            <w:tcW w:type="dxa" w:w="3700"/>
+            <w:tcBorders>
+              <w:top w:val="single" w:color="D9D5CB" w:sz="4"/>
+              <w:left w:val="single" w:color="D9D5CB" w:sz="4"/>
+              <w:bottom w:val="single" w:color="D9D5CB" w:sz="4"/>
+              <w:right w:val="single" w:color="D9D5CB" w:sz="4"/>
+            </w:tcBorders>
+            <w:tcMar>
+              <w:top w:type="dxa" w:w="60"/>
+              <w:left w:type="dxa" w:w="90"/>
+              <w:bottom w:type="dxa" w:w="60"/>
+              <w:right w:type="dxa" w:w="90"/>
+            </w:tcMar>
+            <w:vAlign w:val="top"/>
+          </w:tcPr>
+          <w:p>
+            <w:pPr>
+              <w:spacing w:after="40"/>
+            </w:pPr>
+            <w:r>
+              <w:rPr>
+                <w:rFonts w:ascii="Calibri" w:cs="Calibri" w:eastAsia="Calibri" w:hAnsi="Calibri"/>
+                <w:color w:val="14213D"/>
+                <w:sz w:val="19"/>
+                <w:szCs w:val="19"/>
+              </w:rPr>
+              <w:t xml:space="preserve">L'ancien « 📚 Insérer un bloc… » reste. Modifier un bloc dans la bibliothèque ne change pas les sections qui l'ont déjà copié — voulu.</w:t>
+            </w:r>
+          </w:p>
+        </w:tc>
+        <w:tc>
+          <w:tcPr>
+            <w:tcW w:type="dxa" w:w="1300"/>
+            <w:tcBorders>
+              <w:top w:val="single" w:color="D9D5CB" w:sz="4"/>
+              <w:left w:val="single" w:color="D9D5CB" w:sz="4"/>
+              <w:bottom w:val="single" w:color="D9D5CB" w:sz="4"/>
+              <w:right w:val="single" w:color="D9D5CB" w:sz="4"/>
+            </w:tcBorders>
+            <w:shd w:fill="E6F5EC" w:color="auto" w:val="clear"/>
+            <w:tcMar>
+              <w:top w:type="dxa" w:w="60"/>
+              <w:left w:type="dxa" w:w="90"/>
+              <w:bottom w:type="dxa" w:w="60"/>
+              <w:right w:type="dxa" w:w="90"/>
+            </w:tcMar>
+            <w:vAlign w:val="top"/>
+          </w:tcPr>
+          <w:p>
+            <w:pPr>
+              <w:spacing w:after="40"/>
+            </w:pPr>
+            <w:r>
+              <w:rPr>
+                <w:rFonts w:ascii="Calibri" w:cs="Calibri" w:eastAsia="Calibri" w:hAnsi="Calibri"/>
+                <w:b/>
+                <w:bCs/>
+                <w:color w:val="14213D"/>
+                <w:sz w:val="19"/>
+                <w:szCs w:val="19"/>
+              </w:rPr>
+              <w:t xml:space="preserve">Fait</w:t>
+            </w:r>
+          </w:p>
+        </w:tc>
+        <w:tc>
+          <w:tcPr>
+            <w:tcW w:type="dxa" w:w="3700"/>
+            <w:tcBorders>
+              <w:top w:val="single" w:color="D9D5CB" w:sz="4"/>
+              <w:left w:val="single" w:color="D9D5CB" w:sz="4"/>
+              <w:bottom w:val="single" w:color="D9D5CB" w:sz="4"/>
+              <w:right w:val="single" w:color="D9D5CB" w:sz="4"/>
+            </w:tcBorders>
+            <w:tcMar>
+              <w:top w:type="dxa" w:w="60"/>
+              <w:left w:type="dxa" w:w="90"/>
+              <w:bottom w:type="dxa" w:w="60"/>
+              <w:right w:type="dxa" w:w="90"/>
+            </w:tcMar>
+            <w:vAlign w:val="top"/>
+          </w:tcPr>
+          <w:p>
+            <w:pPr>
+              <w:spacing w:after="40"/>
+            </w:pPr>
+            <w:r>
+              <w:rPr>
+                <w:rFonts w:ascii="Calibri" w:cs="Calibri" w:eastAsia="Calibri" w:hAnsi="Calibri"/>
+                <w:color w:val="14213D"/>
+                <w:sz w:val="20"/>
+                <w:szCs w:val="20"/>
+              </w:rPr>
+              <w:t xml:space="preserve"/>
+            </w:r>
+          </w:p>
+          <w:p>
+            <w:pPr>
+              <w:spacing w:after="40"/>
+            </w:pPr>
+            <w:r>
+              <w:rPr>
+                <w:rFonts w:ascii="Calibri" w:cs="Calibri" w:eastAsia="Calibri" w:hAnsi="Calibri"/>
+                <w:color w:val="14213D"/>
+                <w:sz w:val="20"/>
+                <w:szCs w:val="20"/>
+              </w:rPr>
+              <w:t xml:space="preserve"/>
+            </w:r>
+          </w:p>
+        </w:tc>
+      </w:tr>
+      <w:tr>
+        <w:tc>
+          <w:tcPr>
+            <w:tcW w:type="dxa" w:w="2300"/>
+            <w:tcBorders>
+              <w:top w:val="single" w:color="D9D5CB" w:sz="4"/>
+              <w:left w:val="single" w:color="D9D5CB" w:sz="4"/>
+              <w:bottom w:val="single" w:color="D9D5CB" w:sz="4"/>
+              <w:right w:val="single" w:color="D9D5CB" w:sz="4"/>
+            </w:tcBorders>
+            <w:tcMar>
+              <w:top w:type="dxa" w:w="60"/>
+              <w:left w:type="dxa" w:w="90"/>
+              <w:bottom w:type="dxa" w:w="60"/>
+              <w:right w:type="dxa" w:w="90"/>
+            </w:tcMar>
+            <w:vAlign w:val="top"/>
+          </w:tcPr>
+          <w:p>
+            <w:pPr>
+              <w:spacing w:after="40"/>
+            </w:pPr>
+            <w:r>
+              <w:rPr>
+                <w:rFonts w:ascii="Calibri" w:cs="Calibri" w:eastAsia="Calibri" w:hAnsi="Calibri"/>
+                <w:b/>
+                <w:bCs/>
+                <w:color w:val="14213D"/>
+                <w:sz w:val="20"/>
+                <w:szCs w:val="20"/>
+              </w:rPr>
+              <w:t xml:space="preserve">Facturation et « Chantiers liés »</w:t>
+            </w:r>
+          </w:p>
+        </w:tc>
+        <w:tc>
+          <w:tcPr>
+            <w:tcW w:type="dxa" w:w="4100"/>
+            <w:tcBorders>
+              <w:top w:val="single" w:color="D9D5CB" w:sz="4"/>
+              <w:left w:val="single" w:color="D9D5CB" w:sz="4"/>
+              <w:bottom w:val="single" w:color="D9D5CB" w:sz="4"/>
+              <w:right w:val="single" w:color="D9D5CB" w:sz="4"/>
+            </w:tcBorders>
+            <w:tcMar>
+              <w:top w:type="dxa" w:w="60"/>
+              <w:left w:type="dxa" w:w="90"/>
+              <w:bottom w:type="dxa" w:w="60"/>
+              <w:right w:type="dxa" w:w="90"/>
+            </w:tcMar>
+            <w:vAlign w:val="top"/>
+          </w:tcPr>
+          <w:p>
+            <w:pPr>
+              <w:spacing w:after="40"/>
+            </w:pPr>
+            <w:r>
+              <w:rPr>
+                <w:rFonts w:ascii="Calibri" w:cs="Calibri" w:eastAsia="Calibri" w:hAnsi="Calibri"/>
+                <w:color w:val="14213D"/>
+                <w:sz w:val="19"/>
+                <w:szCs w:val="19"/>
+              </w:rPr>
+              <w:t xml:space="preserve">L'onglet Facturation n'apparaît plus au stade du devis : il vient quand l'affaire est gagnée (à débuter / en cours / terminé) ou déjà facturée. « Chantiers liés » devient « Tracé &amp; chantiers » avec l'explication : dessiner le projet (traceur), comparer les quantités (tracé / phases ↔ chiffrage), préparer l'exécution (plan, fiches, stock, fourniture, DOE sur le même chantier), rattacher plusieurs chantiers à une affaire.</w:t>
+            </w:r>
+          </w:p>
+        </w:tc>
+        <w:tc>
+          <w:tcPr>
+            <w:tcW w:type="dxa" w:w="3700"/>
+            <w:tcBorders>
+              <w:top w:val="single" w:color="D9D5CB" w:sz="4"/>
+              <w:left w:val="single" w:color="D9D5CB" w:sz="4"/>
+              <w:bottom w:val="single" w:color="D9D5CB" w:sz="4"/>
+              <w:right w:val="single" w:color="D9D5CB" w:sz="4"/>
+            </w:tcBorders>
+            <w:tcMar>
+              <w:top w:type="dxa" w:w="60"/>
+              <w:left w:type="dxa" w:w="90"/>
+              <w:bottom w:type="dxa" w:w="60"/>
+              <w:right w:type="dxa" w:w="90"/>
+            </w:tcMar>
+            <w:vAlign w:val="top"/>
+          </w:tcPr>
+          <w:p>
+            <w:pPr>
+              <w:spacing w:after="40"/>
+            </w:pPr>
+            <w:r>
+              <w:rPr>
+                <w:rFonts w:ascii="Calibri" w:cs="Calibri" w:eastAsia="Calibri" w:hAnsi="Calibri"/>
+                <w:color w:val="14213D"/>
+                <w:sz w:val="19"/>
+                <w:szCs w:val="19"/>
+              </w:rPr>
+              <w:t xml:space="preserve"/>
+            </w:r>
+          </w:p>
+        </w:tc>
+        <w:tc>
+          <w:tcPr>
+            <w:tcW w:type="dxa" w:w="1300"/>
+            <w:tcBorders>
+              <w:top w:val="single" w:color="D9D5CB" w:sz="4"/>
+              <w:left w:val="single" w:color="D9D5CB" w:sz="4"/>
+              <w:bottom w:val="single" w:color="D9D5CB" w:sz="4"/>
+              <w:right w:val="single" w:color="D9D5CB" w:sz="4"/>
+            </w:tcBorders>
+            <w:shd w:fill="E6F5EC" w:color="auto" w:val="clear"/>
+            <w:tcMar>
+              <w:top w:type="dxa" w:w="60"/>
+              <w:left w:type="dxa" w:w="90"/>
+              <w:bottom w:type="dxa" w:w="60"/>
+              <w:right w:type="dxa" w:w="90"/>
+            </w:tcMar>
+            <w:vAlign w:val="top"/>
+          </w:tcPr>
+          <w:p>
+            <w:pPr>
+              <w:spacing w:after="40"/>
+            </w:pPr>
+            <w:r>
+              <w:rPr>
+                <w:rFonts w:ascii="Calibri" w:cs="Calibri" w:eastAsia="Calibri" w:hAnsi="Calibri"/>
+                <w:b/>
+                <w:bCs/>
+                <w:color w:val="14213D"/>
+                <w:sz w:val="19"/>
+                <w:szCs w:val="19"/>
+              </w:rPr>
+              <w:t xml:space="preserve">Fait</w:t>
+            </w:r>
+          </w:p>
+        </w:tc>
+        <w:tc>
+          <w:tcPr>
+            <w:tcW w:type="dxa" w:w="3700"/>
+            <w:tcBorders>
+              <w:top w:val="single" w:color="D9D5CB" w:sz="4"/>
+              <w:left w:val="single" w:color="D9D5CB" w:sz="4"/>
+              <w:bottom w:val="single" w:color="D9D5CB" w:sz="4"/>
+              <w:right w:val="single" w:color="D9D5CB" w:sz="4"/>
+            </w:tcBorders>
+            <w:tcMar>
+              <w:top w:type="dxa" w:w="60"/>
+              <w:left w:type="dxa" w:w="90"/>
+              <w:bottom w:type="dxa" w:w="60"/>
+              <w:right w:type="dxa" w:w="90"/>
+            </w:tcMar>
+            <w:vAlign w:val="top"/>
+          </w:tcPr>
+          <w:p>
+            <w:pPr>
+              <w:spacing w:after="40"/>
+            </w:pPr>
+            <w:r>
+              <w:rPr>
+                <w:rFonts w:ascii="Calibri" w:cs="Calibri" w:eastAsia="Calibri" w:hAnsi="Calibri"/>
+                <w:color w:val="14213D"/>
+                <w:sz w:val="20"/>
+                <w:szCs w:val="20"/>
+              </w:rPr>
+              <w:t xml:space="preserve"/>
+            </w:r>
+          </w:p>
+          <w:p>
+            <w:pPr>
+              <w:spacing w:after="40"/>
+            </w:pPr>
+            <w:r>
+              <w:rPr>
+                <w:rFonts w:ascii="Calibri" w:cs="Calibri" w:eastAsia="Calibri" w:hAnsi="Calibri"/>
+                <w:color w:val="14213D"/>
+                <w:sz w:val="20"/>
+                <w:szCs w:val="20"/>
+              </w:rPr>
+              <w:t xml:space="preserve"/>
+            </w:r>
+          </w:p>
+        </w:tc>
+      </w:tr>
+      <w:tr>
+        <w:tc>
+          <w:tcPr>
+            <w:tcW w:type="dxa" w:w="2300"/>
+            <w:tcBorders>
+              <w:top w:val="single" w:color="D9D5CB" w:sz="4"/>
+              <w:left w:val="single" w:color="D9D5CB" w:sz="4"/>
+              <w:bottom w:val="single" w:color="D9D5CB" w:sz="4"/>
+              <w:right w:val="single" w:color="D9D5CB" w:sz="4"/>
+            </w:tcBorders>
+            <w:tcMar>
+              <w:top w:type="dxa" w:w="60"/>
+              <w:left w:type="dxa" w:w="90"/>
+              <w:bottom w:type="dxa" w:w="60"/>
+              <w:right w:type="dxa" w:w="90"/>
+            </w:tcMar>
+            <w:vAlign w:val="top"/>
+          </w:tcPr>
+          <w:p>
+            <w:pPr>
+              <w:spacing w:after="40"/>
+            </w:pPr>
+            <w:r>
+              <w:rPr>
+                <w:rFonts w:ascii="Calibri" w:cs="Calibri" w:eastAsia="Calibri" w:hAnsi="Calibri"/>
+                <w:b/>
+                <w:bCs/>
+                <w:color w:val="14213D"/>
+                <w:sz w:val="20"/>
+                <w:szCs w:val="20"/>
+              </w:rPr>
+              <w:t xml:space="preserve">Sécurité des prix</w:t>
+            </w:r>
+          </w:p>
+        </w:tc>
+        <w:tc>
+          <w:tcPr>
+            <w:tcW w:type="dxa" w:w="4100"/>
+            <w:tcBorders>
+              <w:top w:val="single" w:color="D9D5CB" w:sz="4"/>
+              <w:left w:val="single" w:color="D9D5CB" w:sz="4"/>
+              <w:bottom w:val="single" w:color="D9D5CB" w:sz="4"/>
+              <w:right w:val="single" w:color="D9D5CB" w:sz="4"/>
+            </w:tcBorders>
+            <w:tcMar>
+              <w:top w:type="dxa" w:w="60"/>
+              <w:left w:type="dxa" w:w="90"/>
+              <w:bottom w:type="dxa" w:w="60"/>
+              <w:right w:type="dxa" w:w="90"/>
+            </w:tcMar>
+            <w:vAlign w:val="top"/>
+          </w:tcPr>
+          <w:p>
+            <w:pPr>
+              <w:spacing w:after="40"/>
+            </w:pPr>
+            <w:r>
+              <w:rPr>
+                <w:rFonts w:ascii="Calibri" w:cs="Calibri" w:eastAsia="Calibri" w:hAnsi="Calibri"/>
+                <w:color w:val="14213D"/>
+                <w:sz w:val="19"/>
+                <w:szCs w:val="19"/>
+              </w:rPr>
+              <w:t xml:space="preserve">Le code de l'application n'embarque aucun prix : la base vient du serveur (lecture réservée à l'encadrement / bureau par le SQL) et du miroir de l'appareil. Le dépôt contient une maquette synthétique du classeur pour les tests (test/fixture_prix.xlsx : prix ronds fictifs, mêmes feuilles et blocs) — elle montre la STRUCTURE des paniers, pas vos prix.</w:t>
+            </w:r>
+          </w:p>
+        </w:tc>
+        <w:tc>
+          <w:tcPr>
+            <w:tcW w:type="dxa" w:w="3700"/>
+            <w:tcBorders>
+              <w:top w:val="single" w:color="D9D5CB" w:sz="4"/>
+              <w:left w:val="single" w:color="D9D5CB" w:sz="4"/>
+              <w:bottom w:val="single" w:color="D9D5CB" w:sz="4"/>
+              <w:right w:val="single" w:color="D9D5CB" w:sz="4"/>
+            </w:tcBorders>
+            <w:tcMar>
+              <w:top w:type="dxa" w:w="60"/>
+              <w:left w:type="dxa" w:w="90"/>
+              <w:bottom w:type="dxa" w:w="60"/>
+              <w:right w:type="dxa" w:w="90"/>
+            </w:tcMar>
+            <w:vAlign w:val="top"/>
+          </w:tcPr>
+          <w:p>
+            <w:pPr>
+              <w:spacing w:after="40"/>
+            </w:pPr>
+            <w:r>
+              <w:rPr>
+                <w:rFonts w:ascii="Calibri" w:cs="Calibri" w:eastAsia="Calibri" w:hAnsi="Calibri"/>
+                <w:color w:val="14213D"/>
+                <w:sz w:val="19"/>
+                <w:szCs w:val="19"/>
+              </w:rPr>
+              <w:t xml:space="preserve">Recommandation : passer le dépôt GitHub en privé (GitHub Pages marche aussi en privé avec un compte Pro / Team, sinon héberger le build ailleurs). À trancher par toi.</w:t>
+            </w:r>
+          </w:p>
+        </w:tc>
+        <w:tc>
+          <w:tcPr>
+            <w:tcW w:type="dxa" w:w="1300"/>
+            <w:tcBorders>
+              <w:top w:val="single" w:color="D9D5CB" w:sz="4"/>
+              <w:left w:val="single" w:color="D9D5CB" w:sz="4"/>
+              <w:bottom w:val="single" w:color="D9D5CB" w:sz="4"/>
+              <w:right w:val="single" w:color="D9D5CB" w:sz="4"/>
+            </w:tcBorders>
+            <w:shd w:fill="E6F5EC" w:color="auto" w:val="clear"/>
+            <w:tcMar>
+              <w:top w:type="dxa" w:w="60"/>
+              <w:left w:type="dxa" w:w="90"/>
+              <w:bottom w:type="dxa" w:w="60"/>
+              <w:right w:type="dxa" w:w="90"/>
+            </w:tcMar>
+            <w:vAlign w:val="top"/>
+          </w:tcPr>
+          <w:p>
+            <w:pPr>
+              <w:spacing w:after="40"/>
+            </w:pPr>
+            <w:r>
+              <w:rPr>
+                <w:rFonts w:ascii="Calibri" w:cs="Calibri" w:eastAsia="Calibri" w:hAnsi="Calibri"/>
+                <w:b/>
+                <w:bCs/>
+                <w:color w:val="14213D"/>
+                <w:sz w:val="19"/>
+                <w:szCs w:val="19"/>
+              </w:rPr>
+              <w:t xml:space="preserve">Fait</w:t>
+            </w:r>
+          </w:p>
+        </w:tc>
+        <w:tc>
+          <w:tcPr>
+            <w:tcW w:type="dxa" w:w="3700"/>
+            <w:tcBorders>
+              <w:top w:val="single" w:color="D9D5CB" w:sz="4"/>
+              <w:left w:val="single" w:color="D9D5CB" w:sz="4"/>
+              <w:bottom w:val="single" w:color="D9D5CB" w:sz="4"/>
+              <w:right w:val="single" w:color="D9D5CB" w:sz="4"/>
+            </w:tcBorders>
+            <w:tcMar>
+              <w:top w:type="dxa" w:w="60"/>
+              <w:left w:type="dxa" w:w="90"/>
+              <w:bottom w:type="dxa" w:w="60"/>
+              <w:right w:type="dxa" w:w="90"/>
+            </w:tcMar>
+            <w:vAlign w:val="top"/>
+          </w:tcPr>
+          <w:p>
+            <w:pPr>
+              <w:spacing w:after="40"/>
+            </w:pPr>
+            <w:r>
+              <w:rPr>
+                <w:rFonts w:ascii="Calibri" w:cs="Calibri" w:eastAsia="Calibri" w:hAnsi="Calibri"/>
+                <w:color w:val="14213D"/>
+                <w:sz w:val="20"/>
+                <w:szCs w:val="20"/>
+              </w:rPr>
+              <w:t xml:space="preserve"/>
+            </w:r>
+          </w:p>
+          <w:p>
+            <w:pPr>
+              <w:spacing w:after="40"/>
+            </w:pPr>
+            <w:r>
+              <w:rPr>
+                <w:rFonts w:ascii="Calibri" w:cs="Calibri" w:eastAsia="Calibri" w:hAnsi="Calibri"/>
+                <w:color w:val="14213D"/>
+                <w:sz w:val="20"/>
+                <w:szCs w:val="20"/>
+              </w:rPr>
+              <w:t xml:space="preserve"/>
+            </w:r>
+          </w:p>
+        </w:tc>
+      </w:tr>
+    </w:tbl>
+    <w:p>
+      <w:pPr>
+        <w:pStyle w:val="Heading1"/>
+        <w:spacing w:after="120" w:before="320"/>
+      </w:pPr>
+      <w:r>
+        <w:rPr>
+          <w:rFonts w:ascii="Calibri" w:cs="Calibri" w:eastAsia="Calibri" w:hAnsi="Calibri"/>
+          <w:b/>
+          <w:bCs/>
+          <w:color w:val="EB6834"/>
+          <w:sz w:val="30"/>
+          <w:szCs w:val="30"/>
+        </w:rPr>
         <w:t xml:space="preserve">I · Onglet FOURNITURE (fourniture et pose) — nouveau</w:t>
       </w:r>
     </w:p>
@@ -19016,26 +22009,7 @@
           <w:sz w:val="20"/>
           <w:szCs w:val="20"/>
         </w:rPr>
-        <w:t xml:space="preserve">Chiffrage V2B + lien tracé → calepinage / quantités + situations Excel depuis le DPGF : une maquette dédiée d'abord (une journée), puis le portage.</w:t>
-      </w:r>
-    </w:p>
-    <w:p>
-      <w:pPr>
-        <w:pStyle w:val="ListParagraph"/>
-        <w:numPr>
-          <w:ilvl w:val="0"/>
-          <w:numId w:val="2"/>
-        </w:numPr>
-        <w:spacing w:after="40"/>
-      </w:pPr>
-      <w:r>
-        <w:rPr>
-          <w:rFonts w:ascii="Calibri" w:cs="Calibri" w:eastAsia="Calibri" w:hAnsi="Calibri"/>
-          <w:color w:val="14213D"/>
-          <w:sz w:val="20"/>
-          <w:szCs w:val="20"/>
-        </w:rPr>
-        <w:t xml:space="preserve">Surlignage dans le PDF du CCTP (v2 des notes de lecture) : lecteur PDF annotable.</w:t>
+        <w:t xml:space="preserve">Commerce v2 — reste : planning d'exécution généré depuis les cadences (mémoire) ; situations de facturation par ligne de DPGF ; questions MOE → courrier type ; impression / Word du mémoire avec photos ; annotations à main levée sur les plans (le surlignage est sur le texte) ; ouvrir le traceur directement depuis un plan DWG / DXF du dossier ; dans le classeur, les cellules « Hors €/ml » par défaut (à me dire lesquelles).</w:t>
       </w:r>
     </w:p>
     <w:p>
@@ -19223,7 +22197,45 @@
           <w:sz w:val="20"/>
           <w:szCs w:val="20"/>
         </w:rPr>
-        <w:t xml:space="preserve">Résumé : Onglet Fourniture (commande, livré, reste, zones à livrer, camions datés) + adresses, détente automatique, contrôle GD, plein écran</w:t>
+        <w:t xml:space="preserve">Résumé : Commerce v2 — dossier déballé, lecture des pièces avec surlignage, chiffrage complet (classeur 26.08), paniers, base de prix, DPGF traduite et réécrite dans l'Excel, blocs du mémoire</w:t>
+      </w:r>
+    </w:p>
+    <w:p>
+      <w:pPr>
+        <w:pStyle w:val="ListParagraph"/>
+        <w:numPr>
+          <w:ilvl w:val="0"/>
+          <w:numId w:val="2"/>
+        </w:numPr>
+        <w:spacing w:after="40"/>
+      </w:pPr>
+      <w:r>
+        <w:rPr>
+          <w:rFonts w:ascii="Calibri" w:cs="Calibri" w:eastAsia="Calibri" w:hAnsi="Calibri"/>
+          <w:color w:val="14213D"/>
+          <w:sz w:val="20"/>
+          <w:szCs w:val="20"/>
+        </w:rPr>
+        <w:t xml:space="preserve">Description : 13/10 après-midi — prix.js (moteur du classeur V42 : Base MO / FO / Opération, 39 postes, vente = achat ÷ (1 − (RCFA + marge))), xlsx.js (lecture / écriture sans bibliothèque), chiffrage.js (zones en cartes, récap, par catégorie, paniers du classeur par DN avec écrasements, paniers libres SCR, base de prix éditable, import du .xlsm, comparaison avec le tracé par phase), dce.js (zip déballé et classé, versions, mails, visionneuse PDF / Word / Excel, sélection → note avec page et article, surlignages par destination, points techniques → préremplissage), DPGF (sources par ligne, reste au ml, PU appliqués, Excel du client réécrit), mémoire (blocs à cocher, bibliothèque éditable), Facturation après gain, Tracé &amp; chantiers. SQL retours_13-10b.sql (registres prix / panier, lecture encadrement), blocs_memoire_scr.sql. Tests : fixtures synthétiques (classeur, DCE), e2e_commerce2, 48 suites vertes.</w:t>
+      </w:r>
+    </w:p>
+    <w:p>
+      <w:pPr>
+        <w:pStyle w:val="ListParagraph"/>
+        <w:numPr>
+          <w:ilvl w:val="0"/>
+          <w:numId w:val="2"/>
+        </w:numPr>
+        <w:spacing w:after="40"/>
+      </w:pPr>
+      <w:r>
+        <w:rPr>
+          <w:rFonts w:ascii="Calibri" w:cs="Calibri" w:eastAsia="Calibri" w:hAnsi="Calibri"/>
+          <w:color w:val="14213D"/>
+          <w:sz w:val="20"/>
+          <w:szCs w:val="20"/>
+        </w:rPr>
+        <w:t xml:space="preserve">(matin) Résumé : Onglet Fourniture (commande, livré, reste, zones à livrer, camions datés) + adresses, détente automatique, contrôle GD, plein écran</w:t>
       </w:r>
     </w:p>
     <w:p>

</xml_diff>

<commit_message>
GD jour par jour, Fourniture v2, plan au zoom réparé, accès du responsable de chantier
</commit_message>
<xml_diff>
--- a/app/docs/Feuille_de_route_controle_12-10.docx
+++ b/app/docs/Feuille_de_route_controle_12-10.docx
@@ -29,7 +29,7 @@
           <w:sz w:val="22"/>
           <w:szCs w:val="22"/>
         </w:rPr>
-        <w:t xml:space="preserve">12 octobre 2026 · mise à jour du 13/10 après-midi : COMMERCE v2 (dossier déballé, lecture des pièces avec surlignage, chiffrage complet d'après ton classeur du 26.08, paniers, base de prix, DPGF traduite et réécrite dans l'Excel du client, blocs du mémoire) · le matin : onglet FOURNITURE (commande, livré, reste, zones à livrer, camions datés) et tes retours de la feuille du 09-10 (adresses, détente automatique, contrôle des grands déplacements, plein écran, trame d'accueil) · puis la nuit du 12/10 : six onglets, Commerce, Parc, Sécurité, accidents, Outlook serveur · nouvelle ventilation, « agir comme », raccourci rapide du planning, « ma semaine », tes commentaires du Word (sections 5 à 9) · une colonne pour tes retours</w:t>
+        <w:t xml:space="preserve">12 octobre 2026 · mise à jour de la nuit du 13/10 : le responsable d'un chantier y entre toujours (Sofiane) · le plan de Nantes Géraudière qui disparaissait au zoom (réparé + « Recentrer le repère ») · le soir : GRANDS DÉPLACEMENTS jour par jour (4 ou 5 jours = même forfait), le mois par gars avec nuits et repas accordés, la navette, les adresses à vérifier · FOURNITURE : zone éditable, trame type d'import, écarts « commande complémentaire / inclus », BL de zone → Stock · l'après-midi : COMMERCE v2 (dossier déballé, lecture des pièces avec surlignage, chiffrage complet d'après ton classeur du 26.08, paniers, base de prix, DPGF traduite et réécrite dans l'Excel du client, blocs du mémoire) · le matin : onglet FOURNITURE (commande, livré, reste, zones à livrer, camions datés) et tes retours de la feuille du 09-10 (adresses, détente automatique, contrôle des grands déplacements, plein écran, trame d'accueil) · puis la nuit du 12/10 : six onglets, Commerce, Parc, Sécurité, accidents, Outlook serveur · nouvelle ventilation, « agir comme », raccourci rapide du planning, « ma semaine », tes commentaires du Word (sections 5 à 9) · une colonne pour tes retours</w:t>
       </w:r>
     </w:p>
     <w:p>
@@ -65,7 +65,7 @@
           <w:sz w:val="20"/>
           <w:szCs w:val="20"/>
         </w:rPr>
-        <w:t xml:space="preserve">Même principe que la précédente : tu contrôles ligne par ligne, tu écris dans « Vos commentaires » (OK / à corriger / à changer : quoi), tu me renvoies le fichier. Je corrige à partir de tes commentaires, dans l'ordre du document. Commence par la section K (Commerce v2 : dossier, lecture, chiffrage, DPGF, mémoire — c'est ta demande de l'après-midi), puis I (l'onglet Fourniture), puis J (tes retours de la feuille du 09-10 : c'est la seule feuille à suivre désormais — l'ancienne n'est plus livrée), puis H (Commerce de A à Z), G (la nuit) et F (tes retours du 12/10 soir).</w:t>
+        <w:t xml:space="preserve">Même principe que la précédente : tu contrôles ligne par ligne, tu écris dans « Vos commentaires » (OK / à corriger / à changer : quoi), tu me renvoies le fichier. Je corrige à partir de tes commentaires, dans l'ordre du document. Commence par les sections N (Sofiane et le chantier de Nantes) et M (Nantes Géraudière : le plan qui disparaît au zoom), puis L (grands déplacements et fourniture), puis K (Commerce v2 : dossier, lecture, chiffrage, DPGF, mémoire), puis I (l'onglet Fourniture), puis J (tes retours de la feuille du 09-10 : c'est la seule feuille à suivre désormais — l'ancienne n'est plus livrée), puis H (Commerce de A à Z), G (la nuit) et F (tes retours du 12/10 soir).</w:t>
       </w:r>
     </w:p>
     <w:p>
@@ -84,7 +84,7 @@
           <w:sz w:val="20"/>
           <w:szCs w:val="20"/>
         </w:rPr>
-        <w:t xml:space="preserve">Build livré : 13/10/2026 · 61e3fc (index.html + traceur.html à la racine du dépôt). Nouveaux SQL à passer : retours_13-10b.sql (base de prix et paniers : registres « prix » et « panier », lecture réservée à l'encadrement / bureau), blocs_memoire_scr.sql (ton mémoire O2410-10 découpé en 10 blocs réutilisables) et, si pas encore fait, retours_13-10.sql (onglet Fourniture). SQL retours_12-10.sql et retours_12-10b.sql passés, fonction outlook-sync déployée et vérifiée par toi le 12/10 au soir (« ça fonctionne parfaitement »). Hors connexion, tout se teste avec les personnages de démo.</w:t>
+        <w:t xml:space="preserve">Build livré : 13/10/2026 · 92c3f2 (index.html + traceur.html à la racine du dépôt). Pas de SQL pour les sections N et M. Nouveau SQL du soir : retours_13-10c.sql (qualifications des écarts de fourniture réunies entre deux tablettes). SQL de l'après-midi : retours_13-10b.sql (base de prix et paniers : registres « prix » et « panier », lecture réservée à l'encadrement / bureau), blocs_memoire_scr.sql (ton mémoire O2410-10 découpé en 10 blocs réutilisables) (retours_13-10.sql de l'onglet Fourniture est inclus dans retours_13-10c.sql). SQL retours_12-10.sql et retours_12-10b.sql passés, fonction outlook-sync déployée et vérifiée par toi le 12/10 au soir (« ça fonctionne parfaitement »). Hors connexion, tout se teste avec les personnages de démo.</w:t>
       </w:r>
     </w:p>
     <w:p>
@@ -103,7 +103,7 @@
           <w:sz w:val="20"/>
           <w:szCs w:val="20"/>
         </w:rPr>
-        <w:t xml:space="preserve">Règle gardée : rien d'ancien n'est supprimé ; 48 suites de tests automatiques passent, dont e2e_commerce2 (8 étapes : import du classeur, zone et table des DN, SST / purges / contrôles / hydraulique / panier libre, récap et base de prix, dossier déballé, lecture PDF avec surlignage, Word et points techniques, DPGF réécrite dans l'Excel) et deux de la veille : e2e_fourniture (11 points : commande collée, comparatif, pièces en plus, livré lu dans Stock, zone entourée au doigt, zone du phasage, camions datés, annonce et pointage dans Stock, droits, téléphone, lecteur de lignes PDF, zones qui se chevauchent) et e2e_retours13 (n° d'affaire, plein écran, repas, adresses, détente automatique sur 5 semaines, accords, vue par personne, CSV).</w:t>
+        <w:t xml:space="preserve">Règle gardée : rien d'ancien n'est supprimé ; 52 suites de tests automatiques passent, dont e2e_resp (responsable du chantier = accès) et e2e_rebase (réseau à 1 985 km de l'origine : visible à 19,6 px/m, bandeau, recentrage, fils de nouveau justes au zoom) et les deux du soir : e2e_gdnav (4 jours = 5 nuitées / 10 repas / 15 €, « pas de détente » = 7 / 14 / 0 €, le mois de Julien, l'ajustement d'un jour, la navette CSV, novembre avec la Toussaint et un lundi non travaillé, les adresses à vérifier) et e2e_fourn2 (à la SOURIS réelle : tracer, glisser, insérer, retirer, annuler, reprendre et modifier un contour, boutons du plan ; trame copiée / téléchargée / collée ; écarts qualifiés et commande complémentaire ; BL de zone → Excel → Stock ; trame dans Stock ; classeur fournisseur avec la trame en 2e feuille), puis e2e_commerce2 (8 étapes : import du classeur, zone et table des DN, SST / purges / contrôles / hydraulique / panier libre, récap et base de prix, dossier déballé, lecture PDF avec surlignage, Word et points techniques, DPGF réécrite dans l'Excel) et deux de la veille : e2e_fourniture (11 points : commande collée, comparatif, pièces en plus, livré lu dans Stock, zone entourée au doigt, zone du phasage, camions datés, annonce et pointage dans Stock, droits, téléphone, lecteur de lignes PDF, zones qui se chevauchent) et e2e_retours13 (n° d'affaire, plein écran, repas, adresses, détente automatique sur 5 semaines, accords, vue par personne, CSV).</w:t>
       </w:r>
     </w:p>
     <w:p>
@@ -300,7 +300,121 @@
                 <w:sz w:val="19"/>
                 <w:szCs w:val="19"/>
               </w:rPr>
-              <w:t xml:space="preserve">app/sql/retours_13-10b.sql (NOUVEAU — à passer)</w:t>
+              <w:t xml:space="preserve">app/sql/retours_13-10c.sql (NOUVEAU — à passer ; contient tout retours_13-10.sql : ne repasse pas l'ancien APRÈS celui-ci)</w:t>
+            </w:r>
+          </w:p>
+        </w:tc>
+        <w:tc>
+          <w:tcPr>
+            <w:tcW w:type="dxa" w:w="8100"/>
+            <w:tcBorders>
+              <w:top w:val="single" w:color="D9D5CB" w:sz="4"/>
+              <w:left w:val="single" w:color="D9D5CB" w:sz="4"/>
+              <w:bottom w:val="single" w:color="D9D5CB" w:sz="4"/>
+              <w:right w:val="single" w:color="D9D5CB" w:sz="4"/>
+            </w:tcBorders>
+            <w:tcMar>
+              <w:top w:type="dxa" w:w="60"/>
+              <w:left w:type="dxa" w:w="90"/>
+              <w:bottom w:type="dxa" w:w="60"/>
+              <w:right w:type="dxa" w:w="90"/>
+            </w:tcMar>
+            <w:vAlign w:val="top"/>
+          </w:tcPr>
+          <w:p>
+            <w:pPr>
+              <w:spacing w:after="40"/>
+            </w:pPr>
+            <w:r>
+              <w:rPr>
+                <w:rFonts w:ascii="Calibri" w:cs="Calibri" w:eastAsia="Calibri" w:hAnsi="Calibri"/>
+                <w:color w:val="14213D"/>
+                <w:sz w:val="19"/>
+                <w:szCs w:val="19"/>
+              </w:rPr>
+              <w:t xml:space="preserve">site_set_part v8 : dans la partie « fourniture », les qualifications des écarts (📦 commande complémentaire / ✓ inclus) sont réunies par id entre deux appareils, comme les commandes, pièces en plus et zones (sinon la dernière tablette qui enregistre gagne). Rien d'autre ne change dans la fonction. Sans ce SQL : tout marche, mais deux personnes qui qualifient en même temps sur deux tablettes peuvent s'écraser.</w:t>
+            </w:r>
+          </w:p>
+        </w:tc>
+        <w:tc>
+          <w:tcPr>
+            <w:tcW w:type="dxa" w:w="3800"/>
+            <w:tcBorders>
+              <w:top w:val="single" w:color="D9D5CB" w:sz="4"/>
+              <w:left w:val="single" w:color="D9D5CB" w:sz="4"/>
+              <w:bottom w:val="single" w:color="D9D5CB" w:sz="4"/>
+              <w:right w:val="single" w:color="D9D5CB" w:sz="4"/>
+            </w:tcBorders>
+            <w:tcMar>
+              <w:top w:type="dxa" w:w="60"/>
+              <w:left w:type="dxa" w:w="90"/>
+              <w:bottom w:type="dxa" w:w="60"/>
+              <w:right w:type="dxa" w:w="90"/>
+            </w:tcMar>
+            <w:vAlign w:val="top"/>
+          </w:tcPr>
+          <w:p>
+            <w:pPr>
+              <w:spacing w:after="40"/>
+            </w:pPr>
+            <w:r>
+              <w:rPr>
+                <w:rFonts w:ascii="Calibri" w:cs="Calibri" w:eastAsia="Calibri" w:hAnsi="Calibri"/>
+                <w:color w:val="14213D"/>
+                <w:sz w:val="20"/>
+                <w:szCs w:val="20"/>
+              </w:rPr>
+              <w:t xml:space="preserve"/>
+            </w:r>
+          </w:p>
+          <w:p>
+            <w:pPr>
+              <w:spacing w:after="40"/>
+            </w:pPr>
+            <w:r>
+              <w:rPr>
+                <w:rFonts w:ascii="Calibri" w:cs="Calibri" w:eastAsia="Calibri" w:hAnsi="Calibri"/>
+                <w:color w:val="14213D"/>
+                <w:sz w:val="20"/>
+                <w:szCs w:val="20"/>
+              </w:rPr>
+              <w:t xml:space="preserve"/>
+            </w:r>
+          </w:p>
+        </w:tc>
+      </w:tr>
+      <w:tr>
+        <w:tc>
+          <w:tcPr>
+            <w:tcW w:type="dxa" w:w="3200"/>
+            <w:tcBorders>
+              <w:top w:val="single" w:color="D9D5CB" w:sz="4"/>
+              <w:left w:val="single" w:color="D9D5CB" w:sz="4"/>
+              <w:bottom w:val="single" w:color="D9D5CB" w:sz="4"/>
+              <w:right w:val="single" w:color="D9D5CB" w:sz="4"/>
+            </w:tcBorders>
+            <w:tcMar>
+              <w:top w:type="dxa" w:w="60"/>
+              <w:left w:type="dxa" w:w="90"/>
+              <w:bottom w:type="dxa" w:w="60"/>
+              <w:right w:type="dxa" w:w="90"/>
+            </w:tcMar>
+            <w:vAlign w:val="top"/>
+          </w:tcPr>
+          <w:p>
+            <w:pPr>
+              <w:spacing w:after="40"/>
+            </w:pPr>
+            <w:r>
+              <w:rPr>
+                <w:rFonts w:ascii="Calibri" w:cs="Calibri" w:eastAsia="Calibri" w:hAnsi="Calibri"/>
+                <w:b/>
+                <w:bCs/>
+                <w:color w:val="14213D"/>
+                <w:sz w:val="19"/>
+                <w:szCs w:val="19"/>
+              </w:rPr>
+              <w:t xml:space="preserve">app/sql/retours_13-10b.sql (après-midi — à passer si pas fait)</w:t>
             </w:r>
           </w:p>
         </w:tc>
@@ -12323,6 +12437,3943 @@
           <w:sz w:val="30"/>
           <w:szCs w:val="30"/>
         </w:rPr>
+        <w:t xml:space="preserve">N · Sofiane ne pouvait pas entrer dans Nantes (réglé)</w:t>
+      </w:r>
+    </w:p>
+    <w:tbl>
+      <w:tblPr>
+        <w:tblW w:type="dxa" w:w="15100"/>
+        <w:tblBorders>
+          <w:top w:val="single" w:color="auto" w:sz="4"/>
+          <w:left w:val="single" w:color="auto" w:sz="4"/>
+          <w:bottom w:val="single" w:color="auto" w:sz="4"/>
+          <w:right w:val="single" w:color="auto" w:sz="4"/>
+          <w:insideH w:val="single" w:color="auto" w:sz="4"/>
+          <w:insideV w:val="single" w:color="auto" w:sz="4"/>
+        </w:tblBorders>
+      </w:tblPr>
+      <w:tblGrid>
+        <w:gridCol w:w="2300"/>
+        <w:gridCol w:w="4100"/>
+        <w:gridCol w:w="3700"/>
+        <w:gridCol w:w="1300"/>
+        <w:gridCol w:w="3700"/>
+      </w:tblGrid>
+      <w:tr>
+        <w:trPr>
+          <w:tblHeader/>
+        </w:trPr>
+        <w:tc>
+          <w:tcPr>
+            <w:tcW w:type="dxa" w:w="2300"/>
+            <w:tcBorders>
+              <w:top w:val="single" w:color="D9D5CB" w:sz="4"/>
+              <w:left w:val="single" w:color="D9D5CB" w:sz="4"/>
+              <w:bottom w:val="single" w:color="D9D5CB" w:sz="4"/>
+              <w:right w:val="single" w:color="D9D5CB" w:sz="4"/>
+            </w:tcBorders>
+            <w:shd w:fill="14213D" w:color="auto" w:val="clear"/>
+            <w:tcMar>
+              <w:top w:type="dxa" w:w="60"/>
+              <w:left w:type="dxa" w:w="90"/>
+              <w:bottom w:type="dxa" w:w="60"/>
+              <w:right w:type="dxa" w:w="90"/>
+            </w:tcMar>
+            <w:vAlign w:val="top"/>
+          </w:tcPr>
+          <w:p>
+            <w:pPr>
+              <w:spacing w:after="80" w:line="264"/>
+            </w:pPr>
+            <w:r>
+              <w:rPr>
+                <w:rFonts w:ascii="Calibri" w:cs="Calibri" w:eastAsia="Calibri" w:hAnsi="Calibri"/>
+                <w:b/>
+                <w:bCs/>
+                <w:color w:val="FFFFFF"/>
+                <w:sz w:val="19"/>
+                <w:szCs w:val="19"/>
+              </w:rPr>
+              <w:t xml:space="preserve">Fonctionnalité</w:t>
+            </w:r>
+          </w:p>
+        </w:tc>
+        <w:tc>
+          <w:tcPr>
+            <w:tcW w:type="dxa" w:w="4100"/>
+            <w:tcBorders>
+              <w:top w:val="single" w:color="D9D5CB" w:sz="4"/>
+              <w:left w:val="single" w:color="D9D5CB" w:sz="4"/>
+              <w:bottom w:val="single" w:color="D9D5CB" w:sz="4"/>
+              <w:right w:val="single" w:color="D9D5CB" w:sz="4"/>
+            </w:tcBorders>
+            <w:shd w:fill="14213D" w:color="auto" w:val="clear"/>
+            <w:tcMar>
+              <w:top w:type="dxa" w:w="60"/>
+              <w:left w:type="dxa" w:w="90"/>
+              <w:bottom w:type="dxa" w:w="60"/>
+              <w:right w:type="dxa" w:w="90"/>
+            </w:tcMar>
+            <w:vAlign w:val="top"/>
+          </w:tcPr>
+          <w:p>
+            <w:pPr>
+              <w:spacing w:after="80" w:line="264"/>
+            </w:pPr>
+            <w:r>
+              <w:rPr>
+                <w:rFonts w:ascii="Calibri" w:cs="Calibri" w:eastAsia="Calibri" w:hAnsi="Calibri"/>
+                <w:b/>
+                <w:bCs/>
+                <w:color w:val="FFFFFF"/>
+                <w:sz w:val="19"/>
+                <w:szCs w:val="19"/>
+              </w:rPr>
+              <w:t xml:space="preserve">Où la trouver · comment tester</w:t>
+            </w:r>
+          </w:p>
+        </w:tc>
+        <w:tc>
+          <w:tcPr>
+            <w:tcW w:type="dxa" w:w="3700"/>
+            <w:tcBorders>
+              <w:top w:val="single" w:color="D9D5CB" w:sz="4"/>
+              <w:left w:val="single" w:color="D9D5CB" w:sz="4"/>
+              <w:bottom w:val="single" w:color="D9D5CB" w:sz="4"/>
+              <w:right w:val="single" w:color="D9D5CB" w:sz="4"/>
+            </w:tcBorders>
+            <w:shd w:fill="14213D" w:color="auto" w:val="clear"/>
+            <w:tcMar>
+              <w:top w:type="dxa" w:w="60"/>
+              <w:left w:type="dxa" w:w="90"/>
+              <w:bottom w:type="dxa" w:w="60"/>
+              <w:right w:type="dxa" w:w="90"/>
+            </w:tcMar>
+            <w:vAlign w:val="top"/>
+          </w:tcPr>
+          <w:p>
+            <w:pPr>
+              <w:spacing w:after="80" w:line="264"/>
+            </w:pPr>
+            <w:r>
+              <w:rPr>
+                <w:rFonts w:ascii="Calibri" w:cs="Calibri" w:eastAsia="Calibri" w:hAnsi="Calibri"/>
+                <w:b/>
+                <w:bCs/>
+                <w:color w:val="FFFFFF"/>
+                <w:sz w:val="19"/>
+                <w:szCs w:val="19"/>
+              </w:rPr>
+              <w:t xml:space="preserve">Hypothèses · limites · ce que j'ai tranché</w:t>
+            </w:r>
+          </w:p>
+        </w:tc>
+        <w:tc>
+          <w:tcPr>
+            <w:tcW w:type="dxa" w:w="1300"/>
+            <w:tcBorders>
+              <w:top w:val="single" w:color="D9D5CB" w:sz="4"/>
+              <w:left w:val="single" w:color="D9D5CB" w:sz="4"/>
+              <w:bottom w:val="single" w:color="D9D5CB" w:sz="4"/>
+              <w:right w:val="single" w:color="D9D5CB" w:sz="4"/>
+            </w:tcBorders>
+            <w:shd w:fill="14213D" w:color="auto" w:val="clear"/>
+            <w:tcMar>
+              <w:top w:type="dxa" w:w="60"/>
+              <w:left w:type="dxa" w:w="90"/>
+              <w:bottom w:type="dxa" w:w="60"/>
+              <w:right w:type="dxa" w:w="90"/>
+            </w:tcMar>
+            <w:vAlign w:val="top"/>
+          </w:tcPr>
+          <w:p>
+            <w:pPr>
+              <w:spacing w:after="80" w:line="264"/>
+            </w:pPr>
+            <w:r>
+              <w:rPr>
+                <w:rFonts w:ascii="Calibri" w:cs="Calibri" w:eastAsia="Calibri" w:hAnsi="Calibri"/>
+                <w:b/>
+                <w:bCs/>
+                <w:color w:val="FFFFFF"/>
+                <w:sz w:val="19"/>
+                <w:szCs w:val="19"/>
+              </w:rPr>
+              <w:t xml:space="preserve">Statut</w:t>
+            </w:r>
+          </w:p>
+        </w:tc>
+        <w:tc>
+          <w:tcPr>
+            <w:tcW w:type="dxa" w:w="3700"/>
+            <w:tcBorders>
+              <w:top w:val="single" w:color="D9D5CB" w:sz="4"/>
+              <w:left w:val="single" w:color="D9D5CB" w:sz="4"/>
+              <w:bottom w:val="single" w:color="D9D5CB" w:sz="4"/>
+              <w:right w:val="single" w:color="D9D5CB" w:sz="4"/>
+            </w:tcBorders>
+            <w:shd w:fill="14213D" w:color="auto" w:val="clear"/>
+            <w:tcMar>
+              <w:top w:type="dxa" w:w="60"/>
+              <w:left w:type="dxa" w:w="90"/>
+              <w:bottom w:type="dxa" w:w="60"/>
+              <w:right w:type="dxa" w:w="90"/>
+            </w:tcMar>
+            <w:vAlign w:val="top"/>
+          </w:tcPr>
+          <w:p>
+            <w:pPr>
+              <w:spacing w:after="80" w:line="264"/>
+            </w:pPr>
+            <w:r>
+              <w:rPr>
+                <w:rFonts w:ascii="Calibri" w:cs="Calibri" w:eastAsia="Calibri" w:hAnsi="Calibri"/>
+                <w:b/>
+                <w:bCs/>
+                <w:color w:val="FFFFFF"/>
+                <w:sz w:val="19"/>
+                <w:szCs w:val="19"/>
+              </w:rPr>
+              <w:t xml:space="preserve">Vos commentaires</w:t>
+            </w:r>
+          </w:p>
+        </w:tc>
+      </w:tr>
+      <w:tr>
+        <w:tc>
+          <w:tcPr>
+            <w:tcW w:type="dxa" w:w="2300"/>
+            <w:tcBorders>
+              <w:top w:val="single" w:color="D9D5CB" w:sz="4"/>
+              <w:left w:val="single" w:color="D9D5CB" w:sz="4"/>
+              <w:bottom w:val="single" w:color="D9D5CB" w:sz="4"/>
+              <w:right w:val="single" w:color="D9D5CB" w:sz="4"/>
+            </w:tcBorders>
+            <w:tcMar>
+              <w:top w:type="dxa" w:w="60"/>
+              <w:left w:type="dxa" w:w="90"/>
+              <w:bottom w:type="dxa" w:w="60"/>
+              <w:right w:type="dxa" w:w="90"/>
+            </w:tcMar>
+            <w:vAlign w:val="top"/>
+          </w:tcPr>
+          <w:p>
+            <w:pPr>
+              <w:spacing w:after="40"/>
+            </w:pPr>
+            <w:r>
+              <w:rPr>
+                <w:rFonts w:ascii="Calibri" w:cs="Calibri" w:eastAsia="Calibri" w:hAnsi="Calibri"/>
+                <w:b/>
+                <w:bCs/>
+                <w:color w:val="14213D"/>
+                <w:sz w:val="20"/>
+                <w:szCs w:val="20"/>
+              </w:rPr>
+              <w:t xml:space="preserve">Le responsable du chantier y entre toujours</w:t>
+            </w:r>
+          </w:p>
+        </w:tc>
+        <w:tc>
+          <w:tcPr>
+            <w:tcW w:type="dxa" w:w="4100"/>
+            <w:tcBorders>
+              <w:top w:val="single" w:color="D9D5CB" w:sz="4"/>
+              <w:left w:val="single" w:color="D9D5CB" w:sz="4"/>
+              <w:bottom w:val="single" w:color="D9D5CB" w:sz="4"/>
+              <w:right w:val="single" w:color="D9D5CB" w:sz="4"/>
+            </w:tcBorders>
+            <w:tcMar>
+              <w:top w:type="dxa" w:w="60"/>
+              <w:left w:type="dxa" w:w="90"/>
+              <w:bottom w:type="dxa" w:w="60"/>
+              <w:right w:type="dxa" w:w="90"/>
+            </w:tcMar>
+            <w:vAlign w:val="top"/>
+          </w:tcPr>
+          <w:p>
+            <w:pPr>
+              <w:spacing w:after="40"/>
+            </w:pPr>
+            <w:r>
+              <w:rPr>
+                <w:rFonts w:ascii="Calibri" w:cs="Calibri" w:eastAsia="Calibri" w:hAnsi="Calibri"/>
+                <w:color w:val="14213D"/>
+                <w:sz w:val="19"/>
+                <w:szCs w:val="19"/>
+              </w:rPr>
+              <w:t xml:space="preserve">Planning des équipes → ⚙ du chantier → « Chef de chantier » (ou « Conducteur ») = Sofiane → Sofiane ouvre Nantes, même s'il n'est pas encore placé dessus dans le planning.</w:t>
+            </w:r>
+          </w:p>
+        </w:tc>
+        <w:tc>
+          <w:tcPr>
+            <w:tcW w:type="dxa" w:w="3700"/>
+            <w:tcBorders>
+              <w:top w:val="single" w:color="D9D5CB" w:sz="4"/>
+              <w:left w:val="single" w:color="D9D5CB" w:sz="4"/>
+              <w:bottom w:val="single" w:color="D9D5CB" w:sz="4"/>
+              <w:right w:val="single" w:color="D9D5CB" w:sz="4"/>
+            </w:tcBorders>
+            <w:tcMar>
+              <w:top w:type="dxa" w:w="60"/>
+              <w:left w:type="dxa" w:w="90"/>
+              <w:bottom w:type="dxa" w:w="60"/>
+              <w:right w:type="dxa" w:w="90"/>
+            </w:tcMar>
+            <w:vAlign w:val="top"/>
+          </w:tcPr>
+          <w:p>
+            <w:pPr>
+              <w:spacing w:after="40"/>
+            </w:pPr>
+            <w:r>
+              <w:rPr>
+                <w:rFonts w:ascii="Calibri" w:cs="Calibri" w:eastAsia="Calibri" w:hAnsi="Calibri"/>
+                <w:color w:val="14213D"/>
+                <w:sz w:val="19"/>
+                <w:szCs w:val="19"/>
+              </w:rPr>
+              <w:t xml:space="preserve">Cause : depuis le 09/10, un chef de chantier et les gars de terrain n'ouvrent que les chantiers de leur planning (semaine en cours et précédente). La désignation dans la fiche du chantier n'était pas prise en compte. Le message de refus dit maintenant pourquoi.</w:t>
+            </w:r>
+          </w:p>
+        </w:tc>
+        <w:tc>
+          <w:tcPr>
+            <w:tcW w:type="dxa" w:w="1300"/>
+            <w:tcBorders>
+              <w:top w:val="single" w:color="D9D5CB" w:sz="4"/>
+              <w:left w:val="single" w:color="D9D5CB" w:sz="4"/>
+              <w:bottom w:val="single" w:color="D9D5CB" w:sz="4"/>
+              <w:right w:val="single" w:color="D9D5CB" w:sz="4"/>
+            </w:tcBorders>
+            <w:shd w:fill="E6F5EC" w:color="auto" w:val="clear"/>
+            <w:tcMar>
+              <w:top w:type="dxa" w:w="60"/>
+              <w:left w:type="dxa" w:w="90"/>
+              <w:bottom w:type="dxa" w:w="60"/>
+              <w:right w:type="dxa" w:w="90"/>
+            </w:tcMar>
+            <w:vAlign w:val="top"/>
+          </w:tcPr>
+          <w:p>
+            <w:pPr>
+              <w:spacing w:after="40"/>
+            </w:pPr>
+            <w:r>
+              <w:rPr>
+                <w:rFonts w:ascii="Calibri" w:cs="Calibri" w:eastAsia="Calibri" w:hAnsi="Calibri"/>
+                <w:b/>
+                <w:bCs/>
+                <w:color w:val="14213D"/>
+                <w:sz w:val="19"/>
+                <w:szCs w:val="19"/>
+              </w:rPr>
+              <w:t xml:space="preserve">Fait</w:t>
+            </w:r>
+          </w:p>
+        </w:tc>
+        <w:tc>
+          <w:tcPr>
+            <w:tcW w:type="dxa" w:w="3700"/>
+            <w:tcBorders>
+              <w:top w:val="single" w:color="D9D5CB" w:sz="4"/>
+              <w:left w:val="single" w:color="D9D5CB" w:sz="4"/>
+              <w:bottom w:val="single" w:color="D9D5CB" w:sz="4"/>
+              <w:right w:val="single" w:color="D9D5CB" w:sz="4"/>
+            </w:tcBorders>
+            <w:tcMar>
+              <w:top w:type="dxa" w:w="60"/>
+              <w:left w:type="dxa" w:w="90"/>
+              <w:bottom w:type="dxa" w:w="60"/>
+              <w:right w:type="dxa" w:w="90"/>
+            </w:tcMar>
+            <w:vAlign w:val="top"/>
+          </w:tcPr>
+          <w:p>
+            <w:pPr>
+              <w:spacing w:after="40"/>
+            </w:pPr>
+            <w:r>
+              <w:rPr>
+                <w:rFonts w:ascii="Calibri" w:cs="Calibri" w:eastAsia="Calibri" w:hAnsi="Calibri"/>
+                <w:color w:val="14213D"/>
+                <w:sz w:val="20"/>
+                <w:szCs w:val="20"/>
+              </w:rPr>
+              <w:t xml:space="preserve"/>
+            </w:r>
+          </w:p>
+          <w:p>
+            <w:pPr>
+              <w:spacing w:after="40"/>
+            </w:pPr>
+            <w:r>
+              <w:rPr>
+                <w:rFonts w:ascii="Calibri" w:cs="Calibri" w:eastAsia="Calibri" w:hAnsi="Calibri"/>
+                <w:color w:val="14213D"/>
+                <w:sz w:val="20"/>
+                <w:szCs w:val="20"/>
+              </w:rPr>
+              <w:t xml:space="preserve"/>
+            </w:r>
+          </w:p>
+        </w:tc>
+      </w:tr>
+      <w:tr>
+        <w:tc>
+          <w:tcPr>
+            <w:tcW w:type="dxa" w:w="2300"/>
+            <w:tcBorders>
+              <w:top w:val="single" w:color="D9D5CB" w:sz="4"/>
+              <w:left w:val="single" w:color="D9D5CB" w:sz="4"/>
+              <w:bottom w:val="single" w:color="D9D5CB" w:sz="4"/>
+              <w:right w:val="single" w:color="D9D5CB" w:sz="4"/>
+            </w:tcBorders>
+            <w:tcMar>
+              <w:top w:type="dxa" w:w="60"/>
+              <w:left w:type="dxa" w:w="90"/>
+              <w:bottom w:type="dxa" w:w="60"/>
+              <w:right w:type="dxa" w:w="90"/>
+            </w:tcMar>
+            <w:vAlign w:val="top"/>
+          </w:tcPr>
+          <w:p>
+            <w:pPr>
+              <w:spacing w:after="40"/>
+            </w:pPr>
+            <w:r>
+              <w:rPr>
+                <w:rFonts w:ascii="Calibri" w:cs="Calibri" w:eastAsia="Calibri" w:hAnsi="Calibri"/>
+                <w:b/>
+                <w:bCs/>
+                <w:color w:val="14213D"/>
+                <w:sz w:val="20"/>
+                <w:szCs w:val="20"/>
+              </w:rPr>
+              <w:t xml:space="preserve">Chef de chantier : la semaine prochaine aussi</w:t>
+            </w:r>
+          </w:p>
+        </w:tc>
+        <w:tc>
+          <w:tcPr>
+            <w:tcW w:type="dxa" w:w="4100"/>
+            <w:tcBorders>
+              <w:top w:val="single" w:color="D9D5CB" w:sz="4"/>
+              <w:left w:val="single" w:color="D9D5CB" w:sz="4"/>
+              <w:bottom w:val="single" w:color="D9D5CB" w:sz="4"/>
+              <w:right w:val="single" w:color="D9D5CB" w:sz="4"/>
+            </w:tcBorders>
+            <w:tcMar>
+              <w:top w:type="dxa" w:w="60"/>
+              <w:left w:type="dxa" w:w="90"/>
+              <w:bottom w:type="dxa" w:w="60"/>
+              <w:right w:type="dxa" w:w="90"/>
+            </w:tcMar>
+            <w:vAlign w:val="top"/>
+          </w:tcPr>
+          <w:p>
+            <w:pPr>
+              <w:spacing w:after="40"/>
+            </w:pPr>
+            <w:r>
+              <w:rPr>
+                <w:rFonts w:ascii="Calibri" w:cs="Calibri" w:eastAsia="Calibri" w:hAnsi="Calibri"/>
+                <w:color w:val="14213D"/>
+                <w:sz w:val="19"/>
+                <w:szCs w:val="19"/>
+              </w:rPr>
+              <w:t xml:space="preserve">Un chef placé sur un chantier la semaine PROCHAINE peut déjà l'ouvrir (préparer : plan, stock, accueil).</w:t>
+            </w:r>
+          </w:p>
+        </w:tc>
+        <w:tc>
+          <w:tcPr>
+            <w:tcW w:type="dxa" w:w="3700"/>
+            <w:tcBorders>
+              <w:top w:val="single" w:color="D9D5CB" w:sz="4"/>
+              <w:left w:val="single" w:color="D9D5CB" w:sz="4"/>
+              <w:bottom w:val="single" w:color="D9D5CB" w:sz="4"/>
+              <w:right w:val="single" w:color="D9D5CB" w:sz="4"/>
+            </w:tcBorders>
+            <w:tcMar>
+              <w:top w:type="dxa" w:w="60"/>
+              <w:left w:type="dxa" w:w="90"/>
+              <w:bottom w:type="dxa" w:w="60"/>
+              <w:right w:type="dxa" w:w="90"/>
+            </w:tcMar>
+            <w:vAlign w:val="top"/>
+          </w:tcPr>
+          <w:p>
+            <w:pPr>
+              <w:spacing w:after="40"/>
+            </w:pPr>
+            <w:r>
+              <w:rPr>
+                <w:rFonts w:ascii="Calibri" w:cs="Calibri" w:eastAsia="Calibri" w:hAnsi="Calibri"/>
+                <w:color w:val="14213D"/>
+                <w:sz w:val="19"/>
+                <w:szCs w:val="19"/>
+              </w:rPr>
+              <w:t xml:space="preserve">Les gars de terrain restent sur « semaine en cours et précédente ». Règle souple (pas planifié = tout voir) inchangée ; règle stricte : seulement les chantiers à son nom.</w:t>
+            </w:r>
+          </w:p>
+        </w:tc>
+        <w:tc>
+          <w:tcPr>
+            <w:tcW w:type="dxa" w:w="1300"/>
+            <w:tcBorders>
+              <w:top w:val="single" w:color="D9D5CB" w:sz="4"/>
+              <w:left w:val="single" w:color="D9D5CB" w:sz="4"/>
+              <w:bottom w:val="single" w:color="D9D5CB" w:sz="4"/>
+              <w:right w:val="single" w:color="D9D5CB" w:sz="4"/>
+            </w:tcBorders>
+            <w:shd w:fill="E6F5EC" w:color="auto" w:val="clear"/>
+            <w:tcMar>
+              <w:top w:type="dxa" w:w="60"/>
+              <w:left w:type="dxa" w:w="90"/>
+              <w:bottom w:type="dxa" w:w="60"/>
+              <w:right w:type="dxa" w:w="90"/>
+            </w:tcMar>
+            <w:vAlign w:val="top"/>
+          </w:tcPr>
+          <w:p>
+            <w:pPr>
+              <w:spacing w:after="40"/>
+            </w:pPr>
+            <w:r>
+              <w:rPr>
+                <w:rFonts w:ascii="Calibri" w:cs="Calibri" w:eastAsia="Calibri" w:hAnsi="Calibri"/>
+                <w:b/>
+                <w:bCs/>
+                <w:color w:val="14213D"/>
+                <w:sz w:val="19"/>
+                <w:szCs w:val="19"/>
+              </w:rPr>
+              <w:t xml:space="preserve">Fait</w:t>
+            </w:r>
+          </w:p>
+        </w:tc>
+        <w:tc>
+          <w:tcPr>
+            <w:tcW w:type="dxa" w:w="3700"/>
+            <w:tcBorders>
+              <w:top w:val="single" w:color="D9D5CB" w:sz="4"/>
+              <w:left w:val="single" w:color="D9D5CB" w:sz="4"/>
+              <w:bottom w:val="single" w:color="D9D5CB" w:sz="4"/>
+              <w:right w:val="single" w:color="D9D5CB" w:sz="4"/>
+            </w:tcBorders>
+            <w:tcMar>
+              <w:top w:type="dxa" w:w="60"/>
+              <w:left w:type="dxa" w:w="90"/>
+              <w:bottom w:type="dxa" w:w="60"/>
+              <w:right w:type="dxa" w:w="90"/>
+            </w:tcMar>
+            <w:vAlign w:val="top"/>
+          </w:tcPr>
+          <w:p>
+            <w:pPr>
+              <w:spacing w:after="40"/>
+            </w:pPr>
+            <w:r>
+              <w:rPr>
+                <w:rFonts w:ascii="Calibri" w:cs="Calibri" w:eastAsia="Calibri" w:hAnsi="Calibri"/>
+                <w:color w:val="14213D"/>
+                <w:sz w:val="20"/>
+                <w:szCs w:val="20"/>
+              </w:rPr>
+              <w:t xml:space="preserve"/>
+            </w:r>
+          </w:p>
+          <w:p>
+            <w:pPr>
+              <w:spacing w:after="40"/>
+            </w:pPr>
+            <w:r>
+              <w:rPr>
+                <w:rFonts w:ascii="Calibri" w:cs="Calibri" w:eastAsia="Calibri" w:hAnsi="Calibri"/>
+                <w:color w:val="14213D"/>
+                <w:sz w:val="20"/>
+                <w:szCs w:val="20"/>
+              </w:rPr>
+              <w:t xml:space="preserve"/>
+            </w:r>
+          </w:p>
+        </w:tc>
+      </w:tr>
+    </w:tbl>
+    <w:p>
+      <w:pPr>
+        <w:pStyle w:val="Heading1"/>
+        <w:spacing w:after="120" w:before="320"/>
+      </w:pPr>
+      <w:r>
+        <w:rPr>
+          <w:rFonts w:ascii="Calibri" w:cs="Calibri" w:eastAsia="Calibri" w:hAnsi="Calibri"/>
+          <w:b/>
+          <w:bCs/>
+          <w:color w:val="EB6834"/>
+          <w:sz w:val="30"/>
+          <w:szCs w:val="30"/>
+        </w:rPr>
+        <w:t xml:space="preserve">M · Nantes Géraudière : « au-dessus de 16 px/m tout disparaît » (réglé)</w:t>
+      </w:r>
+    </w:p>
+    <w:p>
+      <w:pPr>
+        <w:spacing w:after="80" w:line="264"/>
+      </w:pPr>
+      <w:r>
+        <w:rPr>
+          <w:rFonts w:ascii="Calibri" w:cs="Calibri" w:eastAsia="Calibri" w:hAnsi="Calibri"/>
+          <w:color w:val="6B6B66"/>
+          <w:sz w:val="20"/>
+          <w:szCs w:val="20"/>
+        </w:rPr>
+        <w:t xml:space="preserve">Reproduit à l'identique chez moi : visible à 16 px/m, plus rien à 19,6 (carte comprise). Deux causes, toutes deux traitées.</w:t>
+      </w:r>
+    </w:p>
+    <w:tbl>
+      <w:tblPr>
+        <w:tblW w:type="dxa" w:w="15100"/>
+        <w:tblBorders>
+          <w:top w:val="single" w:color="auto" w:sz="4"/>
+          <w:left w:val="single" w:color="auto" w:sz="4"/>
+          <w:bottom w:val="single" w:color="auto" w:sz="4"/>
+          <w:right w:val="single" w:color="auto" w:sz="4"/>
+          <w:insideH w:val="single" w:color="auto" w:sz="4"/>
+          <w:insideV w:val="single" w:color="auto" w:sz="4"/>
+        </w:tblBorders>
+      </w:tblPr>
+      <w:tblGrid>
+        <w:gridCol w:w="2300"/>
+        <w:gridCol w:w="4100"/>
+        <w:gridCol w:w="3700"/>
+        <w:gridCol w:w="1300"/>
+        <w:gridCol w:w="3700"/>
+      </w:tblGrid>
+      <w:tr>
+        <w:trPr>
+          <w:tblHeader/>
+        </w:trPr>
+        <w:tc>
+          <w:tcPr>
+            <w:tcW w:type="dxa" w:w="2300"/>
+            <w:tcBorders>
+              <w:top w:val="single" w:color="D9D5CB" w:sz="4"/>
+              <w:left w:val="single" w:color="D9D5CB" w:sz="4"/>
+              <w:bottom w:val="single" w:color="D9D5CB" w:sz="4"/>
+              <w:right w:val="single" w:color="D9D5CB" w:sz="4"/>
+            </w:tcBorders>
+            <w:shd w:fill="14213D" w:color="auto" w:val="clear"/>
+            <w:tcMar>
+              <w:top w:type="dxa" w:w="60"/>
+              <w:left w:type="dxa" w:w="90"/>
+              <w:bottom w:type="dxa" w:w="60"/>
+              <w:right w:type="dxa" w:w="90"/>
+            </w:tcMar>
+            <w:vAlign w:val="top"/>
+          </w:tcPr>
+          <w:p>
+            <w:pPr>
+              <w:spacing w:after="80" w:line="264"/>
+            </w:pPr>
+            <w:r>
+              <w:rPr>
+                <w:rFonts w:ascii="Calibri" w:cs="Calibri" w:eastAsia="Calibri" w:hAnsi="Calibri"/>
+                <w:b/>
+                <w:bCs/>
+                <w:color w:val="FFFFFF"/>
+                <w:sz w:val="19"/>
+                <w:szCs w:val="19"/>
+              </w:rPr>
+              <w:t xml:space="preserve">Fonctionnalité</w:t>
+            </w:r>
+          </w:p>
+        </w:tc>
+        <w:tc>
+          <w:tcPr>
+            <w:tcW w:type="dxa" w:w="4100"/>
+            <w:tcBorders>
+              <w:top w:val="single" w:color="D9D5CB" w:sz="4"/>
+              <w:left w:val="single" w:color="D9D5CB" w:sz="4"/>
+              <w:bottom w:val="single" w:color="D9D5CB" w:sz="4"/>
+              <w:right w:val="single" w:color="D9D5CB" w:sz="4"/>
+            </w:tcBorders>
+            <w:shd w:fill="14213D" w:color="auto" w:val="clear"/>
+            <w:tcMar>
+              <w:top w:type="dxa" w:w="60"/>
+              <w:left w:type="dxa" w:w="90"/>
+              <w:bottom w:type="dxa" w:w="60"/>
+              <w:right w:type="dxa" w:w="90"/>
+            </w:tcMar>
+            <w:vAlign w:val="top"/>
+          </w:tcPr>
+          <w:p>
+            <w:pPr>
+              <w:spacing w:after="80" w:line="264"/>
+            </w:pPr>
+            <w:r>
+              <w:rPr>
+                <w:rFonts w:ascii="Calibri" w:cs="Calibri" w:eastAsia="Calibri" w:hAnsi="Calibri"/>
+                <w:b/>
+                <w:bCs/>
+                <w:color w:val="FFFFFF"/>
+                <w:sz w:val="19"/>
+                <w:szCs w:val="19"/>
+              </w:rPr>
+              <w:t xml:space="preserve">Où la trouver · comment tester</w:t>
+            </w:r>
+          </w:p>
+        </w:tc>
+        <w:tc>
+          <w:tcPr>
+            <w:tcW w:type="dxa" w:w="3700"/>
+            <w:tcBorders>
+              <w:top w:val="single" w:color="D9D5CB" w:sz="4"/>
+              <w:left w:val="single" w:color="D9D5CB" w:sz="4"/>
+              <w:bottom w:val="single" w:color="D9D5CB" w:sz="4"/>
+              <w:right w:val="single" w:color="D9D5CB" w:sz="4"/>
+            </w:tcBorders>
+            <w:shd w:fill="14213D" w:color="auto" w:val="clear"/>
+            <w:tcMar>
+              <w:top w:type="dxa" w:w="60"/>
+              <w:left w:type="dxa" w:w="90"/>
+              <w:bottom w:type="dxa" w:w="60"/>
+              <w:right w:type="dxa" w:w="90"/>
+            </w:tcMar>
+            <w:vAlign w:val="top"/>
+          </w:tcPr>
+          <w:p>
+            <w:pPr>
+              <w:spacing w:after="80" w:line="264"/>
+            </w:pPr>
+            <w:r>
+              <w:rPr>
+                <w:rFonts w:ascii="Calibri" w:cs="Calibri" w:eastAsia="Calibri" w:hAnsi="Calibri"/>
+                <w:b/>
+                <w:bCs/>
+                <w:color w:val="FFFFFF"/>
+                <w:sz w:val="19"/>
+                <w:szCs w:val="19"/>
+              </w:rPr>
+              <w:t xml:space="preserve">Hypothèses · limites · ce que j'ai tranché</w:t>
+            </w:r>
+          </w:p>
+        </w:tc>
+        <w:tc>
+          <w:tcPr>
+            <w:tcW w:type="dxa" w:w="1300"/>
+            <w:tcBorders>
+              <w:top w:val="single" w:color="D9D5CB" w:sz="4"/>
+              <w:left w:val="single" w:color="D9D5CB" w:sz="4"/>
+              <w:bottom w:val="single" w:color="D9D5CB" w:sz="4"/>
+              <w:right w:val="single" w:color="D9D5CB" w:sz="4"/>
+            </w:tcBorders>
+            <w:shd w:fill="14213D" w:color="auto" w:val="clear"/>
+            <w:tcMar>
+              <w:top w:type="dxa" w:w="60"/>
+              <w:left w:type="dxa" w:w="90"/>
+              <w:bottom w:type="dxa" w:w="60"/>
+              <w:right w:type="dxa" w:w="90"/>
+            </w:tcMar>
+            <w:vAlign w:val="top"/>
+          </w:tcPr>
+          <w:p>
+            <w:pPr>
+              <w:spacing w:after="80" w:line="264"/>
+            </w:pPr>
+            <w:r>
+              <w:rPr>
+                <w:rFonts w:ascii="Calibri" w:cs="Calibri" w:eastAsia="Calibri" w:hAnsi="Calibri"/>
+                <w:b/>
+                <w:bCs/>
+                <w:color w:val="FFFFFF"/>
+                <w:sz w:val="19"/>
+                <w:szCs w:val="19"/>
+              </w:rPr>
+              <w:t xml:space="preserve">Statut</w:t>
+            </w:r>
+          </w:p>
+        </w:tc>
+        <w:tc>
+          <w:tcPr>
+            <w:tcW w:type="dxa" w:w="3700"/>
+            <w:tcBorders>
+              <w:top w:val="single" w:color="D9D5CB" w:sz="4"/>
+              <w:left w:val="single" w:color="D9D5CB" w:sz="4"/>
+              <w:bottom w:val="single" w:color="D9D5CB" w:sz="4"/>
+              <w:right w:val="single" w:color="D9D5CB" w:sz="4"/>
+            </w:tcBorders>
+            <w:shd w:fill="14213D" w:color="auto" w:val="clear"/>
+            <w:tcMar>
+              <w:top w:type="dxa" w:w="60"/>
+              <w:left w:type="dxa" w:w="90"/>
+              <w:bottom w:type="dxa" w:w="60"/>
+              <w:right w:type="dxa" w:w="90"/>
+            </w:tcMar>
+            <w:vAlign w:val="top"/>
+          </w:tcPr>
+          <w:p>
+            <w:pPr>
+              <w:spacing w:after="80" w:line="264"/>
+            </w:pPr>
+            <w:r>
+              <w:rPr>
+                <w:rFonts w:ascii="Calibri" w:cs="Calibri" w:eastAsia="Calibri" w:hAnsi="Calibri"/>
+                <w:b/>
+                <w:bCs/>
+                <w:color w:val="FFFFFF"/>
+                <w:sz w:val="19"/>
+                <w:szCs w:val="19"/>
+              </w:rPr>
+              <w:t xml:space="preserve">Vos commentaires</w:t>
+            </w:r>
+          </w:p>
+        </w:tc>
+      </w:tr>
+      <w:tr>
+        <w:tc>
+          <w:tcPr>
+            <w:tcW w:type="dxa" w:w="2300"/>
+            <w:tcBorders>
+              <w:top w:val="single" w:color="D9D5CB" w:sz="4"/>
+              <w:left w:val="single" w:color="D9D5CB" w:sz="4"/>
+              <w:bottom w:val="single" w:color="D9D5CB" w:sz="4"/>
+              <w:right w:val="single" w:color="D9D5CB" w:sz="4"/>
+            </w:tcBorders>
+            <w:tcMar>
+              <w:top w:type="dxa" w:w="60"/>
+              <w:left w:type="dxa" w:w="90"/>
+              <w:bottom w:type="dxa" w:w="60"/>
+              <w:right w:type="dxa" w:w="90"/>
+            </w:tcMar>
+            <w:vAlign w:val="top"/>
+          </w:tcPr>
+          <w:p>
+            <w:pPr>
+              <w:spacing w:after="40"/>
+            </w:pPr>
+            <w:r>
+              <w:rPr>
+                <w:rFonts w:ascii="Calibri" w:cs="Calibri" w:eastAsia="Calibri" w:hAnsi="Calibri"/>
+                <w:b/>
+                <w:bCs/>
+                <w:color w:val="14213D"/>
+                <w:sz w:val="20"/>
+                <w:szCs w:val="20"/>
+              </w:rPr>
+              <w:t xml:space="preserve">Le plan ne disparaît plus au zoom</w:t>
+            </w:r>
+          </w:p>
+        </w:tc>
+        <w:tc>
+          <w:tcPr>
+            <w:tcW w:type="dxa" w:w="4100"/>
+            <w:tcBorders>
+              <w:top w:val="single" w:color="D9D5CB" w:sz="4"/>
+              <w:left w:val="single" w:color="D9D5CB" w:sz="4"/>
+              <w:bottom w:val="single" w:color="D9D5CB" w:sz="4"/>
+              <w:right w:val="single" w:color="D9D5CB" w:sz="4"/>
+            </w:tcBorders>
+            <w:tcMar>
+              <w:top w:type="dxa" w:w="60"/>
+              <w:left w:type="dxa" w:w="90"/>
+              <w:bottom w:type="dxa" w:w="60"/>
+              <w:right w:type="dxa" w:w="90"/>
+            </w:tcMar>
+            <w:vAlign w:val="top"/>
+          </w:tcPr>
+          <w:p>
+            <w:pPr>
+              <w:spacing w:after="40"/>
+            </w:pPr>
+            <w:r>
+              <w:rPr>
+                <w:rFonts w:ascii="Calibri" w:cs="Calibri" w:eastAsia="Calibri" w:hAnsi="Calibri"/>
+                <w:color w:val="14213D"/>
+                <w:sz w:val="19"/>
+                <w:szCs w:val="19"/>
+              </w:rPr>
+              <w:t xml:space="preserve">Ouvre Nantes Géraudière → zoome au-delà de 20, 50, 100 px/m : réseau et carte restent.</w:t>
+            </w:r>
+          </w:p>
+        </w:tc>
+        <w:tc>
+          <w:tcPr>
+            <w:tcW w:type="dxa" w:w="3700"/>
+            <w:tcBorders>
+              <w:top w:val="single" w:color="D9D5CB" w:sz="4"/>
+              <w:left w:val="single" w:color="D9D5CB" w:sz="4"/>
+              <w:bottom w:val="single" w:color="D9D5CB" w:sz="4"/>
+              <w:right w:val="single" w:color="D9D5CB" w:sz="4"/>
+            </w:tcBorders>
+            <w:tcMar>
+              <w:top w:type="dxa" w:w="60"/>
+              <w:left w:type="dxa" w:w="90"/>
+              <w:bottom w:type="dxa" w:w="60"/>
+              <w:right w:type="dxa" w:w="90"/>
+            </w:tcMar>
+            <w:vAlign w:val="top"/>
+          </w:tcPr>
+          <w:p>
+            <w:pPr>
+              <w:spacing w:after="40"/>
+            </w:pPr>
+            <w:r>
+              <w:rPr>
+                <w:rFonts w:ascii="Calibri" w:cs="Calibri" w:eastAsia="Calibri" w:hAnsi="Calibri"/>
+                <w:color w:val="14213D"/>
+                <w:sz w:val="19"/>
+                <w:szCs w:val="19"/>
+              </w:rPr>
+              <w:t xml:space="preserve">Cause : Chrome ne dessine plus rien quand une valeur de position dépasse ~33 millions de pixels. Ton réseau est à ~2 000 km de l'origine de son repère : à 19,6 px/m ça faisait 39 millions. La vue s'écrit maintenant autrement (même résultat à l'écran, plus de valeur énorme) : plan, feuilles hydraulique et stock, traceur.</w:t>
+            </w:r>
+          </w:p>
+        </w:tc>
+        <w:tc>
+          <w:tcPr>
+            <w:tcW w:type="dxa" w:w="1300"/>
+            <w:tcBorders>
+              <w:top w:val="single" w:color="D9D5CB" w:sz="4"/>
+              <w:left w:val="single" w:color="D9D5CB" w:sz="4"/>
+              <w:bottom w:val="single" w:color="D9D5CB" w:sz="4"/>
+              <w:right w:val="single" w:color="D9D5CB" w:sz="4"/>
+            </w:tcBorders>
+            <w:shd w:fill="E6F5EC" w:color="auto" w:val="clear"/>
+            <w:tcMar>
+              <w:top w:type="dxa" w:w="60"/>
+              <w:left w:type="dxa" w:w="90"/>
+              <w:bottom w:type="dxa" w:w="60"/>
+              <w:right w:type="dxa" w:w="90"/>
+            </w:tcMar>
+            <w:vAlign w:val="top"/>
+          </w:tcPr>
+          <w:p>
+            <w:pPr>
+              <w:spacing w:after="40"/>
+            </w:pPr>
+            <w:r>
+              <w:rPr>
+                <w:rFonts w:ascii="Calibri" w:cs="Calibri" w:eastAsia="Calibri" w:hAnsi="Calibri"/>
+                <w:b/>
+                <w:bCs/>
+                <w:color w:val="14213D"/>
+                <w:sz w:val="19"/>
+                <w:szCs w:val="19"/>
+              </w:rPr>
+              <w:t xml:space="preserve">Fait</w:t>
+            </w:r>
+          </w:p>
+        </w:tc>
+        <w:tc>
+          <w:tcPr>
+            <w:tcW w:type="dxa" w:w="3700"/>
+            <w:tcBorders>
+              <w:top w:val="single" w:color="D9D5CB" w:sz="4"/>
+              <w:left w:val="single" w:color="D9D5CB" w:sz="4"/>
+              <w:bottom w:val="single" w:color="D9D5CB" w:sz="4"/>
+              <w:right w:val="single" w:color="D9D5CB" w:sz="4"/>
+            </w:tcBorders>
+            <w:tcMar>
+              <w:top w:type="dxa" w:w="60"/>
+              <w:left w:type="dxa" w:w="90"/>
+              <w:bottom w:type="dxa" w:w="60"/>
+              <w:right w:type="dxa" w:w="90"/>
+            </w:tcMar>
+            <w:vAlign w:val="top"/>
+          </w:tcPr>
+          <w:p>
+            <w:pPr>
+              <w:spacing w:after="40"/>
+            </w:pPr>
+            <w:r>
+              <w:rPr>
+                <w:rFonts w:ascii="Calibri" w:cs="Calibri" w:eastAsia="Calibri" w:hAnsi="Calibri"/>
+                <w:color w:val="14213D"/>
+                <w:sz w:val="20"/>
+                <w:szCs w:val="20"/>
+              </w:rPr>
+              <w:t xml:space="preserve"/>
+            </w:r>
+          </w:p>
+          <w:p>
+            <w:pPr>
+              <w:spacing w:after="40"/>
+            </w:pPr>
+            <w:r>
+              <w:rPr>
+                <w:rFonts w:ascii="Calibri" w:cs="Calibri" w:eastAsia="Calibri" w:hAnsi="Calibri"/>
+                <w:color w:val="14213D"/>
+                <w:sz w:val="20"/>
+                <w:szCs w:val="20"/>
+              </w:rPr>
+              <w:t xml:space="preserve"/>
+            </w:r>
+          </w:p>
+        </w:tc>
+      </w:tr>
+      <w:tr>
+        <w:tc>
+          <w:tcPr>
+            <w:tcW w:type="dxa" w:w="2300"/>
+            <w:tcBorders>
+              <w:top w:val="single" w:color="D9D5CB" w:sz="4"/>
+              <w:left w:val="single" w:color="D9D5CB" w:sz="4"/>
+              <w:bottom w:val="single" w:color="D9D5CB" w:sz="4"/>
+              <w:right w:val="single" w:color="D9D5CB" w:sz="4"/>
+            </w:tcBorders>
+            <w:tcMar>
+              <w:top w:type="dxa" w:w="60"/>
+              <w:left w:type="dxa" w:w="90"/>
+              <w:bottom w:type="dxa" w:w="60"/>
+              <w:right w:type="dxa" w:w="90"/>
+            </w:tcMar>
+            <w:vAlign w:val="top"/>
+          </w:tcPr>
+          <w:p>
+            <w:pPr>
+              <w:spacing w:after="40"/>
+            </w:pPr>
+            <w:r>
+              <w:rPr>
+                <w:rFonts w:ascii="Calibri" w:cs="Calibri" w:eastAsia="Calibri" w:hAnsi="Calibri"/>
+                <w:b/>
+                <w:bCs/>
+                <w:color w:val="14213D"/>
+                <w:sz w:val="20"/>
+                <w:szCs w:val="20"/>
+              </w:rPr>
+              <w:t xml:space="preserve">« Recentrer le repère » (1 clic, à faire une fois)</w:t>
+            </w:r>
+          </w:p>
+        </w:tc>
+        <w:tc>
+          <w:tcPr>
+            <w:tcW w:type="dxa" w:w="4100"/>
+            <w:tcBorders>
+              <w:top w:val="single" w:color="D9D5CB" w:sz="4"/>
+              <w:left w:val="single" w:color="D9D5CB" w:sz="4"/>
+              <w:bottom w:val="single" w:color="D9D5CB" w:sz="4"/>
+              <w:right w:val="single" w:color="D9D5CB" w:sz="4"/>
+            </w:tcBorders>
+            <w:tcMar>
+              <w:top w:type="dxa" w:w="60"/>
+              <w:left w:type="dxa" w:w="90"/>
+              <w:bottom w:type="dxa" w:w="60"/>
+              <w:right w:type="dxa" w:w="90"/>
+            </w:tcMar>
+            <w:vAlign w:val="top"/>
+          </w:tcPr>
+          <w:p>
+            <w:pPr>
+              <w:spacing w:after="40"/>
+            </w:pPr>
+            <w:r>
+              <w:rPr>
+                <w:rFonts w:ascii="Calibri" w:cs="Calibri" w:eastAsia="Calibri" w:hAnsi="Calibri"/>
+                <w:color w:val="14213D"/>
+                <w:sz w:val="19"/>
+                <w:szCs w:val="19"/>
+              </w:rPr>
+              <w:t xml:space="preserve">Sur ce chantier, en haut du plan : bandeau jaune « ⚠ Repère du plan à ~1 985 km de l'origine · Recentrer » → « Recentrer le repère ». CONNECTÉ (le chantier est réécrit sur le serveur). Le plan reste au même endroit à l'écran et sur la carte ; le bandeau disparaît.</w:t>
+            </w:r>
+          </w:p>
+        </w:tc>
+        <w:tc>
+          <w:tcPr>
+            <w:tcW w:type="dxa" w:w="3700"/>
+            <w:tcBorders>
+              <w:top w:val="single" w:color="D9D5CB" w:sz="4"/>
+              <w:left w:val="single" w:color="D9D5CB" w:sz="4"/>
+              <w:bottom w:val="single" w:color="D9D5CB" w:sz="4"/>
+              <w:right w:val="single" w:color="D9D5CB" w:sz="4"/>
+            </w:tcBorders>
+            <w:tcMar>
+              <w:top w:type="dxa" w:w="60"/>
+              <w:left w:type="dxa" w:w="90"/>
+              <w:bottom w:type="dxa" w:w="60"/>
+              <w:right w:type="dxa" w:w="90"/>
+            </w:tcMar>
+            <w:vAlign w:val="top"/>
+          </w:tcPr>
+          <w:p>
+            <w:pPr>
+              <w:spacing w:after="40"/>
+            </w:pPr>
+            <w:r>
+              <w:rPr>
+                <w:rFonts w:ascii="Calibri" w:cs="Calibri" w:eastAsia="Calibri" w:hAnsi="Calibri"/>
+                <w:color w:val="14213D"/>
+                <w:sz w:val="19"/>
+                <w:szCs w:val="19"/>
+              </w:rPr>
+              <w:t xml:space="preserve">Pourquoi : même affiché, à 2 000 km le navigateur arrondit les positions au pas de 12,5 cm → de près, fils absents, bouts d'acier et manchons faux. Recentrer décale tout le chantier d'un bloc (réseau, fond, tracé marché, stock, notes, zones, hydraulique, modifs) et corrige le géoréférencement ; numéros, statuts, photos, PK, phasage : inchangés. L'ancienne version reste dans ⏱ Versions. À faire quand personne d'autre n'a le chantier ouvert.</w:t>
+            </w:r>
+          </w:p>
+        </w:tc>
+        <w:tc>
+          <w:tcPr>
+            <w:tcW w:type="dxa" w:w="1300"/>
+            <w:tcBorders>
+              <w:top w:val="single" w:color="D9D5CB" w:sz="4"/>
+              <w:left w:val="single" w:color="D9D5CB" w:sz="4"/>
+              <w:bottom w:val="single" w:color="D9D5CB" w:sz="4"/>
+              <w:right w:val="single" w:color="D9D5CB" w:sz="4"/>
+            </w:tcBorders>
+            <w:shd w:fill="FFF4EE" w:color="auto" w:val="clear"/>
+            <w:tcMar>
+              <w:top w:type="dxa" w:w="60"/>
+              <w:left w:type="dxa" w:w="90"/>
+              <w:bottom w:type="dxa" w:w="60"/>
+              <w:right w:type="dxa" w:w="90"/>
+            </w:tcMar>
+            <w:vAlign w:val="top"/>
+          </w:tcPr>
+          <w:p>
+            <w:pPr>
+              <w:spacing w:after="40"/>
+            </w:pPr>
+            <w:r>
+              <w:rPr>
+                <w:rFonts w:ascii="Calibri" w:cs="Calibri" w:eastAsia="Calibri" w:hAnsi="Calibri"/>
+                <w:b/>
+                <w:bCs/>
+                <w:color w:val="14213D"/>
+                <w:sz w:val="19"/>
+                <w:szCs w:val="19"/>
+              </w:rPr>
+              <w:t xml:space="preserve">À faire par toi</w:t>
+            </w:r>
+          </w:p>
+        </w:tc>
+        <w:tc>
+          <w:tcPr>
+            <w:tcW w:type="dxa" w:w="3700"/>
+            <w:tcBorders>
+              <w:top w:val="single" w:color="D9D5CB" w:sz="4"/>
+              <w:left w:val="single" w:color="D9D5CB" w:sz="4"/>
+              <w:bottom w:val="single" w:color="D9D5CB" w:sz="4"/>
+              <w:right w:val="single" w:color="D9D5CB" w:sz="4"/>
+            </w:tcBorders>
+            <w:tcMar>
+              <w:top w:type="dxa" w:w="60"/>
+              <w:left w:type="dxa" w:w="90"/>
+              <w:bottom w:type="dxa" w:w="60"/>
+              <w:right w:type="dxa" w:w="90"/>
+            </w:tcMar>
+            <w:vAlign w:val="top"/>
+          </w:tcPr>
+          <w:p>
+            <w:pPr>
+              <w:spacing w:after="40"/>
+            </w:pPr>
+            <w:r>
+              <w:rPr>
+                <w:rFonts w:ascii="Calibri" w:cs="Calibri" w:eastAsia="Calibri" w:hAnsi="Calibri"/>
+                <w:color w:val="14213D"/>
+                <w:sz w:val="20"/>
+                <w:szCs w:val="20"/>
+              </w:rPr>
+              <w:t xml:space="preserve"/>
+            </w:r>
+          </w:p>
+          <w:p>
+            <w:pPr>
+              <w:spacing w:after="40"/>
+            </w:pPr>
+            <w:r>
+              <w:rPr>
+                <w:rFonts w:ascii="Calibri" w:cs="Calibri" w:eastAsia="Calibri" w:hAnsi="Calibri"/>
+                <w:color w:val="14213D"/>
+                <w:sz w:val="20"/>
+                <w:szCs w:val="20"/>
+              </w:rPr>
+              <w:t xml:space="preserve"/>
+            </w:r>
+          </w:p>
+        </w:tc>
+      </w:tr>
+      <w:tr>
+        <w:tc>
+          <w:tcPr>
+            <w:tcW w:type="dxa" w:w="2300"/>
+            <w:tcBorders>
+              <w:top w:val="single" w:color="D9D5CB" w:sz="4"/>
+              <w:left w:val="single" w:color="D9D5CB" w:sz="4"/>
+              <w:bottom w:val="single" w:color="D9D5CB" w:sz="4"/>
+              <w:right w:val="single" w:color="D9D5CB" w:sz="4"/>
+            </w:tcBorders>
+            <w:tcMar>
+              <w:top w:type="dxa" w:w="60"/>
+              <w:left w:type="dxa" w:w="90"/>
+              <w:bottom w:type="dxa" w:w="60"/>
+              <w:right w:type="dxa" w:w="90"/>
+            </w:tcMar>
+            <w:vAlign w:val="top"/>
+          </w:tcPr>
+          <w:p>
+            <w:pPr>
+              <w:spacing w:after="40"/>
+            </w:pPr>
+            <w:r>
+              <w:rPr>
+                <w:rFonts w:ascii="Calibri" w:cs="Calibri" w:eastAsia="Calibri" w:hAnsi="Calibri"/>
+                <w:b/>
+                <w:bCs/>
+                <w:color w:val="14213D"/>
+                <w:sz w:val="20"/>
+                <w:szCs w:val="20"/>
+              </w:rPr>
+              <w:t xml:space="preserve">Le traceur ne reprend plus le repère d'un autre plan</w:t>
+            </w:r>
+          </w:p>
+        </w:tc>
+        <w:tc>
+          <w:tcPr>
+            <w:tcW w:type="dxa" w:w="4100"/>
+            <w:tcBorders>
+              <w:top w:val="single" w:color="D9D5CB" w:sz="4"/>
+              <w:left w:val="single" w:color="D9D5CB" w:sz="4"/>
+              <w:bottom w:val="single" w:color="D9D5CB" w:sz="4"/>
+              <w:right w:val="single" w:color="D9D5CB" w:sz="4"/>
+            </w:tcBorders>
+            <w:tcMar>
+              <w:top w:type="dxa" w:w="60"/>
+              <w:left w:type="dxa" w:w="90"/>
+              <w:bottom w:type="dxa" w:w="60"/>
+              <w:right w:type="dxa" w:w="90"/>
+            </w:tcMar>
+            <w:vAlign w:val="top"/>
+          </w:tcPr>
+          <w:p>
+            <w:pPr>
+              <w:spacing w:after="40"/>
+            </w:pPr>
+            <w:r>
+              <w:rPr>
+                <w:rFonts w:ascii="Calibri" w:cs="Calibri" w:eastAsia="Calibri" w:hAnsi="Calibri"/>
+                <w:color w:val="14213D"/>
+                <w:sz w:val="19"/>
+                <w:szCs w:val="19"/>
+              </w:rPr>
+              <w:t xml:space="preserve">Traceur → charge un DXF d'une autre ville que le précédent : il prend SON repère (alerte si des lignes déjà tracées ne sont pas sur ce plan).</w:t>
+            </w:r>
+          </w:p>
+        </w:tc>
+        <w:tc>
+          <w:tcPr>
+            <w:tcW w:type="dxa" w:w="3700"/>
+            <w:tcBorders>
+              <w:top w:val="single" w:color="D9D5CB" w:sz="4"/>
+              <w:left w:val="single" w:color="D9D5CB" w:sz="4"/>
+              <w:bottom w:val="single" w:color="D9D5CB" w:sz="4"/>
+              <w:right w:val="single" w:color="D9D5CB" w:sz="4"/>
+            </w:tcBorders>
+            <w:tcMar>
+              <w:top w:type="dxa" w:w="60"/>
+              <w:left w:type="dxa" w:w="90"/>
+              <w:bottom w:type="dxa" w:w="60"/>
+              <w:right w:type="dxa" w:w="90"/>
+            </w:tcMar>
+            <w:vAlign w:val="top"/>
+          </w:tcPr>
+          <w:p>
+            <w:pPr>
+              <w:spacing w:after="40"/>
+            </w:pPr>
+            <w:r>
+              <w:rPr>
+                <w:rFonts w:ascii="Calibri" w:cs="Calibri" w:eastAsia="Calibri" w:hAnsi="Calibri"/>
+                <w:color w:val="14213D"/>
+                <w:sz w:val="19"/>
+                <w:szCs w:val="19"/>
+              </w:rPr>
+              <w:t xml:space="preserve">C'était la cause : le traceur gardait l'origine du plan précédent (Saint-Lô, zone CC49) pour ton plan de Nantes (zone CC47) → 1 985 km d'écart. Gardée seulement si le nouveau plan est à moins de 50 km (même plan, version à jour). Un enregistrement du traceur sur un chantier recentré entre-temps est refusé (deux repères ne se mélangent jamais).</w:t>
+            </w:r>
+          </w:p>
+        </w:tc>
+        <w:tc>
+          <w:tcPr>
+            <w:tcW w:type="dxa" w:w="1300"/>
+            <w:tcBorders>
+              <w:top w:val="single" w:color="D9D5CB" w:sz="4"/>
+              <w:left w:val="single" w:color="D9D5CB" w:sz="4"/>
+              <w:bottom w:val="single" w:color="D9D5CB" w:sz="4"/>
+              <w:right w:val="single" w:color="D9D5CB" w:sz="4"/>
+            </w:tcBorders>
+            <w:shd w:fill="E6F5EC" w:color="auto" w:val="clear"/>
+            <w:tcMar>
+              <w:top w:type="dxa" w:w="60"/>
+              <w:left w:type="dxa" w:w="90"/>
+              <w:bottom w:type="dxa" w:w="60"/>
+              <w:right w:type="dxa" w:w="90"/>
+            </w:tcMar>
+            <w:vAlign w:val="top"/>
+          </w:tcPr>
+          <w:p>
+            <w:pPr>
+              <w:spacing w:after="40"/>
+            </w:pPr>
+            <w:r>
+              <w:rPr>
+                <w:rFonts w:ascii="Calibri" w:cs="Calibri" w:eastAsia="Calibri" w:hAnsi="Calibri"/>
+                <w:b/>
+                <w:bCs/>
+                <w:color w:val="14213D"/>
+                <w:sz w:val="19"/>
+                <w:szCs w:val="19"/>
+              </w:rPr>
+              <w:t xml:space="preserve">Fait</w:t>
+            </w:r>
+          </w:p>
+        </w:tc>
+        <w:tc>
+          <w:tcPr>
+            <w:tcW w:type="dxa" w:w="3700"/>
+            <w:tcBorders>
+              <w:top w:val="single" w:color="D9D5CB" w:sz="4"/>
+              <w:left w:val="single" w:color="D9D5CB" w:sz="4"/>
+              <w:bottom w:val="single" w:color="D9D5CB" w:sz="4"/>
+              <w:right w:val="single" w:color="D9D5CB" w:sz="4"/>
+            </w:tcBorders>
+            <w:tcMar>
+              <w:top w:type="dxa" w:w="60"/>
+              <w:left w:type="dxa" w:w="90"/>
+              <w:bottom w:type="dxa" w:w="60"/>
+              <w:right w:type="dxa" w:w="90"/>
+            </w:tcMar>
+            <w:vAlign w:val="top"/>
+          </w:tcPr>
+          <w:p>
+            <w:pPr>
+              <w:spacing w:after="40"/>
+            </w:pPr>
+            <w:r>
+              <w:rPr>
+                <w:rFonts w:ascii="Calibri" w:cs="Calibri" w:eastAsia="Calibri" w:hAnsi="Calibri"/>
+                <w:color w:val="14213D"/>
+                <w:sz w:val="20"/>
+                <w:szCs w:val="20"/>
+              </w:rPr>
+              <w:t xml:space="preserve"/>
+            </w:r>
+          </w:p>
+          <w:p>
+            <w:pPr>
+              <w:spacing w:after="40"/>
+            </w:pPr>
+            <w:r>
+              <w:rPr>
+                <w:rFonts w:ascii="Calibri" w:cs="Calibri" w:eastAsia="Calibri" w:hAnsi="Calibri"/>
+                <w:color w:val="14213D"/>
+                <w:sz w:val="20"/>
+                <w:szCs w:val="20"/>
+              </w:rPr>
+              <w:t xml:space="preserve"/>
+            </w:r>
+          </w:p>
+        </w:tc>
+      </w:tr>
+    </w:tbl>
+    <w:p>
+      <w:pPr>
+        <w:pStyle w:val="Heading1"/>
+        <w:spacing w:after="120" w:before="320"/>
+      </w:pPr>
+      <w:r>
+        <w:rPr>
+          <w:rFonts w:ascii="Calibri" w:cs="Calibri" w:eastAsia="Calibri" w:hAnsi="Calibri"/>
+          <w:b/>
+          <w:bCs/>
+          <w:color w:val="EB6834"/>
+          <w:sz w:val="30"/>
+          <w:szCs w:val="30"/>
+        </w:rPr>
+        <w:t xml:space="preserve">L · Tes retours du soir : GRANDS DÉPLACEMENTS et FOURNITURE</w:t>
+      </w:r>
+    </w:p>
+    <w:p>
+      <w:pPr>
+        <w:spacing w:after="80" w:line="264"/>
+      </w:pPr>
+      <w:r>
+        <w:rPr>
+          <w:rFonts w:ascii="Calibri" w:cs="Calibri" w:eastAsia="Calibri" w:hAnsi="Calibri"/>
+          <w:color w:val="6B6B66"/>
+          <w:sz w:val="20"/>
+          <w:szCs w:val="20"/>
+        </w:rPr>
+        <w:t xml:space="preserve">« En majorité les gars travaillent en 4 jours lundi → jeudi ; 4 ou 5 jours, c'est toujours les mêmes règles ; les indemnités ne se déclenchent qu'en cas de détente ; une vue du mois par gars avec les nuits et repas accordés ; fais-moi ressortir les adresses en erreur » · « entourer une zone : ajouter, supprimer, glisser un point ; une trame type pour importer ; écarts comme les TS : commande complémentaire ou inclus ; une zone ou une phase → un BL importable dans Stock ». ⚠ La navette type que tu voulais joindre n'est PAS arrivée : renvoie-la, je cale l'export dessus.</w:t>
+      </w:r>
+    </w:p>
+    <w:tbl>
+      <w:tblPr>
+        <w:tblW w:type="dxa" w:w="15100"/>
+        <w:tblBorders>
+          <w:top w:val="single" w:color="auto" w:sz="4"/>
+          <w:left w:val="single" w:color="auto" w:sz="4"/>
+          <w:bottom w:val="single" w:color="auto" w:sz="4"/>
+          <w:right w:val="single" w:color="auto" w:sz="4"/>
+          <w:insideH w:val="single" w:color="auto" w:sz="4"/>
+          <w:insideV w:val="single" w:color="auto" w:sz="4"/>
+        </w:tblBorders>
+      </w:tblPr>
+      <w:tblGrid>
+        <w:gridCol w:w="2300"/>
+        <w:gridCol w:w="4100"/>
+        <w:gridCol w:w="3700"/>
+        <w:gridCol w:w="1300"/>
+        <w:gridCol w:w="3700"/>
+      </w:tblGrid>
+      <w:tr>
+        <w:trPr>
+          <w:tblHeader/>
+        </w:trPr>
+        <w:tc>
+          <w:tcPr>
+            <w:tcW w:type="dxa" w:w="2300"/>
+            <w:tcBorders>
+              <w:top w:val="single" w:color="D9D5CB" w:sz="4"/>
+              <w:left w:val="single" w:color="D9D5CB" w:sz="4"/>
+              <w:bottom w:val="single" w:color="D9D5CB" w:sz="4"/>
+              <w:right w:val="single" w:color="D9D5CB" w:sz="4"/>
+            </w:tcBorders>
+            <w:shd w:fill="14213D" w:color="auto" w:val="clear"/>
+            <w:tcMar>
+              <w:top w:type="dxa" w:w="60"/>
+              <w:left w:type="dxa" w:w="90"/>
+              <w:bottom w:type="dxa" w:w="60"/>
+              <w:right w:type="dxa" w:w="90"/>
+            </w:tcMar>
+            <w:vAlign w:val="top"/>
+          </w:tcPr>
+          <w:p>
+            <w:pPr>
+              <w:spacing w:after="80" w:line="264"/>
+            </w:pPr>
+            <w:r>
+              <w:rPr>
+                <w:rFonts w:ascii="Calibri" w:cs="Calibri" w:eastAsia="Calibri" w:hAnsi="Calibri"/>
+                <w:b/>
+                <w:bCs/>
+                <w:color w:val="FFFFFF"/>
+                <w:sz w:val="19"/>
+                <w:szCs w:val="19"/>
+              </w:rPr>
+              <w:t xml:space="preserve">Fonctionnalité</w:t>
+            </w:r>
+          </w:p>
+        </w:tc>
+        <w:tc>
+          <w:tcPr>
+            <w:tcW w:type="dxa" w:w="4100"/>
+            <w:tcBorders>
+              <w:top w:val="single" w:color="D9D5CB" w:sz="4"/>
+              <w:left w:val="single" w:color="D9D5CB" w:sz="4"/>
+              <w:bottom w:val="single" w:color="D9D5CB" w:sz="4"/>
+              <w:right w:val="single" w:color="D9D5CB" w:sz="4"/>
+            </w:tcBorders>
+            <w:shd w:fill="14213D" w:color="auto" w:val="clear"/>
+            <w:tcMar>
+              <w:top w:type="dxa" w:w="60"/>
+              <w:left w:type="dxa" w:w="90"/>
+              <w:bottom w:type="dxa" w:w="60"/>
+              <w:right w:type="dxa" w:w="90"/>
+            </w:tcMar>
+            <w:vAlign w:val="top"/>
+          </w:tcPr>
+          <w:p>
+            <w:pPr>
+              <w:spacing w:after="80" w:line="264"/>
+            </w:pPr>
+            <w:r>
+              <w:rPr>
+                <w:rFonts w:ascii="Calibri" w:cs="Calibri" w:eastAsia="Calibri" w:hAnsi="Calibri"/>
+                <w:b/>
+                <w:bCs/>
+                <w:color w:val="FFFFFF"/>
+                <w:sz w:val="19"/>
+                <w:szCs w:val="19"/>
+              </w:rPr>
+              <w:t xml:space="preserve">Où la trouver · comment tester</w:t>
+            </w:r>
+          </w:p>
+        </w:tc>
+        <w:tc>
+          <w:tcPr>
+            <w:tcW w:type="dxa" w:w="3700"/>
+            <w:tcBorders>
+              <w:top w:val="single" w:color="D9D5CB" w:sz="4"/>
+              <w:left w:val="single" w:color="D9D5CB" w:sz="4"/>
+              <w:bottom w:val="single" w:color="D9D5CB" w:sz="4"/>
+              <w:right w:val="single" w:color="D9D5CB" w:sz="4"/>
+            </w:tcBorders>
+            <w:shd w:fill="14213D" w:color="auto" w:val="clear"/>
+            <w:tcMar>
+              <w:top w:type="dxa" w:w="60"/>
+              <w:left w:type="dxa" w:w="90"/>
+              <w:bottom w:type="dxa" w:w="60"/>
+              <w:right w:type="dxa" w:w="90"/>
+            </w:tcMar>
+            <w:vAlign w:val="top"/>
+          </w:tcPr>
+          <w:p>
+            <w:pPr>
+              <w:spacing w:after="80" w:line="264"/>
+            </w:pPr>
+            <w:r>
+              <w:rPr>
+                <w:rFonts w:ascii="Calibri" w:cs="Calibri" w:eastAsia="Calibri" w:hAnsi="Calibri"/>
+                <w:b/>
+                <w:bCs/>
+                <w:color w:val="FFFFFF"/>
+                <w:sz w:val="19"/>
+                <w:szCs w:val="19"/>
+              </w:rPr>
+              <w:t xml:space="preserve">Hypothèses · limites · ce que j'ai tranché</w:t>
+            </w:r>
+          </w:p>
+        </w:tc>
+        <w:tc>
+          <w:tcPr>
+            <w:tcW w:type="dxa" w:w="1300"/>
+            <w:tcBorders>
+              <w:top w:val="single" w:color="D9D5CB" w:sz="4"/>
+              <w:left w:val="single" w:color="D9D5CB" w:sz="4"/>
+              <w:bottom w:val="single" w:color="D9D5CB" w:sz="4"/>
+              <w:right w:val="single" w:color="D9D5CB" w:sz="4"/>
+            </w:tcBorders>
+            <w:shd w:fill="14213D" w:color="auto" w:val="clear"/>
+            <w:tcMar>
+              <w:top w:type="dxa" w:w="60"/>
+              <w:left w:type="dxa" w:w="90"/>
+              <w:bottom w:type="dxa" w:w="60"/>
+              <w:right w:type="dxa" w:w="90"/>
+            </w:tcMar>
+            <w:vAlign w:val="top"/>
+          </w:tcPr>
+          <w:p>
+            <w:pPr>
+              <w:spacing w:after="80" w:line="264"/>
+            </w:pPr>
+            <w:r>
+              <w:rPr>
+                <w:rFonts w:ascii="Calibri" w:cs="Calibri" w:eastAsia="Calibri" w:hAnsi="Calibri"/>
+                <w:b/>
+                <w:bCs/>
+                <w:color w:val="FFFFFF"/>
+                <w:sz w:val="19"/>
+                <w:szCs w:val="19"/>
+              </w:rPr>
+              <w:t xml:space="preserve">Statut</w:t>
+            </w:r>
+          </w:p>
+        </w:tc>
+        <w:tc>
+          <w:tcPr>
+            <w:tcW w:type="dxa" w:w="3700"/>
+            <w:tcBorders>
+              <w:top w:val="single" w:color="D9D5CB" w:sz="4"/>
+              <w:left w:val="single" w:color="D9D5CB" w:sz="4"/>
+              <w:bottom w:val="single" w:color="D9D5CB" w:sz="4"/>
+              <w:right w:val="single" w:color="D9D5CB" w:sz="4"/>
+            </w:tcBorders>
+            <w:shd w:fill="14213D" w:color="auto" w:val="clear"/>
+            <w:tcMar>
+              <w:top w:type="dxa" w:w="60"/>
+              <w:left w:type="dxa" w:w="90"/>
+              <w:bottom w:type="dxa" w:w="60"/>
+              <w:right w:type="dxa" w:w="90"/>
+            </w:tcMar>
+            <w:vAlign w:val="top"/>
+          </w:tcPr>
+          <w:p>
+            <w:pPr>
+              <w:spacing w:after="80" w:line="264"/>
+            </w:pPr>
+            <w:r>
+              <w:rPr>
+                <w:rFonts w:ascii="Calibri" w:cs="Calibri" w:eastAsia="Calibri" w:hAnsi="Calibri"/>
+                <w:b/>
+                <w:bCs/>
+                <w:color w:val="FFFFFF"/>
+                <w:sz w:val="19"/>
+                <w:szCs w:val="19"/>
+              </w:rPr>
+              <w:t xml:space="preserve">Vos commentaires</w:t>
+            </w:r>
+          </w:p>
+        </w:tc>
+      </w:tr>
+      <w:tr>
+        <w:tc>
+          <w:tcPr>
+            <w:tcW w:type="dxa" w:w="2300"/>
+            <w:tcBorders>
+              <w:top w:val="single" w:color="D9D5CB" w:sz="4"/>
+              <w:left w:val="single" w:color="D9D5CB" w:sz="4"/>
+              <w:bottom w:val="single" w:color="D9D5CB" w:sz="4"/>
+              <w:right w:val="single" w:color="D9D5CB" w:sz="4"/>
+            </w:tcBorders>
+            <w:tcMar>
+              <w:top w:type="dxa" w:w="60"/>
+              <w:left w:type="dxa" w:w="90"/>
+              <w:bottom w:type="dxa" w:w="60"/>
+              <w:right w:type="dxa" w:w="90"/>
+            </w:tcMar>
+            <w:vAlign w:val="top"/>
+          </w:tcPr>
+          <w:p>
+            <w:pPr>
+              <w:spacing w:after="40"/>
+            </w:pPr>
+            <w:r>
+              <w:rPr>
+                <w:rFonts w:ascii="Calibri" w:cs="Calibri" w:eastAsia="Calibri" w:hAnsi="Calibri"/>
+                <w:b/>
+                <w:bCs/>
+                <w:color w:val="14213D"/>
+                <w:sz w:val="20"/>
+                <w:szCs w:val="20"/>
+              </w:rPr>
+              <w:t xml:space="preserve">4 ou 5 jours = le même forfait</w:t>
+            </w:r>
+          </w:p>
+        </w:tc>
+        <w:tc>
+          <w:tcPr>
+            <w:tcW w:type="dxa" w:w="4100"/>
+            <w:tcBorders>
+              <w:top w:val="single" w:color="D9D5CB" w:sz="4"/>
+              <w:left w:val="single" w:color="D9D5CB" w:sz="4"/>
+              <w:bottom w:val="single" w:color="D9D5CB" w:sz="4"/>
+              <w:right w:val="single" w:color="D9D5CB" w:sz="4"/>
+            </w:tcBorders>
+            <w:tcMar>
+              <w:top w:type="dxa" w:w="60"/>
+              <w:left w:type="dxa" w:w="90"/>
+              <w:bottom w:type="dxa" w:w="60"/>
+              <w:right w:type="dxa" w:w="90"/>
+            </w:tcMar>
+            <w:vAlign w:val="top"/>
+          </w:tcPr>
+          <w:p>
+            <w:pPr>
+              <w:spacing w:after="40"/>
+            </w:pPr>
+            <w:r>
+              <w:rPr>
+                <w:rFonts w:ascii="Calibri" w:cs="Calibri" w:eastAsia="Calibri" w:hAnsi="Calibri"/>
+                <w:color w:val="14213D"/>
+                <w:sz w:val="19"/>
+                <w:szCs w:val="19"/>
+              </w:rPr>
+              <w:t xml:space="preserve">Chantiers → Équipes &amp; heures → Grands déplacements → 🗓 Par semaine : Julien, 4 jours (lun → jeu), Rennes → Caen ~191 km, cas 2 → « 5 nuitées · 10 repas · 15 € ». Dans sa fiche (carte Déplacement) : le bandeau jour par jour dim → sam.</w:t>
+            </w:r>
+          </w:p>
+        </w:tc>
+        <w:tc>
+          <w:tcPr>
+            <w:tcW w:type="dxa" w:w="3700"/>
+            <w:tcBorders>
+              <w:top w:val="single" w:color="D9D5CB" w:sz="4"/>
+              <w:left w:val="single" w:color="D9D5CB" w:sz="4"/>
+              <w:bottom w:val="single" w:color="D9D5CB" w:sz="4"/>
+              <w:right w:val="single" w:color="D9D5CB" w:sz="4"/>
+            </w:tcBorders>
+            <w:tcMar>
+              <w:top w:type="dxa" w:w="60"/>
+              <w:left w:type="dxa" w:w="90"/>
+              <w:bottom w:type="dxa" w:w="60"/>
+              <w:right w:type="dxa" w:w="90"/>
+            </w:tcMar>
+            <w:vAlign w:val="top"/>
+          </w:tcPr>
+          <w:p>
+            <w:pPr>
+              <w:spacing w:after="40"/>
+            </w:pPr>
+            <w:r>
+              <w:rPr>
+                <w:rFonts w:ascii="Calibri" w:cs="Calibri" w:eastAsia="Calibri" w:hAnsi="Calibri"/>
+                <w:color w:val="14213D"/>
+                <w:sz w:val="19"/>
+                <w:szCs w:val="19"/>
+              </w:rPr>
+              <w:t xml:space="preserve">Calcul jour par jour, comme ton livret : dimanche soir (nuitée + repas du soir + ½ trajet), lundi → jeudi (midi + soir + nuitée), vendredi (repas du midi + ½ trajet). 4 jours travaillés ou 5 : pareil. Cas 4 : retour le jeudi. Un férié n'est compté travaillé que s'il est planifié exprès.</w:t>
+            </w:r>
+          </w:p>
+        </w:tc>
+        <w:tc>
+          <w:tcPr>
+            <w:tcW w:type="dxa" w:w="1300"/>
+            <w:tcBorders>
+              <w:top w:val="single" w:color="D9D5CB" w:sz="4"/>
+              <w:left w:val="single" w:color="D9D5CB" w:sz="4"/>
+              <w:bottom w:val="single" w:color="D9D5CB" w:sz="4"/>
+              <w:right w:val="single" w:color="D9D5CB" w:sz="4"/>
+            </w:tcBorders>
+            <w:shd w:fill="E6F5EC" w:color="auto" w:val="clear"/>
+            <w:tcMar>
+              <w:top w:type="dxa" w:w="60"/>
+              <w:left w:type="dxa" w:w="90"/>
+              <w:bottom w:type="dxa" w:w="60"/>
+              <w:right w:type="dxa" w:w="90"/>
+            </w:tcMar>
+            <w:vAlign w:val="top"/>
+          </w:tcPr>
+          <w:p>
+            <w:pPr>
+              <w:spacing w:after="40"/>
+            </w:pPr>
+            <w:r>
+              <w:rPr>
+                <w:rFonts w:ascii="Calibri" w:cs="Calibri" w:eastAsia="Calibri" w:hAnsi="Calibri"/>
+                <w:b/>
+                <w:bCs/>
+                <w:color w:val="14213D"/>
+                <w:sz w:val="19"/>
+                <w:szCs w:val="19"/>
+              </w:rPr>
+              <w:t xml:space="preserve">Fait</w:t>
+            </w:r>
+          </w:p>
+        </w:tc>
+        <w:tc>
+          <w:tcPr>
+            <w:tcW w:type="dxa" w:w="3700"/>
+            <w:tcBorders>
+              <w:top w:val="single" w:color="D9D5CB" w:sz="4"/>
+              <w:left w:val="single" w:color="D9D5CB" w:sz="4"/>
+              <w:bottom w:val="single" w:color="D9D5CB" w:sz="4"/>
+              <w:right w:val="single" w:color="D9D5CB" w:sz="4"/>
+            </w:tcBorders>
+            <w:tcMar>
+              <w:top w:type="dxa" w:w="60"/>
+              <w:left w:type="dxa" w:w="90"/>
+              <w:bottom w:type="dxa" w:w="60"/>
+              <w:right w:type="dxa" w:w="90"/>
+            </w:tcMar>
+            <w:vAlign w:val="top"/>
+          </w:tcPr>
+          <w:p>
+            <w:pPr>
+              <w:spacing w:after="40"/>
+            </w:pPr>
+            <w:r>
+              <w:rPr>
+                <w:rFonts w:ascii="Calibri" w:cs="Calibri" w:eastAsia="Calibri" w:hAnsi="Calibri"/>
+                <w:color w:val="14213D"/>
+                <w:sz w:val="20"/>
+                <w:szCs w:val="20"/>
+              </w:rPr>
+              <w:t xml:space="preserve"/>
+            </w:r>
+          </w:p>
+          <w:p>
+            <w:pPr>
+              <w:spacing w:after="40"/>
+            </w:pPr>
+            <w:r>
+              <w:rPr>
+                <w:rFonts w:ascii="Calibri" w:cs="Calibri" w:eastAsia="Calibri" w:hAnsi="Calibri"/>
+                <w:color w:val="14213D"/>
+                <w:sz w:val="20"/>
+                <w:szCs w:val="20"/>
+              </w:rPr>
+              <w:t xml:space="preserve"/>
+            </w:r>
+          </w:p>
+        </w:tc>
+      </w:tr>
+      <w:tr>
+        <w:tc>
+          <w:tcPr>
+            <w:tcW w:type="dxa" w:w="2300"/>
+            <w:tcBorders>
+              <w:top w:val="single" w:color="D9D5CB" w:sz="4"/>
+              <w:left w:val="single" w:color="D9D5CB" w:sz="4"/>
+              <w:bottom w:val="single" w:color="D9D5CB" w:sz="4"/>
+              <w:right w:val="single" w:color="D9D5CB" w:sz="4"/>
+            </w:tcBorders>
+            <w:tcMar>
+              <w:top w:type="dxa" w:w="60"/>
+              <w:left w:type="dxa" w:w="90"/>
+              <w:bottom w:type="dxa" w:w="60"/>
+              <w:right w:type="dxa" w:w="90"/>
+            </w:tcMar>
+            <w:vAlign w:val="top"/>
+          </w:tcPr>
+          <w:p>
+            <w:pPr>
+              <w:spacing w:after="40"/>
+            </w:pPr>
+            <w:r>
+              <w:rPr>
+                <w:rFonts w:ascii="Calibri" w:cs="Calibri" w:eastAsia="Calibri" w:hAnsi="Calibri"/>
+                <w:b/>
+                <w:bCs/>
+                <w:color w:val="14213D"/>
+                <w:sz w:val="20"/>
+                <w:szCs w:val="20"/>
+              </w:rPr>
+              <w:t xml:space="preserve">Indemnité de trajet = seulement quand il rentre</w:t>
+            </w:r>
+          </w:p>
+        </w:tc>
+        <w:tc>
+          <w:tcPr>
+            <w:tcW w:type="dxa" w:w="4100"/>
+            <w:tcBorders>
+              <w:top w:val="single" w:color="D9D5CB" w:sz="4"/>
+              <w:left w:val="single" w:color="D9D5CB" w:sz="4"/>
+              <w:bottom w:val="single" w:color="D9D5CB" w:sz="4"/>
+              <w:right w:val="single" w:color="D9D5CB" w:sz="4"/>
+            </w:tcBorders>
+            <w:tcMar>
+              <w:top w:type="dxa" w:w="60"/>
+              <w:left w:type="dxa" w:w="90"/>
+              <w:bottom w:type="dxa" w:w="60"/>
+              <w:right w:type="dxa" w:w="90"/>
+            </w:tcMar>
+            <w:vAlign w:val="top"/>
+          </w:tcPr>
+          <w:p>
+            <w:pPr>
+              <w:spacing w:after="40"/>
+            </w:pPr>
+            <w:r>
+              <w:rPr>
+                <w:rFonts w:ascii="Calibri" w:cs="Calibri" w:eastAsia="Calibri" w:hAnsi="Calibri"/>
+                <w:color w:val="14213D"/>
+                <w:sz w:val="19"/>
+                <w:szCs w:val="19"/>
+              </w:rPr>
+              <w:t xml:space="preserve">Même vue : Karim (cas 3, Nantes → Caen ~295 km) : semaine de détente « 🏠 détente · 5 nuitées · 11 repas · 15 € » ; « ✗ pas de détente » → « 7 nuitées · 14 repas · 0 € » (il reste le week-end).</w:t>
+            </w:r>
+          </w:p>
+        </w:tc>
+        <w:tc>
+          <w:tcPr>
+            <w:tcW w:type="dxa" w:w="3700"/>
+            <w:tcBorders>
+              <w:top w:val="single" w:color="D9D5CB" w:sz="4"/>
+              <w:left w:val="single" w:color="D9D5CB" w:sz="4"/>
+              <w:bottom w:val="single" w:color="D9D5CB" w:sz="4"/>
+              <w:right w:val="single" w:color="D9D5CB" w:sz="4"/>
+            </w:tcBorders>
+            <w:tcMar>
+              <w:top w:type="dxa" w:w="60"/>
+              <w:left w:type="dxa" w:w="90"/>
+              <w:bottom w:type="dxa" w:w="60"/>
+              <w:right w:type="dxa" w:w="90"/>
+            </w:tcMar>
+            <w:vAlign w:val="top"/>
+          </w:tcPr>
+          <w:p>
+            <w:pPr>
+              <w:spacing w:after="40"/>
+            </w:pPr>
+            <w:r>
+              <w:rPr>
+                <w:rFonts w:ascii="Calibri" w:cs="Calibri" w:eastAsia="Calibri" w:hAnsi="Calibri"/>
+                <w:color w:val="14213D"/>
+                <w:sz w:val="19"/>
+                <w:szCs w:val="19"/>
+              </w:rPr>
+              <w:t xml:space="preserve">Le ½ trajet n'est payé que sur un vrai trajet : l'aller après un retour à la maison, le retour en détente. Cas 2 : il rentre chaque week-end, donc chaque semaine. Hypothèse à confirmer : un retour de congé est payé comme un trajet (aller).</w:t>
+            </w:r>
+          </w:p>
+        </w:tc>
+        <w:tc>
+          <w:tcPr>
+            <w:tcW w:type="dxa" w:w="1300"/>
+            <w:tcBorders>
+              <w:top w:val="single" w:color="D9D5CB" w:sz="4"/>
+              <w:left w:val="single" w:color="D9D5CB" w:sz="4"/>
+              <w:bottom w:val="single" w:color="D9D5CB" w:sz="4"/>
+              <w:right w:val="single" w:color="D9D5CB" w:sz="4"/>
+            </w:tcBorders>
+            <w:shd w:fill="E6F5EC" w:color="auto" w:val="clear"/>
+            <w:tcMar>
+              <w:top w:type="dxa" w:w="60"/>
+              <w:left w:type="dxa" w:w="90"/>
+              <w:bottom w:type="dxa" w:w="60"/>
+              <w:right w:type="dxa" w:w="90"/>
+            </w:tcMar>
+            <w:vAlign w:val="top"/>
+          </w:tcPr>
+          <w:p>
+            <w:pPr>
+              <w:spacing w:after="40"/>
+            </w:pPr>
+            <w:r>
+              <w:rPr>
+                <w:rFonts w:ascii="Calibri" w:cs="Calibri" w:eastAsia="Calibri" w:hAnsi="Calibri"/>
+                <w:b/>
+                <w:bCs/>
+                <w:color w:val="14213D"/>
+                <w:sz w:val="19"/>
+                <w:szCs w:val="19"/>
+              </w:rPr>
+              <w:t xml:space="preserve">Fait · à confirmer</w:t>
+            </w:r>
+          </w:p>
+        </w:tc>
+        <w:tc>
+          <w:tcPr>
+            <w:tcW w:type="dxa" w:w="3700"/>
+            <w:tcBorders>
+              <w:top w:val="single" w:color="D9D5CB" w:sz="4"/>
+              <w:left w:val="single" w:color="D9D5CB" w:sz="4"/>
+              <w:bottom w:val="single" w:color="D9D5CB" w:sz="4"/>
+              <w:right w:val="single" w:color="D9D5CB" w:sz="4"/>
+            </w:tcBorders>
+            <w:tcMar>
+              <w:top w:type="dxa" w:w="60"/>
+              <w:left w:type="dxa" w:w="90"/>
+              <w:bottom w:type="dxa" w:w="60"/>
+              <w:right w:type="dxa" w:w="90"/>
+            </w:tcMar>
+            <w:vAlign w:val="top"/>
+          </w:tcPr>
+          <w:p>
+            <w:pPr>
+              <w:spacing w:after="40"/>
+            </w:pPr>
+            <w:r>
+              <w:rPr>
+                <w:rFonts w:ascii="Calibri" w:cs="Calibri" w:eastAsia="Calibri" w:hAnsi="Calibri"/>
+                <w:color w:val="14213D"/>
+                <w:sz w:val="20"/>
+                <w:szCs w:val="20"/>
+              </w:rPr>
+              <w:t xml:space="preserve"/>
+            </w:r>
+          </w:p>
+          <w:p>
+            <w:pPr>
+              <w:spacing w:after="40"/>
+            </w:pPr>
+            <w:r>
+              <w:rPr>
+                <w:rFonts w:ascii="Calibri" w:cs="Calibri" w:eastAsia="Calibri" w:hAnsi="Calibri"/>
+                <w:color w:val="14213D"/>
+                <w:sz w:val="20"/>
+                <w:szCs w:val="20"/>
+              </w:rPr>
+              <w:t xml:space="preserve"/>
+            </w:r>
+          </w:p>
+        </w:tc>
+      </w:tr>
+      <w:tr>
+        <w:tc>
+          <w:tcPr>
+            <w:tcW w:type="dxa" w:w="2300"/>
+            <w:tcBorders>
+              <w:top w:val="single" w:color="D9D5CB" w:sz="4"/>
+              <w:left w:val="single" w:color="D9D5CB" w:sz="4"/>
+              <w:bottom w:val="single" w:color="D9D5CB" w:sz="4"/>
+              <w:right w:val="single" w:color="D9D5CB" w:sz="4"/>
+            </w:tcBorders>
+            <w:tcMar>
+              <w:top w:type="dxa" w:w="60"/>
+              <w:left w:type="dxa" w:w="90"/>
+              <w:bottom w:type="dxa" w:w="60"/>
+              <w:right w:type="dxa" w:w="90"/>
+            </w:tcMar>
+            <w:vAlign w:val="top"/>
+          </w:tcPr>
+          <w:p>
+            <w:pPr>
+              <w:spacing w:after="40"/>
+            </w:pPr>
+            <w:r>
+              <w:rPr>
+                <w:rFonts w:ascii="Calibri" w:cs="Calibri" w:eastAsia="Calibri" w:hAnsi="Calibri"/>
+                <w:b/>
+                <w:bCs/>
+                <w:color w:val="14213D"/>
+                <w:sz w:val="20"/>
+                <w:szCs w:val="20"/>
+              </w:rPr>
+              <w:t xml:space="preserve">Congé la semaine d'après : pas de nuit du dimanche</w:t>
+            </w:r>
+          </w:p>
+        </w:tc>
+        <w:tc>
+          <w:tcPr>
+            <w:tcW w:type="dxa" w:w="4100"/>
+            <w:tcBorders>
+              <w:top w:val="single" w:color="D9D5CB" w:sz="4"/>
+              <w:left w:val="single" w:color="D9D5CB" w:sz="4"/>
+              <w:bottom w:val="single" w:color="D9D5CB" w:sz="4"/>
+              <w:right w:val="single" w:color="D9D5CB" w:sz="4"/>
+            </w:tcBorders>
+            <w:tcMar>
+              <w:top w:type="dxa" w:w="60"/>
+              <w:left w:type="dxa" w:w="90"/>
+              <w:bottom w:type="dxa" w:w="60"/>
+              <w:right w:type="dxa" w:w="90"/>
+            </w:tcMar>
+            <w:vAlign w:val="top"/>
+          </w:tcPr>
+          <w:p>
+            <w:pPr>
+              <w:spacing w:after="40"/>
+            </w:pPr>
+            <w:r>
+              <w:rPr>
+                <w:rFonts w:ascii="Calibri" w:cs="Calibri" w:eastAsia="Calibri" w:hAnsi="Calibri"/>
+                <w:color w:val="14213D"/>
+                <w:sz w:val="19"/>
+                <w:szCs w:val="19"/>
+              </w:rPr>
+              <w:t xml:space="preserve">Julien en congé S44 : le dimanche 25/10 est vide (pas de 🌙). Lundi 2/11 pas travaillé (S45 mar → jeu) : arrivée le lundi soir (🌙 🍽 soir 🚗½), pas de nuit le dimanche 1/11. S'il n'est pas planifié la semaine suivante alors que les autres le sont : « 🏠 Retour à la maison » même hors cycle de détente.</w:t>
+            </w:r>
+          </w:p>
+        </w:tc>
+        <w:tc>
+          <w:tcPr>
+            <w:tcW w:type="dxa" w:w="3700"/>
+            <w:tcBorders>
+              <w:top w:val="single" w:color="D9D5CB" w:sz="4"/>
+              <w:left w:val="single" w:color="D9D5CB" w:sz="4"/>
+              <w:bottom w:val="single" w:color="D9D5CB" w:sz="4"/>
+              <w:right w:val="single" w:color="D9D5CB" w:sz="4"/>
+            </w:tcBorders>
+            <w:tcMar>
+              <w:top w:type="dxa" w:w="60"/>
+              <w:left w:type="dxa" w:w="90"/>
+              <w:bottom w:type="dxa" w:w="60"/>
+              <w:right w:type="dxa" w:w="90"/>
+            </w:tcMar>
+            <w:vAlign w:val="top"/>
+          </w:tcPr>
+          <w:p>
+            <w:pPr>
+              <w:spacing w:after="40"/>
+            </w:pPr>
+            <w:r>
+              <w:rPr>
+                <w:rFonts w:ascii="Calibri" w:cs="Calibri" w:eastAsia="Calibri" w:hAnsi="Calibri"/>
+                <w:color w:val="14213D"/>
+                <w:sz w:val="19"/>
+                <w:szCs w:val="19"/>
+              </w:rPr>
+              <w:t xml:space="preserve">Congé = « pas planifié la semaine suivante » (le planning ne distingue pas encore congé / pas affecté).</w:t>
+            </w:r>
+          </w:p>
+        </w:tc>
+        <w:tc>
+          <w:tcPr>
+            <w:tcW w:type="dxa" w:w="1300"/>
+            <w:tcBorders>
+              <w:top w:val="single" w:color="D9D5CB" w:sz="4"/>
+              <w:left w:val="single" w:color="D9D5CB" w:sz="4"/>
+              <w:bottom w:val="single" w:color="D9D5CB" w:sz="4"/>
+              <w:right w:val="single" w:color="D9D5CB" w:sz="4"/>
+            </w:tcBorders>
+            <w:shd w:fill="E6F5EC" w:color="auto" w:val="clear"/>
+            <w:tcMar>
+              <w:top w:type="dxa" w:w="60"/>
+              <w:left w:type="dxa" w:w="90"/>
+              <w:bottom w:type="dxa" w:w="60"/>
+              <w:right w:type="dxa" w:w="90"/>
+            </w:tcMar>
+            <w:vAlign w:val="top"/>
+          </w:tcPr>
+          <w:p>
+            <w:pPr>
+              <w:spacing w:after="40"/>
+            </w:pPr>
+            <w:r>
+              <w:rPr>
+                <w:rFonts w:ascii="Calibri" w:cs="Calibri" w:eastAsia="Calibri" w:hAnsi="Calibri"/>
+                <w:b/>
+                <w:bCs/>
+                <w:color w:val="14213D"/>
+                <w:sz w:val="19"/>
+                <w:szCs w:val="19"/>
+              </w:rPr>
+              <w:t xml:space="preserve">Fait</w:t>
+            </w:r>
+          </w:p>
+        </w:tc>
+        <w:tc>
+          <w:tcPr>
+            <w:tcW w:type="dxa" w:w="3700"/>
+            <w:tcBorders>
+              <w:top w:val="single" w:color="D9D5CB" w:sz="4"/>
+              <w:left w:val="single" w:color="D9D5CB" w:sz="4"/>
+              <w:bottom w:val="single" w:color="D9D5CB" w:sz="4"/>
+              <w:right w:val="single" w:color="D9D5CB" w:sz="4"/>
+            </w:tcBorders>
+            <w:tcMar>
+              <w:top w:type="dxa" w:w="60"/>
+              <w:left w:type="dxa" w:w="90"/>
+              <w:bottom w:type="dxa" w:w="60"/>
+              <w:right w:type="dxa" w:w="90"/>
+            </w:tcMar>
+            <w:vAlign w:val="top"/>
+          </w:tcPr>
+          <w:p>
+            <w:pPr>
+              <w:spacing w:after="40"/>
+            </w:pPr>
+            <w:r>
+              <w:rPr>
+                <w:rFonts w:ascii="Calibri" w:cs="Calibri" w:eastAsia="Calibri" w:hAnsi="Calibri"/>
+                <w:color w:val="14213D"/>
+                <w:sz w:val="20"/>
+                <w:szCs w:val="20"/>
+              </w:rPr>
+              <w:t xml:space="preserve"/>
+            </w:r>
+          </w:p>
+          <w:p>
+            <w:pPr>
+              <w:spacing w:after="40"/>
+            </w:pPr>
+            <w:r>
+              <w:rPr>
+                <w:rFonts w:ascii="Calibri" w:cs="Calibri" w:eastAsia="Calibri" w:hAnsi="Calibri"/>
+                <w:color w:val="14213D"/>
+                <w:sz w:val="20"/>
+                <w:szCs w:val="20"/>
+              </w:rPr>
+              <w:t xml:space="preserve"/>
+            </w:r>
+          </w:p>
+        </w:tc>
+      </w:tr>
+      <w:tr>
+        <w:tc>
+          <w:tcPr>
+            <w:tcW w:type="dxa" w:w="2300"/>
+            <w:tcBorders>
+              <w:top w:val="single" w:color="D9D5CB" w:sz="4"/>
+              <w:left w:val="single" w:color="D9D5CB" w:sz="4"/>
+              <w:bottom w:val="single" w:color="D9D5CB" w:sz="4"/>
+              <w:right w:val="single" w:color="D9D5CB" w:sz="4"/>
+            </w:tcBorders>
+            <w:tcMar>
+              <w:top w:type="dxa" w:w="60"/>
+              <w:left w:type="dxa" w:w="90"/>
+              <w:bottom w:type="dxa" w:w="60"/>
+              <w:right w:type="dxa" w:w="90"/>
+            </w:tcMar>
+            <w:vAlign w:val="top"/>
+          </w:tcPr>
+          <w:p>
+            <w:pPr>
+              <w:spacing w:after="40"/>
+            </w:pPr>
+            <w:r>
+              <w:rPr>
+                <w:rFonts w:ascii="Calibri" w:cs="Calibri" w:eastAsia="Calibri" w:hAnsi="Calibri"/>
+                <w:b/>
+                <w:bCs/>
+                <w:color w:val="14213D"/>
+                <w:sz w:val="20"/>
+                <w:szCs w:val="20"/>
+              </w:rPr>
+              <w:t xml:space="preserve">Le mois par gars : nuits et repas accordés</w:t>
+            </w:r>
+          </w:p>
+        </w:tc>
+        <w:tc>
+          <w:tcPr>
+            <w:tcW w:type="dxa" w:w="4100"/>
+            <w:tcBorders>
+              <w:top w:val="single" w:color="D9D5CB" w:sz="4"/>
+              <w:left w:val="single" w:color="D9D5CB" w:sz="4"/>
+              <w:bottom w:val="single" w:color="D9D5CB" w:sz="4"/>
+              <w:right w:val="single" w:color="D9D5CB" w:sz="4"/>
+            </w:tcBorders>
+            <w:tcMar>
+              <w:top w:type="dxa" w:w="60"/>
+              <w:left w:type="dxa" w:w="90"/>
+              <w:bottom w:type="dxa" w:w="60"/>
+              <w:right w:type="dxa" w:w="90"/>
+            </w:tcMar>
+            <w:vAlign w:val="top"/>
+          </w:tcPr>
+          <w:p>
+            <w:pPr>
+              <w:spacing w:after="40"/>
+            </w:pPr>
+            <w:r>
+              <w:rPr>
+                <w:rFonts w:ascii="Calibri" w:cs="Calibri" w:eastAsia="Calibri" w:hAnsi="Calibri"/>
+                <w:color w:val="14213D"/>
+                <w:sz w:val="19"/>
+                <w:szCs w:val="19"/>
+              </w:rPr>
+              <w:t xml:space="preserve">Grands déplacements → 👤 Par personne · mois (ou clic sur le nom) : calendrier dim → sam ; par semaine S42 · chantier · cas · n nuitées · r repas · A/R, « ✓ accordé » ou « à accorder » + ✓ Accorder ; par jour 🌙 nuitée, 🍽 m / s / ×2, 🚗½ trajet, ✎ ajusté. En haut : nuitées accordées · + à accorder, repas, trajets, indemnités, semaines accordées, jours ajustés.</w:t>
+            </w:r>
+          </w:p>
+        </w:tc>
+        <w:tc>
+          <w:tcPr>
+            <w:tcW w:type="dxa" w:w="3700"/>
+            <w:tcBorders>
+              <w:top w:val="single" w:color="D9D5CB" w:sz="4"/>
+              <w:left w:val="single" w:color="D9D5CB" w:sz="4"/>
+              <w:bottom w:val="single" w:color="D9D5CB" w:sz="4"/>
+              <w:right w:val="single" w:color="D9D5CB" w:sz="4"/>
+            </w:tcBorders>
+            <w:tcMar>
+              <w:top w:type="dxa" w:w="60"/>
+              <w:left w:type="dxa" w:w="90"/>
+              <w:bottom w:type="dxa" w:w="60"/>
+              <w:right w:type="dxa" w:w="90"/>
+            </w:tcMar>
+            <w:vAlign w:val="top"/>
+          </w:tcPr>
+          <w:p>
+            <w:pPr>
+              <w:spacing w:after="40"/>
+            </w:pPr>
+            <w:r>
+              <w:rPr>
+                <w:rFonts w:ascii="Calibri" w:cs="Calibri" w:eastAsia="Calibri" w:hAnsi="Calibri"/>
+                <w:color w:val="14213D"/>
+                <w:sz w:val="19"/>
+                <w:szCs w:val="19"/>
+              </w:rPr>
+              <w:t xml:space="preserve">Accordé (figé à l'accord) passe avant le calcul : un planning modifié après l'accord est signalé, pas réécrit.</w:t>
+            </w:r>
+          </w:p>
+        </w:tc>
+        <w:tc>
+          <w:tcPr>
+            <w:tcW w:type="dxa" w:w="1300"/>
+            <w:tcBorders>
+              <w:top w:val="single" w:color="D9D5CB" w:sz="4"/>
+              <w:left w:val="single" w:color="D9D5CB" w:sz="4"/>
+              <w:bottom w:val="single" w:color="D9D5CB" w:sz="4"/>
+              <w:right w:val="single" w:color="D9D5CB" w:sz="4"/>
+            </w:tcBorders>
+            <w:shd w:fill="E6F5EC" w:color="auto" w:val="clear"/>
+            <w:tcMar>
+              <w:top w:type="dxa" w:w="60"/>
+              <w:left w:type="dxa" w:w="90"/>
+              <w:bottom w:type="dxa" w:w="60"/>
+              <w:right w:type="dxa" w:w="90"/>
+            </w:tcMar>
+            <w:vAlign w:val="top"/>
+          </w:tcPr>
+          <w:p>
+            <w:pPr>
+              <w:spacing w:after="40"/>
+            </w:pPr>
+            <w:r>
+              <w:rPr>
+                <w:rFonts w:ascii="Calibri" w:cs="Calibri" w:eastAsia="Calibri" w:hAnsi="Calibri"/>
+                <w:b/>
+                <w:bCs/>
+                <w:color w:val="14213D"/>
+                <w:sz w:val="19"/>
+                <w:szCs w:val="19"/>
+              </w:rPr>
+              <w:t xml:space="preserve">Fait</w:t>
+            </w:r>
+          </w:p>
+        </w:tc>
+        <w:tc>
+          <w:tcPr>
+            <w:tcW w:type="dxa" w:w="3700"/>
+            <w:tcBorders>
+              <w:top w:val="single" w:color="D9D5CB" w:sz="4"/>
+              <w:left w:val="single" w:color="D9D5CB" w:sz="4"/>
+              <w:bottom w:val="single" w:color="D9D5CB" w:sz="4"/>
+              <w:right w:val="single" w:color="D9D5CB" w:sz="4"/>
+            </w:tcBorders>
+            <w:tcMar>
+              <w:top w:type="dxa" w:w="60"/>
+              <w:left w:type="dxa" w:w="90"/>
+              <w:bottom w:type="dxa" w:w="60"/>
+              <w:right w:type="dxa" w:w="90"/>
+            </w:tcMar>
+            <w:vAlign w:val="top"/>
+          </w:tcPr>
+          <w:p>
+            <w:pPr>
+              <w:spacing w:after="40"/>
+            </w:pPr>
+            <w:r>
+              <w:rPr>
+                <w:rFonts w:ascii="Calibri" w:cs="Calibri" w:eastAsia="Calibri" w:hAnsi="Calibri"/>
+                <w:color w:val="14213D"/>
+                <w:sz w:val="20"/>
+                <w:szCs w:val="20"/>
+              </w:rPr>
+              <w:t xml:space="preserve"/>
+            </w:r>
+          </w:p>
+          <w:p>
+            <w:pPr>
+              <w:spacing w:after="40"/>
+            </w:pPr>
+            <w:r>
+              <w:rPr>
+                <w:rFonts w:ascii="Calibri" w:cs="Calibri" w:eastAsia="Calibri" w:hAnsi="Calibri"/>
+                <w:color w:val="14213D"/>
+                <w:sz w:val="20"/>
+                <w:szCs w:val="20"/>
+              </w:rPr>
+              <w:t xml:space="preserve"/>
+            </w:r>
+          </w:p>
+        </w:tc>
+      </w:tr>
+      <w:tr>
+        <w:tc>
+          <w:tcPr>
+            <w:tcW w:type="dxa" w:w="2300"/>
+            <w:tcBorders>
+              <w:top w:val="single" w:color="D9D5CB" w:sz="4"/>
+              <w:left w:val="single" w:color="D9D5CB" w:sz="4"/>
+              <w:bottom w:val="single" w:color="D9D5CB" w:sz="4"/>
+              <w:right w:val="single" w:color="D9D5CB" w:sz="4"/>
+            </w:tcBorders>
+            <w:tcMar>
+              <w:top w:type="dxa" w:w="60"/>
+              <w:left w:type="dxa" w:w="90"/>
+              <w:bottom w:type="dxa" w:w="60"/>
+              <w:right w:type="dxa" w:w="90"/>
+            </w:tcMar>
+            <w:vAlign w:val="top"/>
+          </w:tcPr>
+          <w:p>
+            <w:pPr>
+              <w:spacing w:after="40"/>
+            </w:pPr>
+            <w:r>
+              <w:rPr>
+                <w:rFonts w:ascii="Calibri" w:cs="Calibri" w:eastAsia="Calibri" w:hAnsi="Calibri"/>
+                <w:b/>
+                <w:bCs/>
+                <w:color w:val="14213D"/>
+                <w:sz w:val="20"/>
+                <w:szCs w:val="20"/>
+              </w:rPr>
+              <w:t xml:space="preserve">Ajuster un jour (RH)</w:t>
+            </w:r>
+          </w:p>
+        </w:tc>
+        <w:tc>
+          <w:tcPr>
+            <w:tcW w:type="dxa" w:w="4100"/>
+            <w:tcBorders>
+              <w:top w:val="single" w:color="D9D5CB" w:sz="4"/>
+              <w:left w:val="single" w:color="D9D5CB" w:sz="4"/>
+              <w:bottom w:val="single" w:color="D9D5CB" w:sz="4"/>
+              <w:right w:val="single" w:color="D9D5CB" w:sz="4"/>
+            </w:tcBorders>
+            <w:tcMar>
+              <w:top w:type="dxa" w:w="60"/>
+              <w:left w:type="dxa" w:w="90"/>
+              <w:bottom w:type="dxa" w:w="60"/>
+              <w:right w:type="dxa" w:w="90"/>
+            </w:tcMar>
+            <w:vAlign w:val="top"/>
+          </w:tcPr>
+          <w:p>
+            <w:pPr>
+              <w:spacing w:after="40"/>
+            </w:pPr>
+            <w:r>
+              <w:rPr>
+                <w:rFonts w:ascii="Calibri" w:cs="Calibri" w:eastAsia="Calibri" w:hAnsi="Calibri"/>
+                <w:color w:val="14213D"/>
+                <w:sz w:val="19"/>
+                <w:szCs w:val="19"/>
+              </w:rPr>
+              <w:t xml:space="preserve">Touche un jour du calendrier → Nuitée / Repas midi / Repas soir / Trajet à cocher + motif → « Enregistrer et accorder la semaine ». Ex. : rentré le mercredi soir → plus de nuitée ni de repas du soir ce jour-là ; la semaine passe à 4 nuitées / 9 repas, accordée, ✎ sur le jour.</w:t>
+            </w:r>
+          </w:p>
+        </w:tc>
+        <w:tc>
+          <w:tcPr>
+            <w:tcW w:type="dxa" w:w="3700"/>
+            <w:tcBorders>
+              <w:top w:val="single" w:color="D9D5CB" w:sz="4"/>
+              <w:left w:val="single" w:color="D9D5CB" w:sz="4"/>
+              <w:bottom w:val="single" w:color="D9D5CB" w:sz="4"/>
+              <w:right w:val="single" w:color="D9D5CB" w:sz="4"/>
+            </w:tcBorders>
+            <w:tcMar>
+              <w:top w:type="dxa" w:w="60"/>
+              <w:left w:type="dxa" w:w="90"/>
+              <w:bottom w:type="dxa" w:w="60"/>
+              <w:right w:type="dxa" w:w="90"/>
+            </w:tcMar>
+            <w:vAlign w:val="top"/>
+          </w:tcPr>
+          <w:p>
+            <w:pPr>
+              <w:spacing w:after="40"/>
+            </w:pPr>
+            <w:r>
+              <w:rPr>
+                <w:rFonts w:ascii="Calibri" w:cs="Calibri" w:eastAsia="Calibri" w:hAnsi="Calibri"/>
+                <w:color w:val="14213D"/>
+                <w:sz w:val="19"/>
+                <w:szCs w:val="19"/>
+              </w:rPr>
+              <w:t xml:space="preserve">Qui et quand sont gardés ; « ↻ » ré-accorde avec le planning.</w:t>
+            </w:r>
+          </w:p>
+        </w:tc>
+        <w:tc>
+          <w:tcPr>
+            <w:tcW w:type="dxa" w:w="1300"/>
+            <w:tcBorders>
+              <w:top w:val="single" w:color="D9D5CB" w:sz="4"/>
+              <w:left w:val="single" w:color="D9D5CB" w:sz="4"/>
+              <w:bottom w:val="single" w:color="D9D5CB" w:sz="4"/>
+              <w:right w:val="single" w:color="D9D5CB" w:sz="4"/>
+            </w:tcBorders>
+            <w:shd w:fill="E6F5EC" w:color="auto" w:val="clear"/>
+            <w:tcMar>
+              <w:top w:type="dxa" w:w="60"/>
+              <w:left w:type="dxa" w:w="90"/>
+              <w:bottom w:type="dxa" w:w="60"/>
+              <w:right w:type="dxa" w:w="90"/>
+            </w:tcMar>
+            <w:vAlign w:val="top"/>
+          </w:tcPr>
+          <w:p>
+            <w:pPr>
+              <w:spacing w:after="40"/>
+            </w:pPr>
+            <w:r>
+              <w:rPr>
+                <w:rFonts w:ascii="Calibri" w:cs="Calibri" w:eastAsia="Calibri" w:hAnsi="Calibri"/>
+                <w:b/>
+                <w:bCs/>
+                <w:color w:val="14213D"/>
+                <w:sz w:val="19"/>
+                <w:szCs w:val="19"/>
+              </w:rPr>
+              <w:t xml:space="preserve">Fait</w:t>
+            </w:r>
+          </w:p>
+        </w:tc>
+        <w:tc>
+          <w:tcPr>
+            <w:tcW w:type="dxa" w:w="3700"/>
+            <w:tcBorders>
+              <w:top w:val="single" w:color="D9D5CB" w:sz="4"/>
+              <w:left w:val="single" w:color="D9D5CB" w:sz="4"/>
+              <w:bottom w:val="single" w:color="D9D5CB" w:sz="4"/>
+              <w:right w:val="single" w:color="D9D5CB" w:sz="4"/>
+            </w:tcBorders>
+            <w:tcMar>
+              <w:top w:type="dxa" w:w="60"/>
+              <w:left w:type="dxa" w:w="90"/>
+              <w:bottom w:type="dxa" w:w="60"/>
+              <w:right w:type="dxa" w:w="90"/>
+            </w:tcMar>
+            <w:vAlign w:val="top"/>
+          </w:tcPr>
+          <w:p>
+            <w:pPr>
+              <w:spacing w:after="40"/>
+            </w:pPr>
+            <w:r>
+              <w:rPr>
+                <w:rFonts w:ascii="Calibri" w:cs="Calibri" w:eastAsia="Calibri" w:hAnsi="Calibri"/>
+                <w:color w:val="14213D"/>
+                <w:sz w:val="20"/>
+                <w:szCs w:val="20"/>
+              </w:rPr>
+              <w:t xml:space="preserve"/>
+            </w:r>
+          </w:p>
+          <w:p>
+            <w:pPr>
+              <w:spacing w:after="40"/>
+            </w:pPr>
+            <w:r>
+              <w:rPr>
+                <w:rFonts w:ascii="Calibri" w:cs="Calibri" w:eastAsia="Calibri" w:hAnsi="Calibri"/>
+                <w:color w:val="14213D"/>
+                <w:sz w:val="20"/>
+                <w:szCs w:val="20"/>
+              </w:rPr>
+              <w:t xml:space="preserve"/>
+            </w:r>
+          </w:p>
+        </w:tc>
+      </w:tr>
+      <w:tr>
+        <w:tc>
+          <w:tcPr>
+            <w:tcW w:type="dxa" w:w="2300"/>
+            <w:tcBorders>
+              <w:top w:val="single" w:color="D9D5CB" w:sz="4"/>
+              <w:left w:val="single" w:color="D9D5CB" w:sz="4"/>
+              <w:bottom w:val="single" w:color="D9D5CB" w:sz="4"/>
+              <w:right w:val="single" w:color="D9D5CB" w:sz="4"/>
+            </w:tcBorders>
+            <w:tcMar>
+              <w:top w:type="dxa" w:w="60"/>
+              <w:left w:type="dxa" w:w="90"/>
+              <w:bottom w:type="dxa" w:w="60"/>
+              <w:right w:type="dxa" w:w="90"/>
+            </w:tcMar>
+            <w:vAlign w:val="top"/>
+          </w:tcPr>
+          <w:p>
+            <w:pPr>
+              <w:spacing w:after="40"/>
+            </w:pPr>
+            <w:r>
+              <w:rPr>
+                <w:rFonts w:ascii="Calibri" w:cs="Calibri" w:eastAsia="Calibri" w:hAnsi="Calibri"/>
+                <w:b/>
+                <w:bCs/>
+                <w:color w:val="14213D"/>
+                <w:sz w:val="20"/>
+                <w:szCs w:val="20"/>
+              </w:rPr>
+              <w:t xml:space="preserve">Navette du mois</w:t>
+            </w:r>
+          </w:p>
+        </w:tc>
+        <w:tc>
+          <w:tcPr>
+            <w:tcW w:type="dxa" w:w="4100"/>
+            <w:tcBorders>
+              <w:top w:val="single" w:color="D9D5CB" w:sz="4"/>
+              <w:left w:val="single" w:color="D9D5CB" w:sz="4"/>
+              <w:bottom w:val="single" w:color="D9D5CB" w:sz="4"/>
+              <w:right w:val="single" w:color="D9D5CB" w:sz="4"/>
+            </w:tcBorders>
+            <w:tcMar>
+              <w:top w:type="dxa" w:w="60"/>
+              <w:left w:type="dxa" w:w="90"/>
+              <w:bottom w:type="dxa" w:w="60"/>
+              <w:right w:type="dxa" w:w="90"/>
+            </w:tcMar>
+            <w:vAlign w:val="top"/>
+          </w:tcPr>
+          <w:p>
+            <w:pPr>
+              <w:spacing w:after="40"/>
+            </w:pPr>
+            <w:r>
+              <w:rPr>
+                <w:rFonts w:ascii="Calibri" w:cs="Calibri" w:eastAsia="Calibri" w:hAnsi="Calibri"/>
+                <w:color w:val="14213D"/>
+                <w:sz w:val="19"/>
+                <w:szCs w:val="19"/>
+              </w:rPr>
+              <w:t xml:space="preserve">Sous le calendrier : « Navette du mois » (jours en colonnes : présence T / F / —, nuitée, repas midi, repas soir, trajet, accord) + « ⬇ CSV » (Excel) : Navette_GD_Julien_R_2026-10.csv.</w:t>
+            </w:r>
+          </w:p>
+        </w:tc>
+        <w:tc>
+          <w:tcPr>
+            <w:tcW w:type="dxa" w:w="3700"/>
+            <w:tcBorders>
+              <w:top w:val="single" w:color="D9D5CB" w:sz="4"/>
+              <w:left w:val="single" w:color="D9D5CB" w:sz="4"/>
+              <w:bottom w:val="single" w:color="D9D5CB" w:sz="4"/>
+              <w:right w:val="single" w:color="D9D5CB" w:sz="4"/>
+            </w:tcBorders>
+            <w:tcMar>
+              <w:top w:type="dxa" w:w="60"/>
+              <w:left w:type="dxa" w:w="90"/>
+              <w:bottom w:type="dxa" w:w="60"/>
+              <w:right w:type="dxa" w:w="90"/>
+            </w:tcMar>
+            <w:vAlign w:val="top"/>
+          </w:tcPr>
+          <w:p>
+            <w:pPr>
+              <w:spacing w:after="40"/>
+            </w:pPr>
+            <w:r>
+              <w:rPr>
+                <w:rFonts w:ascii="Calibri" w:cs="Calibri" w:eastAsia="Calibri" w:hAnsi="Calibri"/>
+                <w:color w:val="14213D"/>
+                <w:sz w:val="19"/>
+                <w:szCs w:val="19"/>
+              </w:rPr>
+              <w:t xml:space="preserve">FORMAT PROVISOIRE : ta navette type n'est pas arrivée — envoie-la, je fais l'export à l'identique.</w:t>
+            </w:r>
+          </w:p>
+        </w:tc>
+        <w:tc>
+          <w:tcPr>
+            <w:tcW w:type="dxa" w:w="1300"/>
+            <w:tcBorders>
+              <w:top w:val="single" w:color="D9D5CB" w:sz="4"/>
+              <w:left w:val="single" w:color="D9D5CB" w:sz="4"/>
+              <w:bottom w:val="single" w:color="D9D5CB" w:sz="4"/>
+              <w:right w:val="single" w:color="D9D5CB" w:sz="4"/>
+            </w:tcBorders>
+            <w:shd w:fill="FFF4EE" w:color="auto" w:val="clear"/>
+            <w:tcMar>
+              <w:top w:type="dxa" w:w="60"/>
+              <w:left w:type="dxa" w:w="90"/>
+              <w:bottom w:type="dxa" w:w="60"/>
+              <w:right w:type="dxa" w:w="90"/>
+            </w:tcMar>
+            <w:vAlign w:val="top"/>
+          </w:tcPr>
+          <w:p>
+            <w:pPr>
+              <w:spacing w:after="40"/>
+            </w:pPr>
+            <w:r>
+              <w:rPr>
+                <w:rFonts w:ascii="Calibri" w:cs="Calibri" w:eastAsia="Calibri" w:hAnsi="Calibri"/>
+                <w:b/>
+                <w:bCs/>
+                <w:color w:val="14213D"/>
+                <w:sz w:val="19"/>
+                <w:szCs w:val="19"/>
+              </w:rPr>
+              <w:t xml:space="preserve">À caler sur ta navette</w:t>
+            </w:r>
+          </w:p>
+        </w:tc>
+        <w:tc>
+          <w:tcPr>
+            <w:tcW w:type="dxa" w:w="3700"/>
+            <w:tcBorders>
+              <w:top w:val="single" w:color="D9D5CB" w:sz="4"/>
+              <w:left w:val="single" w:color="D9D5CB" w:sz="4"/>
+              <w:bottom w:val="single" w:color="D9D5CB" w:sz="4"/>
+              <w:right w:val="single" w:color="D9D5CB" w:sz="4"/>
+            </w:tcBorders>
+            <w:tcMar>
+              <w:top w:type="dxa" w:w="60"/>
+              <w:left w:type="dxa" w:w="90"/>
+              <w:bottom w:type="dxa" w:w="60"/>
+              <w:right w:type="dxa" w:w="90"/>
+            </w:tcMar>
+            <w:vAlign w:val="top"/>
+          </w:tcPr>
+          <w:p>
+            <w:pPr>
+              <w:spacing w:after="40"/>
+            </w:pPr>
+            <w:r>
+              <w:rPr>
+                <w:rFonts w:ascii="Calibri" w:cs="Calibri" w:eastAsia="Calibri" w:hAnsi="Calibri"/>
+                <w:color w:val="14213D"/>
+                <w:sz w:val="20"/>
+                <w:szCs w:val="20"/>
+              </w:rPr>
+              <w:t xml:space="preserve"/>
+            </w:r>
+          </w:p>
+          <w:p>
+            <w:pPr>
+              <w:spacing w:after="40"/>
+            </w:pPr>
+            <w:r>
+              <w:rPr>
+                <w:rFonts w:ascii="Calibri" w:cs="Calibri" w:eastAsia="Calibri" w:hAnsi="Calibri"/>
+                <w:color w:val="14213D"/>
+                <w:sz w:val="20"/>
+                <w:szCs w:val="20"/>
+              </w:rPr>
+              <w:t xml:space="preserve"/>
+            </w:r>
+          </w:p>
+        </w:tc>
+      </w:tr>
+      <w:tr>
+        <w:tc>
+          <w:tcPr>
+            <w:tcW w:type="dxa" w:w="2300"/>
+            <w:tcBorders>
+              <w:top w:val="single" w:color="D9D5CB" w:sz="4"/>
+              <w:left w:val="single" w:color="D9D5CB" w:sz="4"/>
+              <w:bottom w:val="single" w:color="D9D5CB" w:sz="4"/>
+              <w:right w:val="single" w:color="D9D5CB" w:sz="4"/>
+            </w:tcBorders>
+            <w:tcMar>
+              <w:top w:type="dxa" w:w="60"/>
+              <w:left w:type="dxa" w:w="90"/>
+              <w:bottom w:type="dxa" w:w="60"/>
+              <w:right w:type="dxa" w:w="90"/>
+            </w:tcMar>
+            <w:vAlign w:val="top"/>
+          </w:tcPr>
+          <w:p>
+            <w:pPr>
+              <w:spacing w:after="40"/>
+            </w:pPr>
+            <w:r>
+              <w:rPr>
+                <w:rFonts w:ascii="Calibri" w:cs="Calibri" w:eastAsia="Calibri" w:hAnsi="Calibri"/>
+                <w:b/>
+                <w:bCs/>
+                <w:color w:val="14213D"/>
+                <w:sz w:val="20"/>
+                <w:szCs w:val="20"/>
+              </w:rPr>
+              <w:t xml:space="preserve">Adresses à vérifier</w:t>
+            </w:r>
+          </w:p>
+        </w:tc>
+        <w:tc>
+          <w:tcPr>
+            <w:tcW w:type="dxa" w:w="4100"/>
+            <w:tcBorders>
+              <w:top w:val="single" w:color="D9D5CB" w:sz="4"/>
+              <w:left w:val="single" w:color="D9D5CB" w:sz="4"/>
+              <w:bottom w:val="single" w:color="D9D5CB" w:sz="4"/>
+              <w:right w:val="single" w:color="D9D5CB" w:sz="4"/>
+            </w:tcBorders>
+            <w:tcMar>
+              <w:top w:type="dxa" w:w="60"/>
+              <w:left w:type="dxa" w:w="90"/>
+              <w:bottom w:type="dxa" w:w="60"/>
+              <w:right w:type="dxa" w:w="90"/>
+            </w:tcMar>
+            <w:vAlign w:val="top"/>
+          </w:tcPr>
+          <w:p>
+            <w:pPr>
+              <w:spacing w:after="40"/>
+            </w:pPr>
+            <w:r>
+              <w:rPr>
+                <w:rFonts w:ascii="Calibri" w:cs="Calibri" w:eastAsia="Calibri" w:hAnsi="Calibri"/>
+                <w:color w:val="14213D"/>
+                <w:sz w:val="19"/>
+                <w:szCs w:val="19"/>
+              </w:rPr>
+              <w:t xml:space="preserve">En tête de Grands déplacements : « 📍 Adresses à vérifier · n » — tout le personnel terrain (même pas planifié), erreurs d'abord : pas de ville, code postal manquant ou invalide, introuvable, trouvée par le nom seul (homonyme possible), hors de France, distance aberrante ; chantiers sans position ni ville. Boutons Fiche (corriger) et ↻ (relancer).</w:t>
+            </w:r>
+          </w:p>
+        </w:tc>
+        <w:tc>
+          <w:tcPr>
+            <w:tcW w:type="dxa" w:w="3700"/>
+            <w:tcBorders>
+              <w:top w:val="single" w:color="D9D5CB" w:sz="4"/>
+              <w:left w:val="single" w:color="D9D5CB" w:sz="4"/>
+              <w:bottom w:val="single" w:color="D9D5CB" w:sz="4"/>
+              <w:right w:val="single" w:color="D9D5CB" w:sz="4"/>
+            </w:tcBorders>
+            <w:tcMar>
+              <w:top w:type="dxa" w:w="60"/>
+              <w:left w:type="dxa" w:w="90"/>
+              <w:bottom w:type="dxa" w:w="60"/>
+              <w:right w:type="dxa" w:w="90"/>
+            </w:tcMar>
+            <w:vAlign w:val="top"/>
+          </w:tcPr>
+          <w:p>
+            <w:pPr>
+              <w:spacing w:after="40"/>
+            </w:pPr>
+            <w:r>
+              <w:rPr>
+                <w:rFonts w:ascii="Calibri" w:cs="Calibri" w:eastAsia="Calibri" w:hAnsi="Calibri"/>
+                <w:color w:val="14213D"/>
+                <w:sz w:val="19"/>
+                <w:szCs w:val="19"/>
+              </w:rPr>
+              <w:t xml:space="preserve">Les adresses jamais tentées sont localisées à l'ouverture de l'onglet. Le géocodage reste celui d'avant (code postal + ville).</w:t>
+            </w:r>
+          </w:p>
+        </w:tc>
+        <w:tc>
+          <w:tcPr>
+            <w:tcW w:type="dxa" w:w="1300"/>
+            <w:tcBorders>
+              <w:top w:val="single" w:color="D9D5CB" w:sz="4"/>
+              <w:left w:val="single" w:color="D9D5CB" w:sz="4"/>
+              <w:bottom w:val="single" w:color="D9D5CB" w:sz="4"/>
+              <w:right w:val="single" w:color="D9D5CB" w:sz="4"/>
+            </w:tcBorders>
+            <w:shd w:fill="E6F5EC" w:color="auto" w:val="clear"/>
+            <w:tcMar>
+              <w:top w:type="dxa" w:w="60"/>
+              <w:left w:type="dxa" w:w="90"/>
+              <w:bottom w:type="dxa" w:w="60"/>
+              <w:right w:type="dxa" w:w="90"/>
+            </w:tcMar>
+            <w:vAlign w:val="top"/>
+          </w:tcPr>
+          <w:p>
+            <w:pPr>
+              <w:spacing w:after="40"/>
+            </w:pPr>
+            <w:r>
+              <w:rPr>
+                <w:rFonts w:ascii="Calibri" w:cs="Calibri" w:eastAsia="Calibri" w:hAnsi="Calibri"/>
+                <w:b/>
+                <w:bCs/>
+                <w:color w:val="14213D"/>
+                <w:sz w:val="19"/>
+                <w:szCs w:val="19"/>
+              </w:rPr>
+              <w:t xml:space="preserve">Fait</w:t>
+            </w:r>
+          </w:p>
+        </w:tc>
+        <w:tc>
+          <w:tcPr>
+            <w:tcW w:type="dxa" w:w="3700"/>
+            <w:tcBorders>
+              <w:top w:val="single" w:color="D9D5CB" w:sz="4"/>
+              <w:left w:val="single" w:color="D9D5CB" w:sz="4"/>
+              <w:bottom w:val="single" w:color="D9D5CB" w:sz="4"/>
+              <w:right w:val="single" w:color="D9D5CB" w:sz="4"/>
+            </w:tcBorders>
+            <w:tcMar>
+              <w:top w:type="dxa" w:w="60"/>
+              <w:left w:type="dxa" w:w="90"/>
+              <w:bottom w:type="dxa" w:w="60"/>
+              <w:right w:type="dxa" w:w="90"/>
+            </w:tcMar>
+            <w:vAlign w:val="top"/>
+          </w:tcPr>
+          <w:p>
+            <w:pPr>
+              <w:spacing w:after="40"/>
+            </w:pPr>
+            <w:r>
+              <w:rPr>
+                <w:rFonts w:ascii="Calibri" w:cs="Calibri" w:eastAsia="Calibri" w:hAnsi="Calibri"/>
+                <w:color w:val="14213D"/>
+                <w:sz w:val="20"/>
+                <w:szCs w:val="20"/>
+              </w:rPr>
+              <w:t xml:space="preserve"/>
+            </w:r>
+          </w:p>
+          <w:p>
+            <w:pPr>
+              <w:spacing w:after="40"/>
+            </w:pPr>
+            <w:r>
+              <w:rPr>
+                <w:rFonts w:ascii="Calibri" w:cs="Calibri" w:eastAsia="Calibri" w:hAnsi="Calibri"/>
+                <w:color w:val="14213D"/>
+                <w:sz w:val="20"/>
+                <w:szCs w:val="20"/>
+              </w:rPr>
+              <w:t xml:space="preserve"/>
+            </w:r>
+          </w:p>
+        </w:tc>
+      </w:tr>
+      <w:tr>
+        <w:tc>
+          <w:tcPr>
+            <w:tcW w:type="dxa" w:w="2300"/>
+            <w:tcBorders>
+              <w:top w:val="single" w:color="D9D5CB" w:sz="4"/>
+              <w:left w:val="single" w:color="D9D5CB" w:sz="4"/>
+              <w:bottom w:val="single" w:color="D9D5CB" w:sz="4"/>
+              <w:right w:val="single" w:color="D9D5CB" w:sz="4"/>
+            </w:tcBorders>
+            <w:tcMar>
+              <w:top w:type="dxa" w:w="60"/>
+              <w:left w:type="dxa" w:w="90"/>
+              <w:bottom w:type="dxa" w:w="60"/>
+              <w:right w:type="dxa" w:w="90"/>
+            </w:tcMar>
+            <w:vAlign w:val="top"/>
+          </w:tcPr>
+          <w:p>
+            <w:pPr>
+              <w:spacing w:after="40"/>
+            </w:pPr>
+            <w:r>
+              <w:rPr>
+                <w:rFonts w:ascii="Calibri" w:cs="Calibri" w:eastAsia="Calibri" w:hAnsi="Calibri"/>
+                <w:b/>
+                <w:bCs/>
+                <w:color w:val="14213D"/>
+                <w:sz w:val="20"/>
+                <w:szCs w:val="20"/>
+              </w:rPr>
+              <w:t xml:space="preserve">Fourniture : entourer une zone, simplifié</w:t>
+            </w:r>
+          </w:p>
+        </w:tc>
+        <w:tc>
+          <w:tcPr>
+            <w:tcW w:type="dxa" w:w="4100"/>
+            <w:tcBorders>
+              <w:top w:val="single" w:color="D9D5CB" w:sz="4"/>
+              <w:left w:val="single" w:color="D9D5CB" w:sz="4"/>
+              <w:bottom w:val="single" w:color="D9D5CB" w:sz="4"/>
+              <w:right w:val="single" w:color="D9D5CB" w:sz="4"/>
+            </w:tcBorders>
+            <w:tcMar>
+              <w:top w:type="dxa" w:w="60"/>
+              <w:left w:type="dxa" w:w="90"/>
+              <w:bottom w:type="dxa" w:w="60"/>
+              <w:right w:type="dxa" w:w="90"/>
+            </w:tcMar>
+            <w:vAlign w:val="top"/>
+          </w:tcPr>
+          <w:p>
+            <w:pPr>
+              <w:spacing w:after="40"/>
+            </w:pPr>
+            <w:r>
+              <w:rPr>
+                <w:rFonts w:ascii="Calibri" w:cs="Calibri" w:eastAsia="Calibri" w:hAnsi="Calibri"/>
+                <w:color w:val="14213D"/>
+                <w:sz w:val="19"/>
+                <w:szCs w:val="19"/>
+              </w:rPr>
+              <w:t xml:space="preserve">Fourniture → ⭕ Entourer une zone : touche le plan (un point) ; GLISSE un point pour le déplacer ; ◆ au milieu d'un côté = ajouter un point (glisser ou toucher) ; touche un point puis 🗑 pour le retirer ; ↶ annule la dernière action ; « ✓ Fermer » → nom + date, ou « ↩ Reprendre le contour ». Une zone existante : « ✏️ Modifier le contour » → « ✓ Enregistrer ».</w:t>
+            </w:r>
+          </w:p>
+        </w:tc>
+        <w:tc>
+          <w:tcPr>
+            <w:tcW w:type="dxa" w:w="3700"/>
+            <w:tcBorders>
+              <w:top w:val="single" w:color="D9D5CB" w:sz="4"/>
+              <w:left w:val="single" w:color="D9D5CB" w:sz="4"/>
+              <w:bottom w:val="single" w:color="D9D5CB" w:sz="4"/>
+              <w:right w:val="single" w:color="D9D5CB" w:sz="4"/>
+            </w:tcBorders>
+            <w:tcMar>
+              <w:top w:type="dxa" w:w="60"/>
+              <w:left w:type="dxa" w:w="90"/>
+              <w:bottom w:type="dxa" w:w="60"/>
+              <w:right w:type="dxa" w:w="90"/>
+            </w:tcMar>
+            <w:vAlign w:val="top"/>
+          </w:tcPr>
+          <w:p>
+            <w:pPr>
+              <w:spacing w:after="40"/>
+            </w:pPr>
+            <w:r>
+              <w:rPr>
+                <w:rFonts w:ascii="Calibri" w:cs="Calibri" w:eastAsia="Calibri" w:hAnsi="Calibri"/>
+                <w:color w:val="14213D"/>
+                <w:sz w:val="19"/>
+                <w:szCs w:val="19"/>
+              </w:rPr>
+              <w:t xml:space="preserve">Cibles larges (gants). Sur ordinateur : Suppr retire le point sélectionné, Ctrl+Z annule, Échap quitte.</w:t>
+            </w:r>
+          </w:p>
+        </w:tc>
+        <w:tc>
+          <w:tcPr>
+            <w:tcW w:type="dxa" w:w="1300"/>
+            <w:tcBorders>
+              <w:top w:val="single" w:color="D9D5CB" w:sz="4"/>
+              <w:left w:val="single" w:color="D9D5CB" w:sz="4"/>
+              <w:bottom w:val="single" w:color="D9D5CB" w:sz="4"/>
+              <w:right w:val="single" w:color="D9D5CB" w:sz="4"/>
+            </w:tcBorders>
+            <w:shd w:fill="E6F5EC" w:color="auto" w:val="clear"/>
+            <w:tcMar>
+              <w:top w:type="dxa" w:w="60"/>
+              <w:left w:type="dxa" w:w="90"/>
+              <w:bottom w:type="dxa" w:w="60"/>
+              <w:right w:type="dxa" w:w="90"/>
+            </w:tcMar>
+            <w:vAlign w:val="top"/>
+          </w:tcPr>
+          <w:p>
+            <w:pPr>
+              <w:spacing w:after="40"/>
+            </w:pPr>
+            <w:r>
+              <w:rPr>
+                <w:rFonts w:ascii="Calibri" w:cs="Calibri" w:eastAsia="Calibri" w:hAnsi="Calibri"/>
+                <w:b/>
+                <w:bCs/>
+                <w:color w:val="14213D"/>
+                <w:sz w:val="19"/>
+                <w:szCs w:val="19"/>
+              </w:rPr>
+              <w:t xml:space="preserve">Fait</w:t>
+            </w:r>
+          </w:p>
+        </w:tc>
+        <w:tc>
+          <w:tcPr>
+            <w:tcW w:type="dxa" w:w="3700"/>
+            <w:tcBorders>
+              <w:top w:val="single" w:color="D9D5CB" w:sz="4"/>
+              <w:left w:val="single" w:color="D9D5CB" w:sz="4"/>
+              <w:bottom w:val="single" w:color="D9D5CB" w:sz="4"/>
+              <w:right w:val="single" w:color="D9D5CB" w:sz="4"/>
+            </w:tcBorders>
+            <w:tcMar>
+              <w:top w:type="dxa" w:w="60"/>
+              <w:left w:type="dxa" w:w="90"/>
+              <w:bottom w:type="dxa" w:w="60"/>
+              <w:right w:type="dxa" w:w="90"/>
+            </w:tcMar>
+            <w:vAlign w:val="top"/>
+          </w:tcPr>
+          <w:p>
+            <w:pPr>
+              <w:spacing w:after="40"/>
+            </w:pPr>
+            <w:r>
+              <w:rPr>
+                <w:rFonts w:ascii="Calibri" w:cs="Calibri" w:eastAsia="Calibri" w:hAnsi="Calibri"/>
+                <w:color w:val="14213D"/>
+                <w:sz w:val="20"/>
+                <w:szCs w:val="20"/>
+              </w:rPr>
+              <w:t xml:space="preserve"/>
+            </w:r>
+          </w:p>
+          <w:p>
+            <w:pPr>
+              <w:spacing w:after="40"/>
+            </w:pPr>
+            <w:r>
+              <w:rPr>
+                <w:rFonts w:ascii="Calibri" w:cs="Calibri" w:eastAsia="Calibri" w:hAnsi="Calibri"/>
+                <w:color w:val="14213D"/>
+                <w:sz w:val="20"/>
+                <w:szCs w:val="20"/>
+              </w:rPr>
+              <w:t xml:space="preserve"/>
+            </w:r>
+          </w:p>
+        </w:tc>
+      </w:tr>
+      <w:tr>
+        <w:tc>
+          <w:tcPr>
+            <w:tcW w:type="dxa" w:w="2300"/>
+            <w:tcBorders>
+              <w:top w:val="single" w:color="D9D5CB" w:sz="4"/>
+              <w:left w:val="single" w:color="D9D5CB" w:sz="4"/>
+              <w:bottom w:val="single" w:color="D9D5CB" w:sz="4"/>
+              <w:right w:val="single" w:color="D9D5CB" w:sz="4"/>
+            </w:tcBorders>
+            <w:tcMar>
+              <w:top w:type="dxa" w:w="60"/>
+              <w:left w:type="dxa" w:w="90"/>
+              <w:bottom w:type="dxa" w:w="60"/>
+              <w:right w:type="dxa" w:w="90"/>
+            </w:tcMar>
+            <w:vAlign w:val="top"/>
+          </w:tcPr>
+          <w:p>
+            <w:pPr>
+              <w:spacing w:after="40"/>
+            </w:pPr>
+            <w:r>
+              <w:rPr>
+                <w:rFonts w:ascii="Calibri" w:cs="Calibri" w:eastAsia="Calibri" w:hAnsi="Calibri"/>
+                <w:b/>
+                <w:bCs/>
+                <w:color w:val="14213D"/>
+                <w:sz w:val="20"/>
+                <w:szCs w:val="20"/>
+              </w:rPr>
+              <w:t xml:space="preserve">Bug corrigé : boutons du plan à la souris</w:t>
+            </w:r>
+          </w:p>
+        </w:tc>
+        <w:tc>
+          <w:tcPr>
+            <w:tcW w:type="dxa" w:w="4100"/>
+            <w:tcBorders>
+              <w:top w:val="single" w:color="D9D5CB" w:sz="4"/>
+              <w:left w:val="single" w:color="D9D5CB" w:sz="4"/>
+              <w:bottom w:val="single" w:color="D9D5CB" w:sz="4"/>
+              <w:right w:val="single" w:color="D9D5CB" w:sz="4"/>
+            </w:tcBorders>
+            <w:tcMar>
+              <w:top w:type="dxa" w:w="60"/>
+              <w:left w:type="dxa" w:w="90"/>
+              <w:bottom w:type="dxa" w:w="60"/>
+              <w:right w:type="dxa" w:w="90"/>
+            </w:tcMar>
+            <w:vAlign w:val="top"/>
+          </w:tcPr>
+          <w:p>
+            <w:pPr>
+              <w:spacing w:after="40"/>
+            </w:pPr>
+            <w:r>
+              <w:rPr>
+                <w:rFonts w:ascii="Calibri" w:cs="Calibri" w:eastAsia="Calibri" w:hAnsi="Calibri"/>
+                <w:color w:val="14213D"/>
+                <w:sz w:val="19"/>
+                <w:szCs w:val="19"/>
+              </w:rPr>
+              <w:t xml:space="preserve">Sur ordinateur, « ＋ Poser sur le plan », le ✕ de la barre Modif · TS et le « ✓ Fermer » de la zone ne réagissaient pas au clic (le plan prenait le clic ; la zone recevait même un point fantôme). Au doigt ça marchait. Corrigé et testé à la souris.</w:t>
+            </w:r>
+          </w:p>
+        </w:tc>
+        <w:tc>
+          <w:tcPr>
+            <w:tcW w:type="dxa" w:w="3700"/>
+            <w:tcBorders>
+              <w:top w:val="single" w:color="D9D5CB" w:sz="4"/>
+              <w:left w:val="single" w:color="D9D5CB" w:sz="4"/>
+              <w:bottom w:val="single" w:color="D9D5CB" w:sz="4"/>
+              <w:right w:val="single" w:color="D9D5CB" w:sz="4"/>
+            </w:tcBorders>
+            <w:tcMar>
+              <w:top w:type="dxa" w:w="60"/>
+              <w:left w:type="dxa" w:w="90"/>
+              <w:bottom w:type="dxa" w:w="60"/>
+              <w:right w:type="dxa" w:w="90"/>
+            </w:tcMar>
+            <w:vAlign w:val="top"/>
+          </w:tcPr>
+          <w:p>
+            <w:pPr>
+              <w:spacing w:after="40"/>
+            </w:pPr>
+            <w:r>
+              <w:rPr>
+                <w:rFonts w:ascii="Calibri" w:cs="Calibri" w:eastAsia="Calibri" w:hAnsi="Calibri"/>
+                <w:color w:val="14213D"/>
+                <w:sz w:val="19"/>
+                <w:szCs w:val="19"/>
+              </w:rPr>
+              <w:t xml:space="preserve">—</w:t>
+            </w:r>
+          </w:p>
+        </w:tc>
+        <w:tc>
+          <w:tcPr>
+            <w:tcW w:type="dxa" w:w="1300"/>
+            <w:tcBorders>
+              <w:top w:val="single" w:color="D9D5CB" w:sz="4"/>
+              <w:left w:val="single" w:color="D9D5CB" w:sz="4"/>
+              <w:bottom w:val="single" w:color="D9D5CB" w:sz="4"/>
+              <w:right w:val="single" w:color="D9D5CB" w:sz="4"/>
+            </w:tcBorders>
+            <w:shd w:fill="E6F5EC" w:color="auto" w:val="clear"/>
+            <w:tcMar>
+              <w:top w:type="dxa" w:w="60"/>
+              <w:left w:type="dxa" w:w="90"/>
+              <w:bottom w:type="dxa" w:w="60"/>
+              <w:right w:type="dxa" w:w="90"/>
+            </w:tcMar>
+            <w:vAlign w:val="top"/>
+          </w:tcPr>
+          <w:p>
+            <w:pPr>
+              <w:spacing w:after="40"/>
+            </w:pPr>
+            <w:r>
+              <w:rPr>
+                <w:rFonts w:ascii="Calibri" w:cs="Calibri" w:eastAsia="Calibri" w:hAnsi="Calibri"/>
+                <w:b/>
+                <w:bCs/>
+                <w:color w:val="14213D"/>
+                <w:sz w:val="19"/>
+                <w:szCs w:val="19"/>
+              </w:rPr>
+              <w:t xml:space="preserve">Fait</w:t>
+            </w:r>
+          </w:p>
+        </w:tc>
+        <w:tc>
+          <w:tcPr>
+            <w:tcW w:type="dxa" w:w="3700"/>
+            <w:tcBorders>
+              <w:top w:val="single" w:color="D9D5CB" w:sz="4"/>
+              <w:left w:val="single" w:color="D9D5CB" w:sz="4"/>
+              <w:bottom w:val="single" w:color="D9D5CB" w:sz="4"/>
+              <w:right w:val="single" w:color="D9D5CB" w:sz="4"/>
+            </w:tcBorders>
+            <w:tcMar>
+              <w:top w:type="dxa" w:w="60"/>
+              <w:left w:type="dxa" w:w="90"/>
+              <w:bottom w:type="dxa" w:w="60"/>
+              <w:right w:type="dxa" w:w="90"/>
+            </w:tcMar>
+            <w:vAlign w:val="top"/>
+          </w:tcPr>
+          <w:p>
+            <w:pPr>
+              <w:spacing w:after="40"/>
+            </w:pPr>
+            <w:r>
+              <w:rPr>
+                <w:rFonts w:ascii="Calibri" w:cs="Calibri" w:eastAsia="Calibri" w:hAnsi="Calibri"/>
+                <w:color w:val="14213D"/>
+                <w:sz w:val="20"/>
+                <w:szCs w:val="20"/>
+              </w:rPr>
+              <w:t xml:space="preserve"/>
+            </w:r>
+          </w:p>
+          <w:p>
+            <w:pPr>
+              <w:spacing w:after="40"/>
+            </w:pPr>
+            <w:r>
+              <w:rPr>
+                <w:rFonts w:ascii="Calibri" w:cs="Calibri" w:eastAsia="Calibri" w:hAnsi="Calibri"/>
+                <w:color w:val="14213D"/>
+                <w:sz w:val="20"/>
+                <w:szCs w:val="20"/>
+              </w:rPr>
+              <w:t xml:space="preserve"/>
+            </w:r>
+          </w:p>
+        </w:tc>
+      </w:tr>
+      <w:tr>
+        <w:tc>
+          <w:tcPr>
+            <w:tcW w:type="dxa" w:w="2300"/>
+            <w:tcBorders>
+              <w:top w:val="single" w:color="D9D5CB" w:sz="4"/>
+              <w:left w:val="single" w:color="D9D5CB" w:sz="4"/>
+              <w:bottom w:val="single" w:color="D9D5CB" w:sz="4"/>
+              <w:right w:val="single" w:color="D9D5CB" w:sz="4"/>
+            </w:tcBorders>
+            <w:tcMar>
+              <w:top w:type="dxa" w:w="60"/>
+              <w:left w:type="dxa" w:w="90"/>
+              <w:bottom w:type="dxa" w:w="60"/>
+              <w:right w:type="dxa" w:w="90"/>
+            </w:tcMar>
+            <w:vAlign w:val="top"/>
+          </w:tcPr>
+          <w:p>
+            <w:pPr>
+              <w:spacing w:after="40"/>
+            </w:pPr>
+            <w:r>
+              <w:rPr>
+                <w:rFonts w:ascii="Calibri" w:cs="Calibri" w:eastAsia="Calibri" w:hAnsi="Calibri"/>
+                <w:b/>
+                <w:bCs/>
+                <w:color w:val="14213D"/>
+                <w:sz w:val="20"/>
+                <w:szCs w:val="20"/>
+              </w:rPr>
+              <w:t xml:space="preserve">Trame type d'import (commande et BL)</w:t>
+            </w:r>
+          </w:p>
+        </w:tc>
+        <w:tc>
+          <w:tcPr>
+            <w:tcW w:type="dxa" w:w="4100"/>
+            <w:tcBorders>
+              <w:top w:val="single" w:color="D9D5CB" w:sz="4"/>
+              <w:left w:val="single" w:color="D9D5CB" w:sz="4"/>
+              <w:bottom w:val="single" w:color="D9D5CB" w:sz="4"/>
+              <w:right w:val="single" w:color="D9D5CB" w:sz="4"/>
+            </w:tcBorders>
+            <w:tcMar>
+              <w:top w:type="dxa" w:w="60"/>
+              <w:left w:type="dxa" w:w="90"/>
+              <w:bottom w:type="dxa" w:w="60"/>
+              <w:right w:type="dxa" w:w="90"/>
+            </w:tcMar>
+            <w:vAlign w:val="top"/>
+          </w:tcPr>
+          <w:p>
+            <w:pPr>
+              <w:spacing w:after="40"/>
+            </w:pPr>
+            <w:r>
+              <w:rPr>
+                <w:rFonts w:ascii="Calibri" w:cs="Calibri" w:eastAsia="Calibri" w:hAnsi="Calibri"/>
+                <w:color w:val="14213D"/>
+                <w:sz w:val="19"/>
+                <w:szCs w:val="19"/>
+              </w:rPr>
+              <w:t xml:space="preserve">Fourniture → 📥 Importer une commande (Fichier ou Coller) et Stock → Nouvelle livraison → 📋 Trame : bloc « Trame type SCR » → 📋 Copier la trame (l'en-tête) · ⬇ Trame Excel · ✨ Copier la consigne Claude Excel. Tu colles la trame à côté du tableau du fournisseur, Claude dans Excel la remplit avec la consigne, tu recopies la trame remplie (en-tête compris) et tu la colles — ou tu importes le fichier : la trame est trouvée sur n'importe quelle feuille.</w:t>
+            </w:r>
+          </w:p>
+        </w:tc>
+        <w:tc>
+          <w:tcPr>
+            <w:tcW w:type="dxa" w:w="3700"/>
+            <w:tcBorders>
+              <w:top w:val="single" w:color="D9D5CB" w:sz="4"/>
+              <w:left w:val="single" w:color="D9D5CB" w:sz="4"/>
+              <w:bottom w:val="single" w:color="D9D5CB" w:sz="4"/>
+              <w:right w:val="single" w:color="D9D5CB" w:sz="4"/>
+            </w:tcBorders>
+            <w:tcMar>
+              <w:top w:type="dxa" w:w="60"/>
+              <w:left w:type="dxa" w:w="90"/>
+              <w:bottom w:type="dxa" w:w="60"/>
+              <w:right w:type="dxa" w:w="90"/>
+            </w:tcMar>
+            <w:vAlign w:val="top"/>
+          </w:tcPr>
+          <w:p>
+            <w:pPr>
+              <w:spacing w:after="40"/>
+            </w:pPr>
+            <w:r>
+              <w:rPr>
+                <w:rFonts w:ascii="Calibri" w:cs="Calibri" w:eastAsia="Calibri" w:hAnsi="Calibri"/>
+                <w:color w:val="14213D"/>
+                <w:sz w:val="19"/>
+                <w:szCs w:val="19"/>
+              </w:rPr>
+              <w:t xml:space="preserve">10 colonnes : Type de pièce (liste de 14), DN, DN 2, Angle, Longueur, Quantité, Unité (u / ml), Gaine Ø, Réf. et Désignation fournisseur. Lecture colonne par colonne (aucune devinette) ; une ligne fausse est montrée avec son n° et la raison, jamais importée. Fichier joint : Trame_import_SCR_commande_BL.xlsx (aussi dans app/docs).</w:t>
+            </w:r>
+          </w:p>
+        </w:tc>
+        <w:tc>
+          <w:tcPr>
+            <w:tcW w:type="dxa" w:w="1300"/>
+            <w:tcBorders>
+              <w:top w:val="single" w:color="D9D5CB" w:sz="4"/>
+              <w:left w:val="single" w:color="D9D5CB" w:sz="4"/>
+              <w:bottom w:val="single" w:color="D9D5CB" w:sz="4"/>
+              <w:right w:val="single" w:color="D9D5CB" w:sz="4"/>
+            </w:tcBorders>
+            <w:shd w:fill="E6F5EC" w:color="auto" w:val="clear"/>
+            <w:tcMar>
+              <w:top w:type="dxa" w:w="60"/>
+              <w:left w:type="dxa" w:w="90"/>
+              <w:bottom w:type="dxa" w:w="60"/>
+              <w:right w:type="dxa" w:w="90"/>
+            </w:tcMar>
+            <w:vAlign w:val="top"/>
+          </w:tcPr>
+          <w:p>
+            <w:pPr>
+              <w:spacing w:after="40"/>
+            </w:pPr>
+            <w:r>
+              <w:rPr>
+                <w:rFonts w:ascii="Calibri" w:cs="Calibri" w:eastAsia="Calibri" w:hAnsi="Calibri"/>
+                <w:b/>
+                <w:bCs/>
+                <w:color w:val="14213D"/>
+                <w:sz w:val="19"/>
+                <w:szCs w:val="19"/>
+              </w:rPr>
+              <w:t xml:space="preserve">Fait</w:t>
+            </w:r>
+          </w:p>
+        </w:tc>
+        <w:tc>
+          <w:tcPr>
+            <w:tcW w:type="dxa" w:w="3700"/>
+            <w:tcBorders>
+              <w:top w:val="single" w:color="D9D5CB" w:sz="4"/>
+              <w:left w:val="single" w:color="D9D5CB" w:sz="4"/>
+              <w:bottom w:val="single" w:color="D9D5CB" w:sz="4"/>
+              <w:right w:val="single" w:color="D9D5CB" w:sz="4"/>
+            </w:tcBorders>
+            <w:tcMar>
+              <w:top w:type="dxa" w:w="60"/>
+              <w:left w:type="dxa" w:w="90"/>
+              <w:bottom w:type="dxa" w:w="60"/>
+              <w:right w:type="dxa" w:w="90"/>
+            </w:tcMar>
+            <w:vAlign w:val="top"/>
+          </w:tcPr>
+          <w:p>
+            <w:pPr>
+              <w:spacing w:after="40"/>
+            </w:pPr>
+            <w:r>
+              <w:rPr>
+                <w:rFonts w:ascii="Calibri" w:cs="Calibri" w:eastAsia="Calibri" w:hAnsi="Calibri"/>
+                <w:color w:val="14213D"/>
+                <w:sz w:val="20"/>
+                <w:szCs w:val="20"/>
+              </w:rPr>
+              <w:t xml:space="preserve"/>
+            </w:r>
+          </w:p>
+          <w:p>
+            <w:pPr>
+              <w:spacing w:after="40"/>
+            </w:pPr>
+            <w:r>
+              <w:rPr>
+                <w:rFonts w:ascii="Calibri" w:cs="Calibri" w:eastAsia="Calibri" w:hAnsi="Calibri"/>
+                <w:color w:val="14213D"/>
+                <w:sz w:val="20"/>
+                <w:szCs w:val="20"/>
+              </w:rPr>
+              <w:t xml:space="preserve"/>
+            </w:r>
+          </w:p>
+        </w:tc>
+      </w:tr>
+      <w:tr>
+        <w:tc>
+          <w:tcPr>
+            <w:tcW w:type="dxa" w:w="2300"/>
+            <w:tcBorders>
+              <w:top w:val="single" w:color="D9D5CB" w:sz="4"/>
+              <w:left w:val="single" w:color="D9D5CB" w:sz="4"/>
+              <w:bottom w:val="single" w:color="D9D5CB" w:sz="4"/>
+              <w:right w:val="single" w:color="D9D5CB" w:sz="4"/>
+            </w:tcBorders>
+            <w:tcMar>
+              <w:top w:type="dxa" w:w="60"/>
+              <w:left w:type="dxa" w:w="90"/>
+              <w:bottom w:type="dxa" w:w="60"/>
+              <w:right w:type="dxa" w:w="90"/>
+            </w:tcMar>
+            <w:vAlign w:val="top"/>
+          </w:tcPr>
+          <w:p>
+            <w:pPr>
+              <w:spacing w:after="40"/>
+            </w:pPr>
+            <w:r>
+              <w:rPr>
+                <w:rFonts w:ascii="Calibri" w:cs="Calibri" w:eastAsia="Calibri" w:hAnsi="Calibri"/>
+                <w:b/>
+                <w:bCs/>
+                <w:color w:val="14213D"/>
+                <w:sz w:val="20"/>
+                <w:szCs w:val="20"/>
+              </w:rPr>
+              <w:t xml:space="preserve">Écarts : commande complémentaire ou inclus (comme les TS)</w:t>
+            </w:r>
+          </w:p>
+        </w:tc>
+        <w:tc>
+          <w:tcPr>
+            <w:tcW w:type="dxa" w:w="4100"/>
+            <w:tcBorders>
+              <w:top w:val="single" w:color="D9D5CB" w:sz="4"/>
+              <w:left w:val="single" w:color="D9D5CB" w:sz="4"/>
+              <w:bottom w:val="single" w:color="D9D5CB" w:sz="4"/>
+              <w:right w:val="single" w:color="D9D5CB" w:sz="4"/>
+            </w:tcBorders>
+            <w:tcMar>
+              <w:top w:type="dxa" w:w="60"/>
+              <w:left w:type="dxa" w:w="90"/>
+              <w:bottom w:type="dxa" w:w="60"/>
+              <w:right w:type="dxa" w:w="90"/>
+            </w:tcMar>
+            <w:vAlign w:val="top"/>
+          </w:tcPr>
+          <w:p>
+            <w:pPr>
+              <w:spacing w:after="40"/>
+            </w:pPr>
+            <w:r>
+              <w:rPr>
+                <w:rFonts w:ascii="Calibri" w:cs="Calibri" w:eastAsia="Calibri" w:hAnsi="Calibri"/>
+                <w:color w:val="14213D"/>
+                <w:sz w:val="19"/>
+                <w:szCs w:val="19"/>
+              </w:rPr>
+              <w:t xml:space="preserve">Fourniture, dès qu'une commande existe : carte « ⚖ Écarts au-delà de la commande » : par référence, la quantité + 📦 Commande compl. ou ✓ Inclus ; les qualifiés sont listés avec ↺. Colonne « à cder » du comparatif : « n ? » (à qualifier), 📦 n, ✓ n incl.</w:t>
+            </w:r>
+          </w:p>
+        </w:tc>
+        <w:tc>
+          <w:tcPr>
+            <w:tcW w:type="dxa" w:w="3700"/>
+            <w:tcBorders>
+              <w:top w:val="single" w:color="D9D5CB" w:sz="4"/>
+              <w:left w:val="single" w:color="D9D5CB" w:sz="4"/>
+              <w:bottom w:val="single" w:color="D9D5CB" w:sz="4"/>
+              <w:right w:val="single" w:color="D9D5CB" w:sz="4"/>
+            </w:tcBorders>
+            <w:tcMar>
+              <w:top w:type="dxa" w:w="60"/>
+              <w:left w:type="dxa" w:w="90"/>
+              <w:bottom w:type="dxa" w:w="60"/>
+              <w:right w:type="dxa" w:w="90"/>
+            </w:tcMar>
+            <w:vAlign w:val="top"/>
+          </w:tcPr>
+          <w:p>
+            <w:pPr>
+              <w:spacing w:after="40"/>
+            </w:pPr>
+            <w:r>
+              <w:rPr>
+                <w:rFonts w:ascii="Calibri" w:cs="Calibri" w:eastAsia="Calibri" w:hAnsi="Calibri"/>
+                <w:color w:val="14213D"/>
+                <w:sz w:val="19"/>
+                <w:szCs w:val="19"/>
+              </w:rPr>
+              <w:t xml:space="preserve">Inclus = pas de commande attendue (livré avec la commande en cours ou pris sur la réserve) : sort du « à commander », compte « à faire livrer » dans les zones. Un écart qui grossit après coup revient « à qualifier » pour la différence.</w:t>
+            </w:r>
+          </w:p>
+        </w:tc>
+        <w:tc>
+          <w:tcPr>
+            <w:tcW w:type="dxa" w:w="1300"/>
+            <w:tcBorders>
+              <w:top w:val="single" w:color="D9D5CB" w:sz="4"/>
+              <w:left w:val="single" w:color="D9D5CB" w:sz="4"/>
+              <w:bottom w:val="single" w:color="D9D5CB" w:sz="4"/>
+              <w:right w:val="single" w:color="D9D5CB" w:sz="4"/>
+            </w:tcBorders>
+            <w:shd w:fill="E6F5EC" w:color="auto" w:val="clear"/>
+            <w:tcMar>
+              <w:top w:type="dxa" w:w="60"/>
+              <w:left w:type="dxa" w:w="90"/>
+              <w:bottom w:type="dxa" w:w="60"/>
+              <w:right w:type="dxa" w:w="90"/>
+            </w:tcMar>
+            <w:vAlign w:val="top"/>
+          </w:tcPr>
+          <w:p>
+            <w:pPr>
+              <w:spacing w:after="40"/>
+            </w:pPr>
+            <w:r>
+              <w:rPr>
+                <w:rFonts w:ascii="Calibri" w:cs="Calibri" w:eastAsia="Calibri" w:hAnsi="Calibri"/>
+                <w:b/>
+                <w:bCs/>
+                <w:color w:val="14213D"/>
+                <w:sz w:val="19"/>
+                <w:szCs w:val="19"/>
+              </w:rPr>
+              <w:t xml:space="preserve">Fait</w:t>
+            </w:r>
+          </w:p>
+        </w:tc>
+        <w:tc>
+          <w:tcPr>
+            <w:tcW w:type="dxa" w:w="3700"/>
+            <w:tcBorders>
+              <w:top w:val="single" w:color="D9D5CB" w:sz="4"/>
+              <w:left w:val="single" w:color="D9D5CB" w:sz="4"/>
+              <w:bottom w:val="single" w:color="D9D5CB" w:sz="4"/>
+              <w:right w:val="single" w:color="D9D5CB" w:sz="4"/>
+            </w:tcBorders>
+            <w:tcMar>
+              <w:top w:type="dxa" w:w="60"/>
+              <w:left w:type="dxa" w:w="90"/>
+              <w:bottom w:type="dxa" w:w="60"/>
+              <w:right w:type="dxa" w:w="90"/>
+            </w:tcMar>
+            <w:vAlign w:val="top"/>
+          </w:tcPr>
+          <w:p>
+            <w:pPr>
+              <w:spacing w:after="40"/>
+            </w:pPr>
+            <w:r>
+              <w:rPr>
+                <w:rFonts w:ascii="Calibri" w:cs="Calibri" w:eastAsia="Calibri" w:hAnsi="Calibri"/>
+                <w:color w:val="14213D"/>
+                <w:sz w:val="20"/>
+                <w:szCs w:val="20"/>
+              </w:rPr>
+              <w:t xml:space="preserve"/>
+            </w:r>
+          </w:p>
+          <w:p>
+            <w:pPr>
+              <w:spacing w:after="40"/>
+            </w:pPr>
+            <w:r>
+              <w:rPr>
+                <w:rFonts w:ascii="Calibri" w:cs="Calibri" w:eastAsia="Calibri" w:hAnsi="Calibri"/>
+                <w:color w:val="14213D"/>
+                <w:sz w:val="20"/>
+                <w:szCs w:val="20"/>
+              </w:rPr>
+              <w:t xml:space="preserve"/>
+            </w:r>
+          </w:p>
+        </w:tc>
+      </w:tr>
+      <w:tr>
+        <w:tc>
+          <w:tcPr>
+            <w:tcW w:type="dxa" w:w="2300"/>
+            <w:tcBorders>
+              <w:top w:val="single" w:color="D9D5CB" w:sz="4"/>
+              <w:left w:val="single" w:color="D9D5CB" w:sz="4"/>
+              <w:bottom w:val="single" w:color="D9D5CB" w:sz="4"/>
+              <w:right w:val="single" w:color="D9D5CB" w:sz="4"/>
+            </w:tcBorders>
+            <w:tcMar>
+              <w:top w:type="dxa" w:w="60"/>
+              <w:left w:type="dxa" w:w="90"/>
+              <w:bottom w:type="dxa" w:w="60"/>
+              <w:right w:type="dxa" w:w="90"/>
+            </w:tcMar>
+            <w:vAlign w:val="top"/>
+          </w:tcPr>
+          <w:p>
+            <w:pPr>
+              <w:spacing w:after="40"/>
+            </w:pPr>
+            <w:r>
+              <w:rPr>
+                <w:rFonts w:ascii="Calibri" w:cs="Calibri" w:eastAsia="Calibri" w:hAnsi="Calibri"/>
+                <w:b/>
+                <w:bCs/>
+                <w:color w:val="14213D"/>
+                <w:sz w:val="20"/>
+                <w:szCs w:val="20"/>
+              </w:rPr>
+              <w:t xml:space="preserve">Commande complémentaire</w:t>
+            </w:r>
+          </w:p>
+        </w:tc>
+        <w:tc>
+          <w:tcPr>
+            <w:tcW w:type="dxa" w:w="4100"/>
+            <w:tcBorders>
+              <w:top w:val="single" w:color="D9D5CB" w:sz="4"/>
+              <w:left w:val="single" w:color="D9D5CB" w:sz="4"/>
+              <w:bottom w:val="single" w:color="D9D5CB" w:sz="4"/>
+              <w:right w:val="single" w:color="D9D5CB" w:sz="4"/>
+            </w:tcBorders>
+            <w:tcMar>
+              <w:top w:type="dxa" w:w="60"/>
+              <w:left w:type="dxa" w:w="90"/>
+              <w:bottom w:type="dxa" w:w="60"/>
+              <w:right w:type="dxa" w:w="90"/>
+            </w:tcMar>
+            <w:vAlign w:val="top"/>
+          </w:tcPr>
+          <w:p>
+            <w:pPr>
+              <w:spacing w:after="40"/>
+            </w:pPr>
+            <w:r>
+              <w:rPr>
+                <w:rFonts w:ascii="Calibri" w:cs="Calibri" w:eastAsia="Calibri" w:hAnsi="Calibri"/>
+                <w:color w:val="14213D"/>
+                <w:sz w:val="19"/>
+                <w:szCs w:val="19"/>
+              </w:rPr>
+              <w:t xml:space="preserve">Carte « 📦 Commande complémentaire à passer » : la liste, « ✓ Passer la commande complémentaire » (n° et date) → elle rejoint les commandes (étiquette « complémentaire ») et le comparatif la compte ; 📋 / ⬇ au format trame pour l'envoyer au fournisseur.</w:t>
+            </w:r>
+          </w:p>
+        </w:tc>
+        <w:tc>
+          <w:tcPr>
+            <w:tcW w:type="dxa" w:w="3700"/>
+            <w:tcBorders>
+              <w:top w:val="single" w:color="D9D5CB" w:sz="4"/>
+              <w:left w:val="single" w:color="D9D5CB" w:sz="4"/>
+              <w:bottom w:val="single" w:color="D9D5CB" w:sz="4"/>
+              <w:right w:val="single" w:color="D9D5CB" w:sz="4"/>
+            </w:tcBorders>
+            <w:tcMar>
+              <w:top w:type="dxa" w:w="60"/>
+              <w:left w:type="dxa" w:w="90"/>
+              <w:bottom w:type="dxa" w:w="60"/>
+              <w:right w:type="dxa" w:w="90"/>
+            </w:tcMar>
+            <w:vAlign w:val="top"/>
+          </w:tcPr>
+          <w:p>
+            <w:pPr>
+              <w:spacing w:after="40"/>
+            </w:pPr>
+            <w:r>
+              <w:rPr>
+                <w:rFonts w:ascii="Calibri" w:cs="Calibri" w:eastAsia="Calibri" w:hAnsi="Calibri"/>
+                <w:color w:val="14213D"/>
+                <w:sz w:val="19"/>
+                <w:szCs w:val="19"/>
+              </w:rPr>
+              <w:t xml:space="preserve">Le brouillon = qualifié − déjà passé (lu dans les commandes) : pas de double commande possible.</w:t>
+            </w:r>
+          </w:p>
+        </w:tc>
+        <w:tc>
+          <w:tcPr>
+            <w:tcW w:type="dxa" w:w="1300"/>
+            <w:tcBorders>
+              <w:top w:val="single" w:color="D9D5CB" w:sz="4"/>
+              <w:left w:val="single" w:color="D9D5CB" w:sz="4"/>
+              <w:bottom w:val="single" w:color="D9D5CB" w:sz="4"/>
+              <w:right w:val="single" w:color="D9D5CB" w:sz="4"/>
+            </w:tcBorders>
+            <w:shd w:fill="E6F5EC" w:color="auto" w:val="clear"/>
+            <w:tcMar>
+              <w:top w:type="dxa" w:w="60"/>
+              <w:left w:type="dxa" w:w="90"/>
+              <w:bottom w:type="dxa" w:w="60"/>
+              <w:right w:type="dxa" w:w="90"/>
+            </w:tcMar>
+            <w:vAlign w:val="top"/>
+          </w:tcPr>
+          <w:p>
+            <w:pPr>
+              <w:spacing w:after="40"/>
+            </w:pPr>
+            <w:r>
+              <w:rPr>
+                <w:rFonts w:ascii="Calibri" w:cs="Calibri" w:eastAsia="Calibri" w:hAnsi="Calibri"/>
+                <w:b/>
+                <w:bCs/>
+                <w:color w:val="14213D"/>
+                <w:sz w:val="19"/>
+                <w:szCs w:val="19"/>
+              </w:rPr>
+              <w:t xml:space="preserve">Fait</w:t>
+            </w:r>
+          </w:p>
+        </w:tc>
+        <w:tc>
+          <w:tcPr>
+            <w:tcW w:type="dxa" w:w="3700"/>
+            <w:tcBorders>
+              <w:top w:val="single" w:color="D9D5CB" w:sz="4"/>
+              <w:left w:val="single" w:color="D9D5CB" w:sz="4"/>
+              <w:bottom w:val="single" w:color="D9D5CB" w:sz="4"/>
+              <w:right w:val="single" w:color="D9D5CB" w:sz="4"/>
+            </w:tcBorders>
+            <w:tcMar>
+              <w:top w:type="dxa" w:w="60"/>
+              <w:left w:type="dxa" w:w="90"/>
+              <w:bottom w:type="dxa" w:w="60"/>
+              <w:right w:type="dxa" w:w="90"/>
+            </w:tcMar>
+            <w:vAlign w:val="top"/>
+          </w:tcPr>
+          <w:p>
+            <w:pPr>
+              <w:spacing w:after="40"/>
+            </w:pPr>
+            <w:r>
+              <w:rPr>
+                <w:rFonts w:ascii="Calibri" w:cs="Calibri" w:eastAsia="Calibri" w:hAnsi="Calibri"/>
+                <w:color w:val="14213D"/>
+                <w:sz w:val="20"/>
+                <w:szCs w:val="20"/>
+              </w:rPr>
+              <w:t xml:space="preserve"/>
+            </w:r>
+          </w:p>
+          <w:p>
+            <w:pPr>
+              <w:spacing w:after="40"/>
+            </w:pPr>
+            <w:r>
+              <w:rPr>
+                <w:rFonts w:ascii="Calibri" w:cs="Calibri" w:eastAsia="Calibri" w:hAnsi="Calibri"/>
+                <w:color w:val="14213D"/>
+                <w:sz w:val="20"/>
+                <w:szCs w:val="20"/>
+              </w:rPr>
+              <w:t xml:space="preserve"/>
+            </w:r>
+          </w:p>
+        </w:tc>
+      </w:tr>
+      <w:tr>
+        <w:tc>
+          <w:tcPr>
+            <w:tcW w:type="dxa" w:w="2300"/>
+            <w:tcBorders>
+              <w:top w:val="single" w:color="D9D5CB" w:sz="4"/>
+              <w:left w:val="single" w:color="D9D5CB" w:sz="4"/>
+              <w:bottom w:val="single" w:color="D9D5CB" w:sz="4"/>
+              <w:right w:val="single" w:color="D9D5CB" w:sz="4"/>
+            </w:tcBorders>
+            <w:tcMar>
+              <w:top w:type="dxa" w:w="60"/>
+              <w:left w:type="dxa" w:w="90"/>
+              <w:bottom w:type="dxa" w:w="60"/>
+              <w:right w:type="dxa" w:w="90"/>
+            </w:tcMar>
+            <w:vAlign w:val="top"/>
+          </w:tcPr>
+          <w:p>
+            <w:pPr>
+              <w:spacing w:after="40"/>
+            </w:pPr>
+            <w:r>
+              <w:rPr>
+                <w:rFonts w:ascii="Calibri" w:cs="Calibri" w:eastAsia="Calibri" w:hAnsi="Calibri"/>
+                <w:b/>
+                <w:bCs/>
+                <w:color w:val="14213D"/>
+                <w:sz w:val="20"/>
+                <w:szCs w:val="20"/>
+              </w:rPr>
+              <w:t xml:space="preserve">BL d'une zone ou d'une phase → Stock</w:t>
+            </w:r>
+          </w:p>
+        </w:tc>
+        <w:tc>
+          <w:tcPr>
+            <w:tcW w:type="dxa" w:w="4100"/>
+            <w:tcBorders>
+              <w:top w:val="single" w:color="D9D5CB" w:sz="4"/>
+              <w:left w:val="single" w:color="D9D5CB" w:sz="4"/>
+              <w:bottom w:val="single" w:color="D9D5CB" w:sz="4"/>
+              <w:right w:val="single" w:color="D9D5CB" w:sz="4"/>
+            </w:tcBorders>
+            <w:tcMar>
+              <w:top w:type="dxa" w:w="60"/>
+              <w:left w:type="dxa" w:w="90"/>
+              <w:bottom w:type="dxa" w:w="60"/>
+              <w:right w:type="dxa" w:w="90"/>
+            </w:tcMar>
+            <w:vAlign w:val="top"/>
+          </w:tcPr>
+          <w:p>
+            <w:pPr>
+              <w:spacing w:after="40"/>
+            </w:pPr>
+            <w:r>
+              <w:rPr>
+                <w:rFonts w:ascii="Calibri" w:cs="Calibri" w:eastAsia="Calibri" w:hAnsi="Calibri"/>
+                <w:color w:val="14213D"/>
+                <w:sz w:val="19"/>
+                <w:szCs w:val="19"/>
+              </w:rPr>
+              <w:t xml:space="preserve">Une zone (entourée ou phase reprise) → « 📄 BL de la zone » : à faire livrer ou tout le besoin, n° BL-Zone-A-aaaammjj → 📋 Copier · ⬇ Excel (au format trame, en-tête du BL au-dessus) · « → Stock : nouvelle livraison pré-remplie » (prévue, rattachée à la zone : comptée « annoncé »).</w:t>
+            </w:r>
+          </w:p>
+        </w:tc>
+        <w:tc>
+          <w:tcPr>
+            <w:tcW w:type="dxa" w:w="3700"/>
+            <w:tcBorders>
+              <w:top w:val="single" w:color="D9D5CB" w:sz="4"/>
+              <w:left w:val="single" w:color="D9D5CB" w:sz="4"/>
+              <w:bottom w:val="single" w:color="D9D5CB" w:sz="4"/>
+              <w:right w:val="single" w:color="D9D5CB" w:sz="4"/>
+            </w:tcBorders>
+            <w:tcMar>
+              <w:top w:type="dxa" w:w="60"/>
+              <w:left w:type="dxa" w:w="90"/>
+              <w:bottom w:type="dxa" w:w="60"/>
+              <w:right w:type="dxa" w:w="90"/>
+            </w:tcMar>
+            <w:vAlign w:val="top"/>
+          </w:tcPr>
+          <w:p>
+            <w:pPr>
+              <w:spacing w:after="40"/>
+            </w:pPr>
+            <w:r>
+              <w:rPr>
+                <w:rFonts w:ascii="Calibri" w:cs="Calibri" w:eastAsia="Calibri" w:hAnsi="Calibri"/>
+                <w:color w:val="14213D"/>
+                <w:sz w:val="19"/>
+                <w:szCs w:val="19"/>
+              </w:rPr>
+              <w:t xml:space="preserve">L'Excel du BL se ré-importe tel quel (Stock → Trame → Fichier).</w:t>
+            </w:r>
+          </w:p>
+        </w:tc>
+        <w:tc>
+          <w:tcPr>
+            <w:tcW w:type="dxa" w:w="1300"/>
+            <w:tcBorders>
+              <w:top w:val="single" w:color="D9D5CB" w:sz="4"/>
+              <w:left w:val="single" w:color="D9D5CB" w:sz="4"/>
+              <w:bottom w:val="single" w:color="D9D5CB" w:sz="4"/>
+              <w:right w:val="single" w:color="D9D5CB" w:sz="4"/>
+            </w:tcBorders>
+            <w:shd w:fill="E6F5EC" w:color="auto" w:val="clear"/>
+            <w:tcMar>
+              <w:top w:type="dxa" w:w="60"/>
+              <w:left w:type="dxa" w:w="90"/>
+              <w:bottom w:type="dxa" w:w="60"/>
+              <w:right w:type="dxa" w:w="90"/>
+            </w:tcMar>
+            <w:vAlign w:val="top"/>
+          </w:tcPr>
+          <w:p>
+            <w:pPr>
+              <w:spacing w:after="40"/>
+            </w:pPr>
+            <w:r>
+              <w:rPr>
+                <w:rFonts w:ascii="Calibri" w:cs="Calibri" w:eastAsia="Calibri" w:hAnsi="Calibri"/>
+                <w:b/>
+                <w:bCs/>
+                <w:color w:val="14213D"/>
+                <w:sz w:val="19"/>
+                <w:szCs w:val="19"/>
+              </w:rPr>
+              <w:t xml:space="preserve">Fait</w:t>
+            </w:r>
+          </w:p>
+        </w:tc>
+        <w:tc>
+          <w:tcPr>
+            <w:tcW w:type="dxa" w:w="3700"/>
+            <w:tcBorders>
+              <w:top w:val="single" w:color="D9D5CB" w:sz="4"/>
+              <w:left w:val="single" w:color="D9D5CB" w:sz="4"/>
+              <w:bottom w:val="single" w:color="D9D5CB" w:sz="4"/>
+              <w:right w:val="single" w:color="D9D5CB" w:sz="4"/>
+            </w:tcBorders>
+            <w:tcMar>
+              <w:top w:type="dxa" w:w="60"/>
+              <w:left w:type="dxa" w:w="90"/>
+              <w:bottom w:type="dxa" w:w="60"/>
+              <w:right w:type="dxa" w:w="90"/>
+            </w:tcMar>
+            <w:vAlign w:val="top"/>
+          </w:tcPr>
+          <w:p>
+            <w:pPr>
+              <w:spacing w:after="40"/>
+            </w:pPr>
+            <w:r>
+              <w:rPr>
+                <w:rFonts w:ascii="Calibri" w:cs="Calibri" w:eastAsia="Calibri" w:hAnsi="Calibri"/>
+                <w:color w:val="14213D"/>
+                <w:sz w:val="20"/>
+                <w:szCs w:val="20"/>
+              </w:rPr>
+              <w:t xml:space="preserve"/>
+            </w:r>
+          </w:p>
+          <w:p>
+            <w:pPr>
+              <w:spacing w:after="40"/>
+            </w:pPr>
+            <w:r>
+              <w:rPr>
+                <w:rFonts w:ascii="Calibri" w:cs="Calibri" w:eastAsia="Calibri" w:hAnsi="Calibri"/>
+                <w:color w:val="14213D"/>
+                <w:sz w:val="20"/>
+                <w:szCs w:val="20"/>
+              </w:rPr>
+              <w:t xml:space="preserve"/>
+            </w:r>
+          </w:p>
+        </w:tc>
+      </w:tr>
+    </w:tbl>
+    <w:p>
+      <w:pPr>
+        <w:pStyle w:val="Heading1"/>
+        <w:spacing w:after="120" w:before="320"/>
+      </w:pPr>
+      <w:r>
+        <w:rPr>
+          <w:rFonts w:ascii="Calibri" w:cs="Calibri" w:eastAsia="Calibri" w:hAnsi="Calibri"/>
+          <w:b/>
+          <w:bCs/>
+          <w:color w:val="EB6834"/>
+          <w:sz w:val="30"/>
+          <w:szCs w:val="30"/>
+        </w:rPr>
         <w:t xml:space="preserve">K · COMMERCE v2 — dossier, lecture des pièces, chiffrage complet, DPGF, mémoire (ta demande de l'après-midi)</w:t>
       </w:r>
     </w:p>
@@ -21972,6 +26023,63 @@
           <w:szCs w:val="30"/>
         </w:rPr>
         <w:t xml:space="preserve">Pas fait · à trancher</w:t>
+      </w:r>
+    </w:p>
+    <w:p>
+      <w:pPr>
+        <w:pStyle w:val="ListParagraph"/>
+        <w:numPr>
+          <w:ilvl w:val="0"/>
+          <w:numId w:val="2"/>
+        </w:numPr>
+        <w:spacing w:after="40"/>
+      </w:pPr>
+      <w:r>
+        <w:rPr>
+          <w:rFonts w:ascii="Calibri" w:cs="Calibri" w:eastAsia="Calibri" w:hAnsi="Calibri"/>
+          <w:color w:val="14213D"/>
+          <w:sz w:val="20"/>
+          <w:szCs w:val="20"/>
+        </w:rPr>
+        <w:t xml:space="preserve">Navette des variables : je n'ai pas reçu ta navette type — l'export du mois est provisoire (jours en colonnes) ; renvoie-la et je le fais à l'identique.</w:t>
+      </w:r>
+    </w:p>
+    <w:p>
+      <w:pPr>
+        <w:pStyle w:val="ListParagraph"/>
+        <w:numPr>
+          <w:ilvl w:val="0"/>
+          <w:numId w:val="2"/>
+        </w:numPr>
+        <w:spacing w:after="40"/>
+      </w:pPr>
+      <w:r>
+        <w:rPr>
+          <w:rFonts w:ascii="Calibri" w:cs="Calibri" w:eastAsia="Calibri" w:hAnsi="Calibri"/>
+          <w:color w:val="14213D"/>
+          <w:sz w:val="20"/>
+          <w:szCs w:val="20"/>
+        </w:rPr>
+        <w:t xml:space="preserve">Grands déplacements : un retour de congé est-il payé comme un trajet (aller) ? Aujourd'hui oui. Le planning ne distingue pas « congé » de « pas affecté ». Le « ½ A/R aller / retour » n'est écrit que dans le calendrier du mois, pas dans la ligne de la vue semaine.</w:t>
+      </w:r>
+    </w:p>
+    <w:p>
+      <w:pPr>
+        <w:pStyle w:val="ListParagraph"/>
+        <w:numPr>
+          <w:ilvl w:val="0"/>
+          <w:numId w:val="2"/>
+        </w:numPr>
+        <w:spacing w:after="40"/>
+      </w:pPr>
+      <w:r>
+        <w:rPr>
+          <w:rFonts w:ascii="Calibri" w:cs="Calibri" w:eastAsia="Calibri" w:hAnsi="Calibri"/>
+          <w:color w:val="14213D"/>
+          <w:sz w:val="20"/>
+          <w:szCs w:val="20"/>
+        </w:rPr>
+        <w:t xml:space="preserve">Trame depuis un PDF fournisseur : Claude dans Excel ne lit pas le PDF — copier d'abord le texte du PDF dans une feuille Excel, puis la consigne. Écart commande ↔ BL fournisseur ligne à ligne : pas fait.</w:t>
       </w:r>
     </w:p>
     <w:p>
@@ -22179,6 +26287,120 @@
           <w:szCs w:val="30"/>
         </w:rPr>
         <w:t xml:space="preserve">Titres de commit (GitHub Desktop)</w:t>
+      </w:r>
+    </w:p>
+    <w:p>
+      <w:pPr>
+        <w:pStyle w:val="ListParagraph"/>
+        <w:numPr>
+          <w:ilvl w:val="0"/>
+          <w:numId w:val="2"/>
+        </w:numPr>
+        <w:spacing w:after="40"/>
+      </w:pPr>
+      <w:r>
+        <w:rPr>
+          <w:rFonts w:ascii="Calibri" w:cs="Calibri" w:eastAsia="Calibri" w:hAnsi="Calibri"/>
+          <w:color w:val="14213D"/>
+          <w:sz w:val="20"/>
+          <w:szCs w:val="20"/>
+        </w:rPr>
+        <w:t xml:space="preserve">(nuit) Résumé : Le chef / conducteur désigné dans la fiche ouvre toujours son chantier ; un chef ouvre aussi ceux de sa semaine prochaine</w:t>
+      </w:r>
+    </w:p>
+    <w:p>
+      <w:pPr>
+        <w:pStyle w:val="ListParagraph"/>
+        <w:numPr>
+          <w:ilvl w:val="0"/>
+          <w:numId w:val="2"/>
+        </w:numPr>
+        <w:spacing w:after="40"/>
+      </w:pPr>
+      <w:r>
+        <w:rPr>
+          <w:rFonts w:ascii="Calibri" w:cs="Calibri" w:eastAsia="Calibri" w:hAnsi="Calibri"/>
+          <w:color w:val="14213D"/>
+          <w:sz w:val="20"/>
+          <w:szCs w:val="20"/>
+        </w:rPr>
+        <w:t xml:space="preserve">Description : 13/10 nuit — espacePlannedSites : fiche chef / conducteur prise en compte, semaine prochaine pour les chefs, règle souple inchangée ; espaceRespSites pour les comptes à liste de chantiers ; message de refus explicite ; test e2e_resp</w:t>
+      </w:r>
+    </w:p>
+    <w:p>
+      <w:pPr>
+        <w:pStyle w:val="ListParagraph"/>
+        <w:numPr>
+          <w:ilvl w:val="0"/>
+          <w:numId w:val="2"/>
+        </w:numPr>
+        <w:spacing w:after="40"/>
+      </w:pPr>
+      <w:r>
+        <w:rPr>
+          <w:rFonts w:ascii="Calibri" w:cs="Calibri" w:eastAsia="Calibri" w:hAnsi="Calibri"/>
+          <w:color w:val="14213D"/>
+          <w:sz w:val="20"/>
+          <w:szCs w:val="20"/>
+        </w:rPr>
+        <w:t xml:space="preserve">(tard le soir) Résumé : Plan qui disparaît au zoom (Nantes Géraudière) — vue réparée, « Recentrer le repère », le traceur ne reprend plus l'origine d'un plan éloigné</w:t>
+      </w:r>
+    </w:p>
+    <w:p>
+      <w:pPr>
+        <w:pStyle w:val="ListParagraph"/>
+        <w:numPr>
+          <w:ilvl w:val="0"/>
+          <w:numId w:val="2"/>
+        </w:numPr>
+        <w:spacing w:after="40"/>
+      </w:pPr>
+      <w:r>
+        <w:rPr>
+          <w:rFonts w:ascii="Calibri" w:cs="Calibri" w:eastAsia="Calibri" w:hAnsi="Calibri"/>
+          <w:color w:val="14213D"/>
+          <w:sz w:val="20"/>
+          <w:szCs w:val="20"/>
+        </w:rPr>
+        <w:t xml:space="preserve">Description : 13/10 tard — viewTf « scale(k) translate(tx/k ty/k) » (Chrome n'affiche plus rien au-delà de ~2^25 px) dans le plan, les feuilles hydraulique / stock, le traceur et engine.js ; src/rebase.js (recentrer tout le chantier d'un bloc, géoréférencement corrigé) + bandeau et action dans le plan ; dxfimport buildBackground : origine du plan précédent gardée seulement à &lt; 50 km ; traceur : pas d'enregistrement sur un repère recentré entre-temps ; test e2e_rebase</w:t>
+      </w:r>
+    </w:p>
+    <w:p>
+      <w:pPr>
+        <w:pStyle w:val="ListParagraph"/>
+        <w:numPr>
+          <w:ilvl w:val="0"/>
+          <w:numId w:val="2"/>
+        </w:numPr>
+        <w:spacing w:after="40"/>
+      </w:pPr>
+      <w:r>
+        <w:rPr>
+          <w:rFonts w:ascii="Calibri" w:cs="Calibri" w:eastAsia="Calibri" w:hAnsi="Calibri"/>
+          <w:color w:val="14213D"/>
+          <w:sz w:val="20"/>
+          <w:szCs w:val="20"/>
+        </w:rPr>
+        <w:t xml:space="preserve">(soir) Résumé : GD jour par jour (4 ou 5 j = même forfait), mois par gars + navette, adresses à vérifier ; Fourniture : zone éditable, trame type d'import, écarts commande complémentaire / inclus, BL de zone → Stock</w:t>
+      </w:r>
+    </w:p>
+    <w:p>
+      <w:pPr>
+        <w:pStyle w:val="ListParagraph"/>
+        <w:numPr>
+          <w:ilvl w:val="0"/>
+          <w:numId w:val="2"/>
+        </w:numPr>
+        <w:spacing w:after="40"/>
+      </w:pPr>
+      <w:r>
+        <w:rPr>
+          <w:rFonts w:ascii="Calibri" w:cs="Calibri" w:eastAsia="Calibri" w:hAnsi="Calibri"/>
+          <w:color w:val="14213D"/>
+          <w:sz w:val="20"/>
+          <w:szCs w:val="20"/>
+        </w:rPr>
+        <w:t xml:space="preserve">Description : 13/10 soir — rh.js gdJours (dim soir → ven midi, trajet seulement sur les vrais allers / retours), mois par personne (calendrier, ajustement d'un jour, navette CSV), adresses à vérifier ; fourniture.js zone éditable (glisser, ◆, 🗑, ↶, modifier le contour), trame.js (trame type commande / BL, Excel généré, consigne Claude Excel), écarts qualifiés (dec) + commande complémentaire, BL de zone → Stock ; boutons du plan réparés à la souris ; sql/retours_13-10c.sql (site_set_part v8) ; tests e2e_gdnav, e2e_fourn2</w:t>
       </w:r>
     </w:p>
     <w:p>

</xml_diff>

<commit_message>
Nantes revient à sa place sur la carte après le recentrage + contrôle des SQL (lecture seule)
</commit_message>
<xml_diff>
--- a/app/docs/Feuille_de_route_controle_12-10.docx
+++ b/app/docs/Feuille_de_route_controle_12-10.docx
@@ -65,7 +65,7 @@
           <w:sz w:val="20"/>
           <w:szCs w:val="20"/>
         </w:rPr>
-        <w:t xml:space="preserve">Même principe que la précédente : tu contrôles ligne par ligne, tu écris dans « Vos commentaires » (OK / à corriger / à changer : quoi), tu me renvoies le fichier. Je corrige à partir de tes commentaires, dans l'ordre du document. Commence par les sections N (Sofiane et le chantier de Nantes) et M (Nantes Géraudière : le plan qui disparaît au zoom), puis L (grands déplacements et fourniture), puis K (Commerce v2 : dossier, lecture, chiffrage, DPGF, mémoire), puis I (l'onglet Fourniture), puis J (tes retours de la feuille du 09-10 : c'est la seule feuille à suivre désormais — l'ancienne n'est plus livrée), puis H (Commerce de A à Z), G (la nuit) et F (tes retours du 12/10 soir).</w:t>
+        <w:t xml:space="preserve">Même principe que la précédente : tu contrôles ligne par ligne, tu écris dans « Vos commentaires » (OK / à corriger / à changer : quoi), tu me renvoies le fichier. Je corrige à partir de tes commentaires, dans l'ordre du document. Commence par la section O (Nantes : la carte après le recentrage, et le contrôle des SQL), puis N (Sofiane et le chantier de Nantes) et M (Nantes Géraudière : le plan qui disparaît au zoom), puis L (grands déplacements et fourniture), puis K (Commerce v2 : dossier, lecture, chiffrage, DPGF, mémoire), puis I (l'onglet Fourniture), puis J (tes retours de la feuille du 09-10 : c'est la seule feuille à suivre désormais — l'ancienne n'est plus livrée), puis H (Commerce de A à Z), G (la nuit) et F (tes retours du 12/10 soir).</w:t>
       </w:r>
     </w:p>
     <w:p>
@@ -84,7 +84,7 @@
           <w:sz w:val="20"/>
           <w:szCs w:val="20"/>
         </w:rPr>
-        <w:t xml:space="preserve">Build livré : 13/10/2026 · 92c3f2 (index.html + traceur.html à la racine du dépôt). Pas de SQL pour les sections N et M. Nouveau SQL du soir : retours_13-10c.sql (qualifications des écarts de fourniture réunies entre deux tablettes). SQL de l'après-midi : retours_13-10b.sql (base de prix et paniers : registres « prix » et « panier », lecture réservée à l'encadrement / bureau), blocs_memoire_scr.sql (ton mémoire O2410-10 découpé en 10 blocs réutilisables) (retours_13-10.sql de l'onglet Fourniture est inclus dans retours_13-10c.sql). SQL retours_12-10.sql et retours_12-10b.sql passés, fonction outlook-sync déployée et vérifiée par toi le 12/10 au soir (« ça fonctionne parfaitement »). Hors connexion, tout se teste avec les personnages de démo.</w:t>
+        <w:t xml:space="preserve">Build livré : 13/10/2026 · 0d618e (index.html + traceur.html à la racine du dépôt). Pas de SQL pour les sections O, N et M (le contrôle des SQL de la section O ne modifie rien). Nouveau SQL du soir : retours_13-10c.sql (qualifications des écarts de fourniture réunies entre deux tablettes). SQL de l'après-midi : retours_13-10b.sql (base de prix et paniers : registres « prix » et « panier », lecture réservée à l'encadrement / bureau), blocs_memoire_scr.sql (ton mémoire O2410-10 découpé en 10 blocs réutilisables) (retours_13-10.sql de l'onglet Fourniture est inclus dans retours_13-10c.sql). SQL retours_12-10.sql et retours_12-10b.sql passés, fonction outlook-sync déployée et vérifiée par toi le 12/10 au soir (« ça fonctionne parfaitement »). Hors connexion, tout se teste avec les personnages de démo.</w:t>
       </w:r>
     </w:p>
     <w:p>
@@ -300,6 +300,120 @@
                 <w:sz w:val="19"/>
                 <w:szCs w:val="19"/>
               </w:rPr>
+              <w:t xml:space="preserve">app/sql/controle_sql.sql (NOUVEAU — LECTURE SEULE, à lancer quand tu veux)</w:t>
+            </w:r>
+          </w:p>
+        </w:tc>
+        <w:tc>
+          <w:tcPr>
+            <w:tcW w:type="dxa" w:w="8100"/>
+            <w:tcBorders>
+              <w:top w:val="single" w:color="D9D5CB" w:sz="4"/>
+              <w:left w:val="single" w:color="D9D5CB" w:sz="4"/>
+              <w:bottom w:val="single" w:color="D9D5CB" w:sz="4"/>
+              <w:right w:val="single" w:color="D9D5CB" w:sz="4"/>
+            </w:tcBorders>
+            <w:tcMar>
+              <w:top w:type="dxa" w:w="60"/>
+              <w:left w:type="dxa" w:w="90"/>
+              <w:bottom w:type="dxa" w:w="60"/>
+              <w:right w:type="dxa" w:w="90"/>
+            </w:tcMar>
+            <w:vAlign w:val="top"/>
+          </w:tcPr>
+          <w:p>
+            <w:pPr>
+              <w:spacing w:after="40"/>
+            </w:pPr>
+            <w:r>
+              <w:rPr>
+                <w:rFonts w:ascii="Calibri" w:cs="Calibri" w:eastAsia="Calibri" w:hAnsi="Calibri"/>
+                <w:color w:val="14213D"/>
+                <w:sz w:val="19"/>
+                <w:szCs w:val="19"/>
+              </w:rPr>
+              <w:t xml:space="preserve">Te dit, script par script, où en est ta base : ✅ passé ou ❌ à passer (avec le nombre d'affaires, de véhicules, de fiches RH et de blocs du mémoire trouvés). Ne modifie rien. Repère aussi l'erreur d'ordre (retours_13-10 repassé après 13-10c). Testé sur une base vide, une base à jour et une base où il manque les SQL du 13/10. Je le tiens à jour à chaque nouveau SQL.</w:t>
+            </w:r>
+          </w:p>
+        </w:tc>
+        <w:tc>
+          <w:tcPr>
+            <w:tcW w:type="dxa" w:w="3800"/>
+            <w:tcBorders>
+              <w:top w:val="single" w:color="D9D5CB" w:sz="4"/>
+              <w:left w:val="single" w:color="D9D5CB" w:sz="4"/>
+              <w:bottom w:val="single" w:color="D9D5CB" w:sz="4"/>
+              <w:right w:val="single" w:color="D9D5CB" w:sz="4"/>
+            </w:tcBorders>
+            <w:tcMar>
+              <w:top w:type="dxa" w:w="60"/>
+              <w:left w:type="dxa" w:w="90"/>
+              <w:bottom w:type="dxa" w:w="60"/>
+              <w:right w:type="dxa" w:w="90"/>
+            </w:tcMar>
+            <w:vAlign w:val="top"/>
+          </w:tcPr>
+          <w:p>
+            <w:pPr>
+              <w:spacing w:after="40"/>
+            </w:pPr>
+            <w:r>
+              <w:rPr>
+                <w:rFonts w:ascii="Calibri" w:cs="Calibri" w:eastAsia="Calibri" w:hAnsi="Calibri"/>
+                <w:color w:val="14213D"/>
+                <w:sz w:val="20"/>
+                <w:szCs w:val="20"/>
+              </w:rPr>
+              <w:t xml:space="preserve"/>
+            </w:r>
+          </w:p>
+          <w:p>
+            <w:pPr>
+              <w:spacing w:after="40"/>
+            </w:pPr>
+            <w:r>
+              <w:rPr>
+                <w:rFonts w:ascii="Calibri" w:cs="Calibri" w:eastAsia="Calibri" w:hAnsi="Calibri"/>
+                <w:color w:val="14213D"/>
+                <w:sz w:val="20"/>
+                <w:szCs w:val="20"/>
+              </w:rPr>
+              <w:t xml:space="preserve"/>
+            </w:r>
+          </w:p>
+        </w:tc>
+      </w:tr>
+      <w:tr>
+        <w:tc>
+          <w:tcPr>
+            <w:tcW w:type="dxa" w:w="3200"/>
+            <w:tcBorders>
+              <w:top w:val="single" w:color="D9D5CB" w:sz="4"/>
+              <w:left w:val="single" w:color="D9D5CB" w:sz="4"/>
+              <w:bottom w:val="single" w:color="D9D5CB" w:sz="4"/>
+              <w:right w:val="single" w:color="D9D5CB" w:sz="4"/>
+            </w:tcBorders>
+            <w:tcMar>
+              <w:top w:type="dxa" w:w="60"/>
+              <w:left w:type="dxa" w:w="90"/>
+              <w:bottom w:type="dxa" w:w="60"/>
+              <w:right w:type="dxa" w:w="90"/>
+            </w:tcMar>
+            <w:vAlign w:val="top"/>
+          </w:tcPr>
+          <w:p>
+            <w:pPr>
+              <w:spacing w:after="40"/>
+            </w:pPr>
+            <w:r>
+              <w:rPr>
+                <w:rFonts w:ascii="Calibri" w:cs="Calibri" w:eastAsia="Calibri" w:hAnsi="Calibri"/>
+                <w:b/>
+                <w:bCs/>
+                <w:color w:val="14213D"/>
+                <w:sz w:val="19"/>
+                <w:szCs w:val="19"/>
+              </w:rPr>
               <w:t xml:space="preserve">app/sql/retours_13-10c.sql (NOUVEAU — à passer ; contient tout retours_13-10.sql : ne repasse pas l'ancien APRÈS celui-ci)</w:t>
             </w:r>
           </w:p>
@@ -12372,6 +12486,599 @@
                 <w:szCs w:val="19"/>
               </w:rPr>
               <w:t xml:space="preserve">Fait (à déployer)</w:t>
+            </w:r>
+          </w:p>
+        </w:tc>
+        <w:tc>
+          <w:tcPr>
+            <w:tcW w:type="dxa" w:w="3700"/>
+            <w:tcBorders>
+              <w:top w:val="single" w:color="D9D5CB" w:sz="4"/>
+              <w:left w:val="single" w:color="D9D5CB" w:sz="4"/>
+              <w:bottom w:val="single" w:color="D9D5CB" w:sz="4"/>
+              <w:right w:val="single" w:color="D9D5CB" w:sz="4"/>
+            </w:tcBorders>
+            <w:tcMar>
+              <w:top w:type="dxa" w:w="60"/>
+              <w:left w:type="dxa" w:w="90"/>
+              <w:bottom w:type="dxa" w:w="60"/>
+              <w:right w:type="dxa" w:w="90"/>
+            </w:tcMar>
+            <w:vAlign w:val="top"/>
+          </w:tcPr>
+          <w:p>
+            <w:pPr>
+              <w:spacing w:after="40"/>
+            </w:pPr>
+            <w:r>
+              <w:rPr>
+                <w:rFonts w:ascii="Calibri" w:cs="Calibri" w:eastAsia="Calibri" w:hAnsi="Calibri"/>
+                <w:color w:val="14213D"/>
+                <w:sz w:val="20"/>
+                <w:szCs w:val="20"/>
+              </w:rPr>
+              <w:t xml:space="preserve"/>
+            </w:r>
+          </w:p>
+          <w:p>
+            <w:pPr>
+              <w:spacing w:after="40"/>
+            </w:pPr>
+            <w:r>
+              <w:rPr>
+                <w:rFonts w:ascii="Calibri" w:cs="Calibri" w:eastAsia="Calibri" w:hAnsi="Calibri"/>
+                <w:color w:val="14213D"/>
+                <w:sz w:val="20"/>
+                <w:szCs w:val="20"/>
+              </w:rPr>
+              <w:t xml:space="preserve"/>
+            </w:r>
+          </w:p>
+        </w:tc>
+      </w:tr>
+    </w:tbl>
+    <w:p>
+      <w:pPr>
+        <w:pStyle w:val="Heading1"/>
+        <w:spacing w:after="120" w:before="320"/>
+      </w:pPr>
+      <w:r>
+        <w:rPr>
+          <w:rFonts w:ascii="Calibri" w:cs="Calibri" w:eastAsia="Calibri" w:hAnsi="Calibri"/>
+          <w:b/>
+          <w:bCs/>
+          <w:color w:val="EB6834"/>
+          <w:sz w:val="30"/>
+          <w:szCs w:val="30"/>
+        </w:rPr>
+        <w:t xml:space="preserve">O · Nantes : « depuis que j'ai recentré, plus bien placé sur la carte » (réglé) + contrôle des SQL</w:t>
+      </w:r>
+    </w:p>
+    <w:p>
+      <w:pPr>
+        <w:spacing w:after="80" w:line="264"/>
+      </w:pPr>
+      <w:r>
+        <w:rPr>
+          <w:rFonts w:ascii="Calibri" w:cs="Calibri" w:eastAsia="Calibri" w:hAnsi="Calibri"/>
+          <w:color w:val="6B6B66"/>
+          <w:sz w:val="20"/>
+          <w:szCs w:val="20"/>
+        </w:rPr>
+        <w:t xml:space="preserve">« Le recentrage a fonctionné » puis « depuis que j'ai recentré, Nantes n'est plus sur la carte bien placé ? ». Reproduit : c'était l'épingle de la carte des chantiers, partie à ~2 000 km.</w:t>
+      </w:r>
+    </w:p>
+    <w:tbl>
+      <w:tblPr>
+        <w:tblW w:type="dxa" w:w="15100"/>
+        <w:tblBorders>
+          <w:top w:val="single" w:color="auto" w:sz="4"/>
+          <w:left w:val="single" w:color="auto" w:sz="4"/>
+          <w:bottom w:val="single" w:color="auto" w:sz="4"/>
+          <w:right w:val="single" w:color="auto" w:sz="4"/>
+          <w:insideH w:val="single" w:color="auto" w:sz="4"/>
+          <w:insideV w:val="single" w:color="auto" w:sz="4"/>
+        </w:tblBorders>
+      </w:tblPr>
+      <w:tblGrid>
+        <w:gridCol w:w="2300"/>
+        <w:gridCol w:w="4100"/>
+        <w:gridCol w:w="3700"/>
+        <w:gridCol w:w="1300"/>
+        <w:gridCol w:w="3700"/>
+      </w:tblGrid>
+      <w:tr>
+        <w:trPr>
+          <w:tblHeader/>
+        </w:trPr>
+        <w:tc>
+          <w:tcPr>
+            <w:tcW w:type="dxa" w:w="2300"/>
+            <w:tcBorders>
+              <w:top w:val="single" w:color="D9D5CB" w:sz="4"/>
+              <w:left w:val="single" w:color="D9D5CB" w:sz="4"/>
+              <w:bottom w:val="single" w:color="D9D5CB" w:sz="4"/>
+              <w:right w:val="single" w:color="D9D5CB" w:sz="4"/>
+            </w:tcBorders>
+            <w:shd w:fill="14213D" w:color="auto" w:val="clear"/>
+            <w:tcMar>
+              <w:top w:type="dxa" w:w="60"/>
+              <w:left w:type="dxa" w:w="90"/>
+              <w:bottom w:type="dxa" w:w="60"/>
+              <w:right w:type="dxa" w:w="90"/>
+            </w:tcMar>
+            <w:vAlign w:val="top"/>
+          </w:tcPr>
+          <w:p>
+            <w:pPr>
+              <w:spacing w:after="80" w:line="264"/>
+            </w:pPr>
+            <w:r>
+              <w:rPr>
+                <w:rFonts w:ascii="Calibri" w:cs="Calibri" w:eastAsia="Calibri" w:hAnsi="Calibri"/>
+                <w:b/>
+                <w:bCs/>
+                <w:color w:val="FFFFFF"/>
+                <w:sz w:val="19"/>
+                <w:szCs w:val="19"/>
+              </w:rPr>
+              <w:t xml:space="preserve">Fonctionnalité</w:t>
+            </w:r>
+          </w:p>
+        </w:tc>
+        <w:tc>
+          <w:tcPr>
+            <w:tcW w:type="dxa" w:w="4100"/>
+            <w:tcBorders>
+              <w:top w:val="single" w:color="D9D5CB" w:sz="4"/>
+              <w:left w:val="single" w:color="D9D5CB" w:sz="4"/>
+              <w:bottom w:val="single" w:color="D9D5CB" w:sz="4"/>
+              <w:right w:val="single" w:color="D9D5CB" w:sz="4"/>
+            </w:tcBorders>
+            <w:shd w:fill="14213D" w:color="auto" w:val="clear"/>
+            <w:tcMar>
+              <w:top w:type="dxa" w:w="60"/>
+              <w:left w:type="dxa" w:w="90"/>
+              <w:bottom w:type="dxa" w:w="60"/>
+              <w:right w:type="dxa" w:w="90"/>
+            </w:tcMar>
+            <w:vAlign w:val="top"/>
+          </w:tcPr>
+          <w:p>
+            <w:pPr>
+              <w:spacing w:after="80" w:line="264"/>
+            </w:pPr>
+            <w:r>
+              <w:rPr>
+                <w:rFonts w:ascii="Calibri" w:cs="Calibri" w:eastAsia="Calibri" w:hAnsi="Calibri"/>
+                <w:b/>
+                <w:bCs/>
+                <w:color w:val="FFFFFF"/>
+                <w:sz w:val="19"/>
+                <w:szCs w:val="19"/>
+              </w:rPr>
+              <w:t xml:space="preserve">Où la trouver · comment tester</w:t>
+            </w:r>
+          </w:p>
+        </w:tc>
+        <w:tc>
+          <w:tcPr>
+            <w:tcW w:type="dxa" w:w="3700"/>
+            <w:tcBorders>
+              <w:top w:val="single" w:color="D9D5CB" w:sz="4"/>
+              <w:left w:val="single" w:color="D9D5CB" w:sz="4"/>
+              <w:bottom w:val="single" w:color="D9D5CB" w:sz="4"/>
+              <w:right w:val="single" w:color="D9D5CB" w:sz="4"/>
+            </w:tcBorders>
+            <w:shd w:fill="14213D" w:color="auto" w:val="clear"/>
+            <w:tcMar>
+              <w:top w:type="dxa" w:w="60"/>
+              <w:left w:type="dxa" w:w="90"/>
+              <w:bottom w:type="dxa" w:w="60"/>
+              <w:right w:type="dxa" w:w="90"/>
+            </w:tcMar>
+            <w:vAlign w:val="top"/>
+          </w:tcPr>
+          <w:p>
+            <w:pPr>
+              <w:spacing w:after="80" w:line="264"/>
+            </w:pPr>
+            <w:r>
+              <w:rPr>
+                <w:rFonts w:ascii="Calibri" w:cs="Calibri" w:eastAsia="Calibri" w:hAnsi="Calibri"/>
+                <w:b/>
+                <w:bCs/>
+                <w:color w:val="FFFFFF"/>
+                <w:sz w:val="19"/>
+                <w:szCs w:val="19"/>
+              </w:rPr>
+              <w:t xml:space="preserve">Hypothèses · limites · ce que j'ai tranché</w:t>
+            </w:r>
+          </w:p>
+        </w:tc>
+        <w:tc>
+          <w:tcPr>
+            <w:tcW w:type="dxa" w:w="1300"/>
+            <w:tcBorders>
+              <w:top w:val="single" w:color="D9D5CB" w:sz="4"/>
+              <w:left w:val="single" w:color="D9D5CB" w:sz="4"/>
+              <w:bottom w:val="single" w:color="D9D5CB" w:sz="4"/>
+              <w:right w:val="single" w:color="D9D5CB" w:sz="4"/>
+            </w:tcBorders>
+            <w:shd w:fill="14213D" w:color="auto" w:val="clear"/>
+            <w:tcMar>
+              <w:top w:type="dxa" w:w="60"/>
+              <w:left w:type="dxa" w:w="90"/>
+              <w:bottom w:type="dxa" w:w="60"/>
+              <w:right w:type="dxa" w:w="90"/>
+            </w:tcMar>
+            <w:vAlign w:val="top"/>
+          </w:tcPr>
+          <w:p>
+            <w:pPr>
+              <w:spacing w:after="80" w:line="264"/>
+            </w:pPr>
+            <w:r>
+              <w:rPr>
+                <w:rFonts w:ascii="Calibri" w:cs="Calibri" w:eastAsia="Calibri" w:hAnsi="Calibri"/>
+                <w:b/>
+                <w:bCs/>
+                <w:color w:val="FFFFFF"/>
+                <w:sz w:val="19"/>
+                <w:szCs w:val="19"/>
+              </w:rPr>
+              <w:t xml:space="preserve">Statut</w:t>
+            </w:r>
+          </w:p>
+        </w:tc>
+        <w:tc>
+          <w:tcPr>
+            <w:tcW w:type="dxa" w:w="3700"/>
+            <w:tcBorders>
+              <w:top w:val="single" w:color="D9D5CB" w:sz="4"/>
+              <w:left w:val="single" w:color="D9D5CB" w:sz="4"/>
+              <w:bottom w:val="single" w:color="D9D5CB" w:sz="4"/>
+              <w:right w:val="single" w:color="D9D5CB" w:sz="4"/>
+            </w:tcBorders>
+            <w:shd w:fill="14213D" w:color="auto" w:val="clear"/>
+            <w:tcMar>
+              <w:top w:type="dxa" w:w="60"/>
+              <w:left w:type="dxa" w:w="90"/>
+              <w:bottom w:type="dxa" w:w="60"/>
+              <w:right w:type="dxa" w:w="90"/>
+            </w:tcMar>
+            <w:vAlign w:val="top"/>
+          </w:tcPr>
+          <w:p>
+            <w:pPr>
+              <w:spacing w:after="80" w:line="264"/>
+            </w:pPr>
+            <w:r>
+              <w:rPr>
+                <w:rFonts w:ascii="Calibri" w:cs="Calibri" w:eastAsia="Calibri" w:hAnsi="Calibri"/>
+                <w:b/>
+                <w:bCs/>
+                <w:color w:val="FFFFFF"/>
+                <w:sz w:val="19"/>
+                <w:szCs w:val="19"/>
+              </w:rPr>
+              <w:t xml:space="preserve">Vos commentaires</w:t>
+            </w:r>
+          </w:p>
+        </w:tc>
+      </w:tr>
+      <w:tr>
+        <w:tc>
+          <w:tcPr>
+            <w:tcW w:type="dxa" w:w="2300"/>
+            <w:tcBorders>
+              <w:top w:val="single" w:color="D9D5CB" w:sz="4"/>
+              <w:left w:val="single" w:color="D9D5CB" w:sz="4"/>
+              <w:bottom w:val="single" w:color="D9D5CB" w:sz="4"/>
+              <w:right w:val="single" w:color="D9D5CB" w:sz="4"/>
+            </w:tcBorders>
+            <w:tcMar>
+              <w:top w:type="dxa" w:w="60"/>
+              <w:left w:type="dxa" w:w="90"/>
+              <w:bottom w:type="dxa" w:w="60"/>
+              <w:right w:type="dxa" w:w="90"/>
+            </w:tcMar>
+            <w:vAlign w:val="top"/>
+          </w:tcPr>
+          <w:p>
+            <w:pPr>
+              <w:spacing w:after="40"/>
+            </w:pPr>
+            <w:r>
+              <w:rPr>
+                <w:rFonts w:ascii="Calibri" w:cs="Calibri" w:eastAsia="Calibri" w:hAnsi="Calibri"/>
+                <w:b/>
+                <w:bCs/>
+                <w:color w:val="14213D"/>
+                <w:sz w:val="20"/>
+                <w:szCs w:val="20"/>
+              </w:rPr>
+              <w:t xml:space="preserve">Nantes revient à sa place sur la carte des chantiers</w:t>
+            </w:r>
+          </w:p>
+        </w:tc>
+        <w:tc>
+          <w:tcPr>
+            <w:tcW w:type="dxa" w:w="4100"/>
+            <w:tcBorders>
+              <w:top w:val="single" w:color="D9D5CB" w:sz="4"/>
+              <w:left w:val="single" w:color="D9D5CB" w:sz="4"/>
+              <w:bottom w:val="single" w:color="D9D5CB" w:sz="4"/>
+              <w:right w:val="single" w:color="D9D5CB" w:sz="4"/>
+            </w:tcBorders>
+            <w:tcMar>
+              <w:top w:type="dxa" w:w="60"/>
+              <w:left w:type="dxa" w:w="90"/>
+              <w:bottom w:type="dxa" w:w="60"/>
+              <w:right w:type="dxa" w:w="90"/>
+            </w:tcMar>
+            <w:vAlign w:val="top"/>
+          </w:tcPr>
+          <w:p>
+            <w:pPr>
+              <w:spacing w:after="40"/>
+            </w:pPr>
+            <w:r>
+              <w:rPr>
+                <w:rFonts w:ascii="Calibri" w:cs="Calibri" w:eastAsia="Calibri" w:hAnsi="Calibri"/>
+                <w:color w:val="14213D"/>
+                <w:sz w:val="19"/>
+                <w:szCs w:val="19"/>
+              </w:rPr>
+              <w:t xml:space="preserve">Accueil → Carte : l'épingle de Nantes Géraudière est de nouveau à Nantes (plus dans « Non localisés sur la carte »). Rien à refaire : ni recentrage, ni calage.</w:t>
+            </w:r>
+          </w:p>
+        </w:tc>
+        <w:tc>
+          <w:tcPr>
+            <w:tcW w:type="dxa" w:w="3700"/>
+            <w:tcBorders>
+              <w:top w:val="single" w:color="D9D5CB" w:sz="4"/>
+              <w:left w:val="single" w:color="D9D5CB" w:sz="4"/>
+              <w:bottom w:val="single" w:color="D9D5CB" w:sz="4"/>
+              <w:right w:val="single" w:color="D9D5CB" w:sz="4"/>
+            </w:tcBorders>
+            <w:tcMar>
+              <w:top w:type="dxa" w:w="60"/>
+              <w:left w:type="dxa" w:w="90"/>
+              <w:bottom w:type="dxa" w:w="60"/>
+              <w:right w:type="dxa" w:w="90"/>
+            </w:tcMar>
+            <w:vAlign w:val="top"/>
+          </w:tcPr>
+          <w:p>
+            <w:pPr>
+              <w:spacing w:after="40"/>
+            </w:pPr>
+            <w:r>
+              <w:rPr>
+                <w:rFonts w:ascii="Calibri" w:cs="Calibri" w:eastAsia="Calibri" w:hAnsi="Calibri"/>
+                <w:color w:val="14213D"/>
+                <w:sz w:val="19"/>
+                <w:szCs w:val="19"/>
+              </w:rPr>
+              <w:t xml:space="preserve">Cause (mon oubli) : le recentrage décalait bien le calage de la carte, mais pas les 2 repères que tu avais posés en calant le plan. L'épingle de l'accueil est calculée sur ces repères → partie à ~2 000 km. Le réseau sur la photo aérienne, lui, était resté juste. Maintenant les repères suivent le recentrage, et un chantier déjà recentré se répare tout seul à l'affichage, chez tout le monde, sans rien réécrire sur le serveur.</w:t>
+            </w:r>
+          </w:p>
+        </w:tc>
+        <w:tc>
+          <w:tcPr>
+            <w:tcW w:type="dxa" w:w="1300"/>
+            <w:tcBorders>
+              <w:top w:val="single" w:color="D9D5CB" w:sz="4"/>
+              <w:left w:val="single" w:color="D9D5CB" w:sz="4"/>
+              <w:bottom w:val="single" w:color="D9D5CB" w:sz="4"/>
+              <w:right w:val="single" w:color="D9D5CB" w:sz="4"/>
+            </w:tcBorders>
+            <w:shd w:fill="E6F5EC" w:color="auto" w:val="clear"/>
+            <w:tcMar>
+              <w:top w:type="dxa" w:w="60"/>
+              <w:left w:type="dxa" w:w="90"/>
+              <w:bottom w:type="dxa" w:w="60"/>
+              <w:right w:type="dxa" w:w="90"/>
+            </w:tcMar>
+            <w:vAlign w:val="top"/>
+          </w:tcPr>
+          <w:p>
+            <w:pPr>
+              <w:spacing w:after="40"/>
+            </w:pPr>
+            <w:r>
+              <w:rPr>
+                <w:rFonts w:ascii="Calibri" w:cs="Calibri" w:eastAsia="Calibri" w:hAnsi="Calibri"/>
+                <w:b/>
+                <w:bCs/>
+                <w:color w:val="14213D"/>
+                <w:sz w:val="19"/>
+                <w:szCs w:val="19"/>
+              </w:rPr>
+              <w:t xml:space="preserve">Fait</w:t>
+            </w:r>
+          </w:p>
+        </w:tc>
+        <w:tc>
+          <w:tcPr>
+            <w:tcW w:type="dxa" w:w="3700"/>
+            <w:tcBorders>
+              <w:top w:val="single" w:color="D9D5CB" w:sz="4"/>
+              <w:left w:val="single" w:color="D9D5CB" w:sz="4"/>
+              <w:bottom w:val="single" w:color="D9D5CB" w:sz="4"/>
+              <w:right w:val="single" w:color="D9D5CB" w:sz="4"/>
+            </w:tcBorders>
+            <w:tcMar>
+              <w:top w:type="dxa" w:w="60"/>
+              <w:left w:type="dxa" w:w="90"/>
+              <w:bottom w:type="dxa" w:w="60"/>
+              <w:right w:type="dxa" w:w="90"/>
+            </w:tcMar>
+            <w:vAlign w:val="top"/>
+          </w:tcPr>
+          <w:p>
+            <w:pPr>
+              <w:spacing w:after="40"/>
+            </w:pPr>
+            <w:r>
+              <w:rPr>
+                <w:rFonts w:ascii="Calibri" w:cs="Calibri" w:eastAsia="Calibri" w:hAnsi="Calibri"/>
+                <w:color w:val="14213D"/>
+                <w:sz w:val="20"/>
+                <w:szCs w:val="20"/>
+              </w:rPr>
+              <w:t xml:space="preserve"/>
+            </w:r>
+          </w:p>
+          <w:p>
+            <w:pPr>
+              <w:spacing w:after="40"/>
+            </w:pPr>
+            <w:r>
+              <w:rPr>
+                <w:rFonts w:ascii="Calibri" w:cs="Calibri" w:eastAsia="Calibri" w:hAnsi="Calibri"/>
+                <w:color w:val="14213D"/>
+                <w:sz w:val="20"/>
+                <w:szCs w:val="20"/>
+              </w:rPr>
+              <w:t xml:space="preserve"/>
+            </w:r>
+          </w:p>
+        </w:tc>
+      </w:tr>
+      <w:tr>
+        <w:tc>
+          <w:tcPr>
+            <w:tcW w:type="dxa" w:w="2300"/>
+            <w:tcBorders>
+              <w:top w:val="single" w:color="D9D5CB" w:sz="4"/>
+              <w:left w:val="single" w:color="D9D5CB" w:sz="4"/>
+              <w:bottom w:val="single" w:color="D9D5CB" w:sz="4"/>
+              <w:right w:val="single" w:color="D9D5CB" w:sz="4"/>
+            </w:tcBorders>
+            <w:tcMar>
+              <w:top w:type="dxa" w:w="60"/>
+              <w:left w:type="dxa" w:w="90"/>
+              <w:bottom w:type="dxa" w:w="60"/>
+              <w:right w:type="dxa" w:w="90"/>
+            </w:tcMar>
+            <w:vAlign w:val="top"/>
+          </w:tcPr>
+          <w:p>
+            <w:pPr>
+              <w:spacing w:after="40"/>
+            </w:pPr>
+            <w:r>
+              <w:rPr>
+                <w:rFonts w:ascii="Calibri" w:cs="Calibri" w:eastAsia="Calibri" w:hAnsi="Calibri"/>
+                <w:b/>
+                <w:bCs/>
+                <w:color w:val="14213D"/>
+                <w:sz w:val="20"/>
+                <w:szCs w:val="20"/>
+              </w:rPr>
+              <w:t xml:space="preserve">Contrôle des SQL (lecture seule)</w:t>
+            </w:r>
+          </w:p>
+        </w:tc>
+        <w:tc>
+          <w:tcPr>
+            <w:tcW w:type="dxa" w:w="4100"/>
+            <w:tcBorders>
+              <w:top w:val="single" w:color="D9D5CB" w:sz="4"/>
+              <w:left w:val="single" w:color="D9D5CB" w:sz="4"/>
+              <w:bottom w:val="single" w:color="D9D5CB" w:sz="4"/>
+              <w:right w:val="single" w:color="D9D5CB" w:sz="4"/>
+            </w:tcBorders>
+            <w:tcMar>
+              <w:top w:type="dxa" w:w="60"/>
+              <w:left w:type="dxa" w:w="90"/>
+              <w:bottom w:type="dxa" w:w="60"/>
+              <w:right w:type="dxa" w:w="90"/>
+            </w:tcMar>
+            <w:vAlign w:val="top"/>
+          </w:tcPr>
+          <w:p>
+            <w:pPr>
+              <w:spacing w:after="40"/>
+            </w:pPr>
+            <w:r>
+              <w:rPr>
+                <w:rFonts w:ascii="Calibri" w:cs="Calibri" w:eastAsia="Calibri" w:hAnsi="Calibri"/>
+                <w:color w:val="14213D"/>
+                <w:sz w:val="19"/>
+                <w:szCs w:val="19"/>
+              </w:rPr>
+              <w:t xml:space="preserve">Supabase → SQL Editor → New query → colle app/sql/controle_sql.sql → Run : une ligne par script, ✅ passé ou ❌ à passer.</w:t>
+            </w:r>
+          </w:p>
+        </w:tc>
+        <w:tc>
+          <w:tcPr>
+            <w:tcW w:type="dxa" w:w="3700"/>
+            <w:tcBorders>
+              <w:top w:val="single" w:color="D9D5CB" w:sz="4"/>
+              <w:left w:val="single" w:color="D9D5CB" w:sz="4"/>
+              <w:bottom w:val="single" w:color="D9D5CB" w:sz="4"/>
+              <w:right w:val="single" w:color="D9D5CB" w:sz="4"/>
+            </w:tcBorders>
+            <w:tcMar>
+              <w:top w:type="dxa" w:w="60"/>
+              <w:left w:type="dxa" w:w="90"/>
+              <w:bottom w:type="dxa" w:w="60"/>
+              <w:right w:type="dxa" w:w="90"/>
+            </w:tcMar>
+            <w:vAlign w:val="top"/>
+          </w:tcPr>
+          <w:p>
+            <w:pPr>
+              <w:spacing w:after="40"/>
+            </w:pPr>
+            <w:r>
+              <w:rPr>
+                <w:rFonts w:ascii="Calibri" w:cs="Calibri" w:eastAsia="Calibri" w:hAnsi="Calibri"/>
+                <w:color w:val="14213D"/>
+                <w:sz w:val="19"/>
+                <w:szCs w:val="19"/>
+              </w:rPr>
+              <w:t xml:space="preserve">Ne modifie rien. À relancer après chaque nouveau SQL ; je le tiens à jour à chaque livraison.</w:t>
+            </w:r>
+          </w:p>
+        </w:tc>
+        <w:tc>
+          <w:tcPr>
+            <w:tcW w:type="dxa" w:w="1300"/>
+            <w:tcBorders>
+              <w:top w:val="single" w:color="D9D5CB" w:sz="4"/>
+              <w:left w:val="single" w:color="D9D5CB" w:sz="4"/>
+              <w:bottom w:val="single" w:color="D9D5CB" w:sz="4"/>
+              <w:right w:val="single" w:color="D9D5CB" w:sz="4"/>
+            </w:tcBorders>
+            <w:shd w:fill="E6F5EC" w:color="auto" w:val="clear"/>
+            <w:tcMar>
+              <w:top w:type="dxa" w:w="60"/>
+              <w:left w:type="dxa" w:w="90"/>
+              <w:bottom w:type="dxa" w:w="60"/>
+              <w:right w:type="dxa" w:w="90"/>
+            </w:tcMar>
+            <w:vAlign w:val="top"/>
+          </w:tcPr>
+          <w:p>
+            <w:pPr>
+              <w:spacing w:after="40"/>
+            </w:pPr>
+            <w:r>
+              <w:rPr>
+                <w:rFonts w:ascii="Calibri" w:cs="Calibri" w:eastAsia="Calibri" w:hAnsi="Calibri"/>
+                <w:b/>
+                <w:bCs/>
+                <w:color w:val="14213D"/>
+                <w:sz w:val="19"/>
+                <w:szCs w:val="19"/>
+              </w:rPr>
+              <w:t xml:space="preserve">Fait</w:t>
             </w:r>
           </w:p>
         </w:tc>
@@ -26287,6 +26994,44 @@
           <w:szCs w:val="30"/>
         </w:rPr>
         <w:t xml:space="preserve">Titres de commit (GitHub Desktop)</w:t>
+      </w:r>
+    </w:p>
+    <w:p>
+      <w:pPr>
+        <w:pStyle w:val="ListParagraph"/>
+        <w:numPr>
+          <w:ilvl w:val="0"/>
+          <w:numId w:val="2"/>
+        </w:numPr>
+        <w:spacing w:after="40"/>
+      </w:pPr>
+      <w:r>
+        <w:rPr>
+          <w:rFonts w:ascii="Calibri" w:cs="Calibri" w:eastAsia="Calibri" w:hAnsi="Calibri"/>
+          <w:color w:val="14213D"/>
+          <w:sz w:val="20"/>
+          <w:szCs w:val="20"/>
+        </w:rPr>
+        <w:t xml:space="preserve">(nuit, suite) Résumé : Nantes revient à sa place sur la carte après le recentrage + contrôle des SQL (lecture seule)</w:t>
+      </w:r>
+    </w:p>
+    <w:p>
+      <w:pPr>
+        <w:pStyle w:val="ListParagraph"/>
+        <w:numPr>
+          <w:ilvl w:val="0"/>
+          <w:numId w:val="2"/>
+        </w:numPr>
+        <w:spacing w:after="40"/>
+      </w:pPr>
+      <w:r>
+        <w:rPr>
+          <w:rFonts w:ascii="Calibri" w:cs="Calibri" w:eastAsia="Calibri" w:hAnsi="Calibri"/>
+          <w:color w:val="14213D"/>
+          <w:sz w:val="20"/>
+          <w:szCs w:val="20"/>
+        </w:rPr>
+        <w:t xml:space="preserve">Description : 13/10 nuit — rebaseSite décale aussi les repères du calage (geo.pts) ; geo.js fixGeoPts : un repère à plus de 1 km de son point carte est replacé par le calage (appelé par geoOfSite : les chantiers déjà recentrés se réparent à l'affichage, sans écriture serveur) ; recenterSite répare avant de décaler ; e2e_rebase 0b / 3b / 5 ; sql/controle_sql.sql : ✅ / ❌ par script</w:t>
       </w:r>
     </w:p>
     <w:p>

</xml_diff>

<commit_message>
Navette de paie au format SCR (Excel pré-rempli, formules gardées) + toutes les navettes du mois
</commit_message>
<xml_diff>
--- a/app/docs/Feuille_de_route_controle_12-10.docx
+++ b/app/docs/Feuille_de_route_controle_12-10.docx
@@ -65,7 +65,7 @@
           <w:sz w:val="20"/>
           <w:szCs w:val="20"/>
         </w:rPr>
-        <w:t xml:space="preserve">Même principe que la précédente : tu contrôles ligne par ligne, tu écris dans « Vos commentaires » (OK / à corriger / à changer : quoi), tu me renvoies le fichier. Je corrige à partir de tes commentaires, dans l'ordre du document. Commence par la section O (Nantes : la carte après le recentrage, et le contrôle des SQL), puis N (Sofiane et le chantier de Nantes) et M (Nantes Géraudière : le plan qui disparaît au zoom), puis L (grands déplacements et fourniture), puis K (Commerce v2 : dossier, lecture, chiffrage, DPGF, mémoire), puis I (l'onglet Fourniture), puis J (tes retours de la feuille du 09-10 : c'est la seule feuille à suivre désormais — l'ancienne n'est plus livrée), puis H (Commerce de A à Z), G (la nuit) et F (tes retours du 12/10 soir).</w:t>
+        <w:t xml:space="preserve">Même principe que la précédente : tu contrôles ligne par ligne, tu écris dans « Vos commentaires » (OK / à corriger / à changer : quoi), tu me renvoies le fichier. Je corrige à partir de tes commentaires, dans l'ordre du document. Commence par la section P (la navette de paie au format SCR — nouveau), puis O (Nantes : la carte après le recentrage, et le contrôle des SQL), puis N (Sofiane et le chantier de Nantes) et M (Nantes Géraudière : le plan qui disparaît au zoom), puis L (grands déplacements et fourniture), puis K (Commerce v2 : dossier, lecture, chiffrage, DPGF, mémoire), puis I (l'onglet Fourniture), puis J (tes retours de la feuille du 09-10 : c'est la seule feuille à suivre désormais — l'ancienne n'est plus livrée), puis H (Commerce de A à Z), G (la nuit) et F (tes retours du 12/10 soir).</w:t>
       </w:r>
     </w:p>
     <w:p>
@@ -84,7 +84,7 @@
           <w:sz w:val="20"/>
           <w:szCs w:val="20"/>
         </w:rPr>
-        <w:t xml:space="preserve">Build livré : 13/10/2026 · 0d618e (index.html + traceur.html à la racine du dépôt). Pas de SQL pour les sections O, N et M (le contrôle des SQL de la section O ne modifie rien). Nouveau SQL du soir : retours_13-10c.sql (qualifications des écarts de fourniture réunies entre deux tablettes). SQL de l'après-midi : retours_13-10b.sql (base de prix et paniers : registres « prix » et « panier », lecture réservée à l'encadrement / bureau), blocs_memoire_scr.sql (ton mémoire O2410-10 découpé en 10 blocs réutilisables) (retours_13-10.sql de l'onglet Fourniture est inclus dans retours_13-10c.sql). SQL retours_12-10.sql et retours_12-10b.sql passés, fonction outlook-sync déployée et vérifiée par toi le 12/10 au soir (« ça fonctionne parfaitement »). Hors connexion, tout se teste avec les personnages de démo.</w:t>
+        <w:t xml:space="preserve">Build livré : 13/10/2026 · 496b5a (index.html + traceur.html à la racine du dépôt). Pas de SQL pour les sections P, O, N et M (le contrôle des SQL de la section O ne modifie rien). Tous les SQL sont passés (toi, 13/10 au soir) : ta base est à jour. Nouveau SQL du soir : retours_13-10c.sql (qualifications des écarts de fourniture réunies entre deux tablettes). SQL de l'après-midi : retours_13-10b.sql (base de prix et paniers : registres « prix » et « panier », lecture réservée à l'encadrement / bureau), blocs_memoire_scr.sql (ton mémoire O2410-10 découpé en 10 blocs réutilisables) (retours_13-10.sql de l'onglet Fourniture est inclus dans retours_13-10c.sql). SQL retours_12-10.sql et retours_12-10b.sql passés, fonction outlook-sync déployée et vérifiée par toi le 12/10 au soir (« ça fonctionne parfaitement »). Hors connexion, tout se teste avec les personnages de démo.</w:t>
       </w:r>
     </w:p>
     <w:p>
@@ -300,7 +300,7 @@
                 <w:sz w:val="19"/>
                 <w:szCs w:val="19"/>
               </w:rPr>
-              <w:t xml:space="preserve">app/sql/controle_sql.sql (NOUVEAU — LECTURE SEULE, à lancer quand tu veux)</w:t>
+              <w:t xml:space="preserve">app/sql/controle_sql.sql (LECTURE SEULE, à relancer après chaque nouveau SQL)</w:t>
             </w:r>
           </w:p>
         </w:tc>
@@ -414,7 +414,7 @@
                 <w:sz w:val="19"/>
                 <w:szCs w:val="19"/>
               </w:rPr>
-              <w:t xml:space="preserve">app/sql/retours_13-10c.sql (NOUVEAU — à passer ; contient tout retours_13-10.sql : ne repasse pas l'ancien APRÈS celui-ci)</w:t>
+              <w:t xml:space="preserve">app/sql/retours_13-10c.sql (PASSÉ par toi le 13/10 au soir ; contient tout retours_13-10.sql : ne repasse pas l'ancien APRÈS celui-ci)</w:t>
             </w:r>
           </w:p>
         </w:tc>
@@ -528,7 +528,7 @@
                 <w:sz w:val="19"/>
                 <w:szCs w:val="19"/>
               </w:rPr>
-              <w:t xml:space="preserve">app/sql/retours_13-10b.sql (après-midi — à passer si pas fait)</w:t>
+              <w:t xml:space="preserve">app/sql/retours_13-10b.sql (PASSÉ par toi le 13/10 au soir)</w:t>
             </w:r>
           </w:p>
         </w:tc>
@@ -642,7 +642,7 @@
                 <w:sz w:val="19"/>
                 <w:szCs w:val="19"/>
               </w:rPr>
-              <w:t xml:space="preserve">app/sql/blocs_memoire_scr.sql (NOUVEAU — à passer si tu veux les blocs)</w:t>
+              <w:t xml:space="preserve">app/sql/blocs_memoire_scr.sql (PASSÉ par toi le 13/10 au soir)</w:t>
             </w:r>
           </w:p>
         </w:tc>
@@ -756,7 +756,7 @@
                 <w:sz w:val="19"/>
                 <w:szCs w:val="19"/>
               </w:rPr>
-              <w:t xml:space="preserve">app/sql/retours_13-10.sql (matin — à passer si pas fait)</w:t>
+              <w:t xml:space="preserve">app/sql/retours_13-10.sql (inclus dans retours_13-10c : NE PLUS LE PASSER)</w:t>
             </w:r>
           </w:p>
         </w:tc>
@@ -12486,6 +12486,780 @@
                 <w:szCs w:val="19"/>
               </w:rPr>
               <w:t xml:space="preserve">Fait (à déployer)</w:t>
+            </w:r>
+          </w:p>
+        </w:tc>
+        <w:tc>
+          <w:tcPr>
+            <w:tcW w:type="dxa" w:w="3700"/>
+            <w:tcBorders>
+              <w:top w:val="single" w:color="D9D5CB" w:sz="4"/>
+              <w:left w:val="single" w:color="D9D5CB" w:sz="4"/>
+              <w:bottom w:val="single" w:color="D9D5CB" w:sz="4"/>
+              <w:right w:val="single" w:color="D9D5CB" w:sz="4"/>
+            </w:tcBorders>
+            <w:tcMar>
+              <w:top w:type="dxa" w:w="60"/>
+              <w:left w:type="dxa" w:w="90"/>
+              <w:bottom w:type="dxa" w:w="60"/>
+              <w:right w:type="dxa" w:w="90"/>
+            </w:tcMar>
+            <w:vAlign w:val="top"/>
+          </w:tcPr>
+          <w:p>
+            <w:pPr>
+              <w:spacing w:after="40"/>
+            </w:pPr>
+            <w:r>
+              <w:rPr>
+                <w:rFonts w:ascii="Calibri" w:cs="Calibri" w:eastAsia="Calibri" w:hAnsi="Calibri"/>
+                <w:color w:val="14213D"/>
+                <w:sz w:val="20"/>
+                <w:szCs w:val="20"/>
+              </w:rPr>
+              <w:t xml:space="preserve"/>
+            </w:r>
+          </w:p>
+          <w:p>
+            <w:pPr>
+              <w:spacing w:after="40"/>
+            </w:pPr>
+            <w:r>
+              <w:rPr>
+                <w:rFonts w:ascii="Calibri" w:cs="Calibri" w:eastAsia="Calibri" w:hAnsi="Calibri"/>
+                <w:color w:val="14213D"/>
+                <w:sz w:val="20"/>
+                <w:szCs w:val="20"/>
+              </w:rPr>
+              <w:t xml:space="preserve"/>
+            </w:r>
+          </w:p>
+        </w:tc>
+      </w:tr>
+    </w:tbl>
+    <w:p>
+      <w:pPr>
+        <w:pStyle w:val="Heading1"/>
+        <w:spacing w:after="120" w:before="320"/>
+      </w:pPr>
+      <w:r>
+        <w:rPr>
+          <w:rFonts w:ascii="Calibri" w:cs="Calibri" w:eastAsia="Calibri" w:hAnsi="Calibri"/>
+          <w:b/>
+          <w:bCs/>
+          <w:color w:val="EB6834"/>
+          <w:sz w:val="30"/>
+          <w:szCs w:val="30"/>
+        </w:rPr>
+        <w:t xml:space="preserve">P · Navette de paie au format SCR (nouveau — ta navette type du 13/10)</w:t>
+      </w:r>
+    </w:p>
+    <w:p>
+      <w:pPr>
+        <w:spacing w:after="80" w:line="264"/>
+      </w:pPr>
+      <w:r>
+        <w:rPr>
+          <w:rFonts w:ascii="Calibri" w:cs="Calibri" w:eastAsia="Calibri" w:hAnsi="Calibri"/>
+          <w:color w:val="6B6B66"/>
+          <w:sz w:val="20"/>
+          <w:szCs w:val="20"/>
+        </w:rPr>
+        <w:t xml:space="preserve">« C'est ça une navette type » (NAVETTE_09-26). Lue ligne à ligne : les règles de grands déplacements de l'appli collaient déjà (cas 2 : 5 hôtels, 10 repas, ½ trajet à l'aller et ½ au retour par semaine) ; il manquait ta feuille. Ton fichier n'est pas dans le dépôt (données personnelles).</w:t>
+      </w:r>
+    </w:p>
+    <w:tbl>
+      <w:tblPr>
+        <w:tblW w:type="dxa" w:w="15100"/>
+        <w:tblBorders>
+          <w:top w:val="single" w:color="auto" w:sz="4"/>
+          <w:left w:val="single" w:color="auto" w:sz="4"/>
+          <w:bottom w:val="single" w:color="auto" w:sz="4"/>
+          <w:right w:val="single" w:color="auto" w:sz="4"/>
+          <w:insideH w:val="single" w:color="auto" w:sz="4"/>
+          <w:insideV w:val="single" w:color="auto" w:sz="4"/>
+        </w:tblBorders>
+      </w:tblPr>
+      <w:tblGrid>
+        <w:gridCol w:w="2300"/>
+        <w:gridCol w:w="4100"/>
+        <w:gridCol w:w="3700"/>
+        <w:gridCol w:w="1300"/>
+        <w:gridCol w:w="3700"/>
+      </w:tblGrid>
+      <w:tr>
+        <w:trPr>
+          <w:tblHeader/>
+        </w:trPr>
+        <w:tc>
+          <w:tcPr>
+            <w:tcW w:type="dxa" w:w="2300"/>
+            <w:tcBorders>
+              <w:top w:val="single" w:color="D9D5CB" w:sz="4"/>
+              <w:left w:val="single" w:color="D9D5CB" w:sz="4"/>
+              <w:bottom w:val="single" w:color="D9D5CB" w:sz="4"/>
+              <w:right w:val="single" w:color="D9D5CB" w:sz="4"/>
+            </w:tcBorders>
+            <w:shd w:fill="14213D" w:color="auto" w:val="clear"/>
+            <w:tcMar>
+              <w:top w:type="dxa" w:w="60"/>
+              <w:left w:type="dxa" w:w="90"/>
+              <w:bottom w:type="dxa" w:w="60"/>
+              <w:right w:type="dxa" w:w="90"/>
+            </w:tcMar>
+            <w:vAlign w:val="top"/>
+          </w:tcPr>
+          <w:p>
+            <w:pPr>
+              <w:spacing w:after="80" w:line="264"/>
+            </w:pPr>
+            <w:r>
+              <w:rPr>
+                <w:rFonts w:ascii="Calibri" w:cs="Calibri" w:eastAsia="Calibri" w:hAnsi="Calibri"/>
+                <w:b/>
+                <w:bCs/>
+                <w:color w:val="FFFFFF"/>
+                <w:sz w:val="19"/>
+                <w:szCs w:val="19"/>
+              </w:rPr>
+              <w:t xml:space="preserve">Fonctionnalité</w:t>
+            </w:r>
+          </w:p>
+        </w:tc>
+        <w:tc>
+          <w:tcPr>
+            <w:tcW w:type="dxa" w:w="4100"/>
+            <w:tcBorders>
+              <w:top w:val="single" w:color="D9D5CB" w:sz="4"/>
+              <w:left w:val="single" w:color="D9D5CB" w:sz="4"/>
+              <w:bottom w:val="single" w:color="D9D5CB" w:sz="4"/>
+              <w:right w:val="single" w:color="D9D5CB" w:sz="4"/>
+            </w:tcBorders>
+            <w:shd w:fill="14213D" w:color="auto" w:val="clear"/>
+            <w:tcMar>
+              <w:top w:type="dxa" w:w="60"/>
+              <w:left w:type="dxa" w:w="90"/>
+              <w:bottom w:type="dxa" w:w="60"/>
+              <w:right w:type="dxa" w:w="90"/>
+            </w:tcMar>
+            <w:vAlign w:val="top"/>
+          </w:tcPr>
+          <w:p>
+            <w:pPr>
+              <w:spacing w:after="80" w:line="264"/>
+            </w:pPr>
+            <w:r>
+              <w:rPr>
+                <w:rFonts w:ascii="Calibri" w:cs="Calibri" w:eastAsia="Calibri" w:hAnsi="Calibri"/>
+                <w:b/>
+                <w:bCs/>
+                <w:color w:val="FFFFFF"/>
+                <w:sz w:val="19"/>
+                <w:szCs w:val="19"/>
+              </w:rPr>
+              <w:t xml:space="preserve">Où la trouver · comment tester</w:t>
+            </w:r>
+          </w:p>
+        </w:tc>
+        <w:tc>
+          <w:tcPr>
+            <w:tcW w:type="dxa" w:w="3700"/>
+            <w:tcBorders>
+              <w:top w:val="single" w:color="D9D5CB" w:sz="4"/>
+              <w:left w:val="single" w:color="D9D5CB" w:sz="4"/>
+              <w:bottom w:val="single" w:color="D9D5CB" w:sz="4"/>
+              <w:right w:val="single" w:color="D9D5CB" w:sz="4"/>
+            </w:tcBorders>
+            <w:shd w:fill="14213D" w:color="auto" w:val="clear"/>
+            <w:tcMar>
+              <w:top w:type="dxa" w:w="60"/>
+              <w:left w:type="dxa" w:w="90"/>
+              <w:bottom w:type="dxa" w:w="60"/>
+              <w:right w:type="dxa" w:w="90"/>
+            </w:tcMar>
+            <w:vAlign w:val="top"/>
+          </w:tcPr>
+          <w:p>
+            <w:pPr>
+              <w:spacing w:after="80" w:line="264"/>
+            </w:pPr>
+            <w:r>
+              <w:rPr>
+                <w:rFonts w:ascii="Calibri" w:cs="Calibri" w:eastAsia="Calibri" w:hAnsi="Calibri"/>
+                <w:b/>
+                <w:bCs/>
+                <w:color w:val="FFFFFF"/>
+                <w:sz w:val="19"/>
+                <w:szCs w:val="19"/>
+              </w:rPr>
+              <w:t xml:space="preserve">Hypothèses · limites · ce que j'ai tranché</w:t>
+            </w:r>
+          </w:p>
+        </w:tc>
+        <w:tc>
+          <w:tcPr>
+            <w:tcW w:type="dxa" w:w="1300"/>
+            <w:tcBorders>
+              <w:top w:val="single" w:color="D9D5CB" w:sz="4"/>
+              <w:left w:val="single" w:color="D9D5CB" w:sz="4"/>
+              <w:bottom w:val="single" w:color="D9D5CB" w:sz="4"/>
+              <w:right w:val="single" w:color="D9D5CB" w:sz="4"/>
+            </w:tcBorders>
+            <w:shd w:fill="14213D" w:color="auto" w:val="clear"/>
+            <w:tcMar>
+              <w:top w:type="dxa" w:w="60"/>
+              <w:left w:type="dxa" w:w="90"/>
+              <w:bottom w:type="dxa" w:w="60"/>
+              <w:right w:type="dxa" w:w="90"/>
+            </w:tcMar>
+            <w:vAlign w:val="top"/>
+          </w:tcPr>
+          <w:p>
+            <w:pPr>
+              <w:spacing w:after="80" w:line="264"/>
+            </w:pPr>
+            <w:r>
+              <w:rPr>
+                <w:rFonts w:ascii="Calibri" w:cs="Calibri" w:eastAsia="Calibri" w:hAnsi="Calibri"/>
+                <w:b/>
+                <w:bCs/>
+                <w:color w:val="FFFFFF"/>
+                <w:sz w:val="19"/>
+                <w:szCs w:val="19"/>
+              </w:rPr>
+              <w:t xml:space="preserve">Statut</w:t>
+            </w:r>
+          </w:p>
+        </w:tc>
+        <w:tc>
+          <w:tcPr>
+            <w:tcW w:type="dxa" w:w="3700"/>
+            <w:tcBorders>
+              <w:top w:val="single" w:color="D9D5CB" w:sz="4"/>
+              <w:left w:val="single" w:color="D9D5CB" w:sz="4"/>
+              <w:bottom w:val="single" w:color="D9D5CB" w:sz="4"/>
+              <w:right w:val="single" w:color="D9D5CB" w:sz="4"/>
+            </w:tcBorders>
+            <w:shd w:fill="14213D" w:color="auto" w:val="clear"/>
+            <w:tcMar>
+              <w:top w:type="dxa" w:w="60"/>
+              <w:left w:type="dxa" w:w="90"/>
+              <w:bottom w:type="dxa" w:w="60"/>
+              <w:right w:type="dxa" w:w="90"/>
+            </w:tcMar>
+            <w:vAlign w:val="top"/>
+          </w:tcPr>
+          <w:p>
+            <w:pPr>
+              <w:spacing w:after="80" w:line="264"/>
+            </w:pPr>
+            <w:r>
+              <w:rPr>
+                <w:rFonts w:ascii="Calibri" w:cs="Calibri" w:eastAsia="Calibri" w:hAnsi="Calibri"/>
+                <w:b/>
+                <w:bCs/>
+                <w:color w:val="FFFFFF"/>
+                <w:sz w:val="19"/>
+                <w:szCs w:val="19"/>
+              </w:rPr>
+              <w:t xml:space="preserve">Vos commentaires</w:t>
+            </w:r>
+          </w:p>
+        </w:tc>
+      </w:tr>
+      <w:tr>
+        <w:tc>
+          <w:tcPr>
+            <w:tcW w:type="dxa" w:w="2300"/>
+            <w:tcBorders>
+              <w:top w:val="single" w:color="D9D5CB" w:sz="4"/>
+              <w:left w:val="single" w:color="D9D5CB" w:sz="4"/>
+              <w:bottom w:val="single" w:color="D9D5CB" w:sz="4"/>
+              <w:right w:val="single" w:color="D9D5CB" w:sz="4"/>
+            </w:tcBorders>
+            <w:tcMar>
+              <w:top w:type="dxa" w:w="60"/>
+              <w:left w:type="dxa" w:w="90"/>
+              <w:bottom w:type="dxa" w:w="60"/>
+              <w:right w:type="dxa" w:w="90"/>
+            </w:tcMar>
+            <w:vAlign w:val="top"/>
+          </w:tcPr>
+          <w:p>
+            <w:pPr>
+              <w:spacing w:after="40"/>
+            </w:pPr>
+            <w:r>
+              <w:rPr>
+                <w:rFonts w:ascii="Calibri" w:cs="Calibri" w:eastAsia="Calibri" w:hAnsi="Calibri"/>
+                <w:b/>
+                <w:bCs/>
+                <w:color w:val="14213D"/>
+                <w:sz w:val="20"/>
+                <w:szCs w:val="20"/>
+              </w:rPr>
+              <w:t xml:space="preserve">Navette du mois au format SCR (Excel)</w:t>
+            </w:r>
+          </w:p>
+        </w:tc>
+        <w:tc>
+          <w:tcPr>
+            <w:tcW w:type="dxa" w:w="4100"/>
+            <w:tcBorders>
+              <w:top w:val="single" w:color="D9D5CB" w:sz="4"/>
+              <w:left w:val="single" w:color="D9D5CB" w:sz="4"/>
+              <w:bottom w:val="single" w:color="D9D5CB" w:sz="4"/>
+              <w:right w:val="single" w:color="D9D5CB" w:sz="4"/>
+            </w:tcBorders>
+            <w:tcMar>
+              <w:top w:type="dxa" w:w="60"/>
+              <w:left w:type="dxa" w:w="90"/>
+              <w:bottom w:type="dxa" w:w="60"/>
+              <w:right w:type="dxa" w:w="90"/>
+            </w:tcMar>
+            <w:vAlign w:val="top"/>
+          </w:tcPr>
+          <w:p>
+            <w:pPr>
+              <w:spacing w:after="40"/>
+            </w:pPr>
+            <w:r>
+              <w:rPr>
+                <w:rFonts w:ascii="Calibri" w:cs="Calibri" w:eastAsia="Calibri" w:hAnsi="Calibri"/>
+                <w:color w:val="14213D"/>
+                <w:sz w:val="19"/>
+                <w:szCs w:val="19"/>
+              </w:rPr>
+              <w:t xml:space="preserve">Exploitation → Grands déplacements → 👤 Par personne · mois → choisis la personne et le mois → « Navette du mois » → ⬇ Navette du mois (Excel, format SCR). Le résumé au-dessus dit les semaines comptées, les hôtels, repas, trajets, heures sup et les jours travaillés sans pointage.</w:t>
+            </w:r>
+          </w:p>
+        </w:tc>
+        <w:tc>
+          <w:tcPr>
+            <w:tcW w:type="dxa" w:w="3700"/>
+            <w:tcBorders>
+              <w:top w:val="single" w:color="D9D5CB" w:sz="4"/>
+              <w:left w:val="single" w:color="D9D5CB" w:sz="4"/>
+              <w:bottom w:val="single" w:color="D9D5CB" w:sz="4"/>
+              <w:right w:val="single" w:color="D9D5CB" w:sz="4"/>
+            </w:tcBorders>
+            <w:tcMar>
+              <w:top w:type="dxa" w:w="60"/>
+              <w:left w:type="dxa" w:w="90"/>
+              <w:bottom w:type="dxa" w:w="60"/>
+              <w:right w:type="dxa" w:w="90"/>
+            </w:tcMar>
+            <w:vAlign w:val="top"/>
+          </w:tcPr>
+          <w:p>
+            <w:pPr>
+              <w:spacing w:after="40"/>
+            </w:pPr>
+            <w:r>
+              <w:rPr>
+                <w:rFonts w:ascii="Calibri" w:cs="Calibri" w:eastAsia="Calibri" w:hAnsi="Calibri"/>
+                <w:color w:val="14213D"/>
+                <w:sz w:val="19"/>
+                <w:szCs w:val="19"/>
+              </w:rPr>
+              <w:t xml:space="preserve">Ta feuille reproduite : un jour par ligne du dimanche au dimanche ; type de cas, ½ trajets, hôtel / hôtel IDF, repas, chantier (planning), heures (pointage de l'appli), km domicile → chantier ; total de la semaine, heures sup 125 % / 150 %, totaux, indemnités 15 / 30 / 50 €, compteurs (cases vertes à remplir par les RH). Les formules sont gardées : une heure corrigée dans l'Excel → tout se recalcule. Vérifié : ton septembre reproduit à l'identique avec des personnages de test (20 hôtels, 40 repas, 4 trajets à 15 €, 27 h à 125 %, 5 h à 150 %), formules recalculées.</w:t>
+            </w:r>
+          </w:p>
+        </w:tc>
+        <w:tc>
+          <w:tcPr>
+            <w:tcW w:type="dxa" w:w="1300"/>
+            <w:tcBorders>
+              <w:top w:val="single" w:color="D9D5CB" w:sz="4"/>
+              <w:left w:val="single" w:color="D9D5CB" w:sz="4"/>
+              <w:bottom w:val="single" w:color="D9D5CB" w:sz="4"/>
+              <w:right w:val="single" w:color="D9D5CB" w:sz="4"/>
+            </w:tcBorders>
+            <w:shd w:fill="E6F5EC" w:color="auto" w:val="clear"/>
+            <w:tcMar>
+              <w:top w:type="dxa" w:w="60"/>
+              <w:left w:type="dxa" w:w="90"/>
+              <w:bottom w:type="dxa" w:w="60"/>
+              <w:right w:type="dxa" w:w="90"/>
+            </w:tcMar>
+            <w:vAlign w:val="top"/>
+          </w:tcPr>
+          <w:p>
+            <w:pPr>
+              <w:spacing w:after="40"/>
+            </w:pPr>
+            <w:r>
+              <w:rPr>
+                <w:rFonts w:ascii="Calibri" w:cs="Calibri" w:eastAsia="Calibri" w:hAnsi="Calibri"/>
+                <w:b/>
+                <w:bCs/>
+                <w:color w:val="14213D"/>
+                <w:sz w:val="19"/>
+                <w:szCs w:val="19"/>
+              </w:rPr>
+              <w:t xml:space="preserve">Fait</w:t>
+            </w:r>
+          </w:p>
+        </w:tc>
+        <w:tc>
+          <w:tcPr>
+            <w:tcW w:type="dxa" w:w="3700"/>
+            <w:tcBorders>
+              <w:top w:val="single" w:color="D9D5CB" w:sz="4"/>
+              <w:left w:val="single" w:color="D9D5CB" w:sz="4"/>
+              <w:bottom w:val="single" w:color="D9D5CB" w:sz="4"/>
+              <w:right w:val="single" w:color="D9D5CB" w:sz="4"/>
+            </w:tcBorders>
+            <w:tcMar>
+              <w:top w:type="dxa" w:w="60"/>
+              <w:left w:type="dxa" w:w="90"/>
+              <w:bottom w:type="dxa" w:w="60"/>
+              <w:right w:type="dxa" w:w="90"/>
+            </w:tcMar>
+            <w:vAlign w:val="top"/>
+          </w:tcPr>
+          <w:p>
+            <w:pPr>
+              <w:spacing w:after="40"/>
+            </w:pPr>
+            <w:r>
+              <w:rPr>
+                <w:rFonts w:ascii="Calibri" w:cs="Calibri" w:eastAsia="Calibri" w:hAnsi="Calibri"/>
+                <w:color w:val="14213D"/>
+                <w:sz w:val="20"/>
+                <w:szCs w:val="20"/>
+              </w:rPr>
+              <w:t xml:space="preserve"/>
+            </w:r>
+          </w:p>
+          <w:p>
+            <w:pPr>
+              <w:spacing w:after="40"/>
+            </w:pPr>
+            <w:r>
+              <w:rPr>
+                <w:rFonts w:ascii="Calibri" w:cs="Calibri" w:eastAsia="Calibri" w:hAnsi="Calibri"/>
+                <w:color w:val="14213D"/>
+                <w:sz w:val="20"/>
+                <w:szCs w:val="20"/>
+              </w:rPr>
+              <w:t xml:space="preserve"/>
+            </w:r>
+          </w:p>
+        </w:tc>
+      </w:tr>
+      <w:tr>
+        <w:tc>
+          <w:tcPr>
+            <w:tcW w:type="dxa" w:w="2300"/>
+            <w:tcBorders>
+              <w:top w:val="single" w:color="D9D5CB" w:sz="4"/>
+              <w:left w:val="single" w:color="D9D5CB" w:sz="4"/>
+              <w:bottom w:val="single" w:color="D9D5CB" w:sz="4"/>
+              <w:right w:val="single" w:color="D9D5CB" w:sz="4"/>
+            </w:tcBorders>
+            <w:tcMar>
+              <w:top w:type="dxa" w:w="60"/>
+              <w:left w:type="dxa" w:w="90"/>
+              <w:bottom w:type="dxa" w:w="60"/>
+              <w:right w:type="dxa" w:w="90"/>
+            </w:tcMar>
+            <w:vAlign w:val="top"/>
+          </w:tcPr>
+          <w:p>
+            <w:pPr>
+              <w:spacing w:after="40"/>
+            </w:pPr>
+            <w:r>
+              <w:rPr>
+                <w:rFonts w:ascii="Calibri" w:cs="Calibri" w:eastAsia="Calibri" w:hAnsi="Calibri"/>
+                <w:b/>
+                <w:bCs/>
+                <w:color w:val="14213D"/>
+                <w:sz w:val="20"/>
+                <w:szCs w:val="20"/>
+              </w:rPr>
+              <w:t xml:space="preserve">Toutes les navettes du mois</w:t>
+            </w:r>
+          </w:p>
+        </w:tc>
+        <w:tc>
+          <w:tcPr>
+            <w:tcW w:type="dxa" w:w="4100"/>
+            <w:tcBorders>
+              <w:top w:val="single" w:color="D9D5CB" w:sz="4"/>
+              <w:left w:val="single" w:color="D9D5CB" w:sz="4"/>
+              <w:bottom w:val="single" w:color="D9D5CB" w:sz="4"/>
+              <w:right w:val="single" w:color="D9D5CB" w:sz="4"/>
+            </w:tcBorders>
+            <w:tcMar>
+              <w:top w:type="dxa" w:w="60"/>
+              <w:left w:type="dxa" w:w="90"/>
+              <w:bottom w:type="dxa" w:w="60"/>
+              <w:right w:type="dxa" w:w="90"/>
+            </w:tcMar>
+            <w:vAlign w:val="top"/>
+          </w:tcPr>
+          <w:p>
+            <w:pPr>
+              <w:spacing w:after="40"/>
+            </w:pPr>
+            <w:r>
+              <w:rPr>
+                <w:rFonts w:ascii="Calibri" w:cs="Calibri" w:eastAsia="Calibri" w:hAnsi="Calibri"/>
+                <w:color w:val="14213D"/>
+                <w:sz w:val="19"/>
+                <w:szCs w:val="19"/>
+              </w:rPr>
+              <w:t xml:space="preserve">Même endroit → ⬇ Toutes les navettes du mois : un seul classeur, un onglet par personne planifiée ou pointée sur le mois (pour les RH).</w:t>
+            </w:r>
+          </w:p>
+        </w:tc>
+        <w:tc>
+          <w:tcPr>
+            <w:tcW w:type="dxa" w:w="3700"/>
+            <w:tcBorders>
+              <w:top w:val="single" w:color="D9D5CB" w:sz="4"/>
+              <w:left w:val="single" w:color="D9D5CB" w:sz="4"/>
+              <w:bottom w:val="single" w:color="D9D5CB" w:sz="4"/>
+              <w:right w:val="single" w:color="D9D5CB" w:sz="4"/>
+            </w:tcBorders>
+            <w:tcMar>
+              <w:top w:type="dxa" w:w="60"/>
+              <w:left w:type="dxa" w:w="90"/>
+              <w:bottom w:type="dxa" w:w="60"/>
+              <w:right w:type="dxa" w:w="90"/>
+            </w:tcMar>
+            <w:vAlign w:val="top"/>
+          </w:tcPr>
+          <w:p>
+            <w:pPr>
+              <w:spacing w:after="40"/>
+            </w:pPr>
+            <w:r>
+              <w:rPr>
+                <w:rFonts w:ascii="Calibri" w:cs="Calibri" w:eastAsia="Calibri" w:hAnsi="Calibri"/>
+                <w:color w:val="14213D"/>
+                <w:sz w:val="19"/>
+                <w:szCs w:val="19"/>
+              </w:rPr>
+              <w:t xml:space="preserve">L'ancien export (jours en colonnes, CSV) reste là.</w:t>
+            </w:r>
+          </w:p>
+        </w:tc>
+        <w:tc>
+          <w:tcPr>
+            <w:tcW w:type="dxa" w:w="1300"/>
+            <w:tcBorders>
+              <w:top w:val="single" w:color="D9D5CB" w:sz="4"/>
+              <w:left w:val="single" w:color="D9D5CB" w:sz="4"/>
+              <w:bottom w:val="single" w:color="D9D5CB" w:sz="4"/>
+              <w:right w:val="single" w:color="D9D5CB" w:sz="4"/>
+            </w:tcBorders>
+            <w:shd w:fill="E6F5EC" w:color="auto" w:val="clear"/>
+            <w:tcMar>
+              <w:top w:type="dxa" w:w="60"/>
+              <w:left w:type="dxa" w:w="90"/>
+              <w:bottom w:type="dxa" w:w="60"/>
+              <w:right w:type="dxa" w:w="90"/>
+            </w:tcMar>
+            <w:vAlign w:val="top"/>
+          </w:tcPr>
+          <w:p>
+            <w:pPr>
+              <w:spacing w:after="40"/>
+            </w:pPr>
+            <w:r>
+              <w:rPr>
+                <w:rFonts w:ascii="Calibri" w:cs="Calibri" w:eastAsia="Calibri" w:hAnsi="Calibri"/>
+                <w:b/>
+                <w:bCs/>
+                <w:color w:val="14213D"/>
+                <w:sz w:val="19"/>
+                <w:szCs w:val="19"/>
+              </w:rPr>
+              <w:t xml:space="preserve">Fait</w:t>
+            </w:r>
+          </w:p>
+        </w:tc>
+        <w:tc>
+          <w:tcPr>
+            <w:tcW w:type="dxa" w:w="3700"/>
+            <w:tcBorders>
+              <w:top w:val="single" w:color="D9D5CB" w:sz="4"/>
+              <w:left w:val="single" w:color="D9D5CB" w:sz="4"/>
+              <w:bottom w:val="single" w:color="D9D5CB" w:sz="4"/>
+              <w:right w:val="single" w:color="D9D5CB" w:sz="4"/>
+            </w:tcBorders>
+            <w:tcMar>
+              <w:top w:type="dxa" w:w="60"/>
+              <w:left w:type="dxa" w:w="90"/>
+              <w:bottom w:type="dxa" w:w="60"/>
+              <w:right w:type="dxa" w:w="90"/>
+            </w:tcMar>
+            <w:vAlign w:val="top"/>
+          </w:tcPr>
+          <w:p>
+            <w:pPr>
+              <w:spacing w:after="40"/>
+            </w:pPr>
+            <w:r>
+              <w:rPr>
+                <w:rFonts w:ascii="Calibri" w:cs="Calibri" w:eastAsia="Calibri" w:hAnsi="Calibri"/>
+                <w:color w:val="14213D"/>
+                <w:sz w:val="20"/>
+                <w:szCs w:val="20"/>
+              </w:rPr>
+              <w:t xml:space="preserve"/>
+            </w:r>
+          </w:p>
+          <w:p>
+            <w:pPr>
+              <w:spacing w:after="40"/>
+            </w:pPr>
+            <w:r>
+              <w:rPr>
+                <w:rFonts w:ascii="Calibri" w:cs="Calibri" w:eastAsia="Calibri" w:hAnsi="Calibri"/>
+                <w:color w:val="14213D"/>
+                <w:sz w:val="20"/>
+                <w:szCs w:val="20"/>
+              </w:rPr>
+              <w:t xml:space="preserve"/>
+            </w:r>
+          </w:p>
+        </w:tc>
+      </w:tr>
+      <w:tr>
+        <w:tc>
+          <w:tcPr>
+            <w:tcW w:type="dxa" w:w="2300"/>
+            <w:tcBorders>
+              <w:top w:val="single" w:color="D9D5CB" w:sz="4"/>
+              <w:left w:val="single" w:color="D9D5CB" w:sz="4"/>
+              <w:bottom w:val="single" w:color="D9D5CB" w:sz="4"/>
+              <w:right w:val="single" w:color="D9D5CB" w:sz="4"/>
+            </w:tcBorders>
+            <w:tcMar>
+              <w:top w:type="dxa" w:w="60"/>
+              <w:left w:type="dxa" w:w="90"/>
+              <w:bottom w:type="dxa" w:w="60"/>
+              <w:right w:type="dxa" w:w="90"/>
+            </w:tcMar>
+            <w:vAlign w:val="top"/>
+          </w:tcPr>
+          <w:p>
+            <w:pPr>
+              <w:spacing w:after="40"/>
+            </w:pPr>
+            <w:r>
+              <w:rPr>
+                <w:rFonts w:ascii="Calibri" w:cs="Calibri" w:eastAsia="Calibri" w:hAnsi="Calibri"/>
+                <w:b/>
+                <w:bCs/>
+                <w:color w:val="14213D"/>
+                <w:sz w:val="20"/>
+                <w:szCs w:val="20"/>
+              </w:rPr>
+              <w:t xml:space="preserve">À valider par toi (hypothèses)</w:t>
+            </w:r>
+          </w:p>
+        </w:tc>
+        <w:tc>
+          <w:tcPr>
+            <w:tcW w:type="dxa" w:w="4100"/>
+            <w:tcBorders>
+              <w:top w:val="single" w:color="D9D5CB" w:sz="4"/>
+              <w:left w:val="single" w:color="D9D5CB" w:sz="4"/>
+              <w:bottom w:val="single" w:color="D9D5CB" w:sz="4"/>
+              <w:right w:val="single" w:color="D9D5CB" w:sz="4"/>
+            </w:tcBorders>
+            <w:tcMar>
+              <w:top w:type="dxa" w:w="60"/>
+              <w:left w:type="dxa" w:w="90"/>
+              <w:bottom w:type="dxa" w:w="60"/>
+              <w:right w:type="dxa" w:w="90"/>
+            </w:tcMar>
+            <w:vAlign w:val="top"/>
+          </w:tcPr>
+          <w:p>
+            <w:pPr>
+              <w:spacing w:after="40"/>
+            </w:pPr>
+            <w:r>
+              <w:rPr>
+                <w:rFonts w:ascii="Calibri" w:cs="Calibri" w:eastAsia="Calibri" w:hAnsi="Calibri"/>
+                <w:color w:val="14213D"/>
+                <w:sz w:val="19"/>
+                <w:szCs w:val="19"/>
+              </w:rPr>
+              <w:t xml:space="preserve">Lis la navette d'un gars que tu connais bien sur un mois passé et compare avec celle des RH.</w:t>
+            </w:r>
+          </w:p>
+        </w:tc>
+        <w:tc>
+          <w:tcPr>
+            <w:tcW w:type="dxa" w:w="3700"/>
+            <w:tcBorders>
+              <w:top w:val="single" w:color="D9D5CB" w:sz="4"/>
+              <w:left w:val="single" w:color="D9D5CB" w:sz="4"/>
+              <w:bottom w:val="single" w:color="D9D5CB" w:sz="4"/>
+              <w:right w:val="single" w:color="D9D5CB" w:sz="4"/>
+            </w:tcBorders>
+            <w:tcMar>
+              <w:top w:type="dxa" w:w="60"/>
+              <w:left w:type="dxa" w:w="90"/>
+              <w:bottom w:type="dxa" w:w="60"/>
+              <w:right w:type="dxa" w:w="90"/>
+            </w:tcMar>
+            <w:vAlign w:val="top"/>
+          </w:tcPr>
+          <w:p>
+            <w:pPr>
+              <w:spacing w:after="40"/>
+            </w:pPr>
+            <w:r>
+              <w:rPr>
+                <w:rFonts w:ascii="Calibri" w:cs="Calibri" w:eastAsia="Calibri" w:hAnsi="Calibri"/>
+                <w:color w:val="14213D"/>
+                <w:sz w:val="19"/>
+                <w:szCs w:val="19"/>
+              </w:rPr>
+              <w:t xml:space="preserve">1) Une semaine compte dans le mois de son JEUDI (ton septembre : le 31/08 dedans, les 28-30/09 en « Régul. » sur octobre). 2) Contrat 35 h pour tout le monde ; heures sup à la semaine : 125 % de la 36e à la 43e heure, 150 % au-delà. 3) Compteur de récup et CET : cases RH (l'appli ne les suit pas). 4) Hôtel IDF = chantier en Île-de-France (contour approché à ±3 km). 5) Heures = pointage de l'appli, sinon case vide. 6) Cas 1 (trajets quotidiens) : aucun repas compté — y a-t-il un panier à mettre ?</w:t>
+            </w:r>
+          </w:p>
+        </w:tc>
+        <w:tc>
+          <w:tcPr>
+            <w:tcW w:type="dxa" w:w="1300"/>
+            <w:tcBorders>
+              <w:top w:val="single" w:color="D9D5CB" w:sz="4"/>
+              <w:left w:val="single" w:color="D9D5CB" w:sz="4"/>
+              <w:bottom w:val="single" w:color="D9D5CB" w:sz="4"/>
+              <w:right w:val="single" w:color="D9D5CB" w:sz="4"/>
+            </w:tcBorders>
+            <w:shd w:fill="FFF4EE" w:color="auto" w:val="clear"/>
+            <w:tcMar>
+              <w:top w:type="dxa" w:w="60"/>
+              <w:left w:type="dxa" w:w="90"/>
+              <w:bottom w:type="dxa" w:w="60"/>
+              <w:right w:type="dxa" w:w="90"/>
+            </w:tcMar>
+            <w:vAlign w:val="top"/>
+          </w:tcPr>
+          <w:p>
+            <w:pPr>
+              <w:spacing w:after="40"/>
+            </w:pPr>
+            <w:r>
+              <w:rPr>
+                <w:rFonts w:ascii="Calibri" w:cs="Calibri" w:eastAsia="Calibri" w:hAnsi="Calibri"/>
+                <w:b/>
+                <w:bCs/>
+                <w:color w:val="14213D"/>
+                <w:sz w:val="19"/>
+                <w:szCs w:val="19"/>
+              </w:rPr>
+              <w:t xml:space="preserve">À valider</w:t>
             </w:r>
           </w:p>
         </w:tc>
@@ -26994,6 +27768,44 @@
           <w:szCs w:val="30"/>
         </w:rPr>
         <w:t xml:space="preserve">Titres de commit (GitHub Desktop)</w:t>
+      </w:r>
+    </w:p>
+    <w:p>
+      <w:pPr>
+        <w:pStyle w:val="ListParagraph"/>
+        <w:numPr>
+          <w:ilvl w:val="0"/>
+          <w:numId w:val="2"/>
+        </w:numPr>
+        <w:spacing w:after="40"/>
+      </w:pPr>
+      <w:r>
+        <w:rPr>
+          <w:rFonts w:ascii="Calibri" w:cs="Calibri" w:eastAsia="Calibri" w:hAnsi="Calibri"/>
+          <w:color w:val="14213D"/>
+          <w:sz w:val="20"/>
+          <w:szCs w:val="20"/>
+        </w:rPr>
+        <w:t xml:space="preserve">(nuit, fin) Résumé : Navette de paie au format SCR (Excel pré-rempli, formules gardées) + toutes les navettes du mois</w:t>
+      </w:r>
+    </w:p>
+    <w:p>
+      <w:pPr>
+        <w:pStyle w:val="ListParagraph"/>
+        <w:numPr>
+          <w:ilvl w:val="0"/>
+          <w:numId w:val="2"/>
+        </w:numPr>
+        <w:spacing w:after="40"/>
+      </w:pPr>
+      <w:r>
+        <w:rPr>
+          <w:rFonts w:ascii="Calibri" w:cs="Calibri" w:eastAsia="Calibri" w:hAnsi="Calibri"/>
+          <w:color w:val="14213D"/>
+          <w:sz w:val="20"/>
+          <w:szCs w:val="20"/>
+        </w:rPr>
+        <w:t xml:space="preserve">Description : 13/10 nuit — src/navette.js (semaines du mois = jeudi dans le mois, lignes jour par jour, heures sup 125 / 150 %, hôtel IDF, indemnités 15 / 30 / 50 €, compteurs) ; xlsx.js makeStyledXlsx (classeur mis en forme, formules recalculées à l'ouverture) ; Grands déplacements → par personne · mois : ⬇ navette Excel, ⬇ toutes les navettes du mois, CSV gardé ; test e2e_navette (septembre du modèle reproduit, recalcul LibreOffice)</w:t>
       </w:r>
     </w:p>
     <w:p>

</xml_diff>

<commit_message>
Les champs date se tapent d'un trait + navette plafonnée à 48 h par semaine (heures à reporter)
</commit_message>
<xml_diff>
--- a/app/docs/Feuille_de_route_controle_12-10.docx
+++ b/app/docs/Feuille_de_route_controle_12-10.docx
@@ -65,7 +65,7 @@
           <w:sz w:val="20"/>
           <w:szCs w:val="20"/>
         </w:rPr>
-        <w:t xml:space="preserve">Même principe que la précédente : tu contrôles ligne par ligne, tu écris dans « Vos commentaires » (OK / à corriger / à changer : quoi), tu me renvoies le fichier. Je corrige à partir de tes commentaires, dans l'ordre du document. Commence par la section P (la navette de paie au format SCR — nouveau), puis O (Nantes : la carte après le recentrage, et le contrôle des SQL), puis N (Sofiane et le chantier de Nantes) et M (Nantes Géraudière : le plan qui disparaît au zoom), puis L (grands déplacements et fourniture), puis K (Commerce v2 : dossier, lecture, chiffrage, DPGF, mémoire), puis I (l'onglet Fourniture), puis J (tes retours de la feuille du 09-10 : c'est la seule feuille à suivre désormais — l'ancienne n'est plus livrée), puis H (Commerce de A à Z), G (la nuit) et F (tes retours du 12/10 soir).</w:t>
+        <w:t xml:space="preserve">Même principe que la précédente : tu contrôles ligne par ligne, tu écris dans « Vos commentaires » (OK / à corriger / à changer : quoi), tu me renvoies le fichier. Je corrige à partir de tes commentaires, dans l'ordre du document. Commence par la section Q (champs date, plafond 48 h, règles GD vérifiées — du mardi matin), puis P (la navette de paie au format SCR), puis O (Nantes : la carte après le recentrage, et le contrôle des SQL), puis N (Sofiane et le chantier de Nantes) et M (Nantes Géraudière : le plan qui disparaît au zoom), puis L (grands déplacements et fourniture), puis K (Commerce v2 : dossier, lecture, chiffrage, DPGF, mémoire), puis I (l'onglet Fourniture), puis J (tes retours de la feuille du 09-10 : c'est la seule feuille à suivre désormais — l'ancienne n'est plus livrée), puis H (Commerce de A à Z), G (la nuit) et F (tes retours du 12/10 soir).</w:t>
       </w:r>
     </w:p>
     <w:p>
@@ -84,7 +84,7 @@
           <w:sz w:val="20"/>
           <w:szCs w:val="20"/>
         </w:rPr>
-        <w:t xml:space="preserve">Build livré : 13/10/2026 · 496b5a (index.html + traceur.html à la racine du dépôt). Pas de SQL pour les sections P, O, N et M (le contrôle des SQL de la section O ne modifie rien). Tous les SQL sont passés (toi, 13/10 au soir) : ta base est à jour. Nouveau SQL du soir : retours_13-10c.sql (qualifications des écarts de fourniture réunies entre deux tablettes). SQL de l'après-midi : retours_13-10b.sql (base de prix et paniers : registres « prix » et « panier », lecture réservée à l'encadrement / bureau), blocs_memoire_scr.sql (ton mémoire O2410-10 découpé en 10 blocs réutilisables) (retours_13-10.sql de l'onglet Fourniture est inclus dans retours_13-10c.sql). SQL retours_12-10.sql et retours_12-10b.sql passés, fonction outlook-sync déployée et vérifiée par toi le 12/10 au soir (« ça fonctionne parfaitement »). Hors connexion, tout se teste avec les personnages de démo.</w:t>
+        <w:t xml:space="preserve">Build livré : 13/10/2026 · 3e2f06 (index.html + traceur.html à la racine du dépôt). Pas de SQL pour les sections Q, P, O, N et M (le contrôle des SQL de la section O ne modifie rien). Tous les SQL sont passés (toi, 13/10 au soir) : ta base est à jour. Nouveau SQL du soir : retours_13-10c.sql (qualifications des écarts de fourniture réunies entre deux tablettes). SQL de l'après-midi : retours_13-10b.sql (base de prix et paniers : registres « prix » et « panier », lecture réservée à l'encadrement / bureau), blocs_memoire_scr.sql (ton mémoire O2410-10 découpé en 10 blocs réutilisables) (retours_13-10.sql de l'onglet Fourniture est inclus dans retours_13-10c.sql). SQL retours_12-10.sql et retours_12-10b.sql passés, fonction outlook-sync déployée et vérifiée par toi le 12/10 au soir (« ça fonctionne parfaitement »). Hors connexion, tout se teste avec les personnages de démo.</w:t>
       </w:r>
     </w:p>
     <w:p>
@@ -12486,6 +12486,766 @@
                 <w:szCs w:val="19"/>
               </w:rPr>
               <w:t xml:space="preserve">Fait (à déployer)</w:t>
+            </w:r>
+          </w:p>
+        </w:tc>
+        <w:tc>
+          <w:tcPr>
+            <w:tcW w:type="dxa" w:w="3700"/>
+            <w:tcBorders>
+              <w:top w:val="single" w:color="D9D5CB" w:sz="4"/>
+              <w:left w:val="single" w:color="D9D5CB" w:sz="4"/>
+              <w:bottom w:val="single" w:color="D9D5CB" w:sz="4"/>
+              <w:right w:val="single" w:color="D9D5CB" w:sz="4"/>
+            </w:tcBorders>
+            <w:tcMar>
+              <w:top w:type="dxa" w:w="60"/>
+              <w:left w:type="dxa" w:w="90"/>
+              <w:bottom w:type="dxa" w:w="60"/>
+              <w:right w:type="dxa" w:w="90"/>
+            </w:tcMar>
+            <w:vAlign w:val="top"/>
+          </w:tcPr>
+          <w:p>
+            <w:pPr>
+              <w:spacing w:after="40"/>
+            </w:pPr>
+            <w:r>
+              <w:rPr>
+                <w:rFonts w:ascii="Calibri" w:cs="Calibri" w:eastAsia="Calibri" w:hAnsi="Calibri"/>
+                <w:color w:val="14213D"/>
+                <w:sz w:val="20"/>
+                <w:szCs w:val="20"/>
+              </w:rPr>
+              <w:t xml:space="preserve"/>
+            </w:r>
+          </w:p>
+          <w:p>
+            <w:pPr>
+              <w:spacing w:after="40"/>
+            </w:pPr>
+            <w:r>
+              <w:rPr>
+                <w:rFonts w:ascii="Calibri" w:cs="Calibri" w:eastAsia="Calibri" w:hAnsi="Calibri"/>
+                <w:color w:val="14213D"/>
+                <w:sz w:val="20"/>
+                <w:szCs w:val="20"/>
+              </w:rPr>
+              <w:t xml:space="preserve"/>
+            </w:r>
+          </w:p>
+        </w:tc>
+      </w:tr>
+    </w:tbl>
+    <w:p>
+      <w:pPr>
+        <w:pStyle w:val="Heading1"/>
+        <w:spacing w:after="120" w:before="320"/>
+      </w:pPr>
+      <w:r>
+        <w:rPr>
+          <w:rFonts w:ascii="Calibri" w:cs="Calibri" w:eastAsia="Calibri" w:hAnsi="Calibri"/>
+          <w:b/>
+          <w:bCs/>
+          <w:color w:val="EB6834"/>
+          <w:sz w:val="30"/>
+          <w:szCs w:val="30"/>
+        </w:rPr>
+        <w:t xml:space="preserve">Q · Champs date, plafond de 48 h, règles GD vérifiées (mardi matin)</w:t>
+      </w:r>
+    </w:p>
+    <w:tbl>
+      <w:tblPr>
+        <w:tblW w:type="dxa" w:w="15100"/>
+        <w:tblBorders>
+          <w:top w:val="single" w:color="auto" w:sz="4"/>
+          <w:left w:val="single" w:color="auto" w:sz="4"/>
+          <w:bottom w:val="single" w:color="auto" w:sz="4"/>
+          <w:right w:val="single" w:color="auto" w:sz="4"/>
+          <w:insideH w:val="single" w:color="auto" w:sz="4"/>
+          <w:insideV w:val="single" w:color="auto" w:sz="4"/>
+        </w:tblBorders>
+      </w:tblPr>
+      <w:tblGrid>
+        <w:gridCol w:w="2300"/>
+        <w:gridCol w:w="4100"/>
+        <w:gridCol w:w="3700"/>
+        <w:gridCol w:w="1300"/>
+        <w:gridCol w:w="3700"/>
+      </w:tblGrid>
+      <w:tr>
+        <w:trPr>
+          <w:tblHeader/>
+        </w:trPr>
+        <w:tc>
+          <w:tcPr>
+            <w:tcW w:type="dxa" w:w="2300"/>
+            <w:tcBorders>
+              <w:top w:val="single" w:color="D9D5CB" w:sz="4"/>
+              <w:left w:val="single" w:color="D9D5CB" w:sz="4"/>
+              <w:bottom w:val="single" w:color="D9D5CB" w:sz="4"/>
+              <w:right w:val="single" w:color="D9D5CB" w:sz="4"/>
+            </w:tcBorders>
+            <w:shd w:fill="14213D" w:color="auto" w:val="clear"/>
+            <w:tcMar>
+              <w:top w:type="dxa" w:w="60"/>
+              <w:left w:type="dxa" w:w="90"/>
+              <w:bottom w:type="dxa" w:w="60"/>
+              <w:right w:type="dxa" w:w="90"/>
+            </w:tcMar>
+            <w:vAlign w:val="top"/>
+          </w:tcPr>
+          <w:p>
+            <w:pPr>
+              <w:spacing w:after="80" w:line="264"/>
+            </w:pPr>
+            <w:r>
+              <w:rPr>
+                <w:rFonts w:ascii="Calibri" w:cs="Calibri" w:eastAsia="Calibri" w:hAnsi="Calibri"/>
+                <w:b/>
+                <w:bCs/>
+                <w:color w:val="FFFFFF"/>
+                <w:sz w:val="19"/>
+                <w:szCs w:val="19"/>
+              </w:rPr>
+              <w:t xml:space="preserve">Fonctionnalité</w:t>
+            </w:r>
+          </w:p>
+        </w:tc>
+        <w:tc>
+          <w:tcPr>
+            <w:tcW w:type="dxa" w:w="4100"/>
+            <w:tcBorders>
+              <w:top w:val="single" w:color="D9D5CB" w:sz="4"/>
+              <w:left w:val="single" w:color="D9D5CB" w:sz="4"/>
+              <w:bottom w:val="single" w:color="D9D5CB" w:sz="4"/>
+              <w:right w:val="single" w:color="D9D5CB" w:sz="4"/>
+            </w:tcBorders>
+            <w:shd w:fill="14213D" w:color="auto" w:val="clear"/>
+            <w:tcMar>
+              <w:top w:type="dxa" w:w="60"/>
+              <w:left w:type="dxa" w:w="90"/>
+              <w:bottom w:type="dxa" w:w="60"/>
+              <w:right w:type="dxa" w:w="90"/>
+            </w:tcMar>
+            <w:vAlign w:val="top"/>
+          </w:tcPr>
+          <w:p>
+            <w:pPr>
+              <w:spacing w:after="80" w:line="264"/>
+            </w:pPr>
+            <w:r>
+              <w:rPr>
+                <w:rFonts w:ascii="Calibri" w:cs="Calibri" w:eastAsia="Calibri" w:hAnsi="Calibri"/>
+                <w:b/>
+                <w:bCs/>
+                <w:color w:val="FFFFFF"/>
+                <w:sz w:val="19"/>
+                <w:szCs w:val="19"/>
+              </w:rPr>
+              <w:t xml:space="preserve">Où la trouver · comment tester</w:t>
+            </w:r>
+          </w:p>
+        </w:tc>
+        <w:tc>
+          <w:tcPr>
+            <w:tcW w:type="dxa" w:w="3700"/>
+            <w:tcBorders>
+              <w:top w:val="single" w:color="D9D5CB" w:sz="4"/>
+              <w:left w:val="single" w:color="D9D5CB" w:sz="4"/>
+              <w:bottom w:val="single" w:color="D9D5CB" w:sz="4"/>
+              <w:right w:val="single" w:color="D9D5CB" w:sz="4"/>
+            </w:tcBorders>
+            <w:shd w:fill="14213D" w:color="auto" w:val="clear"/>
+            <w:tcMar>
+              <w:top w:type="dxa" w:w="60"/>
+              <w:left w:type="dxa" w:w="90"/>
+              <w:bottom w:type="dxa" w:w="60"/>
+              <w:right w:type="dxa" w:w="90"/>
+            </w:tcMar>
+            <w:vAlign w:val="top"/>
+          </w:tcPr>
+          <w:p>
+            <w:pPr>
+              <w:spacing w:after="80" w:line="264"/>
+            </w:pPr>
+            <w:r>
+              <w:rPr>
+                <w:rFonts w:ascii="Calibri" w:cs="Calibri" w:eastAsia="Calibri" w:hAnsi="Calibri"/>
+                <w:b/>
+                <w:bCs/>
+                <w:color w:val="FFFFFF"/>
+                <w:sz w:val="19"/>
+                <w:szCs w:val="19"/>
+              </w:rPr>
+              <w:t xml:space="preserve">Hypothèses · limites · ce que j'ai tranché</w:t>
+            </w:r>
+          </w:p>
+        </w:tc>
+        <w:tc>
+          <w:tcPr>
+            <w:tcW w:type="dxa" w:w="1300"/>
+            <w:tcBorders>
+              <w:top w:val="single" w:color="D9D5CB" w:sz="4"/>
+              <w:left w:val="single" w:color="D9D5CB" w:sz="4"/>
+              <w:bottom w:val="single" w:color="D9D5CB" w:sz="4"/>
+              <w:right w:val="single" w:color="D9D5CB" w:sz="4"/>
+            </w:tcBorders>
+            <w:shd w:fill="14213D" w:color="auto" w:val="clear"/>
+            <w:tcMar>
+              <w:top w:type="dxa" w:w="60"/>
+              <w:left w:type="dxa" w:w="90"/>
+              <w:bottom w:type="dxa" w:w="60"/>
+              <w:right w:type="dxa" w:w="90"/>
+            </w:tcMar>
+            <w:vAlign w:val="top"/>
+          </w:tcPr>
+          <w:p>
+            <w:pPr>
+              <w:spacing w:after="80" w:line="264"/>
+            </w:pPr>
+            <w:r>
+              <w:rPr>
+                <w:rFonts w:ascii="Calibri" w:cs="Calibri" w:eastAsia="Calibri" w:hAnsi="Calibri"/>
+                <w:b/>
+                <w:bCs/>
+                <w:color w:val="FFFFFF"/>
+                <w:sz w:val="19"/>
+                <w:szCs w:val="19"/>
+              </w:rPr>
+              <w:t xml:space="preserve">Statut</w:t>
+            </w:r>
+          </w:p>
+        </w:tc>
+        <w:tc>
+          <w:tcPr>
+            <w:tcW w:type="dxa" w:w="3700"/>
+            <w:tcBorders>
+              <w:top w:val="single" w:color="D9D5CB" w:sz="4"/>
+              <w:left w:val="single" w:color="D9D5CB" w:sz="4"/>
+              <w:bottom w:val="single" w:color="D9D5CB" w:sz="4"/>
+              <w:right w:val="single" w:color="D9D5CB" w:sz="4"/>
+            </w:tcBorders>
+            <w:shd w:fill="14213D" w:color="auto" w:val="clear"/>
+            <w:tcMar>
+              <w:top w:type="dxa" w:w="60"/>
+              <w:left w:type="dxa" w:w="90"/>
+              <w:bottom w:type="dxa" w:w="60"/>
+              <w:right w:type="dxa" w:w="90"/>
+            </w:tcMar>
+            <w:vAlign w:val="top"/>
+          </w:tcPr>
+          <w:p>
+            <w:pPr>
+              <w:spacing w:after="80" w:line="264"/>
+            </w:pPr>
+            <w:r>
+              <w:rPr>
+                <w:rFonts w:ascii="Calibri" w:cs="Calibri" w:eastAsia="Calibri" w:hAnsi="Calibri"/>
+                <w:b/>
+                <w:bCs/>
+                <w:color w:val="FFFFFF"/>
+                <w:sz w:val="19"/>
+                <w:szCs w:val="19"/>
+              </w:rPr>
+              <w:t xml:space="preserve">Vos commentaires</w:t>
+            </w:r>
+          </w:p>
+        </w:tc>
+      </w:tr>
+      <w:tr>
+        <w:tc>
+          <w:tcPr>
+            <w:tcW w:type="dxa" w:w="2300"/>
+            <w:tcBorders>
+              <w:top w:val="single" w:color="D9D5CB" w:sz="4"/>
+              <w:left w:val="single" w:color="D9D5CB" w:sz="4"/>
+              <w:bottom w:val="single" w:color="D9D5CB" w:sz="4"/>
+              <w:right w:val="single" w:color="D9D5CB" w:sz="4"/>
+            </w:tcBorders>
+            <w:tcMar>
+              <w:top w:type="dxa" w:w="60"/>
+              <w:left w:type="dxa" w:w="90"/>
+              <w:bottom w:type="dxa" w:w="60"/>
+              <w:right w:type="dxa" w:w="90"/>
+            </w:tcMar>
+            <w:vAlign w:val="top"/>
+          </w:tcPr>
+          <w:p>
+            <w:pPr>
+              <w:spacing w:after="40"/>
+            </w:pPr>
+            <w:r>
+              <w:rPr>
+                <w:rFonts w:ascii="Calibri" w:cs="Calibri" w:eastAsia="Calibri" w:hAnsi="Calibri"/>
+                <w:b/>
+                <w:bCs/>
+                <w:color w:val="14213D"/>
+                <w:sz w:val="20"/>
+                <w:szCs w:val="20"/>
+              </w:rPr>
+              <w:t xml:space="preserve">Les dates se tapent d'un trait</w:t>
+            </w:r>
+          </w:p>
+        </w:tc>
+        <w:tc>
+          <w:tcPr>
+            <w:tcW w:type="dxa" w:w="4100"/>
+            <w:tcBorders>
+              <w:top w:val="single" w:color="D9D5CB" w:sz="4"/>
+              <w:left w:val="single" w:color="D9D5CB" w:sz="4"/>
+              <w:bottom w:val="single" w:color="D9D5CB" w:sz="4"/>
+              <w:right w:val="single" w:color="D9D5CB" w:sz="4"/>
+            </w:tcBorders>
+            <w:tcMar>
+              <w:top w:type="dxa" w:w="60"/>
+              <w:left w:type="dxa" w:w="90"/>
+              <w:bottom w:type="dxa" w:w="60"/>
+              <w:right w:type="dxa" w:w="90"/>
+            </w:tcMar>
+            <w:vAlign w:val="top"/>
+          </w:tcPr>
+          <w:p>
+            <w:pPr>
+              <w:spacing w:after="40"/>
+            </w:pPr>
+            <w:r>
+              <w:rPr>
+                <w:rFonts w:ascii="Calibri" w:cs="Calibri" w:eastAsia="Calibri" w:hAnsi="Calibri"/>
+                <w:color w:val="14213D"/>
+                <w:sz w:val="19"/>
+                <w:szCs w:val="19"/>
+              </w:rPr>
+              <w:t xml:space="preserve">N'importe quel champ date (ex. Commerce → affaire → Chiffrage → Début des travaux) : tape 10102026 sans t'arrêter, puis touche ailleurs (ou Entrée) → 10/10/2026.</w:t>
+            </w:r>
+          </w:p>
+        </w:tc>
+        <w:tc>
+          <w:tcPr>
+            <w:tcW w:type="dxa" w:w="3700"/>
+            <w:tcBorders>
+              <w:top w:val="single" w:color="D9D5CB" w:sz="4"/>
+              <w:left w:val="single" w:color="D9D5CB" w:sz="4"/>
+              <w:bottom w:val="single" w:color="D9D5CB" w:sz="4"/>
+              <w:right w:val="single" w:color="D9D5CB" w:sz="4"/>
+            </w:tcBorders>
+            <w:tcMar>
+              <w:top w:type="dxa" w:w="60"/>
+              <w:left w:type="dxa" w:w="90"/>
+              <w:bottom w:type="dxa" w:w="60"/>
+              <w:right w:type="dxa" w:w="90"/>
+            </w:tcMar>
+            <w:vAlign w:val="top"/>
+          </w:tcPr>
+          <w:p>
+            <w:pPr>
+              <w:spacing w:after="40"/>
+            </w:pPr>
+            <w:r>
+              <w:rPr>
+                <w:rFonts w:ascii="Calibri" w:cs="Calibri" w:eastAsia="Calibri" w:hAnsi="Calibri"/>
+                <w:color w:val="14213D"/>
+                <w:sz w:val="19"/>
+                <w:szCs w:val="19"/>
+              </w:rPr>
+              <w:t xml:space="preserve">Cause reproduite : le navigateur annonçait une date « valide » dès le 1er chiffre de l'année (0002), l'appli l'enregistrait et redessinait le formulaire : tu étais éjecté. Maintenant la date part quand tu quittes le champ ; une année tapée à moitié (0002) est refusée et l'ancienne date revient, avec un message. Le calendrier marche comme avant. Vaut pour tous les champs date de l'appli.</w:t>
+            </w:r>
+          </w:p>
+        </w:tc>
+        <w:tc>
+          <w:tcPr>
+            <w:tcW w:type="dxa" w:w="1300"/>
+            <w:tcBorders>
+              <w:top w:val="single" w:color="D9D5CB" w:sz="4"/>
+              <w:left w:val="single" w:color="D9D5CB" w:sz="4"/>
+              <w:bottom w:val="single" w:color="D9D5CB" w:sz="4"/>
+              <w:right w:val="single" w:color="D9D5CB" w:sz="4"/>
+            </w:tcBorders>
+            <w:shd w:fill="E6F5EC" w:color="auto" w:val="clear"/>
+            <w:tcMar>
+              <w:top w:type="dxa" w:w="60"/>
+              <w:left w:type="dxa" w:w="90"/>
+              <w:bottom w:type="dxa" w:w="60"/>
+              <w:right w:type="dxa" w:w="90"/>
+            </w:tcMar>
+            <w:vAlign w:val="top"/>
+          </w:tcPr>
+          <w:p>
+            <w:pPr>
+              <w:spacing w:after="40"/>
+            </w:pPr>
+            <w:r>
+              <w:rPr>
+                <w:rFonts w:ascii="Calibri" w:cs="Calibri" w:eastAsia="Calibri" w:hAnsi="Calibri"/>
+                <w:b/>
+                <w:bCs/>
+                <w:color w:val="14213D"/>
+                <w:sz w:val="19"/>
+                <w:szCs w:val="19"/>
+              </w:rPr>
+              <w:t xml:space="preserve">Fait</w:t>
+            </w:r>
+          </w:p>
+        </w:tc>
+        <w:tc>
+          <w:tcPr>
+            <w:tcW w:type="dxa" w:w="3700"/>
+            <w:tcBorders>
+              <w:top w:val="single" w:color="D9D5CB" w:sz="4"/>
+              <w:left w:val="single" w:color="D9D5CB" w:sz="4"/>
+              <w:bottom w:val="single" w:color="D9D5CB" w:sz="4"/>
+              <w:right w:val="single" w:color="D9D5CB" w:sz="4"/>
+            </w:tcBorders>
+            <w:tcMar>
+              <w:top w:type="dxa" w:w="60"/>
+              <w:left w:type="dxa" w:w="90"/>
+              <w:bottom w:type="dxa" w:w="60"/>
+              <w:right w:type="dxa" w:w="90"/>
+            </w:tcMar>
+            <w:vAlign w:val="top"/>
+          </w:tcPr>
+          <w:p>
+            <w:pPr>
+              <w:spacing w:after="40"/>
+            </w:pPr>
+            <w:r>
+              <w:rPr>
+                <w:rFonts w:ascii="Calibri" w:cs="Calibri" w:eastAsia="Calibri" w:hAnsi="Calibri"/>
+                <w:color w:val="14213D"/>
+                <w:sz w:val="20"/>
+                <w:szCs w:val="20"/>
+              </w:rPr>
+              <w:t xml:space="preserve"/>
+            </w:r>
+          </w:p>
+          <w:p>
+            <w:pPr>
+              <w:spacing w:after="40"/>
+            </w:pPr>
+            <w:r>
+              <w:rPr>
+                <w:rFonts w:ascii="Calibri" w:cs="Calibri" w:eastAsia="Calibri" w:hAnsi="Calibri"/>
+                <w:color w:val="14213D"/>
+                <w:sz w:val="20"/>
+                <w:szCs w:val="20"/>
+              </w:rPr>
+              <w:t xml:space="preserve"/>
+            </w:r>
+          </w:p>
+        </w:tc>
+      </w:tr>
+      <w:tr>
+        <w:tc>
+          <w:tcPr>
+            <w:tcW w:type="dxa" w:w="2300"/>
+            <w:tcBorders>
+              <w:top w:val="single" w:color="D9D5CB" w:sz="4"/>
+              <w:left w:val="single" w:color="D9D5CB" w:sz="4"/>
+              <w:bottom w:val="single" w:color="D9D5CB" w:sz="4"/>
+              <w:right w:val="single" w:color="D9D5CB" w:sz="4"/>
+            </w:tcBorders>
+            <w:tcMar>
+              <w:top w:type="dxa" w:w="60"/>
+              <w:left w:type="dxa" w:w="90"/>
+              <w:bottom w:type="dxa" w:w="60"/>
+              <w:right w:type="dxa" w:w="90"/>
+            </w:tcMar>
+            <w:vAlign w:val="top"/>
+          </w:tcPr>
+          <w:p>
+            <w:pPr>
+              <w:spacing w:after="40"/>
+            </w:pPr>
+            <w:r>
+              <w:rPr>
+                <w:rFonts w:ascii="Calibri" w:cs="Calibri" w:eastAsia="Calibri" w:hAnsi="Calibri"/>
+                <w:b/>
+                <w:bCs/>
+                <w:color w:val="14213D"/>
+                <w:sz w:val="20"/>
+                <w:szCs w:val="20"/>
+              </w:rPr>
+              <w:t xml:space="preserve">Plafond de 48 h par semaine</w:t>
+            </w:r>
+          </w:p>
+        </w:tc>
+        <w:tc>
+          <w:tcPr>
+            <w:tcW w:type="dxa" w:w="4100"/>
+            <w:tcBorders>
+              <w:top w:val="single" w:color="D9D5CB" w:sz="4"/>
+              <w:left w:val="single" w:color="D9D5CB" w:sz="4"/>
+              <w:bottom w:val="single" w:color="D9D5CB" w:sz="4"/>
+              <w:right w:val="single" w:color="D9D5CB" w:sz="4"/>
+            </w:tcBorders>
+            <w:tcMar>
+              <w:top w:type="dxa" w:w="60"/>
+              <w:left w:type="dxa" w:w="90"/>
+              <w:bottom w:type="dxa" w:w="60"/>
+              <w:right w:type="dxa" w:w="90"/>
+            </w:tcMar>
+            <w:vAlign w:val="top"/>
+          </w:tcPr>
+          <w:p>
+            <w:pPr>
+              <w:spacing w:after="40"/>
+            </w:pPr>
+            <w:r>
+              <w:rPr>
+                <w:rFonts w:ascii="Calibri" w:cs="Calibri" w:eastAsia="Calibri" w:hAnsi="Calibri"/>
+                <w:color w:val="14213D"/>
+                <w:sz w:val="19"/>
+                <w:szCs w:val="19"/>
+              </w:rPr>
+              <w:t xml:space="preserve">Navette du mois d'un gars qui a pointé plus de 48 h une semaine : heures sup 125 % (36e → 43e h) et 150 % (44e → 48e h), puis « x h à reporter » en rouge sur la ligne 150 %, et une case « Heures à reporter (&gt; 48 h / semaine) » : compteur du mois d'avant (vert), heures du mois au-delà de 48 h, payées en prime (vert), compteur fin de mois.</w:t>
+            </w:r>
+          </w:p>
+        </w:tc>
+        <w:tc>
+          <w:tcPr>
+            <w:tcW w:type="dxa" w:w="3700"/>
+            <w:tcBorders>
+              <w:top w:val="single" w:color="D9D5CB" w:sz="4"/>
+              <w:left w:val="single" w:color="D9D5CB" w:sz="4"/>
+              <w:bottom w:val="single" w:color="D9D5CB" w:sz="4"/>
+              <w:right w:val="single" w:color="D9D5CB" w:sz="4"/>
+            </w:tcBorders>
+            <w:tcMar>
+              <w:top w:type="dxa" w:w="60"/>
+              <w:left w:type="dxa" w:w="90"/>
+              <w:bottom w:type="dxa" w:w="60"/>
+              <w:right w:type="dxa" w:w="90"/>
+            </w:tcMar>
+            <w:vAlign w:val="top"/>
+          </w:tcPr>
+          <w:p>
+            <w:pPr>
+              <w:spacing w:after="40"/>
+            </w:pPr>
+            <w:r>
+              <w:rPr>
+                <w:rFonts w:ascii="Calibri" w:cs="Calibri" w:eastAsia="Calibri" w:hAnsi="Calibri"/>
+                <w:color w:val="14213D"/>
+                <w:sz w:val="19"/>
+                <w:szCs w:val="19"/>
+              </w:rPr>
+              <w:t xml:space="preserve">Pour Franck, normal qu'il n'y ait rien : il n'a pas d'heures pointées. Le compteur « à reporter » par personne (et les autres compteurs) arrive avec les paramètres du profil — section suivante.</w:t>
+            </w:r>
+          </w:p>
+        </w:tc>
+        <w:tc>
+          <w:tcPr>
+            <w:tcW w:type="dxa" w:w="1300"/>
+            <w:tcBorders>
+              <w:top w:val="single" w:color="D9D5CB" w:sz="4"/>
+              <w:left w:val="single" w:color="D9D5CB" w:sz="4"/>
+              <w:bottom w:val="single" w:color="D9D5CB" w:sz="4"/>
+              <w:right w:val="single" w:color="D9D5CB" w:sz="4"/>
+            </w:tcBorders>
+            <w:shd w:fill="E6F5EC" w:color="auto" w:val="clear"/>
+            <w:tcMar>
+              <w:top w:type="dxa" w:w="60"/>
+              <w:left w:type="dxa" w:w="90"/>
+              <w:bottom w:type="dxa" w:w="60"/>
+              <w:right w:type="dxa" w:w="90"/>
+            </w:tcMar>
+            <w:vAlign w:val="top"/>
+          </w:tcPr>
+          <w:p>
+            <w:pPr>
+              <w:spacing w:after="40"/>
+            </w:pPr>
+            <w:r>
+              <w:rPr>
+                <w:rFonts w:ascii="Calibri" w:cs="Calibri" w:eastAsia="Calibri" w:hAnsi="Calibri"/>
+                <w:b/>
+                <w:bCs/>
+                <w:color w:val="14213D"/>
+                <w:sz w:val="19"/>
+                <w:szCs w:val="19"/>
+              </w:rPr>
+              <w:t xml:space="preserve">Fait</w:t>
+            </w:r>
+          </w:p>
+        </w:tc>
+        <w:tc>
+          <w:tcPr>
+            <w:tcW w:type="dxa" w:w="3700"/>
+            <w:tcBorders>
+              <w:top w:val="single" w:color="D9D5CB" w:sz="4"/>
+              <w:left w:val="single" w:color="D9D5CB" w:sz="4"/>
+              <w:bottom w:val="single" w:color="D9D5CB" w:sz="4"/>
+              <w:right w:val="single" w:color="D9D5CB" w:sz="4"/>
+            </w:tcBorders>
+            <w:tcMar>
+              <w:top w:type="dxa" w:w="60"/>
+              <w:left w:type="dxa" w:w="90"/>
+              <w:bottom w:type="dxa" w:w="60"/>
+              <w:right w:type="dxa" w:w="90"/>
+            </w:tcMar>
+            <w:vAlign w:val="top"/>
+          </w:tcPr>
+          <w:p>
+            <w:pPr>
+              <w:spacing w:after="40"/>
+            </w:pPr>
+            <w:r>
+              <w:rPr>
+                <w:rFonts w:ascii="Calibri" w:cs="Calibri" w:eastAsia="Calibri" w:hAnsi="Calibri"/>
+                <w:color w:val="14213D"/>
+                <w:sz w:val="20"/>
+                <w:szCs w:val="20"/>
+              </w:rPr>
+              <w:t xml:space="preserve"/>
+            </w:r>
+          </w:p>
+          <w:p>
+            <w:pPr>
+              <w:spacing w:after="40"/>
+            </w:pPr>
+            <w:r>
+              <w:rPr>
+                <w:rFonts w:ascii="Calibri" w:cs="Calibri" w:eastAsia="Calibri" w:hAnsi="Calibri"/>
+                <w:color w:val="14213D"/>
+                <w:sz w:val="20"/>
+                <w:szCs w:val="20"/>
+              </w:rPr>
+              <w:t xml:space="preserve"/>
+            </w:r>
+          </w:p>
+        </w:tc>
+      </w:tr>
+      <w:tr>
+        <w:tc>
+          <w:tcPr>
+            <w:tcW w:type="dxa" w:w="2300"/>
+            <w:tcBorders>
+              <w:top w:val="single" w:color="D9D5CB" w:sz="4"/>
+              <w:left w:val="single" w:color="D9D5CB" w:sz="4"/>
+              <w:bottom w:val="single" w:color="D9D5CB" w:sz="4"/>
+              <w:right w:val="single" w:color="D9D5CB" w:sz="4"/>
+            </w:tcBorders>
+            <w:tcMar>
+              <w:top w:type="dxa" w:w="60"/>
+              <w:left w:type="dxa" w:w="90"/>
+              <w:bottom w:type="dxa" w:w="60"/>
+              <w:right w:type="dxa" w:w="90"/>
+            </w:tcMar>
+            <w:vAlign w:val="top"/>
+          </w:tcPr>
+          <w:p>
+            <w:pPr>
+              <w:spacing w:after="40"/>
+            </w:pPr>
+            <w:r>
+              <w:rPr>
+                <w:rFonts w:ascii="Calibri" w:cs="Calibri" w:eastAsia="Calibri" w:hAnsi="Calibri"/>
+                <w:b/>
+                <w:bCs/>
+                <w:color w:val="14213D"/>
+                <w:sz w:val="20"/>
+                <w:szCs w:val="20"/>
+              </w:rPr>
+              <w:t xml:space="preserve">Règles des grands déplacements contrôlées</w:t>
+            </w:r>
+          </w:p>
+        </w:tc>
+        <w:tc>
+          <w:tcPr>
+            <w:tcW w:type="dxa" w:w="4100"/>
+            <w:tcBorders>
+              <w:top w:val="single" w:color="D9D5CB" w:sz="4"/>
+              <w:left w:val="single" w:color="D9D5CB" w:sz="4"/>
+              <w:bottom w:val="single" w:color="D9D5CB" w:sz="4"/>
+              <w:right w:val="single" w:color="D9D5CB" w:sz="4"/>
+            </w:tcBorders>
+            <w:tcMar>
+              <w:top w:type="dxa" w:w="60"/>
+              <w:left w:type="dxa" w:w="90"/>
+              <w:bottom w:type="dxa" w:w="60"/>
+              <w:right w:type="dxa" w:w="90"/>
+            </w:tcMar>
+            <w:vAlign w:val="top"/>
+          </w:tcPr>
+          <w:p>
+            <w:pPr>
+              <w:spacing w:after="40"/>
+            </w:pPr>
+            <w:r>
+              <w:rPr>
+                <w:rFonts w:ascii="Calibri" w:cs="Calibri" w:eastAsia="Calibri" w:hAnsi="Calibri"/>
+                <w:color w:val="14213D"/>
+                <w:sz w:val="19"/>
+                <w:szCs w:val="19"/>
+              </w:rPr>
+              <w:t xml:space="preserve">Rien à faire.</w:t>
+            </w:r>
+          </w:p>
+        </w:tc>
+        <w:tc>
+          <w:tcPr>
+            <w:tcW w:type="dxa" w:w="3700"/>
+            <w:tcBorders>
+              <w:top w:val="single" w:color="D9D5CB" w:sz="4"/>
+              <w:left w:val="single" w:color="D9D5CB" w:sz="4"/>
+              <w:bottom w:val="single" w:color="D9D5CB" w:sz="4"/>
+              <w:right w:val="single" w:color="D9D5CB" w:sz="4"/>
+            </w:tcBorders>
+            <w:tcMar>
+              <w:top w:type="dxa" w:w="60"/>
+              <w:left w:type="dxa" w:w="90"/>
+              <w:bottom w:type="dxa" w:w="60"/>
+              <w:right w:type="dxa" w:w="90"/>
+            </w:tcMar>
+            <w:vAlign w:val="top"/>
+          </w:tcPr>
+          <w:p>
+            <w:pPr>
+              <w:spacing w:after="40"/>
+            </w:pPr>
+            <w:r>
+              <w:rPr>
+                <w:rFonts w:ascii="Calibri" w:cs="Calibri" w:eastAsia="Calibri" w:hAnsi="Calibri"/>
+                <w:color w:val="14213D"/>
+                <w:sz w:val="19"/>
+                <w:szCs w:val="19"/>
+              </w:rPr>
+              <w:t xml:space="preserve">Comparé à ton PDF (livret § 2.7, pages 12 à 14) : les tableaux cas 2, cas 3 (S1 à S4) et cas 4 (S1 à S4) — repas, nuitées, ½ trajet — sont exactement ceux de l'appli ; 15 € (cas 2), 30 € (cas 3), 50 € (cas 4) par aller-retour ; critères 30 min / 250 km / 500 km de route.</w:t>
+            </w:r>
+          </w:p>
+        </w:tc>
+        <w:tc>
+          <w:tcPr>
+            <w:tcW w:type="dxa" w:w="1300"/>
+            <w:tcBorders>
+              <w:top w:val="single" w:color="D9D5CB" w:sz="4"/>
+              <w:left w:val="single" w:color="D9D5CB" w:sz="4"/>
+              <w:bottom w:val="single" w:color="D9D5CB" w:sz="4"/>
+              <w:right w:val="single" w:color="D9D5CB" w:sz="4"/>
+            </w:tcBorders>
+            <w:shd w:fill="FFF4EE" w:color="auto" w:val="clear"/>
+            <w:tcMar>
+              <w:top w:type="dxa" w:w="60"/>
+              <w:left w:type="dxa" w:w="90"/>
+              <w:bottom w:type="dxa" w:w="60"/>
+              <w:right w:type="dxa" w:w="90"/>
+            </w:tcMar>
+            <w:vAlign w:val="top"/>
+          </w:tcPr>
+          <w:p>
+            <w:pPr>
+              <w:spacing w:after="40"/>
+            </w:pPr>
+            <w:r>
+              <w:rPr>
+                <w:rFonts w:ascii="Calibri" w:cs="Calibri" w:eastAsia="Calibri" w:hAnsi="Calibri"/>
+                <w:b/>
+                <w:bCs/>
+                <w:color w:val="14213D"/>
+                <w:sz w:val="19"/>
+                <w:szCs w:val="19"/>
+              </w:rPr>
+              <w:t xml:space="preserve">OK</w:t>
             </w:r>
           </w:p>
         </w:tc>
@@ -27768,6 +28528,44 @@
           <w:szCs w:val="30"/>
         </w:rPr>
         <w:t xml:space="preserve">Titres de commit (GitHub Desktop)</w:t>
+      </w:r>
+    </w:p>
+    <w:p>
+      <w:pPr>
+        <w:pStyle w:val="ListParagraph"/>
+        <w:numPr>
+          <w:ilvl w:val="0"/>
+          <w:numId w:val="2"/>
+        </w:numPr>
+        <w:spacing w:after="40"/>
+      </w:pPr>
+      <w:r>
+        <w:rPr>
+          <w:rFonts w:ascii="Calibri" w:cs="Calibri" w:eastAsia="Calibri" w:hAnsi="Calibri"/>
+          <w:color w:val="14213D"/>
+          <w:sz w:val="20"/>
+          <w:szCs w:val="20"/>
+        </w:rPr>
+        <w:t xml:space="preserve">(mardi matin) Résumé : Les champs date se tapent d'un trait + navette plafonnée à 48 h par semaine (heures à reporter)</w:t>
+      </w:r>
+    </w:p>
+    <w:p>
+      <w:pPr>
+        <w:pStyle w:val="ListParagraph"/>
+        <w:numPr>
+          <w:ilvl w:val="0"/>
+          <w:numId w:val="2"/>
+        </w:numPr>
+        <w:spacing w:after="40"/>
+      </w:pPr>
+      <w:r>
+        <w:rPr>
+          <w:rFonts w:ascii="Calibri" w:cs="Calibri" w:eastAsia="Calibri" w:hAnsi="Calibri"/>
+          <w:color w:val="14213D"/>
+          <w:sz w:val="20"/>
+          <w:szCs w:val="20"/>
+        </w:rPr>
+        <w:t xml:space="preserve">Description : 13/10 — app.js : garde globale des champs date / heure (rien n'est envoyé pendant la frappe, la date part à la sortie du champ ou sur Entrée, année incomplète refusée) ; navette : heures sup sur 48 h max, au-delà « à reporter » + case compteur (précédent, du mois, prime, fin de mois) ; tests e2e_dates, e2e_navette (0 : semaine à 50 h)</w:t>
       </w:r>
     </w:p>
     <w:p>

</xml_diff>

<commit_message>
Compteurs d'heures par personne + « Moi » : ma navette, mes variables, comment c'est calculé + PDF du livret
</commit_message>
<xml_diff>
--- a/app/docs/Feuille_de_route_controle_12-10.docx
+++ b/app/docs/Feuille_de_route_controle_12-10.docx
@@ -65,7 +65,7 @@
           <w:sz w:val="20"/>
           <w:szCs w:val="20"/>
         </w:rPr>
-        <w:t xml:space="preserve">Même principe que la précédente : tu contrôles ligne par ligne, tu écris dans « Vos commentaires » (OK / à corriger / à changer : quoi), tu me renvoies le fichier. Je corrige à partir de tes commentaires, dans l'ordre du document. Commence par la section Q (champs date, plafond 48 h, règles GD vérifiées — du mardi matin), puis P (la navette de paie au format SCR), puis O (Nantes : la carte après le recentrage, et le contrôle des SQL), puis N (Sofiane et le chantier de Nantes) et M (Nantes Géraudière : le plan qui disparaît au zoom), puis L (grands déplacements et fourniture), puis K (Commerce v2 : dossier, lecture, chiffrage, DPGF, mémoire), puis I (l'onglet Fourniture), puis J (tes retours de la feuille du 09-10 : c'est la seule feuille à suivre désormais — l'ancienne n'est plus livrée), puis H (Commerce de A à Z), G (la nuit) et F (tes retours du 12/10 soir).</w:t>
+        <w:t xml:space="preserve">Même principe que la précédente : tu contrôles ligne par ligne, tu écris dans « Vos commentaires » (OK / à corriger / à changer : quoi), tu me renvoies le fichier. Je corrige à partir de tes commentaires, dans l'ordre du document. Commence par la section R (compteurs d'heures, « Moi » : ma navette, PDF du livret), puis Q (champs date, plafond 48 h, règles GD vérifiées), puis P (la navette de paie au format SCR), puis O (Nantes : la carte après le recentrage, et le contrôle des SQL), puis N (Sofiane et le chantier de Nantes) et M (Nantes Géraudière : le plan qui disparaît au zoom), puis L (grands déplacements et fourniture), puis K (Commerce v2 : dossier, lecture, chiffrage, DPGF, mémoire), puis I (l'onglet Fourniture), puis J (tes retours de la feuille du 09-10 : c'est la seule feuille à suivre désormais — l'ancienne n'est plus livrée), puis H (Commerce de A à Z), G (la nuit) et F (tes retours du 12/10 soir).</w:t>
       </w:r>
     </w:p>
     <w:p>
@@ -84,7 +84,7 @@
           <w:sz w:val="20"/>
           <w:szCs w:val="20"/>
         </w:rPr>
-        <w:t xml:space="preserve">Build livré : 13/10/2026 · 3e2f06 (index.html + traceur.html à la racine du dépôt). Pas de SQL pour les sections Q, P, O, N et M (le contrôle des SQL de la section O ne modifie rien). Tous les SQL sont passés (toi, 13/10 au soir) : ta base est à jour. Nouveau SQL du soir : retours_13-10c.sql (qualifications des écarts de fourniture réunies entre deux tablettes). SQL de l'après-midi : retours_13-10b.sql (base de prix et paniers : registres « prix » et « panier », lecture réservée à l'encadrement / bureau), blocs_memoire_scr.sql (ton mémoire O2410-10 découpé en 10 blocs réutilisables) (retours_13-10.sql de l'onglet Fourniture est inclus dans retours_13-10c.sql). SQL retours_12-10.sql et retours_12-10b.sql passés, fonction outlook-sync déployée et vérifiée par toi le 12/10 au soir (« ça fonctionne parfaitement »). Hors connexion, tout se teste avec les personnages de démo.</w:t>
+        <w:t xml:space="preserve">Build livré : 13/10/2026 · 61d946 (index.html + traceur.html à la racine du dépôt). SQL pour la section R : retours_13-10d.sql (compteurs d'heures). Pas de SQL pour les sections Q, P, O, N et M (le contrôle des SQL de la section O ne modifie rien). Tous les SQL sont passés (toi, 13/10 au soir) : ta base est à jour. Nouveau SQL du soir : retours_13-10c.sql (qualifications des écarts de fourniture réunies entre deux tablettes). SQL de l'après-midi : retours_13-10b.sql (base de prix et paniers : registres « prix » et « panier », lecture réservée à l'encadrement / bureau), blocs_memoire_scr.sql (ton mémoire O2410-10 découpé en 10 blocs réutilisables) (retours_13-10.sql de l'onglet Fourniture est inclus dans retours_13-10c.sql). SQL retours_12-10.sql et retours_12-10b.sql passés, fonction outlook-sync déployée et vérifiée par toi le 12/10 au soir (« ça fonctionne parfaitement »). Hors connexion, tout se teste avec les personnages de démo.</w:t>
       </w:r>
     </w:p>
     <w:p>
@@ -300,7 +300,121 @@
                 <w:sz w:val="19"/>
                 <w:szCs w:val="19"/>
               </w:rPr>
-              <w:t xml:space="preserve">app/sql/controle_sql.sql (LECTURE SEULE, à relancer après chaque nouveau SQL)</w:t>
+              <w:t xml:space="preserve">app/sql/retours_13-10d.sql (NOUVEAU — à passer)</w:t>
+            </w:r>
+          </w:p>
+        </w:tc>
+        <w:tc>
+          <w:tcPr>
+            <w:tcW w:type="dxa" w:w="8100"/>
+            <w:tcBorders>
+              <w:top w:val="single" w:color="D9D5CB" w:sz="4"/>
+              <w:left w:val="single" w:color="D9D5CB" w:sz="4"/>
+              <w:bottom w:val="single" w:color="D9D5CB" w:sz="4"/>
+              <w:right w:val="single" w:color="D9D5CB" w:sz="4"/>
+            </w:tcBorders>
+            <w:tcMar>
+              <w:top w:type="dxa" w:w="60"/>
+              <w:left w:type="dxa" w:w="90"/>
+              <w:bottom w:type="dxa" w:w="60"/>
+              <w:right w:type="dxa" w:w="90"/>
+            </w:tcMar>
+            <w:vAlign w:val="top"/>
+          </w:tcPr>
+          <w:p>
+            <w:pPr>
+              <w:spacing w:after="40"/>
+            </w:pPr>
+            <w:r>
+              <w:rPr>
+                <w:rFonts w:ascii="Calibri" w:cs="Calibri" w:eastAsia="Calibri" w:hAnsi="Calibri"/>
+                <w:color w:val="14213D"/>
+                <w:sz w:val="19"/>
+                <w:szCs w:val="19"/>
+              </w:rPr>
+              <w:t xml:space="preserve">Compteurs d'heures par personne : nouveau registre « cpth » (contrat, compteurs suivis, soldes, primes). Écriture : RH / bureau / encadrement ; lecture : l'encadrement, ou la personne elle-même (chacun ne voit que son compteur). Contient tout retours_13-10b.sql. Testé sur une base Postgres locale (bureau écrit, soudeur refusé, chacun ne lit que sa ligne). Sans ce SQL : les compteurs restent sur l'appareil (message « passe le SQL retours_13-10d.sql »).</w:t>
+            </w:r>
+          </w:p>
+        </w:tc>
+        <w:tc>
+          <w:tcPr>
+            <w:tcW w:type="dxa" w:w="3800"/>
+            <w:tcBorders>
+              <w:top w:val="single" w:color="D9D5CB" w:sz="4"/>
+              <w:left w:val="single" w:color="D9D5CB" w:sz="4"/>
+              <w:bottom w:val="single" w:color="D9D5CB" w:sz="4"/>
+              <w:right w:val="single" w:color="D9D5CB" w:sz="4"/>
+            </w:tcBorders>
+            <w:tcMar>
+              <w:top w:type="dxa" w:w="60"/>
+              <w:left w:type="dxa" w:w="90"/>
+              <w:bottom w:type="dxa" w:w="60"/>
+              <w:right w:type="dxa" w:w="90"/>
+            </w:tcMar>
+            <w:vAlign w:val="top"/>
+          </w:tcPr>
+          <w:p>
+            <w:pPr>
+              <w:spacing w:after="40"/>
+            </w:pPr>
+            <w:r>
+              <w:rPr>
+                <w:rFonts w:ascii="Calibri" w:cs="Calibri" w:eastAsia="Calibri" w:hAnsi="Calibri"/>
+                <w:color w:val="14213D"/>
+                <w:sz w:val="20"/>
+                <w:szCs w:val="20"/>
+              </w:rPr>
+              <w:t xml:space="preserve"/>
+            </w:r>
+          </w:p>
+          <w:p>
+            <w:pPr>
+              <w:spacing w:after="40"/>
+            </w:pPr>
+            <w:r>
+              <w:rPr>
+                <w:rFonts w:ascii="Calibri" w:cs="Calibri" w:eastAsia="Calibri" w:hAnsi="Calibri"/>
+                <w:color w:val="14213D"/>
+                <w:sz w:val="20"/>
+                <w:szCs w:val="20"/>
+              </w:rPr>
+              <w:t xml:space="preserve"/>
+            </w:r>
+          </w:p>
+        </w:tc>
+      </w:tr>
+      <w:tr>
+        <w:tc>
+          <w:tcPr>
+            <w:tcW w:type="dxa" w:w="3200"/>
+            <w:tcBorders>
+              <w:top w:val="single" w:color="D9D5CB" w:sz="4"/>
+              <w:left w:val="single" w:color="D9D5CB" w:sz="4"/>
+              <w:bottom w:val="single" w:color="D9D5CB" w:sz="4"/>
+              <w:right w:val="single" w:color="D9D5CB" w:sz="4"/>
+            </w:tcBorders>
+            <w:tcMar>
+              <w:top w:type="dxa" w:w="60"/>
+              <w:left w:type="dxa" w:w="90"/>
+              <w:bottom w:type="dxa" w:w="60"/>
+              <w:right w:type="dxa" w:w="90"/>
+            </w:tcMar>
+            <w:vAlign w:val="top"/>
+          </w:tcPr>
+          <w:p>
+            <w:pPr>
+              <w:spacing w:after="40"/>
+            </w:pPr>
+            <w:r>
+              <w:rPr>
+                <w:rFonts w:ascii="Calibri" w:cs="Calibri" w:eastAsia="Calibri" w:hAnsi="Calibri"/>
+                <w:b/>
+                <w:bCs/>
+                <w:color w:val="14213D"/>
+                <w:sz w:val="19"/>
+                <w:szCs w:val="19"/>
+              </w:rPr>
+              <w:t xml:space="preserve">app/sql/controle_sql.sql (LECTURE SEULE, à relancer après chaque nouveau SQL — ligne 20 ajoutée)</w:t>
             </w:r>
           </w:p>
         </w:tc>
@@ -12486,6 +12600,947 @@
                 <w:szCs w:val="19"/>
               </w:rPr>
               <w:t xml:space="preserve">Fait (à déployer)</w:t>
+            </w:r>
+          </w:p>
+        </w:tc>
+        <w:tc>
+          <w:tcPr>
+            <w:tcW w:type="dxa" w:w="3700"/>
+            <w:tcBorders>
+              <w:top w:val="single" w:color="D9D5CB" w:sz="4"/>
+              <w:left w:val="single" w:color="D9D5CB" w:sz="4"/>
+              <w:bottom w:val="single" w:color="D9D5CB" w:sz="4"/>
+              <w:right w:val="single" w:color="D9D5CB" w:sz="4"/>
+            </w:tcBorders>
+            <w:tcMar>
+              <w:top w:type="dxa" w:w="60"/>
+              <w:left w:type="dxa" w:w="90"/>
+              <w:bottom w:type="dxa" w:w="60"/>
+              <w:right w:type="dxa" w:w="90"/>
+            </w:tcMar>
+            <w:vAlign w:val="top"/>
+          </w:tcPr>
+          <w:p>
+            <w:pPr>
+              <w:spacing w:after="40"/>
+            </w:pPr>
+            <w:r>
+              <w:rPr>
+                <w:rFonts w:ascii="Calibri" w:cs="Calibri" w:eastAsia="Calibri" w:hAnsi="Calibri"/>
+                <w:color w:val="14213D"/>
+                <w:sz w:val="20"/>
+                <w:szCs w:val="20"/>
+              </w:rPr>
+              <w:t xml:space="preserve"/>
+            </w:r>
+          </w:p>
+          <w:p>
+            <w:pPr>
+              <w:spacing w:after="40"/>
+            </w:pPr>
+            <w:r>
+              <w:rPr>
+                <w:rFonts w:ascii="Calibri" w:cs="Calibri" w:eastAsia="Calibri" w:hAnsi="Calibri"/>
+                <w:color w:val="14213D"/>
+                <w:sz w:val="20"/>
+                <w:szCs w:val="20"/>
+              </w:rPr>
+              <w:t xml:space="preserve"/>
+            </w:r>
+          </w:p>
+        </w:tc>
+      </w:tr>
+    </w:tbl>
+    <w:p>
+      <w:pPr>
+        <w:pStyle w:val="Heading1"/>
+        <w:spacing w:after="120" w:before="320"/>
+      </w:pPr>
+      <w:r>
+        <w:rPr>
+          <w:rFonts w:ascii="Calibri" w:cs="Calibri" w:eastAsia="Calibri" w:hAnsi="Calibri"/>
+          <w:b/>
+          <w:bCs/>
+          <w:color w:val="EB6834"/>
+          <w:sz w:val="30"/>
+          <w:szCs w:val="30"/>
+        </w:rPr>
+        <w:t xml:space="preserve">R · Compteurs d'heures par personne, « Moi » : ma navette et « comment c'est calculé », PDF du livret</w:t>
+      </w:r>
+    </w:p>
+    <w:tbl>
+      <w:tblPr>
+        <w:tblW w:type="dxa" w:w="15100"/>
+        <w:tblBorders>
+          <w:top w:val="single" w:color="auto" w:sz="4"/>
+          <w:left w:val="single" w:color="auto" w:sz="4"/>
+          <w:bottom w:val="single" w:color="auto" w:sz="4"/>
+          <w:right w:val="single" w:color="auto" w:sz="4"/>
+          <w:insideH w:val="single" w:color="auto" w:sz="4"/>
+          <w:insideV w:val="single" w:color="auto" w:sz="4"/>
+        </w:tblBorders>
+      </w:tblPr>
+      <w:tblGrid>
+        <w:gridCol w:w="2300"/>
+        <w:gridCol w:w="4100"/>
+        <w:gridCol w:w="3700"/>
+        <w:gridCol w:w="1300"/>
+        <w:gridCol w:w="3700"/>
+      </w:tblGrid>
+      <w:tr>
+        <w:trPr>
+          <w:tblHeader/>
+        </w:trPr>
+        <w:tc>
+          <w:tcPr>
+            <w:tcW w:type="dxa" w:w="2300"/>
+            <w:tcBorders>
+              <w:top w:val="single" w:color="D9D5CB" w:sz="4"/>
+              <w:left w:val="single" w:color="D9D5CB" w:sz="4"/>
+              <w:bottom w:val="single" w:color="D9D5CB" w:sz="4"/>
+              <w:right w:val="single" w:color="D9D5CB" w:sz="4"/>
+            </w:tcBorders>
+            <w:shd w:fill="14213D" w:color="auto" w:val="clear"/>
+            <w:tcMar>
+              <w:top w:type="dxa" w:w="60"/>
+              <w:left w:type="dxa" w:w="90"/>
+              <w:bottom w:type="dxa" w:w="60"/>
+              <w:right w:type="dxa" w:w="90"/>
+            </w:tcMar>
+            <w:vAlign w:val="top"/>
+          </w:tcPr>
+          <w:p>
+            <w:pPr>
+              <w:spacing w:after="80" w:line="264"/>
+            </w:pPr>
+            <w:r>
+              <w:rPr>
+                <w:rFonts w:ascii="Calibri" w:cs="Calibri" w:eastAsia="Calibri" w:hAnsi="Calibri"/>
+                <w:b/>
+                <w:bCs/>
+                <w:color w:val="FFFFFF"/>
+                <w:sz w:val="19"/>
+                <w:szCs w:val="19"/>
+              </w:rPr>
+              <w:t xml:space="preserve">Fonctionnalité</w:t>
+            </w:r>
+          </w:p>
+        </w:tc>
+        <w:tc>
+          <w:tcPr>
+            <w:tcW w:type="dxa" w:w="4100"/>
+            <w:tcBorders>
+              <w:top w:val="single" w:color="D9D5CB" w:sz="4"/>
+              <w:left w:val="single" w:color="D9D5CB" w:sz="4"/>
+              <w:bottom w:val="single" w:color="D9D5CB" w:sz="4"/>
+              <w:right w:val="single" w:color="D9D5CB" w:sz="4"/>
+            </w:tcBorders>
+            <w:shd w:fill="14213D" w:color="auto" w:val="clear"/>
+            <w:tcMar>
+              <w:top w:type="dxa" w:w="60"/>
+              <w:left w:type="dxa" w:w="90"/>
+              <w:bottom w:type="dxa" w:w="60"/>
+              <w:right w:type="dxa" w:w="90"/>
+            </w:tcMar>
+            <w:vAlign w:val="top"/>
+          </w:tcPr>
+          <w:p>
+            <w:pPr>
+              <w:spacing w:after="80" w:line="264"/>
+            </w:pPr>
+            <w:r>
+              <w:rPr>
+                <w:rFonts w:ascii="Calibri" w:cs="Calibri" w:eastAsia="Calibri" w:hAnsi="Calibri"/>
+                <w:b/>
+                <w:bCs/>
+                <w:color w:val="FFFFFF"/>
+                <w:sz w:val="19"/>
+                <w:szCs w:val="19"/>
+              </w:rPr>
+              <w:t xml:space="preserve">Où la trouver · comment tester</w:t>
+            </w:r>
+          </w:p>
+        </w:tc>
+        <w:tc>
+          <w:tcPr>
+            <w:tcW w:type="dxa" w:w="3700"/>
+            <w:tcBorders>
+              <w:top w:val="single" w:color="D9D5CB" w:sz="4"/>
+              <w:left w:val="single" w:color="D9D5CB" w:sz="4"/>
+              <w:bottom w:val="single" w:color="D9D5CB" w:sz="4"/>
+              <w:right w:val="single" w:color="D9D5CB" w:sz="4"/>
+            </w:tcBorders>
+            <w:shd w:fill="14213D" w:color="auto" w:val="clear"/>
+            <w:tcMar>
+              <w:top w:type="dxa" w:w="60"/>
+              <w:left w:type="dxa" w:w="90"/>
+              <w:bottom w:type="dxa" w:w="60"/>
+              <w:right w:type="dxa" w:w="90"/>
+            </w:tcMar>
+            <w:vAlign w:val="top"/>
+          </w:tcPr>
+          <w:p>
+            <w:pPr>
+              <w:spacing w:after="80" w:line="264"/>
+            </w:pPr>
+            <w:r>
+              <w:rPr>
+                <w:rFonts w:ascii="Calibri" w:cs="Calibri" w:eastAsia="Calibri" w:hAnsi="Calibri"/>
+                <w:b/>
+                <w:bCs/>
+                <w:color w:val="FFFFFF"/>
+                <w:sz w:val="19"/>
+                <w:szCs w:val="19"/>
+              </w:rPr>
+              <w:t xml:space="preserve">Hypothèses · limites · ce que j'ai tranché</w:t>
+            </w:r>
+          </w:p>
+        </w:tc>
+        <w:tc>
+          <w:tcPr>
+            <w:tcW w:type="dxa" w:w="1300"/>
+            <w:tcBorders>
+              <w:top w:val="single" w:color="D9D5CB" w:sz="4"/>
+              <w:left w:val="single" w:color="D9D5CB" w:sz="4"/>
+              <w:bottom w:val="single" w:color="D9D5CB" w:sz="4"/>
+              <w:right w:val="single" w:color="D9D5CB" w:sz="4"/>
+            </w:tcBorders>
+            <w:shd w:fill="14213D" w:color="auto" w:val="clear"/>
+            <w:tcMar>
+              <w:top w:type="dxa" w:w="60"/>
+              <w:left w:type="dxa" w:w="90"/>
+              <w:bottom w:type="dxa" w:w="60"/>
+              <w:right w:type="dxa" w:w="90"/>
+            </w:tcMar>
+            <w:vAlign w:val="top"/>
+          </w:tcPr>
+          <w:p>
+            <w:pPr>
+              <w:spacing w:after="80" w:line="264"/>
+            </w:pPr>
+            <w:r>
+              <w:rPr>
+                <w:rFonts w:ascii="Calibri" w:cs="Calibri" w:eastAsia="Calibri" w:hAnsi="Calibri"/>
+                <w:b/>
+                <w:bCs/>
+                <w:color w:val="FFFFFF"/>
+                <w:sz w:val="19"/>
+                <w:szCs w:val="19"/>
+              </w:rPr>
+              <w:t xml:space="preserve">Statut</w:t>
+            </w:r>
+          </w:p>
+        </w:tc>
+        <w:tc>
+          <w:tcPr>
+            <w:tcW w:type="dxa" w:w="3700"/>
+            <w:tcBorders>
+              <w:top w:val="single" w:color="D9D5CB" w:sz="4"/>
+              <w:left w:val="single" w:color="D9D5CB" w:sz="4"/>
+              <w:bottom w:val="single" w:color="D9D5CB" w:sz="4"/>
+              <w:right w:val="single" w:color="D9D5CB" w:sz="4"/>
+            </w:tcBorders>
+            <w:shd w:fill="14213D" w:color="auto" w:val="clear"/>
+            <w:tcMar>
+              <w:top w:type="dxa" w:w="60"/>
+              <w:left w:type="dxa" w:w="90"/>
+              <w:bottom w:type="dxa" w:w="60"/>
+              <w:right w:type="dxa" w:w="90"/>
+            </w:tcMar>
+            <w:vAlign w:val="top"/>
+          </w:tcPr>
+          <w:p>
+            <w:pPr>
+              <w:spacing w:after="80" w:line="264"/>
+            </w:pPr>
+            <w:r>
+              <w:rPr>
+                <w:rFonts w:ascii="Calibri" w:cs="Calibri" w:eastAsia="Calibri" w:hAnsi="Calibri"/>
+                <w:b/>
+                <w:bCs/>
+                <w:color w:val="FFFFFF"/>
+                <w:sz w:val="19"/>
+                <w:szCs w:val="19"/>
+              </w:rPr>
+              <w:t xml:space="preserve">Vos commentaires</w:t>
+            </w:r>
+          </w:p>
+        </w:tc>
+      </w:tr>
+      <w:tr>
+        <w:tc>
+          <w:tcPr>
+            <w:tcW w:type="dxa" w:w="2300"/>
+            <w:tcBorders>
+              <w:top w:val="single" w:color="D9D5CB" w:sz="4"/>
+              <w:left w:val="single" w:color="D9D5CB" w:sz="4"/>
+              <w:bottom w:val="single" w:color="D9D5CB" w:sz="4"/>
+              <w:right w:val="single" w:color="D9D5CB" w:sz="4"/>
+            </w:tcBorders>
+            <w:tcMar>
+              <w:top w:type="dxa" w:w="60"/>
+              <w:left w:type="dxa" w:w="90"/>
+              <w:bottom w:type="dxa" w:w="60"/>
+              <w:right w:type="dxa" w:w="90"/>
+            </w:tcMar>
+            <w:vAlign w:val="top"/>
+          </w:tcPr>
+          <w:p>
+            <w:pPr>
+              <w:spacing w:after="40"/>
+            </w:pPr>
+            <w:r>
+              <w:rPr>
+                <w:rFonts w:ascii="Calibri" w:cs="Calibri" w:eastAsia="Calibri" w:hAnsi="Calibri"/>
+                <w:b/>
+                <w:bCs/>
+                <w:color w:val="14213D"/>
+                <w:sz w:val="20"/>
+                <w:szCs w:val="20"/>
+              </w:rPr>
+              <w:t xml:space="preserve">Compteurs dans le profil</w:t>
+            </w:r>
+          </w:p>
+        </w:tc>
+        <w:tc>
+          <w:tcPr>
+            <w:tcW w:type="dxa" w:w="4100"/>
+            <w:tcBorders>
+              <w:top w:val="single" w:color="D9D5CB" w:sz="4"/>
+              <w:left w:val="single" w:color="D9D5CB" w:sz="4"/>
+              <w:bottom w:val="single" w:color="D9D5CB" w:sz="4"/>
+              <w:right w:val="single" w:color="D9D5CB" w:sz="4"/>
+            </w:tcBorders>
+            <w:tcMar>
+              <w:top w:type="dxa" w:w="60"/>
+              <w:left w:type="dxa" w:w="90"/>
+              <w:bottom w:type="dxa" w:w="60"/>
+              <w:right w:type="dxa" w:w="90"/>
+            </w:tcMar>
+            <w:vAlign w:val="top"/>
+          </w:tcPr>
+          <w:p>
+            <w:pPr>
+              <w:spacing w:after="40"/>
+            </w:pPr>
+            <w:r>
+              <w:rPr>
+                <w:rFonts w:ascii="Calibri" w:cs="Calibri" w:eastAsia="Calibri" w:hAnsi="Calibri"/>
+                <w:color w:val="14213D"/>
+                <w:sz w:val="19"/>
+                <w:szCs w:val="19"/>
+              </w:rPr>
+              <w:t xml:space="preserve">La fiche d'une personne (ex. Exploitation → Grands déplacements → 👤 Par personne · mois → Fiche) → carte « Heures et compteurs » : contrat (h / semaine) ✏️ ; coche les compteurs de la personne (récupération, CET, heures à reporter, ＋ autre comme « Modulation ») ; ✏️ solde (heures + date) ; 💶 en prime pour vider les heures à reporter.</w:t>
+            </w:r>
+          </w:p>
+        </w:tc>
+        <w:tc>
+          <w:tcPr>
+            <w:tcW w:type="dxa" w:w="3700"/>
+            <w:tcBorders>
+              <w:top w:val="single" w:color="D9D5CB" w:sz="4"/>
+              <w:left w:val="single" w:color="D9D5CB" w:sz="4"/>
+              <w:bottom w:val="single" w:color="D9D5CB" w:sz="4"/>
+              <w:right w:val="single" w:color="D9D5CB" w:sz="4"/>
+            </w:tcBorders>
+            <w:tcMar>
+              <w:top w:type="dxa" w:w="60"/>
+              <w:left w:type="dxa" w:w="90"/>
+              <w:bottom w:type="dxa" w:w="60"/>
+              <w:right w:type="dxa" w:w="90"/>
+            </w:tcMar>
+            <w:vAlign w:val="top"/>
+          </w:tcPr>
+          <w:p>
+            <w:pPr>
+              <w:spacing w:after="40"/>
+            </w:pPr>
+            <w:r>
+              <w:rPr>
+                <w:rFonts w:ascii="Calibri" w:cs="Calibri" w:eastAsia="Calibri" w:hAnsi="Calibri"/>
+                <w:color w:val="14213D"/>
+                <w:sz w:val="19"/>
+                <w:szCs w:val="19"/>
+              </w:rPr>
+              <w:t xml:space="preserve">Tout le monde n'a pas le même compteur : chacun a les siens. « Heures à reporter » est suivi d'office et se calcule tout seul depuis le pointage (au-delà de 48 h par semaine), moins les primes. Les autres compteurs : soldes datés tenus par les RH. Ils pré-remplissent la navette (cases vertes). L'import de ton classeur des soldes existants : dès que tu me l'envoies.</w:t>
+            </w:r>
+          </w:p>
+        </w:tc>
+        <w:tc>
+          <w:tcPr>
+            <w:tcW w:type="dxa" w:w="1300"/>
+            <w:tcBorders>
+              <w:top w:val="single" w:color="D9D5CB" w:sz="4"/>
+              <w:left w:val="single" w:color="D9D5CB" w:sz="4"/>
+              <w:bottom w:val="single" w:color="D9D5CB" w:sz="4"/>
+              <w:right w:val="single" w:color="D9D5CB" w:sz="4"/>
+            </w:tcBorders>
+            <w:shd w:fill="E6F5EC" w:color="auto" w:val="clear"/>
+            <w:tcMar>
+              <w:top w:type="dxa" w:w="60"/>
+              <w:left w:type="dxa" w:w="90"/>
+              <w:bottom w:type="dxa" w:w="60"/>
+              <w:right w:type="dxa" w:w="90"/>
+            </w:tcMar>
+            <w:vAlign w:val="top"/>
+          </w:tcPr>
+          <w:p>
+            <w:pPr>
+              <w:spacing w:after="40"/>
+            </w:pPr>
+            <w:r>
+              <w:rPr>
+                <w:rFonts w:ascii="Calibri" w:cs="Calibri" w:eastAsia="Calibri" w:hAnsi="Calibri"/>
+                <w:b/>
+                <w:bCs/>
+                <w:color w:val="14213D"/>
+                <w:sz w:val="19"/>
+                <w:szCs w:val="19"/>
+              </w:rPr>
+              <w:t xml:space="preserve">Fait</w:t>
+            </w:r>
+          </w:p>
+        </w:tc>
+        <w:tc>
+          <w:tcPr>
+            <w:tcW w:type="dxa" w:w="3700"/>
+            <w:tcBorders>
+              <w:top w:val="single" w:color="D9D5CB" w:sz="4"/>
+              <w:left w:val="single" w:color="D9D5CB" w:sz="4"/>
+              <w:bottom w:val="single" w:color="D9D5CB" w:sz="4"/>
+              <w:right w:val="single" w:color="D9D5CB" w:sz="4"/>
+            </w:tcBorders>
+            <w:tcMar>
+              <w:top w:type="dxa" w:w="60"/>
+              <w:left w:type="dxa" w:w="90"/>
+              <w:bottom w:type="dxa" w:w="60"/>
+              <w:right w:type="dxa" w:w="90"/>
+            </w:tcMar>
+            <w:vAlign w:val="top"/>
+          </w:tcPr>
+          <w:p>
+            <w:pPr>
+              <w:spacing w:after="40"/>
+            </w:pPr>
+            <w:r>
+              <w:rPr>
+                <w:rFonts w:ascii="Calibri" w:cs="Calibri" w:eastAsia="Calibri" w:hAnsi="Calibri"/>
+                <w:color w:val="14213D"/>
+                <w:sz w:val="20"/>
+                <w:szCs w:val="20"/>
+              </w:rPr>
+              <w:t xml:space="preserve"/>
+            </w:r>
+          </w:p>
+          <w:p>
+            <w:pPr>
+              <w:spacing w:after="40"/>
+            </w:pPr>
+            <w:r>
+              <w:rPr>
+                <w:rFonts w:ascii="Calibri" w:cs="Calibri" w:eastAsia="Calibri" w:hAnsi="Calibri"/>
+                <w:color w:val="14213D"/>
+                <w:sz w:val="20"/>
+                <w:szCs w:val="20"/>
+              </w:rPr>
+              <w:t xml:space="preserve"/>
+            </w:r>
+          </w:p>
+        </w:tc>
+      </w:tr>
+      <w:tr>
+        <w:tc>
+          <w:tcPr>
+            <w:tcW w:type="dxa" w:w="2300"/>
+            <w:tcBorders>
+              <w:top w:val="single" w:color="D9D5CB" w:sz="4"/>
+              <w:left w:val="single" w:color="D9D5CB" w:sz="4"/>
+              <w:bottom w:val="single" w:color="D9D5CB" w:sz="4"/>
+              <w:right w:val="single" w:color="D9D5CB" w:sz="4"/>
+            </w:tcBorders>
+            <w:tcMar>
+              <w:top w:type="dxa" w:w="60"/>
+              <w:left w:type="dxa" w:w="90"/>
+              <w:bottom w:type="dxa" w:w="60"/>
+              <w:right w:type="dxa" w:w="90"/>
+            </w:tcMar>
+            <w:vAlign w:val="top"/>
+          </w:tcPr>
+          <w:p>
+            <w:pPr>
+              <w:spacing w:after="40"/>
+            </w:pPr>
+            <w:r>
+              <w:rPr>
+                <w:rFonts w:ascii="Calibri" w:cs="Calibri" w:eastAsia="Calibri" w:hAnsi="Calibri"/>
+                <w:b/>
+                <w:bCs/>
+                <w:color w:val="14213D"/>
+                <w:sz w:val="20"/>
+                <w:szCs w:val="20"/>
+              </w:rPr>
+              <w:t xml:space="preserve">« Moi » : ma navette et mes variables</w:t>
+            </w:r>
+          </w:p>
+        </w:tc>
+        <w:tc>
+          <w:tcPr>
+            <w:tcW w:type="dxa" w:w="4100"/>
+            <w:tcBorders>
+              <w:top w:val="single" w:color="D9D5CB" w:sz="4"/>
+              <w:left w:val="single" w:color="D9D5CB" w:sz="4"/>
+              <w:bottom w:val="single" w:color="D9D5CB" w:sz="4"/>
+              <w:right w:val="single" w:color="D9D5CB" w:sz="4"/>
+            </w:tcBorders>
+            <w:tcMar>
+              <w:top w:type="dxa" w:w="60"/>
+              <w:left w:type="dxa" w:w="90"/>
+              <w:bottom w:type="dxa" w:w="60"/>
+              <w:right w:type="dxa" w:w="90"/>
+            </w:tcMar>
+            <w:vAlign w:val="top"/>
+          </w:tcPr>
+          <w:p>
+            <w:pPr>
+              <w:spacing w:after="40"/>
+            </w:pPr>
+            <w:r>
+              <w:rPr>
+                <w:rFonts w:ascii="Calibri" w:cs="Calibri" w:eastAsia="Calibri" w:hAnsi="Calibri"/>
+                <w:color w:val="14213D"/>
+                <w:sz w:val="19"/>
+                <w:szCs w:val="19"/>
+              </w:rPr>
+              <w:t xml:space="preserve">Chaque gars : Moi → Heures → « 🧾 Ma navette » : son mois (‹ ›), heures pointées, heures sup 125 / 150 %, au-delà de 48 h, hôtels, repas, indemnités de trajet, semaine par semaine, ses compteurs, ⬇ sa navette Excel.</w:t>
+            </w:r>
+          </w:p>
+        </w:tc>
+        <w:tc>
+          <w:tcPr>
+            <w:tcW w:type="dxa" w:w="3700"/>
+            <w:tcBorders>
+              <w:top w:val="single" w:color="D9D5CB" w:sz="4"/>
+              <w:left w:val="single" w:color="D9D5CB" w:sz="4"/>
+              <w:bottom w:val="single" w:color="D9D5CB" w:sz="4"/>
+              <w:right w:val="single" w:color="D9D5CB" w:sz="4"/>
+            </w:tcBorders>
+            <w:tcMar>
+              <w:top w:type="dxa" w:w="60"/>
+              <w:left w:type="dxa" w:w="90"/>
+              <w:bottom w:type="dxa" w:w="60"/>
+              <w:right w:type="dxa" w:w="90"/>
+            </w:tcMar>
+            <w:vAlign w:val="top"/>
+          </w:tcPr>
+          <w:p>
+            <w:pPr>
+              <w:spacing w:after="40"/>
+            </w:pPr>
+            <w:r>
+              <w:rPr>
+                <w:rFonts w:ascii="Calibri" w:cs="Calibri" w:eastAsia="Calibri" w:hAnsi="Calibri"/>
+                <w:color w:val="14213D"/>
+                <w:sz w:val="19"/>
+                <w:szCs w:val="19"/>
+              </w:rPr>
+              <w:t xml:space="preserve">En dessous, « ❓ Comment c'est calculé » : ses heures selon son contrat, les 4 cas, le tableau jour par jour de SON cas, 15 / 30 / 50 € par aller-retour, les rappels du livret, et le PDF.</w:t>
+            </w:r>
+          </w:p>
+        </w:tc>
+        <w:tc>
+          <w:tcPr>
+            <w:tcW w:type="dxa" w:w="1300"/>
+            <w:tcBorders>
+              <w:top w:val="single" w:color="D9D5CB" w:sz="4"/>
+              <w:left w:val="single" w:color="D9D5CB" w:sz="4"/>
+              <w:bottom w:val="single" w:color="D9D5CB" w:sz="4"/>
+              <w:right w:val="single" w:color="D9D5CB" w:sz="4"/>
+            </w:tcBorders>
+            <w:shd w:fill="E6F5EC" w:color="auto" w:val="clear"/>
+            <w:tcMar>
+              <w:top w:type="dxa" w:w="60"/>
+              <w:left w:type="dxa" w:w="90"/>
+              <w:bottom w:type="dxa" w:w="60"/>
+              <w:right w:type="dxa" w:w="90"/>
+            </w:tcMar>
+            <w:vAlign w:val="top"/>
+          </w:tcPr>
+          <w:p>
+            <w:pPr>
+              <w:spacing w:after="40"/>
+            </w:pPr>
+            <w:r>
+              <w:rPr>
+                <w:rFonts w:ascii="Calibri" w:cs="Calibri" w:eastAsia="Calibri" w:hAnsi="Calibri"/>
+                <w:b/>
+                <w:bCs/>
+                <w:color w:val="14213D"/>
+                <w:sz w:val="19"/>
+                <w:szCs w:val="19"/>
+              </w:rPr>
+              <w:t xml:space="preserve">Fait</w:t>
+            </w:r>
+          </w:p>
+        </w:tc>
+        <w:tc>
+          <w:tcPr>
+            <w:tcW w:type="dxa" w:w="3700"/>
+            <w:tcBorders>
+              <w:top w:val="single" w:color="D9D5CB" w:sz="4"/>
+              <w:left w:val="single" w:color="D9D5CB" w:sz="4"/>
+              <w:bottom w:val="single" w:color="D9D5CB" w:sz="4"/>
+              <w:right w:val="single" w:color="D9D5CB" w:sz="4"/>
+            </w:tcBorders>
+            <w:tcMar>
+              <w:top w:type="dxa" w:w="60"/>
+              <w:left w:type="dxa" w:w="90"/>
+              <w:bottom w:type="dxa" w:w="60"/>
+              <w:right w:type="dxa" w:w="90"/>
+            </w:tcMar>
+            <w:vAlign w:val="top"/>
+          </w:tcPr>
+          <w:p>
+            <w:pPr>
+              <w:spacing w:after="40"/>
+            </w:pPr>
+            <w:r>
+              <w:rPr>
+                <w:rFonts w:ascii="Calibri" w:cs="Calibri" w:eastAsia="Calibri" w:hAnsi="Calibri"/>
+                <w:color w:val="14213D"/>
+                <w:sz w:val="20"/>
+                <w:szCs w:val="20"/>
+              </w:rPr>
+              <w:t xml:space="preserve"/>
+            </w:r>
+          </w:p>
+          <w:p>
+            <w:pPr>
+              <w:spacing w:after="40"/>
+            </w:pPr>
+            <w:r>
+              <w:rPr>
+                <w:rFonts w:ascii="Calibri" w:cs="Calibri" w:eastAsia="Calibri" w:hAnsi="Calibri"/>
+                <w:color w:val="14213D"/>
+                <w:sz w:val="20"/>
+                <w:szCs w:val="20"/>
+              </w:rPr>
+              <w:t xml:space="preserve"/>
+            </w:r>
+          </w:p>
+        </w:tc>
+      </w:tr>
+      <w:tr>
+        <w:tc>
+          <w:tcPr>
+            <w:tcW w:type="dxa" w:w="2300"/>
+            <w:tcBorders>
+              <w:top w:val="single" w:color="D9D5CB" w:sz="4"/>
+              <w:left w:val="single" w:color="D9D5CB" w:sz="4"/>
+              <w:bottom w:val="single" w:color="D9D5CB" w:sz="4"/>
+              <w:right w:val="single" w:color="D9D5CB" w:sz="4"/>
+            </w:tcBorders>
+            <w:tcMar>
+              <w:top w:type="dxa" w:w="60"/>
+              <w:left w:type="dxa" w:w="90"/>
+              <w:bottom w:type="dxa" w:w="60"/>
+              <w:right w:type="dxa" w:w="90"/>
+            </w:tcMar>
+            <w:vAlign w:val="top"/>
+          </w:tcPr>
+          <w:p>
+            <w:pPr>
+              <w:spacing w:after="40"/>
+            </w:pPr>
+            <w:r>
+              <w:rPr>
+                <w:rFonts w:ascii="Calibri" w:cs="Calibri" w:eastAsia="Calibri" w:hAnsi="Calibri"/>
+                <w:b/>
+                <w:bCs/>
+                <w:color w:val="14213D"/>
+                <w:sz w:val="20"/>
+                <w:szCs w:val="20"/>
+              </w:rPr>
+              <w:t xml:space="preserve">Le PDF du livret (§ 2.7)</w:t>
+            </w:r>
+          </w:p>
+        </w:tc>
+        <w:tc>
+          <w:tcPr>
+            <w:tcW w:type="dxa" w:w="4100"/>
+            <w:tcBorders>
+              <w:top w:val="single" w:color="D9D5CB" w:sz="4"/>
+              <w:left w:val="single" w:color="D9D5CB" w:sz="4"/>
+              <w:bottom w:val="single" w:color="D9D5CB" w:sz="4"/>
+              <w:right w:val="single" w:color="D9D5CB" w:sz="4"/>
+            </w:tcBorders>
+            <w:tcMar>
+              <w:top w:type="dxa" w:w="60"/>
+              <w:left w:type="dxa" w:w="90"/>
+              <w:bottom w:type="dxa" w:w="60"/>
+              <w:right w:type="dxa" w:w="90"/>
+            </w:tcMar>
+            <w:vAlign w:val="top"/>
+          </w:tcPr>
+          <w:p>
+            <w:pPr>
+              <w:spacing w:after="40"/>
+            </w:pPr>
+            <w:r>
+              <w:rPr>
+                <w:rFonts w:ascii="Calibri" w:cs="Calibri" w:eastAsia="Calibri" w:hAnsi="Calibri"/>
+                <w:color w:val="14213D"/>
+                <w:sz w:val="19"/>
+                <w:szCs w:val="19"/>
+              </w:rPr>
+              <w:t xml:space="preserve">Exploitation → Grands déplacements → en bas, Règles → 📎 Déposer le PDF du livret. Il apparaît ici et chez chacun dans Moi → Heures → « Comment c'est calculé ».</w:t>
+            </w:r>
+          </w:p>
+        </w:tc>
+        <w:tc>
+          <w:tcPr>
+            <w:tcW w:type="dxa" w:w="3700"/>
+            <w:tcBorders>
+              <w:top w:val="single" w:color="D9D5CB" w:sz="4"/>
+              <w:left w:val="single" w:color="D9D5CB" w:sz="4"/>
+              <w:bottom w:val="single" w:color="D9D5CB" w:sz="4"/>
+              <w:right w:val="single" w:color="D9D5CB" w:sz="4"/>
+            </w:tcBorders>
+            <w:tcMar>
+              <w:top w:type="dxa" w:w="60"/>
+              <w:left w:type="dxa" w:w="90"/>
+              <w:bottom w:type="dxa" w:w="60"/>
+              <w:right w:type="dxa" w:w="90"/>
+            </w:tcMar>
+            <w:vAlign w:val="top"/>
+          </w:tcPr>
+          <w:p>
+            <w:pPr>
+              <w:spacing w:after="40"/>
+            </w:pPr>
+            <w:r>
+              <w:rPr>
+                <w:rFonts w:ascii="Calibri" w:cs="Calibri" w:eastAsia="Calibri" w:hAnsi="Calibri"/>
+                <w:color w:val="14213D"/>
+                <w:sz w:val="19"/>
+                <w:szCs w:val="19"/>
+              </w:rPr>
+              <w:t xml:space="preserve">Les règles sont aussi intégrées dans l'appli (tableaux jour par jour des cas 2, 3, 4 — les mêmes que ton PDF).</w:t>
+            </w:r>
+          </w:p>
+        </w:tc>
+        <w:tc>
+          <w:tcPr>
+            <w:tcW w:type="dxa" w:w="1300"/>
+            <w:tcBorders>
+              <w:top w:val="single" w:color="D9D5CB" w:sz="4"/>
+              <w:left w:val="single" w:color="D9D5CB" w:sz="4"/>
+              <w:bottom w:val="single" w:color="D9D5CB" w:sz="4"/>
+              <w:right w:val="single" w:color="D9D5CB" w:sz="4"/>
+            </w:tcBorders>
+            <w:shd w:fill="E6F5EC" w:color="auto" w:val="clear"/>
+            <w:tcMar>
+              <w:top w:type="dxa" w:w="60"/>
+              <w:left w:type="dxa" w:w="90"/>
+              <w:bottom w:type="dxa" w:w="60"/>
+              <w:right w:type="dxa" w:w="90"/>
+            </w:tcMar>
+            <w:vAlign w:val="top"/>
+          </w:tcPr>
+          <w:p>
+            <w:pPr>
+              <w:spacing w:after="40"/>
+            </w:pPr>
+            <w:r>
+              <w:rPr>
+                <w:rFonts w:ascii="Calibri" w:cs="Calibri" w:eastAsia="Calibri" w:hAnsi="Calibri"/>
+                <w:b/>
+                <w:bCs/>
+                <w:color w:val="14213D"/>
+                <w:sz w:val="19"/>
+                <w:szCs w:val="19"/>
+              </w:rPr>
+              <w:t xml:space="preserve">Fait</w:t>
+            </w:r>
+          </w:p>
+        </w:tc>
+        <w:tc>
+          <w:tcPr>
+            <w:tcW w:type="dxa" w:w="3700"/>
+            <w:tcBorders>
+              <w:top w:val="single" w:color="D9D5CB" w:sz="4"/>
+              <w:left w:val="single" w:color="D9D5CB" w:sz="4"/>
+              <w:bottom w:val="single" w:color="D9D5CB" w:sz="4"/>
+              <w:right w:val="single" w:color="D9D5CB" w:sz="4"/>
+            </w:tcBorders>
+            <w:tcMar>
+              <w:top w:type="dxa" w:w="60"/>
+              <w:left w:type="dxa" w:w="90"/>
+              <w:bottom w:type="dxa" w:w="60"/>
+              <w:right w:type="dxa" w:w="90"/>
+            </w:tcMar>
+            <w:vAlign w:val="top"/>
+          </w:tcPr>
+          <w:p>
+            <w:pPr>
+              <w:spacing w:after="40"/>
+            </w:pPr>
+            <w:r>
+              <w:rPr>
+                <w:rFonts w:ascii="Calibri" w:cs="Calibri" w:eastAsia="Calibri" w:hAnsi="Calibri"/>
+                <w:color w:val="14213D"/>
+                <w:sz w:val="20"/>
+                <w:szCs w:val="20"/>
+              </w:rPr>
+              <w:t xml:space="preserve"/>
+            </w:r>
+          </w:p>
+          <w:p>
+            <w:pPr>
+              <w:spacing w:after="40"/>
+            </w:pPr>
+            <w:r>
+              <w:rPr>
+                <w:rFonts w:ascii="Calibri" w:cs="Calibri" w:eastAsia="Calibri" w:hAnsi="Calibri"/>
+                <w:color w:val="14213D"/>
+                <w:sz w:val="20"/>
+                <w:szCs w:val="20"/>
+              </w:rPr>
+              <w:t xml:space="preserve"/>
+            </w:r>
+          </w:p>
+        </w:tc>
+      </w:tr>
+      <w:tr>
+        <w:tc>
+          <w:tcPr>
+            <w:tcW w:type="dxa" w:w="2300"/>
+            <w:tcBorders>
+              <w:top w:val="single" w:color="D9D5CB" w:sz="4"/>
+              <w:left w:val="single" w:color="D9D5CB" w:sz="4"/>
+              <w:bottom w:val="single" w:color="D9D5CB" w:sz="4"/>
+              <w:right w:val="single" w:color="D9D5CB" w:sz="4"/>
+            </w:tcBorders>
+            <w:tcMar>
+              <w:top w:type="dxa" w:w="60"/>
+              <w:left w:type="dxa" w:w="90"/>
+              <w:bottom w:type="dxa" w:w="60"/>
+              <w:right w:type="dxa" w:w="90"/>
+            </w:tcMar>
+            <w:vAlign w:val="top"/>
+          </w:tcPr>
+          <w:p>
+            <w:pPr>
+              <w:spacing w:after="40"/>
+            </w:pPr>
+            <w:r>
+              <w:rPr>
+                <w:rFonts w:ascii="Calibri" w:cs="Calibri" w:eastAsia="Calibri" w:hAnsi="Calibri"/>
+                <w:b/>
+                <w:bCs/>
+                <w:color w:val="14213D"/>
+                <w:sz w:val="20"/>
+                <w:szCs w:val="20"/>
+              </w:rPr>
+              <w:t xml:space="preserve">À valider par toi</w:t>
+            </w:r>
+          </w:p>
+        </w:tc>
+        <w:tc>
+          <w:tcPr>
+            <w:tcW w:type="dxa" w:w="4100"/>
+            <w:tcBorders>
+              <w:top w:val="single" w:color="D9D5CB" w:sz="4"/>
+              <w:left w:val="single" w:color="D9D5CB" w:sz="4"/>
+              <w:bottom w:val="single" w:color="D9D5CB" w:sz="4"/>
+              <w:right w:val="single" w:color="D9D5CB" w:sz="4"/>
+            </w:tcBorders>
+            <w:tcMar>
+              <w:top w:type="dxa" w:w="60"/>
+              <w:left w:type="dxa" w:w="90"/>
+              <w:bottom w:type="dxa" w:w="60"/>
+              <w:right w:type="dxa" w:w="90"/>
+            </w:tcMar>
+            <w:vAlign w:val="top"/>
+          </w:tcPr>
+          <w:p>
+            <w:pPr>
+              <w:spacing w:after="40"/>
+            </w:pPr>
+            <w:r>
+              <w:rPr>
+                <w:rFonts w:ascii="Calibri" w:cs="Calibri" w:eastAsia="Calibri" w:hAnsi="Calibri"/>
+                <w:color w:val="14213D"/>
+                <w:sz w:val="19"/>
+                <w:szCs w:val="19"/>
+              </w:rPr>
+              <w:t xml:space="preserve">Un contrat à 39 h : la navette compte les heures sup au-delà de 39 h (40e → 47e à 125 %, 48e à 150 %). Est-ce bien comme ça que les RH font, ou les heures sup partent-elles toujours de la 36e ?</w:t>
+            </w:r>
+          </w:p>
+        </w:tc>
+        <w:tc>
+          <w:tcPr>
+            <w:tcW w:type="dxa" w:w="3700"/>
+            <w:tcBorders>
+              <w:top w:val="single" w:color="D9D5CB" w:sz="4"/>
+              <w:left w:val="single" w:color="D9D5CB" w:sz="4"/>
+              <w:bottom w:val="single" w:color="D9D5CB" w:sz="4"/>
+              <w:right w:val="single" w:color="D9D5CB" w:sz="4"/>
+            </w:tcBorders>
+            <w:tcMar>
+              <w:top w:type="dxa" w:w="60"/>
+              <w:left w:type="dxa" w:w="90"/>
+              <w:bottom w:type="dxa" w:w="60"/>
+              <w:right w:type="dxa" w:w="90"/>
+            </w:tcMar>
+            <w:vAlign w:val="top"/>
+          </w:tcPr>
+          <w:p>
+            <w:pPr>
+              <w:spacing w:after="40"/>
+            </w:pPr>
+            <w:r>
+              <w:rPr>
+                <w:rFonts w:ascii="Calibri" w:cs="Calibri" w:eastAsia="Calibri" w:hAnsi="Calibri"/>
+                <w:color w:val="14213D"/>
+                <w:sz w:val="19"/>
+                <w:szCs w:val="19"/>
+              </w:rPr>
+              <w:t xml:space="preserve"/>
+            </w:r>
+          </w:p>
+        </w:tc>
+        <w:tc>
+          <w:tcPr>
+            <w:tcW w:type="dxa" w:w="1300"/>
+            <w:tcBorders>
+              <w:top w:val="single" w:color="D9D5CB" w:sz="4"/>
+              <w:left w:val="single" w:color="D9D5CB" w:sz="4"/>
+              <w:bottom w:val="single" w:color="D9D5CB" w:sz="4"/>
+              <w:right w:val="single" w:color="D9D5CB" w:sz="4"/>
+            </w:tcBorders>
+            <w:shd w:fill="FFF4EE" w:color="auto" w:val="clear"/>
+            <w:tcMar>
+              <w:top w:type="dxa" w:w="60"/>
+              <w:left w:type="dxa" w:w="90"/>
+              <w:bottom w:type="dxa" w:w="60"/>
+              <w:right w:type="dxa" w:w="90"/>
+            </w:tcMar>
+            <w:vAlign w:val="top"/>
+          </w:tcPr>
+          <w:p>
+            <w:pPr>
+              <w:spacing w:after="40"/>
+            </w:pPr>
+            <w:r>
+              <w:rPr>
+                <w:rFonts w:ascii="Calibri" w:cs="Calibri" w:eastAsia="Calibri" w:hAnsi="Calibri"/>
+                <w:b/>
+                <w:bCs/>
+                <w:color w:val="14213D"/>
+                <w:sz w:val="19"/>
+                <w:szCs w:val="19"/>
+              </w:rPr>
+              <w:t xml:space="preserve">À valider</w:t>
             </w:r>
           </w:p>
         </w:tc>
@@ -28528,6 +29583,44 @@
           <w:szCs w:val="30"/>
         </w:rPr>
         <w:t xml:space="preserve">Titres de commit (GitHub Desktop)</w:t>
+      </w:r>
+    </w:p>
+    <w:p>
+      <w:pPr>
+        <w:pStyle w:val="ListParagraph"/>
+        <w:numPr>
+          <w:ilvl w:val="0"/>
+          <w:numId w:val="2"/>
+        </w:numPr>
+        <w:spacing w:after="40"/>
+      </w:pPr>
+      <w:r>
+        <w:rPr>
+          <w:rFonts w:ascii="Calibri" w:cs="Calibri" w:eastAsia="Calibri" w:hAnsi="Calibri"/>
+          <w:color w:val="14213D"/>
+          <w:sz w:val="20"/>
+          <w:szCs w:val="20"/>
+        </w:rPr>
+        <w:t xml:space="preserve">(mardi, suite) Résumé : Compteurs d'heures par personne + « Moi » : ma navette, mes variables, comment c'est calculé + PDF du livret</w:t>
+      </w:r>
+    </w:p>
+    <w:p>
+      <w:pPr>
+        <w:pStyle w:val="ListParagraph"/>
+        <w:numPr>
+          <w:ilvl w:val="0"/>
+          <w:numId w:val="2"/>
+        </w:numPr>
+        <w:spacing w:after="40"/>
+      </w:pPr>
+      <w:r>
+        <w:rPr>
+          <w:rFonts w:ascii="Calibri" w:cs="Calibri" w:eastAsia="Calibri" w:hAnsi="Calibri"/>
+          <w:color w:val="14213D"/>
+          <w:sz w:val="20"/>
+          <w:szCs w:val="20"/>
+        </w:rPr>
+        <w:t xml:space="preserve">Description : 13/10 — registre cpth (sql/retours_13-10d.sql) : contrat, compteurs suivis, soldes, primes, heures à reporter calculées (&gt; 48 h) ; fiche personne « Heures et compteurs » ; navette pré-remplie ; Moi → Heures : ma navette + règles (tableaux du livret) + PDF déposé par les RH ; une fiche reste ouverte quand des données arrivent ; test e2e_compteurs</w:t>
       </w:r>
     </w:p>
     <w:p>

</xml_diff>

<commit_message>
Commerce : lecture v3 (Word, rotation, 2e écran, notes) + points techniques v2
</commit_message>
<xml_diff>
--- a/app/docs/Feuille_de_route_controle_12-10.docx
+++ b/app/docs/Feuille_de_route_controle_12-10.docx
@@ -84,7 +84,7 @@
           <w:sz w:val="20"/>
           <w:szCs w:val="20"/>
         </w:rPr>
-        <w:t xml:space="preserve">Build livré : 13/10/2026 · 61d946 (index.html + traceur.html à la racine du dépôt). SQL pour la section R : retours_13-10d.sql (compteurs d'heures). Pas de SQL pour les sections Q, P, O, N et M (le contrôle des SQL de la section O ne modifie rien). Tous les SQL sont passés (toi, 13/10 au soir) : ta base est à jour. Nouveau SQL du soir : retours_13-10c.sql (qualifications des écarts de fourniture réunies entre deux tablettes). SQL de l'après-midi : retours_13-10b.sql (base de prix et paniers : registres « prix » et « panier », lecture réservée à l'encadrement / bureau), blocs_memoire_scr.sql (ton mémoire O2410-10 découpé en 10 blocs réutilisables) (retours_13-10.sql de l'onglet Fourniture est inclus dans retours_13-10c.sql). SQL retours_12-10.sql et retours_12-10b.sql passés, fonction outlook-sync déployée et vérifiée par toi le 12/10 au soir (« ça fonctionne parfaitement »). Hors connexion, tout se teste avec les personnages de démo.</w:t>
+        <w:t xml:space="preserve">Build livré : 13/10/2026 · 638b71 (index.html + traceur.html à la racine du dépôt). SQL pour la section R : retours_13-10d.sql (compteurs d'heures). Pas de SQL pour les sections Q, P, O, N et M (le contrôle des SQL de la section O ne modifie rien). Tous les SQL sont passés (toi, 13/10 au soir) : ta base est à jour. Nouveau SQL du soir : retours_13-10c.sql (qualifications des écarts de fourniture réunies entre deux tablettes). SQL de l'après-midi : retours_13-10b.sql (base de prix et paniers : registres « prix » et « panier », lecture réservée à l'encadrement / bureau), blocs_memoire_scr.sql (ton mémoire O2410-10 découpé en 10 blocs réutilisables) (retours_13-10.sql de l'onglet Fourniture est inclus dans retours_13-10c.sql). SQL retours_12-10.sql et retours_12-10b.sql passés, fonction outlook-sync déployée et vérifiée par toi le 12/10 au soir (« ça fonctionne parfaitement »). Hors connexion, tout se teste avec les personnages de démo.</w:t>
       </w:r>
     </w:p>
     <w:p>
@@ -12600,6 +12600,2952 @@
                 <w:szCs w:val="19"/>
               </w:rPr>
               <w:t xml:space="preserve">Fait (à déployer)</w:t>
+            </w:r>
+          </w:p>
+        </w:tc>
+        <w:tc>
+          <w:tcPr>
+            <w:tcW w:type="dxa" w:w="3700"/>
+            <w:tcBorders>
+              <w:top w:val="single" w:color="D9D5CB" w:sz="4"/>
+              <w:left w:val="single" w:color="D9D5CB" w:sz="4"/>
+              <w:bottom w:val="single" w:color="D9D5CB" w:sz="4"/>
+              <w:right w:val="single" w:color="D9D5CB" w:sz="4"/>
+            </w:tcBorders>
+            <w:tcMar>
+              <w:top w:type="dxa" w:w="60"/>
+              <w:left w:type="dxa" w:w="90"/>
+              <w:bottom w:type="dxa" w:w="60"/>
+              <w:right w:type="dxa" w:w="90"/>
+            </w:tcMar>
+            <w:vAlign w:val="top"/>
+          </w:tcPr>
+          <w:p>
+            <w:pPr>
+              <w:spacing w:after="40"/>
+            </w:pPr>
+            <w:r>
+              <w:rPr>
+                <w:rFonts w:ascii="Calibri" w:cs="Calibri" w:eastAsia="Calibri" w:hAnsi="Calibri"/>
+                <w:color w:val="14213D"/>
+                <w:sz w:val="20"/>
+                <w:szCs w:val="20"/>
+              </w:rPr>
+              <w:t xml:space="preserve"/>
+            </w:r>
+          </w:p>
+          <w:p>
+            <w:pPr>
+              <w:spacing w:after="40"/>
+            </w:pPr>
+            <w:r>
+              <w:rPr>
+                <w:rFonts w:ascii="Calibri" w:cs="Calibri" w:eastAsia="Calibri" w:hAnsi="Calibri"/>
+                <w:color w:val="14213D"/>
+                <w:sz w:val="20"/>
+                <w:szCs w:val="20"/>
+              </w:rPr>
+              <w:t xml:space="preserve"/>
+            </w:r>
+          </w:p>
+        </w:tc>
+      </w:tr>
+    </w:tbl>
+    <w:p>
+      <w:pPr>
+        <w:pStyle w:val="Heading1"/>
+        <w:spacing w:after="120" w:before="320"/>
+      </w:pPr>
+      <w:r>
+        <w:rPr>
+          <w:rFonts w:ascii="Calibri" w:cs="Calibri" w:eastAsia="Calibri" w:hAnsi="Calibri"/>
+          <w:b/>
+          <w:bCs/>
+          <w:color w:val="EB6834"/>
+          <w:sz w:val="30"/>
+          <w:szCs w:val="30"/>
+        </w:rPr>
+        <w:t xml:space="preserve">S · Commerce : lecture des pièces et points techniques (tes retours du 13/10)</w:t>
+      </w:r>
+    </w:p>
+    <w:p>
+      <w:pPr>
+        <w:spacing w:after="80" w:line="264"/>
+      </w:pPr>
+      <w:r>
+        <w:rPr>
+          <w:rFonts w:ascii="Calibri" w:cs="Calibri" w:eastAsia="Calibri" w:hAnsi="Calibri"/>
+          <w:color w:val="6B6B66"/>
+          <w:sz w:val="20"/>
+          <w:szCs w:val="20"/>
+        </w:rPr>
+        <w:t xml:space="preserve">Cadrage : 5 lots ; les lots 1 (lecture) et 2 (points techniques) sont livrés ici. Tout est testé hors connexion ; à vérifier par toi sur un vrai dossier.</w:t>
+      </w:r>
+    </w:p>
+    <w:tbl>
+      <w:tblPr>
+        <w:tblW w:type="dxa" w:w="15100"/>
+        <w:tblBorders>
+          <w:top w:val="single" w:color="auto" w:sz="4"/>
+          <w:left w:val="single" w:color="auto" w:sz="4"/>
+          <w:bottom w:val="single" w:color="auto" w:sz="4"/>
+          <w:right w:val="single" w:color="auto" w:sz="4"/>
+          <w:insideH w:val="single" w:color="auto" w:sz="4"/>
+          <w:insideV w:val="single" w:color="auto" w:sz="4"/>
+        </w:tblBorders>
+      </w:tblPr>
+      <w:tblGrid>
+        <w:gridCol w:w="2300"/>
+        <w:gridCol w:w="4100"/>
+        <w:gridCol w:w="3700"/>
+        <w:gridCol w:w="1300"/>
+        <w:gridCol w:w="3700"/>
+      </w:tblGrid>
+      <w:tr>
+        <w:trPr>
+          <w:tblHeader/>
+        </w:trPr>
+        <w:tc>
+          <w:tcPr>
+            <w:tcW w:type="dxa" w:w="2300"/>
+            <w:tcBorders>
+              <w:top w:val="single" w:color="D9D5CB" w:sz="4"/>
+              <w:left w:val="single" w:color="D9D5CB" w:sz="4"/>
+              <w:bottom w:val="single" w:color="D9D5CB" w:sz="4"/>
+              <w:right w:val="single" w:color="D9D5CB" w:sz="4"/>
+            </w:tcBorders>
+            <w:shd w:fill="14213D" w:color="auto" w:val="clear"/>
+            <w:tcMar>
+              <w:top w:type="dxa" w:w="60"/>
+              <w:left w:type="dxa" w:w="90"/>
+              <w:bottom w:type="dxa" w:w="60"/>
+              <w:right w:type="dxa" w:w="90"/>
+            </w:tcMar>
+            <w:vAlign w:val="top"/>
+          </w:tcPr>
+          <w:p>
+            <w:pPr>
+              <w:spacing w:after="80" w:line="264"/>
+            </w:pPr>
+            <w:r>
+              <w:rPr>
+                <w:rFonts w:ascii="Calibri" w:cs="Calibri" w:eastAsia="Calibri" w:hAnsi="Calibri"/>
+                <w:b/>
+                <w:bCs/>
+                <w:color w:val="FFFFFF"/>
+                <w:sz w:val="19"/>
+                <w:szCs w:val="19"/>
+              </w:rPr>
+              <w:t xml:space="preserve">Fonctionnalité</w:t>
+            </w:r>
+          </w:p>
+        </w:tc>
+        <w:tc>
+          <w:tcPr>
+            <w:tcW w:type="dxa" w:w="4100"/>
+            <w:tcBorders>
+              <w:top w:val="single" w:color="D9D5CB" w:sz="4"/>
+              <w:left w:val="single" w:color="D9D5CB" w:sz="4"/>
+              <w:bottom w:val="single" w:color="D9D5CB" w:sz="4"/>
+              <w:right w:val="single" w:color="D9D5CB" w:sz="4"/>
+            </w:tcBorders>
+            <w:shd w:fill="14213D" w:color="auto" w:val="clear"/>
+            <w:tcMar>
+              <w:top w:type="dxa" w:w="60"/>
+              <w:left w:type="dxa" w:w="90"/>
+              <w:bottom w:type="dxa" w:w="60"/>
+              <w:right w:type="dxa" w:w="90"/>
+            </w:tcMar>
+            <w:vAlign w:val="top"/>
+          </w:tcPr>
+          <w:p>
+            <w:pPr>
+              <w:spacing w:after="80" w:line="264"/>
+            </w:pPr>
+            <w:r>
+              <w:rPr>
+                <w:rFonts w:ascii="Calibri" w:cs="Calibri" w:eastAsia="Calibri" w:hAnsi="Calibri"/>
+                <w:b/>
+                <w:bCs/>
+                <w:color w:val="FFFFFF"/>
+                <w:sz w:val="19"/>
+                <w:szCs w:val="19"/>
+              </w:rPr>
+              <w:t xml:space="preserve">Où la trouver · comment tester</w:t>
+            </w:r>
+          </w:p>
+        </w:tc>
+        <w:tc>
+          <w:tcPr>
+            <w:tcW w:type="dxa" w:w="3700"/>
+            <w:tcBorders>
+              <w:top w:val="single" w:color="D9D5CB" w:sz="4"/>
+              <w:left w:val="single" w:color="D9D5CB" w:sz="4"/>
+              <w:bottom w:val="single" w:color="D9D5CB" w:sz="4"/>
+              <w:right w:val="single" w:color="D9D5CB" w:sz="4"/>
+            </w:tcBorders>
+            <w:shd w:fill="14213D" w:color="auto" w:val="clear"/>
+            <w:tcMar>
+              <w:top w:type="dxa" w:w="60"/>
+              <w:left w:type="dxa" w:w="90"/>
+              <w:bottom w:type="dxa" w:w="60"/>
+              <w:right w:type="dxa" w:w="90"/>
+            </w:tcMar>
+            <w:vAlign w:val="top"/>
+          </w:tcPr>
+          <w:p>
+            <w:pPr>
+              <w:spacing w:after="80" w:line="264"/>
+            </w:pPr>
+            <w:r>
+              <w:rPr>
+                <w:rFonts w:ascii="Calibri" w:cs="Calibri" w:eastAsia="Calibri" w:hAnsi="Calibri"/>
+                <w:b/>
+                <w:bCs/>
+                <w:color w:val="FFFFFF"/>
+                <w:sz w:val="19"/>
+                <w:szCs w:val="19"/>
+              </w:rPr>
+              <w:t xml:space="preserve">Hypothèses · limites · ce que j'ai tranché</w:t>
+            </w:r>
+          </w:p>
+        </w:tc>
+        <w:tc>
+          <w:tcPr>
+            <w:tcW w:type="dxa" w:w="1300"/>
+            <w:tcBorders>
+              <w:top w:val="single" w:color="D9D5CB" w:sz="4"/>
+              <w:left w:val="single" w:color="D9D5CB" w:sz="4"/>
+              <w:bottom w:val="single" w:color="D9D5CB" w:sz="4"/>
+              <w:right w:val="single" w:color="D9D5CB" w:sz="4"/>
+            </w:tcBorders>
+            <w:shd w:fill="14213D" w:color="auto" w:val="clear"/>
+            <w:tcMar>
+              <w:top w:type="dxa" w:w="60"/>
+              <w:left w:type="dxa" w:w="90"/>
+              <w:bottom w:type="dxa" w:w="60"/>
+              <w:right w:type="dxa" w:w="90"/>
+            </w:tcMar>
+            <w:vAlign w:val="top"/>
+          </w:tcPr>
+          <w:p>
+            <w:pPr>
+              <w:spacing w:after="80" w:line="264"/>
+            </w:pPr>
+            <w:r>
+              <w:rPr>
+                <w:rFonts w:ascii="Calibri" w:cs="Calibri" w:eastAsia="Calibri" w:hAnsi="Calibri"/>
+                <w:b/>
+                <w:bCs/>
+                <w:color w:val="FFFFFF"/>
+                <w:sz w:val="19"/>
+                <w:szCs w:val="19"/>
+              </w:rPr>
+              <w:t xml:space="preserve">Statut</w:t>
+            </w:r>
+          </w:p>
+        </w:tc>
+        <w:tc>
+          <w:tcPr>
+            <w:tcW w:type="dxa" w:w="3700"/>
+            <w:tcBorders>
+              <w:top w:val="single" w:color="D9D5CB" w:sz="4"/>
+              <w:left w:val="single" w:color="D9D5CB" w:sz="4"/>
+              <w:bottom w:val="single" w:color="D9D5CB" w:sz="4"/>
+              <w:right w:val="single" w:color="D9D5CB" w:sz="4"/>
+            </w:tcBorders>
+            <w:shd w:fill="14213D" w:color="auto" w:val="clear"/>
+            <w:tcMar>
+              <w:top w:type="dxa" w:w="60"/>
+              <w:left w:type="dxa" w:w="90"/>
+              <w:bottom w:type="dxa" w:w="60"/>
+              <w:right w:type="dxa" w:w="90"/>
+            </w:tcMar>
+            <w:vAlign w:val="top"/>
+          </w:tcPr>
+          <w:p>
+            <w:pPr>
+              <w:spacing w:after="80" w:line="264"/>
+            </w:pPr>
+            <w:r>
+              <w:rPr>
+                <w:rFonts w:ascii="Calibri" w:cs="Calibri" w:eastAsia="Calibri" w:hAnsi="Calibri"/>
+                <w:b/>
+                <w:bCs/>
+                <w:color w:val="FFFFFF"/>
+                <w:sz w:val="19"/>
+                <w:szCs w:val="19"/>
+              </w:rPr>
+              <w:t xml:space="preserve">Vos commentaires</w:t>
+            </w:r>
+          </w:p>
+        </w:tc>
+      </w:tr>
+      <w:tr>
+        <w:tc>
+          <w:tcPr>
+            <w:tcW w:type="dxa" w:w="2300"/>
+            <w:tcBorders>
+              <w:top w:val="single" w:color="D9D5CB" w:sz="4"/>
+              <w:left w:val="single" w:color="D9D5CB" w:sz="4"/>
+              <w:bottom w:val="single" w:color="D9D5CB" w:sz="4"/>
+              <w:right w:val="single" w:color="D9D5CB" w:sz="4"/>
+            </w:tcBorders>
+            <w:tcMar>
+              <w:top w:type="dxa" w:w="60"/>
+              <w:left w:type="dxa" w:w="90"/>
+              <w:bottom w:type="dxa" w:w="60"/>
+              <w:right w:type="dxa" w:w="90"/>
+            </w:tcMar>
+            <w:vAlign w:val="top"/>
+          </w:tcPr>
+          <w:p>
+            <w:pPr>
+              <w:spacing w:after="40"/>
+            </w:pPr>
+            <w:r>
+              <w:rPr>
+                <w:rFonts w:ascii="Calibri" w:cs="Calibri" w:eastAsia="Calibri" w:hAnsi="Calibri"/>
+                <w:b/>
+                <w:bCs/>
+                <w:color w:val="14213D"/>
+                <w:sz w:val="20"/>
+                <w:szCs w:val="20"/>
+              </w:rPr>
+              <w:t xml:space="preserve">La pièce occupe la hauteur de l'écran</w:t>
+            </w:r>
+          </w:p>
+        </w:tc>
+        <w:tc>
+          <w:tcPr>
+            <w:tcW w:type="dxa" w:w="4100"/>
+            <w:tcBorders>
+              <w:top w:val="single" w:color="D9D5CB" w:sz="4"/>
+              <w:left w:val="single" w:color="D9D5CB" w:sz="4"/>
+              <w:bottom w:val="single" w:color="D9D5CB" w:sz="4"/>
+              <w:right w:val="single" w:color="D9D5CB" w:sz="4"/>
+            </w:tcBorders>
+            <w:tcMar>
+              <w:top w:type="dxa" w:w="60"/>
+              <w:left w:type="dxa" w:w="90"/>
+              <w:bottom w:type="dxa" w:w="60"/>
+              <w:right w:type="dxa" w:w="90"/>
+            </w:tcMar>
+            <w:vAlign w:val="top"/>
+          </w:tcPr>
+          <w:p>
+            <w:pPr>
+              <w:spacing w:after="40"/>
+            </w:pPr>
+            <w:r>
+              <w:rPr>
+                <w:rFonts w:ascii="Calibri" w:cs="Calibri" w:eastAsia="Calibri" w:hAnsi="Calibri"/>
+                <w:color w:val="14213D"/>
+                <w:sz w:val="19"/>
+                <w:szCs w:val="19"/>
+              </w:rPr>
+              <w:t xml:space="preserve">Commerce → une affaire → 2 · Lecture : la pièce prend toute la hauteur. ⤢ = plein écran (la pièce à gauche, les notes à droite), Échap pour sortir. ↕ page entière / ↔ pleine largeur ; + et − redessinent la page (net, même un plan).</w:t>
+            </w:r>
+          </w:p>
+        </w:tc>
+        <w:tc>
+          <w:tcPr>
+            <w:tcW w:type="dxa" w:w="3700"/>
+            <w:tcBorders>
+              <w:top w:val="single" w:color="D9D5CB" w:sz="4"/>
+              <w:left w:val="single" w:color="D9D5CB" w:sz="4"/>
+              <w:bottom w:val="single" w:color="D9D5CB" w:sz="4"/>
+              <w:right w:val="single" w:color="D9D5CB" w:sz="4"/>
+            </w:tcBorders>
+            <w:tcMar>
+              <w:top w:type="dxa" w:w="60"/>
+              <w:left w:type="dxa" w:w="90"/>
+              <w:bottom w:type="dxa" w:w="60"/>
+              <w:right w:type="dxa" w:w="90"/>
+            </w:tcMar>
+            <w:vAlign w:val="top"/>
+          </w:tcPr>
+          <w:p>
+            <w:pPr>
+              <w:spacing w:after="40"/>
+            </w:pPr>
+            <w:r>
+              <w:rPr>
+                <w:rFonts w:ascii="Calibri" w:cs="Calibri" w:eastAsia="Calibri" w:hAnsi="Calibri"/>
+                <w:color w:val="14213D"/>
+                <w:sz w:val="19"/>
+                <w:szCs w:val="19"/>
+              </w:rPr>
+              <w:t xml:space="preserve">Plans : page entière par défaut. Ton dernier choix est retenu, pièce par pièce. Sur PC, l'affichage large (⤢ en haut de l'appli) donne la pièce et les notes côte à côte.</w:t>
+            </w:r>
+          </w:p>
+        </w:tc>
+        <w:tc>
+          <w:tcPr>
+            <w:tcW w:type="dxa" w:w="1300"/>
+            <w:tcBorders>
+              <w:top w:val="single" w:color="D9D5CB" w:sz="4"/>
+              <w:left w:val="single" w:color="D9D5CB" w:sz="4"/>
+              <w:bottom w:val="single" w:color="D9D5CB" w:sz="4"/>
+              <w:right w:val="single" w:color="D9D5CB" w:sz="4"/>
+            </w:tcBorders>
+            <w:shd w:fill="E6F5EC" w:color="auto" w:val="clear"/>
+            <w:tcMar>
+              <w:top w:type="dxa" w:w="60"/>
+              <w:left w:type="dxa" w:w="90"/>
+              <w:bottom w:type="dxa" w:w="60"/>
+              <w:right w:type="dxa" w:w="90"/>
+            </w:tcMar>
+            <w:vAlign w:val="top"/>
+          </w:tcPr>
+          <w:p>
+            <w:pPr>
+              <w:spacing w:after="40"/>
+            </w:pPr>
+            <w:r>
+              <w:rPr>
+                <w:rFonts w:ascii="Calibri" w:cs="Calibri" w:eastAsia="Calibri" w:hAnsi="Calibri"/>
+                <w:b/>
+                <w:bCs/>
+                <w:color w:val="14213D"/>
+                <w:sz w:val="19"/>
+                <w:szCs w:val="19"/>
+              </w:rPr>
+              <w:t xml:space="preserve">Fait</w:t>
+            </w:r>
+          </w:p>
+        </w:tc>
+        <w:tc>
+          <w:tcPr>
+            <w:tcW w:type="dxa" w:w="3700"/>
+            <w:tcBorders>
+              <w:top w:val="single" w:color="D9D5CB" w:sz="4"/>
+              <w:left w:val="single" w:color="D9D5CB" w:sz="4"/>
+              <w:bottom w:val="single" w:color="D9D5CB" w:sz="4"/>
+              <w:right w:val="single" w:color="D9D5CB" w:sz="4"/>
+            </w:tcBorders>
+            <w:tcMar>
+              <w:top w:type="dxa" w:w="60"/>
+              <w:left w:type="dxa" w:w="90"/>
+              <w:bottom w:type="dxa" w:w="60"/>
+              <w:right w:type="dxa" w:w="90"/>
+            </w:tcMar>
+            <w:vAlign w:val="top"/>
+          </w:tcPr>
+          <w:p>
+            <w:pPr>
+              <w:spacing w:after="40"/>
+            </w:pPr>
+            <w:r>
+              <w:rPr>
+                <w:rFonts w:ascii="Calibri" w:cs="Calibri" w:eastAsia="Calibri" w:hAnsi="Calibri"/>
+                <w:color w:val="14213D"/>
+                <w:sz w:val="20"/>
+                <w:szCs w:val="20"/>
+              </w:rPr>
+              <w:t xml:space="preserve"/>
+            </w:r>
+          </w:p>
+          <w:p>
+            <w:pPr>
+              <w:spacing w:after="40"/>
+            </w:pPr>
+            <w:r>
+              <w:rPr>
+                <w:rFonts w:ascii="Calibri" w:cs="Calibri" w:eastAsia="Calibri" w:hAnsi="Calibri"/>
+                <w:color w:val="14213D"/>
+                <w:sz w:val="20"/>
+                <w:szCs w:val="20"/>
+              </w:rPr>
+              <w:t xml:space="preserve"/>
+            </w:r>
+          </w:p>
+        </w:tc>
+      </w:tr>
+      <w:tr>
+        <w:tc>
+          <w:tcPr>
+            <w:tcW w:type="dxa" w:w="2300"/>
+            <w:tcBorders>
+              <w:top w:val="single" w:color="D9D5CB" w:sz="4"/>
+              <w:left w:val="single" w:color="D9D5CB" w:sz="4"/>
+              <w:bottom w:val="single" w:color="D9D5CB" w:sz="4"/>
+              <w:right w:val="single" w:color="D9D5CB" w:sz="4"/>
+            </w:tcBorders>
+            <w:tcMar>
+              <w:top w:type="dxa" w:w="60"/>
+              <w:left w:type="dxa" w:w="90"/>
+              <w:bottom w:type="dxa" w:w="60"/>
+              <w:right w:type="dxa" w:w="90"/>
+            </w:tcMar>
+            <w:vAlign w:val="top"/>
+          </w:tcPr>
+          <w:p>
+            <w:pPr>
+              <w:spacing w:after="40"/>
+            </w:pPr>
+            <w:r>
+              <w:rPr>
+                <w:rFonts w:ascii="Calibri" w:cs="Calibri" w:eastAsia="Calibri" w:hAnsi="Calibri"/>
+                <w:b/>
+                <w:bCs/>
+                <w:color w:val="14213D"/>
+                <w:sz w:val="20"/>
+                <w:szCs w:val="20"/>
+              </w:rPr>
+              <w:t xml:space="preserve">Tourner une pièce (plan PDF, scan, photo)</w:t>
+            </w:r>
+          </w:p>
+        </w:tc>
+        <w:tc>
+          <w:tcPr>
+            <w:tcW w:type="dxa" w:w="4100"/>
+            <w:tcBorders>
+              <w:top w:val="single" w:color="D9D5CB" w:sz="4"/>
+              <w:left w:val="single" w:color="D9D5CB" w:sz="4"/>
+              <w:bottom w:val="single" w:color="D9D5CB" w:sz="4"/>
+              <w:right w:val="single" w:color="D9D5CB" w:sz="4"/>
+            </w:tcBorders>
+            <w:tcMar>
+              <w:top w:type="dxa" w:w="60"/>
+              <w:left w:type="dxa" w:w="90"/>
+              <w:bottom w:type="dxa" w:w="60"/>
+              <w:right w:type="dxa" w:w="90"/>
+            </w:tcMar>
+            <w:vAlign w:val="top"/>
+          </w:tcPr>
+          <w:p>
+            <w:pPr>
+              <w:spacing w:after="40"/>
+            </w:pPr>
+            <w:r>
+              <w:rPr>
+                <w:rFonts w:ascii="Calibri" w:cs="Calibri" w:eastAsia="Calibri" w:hAnsi="Calibri"/>
+                <w:color w:val="14213D"/>
+                <w:sz w:val="19"/>
+                <w:szCs w:val="19"/>
+              </w:rPr>
+              <w:t xml:space="preserve">⟳ dans la barre de la pièce : un quart de tour à chaque appui. C'est gardé sur la pièce, pour tout le monde. Tes surlignages tournent avec.</w:t>
+            </w:r>
+          </w:p>
+        </w:tc>
+        <w:tc>
+          <w:tcPr>
+            <w:tcW w:type="dxa" w:w="3700"/>
+            <w:tcBorders>
+              <w:top w:val="single" w:color="D9D5CB" w:sz="4"/>
+              <w:left w:val="single" w:color="D9D5CB" w:sz="4"/>
+              <w:bottom w:val="single" w:color="D9D5CB" w:sz="4"/>
+              <w:right w:val="single" w:color="D9D5CB" w:sz="4"/>
+            </w:tcBorders>
+            <w:tcMar>
+              <w:top w:type="dxa" w:w="60"/>
+              <w:left w:type="dxa" w:w="90"/>
+              <w:bottom w:type="dxa" w:w="60"/>
+              <w:right w:type="dxa" w:w="90"/>
+            </w:tcMar>
+            <w:vAlign w:val="top"/>
+          </w:tcPr>
+          <w:p>
+            <w:pPr>
+              <w:spacing w:after="40"/>
+            </w:pPr>
+            <w:r>
+              <w:rPr>
+                <w:rFonts w:ascii="Calibri" w:cs="Calibri" w:eastAsia="Calibri" w:hAnsi="Calibri"/>
+                <w:color w:val="14213D"/>
+                <w:sz w:val="19"/>
+                <w:szCs w:val="19"/>
+              </w:rPr>
+              <w:t xml:space="preserve">Une note posée sur une pièce tournée reste juste quand on la remet droite (testé).</w:t>
+            </w:r>
+          </w:p>
+        </w:tc>
+        <w:tc>
+          <w:tcPr>
+            <w:tcW w:type="dxa" w:w="1300"/>
+            <w:tcBorders>
+              <w:top w:val="single" w:color="D9D5CB" w:sz="4"/>
+              <w:left w:val="single" w:color="D9D5CB" w:sz="4"/>
+              <w:bottom w:val="single" w:color="D9D5CB" w:sz="4"/>
+              <w:right w:val="single" w:color="D9D5CB" w:sz="4"/>
+            </w:tcBorders>
+            <w:shd w:fill="E6F5EC" w:color="auto" w:val="clear"/>
+            <w:tcMar>
+              <w:top w:type="dxa" w:w="60"/>
+              <w:left w:type="dxa" w:w="90"/>
+              <w:bottom w:type="dxa" w:w="60"/>
+              <w:right w:type="dxa" w:w="90"/>
+            </w:tcMar>
+            <w:vAlign w:val="top"/>
+          </w:tcPr>
+          <w:p>
+            <w:pPr>
+              <w:spacing w:after="40"/>
+            </w:pPr>
+            <w:r>
+              <w:rPr>
+                <w:rFonts w:ascii="Calibri" w:cs="Calibri" w:eastAsia="Calibri" w:hAnsi="Calibri"/>
+                <w:b/>
+                <w:bCs/>
+                <w:color w:val="14213D"/>
+                <w:sz w:val="19"/>
+                <w:szCs w:val="19"/>
+              </w:rPr>
+              <w:t xml:space="preserve">Fait</w:t>
+            </w:r>
+          </w:p>
+        </w:tc>
+        <w:tc>
+          <w:tcPr>
+            <w:tcW w:type="dxa" w:w="3700"/>
+            <w:tcBorders>
+              <w:top w:val="single" w:color="D9D5CB" w:sz="4"/>
+              <w:left w:val="single" w:color="D9D5CB" w:sz="4"/>
+              <w:bottom w:val="single" w:color="D9D5CB" w:sz="4"/>
+              <w:right w:val="single" w:color="D9D5CB" w:sz="4"/>
+            </w:tcBorders>
+            <w:tcMar>
+              <w:top w:type="dxa" w:w="60"/>
+              <w:left w:type="dxa" w:w="90"/>
+              <w:bottom w:type="dxa" w:w="60"/>
+              <w:right w:type="dxa" w:w="90"/>
+            </w:tcMar>
+            <w:vAlign w:val="top"/>
+          </w:tcPr>
+          <w:p>
+            <w:pPr>
+              <w:spacing w:after="40"/>
+            </w:pPr>
+            <w:r>
+              <w:rPr>
+                <w:rFonts w:ascii="Calibri" w:cs="Calibri" w:eastAsia="Calibri" w:hAnsi="Calibri"/>
+                <w:color w:val="14213D"/>
+                <w:sz w:val="20"/>
+                <w:szCs w:val="20"/>
+              </w:rPr>
+              <w:t xml:space="preserve"/>
+            </w:r>
+          </w:p>
+          <w:p>
+            <w:pPr>
+              <w:spacing w:after="40"/>
+            </w:pPr>
+            <w:r>
+              <w:rPr>
+                <w:rFonts w:ascii="Calibri" w:cs="Calibri" w:eastAsia="Calibri" w:hAnsi="Calibri"/>
+                <w:color w:val="14213D"/>
+                <w:sz w:val="20"/>
+                <w:szCs w:val="20"/>
+              </w:rPr>
+              <w:t xml:space="preserve"/>
+            </w:r>
+          </w:p>
+        </w:tc>
+      </w:tr>
+      <w:tr>
+        <w:tc>
+          <w:tcPr>
+            <w:tcW w:type="dxa" w:w="2300"/>
+            <w:tcBorders>
+              <w:top w:val="single" w:color="D9D5CB" w:sz="4"/>
+              <w:left w:val="single" w:color="D9D5CB" w:sz="4"/>
+              <w:bottom w:val="single" w:color="D9D5CB" w:sz="4"/>
+              <w:right w:val="single" w:color="D9D5CB" w:sz="4"/>
+            </w:tcBorders>
+            <w:tcMar>
+              <w:top w:type="dxa" w:w="60"/>
+              <w:left w:type="dxa" w:w="90"/>
+              <w:bottom w:type="dxa" w:w="60"/>
+              <w:right w:type="dxa" w:w="90"/>
+            </w:tcMar>
+            <w:vAlign w:val="top"/>
+          </w:tcPr>
+          <w:p>
+            <w:pPr>
+              <w:spacing w:after="40"/>
+            </w:pPr>
+            <w:r>
+              <w:rPr>
+                <w:rFonts w:ascii="Calibri" w:cs="Calibri" w:eastAsia="Calibri" w:hAnsi="Calibri"/>
+                <w:b/>
+                <w:bCs/>
+                <w:color w:val="14213D"/>
+                <w:sz w:val="20"/>
+                <w:szCs w:val="20"/>
+              </w:rPr>
+              <w:t xml:space="preserve">▭ Encadrer une zone d'un plan</w:t>
+            </w:r>
+          </w:p>
+        </w:tc>
+        <w:tc>
+          <w:tcPr>
+            <w:tcW w:type="dxa" w:w="4100"/>
+            <w:tcBorders>
+              <w:top w:val="single" w:color="D9D5CB" w:sz="4"/>
+              <w:left w:val="single" w:color="D9D5CB" w:sz="4"/>
+              <w:bottom w:val="single" w:color="D9D5CB" w:sz="4"/>
+              <w:right w:val="single" w:color="D9D5CB" w:sz="4"/>
+            </w:tcBorders>
+            <w:tcMar>
+              <w:top w:type="dxa" w:w="60"/>
+              <w:left w:type="dxa" w:w="90"/>
+              <w:bottom w:type="dxa" w:w="60"/>
+              <w:right w:type="dxa" w:w="90"/>
+            </w:tcMar>
+            <w:vAlign w:val="top"/>
+          </w:tcPr>
+          <w:p>
+            <w:pPr>
+              <w:spacing w:after="40"/>
+            </w:pPr>
+            <w:r>
+              <w:rPr>
+                <w:rFonts w:ascii="Calibri" w:cs="Calibri" w:eastAsia="Calibri" w:hAnsi="Calibri"/>
+                <w:color w:val="14213D"/>
+                <w:sz w:val="19"/>
+                <w:szCs w:val="19"/>
+              </w:rPr>
+              <w:t xml:space="preserve">▭ puis appuie et fais glisser sur le plan : la zone est encadrée → note (titre, pour qui). Marche sur les scans sans texte.</w:t>
+            </w:r>
+          </w:p>
+        </w:tc>
+        <w:tc>
+          <w:tcPr>
+            <w:tcW w:type="dxa" w:w="3700"/>
+            <w:tcBorders>
+              <w:top w:val="single" w:color="D9D5CB" w:sz="4"/>
+              <w:left w:val="single" w:color="D9D5CB" w:sz="4"/>
+              <w:bottom w:val="single" w:color="D9D5CB" w:sz="4"/>
+              <w:right w:val="single" w:color="D9D5CB" w:sz="4"/>
+            </w:tcBorders>
+            <w:tcMar>
+              <w:top w:type="dxa" w:w="60"/>
+              <w:left w:type="dxa" w:w="90"/>
+              <w:bottom w:type="dxa" w:w="60"/>
+              <w:right w:type="dxa" w:w="90"/>
+            </w:tcMar>
+            <w:vAlign w:val="top"/>
+          </w:tcPr>
+          <w:p>
+            <w:pPr>
+              <w:spacing w:after="40"/>
+            </w:pPr>
+            <w:r>
+              <w:rPr>
+                <w:rFonts w:ascii="Calibri" w:cs="Calibri" w:eastAsia="Calibri" w:hAnsi="Calibri"/>
+                <w:color w:val="14213D"/>
+                <w:sz w:val="19"/>
+                <w:szCs w:val="19"/>
+              </w:rPr>
+              <w:t xml:space="preserve"/>
+            </w:r>
+          </w:p>
+        </w:tc>
+        <w:tc>
+          <w:tcPr>
+            <w:tcW w:type="dxa" w:w="1300"/>
+            <w:tcBorders>
+              <w:top w:val="single" w:color="D9D5CB" w:sz="4"/>
+              <w:left w:val="single" w:color="D9D5CB" w:sz="4"/>
+              <w:bottom w:val="single" w:color="D9D5CB" w:sz="4"/>
+              <w:right w:val="single" w:color="D9D5CB" w:sz="4"/>
+            </w:tcBorders>
+            <w:shd w:fill="E6F5EC" w:color="auto" w:val="clear"/>
+            <w:tcMar>
+              <w:top w:type="dxa" w:w="60"/>
+              <w:left w:type="dxa" w:w="90"/>
+              <w:bottom w:type="dxa" w:w="60"/>
+              <w:right w:type="dxa" w:w="90"/>
+            </w:tcMar>
+            <w:vAlign w:val="top"/>
+          </w:tcPr>
+          <w:p>
+            <w:pPr>
+              <w:spacing w:after="40"/>
+            </w:pPr>
+            <w:r>
+              <w:rPr>
+                <w:rFonts w:ascii="Calibri" w:cs="Calibri" w:eastAsia="Calibri" w:hAnsi="Calibri"/>
+                <w:b/>
+                <w:bCs/>
+                <w:color w:val="14213D"/>
+                <w:sz w:val="19"/>
+                <w:szCs w:val="19"/>
+              </w:rPr>
+              <w:t xml:space="preserve">Fait</w:t>
+            </w:r>
+          </w:p>
+        </w:tc>
+        <w:tc>
+          <w:tcPr>
+            <w:tcW w:type="dxa" w:w="3700"/>
+            <w:tcBorders>
+              <w:top w:val="single" w:color="D9D5CB" w:sz="4"/>
+              <w:left w:val="single" w:color="D9D5CB" w:sz="4"/>
+              <w:bottom w:val="single" w:color="D9D5CB" w:sz="4"/>
+              <w:right w:val="single" w:color="D9D5CB" w:sz="4"/>
+            </w:tcBorders>
+            <w:tcMar>
+              <w:top w:type="dxa" w:w="60"/>
+              <w:left w:type="dxa" w:w="90"/>
+              <w:bottom w:type="dxa" w:w="60"/>
+              <w:right w:type="dxa" w:w="90"/>
+            </w:tcMar>
+            <w:vAlign w:val="top"/>
+          </w:tcPr>
+          <w:p>
+            <w:pPr>
+              <w:spacing w:after="40"/>
+            </w:pPr>
+            <w:r>
+              <w:rPr>
+                <w:rFonts w:ascii="Calibri" w:cs="Calibri" w:eastAsia="Calibri" w:hAnsi="Calibri"/>
+                <w:color w:val="14213D"/>
+                <w:sz w:val="20"/>
+                <w:szCs w:val="20"/>
+              </w:rPr>
+              <w:t xml:space="preserve"/>
+            </w:r>
+          </w:p>
+          <w:p>
+            <w:pPr>
+              <w:spacing w:after="40"/>
+            </w:pPr>
+            <w:r>
+              <w:rPr>
+                <w:rFonts w:ascii="Calibri" w:cs="Calibri" w:eastAsia="Calibri" w:hAnsi="Calibri"/>
+                <w:color w:val="14213D"/>
+                <w:sz w:val="20"/>
+                <w:szCs w:val="20"/>
+              </w:rPr>
+              <w:t xml:space="preserve"/>
+            </w:r>
+          </w:p>
+        </w:tc>
+      </w:tr>
+      <w:tr>
+        <w:tc>
+          <w:tcPr>
+            <w:tcW w:type="dxa" w:w="2300"/>
+            <w:tcBorders>
+              <w:top w:val="single" w:color="D9D5CB" w:sz="4"/>
+              <w:left w:val="single" w:color="D9D5CB" w:sz="4"/>
+              <w:bottom w:val="single" w:color="D9D5CB" w:sz="4"/>
+              <w:right w:val="single" w:color="D9D5CB" w:sz="4"/>
+            </w:tcBorders>
+            <w:tcMar>
+              <w:top w:type="dxa" w:w="60"/>
+              <w:left w:type="dxa" w:w="90"/>
+              <w:bottom w:type="dxa" w:w="60"/>
+              <w:right w:type="dxa" w:w="90"/>
+            </w:tcMar>
+            <w:vAlign w:val="top"/>
+          </w:tcPr>
+          <w:p>
+            <w:pPr>
+              <w:spacing w:after="40"/>
+            </w:pPr>
+            <w:r>
+              <w:rPr>
+                <w:rFonts w:ascii="Calibri" w:cs="Calibri" w:eastAsia="Calibri" w:hAnsi="Calibri"/>
+                <w:b/>
+                <w:bCs/>
+                <w:color w:val="14213D"/>
+                <w:sz w:val="20"/>
+                <w:szCs w:val="20"/>
+              </w:rPr>
+              <w:t xml:space="preserve">Les notes : le titre, le déroulant, la recherche</w:t>
+            </w:r>
+          </w:p>
+        </w:tc>
+        <w:tc>
+          <w:tcPr>
+            <w:tcW w:type="dxa" w:w="4100"/>
+            <w:tcBorders>
+              <w:top w:val="single" w:color="D9D5CB" w:sz="4"/>
+              <w:left w:val="single" w:color="D9D5CB" w:sz="4"/>
+              <w:bottom w:val="single" w:color="D9D5CB" w:sz="4"/>
+              <w:right w:val="single" w:color="D9D5CB" w:sz="4"/>
+            </w:tcBorders>
+            <w:tcMar>
+              <w:top w:type="dxa" w:w="60"/>
+              <w:left w:type="dxa" w:w="90"/>
+              <w:bottom w:type="dxa" w:w="60"/>
+              <w:right w:type="dxa" w:w="90"/>
+            </w:tcMar>
+            <w:vAlign w:val="top"/>
+          </w:tcPr>
+          <w:p>
+            <w:pPr>
+              <w:spacing w:after="40"/>
+            </w:pPr>
+            <w:r>
+              <w:rPr>
+                <w:rFonts w:ascii="Calibri" w:cs="Calibri" w:eastAsia="Calibri" w:hAnsi="Calibri"/>
+                <w:color w:val="14213D"/>
+                <w:sz w:val="19"/>
+                <w:szCs w:val="19"/>
+              </w:rPr>
+              <w:t xml:space="preserve">Surligne un passage : le 1er champ = ta note = le TITRE de la note (en gras dans la liste) ; le passage est en dessous. Les notes sont repliées (une ligne chacune), ▾ déplier pour tout ouvrir. 🔍 au-dessus de la liste : cherche dans les notes. ✎ Modifier dans une note dépliée.</w:t>
+            </w:r>
+          </w:p>
+        </w:tc>
+        <w:tc>
+          <w:tcPr>
+            <w:tcW w:type="dxa" w:w="3700"/>
+            <w:tcBorders>
+              <w:top w:val="single" w:color="D9D5CB" w:sz="4"/>
+              <w:left w:val="single" w:color="D9D5CB" w:sz="4"/>
+              <w:bottom w:val="single" w:color="D9D5CB" w:sz="4"/>
+              <w:right w:val="single" w:color="D9D5CB" w:sz="4"/>
+            </w:tcBorders>
+            <w:tcMar>
+              <w:top w:type="dxa" w:w="60"/>
+              <w:left w:type="dxa" w:w="90"/>
+              <w:bottom w:type="dxa" w:w="60"/>
+              <w:right w:type="dxa" w:w="90"/>
+            </w:tcMar>
+            <w:vAlign w:val="top"/>
+          </w:tcPr>
+          <w:p>
+            <w:pPr>
+              <w:spacing w:after="40"/>
+            </w:pPr>
+            <w:r>
+              <w:rPr>
+                <w:rFonts w:ascii="Calibri" w:cs="Calibri" w:eastAsia="Calibri" w:hAnsi="Calibri"/>
+                <w:color w:val="14213D"/>
+                <w:sz w:val="19"/>
+                <w:szCs w:val="19"/>
+              </w:rPr>
+              <w:t xml:space="preserve">Dans le chiffrage et le mémoire, la liste « à barrer » affiche aussi le titre.</w:t>
+            </w:r>
+          </w:p>
+        </w:tc>
+        <w:tc>
+          <w:tcPr>
+            <w:tcW w:type="dxa" w:w="1300"/>
+            <w:tcBorders>
+              <w:top w:val="single" w:color="D9D5CB" w:sz="4"/>
+              <w:left w:val="single" w:color="D9D5CB" w:sz="4"/>
+              <w:bottom w:val="single" w:color="D9D5CB" w:sz="4"/>
+              <w:right w:val="single" w:color="D9D5CB" w:sz="4"/>
+            </w:tcBorders>
+            <w:shd w:fill="E6F5EC" w:color="auto" w:val="clear"/>
+            <w:tcMar>
+              <w:top w:type="dxa" w:w="60"/>
+              <w:left w:type="dxa" w:w="90"/>
+              <w:bottom w:type="dxa" w:w="60"/>
+              <w:right w:type="dxa" w:w="90"/>
+            </w:tcMar>
+            <w:vAlign w:val="top"/>
+          </w:tcPr>
+          <w:p>
+            <w:pPr>
+              <w:spacing w:after="40"/>
+            </w:pPr>
+            <w:r>
+              <w:rPr>
+                <w:rFonts w:ascii="Calibri" w:cs="Calibri" w:eastAsia="Calibri" w:hAnsi="Calibri"/>
+                <w:b/>
+                <w:bCs/>
+                <w:color w:val="14213D"/>
+                <w:sz w:val="19"/>
+                <w:szCs w:val="19"/>
+              </w:rPr>
+              <w:t xml:space="preserve">Fait</w:t>
+            </w:r>
+          </w:p>
+        </w:tc>
+        <w:tc>
+          <w:tcPr>
+            <w:tcW w:type="dxa" w:w="3700"/>
+            <w:tcBorders>
+              <w:top w:val="single" w:color="D9D5CB" w:sz="4"/>
+              <w:left w:val="single" w:color="D9D5CB" w:sz="4"/>
+              <w:bottom w:val="single" w:color="D9D5CB" w:sz="4"/>
+              <w:right w:val="single" w:color="D9D5CB" w:sz="4"/>
+            </w:tcBorders>
+            <w:tcMar>
+              <w:top w:type="dxa" w:w="60"/>
+              <w:left w:type="dxa" w:w="90"/>
+              <w:bottom w:type="dxa" w:w="60"/>
+              <w:right w:type="dxa" w:w="90"/>
+            </w:tcMar>
+            <w:vAlign w:val="top"/>
+          </w:tcPr>
+          <w:p>
+            <w:pPr>
+              <w:spacing w:after="40"/>
+            </w:pPr>
+            <w:r>
+              <w:rPr>
+                <w:rFonts w:ascii="Calibri" w:cs="Calibri" w:eastAsia="Calibri" w:hAnsi="Calibri"/>
+                <w:color w:val="14213D"/>
+                <w:sz w:val="20"/>
+                <w:szCs w:val="20"/>
+              </w:rPr>
+              <w:t xml:space="preserve"/>
+            </w:r>
+          </w:p>
+          <w:p>
+            <w:pPr>
+              <w:spacing w:after="40"/>
+            </w:pPr>
+            <w:r>
+              <w:rPr>
+                <w:rFonts w:ascii="Calibri" w:cs="Calibri" w:eastAsia="Calibri" w:hAnsi="Calibri"/>
+                <w:color w:val="14213D"/>
+                <w:sz w:val="20"/>
+                <w:szCs w:val="20"/>
+              </w:rPr>
+              <w:t xml:space="preserve"/>
+            </w:r>
+          </w:p>
+        </w:tc>
+      </w:tr>
+      <w:tr>
+        <w:tc>
+          <w:tcPr>
+            <w:tcW w:type="dxa" w:w="2300"/>
+            <w:tcBorders>
+              <w:top w:val="single" w:color="D9D5CB" w:sz="4"/>
+              <w:left w:val="single" w:color="D9D5CB" w:sz="4"/>
+              <w:bottom w:val="single" w:color="D9D5CB" w:sz="4"/>
+              <w:right w:val="single" w:color="D9D5CB" w:sz="4"/>
+            </w:tcBorders>
+            <w:tcMar>
+              <w:top w:type="dxa" w:w="60"/>
+              <w:left w:type="dxa" w:w="90"/>
+              <w:bottom w:type="dxa" w:w="60"/>
+              <w:right w:type="dxa" w:w="90"/>
+            </w:tcMar>
+            <w:vAlign w:val="top"/>
+          </w:tcPr>
+          <w:p>
+            <w:pPr>
+              <w:spacing w:after="40"/>
+            </w:pPr>
+            <w:r>
+              <w:rPr>
+                <w:rFonts w:ascii="Calibri" w:cs="Calibri" w:eastAsia="Calibri" w:hAnsi="Calibri"/>
+                <w:b/>
+                <w:bCs/>
+                <w:color w:val="14213D"/>
+                <w:sz w:val="20"/>
+                <w:szCs w:val="20"/>
+              </w:rPr>
+              <w:t xml:space="preserve">Chercher dans la pièce</w:t>
+            </w:r>
+          </w:p>
+        </w:tc>
+        <w:tc>
+          <w:tcPr>
+            <w:tcW w:type="dxa" w:w="4100"/>
+            <w:tcBorders>
+              <w:top w:val="single" w:color="D9D5CB" w:sz="4"/>
+              <w:left w:val="single" w:color="D9D5CB" w:sz="4"/>
+              <w:bottom w:val="single" w:color="D9D5CB" w:sz="4"/>
+              <w:right w:val="single" w:color="D9D5CB" w:sz="4"/>
+            </w:tcBorders>
+            <w:tcMar>
+              <w:top w:type="dxa" w:w="60"/>
+              <w:left w:type="dxa" w:w="90"/>
+              <w:bottom w:type="dxa" w:w="60"/>
+              <w:right w:type="dxa" w:w="90"/>
+            </w:tcMar>
+            <w:vAlign w:val="top"/>
+          </w:tcPr>
+          <w:p>
+            <w:pPr>
+              <w:spacing w:after="40"/>
+            </w:pPr>
+            <w:r>
+              <w:rPr>
+                <w:rFonts w:ascii="Calibri" w:cs="Calibri" w:eastAsia="Calibri" w:hAnsi="Calibri"/>
+                <w:color w:val="14213D"/>
+                <w:sz w:val="19"/>
+                <w:szCs w:val="19"/>
+              </w:rPr>
+              <w:t xml:space="preserve">🔍 dans la barre de la pièce (ou Ctrl+F avec la souris sur la pièce) : toutes les pages, les résultats surlignés, ‹ › ou Entrée pour passer au suivant.</w:t>
+            </w:r>
+          </w:p>
+        </w:tc>
+        <w:tc>
+          <w:tcPr>
+            <w:tcW w:type="dxa" w:w="3700"/>
+            <w:tcBorders>
+              <w:top w:val="single" w:color="D9D5CB" w:sz="4"/>
+              <w:left w:val="single" w:color="D9D5CB" w:sz="4"/>
+              <w:bottom w:val="single" w:color="D9D5CB" w:sz="4"/>
+              <w:right w:val="single" w:color="D9D5CB" w:sz="4"/>
+            </w:tcBorders>
+            <w:tcMar>
+              <w:top w:type="dxa" w:w="60"/>
+              <w:left w:type="dxa" w:w="90"/>
+              <w:bottom w:type="dxa" w:w="60"/>
+              <w:right w:type="dxa" w:w="90"/>
+            </w:tcMar>
+            <w:vAlign w:val="top"/>
+          </w:tcPr>
+          <w:p>
+            <w:pPr>
+              <w:spacing w:after="40"/>
+            </w:pPr>
+            <w:r>
+              <w:rPr>
+                <w:rFonts w:ascii="Calibri" w:cs="Calibri" w:eastAsia="Calibri" w:hAnsi="Calibri"/>
+                <w:color w:val="14213D"/>
+                <w:sz w:val="19"/>
+                <w:szCs w:val="19"/>
+              </w:rPr>
+              <w:t xml:space="preserve"/>
+            </w:r>
+          </w:p>
+        </w:tc>
+        <w:tc>
+          <w:tcPr>
+            <w:tcW w:type="dxa" w:w="1300"/>
+            <w:tcBorders>
+              <w:top w:val="single" w:color="D9D5CB" w:sz="4"/>
+              <w:left w:val="single" w:color="D9D5CB" w:sz="4"/>
+              <w:bottom w:val="single" w:color="D9D5CB" w:sz="4"/>
+              <w:right w:val="single" w:color="D9D5CB" w:sz="4"/>
+            </w:tcBorders>
+            <w:shd w:fill="E6F5EC" w:color="auto" w:val="clear"/>
+            <w:tcMar>
+              <w:top w:type="dxa" w:w="60"/>
+              <w:left w:type="dxa" w:w="90"/>
+              <w:bottom w:type="dxa" w:w="60"/>
+              <w:right w:type="dxa" w:w="90"/>
+            </w:tcMar>
+            <w:vAlign w:val="top"/>
+          </w:tcPr>
+          <w:p>
+            <w:pPr>
+              <w:spacing w:after="40"/>
+            </w:pPr>
+            <w:r>
+              <w:rPr>
+                <w:rFonts w:ascii="Calibri" w:cs="Calibri" w:eastAsia="Calibri" w:hAnsi="Calibri"/>
+                <w:b/>
+                <w:bCs/>
+                <w:color w:val="14213D"/>
+                <w:sz w:val="19"/>
+                <w:szCs w:val="19"/>
+              </w:rPr>
+              <w:t xml:space="preserve">Fait</w:t>
+            </w:r>
+          </w:p>
+        </w:tc>
+        <w:tc>
+          <w:tcPr>
+            <w:tcW w:type="dxa" w:w="3700"/>
+            <w:tcBorders>
+              <w:top w:val="single" w:color="D9D5CB" w:sz="4"/>
+              <w:left w:val="single" w:color="D9D5CB" w:sz="4"/>
+              <w:bottom w:val="single" w:color="D9D5CB" w:sz="4"/>
+              <w:right w:val="single" w:color="D9D5CB" w:sz="4"/>
+            </w:tcBorders>
+            <w:tcMar>
+              <w:top w:type="dxa" w:w="60"/>
+              <w:left w:type="dxa" w:w="90"/>
+              <w:bottom w:type="dxa" w:w="60"/>
+              <w:right w:type="dxa" w:w="90"/>
+            </w:tcMar>
+            <w:vAlign w:val="top"/>
+          </w:tcPr>
+          <w:p>
+            <w:pPr>
+              <w:spacing w:after="40"/>
+            </w:pPr>
+            <w:r>
+              <w:rPr>
+                <w:rFonts w:ascii="Calibri" w:cs="Calibri" w:eastAsia="Calibri" w:hAnsi="Calibri"/>
+                <w:color w:val="14213D"/>
+                <w:sz w:val="20"/>
+                <w:szCs w:val="20"/>
+              </w:rPr>
+              <w:t xml:space="preserve"/>
+            </w:r>
+          </w:p>
+          <w:p>
+            <w:pPr>
+              <w:spacing w:after="40"/>
+            </w:pPr>
+            <w:r>
+              <w:rPr>
+                <w:rFonts w:ascii="Calibri" w:cs="Calibri" w:eastAsia="Calibri" w:hAnsi="Calibri"/>
+                <w:color w:val="14213D"/>
+                <w:sz w:val="20"/>
+                <w:szCs w:val="20"/>
+              </w:rPr>
+              <w:t xml:space="preserve"/>
+            </w:r>
+          </w:p>
+        </w:tc>
+      </w:tr>
+      <w:tr>
+        <w:tc>
+          <w:tcPr>
+            <w:tcW w:type="dxa" w:w="2300"/>
+            <w:tcBorders>
+              <w:top w:val="single" w:color="D9D5CB" w:sz="4"/>
+              <w:left w:val="single" w:color="D9D5CB" w:sz="4"/>
+              <w:bottom w:val="single" w:color="D9D5CB" w:sz="4"/>
+              <w:right w:val="single" w:color="D9D5CB" w:sz="4"/>
+            </w:tcBorders>
+            <w:tcMar>
+              <w:top w:type="dxa" w:w="60"/>
+              <w:left w:type="dxa" w:w="90"/>
+              <w:bottom w:type="dxa" w:w="60"/>
+              <w:right w:type="dxa" w:w="90"/>
+            </w:tcMar>
+            <w:vAlign w:val="top"/>
+          </w:tcPr>
+          <w:p>
+            <w:pPr>
+              <w:spacing w:after="40"/>
+            </w:pPr>
+            <w:r>
+              <w:rPr>
+                <w:rFonts w:ascii="Calibri" w:cs="Calibri" w:eastAsia="Calibri" w:hAnsi="Calibri"/>
+                <w:b/>
+                <w:bCs/>
+                <w:color w:val="14213D"/>
+                <w:sz w:val="20"/>
+                <w:szCs w:val="20"/>
+              </w:rPr>
+              <w:t xml:space="preserve">Les Word se lisent</w:t>
+            </w:r>
+          </w:p>
+        </w:tc>
+        <w:tc>
+          <w:tcPr>
+            <w:tcW w:type="dxa" w:w="4100"/>
+            <w:tcBorders>
+              <w:top w:val="single" w:color="D9D5CB" w:sz="4"/>
+              <w:left w:val="single" w:color="D9D5CB" w:sz="4"/>
+              <w:bottom w:val="single" w:color="D9D5CB" w:sz="4"/>
+              <w:right w:val="single" w:color="D9D5CB" w:sz="4"/>
+            </w:tcBorders>
+            <w:tcMar>
+              <w:top w:type="dxa" w:w="60"/>
+              <w:left w:type="dxa" w:w="90"/>
+              <w:bottom w:type="dxa" w:w="60"/>
+              <w:right w:type="dxa" w:w="90"/>
+            </w:tcMar>
+            <w:vAlign w:val="top"/>
+          </w:tcPr>
+          <w:p>
+            <w:pPr>
+              <w:spacing w:after="40"/>
+            </w:pPr>
+            <w:r>
+              <w:rPr>
+                <w:rFonts w:ascii="Calibri" w:cs="Calibri" w:eastAsia="Calibri" w:hAnsi="Calibri"/>
+                <w:color w:val="14213D"/>
+                <w:sz w:val="19"/>
+                <w:szCs w:val="19"/>
+              </w:rPr>
+              <w:t xml:space="preserve">Joins un .docx, un .doc (Word 97-2003), un .rtf, un .odt ou un mail Outlook .msg : il s'ouvre, se lit et se surligne comme un PDF. Les titres numérotés (« 4.5 ») servent à la référence d'article de la note.</w:t>
+            </w:r>
+          </w:p>
+        </w:tc>
+        <w:tc>
+          <w:tcPr>
+            <w:tcW w:type="dxa" w:w="3700"/>
+            <w:tcBorders>
+              <w:top w:val="single" w:color="D9D5CB" w:sz="4"/>
+              <w:left w:val="single" w:color="D9D5CB" w:sz="4"/>
+              <w:bottom w:val="single" w:color="D9D5CB" w:sz="4"/>
+              <w:right w:val="single" w:color="D9D5CB" w:sz="4"/>
+            </w:tcBorders>
+            <w:tcMar>
+              <w:top w:type="dxa" w:w="60"/>
+              <w:left w:type="dxa" w:w="90"/>
+              <w:bottom w:type="dxa" w:w="60"/>
+              <w:right w:type="dxa" w:w="90"/>
+            </w:tcMar>
+            <w:vAlign w:val="top"/>
+          </w:tcPr>
+          <w:p>
+            <w:pPr>
+              <w:spacing w:after="40"/>
+            </w:pPr>
+            <w:r>
+              <w:rPr>
+                <w:rFonts w:ascii="Calibri" w:cs="Calibri" w:eastAsia="Calibri" w:hAnsi="Calibri"/>
+                <w:color w:val="14213D"/>
+                <w:sz w:val="19"/>
+                <w:szCs w:val="19"/>
+              </w:rPr>
+              <w:t xml:space="preserve">Cause : l'ancien lecteur laissait passer du code (taquets de tabulation) et ne lisait que le .docx. .doc et .rtf : texte seul (bandeau). Excel 97-2003 (.xls) : pas encore — enregistre en .xlsx.</w:t>
+            </w:r>
+          </w:p>
+        </w:tc>
+        <w:tc>
+          <w:tcPr>
+            <w:tcW w:type="dxa" w:w="1300"/>
+            <w:tcBorders>
+              <w:top w:val="single" w:color="D9D5CB" w:sz="4"/>
+              <w:left w:val="single" w:color="D9D5CB" w:sz="4"/>
+              <w:bottom w:val="single" w:color="D9D5CB" w:sz="4"/>
+              <w:right w:val="single" w:color="D9D5CB" w:sz="4"/>
+            </w:tcBorders>
+            <w:shd w:fill="E6F5EC" w:color="auto" w:val="clear"/>
+            <w:tcMar>
+              <w:top w:type="dxa" w:w="60"/>
+              <w:left w:type="dxa" w:w="90"/>
+              <w:bottom w:type="dxa" w:w="60"/>
+              <w:right w:type="dxa" w:w="90"/>
+            </w:tcMar>
+            <w:vAlign w:val="top"/>
+          </w:tcPr>
+          <w:p>
+            <w:pPr>
+              <w:spacing w:after="40"/>
+            </w:pPr>
+            <w:r>
+              <w:rPr>
+                <w:rFonts w:ascii="Calibri" w:cs="Calibri" w:eastAsia="Calibri" w:hAnsi="Calibri"/>
+                <w:b/>
+                <w:bCs/>
+                <w:color w:val="14213D"/>
+                <w:sz w:val="19"/>
+                <w:szCs w:val="19"/>
+              </w:rPr>
+              <w:t xml:space="preserve">Fait</w:t>
+            </w:r>
+          </w:p>
+        </w:tc>
+        <w:tc>
+          <w:tcPr>
+            <w:tcW w:type="dxa" w:w="3700"/>
+            <w:tcBorders>
+              <w:top w:val="single" w:color="D9D5CB" w:sz="4"/>
+              <w:left w:val="single" w:color="D9D5CB" w:sz="4"/>
+              <w:bottom w:val="single" w:color="D9D5CB" w:sz="4"/>
+              <w:right w:val="single" w:color="D9D5CB" w:sz="4"/>
+            </w:tcBorders>
+            <w:tcMar>
+              <w:top w:type="dxa" w:w="60"/>
+              <w:left w:type="dxa" w:w="90"/>
+              <w:bottom w:type="dxa" w:w="60"/>
+              <w:right w:type="dxa" w:w="90"/>
+            </w:tcMar>
+            <w:vAlign w:val="top"/>
+          </w:tcPr>
+          <w:p>
+            <w:pPr>
+              <w:spacing w:after="40"/>
+            </w:pPr>
+            <w:r>
+              <w:rPr>
+                <w:rFonts w:ascii="Calibri" w:cs="Calibri" w:eastAsia="Calibri" w:hAnsi="Calibri"/>
+                <w:color w:val="14213D"/>
+                <w:sz w:val="20"/>
+                <w:szCs w:val="20"/>
+              </w:rPr>
+              <w:t xml:space="preserve"/>
+            </w:r>
+          </w:p>
+          <w:p>
+            <w:pPr>
+              <w:spacing w:after="40"/>
+            </w:pPr>
+            <w:r>
+              <w:rPr>
+                <w:rFonts w:ascii="Calibri" w:cs="Calibri" w:eastAsia="Calibri" w:hAnsi="Calibri"/>
+                <w:color w:val="14213D"/>
+                <w:sz w:val="20"/>
+                <w:szCs w:val="20"/>
+              </w:rPr>
+              <w:t xml:space="preserve"/>
+            </w:r>
+          </w:p>
+        </w:tc>
+      </w:tr>
+      <w:tr>
+        <w:tc>
+          <w:tcPr>
+            <w:tcW w:type="dxa" w:w="2300"/>
+            <w:tcBorders>
+              <w:top w:val="single" w:color="D9D5CB" w:sz="4"/>
+              <w:left w:val="single" w:color="D9D5CB" w:sz="4"/>
+              <w:bottom w:val="single" w:color="D9D5CB" w:sz="4"/>
+              <w:right w:val="single" w:color="D9D5CB" w:sz="4"/>
+            </w:tcBorders>
+            <w:tcMar>
+              <w:top w:type="dxa" w:w="60"/>
+              <w:left w:type="dxa" w:w="90"/>
+              <w:bottom w:type="dxa" w:w="60"/>
+              <w:right w:type="dxa" w:w="90"/>
+            </w:tcMar>
+            <w:vAlign w:val="top"/>
+          </w:tcPr>
+          <w:p>
+            <w:pPr>
+              <w:spacing w:after="40"/>
+            </w:pPr>
+            <w:r>
+              <w:rPr>
+                <w:rFonts w:ascii="Calibri" w:cs="Calibri" w:eastAsia="Calibri" w:hAnsi="Calibri"/>
+                <w:b/>
+                <w:bCs/>
+                <w:color w:val="14213D"/>
+                <w:sz w:val="20"/>
+                <w:szCs w:val="20"/>
+              </w:rPr>
+              <w:t xml:space="preserve">Un DWG (ou un plan trop lourd)</w:t>
+            </w:r>
+          </w:p>
+        </w:tc>
+        <w:tc>
+          <w:tcPr>
+            <w:tcW w:type="dxa" w:w="4100"/>
+            <w:tcBorders>
+              <w:top w:val="single" w:color="D9D5CB" w:sz="4"/>
+              <w:left w:val="single" w:color="D9D5CB" w:sz="4"/>
+              <w:bottom w:val="single" w:color="D9D5CB" w:sz="4"/>
+              <w:right w:val="single" w:color="D9D5CB" w:sz="4"/>
+            </w:tcBorders>
+            <w:tcMar>
+              <w:top w:type="dxa" w:w="60"/>
+              <w:left w:type="dxa" w:w="90"/>
+              <w:bottom w:type="dxa" w:w="60"/>
+              <w:right w:type="dxa" w:w="90"/>
+            </w:tcMar>
+            <w:vAlign w:val="top"/>
+          </w:tcPr>
+          <w:p>
+            <w:pPr>
+              <w:spacing w:after="40"/>
+            </w:pPr>
+            <w:r>
+              <w:rPr>
+                <w:rFonts w:ascii="Calibri" w:cs="Calibri" w:eastAsia="Calibri" w:hAnsi="Calibri"/>
+                <w:color w:val="14213D"/>
+                <w:sz w:val="19"/>
+                <w:szCs w:val="19"/>
+              </w:rPr>
+              <w:t xml:space="preserve">Joins-le : la fiche dit pourquoi il ne s'ouvre pas (DWG = AutoCAD ou DWG TrueView, gratuit), ⤓ Télécharger pour l'ouvrir, et « Note sur ce document » avec un repère (folio, zone, rue) : elle se range avec les autres notes.</w:t>
+            </w:r>
+          </w:p>
+        </w:tc>
+        <w:tc>
+          <w:tcPr>
+            <w:tcW w:type="dxa" w:w="3700"/>
+            <w:tcBorders>
+              <w:top w:val="single" w:color="D9D5CB" w:sz="4"/>
+              <w:left w:val="single" w:color="D9D5CB" w:sz="4"/>
+              <w:bottom w:val="single" w:color="D9D5CB" w:sz="4"/>
+              <w:right w:val="single" w:color="D9D5CB" w:sz="4"/>
+            </w:tcBorders>
+            <w:tcMar>
+              <w:top w:type="dxa" w:w="60"/>
+              <w:left w:type="dxa" w:w="90"/>
+              <w:bottom w:type="dxa" w:w="60"/>
+              <w:right w:type="dxa" w:w="90"/>
+            </w:tcMar>
+            <w:vAlign w:val="top"/>
+          </w:tcPr>
+          <w:p>
+            <w:pPr>
+              <w:spacing w:after="40"/>
+            </w:pPr>
+            <w:r>
+              <w:rPr>
+                <w:rFonts w:ascii="Calibri" w:cs="Calibri" w:eastAsia="Calibri" w:hAnsi="Calibri"/>
+                <w:color w:val="14213D"/>
+                <w:sz w:val="19"/>
+                <w:szCs w:val="19"/>
+              </w:rPr>
+              <w:t xml:space="preserve">Plus de 50 Mo : gardé sur ton appareil seulement — pour le partager, dépose-le sur le Drive / SharePoint et ajoute le lien (1 · Dossier → 🔗).</w:t>
+            </w:r>
+          </w:p>
+        </w:tc>
+        <w:tc>
+          <w:tcPr>
+            <w:tcW w:type="dxa" w:w="1300"/>
+            <w:tcBorders>
+              <w:top w:val="single" w:color="D9D5CB" w:sz="4"/>
+              <w:left w:val="single" w:color="D9D5CB" w:sz="4"/>
+              <w:bottom w:val="single" w:color="D9D5CB" w:sz="4"/>
+              <w:right w:val="single" w:color="D9D5CB" w:sz="4"/>
+            </w:tcBorders>
+            <w:shd w:fill="E6F5EC" w:color="auto" w:val="clear"/>
+            <w:tcMar>
+              <w:top w:type="dxa" w:w="60"/>
+              <w:left w:type="dxa" w:w="90"/>
+              <w:bottom w:type="dxa" w:w="60"/>
+              <w:right w:type="dxa" w:w="90"/>
+            </w:tcMar>
+            <w:vAlign w:val="top"/>
+          </w:tcPr>
+          <w:p>
+            <w:pPr>
+              <w:spacing w:after="40"/>
+            </w:pPr>
+            <w:r>
+              <w:rPr>
+                <w:rFonts w:ascii="Calibri" w:cs="Calibri" w:eastAsia="Calibri" w:hAnsi="Calibri"/>
+                <w:b/>
+                <w:bCs/>
+                <w:color w:val="14213D"/>
+                <w:sz w:val="19"/>
+                <w:szCs w:val="19"/>
+              </w:rPr>
+              <w:t xml:space="preserve">Fait</w:t>
+            </w:r>
+          </w:p>
+        </w:tc>
+        <w:tc>
+          <w:tcPr>
+            <w:tcW w:type="dxa" w:w="3700"/>
+            <w:tcBorders>
+              <w:top w:val="single" w:color="D9D5CB" w:sz="4"/>
+              <w:left w:val="single" w:color="D9D5CB" w:sz="4"/>
+              <w:bottom w:val="single" w:color="D9D5CB" w:sz="4"/>
+              <w:right w:val="single" w:color="D9D5CB" w:sz="4"/>
+            </w:tcBorders>
+            <w:tcMar>
+              <w:top w:type="dxa" w:w="60"/>
+              <w:left w:type="dxa" w:w="90"/>
+              <w:bottom w:type="dxa" w:w="60"/>
+              <w:right w:type="dxa" w:w="90"/>
+            </w:tcMar>
+            <w:vAlign w:val="top"/>
+          </w:tcPr>
+          <w:p>
+            <w:pPr>
+              <w:spacing w:after="40"/>
+            </w:pPr>
+            <w:r>
+              <w:rPr>
+                <w:rFonts w:ascii="Calibri" w:cs="Calibri" w:eastAsia="Calibri" w:hAnsi="Calibri"/>
+                <w:color w:val="14213D"/>
+                <w:sz w:val="20"/>
+                <w:szCs w:val="20"/>
+              </w:rPr>
+              <w:t xml:space="preserve"/>
+            </w:r>
+          </w:p>
+          <w:p>
+            <w:pPr>
+              <w:spacing w:after="40"/>
+            </w:pPr>
+            <w:r>
+              <w:rPr>
+                <w:rFonts w:ascii="Calibri" w:cs="Calibri" w:eastAsia="Calibri" w:hAnsi="Calibri"/>
+                <w:color w:val="14213D"/>
+                <w:sz w:val="20"/>
+                <w:szCs w:val="20"/>
+              </w:rPr>
+              <w:t xml:space="preserve"/>
+            </w:r>
+          </w:p>
+        </w:tc>
+      </w:tr>
+      <w:tr>
+        <w:tc>
+          <w:tcPr>
+            <w:tcW w:type="dxa" w:w="2300"/>
+            <w:tcBorders>
+              <w:top w:val="single" w:color="D9D5CB" w:sz="4"/>
+              <w:left w:val="single" w:color="D9D5CB" w:sz="4"/>
+              <w:bottom w:val="single" w:color="D9D5CB" w:sz="4"/>
+              <w:right w:val="single" w:color="D9D5CB" w:sz="4"/>
+            </w:tcBorders>
+            <w:tcMar>
+              <w:top w:type="dxa" w:w="60"/>
+              <w:left w:type="dxa" w:w="90"/>
+              <w:bottom w:type="dxa" w:w="60"/>
+              <w:right w:type="dxa" w:w="90"/>
+            </w:tcMar>
+            <w:vAlign w:val="top"/>
+          </w:tcPr>
+          <w:p>
+            <w:pPr>
+              <w:spacing w:after="40"/>
+            </w:pPr>
+            <w:r>
+              <w:rPr>
+                <w:rFonts w:ascii="Calibri" w:cs="Calibri" w:eastAsia="Calibri" w:hAnsi="Calibri"/>
+                <w:b/>
+                <w:bCs/>
+                <w:color w:val="14213D"/>
+                <w:sz w:val="20"/>
+                <w:szCs w:val="20"/>
+              </w:rPr>
+              <w:t xml:space="preserve">Joindre ou glisser une pièce dans la lecture</w:t>
+            </w:r>
+          </w:p>
+        </w:tc>
+        <w:tc>
+          <w:tcPr>
+            <w:tcW w:type="dxa" w:w="4100"/>
+            <w:tcBorders>
+              <w:top w:val="single" w:color="D9D5CB" w:sz="4"/>
+              <w:left w:val="single" w:color="D9D5CB" w:sz="4"/>
+              <w:bottom w:val="single" w:color="D9D5CB" w:sz="4"/>
+              <w:right w:val="single" w:color="D9D5CB" w:sz="4"/>
+            </w:tcBorders>
+            <w:tcMar>
+              <w:top w:type="dxa" w:w="60"/>
+              <w:left w:type="dxa" w:w="90"/>
+              <w:bottom w:type="dxa" w:w="60"/>
+              <w:right w:type="dxa" w:w="90"/>
+            </w:tcMar>
+            <w:vAlign w:val="top"/>
+          </w:tcPr>
+          <w:p>
+            <w:pPr>
+              <w:spacing w:after="40"/>
+            </w:pPr>
+            <w:r>
+              <w:rPr>
+                <w:rFonts w:ascii="Calibri" w:cs="Calibri" w:eastAsia="Calibri" w:hAnsi="Calibri"/>
+                <w:color w:val="14213D"/>
+                <w:sz w:val="19"/>
+                <w:szCs w:val="19"/>
+              </w:rPr>
+              <w:t xml:space="preserve">📎 Joindre au bout des onglets des pièces, ou glisse le fichier sur la lecture : la pièce s'ajoute au dossier et s'ouvre.</w:t>
+            </w:r>
+          </w:p>
+        </w:tc>
+        <w:tc>
+          <w:tcPr>
+            <w:tcW w:type="dxa" w:w="3700"/>
+            <w:tcBorders>
+              <w:top w:val="single" w:color="D9D5CB" w:sz="4"/>
+              <w:left w:val="single" w:color="D9D5CB" w:sz="4"/>
+              <w:bottom w:val="single" w:color="D9D5CB" w:sz="4"/>
+              <w:right w:val="single" w:color="D9D5CB" w:sz="4"/>
+            </w:tcBorders>
+            <w:tcMar>
+              <w:top w:type="dxa" w:w="60"/>
+              <w:left w:type="dxa" w:w="90"/>
+              <w:bottom w:type="dxa" w:w="60"/>
+              <w:right w:type="dxa" w:w="90"/>
+            </w:tcMar>
+            <w:vAlign w:val="top"/>
+          </w:tcPr>
+          <w:p>
+            <w:pPr>
+              <w:spacing w:after="40"/>
+            </w:pPr>
+            <w:r>
+              <w:rPr>
+                <w:rFonts w:ascii="Calibri" w:cs="Calibri" w:eastAsia="Calibri" w:hAnsi="Calibri"/>
+                <w:color w:val="14213D"/>
+                <w:sz w:val="19"/>
+                <w:szCs w:val="19"/>
+              </w:rPr>
+              <w:t xml:space="preserve"/>
+            </w:r>
+          </w:p>
+        </w:tc>
+        <w:tc>
+          <w:tcPr>
+            <w:tcW w:type="dxa" w:w="1300"/>
+            <w:tcBorders>
+              <w:top w:val="single" w:color="D9D5CB" w:sz="4"/>
+              <w:left w:val="single" w:color="D9D5CB" w:sz="4"/>
+              <w:bottom w:val="single" w:color="D9D5CB" w:sz="4"/>
+              <w:right w:val="single" w:color="D9D5CB" w:sz="4"/>
+            </w:tcBorders>
+            <w:shd w:fill="E6F5EC" w:color="auto" w:val="clear"/>
+            <w:tcMar>
+              <w:top w:type="dxa" w:w="60"/>
+              <w:left w:type="dxa" w:w="90"/>
+              <w:bottom w:type="dxa" w:w="60"/>
+              <w:right w:type="dxa" w:w="90"/>
+            </w:tcMar>
+            <w:vAlign w:val="top"/>
+          </w:tcPr>
+          <w:p>
+            <w:pPr>
+              <w:spacing w:after="40"/>
+            </w:pPr>
+            <w:r>
+              <w:rPr>
+                <w:rFonts w:ascii="Calibri" w:cs="Calibri" w:eastAsia="Calibri" w:hAnsi="Calibri"/>
+                <w:b/>
+                <w:bCs/>
+                <w:color w:val="14213D"/>
+                <w:sz w:val="19"/>
+                <w:szCs w:val="19"/>
+              </w:rPr>
+              <w:t xml:space="preserve">Fait</w:t>
+            </w:r>
+          </w:p>
+        </w:tc>
+        <w:tc>
+          <w:tcPr>
+            <w:tcW w:type="dxa" w:w="3700"/>
+            <w:tcBorders>
+              <w:top w:val="single" w:color="D9D5CB" w:sz="4"/>
+              <w:left w:val="single" w:color="D9D5CB" w:sz="4"/>
+              <w:bottom w:val="single" w:color="D9D5CB" w:sz="4"/>
+              <w:right w:val="single" w:color="D9D5CB" w:sz="4"/>
+            </w:tcBorders>
+            <w:tcMar>
+              <w:top w:type="dxa" w:w="60"/>
+              <w:left w:type="dxa" w:w="90"/>
+              <w:bottom w:type="dxa" w:w="60"/>
+              <w:right w:type="dxa" w:w="90"/>
+            </w:tcMar>
+            <w:vAlign w:val="top"/>
+          </w:tcPr>
+          <w:p>
+            <w:pPr>
+              <w:spacing w:after="40"/>
+            </w:pPr>
+            <w:r>
+              <w:rPr>
+                <w:rFonts w:ascii="Calibri" w:cs="Calibri" w:eastAsia="Calibri" w:hAnsi="Calibri"/>
+                <w:color w:val="14213D"/>
+                <w:sz w:val="20"/>
+                <w:szCs w:val="20"/>
+              </w:rPr>
+              <w:t xml:space="preserve"/>
+            </w:r>
+          </w:p>
+          <w:p>
+            <w:pPr>
+              <w:spacing w:after="40"/>
+            </w:pPr>
+            <w:r>
+              <w:rPr>
+                <w:rFonts w:ascii="Calibri" w:cs="Calibri" w:eastAsia="Calibri" w:hAnsi="Calibri"/>
+                <w:color w:val="14213D"/>
+                <w:sz w:val="20"/>
+                <w:szCs w:val="20"/>
+              </w:rPr>
+              <w:t xml:space="preserve"/>
+            </w:r>
+          </w:p>
+        </w:tc>
+      </w:tr>
+      <w:tr>
+        <w:tc>
+          <w:tcPr>
+            <w:tcW w:type="dxa" w:w="2300"/>
+            <w:tcBorders>
+              <w:top w:val="single" w:color="D9D5CB" w:sz="4"/>
+              <w:left w:val="single" w:color="D9D5CB" w:sz="4"/>
+              <w:bottom w:val="single" w:color="D9D5CB" w:sz="4"/>
+              <w:right w:val="single" w:color="D9D5CB" w:sz="4"/>
+            </w:tcBorders>
+            <w:tcMar>
+              <w:top w:type="dxa" w:w="60"/>
+              <w:left w:type="dxa" w:w="90"/>
+              <w:bottom w:type="dxa" w:w="60"/>
+              <w:right w:type="dxa" w:w="90"/>
+            </w:tcMar>
+            <w:vAlign w:val="top"/>
+          </w:tcPr>
+          <w:p>
+            <w:pPr>
+              <w:spacing w:after="40"/>
+            </w:pPr>
+            <w:r>
+              <w:rPr>
+                <w:rFonts w:ascii="Calibri" w:cs="Calibri" w:eastAsia="Calibri" w:hAnsi="Calibri"/>
+                <w:b/>
+                <w:bCs/>
+                <w:color w:val="14213D"/>
+                <w:sz w:val="20"/>
+                <w:szCs w:val="20"/>
+              </w:rPr>
+              <w:t xml:space="preserve">La pièce sur ton 2e écran</w:t>
+            </w:r>
+          </w:p>
+        </w:tc>
+        <w:tc>
+          <w:tcPr>
+            <w:tcW w:type="dxa" w:w="4100"/>
+            <w:tcBorders>
+              <w:top w:val="single" w:color="D9D5CB" w:sz="4"/>
+              <w:left w:val="single" w:color="D9D5CB" w:sz="4"/>
+              <w:bottom w:val="single" w:color="D9D5CB" w:sz="4"/>
+              <w:right w:val="single" w:color="D9D5CB" w:sz="4"/>
+            </w:tcBorders>
+            <w:tcMar>
+              <w:top w:type="dxa" w:w="60"/>
+              <w:left w:type="dxa" w:w="90"/>
+              <w:bottom w:type="dxa" w:w="60"/>
+              <w:right w:type="dxa" w:w="90"/>
+            </w:tcMar>
+            <w:vAlign w:val="top"/>
+          </w:tcPr>
+          <w:p>
+            <w:pPr>
+              <w:spacing w:after="40"/>
+            </w:pPr>
+            <w:r>
+              <w:rPr>
+                <w:rFonts w:ascii="Calibri" w:cs="Calibri" w:eastAsia="Calibri" w:hAnsi="Calibri"/>
+                <w:color w:val="14213D"/>
+                <w:sz w:val="19"/>
+                <w:szCs w:val="19"/>
+              </w:rPr>
+              <w:t xml:space="preserve">⧉ dans la barre de la pièce : la pièce s'ouvre dans une fenêtre « Lecture » → glisse-la sur l'autre écran. Tu y surlignes, encadres, cherches : les notes arrivent dans l'appli. Les onglets de l'appli (ou la liste en haut de la fenêtre) changent la pièce affichée. ↩ Ramener : la pièce revient dans l'appli.</w:t>
+            </w:r>
+          </w:p>
+        </w:tc>
+        <w:tc>
+          <w:tcPr>
+            <w:tcW w:type="dxa" w:w="3700"/>
+            <w:tcBorders>
+              <w:top w:val="single" w:color="D9D5CB" w:sz="4"/>
+              <w:left w:val="single" w:color="D9D5CB" w:sz="4"/>
+              <w:bottom w:val="single" w:color="D9D5CB" w:sz="4"/>
+              <w:right w:val="single" w:color="D9D5CB" w:sz="4"/>
+            </w:tcBorders>
+            <w:tcMar>
+              <w:top w:type="dxa" w:w="60"/>
+              <w:left w:type="dxa" w:w="90"/>
+              <w:bottom w:type="dxa" w:w="60"/>
+              <w:right w:type="dxa" w:w="90"/>
+            </w:tcMar>
+            <w:vAlign w:val="top"/>
+          </w:tcPr>
+          <w:p>
+            <w:pPr>
+              <w:spacing w:after="40"/>
+            </w:pPr>
+            <w:r>
+              <w:rPr>
+                <w:rFonts w:ascii="Calibri" w:cs="Calibri" w:eastAsia="Calibri" w:hAnsi="Calibri"/>
+                <w:color w:val="14213D"/>
+                <w:sz w:val="19"/>
+                <w:szCs w:val="19"/>
+              </w:rPr>
+              <w:t xml:space="preserve">Si rien ne s'ouvre : autorise les fenêtres surgissantes (pop-up) pour le site dans le navigateur.</w:t>
+            </w:r>
+          </w:p>
+        </w:tc>
+        <w:tc>
+          <w:tcPr>
+            <w:tcW w:type="dxa" w:w="1300"/>
+            <w:tcBorders>
+              <w:top w:val="single" w:color="D9D5CB" w:sz="4"/>
+              <w:left w:val="single" w:color="D9D5CB" w:sz="4"/>
+              <w:bottom w:val="single" w:color="D9D5CB" w:sz="4"/>
+              <w:right w:val="single" w:color="D9D5CB" w:sz="4"/>
+            </w:tcBorders>
+            <w:shd w:fill="FFF4EE" w:color="auto" w:val="clear"/>
+            <w:tcMar>
+              <w:top w:type="dxa" w:w="60"/>
+              <w:left w:type="dxa" w:w="90"/>
+              <w:bottom w:type="dxa" w:w="60"/>
+              <w:right w:type="dxa" w:w="90"/>
+            </w:tcMar>
+            <w:vAlign w:val="top"/>
+          </w:tcPr>
+          <w:p>
+            <w:pPr>
+              <w:spacing w:after="40"/>
+            </w:pPr>
+            <w:r>
+              <w:rPr>
+                <w:rFonts w:ascii="Calibri" w:cs="Calibri" w:eastAsia="Calibri" w:hAnsi="Calibri"/>
+                <w:b/>
+                <w:bCs/>
+                <w:color w:val="14213D"/>
+                <w:sz w:val="19"/>
+                <w:szCs w:val="19"/>
+              </w:rPr>
+              <w:t xml:space="preserve">À tester sur ton double écran</w:t>
+            </w:r>
+          </w:p>
+        </w:tc>
+        <w:tc>
+          <w:tcPr>
+            <w:tcW w:type="dxa" w:w="3700"/>
+            <w:tcBorders>
+              <w:top w:val="single" w:color="D9D5CB" w:sz="4"/>
+              <w:left w:val="single" w:color="D9D5CB" w:sz="4"/>
+              <w:bottom w:val="single" w:color="D9D5CB" w:sz="4"/>
+              <w:right w:val="single" w:color="D9D5CB" w:sz="4"/>
+            </w:tcBorders>
+            <w:tcMar>
+              <w:top w:type="dxa" w:w="60"/>
+              <w:left w:type="dxa" w:w="90"/>
+              <w:bottom w:type="dxa" w:w="60"/>
+              <w:right w:type="dxa" w:w="90"/>
+            </w:tcMar>
+            <w:vAlign w:val="top"/>
+          </w:tcPr>
+          <w:p>
+            <w:pPr>
+              <w:spacing w:after="40"/>
+            </w:pPr>
+            <w:r>
+              <w:rPr>
+                <w:rFonts w:ascii="Calibri" w:cs="Calibri" w:eastAsia="Calibri" w:hAnsi="Calibri"/>
+                <w:color w:val="14213D"/>
+                <w:sz w:val="20"/>
+                <w:szCs w:val="20"/>
+              </w:rPr>
+              <w:t xml:space="preserve"/>
+            </w:r>
+          </w:p>
+          <w:p>
+            <w:pPr>
+              <w:spacing w:after="40"/>
+            </w:pPr>
+            <w:r>
+              <w:rPr>
+                <w:rFonts w:ascii="Calibri" w:cs="Calibri" w:eastAsia="Calibri" w:hAnsi="Calibri"/>
+                <w:color w:val="14213D"/>
+                <w:sz w:val="20"/>
+                <w:szCs w:val="20"/>
+              </w:rPr>
+              <w:t xml:space="preserve"/>
+            </w:r>
+          </w:p>
+        </w:tc>
+      </w:tr>
+      <w:tr>
+        <w:tc>
+          <w:tcPr>
+            <w:tcW w:type="dxa" w:w="2300"/>
+            <w:tcBorders>
+              <w:top w:val="single" w:color="D9D5CB" w:sz="4"/>
+              <w:left w:val="single" w:color="D9D5CB" w:sz="4"/>
+              <w:bottom w:val="single" w:color="D9D5CB" w:sz="4"/>
+              <w:right w:val="single" w:color="D9D5CB" w:sz="4"/>
+            </w:tcBorders>
+            <w:tcMar>
+              <w:top w:type="dxa" w:w="60"/>
+              <w:left w:type="dxa" w:w="90"/>
+              <w:bottom w:type="dxa" w:w="60"/>
+              <w:right w:type="dxa" w:w="90"/>
+            </w:tcMar>
+            <w:vAlign w:val="top"/>
+          </w:tcPr>
+          <w:p>
+            <w:pPr>
+              <w:spacing w:after="40"/>
+            </w:pPr>
+            <w:r>
+              <w:rPr>
+                <w:rFonts w:ascii="Calibri" w:cs="Calibri" w:eastAsia="Calibri" w:hAnsi="Calibri"/>
+                <w:b/>
+                <w:bCs/>
+                <w:color w:val="14213D"/>
+                <w:sz w:val="20"/>
+                <w:szCs w:val="20"/>
+              </w:rPr>
+              <w:t xml:space="preserve">Dates → jours ouvrés → location base vie</w:t>
+            </w:r>
+          </w:p>
+        </w:tc>
+        <w:tc>
+          <w:tcPr>
+            <w:tcW w:type="dxa" w:w="4100"/>
+            <w:tcBorders>
+              <w:top w:val="single" w:color="D9D5CB" w:sz="4"/>
+              <w:left w:val="single" w:color="D9D5CB" w:sz="4"/>
+              <w:bottom w:val="single" w:color="D9D5CB" w:sz="4"/>
+              <w:right w:val="single" w:color="D9D5CB" w:sz="4"/>
+            </w:tcBorders>
+            <w:tcMar>
+              <w:top w:type="dxa" w:w="60"/>
+              <w:left w:type="dxa" w:w="90"/>
+              <w:bottom w:type="dxa" w:w="60"/>
+              <w:right w:type="dxa" w:w="90"/>
+            </w:tcMar>
+            <w:vAlign w:val="top"/>
+          </w:tcPr>
+          <w:p>
+            <w:pPr>
+              <w:spacing w:after="40"/>
+            </w:pPr>
+            <w:r>
+              <w:rPr>
+                <w:rFonts w:ascii="Calibri" w:cs="Calibri" w:eastAsia="Calibri" w:hAnsi="Calibri"/>
+                <w:color w:val="14213D"/>
+                <w:sz w:val="19"/>
+                <w:szCs w:val="19"/>
+              </w:rPr>
+              <w:t xml:space="preserve">Lecture → Points techniques : début et fin des travaux → « 10 jours ouvrés (lundi → vendredi) · 11 j calendaires · férié : 11/11 ». Coche WC / conteneur / benne / pelle → durée proposée. Chiffrage → Chantier et période → « Location base vie » : « calculé · à valider », ✓ pour valider, ou tape ton nombre (« saisi · calculé 10 j »), ↺ pour revenir au calcul.</w:t>
+            </w:r>
+          </w:p>
+        </w:tc>
+        <w:tc>
+          <w:tcPr>
+            <w:tcW w:type="dxa" w:w="3700"/>
+            <w:tcBorders>
+              <w:top w:val="single" w:color="D9D5CB" w:sz="4"/>
+              <w:left w:val="single" w:color="D9D5CB" w:sz="4"/>
+              <w:bottom w:val="single" w:color="D9D5CB" w:sz="4"/>
+              <w:right w:val="single" w:color="D9D5CB" w:sz="4"/>
+            </w:tcBorders>
+            <w:tcMar>
+              <w:top w:type="dxa" w:w="60"/>
+              <w:left w:type="dxa" w:w="90"/>
+              <w:bottom w:type="dxa" w:w="60"/>
+              <w:right w:type="dxa" w:w="90"/>
+            </w:tcMar>
+            <w:vAlign w:val="top"/>
+          </w:tcPr>
+          <w:p>
+            <w:pPr>
+              <w:spacing w:after="40"/>
+            </w:pPr>
+            <w:r>
+              <w:rPr>
+                <w:rFonts w:ascii="Calibri" w:cs="Calibri" w:eastAsia="Calibri" w:hAnsi="Calibri"/>
+                <w:color w:val="14213D"/>
+                <w:sz w:val="19"/>
+                <w:szCs w:val="19"/>
+              </w:rPr>
+              <w:t xml:space="preserve">Changement : l'appli compte maintenant du lundi au vendredi ; le classeur comptait en jours calendaires (un chiffrage refait aura quelques jours de location de moins). Les fériés sont signalés, pas déduits : à toi de voir.</w:t>
+            </w:r>
+          </w:p>
+        </w:tc>
+        <w:tc>
+          <w:tcPr>
+            <w:tcW w:type="dxa" w:w="1300"/>
+            <w:tcBorders>
+              <w:top w:val="single" w:color="D9D5CB" w:sz="4"/>
+              <w:left w:val="single" w:color="D9D5CB" w:sz="4"/>
+              <w:bottom w:val="single" w:color="D9D5CB" w:sz="4"/>
+              <w:right w:val="single" w:color="D9D5CB" w:sz="4"/>
+            </w:tcBorders>
+            <w:shd w:fill="E6F5EC" w:color="auto" w:val="clear"/>
+            <w:tcMar>
+              <w:top w:type="dxa" w:w="60"/>
+              <w:left w:type="dxa" w:w="90"/>
+              <w:bottom w:type="dxa" w:w="60"/>
+              <w:right w:type="dxa" w:w="90"/>
+            </w:tcMar>
+            <w:vAlign w:val="top"/>
+          </w:tcPr>
+          <w:p>
+            <w:pPr>
+              <w:spacing w:after="40"/>
+            </w:pPr>
+            <w:r>
+              <w:rPr>
+                <w:rFonts w:ascii="Calibri" w:cs="Calibri" w:eastAsia="Calibri" w:hAnsi="Calibri"/>
+                <w:b/>
+                <w:bCs/>
+                <w:color w:val="14213D"/>
+                <w:sz w:val="19"/>
+                <w:szCs w:val="19"/>
+              </w:rPr>
+              <w:t xml:space="preserve">Fait</w:t>
+            </w:r>
+          </w:p>
+        </w:tc>
+        <w:tc>
+          <w:tcPr>
+            <w:tcW w:type="dxa" w:w="3700"/>
+            <w:tcBorders>
+              <w:top w:val="single" w:color="D9D5CB" w:sz="4"/>
+              <w:left w:val="single" w:color="D9D5CB" w:sz="4"/>
+              <w:bottom w:val="single" w:color="D9D5CB" w:sz="4"/>
+              <w:right w:val="single" w:color="D9D5CB" w:sz="4"/>
+            </w:tcBorders>
+            <w:tcMar>
+              <w:top w:type="dxa" w:w="60"/>
+              <w:left w:type="dxa" w:w="90"/>
+              <w:bottom w:type="dxa" w:w="60"/>
+              <w:right w:type="dxa" w:w="90"/>
+            </w:tcMar>
+            <w:vAlign w:val="top"/>
+          </w:tcPr>
+          <w:p>
+            <w:pPr>
+              <w:spacing w:after="40"/>
+            </w:pPr>
+            <w:r>
+              <w:rPr>
+                <w:rFonts w:ascii="Calibri" w:cs="Calibri" w:eastAsia="Calibri" w:hAnsi="Calibri"/>
+                <w:color w:val="14213D"/>
+                <w:sz w:val="20"/>
+                <w:szCs w:val="20"/>
+              </w:rPr>
+              <w:t xml:space="preserve"/>
+            </w:r>
+          </w:p>
+          <w:p>
+            <w:pPr>
+              <w:spacing w:after="40"/>
+            </w:pPr>
+            <w:r>
+              <w:rPr>
+                <w:rFonts w:ascii="Calibri" w:cs="Calibri" w:eastAsia="Calibri" w:hAnsi="Calibri"/>
+                <w:color w:val="14213D"/>
+                <w:sz w:val="20"/>
+                <w:szCs w:val="20"/>
+              </w:rPr>
+              <w:t xml:space="preserve"/>
+            </w:r>
+          </w:p>
+        </w:tc>
+      </w:tr>
+      <w:tr>
+        <w:tc>
+          <w:tcPr>
+            <w:tcW w:type="dxa" w:w="2300"/>
+            <w:tcBorders>
+              <w:top w:val="single" w:color="D9D5CB" w:sz="4"/>
+              <w:left w:val="single" w:color="D9D5CB" w:sz="4"/>
+              <w:bottom w:val="single" w:color="D9D5CB" w:sz="4"/>
+              <w:right w:val="single" w:color="D9D5CB" w:sz="4"/>
+            </w:tcBorders>
+            <w:tcMar>
+              <w:top w:type="dxa" w:w="60"/>
+              <w:left w:type="dxa" w:w="90"/>
+              <w:bottom w:type="dxa" w:w="60"/>
+              <w:right w:type="dxa" w:w="90"/>
+            </w:tcMar>
+            <w:vAlign w:val="top"/>
+          </w:tcPr>
+          <w:p>
+            <w:pPr>
+              <w:spacing w:after="40"/>
+            </w:pPr>
+            <w:r>
+              <w:rPr>
+                <w:rFonts w:ascii="Calibri" w:cs="Calibri" w:eastAsia="Calibri" w:hAnsi="Calibri"/>
+                <w:b/>
+                <w:bCs/>
+                <w:color w:val="14213D"/>
+                <w:sz w:val="20"/>
+                <w:szCs w:val="20"/>
+              </w:rPr>
+              <w:t xml:space="preserve">Vannes SST : toutes les typologies</w:t>
+            </w:r>
+          </w:p>
+        </w:tc>
+        <w:tc>
+          <w:tcPr>
+            <w:tcW w:type="dxa" w:w="4100"/>
+            <w:tcBorders>
+              <w:top w:val="single" w:color="D9D5CB" w:sz="4"/>
+              <w:left w:val="single" w:color="D9D5CB" w:sz="4"/>
+              <w:bottom w:val="single" w:color="D9D5CB" w:sz="4"/>
+              <w:right w:val="single" w:color="D9D5CB" w:sz="4"/>
+            </w:tcBorders>
+            <w:tcMar>
+              <w:top w:type="dxa" w:w="60"/>
+              <w:left w:type="dxa" w:w="90"/>
+              <w:bottom w:type="dxa" w:w="60"/>
+              <w:right w:type="dxa" w:w="90"/>
+            </w:tcMar>
+            <w:vAlign w:val="top"/>
+          </w:tcPr>
+          <w:p>
+            <w:pPr>
+              <w:spacing w:after="40"/>
+            </w:pPr>
+            <w:r>
+              <w:rPr>
+                <w:rFonts w:ascii="Calibri" w:cs="Calibri" w:eastAsia="Calibri" w:hAnsi="Calibri"/>
+                <w:color w:val="14213D"/>
+                <w:sz w:val="19"/>
+                <w:szCs w:val="19"/>
+              </w:rPr>
+              <w:t xml:space="preserve">Points techniques → Vannes de sous-station : les 9 typologies du classeur (BS PN25 / PN40, BS brides PN25 / PN40, PAP PN16 / 25 / 40, by-pass seul, fonds bombés), même sans base de prix, + « Autre » (désignation + prix par paire).</w:t>
+            </w:r>
+          </w:p>
+        </w:tc>
+        <w:tc>
+          <w:tcPr>
+            <w:tcW w:type="dxa" w:w="3700"/>
+            <w:tcBorders>
+              <w:top w:val="single" w:color="D9D5CB" w:sz="4"/>
+              <w:left w:val="single" w:color="D9D5CB" w:sz="4"/>
+              <w:bottom w:val="single" w:color="D9D5CB" w:sz="4"/>
+              <w:right w:val="single" w:color="D9D5CB" w:sz="4"/>
+            </w:tcBorders>
+            <w:tcMar>
+              <w:top w:type="dxa" w:w="60"/>
+              <w:left w:type="dxa" w:w="90"/>
+              <w:bottom w:type="dxa" w:w="60"/>
+              <w:right w:type="dxa" w:w="90"/>
+            </w:tcMar>
+            <w:vAlign w:val="top"/>
+          </w:tcPr>
+          <w:p>
+            <w:pPr>
+              <w:spacing w:after="40"/>
+            </w:pPr>
+            <w:r>
+              <w:rPr>
+                <w:rFonts w:ascii="Calibri" w:cs="Calibri" w:eastAsia="Calibri" w:hAnsi="Calibri"/>
+                <w:color w:val="14213D"/>
+                <w:sz w:val="19"/>
+                <w:szCs w:val="19"/>
+              </w:rPr>
+              <w:t xml:space="preserve">Sans la base importée tu n'en voyais que 3 : c'était ça. S'il en existe d'autres chez vous, donne-moi la liste : j'en fais des paniers.</w:t>
+            </w:r>
+          </w:p>
+        </w:tc>
+        <w:tc>
+          <w:tcPr>
+            <w:tcW w:type="dxa" w:w="1300"/>
+            <w:tcBorders>
+              <w:top w:val="single" w:color="D9D5CB" w:sz="4"/>
+              <w:left w:val="single" w:color="D9D5CB" w:sz="4"/>
+              <w:bottom w:val="single" w:color="D9D5CB" w:sz="4"/>
+              <w:right w:val="single" w:color="D9D5CB" w:sz="4"/>
+            </w:tcBorders>
+            <w:shd w:fill="E6F5EC" w:color="auto" w:val="clear"/>
+            <w:tcMar>
+              <w:top w:type="dxa" w:w="60"/>
+              <w:left w:type="dxa" w:w="90"/>
+              <w:bottom w:type="dxa" w:w="60"/>
+              <w:right w:type="dxa" w:w="90"/>
+            </w:tcMar>
+            <w:vAlign w:val="top"/>
+          </w:tcPr>
+          <w:p>
+            <w:pPr>
+              <w:spacing w:after="40"/>
+            </w:pPr>
+            <w:r>
+              <w:rPr>
+                <w:rFonts w:ascii="Calibri" w:cs="Calibri" w:eastAsia="Calibri" w:hAnsi="Calibri"/>
+                <w:b/>
+                <w:bCs/>
+                <w:color w:val="14213D"/>
+                <w:sz w:val="19"/>
+                <w:szCs w:val="19"/>
+              </w:rPr>
+              <w:t xml:space="preserve">Fait</w:t>
+            </w:r>
+          </w:p>
+        </w:tc>
+        <w:tc>
+          <w:tcPr>
+            <w:tcW w:type="dxa" w:w="3700"/>
+            <w:tcBorders>
+              <w:top w:val="single" w:color="D9D5CB" w:sz="4"/>
+              <w:left w:val="single" w:color="D9D5CB" w:sz="4"/>
+              <w:bottom w:val="single" w:color="D9D5CB" w:sz="4"/>
+              <w:right w:val="single" w:color="D9D5CB" w:sz="4"/>
+            </w:tcBorders>
+            <w:tcMar>
+              <w:top w:type="dxa" w:w="60"/>
+              <w:left w:type="dxa" w:w="90"/>
+              <w:bottom w:type="dxa" w:w="60"/>
+              <w:right w:type="dxa" w:w="90"/>
+            </w:tcMar>
+            <w:vAlign w:val="top"/>
+          </w:tcPr>
+          <w:p>
+            <w:pPr>
+              <w:spacing w:after="40"/>
+            </w:pPr>
+            <w:r>
+              <w:rPr>
+                <w:rFonts w:ascii="Calibri" w:cs="Calibri" w:eastAsia="Calibri" w:hAnsi="Calibri"/>
+                <w:color w:val="14213D"/>
+                <w:sz w:val="20"/>
+                <w:szCs w:val="20"/>
+              </w:rPr>
+              <w:t xml:space="preserve"/>
+            </w:r>
+          </w:p>
+          <w:p>
+            <w:pPr>
+              <w:spacing w:after="40"/>
+            </w:pPr>
+            <w:r>
+              <w:rPr>
+                <w:rFonts w:ascii="Calibri" w:cs="Calibri" w:eastAsia="Calibri" w:hAnsi="Calibri"/>
+                <w:color w:val="14213D"/>
+                <w:sz w:val="20"/>
+                <w:szCs w:val="20"/>
+              </w:rPr>
+              <w:t xml:space="preserve"/>
+            </w:r>
+          </w:p>
+        </w:tc>
+      </w:tr>
+      <w:tr>
+        <w:tc>
+          <w:tcPr>
+            <w:tcW w:type="dxa" w:w="2300"/>
+            <w:tcBorders>
+              <w:top w:val="single" w:color="D9D5CB" w:sz="4"/>
+              <w:left w:val="single" w:color="D9D5CB" w:sz="4"/>
+              <w:bottom w:val="single" w:color="D9D5CB" w:sz="4"/>
+              <w:right w:val="single" w:color="D9D5CB" w:sz="4"/>
+            </w:tcBorders>
+            <w:tcMar>
+              <w:top w:type="dxa" w:w="60"/>
+              <w:left w:type="dxa" w:w="90"/>
+              <w:bottom w:type="dxa" w:w="60"/>
+              <w:right w:type="dxa" w:w="90"/>
+            </w:tcMar>
+            <w:vAlign w:val="top"/>
+          </w:tcPr>
+          <w:p>
+            <w:pPr>
+              <w:spacing w:after="40"/>
+            </w:pPr>
+            <w:r>
+              <w:rPr>
+                <w:rFonts w:ascii="Calibri" w:cs="Calibri" w:eastAsia="Calibri" w:hAnsi="Calibri"/>
+                <w:b/>
+                <w:bCs/>
+                <w:color w:val="14213D"/>
+                <w:sz w:val="20"/>
+                <w:szCs w:val="20"/>
+              </w:rPr>
+              <w:t xml:space="preserve">CND : feeder et antennes</w:t>
+            </w:r>
+          </w:p>
+        </w:tc>
+        <w:tc>
+          <w:tcPr>
+            <w:tcW w:type="dxa" w:w="4100"/>
+            <w:tcBorders>
+              <w:top w:val="single" w:color="D9D5CB" w:sz="4"/>
+              <w:left w:val="single" w:color="D9D5CB" w:sz="4"/>
+              <w:bottom w:val="single" w:color="D9D5CB" w:sz="4"/>
+              <w:right w:val="single" w:color="D9D5CB" w:sz="4"/>
+            </w:tcBorders>
+            <w:tcMar>
+              <w:top w:type="dxa" w:w="60"/>
+              <w:left w:type="dxa" w:w="90"/>
+              <w:bottom w:type="dxa" w:w="60"/>
+              <w:right w:type="dxa" w:w="90"/>
+            </w:tcMar>
+            <w:vAlign w:val="top"/>
+          </w:tcPr>
+          <w:p>
+            <w:pPr>
+              <w:spacing w:after="40"/>
+            </w:pPr>
+            <w:r>
+              <w:rPr>
+                <w:rFonts w:ascii="Calibri" w:cs="Calibri" w:eastAsia="Calibri" w:hAnsi="Calibri"/>
+                <w:color w:val="14213D"/>
+                <w:sz w:val="19"/>
+                <w:szCs w:val="19"/>
+              </w:rPr>
+              <w:t xml:space="preserve">Points techniques → Contrôles CND : répartition des soudures (par DN, « dont antennes », le reste en feeder) ; pour la radio, les ultrasons et le ressuage : % feeder, % antennes, soudures par vacation, vacations de raccordement saisies. La ligne du bas donne le nombre de vacations.</w:t>
+            </w:r>
+          </w:p>
+        </w:tc>
+        <w:tc>
+          <w:tcPr>
+            <w:tcW w:type="dxa" w:w="3700"/>
+            <w:tcBorders>
+              <w:top w:val="single" w:color="D9D5CB" w:sz="4"/>
+              <w:left w:val="single" w:color="D9D5CB" w:sz="4"/>
+              <w:bottom w:val="single" w:color="D9D5CB" w:sz="4"/>
+              <w:right w:val="single" w:color="D9D5CB" w:sz="4"/>
+            </w:tcBorders>
+            <w:tcMar>
+              <w:top w:type="dxa" w:w="60"/>
+              <w:left w:type="dxa" w:w="90"/>
+              <w:bottom w:type="dxa" w:w="60"/>
+              <w:right w:type="dxa" w:w="90"/>
+            </w:tcMar>
+            <w:vAlign w:val="top"/>
+          </w:tcPr>
+          <w:p>
+            <w:pPr>
+              <w:spacing w:after="40"/>
+            </w:pPr>
+            <w:r>
+              <w:rPr>
+                <w:rFonts w:ascii="Calibri" w:cs="Calibri" w:eastAsia="Calibri" w:hAnsi="Calibri"/>
+                <w:color w:val="14213D"/>
+                <w:sz w:val="19"/>
+                <w:szCs w:val="19"/>
+              </w:rPr>
+              <w:t xml:space="preserve">« Films par vacation » renommé « soudures par vacation » partout (c'était déjà le calcul du classeur).</w:t>
+            </w:r>
+          </w:p>
+        </w:tc>
+        <w:tc>
+          <w:tcPr>
+            <w:tcW w:type="dxa" w:w="1300"/>
+            <w:tcBorders>
+              <w:top w:val="single" w:color="D9D5CB" w:sz="4"/>
+              <w:left w:val="single" w:color="D9D5CB" w:sz="4"/>
+              <w:bottom w:val="single" w:color="D9D5CB" w:sz="4"/>
+              <w:right w:val="single" w:color="D9D5CB" w:sz="4"/>
+            </w:tcBorders>
+            <w:shd w:fill="E6F5EC" w:color="auto" w:val="clear"/>
+            <w:tcMar>
+              <w:top w:type="dxa" w:w="60"/>
+              <w:left w:type="dxa" w:w="90"/>
+              <w:bottom w:type="dxa" w:w="60"/>
+              <w:right w:type="dxa" w:w="90"/>
+            </w:tcMar>
+            <w:vAlign w:val="top"/>
+          </w:tcPr>
+          <w:p>
+            <w:pPr>
+              <w:spacing w:after="40"/>
+            </w:pPr>
+            <w:r>
+              <w:rPr>
+                <w:rFonts w:ascii="Calibri" w:cs="Calibri" w:eastAsia="Calibri" w:hAnsi="Calibri"/>
+                <w:b/>
+                <w:bCs/>
+                <w:color w:val="14213D"/>
+                <w:sz w:val="19"/>
+                <w:szCs w:val="19"/>
+              </w:rPr>
+              <w:t xml:space="preserve">Fait</w:t>
+            </w:r>
+          </w:p>
+        </w:tc>
+        <w:tc>
+          <w:tcPr>
+            <w:tcW w:type="dxa" w:w="3700"/>
+            <w:tcBorders>
+              <w:top w:val="single" w:color="D9D5CB" w:sz="4"/>
+              <w:left w:val="single" w:color="D9D5CB" w:sz="4"/>
+              <w:bottom w:val="single" w:color="D9D5CB" w:sz="4"/>
+              <w:right w:val="single" w:color="D9D5CB" w:sz="4"/>
+            </w:tcBorders>
+            <w:tcMar>
+              <w:top w:type="dxa" w:w="60"/>
+              <w:left w:type="dxa" w:w="90"/>
+              <w:bottom w:type="dxa" w:w="60"/>
+              <w:right w:type="dxa" w:w="90"/>
+            </w:tcMar>
+            <w:vAlign w:val="top"/>
+          </w:tcPr>
+          <w:p>
+            <w:pPr>
+              <w:spacing w:after="40"/>
+            </w:pPr>
+            <w:r>
+              <w:rPr>
+                <w:rFonts w:ascii="Calibri" w:cs="Calibri" w:eastAsia="Calibri" w:hAnsi="Calibri"/>
+                <w:color w:val="14213D"/>
+                <w:sz w:val="20"/>
+                <w:szCs w:val="20"/>
+              </w:rPr>
+              <w:t xml:space="preserve"/>
+            </w:r>
+          </w:p>
+          <w:p>
+            <w:pPr>
+              <w:spacing w:after="40"/>
+            </w:pPr>
+            <w:r>
+              <w:rPr>
+                <w:rFonts w:ascii="Calibri" w:cs="Calibri" w:eastAsia="Calibri" w:hAnsi="Calibri"/>
+                <w:color w:val="14213D"/>
+                <w:sz w:val="20"/>
+                <w:szCs w:val="20"/>
+              </w:rPr>
+              <w:t xml:space="preserve"/>
+            </w:r>
+          </w:p>
+        </w:tc>
+      </w:tr>
+      <w:tr>
+        <w:tc>
+          <w:tcPr>
+            <w:tcW w:type="dxa" w:w="2300"/>
+            <w:tcBorders>
+              <w:top w:val="single" w:color="D9D5CB" w:sz="4"/>
+              <w:left w:val="single" w:color="D9D5CB" w:sz="4"/>
+              <w:bottom w:val="single" w:color="D9D5CB" w:sz="4"/>
+              <w:right w:val="single" w:color="D9D5CB" w:sz="4"/>
+            </w:tcBorders>
+            <w:tcMar>
+              <w:top w:type="dxa" w:w="60"/>
+              <w:left w:type="dxa" w:w="90"/>
+              <w:bottom w:type="dxa" w:w="60"/>
+              <w:right w:type="dxa" w:w="90"/>
+            </w:tcMar>
+            <w:vAlign w:val="top"/>
+          </w:tcPr>
+          <w:p>
+            <w:pPr>
+              <w:spacing w:after="40"/>
+            </w:pPr>
+            <w:r>
+              <w:rPr>
+                <w:rFonts w:ascii="Calibri" w:cs="Calibri" w:eastAsia="Calibri" w:hAnsi="Calibri"/>
+                <w:b/>
+                <w:bCs/>
+                <w:color w:val="14213D"/>
+                <w:sz w:val="20"/>
+                <w:szCs w:val="20"/>
+              </w:rPr>
+              <w:t xml:space="preserve">Essai hydraulique par tronçons</w:t>
+            </w:r>
+          </w:p>
+        </w:tc>
+        <w:tc>
+          <w:tcPr>
+            <w:tcW w:type="dxa" w:w="4100"/>
+            <w:tcBorders>
+              <w:top w:val="single" w:color="D9D5CB" w:sz="4"/>
+              <w:left w:val="single" w:color="D9D5CB" w:sz="4"/>
+              <w:bottom w:val="single" w:color="D9D5CB" w:sz="4"/>
+              <w:right w:val="single" w:color="D9D5CB" w:sz="4"/>
+            </w:tcBorders>
+            <w:tcMar>
+              <w:top w:type="dxa" w:w="60"/>
+              <w:left w:type="dxa" w:w="90"/>
+              <w:bottom w:type="dxa" w:w="60"/>
+              <w:right w:type="dxa" w:w="90"/>
+            </w:tcMar>
+            <w:vAlign w:val="top"/>
+          </w:tcPr>
+          <w:p>
+            <w:pPr>
+              <w:spacing w:after="40"/>
+            </w:pPr>
+            <w:r>
+              <w:rPr>
+                <w:rFonts w:ascii="Calibri" w:cs="Calibri" w:eastAsia="Calibri" w:hAnsi="Calibri"/>
+                <w:color w:val="14213D"/>
+                <w:sz w:val="19"/>
+                <w:szCs w:val="19"/>
+              </w:rPr>
+              <w:t xml:space="preserve">Points techniques → Essai hydraulique : la cubature du chantier (depuis les quantités repérées), « ＋ Tronçon avec tout le reste » ou « ÷ Répartir le reste en N tronçons » ; chaque tronçon : ses DN, ses m³, et ce qu'il reçoit (épreuve, eau adoucie, rinçage, passivation, conservation, boulet). Le reste à couvrir s'affiche.</w:t>
+            </w:r>
+          </w:p>
+        </w:tc>
+        <w:tc>
+          <w:tcPr>
+            <w:tcW w:type="dxa" w:w="3700"/>
+            <w:tcBorders>
+              <w:top w:val="single" w:color="D9D5CB" w:sz="4"/>
+              <w:left w:val="single" w:color="D9D5CB" w:sz="4"/>
+              <w:bottom w:val="single" w:color="D9D5CB" w:sz="4"/>
+              <w:right w:val="single" w:color="D9D5CB" w:sz="4"/>
+            </w:tcBorders>
+            <w:tcMar>
+              <w:top w:type="dxa" w:w="60"/>
+              <w:left w:type="dxa" w:w="90"/>
+              <w:bottom w:type="dxa" w:w="60"/>
+              <w:right w:type="dxa" w:w="90"/>
+            </w:tcMar>
+            <w:vAlign w:val="top"/>
+          </w:tcPr>
+          <w:p>
+            <w:pPr>
+              <w:spacing w:after="40"/>
+            </w:pPr>
+            <w:r>
+              <w:rPr>
+                <w:rFonts w:ascii="Calibri" w:cs="Calibri" w:eastAsia="Calibri" w:hAnsi="Calibri"/>
+                <w:color w:val="14213D"/>
+                <w:sz w:val="19"/>
+                <w:szCs w:val="19"/>
+              </w:rPr>
+              <w:t xml:space="preserve">Dans le chiffrage, une zone d'épreuve par tronçon, avec ses prestations. Découpe sur le plan d'un chantier tracé : prochaine étape.</w:t>
+            </w:r>
+          </w:p>
+        </w:tc>
+        <w:tc>
+          <w:tcPr>
+            <w:tcW w:type="dxa" w:w="1300"/>
+            <w:tcBorders>
+              <w:top w:val="single" w:color="D9D5CB" w:sz="4"/>
+              <w:left w:val="single" w:color="D9D5CB" w:sz="4"/>
+              <w:bottom w:val="single" w:color="D9D5CB" w:sz="4"/>
+              <w:right w:val="single" w:color="D9D5CB" w:sz="4"/>
+            </w:tcBorders>
+            <w:shd w:fill="E6F5EC" w:color="auto" w:val="clear"/>
+            <w:tcMar>
+              <w:top w:type="dxa" w:w="60"/>
+              <w:left w:type="dxa" w:w="90"/>
+              <w:bottom w:type="dxa" w:w="60"/>
+              <w:right w:type="dxa" w:w="90"/>
+            </w:tcMar>
+            <w:vAlign w:val="top"/>
+          </w:tcPr>
+          <w:p>
+            <w:pPr>
+              <w:spacing w:after="40"/>
+            </w:pPr>
+            <w:r>
+              <w:rPr>
+                <w:rFonts w:ascii="Calibri" w:cs="Calibri" w:eastAsia="Calibri" w:hAnsi="Calibri"/>
+                <w:b/>
+                <w:bCs/>
+                <w:color w:val="14213D"/>
+                <w:sz w:val="19"/>
+                <w:szCs w:val="19"/>
+              </w:rPr>
+              <w:t xml:space="preserve">Fait</w:t>
+            </w:r>
+          </w:p>
+        </w:tc>
+        <w:tc>
+          <w:tcPr>
+            <w:tcW w:type="dxa" w:w="3700"/>
+            <w:tcBorders>
+              <w:top w:val="single" w:color="D9D5CB" w:sz="4"/>
+              <w:left w:val="single" w:color="D9D5CB" w:sz="4"/>
+              <w:bottom w:val="single" w:color="D9D5CB" w:sz="4"/>
+              <w:right w:val="single" w:color="D9D5CB" w:sz="4"/>
+            </w:tcBorders>
+            <w:tcMar>
+              <w:top w:type="dxa" w:w="60"/>
+              <w:left w:type="dxa" w:w="90"/>
+              <w:bottom w:type="dxa" w:w="60"/>
+              <w:right w:type="dxa" w:w="90"/>
+            </w:tcMar>
+            <w:vAlign w:val="top"/>
+          </w:tcPr>
+          <w:p>
+            <w:pPr>
+              <w:spacing w:after="40"/>
+            </w:pPr>
+            <w:r>
+              <w:rPr>
+                <w:rFonts w:ascii="Calibri" w:cs="Calibri" w:eastAsia="Calibri" w:hAnsi="Calibri"/>
+                <w:color w:val="14213D"/>
+                <w:sz w:val="20"/>
+                <w:szCs w:val="20"/>
+              </w:rPr>
+              <w:t xml:space="preserve"/>
+            </w:r>
+          </w:p>
+          <w:p>
+            <w:pPr>
+              <w:spacing w:after="40"/>
+            </w:pPr>
+            <w:r>
+              <w:rPr>
+                <w:rFonts w:ascii="Calibri" w:cs="Calibri" w:eastAsia="Calibri" w:hAnsi="Calibri"/>
+                <w:color w:val="14213D"/>
+                <w:sz w:val="20"/>
+                <w:szCs w:val="20"/>
+              </w:rPr>
+              <w:t xml:space="preserve"/>
+            </w:r>
+          </w:p>
+        </w:tc>
+      </w:tr>
+      <w:tr>
+        <w:tc>
+          <w:tcPr>
+            <w:tcW w:type="dxa" w:w="2300"/>
+            <w:tcBorders>
+              <w:top w:val="single" w:color="D9D5CB" w:sz="4"/>
+              <w:left w:val="single" w:color="D9D5CB" w:sz="4"/>
+              <w:bottom w:val="single" w:color="D9D5CB" w:sz="4"/>
+              <w:right w:val="single" w:color="D9D5CB" w:sz="4"/>
+            </w:tcBorders>
+            <w:tcMar>
+              <w:top w:type="dxa" w:w="60"/>
+              <w:left w:type="dxa" w:w="90"/>
+              <w:bottom w:type="dxa" w:w="60"/>
+              <w:right w:type="dxa" w:w="90"/>
+            </w:tcMar>
+            <w:vAlign w:val="top"/>
+          </w:tcPr>
+          <w:p>
+            <w:pPr>
+              <w:spacing w:after="40"/>
+            </w:pPr>
+            <w:r>
+              <w:rPr>
+                <w:rFonts w:ascii="Calibri" w:cs="Calibri" w:eastAsia="Calibri" w:hAnsi="Calibri"/>
+                <w:b/>
+                <w:bCs/>
+                <w:color w:val="14213D"/>
+                <w:sz w:val="20"/>
+                <w:szCs w:val="20"/>
+              </w:rPr>
+              <w:t xml:space="preserve">Boulet, aérien, fonçage</w:t>
+            </w:r>
+          </w:p>
+        </w:tc>
+        <w:tc>
+          <w:tcPr>
+            <w:tcW w:type="dxa" w:w="4100"/>
+            <w:tcBorders>
+              <w:top w:val="single" w:color="D9D5CB" w:sz="4"/>
+              <w:left w:val="single" w:color="D9D5CB" w:sz="4"/>
+              <w:bottom w:val="single" w:color="D9D5CB" w:sz="4"/>
+              <w:right w:val="single" w:color="D9D5CB" w:sz="4"/>
+            </w:tcBorders>
+            <w:tcMar>
+              <w:top w:type="dxa" w:w="60"/>
+              <w:left w:type="dxa" w:w="90"/>
+              <w:bottom w:type="dxa" w:w="60"/>
+              <w:right w:type="dxa" w:w="90"/>
+            </w:tcMar>
+            <w:vAlign w:val="top"/>
+          </w:tcPr>
+          <w:p>
+            <w:pPr>
+              <w:spacing w:after="40"/>
+            </w:pPr>
+            <w:r>
+              <w:rPr>
+                <w:rFonts w:ascii="Calibri" w:cs="Calibri" w:eastAsia="Calibri" w:hAnsi="Calibri"/>
+                <w:color w:val="14213D"/>
+                <w:sz w:val="19"/>
+                <w:szCs w:val="19"/>
+              </w:rPr>
+              <w:t xml:space="preserve">Boulet : DN + ml (ou « boulet » coché sur un tronçon). Aérien : coche Supports → type de support par ligne + nombre (1 tous les 3 m sous DN 125, tous les 2 m au-delà) ; coche Calorifuge → PVC ou Isoxal. Fonçage : nombre de colliers ((ml ÷ 1,5 m) + 2, × 2 tubes), segments selon la gaine, schéma.</w:t>
+            </w:r>
+          </w:p>
+        </w:tc>
+        <w:tc>
+          <w:tcPr>
+            <w:tcW w:type="dxa" w:w="3700"/>
+            <w:tcBorders>
+              <w:top w:val="single" w:color="D9D5CB" w:sz="4"/>
+              <w:left w:val="single" w:color="D9D5CB" w:sz="4"/>
+              <w:bottom w:val="single" w:color="D9D5CB" w:sz="4"/>
+              <w:right w:val="single" w:color="D9D5CB" w:sz="4"/>
+            </w:tcBorders>
+            <w:tcMar>
+              <w:top w:type="dxa" w:w="60"/>
+              <w:left w:type="dxa" w:w="90"/>
+              <w:bottom w:type="dxa" w:w="60"/>
+              <w:right w:type="dxa" w:w="90"/>
+            </w:tcMar>
+            <w:vAlign w:val="top"/>
+          </w:tcPr>
+          <w:p>
+            <w:pPr>
+              <w:spacing w:after="40"/>
+            </w:pPr>
+            <w:r>
+              <w:rPr>
+                <w:rFonts w:ascii="Calibri" w:cs="Calibri" w:eastAsia="Calibri" w:hAnsi="Calibri"/>
+                <w:color w:val="14213D"/>
+                <w:sz w:val="19"/>
+                <w:szCs w:val="19"/>
+              </w:rPr>
+              <w:t xml:space="preserve">Valeurs du classeur.</w:t>
+            </w:r>
+          </w:p>
+        </w:tc>
+        <w:tc>
+          <w:tcPr>
+            <w:tcW w:type="dxa" w:w="1300"/>
+            <w:tcBorders>
+              <w:top w:val="single" w:color="D9D5CB" w:sz="4"/>
+              <w:left w:val="single" w:color="D9D5CB" w:sz="4"/>
+              <w:bottom w:val="single" w:color="D9D5CB" w:sz="4"/>
+              <w:right w:val="single" w:color="D9D5CB" w:sz="4"/>
+            </w:tcBorders>
+            <w:shd w:fill="E6F5EC" w:color="auto" w:val="clear"/>
+            <w:tcMar>
+              <w:top w:type="dxa" w:w="60"/>
+              <w:left w:type="dxa" w:w="90"/>
+              <w:bottom w:type="dxa" w:w="60"/>
+              <w:right w:type="dxa" w:w="90"/>
+            </w:tcMar>
+            <w:vAlign w:val="top"/>
+          </w:tcPr>
+          <w:p>
+            <w:pPr>
+              <w:spacing w:after="40"/>
+            </w:pPr>
+            <w:r>
+              <w:rPr>
+                <w:rFonts w:ascii="Calibri" w:cs="Calibri" w:eastAsia="Calibri" w:hAnsi="Calibri"/>
+                <w:b/>
+                <w:bCs/>
+                <w:color w:val="14213D"/>
+                <w:sz w:val="19"/>
+                <w:szCs w:val="19"/>
+              </w:rPr>
+              <w:t xml:space="preserve">Fait</w:t>
+            </w:r>
+          </w:p>
+        </w:tc>
+        <w:tc>
+          <w:tcPr>
+            <w:tcW w:type="dxa" w:w="3700"/>
+            <w:tcBorders>
+              <w:top w:val="single" w:color="D9D5CB" w:sz="4"/>
+              <w:left w:val="single" w:color="D9D5CB" w:sz="4"/>
+              <w:bottom w:val="single" w:color="D9D5CB" w:sz="4"/>
+              <w:right w:val="single" w:color="D9D5CB" w:sz="4"/>
+            </w:tcBorders>
+            <w:tcMar>
+              <w:top w:type="dxa" w:w="60"/>
+              <w:left w:type="dxa" w:w="90"/>
+              <w:bottom w:type="dxa" w:w="60"/>
+              <w:right w:type="dxa" w:w="90"/>
+            </w:tcMar>
+            <w:vAlign w:val="top"/>
+          </w:tcPr>
+          <w:p>
+            <w:pPr>
+              <w:spacing w:after="40"/>
+            </w:pPr>
+            <w:r>
+              <w:rPr>
+                <w:rFonts w:ascii="Calibri" w:cs="Calibri" w:eastAsia="Calibri" w:hAnsi="Calibri"/>
+                <w:color w:val="14213D"/>
+                <w:sz w:val="20"/>
+                <w:szCs w:val="20"/>
+              </w:rPr>
+              <w:t xml:space="preserve"/>
+            </w:r>
+          </w:p>
+          <w:p>
+            <w:pPr>
+              <w:spacing w:after="40"/>
+            </w:pPr>
+            <w:r>
+              <w:rPr>
+                <w:rFonts w:ascii="Calibri" w:cs="Calibri" w:eastAsia="Calibri" w:hAnsi="Calibri"/>
+                <w:color w:val="14213D"/>
+                <w:sz w:val="20"/>
+                <w:szCs w:val="20"/>
+              </w:rPr>
+              <w:t xml:space="preserve"/>
+            </w:r>
+          </w:p>
+        </w:tc>
+      </w:tr>
+      <w:tr>
+        <w:tc>
+          <w:tcPr>
+            <w:tcW w:type="dxa" w:w="2300"/>
+            <w:tcBorders>
+              <w:top w:val="single" w:color="D9D5CB" w:sz="4"/>
+              <w:left w:val="single" w:color="D9D5CB" w:sz="4"/>
+              <w:bottom w:val="single" w:color="D9D5CB" w:sz="4"/>
+              <w:right w:val="single" w:color="D9D5CB" w:sz="4"/>
+            </w:tcBorders>
+            <w:tcMar>
+              <w:top w:type="dxa" w:w="60"/>
+              <w:left w:type="dxa" w:w="90"/>
+              <w:bottom w:type="dxa" w:w="60"/>
+              <w:right w:type="dxa" w:w="90"/>
+            </w:tcMar>
+            <w:vAlign w:val="top"/>
+          </w:tcPr>
+          <w:p>
+            <w:pPr>
+              <w:spacing w:after="40"/>
+            </w:pPr>
+            <w:r>
+              <w:rPr>
+                <w:rFonts w:ascii="Calibri" w:cs="Calibri" w:eastAsia="Calibri" w:hAnsi="Calibri"/>
+                <w:b/>
+                <w:bCs/>
+                <w:color w:val="14213D"/>
+                <w:sz w:val="20"/>
+                <w:szCs w:val="20"/>
+              </w:rPr>
+              <w:t xml:space="preserve">Pas encore fait (lots suivants)</w:t>
+            </w:r>
+          </w:p>
+        </w:tc>
+        <w:tc>
+          <w:tcPr>
+            <w:tcW w:type="dxa" w:w="4100"/>
+            <w:tcBorders>
+              <w:top w:val="single" w:color="D9D5CB" w:sz="4"/>
+              <w:left w:val="single" w:color="D9D5CB" w:sz="4"/>
+              <w:bottom w:val="single" w:color="D9D5CB" w:sz="4"/>
+              <w:right w:val="single" w:color="D9D5CB" w:sz="4"/>
+            </w:tcBorders>
+            <w:tcMar>
+              <w:top w:type="dxa" w:w="60"/>
+              <w:left w:type="dxa" w:w="90"/>
+              <w:bottom w:type="dxa" w:w="60"/>
+              <w:right w:type="dxa" w:w="90"/>
+            </w:tcMar>
+            <w:vAlign w:val="top"/>
+          </w:tcPr>
+          <w:p>
+            <w:pPr>
+              <w:spacing w:after="40"/>
+            </w:pPr>
+            <w:r>
+              <w:rPr>
+                <w:rFonts w:ascii="Calibri" w:cs="Calibri" w:eastAsia="Calibri" w:hAnsi="Calibri"/>
+                <w:color w:val="14213D"/>
+                <w:sz w:val="19"/>
+                <w:szCs w:val="19"/>
+              </w:rPr>
+              <w:t xml:space="preserve">—</w:t>
+            </w:r>
+          </w:p>
+        </w:tc>
+        <w:tc>
+          <w:tcPr>
+            <w:tcW w:type="dxa" w:w="3700"/>
+            <w:tcBorders>
+              <w:top w:val="single" w:color="D9D5CB" w:sz="4"/>
+              <w:left w:val="single" w:color="D9D5CB" w:sz="4"/>
+              <w:bottom w:val="single" w:color="D9D5CB" w:sz="4"/>
+              <w:right w:val="single" w:color="D9D5CB" w:sz="4"/>
+            </w:tcBorders>
+            <w:tcMar>
+              <w:top w:type="dxa" w:w="60"/>
+              <w:left w:type="dxa" w:w="90"/>
+              <w:bottom w:type="dxa" w:w="60"/>
+              <w:right w:type="dxa" w:w="90"/>
+            </w:tcMar>
+            <w:vAlign w:val="top"/>
+          </w:tcPr>
+          <w:p>
+            <w:pPr>
+              <w:spacing w:after="40"/>
+            </w:pPr>
+            <w:r>
+              <w:rPr>
+                <w:rFonts w:ascii="Calibri" w:cs="Calibri" w:eastAsia="Calibri" w:hAnsi="Calibri"/>
+                <w:color w:val="14213D"/>
+                <w:sz w:val="19"/>
+                <w:szCs w:val="19"/>
+              </w:rPr>
+              <w:t xml:space="preserve">3 · quantités fournisseur(s) vs tracé : il me faut une vraie étude fournisseur (Excel ou PDF). 4 · le mémoire « en mode lecture ». 5 · le contrôle croisé classeur ↔ appli.</w:t>
+            </w:r>
+          </w:p>
+        </w:tc>
+        <w:tc>
+          <w:tcPr>
+            <w:tcW w:type="dxa" w:w="1300"/>
+            <w:tcBorders>
+              <w:top w:val="single" w:color="D9D5CB" w:sz="4"/>
+              <w:left w:val="single" w:color="D9D5CB" w:sz="4"/>
+              <w:bottom w:val="single" w:color="D9D5CB" w:sz="4"/>
+              <w:right w:val="single" w:color="D9D5CB" w:sz="4"/>
+            </w:tcBorders>
+            <w:shd w:fill="FFF4EE" w:color="auto" w:val="clear"/>
+            <w:tcMar>
+              <w:top w:type="dxa" w:w="60"/>
+              <w:left w:type="dxa" w:w="90"/>
+              <w:bottom w:type="dxa" w:w="60"/>
+              <w:right w:type="dxa" w:w="90"/>
+            </w:tcMar>
+            <w:vAlign w:val="top"/>
+          </w:tcPr>
+          <w:p>
+            <w:pPr>
+              <w:spacing w:after="40"/>
+            </w:pPr>
+            <w:r>
+              <w:rPr>
+                <w:rFonts w:ascii="Calibri" w:cs="Calibri" w:eastAsia="Calibri" w:hAnsi="Calibri"/>
+                <w:b/>
+                <w:bCs/>
+                <w:color w:val="14213D"/>
+                <w:sz w:val="19"/>
+                <w:szCs w:val="19"/>
+              </w:rPr>
+              <w:t xml:space="preserve">À venir</w:t>
             </w:r>
           </w:p>
         </w:tc>

</xml_diff>

<commit_message>
Commerce : chiffrage complet (installations, récap, charge) + lots 3-4-5
</commit_message>
<xml_diff>
--- a/app/docs/Feuille_de_route_controle_12-10.docx
+++ b/app/docs/Feuille_de_route_controle_12-10.docx
@@ -29,7 +29,7 @@
           <w:sz w:val="22"/>
           <w:szCs w:val="22"/>
         </w:rPr>
-        <w:t xml:space="preserve">12 octobre 2026 · mise à jour de la nuit du 13/10 : le responsable d'un chantier y entre toujours (Sofiane) · le plan de Nantes Géraudière qui disparaissait au zoom (réparé + « Recentrer le repère ») · le soir : GRANDS DÉPLACEMENTS jour par jour (4 ou 5 jours = même forfait), le mois par gars avec nuits et repas accordés, la navette, les adresses à vérifier · FOURNITURE : zone éditable, trame type d'import, écarts « commande complémentaire / inclus », BL de zone → Stock · l'après-midi : COMMERCE v2 (dossier déballé, lecture des pièces avec surlignage, chiffrage complet d'après ton classeur du 26.08, paniers, base de prix, DPGF traduite et réécrite dans l'Excel du client, blocs du mémoire) · le matin : onglet FOURNITURE (commande, livré, reste, zones à livrer, camions datés) et tes retours de la feuille du 09-10 (adresses, détente automatique, contrôle des grands déplacements, plein écran, trame d'accueil) · puis la nuit du 12/10 : six onglets, Commerce, Parc, Sécurité, accidents, Outlook serveur · nouvelle ventilation, « agir comme », raccourci rapide du planning, « ma semaine », tes commentaires du Word (sections 5 à 9) · une colonne pour tes retours</w:t>
+        <w:t xml:space="preserve">12 octobre 2026 · mise à jour du 13/10 (après-midi) : COMMERCE — quantités fournisseur par la trame, mémoire en mode lecture, contrôle croisé classeur ↔ appli, et le chiffrage qui remplace le classeur (base de prix, paniers dépliés, Installations, récap, charge et équipes) · fin de matinée : lecture des pièces et points techniques · la nuit du 13/10 : le responsable d'un chantier y entre toujours (Sofiane) · le plan de Nantes Géraudière qui disparaissait au zoom (réparé + « Recentrer le repère ») · le soir : GRANDS DÉPLACEMENTS jour par jour (4 ou 5 jours = même forfait), le mois par gars avec nuits et repas accordés, la navette, les adresses à vérifier · FOURNITURE : zone éditable, trame type d'import, écarts « commande complémentaire / inclus », BL de zone → Stock · l'après-midi : COMMERCE v2 (dossier déballé, lecture des pièces avec surlignage, chiffrage complet d'après ton classeur du 26.08, paniers, base de prix, DPGF traduite et réécrite dans l'Excel du client, blocs du mémoire) · le matin : onglet FOURNITURE (commande, livré, reste, zones à livrer, camions datés) et tes retours de la feuille du 09-10 (adresses, détente automatique, contrôle des grands déplacements, plein écran, trame d'accueil) · puis la nuit du 12/10 : six onglets, Commerce, Parc, Sécurité, accidents, Outlook serveur · nouvelle ventilation, « agir comme », raccourci rapide du planning, « ma semaine », tes commentaires du Word (sections 5 à 9) · une colonne pour tes retours</w:t>
       </w:r>
     </w:p>
     <w:p>
@@ -65,7 +65,7 @@
           <w:sz w:val="20"/>
           <w:szCs w:val="20"/>
         </w:rPr>
-        <w:t xml:space="preserve">Même principe que la précédente : tu contrôles ligne par ligne, tu écris dans « Vos commentaires » (OK / à corriger / à changer : quoi), tu me renvoies le fichier. Je corrige à partir de tes commentaires, dans l'ordre du document. Commence par la section R (compteurs d'heures, « Moi » : ma navette, PDF du livret), puis Q (champs date, plafond 48 h, règles GD vérifiées), puis P (la navette de paie au format SCR), puis O (Nantes : la carte après le recentrage, et le contrôle des SQL), puis N (Sofiane et le chantier de Nantes) et M (Nantes Géraudière : le plan qui disparaît au zoom), puis L (grands déplacements et fourniture), puis K (Commerce v2 : dossier, lecture, chiffrage, DPGF, mémoire), puis I (l'onglet Fourniture), puis J (tes retours de la feuille du 09-10 : c'est la seule feuille à suivre désormais — l'ancienne n'est plus livrée), puis H (Commerce de A à Z), G (la nuit) et F (tes retours du 12/10 soir).</w:t>
+        <w:t xml:space="preserve">Même principe que la précédente : tu contrôles ligne par ligne, tu écris dans « Vos commentaires » (OK / à corriger / à changer : quoi), tu me renvoies le fichier. Je corrige à partir de tes commentaires, dans l'ordre du document. Commence par la section T (Commerce : quantités fournisseur, mémoire, contrôle croisé, tes retours sur la lecture et les points techniques, le chiffrage qui remplace le classeur), puis S (lecture des pièces et points techniques), puis R (compteurs d'heures, « Moi » : ma navette, PDF du livret), puis Q (champs date, plafond 48 h, règles GD vérifiées), puis P (la navette de paie au format SCR), puis O (Nantes : la carte après le recentrage, et le contrôle des SQL), puis N (Sofiane et le chantier de Nantes) et M (Nantes Géraudière : le plan qui disparaît au zoom), puis L (grands déplacements et fourniture), puis K (Commerce v2 : dossier, lecture, chiffrage, DPGF, mémoire), puis I (l'onglet Fourniture), puis J (tes retours de la feuille du 09-10 : c'est la seule feuille à suivre désormais — l'ancienne n'est plus livrée), puis H (Commerce de A à Z), G (la nuit) et F (tes retours du 12/10 soir).</w:t>
       </w:r>
     </w:p>
     <w:p>
@@ -84,7 +84,7 @@
           <w:sz w:val="20"/>
           <w:szCs w:val="20"/>
         </w:rPr>
-        <w:t xml:space="preserve">Build livré : 13/10/2026 · 638b71 (index.html + traceur.html à la racine du dépôt). SQL pour la section R : retours_13-10d.sql (compteurs d'heures). Pas de SQL pour les sections Q, P, O, N et M (le contrôle des SQL de la section O ne modifie rien). Tous les SQL sont passés (toi, 13/10 au soir) : ta base est à jour. Nouveau SQL du soir : retours_13-10c.sql (qualifications des écarts de fourniture réunies entre deux tablettes). SQL de l'après-midi : retours_13-10b.sql (base de prix et paniers : registres « prix » et « panier », lecture réservée à l'encadrement / bureau), blocs_memoire_scr.sql (ton mémoire O2410-10 découpé en 10 blocs réutilisables) (retours_13-10.sql de l'onglet Fourniture est inclus dans retours_13-10c.sql). SQL retours_12-10.sql et retours_12-10b.sql passés, fonction outlook-sync déployée et vérifiée par toi le 12/10 au soir (« ça fonctionne parfaitement »). Hors connexion, tout se teste avec les personnages de démo.</w:t>
+        <w:t xml:space="preserve">Build livré : 13/10/2026 · da9f25 (index.html + traceur.html à la racine du dépôt). SQL pour la section T : retours_13-10e.sql (la base de prix modifiable seulement avec le droit « Base de prix SCR : modifier » ; contient retours_13-10d.sql). SQL pour la section R : retours_13-10d.sql (compteurs d'heures) — inclus dans 13-10e. Pas de SQL pour les sections Q, P, O, N et M (le contrôle des SQL de la section O ne modifie rien). Tous les SQL sont passés (toi, 13/10 au soir) : ta base est à jour. Nouveau SQL du soir : retours_13-10c.sql (qualifications des écarts de fourniture réunies entre deux tablettes). SQL de l'après-midi : retours_13-10b.sql (base de prix et paniers : registres « prix » et « panier », lecture réservée à l'encadrement / bureau), blocs_memoire_scr.sql (ton mémoire O2410-10 découpé en 10 blocs réutilisables) (retours_13-10.sql de l'onglet Fourniture est inclus dans retours_13-10c.sql). SQL retours_12-10.sql et retours_12-10b.sql passés, fonction outlook-sync déployée et vérifiée par toi le 12/10 au soir (« ça fonctionne parfaitement »). Hors connexion, tout se teste avec les personnages de démo.</w:t>
       </w:r>
     </w:p>
     <w:p>
@@ -103,7 +103,7 @@
           <w:sz w:val="20"/>
           <w:szCs w:val="20"/>
         </w:rPr>
-        <w:t xml:space="preserve">Règle gardée : rien d'ancien n'est supprimé ; 52 suites de tests automatiques passent, dont e2e_resp (responsable du chantier = accès) et e2e_rebase (réseau à 1 985 km de l'origine : visible à 19,6 px/m, bandeau, recentrage, fils de nouveau justes au zoom) et les deux du soir : e2e_gdnav (4 jours = 5 nuitées / 10 repas / 15 €, « pas de détente » = 7 / 14 / 0 €, le mois de Julien, l'ajustement d'un jour, la navette CSV, novembre avec la Toussaint et un lundi non travaillé, les adresses à vérifier) et e2e_fourn2 (à la SOURIS réelle : tracer, glisser, insérer, retirer, annuler, reprendre et modifier un contour, boutons du plan ; trame copiée / téléchargée / collée ; écarts qualifiés et commande complémentaire ; BL de zone → Excel → Stock ; trame dans Stock ; classeur fournisseur avec la trame en 2e feuille), puis e2e_commerce2 (8 étapes : import du classeur, zone et table des DN, SST / purges / contrôles / hydraulique / panier libre, récap et base de prix, dossier déballé, lecture PDF avec surlignage, Word et points techniques, DPGF réécrite dans l'Excel) et deux de la veille : e2e_fourniture (11 points : commande collée, comparatif, pièces en plus, livré lu dans Stock, zone entourée au doigt, zone du phasage, camions datés, annonce et pointage dans Stock, droits, téléphone, lecteur de lignes PDF, zones qui se chevauchent) et e2e_retours13 (n° d'affaire, plein écran, repas, adresses, détente automatique sur 5 semaines, accords, vue par personne, CSV).</w:t>
+        <w:t xml:space="preserve">Règle gardée : rien d'ancien n'est supprimé ; 63 suites de tests automatiques passent, dont celles de la section T (e2e_qsets, e2e_memoire2, e2e_ctrlcl, classeur_test, e2e_chiffrage3 ; e2e_lecture3 et e2e_points2 étendues), et e2e_resp (responsable du chantier = accès) et e2e_rebase (réseau à 1 985 km de l'origine : visible à 19,6 px/m, bandeau, recentrage, fils de nouveau justes au zoom) et les deux du soir : e2e_gdnav (4 jours = 5 nuitées / 10 repas / 15 €, « pas de détente » = 7 / 14 / 0 €, le mois de Julien, l'ajustement d'un jour, la navette CSV, novembre avec la Toussaint et un lundi non travaillé, les adresses à vérifier) et e2e_fourn2 (à la SOURIS réelle : tracer, glisser, insérer, retirer, annuler, reprendre et modifier un contour, boutons du plan ; trame copiée / téléchargée / collée ; écarts qualifiés et commande complémentaire ; BL de zone → Excel → Stock ; trame dans Stock ; classeur fournisseur avec la trame en 2e feuille), puis e2e_commerce2 (8 étapes : import du classeur, zone et table des DN, SST / purges / contrôles / hydraulique / panier libre, récap et base de prix, dossier déballé, lecture PDF avec surlignage, Word et points techniques, DPGF réécrite dans l'Excel) et deux de la veille : e2e_fourniture (11 points : commande collée, comparatif, pièces en plus, livré lu dans Stock, zone entourée au doigt, zone du phasage, camions datés, annonce et pointage dans Stock, droits, téléphone, lecteur de lignes PDF, zones qui se chevauchent) et e2e_retours13 (n° d'affaire, plein écran, repas, adresses, détente automatique sur 5 semaines, accords, vue par personne, CSV).</w:t>
       </w:r>
     </w:p>
     <w:p>
@@ -300,7 +300,7 @@
                 <w:sz w:val="19"/>
                 <w:szCs w:val="19"/>
               </w:rPr>
-              <w:t xml:space="preserve">app/sql/retours_13-10d.sql (NOUVEAU — à passer)</w:t>
+              <w:t xml:space="preserve">app/sql/retours_13-10e.sql (NOUVEAU — à passer ; contient 13-10d)</w:t>
             </w:r>
           </w:p>
         </w:tc>
@@ -332,7 +332,7 @@
                 <w:sz w:val="19"/>
                 <w:szCs w:val="19"/>
               </w:rPr>
-              <w:t xml:space="preserve">Compteurs d'heures par personne : nouveau registre « cpth » (contrat, compteurs suivis, soldes, primes). Écriture : RH / bureau / encadrement ; lecture : l'encadrement, ou la personne elle-même (chacun ne voit que son compteur). Contient tout retours_13-10b.sql. Testé sur une base Postgres locale (bureau écrit, soudeur refusé, chacun ne lit que sa ligne). Sans ce SQL : les compteurs restent sur l'appareil (message « passe le SQL retours_13-10d.sql »).</w:t>
+              <w:t xml:space="preserve">Base de prix SCR : seules les personnes qui ont le droit « Base de prix SCR : modifier » peuvent l'écrire (registres « prix » et « panier ») — le gérant d'office, l'administrateur (toi), et ceux que tu coches dans Administrateur → la personne (Jérôme). La lecture ne change pas (encadrement / bureau). Testé sur une base Postgres locale : gérant, Jérôme coché, droit donné au poste, administrateur → écrit ; conducteur, gérant décoché → refusé ; les affaires ne changent pas. Sans ce SQL : l'appli applique déjà le droit, le serveur suit l'ancienne règle (encadrement / bureau).</w:t>
             </w:r>
           </w:p>
         </w:tc>
@@ -414,7 +414,121 @@
                 <w:sz w:val="19"/>
                 <w:szCs w:val="19"/>
               </w:rPr>
-              <w:t xml:space="preserve">app/sql/controle_sql.sql (LECTURE SEULE, à relancer après chaque nouveau SQL — ligne 20 ajoutée)</w:t>
+              <w:t xml:space="preserve">app/sql/retours_13-10d.sql (inclus dans 13-10e — inutile si tu passes 13-10e)</w:t>
+            </w:r>
+          </w:p>
+        </w:tc>
+        <w:tc>
+          <w:tcPr>
+            <w:tcW w:type="dxa" w:w="8100"/>
+            <w:tcBorders>
+              <w:top w:val="single" w:color="D9D5CB" w:sz="4"/>
+              <w:left w:val="single" w:color="D9D5CB" w:sz="4"/>
+              <w:bottom w:val="single" w:color="D9D5CB" w:sz="4"/>
+              <w:right w:val="single" w:color="D9D5CB" w:sz="4"/>
+            </w:tcBorders>
+            <w:tcMar>
+              <w:top w:type="dxa" w:w="60"/>
+              <w:left w:type="dxa" w:w="90"/>
+              <w:bottom w:type="dxa" w:w="60"/>
+              <w:right w:type="dxa" w:w="90"/>
+            </w:tcMar>
+            <w:vAlign w:val="top"/>
+          </w:tcPr>
+          <w:p>
+            <w:pPr>
+              <w:spacing w:after="40"/>
+            </w:pPr>
+            <w:r>
+              <w:rPr>
+                <w:rFonts w:ascii="Calibri" w:cs="Calibri" w:eastAsia="Calibri" w:hAnsi="Calibri"/>
+                <w:color w:val="14213D"/>
+                <w:sz w:val="19"/>
+                <w:szCs w:val="19"/>
+              </w:rPr>
+              <w:t xml:space="preserve">Compteurs d'heures par personne : nouveau registre « cpth » (contrat, compteurs suivis, soldes, primes). Écriture : RH / bureau / encadrement ; lecture : l'encadrement, ou la personne elle-même (chacun ne voit que son compteur). Contient tout retours_13-10b.sql. Testé sur une base Postgres locale (bureau écrit, soudeur refusé, chacun ne lit que sa ligne). Sans ce SQL : les compteurs restent sur l'appareil (message « passe le SQL retours_13-10d.sql »).</w:t>
+            </w:r>
+          </w:p>
+        </w:tc>
+        <w:tc>
+          <w:tcPr>
+            <w:tcW w:type="dxa" w:w="3800"/>
+            <w:tcBorders>
+              <w:top w:val="single" w:color="D9D5CB" w:sz="4"/>
+              <w:left w:val="single" w:color="D9D5CB" w:sz="4"/>
+              <w:bottom w:val="single" w:color="D9D5CB" w:sz="4"/>
+              <w:right w:val="single" w:color="D9D5CB" w:sz="4"/>
+            </w:tcBorders>
+            <w:tcMar>
+              <w:top w:type="dxa" w:w="60"/>
+              <w:left w:type="dxa" w:w="90"/>
+              <w:bottom w:type="dxa" w:w="60"/>
+              <w:right w:type="dxa" w:w="90"/>
+            </w:tcMar>
+            <w:vAlign w:val="top"/>
+          </w:tcPr>
+          <w:p>
+            <w:pPr>
+              <w:spacing w:after="40"/>
+            </w:pPr>
+            <w:r>
+              <w:rPr>
+                <w:rFonts w:ascii="Calibri" w:cs="Calibri" w:eastAsia="Calibri" w:hAnsi="Calibri"/>
+                <w:color w:val="14213D"/>
+                <w:sz w:val="20"/>
+                <w:szCs w:val="20"/>
+              </w:rPr>
+              <w:t xml:space="preserve"/>
+            </w:r>
+          </w:p>
+          <w:p>
+            <w:pPr>
+              <w:spacing w:after="40"/>
+            </w:pPr>
+            <w:r>
+              <w:rPr>
+                <w:rFonts w:ascii="Calibri" w:cs="Calibri" w:eastAsia="Calibri" w:hAnsi="Calibri"/>
+                <w:color w:val="14213D"/>
+                <w:sz w:val="20"/>
+                <w:szCs w:val="20"/>
+              </w:rPr>
+              <w:t xml:space="preserve"/>
+            </w:r>
+          </w:p>
+        </w:tc>
+      </w:tr>
+      <w:tr>
+        <w:tc>
+          <w:tcPr>
+            <w:tcW w:type="dxa" w:w="3200"/>
+            <w:tcBorders>
+              <w:top w:val="single" w:color="D9D5CB" w:sz="4"/>
+              <w:left w:val="single" w:color="D9D5CB" w:sz="4"/>
+              <w:bottom w:val="single" w:color="D9D5CB" w:sz="4"/>
+              <w:right w:val="single" w:color="D9D5CB" w:sz="4"/>
+            </w:tcBorders>
+            <w:tcMar>
+              <w:top w:type="dxa" w:w="60"/>
+              <w:left w:type="dxa" w:w="90"/>
+              <w:bottom w:type="dxa" w:w="60"/>
+              <w:right w:type="dxa" w:w="90"/>
+            </w:tcMar>
+            <w:vAlign w:val="top"/>
+          </w:tcPr>
+          <w:p>
+            <w:pPr>
+              <w:spacing w:after="40"/>
+            </w:pPr>
+            <w:r>
+              <w:rPr>
+                <w:rFonts w:ascii="Calibri" w:cs="Calibri" w:eastAsia="Calibri" w:hAnsi="Calibri"/>
+                <w:b/>
+                <w:bCs/>
+                <w:color w:val="14213D"/>
+                <w:sz w:val="19"/>
+                <w:szCs w:val="19"/>
+              </w:rPr>
+              <w:t xml:space="preserve">app/sql/controle_sql.sql (LECTURE SEULE, à relancer après chaque nouveau SQL — ligne 21 ajoutée)</w:t>
             </w:r>
           </w:p>
         </w:tc>
@@ -12665,6 +12779,2952 @@
           <w:sz w:val="30"/>
           <w:szCs w:val="30"/>
         </w:rPr>
+        <w:t xml:space="preserve">T · Commerce : quantités fournisseur, mémoire, contrôle croisé, tes retours, et le chiffrage qui remplace le classeur (13/10 après-midi)</w:t>
+      </w:r>
+    </w:p>
+    <w:p>
+      <w:pPr>
+        <w:spacing w:after="80" w:line="264"/>
+      </w:pPr>
+      <w:r>
+        <w:rPr>
+          <w:rFonts w:ascii="Calibri" w:cs="Calibri" w:eastAsia="Calibri" w:hAnsi="Calibri"/>
+          <w:color w:val="6B6B66"/>
+          <w:sz w:val="20"/>
+          <w:szCs w:val="20"/>
+        </w:rPr>
+        <w:t xml:space="preserve">Tout est testé hors connexion. Le contrôle croisé a été validé sur ton vrai classeur V42 (rempli par moi avec 3 chantiers fictifs) : l'appli retombe au centime, poste par poste, sauf les écarts expliqués — et il a trouvé 5 erreurs du moteur, corrigées (ligne « 5 erreurs »).</w:t>
+      </w:r>
+    </w:p>
+    <w:tbl>
+      <w:tblPr>
+        <w:tblW w:type="dxa" w:w="15100"/>
+        <w:tblBorders>
+          <w:top w:val="single" w:color="auto" w:sz="4"/>
+          <w:left w:val="single" w:color="auto" w:sz="4"/>
+          <w:bottom w:val="single" w:color="auto" w:sz="4"/>
+          <w:right w:val="single" w:color="auto" w:sz="4"/>
+          <w:insideH w:val="single" w:color="auto" w:sz="4"/>
+          <w:insideV w:val="single" w:color="auto" w:sz="4"/>
+        </w:tblBorders>
+      </w:tblPr>
+      <w:tblGrid>
+        <w:gridCol w:w="2300"/>
+        <w:gridCol w:w="4100"/>
+        <w:gridCol w:w="3700"/>
+        <w:gridCol w:w="1300"/>
+        <w:gridCol w:w="3700"/>
+      </w:tblGrid>
+      <w:tr>
+        <w:trPr>
+          <w:tblHeader/>
+        </w:trPr>
+        <w:tc>
+          <w:tcPr>
+            <w:tcW w:type="dxa" w:w="2300"/>
+            <w:tcBorders>
+              <w:top w:val="single" w:color="D9D5CB" w:sz="4"/>
+              <w:left w:val="single" w:color="D9D5CB" w:sz="4"/>
+              <w:bottom w:val="single" w:color="D9D5CB" w:sz="4"/>
+              <w:right w:val="single" w:color="D9D5CB" w:sz="4"/>
+            </w:tcBorders>
+            <w:shd w:fill="14213D" w:color="auto" w:val="clear"/>
+            <w:tcMar>
+              <w:top w:type="dxa" w:w="60"/>
+              <w:left w:type="dxa" w:w="90"/>
+              <w:bottom w:type="dxa" w:w="60"/>
+              <w:right w:type="dxa" w:w="90"/>
+            </w:tcMar>
+            <w:vAlign w:val="top"/>
+          </w:tcPr>
+          <w:p>
+            <w:pPr>
+              <w:spacing w:after="80" w:line="264"/>
+            </w:pPr>
+            <w:r>
+              <w:rPr>
+                <w:rFonts w:ascii="Calibri" w:cs="Calibri" w:eastAsia="Calibri" w:hAnsi="Calibri"/>
+                <w:b/>
+                <w:bCs/>
+                <w:color w:val="FFFFFF"/>
+                <w:sz w:val="19"/>
+                <w:szCs w:val="19"/>
+              </w:rPr>
+              <w:t xml:space="preserve">Fonctionnalité</w:t>
+            </w:r>
+          </w:p>
+        </w:tc>
+        <w:tc>
+          <w:tcPr>
+            <w:tcW w:type="dxa" w:w="4100"/>
+            <w:tcBorders>
+              <w:top w:val="single" w:color="D9D5CB" w:sz="4"/>
+              <w:left w:val="single" w:color="D9D5CB" w:sz="4"/>
+              <w:bottom w:val="single" w:color="D9D5CB" w:sz="4"/>
+              <w:right w:val="single" w:color="D9D5CB" w:sz="4"/>
+            </w:tcBorders>
+            <w:shd w:fill="14213D" w:color="auto" w:val="clear"/>
+            <w:tcMar>
+              <w:top w:type="dxa" w:w="60"/>
+              <w:left w:type="dxa" w:w="90"/>
+              <w:bottom w:type="dxa" w:w="60"/>
+              <w:right w:type="dxa" w:w="90"/>
+            </w:tcMar>
+            <w:vAlign w:val="top"/>
+          </w:tcPr>
+          <w:p>
+            <w:pPr>
+              <w:spacing w:after="80" w:line="264"/>
+            </w:pPr>
+            <w:r>
+              <w:rPr>
+                <w:rFonts w:ascii="Calibri" w:cs="Calibri" w:eastAsia="Calibri" w:hAnsi="Calibri"/>
+                <w:b/>
+                <w:bCs/>
+                <w:color w:val="FFFFFF"/>
+                <w:sz w:val="19"/>
+                <w:szCs w:val="19"/>
+              </w:rPr>
+              <w:t xml:space="preserve">Où la trouver · comment tester</w:t>
+            </w:r>
+          </w:p>
+        </w:tc>
+        <w:tc>
+          <w:tcPr>
+            <w:tcW w:type="dxa" w:w="3700"/>
+            <w:tcBorders>
+              <w:top w:val="single" w:color="D9D5CB" w:sz="4"/>
+              <w:left w:val="single" w:color="D9D5CB" w:sz="4"/>
+              <w:bottom w:val="single" w:color="D9D5CB" w:sz="4"/>
+              <w:right w:val="single" w:color="D9D5CB" w:sz="4"/>
+            </w:tcBorders>
+            <w:shd w:fill="14213D" w:color="auto" w:val="clear"/>
+            <w:tcMar>
+              <w:top w:type="dxa" w:w="60"/>
+              <w:left w:type="dxa" w:w="90"/>
+              <w:bottom w:type="dxa" w:w="60"/>
+              <w:right w:type="dxa" w:w="90"/>
+            </w:tcMar>
+            <w:vAlign w:val="top"/>
+          </w:tcPr>
+          <w:p>
+            <w:pPr>
+              <w:spacing w:after="80" w:line="264"/>
+            </w:pPr>
+            <w:r>
+              <w:rPr>
+                <w:rFonts w:ascii="Calibri" w:cs="Calibri" w:eastAsia="Calibri" w:hAnsi="Calibri"/>
+                <w:b/>
+                <w:bCs/>
+                <w:color w:val="FFFFFF"/>
+                <w:sz w:val="19"/>
+                <w:szCs w:val="19"/>
+              </w:rPr>
+              <w:t xml:space="preserve">Hypothèses · limites · ce que j'ai tranché</w:t>
+            </w:r>
+          </w:p>
+        </w:tc>
+        <w:tc>
+          <w:tcPr>
+            <w:tcW w:type="dxa" w:w="1300"/>
+            <w:tcBorders>
+              <w:top w:val="single" w:color="D9D5CB" w:sz="4"/>
+              <w:left w:val="single" w:color="D9D5CB" w:sz="4"/>
+              <w:bottom w:val="single" w:color="D9D5CB" w:sz="4"/>
+              <w:right w:val="single" w:color="D9D5CB" w:sz="4"/>
+            </w:tcBorders>
+            <w:shd w:fill="14213D" w:color="auto" w:val="clear"/>
+            <w:tcMar>
+              <w:top w:type="dxa" w:w="60"/>
+              <w:left w:type="dxa" w:w="90"/>
+              <w:bottom w:type="dxa" w:w="60"/>
+              <w:right w:type="dxa" w:w="90"/>
+            </w:tcMar>
+            <w:vAlign w:val="top"/>
+          </w:tcPr>
+          <w:p>
+            <w:pPr>
+              <w:spacing w:after="80" w:line="264"/>
+            </w:pPr>
+            <w:r>
+              <w:rPr>
+                <w:rFonts w:ascii="Calibri" w:cs="Calibri" w:eastAsia="Calibri" w:hAnsi="Calibri"/>
+                <w:b/>
+                <w:bCs/>
+                <w:color w:val="FFFFFF"/>
+                <w:sz w:val="19"/>
+                <w:szCs w:val="19"/>
+              </w:rPr>
+              <w:t xml:space="preserve">Statut</w:t>
+            </w:r>
+          </w:p>
+        </w:tc>
+        <w:tc>
+          <w:tcPr>
+            <w:tcW w:type="dxa" w:w="3700"/>
+            <w:tcBorders>
+              <w:top w:val="single" w:color="D9D5CB" w:sz="4"/>
+              <w:left w:val="single" w:color="D9D5CB" w:sz="4"/>
+              <w:bottom w:val="single" w:color="D9D5CB" w:sz="4"/>
+              <w:right w:val="single" w:color="D9D5CB" w:sz="4"/>
+            </w:tcBorders>
+            <w:shd w:fill="14213D" w:color="auto" w:val="clear"/>
+            <w:tcMar>
+              <w:top w:type="dxa" w:w="60"/>
+              <w:left w:type="dxa" w:w="90"/>
+              <w:bottom w:type="dxa" w:w="60"/>
+              <w:right w:type="dxa" w:w="90"/>
+            </w:tcMar>
+            <w:vAlign w:val="top"/>
+          </w:tcPr>
+          <w:p>
+            <w:pPr>
+              <w:spacing w:after="80" w:line="264"/>
+            </w:pPr>
+            <w:r>
+              <w:rPr>
+                <w:rFonts w:ascii="Calibri" w:cs="Calibri" w:eastAsia="Calibri" w:hAnsi="Calibri"/>
+                <w:b/>
+                <w:bCs/>
+                <w:color w:val="FFFFFF"/>
+                <w:sz w:val="19"/>
+                <w:szCs w:val="19"/>
+              </w:rPr>
+              <w:t xml:space="preserve">Vos commentaires</w:t>
+            </w:r>
+          </w:p>
+        </w:tc>
+      </w:tr>
+      <w:tr>
+        <w:tc>
+          <w:tcPr>
+            <w:tcW w:type="dxa" w:w="2300"/>
+            <w:tcBorders>
+              <w:top w:val="single" w:color="D9D5CB" w:sz="4"/>
+              <w:left w:val="single" w:color="D9D5CB" w:sz="4"/>
+              <w:bottom w:val="single" w:color="D9D5CB" w:sz="4"/>
+              <w:right w:val="single" w:color="D9D5CB" w:sz="4"/>
+            </w:tcBorders>
+            <w:tcMar>
+              <w:top w:type="dxa" w:w="60"/>
+              <w:left w:type="dxa" w:w="90"/>
+              <w:bottom w:type="dxa" w:w="60"/>
+              <w:right w:type="dxa" w:w="90"/>
+            </w:tcMar>
+            <w:vAlign w:val="top"/>
+          </w:tcPr>
+          <w:p>
+            <w:pPr>
+              <w:spacing w:after="40"/>
+            </w:pPr>
+            <w:r>
+              <w:rPr>
+                <w:rFonts w:ascii="Calibri" w:cs="Calibri" w:eastAsia="Calibri" w:hAnsi="Calibri"/>
+                <w:b/>
+                <w:bCs/>
+                <w:color w:val="14213D"/>
+                <w:sz w:val="20"/>
+                <w:szCs w:val="20"/>
+              </w:rPr>
+              <w:t xml:space="preserve">Quantités fournisseur : la trame (lot 3)</w:t>
+            </w:r>
+          </w:p>
+        </w:tc>
+        <w:tc>
+          <w:tcPr>
+            <w:tcW w:type="dxa" w:w="4100"/>
+            <w:tcBorders>
+              <w:top w:val="single" w:color="D9D5CB" w:sz="4"/>
+              <w:left w:val="single" w:color="D9D5CB" w:sz="4"/>
+              <w:bottom w:val="single" w:color="D9D5CB" w:sz="4"/>
+              <w:right w:val="single" w:color="D9D5CB" w:sz="4"/>
+            </w:tcBorders>
+            <w:tcMar>
+              <w:top w:type="dxa" w:w="60"/>
+              <w:left w:type="dxa" w:w="90"/>
+              <w:bottom w:type="dxa" w:w="60"/>
+              <w:right w:type="dxa" w:w="90"/>
+            </w:tcMar>
+            <w:vAlign w:val="top"/>
+          </w:tcPr>
+          <w:p>
+            <w:pPr>
+              <w:spacing w:after="40"/>
+            </w:pPr>
+            <w:r>
+              <w:rPr>
+                <w:rFonts w:ascii="Calibri" w:cs="Calibri" w:eastAsia="Calibri" w:hAnsi="Calibri"/>
+                <w:color w:val="14213D"/>
+                <w:sz w:val="19"/>
+                <w:szCs w:val="19"/>
+              </w:rPr>
+              <w:t xml:space="preserve">Commerce → une affaire → 2 · Lecture → carte « Quantités · études » : 📋 Trame type SCR (⬇ Excel ou copier l'en-tête). Colle le quantitatif du fournisseur dans Excel, ✨ copie la consigne et demande à Claude Excel de remplir la trame. ⬆ Importer une étude → colle la trame remplie (ou le fichier). Les lignes refusées sont listées avec leur raison ; la synthèse par DN s'affiche avant de valider.</w:t>
+            </w:r>
+          </w:p>
+        </w:tc>
+        <w:tc>
+          <w:tcPr>
+            <w:tcW w:type="dxa" w:w="3700"/>
+            <w:tcBorders>
+              <w:top w:val="single" w:color="D9D5CB" w:sz="4"/>
+              <w:left w:val="single" w:color="D9D5CB" w:sz="4"/>
+              <w:bottom w:val="single" w:color="D9D5CB" w:sz="4"/>
+              <w:right w:val="single" w:color="D9D5CB" w:sz="4"/>
+            </w:tcBorders>
+            <w:tcMar>
+              <w:top w:type="dxa" w:w="60"/>
+              <w:left w:type="dxa" w:w="90"/>
+              <w:bottom w:type="dxa" w:w="60"/>
+              <w:right w:type="dxa" w:w="90"/>
+            </w:tcMar>
+            <w:vAlign w:val="top"/>
+          </w:tcPr>
+          <w:p>
+            <w:pPr>
+              <w:spacing w:after="40"/>
+            </w:pPr>
+            <w:r>
+              <w:rPr>
+                <w:rFonts w:ascii="Calibri" w:cs="Calibri" w:eastAsia="Calibri" w:hAnsi="Calibri"/>
+                <w:color w:val="14213D"/>
+                <w:sz w:val="19"/>
+                <w:szCs w:val="19"/>
+              </w:rPr>
+              <w:t xml:space="preserve">Testé sur ton vrai quantitatif fournisseur : les kits joints donnent les soudures par DN, les ml tombent juste. Le fichier n'est pas dans le dépôt.</w:t>
+            </w:r>
+          </w:p>
+        </w:tc>
+        <w:tc>
+          <w:tcPr>
+            <w:tcW w:type="dxa" w:w="1300"/>
+            <w:tcBorders>
+              <w:top w:val="single" w:color="D9D5CB" w:sz="4"/>
+              <w:left w:val="single" w:color="D9D5CB" w:sz="4"/>
+              <w:bottom w:val="single" w:color="D9D5CB" w:sz="4"/>
+              <w:right w:val="single" w:color="D9D5CB" w:sz="4"/>
+            </w:tcBorders>
+            <w:shd w:fill="E6F5EC" w:color="auto" w:val="clear"/>
+            <w:tcMar>
+              <w:top w:type="dxa" w:w="60"/>
+              <w:left w:type="dxa" w:w="90"/>
+              <w:bottom w:type="dxa" w:w="60"/>
+              <w:right w:type="dxa" w:w="90"/>
+            </w:tcMar>
+            <w:vAlign w:val="top"/>
+          </w:tcPr>
+          <w:p>
+            <w:pPr>
+              <w:spacing w:after="40"/>
+            </w:pPr>
+            <w:r>
+              <w:rPr>
+                <w:rFonts w:ascii="Calibri" w:cs="Calibri" w:eastAsia="Calibri" w:hAnsi="Calibri"/>
+                <w:b/>
+                <w:bCs/>
+                <w:color w:val="14213D"/>
+                <w:sz w:val="19"/>
+                <w:szCs w:val="19"/>
+              </w:rPr>
+              <w:t xml:space="preserve">Fait</w:t>
+            </w:r>
+          </w:p>
+        </w:tc>
+        <w:tc>
+          <w:tcPr>
+            <w:tcW w:type="dxa" w:w="3700"/>
+            <w:tcBorders>
+              <w:top w:val="single" w:color="D9D5CB" w:sz="4"/>
+              <w:left w:val="single" w:color="D9D5CB" w:sz="4"/>
+              <w:bottom w:val="single" w:color="D9D5CB" w:sz="4"/>
+              <w:right w:val="single" w:color="D9D5CB" w:sz="4"/>
+            </w:tcBorders>
+            <w:tcMar>
+              <w:top w:type="dxa" w:w="60"/>
+              <w:left w:type="dxa" w:w="90"/>
+              <w:bottom w:type="dxa" w:w="60"/>
+              <w:right w:type="dxa" w:w="90"/>
+            </w:tcMar>
+            <w:vAlign w:val="top"/>
+          </w:tcPr>
+          <w:p>
+            <w:pPr>
+              <w:spacing w:after="40"/>
+            </w:pPr>
+            <w:r>
+              <w:rPr>
+                <w:rFonts w:ascii="Calibri" w:cs="Calibri" w:eastAsia="Calibri" w:hAnsi="Calibri"/>
+                <w:color w:val="14213D"/>
+                <w:sz w:val="20"/>
+                <w:szCs w:val="20"/>
+              </w:rPr>
+              <w:t xml:space="preserve"/>
+            </w:r>
+          </w:p>
+          <w:p>
+            <w:pPr>
+              <w:spacing w:after="40"/>
+            </w:pPr>
+            <w:r>
+              <w:rPr>
+                <w:rFonts w:ascii="Calibri" w:cs="Calibri" w:eastAsia="Calibri" w:hAnsi="Calibri"/>
+                <w:color w:val="14213D"/>
+                <w:sz w:val="20"/>
+                <w:szCs w:val="20"/>
+              </w:rPr>
+              <w:t xml:space="preserve"/>
+            </w:r>
+          </w:p>
+        </w:tc>
+      </w:tr>
+      <w:tr>
+        <w:tc>
+          <w:tcPr>
+            <w:tcW w:type="dxa" w:w="2300"/>
+            <w:tcBorders>
+              <w:top w:val="single" w:color="D9D5CB" w:sz="4"/>
+              <w:left w:val="single" w:color="D9D5CB" w:sz="4"/>
+              <w:bottom w:val="single" w:color="D9D5CB" w:sz="4"/>
+              <w:right w:val="single" w:color="D9D5CB" w:sz="4"/>
+            </w:tcBorders>
+            <w:tcMar>
+              <w:top w:type="dxa" w:w="60"/>
+              <w:left w:type="dxa" w:w="90"/>
+              <w:bottom w:type="dxa" w:w="60"/>
+              <w:right w:type="dxa" w:w="90"/>
+            </w:tcMar>
+            <w:vAlign w:val="top"/>
+          </w:tcPr>
+          <w:p>
+            <w:pPr>
+              <w:spacing w:after="40"/>
+            </w:pPr>
+            <w:r>
+              <w:rPr>
+                <w:rFonts w:ascii="Calibri" w:cs="Calibri" w:eastAsia="Calibri" w:hAnsi="Calibri"/>
+                <w:b/>
+                <w:bCs/>
+                <w:color w:val="14213D"/>
+                <w:sz w:val="20"/>
+                <w:szCs w:val="20"/>
+              </w:rPr>
+              <w:t xml:space="preserve">Saisie à la main, comparer, prendre</w:t>
+            </w:r>
+          </w:p>
+        </w:tc>
+        <w:tc>
+          <w:tcPr>
+            <w:tcW w:type="dxa" w:w="4100"/>
+            <w:tcBorders>
+              <w:top w:val="single" w:color="D9D5CB" w:sz="4"/>
+              <w:left w:val="single" w:color="D9D5CB" w:sz="4"/>
+              <w:bottom w:val="single" w:color="D9D5CB" w:sz="4"/>
+              <w:right w:val="single" w:color="D9D5CB" w:sz="4"/>
+            </w:tcBorders>
+            <w:tcMar>
+              <w:top w:type="dxa" w:w="60"/>
+              <w:left w:type="dxa" w:w="90"/>
+              <w:bottom w:type="dxa" w:w="60"/>
+              <w:right w:type="dxa" w:w="90"/>
+            </w:tcMar>
+            <w:vAlign w:val="top"/>
+          </w:tcPr>
+          <w:p>
+            <w:pPr>
+              <w:spacing w:after="40"/>
+            </w:pPr>
+            <w:r>
+              <w:rPr>
+                <w:rFonts w:ascii="Calibri" w:cs="Calibri" w:eastAsia="Calibri" w:hAnsi="Calibri"/>
+                <w:color w:val="14213D"/>
+                <w:sz w:val="19"/>
+                <w:szCs w:val="19"/>
+              </w:rPr>
+              <w:t xml:space="preserve">✎ Saisie à la main : une étude vide, ＋ ligne (type, DN, quantité, unité u ou ml — en ml, l'appli compte les barres). Deux études ou plus : comparatif par DN (soudures / ml de tranchée), écarts marqués. « → Prendre » remplit les quantités repérées.</w:t>
+            </w:r>
+          </w:p>
+        </w:tc>
+        <w:tc>
+          <w:tcPr>
+            <w:tcW w:type="dxa" w:w="3700"/>
+            <w:tcBorders>
+              <w:top w:val="single" w:color="D9D5CB" w:sz="4"/>
+              <w:left w:val="single" w:color="D9D5CB" w:sz="4"/>
+              <w:bottom w:val="single" w:color="D9D5CB" w:sz="4"/>
+              <w:right w:val="single" w:color="D9D5CB" w:sz="4"/>
+            </w:tcBorders>
+            <w:tcMar>
+              <w:top w:type="dxa" w:w="60"/>
+              <w:left w:type="dxa" w:w="90"/>
+              <w:bottom w:type="dxa" w:w="60"/>
+              <w:right w:type="dxa" w:w="90"/>
+            </w:tcMar>
+            <w:vAlign w:val="top"/>
+          </w:tcPr>
+          <w:p>
+            <w:pPr>
+              <w:spacing w:after="40"/>
+            </w:pPr>
+            <w:r>
+              <w:rPr>
+                <w:rFonts w:ascii="Calibri" w:cs="Calibri" w:eastAsia="Calibri" w:hAnsi="Calibri"/>
+                <w:color w:val="14213D"/>
+                <w:sz w:val="19"/>
+                <w:szCs w:val="19"/>
+              </w:rPr>
+              <w:t xml:space="preserve">Soudures = manchons / kits joints ; sans manchons : estimées (≈). ml de tranchée = ml de tube ÷ 2.</w:t>
+            </w:r>
+          </w:p>
+        </w:tc>
+        <w:tc>
+          <w:tcPr>
+            <w:tcW w:type="dxa" w:w="1300"/>
+            <w:tcBorders>
+              <w:top w:val="single" w:color="D9D5CB" w:sz="4"/>
+              <w:left w:val="single" w:color="D9D5CB" w:sz="4"/>
+              <w:bottom w:val="single" w:color="D9D5CB" w:sz="4"/>
+              <w:right w:val="single" w:color="D9D5CB" w:sz="4"/>
+            </w:tcBorders>
+            <w:shd w:fill="E6F5EC" w:color="auto" w:val="clear"/>
+            <w:tcMar>
+              <w:top w:type="dxa" w:w="60"/>
+              <w:left w:type="dxa" w:w="90"/>
+              <w:bottom w:type="dxa" w:w="60"/>
+              <w:right w:type="dxa" w:w="90"/>
+            </w:tcMar>
+            <w:vAlign w:val="top"/>
+          </w:tcPr>
+          <w:p>
+            <w:pPr>
+              <w:spacing w:after="40"/>
+            </w:pPr>
+            <w:r>
+              <w:rPr>
+                <w:rFonts w:ascii="Calibri" w:cs="Calibri" w:eastAsia="Calibri" w:hAnsi="Calibri"/>
+                <w:b/>
+                <w:bCs/>
+                <w:color w:val="14213D"/>
+                <w:sz w:val="19"/>
+                <w:szCs w:val="19"/>
+              </w:rPr>
+              <w:t xml:space="preserve">Fait</w:t>
+            </w:r>
+          </w:p>
+        </w:tc>
+        <w:tc>
+          <w:tcPr>
+            <w:tcW w:type="dxa" w:w="3700"/>
+            <w:tcBorders>
+              <w:top w:val="single" w:color="D9D5CB" w:sz="4"/>
+              <w:left w:val="single" w:color="D9D5CB" w:sz="4"/>
+              <w:bottom w:val="single" w:color="D9D5CB" w:sz="4"/>
+              <w:right w:val="single" w:color="D9D5CB" w:sz="4"/>
+            </w:tcBorders>
+            <w:tcMar>
+              <w:top w:type="dxa" w:w="60"/>
+              <w:left w:type="dxa" w:w="90"/>
+              <w:bottom w:type="dxa" w:w="60"/>
+              <w:right w:type="dxa" w:w="90"/>
+            </w:tcMar>
+            <w:vAlign w:val="top"/>
+          </w:tcPr>
+          <w:p>
+            <w:pPr>
+              <w:spacing w:after="40"/>
+            </w:pPr>
+            <w:r>
+              <w:rPr>
+                <w:rFonts w:ascii="Calibri" w:cs="Calibri" w:eastAsia="Calibri" w:hAnsi="Calibri"/>
+                <w:color w:val="14213D"/>
+                <w:sz w:val="20"/>
+                <w:szCs w:val="20"/>
+              </w:rPr>
+              <w:t xml:space="preserve"/>
+            </w:r>
+          </w:p>
+          <w:p>
+            <w:pPr>
+              <w:spacing w:after="40"/>
+            </w:pPr>
+            <w:r>
+              <w:rPr>
+                <w:rFonts w:ascii="Calibri" w:cs="Calibri" w:eastAsia="Calibri" w:hAnsi="Calibri"/>
+                <w:color w:val="14213D"/>
+                <w:sz w:val="20"/>
+                <w:szCs w:val="20"/>
+              </w:rPr>
+              <w:t xml:space="preserve"/>
+            </w:r>
+          </w:p>
+        </w:tc>
+      </w:tr>
+      <w:tr>
+        <w:tc>
+          <w:tcPr>
+            <w:tcW w:type="dxa" w:w="2300"/>
+            <w:tcBorders>
+              <w:top w:val="single" w:color="D9D5CB" w:sz="4"/>
+              <w:left w:val="single" w:color="D9D5CB" w:sz="4"/>
+              <w:bottom w:val="single" w:color="D9D5CB" w:sz="4"/>
+              <w:right w:val="single" w:color="D9D5CB" w:sz="4"/>
+            </w:tcBorders>
+            <w:tcMar>
+              <w:top w:type="dxa" w:w="60"/>
+              <w:left w:type="dxa" w:w="90"/>
+              <w:bottom w:type="dxa" w:w="60"/>
+              <w:right w:type="dxa" w:w="90"/>
+            </w:tcMar>
+            <w:vAlign w:val="top"/>
+          </w:tcPr>
+          <w:p>
+            <w:pPr>
+              <w:spacing w:after="40"/>
+            </w:pPr>
+            <w:r>
+              <w:rPr>
+                <w:rFonts w:ascii="Calibri" w:cs="Calibri" w:eastAsia="Calibri" w:hAnsi="Calibri"/>
+                <w:b/>
+                <w:bCs/>
+                <w:color w:val="14213D"/>
+                <w:sz w:val="20"/>
+                <w:szCs w:val="20"/>
+              </w:rPr>
+              <w:t xml:space="preserve">Le mémoire en mode lecture (lot 4)</w:t>
+            </w:r>
+          </w:p>
+        </w:tc>
+        <w:tc>
+          <w:tcPr>
+            <w:tcW w:type="dxa" w:w="4100"/>
+            <w:tcBorders>
+              <w:top w:val="single" w:color="D9D5CB" w:sz="4"/>
+              <w:left w:val="single" w:color="D9D5CB" w:sz="4"/>
+              <w:bottom w:val="single" w:color="D9D5CB" w:sz="4"/>
+              <w:right w:val="single" w:color="D9D5CB" w:sz="4"/>
+            </w:tcBorders>
+            <w:tcMar>
+              <w:top w:type="dxa" w:w="60"/>
+              <w:left w:type="dxa" w:w="90"/>
+              <w:bottom w:type="dxa" w:w="60"/>
+              <w:right w:type="dxa" w:w="90"/>
+            </w:tcMar>
+            <w:vAlign w:val="top"/>
+          </w:tcPr>
+          <w:p>
+            <w:pPr>
+              <w:spacing w:after="40"/>
+            </w:pPr>
+            <w:r>
+              <w:rPr>
+                <w:rFonts w:ascii="Calibri" w:cs="Calibri" w:eastAsia="Calibri" w:hAnsi="Calibri"/>
+                <w:color w:val="14213D"/>
+                <w:sz w:val="19"/>
+                <w:szCs w:val="19"/>
+              </w:rPr>
+              <w:t xml:space="preserve">4 · Mémoire : le mémoire tel qu'il sortira (page de garde, sommaire, sections). Clique dans une section et écris dedans ; à droite : le plan (coché = dans le mémoire), la section en cours (titre, état, paragraphe du chiffrage, blocs SCR à cocher), les notes du DCE (↧ dans la section, puis coche quand c'est rédigé : barrée). ⤢ plein écran, Échap pour sortir.</w:t>
+            </w:r>
+          </w:p>
+        </w:tc>
+        <w:tc>
+          <w:tcPr>
+            <w:tcW w:type="dxa" w:w="3700"/>
+            <w:tcBorders>
+              <w:top w:val="single" w:color="D9D5CB" w:sz="4"/>
+              <w:left w:val="single" w:color="D9D5CB" w:sz="4"/>
+              <w:bottom w:val="single" w:color="D9D5CB" w:sz="4"/>
+              <w:right w:val="single" w:color="D9D5CB" w:sz="4"/>
+            </w:tcBorders>
+            <w:tcMar>
+              <w:top w:type="dxa" w:w="60"/>
+              <w:left w:type="dxa" w:w="90"/>
+              <w:bottom w:type="dxa" w:w="60"/>
+              <w:right w:type="dxa" w:w="90"/>
+            </w:tcMar>
+            <w:vAlign w:val="top"/>
+          </w:tcPr>
+          <w:p>
+            <w:pPr>
+              <w:spacing w:after="40"/>
+            </w:pPr>
+            <w:r>
+              <w:rPr>
+                <w:rFonts w:ascii="Calibri" w:cs="Calibri" w:eastAsia="Calibri" w:hAnsi="Calibri"/>
+                <w:color w:val="14213D"/>
+                <w:sz w:val="19"/>
+                <w:szCs w:val="19"/>
+              </w:rPr>
+              <w:t xml:space="preserve">Le texte s'enregistre tout seul sans perdre le curseur. Une section décochée sort de la page, du sommaire et de l'export Word / PDF.</w:t>
+            </w:r>
+          </w:p>
+        </w:tc>
+        <w:tc>
+          <w:tcPr>
+            <w:tcW w:type="dxa" w:w="1300"/>
+            <w:tcBorders>
+              <w:top w:val="single" w:color="D9D5CB" w:sz="4"/>
+              <w:left w:val="single" w:color="D9D5CB" w:sz="4"/>
+              <w:bottom w:val="single" w:color="D9D5CB" w:sz="4"/>
+              <w:right w:val="single" w:color="D9D5CB" w:sz="4"/>
+            </w:tcBorders>
+            <w:shd w:fill="E6F5EC" w:color="auto" w:val="clear"/>
+            <w:tcMar>
+              <w:top w:type="dxa" w:w="60"/>
+              <w:left w:type="dxa" w:w="90"/>
+              <w:bottom w:type="dxa" w:w="60"/>
+              <w:right w:type="dxa" w:w="90"/>
+            </w:tcMar>
+            <w:vAlign w:val="top"/>
+          </w:tcPr>
+          <w:p>
+            <w:pPr>
+              <w:spacing w:after="40"/>
+            </w:pPr>
+            <w:r>
+              <w:rPr>
+                <w:rFonts w:ascii="Calibri" w:cs="Calibri" w:eastAsia="Calibri" w:hAnsi="Calibri"/>
+                <w:b/>
+                <w:bCs/>
+                <w:color w:val="14213D"/>
+                <w:sz w:val="19"/>
+                <w:szCs w:val="19"/>
+              </w:rPr>
+              <w:t xml:space="preserve">Fait</w:t>
+            </w:r>
+          </w:p>
+        </w:tc>
+        <w:tc>
+          <w:tcPr>
+            <w:tcW w:type="dxa" w:w="3700"/>
+            <w:tcBorders>
+              <w:top w:val="single" w:color="D9D5CB" w:sz="4"/>
+              <w:left w:val="single" w:color="D9D5CB" w:sz="4"/>
+              <w:bottom w:val="single" w:color="D9D5CB" w:sz="4"/>
+              <w:right w:val="single" w:color="D9D5CB" w:sz="4"/>
+            </w:tcBorders>
+            <w:tcMar>
+              <w:top w:type="dxa" w:w="60"/>
+              <w:left w:type="dxa" w:w="90"/>
+              <w:bottom w:type="dxa" w:w="60"/>
+              <w:right w:type="dxa" w:w="90"/>
+            </w:tcMar>
+            <w:vAlign w:val="top"/>
+          </w:tcPr>
+          <w:p>
+            <w:pPr>
+              <w:spacing w:after="40"/>
+            </w:pPr>
+            <w:r>
+              <w:rPr>
+                <w:rFonts w:ascii="Calibri" w:cs="Calibri" w:eastAsia="Calibri" w:hAnsi="Calibri"/>
+                <w:color w:val="14213D"/>
+                <w:sz w:val="20"/>
+                <w:szCs w:val="20"/>
+              </w:rPr>
+              <w:t xml:space="preserve"/>
+            </w:r>
+          </w:p>
+          <w:p>
+            <w:pPr>
+              <w:spacing w:after="40"/>
+            </w:pPr>
+            <w:r>
+              <w:rPr>
+                <w:rFonts w:ascii="Calibri" w:cs="Calibri" w:eastAsia="Calibri" w:hAnsi="Calibri"/>
+                <w:color w:val="14213D"/>
+                <w:sz w:val="20"/>
+                <w:szCs w:val="20"/>
+              </w:rPr>
+              <w:t xml:space="preserve"/>
+            </w:r>
+          </w:p>
+        </w:tc>
+      </w:tr>
+      <w:tr>
+        <w:tc>
+          <w:tcPr>
+            <w:tcW w:type="dxa" w:w="2300"/>
+            <w:tcBorders>
+              <w:top w:val="single" w:color="D9D5CB" w:sz="4"/>
+              <w:left w:val="single" w:color="D9D5CB" w:sz="4"/>
+              <w:bottom w:val="single" w:color="D9D5CB" w:sz="4"/>
+              <w:right w:val="single" w:color="D9D5CB" w:sz="4"/>
+            </w:tcBorders>
+            <w:tcMar>
+              <w:top w:type="dxa" w:w="60"/>
+              <w:left w:type="dxa" w:w="90"/>
+              <w:bottom w:type="dxa" w:w="60"/>
+              <w:right w:type="dxa" w:w="90"/>
+            </w:tcMar>
+            <w:vAlign w:val="top"/>
+          </w:tcPr>
+          <w:p>
+            <w:pPr>
+              <w:spacing w:after="40"/>
+            </w:pPr>
+            <w:r>
+              <w:rPr>
+                <w:rFonts w:ascii="Calibri" w:cs="Calibri" w:eastAsia="Calibri" w:hAnsi="Calibri"/>
+                <w:b/>
+                <w:bCs/>
+                <w:color w:val="14213D"/>
+                <w:sz w:val="20"/>
+                <w:szCs w:val="20"/>
+              </w:rPr>
+              <w:t xml:space="preserve">Contrôle croisé classeur ↔ appli (lot 5)</w:t>
+            </w:r>
+          </w:p>
+        </w:tc>
+        <w:tc>
+          <w:tcPr>
+            <w:tcW w:type="dxa" w:w="4100"/>
+            <w:tcBorders>
+              <w:top w:val="single" w:color="D9D5CB" w:sz="4"/>
+              <w:left w:val="single" w:color="D9D5CB" w:sz="4"/>
+              <w:bottom w:val="single" w:color="D9D5CB" w:sz="4"/>
+              <w:right w:val="single" w:color="D9D5CB" w:sz="4"/>
+            </w:tcBorders>
+            <w:tcMar>
+              <w:top w:type="dxa" w:w="60"/>
+              <w:left w:type="dxa" w:w="90"/>
+              <w:bottom w:type="dxa" w:w="60"/>
+              <w:right w:type="dxa" w:w="90"/>
+            </w:tcMar>
+            <w:vAlign w:val="top"/>
+          </w:tcPr>
+          <w:p>
+            <w:pPr>
+              <w:spacing w:after="40"/>
+            </w:pPr>
+            <w:r>
+              <w:rPr>
+                <w:rFonts w:ascii="Calibri" w:cs="Calibri" w:eastAsia="Calibri" w:hAnsi="Calibri"/>
+                <w:color w:val="14213D"/>
+                <w:sz w:val="19"/>
+                <w:szCs w:val="19"/>
+              </w:rPr>
+              <w:t xml:space="preserve">3 · Chiffrage → ⇄ Contrôle classeur → 📎 Importer le classeur rempli de l'affaire. L'appli relit chaque onglet (≈ 150 cases), le recalcule avec son moteur et la base de prix du classeur, compare au Récap Prix poste par poste : identique / écart expliqué (orange) / à regarder (rouge). ⬇ Rapport CSV. → Reprendre : les onglets deviennent les zones du chiffrage (marge et RCFA du classeur).</w:t>
+            </w:r>
+          </w:p>
+        </w:tc>
+        <w:tc>
+          <w:tcPr>
+            <w:tcW w:type="dxa" w:w="3700"/>
+            <w:tcBorders>
+              <w:top w:val="single" w:color="D9D5CB" w:sz="4"/>
+              <w:left w:val="single" w:color="D9D5CB" w:sz="4"/>
+              <w:bottom w:val="single" w:color="D9D5CB" w:sz="4"/>
+              <w:right w:val="single" w:color="D9D5CB" w:sz="4"/>
+            </w:tcBorders>
+            <w:tcMar>
+              <w:top w:type="dxa" w:w="60"/>
+              <w:left w:type="dxa" w:w="90"/>
+              <w:bottom w:type="dxa" w:w="60"/>
+              <w:right w:type="dxa" w:w="90"/>
+            </w:tcMar>
+            <w:vAlign w:val="top"/>
+          </w:tcPr>
+          <w:p>
+            <w:pPr>
+              <w:spacing w:after="40"/>
+            </w:pPr>
+            <w:r>
+              <w:rPr>
+                <w:rFonts w:ascii="Calibri" w:cs="Calibri" w:eastAsia="Calibri" w:hAnsi="Calibri"/>
+                <w:color w:val="14213D"/>
+                <w:sz w:val="19"/>
+                <w:szCs w:val="19"/>
+              </w:rPr>
+              <w:t xml:space="preserve">Le classeur n'est jamais modifié. Écarts attendus : base vie en jours ouvrés (le classeur : calendaires) ; soudures sans case antenne / feeder (comptées en feeder) ; une seule équipe pour l'hydraulique. S'il reste du rouge sur un vrai dossier : envoie-moi le classeur.</w:t>
+            </w:r>
+          </w:p>
+        </w:tc>
+        <w:tc>
+          <w:tcPr>
+            <w:tcW w:type="dxa" w:w="1300"/>
+            <w:tcBorders>
+              <w:top w:val="single" w:color="D9D5CB" w:sz="4"/>
+              <w:left w:val="single" w:color="D9D5CB" w:sz="4"/>
+              <w:bottom w:val="single" w:color="D9D5CB" w:sz="4"/>
+              <w:right w:val="single" w:color="D9D5CB" w:sz="4"/>
+            </w:tcBorders>
+            <w:shd w:fill="E6F5EC" w:color="auto" w:val="clear"/>
+            <w:tcMar>
+              <w:top w:type="dxa" w:w="60"/>
+              <w:left w:type="dxa" w:w="90"/>
+              <w:bottom w:type="dxa" w:w="60"/>
+              <w:right w:type="dxa" w:w="90"/>
+            </w:tcMar>
+            <w:vAlign w:val="top"/>
+          </w:tcPr>
+          <w:p>
+            <w:pPr>
+              <w:spacing w:after="40"/>
+            </w:pPr>
+            <w:r>
+              <w:rPr>
+                <w:rFonts w:ascii="Calibri" w:cs="Calibri" w:eastAsia="Calibri" w:hAnsi="Calibri"/>
+                <w:b/>
+                <w:bCs/>
+                <w:color w:val="14213D"/>
+                <w:sz w:val="19"/>
+                <w:szCs w:val="19"/>
+              </w:rPr>
+              <w:t xml:space="preserve">Fait</w:t>
+            </w:r>
+          </w:p>
+        </w:tc>
+        <w:tc>
+          <w:tcPr>
+            <w:tcW w:type="dxa" w:w="3700"/>
+            <w:tcBorders>
+              <w:top w:val="single" w:color="D9D5CB" w:sz="4"/>
+              <w:left w:val="single" w:color="D9D5CB" w:sz="4"/>
+              <w:bottom w:val="single" w:color="D9D5CB" w:sz="4"/>
+              <w:right w:val="single" w:color="D9D5CB" w:sz="4"/>
+            </w:tcBorders>
+            <w:tcMar>
+              <w:top w:type="dxa" w:w="60"/>
+              <w:left w:type="dxa" w:w="90"/>
+              <w:bottom w:type="dxa" w:w="60"/>
+              <w:right w:type="dxa" w:w="90"/>
+            </w:tcMar>
+            <w:vAlign w:val="top"/>
+          </w:tcPr>
+          <w:p>
+            <w:pPr>
+              <w:spacing w:after="40"/>
+            </w:pPr>
+            <w:r>
+              <w:rPr>
+                <w:rFonts w:ascii="Calibri" w:cs="Calibri" w:eastAsia="Calibri" w:hAnsi="Calibri"/>
+                <w:color w:val="14213D"/>
+                <w:sz w:val="20"/>
+                <w:szCs w:val="20"/>
+              </w:rPr>
+              <w:t xml:space="preserve"/>
+            </w:r>
+          </w:p>
+          <w:p>
+            <w:pPr>
+              <w:spacing w:after="40"/>
+            </w:pPr>
+            <w:r>
+              <w:rPr>
+                <w:rFonts w:ascii="Calibri" w:cs="Calibri" w:eastAsia="Calibri" w:hAnsi="Calibri"/>
+                <w:color w:val="14213D"/>
+                <w:sz w:val="20"/>
+                <w:szCs w:val="20"/>
+              </w:rPr>
+              <w:t xml:space="preserve"/>
+            </w:r>
+          </w:p>
+        </w:tc>
+      </w:tr>
+      <w:tr>
+        <w:tc>
+          <w:tcPr>
+            <w:tcW w:type="dxa" w:w="2300"/>
+            <w:tcBorders>
+              <w:top w:val="single" w:color="D9D5CB" w:sz="4"/>
+              <w:left w:val="single" w:color="D9D5CB" w:sz="4"/>
+              <w:bottom w:val="single" w:color="D9D5CB" w:sz="4"/>
+              <w:right w:val="single" w:color="D9D5CB" w:sz="4"/>
+            </w:tcBorders>
+            <w:tcMar>
+              <w:top w:type="dxa" w:w="60"/>
+              <w:left w:type="dxa" w:w="90"/>
+              <w:bottom w:type="dxa" w:w="60"/>
+              <w:right w:type="dxa" w:w="90"/>
+            </w:tcMar>
+            <w:vAlign w:val="top"/>
+          </w:tcPr>
+          <w:p>
+            <w:pPr>
+              <w:spacing w:after="40"/>
+            </w:pPr>
+            <w:r>
+              <w:rPr>
+                <w:rFonts w:ascii="Calibri" w:cs="Calibri" w:eastAsia="Calibri" w:hAnsi="Calibri"/>
+                <w:b/>
+                <w:bCs/>
+                <w:color w:val="14213D"/>
+                <w:sz w:val="20"/>
+                <w:szCs w:val="20"/>
+              </w:rPr>
+              <w:t xml:space="preserve">5 erreurs du moteur corrigées</w:t>
+            </w:r>
+          </w:p>
+        </w:tc>
+        <w:tc>
+          <w:tcPr>
+            <w:tcW w:type="dxa" w:w="4100"/>
+            <w:tcBorders>
+              <w:top w:val="single" w:color="D9D5CB" w:sz="4"/>
+              <w:left w:val="single" w:color="D9D5CB" w:sz="4"/>
+              <w:bottom w:val="single" w:color="D9D5CB" w:sz="4"/>
+              <w:right w:val="single" w:color="D9D5CB" w:sz="4"/>
+            </w:tcBorders>
+            <w:tcMar>
+              <w:top w:type="dxa" w:w="60"/>
+              <w:left w:type="dxa" w:w="90"/>
+              <w:bottom w:type="dxa" w:w="60"/>
+              <w:right w:type="dxa" w:w="90"/>
+            </w:tcMar>
+            <w:vAlign w:val="top"/>
+          </w:tcPr>
+          <w:p>
+            <w:pPr>
+              <w:spacing w:after="40"/>
+            </w:pPr>
+            <w:r>
+              <w:rPr>
+                <w:rFonts w:ascii="Calibri" w:cs="Calibri" w:eastAsia="Calibri" w:hAnsi="Calibri"/>
+                <w:color w:val="14213D"/>
+                <w:sz w:val="19"/>
+                <w:szCs w:val="19"/>
+              </w:rPr>
+              <w:t xml:space="preserve">—</w:t>
+            </w:r>
+          </w:p>
+        </w:tc>
+        <w:tc>
+          <w:tcPr>
+            <w:tcW w:type="dxa" w:w="3700"/>
+            <w:tcBorders>
+              <w:top w:val="single" w:color="D9D5CB" w:sz="4"/>
+              <w:left w:val="single" w:color="D9D5CB" w:sz="4"/>
+              <w:bottom w:val="single" w:color="D9D5CB" w:sz="4"/>
+              <w:right w:val="single" w:color="D9D5CB" w:sz="4"/>
+            </w:tcBorders>
+            <w:tcMar>
+              <w:top w:type="dxa" w:w="60"/>
+              <w:left w:type="dxa" w:w="90"/>
+              <w:bottom w:type="dxa" w:w="60"/>
+              <w:right w:type="dxa" w:w="90"/>
+            </w:tcMar>
+            <w:vAlign w:val="top"/>
+          </w:tcPr>
+          <w:p>
+            <w:pPr>
+              <w:spacing w:after="40"/>
+            </w:pPr>
+            <w:r>
+              <w:rPr>
+                <w:rFonts w:ascii="Calibri" w:cs="Calibri" w:eastAsia="Calibri" w:hAnsi="Calibri"/>
+                <w:color w:val="14213D"/>
+                <w:sz w:val="19"/>
+                <w:szCs w:val="19"/>
+              </w:rPr>
+              <w:t xml:space="preserve">Purgeur automatique compté 250 € la paire au lieu de 500 ; en twin, la réduction de cadence oubliée hors tableau des DN (soudures déportées, pose aérien) et sur la nuit ; supports aériens tous au prix du « Suspendu » ; l'export DPGF dans le fichier Excel du client pouvait abîmer une ligne qui contient une formule en « $ » ; un classeur ré-enregistré par LibreOffice lisait des fournitures à 0.</w:t>
+            </w:r>
+          </w:p>
+        </w:tc>
+        <w:tc>
+          <w:tcPr>
+            <w:tcW w:type="dxa" w:w="1300"/>
+            <w:tcBorders>
+              <w:top w:val="single" w:color="D9D5CB" w:sz="4"/>
+              <w:left w:val="single" w:color="D9D5CB" w:sz="4"/>
+              <w:bottom w:val="single" w:color="D9D5CB" w:sz="4"/>
+              <w:right w:val="single" w:color="D9D5CB" w:sz="4"/>
+            </w:tcBorders>
+            <w:shd w:fill="E6F5EC" w:color="auto" w:val="clear"/>
+            <w:tcMar>
+              <w:top w:type="dxa" w:w="60"/>
+              <w:left w:type="dxa" w:w="90"/>
+              <w:bottom w:type="dxa" w:w="60"/>
+              <w:right w:type="dxa" w:w="90"/>
+            </w:tcMar>
+            <w:vAlign w:val="top"/>
+          </w:tcPr>
+          <w:p>
+            <w:pPr>
+              <w:spacing w:after="40"/>
+            </w:pPr>
+            <w:r>
+              <w:rPr>
+                <w:rFonts w:ascii="Calibri" w:cs="Calibri" w:eastAsia="Calibri" w:hAnsi="Calibri"/>
+                <w:b/>
+                <w:bCs/>
+                <w:color w:val="14213D"/>
+                <w:sz w:val="19"/>
+                <w:szCs w:val="19"/>
+              </w:rPr>
+              <w:t xml:space="preserve">Fait</w:t>
+            </w:r>
+          </w:p>
+        </w:tc>
+        <w:tc>
+          <w:tcPr>
+            <w:tcW w:type="dxa" w:w="3700"/>
+            <w:tcBorders>
+              <w:top w:val="single" w:color="D9D5CB" w:sz="4"/>
+              <w:left w:val="single" w:color="D9D5CB" w:sz="4"/>
+              <w:bottom w:val="single" w:color="D9D5CB" w:sz="4"/>
+              <w:right w:val="single" w:color="D9D5CB" w:sz="4"/>
+            </w:tcBorders>
+            <w:tcMar>
+              <w:top w:type="dxa" w:w="60"/>
+              <w:left w:type="dxa" w:w="90"/>
+              <w:bottom w:type="dxa" w:w="60"/>
+              <w:right w:type="dxa" w:w="90"/>
+            </w:tcMar>
+            <w:vAlign w:val="top"/>
+          </w:tcPr>
+          <w:p>
+            <w:pPr>
+              <w:spacing w:after="40"/>
+            </w:pPr>
+            <w:r>
+              <w:rPr>
+                <w:rFonts w:ascii="Calibri" w:cs="Calibri" w:eastAsia="Calibri" w:hAnsi="Calibri"/>
+                <w:color w:val="14213D"/>
+                <w:sz w:val="20"/>
+                <w:szCs w:val="20"/>
+              </w:rPr>
+              <w:t xml:space="preserve"/>
+            </w:r>
+          </w:p>
+          <w:p>
+            <w:pPr>
+              <w:spacing w:after="40"/>
+            </w:pPr>
+            <w:r>
+              <w:rPr>
+                <w:rFonts w:ascii="Calibri" w:cs="Calibri" w:eastAsia="Calibri" w:hAnsi="Calibri"/>
+                <w:color w:val="14213D"/>
+                <w:sz w:val="20"/>
+                <w:szCs w:val="20"/>
+              </w:rPr>
+              <w:t xml:space="preserve"/>
+            </w:r>
+          </w:p>
+        </w:tc>
+      </w:tr>
+      <w:tr>
+        <w:tc>
+          <w:tcPr>
+            <w:tcW w:type="dxa" w:w="2300"/>
+            <w:tcBorders>
+              <w:top w:val="single" w:color="D9D5CB" w:sz="4"/>
+              <w:left w:val="single" w:color="D9D5CB" w:sz="4"/>
+              <w:bottom w:val="single" w:color="D9D5CB" w:sz="4"/>
+              <w:right w:val="single" w:color="D9D5CB" w:sz="4"/>
+            </w:tcBorders>
+            <w:tcMar>
+              <w:top w:type="dxa" w:w="60"/>
+              <w:left w:type="dxa" w:w="90"/>
+              <w:bottom w:type="dxa" w:w="60"/>
+              <w:right w:type="dxa" w:w="90"/>
+            </w:tcMar>
+            <w:vAlign w:val="top"/>
+          </w:tcPr>
+          <w:p>
+            <w:pPr>
+              <w:spacing w:after="40"/>
+            </w:pPr>
+            <w:r>
+              <w:rPr>
+                <w:rFonts w:ascii="Calibri" w:cs="Calibri" w:eastAsia="Calibri" w:hAnsi="Calibri"/>
+                <w:b/>
+                <w:bCs/>
+                <w:color w:val="14213D"/>
+                <w:sz w:val="20"/>
+                <w:szCs w:val="20"/>
+              </w:rPr>
+              <w:t xml:space="preserve">Lecture plein écran : un menu déroulant</w:t>
+            </w:r>
+          </w:p>
+        </w:tc>
+        <w:tc>
+          <w:tcPr>
+            <w:tcW w:type="dxa" w:w="4100"/>
+            <w:tcBorders>
+              <w:top w:val="single" w:color="D9D5CB" w:sz="4"/>
+              <w:left w:val="single" w:color="D9D5CB" w:sz="4"/>
+              <w:bottom w:val="single" w:color="D9D5CB" w:sz="4"/>
+              <w:right w:val="single" w:color="D9D5CB" w:sz="4"/>
+            </w:tcBorders>
+            <w:tcMar>
+              <w:top w:type="dxa" w:w="60"/>
+              <w:left w:type="dxa" w:w="90"/>
+              <w:bottom w:type="dxa" w:w="60"/>
+              <w:right w:type="dxa" w:w="90"/>
+            </w:tcMar>
+            <w:vAlign w:val="top"/>
+          </w:tcPr>
+          <w:p>
+            <w:pPr>
+              <w:spacing w:after="40"/>
+            </w:pPr>
+            <w:r>
+              <w:rPr>
+                <w:rFonts w:ascii="Calibri" w:cs="Calibri" w:eastAsia="Calibri" w:hAnsi="Calibri"/>
+                <w:color w:val="14213D"/>
+                <w:sz w:val="19"/>
+                <w:szCs w:val="19"/>
+              </w:rPr>
+              <w:t xml:space="preserve">⤢ sur la pièce : en haut, une seule ligne avec un menu déroulant des pièces (classées par type) ; le reste de l'écran = la pièce et la liste des notes. ✕ Quitter ou Échap.</w:t>
+            </w:r>
+          </w:p>
+        </w:tc>
+        <w:tc>
+          <w:tcPr>
+            <w:tcW w:type="dxa" w:w="3700"/>
+            <w:tcBorders>
+              <w:top w:val="single" w:color="D9D5CB" w:sz="4"/>
+              <w:left w:val="single" w:color="D9D5CB" w:sz="4"/>
+              <w:bottom w:val="single" w:color="D9D5CB" w:sz="4"/>
+              <w:right w:val="single" w:color="D9D5CB" w:sz="4"/>
+            </w:tcBorders>
+            <w:tcMar>
+              <w:top w:type="dxa" w:w="60"/>
+              <w:left w:type="dxa" w:w="90"/>
+              <w:bottom w:type="dxa" w:w="60"/>
+              <w:right w:type="dxa" w:w="90"/>
+            </w:tcMar>
+            <w:vAlign w:val="top"/>
+          </w:tcPr>
+          <w:p>
+            <w:pPr>
+              <w:spacing w:after="40"/>
+            </w:pPr>
+            <w:r>
+              <w:rPr>
+                <w:rFonts w:ascii="Calibri" w:cs="Calibri" w:eastAsia="Calibri" w:hAnsi="Calibri"/>
+                <w:color w:val="14213D"/>
+                <w:sz w:val="19"/>
+                <w:szCs w:val="19"/>
+              </w:rPr>
+              <w:t xml:space="preserve">Ton retour : « trop de place pour toutes les pièces en haut ».</w:t>
+            </w:r>
+          </w:p>
+        </w:tc>
+        <w:tc>
+          <w:tcPr>
+            <w:tcW w:type="dxa" w:w="1300"/>
+            <w:tcBorders>
+              <w:top w:val="single" w:color="D9D5CB" w:sz="4"/>
+              <w:left w:val="single" w:color="D9D5CB" w:sz="4"/>
+              <w:bottom w:val="single" w:color="D9D5CB" w:sz="4"/>
+              <w:right w:val="single" w:color="D9D5CB" w:sz="4"/>
+            </w:tcBorders>
+            <w:shd w:fill="E6F5EC" w:color="auto" w:val="clear"/>
+            <w:tcMar>
+              <w:top w:type="dxa" w:w="60"/>
+              <w:left w:type="dxa" w:w="90"/>
+              <w:bottom w:type="dxa" w:w="60"/>
+              <w:right w:type="dxa" w:w="90"/>
+            </w:tcMar>
+            <w:vAlign w:val="top"/>
+          </w:tcPr>
+          <w:p>
+            <w:pPr>
+              <w:spacing w:after="40"/>
+            </w:pPr>
+            <w:r>
+              <w:rPr>
+                <w:rFonts w:ascii="Calibri" w:cs="Calibri" w:eastAsia="Calibri" w:hAnsi="Calibri"/>
+                <w:b/>
+                <w:bCs/>
+                <w:color w:val="14213D"/>
+                <w:sz w:val="19"/>
+                <w:szCs w:val="19"/>
+              </w:rPr>
+              <w:t xml:space="preserve">Fait</w:t>
+            </w:r>
+          </w:p>
+        </w:tc>
+        <w:tc>
+          <w:tcPr>
+            <w:tcW w:type="dxa" w:w="3700"/>
+            <w:tcBorders>
+              <w:top w:val="single" w:color="D9D5CB" w:sz="4"/>
+              <w:left w:val="single" w:color="D9D5CB" w:sz="4"/>
+              <w:bottom w:val="single" w:color="D9D5CB" w:sz="4"/>
+              <w:right w:val="single" w:color="D9D5CB" w:sz="4"/>
+            </w:tcBorders>
+            <w:tcMar>
+              <w:top w:type="dxa" w:w="60"/>
+              <w:left w:type="dxa" w:w="90"/>
+              <w:bottom w:type="dxa" w:w="60"/>
+              <w:right w:type="dxa" w:w="90"/>
+            </w:tcMar>
+            <w:vAlign w:val="top"/>
+          </w:tcPr>
+          <w:p>
+            <w:pPr>
+              <w:spacing w:after="40"/>
+            </w:pPr>
+            <w:r>
+              <w:rPr>
+                <w:rFonts w:ascii="Calibri" w:cs="Calibri" w:eastAsia="Calibri" w:hAnsi="Calibri"/>
+                <w:color w:val="14213D"/>
+                <w:sz w:val="20"/>
+                <w:szCs w:val="20"/>
+              </w:rPr>
+              <w:t xml:space="preserve"/>
+            </w:r>
+          </w:p>
+          <w:p>
+            <w:pPr>
+              <w:spacing w:after="40"/>
+            </w:pPr>
+            <w:r>
+              <w:rPr>
+                <w:rFonts w:ascii="Calibri" w:cs="Calibri" w:eastAsia="Calibri" w:hAnsi="Calibri"/>
+                <w:color w:val="14213D"/>
+                <w:sz w:val="20"/>
+                <w:szCs w:val="20"/>
+              </w:rPr>
+              <w:t xml:space="preserve"/>
+            </w:r>
+          </w:p>
+        </w:tc>
+      </w:tr>
+      <w:tr>
+        <w:tc>
+          <w:tcPr>
+            <w:tcW w:type="dxa" w:w="2300"/>
+            <w:tcBorders>
+              <w:top w:val="single" w:color="D9D5CB" w:sz="4"/>
+              <w:left w:val="single" w:color="D9D5CB" w:sz="4"/>
+              <w:bottom w:val="single" w:color="D9D5CB" w:sz="4"/>
+              <w:right w:val="single" w:color="D9D5CB" w:sz="4"/>
+            </w:tcBorders>
+            <w:tcMar>
+              <w:top w:type="dxa" w:w="60"/>
+              <w:left w:type="dxa" w:w="90"/>
+              <w:bottom w:type="dxa" w:w="60"/>
+              <w:right w:type="dxa" w:w="90"/>
+            </w:tcMar>
+            <w:vAlign w:val="top"/>
+          </w:tcPr>
+          <w:p>
+            <w:pPr>
+              <w:spacing w:after="40"/>
+            </w:pPr>
+            <w:r>
+              <w:rPr>
+                <w:rFonts w:ascii="Calibri" w:cs="Calibri" w:eastAsia="Calibri" w:hAnsi="Calibri"/>
+                <w:b/>
+                <w:bCs/>
+                <w:color w:val="14213D"/>
+                <w:sz w:val="20"/>
+                <w:szCs w:val="20"/>
+              </w:rPr>
+              <w:t xml:space="preserve">Recherche : la barre ‹ › reste là</w:t>
+            </w:r>
+          </w:p>
+        </w:tc>
+        <w:tc>
+          <w:tcPr>
+            <w:tcW w:type="dxa" w:w="4100"/>
+            <w:tcBorders>
+              <w:top w:val="single" w:color="D9D5CB" w:sz="4"/>
+              <w:left w:val="single" w:color="D9D5CB" w:sz="4"/>
+              <w:bottom w:val="single" w:color="D9D5CB" w:sz="4"/>
+              <w:right w:val="single" w:color="D9D5CB" w:sz="4"/>
+            </w:tcBorders>
+            <w:tcMar>
+              <w:top w:type="dxa" w:w="60"/>
+              <w:left w:type="dxa" w:w="90"/>
+              <w:bottom w:type="dxa" w:w="60"/>
+              <w:right w:type="dxa" w:w="90"/>
+            </w:tcMar>
+            <w:vAlign w:val="top"/>
+          </w:tcPr>
+          <w:p>
+            <w:pPr>
+              <w:spacing w:after="40"/>
+            </w:pPr>
+            <w:r>
+              <w:rPr>
+                <w:rFonts w:ascii="Calibri" w:cs="Calibri" w:eastAsia="Calibri" w:hAnsi="Calibri"/>
+                <w:color w:val="14213D"/>
+                <w:sz w:val="19"/>
+                <w:szCs w:val="19"/>
+              </w:rPr>
+              <w:t xml:space="preserve">🔍 (ou Ctrl+F) : la pièce défile jusqu'au mot, la page ne bouge plus — la barre ‹ › reste à l'écran. Entrée = suivant, Maj+Entrée = précédent.</w:t>
+            </w:r>
+          </w:p>
+        </w:tc>
+        <w:tc>
+          <w:tcPr>
+            <w:tcW w:type="dxa" w:w="3700"/>
+            <w:tcBorders>
+              <w:top w:val="single" w:color="D9D5CB" w:sz="4"/>
+              <w:left w:val="single" w:color="D9D5CB" w:sz="4"/>
+              <w:bottom w:val="single" w:color="D9D5CB" w:sz="4"/>
+              <w:right w:val="single" w:color="D9D5CB" w:sz="4"/>
+            </w:tcBorders>
+            <w:tcMar>
+              <w:top w:type="dxa" w:w="60"/>
+              <w:left w:type="dxa" w:w="90"/>
+              <w:bottom w:type="dxa" w:w="60"/>
+              <w:right w:type="dxa" w:w="90"/>
+            </w:tcMar>
+            <w:vAlign w:val="top"/>
+          </w:tcPr>
+          <w:p>
+            <w:pPr>
+              <w:spacing w:after="40"/>
+            </w:pPr>
+            <w:r>
+              <w:rPr>
+                <w:rFonts w:ascii="Calibri" w:cs="Calibri" w:eastAsia="Calibri" w:hAnsi="Calibri"/>
+                <w:color w:val="14213D"/>
+                <w:sz w:val="19"/>
+                <w:szCs w:val="19"/>
+              </w:rPr>
+              <w:t xml:space="preserve">Avant, toute la page défilait et la barre sortait de l'écran.</w:t>
+            </w:r>
+          </w:p>
+        </w:tc>
+        <w:tc>
+          <w:tcPr>
+            <w:tcW w:type="dxa" w:w="1300"/>
+            <w:tcBorders>
+              <w:top w:val="single" w:color="D9D5CB" w:sz="4"/>
+              <w:left w:val="single" w:color="D9D5CB" w:sz="4"/>
+              <w:bottom w:val="single" w:color="D9D5CB" w:sz="4"/>
+              <w:right w:val="single" w:color="D9D5CB" w:sz="4"/>
+            </w:tcBorders>
+            <w:shd w:fill="E6F5EC" w:color="auto" w:val="clear"/>
+            <w:tcMar>
+              <w:top w:type="dxa" w:w="60"/>
+              <w:left w:type="dxa" w:w="90"/>
+              <w:bottom w:type="dxa" w:w="60"/>
+              <w:right w:type="dxa" w:w="90"/>
+            </w:tcMar>
+            <w:vAlign w:val="top"/>
+          </w:tcPr>
+          <w:p>
+            <w:pPr>
+              <w:spacing w:after="40"/>
+            </w:pPr>
+            <w:r>
+              <w:rPr>
+                <w:rFonts w:ascii="Calibri" w:cs="Calibri" w:eastAsia="Calibri" w:hAnsi="Calibri"/>
+                <w:b/>
+                <w:bCs/>
+                <w:color w:val="14213D"/>
+                <w:sz w:val="19"/>
+                <w:szCs w:val="19"/>
+              </w:rPr>
+              <w:t xml:space="preserve">Fait</w:t>
+            </w:r>
+          </w:p>
+        </w:tc>
+        <w:tc>
+          <w:tcPr>
+            <w:tcW w:type="dxa" w:w="3700"/>
+            <w:tcBorders>
+              <w:top w:val="single" w:color="D9D5CB" w:sz="4"/>
+              <w:left w:val="single" w:color="D9D5CB" w:sz="4"/>
+              <w:bottom w:val="single" w:color="D9D5CB" w:sz="4"/>
+              <w:right w:val="single" w:color="D9D5CB" w:sz="4"/>
+            </w:tcBorders>
+            <w:tcMar>
+              <w:top w:type="dxa" w:w="60"/>
+              <w:left w:type="dxa" w:w="90"/>
+              <w:bottom w:type="dxa" w:w="60"/>
+              <w:right w:type="dxa" w:w="90"/>
+            </w:tcMar>
+            <w:vAlign w:val="top"/>
+          </w:tcPr>
+          <w:p>
+            <w:pPr>
+              <w:spacing w:after="40"/>
+            </w:pPr>
+            <w:r>
+              <w:rPr>
+                <w:rFonts w:ascii="Calibri" w:cs="Calibri" w:eastAsia="Calibri" w:hAnsi="Calibri"/>
+                <w:color w:val="14213D"/>
+                <w:sz w:val="20"/>
+                <w:szCs w:val="20"/>
+              </w:rPr>
+              <w:t xml:space="preserve"/>
+            </w:r>
+          </w:p>
+          <w:p>
+            <w:pPr>
+              <w:spacing w:after="40"/>
+            </w:pPr>
+            <w:r>
+              <w:rPr>
+                <w:rFonts w:ascii="Calibri" w:cs="Calibri" w:eastAsia="Calibri" w:hAnsi="Calibri"/>
+                <w:color w:val="14213D"/>
+                <w:sz w:val="20"/>
+                <w:szCs w:val="20"/>
+              </w:rPr>
+              <w:t xml:space="preserve"/>
+            </w:r>
+          </w:p>
+        </w:tc>
+      </w:tr>
+      <w:tr>
+        <w:tc>
+          <w:tcPr>
+            <w:tcW w:type="dxa" w:w="2300"/>
+            <w:tcBorders>
+              <w:top w:val="single" w:color="D9D5CB" w:sz="4"/>
+              <w:left w:val="single" w:color="D9D5CB" w:sz="4"/>
+              <w:bottom w:val="single" w:color="D9D5CB" w:sz="4"/>
+              <w:right w:val="single" w:color="D9D5CB" w:sz="4"/>
+            </w:tcBorders>
+            <w:tcMar>
+              <w:top w:type="dxa" w:w="60"/>
+              <w:left w:type="dxa" w:w="90"/>
+              <w:bottom w:type="dxa" w:w="60"/>
+              <w:right w:type="dxa" w:w="90"/>
+            </w:tcMar>
+            <w:vAlign w:val="top"/>
+          </w:tcPr>
+          <w:p>
+            <w:pPr>
+              <w:spacing w:after="40"/>
+            </w:pPr>
+            <w:r>
+              <w:rPr>
+                <w:rFonts w:ascii="Calibri" w:cs="Calibri" w:eastAsia="Calibri" w:hAnsi="Calibri"/>
+                <w:b/>
+                <w:bCs/>
+                <w:color w:val="14213D"/>
+                <w:sz w:val="20"/>
+                <w:szCs w:val="20"/>
+              </w:rPr>
+              <w:t xml:space="preserve">Essai hydraulique : prestation globale</w:t>
+            </w:r>
+          </w:p>
+        </w:tc>
+        <w:tc>
+          <w:tcPr>
+            <w:tcW w:type="dxa" w:w="4100"/>
+            <w:tcBorders>
+              <w:top w:val="single" w:color="D9D5CB" w:sz="4"/>
+              <w:left w:val="single" w:color="D9D5CB" w:sz="4"/>
+              <w:bottom w:val="single" w:color="D9D5CB" w:sz="4"/>
+              <w:right w:val="single" w:color="D9D5CB" w:sz="4"/>
+            </w:tcBorders>
+            <w:tcMar>
+              <w:top w:type="dxa" w:w="60"/>
+              <w:left w:type="dxa" w:w="90"/>
+              <w:bottom w:type="dxa" w:w="60"/>
+              <w:right w:type="dxa" w:w="90"/>
+            </w:tcMar>
+            <w:vAlign w:val="top"/>
+          </w:tcPr>
+          <w:p>
+            <w:pPr>
+              <w:spacing w:after="40"/>
+            </w:pPr>
+            <w:r>
+              <w:rPr>
+                <w:rFonts w:ascii="Calibri" w:cs="Calibri" w:eastAsia="Calibri" w:hAnsi="Calibri"/>
+                <w:color w:val="14213D"/>
+                <w:sz w:val="19"/>
+                <w:szCs w:val="19"/>
+              </w:rPr>
+              <w:t xml:space="preserve">Points techniques → Essai hydraulique : sous les tronçons, « Rinçage globale » (idem eau adoucie, passivation, conservation) : UNE prestation sur le volume cumulé des tronçons cochés. Exemple : 3 tronçons d'épreuve, 1 rinçage global. Même choix dans le chiffrage (« une par zone » / « GLOBALE »).</w:t>
+            </w:r>
+          </w:p>
+        </w:tc>
+        <w:tc>
+          <w:tcPr>
+            <w:tcW w:type="dxa" w:w="3700"/>
+            <w:tcBorders>
+              <w:top w:val="single" w:color="D9D5CB" w:sz="4"/>
+              <w:left w:val="single" w:color="D9D5CB" w:sz="4"/>
+              <w:bottom w:val="single" w:color="D9D5CB" w:sz="4"/>
+              <w:right w:val="single" w:color="D9D5CB" w:sz="4"/>
+            </w:tcBorders>
+            <w:tcMar>
+              <w:top w:type="dxa" w:w="60"/>
+              <w:left w:type="dxa" w:w="90"/>
+              <w:bottom w:type="dxa" w:w="60"/>
+              <w:right w:type="dxa" w:w="90"/>
+            </w:tcMar>
+            <w:vAlign w:val="top"/>
+          </w:tcPr>
+          <w:p>
+            <w:pPr>
+              <w:spacing w:after="40"/>
+            </w:pPr>
+            <w:r>
+              <w:rPr>
+                <w:rFonts w:ascii="Calibri" w:cs="Calibri" w:eastAsia="Calibri" w:hAnsi="Calibri"/>
+                <w:color w:val="14213D"/>
+                <w:sz w:val="19"/>
+                <w:szCs w:val="19"/>
+              </w:rPr>
+              <w:t xml:space="preserve">Les frais fixes (skid, rapport, trajet, mise en place) ne sont comptés qu'une fois.</w:t>
+            </w:r>
+          </w:p>
+        </w:tc>
+        <w:tc>
+          <w:tcPr>
+            <w:tcW w:type="dxa" w:w="1300"/>
+            <w:tcBorders>
+              <w:top w:val="single" w:color="D9D5CB" w:sz="4"/>
+              <w:left w:val="single" w:color="D9D5CB" w:sz="4"/>
+              <w:bottom w:val="single" w:color="D9D5CB" w:sz="4"/>
+              <w:right w:val="single" w:color="D9D5CB" w:sz="4"/>
+            </w:tcBorders>
+            <w:shd w:fill="E6F5EC" w:color="auto" w:val="clear"/>
+            <w:tcMar>
+              <w:top w:type="dxa" w:w="60"/>
+              <w:left w:type="dxa" w:w="90"/>
+              <w:bottom w:type="dxa" w:w="60"/>
+              <w:right w:type="dxa" w:w="90"/>
+            </w:tcMar>
+            <w:vAlign w:val="top"/>
+          </w:tcPr>
+          <w:p>
+            <w:pPr>
+              <w:spacing w:after="40"/>
+            </w:pPr>
+            <w:r>
+              <w:rPr>
+                <w:rFonts w:ascii="Calibri" w:cs="Calibri" w:eastAsia="Calibri" w:hAnsi="Calibri"/>
+                <w:b/>
+                <w:bCs/>
+                <w:color w:val="14213D"/>
+                <w:sz w:val="19"/>
+                <w:szCs w:val="19"/>
+              </w:rPr>
+              <w:t xml:space="preserve">Fait</w:t>
+            </w:r>
+          </w:p>
+        </w:tc>
+        <w:tc>
+          <w:tcPr>
+            <w:tcW w:type="dxa" w:w="3700"/>
+            <w:tcBorders>
+              <w:top w:val="single" w:color="D9D5CB" w:sz="4"/>
+              <w:left w:val="single" w:color="D9D5CB" w:sz="4"/>
+              <w:bottom w:val="single" w:color="D9D5CB" w:sz="4"/>
+              <w:right w:val="single" w:color="D9D5CB" w:sz="4"/>
+            </w:tcBorders>
+            <w:tcMar>
+              <w:top w:type="dxa" w:w="60"/>
+              <w:left w:type="dxa" w:w="90"/>
+              <w:bottom w:type="dxa" w:w="60"/>
+              <w:right w:type="dxa" w:w="90"/>
+            </w:tcMar>
+            <w:vAlign w:val="top"/>
+          </w:tcPr>
+          <w:p>
+            <w:pPr>
+              <w:spacing w:after="40"/>
+            </w:pPr>
+            <w:r>
+              <w:rPr>
+                <w:rFonts w:ascii="Calibri" w:cs="Calibri" w:eastAsia="Calibri" w:hAnsi="Calibri"/>
+                <w:color w:val="14213D"/>
+                <w:sz w:val="20"/>
+                <w:szCs w:val="20"/>
+              </w:rPr>
+              <w:t xml:space="preserve"/>
+            </w:r>
+          </w:p>
+          <w:p>
+            <w:pPr>
+              <w:spacing w:after="40"/>
+            </w:pPr>
+            <w:r>
+              <w:rPr>
+                <w:rFonts w:ascii="Calibri" w:cs="Calibri" w:eastAsia="Calibri" w:hAnsi="Calibri"/>
+                <w:color w:val="14213D"/>
+                <w:sz w:val="20"/>
+                <w:szCs w:val="20"/>
+              </w:rPr>
+              <w:t xml:space="preserve"/>
+            </w:r>
+          </w:p>
+        </w:tc>
+      </w:tr>
+      <w:tr>
+        <w:tc>
+          <w:tcPr>
+            <w:tcW w:type="dxa" w:w="2300"/>
+            <w:tcBorders>
+              <w:top w:val="single" w:color="D9D5CB" w:sz="4"/>
+              <w:left w:val="single" w:color="D9D5CB" w:sz="4"/>
+              <w:bottom w:val="single" w:color="D9D5CB" w:sz="4"/>
+              <w:right w:val="single" w:color="D9D5CB" w:sz="4"/>
+            </w:tcBorders>
+            <w:tcMar>
+              <w:top w:type="dxa" w:w="60"/>
+              <w:left w:type="dxa" w:w="90"/>
+              <w:bottom w:type="dxa" w:w="60"/>
+              <w:right w:type="dxa" w:w="90"/>
+            </w:tcMar>
+            <w:vAlign w:val="top"/>
+          </w:tcPr>
+          <w:p>
+            <w:pPr>
+              <w:spacing w:after="40"/>
+            </w:pPr>
+            <w:r>
+              <w:rPr>
+                <w:rFonts w:ascii="Calibri" w:cs="Calibri" w:eastAsia="Calibri" w:hAnsi="Calibri"/>
+                <w:b/>
+                <w:bCs/>
+                <w:color w:val="14213D"/>
+                <w:sz w:val="20"/>
+                <w:szCs w:val="20"/>
+              </w:rPr>
+              <w:t xml:space="preserve">ml précisés</w:t>
+            </w:r>
+          </w:p>
+        </w:tc>
+        <w:tc>
+          <w:tcPr>
+            <w:tcW w:type="dxa" w:w="4100"/>
+            <w:tcBorders>
+              <w:top w:val="single" w:color="D9D5CB" w:sz="4"/>
+              <w:left w:val="single" w:color="D9D5CB" w:sz="4"/>
+              <w:bottom w:val="single" w:color="D9D5CB" w:sz="4"/>
+              <w:right w:val="single" w:color="D9D5CB" w:sz="4"/>
+            </w:tcBorders>
+            <w:tcMar>
+              <w:top w:type="dxa" w:w="60"/>
+              <w:left w:type="dxa" w:w="90"/>
+              <w:bottom w:type="dxa" w:w="60"/>
+              <w:right w:type="dxa" w:w="90"/>
+            </w:tcMar>
+            <w:vAlign w:val="top"/>
+          </w:tcPr>
+          <w:p>
+            <w:pPr>
+              <w:spacing w:after="40"/>
+            </w:pPr>
+            <w:r>
+              <w:rPr>
+                <w:rFonts w:ascii="Calibri" w:cs="Calibri" w:eastAsia="Calibri" w:hAnsi="Calibri"/>
+                <w:color w:val="14213D"/>
+                <w:sz w:val="19"/>
+                <w:szCs w:val="19"/>
+              </w:rPr>
+              <w:t xml:space="preserve">Partout : « ml de tube (aller + retour) » (essai, boulet, aérien, dépose) ou « ml de tranchée » (quantités, table des DN, fonçage).</w:t>
+            </w:r>
+          </w:p>
+        </w:tc>
+        <w:tc>
+          <w:tcPr>
+            <w:tcW w:type="dxa" w:w="3700"/>
+            <w:tcBorders>
+              <w:top w:val="single" w:color="D9D5CB" w:sz="4"/>
+              <w:left w:val="single" w:color="D9D5CB" w:sz="4"/>
+              <w:bottom w:val="single" w:color="D9D5CB" w:sz="4"/>
+              <w:right w:val="single" w:color="D9D5CB" w:sz="4"/>
+            </w:tcBorders>
+            <w:tcMar>
+              <w:top w:type="dxa" w:w="60"/>
+              <w:left w:type="dxa" w:w="90"/>
+              <w:bottom w:type="dxa" w:w="60"/>
+              <w:right w:type="dxa" w:w="90"/>
+            </w:tcMar>
+            <w:vAlign w:val="top"/>
+          </w:tcPr>
+          <w:p>
+            <w:pPr>
+              <w:spacing w:after="40"/>
+            </w:pPr>
+            <w:r>
+              <w:rPr>
+                <w:rFonts w:ascii="Calibri" w:cs="Calibri" w:eastAsia="Calibri" w:hAnsi="Calibri"/>
+                <w:color w:val="14213D"/>
+                <w:sz w:val="19"/>
+                <w:szCs w:val="19"/>
+              </w:rPr>
+              <w:t xml:space="preserve"/>
+            </w:r>
+          </w:p>
+        </w:tc>
+        <w:tc>
+          <w:tcPr>
+            <w:tcW w:type="dxa" w:w="1300"/>
+            <w:tcBorders>
+              <w:top w:val="single" w:color="D9D5CB" w:sz="4"/>
+              <w:left w:val="single" w:color="D9D5CB" w:sz="4"/>
+              <w:bottom w:val="single" w:color="D9D5CB" w:sz="4"/>
+              <w:right w:val="single" w:color="D9D5CB" w:sz="4"/>
+            </w:tcBorders>
+            <w:shd w:fill="E6F5EC" w:color="auto" w:val="clear"/>
+            <w:tcMar>
+              <w:top w:type="dxa" w:w="60"/>
+              <w:left w:type="dxa" w:w="90"/>
+              <w:bottom w:type="dxa" w:w="60"/>
+              <w:right w:type="dxa" w:w="90"/>
+            </w:tcMar>
+            <w:vAlign w:val="top"/>
+          </w:tcPr>
+          <w:p>
+            <w:pPr>
+              <w:spacing w:after="40"/>
+            </w:pPr>
+            <w:r>
+              <w:rPr>
+                <w:rFonts w:ascii="Calibri" w:cs="Calibri" w:eastAsia="Calibri" w:hAnsi="Calibri"/>
+                <w:b/>
+                <w:bCs/>
+                <w:color w:val="14213D"/>
+                <w:sz w:val="19"/>
+                <w:szCs w:val="19"/>
+              </w:rPr>
+              <w:t xml:space="preserve">Fait</w:t>
+            </w:r>
+          </w:p>
+        </w:tc>
+        <w:tc>
+          <w:tcPr>
+            <w:tcW w:type="dxa" w:w="3700"/>
+            <w:tcBorders>
+              <w:top w:val="single" w:color="D9D5CB" w:sz="4"/>
+              <w:left w:val="single" w:color="D9D5CB" w:sz="4"/>
+              <w:bottom w:val="single" w:color="D9D5CB" w:sz="4"/>
+              <w:right w:val="single" w:color="D9D5CB" w:sz="4"/>
+            </w:tcBorders>
+            <w:tcMar>
+              <w:top w:type="dxa" w:w="60"/>
+              <w:left w:type="dxa" w:w="90"/>
+              <w:bottom w:type="dxa" w:w="60"/>
+              <w:right w:type="dxa" w:w="90"/>
+            </w:tcMar>
+            <w:vAlign w:val="top"/>
+          </w:tcPr>
+          <w:p>
+            <w:pPr>
+              <w:spacing w:after="40"/>
+            </w:pPr>
+            <w:r>
+              <w:rPr>
+                <w:rFonts w:ascii="Calibri" w:cs="Calibri" w:eastAsia="Calibri" w:hAnsi="Calibri"/>
+                <w:color w:val="14213D"/>
+                <w:sz w:val="20"/>
+                <w:szCs w:val="20"/>
+              </w:rPr>
+              <w:t xml:space="preserve"/>
+            </w:r>
+          </w:p>
+          <w:p>
+            <w:pPr>
+              <w:spacing w:after="40"/>
+            </w:pPr>
+            <w:r>
+              <w:rPr>
+                <w:rFonts w:ascii="Calibri" w:cs="Calibri" w:eastAsia="Calibri" w:hAnsi="Calibri"/>
+                <w:color w:val="14213D"/>
+                <w:sz w:val="20"/>
+                <w:szCs w:val="20"/>
+              </w:rPr>
+              <w:t xml:space="preserve"/>
+            </w:r>
+          </w:p>
+        </w:tc>
+      </w:tr>
+      <w:tr>
+        <w:tc>
+          <w:tcPr>
+            <w:tcW w:type="dxa" w:w="2300"/>
+            <w:tcBorders>
+              <w:top w:val="single" w:color="D9D5CB" w:sz="4"/>
+              <w:left w:val="single" w:color="D9D5CB" w:sz="4"/>
+              <w:bottom w:val="single" w:color="D9D5CB" w:sz="4"/>
+              <w:right w:val="single" w:color="D9D5CB" w:sz="4"/>
+            </w:tcBorders>
+            <w:tcMar>
+              <w:top w:type="dxa" w:w="60"/>
+              <w:left w:type="dxa" w:w="90"/>
+              <w:bottom w:type="dxa" w:w="60"/>
+              <w:right w:type="dxa" w:w="90"/>
+            </w:tcMar>
+            <w:vAlign w:val="top"/>
+          </w:tcPr>
+          <w:p>
+            <w:pPr>
+              <w:spacing w:after="40"/>
+            </w:pPr>
+            <w:r>
+              <w:rPr>
+                <w:rFonts w:ascii="Calibri" w:cs="Calibri" w:eastAsia="Calibri" w:hAnsi="Calibri"/>
+                <w:b/>
+                <w:bCs/>
+                <w:color w:val="14213D"/>
+                <w:sz w:val="20"/>
+                <w:szCs w:val="20"/>
+              </w:rPr>
+              <w:t xml:space="preserve">Base de prix SCR (consultable, modifiable par toi, Jérôme et le gérant)</w:t>
+            </w:r>
+          </w:p>
+        </w:tc>
+        <w:tc>
+          <w:tcPr>
+            <w:tcW w:type="dxa" w:w="4100"/>
+            <w:tcBorders>
+              <w:top w:val="single" w:color="D9D5CB" w:sz="4"/>
+              <w:left w:val="single" w:color="D9D5CB" w:sz="4"/>
+              <w:bottom w:val="single" w:color="D9D5CB" w:sz="4"/>
+              <w:right w:val="single" w:color="D9D5CB" w:sz="4"/>
+            </w:tcBorders>
+            <w:tcMar>
+              <w:top w:type="dxa" w:w="60"/>
+              <w:left w:type="dxa" w:w="90"/>
+              <w:bottom w:type="dxa" w:w="60"/>
+              <w:right w:type="dxa" w:w="90"/>
+            </w:tcMar>
+            <w:vAlign w:val="top"/>
+          </w:tcPr>
+          <w:p>
+            <w:pPr>
+              <w:spacing w:after="40"/>
+            </w:pPr>
+            <w:r>
+              <w:rPr>
+                <w:rFonts w:ascii="Calibri" w:cs="Calibri" w:eastAsia="Calibri" w:hAnsi="Calibri"/>
+                <w:color w:val="14213D"/>
+                <w:sz w:val="19"/>
+                <w:szCs w:val="19"/>
+              </w:rPr>
+              <w:t xml:space="preserve">Commerce → ⚙ Base de prix SCR (sans ouvrir d'affaire) : taux, équipes, cadences, fournitures, sous-traitance, paramètres, paniers ; import / réimport du classeur. Nouveau droit « Base de prix SCR : modifier » : le gérant d'office, toi (administrateur) ; pour Jérôme : Administrateur → Jérôme → coche ce droit. Les autres la consultent (champs grisés).</w:t>
+            </w:r>
+          </w:p>
+        </w:tc>
+        <w:tc>
+          <w:tcPr>
+            <w:tcW w:type="dxa" w:w="3700"/>
+            <w:tcBorders>
+              <w:top w:val="single" w:color="D9D5CB" w:sz="4"/>
+              <w:left w:val="single" w:color="D9D5CB" w:sz="4"/>
+              <w:bottom w:val="single" w:color="D9D5CB" w:sz="4"/>
+              <w:right w:val="single" w:color="D9D5CB" w:sz="4"/>
+            </w:tcBorders>
+            <w:tcMar>
+              <w:top w:type="dxa" w:w="60"/>
+              <w:left w:type="dxa" w:w="90"/>
+              <w:bottom w:type="dxa" w:w="60"/>
+              <w:right w:type="dxa" w:w="90"/>
+            </w:tcMar>
+            <w:vAlign w:val="top"/>
+          </w:tcPr>
+          <w:p>
+            <w:pPr>
+              <w:spacing w:after="40"/>
+            </w:pPr>
+            <w:r>
+              <w:rPr>
+                <w:rFonts w:ascii="Calibri" w:cs="Calibri" w:eastAsia="Calibri" w:hAnsi="Calibri"/>
+                <w:color w:val="14213D"/>
+                <w:sz w:val="19"/>
+                <w:szCs w:val="19"/>
+              </w:rPr>
+              <w:t xml:space="preserve">Passe retours_13-10e.sql pour que le serveur applique la même règle.</w:t>
+            </w:r>
+          </w:p>
+        </w:tc>
+        <w:tc>
+          <w:tcPr>
+            <w:tcW w:type="dxa" w:w="1300"/>
+            <w:tcBorders>
+              <w:top w:val="single" w:color="D9D5CB" w:sz="4"/>
+              <w:left w:val="single" w:color="D9D5CB" w:sz="4"/>
+              <w:bottom w:val="single" w:color="D9D5CB" w:sz="4"/>
+              <w:right w:val="single" w:color="D9D5CB" w:sz="4"/>
+            </w:tcBorders>
+            <w:shd w:fill="E6F5EC" w:color="auto" w:val="clear"/>
+            <w:tcMar>
+              <w:top w:type="dxa" w:w="60"/>
+              <w:left w:type="dxa" w:w="90"/>
+              <w:bottom w:type="dxa" w:w="60"/>
+              <w:right w:type="dxa" w:w="90"/>
+            </w:tcMar>
+            <w:vAlign w:val="top"/>
+          </w:tcPr>
+          <w:p>
+            <w:pPr>
+              <w:spacing w:after="40"/>
+            </w:pPr>
+            <w:r>
+              <w:rPr>
+                <w:rFonts w:ascii="Calibri" w:cs="Calibri" w:eastAsia="Calibri" w:hAnsi="Calibri"/>
+                <w:b/>
+                <w:bCs/>
+                <w:color w:val="14213D"/>
+                <w:sz w:val="19"/>
+                <w:szCs w:val="19"/>
+              </w:rPr>
+              <w:t xml:space="preserve">Fait</w:t>
+            </w:r>
+          </w:p>
+        </w:tc>
+        <w:tc>
+          <w:tcPr>
+            <w:tcW w:type="dxa" w:w="3700"/>
+            <w:tcBorders>
+              <w:top w:val="single" w:color="D9D5CB" w:sz="4"/>
+              <w:left w:val="single" w:color="D9D5CB" w:sz="4"/>
+              <w:bottom w:val="single" w:color="D9D5CB" w:sz="4"/>
+              <w:right w:val="single" w:color="D9D5CB" w:sz="4"/>
+            </w:tcBorders>
+            <w:tcMar>
+              <w:top w:type="dxa" w:w="60"/>
+              <w:left w:type="dxa" w:w="90"/>
+              <w:bottom w:type="dxa" w:w="60"/>
+              <w:right w:type="dxa" w:w="90"/>
+            </w:tcMar>
+            <w:vAlign w:val="top"/>
+          </w:tcPr>
+          <w:p>
+            <w:pPr>
+              <w:spacing w:after="40"/>
+            </w:pPr>
+            <w:r>
+              <w:rPr>
+                <w:rFonts w:ascii="Calibri" w:cs="Calibri" w:eastAsia="Calibri" w:hAnsi="Calibri"/>
+                <w:color w:val="14213D"/>
+                <w:sz w:val="20"/>
+                <w:szCs w:val="20"/>
+              </w:rPr>
+              <w:t xml:space="preserve"/>
+            </w:r>
+          </w:p>
+          <w:p>
+            <w:pPr>
+              <w:spacing w:after="40"/>
+            </w:pPr>
+            <w:r>
+              <w:rPr>
+                <w:rFonts w:ascii="Calibri" w:cs="Calibri" w:eastAsia="Calibri" w:hAnsi="Calibri"/>
+                <w:color w:val="14213D"/>
+                <w:sz w:val="20"/>
+                <w:szCs w:val="20"/>
+              </w:rPr>
+              <w:t xml:space="preserve"/>
+            </w:r>
+          </w:p>
+        </w:tc>
+      </w:tr>
+      <w:tr>
+        <w:tc>
+          <w:tcPr>
+            <w:tcW w:type="dxa" w:w="2300"/>
+            <w:tcBorders>
+              <w:top w:val="single" w:color="D9D5CB" w:sz="4"/>
+              <w:left w:val="single" w:color="D9D5CB" w:sz="4"/>
+              <w:bottom w:val="single" w:color="D9D5CB" w:sz="4"/>
+              <w:right w:val="single" w:color="D9D5CB" w:sz="4"/>
+            </w:tcBorders>
+            <w:tcMar>
+              <w:top w:type="dxa" w:w="60"/>
+              <w:left w:type="dxa" w:w="90"/>
+              <w:bottom w:type="dxa" w:w="60"/>
+              <w:right w:type="dxa" w:w="90"/>
+            </w:tcMar>
+            <w:vAlign w:val="top"/>
+          </w:tcPr>
+          <w:p>
+            <w:pPr>
+              <w:spacing w:after="40"/>
+            </w:pPr>
+            <w:r>
+              <w:rPr>
+                <w:rFonts w:ascii="Calibri" w:cs="Calibri" w:eastAsia="Calibri" w:hAnsi="Calibri"/>
+                <w:b/>
+                <w:bCs/>
+                <w:color w:val="14213D"/>
+                <w:sz w:val="20"/>
+                <w:szCs w:val="20"/>
+              </w:rPr>
+              <w:t xml:space="preserve">Le panier se déplie dans la zone</w:t>
+            </w:r>
+          </w:p>
+        </w:tc>
+        <w:tc>
+          <w:tcPr>
+            <w:tcW w:type="dxa" w:w="4100"/>
+            <w:tcBorders>
+              <w:top w:val="single" w:color="D9D5CB" w:sz="4"/>
+              <w:left w:val="single" w:color="D9D5CB" w:sz="4"/>
+              <w:bottom w:val="single" w:color="D9D5CB" w:sz="4"/>
+              <w:right w:val="single" w:color="D9D5CB" w:sz="4"/>
+            </w:tcBorders>
+            <w:tcMar>
+              <w:top w:type="dxa" w:w="60"/>
+              <w:left w:type="dxa" w:w="90"/>
+              <w:bottom w:type="dxa" w:w="60"/>
+              <w:right w:type="dxa" w:w="90"/>
+            </w:tcMar>
+            <w:vAlign w:val="top"/>
+          </w:tcPr>
+          <w:p>
+            <w:pPr>
+              <w:spacing w:after="40"/>
+            </w:pPr>
+            <w:r>
+              <w:rPr>
+                <w:rFonts w:ascii="Calibri" w:cs="Calibri" w:eastAsia="Calibri" w:hAnsi="Calibri"/>
+                <w:color w:val="14213D"/>
+                <w:sz w:val="19"/>
+                <w:szCs w:val="19"/>
+              </w:rPr>
+              <w:t xml:space="preserve">Dans une zone : SST, purges, vidanges, raccordements → « ▸ Panier … » sous la ligne : MO (équipe, heures, taux) et fournitures (qté, PU). Change un PU ou des heures : ça ne vaut que pour CE chiffrage, la ligne passe en jaune avec « base 90,00 », le panier affiche « ⚠ modifié · base … ». ↺ revient à la base.</w:t>
+            </w:r>
+          </w:p>
+        </w:tc>
+        <w:tc>
+          <w:tcPr>
+            <w:tcW w:type="dxa" w:w="3700"/>
+            <w:tcBorders>
+              <w:top w:val="single" w:color="D9D5CB" w:sz="4"/>
+              <w:left w:val="single" w:color="D9D5CB" w:sz="4"/>
+              <w:bottom w:val="single" w:color="D9D5CB" w:sz="4"/>
+              <w:right w:val="single" w:color="D9D5CB" w:sz="4"/>
+            </w:tcBorders>
+            <w:tcMar>
+              <w:top w:type="dxa" w:w="60"/>
+              <w:left w:type="dxa" w:w="90"/>
+              <w:bottom w:type="dxa" w:w="60"/>
+              <w:right w:type="dxa" w:w="90"/>
+            </w:tcMar>
+            <w:vAlign w:val="top"/>
+          </w:tcPr>
+          <w:p>
+            <w:pPr>
+              <w:spacing w:after="40"/>
+            </w:pPr>
+            <w:r>
+              <w:rPr>
+                <w:rFonts w:ascii="Calibri" w:cs="Calibri" w:eastAsia="Calibri" w:hAnsi="Calibri"/>
+                <w:color w:val="14213D"/>
+                <w:sz w:val="19"/>
+                <w:szCs w:val="19"/>
+              </w:rPr>
+              <w:t xml:space="preserve">La base de prix ne bouge pas. Purges sans purgeur automatique : les lignes purgeur et tés sont barrées (non comprises).</w:t>
+            </w:r>
+          </w:p>
+        </w:tc>
+        <w:tc>
+          <w:tcPr>
+            <w:tcW w:type="dxa" w:w="1300"/>
+            <w:tcBorders>
+              <w:top w:val="single" w:color="D9D5CB" w:sz="4"/>
+              <w:left w:val="single" w:color="D9D5CB" w:sz="4"/>
+              <w:bottom w:val="single" w:color="D9D5CB" w:sz="4"/>
+              <w:right w:val="single" w:color="D9D5CB" w:sz="4"/>
+            </w:tcBorders>
+            <w:shd w:fill="E6F5EC" w:color="auto" w:val="clear"/>
+            <w:tcMar>
+              <w:top w:type="dxa" w:w="60"/>
+              <w:left w:type="dxa" w:w="90"/>
+              <w:bottom w:type="dxa" w:w="60"/>
+              <w:right w:type="dxa" w:w="90"/>
+            </w:tcMar>
+            <w:vAlign w:val="top"/>
+          </w:tcPr>
+          <w:p>
+            <w:pPr>
+              <w:spacing w:after="40"/>
+            </w:pPr>
+            <w:r>
+              <w:rPr>
+                <w:rFonts w:ascii="Calibri" w:cs="Calibri" w:eastAsia="Calibri" w:hAnsi="Calibri"/>
+                <w:b/>
+                <w:bCs/>
+                <w:color w:val="14213D"/>
+                <w:sz w:val="19"/>
+                <w:szCs w:val="19"/>
+              </w:rPr>
+              <w:t xml:space="preserve">Fait</w:t>
+            </w:r>
+          </w:p>
+        </w:tc>
+        <w:tc>
+          <w:tcPr>
+            <w:tcW w:type="dxa" w:w="3700"/>
+            <w:tcBorders>
+              <w:top w:val="single" w:color="D9D5CB" w:sz="4"/>
+              <w:left w:val="single" w:color="D9D5CB" w:sz="4"/>
+              <w:bottom w:val="single" w:color="D9D5CB" w:sz="4"/>
+              <w:right w:val="single" w:color="D9D5CB" w:sz="4"/>
+            </w:tcBorders>
+            <w:tcMar>
+              <w:top w:type="dxa" w:w="60"/>
+              <w:left w:type="dxa" w:w="90"/>
+              <w:bottom w:type="dxa" w:w="60"/>
+              <w:right w:type="dxa" w:w="90"/>
+            </w:tcMar>
+            <w:vAlign w:val="top"/>
+          </w:tcPr>
+          <w:p>
+            <w:pPr>
+              <w:spacing w:after="40"/>
+            </w:pPr>
+            <w:r>
+              <w:rPr>
+                <w:rFonts w:ascii="Calibri" w:cs="Calibri" w:eastAsia="Calibri" w:hAnsi="Calibri"/>
+                <w:color w:val="14213D"/>
+                <w:sz w:val="20"/>
+                <w:szCs w:val="20"/>
+              </w:rPr>
+              <w:t xml:space="preserve"/>
+            </w:r>
+          </w:p>
+          <w:p>
+            <w:pPr>
+              <w:spacing w:after="40"/>
+            </w:pPr>
+            <w:r>
+              <w:rPr>
+                <w:rFonts w:ascii="Calibri" w:cs="Calibri" w:eastAsia="Calibri" w:hAnsi="Calibri"/>
+                <w:color w:val="14213D"/>
+                <w:sz w:val="20"/>
+                <w:szCs w:val="20"/>
+              </w:rPr>
+              <w:t xml:space="preserve"/>
+            </w:r>
+          </w:p>
+        </w:tc>
+      </w:tr>
+      <w:tr>
+        <w:tc>
+          <w:tcPr>
+            <w:tcW w:type="dxa" w:w="2300"/>
+            <w:tcBorders>
+              <w:top w:val="single" w:color="D9D5CB" w:sz="4"/>
+              <w:left w:val="single" w:color="D9D5CB" w:sz="4"/>
+              <w:bottom w:val="single" w:color="D9D5CB" w:sz="4"/>
+              <w:right w:val="single" w:color="D9D5CB" w:sz="4"/>
+            </w:tcBorders>
+            <w:tcMar>
+              <w:top w:type="dxa" w:w="60"/>
+              <w:left w:type="dxa" w:w="90"/>
+              <w:bottom w:type="dxa" w:w="60"/>
+              <w:right w:type="dxa" w:w="90"/>
+            </w:tcMar>
+            <w:vAlign w:val="top"/>
+          </w:tcPr>
+          <w:p>
+            <w:pPr>
+              <w:spacing w:after="40"/>
+            </w:pPr>
+            <w:r>
+              <w:rPr>
+                <w:rFonts w:ascii="Calibri" w:cs="Calibri" w:eastAsia="Calibri" w:hAnsi="Calibri"/>
+                <w:b/>
+                <w:bCs/>
+                <w:color w:val="14213D"/>
+                <w:sz w:val="20"/>
+                <w:szCs w:val="20"/>
+              </w:rPr>
+              <w:t xml:space="preserve">Onglet 🏗 Installations</w:t>
+            </w:r>
+          </w:p>
+        </w:tc>
+        <w:tc>
+          <w:tcPr>
+            <w:tcW w:type="dxa" w:w="4100"/>
+            <w:tcBorders>
+              <w:top w:val="single" w:color="D9D5CB" w:sz="4"/>
+              <w:left w:val="single" w:color="D9D5CB" w:sz="4"/>
+              <w:bottom w:val="single" w:color="D9D5CB" w:sz="4"/>
+              <w:right w:val="single" w:color="D9D5CB" w:sz="4"/>
+            </w:tcBorders>
+            <w:tcMar>
+              <w:top w:type="dxa" w:w="60"/>
+              <w:left w:type="dxa" w:w="90"/>
+              <w:bottom w:type="dxa" w:w="60"/>
+              <w:right w:type="dxa" w:w="90"/>
+            </w:tcMar>
+            <w:vAlign w:val="top"/>
+          </w:tcPr>
+          <w:p>
+            <w:pPr>
+              <w:spacing w:after="40"/>
+            </w:pPr>
+            <w:r>
+              <w:rPr>
+                <w:rFonts w:ascii="Calibri" w:cs="Calibri" w:eastAsia="Calibri" w:hAnsi="Calibri"/>
+                <w:color w:val="14213D"/>
+                <w:sz w:val="19"/>
+                <w:szCs w:val="19"/>
+              </w:rPr>
+              <w:t xml:space="preserve">Chiffrage → 🏗 Installations → « Utiliser l'onglet Installations » : WC, conteneur, benne, pelle (nombre, jours de location réels, A/R), amené / repli, déchargements, transfert, DOE / carnet, frais d'installation — comptés une fois pour le chantier. Les zones ne les comptent plus (bandeau orange dans la zone). En bas : répartition sur les zones au ml, au prix, aux jours d'équipe, à parts égales ou en %.</w:t>
+            </w:r>
+          </w:p>
+        </w:tc>
+        <w:tc>
+          <w:tcPr>
+            <w:tcW w:type="dxa" w:w="3700"/>
+            <w:tcBorders>
+              <w:top w:val="single" w:color="D9D5CB" w:sz="4"/>
+              <w:left w:val="single" w:color="D9D5CB" w:sz="4"/>
+              <w:bottom w:val="single" w:color="D9D5CB" w:sz="4"/>
+              <w:right w:val="single" w:color="D9D5CB" w:sz="4"/>
+            </w:tcBorders>
+            <w:tcMar>
+              <w:top w:type="dxa" w:w="60"/>
+              <w:left w:type="dxa" w:w="90"/>
+              <w:bottom w:type="dxa" w:w="60"/>
+              <w:right w:type="dxa" w:w="90"/>
+            </w:tcMar>
+            <w:vAlign w:val="top"/>
+          </w:tcPr>
+          <w:p>
+            <w:pPr>
+              <w:spacing w:after="40"/>
+            </w:pPr>
+            <w:r>
+              <w:rPr>
+                <w:rFonts w:ascii="Calibri" w:cs="Calibri" w:eastAsia="Calibri" w:hAnsi="Calibri"/>
+                <w:color w:val="14213D"/>
+                <w:sz w:val="19"/>
+                <w:szCs w:val="19"/>
+              </w:rPr>
+              <w:t xml:space="preserve">Durée de la pelle : tape les vrais jours (phasage : l'engin dort ; plus vite que les cadences) ou les raccourcis « = la période / = jours de soudure ». Le récap, la fiche imprimable, le CSV et le DPGF en tiennent compte.</w:t>
+            </w:r>
+          </w:p>
+        </w:tc>
+        <w:tc>
+          <w:tcPr>
+            <w:tcW w:type="dxa" w:w="1300"/>
+            <w:tcBorders>
+              <w:top w:val="single" w:color="D9D5CB" w:sz="4"/>
+              <w:left w:val="single" w:color="D9D5CB" w:sz="4"/>
+              <w:bottom w:val="single" w:color="D9D5CB" w:sz="4"/>
+              <w:right w:val="single" w:color="D9D5CB" w:sz="4"/>
+            </w:tcBorders>
+            <w:shd w:fill="E6F5EC" w:color="auto" w:val="clear"/>
+            <w:tcMar>
+              <w:top w:type="dxa" w:w="60"/>
+              <w:left w:type="dxa" w:w="90"/>
+              <w:bottom w:type="dxa" w:w="60"/>
+              <w:right w:type="dxa" w:w="90"/>
+            </w:tcMar>
+            <w:vAlign w:val="top"/>
+          </w:tcPr>
+          <w:p>
+            <w:pPr>
+              <w:spacing w:after="40"/>
+            </w:pPr>
+            <w:r>
+              <w:rPr>
+                <w:rFonts w:ascii="Calibri" w:cs="Calibri" w:eastAsia="Calibri" w:hAnsi="Calibri"/>
+                <w:b/>
+                <w:bCs/>
+                <w:color w:val="14213D"/>
+                <w:sz w:val="19"/>
+                <w:szCs w:val="19"/>
+              </w:rPr>
+              <w:t xml:space="preserve">Fait</w:t>
+            </w:r>
+          </w:p>
+        </w:tc>
+        <w:tc>
+          <w:tcPr>
+            <w:tcW w:type="dxa" w:w="3700"/>
+            <w:tcBorders>
+              <w:top w:val="single" w:color="D9D5CB" w:sz="4"/>
+              <w:left w:val="single" w:color="D9D5CB" w:sz="4"/>
+              <w:bottom w:val="single" w:color="D9D5CB" w:sz="4"/>
+              <w:right w:val="single" w:color="D9D5CB" w:sz="4"/>
+            </w:tcBorders>
+            <w:tcMar>
+              <w:top w:type="dxa" w:w="60"/>
+              <w:left w:type="dxa" w:w="90"/>
+              <w:bottom w:type="dxa" w:w="60"/>
+              <w:right w:type="dxa" w:w="90"/>
+            </w:tcMar>
+            <w:vAlign w:val="top"/>
+          </w:tcPr>
+          <w:p>
+            <w:pPr>
+              <w:spacing w:after="40"/>
+            </w:pPr>
+            <w:r>
+              <w:rPr>
+                <w:rFonts w:ascii="Calibri" w:cs="Calibri" w:eastAsia="Calibri" w:hAnsi="Calibri"/>
+                <w:color w:val="14213D"/>
+                <w:sz w:val="20"/>
+                <w:szCs w:val="20"/>
+              </w:rPr>
+              <w:t xml:space="preserve"/>
+            </w:r>
+          </w:p>
+          <w:p>
+            <w:pPr>
+              <w:spacing w:after="40"/>
+            </w:pPr>
+            <w:r>
+              <w:rPr>
+                <w:rFonts w:ascii="Calibri" w:cs="Calibri" w:eastAsia="Calibri" w:hAnsi="Calibri"/>
+                <w:color w:val="14213D"/>
+                <w:sz w:val="20"/>
+                <w:szCs w:val="20"/>
+              </w:rPr>
+              <w:t xml:space="preserve"/>
+            </w:r>
+          </w:p>
+        </w:tc>
+      </w:tr>
+      <w:tr>
+        <w:tc>
+          <w:tcPr>
+            <w:tcW w:type="dxa" w:w="2300"/>
+            <w:tcBorders>
+              <w:top w:val="single" w:color="D9D5CB" w:sz="4"/>
+              <w:left w:val="single" w:color="D9D5CB" w:sz="4"/>
+              <w:bottom w:val="single" w:color="D9D5CB" w:sz="4"/>
+              <w:right w:val="single" w:color="D9D5CB" w:sz="4"/>
+            </w:tcBorders>
+            <w:tcMar>
+              <w:top w:type="dxa" w:w="60"/>
+              <w:left w:type="dxa" w:w="90"/>
+              <w:bottom w:type="dxa" w:w="60"/>
+              <w:right w:type="dxa" w:w="90"/>
+            </w:tcMar>
+            <w:vAlign w:val="top"/>
+          </w:tcPr>
+          <w:p>
+            <w:pPr>
+              <w:spacing w:after="40"/>
+            </w:pPr>
+            <w:r>
+              <w:rPr>
+                <w:rFonts w:ascii="Calibri" w:cs="Calibri" w:eastAsia="Calibri" w:hAnsi="Calibri"/>
+                <w:b/>
+                <w:bCs/>
+                <w:color w:val="14213D"/>
+                <w:sz w:val="20"/>
+                <w:szCs w:val="20"/>
+              </w:rPr>
+              <w:t xml:space="preserve">Zones : où je suis, ce que c'est</w:t>
+            </w:r>
+          </w:p>
+        </w:tc>
+        <w:tc>
+          <w:tcPr>
+            <w:tcW w:type="dxa" w:w="4100"/>
+            <w:tcBorders>
+              <w:top w:val="single" w:color="D9D5CB" w:sz="4"/>
+              <w:left w:val="single" w:color="D9D5CB" w:sz="4"/>
+              <w:bottom w:val="single" w:color="D9D5CB" w:sz="4"/>
+              <w:right w:val="single" w:color="D9D5CB" w:sz="4"/>
+            </w:tcBorders>
+            <w:tcMar>
+              <w:top w:type="dxa" w:w="60"/>
+              <w:left w:type="dxa" w:w="90"/>
+              <w:bottom w:type="dxa" w:w="60"/>
+              <w:right w:type="dxa" w:w="90"/>
+            </w:tcMar>
+            <w:vAlign w:val="top"/>
+          </w:tcPr>
+          <w:p>
+            <w:pPr>
+              <w:spacing w:after="40"/>
+            </w:pPr>
+            <w:r>
+              <w:rPr>
+                <w:rFonts w:ascii="Calibri" w:cs="Calibri" w:eastAsia="Calibri" w:hAnsi="Calibri"/>
+                <w:color w:val="14213D"/>
+                <w:sz w:val="19"/>
+                <w:szCs w:val="19"/>
+              </w:rPr>
+              <w:t xml:space="preserve">Chaque zone a une couleur, un intitulé « ce que couvre la zone » (carte Chantier) et un bandeau « Zone 2 / 4 · Antenne Lilas · ce que couvre la zone · ml, soudures, achat ».</w:t>
+            </w:r>
+          </w:p>
+        </w:tc>
+        <w:tc>
+          <w:tcPr>
+            <w:tcW w:type="dxa" w:w="3700"/>
+            <w:tcBorders>
+              <w:top w:val="single" w:color="D9D5CB" w:sz="4"/>
+              <w:left w:val="single" w:color="D9D5CB" w:sz="4"/>
+              <w:bottom w:val="single" w:color="D9D5CB" w:sz="4"/>
+              <w:right w:val="single" w:color="D9D5CB" w:sz="4"/>
+            </w:tcBorders>
+            <w:tcMar>
+              <w:top w:type="dxa" w:w="60"/>
+              <w:left w:type="dxa" w:w="90"/>
+              <w:bottom w:type="dxa" w:w="60"/>
+              <w:right w:type="dxa" w:w="90"/>
+            </w:tcMar>
+            <w:vAlign w:val="top"/>
+          </w:tcPr>
+          <w:p>
+            <w:pPr>
+              <w:spacing w:after="40"/>
+            </w:pPr>
+            <w:r>
+              <w:rPr>
+                <w:rFonts w:ascii="Calibri" w:cs="Calibri" w:eastAsia="Calibri" w:hAnsi="Calibri"/>
+                <w:color w:val="14213D"/>
+                <w:sz w:val="19"/>
+                <w:szCs w:val="19"/>
+              </w:rPr>
+              <w:t xml:space="preserve">Le lien zone ↔ onglet du DPGF : la prochaine étape, une fois ça validé.</w:t>
+            </w:r>
+          </w:p>
+        </w:tc>
+        <w:tc>
+          <w:tcPr>
+            <w:tcW w:type="dxa" w:w="1300"/>
+            <w:tcBorders>
+              <w:top w:val="single" w:color="D9D5CB" w:sz="4"/>
+              <w:left w:val="single" w:color="D9D5CB" w:sz="4"/>
+              <w:bottom w:val="single" w:color="D9D5CB" w:sz="4"/>
+              <w:right w:val="single" w:color="D9D5CB" w:sz="4"/>
+            </w:tcBorders>
+            <w:shd w:fill="E6F5EC" w:color="auto" w:val="clear"/>
+            <w:tcMar>
+              <w:top w:type="dxa" w:w="60"/>
+              <w:left w:type="dxa" w:w="90"/>
+              <w:bottom w:type="dxa" w:w="60"/>
+              <w:right w:type="dxa" w:w="90"/>
+            </w:tcMar>
+            <w:vAlign w:val="top"/>
+          </w:tcPr>
+          <w:p>
+            <w:pPr>
+              <w:spacing w:after="40"/>
+            </w:pPr>
+            <w:r>
+              <w:rPr>
+                <w:rFonts w:ascii="Calibri" w:cs="Calibri" w:eastAsia="Calibri" w:hAnsi="Calibri"/>
+                <w:b/>
+                <w:bCs/>
+                <w:color w:val="14213D"/>
+                <w:sz w:val="19"/>
+                <w:szCs w:val="19"/>
+              </w:rPr>
+              <w:t xml:space="preserve">Fait</w:t>
+            </w:r>
+          </w:p>
+        </w:tc>
+        <w:tc>
+          <w:tcPr>
+            <w:tcW w:type="dxa" w:w="3700"/>
+            <w:tcBorders>
+              <w:top w:val="single" w:color="D9D5CB" w:sz="4"/>
+              <w:left w:val="single" w:color="D9D5CB" w:sz="4"/>
+              <w:bottom w:val="single" w:color="D9D5CB" w:sz="4"/>
+              <w:right w:val="single" w:color="D9D5CB" w:sz="4"/>
+            </w:tcBorders>
+            <w:tcMar>
+              <w:top w:type="dxa" w:w="60"/>
+              <w:left w:type="dxa" w:w="90"/>
+              <w:bottom w:type="dxa" w:w="60"/>
+              <w:right w:type="dxa" w:w="90"/>
+            </w:tcMar>
+            <w:vAlign w:val="top"/>
+          </w:tcPr>
+          <w:p>
+            <w:pPr>
+              <w:spacing w:after="40"/>
+            </w:pPr>
+            <w:r>
+              <w:rPr>
+                <w:rFonts w:ascii="Calibri" w:cs="Calibri" w:eastAsia="Calibri" w:hAnsi="Calibri"/>
+                <w:color w:val="14213D"/>
+                <w:sz w:val="20"/>
+                <w:szCs w:val="20"/>
+              </w:rPr>
+              <w:t xml:space="preserve"/>
+            </w:r>
+          </w:p>
+          <w:p>
+            <w:pPr>
+              <w:spacing w:after="40"/>
+            </w:pPr>
+            <w:r>
+              <w:rPr>
+                <w:rFonts w:ascii="Calibri" w:cs="Calibri" w:eastAsia="Calibri" w:hAnsi="Calibri"/>
+                <w:color w:val="14213D"/>
+                <w:sz w:val="20"/>
+                <w:szCs w:val="20"/>
+              </w:rPr>
+              <w:t xml:space="preserve"/>
+            </w:r>
+          </w:p>
+        </w:tc>
+      </w:tr>
+      <w:tr>
+        <w:tc>
+          <w:tcPr>
+            <w:tcW w:type="dxa" w:w="2300"/>
+            <w:tcBorders>
+              <w:top w:val="single" w:color="D9D5CB" w:sz="4"/>
+              <w:left w:val="single" w:color="D9D5CB" w:sz="4"/>
+              <w:bottom w:val="single" w:color="D9D5CB" w:sz="4"/>
+              <w:right w:val="single" w:color="D9D5CB" w:sz="4"/>
+            </w:tcBorders>
+            <w:tcMar>
+              <w:top w:type="dxa" w:w="60"/>
+              <w:left w:type="dxa" w:w="90"/>
+              <w:bottom w:type="dxa" w:w="60"/>
+              <w:right w:type="dxa" w:w="90"/>
+            </w:tcMar>
+            <w:vAlign w:val="top"/>
+          </w:tcPr>
+          <w:p>
+            <w:pPr>
+              <w:spacing w:after="40"/>
+            </w:pPr>
+            <w:r>
+              <w:rPr>
+                <w:rFonts w:ascii="Calibri" w:cs="Calibri" w:eastAsia="Calibri" w:hAnsi="Calibri"/>
+                <w:b/>
+                <w:bCs/>
+                <w:color w:val="14213D"/>
+                <w:sz w:val="20"/>
+                <w:szCs w:val="20"/>
+              </w:rPr>
+              <w:t xml:space="preserve">Récap : tout, et la charge</w:t>
+            </w:r>
+          </w:p>
+        </w:tc>
+        <w:tc>
+          <w:tcPr>
+            <w:tcW w:type="dxa" w:w="4100"/>
+            <w:tcBorders>
+              <w:top w:val="single" w:color="D9D5CB" w:sz="4"/>
+              <w:left w:val="single" w:color="D9D5CB" w:sz="4"/>
+              <w:bottom w:val="single" w:color="D9D5CB" w:sz="4"/>
+              <w:right w:val="single" w:color="D9D5CB" w:sz="4"/>
+            </w:tcBorders>
+            <w:tcMar>
+              <w:top w:type="dxa" w:w="60"/>
+              <w:left w:type="dxa" w:w="90"/>
+              <w:bottom w:type="dxa" w:w="60"/>
+              <w:right w:type="dxa" w:w="90"/>
+            </w:tcMar>
+            <w:vAlign w:val="top"/>
+          </w:tcPr>
+          <w:p>
+            <w:pPr>
+              <w:spacing w:after="40"/>
+            </w:pPr>
+            <w:r>
+              <w:rPr>
+                <w:rFonts w:ascii="Calibri" w:cs="Calibri" w:eastAsia="Calibri" w:hAnsi="Calibri"/>
+                <w:color w:val="14213D"/>
+                <w:sz w:val="19"/>
+                <w:szCs w:val="19"/>
+              </w:rPr>
+              <w:t xml:space="preserve">Σ Récap : montants par poste et par zone + colonne Installations + ligne « avec les installations ventilées ». Dessous : « Quantités du chiffrage » (soudures, manchons, ml, jours d'équipe, purges, vidanges, SST, raccordements, CND, m³, jours de location…) et « Charge et équipes » : jours d'équipe de soudure et de manchonnage (nos cadences) face aux jours ouvrés → nombre d'équipes, pelles à prévoir ; « Phases du chantier » → A/R de pelle.</w:t>
+            </w:r>
+          </w:p>
+        </w:tc>
+        <w:tc>
+          <w:tcPr>
+            <w:tcW w:type="dxa" w:w="3700"/>
+            <w:tcBorders>
+              <w:top w:val="single" w:color="D9D5CB" w:sz="4"/>
+              <w:left w:val="single" w:color="D9D5CB" w:sz="4"/>
+              <w:bottom w:val="single" w:color="D9D5CB" w:sz="4"/>
+              <w:right w:val="single" w:color="D9D5CB" w:sz="4"/>
+            </w:tcBorders>
+            <w:tcMar>
+              <w:top w:type="dxa" w:w="60"/>
+              <w:left w:type="dxa" w:w="90"/>
+              <w:bottom w:type="dxa" w:w="60"/>
+              <w:right w:type="dxa" w:w="90"/>
+            </w:tcMar>
+            <w:vAlign w:val="top"/>
+          </w:tcPr>
+          <w:p>
+            <w:pPr>
+              <w:spacing w:after="40"/>
+            </w:pPr>
+            <w:r>
+              <w:rPr>
+                <w:rFonts w:ascii="Calibri" w:cs="Calibri" w:eastAsia="Calibri" w:hAnsi="Calibri"/>
+                <w:color w:val="14213D"/>
+                <w:sz w:val="19"/>
+                <w:szCs w:val="19"/>
+              </w:rPr>
+              <w:t xml:space="preserve">Exemple testé : 25 jours d'équipe de soudure en 10 jours ouvrés → « 3 équipes de soudure », « 3 équipes mais 2 pelles prévues », « 4 phases → 4 A/R (prévus 3) ».</w:t>
+            </w:r>
+          </w:p>
+        </w:tc>
+        <w:tc>
+          <w:tcPr>
+            <w:tcW w:type="dxa" w:w="1300"/>
+            <w:tcBorders>
+              <w:top w:val="single" w:color="D9D5CB" w:sz="4"/>
+              <w:left w:val="single" w:color="D9D5CB" w:sz="4"/>
+              <w:bottom w:val="single" w:color="D9D5CB" w:sz="4"/>
+              <w:right w:val="single" w:color="D9D5CB" w:sz="4"/>
+            </w:tcBorders>
+            <w:shd w:fill="E6F5EC" w:color="auto" w:val="clear"/>
+            <w:tcMar>
+              <w:top w:type="dxa" w:w="60"/>
+              <w:left w:type="dxa" w:w="90"/>
+              <w:bottom w:type="dxa" w:w="60"/>
+              <w:right w:type="dxa" w:w="90"/>
+            </w:tcMar>
+            <w:vAlign w:val="top"/>
+          </w:tcPr>
+          <w:p>
+            <w:pPr>
+              <w:spacing w:after="40"/>
+            </w:pPr>
+            <w:r>
+              <w:rPr>
+                <w:rFonts w:ascii="Calibri" w:cs="Calibri" w:eastAsia="Calibri" w:hAnsi="Calibri"/>
+                <w:b/>
+                <w:bCs/>
+                <w:color w:val="14213D"/>
+                <w:sz w:val="19"/>
+                <w:szCs w:val="19"/>
+              </w:rPr>
+              <w:t xml:space="preserve">Fait</w:t>
+            </w:r>
+          </w:p>
+        </w:tc>
+        <w:tc>
+          <w:tcPr>
+            <w:tcW w:type="dxa" w:w="3700"/>
+            <w:tcBorders>
+              <w:top w:val="single" w:color="D9D5CB" w:sz="4"/>
+              <w:left w:val="single" w:color="D9D5CB" w:sz="4"/>
+              <w:bottom w:val="single" w:color="D9D5CB" w:sz="4"/>
+              <w:right w:val="single" w:color="D9D5CB" w:sz="4"/>
+            </w:tcBorders>
+            <w:tcMar>
+              <w:top w:type="dxa" w:w="60"/>
+              <w:left w:type="dxa" w:w="90"/>
+              <w:bottom w:type="dxa" w:w="60"/>
+              <w:right w:type="dxa" w:w="90"/>
+            </w:tcMar>
+            <w:vAlign w:val="top"/>
+          </w:tcPr>
+          <w:p>
+            <w:pPr>
+              <w:spacing w:after="40"/>
+            </w:pPr>
+            <w:r>
+              <w:rPr>
+                <w:rFonts w:ascii="Calibri" w:cs="Calibri" w:eastAsia="Calibri" w:hAnsi="Calibri"/>
+                <w:color w:val="14213D"/>
+                <w:sz w:val="20"/>
+                <w:szCs w:val="20"/>
+              </w:rPr>
+              <w:t xml:space="preserve"/>
+            </w:r>
+          </w:p>
+          <w:p>
+            <w:pPr>
+              <w:spacing w:after="40"/>
+            </w:pPr>
+            <w:r>
+              <w:rPr>
+                <w:rFonts w:ascii="Calibri" w:cs="Calibri" w:eastAsia="Calibri" w:hAnsi="Calibri"/>
+                <w:color w:val="14213D"/>
+                <w:sz w:val="20"/>
+                <w:szCs w:val="20"/>
+              </w:rPr>
+              <w:t xml:space="preserve"/>
+            </w:r>
+          </w:p>
+        </w:tc>
+      </w:tr>
+      <w:tr>
+        <w:tc>
+          <w:tcPr>
+            <w:tcW w:type="dxa" w:w="2300"/>
+            <w:tcBorders>
+              <w:top w:val="single" w:color="D9D5CB" w:sz="4"/>
+              <w:left w:val="single" w:color="D9D5CB" w:sz="4"/>
+              <w:bottom w:val="single" w:color="D9D5CB" w:sz="4"/>
+              <w:right w:val="single" w:color="D9D5CB" w:sz="4"/>
+            </w:tcBorders>
+            <w:tcMar>
+              <w:top w:type="dxa" w:w="60"/>
+              <w:left w:type="dxa" w:w="90"/>
+              <w:bottom w:type="dxa" w:w="60"/>
+              <w:right w:type="dxa" w:w="90"/>
+            </w:tcMar>
+            <w:vAlign w:val="top"/>
+          </w:tcPr>
+          <w:p>
+            <w:pPr>
+              <w:spacing w:after="40"/>
+            </w:pPr>
+            <w:r>
+              <w:rPr>
+                <w:rFonts w:ascii="Calibri" w:cs="Calibri" w:eastAsia="Calibri" w:hAnsi="Calibri"/>
+                <w:b/>
+                <w:bCs/>
+                <w:color w:val="14213D"/>
+                <w:sz w:val="20"/>
+                <w:szCs w:val="20"/>
+              </w:rPr>
+              <w:t xml:space="preserve">À valider par toi</w:t>
+            </w:r>
+          </w:p>
+        </w:tc>
+        <w:tc>
+          <w:tcPr>
+            <w:tcW w:type="dxa" w:w="4100"/>
+            <w:tcBorders>
+              <w:top w:val="single" w:color="D9D5CB" w:sz="4"/>
+              <w:left w:val="single" w:color="D9D5CB" w:sz="4"/>
+              <w:bottom w:val="single" w:color="D9D5CB" w:sz="4"/>
+              <w:right w:val="single" w:color="D9D5CB" w:sz="4"/>
+            </w:tcBorders>
+            <w:tcMar>
+              <w:top w:type="dxa" w:w="60"/>
+              <w:left w:type="dxa" w:w="90"/>
+              <w:bottom w:type="dxa" w:w="60"/>
+              <w:right w:type="dxa" w:w="90"/>
+            </w:tcMar>
+            <w:vAlign w:val="top"/>
+          </w:tcPr>
+          <w:p>
+            <w:pPr>
+              <w:spacing w:after="40"/>
+            </w:pPr>
+            <w:r>
+              <w:rPr>
+                <w:rFonts w:ascii="Calibri" w:cs="Calibri" w:eastAsia="Calibri" w:hAnsi="Calibri"/>
+                <w:color w:val="14213D"/>
+                <w:sz w:val="19"/>
+                <w:szCs w:val="19"/>
+              </w:rPr>
+              <w:t xml:space="preserve">L'hydraulique : une seule équipe (OS) pour toutes les prestations ; le classeur permet une équipe par prestation et par zone. Je l'ajoute si vous vous en servez. Ventilation par défaut des installations : au ml.</w:t>
+            </w:r>
+          </w:p>
+        </w:tc>
+        <w:tc>
+          <w:tcPr>
+            <w:tcW w:type="dxa" w:w="3700"/>
+            <w:tcBorders>
+              <w:top w:val="single" w:color="D9D5CB" w:sz="4"/>
+              <w:left w:val="single" w:color="D9D5CB" w:sz="4"/>
+              <w:bottom w:val="single" w:color="D9D5CB" w:sz="4"/>
+              <w:right w:val="single" w:color="D9D5CB" w:sz="4"/>
+            </w:tcBorders>
+            <w:tcMar>
+              <w:top w:type="dxa" w:w="60"/>
+              <w:left w:type="dxa" w:w="90"/>
+              <w:bottom w:type="dxa" w:w="60"/>
+              <w:right w:type="dxa" w:w="90"/>
+            </w:tcMar>
+            <w:vAlign w:val="top"/>
+          </w:tcPr>
+          <w:p>
+            <w:pPr>
+              <w:spacing w:after="40"/>
+            </w:pPr>
+            <w:r>
+              <w:rPr>
+                <w:rFonts w:ascii="Calibri" w:cs="Calibri" w:eastAsia="Calibri" w:hAnsi="Calibri"/>
+                <w:color w:val="14213D"/>
+                <w:sz w:val="19"/>
+                <w:szCs w:val="19"/>
+              </w:rPr>
+              <w:t xml:space="preserve"/>
+            </w:r>
+          </w:p>
+        </w:tc>
+        <w:tc>
+          <w:tcPr>
+            <w:tcW w:type="dxa" w:w="1300"/>
+            <w:tcBorders>
+              <w:top w:val="single" w:color="D9D5CB" w:sz="4"/>
+              <w:left w:val="single" w:color="D9D5CB" w:sz="4"/>
+              <w:bottom w:val="single" w:color="D9D5CB" w:sz="4"/>
+              <w:right w:val="single" w:color="D9D5CB" w:sz="4"/>
+            </w:tcBorders>
+            <w:shd w:fill="FFF4EE" w:color="auto" w:val="clear"/>
+            <w:tcMar>
+              <w:top w:type="dxa" w:w="60"/>
+              <w:left w:type="dxa" w:w="90"/>
+              <w:bottom w:type="dxa" w:w="60"/>
+              <w:right w:type="dxa" w:w="90"/>
+            </w:tcMar>
+            <w:vAlign w:val="top"/>
+          </w:tcPr>
+          <w:p>
+            <w:pPr>
+              <w:spacing w:after="40"/>
+            </w:pPr>
+            <w:r>
+              <w:rPr>
+                <w:rFonts w:ascii="Calibri" w:cs="Calibri" w:eastAsia="Calibri" w:hAnsi="Calibri"/>
+                <w:b/>
+                <w:bCs/>
+                <w:color w:val="14213D"/>
+                <w:sz w:val="19"/>
+                <w:szCs w:val="19"/>
+              </w:rPr>
+              <w:t xml:space="preserve">À valider</w:t>
+            </w:r>
+          </w:p>
+        </w:tc>
+        <w:tc>
+          <w:tcPr>
+            <w:tcW w:type="dxa" w:w="3700"/>
+            <w:tcBorders>
+              <w:top w:val="single" w:color="D9D5CB" w:sz="4"/>
+              <w:left w:val="single" w:color="D9D5CB" w:sz="4"/>
+              <w:bottom w:val="single" w:color="D9D5CB" w:sz="4"/>
+              <w:right w:val="single" w:color="D9D5CB" w:sz="4"/>
+            </w:tcBorders>
+            <w:tcMar>
+              <w:top w:type="dxa" w:w="60"/>
+              <w:left w:type="dxa" w:w="90"/>
+              <w:bottom w:type="dxa" w:w="60"/>
+              <w:right w:type="dxa" w:w="90"/>
+            </w:tcMar>
+            <w:vAlign w:val="top"/>
+          </w:tcPr>
+          <w:p>
+            <w:pPr>
+              <w:spacing w:after="40"/>
+            </w:pPr>
+            <w:r>
+              <w:rPr>
+                <w:rFonts w:ascii="Calibri" w:cs="Calibri" w:eastAsia="Calibri" w:hAnsi="Calibri"/>
+                <w:color w:val="14213D"/>
+                <w:sz w:val="20"/>
+                <w:szCs w:val="20"/>
+              </w:rPr>
+              <w:t xml:space="preserve"/>
+            </w:r>
+          </w:p>
+          <w:p>
+            <w:pPr>
+              <w:spacing w:after="40"/>
+            </w:pPr>
+            <w:r>
+              <w:rPr>
+                <w:rFonts w:ascii="Calibri" w:cs="Calibri" w:eastAsia="Calibri" w:hAnsi="Calibri"/>
+                <w:color w:val="14213D"/>
+                <w:sz w:val="20"/>
+                <w:szCs w:val="20"/>
+              </w:rPr>
+              <w:t xml:space="preserve"/>
+            </w:r>
+          </w:p>
+        </w:tc>
+      </w:tr>
+    </w:tbl>
+    <w:p>
+      <w:pPr>
+        <w:pStyle w:val="Heading1"/>
+        <w:spacing w:after="120" w:before="320"/>
+      </w:pPr>
+      <w:r>
+        <w:rPr>
+          <w:rFonts w:ascii="Calibri" w:cs="Calibri" w:eastAsia="Calibri" w:hAnsi="Calibri"/>
+          <w:b/>
+          <w:bCs/>
+          <w:color w:val="EB6834"/>
+          <w:sz w:val="30"/>
+          <w:szCs w:val="30"/>
+        </w:rPr>
         <w:t xml:space="preserve">S · Commerce : lecture des pièces et points techniques (tes retours du 13/10)</w:t>
       </w:r>
     </w:p>
@@ -15446,7 +18506,7 @@
                 <w:sz w:val="20"/>
                 <w:szCs w:val="20"/>
               </w:rPr>
-              <w:t xml:space="preserve">Pas encore fait (lots suivants)</w:t>
+              <w:t xml:space="preserve">Lots suivants</w:t>
             </w:r>
           </w:p>
         </w:tc>
@@ -15510,7 +18570,7 @@
                 <w:sz w:val="19"/>
                 <w:szCs w:val="19"/>
               </w:rPr>
-              <w:t xml:space="preserve">3 · quantités fournisseur(s) vs tracé : il me faut une vraie étude fournisseur (Excel ou PDF). 4 · le mémoire « en mode lecture ». 5 · le contrôle croisé classeur ↔ appli.</w:t>
+              <w:t xml:space="preserve">3 · quantités fournisseur, 4 · le mémoire « en mode lecture », 5 · le contrôle croisé classeur ↔ appli : faits, section T.</w:t>
             </w:r>
           </w:p>
         </w:tc>
@@ -15523,29 +18583,29 @@
               <w:bottom w:val="single" w:color="D9D5CB" w:sz="4"/>
               <w:right w:val="single" w:color="D9D5CB" w:sz="4"/>
             </w:tcBorders>
-            <w:shd w:fill="FFF4EE" w:color="auto" w:val="clear"/>
-            <w:tcMar>
-              <w:top w:type="dxa" w:w="60"/>
-              <w:left w:type="dxa" w:w="90"/>
-              <w:bottom w:type="dxa" w:w="60"/>
-              <w:right w:type="dxa" w:w="90"/>
-            </w:tcMar>
-            <w:vAlign w:val="top"/>
-          </w:tcPr>
-          <w:p>
-            <w:pPr>
-              <w:spacing w:after="40"/>
-            </w:pPr>
-            <w:r>
-              <w:rPr>
-                <w:rFonts w:ascii="Calibri" w:cs="Calibri" w:eastAsia="Calibri" w:hAnsi="Calibri"/>
-                <w:b/>
-                <w:bCs/>
-                <w:color w:val="14213D"/>
-                <w:sz w:val="19"/>
-                <w:szCs w:val="19"/>
-              </w:rPr>
-              <w:t xml:space="preserve">À venir</w:t>
+            <w:shd w:fill="E6F5EC" w:color="auto" w:val="clear"/>
+            <w:tcMar>
+              <w:top w:type="dxa" w:w="60"/>
+              <w:left w:type="dxa" w:w="90"/>
+              <w:bottom w:type="dxa" w:w="60"/>
+              <w:right w:type="dxa" w:w="90"/>
+            </w:tcMar>
+            <w:vAlign w:val="top"/>
+          </w:tcPr>
+          <w:p>
+            <w:pPr>
+              <w:spacing w:after="40"/>
+            </w:pPr>
+            <w:r>
+              <w:rPr>
+                <w:rFonts w:ascii="Calibri" w:cs="Calibri" w:eastAsia="Calibri" w:hAnsi="Calibri"/>
+                <w:b/>
+                <w:bCs/>
+                <w:color w:val="14213D"/>
+                <w:sz w:val="19"/>
+                <w:szCs w:val="19"/>
+              </w:rPr>
+              <w:t xml:space="preserve">Fait (T)</w:t>
             </w:r>
           </w:p>
         </w:tc>

</xml_diff>

<commit_message>
Heures : compteur majoré avec plafond, heures à reporter, import du compteur, cas forcé, droits RH
</commit_message>
<xml_diff>
--- a/app/docs/Feuille_de_route_controle_12-10.docx
+++ b/app/docs/Feuille_de_route_controle_12-10.docx
@@ -29,7 +29,7 @@
           <w:sz w:val="22"/>
           <w:szCs w:val="22"/>
         </w:rPr>
-        <w:t xml:space="preserve">12 octobre 2026 · mise à jour du 13/10 (après-midi) : COMMERCE — quantités fournisseur par la trame, mémoire en mode lecture, contrôle croisé classeur ↔ appli, et le chiffrage qui remplace le classeur (base de prix, paniers dépliés, Installations, récap, charge et équipes) · fin de matinée : lecture des pièces et points techniques · la nuit du 13/10 : le responsable d'un chantier y entre toujours (Sofiane) · le plan de Nantes Géraudière qui disparaissait au zoom (réparé + « Recentrer le repère ») · le soir : GRANDS DÉPLACEMENTS jour par jour (4 ou 5 jours = même forfait), le mois par gars avec nuits et repas accordés, la navette, les adresses à vérifier · FOURNITURE : zone éditable, trame type d'import, écarts « commande complémentaire / inclus », BL de zone → Stock · l'après-midi : COMMERCE v2 (dossier déballé, lecture des pièces avec surlignage, chiffrage complet d'après ton classeur du 26.08, paniers, base de prix, DPGF traduite et réécrite dans l'Excel du client, blocs du mémoire) · le matin : onglet FOURNITURE (commande, livré, reste, zones à livrer, camions datés) et tes retours de la feuille du 09-10 (adresses, détente automatique, contrôle des grands déplacements, plein écran, trame d'accueil) · puis la nuit du 12/10 : six onglets, Commerce, Parc, Sécurité, accidents, Outlook serveur · nouvelle ventilation, « agir comme », raccourci rapide du planning, « ma semaine », tes commentaires du Word (sections 5 à 9) · une colonne pour tes retours</w:t>
+        <w:t xml:space="preserve">12 octobre 2026 · mise à jour du 13/10 (fin d'après-midi) : HEURES — compteur d'heures (heures sup majorées par rang jusqu'au plafond, repos, posé par l'entreprise), heures à reporter (prime, semaine plus légère), import du compteur existant, cas de déplacement forcé, droits RH · après-midi : COMMERCE — quantités fournisseur par la trame, mémoire en mode lecture, contrôle croisé classeur ↔ appli, et le chiffrage qui remplace le classeur (base de prix, paniers dépliés, Installations, récap, charge et équipes) · fin de matinée : lecture des pièces et points techniques · la nuit du 13/10 : le responsable d'un chantier y entre toujours (Sofiane) · le plan de Nantes Géraudière qui disparaissait au zoom (réparé + « Recentrer le repère ») · le soir : GRANDS DÉPLACEMENTS jour par jour (4 ou 5 jours = même forfait), le mois par gars avec nuits et repas accordés, la navette, les adresses à vérifier · FOURNITURE : zone éditable, trame type d'import, écarts « commande complémentaire / inclus », BL de zone → Stock · l'après-midi : COMMERCE v2 (dossier déballé, lecture des pièces avec surlignage, chiffrage complet d'après ton classeur du 26.08, paniers, base de prix, DPGF traduite et réécrite dans l'Excel du client, blocs du mémoire) · le matin : onglet FOURNITURE (commande, livré, reste, zones à livrer, camions datés) et tes retours de la feuille du 09-10 (adresses, détente automatique, contrôle des grands déplacements, plein écran, trame d'accueil) · puis la nuit du 12/10 : six onglets, Commerce, Parc, Sécurité, accidents, Outlook serveur · nouvelle ventilation, « agir comme », raccourci rapide du planning, « ma semaine », tes commentaires du Word (sections 5 à 9) · une colonne pour tes retours</w:t>
       </w:r>
     </w:p>
     <w:p>
@@ -65,7 +65,7 @@
           <w:sz w:val="20"/>
           <w:szCs w:val="20"/>
         </w:rPr>
-        <w:t xml:space="preserve">Même principe que la précédente : tu contrôles ligne par ligne, tu écris dans « Vos commentaires » (OK / à corriger / à changer : quoi), tu me renvoies le fichier. Je corrige à partir de tes commentaires, dans l'ordre du document. Commence par la section T (Commerce : quantités fournisseur, mémoire, contrôle croisé, tes retours sur la lecture et les points techniques, le chiffrage qui remplace le classeur), puis S (lecture des pièces et points techniques), puis R (compteurs d'heures, « Moi » : ma navette, PDF du livret), puis Q (champs date, plafond 48 h, règles GD vérifiées), puis P (la navette de paie au format SCR), puis O (Nantes : la carte après le recentrage, et le contrôle des SQL), puis N (Sofiane et le chantier de Nantes) et M (Nantes Géraudière : le plan qui disparaît au zoom), puis L (grands déplacements et fourniture), puis K (Commerce v2 : dossier, lecture, chiffrage, DPGF, mémoire), puis I (l'onglet Fourniture), puis J (tes retours de la feuille du 09-10 : c'est la seule feuille à suivre désormais — l'ancienne n'est plus livrée), puis H (Commerce de A à Z), G (la nuit) et F (tes retours du 12/10 soir).</w:t>
+        <w:t xml:space="preserve">Même principe que la précédente : tu contrôles ligne par ligne, tu écris dans « Vos commentaires » (OK / à corriger / à changer : quoi), tu me renvoies le fichier. Je corrige à partir de tes commentaires, dans l'ordre du document. Commence par la section U (compteurs d'heures, heures à reporter, import du compteur existant, cas forcé, qui voit / qui modifie), puis T (Commerce : quantités fournisseur, mémoire, contrôle croisé, tes retours sur la lecture et les points techniques, le chiffrage qui remplace le classeur), puis S (lecture des pièces et points techniques), puis R (compteurs d'heures, « Moi » : ma navette, PDF du livret), puis Q (champs date, plafond 48 h, règles GD vérifiées), puis P (la navette de paie au format SCR), puis O (Nantes : la carte après le recentrage, et le contrôle des SQL), puis N (Sofiane et le chantier de Nantes) et M (Nantes Géraudière : le plan qui disparaît au zoom), puis L (grands déplacements et fourniture), puis K (Commerce v2 : dossier, lecture, chiffrage, DPGF, mémoire), puis I (l'onglet Fourniture), puis J (tes retours de la feuille du 09-10 : c'est la seule feuille à suivre désormais — l'ancienne n'est plus livrée), puis H (Commerce de A à Z), G (la nuit) et F (tes retours du 12/10 soir).</w:t>
       </w:r>
     </w:p>
     <w:p>
@@ -84,7 +84,7 @@
           <w:sz w:val="20"/>
           <w:szCs w:val="20"/>
         </w:rPr>
-        <w:t xml:space="preserve">Build livré : 13/10/2026 · da9f25 (index.html + traceur.html à la racine du dépôt). SQL pour la section T : retours_13-10e.sql (la base de prix modifiable seulement avec le droit « Base de prix SCR : modifier » ; contient retours_13-10d.sql). SQL pour la section R : retours_13-10d.sql (compteurs d'heures) — inclus dans 13-10e. Pas de SQL pour les sections Q, P, O, N et M (le contrôle des SQL de la section O ne modifie rien). Tous les SQL sont passés (toi, 13/10 au soir) : ta base est à jour. Nouveau SQL du soir : retours_13-10c.sql (qualifications des écarts de fourniture réunies entre deux tablettes). SQL de l'après-midi : retours_13-10b.sql (base de prix et paniers : registres « prix » et « panier », lecture réservée à l'encadrement / bureau), blocs_memoire_scr.sql (ton mémoire O2410-10 découpé en 10 blocs réutilisables) (retours_13-10.sql de l'onglet Fourniture est inclus dans retours_13-10c.sql). SQL retours_12-10.sql et retours_12-10b.sql passés, fonction outlook-sync déployée et vérifiée par toi le 12/10 au soir (« ça fonctionne parfaitement »). Hors connexion, tout se teste avec les personnages de démo.</w:t>
+        <w:t xml:space="preserve">Build livré : 13/10/2026 · 20de40 (index.html + traceur.html à la racine du dépôt). SQL pour la section U : retours_13-10f.sql (contrats, compteurs, cas forcés : lus par le gérant, la direction, les RH, toi et la personne elle-même ; écrits par les RH et toi ; contient retours_13-10e.sql et 13-10d). SQL pour la section T : retours_13-10e.sql (la base de prix modifiable seulement avec le droit « Base de prix SCR : modifier ») — inclus dans 13-10f. SQL pour la section R : retours_13-10d.sql (compteurs d'heures) — inclus dans 13-10e. Pas de SQL pour les sections Q, P, O, N et M (le contrôle des SQL de la section O ne modifie rien). Tous les SQL sont passés (toi, 13/10 au soir) : ta base est à jour. Nouveau SQL du soir : retours_13-10c.sql (qualifications des écarts de fourniture réunies entre deux tablettes). SQL de l'après-midi : retours_13-10b.sql (base de prix et paniers : registres « prix » et « panier », lecture réservée à l'encadrement / bureau), blocs_memoire_scr.sql (ton mémoire O2410-10 découpé en 10 blocs réutilisables) (retours_13-10.sql de l'onglet Fourniture est inclus dans retours_13-10c.sql). SQL retours_12-10.sql et retours_12-10b.sql passés, fonction outlook-sync déployée et vérifiée par toi le 12/10 au soir (« ça fonctionne parfaitement »). Hors connexion, tout se teste avec les personnages de démo.</w:t>
       </w:r>
     </w:p>
     <w:p>
@@ -103,7 +103,7 @@
           <w:sz w:val="20"/>
           <w:szCs w:val="20"/>
         </w:rPr>
-        <w:t xml:space="preserve">Règle gardée : rien d'ancien n'est supprimé ; 63 suites de tests automatiques passent, dont celles de la section T (e2e_qsets, e2e_memoire2, e2e_ctrlcl, classeur_test, e2e_chiffrage3 ; e2e_lecture3 et e2e_points2 étendues), et e2e_resp (responsable du chantier = accès) et e2e_rebase (réseau à 1 985 km de l'origine : visible à 19,6 px/m, bandeau, recentrage, fils de nouveau justes au zoom) et les deux du soir : e2e_gdnav (4 jours = 5 nuitées / 10 repas / 15 €, « pas de détente » = 7 / 14 / 0 €, le mois de Julien, l'ajustement d'un jour, la navette CSV, novembre avec la Toussaint et un lundi non travaillé, les adresses à vérifier) et e2e_fourn2 (à la SOURIS réelle : tracer, glisser, insérer, retirer, annuler, reprendre et modifier un contour, boutons du plan ; trame copiée / téléchargée / collée ; écarts qualifiés et commande complémentaire ; BL de zone → Excel → Stock ; trame dans Stock ; classeur fournisseur avec la trame en 2e feuille), puis e2e_commerce2 (8 étapes : import du classeur, zone et table des DN, SST / purges / contrôles / hydraulique / panier libre, récap et base de prix, dossier déballé, lecture PDF avec surlignage, Word et points techniques, DPGF réécrite dans l'Excel) et deux de la veille : e2e_fourniture (11 points : commande collée, comparatif, pièces en plus, livré lu dans Stock, zone entourée au doigt, zone du phasage, camions datés, annonce et pointage dans Stock, droits, téléphone, lecteur de lignes PDF, zones qui se chevauchent) et e2e_retours13 (n° d'affaire, plein écran, repas, adresses, détente automatique sur 5 semaines, accords, vue par personne, CSV).</w:t>
+        <w:t xml:space="preserve">Règle gardée : rien d'ancien n'est supprimé ; 65 suites de tests automatiques passent, dont celles de la section U (compteurs_test : le moteur des compteurs en Node ; e2e_compteurs réécrite ; e2e_compteurs2 : droits, import, export, cas forcé ; e2e_navette et e2e_acces recalées), celles de la section T (e2e_qsets, e2e_memoire2, e2e_ctrlcl, classeur_test, e2e_chiffrage3 ; e2e_lecture3 et e2e_points2 étendues), et e2e_resp (responsable du chantier = accès) et e2e_rebase (réseau à 1 985 km de l'origine : visible à 19,6 px/m, bandeau, recentrage, fils de nouveau justes au zoom) et les deux du soir : e2e_gdnav (4 jours = 5 nuitées / 10 repas / 15 €, « pas de détente » = 7 / 14 / 0 €, le mois de Julien, l'ajustement d'un jour, la navette CSV, novembre avec la Toussaint et un lundi non travaillé, les adresses à vérifier) et e2e_fourn2 (à la SOURIS réelle : tracer, glisser, insérer, retirer, annuler, reprendre et modifier un contour, boutons du plan ; trame copiée / téléchargée / collée ; écarts qualifiés et commande complémentaire ; BL de zone → Excel → Stock ; trame dans Stock ; classeur fournisseur avec la trame en 2e feuille), puis e2e_commerce2 (8 étapes : import du classeur, zone et table des DN, SST / purges / contrôles / hydraulique / panier libre, récap et base de prix, dossier déballé, lecture PDF avec surlignage, Word et points techniques, DPGF réécrite dans l'Excel) et deux de la veille : e2e_fourniture (11 points : commande collée, comparatif, pièces en plus, livré lu dans Stock, zone entourée au doigt, zone du phasage, camions datés, annonce et pointage dans Stock, droits, téléphone, lecteur de lignes PDF, zones qui se chevauchent) et e2e_retours13 (n° d'affaire, plein écran, repas, adresses, détente automatique sur 5 semaines, accords, vue par personne, CSV).</w:t>
       </w:r>
     </w:p>
     <w:p>
@@ -300,7 +300,7 @@
                 <w:sz w:val="19"/>
                 <w:szCs w:val="19"/>
               </w:rPr>
-              <w:t xml:space="preserve">app/sql/retours_13-10e.sql (NOUVEAU — à passer ; contient 13-10d)</w:t>
+              <w:t xml:space="preserve">app/sql/retours_13-10f.sql (NOUVEAU — à passer ; contient 13-10e et 13-10d)</w:t>
             </w:r>
           </w:p>
         </w:tc>
@@ -332,7 +332,7 @@
                 <w:sz w:val="19"/>
                 <w:szCs w:val="19"/>
               </w:rPr>
-              <w:t xml:space="preserve">Base de prix SCR : seules les personnes qui ont le droit « Base de prix SCR : modifier » peuvent l'écrire (registres « prix » et « panier ») — le gérant d'office, l'administrateur (toi), et ceux que tu coches dans Administrateur → la personne (Jérôme). La lecture ne change pas (encadrement / bureau). Testé sur une base Postgres locale : gérant, Jérôme coché, droit donné au poste, administrateur → écrit ; conducteur, gérant décoché → refusé ; les affaires ne changent pas. Sans ce SQL : l'appli applique déjà le droit, le serveur suit l'ancienne règle (encadrement / bureau).</w:t>
+              <w:t xml:space="preserve">Contrats, compteurs d'heures et cas de déplacement forcés : ÉCRITS seulement par les RH (resp. RH, assistante RH, chargée de dév. RH) et l'administrateur (toi) — avant : tout l'encadrement (chefs, conducteurs…) ; LUS seulement par le gérant, la direction (directrice adjointe, directeur technique), les RH, toi et la personne elle-même (son solde) — avant : chefs et bureau aussi. Les droits se règlent comme les autres (Administrateur → poste ou personne : « RH : voir… » / « RH : modifier… »). Testé sur une base Postgres locale : RH, administrateur → écrit ; gérant, directrice adjointe, conducteur, chef, soudeur, assistante RH décochée → refusé ; lecture : gérant, RH, direction, toi, RAF cochée → tout ; soudeur → sa ligne ; chef, conducteur, autre responsable d'exploitation → rien ; accords GD, affaires, base de prix inchangés. Sans ce SQL : l'appli applique déjà la règle, le serveur suit l'ancienne.</w:t>
             </w:r>
           </w:p>
         </w:tc>
@@ -414,7 +414,7 @@
                 <w:sz w:val="19"/>
                 <w:szCs w:val="19"/>
               </w:rPr>
-              <w:t xml:space="preserve">app/sql/retours_13-10d.sql (inclus dans 13-10e — inutile si tu passes 13-10e)</w:t>
+              <w:t xml:space="preserve">app/sql/retours_13-10e.sql (inclus dans 13-10f — inutile si tu passes 13-10f)</w:t>
             </w:r>
           </w:p>
         </w:tc>
@@ -446,7 +446,7 @@
                 <w:sz w:val="19"/>
                 <w:szCs w:val="19"/>
               </w:rPr>
-              <w:t xml:space="preserve">Compteurs d'heures par personne : nouveau registre « cpth » (contrat, compteurs suivis, soldes, primes). Écriture : RH / bureau / encadrement ; lecture : l'encadrement, ou la personne elle-même (chacun ne voit que son compteur). Contient tout retours_13-10b.sql. Testé sur une base Postgres locale (bureau écrit, soudeur refusé, chacun ne lit que sa ligne). Sans ce SQL : les compteurs restent sur l'appareil (message « passe le SQL retours_13-10d.sql »).</w:t>
+              <w:t xml:space="preserve">Base de prix SCR : seules les personnes qui ont le droit « Base de prix SCR : modifier » peuvent l'écrire (registres « prix » et « panier ») — le gérant d'office, l'administrateur (toi), et ceux que tu coches dans Administrateur → la personne (Jérôme). La lecture ne change pas (encadrement / bureau). Testé sur une base Postgres locale : gérant, Jérôme coché, droit donné au poste, administrateur → écrit ; conducteur, gérant décoché → refusé ; les affaires ne changent pas. Sans ce SQL : l'appli applique déjà le droit, le serveur suit l'ancienne règle (encadrement / bureau).</w:t>
             </w:r>
           </w:p>
         </w:tc>
@@ -528,7 +528,121 @@
                 <w:sz w:val="19"/>
                 <w:szCs w:val="19"/>
               </w:rPr>
-              <w:t xml:space="preserve">app/sql/controle_sql.sql (LECTURE SEULE, à relancer après chaque nouveau SQL — ligne 21 ajoutée)</w:t>
+              <w:t xml:space="preserve">app/sql/retours_13-10d.sql (inclus dans 13-10e — inutile si tu passes 13-10e)</w:t>
+            </w:r>
+          </w:p>
+        </w:tc>
+        <w:tc>
+          <w:tcPr>
+            <w:tcW w:type="dxa" w:w="8100"/>
+            <w:tcBorders>
+              <w:top w:val="single" w:color="D9D5CB" w:sz="4"/>
+              <w:left w:val="single" w:color="D9D5CB" w:sz="4"/>
+              <w:bottom w:val="single" w:color="D9D5CB" w:sz="4"/>
+              <w:right w:val="single" w:color="D9D5CB" w:sz="4"/>
+            </w:tcBorders>
+            <w:tcMar>
+              <w:top w:type="dxa" w:w="60"/>
+              <w:left w:type="dxa" w:w="90"/>
+              <w:bottom w:type="dxa" w:w="60"/>
+              <w:right w:type="dxa" w:w="90"/>
+            </w:tcMar>
+            <w:vAlign w:val="top"/>
+          </w:tcPr>
+          <w:p>
+            <w:pPr>
+              <w:spacing w:after="40"/>
+            </w:pPr>
+            <w:r>
+              <w:rPr>
+                <w:rFonts w:ascii="Calibri" w:cs="Calibri" w:eastAsia="Calibri" w:hAnsi="Calibri"/>
+                <w:color w:val="14213D"/>
+                <w:sz w:val="19"/>
+                <w:szCs w:val="19"/>
+              </w:rPr>
+              <w:t xml:space="preserve">Compteurs d'heures par personne : nouveau registre « cpth » (contrat, compteurs suivis, soldes, primes). Écriture : RH / bureau / encadrement ; lecture : l'encadrement, ou la personne elle-même (chacun ne voit que son compteur). Contient tout retours_13-10b.sql. Testé sur une base Postgres locale (bureau écrit, soudeur refusé, chacun ne lit que sa ligne). Sans ce SQL : les compteurs restent sur l'appareil (message « passe le SQL retours_13-10d.sql »).</w:t>
+            </w:r>
+          </w:p>
+        </w:tc>
+        <w:tc>
+          <w:tcPr>
+            <w:tcW w:type="dxa" w:w="3800"/>
+            <w:tcBorders>
+              <w:top w:val="single" w:color="D9D5CB" w:sz="4"/>
+              <w:left w:val="single" w:color="D9D5CB" w:sz="4"/>
+              <w:bottom w:val="single" w:color="D9D5CB" w:sz="4"/>
+              <w:right w:val="single" w:color="D9D5CB" w:sz="4"/>
+            </w:tcBorders>
+            <w:tcMar>
+              <w:top w:type="dxa" w:w="60"/>
+              <w:left w:type="dxa" w:w="90"/>
+              <w:bottom w:type="dxa" w:w="60"/>
+              <w:right w:type="dxa" w:w="90"/>
+            </w:tcMar>
+            <w:vAlign w:val="top"/>
+          </w:tcPr>
+          <w:p>
+            <w:pPr>
+              <w:spacing w:after="40"/>
+            </w:pPr>
+            <w:r>
+              <w:rPr>
+                <w:rFonts w:ascii="Calibri" w:cs="Calibri" w:eastAsia="Calibri" w:hAnsi="Calibri"/>
+                <w:color w:val="14213D"/>
+                <w:sz w:val="20"/>
+                <w:szCs w:val="20"/>
+              </w:rPr>
+              <w:t xml:space="preserve"/>
+            </w:r>
+          </w:p>
+          <w:p>
+            <w:pPr>
+              <w:spacing w:after="40"/>
+            </w:pPr>
+            <w:r>
+              <w:rPr>
+                <w:rFonts w:ascii="Calibri" w:cs="Calibri" w:eastAsia="Calibri" w:hAnsi="Calibri"/>
+                <w:color w:val="14213D"/>
+                <w:sz w:val="20"/>
+                <w:szCs w:val="20"/>
+              </w:rPr>
+              <w:t xml:space="preserve"/>
+            </w:r>
+          </w:p>
+        </w:tc>
+      </w:tr>
+      <w:tr>
+        <w:tc>
+          <w:tcPr>
+            <w:tcW w:type="dxa" w:w="3200"/>
+            <w:tcBorders>
+              <w:top w:val="single" w:color="D9D5CB" w:sz="4"/>
+              <w:left w:val="single" w:color="D9D5CB" w:sz="4"/>
+              <w:bottom w:val="single" w:color="D9D5CB" w:sz="4"/>
+              <w:right w:val="single" w:color="D9D5CB" w:sz="4"/>
+            </w:tcBorders>
+            <w:tcMar>
+              <w:top w:type="dxa" w:w="60"/>
+              <w:left w:type="dxa" w:w="90"/>
+              <w:bottom w:type="dxa" w:w="60"/>
+              <w:right w:type="dxa" w:w="90"/>
+            </w:tcMar>
+            <w:vAlign w:val="top"/>
+          </w:tcPr>
+          <w:p>
+            <w:pPr>
+              <w:spacing w:after="40"/>
+            </w:pPr>
+            <w:r>
+              <w:rPr>
+                <w:rFonts w:ascii="Calibri" w:cs="Calibri" w:eastAsia="Calibri" w:hAnsi="Calibri"/>
+                <w:b/>
+                <w:bCs/>
+                <w:color w:val="14213D"/>
+                <w:sz w:val="19"/>
+                <w:szCs w:val="19"/>
+              </w:rPr>
+              <w:t xml:space="preserve">app/sql/controle_sql.sql (LECTURE SEULE, à relancer après chaque nouveau SQL — ligne 22 ajoutée)</w:t>
             </w:r>
           </w:p>
         </w:tc>
@@ -12714,6 +12828,1866 @@
                 <w:szCs w:val="19"/>
               </w:rPr>
               <w:t xml:space="preserve">Fait (à déployer)</w:t>
+            </w:r>
+          </w:p>
+        </w:tc>
+        <w:tc>
+          <w:tcPr>
+            <w:tcW w:type="dxa" w:w="3700"/>
+            <w:tcBorders>
+              <w:top w:val="single" w:color="D9D5CB" w:sz="4"/>
+              <w:left w:val="single" w:color="D9D5CB" w:sz="4"/>
+              <w:bottom w:val="single" w:color="D9D5CB" w:sz="4"/>
+              <w:right w:val="single" w:color="D9D5CB" w:sz="4"/>
+            </w:tcBorders>
+            <w:tcMar>
+              <w:top w:type="dxa" w:w="60"/>
+              <w:left w:type="dxa" w:w="90"/>
+              <w:bottom w:type="dxa" w:w="60"/>
+              <w:right w:type="dxa" w:w="90"/>
+            </w:tcMar>
+            <w:vAlign w:val="top"/>
+          </w:tcPr>
+          <w:p>
+            <w:pPr>
+              <w:spacing w:after="40"/>
+            </w:pPr>
+            <w:r>
+              <w:rPr>
+                <w:rFonts w:ascii="Calibri" w:cs="Calibri" w:eastAsia="Calibri" w:hAnsi="Calibri"/>
+                <w:color w:val="14213D"/>
+                <w:sz w:val="20"/>
+                <w:szCs w:val="20"/>
+              </w:rPr>
+              <w:t xml:space="preserve"/>
+            </w:r>
+          </w:p>
+          <w:p>
+            <w:pPr>
+              <w:spacing w:after="40"/>
+            </w:pPr>
+            <w:r>
+              <w:rPr>
+                <w:rFonts w:ascii="Calibri" w:cs="Calibri" w:eastAsia="Calibri" w:hAnsi="Calibri"/>
+                <w:color w:val="14213D"/>
+                <w:sz w:val="20"/>
+                <w:szCs w:val="20"/>
+              </w:rPr>
+              <w:t xml:space="preserve"/>
+            </w:r>
+          </w:p>
+        </w:tc>
+      </w:tr>
+    </w:tbl>
+    <w:p>
+      <w:pPr>
+        <w:pStyle w:val="Heading1"/>
+        <w:spacing w:after="120" w:before="320"/>
+      </w:pPr>
+      <w:r>
+        <w:rPr>
+          <w:rFonts w:ascii="Calibri" w:cs="Calibri" w:eastAsia="Calibri" w:hAnsi="Calibri"/>
+          <w:b/>
+          <w:bCs/>
+          <w:color w:val="EB6834"/>
+          <w:sz w:val="30"/>
+          <w:szCs w:val="30"/>
+        </w:rPr>
+        <w:t xml:space="preserve">U · Heures : compteur d'heures, heures à reporter, import du compteur existant, cas forcé (13/10 fin d'après-midi)</w:t>
+      </w:r>
+    </w:p>
+    <w:p>
+      <w:pPr>
+        <w:spacing w:after="80" w:line="264"/>
+      </w:pPr>
+      <w:r>
+        <w:rPr>
+          <w:rFonts w:ascii="Calibri" w:cs="Calibri" w:eastAsia="Calibri" w:hAnsi="Calibri"/>
+          <w:color w:val="6B6B66"/>
+          <w:sz w:val="20"/>
+          <w:szCs w:val="20"/>
+        </w:rPr>
+        <w:t xml:space="preserve">Tes règles, appliquées telles quelles. Tout est testé hors connexion (personnages de démo) et le moteur de calcul a son propre test. Trois hypothèses à valider : dernière ligne.</w:t>
+      </w:r>
+    </w:p>
+    <w:tbl>
+      <w:tblPr>
+        <w:tblW w:type="dxa" w:w="15100"/>
+        <w:tblBorders>
+          <w:top w:val="single" w:color="auto" w:sz="4"/>
+          <w:left w:val="single" w:color="auto" w:sz="4"/>
+          <w:bottom w:val="single" w:color="auto" w:sz="4"/>
+          <w:right w:val="single" w:color="auto" w:sz="4"/>
+          <w:insideH w:val="single" w:color="auto" w:sz="4"/>
+          <w:insideV w:val="single" w:color="auto" w:sz="4"/>
+        </w:tblBorders>
+      </w:tblPr>
+      <w:tblGrid>
+        <w:gridCol w:w="2300"/>
+        <w:gridCol w:w="4100"/>
+        <w:gridCol w:w="3700"/>
+        <w:gridCol w:w="1300"/>
+        <w:gridCol w:w="3700"/>
+      </w:tblGrid>
+      <w:tr>
+        <w:trPr>
+          <w:tblHeader/>
+        </w:trPr>
+        <w:tc>
+          <w:tcPr>
+            <w:tcW w:type="dxa" w:w="2300"/>
+            <w:tcBorders>
+              <w:top w:val="single" w:color="D9D5CB" w:sz="4"/>
+              <w:left w:val="single" w:color="D9D5CB" w:sz="4"/>
+              <w:bottom w:val="single" w:color="D9D5CB" w:sz="4"/>
+              <w:right w:val="single" w:color="D9D5CB" w:sz="4"/>
+            </w:tcBorders>
+            <w:shd w:fill="14213D" w:color="auto" w:val="clear"/>
+            <w:tcMar>
+              <w:top w:type="dxa" w:w="60"/>
+              <w:left w:type="dxa" w:w="90"/>
+              <w:bottom w:type="dxa" w:w="60"/>
+              <w:right w:type="dxa" w:w="90"/>
+            </w:tcMar>
+            <w:vAlign w:val="top"/>
+          </w:tcPr>
+          <w:p>
+            <w:pPr>
+              <w:spacing w:after="80" w:line="264"/>
+            </w:pPr>
+            <w:r>
+              <w:rPr>
+                <w:rFonts w:ascii="Calibri" w:cs="Calibri" w:eastAsia="Calibri" w:hAnsi="Calibri"/>
+                <w:b/>
+                <w:bCs/>
+                <w:color w:val="FFFFFF"/>
+                <w:sz w:val="19"/>
+                <w:szCs w:val="19"/>
+              </w:rPr>
+              <w:t xml:space="preserve">Fonctionnalité</w:t>
+            </w:r>
+          </w:p>
+        </w:tc>
+        <w:tc>
+          <w:tcPr>
+            <w:tcW w:type="dxa" w:w="4100"/>
+            <w:tcBorders>
+              <w:top w:val="single" w:color="D9D5CB" w:sz="4"/>
+              <w:left w:val="single" w:color="D9D5CB" w:sz="4"/>
+              <w:bottom w:val="single" w:color="D9D5CB" w:sz="4"/>
+              <w:right w:val="single" w:color="D9D5CB" w:sz="4"/>
+            </w:tcBorders>
+            <w:shd w:fill="14213D" w:color="auto" w:val="clear"/>
+            <w:tcMar>
+              <w:top w:type="dxa" w:w="60"/>
+              <w:left w:type="dxa" w:w="90"/>
+              <w:bottom w:type="dxa" w:w="60"/>
+              <w:right w:type="dxa" w:w="90"/>
+            </w:tcMar>
+            <w:vAlign w:val="top"/>
+          </w:tcPr>
+          <w:p>
+            <w:pPr>
+              <w:spacing w:after="80" w:line="264"/>
+            </w:pPr>
+            <w:r>
+              <w:rPr>
+                <w:rFonts w:ascii="Calibri" w:cs="Calibri" w:eastAsia="Calibri" w:hAnsi="Calibri"/>
+                <w:b/>
+                <w:bCs/>
+                <w:color w:val="FFFFFF"/>
+                <w:sz w:val="19"/>
+                <w:szCs w:val="19"/>
+              </w:rPr>
+              <w:t xml:space="preserve">Où la trouver · comment tester</w:t>
+            </w:r>
+          </w:p>
+        </w:tc>
+        <w:tc>
+          <w:tcPr>
+            <w:tcW w:type="dxa" w:w="3700"/>
+            <w:tcBorders>
+              <w:top w:val="single" w:color="D9D5CB" w:sz="4"/>
+              <w:left w:val="single" w:color="D9D5CB" w:sz="4"/>
+              <w:bottom w:val="single" w:color="D9D5CB" w:sz="4"/>
+              <w:right w:val="single" w:color="D9D5CB" w:sz="4"/>
+            </w:tcBorders>
+            <w:shd w:fill="14213D" w:color="auto" w:val="clear"/>
+            <w:tcMar>
+              <w:top w:type="dxa" w:w="60"/>
+              <w:left w:type="dxa" w:w="90"/>
+              <w:bottom w:type="dxa" w:w="60"/>
+              <w:right w:type="dxa" w:w="90"/>
+            </w:tcMar>
+            <w:vAlign w:val="top"/>
+          </w:tcPr>
+          <w:p>
+            <w:pPr>
+              <w:spacing w:after="80" w:line="264"/>
+            </w:pPr>
+            <w:r>
+              <w:rPr>
+                <w:rFonts w:ascii="Calibri" w:cs="Calibri" w:eastAsia="Calibri" w:hAnsi="Calibri"/>
+                <w:b/>
+                <w:bCs/>
+                <w:color w:val="FFFFFF"/>
+                <w:sz w:val="19"/>
+                <w:szCs w:val="19"/>
+              </w:rPr>
+              <w:t xml:space="preserve">Hypothèses · limites · ce que j'ai tranché</w:t>
+            </w:r>
+          </w:p>
+        </w:tc>
+        <w:tc>
+          <w:tcPr>
+            <w:tcW w:type="dxa" w:w="1300"/>
+            <w:tcBorders>
+              <w:top w:val="single" w:color="D9D5CB" w:sz="4"/>
+              <w:left w:val="single" w:color="D9D5CB" w:sz="4"/>
+              <w:bottom w:val="single" w:color="D9D5CB" w:sz="4"/>
+              <w:right w:val="single" w:color="D9D5CB" w:sz="4"/>
+            </w:tcBorders>
+            <w:shd w:fill="14213D" w:color="auto" w:val="clear"/>
+            <w:tcMar>
+              <w:top w:type="dxa" w:w="60"/>
+              <w:left w:type="dxa" w:w="90"/>
+              <w:bottom w:type="dxa" w:w="60"/>
+              <w:right w:type="dxa" w:w="90"/>
+            </w:tcMar>
+            <w:vAlign w:val="top"/>
+          </w:tcPr>
+          <w:p>
+            <w:pPr>
+              <w:spacing w:after="80" w:line="264"/>
+            </w:pPr>
+            <w:r>
+              <w:rPr>
+                <w:rFonts w:ascii="Calibri" w:cs="Calibri" w:eastAsia="Calibri" w:hAnsi="Calibri"/>
+                <w:b/>
+                <w:bCs/>
+                <w:color w:val="FFFFFF"/>
+                <w:sz w:val="19"/>
+                <w:szCs w:val="19"/>
+              </w:rPr>
+              <w:t xml:space="preserve">Statut</w:t>
+            </w:r>
+          </w:p>
+        </w:tc>
+        <w:tc>
+          <w:tcPr>
+            <w:tcW w:type="dxa" w:w="3700"/>
+            <w:tcBorders>
+              <w:top w:val="single" w:color="D9D5CB" w:sz="4"/>
+              <w:left w:val="single" w:color="D9D5CB" w:sz="4"/>
+              <w:bottom w:val="single" w:color="D9D5CB" w:sz="4"/>
+              <w:right w:val="single" w:color="D9D5CB" w:sz="4"/>
+            </w:tcBorders>
+            <w:shd w:fill="14213D" w:color="auto" w:val="clear"/>
+            <w:tcMar>
+              <w:top w:type="dxa" w:w="60"/>
+              <w:left w:type="dxa" w:w="90"/>
+              <w:bottom w:type="dxa" w:w="60"/>
+              <w:right w:type="dxa" w:w="90"/>
+            </w:tcMar>
+            <w:vAlign w:val="top"/>
+          </w:tcPr>
+          <w:p>
+            <w:pPr>
+              <w:spacing w:after="80" w:line="264"/>
+            </w:pPr>
+            <w:r>
+              <w:rPr>
+                <w:rFonts w:ascii="Calibri" w:cs="Calibri" w:eastAsia="Calibri" w:hAnsi="Calibri"/>
+                <w:b/>
+                <w:bCs/>
+                <w:color w:val="FFFFFF"/>
+                <w:sz w:val="19"/>
+                <w:szCs w:val="19"/>
+              </w:rPr>
+              <w:t xml:space="preserve">Vos commentaires</w:t>
+            </w:r>
+          </w:p>
+        </w:tc>
+      </w:tr>
+      <w:tr>
+        <w:tc>
+          <w:tcPr>
+            <w:tcW w:type="dxa" w:w="2300"/>
+            <w:tcBorders>
+              <w:top w:val="single" w:color="D9D5CB" w:sz="4"/>
+              <w:left w:val="single" w:color="D9D5CB" w:sz="4"/>
+              <w:bottom w:val="single" w:color="D9D5CB" w:sz="4"/>
+              <w:right w:val="single" w:color="D9D5CB" w:sz="4"/>
+            </w:tcBorders>
+            <w:tcMar>
+              <w:top w:type="dxa" w:w="60"/>
+              <w:left w:type="dxa" w:w="90"/>
+              <w:bottom w:type="dxa" w:w="60"/>
+              <w:right w:type="dxa" w:w="90"/>
+            </w:tcMar>
+            <w:vAlign w:val="top"/>
+          </w:tcPr>
+          <w:p>
+            <w:pPr>
+              <w:spacing w:after="40"/>
+            </w:pPr>
+            <w:r>
+              <w:rPr>
+                <w:rFonts w:ascii="Calibri" w:cs="Calibri" w:eastAsia="Calibri" w:hAnsi="Calibri"/>
+                <w:b/>
+                <w:bCs/>
+                <w:color w:val="14213D"/>
+                <w:sz w:val="20"/>
+                <w:szCs w:val="20"/>
+              </w:rPr>
+              <w:t xml:space="preserve">Le compteur d'heures se remplit tout seul</w:t>
+            </w:r>
+          </w:p>
+        </w:tc>
+        <w:tc>
+          <w:tcPr>
+            <w:tcW w:type="dxa" w:w="4100"/>
+            <w:tcBorders>
+              <w:top w:val="single" w:color="D9D5CB" w:sz="4"/>
+              <w:left w:val="single" w:color="D9D5CB" w:sz="4"/>
+              <w:bottom w:val="single" w:color="D9D5CB" w:sz="4"/>
+              <w:right w:val="single" w:color="D9D5CB" w:sz="4"/>
+            </w:tcBorders>
+            <w:tcMar>
+              <w:top w:type="dxa" w:w="60"/>
+              <w:left w:type="dxa" w:w="90"/>
+              <w:bottom w:type="dxa" w:w="60"/>
+              <w:right w:type="dxa" w:w="90"/>
+            </w:tcMar>
+            <w:vAlign w:val="top"/>
+          </w:tcPr>
+          <w:p>
+            <w:pPr>
+              <w:spacing w:after="40"/>
+            </w:pPr>
+            <w:r>
+              <w:rPr>
+                <w:rFonts w:ascii="Calibri" w:cs="Calibri" w:eastAsia="Calibri" w:hAnsi="Calibri"/>
+                <w:color w:val="14213D"/>
+                <w:sz w:val="19"/>
+                <w:szCs w:val="19"/>
+              </w:rPr>
+              <w:t xml:space="preserve">Fiche d'un gars → carte « Contrat, compteur et déplacements » → coche « Compteur d'heures » (ou pas : sans compteur, ses heures sup sont payées chaque mois). Chaque semaine finie (lundi → samedi), les heures sup y entrent majorées selon leur rang : de la 36e à la 43e heure → 1 h 15 au compteur, de la 44e à la 48e → 1 h 30. « Semaine par semaine » montre le détail (heures, 125 %, 150 %, → compteur, payées).</w:t>
+            </w:r>
+          </w:p>
+        </w:tc>
+        <w:tc>
+          <w:tcPr>
+            <w:tcW w:type="dxa" w:w="3700"/>
+            <w:tcBorders>
+              <w:top w:val="single" w:color="D9D5CB" w:sz="4"/>
+              <w:left w:val="single" w:color="D9D5CB" w:sz="4"/>
+              <w:bottom w:val="single" w:color="D9D5CB" w:sz="4"/>
+              <w:right w:val="single" w:color="D9D5CB" w:sz="4"/>
+            </w:tcBorders>
+            <w:tcMar>
+              <w:top w:type="dxa" w:w="60"/>
+              <w:left w:type="dxa" w:w="90"/>
+              <w:bottom w:type="dxa" w:w="60"/>
+              <w:right w:type="dxa" w:w="90"/>
+            </w:tcMar>
+            <w:vAlign w:val="top"/>
+          </w:tcPr>
+          <w:p>
+            <w:pPr>
+              <w:spacing w:after="40"/>
+            </w:pPr>
+            <w:r>
+              <w:rPr>
+                <w:rFonts w:ascii="Calibri" w:cs="Calibri" w:eastAsia="Calibri" w:hAnsi="Calibri"/>
+                <w:color w:val="14213D"/>
+                <w:sz w:val="19"/>
+                <w:szCs w:val="19"/>
+              </w:rPr>
+              <w:t xml:space="preserve">Contrat de 39 h : les heures 36 à 39 sont dans le salaire, le compteur prend à partir de la 40e (125 % jusqu'à la 43e, 150 % de la 44e à la 48e). C'était faux avant (125 % de la 40e à la 47e) : corrigé partout, navette comprise.</w:t>
+            </w:r>
+          </w:p>
+        </w:tc>
+        <w:tc>
+          <w:tcPr>
+            <w:tcW w:type="dxa" w:w="1300"/>
+            <w:tcBorders>
+              <w:top w:val="single" w:color="D9D5CB" w:sz="4"/>
+              <w:left w:val="single" w:color="D9D5CB" w:sz="4"/>
+              <w:bottom w:val="single" w:color="D9D5CB" w:sz="4"/>
+              <w:right w:val="single" w:color="D9D5CB" w:sz="4"/>
+            </w:tcBorders>
+            <w:shd w:fill="E6F5EC" w:color="auto" w:val="clear"/>
+            <w:tcMar>
+              <w:top w:type="dxa" w:w="60"/>
+              <w:left w:type="dxa" w:w="90"/>
+              <w:bottom w:type="dxa" w:w="60"/>
+              <w:right w:type="dxa" w:w="90"/>
+            </w:tcMar>
+            <w:vAlign w:val="top"/>
+          </w:tcPr>
+          <w:p>
+            <w:pPr>
+              <w:spacing w:after="40"/>
+            </w:pPr>
+            <w:r>
+              <w:rPr>
+                <w:rFonts w:ascii="Calibri" w:cs="Calibri" w:eastAsia="Calibri" w:hAnsi="Calibri"/>
+                <w:b/>
+                <w:bCs/>
+                <w:color w:val="14213D"/>
+                <w:sz w:val="19"/>
+                <w:szCs w:val="19"/>
+              </w:rPr>
+              <w:t xml:space="preserve">Fait</w:t>
+            </w:r>
+          </w:p>
+        </w:tc>
+        <w:tc>
+          <w:tcPr>
+            <w:tcW w:type="dxa" w:w="3700"/>
+            <w:tcBorders>
+              <w:top w:val="single" w:color="D9D5CB" w:sz="4"/>
+              <w:left w:val="single" w:color="D9D5CB" w:sz="4"/>
+              <w:bottom w:val="single" w:color="D9D5CB" w:sz="4"/>
+              <w:right w:val="single" w:color="D9D5CB" w:sz="4"/>
+            </w:tcBorders>
+            <w:tcMar>
+              <w:top w:type="dxa" w:w="60"/>
+              <w:left w:type="dxa" w:w="90"/>
+              <w:bottom w:type="dxa" w:w="60"/>
+              <w:right w:type="dxa" w:w="90"/>
+            </w:tcMar>
+            <w:vAlign w:val="top"/>
+          </w:tcPr>
+          <w:p>
+            <w:pPr>
+              <w:spacing w:after="40"/>
+            </w:pPr>
+            <w:r>
+              <w:rPr>
+                <w:rFonts w:ascii="Calibri" w:cs="Calibri" w:eastAsia="Calibri" w:hAnsi="Calibri"/>
+                <w:color w:val="14213D"/>
+                <w:sz w:val="20"/>
+                <w:szCs w:val="20"/>
+              </w:rPr>
+              <w:t xml:space="preserve"/>
+            </w:r>
+          </w:p>
+          <w:p>
+            <w:pPr>
+              <w:spacing w:after="40"/>
+            </w:pPr>
+            <w:r>
+              <w:rPr>
+                <w:rFonts w:ascii="Calibri" w:cs="Calibri" w:eastAsia="Calibri" w:hAnsi="Calibri"/>
+                <w:color w:val="14213D"/>
+                <w:sz w:val="20"/>
+                <w:szCs w:val="20"/>
+              </w:rPr>
+              <w:t xml:space="preserve"/>
+            </w:r>
+          </w:p>
+        </w:tc>
+      </w:tr>
+      <w:tr>
+        <w:tc>
+          <w:tcPr>
+            <w:tcW w:type="dxa" w:w="2300"/>
+            <w:tcBorders>
+              <w:top w:val="single" w:color="D9D5CB" w:sz="4"/>
+              <w:left w:val="single" w:color="D9D5CB" w:sz="4"/>
+              <w:bottom w:val="single" w:color="D9D5CB" w:sz="4"/>
+              <w:right w:val="single" w:color="D9D5CB" w:sz="4"/>
+            </w:tcBorders>
+            <w:tcMar>
+              <w:top w:type="dxa" w:w="60"/>
+              <w:left w:type="dxa" w:w="90"/>
+              <w:bottom w:type="dxa" w:w="60"/>
+              <w:right w:type="dxa" w:w="90"/>
+            </w:tcMar>
+            <w:vAlign w:val="top"/>
+          </w:tcPr>
+          <w:p>
+            <w:pPr>
+              <w:spacing w:after="40"/>
+            </w:pPr>
+            <w:r>
+              <w:rPr>
+                <w:rFonts w:ascii="Calibri" w:cs="Calibri" w:eastAsia="Calibri" w:hAnsi="Calibri"/>
+                <w:b/>
+                <w:bCs/>
+                <w:color w:val="14213D"/>
+                <w:sz w:val="20"/>
+                <w:szCs w:val="20"/>
+              </w:rPr>
+              <w:t xml:space="preserve">Plafond : compteur plein → payé</w:t>
+            </w:r>
+          </w:p>
+        </w:tc>
+        <w:tc>
+          <w:tcPr>
+            <w:tcW w:type="dxa" w:w="4100"/>
+            <w:tcBorders>
+              <w:top w:val="single" w:color="D9D5CB" w:sz="4"/>
+              <w:left w:val="single" w:color="D9D5CB" w:sz="4"/>
+              <w:bottom w:val="single" w:color="D9D5CB" w:sz="4"/>
+              <w:right w:val="single" w:color="D9D5CB" w:sz="4"/>
+            </w:tcBorders>
+            <w:tcMar>
+              <w:top w:type="dxa" w:w="60"/>
+              <w:left w:type="dxa" w:w="90"/>
+              <w:bottom w:type="dxa" w:w="60"/>
+              <w:right w:type="dxa" w:w="90"/>
+            </w:tcMar>
+            <w:vAlign w:val="top"/>
+          </w:tcPr>
+          <w:p>
+            <w:pPr>
+              <w:spacing w:after="40"/>
+            </w:pPr>
+            <w:r>
+              <w:rPr>
+                <w:rFonts w:ascii="Calibri" w:cs="Calibri" w:eastAsia="Calibri" w:hAnsi="Calibri"/>
+                <w:color w:val="14213D"/>
+                <w:sz w:val="19"/>
+                <w:szCs w:val="19"/>
+              </w:rPr>
+              <w:t xml:space="preserve">✏️ plafond (vide = sans plafond). Quand le compteur est plein, les heures sup suivantes sont payées : la navette du mois les met dans « HS à payer dans le mois » (cases vertes, corrigeables). Jauge verte / orange (80 %) / rouge (plein).</w:t>
+            </w:r>
+          </w:p>
+        </w:tc>
+        <w:tc>
+          <w:tcPr>
+            <w:tcW w:type="dxa" w:w="3700"/>
+            <w:tcBorders>
+              <w:top w:val="single" w:color="D9D5CB" w:sz="4"/>
+              <w:left w:val="single" w:color="D9D5CB" w:sz="4"/>
+              <w:bottom w:val="single" w:color="D9D5CB" w:sz="4"/>
+              <w:right w:val="single" w:color="D9D5CB" w:sz="4"/>
+            </w:tcBorders>
+            <w:tcMar>
+              <w:top w:type="dxa" w:w="60"/>
+              <w:left w:type="dxa" w:w="90"/>
+              <w:bottom w:type="dxa" w:w="60"/>
+              <w:right w:type="dxa" w:w="90"/>
+            </w:tcMar>
+            <w:vAlign w:val="top"/>
+          </w:tcPr>
+          <w:p>
+            <w:pPr>
+              <w:spacing w:after="40"/>
+            </w:pPr>
+            <w:r>
+              <w:rPr>
+                <w:rFonts w:ascii="Calibri" w:cs="Calibri" w:eastAsia="Calibri" w:hAnsi="Calibri"/>
+                <w:color w:val="14213D"/>
+                <w:sz w:val="19"/>
+                <w:szCs w:val="19"/>
+              </w:rPr>
+              <w:t xml:space="preserve">Hypothèse : compteur plein → le surplus est payé en heures sup (pas en « à reporter »).</w:t>
+            </w:r>
+          </w:p>
+        </w:tc>
+        <w:tc>
+          <w:tcPr>
+            <w:tcW w:type="dxa" w:w="1300"/>
+            <w:tcBorders>
+              <w:top w:val="single" w:color="D9D5CB" w:sz="4"/>
+              <w:left w:val="single" w:color="D9D5CB" w:sz="4"/>
+              <w:bottom w:val="single" w:color="D9D5CB" w:sz="4"/>
+              <w:right w:val="single" w:color="D9D5CB" w:sz="4"/>
+            </w:tcBorders>
+            <w:shd w:fill="E6F5EC" w:color="auto" w:val="clear"/>
+            <w:tcMar>
+              <w:top w:type="dxa" w:w="60"/>
+              <w:left w:type="dxa" w:w="90"/>
+              <w:bottom w:type="dxa" w:w="60"/>
+              <w:right w:type="dxa" w:w="90"/>
+            </w:tcMar>
+            <w:vAlign w:val="top"/>
+          </w:tcPr>
+          <w:p>
+            <w:pPr>
+              <w:spacing w:after="40"/>
+            </w:pPr>
+            <w:r>
+              <w:rPr>
+                <w:rFonts w:ascii="Calibri" w:cs="Calibri" w:eastAsia="Calibri" w:hAnsi="Calibri"/>
+                <w:b/>
+                <w:bCs/>
+                <w:color w:val="14213D"/>
+                <w:sz w:val="19"/>
+                <w:szCs w:val="19"/>
+              </w:rPr>
+              <w:t xml:space="preserve">Fait</w:t>
+            </w:r>
+          </w:p>
+        </w:tc>
+        <w:tc>
+          <w:tcPr>
+            <w:tcW w:type="dxa" w:w="3700"/>
+            <w:tcBorders>
+              <w:top w:val="single" w:color="D9D5CB" w:sz="4"/>
+              <w:left w:val="single" w:color="D9D5CB" w:sz="4"/>
+              <w:bottom w:val="single" w:color="D9D5CB" w:sz="4"/>
+              <w:right w:val="single" w:color="D9D5CB" w:sz="4"/>
+            </w:tcBorders>
+            <w:tcMar>
+              <w:top w:type="dxa" w:w="60"/>
+              <w:left w:type="dxa" w:w="90"/>
+              <w:bottom w:type="dxa" w:w="60"/>
+              <w:right w:type="dxa" w:w="90"/>
+            </w:tcMar>
+            <w:vAlign w:val="top"/>
+          </w:tcPr>
+          <w:p>
+            <w:pPr>
+              <w:spacing w:after="40"/>
+            </w:pPr>
+            <w:r>
+              <w:rPr>
+                <w:rFonts w:ascii="Calibri" w:cs="Calibri" w:eastAsia="Calibri" w:hAnsi="Calibri"/>
+                <w:color w:val="14213D"/>
+                <w:sz w:val="20"/>
+                <w:szCs w:val="20"/>
+              </w:rPr>
+              <w:t xml:space="preserve"/>
+            </w:r>
+          </w:p>
+          <w:p>
+            <w:pPr>
+              <w:spacing w:after="40"/>
+            </w:pPr>
+            <w:r>
+              <w:rPr>
+                <w:rFonts w:ascii="Calibri" w:cs="Calibri" w:eastAsia="Calibri" w:hAnsi="Calibri"/>
+                <w:color w:val="14213D"/>
+                <w:sz w:val="20"/>
+                <w:szCs w:val="20"/>
+              </w:rPr>
+              <w:t xml:space="preserve"/>
+            </w:r>
+          </w:p>
+        </w:tc>
+      </w:tr>
+      <w:tr>
+        <w:tc>
+          <w:tcPr>
+            <w:tcW w:type="dxa" w:w="2300"/>
+            <w:tcBorders>
+              <w:top w:val="single" w:color="D9D5CB" w:sz="4"/>
+              <w:left w:val="single" w:color="D9D5CB" w:sz="4"/>
+              <w:bottom w:val="single" w:color="D9D5CB" w:sz="4"/>
+              <w:right w:val="single" w:color="D9D5CB" w:sz="4"/>
+            </w:tcBorders>
+            <w:tcMar>
+              <w:top w:type="dxa" w:w="60"/>
+              <w:left w:type="dxa" w:w="90"/>
+              <w:bottom w:type="dxa" w:w="60"/>
+              <w:right w:type="dxa" w:w="90"/>
+            </w:tcMar>
+            <w:vAlign w:val="top"/>
+          </w:tcPr>
+          <w:p>
+            <w:pPr>
+              <w:spacing w:after="40"/>
+            </w:pPr>
+            <w:r>
+              <w:rPr>
+                <w:rFonts w:ascii="Calibri" w:cs="Calibri" w:eastAsia="Calibri" w:hAnsi="Calibri"/>
+                <w:b/>
+                <w:bCs/>
+                <w:color w:val="14213D"/>
+                <w:sz w:val="20"/>
+                <w:szCs w:val="20"/>
+              </w:rPr>
+              <w:t xml:space="preserve">Repos pris / posé par l'entreprise</w:t>
+            </w:r>
+          </w:p>
+        </w:tc>
+        <w:tc>
+          <w:tcPr>
+            <w:tcW w:type="dxa" w:w="4100"/>
+            <w:tcBorders>
+              <w:top w:val="single" w:color="D9D5CB" w:sz="4"/>
+              <w:left w:val="single" w:color="D9D5CB" w:sz="4"/>
+              <w:bottom w:val="single" w:color="D9D5CB" w:sz="4"/>
+              <w:right w:val="single" w:color="D9D5CB" w:sz="4"/>
+            </w:tcBorders>
+            <w:tcMar>
+              <w:top w:type="dxa" w:w="60"/>
+              <w:left w:type="dxa" w:w="90"/>
+              <w:bottom w:type="dxa" w:w="60"/>
+              <w:right w:type="dxa" w:w="90"/>
+            </w:tcMar>
+            <w:vAlign w:val="top"/>
+          </w:tcPr>
+          <w:p>
+            <w:pPr>
+              <w:spacing w:after="40"/>
+            </w:pPr>
+            <w:r>
+              <w:rPr>
+                <w:rFonts w:ascii="Calibri" w:cs="Calibri" w:eastAsia="Calibri" w:hAnsi="Calibri"/>
+                <w:color w:val="14213D"/>
+                <w:sz w:val="19"/>
+                <w:szCs w:val="19"/>
+              </w:rPr>
+              <w:t xml:space="preserve">« 🏖 repos pris » (le gars pose ses heures comme des congés : boutons 1 jour / 1 semaine = 35 h) ou « 🏢 posé par l'entreprise » (pas de travail : motif). Date, heures, note. Chaque mouvement est listé avec qui l'a saisi ; ✕ le retire (le solde se recalcule). Le compteur peut passer en négatif (affiché).</w:t>
+            </w:r>
+          </w:p>
+        </w:tc>
+        <w:tc>
+          <w:tcPr>
+            <w:tcW w:type="dxa" w:w="3700"/>
+            <w:tcBorders>
+              <w:top w:val="single" w:color="D9D5CB" w:sz="4"/>
+              <w:left w:val="single" w:color="D9D5CB" w:sz="4"/>
+              <w:bottom w:val="single" w:color="D9D5CB" w:sz="4"/>
+              <w:right w:val="single" w:color="D9D5CB" w:sz="4"/>
+            </w:tcBorders>
+            <w:tcMar>
+              <w:top w:type="dxa" w:w="60"/>
+              <w:left w:type="dxa" w:w="90"/>
+              <w:bottom w:type="dxa" w:w="60"/>
+              <w:right w:type="dxa" w:w="90"/>
+            </w:tcMar>
+            <w:vAlign w:val="top"/>
+          </w:tcPr>
+          <w:p>
+            <w:pPr>
+              <w:spacing w:after="40"/>
+            </w:pPr>
+            <w:r>
+              <w:rPr>
+                <w:rFonts w:ascii="Calibri" w:cs="Calibri" w:eastAsia="Calibri" w:hAnsi="Calibri"/>
+                <w:color w:val="14213D"/>
+                <w:sz w:val="19"/>
+                <w:szCs w:val="19"/>
+              </w:rPr>
+              <w:t xml:space="preserve">La navette du mois les reprend : « Heures de récup. prises dans le mois » et, sur la ligne du jour, « RÉCUP 7 H » ou « RÉCUP (ENTREPRISE) 14 H ».</w:t>
+            </w:r>
+          </w:p>
+        </w:tc>
+        <w:tc>
+          <w:tcPr>
+            <w:tcW w:type="dxa" w:w="1300"/>
+            <w:tcBorders>
+              <w:top w:val="single" w:color="D9D5CB" w:sz="4"/>
+              <w:left w:val="single" w:color="D9D5CB" w:sz="4"/>
+              <w:bottom w:val="single" w:color="D9D5CB" w:sz="4"/>
+              <w:right w:val="single" w:color="D9D5CB" w:sz="4"/>
+            </w:tcBorders>
+            <w:shd w:fill="E6F5EC" w:color="auto" w:val="clear"/>
+            <w:tcMar>
+              <w:top w:type="dxa" w:w="60"/>
+              <w:left w:type="dxa" w:w="90"/>
+              <w:bottom w:type="dxa" w:w="60"/>
+              <w:right w:type="dxa" w:w="90"/>
+            </w:tcMar>
+            <w:vAlign w:val="top"/>
+          </w:tcPr>
+          <w:p>
+            <w:pPr>
+              <w:spacing w:after="40"/>
+            </w:pPr>
+            <w:r>
+              <w:rPr>
+                <w:rFonts w:ascii="Calibri" w:cs="Calibri" w:eastAsia="Calibri" w:hAnsi="Calibri"/>
+                <w:b/>
+                <w:bCs/>
+                <w:color w:val="14213D"/>
+                <w:sz w:val="19"/>
+                <w:szCs w:val="19"/>
+              </w:rPr>
+              <w:t xml:space="preserve">Fait</w:t>
+            </w:r>
+          </w:p>
+        </w:tc>
+        <w:tc>
+          <w:tcPr>
+            <w:tcW w:type="dxa" w:w="3700"/>
+            <w:tcBorders>
+              <w:top w:val="single" w:color="D9D5CB" w:sz="4"/>
+              <w:left w:val="single" w:color="D9D5CB" w:sz="4"/>
+              <w:bottom w:val="single" w:color="D9D5CB" w:sz="4"/>
+              <w:right w:val="single" w:color="D9D5CB" w:sz="4"/>
+            </w:tcBorders>
+            <w:tcMar>
+              <w:top w:type="dxa" w:w="60"/>
+              <w:left w:type="dxa" w:w="90"/>
+              <w:bottom w:type="dxa" w:w="60"/>
+              <w:right w:type="dxa" w:w="90"/>
+            </w:tcMar>
+            <w:vAlign w:val="top"/>
+          </w:tcPr>
+          <w:p>
+            <w:pPr>
+              <w:spacing w:after="40"/>
+            </w:pPr>
+            <w:r>
+              <w:rPr>
+                <w:rFonts w:ascii="Calibri" w:cs="Calibri" w:eastAsia="Calibri" w:hAnsi="Calibri"/>
+                <w:color w:val="14213D"/>
+                <w:sz w:val="20"/>
+                <w:szCs w:val="20"/>
+              </w:rPr>
+              <w:t xml:space="preserve"/>
+            </w:r>
+          </w:p>
+          <w:p>
+            <w:pPr>
+              <w:spacing w:after="40"/>
+            </w:pPr>
+            <w:r>
+              <w:rPr>
+                <w:rFonts w:ascii="Calibri" w:cs="Calibri" w:eastAsia="Calibri" w:hAnsi="Calibri"/>
+                <w:color w:val="14213D"/>
+                <w:sz w:val="20"/>
+                <w:szCs w:val="20"/>
+              </w:rPr>
+              <w:t xml:space="preserve"/>
+            </w:r>
+          </w:p>
+        </w:tc>
+      </w:tr>
+      <w:tr>
+        <w:tc>
+          <w:tcPr>
+            <w:tcW w:type="dxa" w:w="2300"/>
+            <w:tcBorders>
+              <w:top w:val="single" w:color="D9D5CB" w:sz="4"/>
+              <w:left w:val="single" w:color="D9D5CB" w:sz="4"/>
+              <w:bottom w:val="single" w:color="D9D5CB" w:sz="4"/>
+              <w:right w:val="single" w:color="D9D5CB" w:sz="4"/>
+            </w:tcBorders>
+            <w:tcMar>
+              <w:top w:type="dxa" w:w="60"/>
+              <w:left w:type="dxa" w:w="90"/>
+              <w:bottom w:type="dxa" w:w="60"/>
+              <w:right w:type="dxa" w:w="90"/>
+            </w:tcMar>
+            <w:vAlign w:val="top"/>
+          </w:tcPr>
+          <w:p>
+            <w:pPr>
+              <w:spacing w:after="40"/>
+            </w:pPr>
+            <w:r>
+              <w:rPr>
+                <w:rFonts w:ascii="Calibri" w:cs="Calibri" w:eastAsia="Calibri" w:hAnsi="Calibri"/>
+                <w:b/>
+                <w:bCs/>
+                <w:color w:val="14213D"/>
+                <w:sz w:val="20"/>
+                <w:szCs w:val="20"/>
+              </w:rPr>
+              <w:t xml:space="preserve">Heures à reporter (au-delà de 48 h)</w:t>
+            </w:r>
+          </w:p>
+        </w:tc>
+        <w:tc>
+          <w:tcPr>
+            <w:tcW w:type="dxa" w:w="4100"/>
+            <w:tcBorders>
+              <w:top w:val="single" w:color="D9D5CB" w:sz="4"/>
+              <w:left w:val="single" w:color="D9D5CB" w:sz="4"/>
+              <w:bottom w:val="single" w:color="D9D5CB" w:sz="4"/>
+              <w:right w:val="single" w:color="D9D5CB" w:sz="4"/>
+            </w:tcBorders>
+            <w:tcMar>
+              <w:top w:type="dxa" w:w="60"/>
+              <w:left w:type="dxa" w:w="90"/>
+              <w:bottom w:type="dxa" w:w="60"/>
+              <w:right w:type="dxa" w:w="90"/>
+            </w:tcMar>
+            <w:vAlign w:val="top"/>
+          </w:tcPr>
+          <w:p>
+            <w:pPr>
+              <w:spacing w:after="40"/>
+            </w:pPr>
+            <w:r>
+              <w:rPr>
+                <w:rFonts w:ascii="Calibri" w:cs="Calibri" w:eastAsia="Calibri" w:hAnsi="Calibri"/>
+                <w:color w:val="14213D"/>
+                <w:sz w:val="19"/>
+                <w:szCs w:val="19"/>
+              </w:rPr>
+              <w:t xml:space="preserve">Elles entrent majorées × 1,5. « 💶 payer en prime » (date de paie, note) ou « ↪ replacer sur une semaine » plus légère : tu choisis la semaine, l'appli propose de quoi atteindre son contrat ; ces heures s'ajoutent à sa semaine sur la navette (« TOTAL SEMAINE - 40 (DONT 1 H REPORTÉES) »).</w:t>
+            </w:r>
+          </w:p>
+        </w:tc>
+        <w:tc>
+          <w:tcPr>
+            <w:tcW w:type="dxa" w:w="3700"/>
+            <w:tcBorders>
+              <w:top w:val="single" w:color="D9D5CB" w:sz="4"/>
+              <w:left w:val="single" w:color="D9D5CB" w:sz="4"/>
+              <w:bottom w:val="single" w:color="D9D5CB" w:sz="4"/>
+              <w:right w:val="single" w:color="D9D5CB" w:sz="4"/>
+            </w:tcBorders>
+            <w:tcMar>
+              <w:top w:type="dxa" w:w="60"/>
+              <w:left w:type="dxa" w:w="90"/>
+              <w:bottom w:type="dxa" w:w="60"/>
+              <w:right w:type="dxa" w:w="90"/>
+            </w:tcMar>
+            <w:vAlign w:val="top"/>
+          </w:tcPr>
+          <w:p>
+            <w:pPr>
+              <w:spacing w:after="40"/>
+            </w:pPr>
+            <w:r>
+              <w:rPr>
+                <w:rFonts w:ascii="Calibri" w:cs="Calibri" w:eastAsia="Calibri" w:hAnsi="Calibri"/>
+                <w:color w:val="14213D"/>
+                <w:sz w:val="19"/>
+                <w:szCs w:val="19"/>
+              </w:rPr>
+              <w:t xml:space="preserve">Au-delà de son contrat, la semaine générerait des heures sup : l'appli prévient avant d'enregistrer.</w:t>
+            </w:r>
+          </w:p>
+        </w:tc>
+        <w:tc>
+          <w:tcPr>
+            <w:tcW w:type="dxa" w:w="1300"/>
+            <w:tcBorders>
+              <w:top w:val="single" w:color="D9D5CB" w:sz="4"/>
+              <w:left w:val="single" w:color="D9D5CB" w:sz="4"/>
+              <w:bottom w:val="single" w:color="D9D5CB" w:sz="4"/>
+              <w:right w:val="single" w:color="D9D5CB" w:sz="4"/>
+            </w:tcBorders>
+            <w:shd w:fill="E6F5EC" w:color="auto" w:val="clear"/>
+            <w:tcMar>
+              <w:top w:type="dxa" w:w="60"/>
+              <w:left w:type="dxa" w:w="90"/>
+              <w:bottom w:type="dxa" w:w="60"/>
+              <w:right w:type="dxa" w:w="90"/>
+            </w:tcMar>
+            <w:vAlign w:val="top"/>
+          </w:tcPr>
+          <w:p>
+            <w:pPr>
+              <w:spacing w:after="40"/>
+            </w:pPr>
+            <w:r>
+              <w:rPr>
+                <w:rFonts w:ascii="Calibri" w:cs="Calibri" w:eastAsia="Calibri" w:hAnsi="Calibri"/>
+                <w:b/>
+                <w:bCs/>
+                <w:color w:val="14213D"/>
+                <w:sz w:val="19"/>
+                <w:szCs w:val="19"/>
+              </w:rPr>
+              <w:t xml:space="preserve">Fait</w:t>
+            </w:r>
+          </w:p>
+        </w:tc>
+        <w:tc>
+          <w:tcPr>
+            <w:tcW w:type="dxa" w:w="3700"/>
+            <w:tcBorders>
+              <w:top w:val="single" w:color="D9D5CB" w:sz="4"/>
+              <w:left w:val="single" w:color="D9D5CB" w:sz="4"/>
+              <w:bottom w:val="single" w:color="D9D5CB" w:sz="4"/>
+              <w:right w:val="single" w:color="D9D5CB" w:sz="4"/>
+            </w:tcBorders>
+            <w:tcMar>
+              <w:top w:type="dxa" w:w="60"/>
+              <w:left w:type="dxa" w:w="90"/>
+              <w:bottom w:type="dxa" w:w="60"/>
+              <w:right w:type="dxa" w:w="90"/>
+            </w:tcMar>
+            <w:vAlign w:val="top"/>
+          </w:tcPr>
+          <w:p>
+            <w:pPr>
+              <w:spacing w:after="40"/>
+            </w:pPr>
+            <w:r>
+              <w:rPr>
+                <w:rFonts w:ascii="Calibri" w:cs="Calibri" w:eastAsia="Calibri" w:hAnsi="Calibri"/>
+                <w:color w:val="14213D"/>
+                <w:sz w:val="20"/>
+                <w:szCs w:val="20"/>
+              </w:rPr>
+              <w:t xml:space="preserve"/>
+            </w:r>
+          </w:p>
+          <w:p>
+            <w:pPr>
+              <w:spacing w:after="40"/>
+            </w:pPr>
+            <w:r>
+              <w:rPr>
+                <w:rFonts w:ascii="Calibri" w:cs="Calibri" w:eastAsia="Calibri" w:hAnsi="Calibri"/>
+                <w:color w:val="14213D"/>
+                <w:sz w:val="20"/>
+                <w:szCs w:val="20"/>
+              </w:rPr>
+              <w:t xml:space="preserve"/>
+            </w:r>
+          </w:p>
+        </w:tc>
+      </w:tr>
+      <w:tr>
+        <w:tc>
+          <w:tcPr>
+            <w:tcW w:type="dxa" w:w="2300"/>
+            <w:tcBorders>
+              <w:top w:val="single" w:color="D9D5CB" w:sz="4"/>
+              <w:left w:val="single" w:color="D9D5CB" w:sz="4"/>
+              <w:bottom w:val="single" w:color="D9D5CB" w:sz="4"/>
+              <w:right w:val="single" w:color="D9D5CB" w:sz="4"/>
+            </w:tcBorders>
+            <w:tcMar>
+              <w:top w:type="dxa" w:w="60"/>
+              <w:left w:type="dxa" w:w="90"/>
+              <w:bottom w:type="dxa" w:w="60"/>
+              <w:right w:type="dxa" w:w="90"/>
+            </w:tcMar>
+            <w:vAlign w:val="top"/>
+          </w:tcPr>
+          <w:p>
+            <w:pPr>
+              <w:spacing w:after="40"/>
+            </w:pPr>
+            <w:r>
+              <w:rPr>
+                <w:rFonts w:ascii="Calibri" w:cs="Calibri" w:eastAsia="Calibri" w:hAnsi="Calibri"/>
+                <w:b/>
+                <w:bCs/>
+                <w:color w:val="14213D"/>
+                <w:sz w:val="20"/>
+                <w:szCs w:val="20"/>
+              </w:rPr>
+              <w:t xml:space="preserve">Import du compteur existant</w:t>
+            </w:r>
+          </w:p>
+        </w:tc>
+        <w:tc>
+          <w:tcPr>
+            <w:tcW w:type="dxa" w:w="4100"/>
+            <w:tcBorders>
+              <w:top w:val="single" w:color="D9D5CB" w:sz="4"/>
+              <w:left w:val="single" w:color="D9D5CB" w:sz="4"/>
+              <w:bottom w:val="single" w:color="D9D5CB" w:sz="4"/>
+              <w:right w:val="single" w:color="D9D5CB" w:sz="4"/>
+            </w:tcBorders>
+            <w:tcMar>
+              <w:top w:type="dxa" w:w="60"/>
+              <w:left w:type="dxa" w:w="90"/>
+              <w:bottom w:type="dxa" w:w="60"/>
+              <w:right w:type="dxa" w:w="90"/>
+            </w:tcMar>
+            <w:vAlign w:val="top"/>
+          </w:tcPr>
+          <w:p>
+            <w:pPr>
+              <w:spacing w:after="40"/>
+            </w:pPr>
+            <w:r>
+              <w:rPr>
+                <w:rFonts w:ascii="Calibri" w:cs="Calibri" w:eastAsia="Calibri" w:hAnsi="Calibri"/>
+                <w:color w:val="14213D"/>
+                <w:sz w:val="19"/>
+                <w:szCs w:val="19"/>
+              </w:rPr>
+              <w:t xml:space="preserve">Chantiers → Équipes &amp; heures → Heures &amp; paie → « Compteurs d'heures » → « ⬆ Importer le compteur existant » : choisis la navette de fin (« soldes arrêtés à la fin de la navette de septembre », dimanche 27/09), colle ton tableau Excel (Nom, Prénom, Compteur, Plafond, Heures à reporter, Contrat, Cas forcé — l'ordre et les colonnes en plus n'ont pas d'importance) ou dépose le fichier. Aperçu : lignes reconnues, lignes refusées avec la raison (inconnu, homonyme, en double, illisible). ✓ Importer.</w:t>
+            </w:r>
+          </w:p>
+        </w:tc>
+        <w:tc>
+          <w:tcPr>
+            <w:tcW w:type="dxa" w:w="3700"/>
+            <w:tcBorders>
+              <w:top w:val="single" w:color="D9D5CB" w:sz="4"/>
+              <w:left w:val="single" w:color="D9D5CB" w:sz="4"/>
+              <w:bottom w:val="single" w:color="D9D5CB" w:sz="4"/>
+              <w:right w:val="single" w:color="D9D5CB" w:sz="4"/>
+            </w:tcBorders>
+            <w:tcMar>
+              <w:top w:type="dxa" w:w="60"/>
+              <w:left w:type="dxa" w:w="90"/>
+              <w:bottom w:type="dxa" w:w="60"/>
+              <w:right w:type="dxa" w:w="90"/>
+            </w:tcMar>
+            <w:vAlign w:val="top"/>
+          </w:tcPr>
+          <w:p>
+            <w:pPr>
+              <w:spacing w:after="40"/>
+            </w:pPr>
+            <w:r>
+              <w:rPr>
+                <w:rFonts w:ascii="Calibri" w:cs="Calibri" w:eastAsia="Calibri" w:hAnsi="Calibri"/>
+                <w:color w:val="14213D"/>
+                <w:sz w:val="19"/>
+                <w:szCs w:val="19"/>
+              </w:rPr>
+              <w:t xml:space="preserve">« ⬇ Tableau Excel pré-rempli » : les noms y sont déjà, avec les soldes à la fin de la navette choisie — remplis, recolle. Le solde importé remplace le solde de départ ; les semaines suivantes s'y ajoutent toutes seules. Une date tapée (30/09) est ramenée à la fin de la navette de son mois.</w:t>
+            </w:r>
+          </w:p>
+        </w:tc>
+        <w:tc>
+          <w:tcPr>
+            <w:tcW w:type="dxa" w:w="1300"/>
+            <w:tcBorders>
+              <w:top w:val="single" w:color="D9D5CB" w:sz="4"/>
+              <w:left w:val="single" w:color="D9D5CB" w:sz="4"/>
+              <w:bottom w:val="single" w:color="D9D5CB" w:sz="4"/>
+              <w:right w:val="single" w:color="D9D5CB" w:sz="4"/>
+            </w:tcBorders>
+            <w:shd w:fill="E6F5EC" w:color="auto" w:val="clear"/>
+            <w:tcMar>
+              <w:top w:type="dxa" w:w="60"/>
+              <w:left w:type="dxa" w:w="90"/>
+              <w:bottom w:type="dxa" w:w="60"/>
+              <w:right w:type="dxa" w:w="90"/>
+            </w:tcMar>
+            <w:vAlign w:val="top"/>
+          </w:tcPr>
+          <w:p>
+            <w:pPr>
+              <w:spacing w:after="40"/>
+            </w:pPr>
+            <w:r>
+              <w:rPr>
+                <w:rFonts w:ascii="Calibri" w:cs="Calibri" w:eastAsia="Calibri" w:hAnsi="Calibri"/>
+                <w:b/>
+                <w:bCs/>
+                <w:color w:val="14213D"/>
+                <w:sz w:val="19"/>
+                <w:szCs w:val="19"/>
+              </w:rPr>
+              <w:t xml:space="preserve">Fait</w:t>
+            </w:r>
+          </w:p>
+        </w:tc>
+        <w:tc>
+          <w:tcPr>
+            <w:tcW w:type="dxa" w:w="3700"/>
+            <w:tcBorders>
+              <w:top w:val="single" w:color="D9D5CB" w:sz="4"/>
+              <w:left w:val="single" w:color="D9D5CB" w:sz="4"/>
+              <w:bottom w:val="single" w:color="D9D5CB" w:sz="4"/>
+              <w:right w:val="single" w:color="D9D5CB" w:sz="4"/>
+            </w:tcBorders>
+            <w:tcMar>
+              <w:top w:type="dxa" w:w="60"/>
+              <w:left w:type="dxa" w:w="90"/>
+              <w:bottom w:type="dxa" w:w="60"/>
+              <w:right w:type="dxa" w:w="90"/>
+            </w:tcMar>
+            <w:vAlign w:val="top"/>
+          </w:tcPr>
+          <w:p>
+            <w:pPr>
+              <w:spacing w:after="40"/>
+            </w:pPr>
+            <w:r>
+              <w:rPr>
+                <w:rFonts w:ascii="Calibri" w:cs="Calibri" w:eastAsia="Calibri" w:hAnsi="Calibri"/>
+                <w:color w:val="14213D"/>
+                <w:sz w:val="20"/>
+                <w:szCs w:val="20"/>
+              </w:rPr>
+              <w:t xml:space="preserve"/>
+            </w:r>
+          </w:p>
+          <w:p>
+            <w:pPr>
+              <w:spacing w:after="40"/>
+            </w:pPr>
+            <w:r>
+              <w:rPr>
+                <w:rFonts w:ascii="Calibri" w:cs="Calibri" w:eastAsia="Calibri" w:hAnsi="Calibri"/>
+                <w:color w:val="14213D"/>
+                <w:sz w:val="20"/>
+                <w:szCs w:val="20"/>
+              </w:rPr>
+              <w:t xml:space="preserve"/>
+            </w:r>
+          </w:p>
+        </w:tc>
+      </w:tr>
+      <w:tr>
+        <w:tc>
+          <w:tcPr>
+            <w:tcW w:type="dxa" w:w="2300"/>
+            <w:tcBorders>
+              <w:top w:val="single" w:color="D9D5CB" w:sz="4"/>
+              <w:left w:val="single" w:color="D9D5CB" w:sz="4"/>
+              <w:bottom w:val="single" w:color="D9D5CB" w:sz="4"/>
+              <w:right w:val="single" w:color="D9D5CB" w:sz="4"/>
+            </w:tcBorders>
+            <w:tcMar>
+              <w:top w:type="dxa" w:w="60"/>
+              <w:left w:type="dxa" w:w="90"/>
+              <w:bottom w:type="dxa" w:w="60"/>
+              <w:right w:type="dxa" w:w="90"/>
+            </w:tcMar>
+            <w:vAlign w:val="top"/>
+          </w:tcPr>
+          <w:p>
+            <w:pPr>
+              <w:spacing w:after="40"/>
+            </w:pPr>
+            <w:r>
+              <w:rPr>
+                <w:rFonts w:ascii="Calibri" w:cs="Calibri" w:eastAsia="Calibri" w:hAnsi="Calibri"/>
+                <w:b/>
+                <w:bCs/>
+                <w:color w:val="14213D"/>
+                <w:sz w:val="20"/>
+                <w:szCs w:val="20"/>
+              </w:rPr>
+              <w:t xml:space="preserve">Tableau de tout le monde</w:t>
+            </w:r>
+          </w:p>
+        </w:tc>
+        <w:tc>
+          <w:tcPr>
+            <w:tcW w:type="dxa" w:w="4100"/>
+            <w:tcBorders>
+              <w:top w:val="single" w:color="D9D5CB" w:sz="4"/>
+              <w:left w:val="single" w:color="D9D5CB" w:sz="4"/>
+              <w:bottom w:val="single" w:color="D9D5CB" w:sz="4"/>
+              <w:right w:val="single" w:color="D9D5CB" w:sz="4"/>
+            </w:tcBorders>
+            <w:tcMar>
+              <w:top w:type="dxa" w:w="60"/>
+              <w:left w:type="dxa" w:w="90"/>
+              <w:bottom w:type="dxa" w:w="60"/>
+              <w:right w:type="dxa" w:w="90"/>
+            </w:tcMar>
+            <w:vAlign w:val="top"/>
+          </w:tcPr>
+          <w:p>
+            <w:pPr>
+              <w:spacing w:after="40"/>
+            </w:pPr>
+            <w:r>
+              <w:rPr>
+                <w:rFonts w:ascii="Calibri" w:cs="Calibri" w:eastAsia="Calibri" w:hAnsi="Calibri"/>
+                <w:color w:val="14213D"/>
+                <w:sz w:val="19"/>
+                <w:szCs w:val="19"/>
+              </w:rPr>
+              <w:t xml:space="preserve">Même écran : chaque personne (contrat, compteur / plafond avec jauge, à reporter, cas), « Fiche » pour la régler ; en haut : combien ont un compteur, total en heures, compteurs pleins, heures à reporter, cas forcés.</w:t>
+            </w:r>
+          </w:p>
+        </w:tc>
+        <w:tc>
+          <w:tcPr>
+            <w:tcW w:type="dxa" w:w="3700"/>
+            <w:tcBorders>
+              <w:top w:val="single" w:color="D9D5CB" w:sz="4"/>
+              <w:left w:val="single" w:color="D9D5CB" w:sz="4"/>
+              <w:bottom w:val="single" w:color="D9D5CB" w:sz="4"/>
+              <w:right w:val="single" w:color="D9D5CB" w:sz="4"/>
+            </w:tcBorders>
+            <w:tcMar>
+              <w:top w:type="dxa" w:w="60"/>
+              <w:left w:type="dxa" w:w="90"/>
+              <w:bottom w:type="dxa" w:w="60"/>
+              <w:right w:type="dxa" w:w="90"/>
+            </w:tcMar>
+            <w:vAlign w:val="top"/>
+          </w:tcPr>
+          <w:p>
+            <w:pPr>
+              <w:spacing w:after="40"/>
+            </w:pPr>
+            <w:r>
+              <w:rPr>
+                <w:rFonts w:ascii="Calibri" w:cs="Calibri" w:eastAsia="Calibri" w:hAnsi="Calibri"/>
+                <w:color w:val="14213D"/>
+                <w:sz w:val="19"/>
+                <w:szCs w:val="19"/>
+              </w:rPr>
+              <w:t xml:space="preserve"/>
+            </w:r>
+          </w:p>
+        </w:tc>
+        <w:tc>
+          <w:tcPr>
+            <w:tcW w:type="dxa" w:w="1300"/>
+            <w:tcBorders>
+              <w:top w:val="single" w:color="D9D5CB" w:sz="4"/>
+              <w:left w:val="single" w:color="D9D5CB" w:sz="4"/>
+              <w:bottom w:val="single" w:color="D9D5CB" w:sz="4"/>
+              <w:right w:val="single" w:color="D9D5CB" w:sz="4"/>
+            </w:tcBorders>
+            <w:shd w:fill="E6F5EC" w:color="auto" w:val="clear"/>
+            <w:tcMar>
+              <w:top w:type="dxa" w:w="60"/>
+              <w:left w:type="dxa" w:w="90"/>
+              <w:bottom w:type="dxa" w:w="60"/>
+              <w:right w:type="dxa" w:w="90"/>
+            </w:tcMar>
+            <w:vAlign w:val="top"/>
+          </w:tcPr>
+          <w:p>
+            <w:pPr>
+              <w:spacing w:after="40"/>
+            </w:pPr>
+            <w:r>
+              <w:rPr>
+                <w:rFonts w:ascii="Calibri" w:cs="Calibri" w:eastAsia="Calibri" w:hAnsi="Calibri"/>
+                <w:b/>
+                <w:bCs/>
+                <w:color w:val="14213D"/>
+                <w:sz w:val="19"/>
+                <w:szCs w:val="19"/>
+              </w:rPr>
+              <w:t xml:space="preserve">Fait</w:t>
+            </w:r>
+          </w:p>
+        </w:tc>
+        <w:tc>
+          <w:tcPr>
+            <w:tcW w:type="dxa" w:w="3700"/>
+            <w:tcBorders>
+              <w:top w:val="single" w:color="D9D5CB" w:sz="4"/>
+              <w:left w:val="single" w:color="D9D5CB" w:sz="4"/>
+              <w:bottom w:val="single" w:color="D9D5CB" w:sz="4"/>
+              <w:right w:val="single" w:color="D9D5CB" w:sz="4"/>
+            </w:tcBorders>
+            <w:tcMar>
+              <w:top w:type="dxa" w:w="60"/>
+              <w:left w:type="dxa" w:w="90"/>
+              <w:bottom w:type="dxa" w:w="60"/>
+              <w:right w:type="dxa" w:w="90"/>
+            </w:tcMar>
+            <w:vAlign w:val="top"/>
+          </w:tcPr>
+          <w:p>
+            <w:pPr>
+              <w:spacing w:after="40"/>
+            </w:pPr>
+            <w:r>
+              <w:rPr>
+                <w:rFonts w:ascii="Calibri" w:cs="Calibri" w:eastAsia="Calibri" w:hAnsi="Calibri"/>
+                <w:color w:val="14213D"/>
+                <w:sz w:val="20"/>
+                <w:szCs w:val="20"/>
+              </w:rPr>
+              <w:t xml:space="preserve"/>
+            </w:r>
+          </w:p>
+          <w:p>
+            <w:pPr>
+              <w:spacing w:after="40"/>
+            </w:pPr>
+            <w:r>
+              <w:rPr>
+                <w:rFonts w:ascii="Calibri" w:cs="Calibri" w:eastAsia="Calibri" w:hAnsi="Calibri"/>
+                <w:color w:val="14213D"/>
+                <w:sz w:val="20"/>
+                <w:szCs w:val="20"/>
+              </w:rPr>
+              <w:t xml:space="preserve"/>
+            </w:r>
+          </w:p>
+        </w:tc>
+      </w:tr>
+      <w:tr>
+        <w:tc>
+          <w:tcPr>
+            <w:tcW w:type="dxa" w:w="2300"/>
+            <w:tcBorders>
+              <w:top w:val="single" w:color="D9D5CB" w:sz="4"/>
+              <w:left w:val="single" w:color="D9D5CB" w:sz="4"/>
+              <w:bottom w:val="single" w:color="D9D5CB" w:sz="4"/>
+              <w:right w:val="single" w:color="D9D5CB" w:sz="4"/>
+            </w:tcBorders>
+            <w:tcMar>
+              <w:top w:type="dxa" w:w="60"/>
+              <w:left w:type="dxa" w:w="90"/>
+              <w:bottom w:type="dxa" w:w="60"/>
+              <w:right w:type="dxa" w:w="90"/>
+            </w:tcMar>
+            <w:vAlign w:val="top"/>
+          </w:tcPr>
+          <w:p>
+            <w:pPr>
+              <w:spacing w:after="40"/>
+            </w:pPr>
+            <w:r>
+              <w:rPr>
+                <w:rFonts w:ascii="Calibri" w:cs="Calibri" w:eastAsia="Calibri" w:hAnsi="Calibri"/>
+                <w:b/>
+                <w:bCs/>
+                <w:color w:val="14213D"/>
+                <w:sz w:val="20"/>
+                <w:szCs w:val="20"/>
+              </w:rPr>
+              <w:t xml:space="preserve">Cas de déplacement forcé</w:t>
+            </w:r>
+          </w:p>
+        </w:tc>
+        <w:tc>
+          <w:tcPr>
+            <w:tcW w:type="dxa" w:w="4100"/>
+            <w:tcBorders>
+              <w:top w:val="single" w:color="D9D5CB" w:sz="4"/>
+              <w:left w:val="single" w:color="D9D5CB" w:sz="4"/>
+              <w:bottom w:val="single" w:color="D9D5CB" w:sz="4"/>
+              <w:right w:val="single" w:color="D9D5CB" w:sz="4"/>
+            </w:tcBorders>
+            <w:tcMar>
+              <w:top w:type="dxa" w:w="60"/>
+              <w:left w:type="dxa" w:w="90"/>
+              <w:bottom w:type="dxa" w:w="60"/>
+              <w:right w:type="dxa" w:w="90"/>
+            </w:tcMar>
+            <w:vAlign w:val="top"/>
+          </w:tcPr>
+          <w:p>
+            <w:pPr>
+              <w:spacing w:after="40"/>
+            </w:pPr>
+            <w:r>
+              <w:rPr>
+                <w:rFonts w:ascii="Calibri" w:cs="Calibri" w:eastAsia="Calibri" w:hAnsi="Calibri"/>
+                <w:color w:val="14213D"/>
+                <w:sz w:val="19"/>
+                <w:szCs w:val="19"/>
+              </w:rPr>
+              <w:t xml:space="preserve">Fiche → « Cas de déplacement » ✏️ : selon la distance, ou cas 1 à 4 forcé + motif. Il s'applique partout où le cas est calculé (planning, grands déplacements, accords, navettes) — sinon les indemnités seraient fausses. La mention « forcé » ne se voit que du gérant, de la direction et des RH ; le gars voit son cas, jamais « forcé ». Aussi par l'import (colonne « Cas »).</w:t>
+            </w:r>
+          </w:p>
+        </w:tc>
+        <w:tc>
+          <w:tcPr>
+            <w:tcW w:type="dxa" w:w="3700"/>
+            <w:tcBorders>
+              <w:top w:val="single" w:color="D9D5CB" w:sz="4"/>
+              <w:left w:val="single" w:color="D9D5CB" w:sz="4"/>
+              <w:bottom w:val="single" w:color="D9D5CB" w:sz="4"/>
+              <w:right w:val="single" w:color="D9D5CB" w:sz="4"/>
+            </w:tcBorders>
+            <w:tcMar>
+              <w:top w:type="dxa" w:w="60"/>
+              <w:left w:type="dxa" w:w="90"/>
+              <w:bottom w:type="dxa" w:w="60"/>
+              <w:right w:type="dxa" w:w="90"/>
+            </w:tcMar>
+            <w:vAlign w:val="top"/>
+          </w:tcPr>
+          <w:p>
+            <w:pPr>
+              <w:spacing w:after="40"/>
+            </w:pPr>
+            <w:r>
+              <w:rPr>
+                <w:rFonts w:ascii="Calibri" w:cs="Calibri" w:eastAsia="Calibri" w:hAnsi="Calibri"/>
+                <w:color w:val="14213D"/>
+                <w:sz w:val="19"/>
+                <w:szCs w:val="19"/>
+              </w:rPr>
+              <w:t xml:space="preserve"/>
+            </w:r>
+          </w:p>
+        </w:tc>
+        <w:tc>
+          <w:tcPr>
+            <w:tcW w:type="dxa" w:w="1300"/>
+            <w:tcBorders>
+              <w:top w:val="single" w:color="D9D5CB" w:sz="4"/>
+              <w:left w:val="single" w:color="D9D5CB" w:sz="4"/>
+              <w:bottom w:val="single" w:color="D9D5CB" w:sz="4"/>
+              <w:right w:val="single" w:color="D9D5CB" w:sz="4"/>
+            </w:tcBorders>
+            <w:shd w:fill="E6F5EC" w:color="auto" w:val="clear"/>
+            <w:tcMar>
+              <w:top w:type="dxa" w:w="60"/>
+              <w:left w:type="dxa" w:w="90"/>
+              <w:bottom w:type="dxa" w:w="60"/>
+              <w:right w:type="dxa" w:w="90"/>
+            </w:tcMar>
+            <w:vAlign w:val="top"/>
+          </w:tcPr>
+          <w:p>
+            <w:pPr>
+              <w:spacing w:after="40"/>
+            </w:pPr>
+            <w:r>
+              <w:rPr>
+                <w:rFonts w:ascii="Calibri" w:cs="Calibri" w:eastAsia="Calibri" w:hAnsi="Calibri"/>
+                <w:b/>
+                <w:bCs/>
+                <w:color w:val="14213D"/>
+                <w:sz w:val="19"/>
+                <w:szCs w:val="19"/>
+              </w:rPr>
+              <w:t xml:space="preserve">Fait</w:t>
+            </w:r>
+          </w:p>
+        </w:tc>
+        <w:tc>
+          <w:tcPr>
+            <w:tcW w:type="dxa" w:w="3700"/>
+            <w:tcBorders>
+              <w:top w:val="single" w:color="D9D5CB" w:sz="4"/>
+              <w:left w:val="single" w:color="D9D5CB" w:sz="4"/>
+              <w:bottom w:val="single" w:color="D9D5CB" w:sz="4"/>
+              <w:right w:val="single" w:color="D9D5CB" w:sz="4"/>
+            </w:tcBorders>
+            <w:tcMar>
+              <w:top w:type="dxa" w:w="60"/>
+              <w:left w:type="dxa" w:w="90"/>
+              <w:bottom w:type="dxa" w:w="60"/>
+              <w:right w:type="dxa" w:w="90"/>
+            </w:tcMar>
+            <w:vAlign w:val="top"/>
+          </w:tcPr>
+          <w:p>
+            <w:pPr>
+              <w:spacing w:after="40"/>
+            </w:pPr>
+            <w:r>
+              <w:rPr>
+                <w:rFonts w:ascii="Calibri" w:cs="Calibri" w:eastAsia="Calibri" w:hAnsi="Calibri"/>
+                <w:color w:val="14213D"/>
+                <w:sz w:val="20"/>
+                <w:szCs w:val="20"/>
+              </w:rPr>
+              <w:t xml:space="preserve"/>
+            </w:r>
+          </w:p>
+          <w:p>
+            <w:pPr>
+              <w:spacing w:after="40"/>
+            </w:pPr>
+            <w:r>
+              <w:rPr>
+                <w:rFonts w:ascii="Calibri" w:cs="Calibri" w:eastAsia="Calibri" w:hAnsi="Calibri"/>
+                <w:color w:val="14213D"/>
+                <w:sz w:val="20"/>
+                <w:szCs w:val="20"/>
+              </w:rPr>
+              <w:t xml:space="preserve"/>
+            </w:r>
+          </w:p>
+        </w:tc>
+      </w:tr>
+      <w:tr>
+        <w:tc>
+          <w:tcPr>
+            <w:tcW w:type="dxa" w:w="2300"/>
+            <w:tcBorders>
+              <w:top w:val="single" w:color="D9D5CB" w:sz="4"/>
+              <w:left w:val="single" w:color="D9D5CB" w:sz="4"/>
+              <w:bottom w:val="single" w:color="D9D5CB" w:sz="4"/>
+              <w:right w:val="single" w:color="D9D5CB" w:sz="4"/>
+            </w:tcBorders>
+            <w:tcMar>
+              <w:top w:type="dxa" w:w="60"/>
+              <w:left w:type="dxa" w:w="90"/>
+              <w:bottom w:type="dxa" w:w="60"/>
+              <w:right w:type="dxa" w:w="90"/>
+            </w:tcMar>
+            <w:vAlign w:val="top"/>
+          </w:tcPr>
+          <w:p>
+            <w:pPr>
+              <w:spacing w:after="40"/>
+            </w:pPr>
+            <w:r>
+              <w:rPr>
+                <w:rFonts w:ascii="Calibri" w:cs="Calibri" w:eastAsia="Calibri" w:hAnsi="Calibri"/>
+                <w:b/>
+                <w:bCs/>
+                <w:color w:val="14213D"/>
+                <w:sz w:val="20"/>
+                <w:szCs w:val="20"/>
+              </w:rPr>
+              <w:t xml:space="preserve">Qui voit, qui modifie</w:t>
+            </w:r>
+          </w:p>
+        </w:tc>
+        <w:tc>
+          <w:tcPr>
+            <w:tcW w:type="dxa" w:w="4100"/>
+            <w:tcBorders>
+              <w:top w:val="single" w:color="D9D5CB" w:sz="4"/>
+              <w:left w:val="single" w:color="D9D5CB" w:sz="4"/>
+              <w:bottom w:val="single" w:color="D9D5CB" w:sz="4"/>
+              <w:right w:val="single" w:color="D9D5CB" w:sz="4"/>
+            </w:tcBorders>
+            <w:tcMar>
+              <w:top w:type="dxa" w:w="60"/>
+              <w:left w:type="dxa" w:w="90"/>
+              <w:bottom w:type="dxa" w:w="60"/>
+              <w:right w:type="dxa" w:w="90"/>
+            </w:tcMar>
+            <w:vAlign w:val="top"/>
+          </w:tcPr>
+          <w:p>
+            <w:pPr>
+              <w:spacing w:after="40"/>
+            </w:pPr>
+            <w:r>
+              <w:rPr>
+                <w:rFonts w:ascii="Calibri" w:cs="Calibri" w:eastAsia="Calibri" w:hAnsi="Calibri"/>
+                <w:color w:val="14213D"/>
+                <w:sz w:val="19"/>
+                <w:szCs w:val="19"/>
+              </w:rPr>
+              <w:t xml:space="preserve">Nouveaux droits « RH : voir… » (d'office : gérant, directrice adjointe, directeur technique, RH) et « RH : modifier… » (d'office : RH) ; toi : tout (administrateur). Les chefs, conducteurs, chargés d'affaires et autres responsables d'exploitation ne voient plus la carte — avant, ils pouvaient même la modifier. Le gars voit son solde en lecture dans Moi → Heures (il doit être informé de ses heures de repos avec sa paie). Ajustable par personne dans Administrateur.</w:t>
+            </w:r>
+          </w:p>
+        </w:tc>
+        <w:tc>
+          <w:tcPr>
+            <w:tcW w:type="dxa" w:w="3700"/>
+            <w:tcBorders>
+              <w:top w:val="single" w:color="D9D5CB" w:sz="4"/>
+              <w:left w:val="single" w:color="D9D5CB" w:sz="4"/>
+              <w:bottom w:val="single" w:color="D9D5CB" w:sz="4"/>
+              <w:right w:val="single" w:color="D9D5CB" w:sz="4"/>
+            </w:tcBorders>
+            <w:tcMar>
+              <w:top w:type="dxa" w:w="60"/>
+              <w:left w:type="dxa" w:w="90"/>
+              <w:bottom w:type="dxa" w:w="60"/>
+              <w:right w:type="dxa" w:w="90"/>
+            </w:tcMar>
+            <w:vAlign w:val="top"/>
+          </w:tcPr>
+          <w:p>
+            <w:pPr>
+              <w:spacing w:after="40"/>
+            </w:pPr>
+            <w:r>
+              <w:rPr>
+                <w:rFonts w:ascii="Calibri" w:cs="Calibri" w:eastAsia="Calibri" w:hAnsi="Calibri"/>
+                <w:color w:val="14213D"/>
+                <w:sz w:val="19"/>
+                <w:szCs w:val="19"/>
+              </w:rPr>
+              <w:t xml:space="preserve">Passe retours_13-10f.sql pour que le serveur applique la même règle.</w:t>
+            </w:r>
+          </w:p>
+        </w:tc>
+        <w:tc>
+          <w:tcPr>
+            <w:tcW w:type="dxa" w:w="1300"/>
+            <w:tcBorders>
+              <w:top w:val="single" w:color="D9D5CB" w:sz="4"/>
+              <w:left w:val="single" w:color="D9D5CB" w:sz="4"/>
+              <w:bottom w:val="single" w:color="D9D5CB" w:sz="4"/>
+              <w:right w:val="single" w:color="D9D5CB" w:sz="4"/>
+            </w:tcBorders>
+            <w:shd w:fill="E6F5EC" w:color="auto" w:val="clear"/>
+            <w:tcMar>
+              <w:top w:type="dxa" w:w="60"/>
+              <w:left w:type="dxa" w:w="90"/>
+              <w:bottom w:type="dxa" w:w="60"/>
+              <w:right w:type="dxa" w:w="90"/>
+            </w:tcMar>
+            <w:vAlign w:val="top"/>
+          </w:tcPr>
+          <w:p>
+            <w:pPr>
+              <w:spacing w:after="40"/>
+            </w:pPr>
+            <w:r>
+              <w:rPr>
+                <w:rFonts w:ascii="Calibri" w:cs="Calibri" w:eastAsia="Calibri" w:hAnsi="Calibri"/>
+                <w:b/>
+                <w:bCs/>
+                <w:color w:val="14213D"/>
+                <w:sz w:val="19"/>
+                <w:szCs w:val="19"/>
+              </w:rPr>
+              <w:t xml:space="preserve">Fait</w:t>
+            </w:r>
+          </w:p>
+        </w:tc>
+        <w:tc>
+          <w:tcPr>
+            <w:tcW w:type="dxa" w:w="3700"/>
+            <w:tcBorders>
+              <w:top w:val="single" w:color="D9D5CB" w:sz="4"/>
+              <w:left w:val="single" w:color="D9D5CB" w:sz="4"/>
+              <w:bottom w:val="single" w:color="D9D5CB" w:sz="4"/>
+              <w:right w:val="single" w:color="D9D5CB" w:sz="4"/>
+            </w:tcBorders>
+            <w:tcMar>
+              <w:top w:type="dxa" w:w="60"/>
+              <w:left w:type="dxa" w:w="90"/>
+              <w:bottom w:type="dxa" w:w="60"/>
+              <w:right w:type="dxa" w:w="90"/>
+            </w:tcMar>
+            <w:vAlign w:val="top"/>
+          </w:tcPr>
+          <w:p>
+            <w:pPr>
+              <w:spacing w:after="40"/>
+            </w:pPr>
+            <w:r>
+              <w:rPr>
+                <w:rFonts w:ascii="Calibri" w:cs="Calibri" w:eastAsia="Calibri" w:hAnsi="Calibri"/>
+                <w:color w:val="14213D"/>
+                <w:sz w:val="20"/>
+                <w:szCs w:val="20"/>
+              </w:rPr>
+              <w:t xml:space="preserve"/>
+            </w:r>
+          </w:p>
+          <w:p>
+            <w:pPr>
+              <w:spacing w:after="40"/>
+            </w:pPr>
+            <w:r>
+              <w:rPr>
+                <w:rFonts w:ascii="Calibri" w:cs="Calibri" w:eastAsia="Calibri" w:hAnsi="Calibri"/>
+                <w:color w:val="14213D"/>
+                <w:sz w:val="20"/>
+                <w:szCs w:val="20"/>
+              </w:rPr>
+              <w:t xml:space="preserve"/>
+            </w:r>
+          </w:p>
+        </w:tc>
+      </w:tr>
+      <w:tr>
+        <w:tc>
+          <w:tcPr>
+            <w:tcW w:type="dxa" w:w="2300"/>
+            <w:tcBorders>
+              <w:top w:val="single" w:color="D9D5CB" w:sz="4"/>
+              <w:left w:val="single" w:color="D9D5CB" w:sz="4"/>
+              <w:bottom w:val="single" w:color="D9D5CB" w:sz="4"/>
+              <w:right w:val="single" w:color="D9D5CB" w:sz="4"/>
+            </w:tcBorders>
+            <w:tcMar>
+              <w:top w:type="dxa" w:w="60"/>
+              <w:left w:type="dxa" w:w="90"/>
+              <w:bottom w:type="dxa" w:w="60"/>
+              <w:right w:type="dxa" w:w="90"/>
+            </w:tcMar>
+            <w:vAlign w:val="top"/>
+          </w:tcPr>
+          <w:p>
+            <w:pPr>
+              <w:spacing w:after="40"/>
+            </w:pPr>
+            <w:r>
+              <w:rPr>
+                <w:rFonts w:ascii="Calibri" w:cs="Calibri" w:eastAsia="Calibri" w:hAnsi="Calibri"/>
+                <w:b/>
+                <w:bCs/>
+                <w:color w:val="14213D"/>
+                <w:sz w:val="20"/>
+                <w:szCs w:val="20"/>
+              </w:rPr>
+              <w:t xml:space="preserve">À valider par toi</w:t>
+            </w:r>
+          </w:p>
+        </w:tc>
+        <w:tc>
+          <w:tcPr>
+            <w:tcW w:type="dxa" w:w="4100"/>
+            <w:tcBorders>
+              <w:top w:val="single" w:color="D9D5CB" w:sz="4"/>
+              <w:left w:val="single" w:color="D9D5CB" w:sz="4"/>
+              <w:bottom w:val="single" w:color="D9D5CB" w:sz="4"/>
+              <w:right w:val="single" w:color="D9D5CB" w:sz="4"/>
+            </w:tcBorders>
+            <w:tcMar>
+              <w:top w:type="dxa" w:w="60"/>
+              <w:left w:type="dxa" w:w="90"/>
+              <w:bottom w:type="dxa" w:w="60"/>
+              <w:right w:type="dxa" w:w="90"/>
+            </w:tcMar>
+            <w:vAlign w:val="top"/>
+          </w:tcPr>
+          <w:p>
+            <w:pPr>
+              <w:spacing w:after="40"/>
+            </w:pPr>
+            <w:r>
+              <w:rPr>
+                <w:rFonts w:ascii="Calibri" w:cs="Calibri" w:eastAsia="Calibri" w:hAnsi="Calibri"/>
+                <w:color w:val="14213D"/>
+                <w:sz w:val="19"/>
+                <w:szCs w:val="19"/>
+              </w:rPr>
+              <w:t xml:space="preserve">1) Compteur plein → surplus payé en heures sup. 2) Le gars voit son propre solde (lecture). 3) La chargée de développement RH a les mêmes droits que les autres RH (voir + modifier). Le CET et les compteurs ajoutés à la main restent (« Autres compteurs »).</w:t>
+            </w:r>
+          </w:p>
+        </w:tc>
+        <w:tc>
+          <w:tcPr>
+            <w:tcW w:type="dxa" w:w="3700"/>
+            <w:tcBorders>
+              <w:top w:val="single" w:color="D9D5CB" w:sz="4"/>
+              <w:left w:val="single" w:color="D9D5CB" w:sz="4"/>
+              <w:bottom w:val="single" w:color="D9D5CB" w:sz="4"/>
+              <w:right w:val="single" w:color="D9D5CB" w:sz="4"/>
+            </w:tcBorders>
+            <w:tcMar>
+              <w:top w:type="dxa" w:w="60"/>
+              <w:left w:type="dxa" w:w="90"/>
+              <w:bottom w:type="dxa" w:w="60"/>
+              <w:right w:type="dxa" w:w="90"/>
+            </w:tcMar>
+            <w:vAlign w:val="top"/>
+          </w:tcPr>
+          <w:p>
+            <w:pPr>
+              <w:spacing w:after="40"/>
+            </w:pPr>
+            <w:r>
+              <w:rPr>
+                <w:rFonts w:ascii="Calibri" w:cs="Calibri" w:eastAsia="Calibri" w:hAnsi="Calibri"/>
+                <w:color w:val="14213D"/>
+                <w:sz w:val="19"/>
+                <w:szCs w:val="19"/>
+              </w:rPr>
+              <w:t xml:space="preserve"/>
+            </w:r>
+          </w:p>
+        </w:tc>
+        <w:tc>
+          <w:tcPr>
+            <w:tcW w:type="dxa" w:w="1300"/>
+            <w:tcBorders>
+              <w:top w:val="single" w:color="D9D5CB" w:sz="4"/>
+              <w:left w:val="single" w:color="D9D5CB" w:sz="4"/>
+              <w:bottom w:val="single" w:color="D9D5CB" w:sz="4"/>
+              <w:right w:val="single" w:color="D9D5CB" w:sz="4"/>
+            </w:tcBorders>
+            <w:shd w:fill="FFF4EE" w:color="auto" w:val="clear"/>
+            <w:tcMar>
+              <w:top w:type="dxa" w:w="60"/>
+              <w:left w:type="dxa" w:w="90"/>
+              <w:bottom w:type="dxa" w:w="60"/>
+              <w:right w:type="dxa" w:w="90"/>
+            </w:tcMar>
+            <w:vAlign w:val="top"/>
+          </w:tcPr>
+          <w:p>
+            <w:pPr>
+              <w:spacing w:after="40"/>
+            </w:pPr>
+            <w:r>
+              <w:rPr>
+                <w:rFonts w:ascii="Calibri" w:cs="Calibri" w:eastAsia="Calibri" w:hAnsi="Calibri"/>
+                <w:b/>
+                <w:bCs/>
+                <w:color w:val="14213D"/>
+                <w:sz w:val="19"/>
+                <w:szCs w:val="19"/>
+              </w:rPr>
+              <w:t xml:space="preserve">À valider</w:t>
             </w:r>
           </w:p>
         </w:tc>

</xml_diff>

<commit_message>
Quantitatifs lus tout seuls + même écran d'import (étude, commande, BL) + CET retiré
</commit_message>
<xml_diff>
--- a/app/docs/Feuille_de_route_controle_12-10.docx
+++ b/app/docs/Feuille_de_route_controle_12-10.docx
@@ -29,7 +29,7 @@
           <w:sz w:val="22"/>
           <w:szCs w:val="22"/>
         </w:rPr>
-        <w:t xml:space="preserve">12 octobre 2026 · mise à jour du 13/10 (fin d'après-midi) : HEURES — compteur d'heures (heures sup majorées par rang jusqu'au plafond, repos, posé par l'entreprise), heures à reporter (prime, semaine plus légère), import du compteur existant, cas de déplacement forcé, droits RH · après-midi : COMMERCE — quantités fournisseur par la trame, mémoire en mode lecture, contrôle croisé classeur ↔ appli, et le chiffrage qui remplace le classeur (base de prix, paniers dépliés, Installations, récap, charge et équipes) · fin de matinée : lecture des pièces et points techniques · la nuit du 13/10 : le responsable d'un chantier y entre toujours (Sofiane) · le plan de Nantes Géraudière qui disparaissait au zoom (réparé + « Recentrer le repère ») · le soir : GRANDS DÉPLACEMENTS jour par jour (4 ou 5 jours = même forfait), le mois par gars avec nuits et repas accordés, la navette, les adresses à vérifier · FOURNITURE : zone éditable, trame type d'import, écarts « commande complémentaire / inclus », BL de zone → Stock · l'après-midi : COMMERCE v2 (dossier déballé, lecture des pièces avec surlignage, chiffrage complet d'après ton classeur du 26.08, paniers, base de prix, DPGF traduite et réécrite dans l'Excel du client, blocs du mémoire) · le matin : onglet FOURNITURE (commande, livré, reste, zones à livrer, camions datés) et tes retours de la feuille du 09-10 (adresses, détente automatique, contrôle des grands déplacements, plein écran, trame d'accueil) · puis la nuit du 12/10 : six onglets, Commerce, Parc, Sécurité, accidents, Outlook serveur · nouvelle ventilation, « agir comme », raccourci rapide du planning, « ma semaine », tes commentaires du Word (sections 5 à 9) · une colonne pour tes retours</w:t>
+        <w:t xml:space="preserve">12 octobre 2026 · mise à jour du 13/10 (soir) : QUANTITATIFS — le fichier du fournisseur (Excel ou PDF) lu tout seul, le même écran d'import pour l'étude, la commande et le BL, réductions et kits fin de ligne dans la synthèse, consigne Claude Excel réécrite, CET retiré · fin d'après-midi : HEURES — compteur d'heures (heures sup majorées par rang jusqu'au plafond, repos, posé par l'entreprise), heures à reporter (prime, semaine plus légère), import du compteur existant, cas de déplacement forcé, droits RH · après-midi : COMMERCE — quantités fournisseur par la trame, mémoire en mode lecture, contrôle croisé classeur ↔ appli, et le chiffrage qui remplace le classeur (base de prix, paniers dépliés, Installations, récap, charge et équipes) · fin de matinée : lecture des pièces et points techniques · la nuit du 13/10 : le responsable d'un chantier y entre toujours (Sofiane) · le plan de Nantes Géraudière qui disparaissait au zoom (réparé + « Recentrer le repère ») · le soir : GRANDS DÉPLACEMENTS jour par jour (4 ou 5 jours = même forfait), le mois par gars avec nuits et repas accordés, la navette, les adresses à vérifier · FOURNITURE : zone éditable, trame type d'import, écarts « commande complémentaire / inclus », BL de zone → Stock · l'après-midi : COMMERCE v2 (dossier déballé, lecture des pièces avec surlignage, chiffrage complet d'après ton classeur du 26.08, paniers, base de prix, DPGF traduite et réécrite dans l'Excel du client, blocs du mémoire) · le matin : onglet FOURNITURE (commande, livré, reste, zones à livrer, camions datés) et tes retours de la feuille du 09-10 (adresses, détente automatique, contrôle des grands déplacements, plein écran, trame d'accueil) · puis la nuit du 12/10 : six onglets, Commerce, Parc, Sécurité, accidents, Outlook serveur · nouvelle ventilation, « agir comme », raccourci rapide du planning, « ma semaine », tes commentaires du Word (sections 5 à 9) · une colonne pour tes retours</w:t>
       </w:r>
     </w:p>
     <w:p>
@@ -65,7 +65,7 @@
           <w:sz w:val="20"/>
           <w:szCs w:val="20"/>
         </w:rPr>
-        <w:t xml:space="preserve">Même principe que la précédente : tu contrôles ligne par ligne, tu écris dans « Vos commentaires » (OK / à corriger / à changer : quoi), tu me renvoies le fichier. Je corrige à partir de tes commentaires, dans l'ordre du document. Commence par la section U (compteurs d'heures, heures à reporter, import du compteur existant, cas forcé, qui voit / qui modifie), puis T (Commerce : quantités fournisseur, mémoire, contrôle croisé, tes retours sur la lecture et les points techniques, le chiffrage qui remplace le classeur), puis S (lecture des pièces et points techniques), puis R (compteurs d'heures, « Moi » : ma navette, PDF du livret), puis Q (champs date, plafond 48 h, règles GD vérifiées), puis P (la navette de paie au format SCR), puis O (Nantes : la carte après le recentrage, et le contrôle des SQL), puis N (Sofiane et le chantier de Nantes) et M (Nantes Géraudière : le plan qui disparaît au zoom), puis L (grands déplacements et fourniture), puis K (Commerce v2 : dossier, lecture, chiffrage, DPGF, mémoire), puis I (l'onglet Fourniture), puis J (tes retours de la feuille du 09-10 : c'est la seule feuille à suivre désormais — l'ancienne n'est plus livrée), puis H (Commerce de A à Z), G (la nuit) et F (tes retours du 12/10 soir).</w:t>
+        <w:t xml:space="preserve">Même principe que la précédente : tu contrôles ligne par ligne, tu écris dans « Vos commentaires » (OK / à corriger / à changer : quoi), tu me renvoies le fichier. Je corrige à partir de tes commentaires, dans l'ordre du document. Commence par la section V (les quantitatifs lus tout seuls et le même écran d'import partout), puis U (compteurs d'heures, heures à reporter, import du compteur existant, cas forcé, qui voit / qui modifie), puis T (Commerce : quantités fournisseur, mémoire, contrôle croisé, tes retours sur la lecture et les points techniques, le chiffrage qui remplace le classeur), puis S (lecture des pièces et points techniques), puis R (compteurs d'heures, « Moi » : ma navette, PDF du livret), puis Q (champs date, plafond 48 h, règles GD vérifiées), puis P (la navette de paie au format SCR), puis O (Nantes : la carte après le recentrage, et le contrôle des SQL), puis N (Sofiane et le chantier de Nantes) et M (Nantes Géraudière : le plan qui disparaît au zoom), puis L (grands déplacements et fourniture), puis K (Commerce v2 : dossier, lecture, chiffrage, DPGF, mémoire), puis I (l'onglet Fourniture), puis J (tes retours de la feuille du 09-10 : c'est la seule feuille à suivre désormais — l'ancienne n'est plus livrée), puis H (Commerce de A à Z), G (la nuit) et F (tes retours du 12/10 soir).</w:t>
       </w:r>
     </w:p>
     <w:p>
@@ -84,7 +84,7 @@
           <w:sz w:val="20"/>
           <w:szCs w:val="20"/>
         </w:rPr>
-        <w:t xml:space="preserve">Build livré : 13/10/2026 · 20de40 (index.html + traceur.html à la racine du dépôt). SQL pour la section U : retours_13-10f.sql (contrats, compteurs, cas forcés : lus par le gérant, la direction, les RH, toi et la personne elle-même ; écrits par les RH et toi ; contient retours_13-10e.sql et 13-10d). SQL pour la section T : retours_13-10e.sql (la base de prix modifiable seulement avec le droit « Base de prix SCR : modifier ») — inclus dans 13-10f. SQL pour la section R : retours_13-10d.sql (compteurs d'heures) — inclus dans 13-10e. Pas de SQL pour les sections Q, P, O, N et M (le contrôle des SQL de la section O ne modifie rien). Tous les SQL sont passés (toi, 13/10 au soir) : ta base est à jour. Nouveau SQL du soir : retours_13-10c.sql (qualifications des écarts de fourniture réunies entre deux tablettes). SQL de l'après-midi : retours_13-10b.sql (base de prix et paniers : registres « prix » et « panier », lecture réservée à l'encadrement / bureau), blocs_memoire_scr.sql (ton mémoire O2410-10 découpé en 10 blocs réutilisables) (retours_13-10.sql de l'onglet Fourniture est inclus dans retours_13-10c.sql). SQL retours_12-10.sql et retours_12-10b.sql passés, fonction outlook-sync déployée et vérifiée par toi le 12/10 au soir (« ça fonctionne parfaitement »). Hors connexion, tout se teste avec les personnages de démo.</w:t>
+        <w:t xml:space="preserve">Build livré : 13/10/2026 · 947103 (index.html + traceur.html à la racine du dépôt). Pas de SQL pour la section V. SQL pour la section U : retours_13-10f.sql (contrats, compteurs, cas forcés : lus par le gérant, la direction, les RH, toi et la personne elle-même ; écrits par les RH et toi ; contient retours_13-10e.sql et 13-10d). SQL pour la section T : retours_13-10e.sql (la base de prix modifiable seulement avec le droit « Base de prix SCR : modifier ») — inclus dans 13-10f. SQL pour la section R : retours_13-10d.sql (compteurs d'heures) — inclus dans 13-10e. Pas de SQL pour les sections Q, P, O, N et M (le contrôle des SQL de la section O ne modifie rien). Tous les SQL sont passés (toi, 13/10 au soir) : ta base est à jour. Nouveau SQL du soir : retours_13-10c.sql (qualifications des écarts de fourniture réunies entre deux tablettes). SQL de l'après-midi : retours_13-10b.sql (base de prix et paniers : registres « prix » et « panier », lecture réservée à l'encadrement / bureau), blocs_memoire_scr.sql (ton mémoire O2410-10 découpé en 10 blocs réutilisables) (retours_13-10.sql de l'onglet Fourniture est inclus dans retours_13-10c.sql). SQL retours_12-10.sql et retours_12-10b.sql passés, fonction outlook-sync déployée et vérifiée par toi le 12/10 au soir (« ça fonctionne parfaitement »). Hors connexion, tout se teste avec les personnages de démo.</w:t>
       </w:r>
     </w:p>
     <w:p>
@@ -103,7 +103,7 @@
           <w:sz w:val="20"/>
           <w:szCs w:val="20"/>
         </w:rPr>
-        <w:t xml:space="preserve">Règle gardée : rien d'ancien n'est supprimé ; 65 suites de tests automatiques passent, dont celles de la section U (compteurs_test : le moteur des compteurs en Node ; e2e_compteurs réécrite ; e2e_compteurs2 : droits, import, export, cas forcé ; e2e_navette et e2e_acces recalées), celles de la section T (e2e_qsets, e2e_memoire2, e2e_ctrlcl, classeur_test, e2e_chiffrage3 ; e2e_lecture3 et e2e_points2 étendues), et e2e_resp (responsable du chantier = accès) et e2e_rebase (réseau à 1 985 km de l'origine : visible à 19,6 px/m, bandeau, recentrage, fils de nouveau justes au zoom) et les deux du soir : e2e_gdnav (4 jours = 5 nuitées / 10 repas / 15 €, « pas de détente » = 7 / 14 / 0 €, le mois de Julien, l'ajustement d'un jour, la navette CSV, novembre avec la Toussaint et un lundi non travaillé, les adresses à vérifier) et e2e_fourn2 (à la SOURIS réelle : tracer, glisser, insérer, retirer, annuler, reprendre et modifier un contour, boutons du plan ; trame copiée / téléchargée / collée ; écarts qualifiés et commande complémentaire ; BL de zone → Excel → Stock ; trame dans Stock ; classeur fournisseur avec la trame en 2e feuille), puis e2e_commerce2 (8 étapes : import du classeur, zone et table des DN, SST / purges / contrôles / hydraulique / panier libre, récap et base de prix, dossier déballé, lecture PDF avec surlignage, Word et points techniques, DPGF réécrite dans l'Excel) et deux de la veille : e2e_fourniture (11 points : commande collée, comparatif, pièces en plus, livré lu dans Stock, zone entourée au doigt, zone du phasage, camions datés, annonce et pointage dans Stock, droits, téléphone, lecteur de lignes PDF, zones qui se chevauchent) et e2e_retours13 (n° d'affaire, plein écran, repas, adresses, détente automatique sur 5 semaines, accords, vue par personne, CSV).</w:t>
+        <w:t xml:space="preserve">Règle gardée : rien d'ancien n'est supprimé ; 67 suites de tests automatiques passent, dont celles de la section V (lecteur_test : le lecteur en Node sur des copies fictives de chaque format ; e2e_import : commande Excel et livraison PDF lues toutes seules, une pièce corrigée, téléphone ; e2e_qsets étendue : PDF lu tout seul, pièce à classer, options, classeur + trame à moitié ; e2e_fourniture, e2e_fourn2, e2e_stock, e2e_stock2 recalées sur le nouvel écran ; e2e_compteurs sans CET), celles de la section U (compteurs_test : le moteur des compteurs en Node ; e2e_compteurs réécrite ; e2e_compteurs2 : droits, import, export, cas forcé ; e2e_navette et e2e_acces recalées), celles de la section T (e2e_qsets, e2e_memoire2, e2e_ctrlcl, classeur_test, e2e_chiffrage3 ; e2e_lecture3 et e2e_points2 étendues), et e2e_resp (responsable du chantier = accès) et e2e_rebase (réseau à 1 985 km de l'origine : visible à 19,6 px/m, bandeau, recentrage, fils de nouveau justes au zoom) et les deux du soir : e2e_gdnav (4 jours = 5 nuitées / 10 repas / 15 €, « pas de détente » = 7 / 14 / 0 €, le mois de Julien, l'ajustement d'un jour, la navette CSV, novembre avec la Toussaint et un lundi non travaillé, les adresses à vérifier) et e2e_fourn2 (à la SOURIS réelle : tracer, glisser, insérer, retirer, annuler, reprendre et modifier un contour, boutons du plan ; trame copiée / téléchargée / collée ; écarts qualifiés et commande complémentaire ; BL de zone → Excel → Stock ; trame dans Stock ; classeur fournisseur avec la trame en 2e feuille), puis e2e_commerce2 (8 étapes : import du classeur, zone et table des DN, SST / purges / contrôles / hydraulique / panier libre, récap et base de prix, dossier déballé, lecture PDF avec surlignage, Word et points techniques, DPGF réécrite dans l'Excel) et deux de la veille : e2e_fourniture (11 points : commande collée, comparatif, pièces en plus, livré lu dans Stock, zone entourée au doigt, zone du phasage, camions datés, annonce et pointage dans Stock, droits, téléphone, lecteur de lignes PDF, zones qui se chevauchent) et e2e_retours13 (n° d'affaire, plein écran, repas, adresses, détente automatique sur 5 semaines, accords, vue par personne, CSV).</w:t>
       </w:r>
     </w:p>
     <w:p>
@@ -12893,6 +12893,1685 @@
           <w:sz w:val="30"/>
           <w:szCs w:val="30"/>
         </w:rPr>
+        <w:t xml:space="preserve">V · Quantitatifs : le fichier du fournisseur lu tout seul, le même écran d'import pour l'étude, la commande et le BL (13/10 soir)</w:t>
+      </w:r>
+    </w:p>
+    <w:p>
+      <w:pPr>
+        <w:spacing w:after="80" w:line="264"/>
+      </w:pPr>
+      <w:r>
+        <w:rPr>
+          <w:rFonts w:ascii="Calibri" w:cs="Calibri" w:eastAsia="Calibri" w:hAnsi="Calibri"/>
+          <w:color w:val="6B6B66"/>
+          <w:sz w:val="20"/>
+          <w:szCs w:val="20"/>
+        </w:rPr>
+        <w:t xml:space="preserve">Ta question : « tu n'es pas capable d'ouvrir Excel, coller la trame, lancer le prompt… et je pose n'importe quel quantitatif ? » — l'appli ne pilote ni Excel ni Claude, mais elle lit maintenant elle-même le fichier du fournisseur. Réglé et vérifié sur tes 11 fichiers (gardés hors du dépôt) ; les tests automatiques utilisent des copies fictives.</w:t>
+      </w:r>
+    </w:p>
+    <w:tbl>
+      <w:tblPr>
+        <w:tblW w:type="dxa" w:w="15100"/>
+        <w:tblBorders>
+          <w:top w:val="single" w:color="auto" w:sz="4"/>
+          <w:left w:val="single" w:color="auto" w:sz="4"/>
+          <w:bottom w:val="single" w:color="auto" w:sz="4"/>
+          <w:right w:val="single" w:color="auto" w:sz="4"/>
+          <w:insideH w:val="single" w:color="auto" w:sz="4"/>
+          <w:insideV w:val="single" w:color="auto" w:sz="4"/>
+        </w:tblBorders>
+      </w:tblPr>
+      <w:tblGrid>
+        <w:gridCol w:w="2300"/>
+        <w:gridCol w:w="4100"/>
+        <w:gridCol w:w="3700"/>
+        <w:gridCol w:w="1300"/>
+        <w:gridCol w:w="3700"/>
+      </w:tblGrid>
+      <w:tr>
+        <w:trPr>
+          <w:tblHeader/>
+        </w:trPr>
+        <w:tc>
+          <w:tcPr>
+            <w:tcW w:type="dxa" w:w="2300"/>
+            <w:tcBorders>
+              <w:top w:val="single" w:color="D9D5CB" w:sz="4"/>
+              <w:left w:val="single" w:color="D9D5CB" w:sz="4"/>
+              <w:bottom w:val="single" w:color="D9D5CB" w:sz="4"/>
+              <w:right w:val="single" w:color="D9D5CB" w:sz="4"/>
+            </w:tcBorders>
+            <w:shd w:fill="14213D" w:color="auto" w:val="clear"/>
+            <w:tcMar>
+              <w:top w:type="dxa" w:w="60"/>
+              <w:left w:type="dxa" w:w="90"/>
+              <w:bottom w:type="dxa" w:w="60"/>
+              <w:right w:type="dxa" w:w="90"/>
+            </w:tcMar>
+            <w:vAlign w:val="top"/>
+          </w:tcPr>
+          <w:p>
+            <w:pPr>
+              <w:spacing w:after="80" w:line="264"/>
+            </w:pPr>
+            <w:r>
+              <w:rPr>
+                <w:rFonts w:ascii="Calibri" w:cs="Calibri" w:eastAsia="Calibri" w:hAnsi="Calibri"/>
+                <w:b/>
+                <w:bCs/>
+                <w:color w:val="FFFFFF"/>
+                <w:sz w:val="19"/>
+                <w:szCs w:val="19"/>
+              </w:rPr>
+              <w:t xml:space="preserve">Fonctionnalité</w:t>
+            </w:r>
+          </w:p>
+        </w:tc>
+        <w:tc>
+          <w:tcPr>
+            <w:tcW w:type="dxa" w:w="4100"/>
+            <w:tcBorders>
+              <w:top w:val="single" w:color="D9D5CB" w:sz="4"/>
+              <w:left w:val="single" w:color="D9D5CB" w:sz="4"/>
+              <w:bottom w:val="single" w:color="D9D5CB" w:sz="4"/>
+              <w:right w:val="single" w:color="D9D5CB" w:sz="4"/>
+            </w:tcBorders>
+            <w:shd w:fill="14213D" w:color="auto" w:val="clear"/>
+            <w:tcMar>
+              <w:top w:type="dxa" w:w="60"/>
+              <w:left w:type="dxa" w:w="90"/>
+              <w:bottom w:type="dxa" w:w="60"/>
+              <w:right w:type="dxa" w:w="90"/>
+            </w:tcMar>
+            <w:vAlign w:val="top"/>
+          </w:tcPr>
+          <w:p>
+            <w:pPr>
+              <w:spacing w:after="80" w:line="264"/>
+            </w:pPr>
+            <w:r>
+              <w:rPr>
+                <w:rFonts w:ascii="Calibri" w:cs="Calibri" w:eastAsia="Calibri" w:hAnsi="Calibri"/>
+                <w:b/>
+                <w:bCs/>
+                <w:color w:val="FFFFFF"/>
+                <w:sz w:val="19"/>
+                <w:szCs w:val="19"/>
+              </w:rPr>
+              <w:t xml:space="preserve">Où la trouver · comment tester</w:t>
+            </w:r>
+          </w:p>
+        </w:tc>
+        <w:tc>
+          <w:tcPr>
+            <w:tcW w:type="dxa" w:w="3700"/>
+            <w:tcBorders>
+              <w:top w:val="single" w:color="D9D5CB" w:sz="4"/>
+              <w:left w:val="single" w:color="D9D5CB" w:sz="4"/>
+              <w:bottom w:val="single" w:color="D9D5CB" w:sz="4"/>
+              <w:right w:val="single" w:color="D9D5CB" w:sz="4"/>
+            </w:tcBorders>
+            <w:shd w:fill="14213D" w:color="auto" w:val="clear"/>
+            <w:tcMar>
+              <w:top w:type="dxa" w:w="60"/>
+              <w:left w:type="dxa" w:w="90"/>
+              <w:bottom w:type="dxa" w:w="60"/>
+              <w:right w:type="dxa" w:w="90"/>
+            </w:tcMar>
+            <w:vAlign w:val="top"/>
+          </w:tcPr>
+          <w:p>
+            <w:pPr>
+              <w:spacing w:after="80" w:line="264"/>
+            </w:pPr>
+            <w:r>
+              <w:rPr>
+                <w:rFonts w:ascii="Calibri" w:cs="Calibri" w:eastAsia="Calibri" w:hAnsi="Calibri"/>
+                <w:b/>
+                <w:bCs/>
+                <w:color w:val="FFFFFF"/>
+                <w:sz w:val="19"/>
+                <w:szCs w:val="19"/>
+              </w:rPr>
+              <w:t xml:space="preserve">Hypothèses · limites · ce que j'ai tranché</w:t>
+            </w:r>
+          </w:p>
+        </w:tc>
+        <w:tc>
+          <w:tcPr>
+            <w:tcW w:type="dxa" w:w="1300"/>
+            <w:tcBorders>
+              <w:top w:val="single" w:color="D9D5CB" w:sz="4"/>
+              <w:left w:val="single" w:color="D9D5CB" w:sz="4"/>
+              <w:bottom w:val="single" w:color="D9D5CB" w:sz="4"/>
+              <w:right w:val="single" w:color="D9D5CB" w:sz="4"/>
+            </w:tcBorders>
+            <w:shd w:fill="14213D" w:color="auto" w:val="clear"/>
+            <w:tcMar>
+              <w:top w:type="dxa" w:w="60"/>
+              <w:left w:type="dxa" w:w="90"/>
+              <w:bottom w:type="dxa" w:w="60"/>
+              <w:right w:type="dxa" w:w="90"/>
+            </w:tcMar>
+            <w:vAlign w:val="top"/>
+          </w:tcPr>
+          <w:p>
+            <w:pPr>
+              <w:spacing w:after="80" w:line="264"/>
+            </w:pPr>
+            <w:r>
+              <w:rPr>
+                <w:rFonts w:ascii="Calibri" w:cs="Calibri" w:eastAsia="Calibri" w:hAnsi="Calibri"/>
+                <w:b/>
+                <w:bCs/>
+                <w:color w:val="FFFFFF"/>
+                <w:sz w:val="19"/>
+                <w:szCs w:val="19"/>
+              </w:rPr>
+              <w:t xml:space="preserve">Statut</w:t>
+            </w:r>
+          </w:p>
+        </w:tc>
+        <w:tc>
+          <w:tcPr>
+            <w:tcW w:type="dxa" w:w="3700"/>
+            <w:tcBorders>
+              <w:top w:val="single" w:color="D9D5CB" w:sz="4"/>
+              <w:left w:val="single" w:color="D9D5CB" w:sz="4"/>
+              <w:bottom w:val="single" w:color="D9D5CB" w:sz="4"/>
+              <w:right w:val="single" w:color="D9D5CB" w:sz="4"/>
+            </w:tcBorders>
+            <w:shd w:fill="14213D" w:color="auto" w:val="clear"/>
+            <w:tcMar>
+              <w:top w:type="dxa" w:w="60"/>
+              <w:left w:type="dxa" w:w="90"/>
+              <w:bottom w:type="dxa" w:w="60"/>
+              <w:right w:type="dxa" w:w="90"/>
+            </w:tcMar>
+            <w:vAlign w:val="top"/>
+          </w:tcPr>
+          <w:p>
+            <w:pPr>
+              <w:spacing w:after="80" w:line="264"/>
+            </w:pPr>
+            <w:r>
+              <w:rPr>
+                <w:rFonts w:ascii="Calibri" w:cs="Calibri" w:eastAsia="Calibri" w:hAnsi="Calibri"/>
+                <w:b/>
+                <w:bCs/>
+                <w:color w:val="FFFFFF"/>
+                <w:sz w:val="19"/>
+                <w:szCs w:val="19"/>
+              </w:rPr>
+              <w:t xml:space="preserve">Vos commentaires</w:t>
+            </w:r>
+          </w:p>
+        </w:tc>
+      </w:tr>
+      <w:tr>
+        <w:tc>
+          <w:tcPr>
+            <w:tcW w:type="dxa" w:w="2300"/>
+            <w:tcBorders>
+              <w:top w:val="single" w:color="D9D5CB" w:sz="4"/>
+              <w:left w:val="single" w:color="D9D5CB" w:sz="4"/>
+              <w:bottom w:val="single" w:color="D9D5CB" w:sz="4"/>
+              <w:right w:val="single" w:color="D9D5CB" w:sz="4"/>
+            </w:tcBorders>
+            <w:tcMar>
+              <w:top w:type="dxa" w:w="60"/>
+              <w:left w:type="dxa" w:w="90"/>
+              <w:bottom w:type="dxa" w:w="60"/>
+              <w:right w:type="dxa" w:w="90"/>
+            </w:tcMar>
+            <w:vAlign w:val="top"/>
+          </w:tcPr>
+          <w:p>
+            <w:pPr>
+              <w:spacing w:after="40"/>
+            </w:pPr>
+            <w:r>
+              <w:rPr>
+                <w:rFonts w:ascii="Calibri" w:cs="Calibri" w:eastAsia="Calibri" w:hAnsi="Calibri"/>
+                <w:b/>
+                <w:bCs/>
+                <w:color w:val="14213D"/>
+                <w:sz w:val="20"/>
+                <w:szCs w:val="20"/>
+              </w:rPr>
+              <w:t xml:space="preserve">Le fichier du fournisseur lu tout seul</w:t>
+            </w:r>
+          </w:p>
+        </w:tc>
+        <w:tc>
+          <w:tcPr>
+            <w:tcW w:type="dxa" w:w="4100"/>
+            <w:tcBorders>
+              <w:top w:val="single" w:color="D9D5CB" w:sz="4"/>
+              <w:left w:val="single" w:color="D9D5CB" w:sz="4"/>
+              <w:bottom w:val="single" w:color="D9D5CB" w:sz="4"/>
+              <w:right w:val="single" w:color="D9D5CB" w:sz="4"/>
+            </w:tcBorders>
+            <w:tcMar>
+              <w:top w:type="dxa" w:w="60"/>
+              <w:left w:type="dxa" w:w="90"/>
+              <w:bottom w:type="dxa" w:w="60"/>
+              <w:right w:type="dxa" w:w="90"/>
+            </w:tcMar>
+            <w:vAlign w:val="top"/>
+          </w:tcPr>
+          <w:p>
+            <w:pPr>
+              <w:spacing w:after="40"/>
+            </w:pPr>
+            <w:r>
+              <w:rPr>
+                <w:rFonts w:ascii="Calibri" w:cs="Calibri" w:eastAsia="Calibri" w:hAnsi="Calibri"/>
+                <w:color w:val="14213D"/>
+                <w:sz w:val="19"/>
+                <w:szCs w:val="19"/>
+              </w:rPr>
+              <w:t xml:space="preserve">Commerce → une affaire → 2 · Lecture → Quantités → 📥 Importer une étude fournisseur → 📄 Fichier du fournisseur : dépose l'Excel ou le PDF tel que tu l'as reçu (quantitatif, devis). L'appli reconnaît le fournisseur, lit chaque pièce (type, DN acier, angle réel, longueur, quantité) et affiche la synthèse par DN. Le nom de l'étude se met tout seul (« LOGSTOR — nom du fichier »), modifiable.</w:t>
+            </w:r>
+          </w:p>
+        </w:tc>
+        <w:tc>
+          <w:tcPr>
+            <w:tcW w:type="dxa" w:w="3700"/>
+            <w:tcBorders>
+              <w:top w:val="single" w:color="D9D5CB" w:sz="4"/>
+              <w:left w:val="single" w:color="D9D5CB" w:sz="4"/>
+              <w:bottom w:val="single" w:color="D9D5CB" w:sz="4"/>
+              <w:right w:val="single" w:color="D9D5CB" w:sz="4"/>
+            </w:tcBorders>
+            <w:tcMar>
+              <w:top w:type="dxa" w:w="60"/>
+              <w:left w:type="dxa" w:w="90"/>
+              <w:bottom w:type="dxa" w:w="60"/>
+              <w:right w:type="dxa" w:w="90"/>
+            </w:tcMar>
+            <w:vAlign w:val="top"/>
+          </w:tcPr>
+          <w:p>
+            <w:pPr>
+              <w:spacing w:after="40"/>
+            </w:pPr>
+            <w:r>
+              <w:rPr>
+                <w:rFonts w:ascii="Calibri" w:cs="Calibri" w:eastAsia="Calibri" w:hAnsi="Calibri"/>
+                <w:color w:val="14213D"/>
+                <w:sz w:val="19"/>
+                <w:szCs w:val="19"/>
+              </w:rPr>
+              <w:t xml:space="preserve">Une trame SCR remplie dans le classeur passe en priorité si elle est propre ; si elle a des lignes refusées (comme la feuille remplie par Claude dans ton fichier AXIOM), la lecture du tableau du fournisseur passe devant et la trame reste proposée (↔ pour basculer). PDF scanné (photo) : rien à lire — demande l'Excel.</w:t>
+            </w:r>
+          </w:p>
+        </w:tc>
+        <w:tc>
+          <w:tcPr>
+            <w:tcW w:type="dxa" w:w="1300"/>
+            <w:tcBorders>
+              <w:top w:val="single" w:color="D9D5CB" w:sz="4"/>
+              <w:left w:val="single" w:color="D9D5CB" w:sz="4"/>
+              <w:bottom w:val="single" w:color="D9D5CB" w:sz="4"/>
+              <w:right w:val="single" w:color="D9D5CB" w:sz="4"/>
+            </w:tcBorders>
+            <w:shd w:fill="E6F5EC" w:color="auto" w:val="clear"/>
+            <w:tcMar>
+              <w:top w:type="dxa" w:w="60"/>
+              <w:left w:type="dxa" w:w="90"/>
+              <w:bottom w:type="dxa" w:w="60"/>
+              <w:right w:type="dxa" w:w="90"/>
+            </w:tcMar>
+            <w:vAlign w:val="top"/>
+          </w:tcPr>
+          <w:p>
+            <w:pPr>
+              <w:spacing w:after="40"/>
+            </w:pPr>
+            <w:r>
+              <w:rPr>
+                <w:rFonts w:ascii="Calibri" w:cs="Calibri" w:eastAsia="Calibri" w:hAnsi="Calibri"/>
+                <w:b/>
+                <w:bCs/>
+                <w:color w:val="14213D"/>
+                <w:sz w:val="19"/>
+                <w:szCs w:val="19"/>
+              </w:rPr>
+              <w:t xml:space="preserve">Fait</w:t>
+            </w:r>
+          </w:p>
+        </w:tc>
+        <w:tc>
+          <w:tcPr>
+            <w:tcW w:type="dxa" w:w="3700"/>
+            <w:tcBorders>
+              <w:top w:val="single" w:color="D9D5CB" w:sz="4"/>
+              <w:left w:val="single" w:color="D9D5CB" w:sz="4"/>
+              <w:bottom w:val="single" w:color="D9D5CB" w:sz="4"/>
+              <w:right w:val="single" w:color="D9D5CB" w:sz="4"/>
+            </w:tcBorders>
+            <w:tcMar>
+              <w:top w:type="dxa" w:w="60"/>
+              <w:left w:type="dxa" w:w="90"/>
+              <w:bottom w:type="dxa" w:w="60"/>
+              <w:right w:type="dxa" w:w="90"/>
+            </w:tcMar>
+            <w:vAlign w:val="top"/>
+          </w:tcPr>
+          <w:p>
+            <w:pPr>
+              <w:spacing w:after="40"/>
+            </w:pPr>
+            <w:r>
+              <w:rPr>
+                <w:rFonts w:ascii="Calibri" w:cs="Calibri" w:eastAsia="Calibri" w:hAnsi="Calibri"/>
+                <w:color w:val="14213D"/>
+                <w:sz w:val="20"/>
+                <w:szCs w:val="20"/>
+              </w:rPr>
+              <w:t xml:space="preserve"/>
+            </w:r>
+          </w:p>
+          <w:p>
+            <w:pPr>
+              <w:spacing w:after="40"/>
+            </w:pPr>
+            <w:r>
+              <w:rPr>
+                <w:rFonts w:ascii="Calibri" w:cs="Calibri" w:eastAsia="Calibri" w:hAnsi="Calibri"/>
+                <w:color w:val="14213D"/>
+                <w:sz w:val="20"/>
+                <w:szCs w:val="20"/>
+              </w:rPr>
+              <w:t xml:space="preserve"/>
+            </w:r>
+          </w:p>
+        </w:tc>
+      </w:tr>
+      <w:tr>
+        <w:tc>
+          <w:tcPr>
+            <w:tcW w:type="dxa" w:w="2300"/>
+            <w:tcBorders>
+              <w:top w:val="single" w:color="D9D5CB" w:sz="4"/>
+              <w:left w:val="single" w:color="D9D5CB" w:sz="4"/>
+              <w:bottom w:val="single" w:color="D9D5CB" w:sz="4"/>
+              <w:right w:val="single" w:color="D9D5CB" w:sz="4"/>
+            </w:tcBorders>
+            <w:tcMar>
+              <w:top w:type="dxa" w:w="60"/>
+              <w:left w:type="dxa" w:w="90"/>
+              <w:bottom w:type="dxa" w:w="60"/>
+              <w:right w:type="dxa" w:w="90"/>
+            </w:tcMar>
+            <w:vAlign w:val="top"/>
+          </w:tcPr>
+          <w:p>
+            <w:pPr>
+              <w:spacing w:after="40"/>
+            </w:pPr>
+            <w:r>
+              <w:rPr>
+                <w:rFonts w:ascii="Calibri" w:cs="Calibri" w:eastAsia="Calibri" w:hAnsi="Calibri"/>
+                <w:b/>
+                <w:bCs/>
+                <w:color w:val="14213D"/>
+                <w:sz w:val="20"/>
+                <w:szCs w:val="20"/>
+              </w:rPr>
+              <w:t xml:space="preserve">Réglé sur tes 11 fichiers</w:t>
+            </w:r>
+          </w:p>
+        </w:tc>
+        <w:tc>
+          <w:tcPr>
+            <w:tcW w:type="dxa" w:w="4100"/>
+            <w:tcBorders>
+              <w:top w:val="single" w:color="D9D5CB" w:sz="4"/>
+              <w:left w:val="single" w:color="D9D5CB" w:sz="4"/>
+              <w:bottom w:val="single" w:color="D9D5CB" w:sz="4"/>
+              <w:right w:val="single" w:color="D9D5CB" w:sz="4"/>
+            </w:tcBorders>
+            <w:tcMar>
+              <w:top w:type="dxa" w:w="60"/>
+              <w:left w:type="dxa" w:w="90"/>
+              <w:bottom w:type="dxa" w:w="60"/>
+              <w:right w:type="dxa" w:w="90"/>
+            </w:tcMar>
+            <w:vAlign w:val="top"/>
+          </w:tcPr>
+          <w:p>
+            <w:pPr>
+              <w:spacing w:after="40"/>
+            </w:pPr>
+            <w:r>
+              <w:rPr>
+                <w:rFonts w:ascii="Calibri" w:cs="Calibri" w:eastAsia="Calibri" w:hAnsi="Calibri"/>
+                <w:color w:val="14213D"/>
+                <w:sz w:val="19"/>
+                <w:szCs w:val="19"/>
+              </w:rPr>
+              <w:t xml:space="preserve">INPAL et isoplus (PDF) : sections DN, kits de jonction + manchettes, kit réduit, kit fin de ligne, té à saut, coudes « XX&gt;45° », options (cales, grillage, variante DN65) mises à part, pouces de soudure et linéaire annoncés repris pour contrôle. LOGSTOR (Excel ET PDF : mêmes 154 lignes, mêmes totaux) : familles, séries 2 et 3, manchon EW complet, jonctions réduites avec leur réduction acier, coiffes, joints labyrinthe, conditions générales ignorées. AXIOM : une feuille par DN, colonne TOTAL, tous les codes (R, K, TW, TP, Z, NT, NK, E, P, ZKODPI, EL…) — 98 lignes, là où la trame remplie par Claude en avait 84 + 14 refusées. Renalia : 493 lignes, comme ta trame, avec les vrais angles (45, 55, 60, 75°) au lieu de 90°. BRUGG : la pièce, le transport ignoré.</w:t>
+            </w:r>
+          </w:p>
+        </w:tc>
+        <w:tc>
+          <w:tcPr>
+            <w:tcW w:type="dxa" w:w="3700"/>
+            <w:tcBorders>
+              <w:top w:val="single" w:color="D9D5CB" w:sz="4"/>
+              <w:left w:val="single" w:color="D9D5CB" w:sz="4"/>
+              <w:bottom w:val="single" w:color="D9D5CB" w:sz="4"/>
+              <w:right w:val="single" w:color="D9D5CB" w:sz="4"/>
+            </w:tcBorders>
+            <w:tcMar>
+              <w:top w:type="dxa" w:w="60"/>
+              <w:left w:type="dxa" w:w="90"/>
+              <w:bottom w:type="dxa" w:w="60"/>
+              <w:right w:type="dxa" w:w="90"/>
+            </w:tcMar>
+            <w:vAlign w:val="top"/>
+          </w:tcPr>
+          <w:p>
+            <w:pPr>
+              <w:spacing w:after="40"/>
+            </w:pPr>
+            <w:r>
+              <w:rPr>
+                <w:rFonts w:ascii="Calibri" w:cs="Calibri" w:eastAsia="Calibri" w:hAnsi="Calibri"/>
+                <w:color w:val="14213D"/>
+                <w:sz w:val="19"/>
+                <w:szCs w:val="19"/>
+              </w:rPr>
+              <w:t xml:space="preserve">Toutes les lignes avec un code article sont retrouvées (lues, en option ou ignorées avec leur raison) ; 0 ligne « à classer » sur les 11. Quand un fournisseur écrit une incohérence (ex. INPAL : kit de jonction 42,4 x 125 dans une section DN50), l'appli recopie ce qui est écrit.</w:t>
+            </w:r>
+          </w:p>
+        </w:tc>
+        <w:tc>
+          <w:tcPr>
+            <w:tcW w:type="dxa" w:w="1300"/>
+            <w:tcBorders>
+              <w:top w:val="single" w:color="D9D5CB" w:sz="4"/>
+              <w:left w:val="single" w:color="D9D5CB" w:sz="4"/>
+              <w:bottom w:val="single" w:color="D9D5CB" w:sz="4"/>
+              <w:right w:val="single" w:color="D9D5CB" w:sz="4"/>
+            </w:tcBorders>
+            <w:shd w:fill="E6F5EC" w:color="auto" w:val="clear"/>
+            <w:tcMar>
+              <w:top w:type="dxa" w:w="60"/>
+              <w:left w:type="dxa" w:w="90"/>
+              <w:bottom w:type="dxa" w:w="60"/>
+              <w:right w:type="dxa" w:w="90"/>
+            </w:tcMar>
+            <w:vAlign w:val="top"/>
+          </w:tcPr>
+          <w:p>
+            <w:pPr>
+              <w:spacing w:after="40"/>
+            </w:pPr>
+            <w:r>
+              <w:rPr>
+                <w:rFonts w:ascii="Calibri" w:cs="Calibri" w:eastAsia="Calibri" w:hAnsi="Calibri"/>
+                <w:b/>
+                <w:bCs/>
+                <w:color w:val="14213D"/>
+                <w:sz w:val="19"/>
+                <w:szCs w:val="19"/>
+              </w:rPr>
+              <w:t xml:space="preserve">Fait</w:t>
+            </w:r>
+          </w:p>
+        </w:tc>
+        <w:tc>
+          <w:tcPr>
+            <w:tcW w:type="dxa" w:w="3700"/>
+            <w:tcBorders>
+              <w:top w:val="single" w:color="D9D5CB" w:sz="4"/>
+              <w:left w:val="single" w:color="D9D5CB" w:sz="4"/>
+              <w:bottom w:val="single" w:color="D9D5CB" w:sz="4"/>
+              <w:right w:val="single" w:color="D9D5CB" w:sz="4"/>
+            </w:tcBorders>
+            <w:tcMar>
+              <w:top w:type="dxa" w:w="60"/>
+              <w:left w:type="dxa" w:w="90"/>
+              <w:bottom w:type="dxa" w:w="60"/>
+              <w:right w:type="dxa" w:w="90"/>
+            </w:tcMar>
+            <w:vAlign w:val="top"/>
+          </w:tcPr>
+          <w:p>
+            <w:pPr>
+              <w:spacing w:after="40"/>
+            </w:pPr>
+            <w:r>
+              <w:rPr>
+                <w:rFonts w:ascii="Calibri" w:cs="Calibri" w:eastAsia="Calibri" w:hAnsi="Calibri"/>
+                <w:color w:val="14213D"/>
+                <w:sz w:val="20"/>
+                <w:szCs w:val="20"/>
+              </w:rPr>
+              <w:t xml:space="preserve"/>
+            </w:r>
+          </w:p>
+          <w:p>
+            <w:pPr>
+              <w:spacing w:after="40"/>
+            </w:pPr>
+            <w:r>
+              <w:rPr>
+                <w:rFonts w:ascii="Calibri" w:cs="Calibri" w:eastAsia="Calibri" w:hAnsi="Calibri"/>
+                <w:color w:val="14213D"/>
+                <w:sz w:val="20"/>
+                <w:szCs w:val="20"/>
+              </w:rPr>
+              <w:t xml:space="preserve"/>
+            </w:r>
+          </w:p>
+        </w:tc>
+      </w:tr>
+      <w:tr>
+        <w:tc>
+          <w:tcPr>
+            <w:tcW w:type="dxa" w:w="2300"/>
+            <w:tcBorders>
+              <w:top w:val="single" w:color="D9D5CB" w:sz="4"/>
+              <w:left w:val="single" w:color="D9D5CB" w:sz="4"/>
+              <w:bottom w:val="single" w:color="D9D5CB" w:sz="4"/>
+              <w:right w:val="single" w:color="D9D5CB" w:sz="4"/>
+            </w:tcBorders>
+            <w:tcMar>
+              <w:top w:type="dxa" w:w="60"/>
+              <w:left w:type="dxa" w:w="90"/>
+              <w:bottom w:type="dxa" w:w="60"/>
+              <w:right w:type="dxa" w:w="90"/>
+            </w:tcMar>
+            <w:vAlign w:val="top"/>
+          </w:tcPr>
+          <w:p>
+            <w:pPr>
+              <w:spacing w:after="40"/>
+            </w:pPr>
+            <w:r>
+              <w:rPr>
+                <w:rFonts w:ascii="Calibri" w:cs="Calibri" w:eastAsia="Calibri" w:hAnsi="Calibri"/>
+                <w:b/>
+                <w:bCs/>
+                <w:color w:val="14213D"/>
+                <w:sz w:val="20"/>
+                <w:szCs w:val="20"/>
+              </w:rPr>
+              <w:t xml:space="preserve">Réductions et kits fin de ligne dans la synthèse</w:t>
+            </w:r>
+          </w:p>
+        </w:tc>
+        <w:tc>
+          <w:tcPr>
+            <w:tcW w:type="dxa" w:w="4100"/>
+            <w:tcBorders>
+              <w:top w:val="single" w:color="D9D5CB" w:sz="4"/>
+              <w:left w:val="single" w:color="D9D5CB" w:sz="4"/>
+              <w:bottom w:val="single" w:color="D9D5CB" w:sz="4"/>
+              <w:right w:val="single" w:color="D9D5CB" w:sz="4"/>
+            </w:tcBorders>
+            <w:tcMar>
+              <w:top w:type="dxa" w:w="60"/>
+              <w:left w:type="dxa" w:w="90"/>
+              <w:bottom w:type="dxa" w:w="60"/>
+              <w:right w:type="dxa" w:w="90"/>
+            </w:tcMar>
+            <w:vAlign w:val="top"/>
+          </w:tcPr>
+          <w:p>
+            <w:pPr>
+              <w:spacing w:after="40"/>
+            </w:pPr>
+            <w:r>
+              <w:rPr>
+                <w:rFonts w:ascii="Calibri" w:cs="Calibri" w:eastAsia="Calibri" w:hAnsi="Calibri"/>
+                <w:color w:val="14213D"/>
+                <w:sz w:val="19"/>
+                <w:szCs w:val="19"/>
+              </w:rPr>
+              <w:t xml:space="preserve">La synthèse (fenêtre d'import et carte de l'étude) : barres, ml de tube, ml de tranchée, soudures, coudes, tés, piquages, RÉDUCTIONS, vannes, KITS FIN DE LIGNE, et DHEC / passages de mur quand il y en a.</w:t>
+            </w:r>
+          </w:p>
+        </w:tc>
+        <w:tc>
+          <w:tcPr>
+            <w:tcW w:type="dxa" w:w="3700"/>
+            <w:tcBorders>
+              <w:top w:val="single" w:color="D9D5CB" w:sz="4"/>
+              <w:left w:val="single" w:color="D9D5CB" w:sz="4"/>
+              <w:bottom w:val="single" w:color="D9D5CB" w:sz="4"/>
+              <w:right w:val="single" w:color="D9D5CB" w:sz="4"/>
+            </w:tcBorders>
+            <w:tcMar>
+              <w:top w:type="dxa" w:w="60"/>
+              <w:left w:type="dxa" w:w="90"/>
+              <w:bottom w:type="dxa" w:w="60"/>
+              <w:right w:type="dxa" w:w="90"/>
+            </w:tcMar>
+            <w:vAlign w:val="top"/>
+          </w:tcPr>
+          <w:p>
+            <w:pPr>
+              <w:spacing w:after="40"/>
+            </w:pPr>
+            <w:r>
+              <w:rPr>
+                <w:rFonts w:ascii="Calibri" w:cs="Calibri" w:eastAsia="Calibri" w:hAnsi="Calibri"/>
+                <w:color w:val="14213D"/>
+                <w:sz w:val="19"/>
+                <w:szCs w:val="19"/>
+              </w:rPr>
+              <w:t xml:space="preserve">Soudures = manchons ; une réduction acier soudée DANS un manchon réduit (kit réduit INPAL, Reduktion St LOGSTOR) = 2 soudures pour 1 manchon (+1 au petit DN) ; une courbe acier dans un manchon = +1 ; un té fait sur place (kit té INPAL) : la conduite n'est pas coupée, +1 au piquage.</w:t>
+            </w:r>
+          </w:p>
+        </w:tc>
+        <w:tc>
+          <w:tcPr>
+            <w:tcW w:type="dxa" w:w="1300"/>
+            <w:tcBorders>
+              <w:top w:val="single" w:color="D9D5CB" w:sz="4"/>
+              <w:left w:val="single" w:color="D9D5CB" w:sz="4"/>
+              <w:bottom w:val="single" w:color="D9D5CB" w:sz="4"/>
+              <w:right w:val="single" w:color="D9D5CB" w:sz="4"/>
+            </w:tcBorders>
+            <w:shd w:fill="E6F5EC" w:color="auto" w:val="clear"/>
+            <w:tcMar>
+              <w:top w:type="dxa" w:w="60"/>
+              <w:left w:type="dxa" w:w="90"/>
+              <w:bottom w:type="dxa" w:w="60"/>
+              <w:right w:type="dxa" w:w="90"/>
+            </w:tcMar>
+            <w:vAlign w:val="top"/>
+          </w:tcPr>
+          <w:p>
+            <w:pPr>
+              <w:spacing w:after="40"/>
+            </w:pPr>
+            <w:r>
+              <w:rPr>
+                <w:rFonts w:ascii="Calibri" w:cs="Calibri" w:eastAsia="Calibri" w:hAnsi="Calibri"/>
+                <w:b/>
+                <w:bCs/>
+                <w:color w:val="14213D"/>
+                <w:sz w:val="19"/>
+                <w:szCs w:val="19"/>
+              </w:rPr>
+              <w:t xml:space="preserve">Fait</w:t>
+            </w:r>
+          </w:p>
+        </w:tc>
+        <w:tc>
+          <w:tcPr>
+            <w:tcW w:type="dxa" w:w="3700"/>
+            <w:tcBorders>
+              <w:top w:val="single" w:color="D9D5CB" w:sz="4"/>
+              <w:left w:val="single" w:color="D9D5CB" w:sz="4"/>
+              <w:bottom w:val="single" w:color="D9D5CB" w:sz="4"/>
+              <w:right w:val="single" w:color="D9D5CB" w:sz="4"/>
+            </w:tcBorders>
+            <w:tcMar>
+              <w:top w:type="dxa" w:w="60"/>
+              <w:left w:type="dxa" w:w="90"/>
+              <w:bottom w:type="dxa" w:w="60"/>
+              <w:right w:type="dxa" w:w="90"/>
+            </w:tcMar>
+            <w:vAlign w:val="top"/>
+          </w:tcPr>
+          <w:p>
+            <w:pPr>
+              <w:spacing w:after="40"/>
+            </w:pPr>
+            <w:r>
+              <w:rPr>
+                <w:rFonts w:ascii="Calibri" w:cs="Calibri" w:eastAsia="Calibri" w:hAnsi="Calibri"/>
+                <w:color w:val="14213D"/>
+                <w:sz w:val="20"/>
+                <w:szCs w:val="20"/>
+              </w:rPr>
+              <w:t xml:space="preserve"/>
+            </w:r>
+          </w:p>
+          <w:p>
+            <w:pPr>
+              <w:spacing w:after="40"/>
+            </w:pPr>
+            <w:r>
+              <w:rPr>
+                <w:rFonts w:ascii="Calibri" w:cs="Calibri" w:eastAsia="Calibri" w:hAnsi="Calibri"/>
+                <w:color w:val="14213D"/>
+                <w:sz w:val="20"/>
+                <w:szCs w:val="20"/>
+              </w:rPr>
+              <w:t xml:space="preserve"/>
+            </w:r>
+          </w:p>
+        </w:tc>
+      </w:tr>
+      <w:tr>
+        <w:tc>
+          <w:tcPr>
+            <w:tcW w:type="dxa" w:w="2300"/>
+            <w:tcBorders>
+              <w:top w:val="single" w:color="D9D5CB" w:sz="4"/>
+              <w:left w:val="single" w:color="D9D5CB" w:sz="4"/>
+              <w:bottom w:val="single" w:color="D9D5CB" w:sz="4"/>
+              <w:right w:val="single" w:color="D9D5CB" w:sz="4"/>
+            </w:tcBorders>
+            <w:tcMar>
+              <w:top w:type="dxa" w:w="60"/>
+              <w:left w:type="dxa" w:w="90"/>
+              <w:bottom w:type="dxa" w:w="60"/>
+              <w:right w:type="dxa" w:w="90"/>
+            </w:tcMar>
+            <w:vAlign w:val="top"/>
+          </w:tcPr>
+          <w:p>
+            <w:pPr>
+              <w:spacing w:after="40"/>
+            </w:pPr>
+            <w:r>
+              <w:rPr>
+                <w:rFonts w:ascii="Calibri" w:cs="Calibri" w:eastAsia="Calibri" w:hAnsi="Calibri"/>
+                <w:b/>
+                <w:bCs/>
+                <w:color w:val="14213D"/>
+                <w:sz w:val="20"/>
+                <w:szCs w:val="20"/>
+              </w:rPr>
+              <w:t xml:space="preserve">Le même écran pour la commande et le BL</w:t>
+            </w:r>
+          </w:p>
+        </w:tc>
+        <w:tc>
+          <w:tcPr>
+            <w:tcW w:type="dxa" w:w="4100"/>
+            <w:tcBorders>
+              <w:top w:val="single" w:color="D9D5CB" w:sz="4"/>
+              <w:left w:val="single" w:color="D9D5CB" w:sz="4"/>
+              <w:bottom w:val="single" w:color="D9D5CB" w:sz="4"/>
+              <w:right w:val="single" w:color="D9D5CB" w:sz="4"/>
+            </w:tcBorders>
+            <w:tcMar>
+              <w:top w:type="dxa" w:w="60"/>
+              <w:left w:type="dxa" w:w="90"/>
+              <w:bottom w:type="dxa" w:w="60"/>
+              <w:right w:type="dxa" w:w="90"/>
+            </w:tcMar>
+            <w:vAlign w:val="top"/>
+          </w:tcPr>
+          <w:p>
+            <w:pPr>
+              <w:spacing w:after="40"/>
+            </w:pPr>
+            <w:r>
+              <w:rPr>
+                <w:rFonts w:ascii="Calibri" w:cs="Calibri" w:eastAsia="Calibri" w:hAnsi="Calibri"/>
+                <w:color w:val="14213D"/>
+                <w:sz w:val="19"/>
+                <w:szCs w:val="19"/>
+              </w:rPr>
+              <w:t xml:space="preserve">Fourniture → Importer une commande : 📄 Fichier · 📋 Coller · ✍ Saisir. Stock → Nouvelle livraison : 📄 BL / fichier · 📋 Coller · ✍ Catalogue · Depuis le calepinage. Même lecture, même synthèse, mêmes lignes que l'étude fournisseur.</w:t>
+            </w:r>
+          </w:p>
+        </w:tc>
+        <w:tc>
+          <w:tcPr>
+            <w:tcW w:type="dxa" w:w="3700"/>
+            <w:tcBorders>
+              <w:top w:val="single" w:color="D9D5CB" w:sz="4"/>
+              <w:left w:val="single" w:color="D9D5CB" w:sz="4"/>
+              <w:bottom w:val="single" w:color="D9D5CB" w:sz="4"/>
+              <w:right w:val="single" w:color="D9D5CB" w:sz="4"/>
+            </w:tcBorders>
+            <w:tcMar>
+              <w:top w:type="dxa" w:w="60"/>
+              <w:left w:type="dxa" w:w="90"/>
+              <w:bottom w:type="dxa" w:w="60"/>
+              <w:right w:type="dxa" w:w="90"/>
+            </w:tcMar>
+            <w:vAlign w:val="top"/>
+          </w:tcPr>
+          <w:p>
+            <w:pPr>
+              <w:spacing w:after="40"/>
+            </w:pPr>
+            <w:r>
+              <w:rPr>
+                <w:rFonts w:ascii="Calibri" w:cs="Calibri" w:eastAsia="Calibri" w:hAnsi="Calibri"/>
+                <w:color w:val="14213D"/>
+                <w:sz w:val="19"/>
+                <w:szCs w:val="19"/>
+              </w:rPr>
+              <w:t xml:space="preserve">BL PDF AXIOM / Renalia / LOGSTOR : leur lecteur dédié passe d'abord (inchangé), sinon la lecture automatique. Rien d'autre ne change : prévu / déchargé, zone, classement du BL au dossier administratif, mousse ajoutée avec le manchon au catalogue, n° de commande, date.</w:t>
+            </w:r>
+          </w:p>
+        </w:tc>
+        <w:tc>
+          <w:tcPr>
+            <w:tcW w:type="dxa" w:w="1300"/>
+            <w:tcBorders>
+              <w:top w:val="single" w:color="D9D5CB" w:sz="4"/>
+              <w:left w:val="single" w:color="D9D5CB" w:sz="4"/>
+              <w:bottom w:val="single" w:color="D9D5CB" w:sz="4"/>
+              <w:right w:val="single" w:color="D9D5CB" w:sz="4"/>
+            </w:tcBorders>
+            <w:shd w:fill="E6F5EC" w:color="auto" w:val="clear"/>
+            <w:tcMar>
+              <w:top w:type="dxa" w:w="60"/>
+              <w:left w:type="dxa" w:w="90"/>
+              <w:bottom w:type="dxa" w:w="60"/>
+              <w:right w:type="dxa" w:w="90"/>
+            </w:tcMar>
+            <w:vAlign w:val="top"/>
+          </w:tcPr>
+          <w:p>
+            <w:pPr>
+              <w:spacing w:after="40"/>
+            </w:pPr>
+            <w:r>
+              <w:rPr>
+                <w:rFonts w:ascii="Calibri" w:cs="Calibri" w:eastAsia="Calibri" w:hAnsi="Calibri"/>
+                <w:b/>
+                <w:bCs/>
+                <w:color w:val="14213D"/>
+                <w:sz w:val="19"/>
+                <w:szCs w:val="19"/>
+              </w:rPr>
+              <w:t xml:space="preserve">Fait</w:t>
+            </w:r>
+          </w:p>
+        </w:tc>
+        <w:tc>
+          <w:tcPr>
+            <w:tcW w:type="dxa" w:w="3700"/>
+            <w:tcBorders>
+              <w:top w:val="single" w:color="D9D5CB" w:sz="4"/>
+              <w:left w:val="single" w:color="D9D5CB" w:sz="4"/>
+              <w:bottom w:val="single" w:color="D9D5CB" w:sz="4"/>
+              <w:right w:val="single" w:color="D9D5CB" w:sz="4"/>
+            </w:tcBorders>
+            <w:tcMar>
+              <w:top w:type="dxa" w:w="60"/>
+              <w:left w:type="dxa" w:w="90"/>
+              <w:bottom w:type="dxa" w:w="60"/>
+              <w:right w:type="dxa" w:w="90"/>
+            </w:tcMar>
+            <w:vAlign w:val="top"/>
+          </w:tcPr>
+          <w:p>
+            <w:pPr>
+              <w:spacing w:after="40"/>
+            </w:pPr>
+            <w:r>
+              <w:rPr>
+                <w:rFonts w:ascii="Calibri" w:cs="Calibri" w:eastAsia="Calibri" w:hAnsi="Calibri"/>
+                <w:color w:val="14213D"/>
+                <w:sz w:val="20"/>
+                <w:szCs w:val="20"/>
+              </w:rPr>
+              <w:t xml:space="preserve"/>
+            </w:r>
+          </w:p>
+          <w:p>
+            <w:pPr>
+              <w:spacing w:after="40"/>
+            </w:pPr>
+            <w:r>
+              <w:rPr>
+                <w:rFonts w:ascii="Calibri" w:cs="Calibri" w:eastAsia="Calibri" w:hAnsi="Calibri"/>
+                <w:color w:val="14213D"/>
+                <w:sz w:val="20"/>
+                <w:szCs w:val="20"/>
+              </w:rPr>
+              <w:t xml:space="preserve"/>
+            </w:r>
+          </w:p>
+        </w:tc>
+      </w:tr>
+      <w:tr>
+        <w:tc>
+          <w:tcPr>
+            <w:tcW w:type="dxa" w:w="2300"/>
+            <w:tcBorders>
+              <w:top w:val="single" w:color="D9D5CB" w:sz="4"/>
+              <w:left w:val="single" w:color="D9D5CB" w:sz="4"/>
+              <w:bottom w:val="single" w:color="D9D5CB" w:sz="4"/>
+              <w:right w:val="single" w:color="D9D5CB" w:sz="4"/>
+            </w:tcBorders>
+            <w:tcMar>
+              <w:top w:type="dxa" w:w="60"/>
+              <w:left w:type="dxa" w:w="90"/>
+              <w:bottom w:type="dxa" w:w="60"/>
+              <w:right w:type="dxa" w:w="90"/>
+            </w:tcMar>
+            <w:vAlign w:val="top"/>
+          </w:tcPr>
+          <w:p>
+            <w:pPr>
+              <w:spacing w:after="40"/>
+            </w:pPr>
+            <w:r>
+              <w:rPr>
+                <w:rFonts w:ascii="Calibri" w:cs="Calibri" w:eastAsia="Calibri" w:hAnsi="Calibri"/>
+                <w:b/>
+                <w:bCs/>
+                <w:color w:val="14213D"/>
+                <w:sz w:val="20"/>
+                <w:szCs w:val="20"/>
+              </w:rPr>
+              <w:t xml:space="preserve">Corriger avant d'enregistrer</w:t>
+            </w:r>
+          </w:p>
+        </w:tc>
+        <w:tc>
+          <w:tcPr>
+            <w:tcW w:type="dxa" w:w="4100"/>
+            <w:tcBorders>
+              <w:top w:val="single" w:color="D9D5CB" w:sz="4"/>
+              <w:left w:val="single" w:color="D9D5CB" w:sz="4"/>
+              <w:bottom w:val="single" w:color="D9D5CB" w:sz="4"/>
+              <w:right w:val="single" w:color="D9D5CB" w:sz="4"/>
+            </w:tcBorders>
+            <w:tcMar>
+              <w:top w:type="dxa" w:w="60"/>
+              <w:left w:type="dxa" w:w="90"/>
+              <w:bottom w:type="dxa" w:w="60"/>
+              <w:right w:type="dxa" w:w="90"/>
+            </w:tcMar>
+            <w:vAlign w:val="top"/>
+          </w:tcPr>
+          <w:p>
+            <w:pPr>
+              <w:spacing w:after="40"/>
+            </w:pPr>
+            <w:r>
+              <w:rPr>
+                <w:rFonts w:ascii="Calibri" w:cs="Calibri" w:eastAsia="Calibri" w:hAnsi="Calibri"/>
+                <w:color w:val="14213D"/>
+                <w:sz w:val="19"/>
+                <w:szCs w:val="19"/>
+              </w:rPr>
+              <w:t xml:space="preserve">Chaque ligne lue : pièce, DN, DN 2 ou angle, quantité modifiables, ✕ pour retirer (une ligne reclassée prend son DN dans sa désignation). « À classer » : choisis la pièce (sinon elle n'est pas comptée). Options : coche pour les compter. Lignes ignorées et lignes de trame refusées : listées avec leur raison. Contrôles : pouces de soudure, linéaire et longueur de tranchée annoncés par le fournisseur, comparés à ce qui est lu.</w:t>
+            </w:r>
+          </w:p>
+        </w:tc>
+        <w:tc>
+          <w:tcPr>
+            <w:tcW w:type="dxa" w:w="3700"/>
+            <w:tcBorders>
+              <w:top w:val="single" w:color="D9D5CB" w:sz="4"/>
+              <w:left w:val="single" w:color="D9D5CB" w:sz="4"/>
+              <w:bottom w:val="single" w:color="D9D5CB" w:sz="4"/>
+              <w:right w:val="single" w:color="D9D5CB" w:sz="4"/>
+            </w:tcBorders>
+            <w:tcMar>
+              <w:top w:type="dxa" w:w="60"/>
+              <w:left w:type="dxa" w:w="90"/>
+              <w:bottom w:type="dxa" w:w="60"/>
+              <w:right w:type="dxa" w:w="90"/>
+            </w:tcMar>
+            <w:vAlign w:val="top"/>
+          </w:tcPr>
+          <w:p>
+            <w:pPr>
+              <w:spacing w:after="40"/>
+            </w:pPr>
+            <w:r>
+              <w:rPr>
+                <w:rFonts w:ascii="Calibri" w:cs="Calibri" w:eastAsia="Calibri" w:hAnsi="Calibri"/>
+                <w:color w:val="14213D"/>
+                <w:sz w:val="19"/>
+                <w:szCs w:val="19"/>
+              </w:rPr>
+              <w:t xml:space="preserve">Jamais d'import aveugle : rien n'entre sans « Enregistrer ».</w:t>
+            </w:r>
+          </w:p>
+        </w:tc>
+        <w:tc>
+          <w:tcPr>
+            <w:tcW w:type="dxa" w:w="1300"/>
+            <w:tcBorders>
+              <w:top w:val="single" w:color="D9D5CB" w:sz="4"/>
+              <w:left w:val="single" w:color="D9D5CB" w:sz="4"/>
+              <w:bottom w:val="single" w:color="D9D5CB" w:sz="4"/>
+              <w:right w:val="single" w:color="D9D5CB" w:sz="4"/>
+            </w:tcBorders>
+            <w:shd w:fill="E6F5EC" w:color="auto" w:val="clear"/>
+            <w:tcMar>
+              <w:top w:type="dxa" w:w="60"/>
+              <w:left w:type="dxa" w:w="90"/>
+              <w:bottom w:type="dxa" w:w="60"/>
+              <w:right w:type="dxa" w:w="90"/>
+            </w:tcMar>
+            <w:vAlign w:val="top"/>
+          </w:tcPr>
+          <w:p>
+            <w:pPr>
+              <w:spacing w:after="40"/>
+            </w:pPr>
+            <w:r>
+              <w:rPr>
+                <w:rFonts w:ascii="Calibri" w:cs="Calibri" w:eastAsia="Calibri" w:hAnsi="Calibri"/>
+                <w:b/>
+                <w:bCs/>
+                <w:color w:val="14213D"/>
+                <w:sz w:val="19"/>
+                <w:szCs w:val="19"/>
+              </w:rPr>
+              <w:t xml:space="preserve">Fait</w:t>
+            </w:r>
+          </w:p>
+        </w:tc>
+        <w:tc>
+          <w:tcPr>
+            <w:tcW w:type="dxa" w:w="3700"/>
+            <w:tcBorders>
+              <w:top w:val="single" w:color="D9D5CB" w:sz="4"/>
+              <w:left w:val="single" w:color="D9D5CB" w:sz="4"/>
+              <w:bottom w:val="single" w:color="D9D5CB" w:sz="4"/>
+              <w:right w:val="single" w:color="D9D5CB" w:sz="4"/>
+            </w:tcBorders>
+            <w:tcMar>
+              <w:top w:type="dxa" w:w="60"/>
+              <w:left w:type="dxa" w:w="90"/>
+              <w:bottom w:type="dxa" w:w="60"/>
+              <w:right w:type="dxa" w:w="90"/>
+            </w:tcMar>
+            <w:vAlign w:val="top"/>
+          </w:tcPr>
+          <w:p>
+            <w:pPr>
+              <w:spacing w:after="40"/>
+            </w:pPr>
+            <w:r>
+              <w:rPr>
+                <w:rFonts w:ascii="Calibri" w:cs="Calibri" w:eastAsia="Calibri" w:hAnsi="Calibri"/>
+                <w:color w:val="14213D"/>
+                <w:sz w:val="20"/>
+                <w:szCs w:val="20"/>
+              </w:rPr>
+              <w:t xml:space="preserve"/>
+            </w:r>
+          </w:p>
+          <w:p>
+            <w:pPr>
+              <w:spacing w:after="40"/>
+            </w:pPr>
+            <w:r>
+              <w:rPr>
+                <w:rFonts w:ascii="Calibri" w:cs="Calibri" w:eastAsia="Calibri" w:hAnsi="Calibri"/>
+                <w:color w:val="14213D"/>
+                <w:sz w:val="20"/>
+                <w:szCs w:val="20"/>
+              </w:rPr>
+              <w:t xml:space="preserve"/>
+            </w:r>
+          </w:p>
+        </w:tc>
+      </w:tr>
+      <w:tr>
+        <w:tc>
+          <w:tcPr>
+            <w:tcW w:type="dxa" w:w="2300"/>
+            <w:tcBorders>
+              <w:top w:val="single" w:color="D9D5CB" w:sz="4"/>
+              <w:left w:val="single" w:color="D9D5CB" w:sz="4"/>
+              <w:bottom w:val="single" w:color="D9D5CB" w:sz="4"/>
+              <w:right w:val="single" w:color="D9D5CB" w:sz="4"/>
+            </w:tcBorders>
+            <w:tcMar>
+              <w:top w:type="dxa" w:w="60"/>
+              <w:left w:type="dxa" w:w="90"/>
+              <w:bottom w:type="dxa" w:w="60"/>
+              <w:right w:type="dxa" w:w="90"/>
+            </w:tcMar>
+            <w:vAlign w:val="top"/>
+          </w:tcPr>
+          <w:p>
+            <w:pPr>
+              <w:spacing w:after="40"/>
+            </w:pPr>
+            <w:r>
+              <w:rPr>
+                <w:rFonts w:ascii="Calibri" w:cs="Calibri" w:eastAsia="Calibri" w:hAnsi="Calibri"/>
+                <w:b/>
+                <w:bCs/>
+                <w:color w:val="14213D"/>
+                <w:sz w:val="20"/>
+                <w:szCs w:val="20"/>
+              </w:rPr>
+              <w:t xml:space="preserve">La trame et la consigne Claude Excel réécrites</w:t>
+            </w:r>
+          </w:p>
+        </w:tc>
+        <w:tc>
+          <w:tcPr>
+            <w:tcW w:type="dxa" w:w="4100"/>
+            <w:tcBorders>
+              <w:top w:val="single" w:color="D9D5CB" w:sz="4"/>
+              <w:left w:val="single" w:color="D9D5CB" w:sz="4"/>
+              <w:bottom w:val="single" w:color="D9D5CB" w:sz="4"/>
+              <w:right w:val="single" w:color="D9D5CB" w:sz="4"/>
+            </w:tcBorders>
+            <w:tcMar>
+              <w:top w:type="dxa" w:w="60"/>
+              <w:left w:type="dxa" w:w="90"/>
+              <w:bottom w:type="dxa" w:w="60"/>
+              <w:right w:type="dxa" w:w="90"/>
+            </w:tcMar>
+            <w:vAlign w:val="top"/>
+          </w:tcPr>
+          <w:p>
+            <w:pPr>
+              <w:spacing w:after="40"/>
+            </w:pPr>
+            <w:r>
+              <w:rPr>
+                <w:rFonts w:ascii="Calibri" w:cs="Calibri" w:eastAsia="Calibri" w:hAnsi="Calibri"/>
+                <w:color w:val="14213D"/>
+                <w:sz w:val="19"/>
+                <w:szCs w:val="19"/>
+              </w:rPr>
+              <w:t xml:space="preserve">La trame reste en secours (« La lecture automatique rate des lignes ? » dans chaque fenêtre). Nouveau type « Réduction dans manchon ». La consigne : où lire (feuille par DN, colonne TOTAL, titres de section), ce qu'on ne reporte pas (options, totaux, transport), le type avec les codes de chaque fournisseur, le DN acier (table des diamètres), l'angle réel (« XX&gt;45° » → 60), le compte rendu à la fin. Exemple et listes complétés.</w:t>
+            </w:r>
+          </w:p>
+        </w:tc>
+        <w:tc>
+          <w:tcPr>
+            <w:tcW w:type="dxa" w:w="3700"/>
+            <w:tcBorders>
+              <w:top w:val="single" w:color="D9D5CB" w:sz="4"/>
+              <w:left w:val="single" w:color="D9D5CB" w:sz="4"/>
+              <w:bottom w:val="single" w:color="D9D5CB" w:sz="4"/>
+              <w:right w:val="single" w:color="D9D5CB" w:sz="4"/>
+            </w:tcBorders>
+            <w:tcMar>
+              <w:top w:type="dxa" w:w="60"/>
+              <w:left w:type="dxa" w:w="90"/>
+              <w:bottom w:type="dxa" w:w="60"/>
+              <w:right w:type="dxa" w:w="90"/>
+            </w:tcMar>
+            <w:vAlign w:val="top"/>
+          </w:tcPr>
+          <w:p>
+            <w:pPr>
+              <w:spacing w:after="40"/>
+            </w:pPr>
+            <w:r>
+              <w:rPr>
+                <w:rFonts w:ascii="Calibri" w:cs="Calibri" w:eastAsia="Calibri" w:hAnsi="Calibri"/>
+                <w:color w:val="14213D"/>
+                <w:sz w:val="19"/>
+                <w:szCs w:val="19"/>
+              </w:rPr>
+              <w:t xml:space="preserve">La cause des cases vides sur AXIOM et Renalia : l'ancienne consigne limitait les angles à 15 / 30 / 45 / 60 / 90 et ne connaissait pas les codes NK, P, E, ZKODPI, EL.</w:t>
+            </w:r>
+          </w:p>
+        </w:tc>
+        <w:tc>
+          <w:tcPr>
+            <w:tcW w:type="dxa" w:w="1300"/>
+            <w:tcBorders>
+              <w:top w:val="single" w:color="D9D5CB" w:sz="4"/>
+              <w:left w:val="single" w:color="D9D5CB" w:sz="4"/>
+              <w:bottom w:val="single" w:color="D9D5CB" w:sz="4"/>
+              <w:right w:val="single" w:color="D9D5CB" w:sz="4"/>
+            </w:tcBorders>
+            <w:shd w:fill="E6F5EC" w:color="auto" w:val="clear"/>
+            <w:tcMar>
+              <w:top w:type="dxa" w:w="60"/>
+              <w:left w:type="dxa" w:w="90"/>
+              <w:bottom w:type="dxa" w:w="60"/>
+              <w:right w:type="dxa" w:w="90"/>
+            </w:tcMar>
+            <w:vAlign w:val="top"/>
+          </w:tcPr>
+          <w:p>
+            <w:pPr>
+              <w:spacing w:after="40"/>
+            </w:pPr>
+            <w:r>
+              <w:rPr>
+                <w:rFonts w:ascii="Calibri" w:cs="Calibri" w:eastAsia="Calibri" w:hAnsi="Calibri"/>
+                <w:b/>
+                <w:bCs/>
+                <w:color w:val="14213D"/>
+                <w:sz w:val="19"/>
+                <w:szCs w:val="19"/>
+              </w:rPr>
+              <w:t xml:space="preserve">Fait</w:t>
+            </w:r>
+          </w:p>
+        </w:tc>
+        <w:tc>
+          <w:tcPr>
+            <w:tcW w:type="dxa" w:w="3700"/>
+            <w:tcBorders>
+              <w:top w:val="single" w:color="D9D5CB" w:sz="4"/>
+              <w:left w:val="single" w:color="D9D5CB" w:sz="4"/>
+              <w:bottom w:val="single" w:color="D9D5CB" w:sz="4"/>
+              <w:right w:val="single" w:color="D9D5CB" w:sz="4"/>
+            </w:tcBorders>
+            <w:tcMar>
+              <w:top w:type="dxa" w:w="60"/>
+              <w:left w:type="dxa" w:w="90"/>
+              <w:bottom w:type="dxa" w:w="60"/>
+              <w:right w:type="dxa" w:w="90"/>
+            </w:tcMar>
+            <w:vAlign w:val="top"/>
+          </w:tcPr>
+          <w:p>
+            <w:pPr>
+              <w:spacing w:after="40"/>
+            </w:pPr>
+            <w:r>
+              <w:rPr>
+                <w:rFonts w:ascii="Calibri" w:cs="Calibri" w:eastAsia="Calibri" w:hAnsi="Calibri"/>
+                <w:color w:val="14213D"/>
+                <w:sz w:val="20"/>
+                <w:szCs w:val="20"/>
+              </w:rPr>
+              <w:t xml:space="preserve"/>
+            </w:r>
+          </w:p>
+          <w:p>
+            <w:pPr>
+              <w:spacing w:after="40"/>
+            </w:pPr>
+            <w:r>
+              <w:rPr>
+                <w:rFonts w:ascii="Calibri" w:cs="Calibri" w:eastAsia="Calibri" w:hAnsi="Calibri"/>
+                <w:color w:val="14213D"/>
+                <w:sz w:val="20"/>
+                <w:szCs w:val="20"/>
+              </w:rPr>
+              <w:t xml:space="preserve"/>
+            </w:r>
+          </w:p>
+        </w:tc>
+      </w:tr>
+      <w:tr>
+        <w:tc>
+          <w:tcPr>
+            <w:tcW w:type="dxa" w:w="2300"/>
+            <w:tcBorders>
+              <w:top w:val="single" w:color="D9D5CB" w:sz="4"/>
+              <w:left w:val="single" w:color="D9D5CB" w:sz="4"/>
+              <w:bottom w:val="single" w:color="D9D5CB" w:sz="4"/>
+              <w:right w:val="single" w:color="D9D5CB" w:sz="4"/>
+            </w:tcBorders>
+            <w:tcMar>
+              <w:top w:type="dxa" w:w="60"/>
+              <w:left w:type="dxa" w:w="90"/>
+              <w:bottom w:type="dxa" w:w="60"/>
+              <w:right w:type="dxa" w:w="90"/>
+            </w:tcMar>
+            <w:vAlign w:val="top"/>
+          </w:tcPr>
+          <w:p>
+            <w:pPr>
+              <w:spacing w:after="40"/>
+            </w:pPr>
+            <w:r>
+              <w:rPr>
+                <w:rFonts w:ascii="Calibri" w:cs="Calibri" w:eastAsia="Calibri" w:hAnsi="Calibri"/>
+                <w:b/>
+                <w:bCs/>
+                <w:color w:val="14213D"/>
+                <w:sz w:val="20"/>
+                <w:szCs w:val="20"/>
+              </w:rPr>
+              <w:t xml:space="preserve">CET retiré</w:t>
+            </w:r>
+          </w:p>
+        </w:tc>
+        <w:tc>
+          <w:tcPr>
+            <w:tcW w:type="dxa" w:w="4100"/>
+            <w:tcBorders>
+              <w:top w:val="single" w:color="D9D5CB" w:sz="4"/>
+              <w:left w:val="single" w:color="D9D5CB" w:sz="4"/>
+              <w:bottom w:val="single" w:color="D9D5CB" w:sz="4"/>
+              <w:right w:val="single" w:color="D9D5CB" w:sz="4"/>
+            </w:tcBorders>
+            <w:tcMar>
+              <w:top w:type="dxa" w:w="60"/>
+              <w:left w:type="dxa" w:w="90"/>
+              <w:bottom w:type="dxa" w:w="60"/>
+              <w:right w:type="dxa" w:w="90"/>
+            </w:tcMar>
+            <w:vAlign w:val="top"/>
+          </w:tcPr>
+          <w:p>
+            <w:pPr>
+              <w:spacing w:after="40"/>
+            </w:pPr>
+            <w:r>
+              <w:rPr>
+                <w:rFonts w:ascii="Calibri" w:cs="Calibri" w:eastAsia="Calibri" w:hAnsi="Calibri"/>
+                <w:color w:val="14213D"/>
+                <w:sz w:val="19"/>
+                <w:szCs w:val="19"/>
+              </w:rPr>
+              <w:t xml:space="preserve">Fiche d'un gars : plus de ligne « CET » ; navette : plus de cases « HS à mettre en CET » (les formules sont recalées). « Autres compteurs » n'apparaît que si un compteur a été ajouté.</w:t>
+            </w:r>
+          </w:p>
+        </w:tc>
+        <w:tc>
+          <w:tcPr>
+            <w:tcW w:type="dxa" w:w="3700"/>
+            <w:tcBorders>
+              <w:top w:val="single" w:color="D9D5CB" w:sz="4"/>
+              <w:left w:val="single" w:color="D9D5CB" w:sz="4"/>
+              <w:bottom w:val="single" w:color="D9D5CB" w:sz="4"/>
+              <w:right w:val="single" w:color="D9D5CB" w:sz="4"/>
+            </w:tcBorders>
+            <w:tcMar>
+              <w:top w:type="dxa" w:w="60"/>
+              <w:left w:type="dxa" w:w="90"/>
+              <w:bottom w:type="dxa" w:w="60"/>
+              <w:right w:type="dxa" w:w="90"/>
+            </w:tcMar>
+            <w:vAlign w:val="top"/>
+          </w:tcPr>
+          <w:p>
+            <w:pPr>
+              <w:spacing w:after="40"/>
+            </w:pPr>
+            <w:r>
+              <w:rPr>
+                <w:rFonts w:ascii="Calibri" w:cs="Calibri" w:eastAsia="Calibri" w:hAnsi="Calibri"/>
+                <w:color w:val="14213D"/>
+                <w:sz w:val="19"/>
+                <w:szCs w:val="19"/>
+              </w:rPr>
+              <w:t xml:space="preserve"/>
+            </w:r>
+          </w:p>
+        </w:tc>
+        <w:tc>
+          <w:tcPr>
+            <w:tcW w:type="dxa" w:w="1300"/>
+            <w:tcBorders>
+              <w:top w:val="single" w:color="D9D5CB" w:sz="4"/>
+              <w:left w:val="single" w:color="D9D5CB" w:sz="4"/>
+              <w:bottom w:val="single" w:color="D9D5CB" w:sz="4"/>
+              <w:right w:val="single" w:color="D9D5CB" w:sz="4"/>
+            </w:tcBorders>
+            <w:shd w:fill="E6F5EC" w:color="auto" w:val="clear"/>
+            <w:tcMar>
+              <w:top w:type="dxa" w:w="60"/>
+              <w:left w:type="dxa" w:w="90"/>
+              <w:bottom w:type="dxa" w:w="60"/>
+              <w:right w:type="dxa" w:w="90"/>
+            </w:tcMar>
+            <w:vAlign w:val="top"/>
+          </w:tcPr>
+          <w:p>
+            <w:pPr>
+              <w:spacing w:after="40"/>
+            </w:pPr>
+            <w:r>
+              <w:rPr>
+                <w:rFonts w:ascii="Calibri" w:cs="Calibri" w:eastAsia="Calibri" w:hAnsi="Calibri"/>
+                <w:b/>
+                <w:bCs/>
+                <w:color w:val="14213D"/>
+                <w:sz w:val="19"/>
+                <w:szCs w:val="19"/>
+              </w:rPr>
+              <w:t xml:space="preserve">Fait</w:t>
+            </w:r>
+          </w:p>
+        </w:tc>
+        <w:tc>
+          <w:tcPr>
+            <w:tcW w:type="dxa" w:w="3700"/>
+            <w:tcBorders>
+              <w:top w:val="single" w:color="D9D5CB" w:sz="4"/>
+              <w:left w:val="single" w:color="D9D5CB" w:sz="4"/>
+              <w:bottom w:val="single" w:color="D9D5CB" w:sz="4"/>
+              <w:right w:val="single" w:color="D9D5CB" w:sz="4"/>
+            </w:tcBorders>
+            <w:tcMar>
+              <w:top w:type="dxa" w:w="60"/>
+              <w:left w:type="dxa" w:w="90"/>
+              <w:bottom w:type="dxa" w:w="60"/>
+              <w:right w:type="dxa" w:w="90"/>
+            </w:tcMar>
+            <w:vAlign w:val="top"/>
+          </w:tcPr>
+          <w:p>
+            <w:pPr>
+              <w:spacing w:after="40"/>
+            </w:pPr>
+            <w:r>
+              <w:rPr>
+                <w:rFonts w:ascii="Calibri" w:cs="Calibri" w:eastAsia="Calibri" w:hAnsi="Calibri"/>
+                <w:color w:val="14213D"/>
+                <w:sz w:val="20"/>
+                <w:szCs w:val="20"/>
+              </w:rPr>
+              <w:t xml:space="preserve"/>
+            </w:r>
+          </w:p>
+          <w:p>
+            <w:pPr>
+              <w:spacing w:after="40"/>
+            </w:pPr>
+            <w:r>
+              <w:rPr>
+                <w:rFonts w:ascii="Calibri" w:cs="Calibri" w:eastAsia="Calibri" w:hAnsi="Calibri"/>
+                <w:color w:val="14213D"/>
+                <w:sz w:val="20"/>
+                <w:szCs w:val="20"/>
+              </w:rPr>
+              <w:t xml:space="preserve"/>
+            </w:r>
+          </w:p>
+        </w:tc>
+      </w:tr>
+      <w:tr>
+        <w:tc>
+          <w:tcPr>
+            <w:tcW w:type="dxa" w:w="2300"/>
+            <w:tcBorders>
+              <w:top w:val="single" w:color="D9D5CB" w:sz="4"/>
+              <w:left w:val="single" w:color="D9D5CB" w:sz="4"/>
+              <w:bottom w:val="single" w:color="D9D5CB" w:sz="4"/>
+              <w:right w:val="single" w:color="D9D5CB" w:sz="4"/>
+            </w:tcBorders>
+            <w:tcMar>
+              <w:top w:type="dxa" w:w="60"/>
+              <w:left w:type="dxa" w:w="90"/>
+              <w:bottom w:type="dxa" w:w="60"/>
+              <w:right w:type="dxa" w:w="90"/>
+            </w:tcMar>
+            <w:vAlign w:val="top"/>
+          </w:tcPr>
+          <w:p>
+            <w:pPr>
+              <w:spacing w:after="40"/>
+            </w:pPr>
+            <w:r>
+              <w:rPr>
+                <w:rFonts w:ascii="Calibri" w:cs="Calibri" w:eastAsia="Calibri" w:hAnsi="Calibri"/>
+                <w:b/>
+                <w:bCs/>
+                <w:color w:val="14213D"/>
+                <w:sz w:val="20"/>
+                <w:szCs w:val="20"/>
+              </w:rPr>
+              <w:t xml:space="preserve">À valider par toi</w:t>
+            </w:r>
+          </w:p>
+        </w:tc>
+        <w:tc>
+          <w:tcPr>
+            <w:tcW w:type="dxa" w:w="4100"/>
+            <w:tcBorders>
+              <w:top w:val="single" w:color="D9D5CB" w:sz="4"/>
+              <w:left w:val="single" w:color="D9D5CB" w:sz="4"/>
+              <w:bottom w:val="single" w:color="D9D5CB" w:sz="4"/>
+              <w:right w:val="single" w:color="D9D5CB" w:sz="4"/>
+            </w:tcBorders>
+            <w:tcMar>
+              <w:top w:type="dxa" w:w="60"/>
+              <w:left w:type="dxa" w:w="90"/>
+              <w:bottom w:type="dxa" w:w="60"/>
+              <w:right w:type="dxa" w:w="90"/>
+            </w:tcMar>
+            <w:vAlign w:val="top"/>
+          </w:tcPr>
+          <w:p>
+            <w:pPr>
+              <w:spacing w:after="40"/>
+            </w:pPr>
+            <w:r>
+              <w:rPr>
+                <w:rFonts w:ascii="Calibri" w:cs="Calibri" w:eastAsia="Calibri" w:hAnsi="Calibri"/>
+                <w:color w:val="14213D"/>
+                <w:sz w:val="19"/>
+                <w:szCs w:val="19"/>
+              </w:rPr>
+              <w:t xml:space="preserve">1) INPAL « KIT TE A SAUT » = té fait sur place (pas de coupe de la conduite, 1 soudure au piquage). 2) AXIOM : E- = DHEC (embout), NK- = manchon fin de ligne (compté en kit fin de ligne), ZKODPI = vanne. 3) BRUGG « raccord à compression / à souder » compté en accessoire (pas de soudure). 4) Les options ne sont jamais comptées d'office.</w:t>
+            </w:r>
+          </w:p>
+        </w:tc>
+        <w:tc>
+          <w:tcPr>
+            <w:tcW w:type="dxa" w:w="3700"/>
+            <w:tcBorders>
+              <w:top w:val="single" w:color="D9D5CB" w:sz="4"/>
+              <w:left w:val="single" w:color="D9D5CB" w:sz="4"/>
+              <w:bottom w:val="single" w:color="D9D5CB" w:sz="4"/>
+              <w:right w:val="single" w:color="D9D5CB" w:sz="4"/>
+            </w:tcBorders>
+            <w:tcMar>
+              <w:top w:type="dxa" w:w="60"/>
+              <w:left w:type="dxa" w:w="90"/>
+              <w:bottom w:type="dxa" w:w="60"/>
+              <w:right w:type="dxa" w:w="90"/>
+            </w:tcMar>
+            <w:vAlign w:val="top"/>
+          </w:tcPr>
+          <w:p>
+            <w:pPr>
+              <w:spacing w:after="40"/>
+            </w:pPr>
+            <w:r>
+              <w:rPr>
+                <w:rFonts w:ascii="Calibri" w:cs="Calibri" w:eastAsia="Calibri" w:hAnsi="Calibri"/>
+                <w:color w:val="14213D"/>
+                <w:sz w:val="19"/>
+                <w:szCs w:val="19"/>
+              </w:rPr>
+              <w:t xml:space="preserve"/>
+            </w:r>
+          </w:p>
+        </w:tc>
+        <w:tc>
+          <w:tcPr>
+            <w:tcW w:type="dxa" w:w="1300"/>
+            <w:tcBorders>
+              <w:top w:val="single" w:color="D9D5CB" w:sz="4"/>
+              <w:left w:val="single" w:color="D9D5CB" w:sz="4"/>
+              <w:bottom w:val="single" w:color="D9D5CB" w:sz="4"/>
+              <w:right w:val="single" w:color="D9D5CB" w:sz="4"/>
+            </w:tcBorders>
+            <w:shd w:fill="FFF4EE" w:color="auto" w:val="clear"/>
+            <w:tcMar>
+              <w:top w:type="dxa" w:w="60"/>
+              <w:left w:type="dxa" w:w="90"/>
+              <w:bottom w:type="dxa" w:w="60"/>
+              <w:right w:type="dxa" w:w="90"/>
+            </w:tcMar>
+            <w:vAlign w:val="top"/>
+          </w:tcPr>
+          <w:p>
+            <w:pPr>
+              <w:spacing w:after="40"/>
+            </w:pPr>
+            <w:r>
+              <w:rPr>
+                <w:rFonts w:ascii="Calibri" w:cs="Calibri" w:eastAsia="Calibri" w:hAnsi="Calibri"/>
+                <w:b/>
+                <w:bCs/>
+                <w:color w:val="14213D"/>
+                <w:sz w:val="19"/>
+                <w:szCs w:val="19"/>
+              </w:rPr>
+              <w:t xml:space="preserve">À valider</w:t>
+            </w:r>
+          </w:p>
+        </w:tc>
+        <w:tc>
+          <w:tcPr>
+            <w:tcW w:type="dxa" w:w="3700"/>
+            <w:tcBorders>
+              <w:top w:val="single" w:color="D9D5CB" w:sz="4"/>
+              <w:left w:val="single" w:color="D9D5CB" w:sz="4"/>
+              <w:bottom w:val="single" w:color="D9D5CB" w:sz="4"/>
+              <w:right w:val="single" w:color="D9D5CB" w:sz="4"/>
+            </w:tcBorders>
+            <w:tcMar>
+              <w:top w:type="dxa" w:w="60"/>
+              <w:left w:type="dxa" w:w="90"/>
+              <w:bottom w:type="dxa" w:w="60"/>
+              <w:right w:type="dxa" w:w="90"/>
+            </w:tcMar>
+            <w:vAlign w:val="top"/>
+          </w:tcPr>
+          <w:p>
+            <w:pPr>
+              <w:spacing w:after="40"/>
+            </w:pPr>
+            <w:r>
+              <w:rPr>
+                <w:rFonts w:ascii="Calibri" w:cs="Calibri" w:eastAsia="Calibri" w:hAnsi="Calibri"/>
+                <w:color w:val="14213D"/>
+                <w:sz w:val="20"/>
+                <w:szCs w:val="20"/>
+              </w:rPr>
+              <w:t xml:space="preserve"/>
+            </w:r>
+          </w:p>
+          <w:p>
+            <w:pPr>
+              <w:spacing w:after="40"/>
+            </w:pPr>
+            <w:r>
+              <w:rPr>
+                <w:rFonts w:ascii="Calibri" w:cs="Calibri" w:eastAsia="Calibri" w:hAnsi="Calibri"/>
+                <w:color w:val="14213D"/>
+                <w:sz w:val="20"/>
+                <w:szCs w:val="20"/>
+              </w:rPr>
+              <w:t xml:space="preserve"/>
+            </w:r>
+          </w:p>
+        </w:tc>
+      </w:tr>
+    </w:tbl>
+    <w:p>
+      <w:pPr>
+        <w:pStyle w:val="Heading1"/>
+        <w:spacing w:after="120" w:before="320"/>
+      </w:pPr>
+      <w:r>
+        <w:rPr>
+          <w:rFonts w:ascii="Calibri" w:cs="Calibri" w:eastAsia="Calibri" w:hAnsi="Calibri"/>
+          <w:b/>
+          <w:bCs/>
+          <w:color w:val="EB6834"/>
+          <w:sz w:val="30"/>
+          <w:szCs w:val="30"/>
+        </w:rPr>
         <w:t xml:space="preserve">U · Heures : compteur d'heures, heures à reporter, import du compteur existant, cas forcé (13/10 fin d'après-midi)</w:t>
       </w:r>
     </w:p>
@@ -14620,7 +16299,7 @@
                 <w:sz w:val="19"/>
                 <w:szCs w:val="19"/>
               </w:rPr>
-              <w:t xml:space="preserve">1) Compteur plein → surplus payé en heures sup. 2) Le gars voit son propre solde (lecture). 3) La chargée de développement RH a les mêmes droits que les autres RH (voir + modifier). Le CET et les compteurs ajoutés à la main restent (« Autres compteurs »).</w:t>
+              <w:t xml:space="preserve">1) Compteur plein → surplus payé en heures sup. 2) Le gars voit son propre solde (lecture). 3) La chargée de développement RH a les mêmes droits que les autres RH (voir + modifier). Les compteurs ajoutés à la main restent (« Autres compteurs ») ; le CET est retiré (section V).</w:t>
             </w:r>
           </w:p>
         </w:tc>

</xml_diff>

<commit_message>
Mot de passe créé dès l'écran de connexion (code e-mail) + petit œil
</commit_message>
<xml_diff>
--- a/app/docs/Feuille_de_route_controle_12-10.docx
+++ b/app/docs/Feuille_de_route_controle_12-10.docx
@@ -29,7 +29,7 @@
           <w:sz w:val="22"/>
           <w:szCs w:val="22"/>
         </w:rPr>
-        <w:t xml:space="preserve">12 octobre 2026 · mise à jour du 13/10 (soir) : QUANTITATIFS — le fichier du fournisseur (Excel ou PDF) lu tout seul, le même écran d'import pour l'étude, la commande et le BL, réductions et kits fin de ligne dans la synthèse, consigne Claude Excel réécrite, CET retiré · fin d'après-midi : HEURES — compteur d'heures (heures sup majorées par rang jusqu'au plafond, repos, posé par l'entreprise), heures à reporter (prime, semaine plus légère), import du compteur existant, cas de déplacement forcé, droits RH · après-midi : COMMERCE — quantités fournisseur par la trame, mémoire en mode lecture, contrôle croisé classeur ↔ appli, et le chiffrage qui remplace le classeur (base de prix, paniers dépliés, Installations, récap, charge et équipes) · fin de matinée : lecture des pièces et points techniques · la nuit du 13/10 : le responsable d'un chantier y entre toujours (Sofiane) · le plan de Nantes Géraudière qui disparaissait au zoom (réparé + « Recentrer le repère ») · le soir : GRANDS DÉPLACEMENTS jour par jour (4 ou 5 jours = même forfait), le mois par gars avec nuits et repas accordés, la navette, les adresses à vérifier · FOURNITURE : zone éditable, trame type d'import, écarts « commande complémentaire / inclus », BL de zone → Stock · l'après-midi : COMMERCE v2 (dossier déballé, lecture des pièces avec surlignage, chiffrage complet d'après ton classeur du 26.08, paniers, base de prix, DPGF traduite et réécrite dans l'Excel du client, blocs du mémoire) · le matin : onglet FOURNITURE (commande, livré, reste, zones à livrer, camions datés) et tes retours de la feuille du 09-10 (adresses, détente automatique, contrôle des grands déplacements, plein écran, trame d'accueil) · puis la nuit du 12/10 : six onglets, Commerce, Parc, Sécurité, accidents, Outlook serveur · nouvelle ventilation, « agir comme », raccourci rapide du planning, « ma semaine », tes commentaires du Word (sections 5 à 9) · une colonne pour tes retours</w:t>
+        <w:t xml:space="preserve">12 octobre 2026 · mise à jour du 13/10 (fin de soirée) : MOT DE PASSE — créé dès l'écran de connexion (code reçu par e-mail), petit œil pour voir ce qu'on tape · soir : QUANTITATIFS — le fichier du fournisseur (Excel ou PDF) lu tout seul, le même écran d'import pour l'étude, la commande et le BL, réductions et kits fin de ligne dans la synthèse, consigne Claude Excel réécrite, CET retiré · fin d'après-midi : HEURES — compteur d'heures (heures sup majorées par rang jusqu'au plafond, repos, posé par l'entreprise), heures à reporter (prime, semaine plus légère), import du compteur existant, cas de déplacement forcé, droits RH · après-midi : COMMERCE — quantités fournisseur par la trame, mémoire en mode lecture, contrôle croisé classeur ↔ appli, et le chiffrage qui remplace le classeur (base de prix, paniers dépliés, Installations, récap, charge et équipes) · fin de matinée : lecture des pièces et points techniques · la nuit du 13/10 : le responsable d'un chantier y entre toujours (Sofiane) · le plan de Nantes Géraudière qui disparaissait au zoom (réparé + « Recentrer le repère ») · le soir : GRANDS DÉPLACEMENTS jour par jour (4 ou 5 jours = même forfait), le mois par gars avec nuits et repas accordés, la navette, les adresses à vérifier · FOURNITURE : zone éditable, trame type d'import, écarts « commande complémentaire / inclus », BL de zone → Stock · l'après-midi : COMMERCE v2 (dossier déballé, lecture des pièces avec surlignage, chiffrage complet d'après ton classeur du 26.08, paniers, base de prix, DPGF traduite et réécrite dans l'Excel du client, blocs du mémoire) · le matin : onglet FOURNITURE (commande, livré, reste, zones à livrer, camions datés) et tes retours de la feuille du 09-10 (adresses, détente automatique, contrôle des grands déplacements, plein écran, trame d'accueil) · puis la nuit du 12/10 : six onglets, Commerce, Parc, Sécurité, accidents, Outlook serveur · nouvelle ventilation, « agir comme », raccourci rapide du planning, « ma semaine », tes commentaires du Word (sections 5 à 9) · une colonne pour tes retours</w:t>
       </w:r>
     </w:p>
     <w:p>
@@ -65,7 +65,7 @@
           <w:sz w:val="20"/>
           <w:szCs w:val="20"/>
         </w:rPr>
-        <w:t xml:space="preserve">Même principe que la précédente : tu contrôles ligne par ligne, tu écris dans « Vos commentaires » (OK / à corriger / à changer : quoi), tu me renvoies le fichier. Je corrige à partir de tes commentaires, dans l'ordre du document. Commence par la section V (les quantitatifs lus tout seuls et le même écran d'import partout), puis U (compteurs d'heures, heures à reporter, import du compteur existant, cas forcé, qui voit / qui modifie), puis T (Commerce : quantités fournisseur, mémoire, contrôle croisé, tes retours sur la lecture et les points techniques, le chiffrage qui remplace le classeur), puis S (lecture des pièces et points techniques), puis R (compteurs d'heures, « Moi » : ma navette, PDF du livret), puis Q (champs date, plafond 48 h, règles GD vérifiées), puis P (la navette de paie au format SCR), puis O (Nantes : la carte après le recentrage, et le contrôle des SQL), puis N (Sofiane et le chantier de Nantes) et M (Nantes Géraudière : le plan qui disparaît au zoom), puis L (grands déplacements et fourniture), puis K (Commerce v2 : dossier, lecture, chiffrage, DPGF, mémoire), puis I (l'onglet Fourniture), puis J (tes retours de la feuille du 09-10 : c'est la seule feuille à suivre désormais — l'ancienne n'est plus livrée), puis H (Commerce de A à Z), G (la nuit) et F (tes retours du 12/10 soir).</w:t>
+        <w:t xml:space="preserve">Même principe que la précédente : tu contrôles ligne par ligne, tu écris dans « Vos commentaires » (OK / à corriger / à changer : quoi), tu me renvoies le fichier. Je corrige à partir de tes commentaires, dans l'ordre du document. Commence par la section W (mot de passe créé dès l'écran de connexion, petit œil), puis V (les quantitatifs lus tout seuls et le même écran d'import partout), puis U (compteurs d'heures, heures à reporter, import du compteur existant, cas forcé, qui voit / qui modifie), puis T (Commerce : quantités fournisseur, mémoire, contrôle croisé, tes retours sur la lecture et les points techniques, le chiffrage qui remplace le classeur), puis S (lecture des pièces et points techniques), puis R (compteurs d'heures, « Moi » : ma navette, PDF du livret), puis Q (champs date, plafond 48 h, règles GD vérifiées), puis P (la navette de paie au format SCR), puis O (Nantes : la carte après le recentrage, et le contrôle des SQL), puis N (Sofiane et le chantier de Nantes) et M (Nantes Géraudière : le plan qui disparaît au zoom), puis L (grands déplacements et fourniture), puis K (Commerce v2 : dossier, lecture, chiffrage, DPGF, mémoire), puis I (l'onglet Fourniture), puis J (tes retours de la feuille du 09-10 : c'est la seule feuille à suivre désormais — l'ancienne n'est plus livrée), puis H (Commerce de A à Z), G (la nuit) et F (tes retours du 12/10 soir).</w:t>
       </w:r>
     </w:p>
     <w:p>
@@ -84,7 +84,7 @@
           <w:sz w:val="20"/>
           <w:szCs w:val="20"/>
         </w:rPr>
-        <w:t xml:space="preserve">Build livré : 13/10/2026 · 947103 (index.html + traceur.html à la racine du dépôt). Pas de SQL pour la section V. SQL pour la section U : retours_13-10f.sql (contrats, compteurs, cas forcés : lus par le gérant, la direction, les RH, toi et la personne elle-même ; écrits par les RH et toi ; contient retours_13-10e.sql et 13-10d). SQL pour la section T : retours_13-10e.sql (la base de prix modifiable seulement avec le droit « Base de prix SCR : modifier ») — inclus dans 13-10f. SQL pour la section R : retours_13-10d.sql (compteurs d'heures) — inclus dans 13-10e. Pas de SQL pour les sections Q, P, O, N et M (le contrôle des SQL de la section O ne modifie rien). Tous les SQL sont passés (toi, 13/10 au soir) : ta base est à jour. Nouveau SQL du soir : retours_13-10c.sql (qualifications des écarts de fourniture réunies entre deux tablettes). SQL de l'après-midi : retours_13-10b.sql (base de prix et paniers : registres « prix » et « panier », lecture réservée à l'encadrement / bureau), blocs_memoire_scr.sql (ton mémoire O2410-10 découpé en 10 blocs réutilisables) (retours_13-10.sql de l'onglet Fourniture est inclus dans retours_13-10c.sql). SQL retours_12-10.sql et retours_12-10b.sql passés, fonction outlook-sync déployée et vérifiée par toi le 12/10 au soir (« ça fonctionne parfaitement »). Hors connexion, tout se teste avec les personnages de démo.</w:t>
+        <w:t xml:space="preserve">Build livré : 13/10/2026 · 0d6ea9 (index.html + traceur.html à la racine du dépôt). Pas de SQL pour les sections W et V (section W : deux lignes à ajouter dans les modèles d'e-mail de Supabase pour que le code apparaisse — voir la section). SQL pour la section U : retours_13-10f.sql (contrats, compteurs, cas forcés : lus par le gérant, la direction, les RH, toi et la personne elle-même ; écrits par les RH et toi ; contient retours_13-10e.sql et 13-10d). SQL pour la section T : retours_13-10e.sql (la base de prix modifiable seulement avec le droit « Base de prix SCR : modifier ») — inclus dans 13-10f. SQL pour la section R : retours_13-10d.sql (compteurs d'heures) — inclus dans 13-10e. Pas de SQL pour les sections Q, P, O, N et M (le contrôle des SQL de la section O ne modifie rien). Tous les SQL sont passés (toi, 13/10 au soir) : ta base est à jour. Nouveau SQL du soir : retours_13-10c.sql (qualifications des écarts de fourniture réunies entre deux tablettes). SQL de l'après-midi : retours_13-10b.sql (base de prix et paniers : registres « prix » et « panier », lecture réservée à l'encadrement / bureau), blocs_memoire_scr.sql (ton mémoire O2410-10 découpé en 10 blocs réutilisables) (retours_13-10.sql de l'onglet Fourniture est inclus dans retours_13-10c.sql). SQL retours_12-10.sql et retours_12-10b.sql passés, fonction outlook-sync déployée et vérifiée par toi le 12/10 au soir (« ça fonctionne parfaitement »). Hors connexion, tout se teste avec les personnages de démo.</w:t>
       </w:r>
     </w:p>
     <w:p>
@@ -103,7 +103,7 @@
           <w:sz w:val="20"/>
           <w:szCs w:val="20"/>
         </w:rPr>
-        <w:t xml:space="preserve">Règle gardée : rien d'ancien n'est supprimé ; 67 suites de tests automatiques passent, dont celles de la section V (lecteur_test : le lecteur en Node sur des copies fictives de chaque format ; e2e_import : commande Excel et livraison PDF lues toutes seules, une pièce corrigée, téléphone ; e2e_qsets étendue : PDF lu tout seul, pièce à classer, options, classeur + trame à moitié ; e2e_fourniture, e2e_fourn2, e2e_stock, e2e_stock2 recalées sur le nouvel écran ; e2e_compteurs sans CET), celles de la section U (compteurs_test : le moteur des compteurs en Node ; e2e_compteurs réécrite ; e2e_compteurs2 : droits, import, export, cas forcé ; e2e_navette et e2e_acces recalées), celles de la section T (e2e_qsets, e2e_memoire2, e2e_ctrlcl, classeur_test, e2e_chiffrage3 ; e2e_lecture3 et e2e_points2 étendues), et e2e_resp (responsable du chantier = accès) et e2e_rebase (réseau à 1 985 km de l'origine : visible à 19,6 px/m, bandeau, recentrage, fils de nouveau justes au zoom) et les deux du soir : e2e_gdnav (4 jours = 5 nuitées / 10 repas / 15 €, « pas de détente » = 7 / 14 / 0 €, le mois de Julien, l'ajustement d'un jour, la navette CSV, novembre avec la Toussaint et un lundi non travaillé, les adresses à vérifier) et e2e_fourn2 (à la SOURIS réelle : tracer, glisser, insérer, retirer, annuler, reprendre et modifier un contour, boutons du plan ; trame copiée / téléchargée / collée ; écarts qualifiés et commande complémentaire ; BL de zone → Excel → Stock ; trame dans Stock ; classeur fournisseur avec la trame en 2e feuille), puis e2e_commerce2 (8 étapes : import du classeur, zone et table des DN, SST / purges / contrôles / hydraulique / panier libre, récap et base de prix, dossier déballé, lecture PDF avec surlignage, Word et points techniques, DPGF réécrite dans l'Excel) et deux de la veille : e2e_fourniture (11 points : commande collée, comparatif, pièces en plus, livré lu dans Stock, zone entourée au doigt, zone du phasage, camions datés, annonce et pointage dans Stock, droits, téléphone, lecteur de lignes PDF, zones qui se chevauchent) et e2e_retours13 (n° d'affaire, plein écran, repas, adresses, détente automatique sur 5 semaines, accords, vue par personne, CSV).</w:t>
+        <w:t xml:space="preserve">Règle gardée : rien d'ancien n'est supprimé ; 68 suites de tests automatiques passent, dont celle de la section W (e2e_motdepasse : serveur simulé qui garde les mots de passe — œil, refus avant création, code faux, contrôles, mot de passe refusé puis accepté, reconnexion, changement dans l'appli, connexion par code, lien du mail, limite d'envoi ; e2e_login inchangée), celles de la section V (lecteur_test : le lecteur en Node sur des copies fictives de chaque format ; e2e_import : commande Excel et livraison PDF lues toutes seules, une pièce corrigée, téléphone ; e2e_qsets étendue : PDF lu tout seul, pièce à classer, options, classeur + trame à moitié ; e2e_fourniture, e2e_fourn2, e2e_stock, e2e_stock2 recalées sur le nouvel écran ; e2e_compteurs sans CET), celles de la section U (compteurs_test : le moteur des compteurs en Node ; e2e_compteurs réécrite ; e2e_compteurs2 : droits, import, export, cas forcé ; e2e_navette et e2e_acces recalées), celles de la section T (e2e_qsets, e2e_memoire2, e2e_ctrlcl, classeur_test, e2e_chiffrage3 ; e2e_lecture3 et e2e_points2 étendues), et e2e_resp (responsable du chantier = accès) et e2e_rebase (réseau à 1 985 km de l'origine : visible à 19,6 px/m, bandeau, recentrage, fils de nouveau justes au zoom) et les deux du soir : e2e_gdnav (4 jours = 5 nuitées / 10 repas / 15 €, « pas de détente » = 7 / 14 / 0 €, le mois de Julien, l'ajustement d'un jour, la navette CSV, novembre avec la Toussaint et un lundi non travaillé, les adresses à vérifier) et e2e_fourn2 (à la SOURIS réelle : tracer, glisser, insérer, retirer, annuler, reprendre et modifier un contour, boutons du plan ; trame copiée / téléchargée / collée ; écarts qualifiés et commande complémentaire ; BL de zone → Excel → Stock ; trame dans Stock ; classeur fournisseur avec la trame en 2e feuille), puis e2e_commerce2 (8 étapes : import du classeur, zone et table des DN, SST / purges / contrôles / hydraulique / panier libre, récap et base de prix, dossier déballé, lecture PDF avec surlignage, Word et points techniques, DPGF réécrite dans l'Excel) et deux de la veille : e2e_fourniture (11 points : commande collée, comparatif, pièces en plus, livré lu dans Stock, zone entourée au doigt, zone du phasage, camions datés, annonce et pointage dans Stock, droits, téléphone, lecteur de lignes PDF, zones qui se chevauchent) et e2e_retours13 (n° d'affaire, plein écran, repas, adresses, détente automatique sur 5 semaines, accords, vue par personne, CSV).</w:t>
       </w:r>
     </w:p>
     <w:p>
@@ -12828,6 +12828,1142 @@
                 <w:szCs w:val="19"/>
               </w:rPr>
               <w:t xml:space="preserve">Fait (à déployer)</w:t>
+            </w:r>
+          </w:p>
+        </w:tc>
+        <w:tc>
+          <w:tcPr>
+            <w:tcW w:type="dxa" w:w="3700"/>
+            <w:tcBorders>
+              <w:top w:val="single" w:color="D9D5CB" w:sz="4"/>
+              <w:left w:val="single" w:color="D9D5CB" w:sz="4"/>
+              <w:bottom w:val="single" w:color="D9D5CB" w:sz="4"/>
+              <w:right w:val="single" w:color="D9D5CB" w:sz="4"/>
+            </w:tcBorders>
+            <w:tcMar>
+              <w:top w:type="dxa" w:w="60"/>
+              <w:left w:type="dxa" w:w="90"/>
+              <w:bottom w:type="dxa" w:w="60"/>
+              <w:right w:type="dxa" w:w="90"/>
+            </w:tcMar>
+            <w:vAlign w:val="top"/>
+          </w:tcPr>
+          <w:p>
+            <w:pPr>
+              <w:spacing w:after="40"/>
+            </w:pPr>
+            <w:r>
+              <w:rPr>
+                <w:rFonts w:ascii="Calibri" w:cs="Calibri" w:eastAsia="Calibri" w:hAnsi="Calibri"/>
+                <w:color w:val="14213D"/>
+                <w:sz w:val="20"/>
+                <w:szCs w:val="20"/>
+              </w:rPr>
+              <w:t xml:space="preserve"/>
+            </w:r>
+          </w:p>
+          <w:p>
+            <w:pPr>
+              <w:spacing w:after="40"/>
+            </w:pPr>
+            <w:r>
+              <w:rPr>
+                <w:rFonts w:ascii="Calibri" w:cs="Calibri" w:eastAsia="Calibri" w:hAnsi="Calibri"/>
+                <w:color w:val="14213D"/>
+                <w:sz w:val="20"/>
+                <w:szCs w:val="20"/>
+              </w:rPr>
+              <w:t xml:space="preserve"/>
+            </w:r>
+          </w:p>
+        </w:tc>
+      </w:tr>
+    </w:tbl>
+    <w:p>
+      <w:pPr>
+        <w:pStyle w:val="Heading1"/>
+        <w:spacing w:after="120" w:before="320"/>
+      </w:pPr>
+      <w:r>
+        <w:rPr>
+          <w:rFonts w:ascii="Calibri" w:cs="Calibri" w:eastAsia="Calibri" w:hAnsi="Calibri"/>
+          <w:b/>
+          <w:bCs/>
+          <w:color w:val="EB6834"/>
+          <w:sz w:val="30"/>
+          <w:szCs w:val="30"/>
+        </w:rPr>
+        <w:t xml:space="preserve">W · Mot de passe créé dès l'écran de connexion, petit œil (13/10 fin de soirée)</w:t>
+      </w:r>
+    </w:p>
+    <w:p>
+      <w:pPr>
+        <w:spacing w:after="80" w:line="264"/>
+      </w:pPr>
+      <w:r>
+        <w:rPr>
+          <w:rFonts w:ascii="Calibri" w:cs="Calibri" w:eastAsia="Calibri" w:hAnsi="Calibri"/>
+          <w:color w:val="6B6B66"/>
+          <w:sz w:val="20"/>
+          <w:szCs w:val="20"/>
+        </w:rPr>
+        <w:t xml:space="preserve">Pourquoi ça ne marchait pas : « créer mon mot de passe » demandait au serveur de CRÉER un compte ; ton accès existait déjà (créé par toi, déjà utilisé avec le code) — le serveur répond « ok » sans rien faire, par sécurité. Un mot de passe ne se pose que sur une personne connectée : c'est pour ça que ça marchait depuis l'appli. Désormais, l'écran de connexion fait les deux d'un coup : code reçu par e-mail, puis mot de passe.</w:t>
+      </w:r>
+    </w:p>
+    <w:tbl>
+      <w:tblPr>
+        <w:tblW w:type="dxa" w:w="15100"/>
+        <w:tblBorders>
+          <w:top w:val="single" w:color="auto" w:sz="4"/>
+          <w:left w:val="single" w:color="auto" w:sz="4"/>
+          <w:bottom w:val="single" w:color="auto" w:sz="4"/>
+          <w:right w:val="single" w:color="auto" w:sz="4"/>
+          <w:insideH w:val="single" w:color="auto" w:sz="4"/>
+          <w:insideV w:val="single" w:color="auto" w:sz="4"/>
+        </w:tblBorders>
+      </w:tblPr>
+      <w:tblGrid>
+        <w:gridCol w:w="2300"/>
+        <w:gridCol w:w="4100"/>
+        <w:gridCol w:w="3700"/>
+        <w:gridCol w:w="1300"/>
+        <w:gridCol w:w="3700"/>
+      </w:tblGrid>
+      <w:tr>
+        <w:trPr>
+          <w:tblHeader/>
+        </w:trPr>
+        <w:tc>
+          <w:tcPr>
+            <w:tcW w:type="dxa" w:w="2300"/>
+            <w:tcBorders>
+              <w:top w:val="single" w:color="D9D5CB" w:sz="4"/>
+              <w:left w:val="single" w:color="D9D5CB" w:sz="4"/>
+              <w:bottom w:val="single" w:color="D9D5CB" w:sz="4"/>
+              <w:right w:val="single" w:color="D9D5CB" w:sz="4"/>
+            </w:tcBorders>
+            <w:shd w:fill="14213D" w:color="auto" w:val="clear"/>
+            <w:tcMar>
+              <w:top w:type="dxa" w:w="60"/>
+              <w:left w:type="dxa" w:w="90"/>
+              <w:bottom w:type="dxa" w:w="60"/>
+              <w:right w:type="dxa" w:w="90"/>
+            </w:tcMar>
+            <w:vAlign w:val="top"/>
+          </w:tcPr>
+          <w:p>
+            <w:pPr>
+              <w:spacing w:after="80" w:line="264"/>
+            </w:pPr>
+            <w:r>
+              <w:rPr>
+                <w:rFonts w:ascii="Calibri" w:cs="Calibri" w:eastAsia="Calibri" w:hAnsi="Calibri"/>
+                <w:b/>
+                <w:bCs/>
+                <w:color w:val="FFFFFF"/>
+                <w:sz w:val="19"/>
+                <w:szCs w:val="19"/>
+              </w:rPr>
+              <w:t xml:space="preserve">Fonctionnalité</w:t>
+            </w:r>
+          </w:p>
+        </w:tc>
+        <w:tc>
+          <w:tcPr>
+            <w:tcW w:type="dxa" w:w="4100"/>
+            <w:tcBorders>
+              <w:top w:val="single" w:color="D9D5CB" w:sz="4"/>
+              <w:left w:val="single" w:color="D9D5CB" w:sz="4"/>
+              <w:bottom w:val="single" w:color="D9D5CB" w:sz="4"/>
+              <w:right w:val="single" w:color="D9D5CB" w:sz="4"/>
+            </w:tcBorders>
+            <w:shd w:fill="14213D" w:color="auto" w:val="clear"/>
+            <w:tcMar>
+              <w:top w:type="dxa" w:w="60"/>
+              <w:left w:type="dxa" w:w="90"/>
+              <w:bottom w:type="dxa" w:w="60"/>
+              <w:right w:type="dxa" w:w="90"/>
+            </w:tcMar>
+            <w:vAlign w:val="top"/>
+          </w:tcPr>
+          <w:p>
+            <w:pPr>
+              <w:spacing w:after="80" w:line="264"/>
+            </w:pPr>
+            <w:r>
+              <w:rPr>
+                <w:rFonts w:ascii="Calibri" w:cs="Calibri" w:eastAsia="Calibri" w:hAnsi="Calibri"/>
+                <w:b/>
+                <w:bCs/>
+                <w:color w:val="FFFFFF"/>
+                <w:sz w:val="19"/>
+                <w:szCs w:val="19"/>
+              </w:rPr>
+              <w:t xml:space="preserve">Où la trouver · comment tester</w:t>
+            </w:r>
+          </w:p>
+        </w:tc>
+        <w:tc>
+          <w:tcPr>
+            <w:tcW w:type="dxa" w:w="3700"/>
+            <w:tcBorders>
+              <w:top w:val="single" w:color="D9D5CB" w:sz="4"/>
+              <w:left w:val="single" w:color="D9D5CB" w:sz="4"/>
+              <w:bottom w:val="single" w:color="D9D5CB" w:sz="4"/>
+              <w:right w:val="single" w:color="D9D5CB" w:sz="4"/>
+            </w:tcBorders>
+            <w:shd w:fill="14213D" w:color="auto" w:val="clear"/>
+            <w:tcMar>
+              <w:top w:type="dxa" w:w="60"/>
+              <w:left w:type="dxa" w:w="90"/>
+              <w:bottom w:type="dxa" w:w="60"/>
+              <w:right w:type="dxa" w:w="90"/>
+            </w:tcMar>
+            <w:vAlign w:val="top"/>
+          </w:tcPr>
+          <w:p>
+            <w:pPr>
+              <w:spacing w:after="80" w:line="264"/>
+            </w:pPr>
+            <w:r>
+              <w:rPr>
+                <w:rFonts w:ascii="Calibri" w:cs="Calibri" w:eastAsia="Calibri" w:hAnsi="Calibri"/>
+                <w:b/>
+                <w:bCs/>
+                <w:color w:val="FFFFFF"/>
+                <w:sz w:val="19"/>
+                <w:szCs w:val="19"/>
+              </w:rPr>
+              <w:t xml:space="preserve">Hypothèses · limites · ce que j'ai tranché</w:t>
+            </w:r>
+          </w:p>
+        </w:tc>
+        <w:tc>
+          <w:tcPr>
+            <w:tcW w:type="dxa" w:w="1300"/>
+            <w:tcBorders>
+              <w:top w:val="single" w:color="D9D5CB" w:sz="4"/>
+              <w:left w:val="single" w:color="D9D5CB" w:sz="4"/>
+              <w:bottom w:val="single" w:color="D9D5CB" w:sz="4"/>
+              <w:right w:val="single" w:color="D9D5CB" w:sz="4"/>
+            </w:tcBorders>
+            <w:shd w:fill="14213D" w:color="auto" w:val="clear"/>
+            <w:tcMar>
+              <w:top w:type="dxa" w:w="60"/>
+              <w:left w:type="dxa" w:w="90"/>
+              <w:bottom w:type="dxa" w:w="60"/>
+              <w:right w:type="dxa" w:w="90"/>
+            </w:tcMar>
+            <w:vAlign w:val="top"/>
+          </w:tcPr>
+          <w:p>
+            <w:pPr>
+              <w:spacing w:after="80" w:line="264"/>
+            </w:pPr>
+            <w:r>
+              <w:rPr>
+                <w:rFonts w:ascii="Calibri" w:cs="Calibri" w:eastAsia="Calibri" w:hAnsi="Calibri"/>
+                <w:b/>
+                <w:bCs/>
+                <w:color w:val="FFFFFF"/>
+                <w:sz w:val="19"/>
+                <w:szCs w:val="19"/>
+              </w:rPr>
+              <w:t xml:space="preserve">Statut</w:t>
+            </w:r>
+          </w:p>
+        </w:tc>
+        <w:tc>
+          <w:tcPr>
+            <w:tcW w:type="dxa" w:w="3700"/>
+            <w:tcBorders>
+              <w:top w:val="single" w:color="D9D5CB" w:sz="4"/>
+              <w:left w:val="single" w:color="D9D5CB" w:sz="4"/>
+              <w:bottom w:val="single" w:color="D9D5CB" w:sz="4"/>
+              <w:right w:val="single" w:color="D9D5CB" w:sz="4"/>
+            </w:tcBorders>
+            <w:shd w:fill="14213D" w:color="auto" w:val="clear"/>
+            <w:tcMar>
+              <w:top w:type="dxa" w:w="60"/>
+              <w:left w:type="dxa" w:w="90"/>
+              <w:bottom w:type="dxa" w:w="60"/>
+              <w:right w:type="dxa" w:w="90"/>
+            </w:tcMar>
+            <w:vAlign w:val="top"/>
+          </w:tcPr>
+          <w:p>
+            <w:pPr>
+              <w:spacing w:after="80" w:line="264"/>
+            </w:pPr>
+            <w:r>
+              <w:rPr>
+                <w:rFonts w:ascii="Calibri" w:cs="Calibri" w:eastAsia="Calibri" w:hAnsi="Calibri"/>
+                <w:b/>
+                <w:bCs/>
+                <w:color w:val="FFFFFF"/>
+                <w:sz w:val="19"/>
+                <w:szCs w:val="19"/>
+              </w:rPr>
+              <w:t xml:space="preserve">Vos commentaires</w:t>
+            </w:r>
+          </w:p>
+        </w:tc>
+      </w:tr>
+      <w:tr>
+        <w:tc>
+          <w:tcPr>
+            <w:tcW w:type="dxa" w:w="2300"/>
+            <w:tcBorders>
+              <w:top w:val="single" w:color="D9D5CB" w:sz="4"/>
+              <w:left w:val="single" w:color="D9D5CB" w:sz="4"/>
+              <w:bottom w:val="single" w:color="D9D5CB" w:sz="4"/>
+              <w:right w:val="single" w:color="D9D5CB" w:sz="4"/>
+            </w:tcBorders>
+            <w:tcMar>
+              <w:top w:type="dxa" w:w="60"/>
+              <w:left w:type="dxa" w:w="90"/>
+              <w:bottom w:type="dxa" w:w="60"/>
+              <w:right w:type="dxa" w:w="90"/>
+            </w:tcMar>
+            <w:vAlign w:val="top"/>
+          </w:tcPr>
+          <w:p>
+            <w:pPr>
+              <w:spacing w:after="40"/>
+            </w:pPr>
+            <w:r>
+              <w:rPr>
+                <w:rFonts w:ascii="Calibri" w:cs="Calibri" w:eastAsia="Calibri" w:hAnsi="Calibri"/>
+                <w:b/>
+                <w:bCs/>
+                <w:color w:val="14213D"/>
+                <w:sz w:val="20"/>
+                <w:szCs w:val="20"/>
+              </w:rPr>
+              <w:t xml:space="preserve">Créer (ou retrouver) son mot de passe dès l'accueil</w:t>
+            </w:r>
+          </w:p>
+        </w:tc>
+        <w:tc>
+          <w:tcPr>
+            <w:tcW w:type="dxa" w:w="4100"/>
+            <w:tcBorders>
+              <w:top w:val="single" w:color="D9D5CB" w:sz="4"/>
+              <w:left w:val="single" w:color="D9D5CB" w:sz="4"/>
+              <w:bottom w:val="single" w:color="D9D5CB" w:sz="4"/>
+              <w:right w:val="single" w:color="D9D5CB" w:sz="4"/>
+            </w:tcBorders>
+            <w:tcMar>
+              <w:top w:type="dxa" w:w="60"/>
+              <w:left w:type="dxa" w:w="90"/>
+              <w:bottom w:type="dxa" w:w="60"/>
+              <w:right w:type="dxa" w:w="90"/>
+            </w:tcMar>
+            <w:vAlign w:val="top"/>
+          </w:tcPr>
+          <w:p>
+            <w:pPr>
+              <w:spacing w:after="40"/>
+            </w:pPr>
+            <w:r>
+              <w:rPr>
+                <w:rFonts w:ascii="Calibri" w:cs="Calibri" w:eastAsia="Calibri" w:hAnsi="Calibri"/>
+                <w:color w:val="14213D"/>
+                <w:sz w:val="19"/>
+                <w:szCs w:val="19"/>
+              </w:rPr>
+              <w:t xml:space="preserve">Écran de connexion → « Première connexion ou oubli : créer mon mot de passe » → 1 · e-mail (déjà rempli) → « Recevoir mon code par e-mail » → 2 · le code à 6 chiffres → 3 · le mot de passe, deux fois → « Valider et me connecter » : l'accueil s'ouvre. Ensuite : e-mail + mot de passe → « Se connecter ».</w:t>
+            </w:r>
+          </w:p>
+        </w:tc>
+        <w:tc>
+          <w:tcPr>
+            <w:tcW w:type="dxa" w:w="3700"/>
+            <w:tcBorders>
+              <w:top w:val="single" w:color="D9D5CB" w:sz="4"/>
+              <w:left w:val="single" w:color="D9D5CB" w:sz="4"/>
+              <w:bottom w:val="single" w:color="D9D5CB" w:sz="4"/>
+              <w:right w:val="single" w:color="D9D5CB" w:sz="4"/>
+            </w:tcBorders>
+            <w:tcMar>
+              <w:top w:type="dxa" w:w="60"/>
+              <w:left w:type="dxa" w:w="90"/>
+              <w:bottom w:type="dxa" w:w="60"/>
+              <w:right w:type="dxa" w:w="90"/>
+            </w:tcMar>
+            <w:vAlign w:val="top"/>
+          </w:tcPr>
+          <w:p>
+            <w:pPr>
+              <w:spacing w:after="40"/>
+            </w:pPr>
+            <w:r>
+              <w:rPr>
+                <w:rFonts w:ascii="Calibri" w:cs="Calibri" w:eastAsia="Calibri" w:hAnsi="Calibri"/>
+                <w:color w:val="14213D"/>
+                <w:sz w:val="19"/>
+                <w:szCs w:val="19"/>
+              </w:rPr>
+              <w:t xml:space="preserve">Même chemin pour un mot de passe oublié. Code faux ou périmé, trop de demandes, mot de passe trop court ou trop simple : message clair en français. Si le serveur refuse le mot de passe, le code reste valable : on en tape un autre (ou on entre dans l'appli et on le fera plus tard).</w:t>
+            </w:r>
+          </w:p>
+        </w:tc>
+        <w:tc>
+          <w:tcPr>
+            <w:tcW w:type="dxa" w:w="1300"/>
+            <w:tcBorders>
+              <w:top w:val="single" w:color="D9D5CB" w:sz="4"/>
+              <w:left w:val="single" w:color="D9D5CB" w:sz="4"/>
+              <w:bottom w:val="single" w:color="D9D5CB" w:sz="4"/>
+              <w:right w:val="single" w:color="D9D5CB" w:sz="4"/>
+            </w:tcBorders>
+            <w:shd w:fill="E6F5EC" w:color="auto" w:val="clear"/>
+            <w:tcMar>
+              <w:top w:type="dxa" w:w="60"/>
+              <w:left w:type="dxa" w:w="90"/>
+              <w:bottom w:type="dxa" w:w="60"/>
+              <w:right w:type="dxa" w:w="90"/>
+            </w:tcMar>
+            <w:vAlign w:val="top"/>
+          </w:tcPr>
+          <w:p>
+            <w:pPr>
+              <w:spacing w:after="40"/>
+            </w:pPr>
+            <w:r>
+              <w:rPr>
+                <w:rFonts w:ascii="Calibri" w:cs="Calibri" w:eastAsia="Calibri" w:hAnsi="Calibri"/>
+                <w:b/>
+                <w:bCs/>
+                <w:color w:val="14213D"/>
+                <w:sz w:val="19"/>
+                <w:szCs w:val="19"/>
+              </w:rPr>
+              <w:t xml:space="preserve">Fait</w:t>
+            </w:r>
+          </w:p>
+        </w:tc>
+        <w:tc>
+          <w:tcPr>
+            <w:tcW w:type="dxa" w:w="3700"/>
+            <w:tcBorders>
+              <w:top w:val="single" w:color="D9D5CB" w:sz="4"/>
+              <w:left w:val="single" w:color="D9D5CB" w:sz="4"/>
+              <w:bottom w:val="single" w:color="D9D5CB" w:sz="4"/>
+              <w:right w:val="single" w:color="D9D5CB" w:sz="4"/>
+            </w:tcBorders>
+            <w:tcMar>
+              <w:top w:type="dxa" w:w="60"/>
+              <w:left w:type="dxa" w:w="90"/>
+              <w:bottom w:type="dxa" w:w="60"/>
+              <w:right w:type="dxa" w:w="90"/>
+            </w:tcMar>
+            <w:vAlign w:val="top"/>
+          </w:tcPr>
+          <w:p>
+            <w:pPr>
+              <w:spacing w:after="40"/>
+            </w:pPr>
+            <w:r>
+              <w:rPr>
+                <w:rFonts w:ascii="Calibri" w:cs="Calibri" w:eastAsia="Calibri" w:hAnsi="Calibri"/>
+                <w:color w:val="14213D"/>
+                <w:sz w:val="20"/>
+                <w:szCs w:val="20"/>
+              </w:rPr>
+              <w:t xml:space="preserve"/>
+            </w:r>
+          </w:p>
+          <w:p>
+            <w:pPr>
+              <w:spacing w:after="40"/>
+            </w:pPr>
+            <w:r>
+              <w:rPr>
+                <w:rFonts w:ascii="Calibri" w:cs="Calibri" w:eastAsia="Calibri" w:hAnsi="Calibri"/>
+                <w:color w:val="14213D"/>
+                <w:sz w:val="20"/>
+                <w:szCs w:val="20"/>
+              </w:rPr>
+              <w:t xml:space="preserve"/>
+            </w:r>
+          </w:p>
+        </w:tc>
+      </w:tr>
+      <w:tr>
+        <w:tc>
+          <w:tcPr>
+            <w:tcW w:type="dxa" w:w="2300"/>
+            <w:tcBorders>
+              <w:top w:val="single" w:color="D9D5CB" w:sz="4"/>
+              <w:left w:val="single" w:color="D9D5CB" w:sz="4"/>
+              <w:bottom w:val="single" w:color="D9D5CB" w:sz="4"/>
+              <w:right w:val="single" w:color="D9D5CB" w:sz="4"/>
+            </w:tcBorders>
+            <w:tcMar>
+              <w:top w:type="dxa" w:w="60"/>
+              <w:left w:type="dxa" w:w="90"/>
+              <w:bottom w:type="dxa" w:w="60"/>
+              <w:right w:type="dxa" w:w="90"/>
+            </w:tcMar>
+            <w:vAlign w:val="top"/>
+          </w:tcPr>
+          <w:p>
+            <w:pPr>
+              <w:spacing w:after="40"/>
+            </w:pPr>
+            <w:r>
+              <w:rPr>
+                <w:rFonts w:ascii="Calibri" w:cs="Calibri" w:eastAsia="Calibri" w:hAnsi="Calibri"/>
+                <w:b/>
+                <w:bCs/>
+                <w:color w:val="14213D"/>
+                <w:sz w:val="20"/>
+                <w:szCs w:val="20"/>
+              </w:rPr>
+              <w:t xml:space="preserve">Le mail n'a qu'un lien (pas de code)</w:t>
+            </w:r>
+          </w:p>
+        </w:tc>
+        <w:tc>
+          <w:tcPr>
+            <w:tcW w:type="dxa" w:w="4100"/>
+            <w:tcBorders>
+              <w:top w:val="single" w:color="D9D5CB" w:sz="4"/>
+              <w:left w:val="single" w:color="D9D5CB" w:sz="4"/>
+              <w:bottom w:val="single" w:color="D9D5CB" w:sz="4"/>
+              <w:right w:val="single" w:color="D9D5CB" w:sz="4"/>
+            </w:tcBorders>
+            <w:tcMar>
+              <w:top w:type="dxa" w:w="60"/>
+              <w:left w:type="dxa" w:w="90"/>
+              <w:bottom w:type="dxa" w:w="60"/>
+              <w:right w:type="dxa" w:w="90"/>
+            </w:tcMar>
+            <w:vAlign w:val="top"/>
+          </w:tcPr>
+          <w:p>
+            <w:pPr>
+              <w:spacing w:after="40"/>
+            </w:pPr>
+            <w:r>
+              <w:rPr>
+                <w:rFonts w:ascii="Calibri" w:cs="Calibri" w:eastAsia="Calibri" w:hAnsi="Calibri"/>
+                <w:color w:val="14213D"/>
+                <w:sz w:val="19"/>
+                <w:szCs w:val="19"/>
+              </w:rPr>
+              <w:t xml:space="preserve">Touche le lien du mail sur le même téléphone : l'appli s'ouvre connectée et te demande tout de suite ton mot de passe (deux saisies avec l'œil).</w:t>
+            </w:r>
+          </w:p>
+        </w:tc>
+        <w:tc>
+          <w:tcPr>
+            <w:tcW w:type="dxa" w:w="3700"/>
+            <w:tcBorders>
+              <w:top w:val="single" w:color="D9D5CB" w:sz="4"/>
+              <w:left w:val="single" w:color="D9D5CB" w:sz="4"/>
+              <w:bottom w:val="single" w:color="D9D5CB" w:sz="4"/>
+              <w:right w:val="single" w:color="D9D5CB" w:sz="4"/>
+            </w:tcBorders>
+            <w:tcMar>
+              <w:top w:type="dxa" w:w="60"/>
+              <w:left w:type="dxa" w:w="90"/>
+              <w:bottom w:type="dxa" w:w="60"/>
+              <w:right w:type="dxa" w:w="90"/>
+            </w:tcMar>
+            <w:vAlign w:val="top"/>
+          </w:tcPr>
+          <w:p>
+            <w:pPr>
+              <w:spacing w:after="40"/>
+            </w:pPr>
+            <w:r>
+              <w:rPr>
+                <w:rFonts w:ascii="Calibri" w:cs="Calibri" w:eastAsia="Calibri" w:hAnsi="Calibri"/>
+                <w:color w:val="14213D"/>
+                <w:sz w:val="19"/>
+                <w:szCs w:val="19"/>
+              </w:rPr>
+              <w:t xml:space="preserve">Valable 3 heures après la demande. Pour que le CODE apparaisse aussi dans le mail (indispensable si l'appli est installée sur l'écran d'accueil du téléphone : le lien s'ouvre alors dans un autre navigateur), à faire UNE fois dans Supabase → Authentication → Emails → modèles « Magic Link » ET « Confirm signup » : ajouter la ligne « Ou tape ce code dans TRACÉ : {{ .Token }} ».</w:t>
+            </w:r>
+          </w:p>
+        </w:tc>
+        <w:tc>
+          <w:tcPr>
+            <w:tcW w:type="dxa" w:w="1300"/>
+            <w:tcBorders>
+              <w:top w:val="single" w:color="D9D5CB" w:sz="4"/>
+              <w:left w:val="single" w:color="D9D5CB" w:sz="4"/>
+              <w:bottom w:val="single" w:color="D9D5CB" w:sz="4"/>
+              <w:right w:val="single" w:color="D9D5CB" w:sz="4"/>
+            </w:tcBorders>
+            <w:shd w:fill="FFF4EE" w:color="auto" w:val="clear"/>
+            <w:tcMar>
+              <w:top w:type="dxa" w:w="60"/>
+              <w:left w:type="dxa" w:w="90"/>
+              <w:bottom w:type="dxa" w:w="60"/>
+              <w:right w:type="dxa" w:w="90"/>
+            </w:tcMar>
+            <w:vAlign w:val="top"/>
+          </w:tcPr>
+          <w:p>
+            <w:pPr>
+              <w:spacing w:after="40"/>
+            </w:pPr>
+            <w:r>
+              <w:rPr>
+                <w:rFonts w:ascii="Calibri" w:cs="Calibri" w:eastAsia="Calibri" w:hAnsi="Calibri"/>
+                <w:b/>
+                <w:bCs/>
+                <w:color w:val="14213D"/>
+                <w:sz w:val="19"/>
+                <w:szCs w:val="19"/>
+              </w:rPr>
+              <w:t xml:space="preserve">À faire (Supabase)</w:t>
+            </w:r>
+          </w:p>
+        </w:tc>
+        <w:tc>
+          <w:tcPr>
+            <w:tcW w:type="dxa" w:w="3700"/>
+            <w:tcBorders>
+              <w:top w:val="single" w:color="D9D5CB" w:sz="4"/>
+              <w:left w:val="single" w:color="D9D5CB" w:sz="4"/>
+              <w:bottom w:val="single" w:color="D9D5CB" w:sz="4"/>
+              <w:right w:val="single" w:color="D9D5CB" w:sz="4"/>
+            </w:tcBorders>
+            <w:tcMar>
+              <w:top w:type="dxa" w:w="60"/>
+              <w:left w:type="dxa" w:w="90"/>
+              <w:bottom w:type="dxa" w:w="60"/>
+              <w:right w:type="dxa" w:w="90"/>
+            </w:tcMar>
+            <w:vAlign w:val="top"/>
+          </w:tcPr>
+          <w:p>
+            <w:pPr>
+              <w:spacing w:after="40"/>
+            </w:pPr>
+            <w:r>
+              <w:rPr>
+                <w:rFonts w:ascii="Calibri" w:cs="Calibri" w:eastAsia="Calibri" w:hAnsi="Calibri"/>
+                <w:color w:val="14213D"/>
+                <w:sz w:val="20"/>
+                <w:szCs w:val="20"/>
+              </w:rPr>
+              <w:t xml:space="preserve"/>
+            </w:r>
+          </w:p>
+          <w:p>
+            <w:pPr>
+              <w:spacing w:after="40"/>
+            </w:pPr>
+            <w:r>
+              <w:rPr>
+                <w:rFonts w:ascii="Calibri" w:cs="Calibri" w:eastAsia="Calibri" w:hAnsi="Calibri"/>
+                <w:color w:val="14213D"/>
+                <w:sz w:val="20"/>
+                <w:szCs w:val="20"/>
+              </w:rPr>
+              <w:t xml:space="preserve"/>
+            </w:r>
+          </w:p>
+        </w:tc>
+      </w:tr>
+      <w:tr>
+        <w:tc>
+          <w:tcPr>
+            <w:tcW w:type="dxa" w:w="2300"/>
+            <w:tcBorders>
+              <w:top w:val="single" w:color="D9D5CB" w:sz="4"/>
+              <w:left w:val="single" w:color="D9D5CB" w:sz="4"/>
+              <w:bottom w:val="single" w:color="D9D5CB" w:sz="4"/>
+              <w:right w:val="single" w:color="D9D5CB" w:sz="4"/>
+            </w:tcBorders>
+            <w:tcMar>
+              <w:top w:type="dxa" w:w="60"/>
+              <w:left w:type="dxa" w:w="90"/>
+              <w:bottom w:type="dxa" w:w="60"/>
+              <w:right w:type="dxa" w:w="90"/>
+            </w:tcMar>
+            <w:vAlign w:val="top"/>
+          </w:tcPr>
+          <w:p>
+            <w:pPr>
+              <w:spacing w:after="40"/>
+            </w:pPr>
+            <w:r>
+              <w:rPr>
+                <w:rFonts w:ascii="Calibri" w:cs="Calibri" w:eastAsia="Calibri" w:hAnsi="Calibri"/>
+                <w:b/>
+                <w:bCs/>
+                <w:color w:val="14213D"/>
+                <w:sz w:val="20"/>
+                <w:szCs w:val="20"/>
+              </w:rPr>
+              <w:t xml:space="preserve">Connexion par code</w:t>
+            </w:r>
+          </w:p>
+        </w:tc>
+        <w:tc>
+          <w:tcPr>
+            <w:tcW w:type="dxa" w:w="4100"/>
+            <w:tcBorders>
+              <w:top w:val="single" w:color="D9D5CB" w:sz="4"/>
+              <w:left w:val="single" w:color="D9D5CB" w:sz="4"/>
+              <w:bottom w:val="single" w:color="D9D5CB" w:sz="4"/>
+              <w:right w:val="single" w:color="D9D5CB" w:sz="4"/>
+            </w:tcBorders>
+            <w:tcMar>
+              <w:top w:type="dxa" w:w="60"/>
+              <w:left w:type="dxa" w:w="90"/>
+              <w:bottom w:type="dxa" w:w="60"/>
+              <w:right w:type="dxa" w:w="90"/>
+            </w:tcMar>
+            <w:vAlign w:val="top"/>
+          </w:tcPr>
+          <w:p>
+            <w:pPr>
+              <w:spacing w:after="40"/>
+            </w:pPr>
+            <w:r>
+              <w:rPr>
+                <w:rFonts w:ascii="Calibri" w:cs="Calibri" w:eastAsia="Calibri" w:hAnsi="Calibri"/>
+                <w:color w:val="14213D"/>
+                <w:sz w:val="19"/>
+                <w:szCs w:val="19"/>
+              </w:rPr>
+              <w:t xml:space="preserve">« Code par e-mail » → recevoir le code → le taper → connecté (sans mot de passe).</w:t>
+            </w:r>
+          </w:p>
+        </w:tc>
+        <w:tc>
+          <w:tcPr>
+            <w:tcW w:type="dxa" w:w="3700"/>
+            <w:tcBorders>
+              <w:top w:val="single" w:color="D9D5CB" w:sz="4"/>
+              <w:left w:val="single" w:color="D9D5CB" w:sz="4"/>
+              <w:bottom w:val="single" w:color="D9D5CB" w:sz="4"/>
+              <w:right w:val="single" w:color="D9D5CB" w:sz="4"/>
+            </w:tcBorders>
+            <w:tcMar>
+              <w:top w:type="dxa" w:w="60"/>
+              <w:left w:type="dxa" w:w="90"/>
+              <w:bottom w:type="dxa" w:w="60"/>
+              <w:right w:type="dxa" w:w="90"/>
+            </w:tcMar>
+            <w:vAlign w:val="top"/>
+          </w:tcPr>
+          <w:p>
+            <w:pPr>
+              <w:spacing w:after="40"/>
+            </w:pPr>
+            <w:r>
+              <w:rPr>
+                <w:rFonts w:ascii="Calibri" w:cs="Calibri" w:eastAsia="Calibri" w:hAnsi="Calibri"/>
+                <w:color w:val="14213D"/>
+                <w:sz w:val="19"/>
+                <w:szCs w:val="19"/>
+              </w:rPr>
+              <w:t xml:space="preserve">Même écran que la création, sans les cases mot de passe.</w:t>
+            </w:r>
+          </w:p>
+        </w:tc>
+        <w:tc>
+          <w:tcPr>
+            <w:tcW w:type="dxa" w:w="1300"/>
+            <w:tcBorders>
+              <w:top w:val="single" w:color="D9D5CB" w:sz="4"/>
+              <w:left w:val="single" w:color="D9D5CB" w:sz="4"/>
+              <w:bottom w:val="single" w:color="D9D5CB" w:sz="4"/>
+              <w:right w:val="single" w:color="D9D5CB" w:sz="4"/>
+            </w:tcBorders>
+            <w:shd w:fill="E6F5EC" w:color="auto" w:val="clear"/>
+            <w:tcMar>
+              <w:top w:type="dxa" w:w="60"/>
+              <w:left w:type="dxa" w:w="90"/>
+              <w:bottom w:type="dxa" w:w="60"/>
+              <w:right w:type="dxa" w:w="90"/>
+            </w:tcMar>
+            <w:vAlign w:val="top"/>
+          </w:tcPr>
+          <w:p>
+            <w:pPr>
+              <w:spacing w:after="40"/>
+            </w:pPr>
+            <w:r>
+              <w:rPr>
+                <w:rFonts w:ascii="Calibri" w:cs="Calibri" w:eastAsia="Calibri" w:hAnsi="Calibri"/>
+                <w:b/>
+                <w:bCs/>
+                <w:color w:val="14213D"/>
+                <w:sz w:val="19"/>
+                <w:szCs w:val="19"/>
+              </w:rPr>
+              <w:t xml:space="preserve">Fait</w:t>
+            </w:r>
+          </w:p>
+        </w:tc>
+        <w:tc>
+          <w:tcPr>
+            <w:tcW w:type="dxa" w:w="3700"/>
+            <w:tcBorders>
+              <w:top w:val="single" w:color="D9D5CB" w:sz="4"/>
+              <w:left w:val="single" w:color="D9D5CB" w:sz="4"/>
+              <w:bottom w:val="single" w:color="D9D5CB" w:sz="4"/>
+              <w:right w:val="single" w:color="D9D5CB" w:sz="4"/>
+            </w:tcBorders>
+            <w:tcMar>
+              <w:top w:type="dxa" w:w="60"/>
+              <w:left w:type="dxa" w:w="90"/>
+              <w:bottom w:type="dxa" w:w="60"/>
+              <w:right w:type="dxa" w:w="90"/>
+            </w:tcMar>
+            <w:vAlign w:val="top"/>
+          </w:tcPr>
+          <w:p>
+            <w:pPr>
+              <w:spacing w:after="40"/>
+            </w:pPr>
+            <w:r>
+              <w:rPr>
+                <w:rFonts w:ascii="Calibri" w:cs="Calibri" w:eastAsia="Calibri" w:hAnsi="Calibri"/>
+                <w:color w:val="14213D"/>
+                <w:sz w:val="20"/>
+                <w:szCs w:val="20"/>
+              </w:rPr>
+              <w:t xml:space="preserve"/>
+            </w:r>
+          </w:p>
+          <w:p>
+            <w:pPr>
+              <w:spacing w:after="40"/>
+            </w:pPr>
+            <w:r>
+              <w:rPr>
+                <w:rFonts w:ascii="Calibri" w:cs="Calibri" w:eastAsia="Calibri" w:hAnsi="Calibri"/>
+                <w:color w:val="14213D"/>
+                <w:sz w:val="20"/>
+                <w:szCs w:val="20"/>
+              </w:rPr>
+              <w:t xml:space="preserve"/>
+            </w:r>
+          </w:p>
+        </w:tc>
+      </w:tr>
+      <w:tr>
+        <w:tc>
+          <w:tcPr>
+            <w:tcW w:type="dxa" w:w="2300"/>
+            <w:tcBorders>
+              <w:top w:val="single" w:color="D9D5CB" w:sz="4"/>
+              <w:left w:val="single" w:color="D9D5CB" w:sz="4"/>
+              <w:bottom w:val="single" w:color="D9D5CB" w:sz="4"/>
+              <w:right w:val="single" w:color="D9D5CB" w:sz="4"/>
+            </w:tcBorders>
+            <w:tcMar>
+              <w:top w:type="dxa" w:w="60"/>
+              <w:left w:type="dxa" w:w="90"/>
+              <w:bottom w:type="dxa" w:w="60"/>
+              <w:right w:type="dxa" w:w="90"/>
+            </w:tcMar>
+            <w:vAlign w:val="top"/>
+          </w:tcPr>
+          <w:p>
+            <w:pPr>
+              <w:spacing w:after="40"/>
+            </w:pPr>
+            <w:r>
+              <w:rPr>
+                <w:rFonts w:ascii="Calibri" w:cs="Calibri" w:eastAsia="Calibri" w:hAnsi="Calibri"/>
+                <w:b/>
+                <w:bCs/>
+                <w:color w:val="14213D"/>
+                <w:sz w:val="20"/>
+                <w:szCs w:val="20"/>
+              </w:rPr>
+              <w:t xml:space="preserve">Petit œil</w:t>
+            </w:r>
+          </w:p>
+        </w:tc>
+        <w:tc>
+          <w:tcPr>
+            <w:tcW w:type="dxa" w:w="4100"/>
+            <w:tcBorders>
+              <w:top w:val="single" w:color="D9D5CB" w:sz="4"/>
+              <w:left w:val="single" w:color="D9D5CB" w:sz="4"/>
+              <w:bottom w:val="single" w:color="D9D5CB" w:sz="4"/>
+              <w:right w:val="single" w:color="D9D5CB" w:sz="4"/>
+            </w:tcBorders>
+            <w:tcMar>
+              <w:top w:type="dxa" w:w="60"/>
+              <w:left w:type="dxa" w:w="90"/>
+              <w:bottom w:type="dxa" w:w="60"/>
+              <w:right w:type="dxa" w:w="90"/>
+            </w:tcMar>
+            <w:vAlign w:val="top"/>
+          </w:tcPr>
+          <w:p>
+            <w:pPr>
+              <w:spacing w:after="40"/>
+            </w:pPr>
+            <w:r>
+              <w:rPr>
+                <w:rFonts w:ascii="Calibri" w:cs="Calibri" w:eastAsia="Calibri" w:hAnsi="Calibri"/>
+                <w:color w:val="14213D"/>
+                <w:sz w:val="19"/>
+                <w:szCs w:val="19"/>
+              </w:rPr>
+              <w:t xml:space="preserve">Sur la case mot de passe de la connexion, les cases de création et la fenêtre « 🔑 Définir / changer mon mot de passe » de ton compte : touche l'œil → le mot de passe s'affiche ; re-touche → masqué. Bouton large (42 px), utilisable avec des gants.</w:t>
+            </w:r>
+          </w:p>
+        </w:tc>
+        <w:tc>
+          <w:tcPr>
+            <w:tcW w:type="dxa" w:w="3700"/>
+            <w:tcBorders>
+              <w:top w:val="single" w:color="D9D5CB" w:sz="4"/>
+              <w:left w:val="single" w:color="D9D5CB" w:sz="4"/>
+              <w:bottom w:val="single" w:color="D9D5CB" w:sz="4"/>
+              <w:right w:val="single" w:color="D9D5CB" w:sz="4"/>
+            </w:tcBorders>
+            <w:tcMar>
+              <w:top w:type="dxa" w:w="60"/>
+              <w:left w:type="dxa" w:w="90"/>
+              <w:bottom w:type="dxa" w:w="60"/>
+              <w:right w:type="dxa" w:w="90"/>
+            </w:tcMar>
+            <w:vAlign w:val="top"/>
+          </w:tcPr>
+          <w:p>
+            <w:pPr>
+              <w:spacing w:after="40"/>
+            </w:pPr>
+            <w:r>
+              <w:rPr>
+                <w:rFonts w:ascii="Calibri" w:cs="Calibri" w:eastAsia="Calibri" w:hAnsi="Calibri"/>
+                <w:color w:val="14213D"/>
+                <w:sz w:val="19"/>
+                <w:szCs w:val="19"/>
+              </w:rPr>
+              <w:t xml:space="preserve">« 🔑 Définir / changer mon mot de passe » ouvre maintenant une fenêtre à deux cases (avant : deux petites fenêtres où l'on ne voyait pas ce qu'on tapait).</w:t>
+            </w:r>
+          </w:p>
+        </w:tc>
+        <w:tc>
+          <w:tcPr>
+            <w:tcW w:type="dxa" w:w="1300"/>
+            <w:tcBorders>
+              <w:top w:val="single" w:color="D9D5CB" w:sz="4"/>
+              <w:left w:val="single" w:color="D9D5CB" w:sz="4"/>
+              <w:bottom w:val="single" w:color="D9D5CB" w:sz="4"/>
+              <w:right w:val="single" w:color="D9D5CB" w:sz="4"/>
+            </w:tcBorders>
+            <w:shd w:fill="E6F5EC" w:color="auto" w:val="clear"/>
+            <w:tcMar>
+              <w:top w:type="dxa" w:w="60"/>
+              <w:left w:type="dxa" w:w="90"/>
+              <w:bottom w:type="dxa" w:w="60"/>
+              <w:right w:type="dxa" w:w="90"/>
+            </w:tcMar>
+            <w:vAlign w:val="top"/>
+          </w:tcPr>
+          <w:p>
+            <w:pPr>
+              <w:spacing w:after="40"/>
+            </w:pPr>
+            <w:r>
+              <w:rPr>
+                <w:rFonts w:ascii="Calibri" w:cs="Calibri" w:eastAsia="Calibri" w:hAnsi="Calibri"/>
+                <w:b/>
+                <w:bCs/>
+                <w:color w:val="14213D"/>
+                <w:sz w:val="19"/>
+                <w:szCs w:val="19"/>
+              </w:rPr>
+              <w:t xml:space="preserve">Fait</w:t>
+            </w:r>
+          </w:p>
+        </w:tc>
+        <w:tc>
+          <w:tcPr>
+            <w:tcW w:type="dxa" w:w="3700"/>
+            <w:tcBorders>
+              <w:top w:val="single" w:color="D9D5CB" w:sz="4"/>
+              <w:left w:val="single" w:color="D9D5CB" w:sz="4"/>
+              <w:bottom w:val="single" w:color="D9D5CB" w:sz="4"/>
+              <w:right w:val="single" w:color="D9D5CB" w:sz="4"/>
+            </w:tcBorders>
+            <w:tcMar>
+              <w:top w:type="dxa" w:w="60"/>
+              <w:left w:type="dxa" w:w="90"/>
+              <w:bottom w:type="dxa" w:w="60"/>
+              <w:right w:type="dxa" w:w="90"/>
+            </w:tcMar>
+            <w:vAlign w:val="top"/>
+          </w:tcPr>
+          <w:p>
+            <w:pPr>
+              <w:spacing w:after="40"/>
+            </w:pPr>
+            <w:r>
+              <w:rPr>
+                <w:rFonts w:ascii="Calibri" w:cs="Calibri" w:eastAsia="Calibri" w:hAnsi="Calibri"/>
+                <w:color w:val="14213D"/>
+                <w:sz w:val="20"/>
+                <w:szCs w:val="20"/>
+              </w:rPr>
+              <w:t xml:space="preserve"/>
+            </w:r>
+          </w:p>
+          <w:p>
+            <w:pPr>
+              <w:spacing w:after="40"/>
+            </w:pPr>
+            <w:r>
+              <w:rPr>
+                <w:rFonts w:ascii="Calibri" w:cs="Calibri" w:eastAsia="Calibri" w:hAnsi="Calibri"/>
+                <w:color w:val="14213D"/>
+                <w:sz w:val="20"/>
+                <w:szCs w:val="20"/>
+              </w:rPr>
+              <w:t xml:space="preserve"/>
+            </w:r>
+          </w:p>
+        </w:tc>
+      </w:tr>
+      <w:tr>
+        <w:tc>
+          <w:tcPr>
+            <w:tcW w:type="dxa" w:w="2300"/>
+            <w:tcBorders>
+              <w:top w:val="single" w:color="D9D5CB" w:sz="4"/>
+              <w:left w:val="single" w:color="D9D5CB" w:sz="4"/>
+              <w:bottom w:val="single" w:color="D9D5CB" w:sz="4"/>
+              <w:right w:val="single" w:color="D9D5CB" w:sz="4"/>
+            </w:tcBorders>
+            <w:tcMar>
+              <w:top w:type="dxa" w:w="60"/>
+              <w:left w:type="dxa" w:w="90"/>
+              <w:bottom w:type="dxa" w:w="60"/>
+              <w:right w:type="dxa" w:w="90"/>
+            </w:tcMar>
+            <w:vAlign w:val="top"/>
+          </w:tcPr>
+          <w:p>
+            <w:pPr>
+              <w:spacing w:after="40"/>
+            </w:pPr>
+            <w:r>
+              <w:rPr>
+                <w:rFonts w:ascii="Calibri" w:cs="Calibri" w:eastAsia="Calibri" w:hAnsi="Calibri"/>
+                <w:b/>
+                <w:bCs/>
+                <w:color w:val="14213D"/>
+                <w:sz w:val="20"/>
+                <w:szCs w:val="20"/>
+              </w:rPr>
+              <w:t xml:space="preserve">E-mail repris</w:t>
+            </w:r>
+          </w:p>
+        </w:tc>
+        <w:tc>
+          <w:tcPr>
+            <w:tcW w:type="dxa" w:w="4100"/>
+            <w:tcBorders>
+              <w:top w:val="single" w:color="D9D5CB" w:sz="4"/>
+              <w:left w:val="single" w:color="D9D5CB" w:sz="4"/>
+              <w:bottom w:val="single" w:color="D9D5CB" w:sz="4"/>
+              <w:right w:val="single" w:color="D9D5CB" w:sz="4"/>
+            </w:tcBorders>
+            <w:tcMar>
+              <w:top w:type="dxa" w:w="60"/>
+              <w:left w:type="dxa" w:w="90"/>
+              <w:bottom w:type="dxa" w:w="60"/>
+              <w:right w:type="dxa" w:w="90"/>
+            </w:tcMar>
+            <w:vAlign w:val="top"/>
+          </w:tcPr>
+          <w:p>
+            <w:pPr>
+              <w:spacing w:after="40"/>
+            </w:pPr>
+            <w:r>
+              <w:rPr>
+                <w:rFonts w:ascii="Calibri" w:cs="Calibri" w:eastAsia="Calibri" w:hAnsi="Calibri"/>
+                <w:color w:val="14213D"/>
+                <w:sz w:val="19"/>
+                <w:szCs w:val="19"/>
+              </w:rPr>
+              <w:t xml:space="preserve">L'écran de connexion reprend l'e-mail de la dernière connexion sur cet appareil.</w:t>
+            </w:r>
+          </w:p>
+        </w:tc>
+        <w:tc>
+          <w:tcPr>
+            <w:tcW w:type="dxa" w:w="3700"/>
+            <w:tcBorders>
+              <w:top w:val="single" w:color="D9D5CB" w:sz="4"/>
+              <w:left w:val="single" w:color="D9D5CB" w:sz="4"/>
+              <w:bottom w:val="single" w:color="D9D5CB" w:sz="4"/>
+              <w:right w:val="single" w:color="D9D5CB" w:sz="4"/>
+            </w:tcBorders>
+            <w:tcMar>
+              <w:top w:type="dxa" w:w="60"/>
+              <w:left w:type="dxa" w:w="90"/>
+              <w:bottom w:type="dxa" w:w="60"/>
+              <w:right w:type="dxa" w:w="90"/>
+            </w:tcMar>
+            <w:vAlign w:val="top"/>
+          </w:tcPr>
+          <w:p>
+            <w:pPr>
+              <w:spacing w:after="40"/>
+            </w:pPr>
+            <w:r>
+              <w:rPr>
+                <w:rFonts w:ascii="Calibri" w:cs="Calibri" w:eastAsia="Calibri" w:hAnsi="Calibri"/>
+                <w:color w:val="14213D"/>
+                <w:sz w:val="19"/>
+                <w:szCs w:val="19"/>
+              </w:rPr>
+              <w:t xml:space="preserve"/>
+            </w:r>
+          </w:p>
+        </w:tc>
+        <w:tc>
+          <w:tcPr>
+            <w:tcW w:type="dxa" w:w="1300"/>
+            <w:tcBorders>
+              <w:top w:val="single" w:color="D9D5CB" w:sz="4"/>
+              <w:left w:val="single" w:color="D9D5CB" w:sz="4"/>
+              <w:bottom w:val="single" w:color="D9D5CB" w:sz="4"/>
+              <w:right w:val="single" w:color="D9D5CB" w:sz="4"/>
+            </w:tcBorders>
+            <w:shd w:fill="E6F5EC" w:color="auto" w:val="clear"/>
+            <w:tcMar>
+              <w:top w:type="dxa" w:w="60"/>
+              <w:left w:type="dxa" w:w="90"/>
+              <w:bottom w:type="dxa" w:w="60"/>
+              <w:right w:type="dxa" w:w="90"/>
+            </w:tcMar>
+            <w:vAlign w:val="top"/>
+          </w:tcPr>
+          <w:p>
+            <w:pPr>
+              <w:spacing w:after="40"/>
+            </w:pPr>
+            <w:r>
+              <w:rPr>
+                <w:rFonts w:ascii="Calibri" w:cs="Calibri" w:eastAsia="Calibri" w:hAnsi="Calibri"/>
+                <w:b/>
+                <w:bCs/>
+                <w:color w:val="14213D"/>
+                <w:sz w:val="19"/>
+                <w:szCs w:val="19"/>
+              </w:rPr>
+              <w:t xml:space="preserve">Fait</w:t>
             </w:r>
           </w:p>
         </w:tc>

</xml_diff>

<commit_message>
Atelier DPGF (coûts ↔ lignes du client, ÷ quantité d'une autre ligne, 2e écran) + devis de référence en face des prix
</commit_message>
<xml_diff>
--- a/app/docs/Feuille_de_route_controle_12-10.docx
+++ b/app/docs/Feuille_de_route_controle_12-10.docx
@@ -29,7 +29,7 @@
           <w:sz w:val="22"/>
           <w:szCs w:val="22"/>
         </w:rPr>
-        <w:t xml:space="preserve">12 octobre 2026 · mise à jour du 13/10 (fin de soirée) : MOT DE PASSE — créé dès l'écran de connexion (code reçu par e-mail), petit œil pour voir ce qu'on tape · soir : QUANTITATIFS — le fichier du fournisseur (Excel ou PDF) lu tout seul, le même écran d'import pour l'étude, la commande et le BL, réductions et kits fin de ligne dans la synthèse, consigne Claude Excel réécrite, CET retiré · fin d'après-midi : HEURES — compteur d'heures (heures sup majorées par rang jusqu'au plafond, repos, posé par l'entreprise), heures à reporter (prime, semaine plus légère), import du compteur existant, cas de déplacement forcé, droits RH · après-midi : COMMERCE — quantités fournisseur par la trame, mémoire en mode lecture, contrôle croisé classeur ↔ appli, et le chiffrage qui remplace le classeur (base de prix, paniers dépliés, Installations, récap, charge et équipes) · fin de matinée : lecture des pièces et points techniques · la nuit du 13/10 : le responsable d'un chantier y entre toujours (Sofiane) · le plan de Nantes Géraudière qui disparaissait au zoom (réparé + « Recentrer le repère ») · le soir : GRANDS DÉPLACEMENTS jour par jour (4 ou 5 jours = même forfait), le mois par gars avec nuits et repas accordés, la navette, les adresses à vérifier · FOURNITURE : zone éditable, trame type d'import, écarts « commande complémentaire / inclus », BL de zone → Stock · l'après-midi : COMMERCE v2 (dossier déballé, lecture des pièces avec surlignage, chiffrage complet d'après ton classeur du 26.08, paniers, base de prix, DPGF traduite et réécrite dans l'Excel du client, blocs du mémoire) · le matin : onglet FOURNITURE (commande, livré, reste, zones à livrer, camions datés) et tes retours de la feuille du 09-10 (adresses, détente automatique, contrôle des grands déplacements, plein écran, trame d'accueil) · puis la nuit du 12/10 : six onglets, Commerce, Parc, Sécurité, accidents, Outlook serveur · nouvelle ventilation, « agir comme », raccourci rapide du planning, « ma semaine », tes commentaires du Word (sections 5 à 9) · une colonne pour tes retours</w:t>
+        <w:t xml:space="preserve">12 octobre 2026 · mise à jour du 13/10 (suite) : CODE DE CONNEXION sans e-mail (tu le donnes, le gars crée son mot de passe dès l'accueil) · COMMERCE — Lecture, Quantités, Points en onglets séparés, quantités de référence ★ en tête, bulle « tracé », fichier du quantitatif gardé, AXIOM « kit manchon avec mousse » = manchon, colonne € / pouce retirée · fin de soirée : MOT DE PASSE — créé dès l'écran de connexion (code reçu par e-mail), petit œil pour voir ce qu'on tape · soir : QUANTITATIFS — le fichier du fournisseur (Excel ou PDF) lu tout seul, le même écran d'import pour l'étude, la commande et le BL, réductions et kits fin de ligne dans la synthèse, consigne Claude Excel réécrite, CET retiré · fin d'après-midi : HEURES — compteur d'heures (heures sup majorées par rang jusqu'au plafond, repos, posé par l'entreprise), heures à reporter (prime, semaine plus légère), import du compteur existant, cas de déplacement forcé, droits RH · après-midi : COMMERCE — quantités fournisseur par la trame, mémoire en mode lecture, contrôle croisé classeur ↔ appli, et le chiffrage qui remplace le classeur (base de prix, paniers dépliés, Installations, récap, charge et équipes) · fin de matinée : lecture des pièces et points techniques · la nuit du 13/10 : le responsable d'un chantier y entre toujours (Sofiane) · le plan de Nantes Géraudière qui disparaissait au zoom (réparé + « Recentrer le repère ») · le soir : GRANDS DÉPLACEMENTS jour par jour (4 ou 5 jours = même forfait), le mois par gars avec nuits et repas accordés, la navette, les adresses à vérifier · FOURNITURE : zone éditable, trame type d'import, écarts « commande complémentaire / inclus », BL de zone → Stock · l'après-midi : COMMERCE v2 (dossier déballé, lecture des pièces avec surlignage, chiffrage complet d'après ton classeur du 26.08, paniers, base de prix, DPGF traduite et réécrite dans l'Excel du client, blocs du mémoire) · le matin : onglet FOURNITURE (commande, livré, reste, zones à livrer, camions datés) et tes retours de la feuille du 09-10 (adresses, détente automatique, contrôle des grands déplacements, plein écran, trame d'accueil) · puis la nuit du 12/10 : six onglets, Commerce, Parc, Sécurité, accidents, Outlook serveur · nouvelle ventilation, « agir comme », raccourci rapide du planning, « ma semaine », tes commentaires du Word (sections 5 à 9) · une colonne pour tes retours</w:t>
       </w:r>
     </w:p>
     <w:p>
@@ -65,7 +65,7 @@
           <w:sz w:val="20"/>
           <w:szCs w:val="20"/>
         </w:rPr>
-        <w:t xml:space="preserve">Même principe que la précédente : tu contrôles ligne par ligne, tu écris dans « Vos commentaires » (OK / à corriger / à changer : quoi), tu me renvoies le fichier. Je corrige à partir de tes commentaires, dans l'ordre du document. Commence par la section W (mot de passe créé dès l'écran de connexion, petit œil), puis V (les quantitatifs lus tout seuls et le même écran d'import partout), puis U (compteurs d'heures, heures à reporter, import du compteur existant, cas forcé, qui voit / qui modifie), puis T (Commerce : quantités fournisseur, mémoire, contrôle croisé, tes retours sur la lecture et les points techniques, le chiffrage qui remplace le classeur), puis S (lecture des pièces et points techniques), puis R (compteurs d'heures, « Moi » : ma navette, PDF du livret), puis Q (champs date, plafond 48 h, règles GD vérifiées), puis P (la navette de paie au format SCR), puis O (Nantes : la carte après le recentrage, et le contrôle des SQL), puis N (Sofiane et le chantier de Nantes) et M (Nantes Géraudière : le plan qui disparaît au zoom), puis L (grands déplacements et fourniture), puis K (Commerce v2 : dossier, lecture, chiffrage, DPGF, mémoire), puis I (l'onglet Fourniture), puis J (tes retours de la feuille du 09-10 : c'est la seule feuille à suivre désormais — l'ancienne n'est plus livrée), puis H (Commerce de A à Z), G (la nuit) et F (tes retours du 12/10 soir).</w:t>
+        <w:t xml:space="preserve">Même principe que la précédente : tu contrôles ligne par ligne, tu écris dans « Vos commentaires » (OK / à corriger / à changer : quoi), tu me renvoies le fichier. Je corrige à partir de tes commentaires, dans l'ordre du document. Commence par la section X (code de connexion sans e-mail ; onglets Quantités et Points), puis W (mot de passe créé dès l'écran de connexion, petit œil), puis V (les quantitatifs lus tout seuls et le même écran d'import partout), puis U (compteurs d'heures, heures à reporter, import du compteur existant, cas forcé, qui voit / qui modifie), puis T (Commerce : quantités fournisseur, mémoire, contrôle croisé, tes retours sur la lecture et les points techniques, le chiffrage qui remplace le classeur), puis S (lecture des pièces et points techniques), puis R (compteurs d'heures, « Moi » : ma navette, PDF du livret), puis Q (champs date, plafond 48 h, règles GD vérifiées), puis P (la navette de paie au format SCR), puis O (Nantes : la carte après le recentrage, et le contrôle des SQL), puis N (Sofiane et le chantier de Nantes) et M (Nantes Géraudière : le plan qui disparaît au zoom), puis L (grands déplacements et fourniture), puis K (Commerce v2 : dossier, lecture, chiffrage, DPGF, mémoire), puis I (l'onglet Fourniture), puis J (tes retours de la feuille du 09-10 : c'est la seule feuille à suivre désormais — l'ancienne n'est plus livrée), puis H (Commerce de A à Z), G (la nuit) et F (tes retours du 12/10 soir).</w:t>
       </w:r>
     </w:p>
     <w:p>
@@ -84,7 +84,7 @@
           <w:sz w:val="20"/>
           <w:szCs w:val="20"/>
         </w:rPr>
-        <w:t xml:space="preserve">Build livré : 13/10/2026 · 0d6ea9 (index.html + traceur.html à la racine du dépôt). Pas de SQL pour les sections W et V (section W : deux lignes à ajouter dans les modèles d'e-mail de Supabase pour que le code apparaisse — voir la section). SQL pour la section U : retours_13-10f.sql (contrats, compteurs, cas forcés : lus par le gérant, la direction, les RH, toi et la personne elle-même ; écrits par les RH et toi ; contient retours_13-10e.sql et 13-10d). SQL pour la section T : retours_13-10e.sql (la base de prix modifiable seulement avec le droit « Base de prix SCR : modifier ») — inclus dans 13-10f. SQL pour la section R : retours_13-10d.sql (compteurs d'heures) — inclus dans 13-10e. Pas de SQL pour les sections Q, P, O, N et M (le contrôle des SQL de la section O ne modifie rien). Tous les SQL sont passés (toi, 13/10 au soir) : ta base est à jour. Nouveau SQL du soir : retours_13-10c.sql (qualifications des écarts de fourniture réunies entre deux tablettes). SQL de l'après-midi : retours_13-10b.sql (base de prix et paniers : registres « prix » et « panier », lecture réservée à l'encadrement / bureau), blocs_memoire_scr.sql (ton mémoire O2410-10 découpé en 10 blocs réutilisables) (retours_13-10.sql de l'onglet Fourniture est inclus dans retours_13-10c.sql). SQL retours_12-10.sql et retours_12-10b.sql passés, fonction outlook-sync déployée et vérifiée par toi le 12/10 au soir (« ça fonctionne parfaitement »). Hors connexion, tout se teste avec les personnages de démo.</w:t>
+        <w:t xml:space="preserve">Build livré : 13/10/2026 · 48e8a4 (index.html + traceur.html à la racine du dépôt). Section X : pas de SQL, mais une fonction serveur à déployer (acces-code, 5 minutes, comme outlook-sync : voir la section). Pas de SQL pour les sections W et V (section W : deux lignes à ajouter dans les modèles d'e-mail de Supabase pour que le code apparaisse — voir la section). SQL pour la section U : retours_13-10f.sql (contrats, compteurs, cas forcés : lus par le gérant, la direction, les RH, toi et la personne elle-même ; écrits par les RH et toi ; contient retours_13-10e.sql et 13-10d). SQL pour la section T : retours_13-10e.sql (la base de prix modifiable seulement avec le droit « Base de prix SCR : modifier ») — inclus dans 13-10f. SQL pour la section R : retours_13-10d.sql (compteurs d'heures) — inclus dans 13-10e. Pas de SQL pour les sections Q, P, O, N et M (le contrôle des SQL de la section O ne modifie rien). Tous les SQL sont passés (toi, 13/10 au soir) : ta base est à jour. Nouveau SQL du soir : retours_13-10c.sql (qualifications des écarts de fourniture réunies entre deux tablettes). SQL de l'après-midi : retours_13-10b.sql (base de prix et paniers : registres « prix » et « panier », lecture réservée à l'encadrement / bureau), blocs_memoire_scr.sql (ton mémoire O2410-10 découpé en 10 blocs réutilisables) (retours_13-10.sql de l'onglet Fourniture est inclus dans retours_13-10c.sql). SQL retours_12-10.sql et retours_12-10b.sql passés, fonction outlook-sync déployée et vérifiée par toi le 12/10 au soir (« ça fonctionne parfaitement »). Hors connexion, tout se teste avec les personnages de démo.</w:t>
       </w:r>
     </w:p>
     <w:p>
@@ -103,7 +103,7 @@
           <w:sz w:val="20"/>
           <w:szCs w:val="20"/>
         </w:rPr>
-        <w:t xml:space="preserve">Règle gardée : rien d'ancien n'est supprimé ; 68 suites de tests automatiques passent, dont celle de la section W (e2e_motdepasse : serveur simulé qui garde les mots de passe — œil, refus avant création, code faux, contrôles, mot de passe refusé puis accepté, reconnexion, changement dans l'appli, connexion par code, lien du mail, limite d'envoi ; e2e_login inchangée), celles de la section V (lecteur_test : le lecteur en Node sur des copies fictives de chaque format ; e2e_import : commande Excel et livraison PDF lues toutes seules, une pièce corrigée, téléphone ; e2e_qsets étendue : PDF lu tout seul, pièce à classer, options, classeur + trame à moitié ; e2e_fourniture, e2e_fourn2, e2e_stock, e2e_stock2 recalées sur le nouvel écran ; e2e_compteurs sans CET), celles de la section U (compteurs_test : le moteur des compteurs en Node ; e2e_compteurs réécrite ; e2e_compteurs2 : droits, import, export, cas forcé ; e2e_navette et e2e_acces recalées), celles de la section T (e2e_qsets, e2e_memoire2, e2e_ctrlcl, classeur_test, e2e_chiffrage3 ; e2e_lecture3 et e2e_points2 étendues), et e2e_resp (responsable du chantier = accès) et e2e_rebase (réseau à 1 985 km de l'origine : visible à 19,6 px/m, bandeau, recentrage, fils de nouveau justes au zoom) et les deux du soir : e2e_gdnav (4 jours = 5 nuitées / 10 repas / 15 €, « pas de détente » = 7 / 14 / 0 €, le mois de Julien, l'ajustement d'un jour, la navette CSV, novembre avec la Toussaint et un lundi non travaillé, les adresses à vérifier) et e2e_fourn2 (à la SOURIS réelle : tracer, glisser, insérer, retirer, annuler, reprendre et modifier un contour, boutons du plan ; trame copiée / téléchargée / collée ; écarts qualifiés et commande complémentaire ; BL de zone → Excel → Stock ; trame dans Stock ; classeur fournisseur avec la trame en 2e feuille), puis e2e_commerce2 (8 étapes : import du classeur, zone et table des DN, SST / purges / contrôles / hydraulique / panier libre, récap et base de prix, dossier déballé, lecture PDF avec surlignage, Word et points techniques, DPGF réécrite dans l'Excel) et deux de la veille : e2e_fourniture (11 points : commande collée, comparatif, pièces en plus, livré lu dans Stock, zone entourée au doigt, zone du phasage, camions datés, annonce et pointage dans Stock, droits, téléphone, lecteur de lignes PDF, zones qui se chevauchent) et e2e_retours13 (n° d'affaire, plein écran, repas, adresses, détente automatique sur 5 semaines, accords, vue par personne, CSV).</w:t>
+        <w:t xml:space="preserve">Règle gardée : rien d'ancien n'est supprimé ; 71 suites de tests automatiques passent, dont celles de la section X (e2e_codeacces : code créé par l'administrateur, première connexion avec le code, code tapé dans la case mot de passe, réouverture, adresse refusée par Supabase ; fn_acces_code : la fonction serveur elle-même, lancée dans Deno face à un Supabase simulé ; e2e_quantites : onglets, référence, fichier gardé, bulle du tracé, une seule zone de lecture), celle de la section W (e2e_motdepasse : serveur simulé qui garde les mots de passe — œil, refus avant création, code faux, contrôles, mot de passe refusé puis accepté, reconnexion, changement dans l'appli, connexion par code, lien du mail, limite d'envoi ; e2e_login inchangée), celles de la section V (lecteur_test : le lecteur en Node sur des copies fictives de chaque format ; e2e_import : commande Excel et livraison PDF lues toutes seules, une pièce corrigée, téléphone ; e2e_qsets étendue : PDF lu tout seul, pièce à classer, options, classeur + trame à moitié ; e2e_fourniture, e2e_fourn2, e2e_stock, e2e_stock2 recalées sur le nouvel écran ; e2e_compteurs sans CET), celles de la section U (compteurs_test : le moteur des compteurs en Node ; e2e_compteurs réécrite ; e2e_compteurs2 : droits, import, export, cas forcé ; e2e_navette et e2e_acces recalées), celles de la section T (e2e_qsets, e2e_memoire2, e2e_ctrlcl, classeur_test, e2e_chiffrage3 ; e2e_lecture3 et e2e_points2 étendues), et e2e_resp (responsable du chantier = accès) et e2e_rebase (réseau à 1 985 km de l'origine : visible à 19,6 px/m, bandeau, recentrage, fils de nouveau justes au zoom) et les deux du soir : e2e_gdnav (4 jours = 5 nuitées / 10 repas / 15 €, « pas de détente » = 7 / 14 / 0 €, le mois de Julien, l'ajustement d'un jour, la navette CSV, novembre avec la Toussaint et un lundi non travaillé, les adresses à vérifier) et e2e_fourn2 (à la SOURIS réelle : tracer, glisser, insérer, retirer, annuler, reprendre et modifier un contour, boutons du plan ; trame copiée / téléchargée / collée ; écarts qualifiés et commande complémentaire ; BL de zone → Excel → Stock ; trame dans Stock ; classeur fournisseur avec la trame en 2e feuille), puis e2e_commerce2 (8 étapes : import du classeur, zone et table des DN, SST / purges / contrôles / hydraulique / panier libre, récap et base de prix, dossier déballé, lecture PDF avec surlignage, Word et points techniques, DPGF réécrite dans l'Excel) et deux de la veille : e2e_fourniture (11 points : commande collée, comparatif, pièces en plus, livré lu dans Stock, zone entourée au doigt, zone du phasage, camions datés, annonce et pointage dans Stock, droits, téléphone, lecteur de lignes PDF, zones qui se chevauchent) et e2e_retours13 (n° d'affaire, plein écran, repas, adresses, détente automatique sur 5 semaines, accords, vue par personne, CSV).</w:t>
       </w:r>
     </w:p>
     <w:p>
@@ -12828,6 +12828,2409 @@
                 <w:szCs w:val="19"/>
               </w:rPr>
               <w:t xml:space="preserve">Fait (à déployer)</w:t>
+            </w:r>
+          </w:p>
+        </w:tc>
+        <w:tc>
+          <w:tcPr>
+            <w:tcW w:type="dxa" w:w="3700"/>
+            <w:tcBorders>
+              <w:top w:val="single" w:color="D9D5CB" w:sz="4"/>
+              <w:left w:val="single" w:color="D9D5CB" w:sz="4"/>
+              <w:bottom w:val="single" w:color="D9D5CB" w:sz="4"/>
+              <w:right w:val="single" w:color="D9D5CB" w:sz="4"/>
+            </w:tcBorders>
+            <w:tcMar>
+              <w:top w:type="dxa" w:w="60"/>
+              <w:left w:type="dxa" w:w="90"/>
+              <w:bottom w:type="dxa" w:w="60"/>
+              <w:right w:type="dxa" w:w="90"/>
+            </w:tcMar>
+            <w:vAlign w:val="top"/>
+          </w:tcPr>
+          <w:p>
+            <w:pPr>
+              <w:spacing w:after="40"/>
+            </w:pPr>
+            <w:r>
+              <w:rPr>
+                <w:rFonts w:ascii="Calibri" w:cs="Calibri" w:eastAsia="Calibri" w:hAnsi="Calibri"/>
+                <w:color w:val="14213D"/>
+                <w:sz w:val="20"/>
+                <w:szCs w:val="20"/>
+              </w:rPr>
+              <w:t xml:space="preserve"/>
+            </w:r>
+          </w:p>
+          <w:p>
+            <w:pPr>
+              <w:spacing w:after="40"/>
+            </w:pPr>
+            <w:r>
+              <w:rPr>
+                <w:rFonts w:ascii="Calibri" w:cs="Calibri" w:eastAsia="Calibri" w:hAnsi="Calibri"/>
+                <w:color w:val="14213D"/>
+                <w:sz w:val="20"/>
+                <w:szCs w:val="20"/>
+              </w:rPr>
+              <w:t xml:space="preserve"/>
+            </w:r>
+          </w:p>
+        </w:tc>
+      </w:tr>
+    </w:tbl>
+    <w:p>
+      <w:pPr>
+        <w:pStyle w:val="Heading1"/>
+        <w:spacing w:after="120" w:before="320"/>
+      </w:pPr>
+      <w:r>
+        <w:rPr>
+          <w:rFonts w:ascii="Calibri" w:cs="Calibri" w:eastAsia="Calibri" w:hAnsi="Calibri"/>
+          <w:b/>
+          <w:bCs/>
+          <w:color w:val="EB6834"/>
+          <w:sz w:val="30"/>
+          <w:szCs w:val="30"/>
+        </w:rPr>
+        <w:t xml:space="preserve">X · Code de connexion sans e-mail ; Commerce : Lecture, Quantités, Points (13/10, suite)</w:t>
+      </w:r>
+    </w:p>
+    <w:p>
+      <w:pPr>
+        <w:spacing w:after="80" w:line="264"/>
+      </w:pPr>
+      <w:r>
+        <w:rPr>
+          <w:rFonts w:ascii="Calibri" w:cs="Calibri" w:eastAsia="Calibri" w:hAnsi="Calibri"/>
+          <w:color w:val="6B6B66"/>
+          <w:sz w:val="20"/>
+          <w:szCs w:val="20"/>
+        </w:rPr>
+        <w:t xml:space="preserve">Ta capture Supabase : sans serveur d'envoi personnalisé (SMTP), Supabase n'envoie ses e-mails de connexion qu'aux membres de ton organisation Supabase, 2 par heure, et les modèles de mail ne se modifient pas. Tes gars ne recevraient jamais ni code ni lien. D'où le code que TU donnes. Le SMTP reste possible plus tard (mode d'emploi dans le README de la fonction) : les deux méthodes cohabitent.</w:t>
+      </w:r>
+    </w:p>
+    <w:tbl>
+      <w:tblPr>
+        <w:tblW w:type="dxa" w:w="15100"/>
+        <w:tblBorders>
+          <w:top w:val="single" w:color="auto" w:sz="4"/>
+          <w:left w:val="single" w:color="auto" w:sz="4"/>
+          <w:bottom w:val="single" w:color="auto" w:sz="4"/>
+          <w:right w:val="single" w:color="auto" w:sz="4"/>
+          <w:insideH w:val="single" w:color="auto" w:sz="4"/>
+          <w:insideV w:val="single" w:color="auto" w:sz="4"/>
+        </w:tblBorders>
+      </w:tblPr>
+      <w:tblGrid>
+        <w:gridCol w:w="2300"/>
+        <w:gridCol w:w="4100"/>
+        <w:gridCol w:w="3700"/>
+        <w:gridCol w:w="1300"/>
+        <w:gridCol w:w="3700"/>
+      </w:tblGrid>
+      <w:tr>
+        <w:trPr>
+          <w:tblHeader/>
+        </w:trPr>
+        <w:tc>
+          <w:tcPr>
+            <w:tcW w:type="dxa" w:w="2300"/>
+            <w:tcBorders>
+              <w:top w:val="single" w:color="D9D5CB" w:sz="4"/>
+              <w:left w:val="single" w:color="D9D5CB" w:sz="4"/>
+              <w:bottom w:val="single" w:color="D9D5CB" w:sz="4"/>
+              <w:right w:val="single" w:color="D9D5CB" w:sz="4"/>
+            </w:tcBorders>
+            <w:shd w:fill="14213D" w:color="auto" w:val="clear"/>
+            <w:tcMar>
+              <w:top w:type="dxa" w:w="60"/>
+              <w:left w:type="dxa" w:w="90"/>
+              <w:bottom w:type="dxa" w:w="60"/>
+              <w:right w:type="dxa" w:w="90"/>
+            </w:tcMar>
+            <w:vAlign w:val="top"/>
+          </w:tcPr>
+          <w:p>
+            <w:pPr>
+              <w:spacing w:after="80" w:line="264"/>
+            </w:pPr>
+            <w:r>
+              <w:rPr>
+                <w:rFonts w:ascii="Calibri" w:cs="Calibri" w:eastAsia="Calibri" w:hAnsi="Calibri"/>
+                <w:b/>
+                <w:bCs/>
+                <w:color w:val="FFFFFF"/>
+                <w:sz w:val="19"/>
+                <w:szCs w:val="19"/>
+              </w:rPr>
+              <w:t xml:space="preserve">Fonctionnalité</w:t>
+            </w:r>
+          </w:p>
+        </w:tc>
+        <w:tc>
+          <w:tcPr>
+            <w:tcW w:type="dxa" w:w="4100"/>
+            <w:tcBorders>
+              <w:top w:val="single" w:color="D9D5CB" w:sz="4"/>
+              <w:left w:val="single" w:color="D9D5CB" w:sz="4"/>
+              <w:bottom w:val="single" w:color="D9D5CB" w:sz="4"/>
+              <w:right w:val="single" w:color="D9D5CB" w:sz="4"/>
+            </w:tcBorders>
+            <w:shd w:fill="14213D" w:color="auto" w:val="clear"/>
+            <w:tcMar>
+              <w:top w:type="dxa" w:w="60"/>
+              <w:left w:type="dxa" w:w="90"/>
+              <w:bottom w:type="dxa" w:w="60"/>
+              <w:right w:type="dxa" w:w="90"/>
+            </w:tcMar>
+            <w:vAlign w:val="top"/>
+          </w:tcPr>
+          <w:p>
+            <w:pPr>
+              <w:spacing w:after="80" w:line="264"/>
+            </w:pPr>
+            <w:r>
+              <w:rPr>
+                <w:rFonts w:ascii="Calibri" w:cs="Calibri" w:eastAsia="Calibri" w:hAnsi="Calibri"/>
+                <w:b/>
+                <w:bCs/>
+                <w:color w:val="FFFFFF"/>
+                <w:sz w:val="19"/>
+                <w:szCs w:val="19"/>
+              </w:rPr>
+              <w:t xml:space="preserve">Où la trouver · comment tester</w:t>
+            </w:r>
+          </w:p>
+        </w:tc>
+        <w:tc>
+          <w:tcPr>
+            <w:tcW w:type="dxa" w:w="3700"/>
+            <w:tcBorders>
+              <w:top w:val="single" w:color="D9D5CB" w:sz="4"/>
+              <w:left w:val="single" w:color="D9D5CB" w:sz="4"/>
+              <w:bottom w:val="single" w:color="D9D5CB" w:sz="4"/>
+              <w:right w:val="single" w:color="D9D5CB" w:sz="4"/>
+            </w:tcBorders>
+            <w:shd w:fill="14213D" w:color="auto" w:val="clear"/>
+            <w:tcMar>
+              <w:top w:type="dxa" w:w="60"/>
+              <w:left w:type="dxa" w:w="90"/>
+              <w:bottom w:type="dxa" w:w="60"/>
+              <w:right w:type="dxa" w:w="90"/>
+            </w:tcMar>
+            <w:vAlign w:val="top"/>
+          </w:tcPr>
+          <w:p>
+            <w:pPr>
+              <w:spacing w:after="80" w:line="264"/>
+            </w:pPr>
+            <w:r>
+              <w:rPr>
+                <w:rFonts w:ascii="Calibri" w:cs="Calibri" w:eastAsia="Calibri" w:hAnsi="Calibri"/>
+                <w:b/>
+                <w:bCs/>
+                <w:color w:val="FFFFFF"/>
+                <w:sz w:val="19"/>
+                <w:szCs w:val="19"/>
+              </w:rPr>
+              <w:t xml:space="preserve">Hypothèses · limites · ce que j'ai tranché</w:t>
+            </w:r>
+          </w:p>
+        </w:tc>
+        <w:tc>
+          <w:tcPr>
+            <w:tcW w:type="dxa" w:w="1300"/>
+            <w:tcBorders>
+              <w:top w:val="single" w:color="D9D5CB" w:sz="4"/>
+              <w:left w:val="single" w:color="D9D5CB" w:sz="4"/>
+              <w:bottom w:val="single" w:color="D9D5CB" w:sz="4"/>
+              <w:right w:val="single" w:color="D9D5CB" w:sz="4"/>
+            </w:tcBorders>
+            <w:shd w:fill="14213D" w:color="auto" w:val="clear"/>
+            <w:tcMar>
+              <w:top w:type="dxa" w:w="60"/>
+              <w:left w:type="dxa" w:w="90"/>
+              <w:bottom w:type="dxa" w:w="60"/>
+              <w:right w:type="dxa" w:w="90"/>
+            </w:tcMar>
+            <w:vAlign w:val="top"/>
+          </w:tcPr>
+          <w:p>
+            <w:pPr>
+              <w:spacing w:after="80" w:line="264"/>
+            </w:pPr>
+            <w:r>
+              <w:rPr>
+                <w:rFonts w:ascii="Calibri" w:cs="Calibri" w:eastAsia="Calibri" w:hAnsi="Calibri"/>
+                <w:b/>
+                <w:bCs/>
+                <w:color w:val="FFFFFF"/>
+                <w:sz w:val="19"/>
+                <w:szCs w:val="19"/>
+              </w:rPr>
+              <w:t xml:space="preserve">Statut</w:t>
+            </w:r>
+          </w:p>
+        </w:tc>
+        <w:tc>
+          <w:tcPr>
+            <w:tcW w:type="dxa" w:w="3700"/>
+            <w:tcBorders>
+              <w:top w:val="single" w:color="D9D5CB" w:sz="4"/>
+              <w:left w:val="single" w:color="D9D5CB" w:sz="4"/>
+              <w:bottom w:val="single" w:color="D9D5CB" w:sz="4"/>
+              <w:right w:val="single" w:color="D9D5CB" w:sz="4"/>
+            </w:tcBorders>
+            <w:shd w:fill="14213D" w:color="auto" w:val="clear"/>
+            <w:tcMar>
+              <w:top w:type="dxa" w:w="60"/>
+              <w:left w:type="dxa" w:w="90"/>
+              <w:bottom w:type="dxa" w:w="60"/>
+              <w:right w:type="dxa" w:w="90"/>
+            </w:tcMar>
+            <w:vAlign w:val="top"/>
+          </w:tcPr>
+          <w:p>
+            <w:pPr>
+              <w:spacing w:after="80" w:line="264"/>
+            </w:pPr>
+            <w:r>
+              <w:rPr>
+                <w:rFonts w:ascii="Calibri" w:cs="Calibri" w:eastAsia="Calibri" w:hAnsi="Calibri"/>
+                <w:b/>
+                <w:bCs/>
+                <w:color w:val="FFFFFF"/>
+                <w:sz w:val="19"/>
+                <w:szCs w:val="19"/>
+              </w:rPr>
+              <w:t xml:space="preserve">Vos commentaires</w:t>
+            </w:r>
+          </w:p>
+        </w:tc>
+      </w:tr>
+      <w:tr>
+        <w:tc>
+          <w:tcPr>
+            <w:tcW w:type="dxa" w:w="2300"/>
+            <w:tcBorders>
+              <w:top w:val="single" w:color="D9D5CB" w:sz="4"/>
+              <w:left w:val="single" w:color="D9D5CB" w:sz="4"/>
+              <w:bottom w:val="single" w:color="D9D5CB" w:sz="4"/>
+              <w:right w:val="single" w:color="D9D5CB" w:sz="4"/>
+            </w:tcBorders>
+            <w:tcMar>
+              <w:top w:type="dxa" w:w="60"/>
+              <w:left w:type="dxa" w:w="90"/>
+              <w:bottom w:type="dxa" w:w="60"/>
+              <w:right w:type="dxa" w:w="90"/>
+            </w:tcMar>
+            <w:vAlign w:val="top"/>
+          </w:tcPr>
+          <w:p>
+            <w:pPr>
+              <w:spacing w:after="40"/>
+            </w:pPr>
+            <w:r>
+              <w:rPr>
+                <w:rFonts w:ascii="Calibri" w:cs="Calibri" w:eastAsia="Calibri" w:hAnsi="Calibri"/>
+                <w:b/>
+                <w:bCs/>
+                <w:color w:val="14213D"/>
+                <w:sz w:val="20"/>
+                <w:szCs w:val="20"/>
+              </w:rPr>
+              <w:t xml:space="preserve">Déployer la fonction « acces-code » (toi, une fois)</w:t>
+            </w:r>
+          </w:p>
+        </w:tc>
+        <w:tc>
+          <w:tcPr>
+            <w:tcW w:type="dxa" w:w="4100"/>
+            <w:tcBorders>
+              <w:top w:val="single" w:color="D9D5CB" w:sz="4"/>
+              <w:left w:val="single" w:color="D9D5CB" w:sz="4"/>
+              <w:bottom w:val="single" w:color="D9D5CB" w:sz="4"/>
+              <w:right w:val="single" w:color="D9D5CB" w:sz="4"/>
+            </w:tcBorders>
+            <w:tcMar>
+              <w:top w:type="dxa" w:w="60"/>
+              <w:left w:type="dxa" w:w="90"/>
+              <w:bottom w:type="dxa" w:w="60"/>
+              <w:right w:type="dxa" w:w="90"/>
+            </w:tcMar>
+            <w:vAlign w:val="top"/>
+          </w:tcPr>
+          <w:p>
+            <w:pPr>
+              <w:spacing w:after="40"/>
+            </w:pPr>
+            <w:r>
+              <w:rPr>
+                <w:rFonts w:ascii="Calibri" w:cs="Calibri" w:eastAsia="Calibri" w:hAnsi="Calibri"/>
+                <w:color w:val="14213D"/>
+                <w:sz w:val="19"/>
+                <w:szCs w:val="19"/>
+              </w:rPr>
+              <w:t xml:space="preserve">Supabase → Edge Functions → Deploy a new function → Via Editor → nom acces-code → coller tout le fichier app/supabase/functions/acces-code/index.ts → Deploy ; dans Details, laisser Verify JWT coché. Aucun SQL, aucun secret.</w:t>
+            </w:r>
+          </w:p>
+        </w:tc>
+        <w:tc>
+          <w:tcPr>
+            <w:tcW w:type="dxa" w:w="3700"/>
+            <w:tcBorders>
+              <w:top w:val="single" w:color="D9D5CB" w:sz="4"/>
+              <w:left w:val="single" w:color="D9D5CB" w:sz="4"/>
+              <w:bottom w:val="single" w:color="D9D5CB" w:sz="4"/>
+              <w:right w:val="single" w:color="D9D5CB" w:sz="4"/>
+            </w:tcBorders>
+            <w:tcMar>
+              <w:top w:type="dxa" w:w="60"/>
+              <w:left w:type="dxa" w:w="90"/>
+              <w:bottom w:type="dxa" w:w="60"/>
+              <w:right w:type="dxa" w:w="90"/>
+            </w:tcMar>
+            <w:vAlign w:val="top"/>
+          </w:tcPr>
+          <w:p>
+            <w:pPr>
+              <w:spacing w:after="40"/>
+            </w:pPr>
+            <w:r>
+              <w:rPr>
+                <w:rFonts w:ascii="Calibri" w:cs="Calibri" w:eastAsia="Calibri" w:hAnsi="Calibri"/>
+                <w:color w:val="14213D"/>
+                <w:sz w:val="19"/>
+                <w:szCs w:val="19"/>
+              </w:rPr>
+              <w:t xml:space="preserve">Sans elle, le bouton « Activer ce code » répond « fonction pas encore installée ». Testée de bout en bout ici (dans Deno, face à un Supabase simulé).</w:t>
+            </w:r>
+          </w:p>
+        </w:tc>
+        <w:tc>
+          <w:tcPr>
+            <w:tcW w:type="dxa" w:w="1300"/>
+            <w:tcBorders>
+              <w:top w:val="single" w:color="D9D5CB" w:sz="4"/>
+              <w:left w:val="single" w:color="D9D5CB" w:sz="4"/>
+              <w:bottom w:val="single" w:color="D9D5CB" w:sz="4"/>
+              <w:right w:val="single" w:color="D9D5CB" w:sz="4"/>
+            </w:tcBorders>
+            <w:shd w:fill="FFF4EE" w:color="auto" w:val="clear"/>
+            <w:tcMar>
+              <w:top w:type="dxa" w:w="60"/>
+              <w:left w:type="dxa" w:w="90"/>
+              <w:bottom w:type="dxa" w:w="60"/>
+              <w:right w:type="dxa" w:w="90"/>
+            </w:tcMar>
+            <w:vAlign w:val="top"/>
+          </w:tcPr>
+          <w:p>
+            <w:pPr>
+              <w:spacing w:after="40"/>
+            </w:pPr>
+            <w:r>
+              <w:rPr>
+                <w:rFonts w:ascii="Calibri" w:cs="Calibri" w:eastAsia="Calibri" w:hAnsi="Calibri"/>
+                <w:b/>
+                <w:bCs/>
+                <w:color w:val="14213D"/>
+                <w:sz w:val="19"/>
+                <w:szCs w:val="19"/>
+              </w:rPr>
+              <w:t xml:space="preserve">À faire (toi)</w:t>
+            </w:r>
+          </w:p>
+        </w:tc>
+        <w:tc>
+          <w:tcPr>
+            <w:tcW w:type="dxa" w:w="3700"/>
+            <w:tcBorders>
+              <w:top w:val="single" w:color="D9D5CB" w:sz="4"/>
+              <w:left w:val="single" w:color="D9D5CB" w:sz="4"/>
+              <w:bottom w:val="single" w:color="D9D5CB" w:sz="4"/>
+              <w:right w:val="single" w:color="D9D5CB" w:sz="4"/>
+            </w:tcBorders>
+            <w:tcMar>
+              <w:top w:type="dxa" w:w="60"/>
+              <w:left w:type="dxa" w:w="90"/>
+              <w:bottom w:type="dxa" w:w="60"/>
+              <w:right w:type="dxa" w:w="90"/>
+            </w:tcMar>
+            <w:vAlign w:val="top"/>
+          </w:tcPr>
+          <w:p>
+            <w:pPr>
+              <w:spacing w:after="40"/>
+            </w:pPr>
+            <w:r>
+              <w:rPr>
+                <w:rFonts w:ascii="Calibri" w:cs="Calibri" w:eastAsia="Calibri" w:hAnsi="Calibri"/>
+                <w:color w:val="14213D"/>
+                <w:sz w:val="20"/>
+                <w:szCs w:val="20"/>
+              </w:rPr>
+              <w:t xml:space="preserve"/>
+            </w:r>
+          </w:p>
+          <w:p>
+            <w:pPr>
+              <w:spacing w:after="40"/>
+            </w:pPr>
+            <w:r>
+              <w:rPr>
+                <w:rFonts w:ascii="Calibri" w:cs="Calibri" w:eastAsia="Calibri" w:hAnsi="Calibri"/>
+                <w:color w:val="14213D"/>
+                <w:sz w:val="20"/>
+                <w:szCs w:val="20"/>
+              </w:rPr>
+              <w:t xml:space="preserve"/>
+            </w:r>
+          </w:p>
+        </w:tc>
+      </w:tr>
+      <w:tr>
+        <w:tc>
+          <w:tcPr>
+            <w:tcW w:type="dxa" w:w="2300"/>
+            <w:tcBorders>
+              <w:top w:val="single" w:color="D9D5CB" w:sz="4"/>
+              <w:left w:val="single" w:color="D9D5CB" w:sz="4"/>
+              <w:bottom w:val="single" w:color="D9D5CB" w:sz="4"/>
+              <w:right w:val="single" w:color="D9D5CB" w:sz="4"/>
+            </w:tcBorders>
+            <w:tcMar>
+              <w:top w:type="dxa" w:w="60"/>
+              <w:left w:type="dxa" w:w="90"/>
+              <w:bottom w:type="dxa" w:w="60"/>
+              <w:right w:type="dxa" w:w="90"/>
+            </w:tcMar>
+            <w:vAlign w:val="top"/>
+          </w:tcPr>
+          <w:p>
+            <w:pPr>
+              <w:spacing w:after="40"/>
+            </w:pPr>
+            <w:r>
+              <w:rPr>
+                <w:rFonts w:ascii="Calibri" w:cs="Calibri" w:eastAsia="Calibri" w:hAnsi="Calibri"/>
+                <w:b/>
+                <w:bCs/>
+                <w:color w:val="14213D"/>
+                <w:sz w:val="20"/>
+                <w:szCs w:val="20"/>
+              </w:rPr>
+              <w:t xml:space="preserve">Donner un code</w:t>
+            </w:r>
+          </w:p>
+        </w:tc>
+        <w:tc>
+          <w:tcPr>
+            <w:tcW w:type="dxa" w:w="4100"/>
+            <w:tcBorders>
+              <w:top w:val="single" w:color="D9D5CB" w:sz="4"/>
+              <w:left w:val="single" w:color="D9D5CB" w:sz="4"/>
+              <w:bottom w:val="single" w:color="D9D5CB" w:sz="4"/>
+              <w:right w:val="single" w:color="D9D5CB" w:sz="4"/>
+            </w:tcBorders>
+            <w:tcMar>
+              <w:top w:type="dxa" w:w="60"/>
+              <w:left w:type="dxa" w:w="90"/>
+              <w:bottom w:type="dxa" w:w="60"/>
+              <w:right w:type="dxa" w:w="90"/>
+            </w:tcMar>
+            <w:vAlign w:val="top"/>
+          </w:tcPr>
+          <w:p>
+            <w:pPr>
+              <w:spacing w:after="40"/>
+            </w:pPr>
+            <w:r>
+              <w:rPr>
+                <w:rFonts w:ascii="Calibri" w:cs="Calibri" w:eastAsia="Calibri" w:hAnsi="Calibri"/>
+                <w:color w:val="14213D"/>
+                <w:sz w:val="19"/>
+                <w:szCs w:val="19"/>
+              </w:rPr>
+              <w:t xml:space="preserve">Administrateur → la carte de la personne → 🔐 Code de 1re connexion (invité) ou 🔐 Nouveau code (mot de passe oublié) → le code s'affiche en gros (ex. k7mp 4qxa : ni i, l, o, 0, 1) → « Activer ce code » → message prêt : 💬 Envoyer par SMS (le téléphone de sa fiche s'il est renseigné) ou 📋 Copier.</w:t>
+            </w:r>
+          </w:p>
+        </w:tc>
+        <w:tc>
+          <w:tcPr>
+            <w:tcW w:type="dxa" w:w="3700"/>
+            <w:tcBorders>
+              <w:top w:val="single" w:color="D9D5CB" w:sz="4"/>
+              <w:left w:val="single" w:color="D9D5CB" w:sz="4"/>
+              <w:bottom w:val="single" w:color="D9D5CB" w:sz="4"/>
+              <w:right w:val="single" w:color="D9D5CB" w:sz="4"/>
+            </w:tcBorders>
+            <w:tcMar>
+              <w:top w:type="dxa" w:w="60"/>
+              <w:left w:type="dxa" w:w="90"/>
+              <w:bottom w:type="dxa" w:w="60"/>
+              <w:right w:type="dxa" w:w="90"/>
+            </w:tcMar>
+            <w:vAlign w:val="top"/>
+          </w:tcPr>
+          <w:p>
+            <w:pPr>
+              <w:spacing w:after="40"/>
+            </w:pPr>
+            <w:r>
+              <w:rPr>
+                <w:rFonts w:ascii="Calibri" w:cs="Calibri" w:eastAsia="Calibri" w:hAnsi="Calibri"/>
+                <w:color w:val="14213D"/>
+                <w:sz w:val="19"/>
+                <w:szCs w:val="19"/>
+              </w:rPr>
+              <w:t xml:space="preserve">Pas pour toi-même ni pour un administrateur (refusé aussi par le serveur) : ton mot de passe se change dans 🔑 de ton compte. Un nouveau code annule le précédent.</w:t>
+            </w:r>
+          </w:p>
+        </w:tc>
+        <w:tc>
+          <w:tcPr>
+            <w:tcW w:type="dxa" w:w="1300"/>
+            <w:tcBorders>
+              <w:top w:val="single" w:color="D9D5CB" w:sz="4"/>
+              <w:left w:val="single" w:color="D9D5CB" w:sz="4"/>
+              <w:bottom w:val="single" w:color="D9D5CB" w:sz="4"/>
+              <w:right w:val="single" w:color="D9D5CB" w:sz="4"/>
+            </w:tcBorders>
+            <w:shd w:fill="E6F5EC" w:color="auto" w:val="clear"/>
+            <w:tcMar>
+              <w:top w:type="dxa" w:w="60"/>
+              <w:left w:type="dxa" w:w="90"/>
+              <w:bottom w:type="dxa" w:w="60"/>
+              <w:right w:type="dxa" w:w="90"/>
+            </w:tcMar>
+            <w:vAlign w:val="top"/>
+          </w:tcPr>
+          <w:p>
+            <w:pPr>
+              <w:spacing w:after="40"/>
+            </w:pPr>
+            <w:r>
+              <w:rPr>
+                <w:rFonts w:ascii="Calibri" w:cs="Calibri" w:eastAsia="Calibri" w:hAnsi="Calibri"/>
+                <w:b/>
+                <w:bCs/>
+                <w:color w:val="14213D"/>
+                <w:sz w:val="19"/>
+                <w:szCs w:val="19"/>
+              </w:rPr>
+              <w:t xml:space="preserve">Fait</w:t>
+            </w:r>
+          </w:p>
+        </w:tc>
+        <w:tc>
+          <w:tcPr>
+            <w:tcW w:type="dxa" w:w="3700"/>
+            <w:tcBorders>
+              <w:top w:val="single" w:color="D9D5CB" w:sz="4"/>
+              <w:left w:val="single" w:color="D9D5CB" w:sz="4"/>
+              <w:bottom w:val="single" w:color="D9D5CB" w:sz="4"/>
+              <w:right w:val="single" w:color="D9D5CB" w:sz="4"/>
+            </w:tcBorders>
+            <w:tcMar>
+              <w:top w:type="dxa" w:w="60"/>
+              <w:left w:type="dxa" w:w="90"/>
+              <w:bottom w:type="dxa" w:w="60"/>
+              <w:right w:type="dxa" w:w="90"/>
+            </w:tcMar>
+            <w:vAlign w:val="top"/>
+          </w:tcPr>
+          <w:p>
+            <w:pPr>
+              <w:spacing w:after="40"/>
+            </w:pPr>
+            <w:r>
+              <w:rPr>
+                <w:rFonts w:ascii="Calibri" w:cs="Calibri" w:eastAsia="Calibri" w:hAnsi="Calibri"/>
+                <w:color w:val="14213D"/>
+                <w:sz w:val="20"/>
+                <w:szCs w:val="20"/>
+              </w:rPr>
+              <w:t xml:space="preserve"/>
+            </w:r>
+          </w:p>
+          <w:p>
+            <w:pPr>
+              <w:spacing w:after="40"/>
+            </w:pPr>
+            <w:r>
+              <w:rPr>
+                <w:rFonts w:ascii="Calibri" w:cs="Calibri" w:eastAsia="Calibri" w:hAnsi="Calibri"/>
+                <w:color w:val="14213D"/>
+                <w:sz w:val="20"/>
+                <w:szCs w:val="20"/>
+              </w:rPr>
+              <w:t xml:space="preserve"/>
+            </w:r>
+          </w:p>
+        </w:tc>
+      </w:tr>
+      <w:tr>
+        <w:tc>
+          <w:tcPr>
+            <w:tcW w:type="dxa" w:w="2300"/>
+            <w:tcBorders>
+              <w:top w:val="single" w:color="D9D5CB" w:sz="4"/>
+              <w:left w:val="single" w:color="D9D5CB" w:sz="4"/>
+              <w:bottom w:val="single" w:color="D9D5CB" w:sz="4"/>
+              <w:right w:val="single" w:color="D9D5CB" w:sz="4"/>
+            </w:tcBorders>
+            <w:tcMar>
+              <w:top w:type="dxa" w:w="60"/>
+              <w:left w:type="dxa" w:w="90"/>
+              <w:bottom w:type="dxa" w:w="60"/>
+              <w:right w:type="dxa" w:w="90"/>
+            </w:tcMar>
+            <w:vAlign w:val="top"/>
+          </w:tcPr>
+          <w:p>
+            <w:pPr>
+              <w:spacing w:after="40"/>
+            </w:pPr>
+            <w:r>
+              <w:rPr>
+                <w:rFonts w:ascii="Calibri" w:cs="Calibri" w:eastAsia="Calibri" w:hAnsi="Calibri"/>
+                <w:b/>
+                <w:bCs/>
+                <w:color w:val="14213D"/>
+                <w:sz w:val="20"/>
+                <w:szCs w:val="20"/>
+              </w:rPr>
+              <w:t xml:space="preserve">Le gars crée son mot de passe dès l'accueil</w:t>
+            </w:r>
+          </w:p>
+        </w:tc>
+        <w:tc>
+          <w:tcPr>
+            <w:tcW w:type="dxa" w:w="4100"/>
+            <w:tcBorders>
+              <w:top w:val="single" w:color="D9D5CB" w:sz="4"/>
+              <w:left w:val="single" w:color="D9D5CB" w:sz="4"/>
+              <w:bottom w:val="single" w:color="D9D5CB" w:sz="4"/>
+              <w:right w:val="single" w:color="D9D5CB" w:sz="4"/>
+            </w:tcBorders>
+            <w:tcMar>
+              <w:top w:type="dxa" w:w="60"/>
+              <w:left w:type="dxa" w:w="90"/>
+              <w:bottom w:type="dxa" w:w="60"/>
+              <w:right w:type="dxa" w:w="90"/>
+            </w:tcMar>
+            <w:vAlign w:val="top"/>
+          </w:tcPr>
+          <w:p>
+            <w:pPr>
+              <w:spacing w:after="40"/>
+            </w:pPr>
+            <w:r>
+              <w:rPr>
+                <w:rFonts w:ascii="Calibri" w:cs="Calibri" w:eastAsia="Calibri" w:hAnsi="Calibri"/>
+                <w:color w:val="14213D"/>
+                <w:sz w:val="19"/>
+                <w:szCs w:val="19"/>
+              </w:rPr>
+              <w:t xml:space="preserve">Écran de connexion → « Première connexion ou oubli : créer mon mot de passe » → son e-mail, le code (espaces et majuscules acceptés), son mot de passe deux fois → « Valider et me connecter ».</w:t>
+            </w:r>
+          </w:p>
+        </w:tc>
+        <w:tc>
+          <w:tcPr>
+            <w:tcW w:type="dxa" w:w="3700"/>
+            <w:tcBorders>
+              <w:top w:val="single" w:color="D9D5CB" w:sz="4"/>
+              <w:left w:val="single" w:color="D9D5CB" w:sz="4"/>
+              <w:bottom w:val="single" w:color="D9D5CB" w:sz="4"/>
+              <w:right w:val="single" w:color="D9D5CB" w:sz="4"/>
+            </w:tcBorders>
+            <w:tcMar>
+              <w:top w:type="dxa" w:w="60"/>
+              <w:left w:type="dxa" w:w="90"/>
+              <w:bottom w:type="dxa" w:w="60"/>
+              <w:right w:type="dxa" w:w="90"/>
+            </w:tcMar>
+            <w:vAlign w:val="top"/>
+          </w:tcPr>
+          <w:p>
+            <w:pPr>
+              <w:spacing w:after="40"/>
+            </w:pPr>
+            <w:r>
+              <w:rPr>
+                <w:rFonts w:ascii="Calibri" w:cs="Calibri" w:eastAsia="Calibri" w:hAnsi="Calibri"/>
+                <w:color w:val="14213D"/>
+                <w:sz w:val="19"/>
+                <w:szCs w:val="19"/>
+              </w:rPr>
+              <w:t xml:space="preserve">S'il tape le code dans la case mot de passe normale : il est connecté puis l'écran « Choisis ton mot de passe » s'impose avant d'entrer (et revient s'il ferme l'appli avant). Toi, tu ne connais jamais son mot de passe.</w:t>
+            </w:r>
+          </w:p>
+        </w:tc>
+        <w:tc>
+          <w:tcPr>
+            <w:tcW w:type="dxa" w:w="1300"/>
+            <w:tcBorders>
+              <w:top w:val="single" w:color="D9D5CB" w:sz="4"/>
+              <w:left w:val="single" w:color="D9D5CB" w:sz="4"/>
+              <w:bottom w:val="single" w:color="D9D5CB" w:sz="4"/>
+              <w:right w:val="single" w:color="D9D5CB" w:sz="4"/>
+            </w:tcBorders>
+            <w:shd w:fill="E6F5EC" w:color="auto" w:val="clear"/>
+            <w:tcMar>
+              <w:top w:type="dxa" w:w="60"/>
+              <w:left w:type="dxa" w:w="90"/>
+              <w:bottom w:type="dxa" w:w="60"/>
+              <w:right w:type="dxa" w:w="90"/>
+            </w:tcMar>
+            <w:vAlign w:val="top"/>
+          </w:tcPr>
+          <w:p>
+            <w:pPr>
+              <w:spacing w:after="40"/>
+            </w:pPr>
+            <w:r>
+              <w:rPr>
+                <w:rFonts w:ascii="Calibri" w:cs="Calibri" w:eastAsia="Calibri" w:hAnsi="Calibri"/>
+                <w:b/>
+                <w:bCs/>
+                <w:color w:val="14213D"/>
+                <w:sz w:val="19"/>
+                <w:szCs w:val="19"/>
+              </w:rPr>
+              <w:t xml:space="preserve">Fait</w:t>
+            </w:r>
+          </w:p>
+        </w:tc>
+        <w:tc>
+          <w:tcPr>
+            <w:tcW w:type="dxa" w:w="3700"/>
+            <w:tcBorders>
+              <w:top w:val="single" w:color="D9D5CB" w:sz="4"/>
+              <w:left w:val="single" w:color="D9D5CB" w:sz="4"/>
+              <w:bottom w:val="single" w:color="D9D5CB" w:sz="4"/>
+              <w:right w:val="single" w:color="D9D5CB" w:sz="4"/>
+            </w:tcBorders>
+            <w:tcMar>
+              <w:top w:type="dxa" w:w="60"/>
+              <w:left w:type="dxa" w:w="90"/>
+              <w:bottom w:type="dxa" w:w="60"/>
+              <w:right w:type="dxa" w:w="90"/>
+            </w:tcMar>
+            <w:vAlign w:val="top"/>
+          </w:tcPr>
+          <w:p>
+            <w:pPr>
+              <w:spacing w:after="40"/>
+            </w:pPr>
+            <w:r>
+              <w:rPr>
+                <w:rFonts w:ascii="Calibri" w:cs="Calibri" w:eastAsia="Calibri" w:hAnsi="Calibri"/>
+                <w:color w:val="14213D"/>
+                <w:sz w:val="20"/>
+                <w:szCs w:val="20"/>
+              </w:rPr>
+              <w:t xml:space="preserve"/>
+            </w:r>
+          </w:p>
+          <w:p>
+            <w:pPr>
+              <w:spacing w:after="40"/>
+            </w:pPr>
+            <w:r>
+              <w:rPr>
+                <w:rFonts w:ascii="Calibri" w:cs="Calibri" w:eastAsia="Calibri" w:hAnsi="Calibri"/>
+                <w:color w:val="14213D"/>
+                <w:sz w:val="20"/>
+                <w:szCs w:val="20"/>
+              </w:rPr>
+              <w:t xml:space="preserve"/>
+            </w:r>
+          </w:p>
+        </w:tc>
+      </w:tr>
+      <w:tr>
+        <w:tc>
+          <w:tcPr>
+            <w:tcW w:type="dxa" w:w="2300"/>
+            <w:tcBorders>
+              <w:top w:val="single" w:color="D9D5CB" w:sz="4"/>
+              <w:left w:val="single" w:color="D9D5CB" w:sz="4"/>
+              <w:bottom w:val="single" w:color="D9D5CB" w:sz="4"/>
+              <w:right w:val="single" w:color="D9D5CB" w:sz="4"/>
+            </w:tcBorders>
+            <w:tcMar>
+              <w:top w:type="dxa" w:w="60"/>
+              <w:left w:type="dxa" w:w="90"/>
+              <w:bottom w:type="dxa" w:w="60"/>
+              <w:right w:type="dxa" w:w="90"/>
+            </w:tcMar>
+            <w:vAlign w:val="top"/>
+          </w:tcPr>
+          <w:p>
+            <w:pPr>
+              <w:spacing w:after="40"/>
+            </w:pPr>
+            <w:r>
+              <w:rPr>
+                <w:rFonts w:ascii="Calibri" w:cs="Calibri" w:eastAsia="Calibri" w:hAnsi="Calibri"/>
+                <w:b/>
+                <w:bCs/>
+                <w:color w:val="14213D"/>
+                <w:sz w:val="20"/>
+                <w:szCs w:val="20"/>
+              </w:rPr>
+              <w:t xml:space="preserve">E-mail toujours possible</w:t>
+            </w:r>
+          </w:p>
+        </w:tc>
+        <w:tc>
+          <w:tcPr>
+            <w:tcW w:type="dxa" w:w="4100"/>
+            <w:tcBorders>
+              <w:top w:val="single" w:color="D9D5CB" w:sz="4"/>
+              <w:left w:val="single" w:color="D9D5CB" w:sz="4"/>
+              <w:bottom w:val="single" w:color="D9D5CB" w:sz="4"/>
+              <w:right w:val="single" w:color="D9D5CB" w:sz="4"/>
+            </w:tcBorders>
+            <w:tcMar>
+              <w:top w:type="dxa" w:w="60"/>
+              <w:left w:type="dxa" w:w="90"/>
+              <w:bottom w:type="dxa" w:w="60"/>
+              <w:right w:type="dxa" w:w="90"/>
+            </w:tcMar>
+            <w:vAlign w:val="top"/>
+          </w:tcPr>
+          <w:p>
+            <w:pPr>
+              <w:spacing w:after="40"/>
+            </w:pPr>
+            <w:r>
+              <w:rPr>
+                <w:rFonts w:ascii="Calibri" w:cs="Calibri" w:eastAsia="Calibri" w:hAnsi="Calibri"/>
+                <w:color w:val="14213D"/>
+                <w:sz w:val="19"/>
+                <w:szCs w:val="19"/>
+              </w:rPr>
+              <w:t xml:space="preserve">« Pas de code ? Le recevoir par e-mail » reste sur le même écran. Pour une adresse que Supabase refuse : « demande ton code à ton responsable ».</w:t>
+            </w:r>
+          </w:p>
+        </w:tc>
+        <w:tc>
+          <w:tcPr>
+            <w:tcW w:type="dxa" w:w="3700"/>
+            <w:tcBorders>
+              <w:top w:val="single" w:color="D9D5CB" w:sz="4"/>
+              <w:left w:val="single" w:color="D9D5CB" w:sz="4"/>
+              <w:bottom w:val="single" w:color="D9D5CB" w:sz="4"/>
+              <w:right w:val="single" w:color="D9D5CB" w:sz="4"/>
+            </w:tcBorders>
+            <w:tcMar>
+              <w:top w:type="dxa" w:w="60"/>
+              <w:left w:type="dxa" w:w="90"/>
+              <w:bottom w:type="dxa" w:w="60"/>
+              <w:right w:type="dxa" w:w="90"/>
+            </w:tcMar>
+            <w:vAlign w:val="top"/>
+          </w:tcPr>
+          <w:p>
+            <w:pPr>
+              <w:spacing w:after="40"/>
+            </w:pPr>
+            <w:r>
+              <w:rPr>
+                <w:rFonts w:ascii="Calibri" w:cs="Calibri" w:eastAsia="Calibri" w:hAnsi="Calibri"/>
+                <w:color w:val="14213D"/>
+                <w:sz w:val="19"/>
+                <w:szCs w:val="19"/>
+              </w:rPr>
+              <w:t xml:space="preserve">Quand tu brancheras le SMTP : modèle de mail avec le code fourni dans le README.</w:t>
+            </w:r>
+          </w:p>
+        </w:tc>
+        <w:tc>
+          <w:tcPr>
+            <w:tcW w:type="dxa" w:w="1300"/>
+            <w:tcBorders>
+              <w:top w:val="single" w:color="D9D5CB" w:sz="4"/>
+              <w:left w:val="single" w:color="D9D5CB" w:sz="4"/>
+              <w:bottom w:val="single" w:color="D9D5CB" w:sz="4"/>
+              <w:right w:val="single" w:color="D9D5CB" w:sz="4"/>
+            </w:tcBorders>
+            <w:shd w:fill="E6F5EC" w:color="auto" w:val="clear"/>
+            <w:tcMar>
+              <w:top w:type="dxa" w:w="60"/>
+              <w:left w:type="dxa" w:w="90"/>
+              <w:bottom w:type="dxa" w:w="60"/>
+              <w:right w:type="dxa" w:w="90"/>
+            </w:tcMar>
+            <w:vAlign w:val="top"/>
+          </w:tcPr>
+          <w:p>
+            <w:pPr>
+              <w:spacing w:after="40"/>
+            </w:pPr>
+            <w:r>
+              <w:rPr>
+                <w:rFonts w:ascii="Calibri" w:cs="Calibri" w:eastAsia="Calibri" w:hAnsi="Calibri"/>
+                <w:b/>
+                <w:bCs/>
+                <w:color w:val="14213D"/>
+                <w:sz w:val="19"/>
+                <w:szCs w:val="19"/>
+              </w:rPr>
+              <w:t xml:space="preserve">Fait</w:t>
+            </w:r>
+          </w:p>
+        </w:tc>
+        <w:tc>
+          <w:tcPr>
+            <w:tcW w:type="dxa" w:w="3700"/>
+            <w:tcBorders>
+              <w:top w:val="single" w:color="D9D5CB" w:sz="4"/>
+              <w:left w:val="single" w:color="D9D5CB" w:sz="4"/>
+              <w:bottom w:val="single" w:color="D9D5CB" w:sz="4"/>
+              <w:right w:val="single" w:color="D9D5CB" w:sz="4"/>
+            </w:tcBorders>
+            <w:tcMar>
+              <w:top w:type="dxa" w:w="60"/>
+              <w:left w:type="dxa" w:w="90"/>
+              <w:bottom w:type="dxa" w:w="60"/>
+              <w:right w:type="dxa" w:w="90"/>
+            </w:tcMar>
+            <w:vAlign w:val="top"/>
+          </w:tcPr>
+          <w:p>
+            <w:pPr>
+              <w:spacing w:after="40"/>
+            </w:pPr>
+            <w:r>
+              <w:rPr>
+                <w:rFonts w:ascii="Calibri" w:cs="Calibri" w:eastAsia="Calibri" w:hAnsi="Calibri"/>
+                <w:color w:val="14213D"/>
+                <w:sz w:val="20"/>
+                <w:szCs w:val="20"/>
+              </w:rPr>
+              <w:t xml:space="preserve"/>
+            </w:r>
+          </w:p>
+          <w:p>
+            <w:pPr>
+              <w:spacing w:after="40"/>
+            </w:pPr>
+            <w:r>
+              <w:rPr>
+                <w:rFonts w:ascii="Calibri" w:cs="Calibri" w:eastAsia="Calibri" w:hAnsi="Calibri"/>
+                <w:color w:val="14213D"/>
+                <w:sz w:val="20"/>
+                <w:szCs w:val="20"/>
+              </w:rPr>
+              <w:t xml:space="preserve"/>
+            </w:r>
+          </w:p>
+        </w:tc>
+      </w:tr>
+      <w:tr>
+        <w:tc>
+          <w:tcPr>
+            <w:tcW w:type="dxa" w:w="2300"/>
+            <w:tcBorders>
+              <w:top w:val="single" w:color="D9D5CB" w:sz="4"/>
+              <w:left w:val="single" w:color="D9D5CB" w:sz="4"/>
+              <w:bottom w:val="single" w:color="D9D5CB" w:sz="4"/>
+              <w:right w:val="single" w:color="D9D5CB" w:sz="4"/>
+            </w:tcBorders>
+            <w:tcMar>
+              <w:top w:type="dxa" w:w="60"/>
+              <w:left w:type="dxa" w:w="90"/>
+              <w:bottom w:type="dxa" w:w="60"/>
+              <w:right w:type="dxa" w:w="90"/>
+            </w:tcMar>
+            <w:vAlign w:val="top"/>
+          </w:tcPr>
+          <w:p>
+            <w:pPr>
+              <w:spacing w:after="40"/>
+            </w:pPr>
+            <w:r>
+              <w:rPr>
+                <w:rFonts w:ascii="Calibri" w:cs="Calibri" w:eastAsia="Calibri" w:hAnsi="Calibri"/>
+                <w:b/>
+                <w:bCs/>
+                <w:color w:val="14213D"/>
+                <w:sz w:val="20"/>
+                <w:szCs w:val="20"/>
+              </w:rPr>
+              <w:t xml:space="preserve">Lecture, Quantités, Points : trois onglets</w:t>
+            </w:r>
+          </w:p>
+        </w:tc>
+        <w:tc>
+          <w:tcPr>
+            <w:tcW w:type="dxa" w:w="4100"/>
+            <w:tcBorders>
+              <w:top w:val="single" w:color="D9D5CB" w:sz="4"/>
+              <w:left w:val="single" w:color="D9D5CB" w:sz="4"/>
+              <w:bottom w:val="single" w:color="D9D5CB" w:sz="4"/>
+              <w:right w:val="single" w:color="D9D5CB" w:sz="4"/>
+            </w:tcBorders>
+            <w:tcMar>
+              <w:top w:type="dxa" w:w="60"/>
+              <w:left w:type="dxa" w:w="90"/>
+              <w:bottom w:type="dxa" w:w="60"/>
+              <w:right w:type="dxa" w:w="90"/>
+            </w:tcMar>
+            <w:vAlign w:val="top"/>
+          </w:tcPr>
+          <w:p>
+            <w:pPr>
+              <w:spacing w:after="40"/>
+            </w:pPr>
+            <w:r>
+              <w:rPr>
+                <w:rFonts w:ascii="Calibri" w:cs="Calibri" w:eastAsia="Calibri" w:hAnsi="Calibri"/>
+                <w:color w:val="14213D"/>
+                <w:sz w:val="19"/>
+                <w:szCs w:val="19"/>
+              </w:rPr>
+              <w:t xml:space="preserve">Fiche d'une affaire : 1 · Dossier · 2 · Lecture (la visionneuse et les notes, seules) · 3 · Quantités · 4 · Points · 5 · Chiffrage · 6 · Mémoire · 7 · DPGF · 8 · Offre.</w:t>
+            </w:r>
+          </w:p>
+        </w:tc>
+        <w:tc>
+          <w:tcPr>
+            <w:tcW w:type="dxa" w:w="3700"/>
+            <w:tcBorders>
+              <w:top w:val="single" w:color="D9D5CB" w:sz="4"/>
+              <w:left w:val="single" w:color="D9D5CB" w:sz="4"/>
+              <w:bottom w:val="single" w:color="D9D5CB" w:sz="4"/>
+              <w:right w:val="single" w:color="D9D5CB" w:sz="4"/>
+            </w:tcBorders>
+            <w:tcMar>
+              <w:top w:type="dxa" w:w="60"/>
+              <w:left w:type="dxa" w:w="90"/>
+              <w:bottom w:type="dxa" w:w="60"/>
+              <w:right w:type="dxa" w:w="90"/>
+            </w:tcMar>
+            <w:vAlign w:val="top"/>
+          </w:tcPr>
+          <w:p>
+            <w:pPr>
+              <w:spacing w:after="40"/>
+            </w:pPr>
+            <w:r>
+              <w:rPr>
+                <w:rFonts w:ascii="Calibri" w:cs="Calibri" w:eastAsia="Calibri" w:hAnsi="Calibri"/>
+                <w:color w:val="14213D"/>
+                <w:sz w:val="19"/>
+                <w:szCs w:val="19"/>
+              </w:rPr>
+              <w:t xml:space="preserve">Ton message : « un onglet lecture, un quantités, et après les autres points ».</w:t>
+            </w:r>
+          </w:p>
+        </w:tc>
+        <w:tc>
+          <w:tcPr>
+            <w:tcW w:type="dxa" w:w="1300"/>
+            <w:tcBorders>
+              <w:top w:val="single" w:color="D9D5CB" w:sz="4"/>
+              <w:left w:val="single" w:color="D9D5CB" w:sz="4"/>
+              <w:bottom w:val="single" w:color="D9D5CB" w:sz="4"/>
+              <w:right w:val="single" w:color="D9D5CB" w:sz="4"/>
+            </w:tcBorders>
+            <w:shd w:fill="E6F5EC" w:color="auto" w:val="clear"/>
+            <w:tcMar>
+              <w:top w:type="dxa" w:w="60"/>
+              <w:left w:type="dxa" w:w="90"/>
+              <w:bottom w:type="dxa" w:w="60"/>
+              <w:right w:type="dxa" w:w="90"/>
+            </w:tcMar>
+            <w:vAlign w:val="top"/>
+          </w:tcPr>
+          <w:p>
+            <w:pPr>
+              <w:spacing w:after="40"/>
+            </w:pPr>
+            <w:r>
+              <w:rPr>
+                <w:rFonts w:ascii="Calibri" w:cs="Calibri" w:eastAsia="Calibri" w:hAnsi="Calibri"/>
+                <w:b/>
+                <w:bCs/>
+                <w:color w:val="14213D"/>
+                <w:sz w:val="19"/>
+                <w:szCs w:val="19"/>
+              </w:rPr>
+              <w:t xml:space="preserve">Fait</w:t>
+            </w:r>
+          </w:p>
+        </w:tc>
+        <w:tc>
+          <w:tcPr>
+            <w:tcW w:type="dxa" w:w="3700"/>
+            <w:tcBorders>
+              <w:top w:val="single" w:color="D9D5CB" w:sz="4"/>
+              <w:left w:val="single" w:color="D9D5CB" w:sz="4"/>
+              <w:bottom w:val="single" w:color="D9D5CB" w:sz="4"/>
+              <w:right w:val="single" w:color="D9D5CB" w:sz="4"/>
+            </w:tcBorders>
+            <w:tcMar>
+              <w:top w:type="dxa" w:w="60"/>
+              <w:left w:type="dxa" w:w="90"/>
+              <w:bottom w:type="dxa" w:w="60"/>
+              <w:right w:type="dxa" w:w="90"/>
+            </w:tcMar>
+            <w:vAlign w:val="top"/>
+          </w:tcPr>
+          <w:p>
+            <w:pPr>
+              <w:spacing w:after="40"/>
+            </w:pPr>
+            <w:r>
+              <w:rPr>
+                <w:rFonts w:ascii="Calibri" w:cs="Calibri" w:eastAsia="Calibri" w:hAnsi="Calibri"/>
+                <w:color w:val="14213D"/>
+                <w:sz w:val="20"/>
+                <w:szCs w:val="20"/>
+              </w:rPr>
+              <w:t xml:space="preserve"/>
+            </w:r>
+          </w:p>
+          <w:p>
+            <w:pPr>
+              <w:spacing w:after="40"/>
+            </w:pPr>
+            <w:r>
+              <w:rPr>
+                <w:rFonts w:ascii="Calibri" w:cs="Calibri" w:eastAsia="Calibri" w:hAnsi="Calibri"/>
+                <w:color w:val="14213D"/>
+                <w:sz w:val="20"/>
+                <w:szCs w:val="20"/>
+              </w:rPr>
+              <w:t xml:space="preserve"/>
+            </w:r>
+          </w:p>
+        </w:tc>
+      </w:tr>
+      <w:tr>
+        <w:tc>
+          <w:tcPr>
+            <w:tcW w:type="dxa" w:w="2300"/>
+            <w:tcBorders>
+              <w:top w:val="single" w:color="D9D5CB" w:sz="4"/>
+              <w:left w:val="single" w:color="D9D5CB" w:sz="4"/>
+              <w:bottom w:val="single" w:color="D9D5CB" w:sz="4"/>
+              <w:right w:val="single" w:color="D9D5CB" w:sz="4"/>
+            </w:tcBorders>
+            <w:tcMar>
+              <w:top w:type="dxa" w:w="60"/>
+              <w:left w:type="dxa" w:w="90"/>
+              <w:bottom w:type="dxa" w:w="60"/>
+              <w:right w:type="dxa" w:w="90"/>
+            </w:tcMar>
+            <w:vAlign w:val="top"/>
+          </w:tcPr>
+          <w:p>
+            <w:pPr>
+              <w:spacing w:after="40"/>
+            </w:pPr>
+            <w:r>
+              <w:rPr>
+                <w:rFonts w:ascii="Calibri" w:cs="Calibri" w:eastAsia="Calibri" w:hAnsi="Calibri"/>
+                <w:b/>
+                <w:bCs/>
+                <w:color w:val="14213D"/>
+                <w:sz w:val="20"/>
+                <w:szCs w:val="20"/>
+              </w:rPr>
+              <w:t xml:space="preserve">Quantités : la référence saute aux yeux</w:t>
+            </w:r>
+          </w:p>
+        </w:tc>
+        <w:tc>
+          <w:tcPr>
+            <w:tcW w:type="dxa" w:w="4100"/>
+            <w:tcBorders>
+              <w:top w:val="single" w:color="D9D5CB" w:sz="4"/>
+              <w:left w:val="single" w:color="D9D5CB" w:sz="4"/>
+              <w:bottom w:val="single" w:color="D9D5CB" w:sz="4"/>
+              <w:right w:val="single" w:color="D9D5CB" w:sz="4"/>
+            </w:tcBorders>
+            <w:tcMar>
+              <w:top w:type="dxa" w:w="60"/>
+              <w:left w:type="dxa" w:w="90"/>
+              <w:bottom w:type="dxa" w:w="60"/>
+              <w:right w:type="dxa" w:w="90"/>
+            </w:tcMar>
+            <w:vAlign w:val="top"/>
+          </w:tcPr>
+          <w:p>
+            <w:pPr>
+              <w:spacing w:after="40"/>
+            </w:pPr>
+            <w:r>
+              <w:rPr>
+                <w:rFonts w:ascii="Calibri" w:cs="Calibri" w:eastAsia="Calibri" w:hAnsi="Calibri"/>
+                <w:color w:val="14213D"/>
+                <w:sz w:val="19"/>
+                <w:szCs w:val="19"/>
+              </w:rPr>
+              <w:t xml:space="preserve">3 · Quantités : bandeau ① importer → ② comparer → ③ référence ★ → ④ préremplir. En tête, la carte dorée « ★ Quantités de référence — ce sont elles qui préremplissent le chiffrage », avec leur origine (« prises sur INPAL — fichier le 13/10 », saisies, ou vides → quoi faire). Sur chaque quantitatif fournisseur : « ★ En faire la référence » ; la puce et l'étude choisie portent « ★ référence » ; le comparatif titre « ★ Référence ».</w:t>
+            </w:r>
+          </w:p>
+        </w:tc>
+        <w:tc>
+          <w:tcPr>
+            <w:tcW w:type="dxa" w:w="3700"/>
+            <w:tcBorders>
+              <w:top w:val="single" w:color="D9D5CB" w:sz="4"/>
+              <w:left w:val="single" w:color="D9D5CB" w:sz="4"/>
+              <w:bottom w:val="single" w:color="D9D5CB" w:sz="4"/>
+              <w:right w:val="single" w:color="D9D5CB" w:sz="4"/>
+            </w:tcBorders>
+            <w:tcMar>
+              <w:top w:type="dxa" w:w="60"/>
+              <w:left w:type="dxa" w:w="90"/>
+              <w:bottom w:type="dxa" w:w="60"/>
+              <w:right w:type="dxa" w:w="90"/>
+            </w:tcMar>
+            <w:vAlign w:val="top"/>
+          </w:tcPr>
+          <w:p>
+            <w:pPr>
+              <w:spacing w:after="40"/>
+            </w:pPr>
+            <w:r>
+              <w:rPr>
+                <w:rFonts w:ascii="Calibri" w:cs="Calibri" w:eastAsia="Calibri" w:hAnsi="Calibri"/>
+                <w:color w:val="14213D"/>
+                <w:sz w:val="19"/>
+                <w:szCs w:val="19"/>
+              </w:rPr>
+              <w:t xml:space="preserve">« Quantités repérées » n'existe plus nulle part (renommé partout, y compris la zone du chiffrage : « Quantités de référence »).</w:t>
+            </w:r>
+          </w:p>
+        </w:tc>
+        <w:tc>
+          <w:tcPr>
+            <w:tcW w:type="dxa" w:w="1300"/>
+            <w:tcBorders>
+              <w:top w:val="single" w:color="D9D5CB" w:sz="4"/>
+              <w:left w:val="single" w:color="D9D5CB" w:sz="4"/>
+              <w:bottom w:val="single" w:color="D9D5CB" w:sz="4"/>
+              <w:right w:val="single" w:color="D9D5CB" w:sz="4"/>
+            </w:tcBorders>
+            <w:shd w:fill="E6F5EC" w:color="auto" w:val="clear"/>
+            <w:tcMar>
+              <w:top w:type="dxa" w:w="60"/>
+              <w:left w:type="dxa" w:w="90"/>
+              <w:bottom w:type="dxa" w:w="60"/>
+              <w:right w:type="dxa" w:w="90"/>
+            </w:tcMar>
+            <w:vAlign w:val="top"/>
+          </w:tcPr>
+          <w:p>
+            <w:pPr>
+              <w:spacing w:after="40"/>
+            </w:pPr>
+            <w:r>
+              <w:rPr>
+                <w:rFonts w:ascii="Calibri" w:cs="Calibri" w:eastAsia="Calibri" w:hAnsi="Calibri"/>
+                <w:b/>
+                <w:bCs/>
+                <w:color w:val="14213D"/>
+                <w:sz w:val="19"/>
+                <w:szCs w:val="19"/>
+              </w:rPr>
+              <w:t xml:space="preserve">Fait</w:t>
+            </w:r>
+          </w:p>
+        </w:tc>
+        <w:tc>
+          <w:tcPr>
+            <w:tcW w:type="dxa" w:w="3700"/>
+            <w:tcBorders>
+              <w:top w:val="single" w:color="D9D5CB" w:sz="4"/>
+              <w:left w:val="single" w:color="D9D5CB" w:sz="4"/>
+              <w:bottom w:val="single" w:color="D9D5CB" w:sz="4"/>
+              <w:right w:val="single" w:color="D9D5CB" w:sz="4"/>
+            </w:tcBorders>
+            <w:tcMar>
+              <w:top w:type="dxa" w:w="60"/>
+              <w:left w:type="dxa" w:w="90"/>
+              <w:bottom w:type="dxa" w:w="60"/>
+              <w:right w:type="dxa" w:w="90"/>
+            </w:tcMar>
+            <w:vAlign w:val="top"/>
+          </w:tcPr>
+          <w:p>
+            <w:pPr>
+              <w:spacing w:after="40"/>
+            </w:pPr>
+            <w:r>
+              <w:rPr>
+                <w:rFonts w:ascii="Calibri" w:cs="Calibri" w:eastAsia="Calibri" w:hAnsi="Calibri"/>
+                <w:color w:val="14213D"/>
+                <w:sz w:val="20"/>
+                <w:szCs w:val="20"/>
+              </w:rPr>
+              <w:t xml:space="preserve"/>
+            </w:r>
+          </w:p>
+          <w:p>
+            <w:pPr>
+              <w:spacing w:after="40"/>
+            </w:pPr>
+            <w:r>
+              <w:rPr>
+                <w:rFonts w:ascii="Calibri" w:cs="Calibri" w:eastAsia="Calibri" w:hAnsi="Calibri"/>
+                <w:color w:val="14213D"/>
+                <w:sz w:val="20"/>
+                <w:szCs w:val="20"/>
+              </w:rPr>
+              <w:t xml:space="preserve"/>
+            </w:r>
+          </w:p>
+        </w:tc>
+      </w:tr>
+      <w:tr>
+        <w:tc>
+          <w:tcPr>
+            <w:tcW w:type="dxa" w:w="2300"/>
+            <w:tcBorders>
+              <w:top w:val="single" w:color="D9D5CB" w:sz="4"/>
+              <w:left w:val="single" w:color="D9D5CB" w:sz="4"/>
+              <w:bottom w:val="single" w:color="D9D5CB" w:sz="4"/>
+              <w:right w:val="single" w:color="D9D5CB" w:sz="4"/>
+            </w:tcBorders>
+            <w:tcMar>
+              <w:top w:type="dxa" w:w="60"/>
+              <w:left w:type="dxa" w:w="90"/>
+              <w:bottom w:type="dxa" w:w="60"/>
+              <w:right w:type="dxa" w:w="90"/>
+            </w:tcMar>
+            <w:vAlign w:val="top"/>
+          </w:tcPr>
+          <w:p>
+            <w:pPr>
+              <w:spacing w:after="40"/>
+            </w:pPr>
+            <w:r>
+              <w:rPr>
+                <w:rFonts w:ascii="Calibri" w:cs="Calibri" w:eastAsia="Calibri" w:hAnsi="Calibri"/>
+                <w:b/>
+                <w:bCs/>
+                <w:color w:val="14213D"/>
+                <w:sz w:val="20"/>
+                <w:szCs w:val="20"/>
+              </w:rPr>
+              <w:t xml:space="preserve">Bulle « tracé » à côté des quantités fournisseur</w:t>
+            </w:r>
+          </w:p>
+        </w:tc>
+        <w:tc>
+          <w:tcPr>
+            <w:tcW w:type="dxa" w:w="4100"/>
+            <w:tcBorders>
+              <w:top w:val="single" w:color="D9D5CB" w:sz="4"/>
+              <w:left w:val="single" w:color="D9D5CB" w:sz="4"/>
+              <w:bottom w:val="single" w:color="D9D5CB" w:sz="4"/>
+              <w:right w:val="single" w:color="D9D5CB" w:sz="4"/>
+            </w:tcBorders>
+            <w:tcMar>
+              <w:top w:type="dxa" w:w="60"/>
+              <w:left w:type="dxa" w:w="90"/>
+              <w:bottom w:type="dxa" w:w="60"/>
+              <w:right w:type="dxa" w:w="90"/>
+            </w:tcMar>
+            <w:vAlign w:val="top"/>
+          </w:tcPr>
+          <w:p>
+            <w:pPr>
+              <w:spacing w:after="40"/>
+            </w:pPr>
+            <w:r>
+              <w:rPr>
+                <w:rFonts w:ascii="Calibri" w:cs="Calibri" w:eastAsia="Calibri" w:hAnsi="Calibri"/>
+                <w:color w:val="14213D"/>
+                <w:sz w:val="19"/>
+                <w:szCs w:val="19"/>
+              </w:rPr>
+              <w:t xml:space="preserve">📐 Tracé · chantier lié : soudures · ml tracés → « ↗ Ouvrir le tracé ». Lié mais rien de tracé : « ✎ Tracer ». Aucun chantier : « ✎ Tracer le réseau » → le traceur. Le tracé reste aussi une colonne du comparatif, et peut devenir la référence.</w:t>
+            </w:r>
+          </w:p>
+        </w:tc>
+        <w:tc>
+          <w:tcPr>
+            <w:tcW w:type="dxa" w:w="3700"/>
+            <w:tcBorders>
+              <w:top w:val="single" w:color="D9D5CB" w:sz="4"/>
+              <w:left w:val="single" w:color="D9D5CB" w:sz="4"/>
+              <w:bottom w:val="single" w:color="D9D5CB" w:sz="4"/>
+              <w:right w:val="single" w:color="D9D5CB" w:sz="4"/>
+            </w:tcBorders>
+            <w:tcMar>
+              <w:top w:type="dxa" w:w="60"/>
+              <w:left w:type="dxa" w:w="90"/>
+              <w:bottom w:type="dxa" w:w="60"/>
+              <w:right w:type="dxa" w:w="90"/>
+            </w:tcMar>
+            <w:vAlign w:val="top"/>
+          </w:tcPr>
+          <w:p>
+            <w:pPr>
+              <w:spacing w:after="40"/>
+            </w:pPr>
+            <w:r>
+              <w:rPr>
+                <w:rFonts w:ascii="Calibri" w:cs="Calibri" w:eastAsia="Calibri" w:hAnsi="Calibri"/>
+                <w:color w:val="14213D"/>
+                <w:sz w:val="19"/>
+                <w:szCs w:val="19"/>
+              </w:rPr>
+              <w:t xml:space="preserve"/>
+            </w:r>
+          </w:p>
+        </w:tc>
+        <w:tc>
+          <w:tcPr>
+            <w:tcW w:type="dxa" w:w="1300"/>
+            <w:tcBorders>
+              <w:top w:val="single" w:color="D9D5CB" w:sz="4"/>
+              <w:left w:val="single" w:color="D9D5CB" w:sz="4"/>
+              <w:bottom w:val="single" w:color="D9D5CB" w:sz="4"/>
+              <w:right w:val="single" w:color="D9D5CB" w:sz="4"/>
+            </w:tcBorders>
+            <w:shd w:fill="E6F5EC" w:color="auto" w:val="clear"/>
+            <w:tcMar>
+              <w:top w:type="dxa" w:w="60"/>
+              <w:left w:type="dxa" w:w="90"/>
+              <w:bottom w:type="dxa" w:w="60"/>
+              <w:right w:type="dxa" w:w="90"/>
+            </w:tcMar>
+            <w:vAlign w:val="top"/>
+          </w:tcPr>
+          <w:p>
+            <w:pPr>
+              <w:spacing w:after="40"/>
+            </w:pPr>
+            <w:r>
+              <w:rPr>
+                <w:rFonts w:ascii="Calibri" w:cs="Calibri" w:eastAsia="Calibri" w:hAnsi="Calibri"/>
+                <w:b/>
+                <w:bCs/>
+                <w:color w:val="14213D"/>
+                <w:sz w:val="19"/>
+                <w:szCs w:val="19"/>
+              </w:rPr>
+              <w:t xml:space="preserve">Fait</w:t>
+            </w:r>
+          </w:p>
+        </w:tc>
+        <w:tc>
+          <w:tcPr>
+            <w:tcW w:type="dxa" w:w="3700"/>
+            <w:tcBorders>
+              <w:top w:val="single" w:color="D9D5CB" w:sz="4"/>
+              <w:left w:val="single" w:color="D9D5CB" w:sz="4"/>
+              <w:bottom w:val="single" w:color="D9D5CB" w:sz="4"/>
+              <w:right w:val="single" w:color="D9D5CB" w:sz="4"/>
+            </w:tcBorders>
+            <w:tcMar>
+              <w:top w:type="dxa" w:w="60"/>
+              <w:left w:type="dxa" w:w="90"/>
+              <w:bottom w:type="dxa" w:w="60"/>
+              <w:right w:type="dxa" w:w="90"/>
+            </w:tcMar>
+            <w:vAlign w:val="top"/>
+          </w:tcPr>
+          <w:p>
+            <w:pPr>
+              <w:spacing w:after="40"/>
+            </w:pPr>
+            <w:r>
+              <w:rPr>
+                <w:rFonts w:ascii="Calibri" w:cs="Calibri" w:eastAsia="Calibri" w:hAnsi="Calibri"/>
+                <w:color w:val="14213D"/>
+                <w:sz w:val="20"/>
+                <w:szCs w:val="20"/>
+              </w:rPr>
+              <w:t xml:space="preserve"/>
+            </w:r>
+          </w:p>
+          <w:p>
+            <w:pPr>
+              <w:spacing w:after="40"/>
+            </w:pPr>
+            <w:r>
+              <w:rPr>
+                <w:rFonts w:ascii="Calibri" w:cs="Calibri" w:eastAsia="Calibri" w:hAnsi="Calibri"/>
+                <w:color w:val="14213D"/>
+                <w:sz w:val="20"/>
+                <w:szCs w:val="20"/>
+              </w:rPr>
+              <w:t xml:space="preserve"/>
+            </w:r>
+          </w:p>
+        </w:tc>
+      </w:tr>
+      <w:tr>
+        <w:tc>
+          <w:tcPr>
+            <w:tcW w:type="dxa" w:w="2300"/>
+            <w:tcBorders>
+              <w:top w:val="single" w:color="D9D5CB" w:sz="4"/>
+              <w:left w:val="single" w:color="D9D5CB" w:sz="4"/>
+              <w:bottom w:val="single" w:color="D9D5CB" w:sz="4"/>
+              <w:right w:val="single" w:color="D9D5CB" w:sz="4"/>
+            </w:tcBorders>
+            <w:tcMar>
+              <w:top w:type="dxa" w:w="60"/>
+              <w:left w:type="dxa" w:w="90"/>
+              <w:bottom w:type="dxa" w:w="60"/>
+              <w:right w:type="dxa" w:w="90"/>
+            </w:tcMar>
+            <w:vAlign w:val="top"/>
+          </w:tcPr>
+          <w:p>
+            <w:pPr>
+              <w:spacing w:after="40"/>
+            </w:pPr>
+            <w:r>
+              <w:rPr>
+                <w:rFonts w:ascii="Calibri" w:cs="Calibri" w:eastAsia="Calibri" w:hAnsi="Calibri"/>
+                <w:b/>
+                <w:bCs/>
+                <w:color w:val="14213D"/>
+                <w:sz w:val="20"/>
+                <w:szCs w:val="20"/>
+              </w:rPr>
+              <w:t xml:space="preserve">Le quantitatif importé est gardé</w:t>
+            </w:r>
+          </w:p>
+        </w:tc>
+        <w:tc>
+          <w:tcPr>
+            <w:tcW w:type="dxa" w:w="4100"/>
+            <w:tcBorders>
+              <w:top w:val="single" w:color="D9D5CB" w:sz="4"/>
+              <w:left w:val="single" w:color="D9D5CB" w:sz="4"/>
+              <w:bottom w:val="single" w:color="D9D5CB" w:sz="4"/>
+              <w:right w:val="single" w:color="D9D5CB" w:sz="4"/>
+            </w:tcBorders>
+            <w:tcMar>
+              <w:top w:type="dxa" w:w="60"/>
+              <w:left w:type="dxa" w:w="90"/>
+              <w:bottom w:type="dxa" w:w="60"/>
+              <w:right w:type="dxa" w:w="90"/>
+            </w:tcMar>
+            <w:vAlign w:val="top"/>
+          </w:tcPr>
+          <w:p>
+            <w:pPr>
+              <w:spacing w:after="40"/>
+            </w:pPr>
+            <w:r>
+              <w:rPr>
+                <w:rFonts w:ascii="Calibri" w:cs="Calibri" w:eastAsia="Calibri" w:hAnsi="Calibri"/>
+                <w:color w:val="14213D"/>
+                <w:sz w:val="19"/>
+                <w:szCs w:val="19"/>
+              </w:rPr>
+              <w:t xml:space="preserve">Le fichier déposé (Excel, PDF) part au stockage de l'affaire ; sur l'étude : « 📎 nom du fichier » pour le rouvrir.</w:t>
+            </w:r>
+          </w:p>
+        </w:tc>
+        <w:tc>
+          <w:tcPr>
+            <w:tcW w:type="dxa" w:w="3700"/>
+            <w:tcBorders>
+              <w:top w:val="single" w:color="D9D5CB" w:sz="4"/>
+              <w:left w:val="single" w:color="D9D5CB" w:sz="4"/>
+              <w:bottom w:val="single" w:color="D9D5CB" w:sz="4"/>
+              <w:right w:val="single" w:color="D9D5CB" w:sz="4"/>
+            </w:tcBorders>
+            <w:tcMar>
+              <w:top w:type="dxa" w:w="60"/>
+              <w:left w:type="dxa" w:w="90"/>
+              <w:bottom w:type="dxa" w:w="60"/>
+              <w:right w:type="dxa" w:w="90"/>
+            </w:tcMar>
+            <w:vAlign w:val="top"/>
+          </w:tcPr>
+          <w:p>
+            <w:pPr>
+              <w:spacing w:after="40"/>
+            </w:pPr>
+            <w:r>
+              <w:rPr>
+                <w:rFonts w:ascii="Calibri" w:cs="Calibri" w:eastAsia="Calibri" w:hAnsi="Calibri"/>
+                <w:color w:val="14213D"/>
+                <w:sz w:val="19"/>
+                <w:szCs w:val="19"/>
+              </w:rPr>
+              <w:t xml:space="preserve">Connecté seulement (hors connexion : le nom est gardé, pas le fichier).</w:t>
+            </w:r>
+          </w:p>
+        </w:tc>
+        <w:tc>
+          <w:tcPr>
+            <w:tcW w:type="dxa" w:w="1300"/>
+            <w:tcBorders>
+              <w:top w:val="single" w:color="D9D5CB" w:sz="4"/>
+              <w:left w:val="single" w:color="D9D5CB" w:sz="4"/>
+              <w:bottom w:val="single" w:color="D9D5CB" w:sz="4"/>
+              <w:right w:val="single" w:color="D9D5CB" w:sz="4"/>
+            </w:tcBorders>
+            <w:shd w:fill="E6F5EC" w:color="auto" w:val="clear"/>
+            <w:tcMar>
+              <w:top w:type="dxa" w:w="60"/>
+              <w:left w:type="dxa" w:w="90"/>
+              <w:bottom w:type="dxa" w:w="60"/>
+              <w:right w:type="dxa" w:w="90"/>
+            </w:tcMar>
+            <w:vAlign w:val="top"/>
+          </w:tcPr>
+          <w:p>
+            <w:pPr>
+              <w:spacing w:after="40"/>
+            </w:pPr>
+            <w:r>
+              <w:rPr>
+                <w:rFonts w:ascii="Calibri" w:cs="Calibri" w:eastAsia="Calibri" w:hAnsi="Calibri"/>
+                <w:b/>
+                <w:bCs/>
+                <w:color w:val="14213D"/>
+                <w:sz w:val="19"/>
+                <w:szCs w:val="19"/>
+              </w:rPr>
+              <w:t xml:space="preserve">Fait</w:t>
+            </w:r>
+          </w:p>
+        </w:tc>
+        <w:tc>
+          <w:tcPr>
+            <w:tcW w:type="dxa" w:w="3700"/>
+            <w:tcBorders>
+              <w:top w:val="single" w:color="D9D5CB" w:sz="4"/>
+              <w:left w:val="single" w:color="D9D5CB" w:sz="4"/>
+              <w:bottom w:val="single" w:color="D9D5CB" w:sz="4"/>
+              <w:right w:val="single" w:color="D9D5CB" w:sz="4"/>
+            </w:tcBorders>
+            <w:tcMar>
+              <w:top w:type="dxa" w:w="60"/>
+              <w:left w:type="dxa" w:w="90"/>
+              <w:bottom w:type="dxa" w:w="60"/>
+              <w:right w:type="dxa" w:w="90"/>
+            </w:tcMar>
+            <w:vAlign w:val="top"/>
+          </w:tcPr>
+          <w:p>
+            <w:pPr>
+              <w:spacing w:after="40"/>
+            </w:pPr>
+            <w:r>
+              <w:rPr>
+                <w:rFonts w:ascii="Calibri" w:cs="Calibri" w:eastAsia="Calibri" w:hAnsi="Calibri"/>
+                <w:color w:val="14213D"/>
+                <w:sz w:val="20"/>
+                <w:szCs w:val="20"/>
+              </w:rPr>
+              <w:t xml:space="preserve"/>
+            </w:r>
+          </w:p>
+          <w:p>
+            <w:pPr>
+              <w:spacing w:after="40"/>
+            </w:pPr>
+            <w:r>
+              <w:rPr>
+                <w:rFonts w:ascii="Calibri" w:cs="Calibri" w:eastAsia="Calibri" w:hAnsi="Calibri"/>
+                <w:color w:val="14213D"/>
+                <w:sz w:val="20"/>
+                <w:szCs w:val="20"/>
+              </w:rPr>
+              <w:t xml:space="preserve"/>
+            </w:r>
+          </w:p>
+        </w:tc>
+      </w:tr>
+      <w:tr>
+        <w:tc>
+          <w:tcPr>
+            <w:tcW w:type="dxa" w:w="2300"/>
+            <w:tcBorders>
+              <w:top w:val="single" w:color="D9D5CB" w:sz="4"/>
+              <w:left w:val="single" w:color="D9D5CB" w:sz="4"/>
+              <w:bottom w:val="single" w:color="D9D5CB" w:sz="4"/>
+              <w:right w:val="single" w:color="D9D5CB" w:sz="4"/>
+            </w:tcBorders>
+            <w:tcMar>
+              <w:top w:type="dxa" w:w="60"/>
+              <w:left w:type="dxa" w:w="90"/>
+              <w:bottom w:type="dxa" w:w="60"/>
+              <w:right w:type="dxa" w:w="90"/>
+            </w:tcMar>
+            <w:vAlign w:val="top"/>
+          </w:tcPr>
+          <w:p>
+            <w:pPr>
+              <w:spacing w:after="40"/>
+            </w:pPr>
+            <w:r>
+              <w:rPr>
+                <w:rFonts w:ascii="Calibri" w:cs="Calibri" w:eastAsia="Calibri" w:hAnsi="Calibri"/>
+                <w:b/>
+                <w:bCs/>
+                <w:color w:val="14213D"/>
+                <w:sz w:val="20"/>
+                <w:szCs w:val="20"/>
+              </w:rPr>
+              <w:t xml:space="preserve">AXIOM « kit manchon avec mousse »</w:t>
+            </w:r>
+          </w:p>
+        </w:tc>
+        <w:tc>
+          <w:tcPr>
+            <w:tcW w:type="dxa" w:w="4100"/>
+            <w:tcBorders>
+              <w:top w:val="single" w:color="D9D5CB" w:sz="4"/>
+              <w:left w:val="single" w:color="D9D5CB" w:sz="4"/>
+              <w:bottom w:val="single" w:color="D9D5CB" w:sz="4"/>
+              <w:right w:val="single" w:color="D9D5CB" w:sz="4"/>
+            </w:tcBorders>
+            <w:tcMar>
+              <w:top w:type="dxa" w:w="60"/>
+              <w:left w:type="dxa" w:w="90"/>
+              <w:bottom w:type="dxa" w:w="60"/>
+              <w:right w:type="dxa" w:w="90"/>
+            </w:tcMar>
+            <w:vAlign w:val="top"/>
+          </w:tcPr>
+          <w:p>
+            <w:pPr>
+              <w:spacing w:after="40"/>
+            </w:pPr>
+            <w:r>
+              <w:rPr>
+                <w:rFonts w:ascii="Calibri" w:cs="Calibri" w:eastAsia="Calibri" w:hAnsi="Calibri"/>
+                <w:color w:val="14213D"/>
+                <w:sz w:val="19"/>
+                <w:szCs w:val="19"/>
+              </w:rPr>
+              <w:t xml:space="preserve">Compté comme UN manchon (avant : mousse PU). La pochette de mousse seule reste de la mousse.</w:t>
+            </w:r>
+          </w:p>
+        </w:tc>
+        <w:tc>
+          <w:tcPr>
+            <w:tcW w:type="dxa" w:w="3700"/>
+            <w:tcBorders>
+              <w:top w:val="single" w:color="D9D5CB" w:sz="4"/>
+              <w:left w:val="single" w:color="D9D5CB" w:sz="4"/>
+              <w:bottom w:val="single" w:color="D9D5CB" w:sz="4"/>
+              <w:right w:val="single" w:color="D9D5CB" w:sz="4"/>
+            </w:tcBorders>
+            <w:tcMar>
+              <w:top w:type="dxa" w:w="60"/>
+              <w:left w:type="dxa" w:w="90"/>
+              <w:bottom w:type="dxa" w:w="60"/>
+              <w:right w:type="dxa" w:w="90"/>
+            </w:tcMar>
+            <w:vAlign w:val="top"/>
+          </w:tcPr>
+          <w:p>
+            <w:pPr>
+              <w:spacing w:after="40"/>
+            </w:pPr>
+            <w:r>
+              <w:rPr>
+                <w:rFonts w:ascii="Calibri" w:cs="Calibri" w:eastAsia="Calibri" w:hAnsi="Calibri"/>
+                <w:color w:val="14213D"/>
+                <w:sz w:val="19"/>
+                <w:szCs w:val="19"/>
+              </w:rPr>
+              <w:t xml:space="preserve"/>
+            </w:r>
+          </w:p>
+        </w:tc>
+        <w:tc>
+          <w:tcPr>
+            <w:tcW w:type="dxa" w:w="1300"/>
+            <w:tcBorders>
+              <w:top w:val="single" w:color="D9D5CB" w:sz="4"/>
+              <w:left w:val="single" w:color="D9D5CB" w:sz="4"/>
+              <w:bottom w:val="single" w:color="D9D5CB" w:sz="4"/>
+              <w:right w:val="single" w:color="D9D5CB" w:sz="4"/>
+            </w:tcBorders>
+            <w:shd w:fill="E6F5EC" w:color="auto" w:val="clear"/>
+            <w:tcMar>
+              <w:top w:type="dxa" w:w="60"/>
+              <w:left w:type="dxa" w:w="90"/>
+              <w:bottom w:type="dxa" w:w="60"/>
+              <w:right w:type="dxa" w:w="90"/>
+            </w:tcMar>
+            <w:vAlign w:val="top"/>
+          </w:tcPr>
+          <w:p>
+            <w:pPr>
+              <w:spacing w:after="40"/>
+            </w:pPr>
+            <w:r>
+              <w:rPr>
+                <w:rFonts w:ascii="Calibri" w:cs="Calibri" w:eastAsia="Calibri" w:hAnsi="Calibri"/>
+                <w:b/>
+                <w:bCs/>
+                <w:color w:val="14213D"/>
+                <w:sz w:val="19"/>
+                <w:szCs w:val="19"/>
+              </w:rPr>
+              <w:t xml:space="preserve">Fait</w:t>
+            </w:r>
+          </w:p>
+        </w:tc>
+        <w:tc>
+          <w:tcPr>
+            <w:tcW w:type="dxa" w:w="3700"/>
+            <w:tcBorders>
+              <w:top w:val="single" w:color="D9D5CB" w:sz="4"/>
+              <w:left w:val="single" w:color="D9D5CB" w:sz="4"/>
+              <w:bottom w:val="single" w:color="D9D5CB" w:sz="4"/>
+              <w:right w:val="single" w:color="D9D5CB" w:sz="4"/>
+            </w:tcBorders>
+            <w:tcMar>
+              <w:top w:type="dxa" w:w="60"/>
+              <w:left w:type="dxa" w:w="90"/>
+              <w:bottom w:type="dxa" w:w="60"/>
+              <w:right w:type="dxa" w:w="90"/>
+            </w:tcMar>
+            <w:vAlign w:val="top"/>
+          </w:tcPr>
+          <w:p>
+            <w:pPr>
+              <w:spacing w:after="40"/>
+            </w:pPr>
+            <w:r>
+              <w:rPr>
+                <w:rFonts w:ascii="Calibri" w:cs="Calibri" w:eastAsia="Calibri" w:hAnsi="Calibri"/>
+                <w:color w:val="14213D"/>
+                <w:sz w:val="20"/>
+                <w:szCs w:val="20"/>
+              </w:rPr>
+              <w:t xml:space="preserve"/>
+            </w:r>
+          </w:p>
+          <w:p>
+            <w:pPr>
+              <w:spacing w:after="40"/>
+            </w:pPr>
+            <w:r>
+              <w:rPr>
+                <w:rFonts w:ascii="Calibri" w:cs="Calibri" w:eastAsia="Calibri" w:hAnsi="Calibri"/>
+                <w:color w:val="14213D"/>
+                <w:sz w:val="20"/>
+                <w:szCs w:val="20"/>
+              </w:rPr>
+              <w:t xml:space="preserve"/>
+            </w:r>
+          </w:p>
+        </w:tc>
+      </w:tr>
+      <w:tr>
+        <w:tc>
+          <w:tcPr>
+            <w:tcW w:type="dxa" w:w="2300"/>
+            <w:tcBorders>
+              <w:top w:val="single" w:color="D9D5CB" w:sz="4"/>
+              <w:left w:val="single" w:color="D9D5CB" w:sz="4"/>
+              <w:bottom w:val="single" w:color="D9D5CB" w:sz="4"/>
+              <w:right w:val="single" w:color="D9D5CB" w:sz="4"/>
+            </w:tcBorders>
+            <w:tcMar>
+              <w:top w:type="dxa" w:w="60"/>
+              <w:left w:type="dxa" w:w="90"/>
+              <w:bottom w:type="dxa" w:w="60"/>
+              <w:right w:type="dxa" w:w="90"/>
+            </w:tcMar>
+            <w:vAlign w:val="top"/>
+          </w:tcPr>
+          <w:p>
+            <w:pPr>
+              <w:spacing w:after="40"/>
+            </w:pPr>
+            <w:r>
+              <w:rPr>
+                <w:rFonts w:ascii="Calibri" w:cs="Calibri" w:eastAsia="Calibri" w:hAnsi="Calibri"/>
+                <w:b/>
+                <w:bCs/>
+                <w:color w:val="14213D"/>
+                <w:sz w:val="20"/>
+                <w:szCs w:val="20"/>
+              </w:rPr>
+              <w:t xml:space="preserve">Colonne € / pouce retirée</w:t>
+            </w:r>
+          </w:p>
+        </w:tc>
+        <w:tc>
+          <w:tcPr>
+            <w:tcW w:type="dxa" w:w="4100"/>
+            <w:tcBorders>
+              <w:top w:val="single" w:color="D9D5CB" w:sz="4"/>
+              <w:left w:val="single" w:color="D9D5CB" w:sz="4"/>
+              <w:bottom w:val="single" w:color="D9D5CB" w:sz="4"/>
+              <w:right w:val="single" w:color="D9D5CB" w:sz="4"/>
+            </w:tcBorders>
+            <w:tcMar>
+              <w:top w:type="dxa" w:w="60"/>
+              <w:left w:type="dxa" w:w="90"/>
+              <w:bottom w:type="dxa" w:w="60"/>
+              <w:right w:type="dxa" w:w="90"/>
+            </w:tcMar>
+            <w:vAlign w:val="top"/>
+          </w:tcPr>
+          <w:p>
+            <w:pPr>
+              <w:spacing w:after="40"/>
+            </w:pPr>
+            <w:r>
+              <w:rPr>
+                <w:rFonts w:ascii="Calibri" w:cs="Calibri" w:eastAsia="Calibri" w:hAnsi="Calibri"/>
+                <w:color w:val="14213D"/>
+                <w:sz w:val="19"/>
+                <w:szCs w:val="19"/>
+              </w:rPr>
+              <w:t xml:space="preserve">Table des DN du chiffrage (écran et impression), v1 et v2. Le prix du pouce reste calculé derrière (soudure €).</w:t>
+            </w:r>
+          </w:p>
+        </w:tc>
+        <w:tc>
+          <w:tcPr>
+            <w:tcW w:type="dxa" w:w="3700"/>
+            <w:tcBorders>
+              <w:top w:val="single" w:color="D9D5CB" w:sz="4"/>
+              <w:left w:val="single" w:color="D9D5CB" w:sz="4"/>
+              <w:bottom w:val="single" w:color="D9D5CB" w:sz="4"/>
+              <w:right w:val="single" w:color="D9D5CB" w:sz="4"/>
+            </w:tcBorders>
+            <w:tcMar>
+              <w:top w:type="dxa" w:w="60"/>
+              <w:left w:type="dxa" w:w="90"/>
+              <w:bottom w:type="dxa" w:w="60"/>
+              <w:right w:type="dxa" w:w="90"/>
+            </w:tcMar>
+            <w:vAlign w:val="top"/>
+          </w:tcPr>
+          <w:p>
+            <w:pPr>
+              <w:spacing w:after="40"/>
+            </w:pPr>
+            <w:r>
+              <w:rPr>
+                <w:rFonts w:ascii="Calibri" w:cs="Calibri" w:eastAsia="Calibri" w:hAnsi="Calibri"/>
+                <w:color w:val="14213D"/>
+                <w:sz w:val="19"/>
+                <w:szCs w:val="19"/>
+              </w:rPr>
+              <w:t xml:space="preserve"/>
+            </w:r>
+          </w:p>
+        </w:tc>
+        <w:tc>
+          <w:tcPr>
+            <w:tcW w:type="dxa" w:w="1300"/>
+            <w:tcBorders>
+              <w:top w:val="single" w:color="D9D5CB" w:sz="4"/>
+              <w:left w:val="single" w:color="D9D5CB" w:sz="4"/>
+              <w:bottom w:val="single" w:color="D9D5CB" w:sz="4"/>
+              <w:right w:val="single" w:color="D9D5CB" w:sz="4"/>
+            </w:tcBorders>
+            <w:shd w:fill="E6F5EC" w:color="auto" w:val="clear"/>
+            <w:tcMar>
+              <w:top w:type="dxa" w:w="60"/>
+              <w:left w:type="dxa" w:w="90"/>
+              <w:bottom w:type="dxa" w:w="60"/>
+              <w:right w:type="dxa" w:w="90"/>
+            </w:tcMar>
+            <w:vAlign w:val="top"/>
+          </w:tcPr>
+          <w:p>
+            <w:pPr>
+              <w:spacing w:after="40"/>
+            </w:pPr>
+            <w:r>
+              <w:rPr>
+                <w:rFonts w:ascii="Calibri" w:cs="Calibri" w:eastAsia="Calibri" w:hAnsi="Calibri"/>
+                <w:b/>
+                <w:bCs/>
+                <w:color w:val="14213D"/>
+                <w:sz w:val="19"/>
+                <w:szCs w:val="19"/>
+              </w:rPr>
+              <w:t xml:space="preserve">Fait</w:t>
+            </w:r>
+          </w:p>
+        </w:tc>
+        <w:tc>
+          <w:tcPr>
+            <w:tcW w:type="dxa" w:w="3700"/>
+            <w:tcBorders>
+              <w:top w:val="single" w:color="D9D5CB" w:sz="4"/>
+              <w:left w:val="single" w:color="D9D5CB" w:sz="4"/>
+              <w:bottom w:val="single" w:color="D9D5CB" w:sz="4"/>
+              <w:right w:val="single" w:color="D9D5CB" w:sz="4"/>
+            </w:tcBorders>
+            <w:tcMar>
+              <w:top w:type="dxa" w:w="60"/>
+              <w:left w:type="dxa" w:w="90"/>
+              <w:bottom w:type="dxa" w:w="60"/>
+              <w:right w:type="dxa" w:w="90"/>
+            </w:tcMar>
+            <w:vAlign w:val="top"/>
+          </w:tcPr>
+          <w:p>
+            <w:pPr>
+              <w:spacing w:after="40"/>
+            </w:pPr>
+            <w:r>
+              <w:rPr>
+                <w:rFonts w:ascii="Calibri" w:cs="Calibri" w:eastAsia="Calibri" w:hAnsi="Calibri"/>
+                <w:color w:val="14213D"/>
+                <w:sz w:val="20"/>
+                <w:szCs w:val="20"/>
+              </w:rPr>
+              <w:t xml:space="preserve"/>
+            </w:r>
+          </w:p>
+          <w:p>
+            <w:pPr>
+              <w:spacing w:after="40"/>
+            </w:pPr>
+            <w:r>
+              <w:rPr>
+                <w:rFonts w:ascii="Calibri" w:cs="Calibri" w:eastAsia="Calibri" w:hAnsi="Calibri"/>
+                <w:color w:val="14213D"/>
+                <w:sz w:val="20"/>
+                <w:szCs w:val="20"/>
+              </w:rPr>
+              <w:t xml:space="preserve"/>
+            </w:r>
+          </w:p>
+        </w:tc>
+      </w:tr>
+      <w:tr>
+        <w:tc>
+          <w:tcPr>
+            <w:tcW w:type="dxa" w:w="2300"/>
+            <w:tcBorders>
+              <w:top w:val="single" w:color="D9D5CB" w:sz="4"/>
+              <w:left w:val="single" w:color="D9D5CB" w:sz="4"/>
+              <w:bottom w:val="single" w:color="D9D5CB" w:sz="4"/>
+              <w:right w:val="single" w:color="D9D5CB" w:sz="4"/>
+            </w:tcBorders>
+            <w:tcMar>
+              <w:top w:type="dxa" w:w="60"/>
+              <w:left w:type="dxa" w:w="90"/>
+              <w:bottom w:type="dxa" w:w="60"/>
+              <w:right w:type="dxa" w:w="90"/>
+            </w:tcMar>
+            <w:vAlign w:val="top"/>
+          </w:tcPr>
+          <w:p>
+            <w:pPr>
+              <w:spacing w:after="40"/>
+            </w:pPr>
+            <w:r>
+              <w:rPr>
+                <w:rFonts w:ascii="Calibri" w:cs="Calibri" w:eastAsia="Calibri" w:hAnsi="Calibri"/>
+                <w:b/>
+                <w:bCs/>
+                <w:color w:val="14213D"/>
+                <w:sz w:val="20"/>
+                <w:szCs w:val="20"/>
+              </w:rPr>
+              <w:t xml:space="preserve">Points : la checklist revue</w:t>
+            </w:r>
+          </w:p>
+        </w:tc>
+        <w:tc>
+          <w:tcPr>
+            <w:tcW w:type="dxa" w:w="4100"/>
+            <w:tcBorders>
+              <w:top w:val="single" w:color="D9D5CB" w:sz="4"/>
+              <w:left w:val="single" w:color="D9D5CB" w:sz="4"/>
+              <w:bottom w:val="single" w:color="D9D5CB" w:sz="4"/>
+              <w:right w:val="single" w:color="D9D5CB" w:sz="4"/>
+            </w:tcBorders>
+            <w:tcMar>
+              <w:top w:type="dxa" w:w="60"/>
+              <w:left w:type="dxa" w:w="90"/>
+              <w:bottom w:type="dxa" w:w="60"/>
+              <w:right w:type="dxa" w:w="90"/>
+            </w:tcMar>
+            <w:vAlign w:val="top"/>
+          </w:tcPr>
+          <w:p>
+            <w:pPr>
+              <w:spacing w:after="40"/>
+            </w:pPr>
+            <w:r>
+              <w:rPr>
+                <w:rFonts w:ascii="Calibri" w:cs="Calibri" w:eastAsia="Calibri" w:hAnsi="Calibri"/>
+                <w:color w:val="14213D"/>
+                <w:sz w:val="19"/>
+                <w:szCs w:val="19"/>
+              </w:rPr>
+              <w:t xml:space="preserve">4 · Points : en tête, les notes de lecture « à chiffrer » et « risques », chacune se coche quand elle est prise en compte ; puis les points techniques. « Préremplir » (depuis Quantités ou depuis Points) remplit UNE seule zone de lecture du chiffrage (« Quantités de référence ») : plus deux zones en double.</w:t>
+            </w:r>
+          </w:p>
+        </w:tc>
+        <w:tc>
+          <w:tcPr>
+            <w:tcW w:type="dxa" w:w="3700"/>
+            <w:tcBorders>
+              <w:top w:val="single" w:color="D9D5CB" w:sz="4"/>
+              <w:left w:val="single" w:color="D9D5CB" w:sz="4"/>
+              <w:bottom w:val="single" w:color="D9D5CB" w:sz="4"/>
+              <w:right w:val="single" w:color="D9D5CB" w:sz="4"/>
+            </w:tcBorders>
+            <w:tcMar>
+              <w:top w:type="dxa" w:w="60"/>
+              <w:left w:type="dxa" w:w="90"/>
+              <w:bottom w:type="dxa" w:w="60"/>
+              <w:right w:type="dxa" w:w="90"/>
+            </w:tcMar>
+            <w:vAlign w:val="top"/>
+          </w:tcPr>
+          <w:p>
+            <w:pPr>
+              <w:spacing w:after="40"/>
+            </w:pPr>
+            <w:r>
+              <w:rPr>
+                <w:rFonts w:ascii="Calibri" w:cs="Calibri" w:eastAsia="Calibri" w:hAnsi="Calibri"/>
+                <w:color w:val="14213D"/>
+                <w:sz w:val="19"/>
+                <w:szCs w:val="19"/>
+              </w:rPr>
+              <w:t xml:space="preserve">Ton message : « ça fait doublon entre les potentielles plusieurs zones ». Les autres zones se règlent dans le chiffrage.</w:t>
+            </w:r>
+          </w:p>
+        </w:tc>
+        <w:tc>
+          <w:tcPr>
+            <w:tcW w:type="dxa" w:w="1300"/>
+            <w:tcBorders>
+              <w:top w:val="single" w:color="D9D5CB" w:sz="4"/>
+              <w:left w:val="single" w:color="D9D5CB" w:sz="4"/>
+              <w:bottom w:val="single" w:color="D9D5CB" w:sz="4"/>
+              <w:right w:val="single" w:color="D9D5CB" w:sz="4"/>
+            </w:tcBorders>
+            <w:shd w:fill="E6F5EC" w:color="auto" w:val="clear"/>
+            <w:tcMar>
+              <w:top w:type="dxa" w:w="60"/>
+              <w:left w:type="dxa" w:w="90"/>
+              <w:bottom w:type="dxa" w:w="60"/>
+              <w:right w:type="dxa" w:w="90"/>
+            </w:tcMar>
+            <w:vAlign w:val="top"/>
+          </w:tcPr>
+          <w:p>
+            <w:pPr>
+              <w:spacing w:after="40"/>
+            </w:pPr>
+            <w:r>
+              <w:rPr>
+                <w:rFonts w:ascii="Calibri" w:cs="Calibri" w:eastAsia="Calibri" w:hAnsi="Calibri"/>
+                <w:b/>
+                <w:bCs/>
+                <w:color w:val="14213D"/>
+                <w:sz w:val="19"/>
+                <w:szCs w:val="19"/>
+              </w:rPr>
+              <w:t xml:space="preserve">Fait</w:t>
+            </w:r>
+          </w:p>
+        </w:tc>
+        <w:tc>
+          <w:tcPr>
+            <w:tcW w:type="dxa" w:w="3700"/>
+            <w:tcBorders>
+              <w:top w:val="single" w:color="D9D5CB" w:sz="4"/>
+              <w:left w:val="single" w:color="D9D5CB" w:sz="4"/>
+              <w:bottom w:val="single" w:color="D9D5CB" w:sz="4"/>
+              <w:right w:val="single" w:color="D9D5CB" w:sz="4"/>
+            </w:tcBorders>
+            <w:tcMar>
+              <w:top w:type="dxa" w:w="60"/>
+              <w:left w:type="dxa" w:w="90"/>
+              <w:bottom w:type="dxa" w:w="60"/>
+              <w:right w:type="dxa" w:w="90"/>
+            </w:tcMar>
+            <w:vAlign w:val="top"/>
+          </w:tcPr>
+          <w:p>
+            <w:pPr>
+              <w:spacing w:after="40"/>
+            </w:pPr>
+            <w:r>
+              <w:rPr>
+                <w:rFonts w:ascii="Calibri" w:cs="Calibri" w:eastAsia="Calibri" w:hAnsi="Calibri"/>
+                <w:color w:val="14213D"/>
+                <w:sz w:val="20"/>
+                <w:szCs w:val="20"/>
+              </w:rPr>
+              <w:t xml:space="preserve"/>
+            </w:r>
+          </w:p>
+          <w:p>
+            <w:pPr>
+              <w:spacing w:after="40"/>
+            </w:pPr>
+            <w:r>
+              <w:rPr>
+                <w:rFonts w:ascii="Calibri" w:cs="Calibri" w:eastAsia="Calibri" w:hAnsi="Calibri"/>
+                <w:color w:val="14213D"/>
+                <w:sz w:val="20"/>
+                <w:szCs w:val="20"/>
+              </w:rPr>
+              <w:t xml:space="preserve"/>
+            </w:r>
+          </w:p>
+        </w:tc>
+      </w:tr>
+      <w:tr>
+        <w:tc>
+          <w:tcPr>
+            <w:tcW w:type="dxa" w:w="2300"/>
+            <w:tcBorders>
+              <w:top w:val="single" w:color="D9D5CB" w:sz="4"/>
+              <w:left w:val="single" w:color="D9D5CB" w:sz="4"/>
+              <w:bottom w:val="single" w:color="D9D5CB" w:sz="4"/>
+              <w:right w:val="single" w:color="D9D5CB" w:sz="4"/>
+            </w:tcBorders>
+            <w:tcMar>
+              <w:top w:type="dxa" w:w="60"/>
+              <w:left w:type="dxa" w:w="90"/>
+              <w:bottom w:type="dxa" w:w="60"/>
+              <w:right w:type="dxa" w:w="90"/>
+            </w:tcMar>
+            <w:vAlign w:val="top"/>
+          </w:tcPr>
+          <w:p>
+            <w:pPr>
+              <w:spacing w:after="40"/>
+            </w:pPr>
+            <w:r>
+              <w:rPr>
+                <w:rFonts w:ascii="Calibri" w:cs="Calibri" w:eastAsia="Calibri" w:hAnsi="Calibri"/>
+                <w:b/>
+                <w:bCs/>
+                <w:color w:val="14213D"/>
+                <w:sz w:val="20"/>
+                <w:szCs w:val="20"/>
+              </w:rPr>
+              <w:t xml:space="preserve">Prochaine livraison (en cours)</w:t>
+            </w:r>
+          </w:p>
+        </w:tc>
+        <w:tc>
+          <w:tcPr>
+            <w:tcW w:type="dxa" w:w="4100"/>
+            <w:tcBorders>
+              <w:top w:val="single" w:color="D9D5CB" w:sz="4"/>
+              <w:left w:val="single" w:color="D9D5CB" w:sz="4"/>
+              <w:bottom w:val="single" w:color="D9D5CB" w:sz="4"/>
+              <w:right w:val="single" w:color="D9D5CB" w:sz="4"/>
+            </w:tcBorders>
+            <w:tcMar>
+              <w:top w:type="dxa" w:w="60"/>
+              <w:left w:type="dxa" w:w="90"/>
+              <w:bottom w:type="dxa" w:w="60"/>
+              <w:right w:type="dxa" w:w="90"/>
+            </w:tcMar>
+            <w:vAlign w:val="top"/>
+          </w:tcPr>
+          <w:p>
+            <w:pPr>
+              <w:spacing w:after="40"/>
+            </w:pPr>
+            <w:r>
+              <w:rPr>
+                <w:rFonts w:ascii="Calibri" w:cs="Calibri" w:eastAsia="Calibri" w:hAnsi="Calibri"/>
+                <w:color w:val="14213D"/>
+                <w:sz w:val="19"/>
+                <w:szCs w:val="19"/>
+              </w:rPr>
+              <w:t xml:space="preserve">Base de prix et paniers communs à tous (modifiables avec le droit) + ajustements dans chaque dossier ; lien « devis de référence » en face de chaque prix de fourniture ; DPGF façon Lecture : tes coûts d'un côté, le DPGF Excel de l'autre (2e écran possible), « cette dépense dans telle cellule », « divisée par la quantité de telle cellule = le PU », export.</w:t>
+            </w:r>
+          </w:p>
+        </w:tc>
+        <w:tc>
+          <w:tcPr>
+            <w:tcW w:type="dxa" w:w="3700"/>
+            <w:tcBorders>
+              <w:top w:val="single" w:color="D9D5CB" w:sz="4"/>
+              <w:left w:val="single" w:color="D9D5CB" w:sz="4"/>
+              <w:bottom w:val="single" w:color="D9D5CB" w:sz="4"/>
+              <w:right w:val="single" w:color="D9D5CB" w:sz="4"/>
+            </w:tcBorders>
+            <w:tcMar>
+              <w:top w:type="dxa" w:w="60"/>
+              <w:left w:type="dxa" w:w="90"/>
+              <w:bottom w:type="dxa" w:w="60"/>
+              <w:right w:type="dxa" w:w="90"/>
+            </w:tcMar>
+            <w:vAlign w:val="top"/>
+          </w:tcPr>
+          <w:p>
+            <w:pPr>
+              <w:spacing w:after="40"/>
+            </w:pPr>
+            <w:r>
+              <w:rPr>
+                <w:rFonts w:ascii="Calibri" w:cs="Calibri" w:eastAsia="Calibri" w:hAnsi="Calibri"/>
+                <w:color w:val="14213D"/>
+                <w:sz w:val="19"/>
+                <w:szCs w:val="19"/>
+              </w:rPr>
+              <w:t xml:space="preserve"/>
+            </w:r>
+          </w:p>
+        </w:tc>
+        <w:tc>
+          <w:tcPr>
+            <w:tcW w:type="dxa" w:w="1300"/>
+            <w:tcBorders>
+              <w:top w:val="single" w:color="D9D5CB" w:sz="4"/>
+              <w:left w:val="single" w:color="D9D5CB" w:sz="4"/>
+              <w:bottom w:val="single" w:color="D9D5CB" w:sz="4"/>
+              <w:right w:val="single" w:color="D9D5CB" w:sz="4"/>
+            </w:tcBorders>
+            <w:shd w:fill="FFF4EE" w:color="auto" w:val="clear"/>
+            <w:tcMar>
+              <w:top w:type="dxa" w:w="60"/>
+              <w:left w:type="dxa" w:w="90"/>
+              <w:bottom w:type="dxa" w:w="60"/>
+              <w:right w:type="dxa" w:w="90"/>
+            </w:tcMar>
+            <w:vAlign w:val="top"/>
+          </w:tcPr>
+          <w:p>
+            <w:pPr>
+              <w:spacing w:after="40"/>
+            </w:pPr>
+            <w:r>
+              <w:rPr>
+                <w:rFonts w:ascii="Calibri" w:cs="Calibri" w:eastAsia="Calibri" w:hAnsi="Calibri"/>
+                <w:b/>
+                <w:bCs/>
+                <w:color w:val="14213D"/>
+                <w:sz w:val="19"/>
+                <w:szCs w:val="19"/>
+              </w:rPr>
+              <w:t xml:space="preserve">En cours</w:t>
             </w:r>
           </w:p>
         </w:tc>
@@ -40378,6 +42781,44 @@
           <w:szCs w:val="30"/>
         </w:rPr>
         <w:t xml:space="preserve">Titres de commit (GitHub Desktop)</w:t>
+      </w:r>
+    </w:p>
+    <w:p>
+      <w:pPr>
+        <w:pStyle w:val="ListParagraph"/>
+        <w:numPr>
+          <w:ilvl w:val="0"/>
+          <w:numId w:val="2"/>
+        </w:numPr>
+        <w:spacing w:after="40"/>
+      </w:pPr>
+      <w:r>
+        <w:rPr>
+          <w:rFonts w:ascii="Calibri" w:cs="Calibri" w:eastAsia="Calibri" w:hAnsi="Calibri"/>
+          <w:color w:val="14213D"/>
+          <w:sz w:val="20"/>
+          <w:szCs w:val="20"/>
+        </w:rPr>
+        <w:t xml:space="preserve">(13/10, suite) Résumé : Code de connexion sans e-mail (acces-code) + Commerce : onglets Quantités / Points, référence ★, bulle tracé</w:t>
+      </w:r>
+    </w:p>
+    <w:p>
+      <w:pPr>
+        <w:pStyle w:val="ListParagraph"/>
+        <w:numPr>
+          <w:ilvl w:val="0"/>
+          <w:numId w:val="2"/>
+        </w:numPr>
+        <w:spacing w:after="40"/>
+      </w:pPr>
+      <w:r>
+        <w:rPr>
+          <w:rFonts w:ascii="Calibri" w:cs="Calibri" w:eastAsia="Calibri" w:hAnsi="Calibri"/>
+          <w:color w:val="14213D"/>
+          <w:sz w:val="20"/>
+          <w:szCs w:val="20"/>
+        </w:rPr>
+        <w:t xml:space="preserve">Description : 13/10 — fonction serveur supabase/functions/acces-code (administrateur vérifié, compte créé ou mot de passe remplacé, repère must_change) ; Administrateur → 🔐 code de connexion (SMS, copier) ; écran d'accueil : première connexion avec le code, choix du mot de passe obligatoire ; Commerce : Lecture / Quantités / Points séparés, quantités de référence ★ avec leur source, bulle 📐 tracé, fichier du quantitatif gardé, une seule zone de lecture au préremplissage, AXIOM kit manchon = manchon, colonne € / pouce retirée ; tests e2e_codeacces, fn_acces_code (Deno), e2e_quantites</w:t>
       </w:r>
     </w:p>
     <w:p>

</xml_diff>

<commit_message>
Retrait des données internes du dépôt public + poste de Sofiane (annuaire, réglages DH communs, refus à abandonner)
</commit_message>
<xml_diff>
--- a/app/docs/Feuille_de_route_controle_12-10.docx
+++ b/app/docs/Feuille_de_route_controle_12-10.docx
@@ -29,7 +29,7 @@
           <w:sz w:val="22"/>
           <w:szCs w:val="22"/>
         </w:rPr>
-        <w:t xml:space="preserve">12 octobre 2026 · mise à jour du 13/10 (suite) : CODE DE CONNEXION sans e-mail (tu le donnes, le gars crée son mot de passe dès l'accueil) · COMMERCE — Lecture, Quantités, Points en onglets séparés, quantités de référence ★ en tête, bulle « tracé », fichier du quantitatif gardé, AXIOM « kit manchon avec mousse » = manchon, colonne € / pouce retirée · fin de soirée : MOT DE PASSE — créé dès l'écran de connexion (code reçu par e-mail), petit œil pour voir ce qu'on tape · soir : QUANTITATIFS — le fichier du fournisseur (Excel ou PDF) lu tout seul, le même écran d'import pour l'étude, la commande et le BL, réductions et kits fin de ligne dans la synthèse, consigne Claude Excel réécrite, CET retiré · fin d'après-midi : HEURES — compteur d'heures (heures sup majorées par rang jusqu'au plafond, repos, posé par l'entreprise), heures à reporter (prime, semaine plus légère), import du compteur existant, cas de déplacement forcé, droits RH · après-midi : COMMERCE — quantités fournisseur par la trame, mémoire en mode lecture, contrôle croisé classeur ↔ appli, et le chiffrage qui remplace le classeur (base de prix, paniers dépliés, Installations, récap, charge et équipes) · fin de matinée : lecture des pièces et points techniques · la nuit du 13/10 : le responsable d'un chantier y entre toujours (Sofiane) · le plan de Nantes Géraudière qui disparaissait au zoom (réparé + « Recentrer le repère ») · le soir : GRANDS DÉPLACEMENTS jour par jour (4 ou 5 jours = même forfait), le mois par gars avec nuits et repas accordés, la navette, les adresses à vérifier · FOURNITURE : zone éditable, trame type d'import, écarts « commande complémentaire / inclus », BL de zone → Stock · l'après-midi : COMMERCE v2 (dossier déballé, lecture des pièces avec surlignage, chiffrage complet d'après ton classeur du 26.08, paniers, base de prix, DPGF traduite et réécrite dans l'Excel du client, blocs du mémoire) · le matin : onglet FOURNITURE (commande, livré, reste, zones à livrer, camions datés) et tes retours de la feuille du 09-10 (adresses, détente automatique, contrôle des grands déplacements, plein écran, trame d'accueil) · puis la nuit du 12/10 : six onglets, Commerce, Parc, Sécurité, accidents, Outlook serveur · nouvelle ventilation, « agir comme », raccourci rapide du planning, « ma semaine », tes commentaires du Word (sections 5 à 9) · une colonne pour tes retours</w:t>
+        <w:t xml:space="preserve">12 octobre 2026 · mise à jour du 13/10 (soir) : « ON NE VOIT PAS LA MÊME CHOSE » (poste de Sofiane) — annuaire des invités pour tous, réglages DH communs, message « pas enregistré » qu'on peut abandonner · (fin de journée) : ATELIER DPGF (tes coûts à gauche, la feuille du client à droite, placer une dépense ou la diviser par la quantité d'une autre ligne, 2e écran) · DEVIS DE RÉFÉRENCE en face de chaque prix de la base · « Comment ça marche » de la base de prix · (suite) : CODE DE CONNEXION sans e-mail (tu le donnes, le gars crée son mot de passe dès l'accueil) · COMMERCE — Lecture, Quantités, Points en onglets séparés, quantités de référence ★ en tête, bulle « tracé », fichier du quantitatif gardé, AXIOM « kit manchon avec mousse » = manchon, colonne € / pouce retirée · fin de soirée : MOT DE PASSE — créé dès l'écran de connexion (code reçu par e-mail), petit œil pour voir ce qu'on tape · soir : QUANTITATIFS — le fichier du fournisseur (Excel ou PDF) lu tout seul, le même écran d'import pour l'étude, la commande et le BL, réductions et kits fin de ligne dans la synthèse, consigne Claude Excel réécrite, CET retiré · fin d'après-midi : HEURES — compteur d'heures (heures sup majorées par rang jusqu'au plafond, repos, posé par l'entreprise), heures à reporter (prime, semaine plus légère), import du compteur existant, cas de déplacement forcé, droits RH · après-midi : COMMERCE — quantités fournisseur par la trame, mémoire en mode lecture, contrôle croisé classeur ↔ appli, et le chiffrage qui remplace le classeur (base de prix, paniers dépliés, Installations, récap, charge et équipes) · fin de matinée : lecture des pièces et points techniques · la nuit du 13/10 : le responsable d'un chantier y entre toujours (Sofiane) · le plan de Nantes Géraudière qui disparaissait au zoom (réparé + « Recentrer le repère ») · le soir : GRANDS DÉPLACEMENTS jour par jour (4 ou 5 jours = même forfait), le mois par gars avec nuits et repas accordés, la navette, les adresses à vérifier · FOURNITURE : zone éditable, trame type d'import, écarts « commande complémentaire / inclus », BL de zone → Stock · l'après-midi : COMMERCE v2 (dossier déballé, lecture des pièces avec surlignage, chiffrage complet d'après ton classeur du 26.08, paniers, base de prix, DPGF traduite et réécrite dans l'Excel du client, blocs du mémoire) · le matin : onglet FOURNITURE (commande, livré, reste, zones à livrer, camions datés) et tes retours de la feuille du 09-10 (adresses, détente automatique, contrôle des grands déplacements, plein écran, trame d'accueil) · puis la nuit du 12/10 : six onglets, Commerce, Parc, Sécurité, accidents, Outlook serveur · nouvelle ventilation, « agir comme », raccourci rapide du planning, « ma semaine », tes commentaires du Word (sections 5 à 9) · une colonne pour tes retours</w:t>
       </w:r>
     </w:p>
     <w:p>
@@ -65,7 +65,7 @@
           <w:sz w:val="20"/>
           <w:szCs w:val="20"/>
         </w:rPr>
-        <w:t xml:space="preserve">Même principe que la précédente : tu contrôles ligne par ligne, tu écris dans « Vos commentaires » (OK / à corriger / à changer : quoi), tu me renvoies le fichier. Je corrige à partir de tes commentaires, dans l'ordre du document. Commence par la section X (code de connexion sans e-mail ; onglets Quantités et Points), puis W (mot de passe créé dès l'écran de connexion, petit œil), puis V (les quantitatifs lus tout seuls et le même écran d'import partout), puis U (compteurs d'heures, heures à reporter, import du compteur existant, cas forcé, qui voit / qui modifie), puis T (Commerce : quantités fournisseur, mémoire, contrôle croisé, tes retours sur la lecture et les points techniques, le chiffrage qui remplace le classeur), puis S (lecture des pièces et points techniques), puis R (compteurs d'heures, « Moi » : ma navette, PDF du livret), puis Q (champs date, plafond 48 h, règles GD vérifiées), puis P (la navette de paie au format SCR), puis O (Nantes : la carte après le recentrage, et le contrôle des SQL), puis N (Sofiane et le chantier de Nantes) et M (Nantes Géraudière : le plan qui disparaît au zoom), puis L (grands déplacements et fourniture), puis K (Commerce v2 : dossier, lecture, chiffrage, DPGF, mémoire), puis I (l'onglet Fourniture), puis J (tes retours de la feuille du 09-10 : c'est la seule feuille à suivre désormais — l'ancienne n'est plus livrée), puis H (Commerce de A à Z), G (la nuit) et F (tes retours du 12/10 soir).</w:t>
+        <w:t xml:space="preserve">Même principe que la précédente : tu contrôles ligne par ligne, tu écris dans « Vos commentaires » (OK / à corriger / à changer : quoi), tu me renvoies le fichier. Je corrige à partir de tes commentaires, dans l'ordre du document. Commence par la section Z (ce que Sofiane voyait de différent : noms, équipes, réglages DH, message impossible à enlever), puis Y (atelier DPGF, devis de référence, comment marche la base de prix), puis X (code de connexion sans e-mail ; onglets Quantités et Points), puis W (mot de passe créé dès l'écran de connexion, petit œil), puis V (les quantitatifs lus tout seuls et le même écran d'import partout), puis U (compteurs d'heures, heures à reporter, import du compteur existant, cas forcé, qui voit / qui modifie), puis T (Commerce : quantités fournisseur, mémoire, contrôle croisé, tes retours sur la lecture et les points techniques, le chiffrage qui remplace le classeur), puis S (lecture des pièces et points techniques), puis R (compteurs d'heures, « Moi » : ma navette, PDF du livret), puis Q (champs date, plafond 48 h, règles GD vérifiées), puis P (la navette de paie au format SCR), puis O (Nantes : la carte après le recentrage, et le contrôle des SQL), puis N (Sofiane et le chantier de Nantes) et M (Nantes Géraudière : le plan qui disparaît au zoom), puis L (grands déplacements et fourniture), puis K (Commerce v2 : dossier, lecture, chiffrage, DPGF, mémoire), puis I (l'onglet Fourniture), puis J (tes retours de la feuille du 09-10 : c'est la seule feuille à suivre désormais — l'ancienne n'est plus livrée), puis H (Commerce de A à Z), G (la nuit) et F (tes retours du 12/10 soir).</w:t>
       </w:r>
     </w:p>
     <w:p>
@@ -84,7 +84,7 @@
           <w:sz w:val="20"/>
           <w:szCs w:val="20"/>
         </w:rPr>
-        <w:t xml:space="preserve">Build livré : 13/10/2026 · 48e8a4 (index.html + traceur.html à la racine du dépôt). Section X : pas de SQL, mais une fonction serveur à déployer (acces-code, 5 minutes, comme outlook-sync : voir la section). Pas de SQL pour les sections W et V (section W : deux lignes à ajouter dans les modèles d'e-mail de Supabase pour que le code apparaisse — voir la section). SQL pour la section U : retours_13-10f.sql (contrats, compteurs, cas forcés : lus par le gérant, la direction, les RH, toi et la personne elle-même ; écrits par les RH et toi ; contient retours_13-10e.sql et 13-10d). SQL pour la section T : retours_13-10e.sql (la base de prix modifiable seulement avec le droit « Base de prix SCR : modifier ») — inclus dans 13-10f. SQL pour la section R : retours_13-10d.sql (compteurs d'heures) — inclus dans 13-10e. Pas de SQL pour les sections Q, P, O, N et M (le contrôle des SQL de la section O ne modifie rien). Tous les SQL sont passés (toi, 13/10 au soir) : ta base est à jour. Nouveau SQL du soir : retours_13-10c.sql (qualifications des écarts de fourniture réunies entre deux tablettes). SQL de l'après-midi : retours_13-10b.sql (base de prix et paniers : registres « prix » et « panier », lecture réservée à l'encadrement / bureau), blocs_memoire_scr.sql (ton mémoire O2410-10 découpé en 10 blocs réutilisables) (retours_13-10.sql de l'onglet Fourniture est inclus dans retours_13-10c.sql). SQL retours_12-10.sql et retours_12-10b.sql passés, fonction outlook-sync déployée et vérifiée par toi le 12/10 au soir (« ça fonctionne parfaitement »). Hors connexion, tout se teste avec les personnages de démo.</w:t>
+        <w:t xml:space="preserve">Build livré : 13/10/2026 · 66cdb0 (index.html + traceur.html à la racine du dépôt, et la même chose dans docs/ pour GitHub Pages). Sécurité : les fichiers de données sortent du dépôt (section « Sécurité du dépôt »). Section Z : retours_13-10g.sql à passer (seul : l'annuaire des personnes invitées lisible par tous les comptes actifs — nom, prénom, poste, sans les droits), puis sur TON appareil, onglet DH : « 📤 Appliquer ces réglages à tout le monde ». Section Y : pas de SQL. Section X : pas de SQL, mais une fonction serveur à déployer (acces-code, 5 minutes, comme outlook-sync : voir la section). Pas de SQL pour les sections W et V (section W : deux lignes à ajouter dans les modèles d'e-mail de Supabase pour que le code apparaisse — voir la section). SQL pour la section U : retours_13-10f.sql (contrats, compteurs, cas forcés : lus par le gérant, la direction, les RH, toi et la personne elle-même ; écrits par les RH et toi ; contient retours_13-10e.sql et 13-10d). SQL pour la section T : retours_13-10e.sql (la base de prix modifiable seulement avec le droit « Base de prix SCR : modifier ») — inclus dans 13-10f. SQL pour la section R : retours_13-10d.sql (compteurs d'heures) — inclus dans 13-10e. Pas de SQL pour les sections Q, P, O, N et M (le contrôle des SQL de la section O ne modifie rien). Tous les SQL sont passés (toi, 13/10 au soir) : ta base est à jour. Nouveau SQL du soir : retours_13-10c.sql (qualifications des écarts de fourniture réunies entre deux tablettes). SQL de l'après-midi : retours_13-10b.sql (base de prix et paniers : registres « prix » et « panier », lecture réservée à l'encadrement / bureau), blocs_memoire_scr.sql (ton mémoire O2410-10 découpé en 10 blocs réutilisables) (retours_13-10.sql de l'onglet Fourniture est inclus dans retours_13-10c.sql). SQL retours_12-10.sql et retours_12-10b.sql passés, fonction outlook-sync déployée et vérifiée par toi le 12/10 au soir (« ça fonctionne parfaitement »). Hors connexion, tout se teste avec les personnages de démo.</w:t>
       </w:r>
     </w:p>
     <w:p>
@@ -103,7 +103,7 @@
           <w:sz w:val="20"/>
           <w:szCs w:val="20"/>
         </w:rPr>
-        <w:t xml:space="preserve">Règle gardée : rien d'ancien n'est supprimé ; 71 suites de tests automatiques passent, dont celles de la section X (e2e_codeacces : code créé par l'administrateur, première connexion avec le code, code tapé dans la case mot de passe, réouverture, adresse refusée par Supabase ; fn_acces_code : la fonction serveur elle-même, lancée dans Deno face à un Supabase simulé ; e2e_quantites : onglets, référence, fichier gardé, bulle du tracé, une seule zone de lecture), celle de la section W (e2e_motdepasse : serveur simulé qui garde les mots de passe — œil, refus avant création, code faux, contrôles, mot de passe refusé puis accepté, reconnexion, changement dans l'appli, connexion par code, lien du mail, limite d'envoi ; e2e_login inchangée), celles de la section V (lecteur_test : le lecteur en Node sur des copies fictives de chaque format ; e2e_import : commande Excel et livraison PDF lues toutes seules, une pièce corrigée, téléphone ; e2e_qsets étendue : PDF lu tout seul, pièce à classer, options, classeur + trame à moitié ; e2e_fourniture, e2e_fourn2, e2e_stock, e2e_stock2 recalées sur le nouvel écran ; e2e_compteurs sans CET), celles de la section U (compteurs_test : le moteur des compteurs en Node ; e2e_compteurs réécrite ; e2e_compteurs2 : droits, import, export, cas forcé ; e2e_navette et e2e_acces recalées), celles de la section T (e2e_qsets, e2e_memoire2, e2e_ctrlcl, classeur_test, e2e_chiffrage3 ; e2e_lecture3 et e2e_points2 étendues), et e2e_resp (responsable du chantier = accès) et e2e_rebase (réseau à 1 985 km de l'origine : visible à 19,6 px/m, bandeau, recentrage, fils de nouveau justes au zoom) et les deux du soir : e2e_gdnav (4 jours = 5 nuitées / 10 repas / 15 €, « pas de détente » = 7 / 14 / 0 €, le mois de Julien, l'ajustement d'un jour, la navette CSV, novembre avec la Toussaint et un lundi non travaillé, les adresses à vérifier) et e2e_fourn2 (à la SOURIS réelle : tracer, glisser, insérer, retirer, annuler, reprendre et modifier un contour, boutons du plan ; trame copiée / téléchargée / collée ; écarts qualifiés et commande complémentaire ; BL de zone → Excel → Stock ; trame dans Stock ; classeur fournisseur avec la trame en 2e feuille), puis e2e_commerce2 (8 étapes : import du classeur, zone et table des DN, SST / purges / contrôles / hydraulique / panier libre, récap et base de prix, dossier déballé, lecture PDF avec surlignage, Word et points techniques, DPGF réécrite dans l'Excel) et deux de la veille : e2e_fourniture (11 points : commande collée, comparatif, pièces en plus, livré lu dans Stock, zone entourée au doigt, zone du phasage, camions datés, annonce et pointage dans Stock, droits, téléphone, lecteur de lignes PDF, zones qui se chevauchent) et e2e_retours13 (n° d'affaire, plein écran, repas, adresses, détente automatique sur 5 semaines, accords, vue par personne, CSV).</w:t>
+        <w:t xml:space="preserve">Règle gardée : rien d'ancien n'est supprimé ; 73 suites de tests automatiques passent, dont celles de la section Z (e2e_sofiane : un compte non administrateur voit le prénom du chef et l'équipe du jour, les réglages DH du serveur en lecture, un refus du serveur qu'il abandonne, aucune écriture automatique sans le droit, l'administrateur qui publie les réglages ; e2e_sync : abandonner une partie refusée), celle de la section Y (e2e_dpgfwb : comment ça marche, devis par lien et refus d'un lien douteux, prix relié à son devis, réimport qui garde les devis, atelier, placer un coût sur sa ligne, le diviser par la quantité d'une autre ligne, retrait, plein écran, 2e fenêtre, appliquer = prix de vente), celles de la section X (e2e_codeacces : code créé par l'administrateur, première connexion avec le code, code tapé dans la case mot de passe, réouverture, adresse refusée par Supabase ; fn_acces_code : la fonction serveur elle-même, lancée dans Deno face à un Supabase simulé ; e2e_quantites : onglets, référence, fichier gardé, bulle du tracé, une seule zone de lecture), celle de la section W (e2e_motdepasse : serveur simulé qui garde les mots de passe — œil, refus avant création, code faux, contrôles, mot de passe refusé puis accepté, reconnexion, changement dans l'appli, connexion par code, lien du mail, limite d'envoi ; e2e_login inchangée), celles de la section V (lecteur_test : le lecteur en Node sur des copies fictives de chaque format ; e2e_import : commande Excel et livraison PDF lues toutes seules, une pièce corrigée, téléphone ; e2e_qsets étendue : PDF lu tout seul, pièce à classer, options, classeur + trame à moitié ; e2e_fourniture, e2e_fourn2, e2e_stock, e2e_stock2 recalées sur le nouvel écran ; e2e_compteurs sans CET), celles de la section U (compteurs_test : le moteur des compteurs en Node ; e2e_compteurs réécrite ; e2e_compteurs2 : droits, import, export, cas forcé ; e2e_navette et e2e_acces recalées), celles de la section T (e2e_qsets, e2e_memoire2, e2e_ctrlcl, classeur_test, e2e_chiffrage3 ; e2e_lecture3 et e2e_points2 étendues), et e2e_resp (responsable du chantier = accès) et e2e_rebase (réseau à 1 985 km de l'origine : visible à 19,6 px/m, bandeau, recentrage, fils de nouveau justes au zoom) et les deux du soir : e2e_gdnav (4 jours = 5 nuitées / 10 repas / 15 €, « pas de détente » = 7 / 14 / 0 €, le mois de Julien, l'ajustement d'un jour, la navette CSV, novembre avec la Toussaint et un lundi non travaillé, les adresses à vérifier) et e2e_fourn2 (à la SOURIS réelle : tracer, glisser, insérer, retirer, annuler, reprendre et modifier un contour, boutons du plan ; trame copiée / téléchargée / collée ; écarts qualifiés et commande complémentaire ; BL de zone → Excel → Stock ; trame dans Stock ; classeur fournisseur avec la trame en 2e feuille), puis e2e_commerce2 (8 étapes : import du classeur, zone et table des DN, SST / purges / contrôles / hydraulique / panier libre, récap et base de prix, dossier déballé, lecture PDF avec surlignage, Word et points techniques, DPGF réécrite dans l'Excel) et deux de la veille : e2e_fourniture (11 points : commande collée, comparatif, pièces en plus, livré lu dans Stock, zone entourée au doigt, zone du phasage, camions datés, annonce et pointage dans Stock, droits, téléphone, lecteur de lignes PDF, zones qui se chevauchent) et e2e_retours13 (n° d'affaire, plein écran, repas, adresses, détente automatique sur 5 semaines, accords, vue par personne, CSV).</w:t>
       </w:r>
     </w:p>
     <w:p>
@@ -12828,6 +12828,3233 @@
                 <w:szCs w:val="19"/>
               </w:rPr>
               <w:t xml:space="preserve">Fait (à déployer)</w:t>
+            </w:r>
+          </w:p>
+        </w:tc>
+        <w:tc>
+          <w:tcPr>
+            <w:tcW w:type="dxa" w:w="3700"/>
+            <w:tcBorders>
+              <w:top w:val="single" w:color="D9D5CB" w:sz="4"/>
+              <w:left w:val="single" w:color="D9D5CB" w:sz="4"/>
+              <w:bottom w:val="single" w:color="D9D5CB" w:sz="4"/>
+              <w:right w:val="single" w:color="D9D5CB" w:sz="4"/>
+            </w:tcBorders>
+            <w:tcMar>
+              <w:top w:type="dxa" w:w="60"/>
+              <w:left w:type="dxa" w:w="90"/>
+              <w:bottom w:type="dxa" w:w="60"/>
+              <w:right w:type="dxa" w:w="90"/>
+            </w:tcMar>
+            <w:vAlign w:val="top"/>
+          </w:tcPr>
+          <w:p>
+            <w:pPr>
+              <w:spacing w:after="40"/>
+            </w:pPr>
+            <w:r>
+              <w:rPr>
+                <w:rFonts w:ascii="Calibri" w:cs="Calibri" w:eastAsia="Calibri" w:hAnsi="Calibri"/>
+                <w:color w:val="14213D"/>
+                <w:sz w:val="20"/>
+                <w:szCs w:val="20"/>
+              </w:rPr>
+              <w:t xml:space="preserve"/>
+            </w:r>
+          </w:p>
+          <w:p>
+            <w:pPr>
+              <w:spacing w:after="40"/>
+            </w:pPr>
+            <w:r>
+              <w:rPr>
+                <w:rFonts w:ascii="Calibri" w:cs="Calibri" w:eastAsia="Calibri" w:hAnsi="Calibri"/>
+                <w:color w:val="14213D"/>
+                <w:sz w:val="20"/>
+                <w:szCs w:val="20"/>
+              </w:rPr>
+              <w:t xml:space="preserve"/>
+            </w:r>
+          </w:p>
+        </w:tc>
+      </w:tr>
+    </w:tbl>
+    <w:p>
+      <w:pPr>
+        <w:pStyle w:val="Heading1"/>
+        <w:spacing w:after="120" w:before="320"/>
+      </w:pPr>
+      <w:r>
+        <w:rPr>
+          <w:rFonts w:ascii="Calibri" w:cs="Calibri" w:eastAsia="Calibri" w:hAnsi="Calibri"/>
+          <w:b/>
+          <w:bCs/>
+          <w:color w:val="EB6834"/>
+          <w:sz w:val="30"/>
+          <w:szCs w:val="30"/>
+        </w:rPr>
+        <w:t xml:space="preserve">Sécurité du dépôt (13/10, soir)</w:t>
+      </w:r>
+    </w:p>
+    <w:p>
+      <w:pPr>
+        <w:spacing w:after="80" w:line="264"/>
+      </w:pPr>
+      <w:r>
+        <w:rPr>
+          <w:rFonts w:ascii="Calibri" w:cs="Calibri" w:eastAsia="Calibri" w:hAnsi="Calibri"/>
+          <w:color w:val="6B6B66"/>
+          <w:sz w:val="20"/>
+          <w:szCs w:val="20"/>
+        </w:rPr>
+        <w:t xml:space="preserve">GitHub Pages publie tout le dépôt, pas seulement l'appli. Règle désormais : aucune donnée réelle dans le dépôt.</w:t>
+      </w:r>
+    </w:p>
+    <w:tbl>
+      <w:tblPr>
+        <w:tblW w:type="dxa" w:w="15100"/>
+        <w:tblBorders>
+          <w:top w:val="single" w:color="auto" w:sz="4"/>
+          <w:left w:val="single" w:color="auto" w:sz="4"/>
+          <w:bottom w:val="single" w:color="auto" w:sz="4"/>
+          <w:right w:val="single" w:color="auto" w:sz="4"/>
+          <w:insideH w:val="single" w:color="auto" w:sz="4"/>
+          <w:insideV w:val="single" w:color="auto" w:sz="4"/>
+        </w:tblBorders>
+      </w:tblPr>
+      <w:tblGrid>
+        <w:gridCol w:w="2300"/>
+        <w:gridCol w:w="4100"/>
+        <w:gridCol w:w="3700"/>
+        <w:gridCol w:w="1300"/>
+        <w:gridCol w:w="3700"/>
+      </w:tblGrid>
+      <w:tr>
+        <w:trPr>
+          <w:tblHeader/>
+        </w:trPr>
+        <w:tc>
+          <w:tcPr>
+            <w:tcW w:type="dxa" w:w="2300"/>
+            <w:tcBorders>
+              <w:top w:val="single" w:color="D9D5CB" w:sz="4"/>
+              <w:left w:val="single" w:color="D9D5CB" w:sz="4"/>
+              <w:bottom w:val="single" w:color="D9D5CB" w:sz="4"/>
+              <w:right w:val="single" w:color="D9D5CB" w:sz="4"/>
+            </w:tcBorders>
+            <w:shd w:fill="14213D" w:color="auto" w:val="clear"/>
+            <w:tcMar>
+              <w:top w:type="dxa" w:w="60"/>
+              <w:left w:type="dxa" w:w="90"/>
+              <w:bottom w:type="dxa" w:w="60"/>
+              <w:right w:type="dxa" w:w="90"/>
+            </w:tcMar>
+            <w:vAlign w:val="top"/>
+          </w:tcPr>
+          <w:p>
+            <w:pPr>
+              <w:spacing w:after="80" w:line="264"/>
+            </w:pPr>
+            <w:r>
+              <w:rPr>
+                <w:rFonts w:ascii="Calibri" w:cs="Calibri" w:eastAsia="Calibri" w:hAnsi="Calibri"/>
+                <w:b/>
+                <w:bCs/>
+                <w:color w:val="FFFFFF"/>
+                <w:sz w:val="19"/>
+                <w:szCs w:val="19"/>
+              </w:rPr>
+              <w:t xml:space="preserve">Fonctionnalité</w:t>
+            </w:r>
+          </w:p>
+        </w:tc>
+        <w:tc>
+          <w:tcPr>
+            <w:tcW w:type="dxa" w:w="4100"/>
+            <w:tcBorders>
+              <w:top w:val="single" w:color="D9D5CB" w:sz="4"/>
+              <w:left w:val="single" w:color="D9D5CB" w:sz="4"/>
+              <w:bottom w:val="single" w:color="D9D5CB" w:sz="4"/>
+              <w:right w:val="single" w:color="D9D5CB" w:sz="4"/>
+            </w:tcBorders>
+            <w:shd w:fill="14213D" w:color="auto" w:val="clear"/>
+            <w:tcMar>
+              <w:top w:type="dxa" w:w="60"/>
+              <w:left w:type="dxa" w:w="90"/>
+              <w:bottom w:type="dxa" w:w="60"/>
+              <w:right w:type="dxa" w:w="90"/>
+            </w:tcMar>
+            <w:vAlign w:val="top"/>
+          </w:tcPr>
+          <w:p>
+            <w:pPr>
+              <w:spacing w:after="80" w:line="264"/>
+            </w:pPr>
+            <w:r>
+              <w:rPr>
+                <w:rFonts w:ascii="Calibri" w:cs="Calibri" w:eastAsia="Calibri" w:hAnsi="Calibri"/>
+                <w:b/>
+                <w:bCs/>
+                <w:color w:val="FFFFFF"/>
+                <w:sz w:val="19"/>
+                <w:szCs w:val="19"/>
+              </w:rPr>
+              <w:t xml:space="preserve">Où la trouver · comment tester</w:t>
+            </w:r>
+          </w:p>
+        </w:tc>
+        <w:tc>
+          <w:tcPr>
+            <w:tcW w:type="dxa" w:w="3700"/>
+            <w:tcBorders>
+              <w:top w:val="single" w:color="D9D5CB" w:sz="4"/>
+              <w:left w:val="single" w:color="D9D5CB" w:sz="4"/>
+              <w:bottom w:val="single" w:color="D9D5CB" w:sz="4"/>
+              <w:right w:val="single" w:color="D9D5CB" w:sz="4"/>
+            </w:tcBorders>
+            <w:shd w:fill="14213D" w:color="auto" w:val="clear"/>
+            <w:tcMar>
+              <w:top w:type="dxa" w:w="60"/>
+              <w:left w:type="dxa" w:w="90"/>
+              <w:bottom w:type="dxa" w:w="60"/>
+              <w:right w:type="dxa" w:w="90"/>
+            </w:tcMar>
+            <w:vAlign w:val="top"/>
+          </w:tcPr>
+          <w:p>
+            <w:pPr>
+              <w:spacing w:after="80" w:line="264"/>
+            </w:pPr>
+            <w:r>
+              <w:rPr>
+                <w:rFonts w:ascii="Calibri" w:cs="Calibri" w:eastAsia="Calibri" w:hAnsi="Calibri"/>
+                <w:b/>
+                <w:bCs/>
+                <w:color w:val="FFFFFF"/>
+                <w:sz w:val="19"/>
+                <w:szCs w:val="19"/>
+              </w:rPr>
+              <w:t xml:space="preserve">Hypothèses · limites · ce que j'ai tranché</w:t>
+            </w:r>
+          </w:p>
+        </w:tc>
+        <w:tc>
+          <w:tcPr>
+            <w:tcW w:type="dxa" w:w="1300"/>
+            <w:tcBorders>
+              <w:top w:val="single" w:color="D9D5CB" w:sz="4"/>
+              <w:left w:val="single" w:color="D9D5CB" w:sz="4"/>
+              <w:bottom w:val="single" w:color="D9D5CB" w:sz="4"/>
+              <w:right w:val="single" w:color="D9D5CB" w:sz="4"/>
+            </w:tcBorders>
+            <w:shd w:fill="14213D" w:color="auto" w:val="clear"/>
+            <w:tcMar>
+              <w:top w:type="dxa" w:w="60"/>
+              <w:left w:type="dxa" w:w="90"/>
+              <w:bottom w:type="dxa" w:w="60"/>
+              <w:right w:type="dxa" w:w="90"/>
+            </w:tcMar>
+            <w:vAlign w:val="top"/>
+          </w:tcPr>
+          <w:p>
+            <w:pPr>
+              <w:spacing w:after="80" w:line="264"/>
+            </w:pPr>
+            <w:r>
+              <w:rPr>
+                <w:rFonts w:ascii="Calibri" w:cs="Calibri" w:eastAsia="Calibri" w:hAnsi="Calibri"/>
+                <w:b/>
+                <w:bCs/>
+                <w:color w:val="FFFFFF"/>
+                <w:sz w:val="19"/>
+                <w:szCs w:val="19"/>
+              </w:rPr>
+              <w:t xml:space="preserve">Statut</w:t>
+            </w:r>
+          </w:p>
+        </w:tc>
+        <w:tc>
+          <w:tcPr>
+            <w:tcW w:type="dxa" w:w="3700"/>
+            <w:tcBorders>
+              <w:top w:val="single" w:color="D9D5CB" w:sz="4"/>
+              <w:left w:val="single" w:color="D9D5CB" w:sz="4"/>
+              <w:bottom w:val="single" w:color="D9D5CB" w:sz="4"/>
+              <w:right w:val="single" w:color="D9D5CB" w:sz="4"/>
+            </w:tcBorders>
+            <w:shd w:fill="14213D" w:color="auto" w:val="clear"/>
+            <w:tcMar>
+              <w:top w:type="dxa" w:w="60"/>
+              <w:left w:type="dxa" w:w="90"/>
+              <w:bottom w:type="dxa" w:w="60"/>
+              <w:right w:type="dxa" w:w="90"/>
+            </w:tcMar>
+            <w:vAlign w:val="top"/>
+          </w:tcPr>
+          <w:p>
+            <w:pPr>
+              <w:spacing w:after="80" w:line="264"/>
+            </w:pPr>
+            <w:r>
+              <w:rPr>
+                <w:rFonts w:ascii="Calibri" w:cs="Calibri" w:eastAsia="Calibri" w:hAnsi="Calibri"/>
+                <w:b/>
+                <w:bCs/>
+                <w:color w:val="FFFFFF"/>
+                <w:sz w:val="19"/>
+                <w:szCs w:val="19"/>
+              </w:rPr>
+              <w:t xml:space="preserve">Vos commentaires</w:t>
+            </w:r>
+          </w:p>
+        </w:tc>
+      </w:tr>
+      <w:tr>
+        <w:tc>
+          <w:tcPr>
+            <w:tcW w:type="dxa" w:w="2300"/>
+            <w:tcBorders>
+              <w:top w:val="single" w:color="D9D5CB" w:sz="4"/>
+              <w:left w:val="single" w:color="D9D5CB" w:sz="4"/>
+              <w:bottom w:val="single" w:color="D9D5CB" w:sz="4"/>
+              <w:right w:val="single" w:color="D9D5CB" w:sz="4"/>
+            </w:tcBorders>
+            <w:tcMar>
+              <w:top w:type="dxa" w:w="60"/>
+              <w:left w:type="dxa" w:w="90"/>
+              <w:bottom w:type="dxa" w:w="60"/>
+              <w:right w:type="dxa" w:w="90"/>
+            </w:tcMar>
+            <w:vAlign w:val="top"/>
+          </w:tcPr>
+          <w:p>
+            <w:pPr>
+              <w:spacing w:after="40"/>
+            </w:pPr>
+            <w:r>
+              <w:rPr>
+                <w:rFonts w:ascii="Calibri" w:cs="Calibri" w:eastAsia="Calibri" w:hAnsi="Calibri"/>
+                <w:b/>
+                <w:bCs/>
+                <w:color w:val="14213D"/>
+                <w:sz w:val="20"/>
+                <w:szCs w:val="20"/>
+              </w:rPr>
+              <w:t xml:space="preserve">Fichiers de données sortis du dépôt</w:t>
+            </w:r>
+          </w:p>
+        </w:tc>
+        <w:tc>
+          <w:tcPr>
+            <w:tcW w:type="dxa" w:w="4100"/>
+            <w:tcBorders>
+              <w:top w:val="single" w:color="D9D5CB" w:sz="4"/>
+              <w:left w:val="single" w:color="D9D5CB" w:sz="4"/>
+              <w:bottom w:val="single" w:color="D9D5CB" w:sz="4"/>
+              <w:right w:val="single" w:color="D9D5CB" w:sz="4"/>
+            </w:tcBorders>
+            <w:tcMar>
+              <w:top w:type="dxa" w:w="60"/>
+              <w:left w:type="dxa" w:w="90"/>
+              <w:bottom w:type="dxa" w:w="60"/>
+              <w:right w:type="dxa" w:w="90"/>
+            </w:tcMar>
+            <w:vAlign w:val="top"/>
+          </w:tcPr>
+          <w:p>
+            <w:pPr>
+              <w:spacing w:after="40"/>
+            </w:pPr>
+            <w:r>
+              <w:rPr>
+                <w:rFonts w:ascii="Calibri" w:cs="Calibri" w:eastAsia="Calibri" w:hAnsi="Calibri"/>
+                <w:color w:val="14213D"/>
+                <w:sz w:val="19"/>
+                <w:szCs w:val="19"/>
+              </w:rPr>
+              <w:t xml:space="preserve">Les fichiers d'import de données de app/sql (09-10/10) sont rangés hors du dépôt, dans C:\Users\EthanLEBIHAN\Dev\SCR-PRIVE. Le .gitignore les bloque désormais. Les tests n'utilisent que des personnages fictifs.</w:t>
+            </w:r>
+          </w:p>
+        </w:tc>
+        <w:tc>
+          <w:tcPr>
+            <w:tcW w:type="dxa" w:w="3700"/>
+            <w:tcBorders>
+              <w:top w:val="single" w:color="D9D5CB" w:sz="4"/>
+              <w:left w:val="single" w:color="D9D5CB" w:sz="4"/>
+              <w:bottom w:val="single" w:color="D9D5CB" w:sz="4"/>
+              <w:right w:val="single" w:color="D9D5CB" w:sz="4"/>
+            </w:tcBorders>
+            <w:tcMar>
+              <w:top w:type="dxa" w:w="60"/>
+              <w:left w:type="dxa" w:w="90"/>
+              <w:bottom w:type="dxa" w:w="60"/>
+              <w:right w:type="dxa" w:w="90"/>
+            </w:tcMar>
+            <w:vAlign w:val="top"/>
+          </w:tcPr>
+          <w:p>
+            <w:pPr>
+              <w:spacing w:after="40"/>
+            </w:pPr>
+            <w:r>
+              <w:rPr>
+                <w:rFonts w:ascii="Calibri" w:cs="Calibri" w:eastAsia="Calibri" w:hAnsi="Calibri"/>
+                <w:color w:val="14213D"/>
+                <w:sz w:val="19"/>
+                <w:szCs w:val="19"/>
+              </w:rPr>
+              <w:t xml:space="preserve">Commit « Retrait des données internes du dépôt public », puis la livraison du soir.</w:t>
+            </w:r>
+          </w:p>
+        </w:tc>
+        <w:tc>
+          <w:tcPr>
+            <w:tcW w:type="dxa" w:w="1300"/>
+            <w:tcBorders>
+              <w:top w:val="single" w:color="D9D5CB" w:sz="4"/>
+              <w:left w:val="single" w:color="D9D5CB" w:sz="4"/>
+              <w:bottom w:val="single" w:color="D9D5CB" w:sz="4"/>
+              <w:right w:val="single" w:color="D9D5CB" w:sz="4"/>
+            </w:tcBorders>
+            <w:shd w:fill="FFF4EE" w:color="auto" w:val="clear"/>
+            <w:tcMar>
+              <w:top w:type="dxa" w:w="60"/>
+              <w:left w:type="dxa" w:w="90"/>
+              <w:bottom w:type="dxa" w:w="60"/>
+              <w:right w:type="dxa" w:w="90"/>
+            </w:tcMar>
+            <w:vAlign w:val="top"/>
+          </w:tcPr>
+          <w:p>
+            <w:pPr>
+              <w:spacing w:after="40"/>
+            </w:pPr>
+            <w:r>
+              <w:rPr>
+                <w:rFonts w:ascii="Calibri" w:cs="Calibri" w:eastAsia="Calibri" w:hAnsi="Calibri"/>
+                <w:b/>
+                <w:bCs/>
+                <w:color w:val="14213D"/>
+                <w:sz w:val="19"/>
+                <w:szCs w:val="19"/>
+              </w:rPr>
+              <w:t xml:space="preserve">À faire (toi) — 3 min</w:t>
+            </w:r>
+          </w:p>
+        </w:tc>
+        <w:tc>
+          <w:tcPr>
+            <w:tcW w:type="dxa" w:w="3700"/>
+            <w:tcBorders>
+              <w:top w:val="single" w:color="D9D5CB" w:sz="4"/>
+              <w:left w:val="single" w:color="D9D5CB" w:sz="4"/>
+              <w:bottom w:val="single" w:color="D9D5CB" w:sz="4"/>
+              <w:right w:val="single" w:color="D9D5CB" w:sz="4"/>
+            </w:tcBorders>
+            <w:tcMar>
+              <w:top w:type="dxa" w:w="60"/>
+              <w:left w:type="dxa" w:w="90"/>
+              <w:bottom w:type="dxa" w:w="60"/>
+              <w:right w:type="dxa" w:w="90"/>
+            </w:tcMar>
+            <w:vAlign w:val="top"/>
+          </w:tcPr>
+          <w:p>
+            <w:pPr>
+              <w:spacing w:after="40"/>
+            </w:pPr>
+            <w:r>
+              <w:rPr>
+                <w:rFonts w:ascii="Calibri" w:cs="Calibri" w:eastAsia="Calibri" w:hAnsi="Calibri"/>
+                <w:color w:val="14213D"/>
+                <w:sz w:val="20"/>
+                <w:szCs w:val="20"/>
+              </w:rPr>
+              <w:t xml:space="preserve"/>
+            </w:r>
+          </w:p>
+          <w:p>
+            <w:pPr>
+              <w:spacing w:after="40"/>
+            </w:pPr>
+            <w:r>
+              <w:rPr>
+                <w:rFonts w:ascii="Calibri" w:cs="Calibri" w:eastAsia="Calibri" w:hAnsi="Calibri"/>
+                <w:color w:val="14213D"/>
+                <w:sz w:val="20"/>
+                <w:szCs w:val="20"/>
+              </w:rPr>
+              <w:t xml:space="preserve"/>
+            </w:r>
+          </w:p>
+        </w:tc>
+      </w:tr>
+      <w:tr>
+        <w:tc>
+          <w:tcPr>
+            <w:tcW w:type="dxa" w:w="2300"/>
+            <w:tcBorders>
+              <w:top w:val="single" w:color="D9D5CB" w:sz="4"/>
+              <w:left w:val="single" w:color="D9D5CB" w:sz="4"/>
+              <w:bottom w:val="single" w:color="D9D5CB" w:sz="4"/>
+              <w:right w:val="single" w:color="D9D5CB" w:sz="4"/>
+            </w:tcBorders>
+            <w:tcMar>
+              <w:top w:type="dxa" w:w="60"/>
+              <w:left w:type="dxa" w:w="90"/>
+              <w:bottom w:type="dxa" w:w="60"/>
+              <w:right w:type="dxa" w:w="90"/>
+            </w:tcMar>
+            <w:vAlign w:val="top"/>
+          </w:tcPr>
+          <w:p>
+            <w:pPr>
+              <w:spacing w:after="40"/>
+            </w:pPr>
+            <w:r>
+              <w:rPr>
+                <w:rFonts w:ascii="Calibri" w:cs="Calibri" w:eastAsia="Calibri" w:hAnsi="Calibri"/>
+                <w:b/>
+                <w:bCs/>
+                <w:color w:val="14213D"/>
+                <w:sz w:val="20"/>
+                <w:szCs w:val="20"/>
+              </w:rPr>
+              <w:t xml:space="preserve">Dépôt privé, site inchangé</w:t>
+            </w:r>
+          </w:p>
+        </w:tc>
+        <w:tc>
+          <w:tcPr>
+            <w:tcW w:type="dxa" w:w="4100"/>
+            <w:tcBorders>
+              <w:top w:val="single" w:color="D9D5CB" w:sz="4"/>
+              <w:left w:val="single" w:color="D9D5CB" w:sz="4"/>
+              <w:bottom w:val="single" w:color="D9D5CB" w:sz="4"/>
+              <w:right w:val="single" w:color="D9D5CB" w:sz="4"/>
+            </w:tcBorders>
+            <w:tcMar>
+              <w:top w:type="dxa" w:w="60"/>
+              <w:left w:type="dxa" w:w="90"/>
+              <w:bottom w:type="dxa" w:w="60"/>
+              <w:right w:type="dxa" w:w="90"/>
+            </w:tcMar>
+            <w:vAlign w:val="top"/>
+          </w:tcPr>
+          <w:p>
+            <w:pPr>
+              <w:spacing w:after="40"/>
+            </w:pPr>
+            <w:r>
+              <w:rPr>
+                <w:rFonts w:ascii="Calibri" w:cs="Calibri" w:eastAsia="Calibri" w:hAnsi="Calibri"/>
+                <w:color w:val="14213D"/>
+                <w:sz w:val="19"/>
+                <w:szCs w:val="19"/>
+              </w:rPr>
+              <w:t xml:space="preserve">GitHub Pro (4 $ / mois) : le dépôt passe en privé et GitHub Pages continue de servir l'appli à la même adresse. Puis Settings → Pages → dossier /docs : seul l'appli est publiée (docs/index.html, docs/traceur.html), plus les notes, le code ni les SQL.</w:t>
+            </w:r>
+          </w:p>
+        </w:tc>
+        <w:tc>
+          <w:tcPr>
+            <w:tcW w:type="dxa" w:w="3700"/>
+            <w:tcBorders>
+              <w:top w:val="single" w:color="D9D5CB" w:sz="4"/>
+              <w:left w:val="single" w:color="D9D5CB" w:sz="4"/>
+              <w:bottom w:val="single" w:color="D9D5CB" w:sz="4"/>
+              <w:right w:val="single" w:color="D9D5CB" w:sz="4"/>
+            </w:tcBorders>
+            <w:tcMar>
+              <w:top w:type="dxa" w:w="60"/>
+              <w:left w:type="dxa" w:w="90"/>
+              <w:bottom w:type="dxa" w:w="60"/>
+              <w:right w:type="dxa" w:w="90"/>
+            </w:tcMar>
+            <w:vAlign w:val="top"/>
+          </w:tcPr>
+          <w:p>
+            <w:pPr>
+              <w:spacing w:after="40"/>
+            </w:pPr>
+            <w:r>
+              <w:rPr>
+                <w:rFonts w:ascii="Calibri" w:cs="Calibri" w:eastAsia="Calibri" w:hAnsi="Calibri"/>
+                <w:color w:val="14213D"/>
+                <w:sz w:val="19"/>
+                <w:szCs w:val="19"/>
+              </w:rPr>
+              <w:t xml:space="preserve">Le site reste accessible à tous ; la connexion protège les données.</w:t>
+            </w:r>
+          </w:p>
+        </w:tc>
+        <w:tc>
+          <w:tcPr>
+            <w:tcW w:type="dxa" w:w="1300"/>
+            <w:tcBorders>
+              <w:top w:val="single" w:color="D9D5CB" w:sz="4"/>
+              <w:left w:val="single" w:color="D9D5CB" w:sz="4"/>
+              <w:bottom w:val="single" w:color="D9D5CB" w:sz="4"/>
+              <w:right w:val="single" w:color="D9D5CB" w:sz="4"/>
+            </w:tcBorders>
+            <w:shd w:fill="FFF4EE" w:color="auto" w:val="clear"/>
+            <w:tcMar>
+              <w:top w:type="dxa" w:w="60"/>
+              <w:left w:type="dxa" w:w="90"/>
+              <w:bottom w:type="dxa" w:w="60"/>
+              <w:right w:type="dxa" w:w="90"/>
+            </w:tcMar>
+            <w:vAlign w:val="top"/>
+          </w:tcPr>
+          <w:p>
+            <w:pPr>
+              <w:spacing w:after="40"/>
+            </w:pPr>
+            <w:r>
+              <w:rPr>
+                <w:rFonts w:ascii="Calibri" w:cs="Calibri" w:eastAsia="Calibri" w:hAnsi="Calibri"/>
+                <w:b/>
+                <w:bCs/>
+                <w:color w:val="14213D"/>
+                <w:sz w:val="19"/>
+                <w:szCs w:val="19"/>
+              </w:rPr>
+              <w:t xml:space="preserve">À décider</w:t>
+            </w:r>
+          </w:p>
+        </w:tc>
+        <w:tc>
+          <w:tcPr>
+            <w:tcW w:type="dxa" w:w="3700"/>
+            <w:tcBorders>
+              <w:top w:val="single" w:color="D9D5CB" w:sz="4"/>
+              <w:left w:val="single" w:color="D9D5CB" w:sz="4"/>
+              <w:bottom w:val="single" w:color="D9D5CB" w:sz="4"/>
+              <w:right w:val="single" w:color="D9D5CB" w:sz="4"/>
+            </w:tcBorders>
+            <w:tcMar>
+              <w:top w:type="dxa" w:w="60"/>
+              <w:left w:type="dxa" w:w="90"/>
+              <w:bottom w:type="dxa" w:w="60"/>
+              <w:right w:type="dxa" w:w="90"/>
+            </w:tcMar>
+            <w:vAlign w:val="top"/>
+          </w:tcPr>
+          <w:p>
+            <w:pPr>
+              <w:spacing w:after="40"/>
+            </w:pPr>
+            <w:r>
+              <w:rPr>
+                <w:rFonts w:ascii="Calibri" w:cs="Calibri" w:eastAsia="Calibri" w:hAnsi="Calibri"/>
+                <w:color w:val="14213D"/>
+                <w:sz w:val="20"/>
+                <w:szCs w:val="20"/>
+              </w:rPr>
+              <w:t xml:space="preserve"/>
+            </w:r>
+          </w:p>
+          <w:p>
+            <w:pPr>
+              <w:spacing w:after="40"/>
+            </w:pPr>
+            <w:r>
+              <w:rPr>
+                <w:rFonts w:ascii="Calibri" w:cs="Calibri" w:eastAsia="Calibri" w:hAnsi="Calibri"/>
+                <w:color w:val="14213D"/>
+                <w:sz w:val="20"/>
+                <w:szCs w:val="20"/>
+              </w:rPr>
+              <w:t xml:space="preserve"/>
+            </w:r>
+          </w:p>
+        </w:tc>
+      </w:tr>
+      <w:tr>
+        <w:tc>
+          <w:tcPr>
+            <w:tcW w:type="dxa" w:w="2300"/>
+            <w:tcBorders>
+              <w:top w:val="single" w:color="D9D5CB" w:sz="4"/>
+              <w:left w:val="single" w:color="D9D5CB" w:sz="4"/>
+              <w:bottom w:val="single" w:color="D9D5CB" w:sz="4"/>
+              <w:right w:val="single" w:color="D9D5CB" w:sz="4"/>
+            </w:tcBorders>
+            <w:tcMar>
+              <w:top w:type="dxa" w:w="60"/>
+              <w:left w:type="dxa" w:w="90"/>
+              <w:bottom w:type="dxa" w:w="60"/>
+              <w:right w:type="dxa" w:w="90"/>
+            </w:tcMar>
+            <w:vAlign w:val="top"/>
+          </w:tcPr>
+          <w:p>
+            <w:pPr>
+              <w:spacing w:after="40"/>
+            </w:pPr>
+            <w:r>
+              <w:rPr>
+                <w:rFonts w:ascii="Calibri" w:cs="Calibri" w:eastAsia="Calibri" w:hAnsi="Calibri"/>
+                <w:b/>
+                <w:bCs/>
+                <w:color w:val="14213D"/>
+                <w:sz w:val="20"/>
+                <w:szCs w:val="20"/>
+              </w:rPr>
+              <w:t xml:space="preserve">Paramètres du chiffrage d'origine</w:t>
+            </w:r>
+          </w:p>
+        </w:tc>
+        <w:tc>
+          <w:tcPr>
+            <w:tcW w:type="dxa" w:w="4100"/>
+            <w:tcBorders>
+              <w:top w:val="single" w:color="D9D5CB" w:sz="4"/>
+              <w:left w:val="single" w:color="D9D5CB" w:sz="4"/>
+              <w:bottom w:val="single" w:color="D9D5CB" w:sz="4"/>
+              <w:right w:val="single" w:color="D9D5CB" w:sz="4"/>
+            </w:tcBorders>
+            <w:tcMar>
+              <w:top w:type="dxa" w:w="60"/>
+              <w:left w:type="dxa" w:w="90"/>
+              <w:bottom w:type="dxa" w:w="60"/>
+              <w:right w:type="dxa" w:w="90"/>
+            </w:tcMar>
+            <w:vAlign w:val="top"/>
+          </w:tcPr>
+          <w:p>
+            <w:pPr>
+              <w:spacing w:after="40"/>
+            </w:pPr>
+            <w:r>
+              <w:rPr>
+                <w:rFonts w:ascii="Calibri" w:cs="Calibri" w:eastAsia="Calibri" w:hAnsi="Calibri"/>
+                <w:color w:val="14213D"/>
+                <w:sz w:val="19"/>
+                <w:szCs w:val="19"/>
+              </w:rPr>
+              <w:t xml:space="preserve">Encore écrits dans le code de l'appli : à déplacer vers la base de prix du serveur, lisible seulement par les comptes autorisés.</w:t>
+            </w:r>
+          </w:p>
+        </w:tc>
+        <w:tc>
+          <w:tcPr>
+            <w:tcW w:type="dxa" w:w="3700"/>
+            <w:tcBorders>
+              <w:top w:val="single" w:color="D9D5CB" w:sz="4"/>
+              <w:left w:val="single" w:color="D9D5CB" w:sz="4"/>
+              <w:bottom w:val="single" w:color="D9D5CB" w:sz="4"/>
+              <w:right w:val="single" w:color="D9D5CB" w:sz="4"/>
+            </w:tcBorders>
+            <w:tcMar>
+              <w:top w:type="dxa" w:w="60"/>
+              <w:left w:type="dxa" w:w="90"/>
+              <w:bottom w:type="dxa" w:w="60"/>
+              <w:right w:type="dxa" w:w="90"/>
+            </w:tcMar>
+            <w:vAlign w:val="top"/>
+          </w:tcPr>
+          <w:p>
+            <w:pPr>
+              <w:spacing w:after="40"/>
+            </w:pPr>
+            <w:r>
+              <w:rPr>
+                <w:rFonts w:ascii="Calibri" w:cs="Calibri" w:eastAsia="Calibri" w:hAnsi="Calibri"/>
+                <w:color w:val="14213D"/>
+                <w:sz w:val="19"/>
+                <w:szCs w:val="19"/>
+              </w:rPr>
+              <w:t xml:space="preserve">1 à 2 h de code.</w:t>
+            </w:r>
+          </w:p>
+        </w:tc>
+        <w:tc>
+          <w:tcPr>
+            <w:tcW w:type="dxa" w:w="1300"/>
+            <w:tcBorders>
+              <w:top w:val="single" w:color="D9D5CB" w:sz="4"/>
+              <w:left w:val="single" w:color="D9D5CB" w:sz="4"/>
+              <w:bottom w:val="single" w:color="D9D5CB" w:sz="4"/>
+              <w:right w:val="single" w:color="D9D5CB" w:sz="4"/>
+            </w:tcBorders>
+            <w:shd w:fill="FFF4EE" w:color="auto" w:val="clear"/>
+            <w:tcMar>
+              <w:top w:type="dxa" w:w="60"/>
+              <w:left w:type="dxa" w:w="90"/>
+              <w:bottom w:type="dxa" w:w="60"/>
+              <w:right w:type="dxa" w:w="90"/>
+            </w:tcMar>
+            <w:vAlign w:val="top"/>
+          </w:tcPr>
+          <w:p>
+            <w:pPr>
+              <w:spacing w:after="40"/>
+            </w:pPr>
+            <w:r>
+              <w:rPr>
+                <w:rFonts w:ascii="Calibri" w:cs="Calibri" w:eastAsia="Calibri" w:hAnsi="Calibri"/>
+                <w:b/>
+                <w:bCs/>
+                <w:color w:val="14213D"/>
+                <w:sz w:val="19"/>
+                <w:szCs w:val="19"/>
+              </w:rPr>
+              <w:t xml:space="preserve">À faire</w:t>
+            </w:r>
+          </w:p>
+        </w:tc>
+        <w:tc>
+          <w:tcPr>
+            <w:tcW w:type="dxa" w:w="3700"/>
+            <w:tcBorders>
+              <w:top w:val="single" w:color="D9D5CB" w:sz="4"/>
+              <w:left w:val="single" w:color="D9D5CB" w:sz="4"/>
+              <w:bottom w:val="single" w:color="D9D5CB" w:sz="4"/>
+              <w:right w:val="single" w:color="D9D5CB" w:sz="4"/>
+            </w:tcBorders>
+            <w:tcMar>
+              <w:top w:type="dxa" w:w="60"/>
+              <w:left w:type="dxa" w:w="90"/>
+              <w:bottom w:type="dxa" w:w="60"/>
+              <w:right w:type="dxa" w:w="90"/>
+            </w:tcMar>
+            <w:vAlign w:val="top"/>
+          </w:tcPr>
+          <w:p>
+            <w:pPr>
+              <w:spacing w:after="40"/>
+            </w:pPr>
+            <w:r>
+              <w:rPr>
+                <w:rFonts w:ascii="Calibri" w:cs="Calibri" w:eastAsia="Calibri" w:hAnsi="Calibri"/>
+                <w:color w:val="14213D"/>
+                <w:sz w:val="20"/>
+                <w:szCs w:val="20"/>
+              </w:rPr>
+              <w:t xml:space="preserve"/>
+            </w:r>
+          </w:p>
+          <w:p>
+            <w:pPr>
+              <w:spacing w:after="40"/>
+            </w:pPr>
+            <w:r>
+              <w:rPr>
+                <w:rFonts w:ascii="Calibri" w:cs="Calibri" w:eastAsia="Calibri" w:hAnsi="Calibri"/>
+                <w:color w:val="14213D"/>
+                <w:sz w:val="20"/>
+                <w:szCs w:val="20"/>
+              </w:rPr>
+              <w:t xml:space="preserve"/>
+            </w:r>
+          </w:p>
+        </w:tc>
+      </w:tr>
+    </w:tbl>
+    <w:p>
+      <w:pPr>
+        <w:pStyle w:val="Heading1"/>
+        <w:spacing w:after="120" w:before="320"/>
+      </w:pPr>
+      <w:r>
+        <w:rPr>
+          <w:rFonts w:ascii="Calibri" w:cs="Calibri" w:eastAsia="Calibri" w:hAnsi="Calibri"/>
+          <w:b/>
+          <w:bCs/>
+          <w:color w:val="EB6834"/>
+          <w:sz w:val="30"/>
+          <w:szCs w:val="30"/>
+        </w:rPr>
+        <w:t xml:space="preserve">Z · « On ne voit pas la même chose » : le poste de Sofiane (13/10 soir)</w:t>
+      </w:r>
+    </w:p>
+    <w:p>
+      <w:pPr>
+        <w:spacing w:after="80" w:line="264"/>
+      </w:pPr>
+      <w:r>
+        <w:rPr>
+          <w:rFonts w:ascii="Calibri" w:cs="Calibri" w:eastAsia="Calibri" w:hAnsi="Calibri"/>
+          <w:color w:val="6B6B66"/>
+          <w:sz w:val="20"/>
+          <w:szCs w:val="20"/>
+        </w:rPr>
+        <w:t xml:space="preserve">Tes quatre constats sur l'ordinateur de Sofiane, et ce qui les causait. Un SQL à passer (g), puis un geste sur ton appareil pour les réglages DH.</w:t>
+      </w:r>
+    </w:p>
+    <w:tbl>
+      <w:tblPr>
+        <w:tblW w:type="dxa" w:w="15100"/>
+        <w:tblBorders>
+          <w:top w:val="single" w:color="auto" w:sz="4"/>
+          <w:left w:val="single" w:color="auto" w:sz="4"/>
+          <w:bottom w:val="single" w:color="auto" w:sz="4"/>
+          <w:right w:val="single" w:color="auto" w:sz="4"/>
+          <w:insideH w:val="single" w:color="auto" w:sz="4"/>
+          <w:insideV w:val="single" w:color="auto" w:sz="4"/>
+        </w:tblBorders>
+      </w:tblPr>
+      <w:tblGrid>
+        <w:gridCol w:w="2300"/>
+        <w:gridCol w:w="4100"/>
+        <w:gridCol w:w="3700"/>
+        <w:gridCol w:w="1300"/>
+        <w:gridCol w:w="3700"/>
+      </w:tblGrid>
+      <w:tr>
+        <w:trPr>
+          <w:tblHeader/>
+        </w:trPr>
+        <w:tc>
+          <w:tcPr>
+            <w:tcW w:type="dxa" w:w="2300"/>
+            <w:tcBorders>
+              <w:top w:val="single" w:color="D9D5CB" w:sz="4"/>
+              <w:left w:val="single" w:color="D9D5CB" w:sz="4"/>
+              <w:bottom w:val="single" w:color="D9D5CB" w:sz="4"/>
+              <w:right w:val="single" w:color="D9D5CB" w:sz="4"/>
+            </w:tcBorders>
+            <w:shd w:fill="14213D" w:color="auto" w:val="clear"/>
+            <w:tcMar>
+              <w:top w:type="dxa" w:w="60"/>
+              <w:left w:type="dxa" w:w="90"/>
+              <w:bottom w:type="dxa" w:w="60"/>
+              <w:right w:type="dxa" w:w="90"/>
+            </w:tcMar>
+            <w:vAlign w:val="top"/>
+          </w:tcPr>
+          <w:p>
+            <w:pPr>
+              <w:spacing w:after="80" w:line="264"/>
+            </w:pPr>
+            <w:r>
+              <w:rPr>
+                <w:rFonts w:ascii="Calibri" w:cs="Calibri" w:eastAsia="Calibri" w:hAnsi="Calibri"/>
+                <w:b/>
+                <w:bCs/>
+                <w:color w:val="FFFFFF"/>
+                <w:sz w:val="19"/>
+                <w:szCs w:val="19"/>
+              </w:rPr>
+              <w:t xml:space="preserve">Fonctionnalité</w:t>
+            </w:r>
+          </w:p>
+        </w:tc>
+        <w:tc>
+          <w:tcPr>
+            <w:tcW w:type="dxa" w:w="4100"/>
+            <w:tcBorders>
+              <w:top w:val="single" w:color="D9D5CB" w:sz="4"/>
+              <w:left w:val="single" w:color="D9D5CB" w:sz="4"/>
+              <w:bottom w:val="single" w:color="D9D5CB" w:sz="4"/>
+              <w:right w:val="single" w:color="D9D5CB" w:sz="4"/>
+            </w:tcBorders>
+            <w:shd w:fill="14213D" w:color="auto" w:val="clear"/>
+            <w:tcMar>
+              <w:top w:type="dxa" w:w="60"/>
+              <w:left w:type="dxa" w:w="90"/>
+              <w:bottom w:type="dxa" w:w="60"/>
+              <w:right w:type="dxa" w:w="90"/>
+            </w:tcMar>
+            <w:vAlign w:val="top"/>
+          </w:tcPr>
+          <w:p>
+            <w:pPr>
+              <w:spacing w:after="80" w:line="264"/>
+            </w:pPr>
+            <w:r>
+              <w:rPr>
+                <w:rFonts w:ascii="Calibri" w:cs="Calibri" w:eastAsia="Calibri" w:hAnsi="Calibri"/>
+                <w:b/>
+                <w:bCs/>
+                <w:color w:val="FFFFFF"/>
+                <w:sz w:val="19"/>
+                <w:szCs w:val="19"/>
+              </w:rPr>
+              <w:t xml:space="preserve">Où la trouver · comment tester</w:t>
+            </w:r>
+          </w:p>
+        </w:tc>
+        <w:tc>
+          <w:tcPr>
+            <w:tcW w:type="dxa" w:w="3700"/>
+            <w:tcBorders>
+              <w:top w:val="single" w:color="D9D5CB" w:sz="4"/>
+              <w:left w:val="single" w:color="D9D5CB" w:sz="4"/>
+              <w:bottom w:val="single" w:color="D9D5CB" w:sz="4"/>
+              <w:right w:val="single" w:color="D9D5CB" w:sz="4"/>
+            </w:tcBorders>
+            <w:shd w:fill="14213D" w:color="auto" w:val="clear"/>
+            <w:tcMar>
+              <w:top w:type="dxa" w:w="60"/>
+              <w:left w:type="dxa" w:w="90"/>
+              <w:bottom w:type="dxa" w:w="60"/>
+              <w:right w:type="dxa" w:w="90"/>
+            </w:tcMar>
+            <w:vAlign w:val="top"/>
+          </w:tcPr>
+          <w:p>
+            <w:pPr>
+              <w:spacing w:after="80" w:line="264"/>
+            </w:pPr>
+            <w:r>
+              <w:rPr>
+                <w:rFonts w:ascii="Calibri" w:cs="Calibri" w:eastAsia="Calibri" w:hAnsi="Calibri"/>
+                <w:b/>
+                <w:bCs/>
+                <w:color w:val="FFFFFF"/>
+                <w:sz w:val="19"/>
+                <w:szCs w:val="19"/>
+              </w:rPr>
+              <w:t xml:space="preserve">Hypothèses · limites · ce que j'ai tranché</w:t>
+            </w:r>
+          </w:p>
+        </w:tc>
+        <w:tc>
+          <w:tcPr>
+            <w:tcW w:type="dxa" w:w="1300"/>
+            <w:tcBorders>
+              <w:top w:val="single" w:color="D9D5CB" w:sz="4"/>
+              <w:left w:val="single" w:color="D9D5CB" w:sz="4"/>
+              <w:bottom w:val="single" w:color="D9D5CB" w:sz="4"/>
+              <w:right w:val="single" w:color="D9D5CB" w:sz="4"/>
+            </w:tcBorders>
+            <w:shd w:fill="14213D" w:color="auto" w:val="clear"/>
+            <w:tcMar>
+              <w:top w:type="dxa" w:w="60"/>
+              <w:left w:type="dxa" w:w="90"/>
+              <w:bottom w:type="dxa" w:w="60"/>
+              <w:right w:type="dxa" w:w="90"/>
+            </w:tcMar>
+            <w:vAlign w:val="top"/>
+          </w:tcPr>
+          <w:p>
+            <w:pPr>
+              <w:spacing w:after="80" w:line="264"/>
+            </w:pPr>
+            <w:r>
+              <w:rPr>
+                <w:rFonts w:ascii="Calibri" w:cs="Calibri" w:eastAsia="Calibri" w:hAnsi="Calibri"/>
+                <w:b/>
+                <w:bCs/>
+                <w:color w:val="FFFFFF"/>
+                <w:sz w:val="19"/>
+                <w:szCs w:val="19"/>
+              </w:rPr>
+              <w:t xml:space="preserve">Statut</w:t>
+            </w:r>
+          </w:p>
+        </w:tc>
+        <w:tc>
+          <w:tcPr>
+            <w:tcW w:type="dxa" w:w="3700"/>
+            <w:tcBorders>
+              <w:top w:val="single" w:color="D9D5CB" w:sz="4"/>
+              <w:left w:val="single" w:color="D9D5CB" w:sz="4"/>
+              <w:bottom w:val="single" w:color="D9D5CB" w:sz="4"/>
+              <w:right w:val="single" w:color="D9D5CB" w:sz="4"/>
+            </w:tcBorders>
+            <w:shd w:fill="14213D" w:color="auto" w:val="clear"/>
+            <w:tcMar>
+              <w:top w:type="dxa" w:w="60"/>
+              <w:left w:type="dxa" w:w="90"/>
+              <w:bottom w:type="dxa" w:w="60"/>
+              <w:right w:type="dxa" w:w="90"/>
+            </w:tcMar>
+            <w:vAlign w:val="top"/>
+          </w:tcPr>
+          <w:p>
+            <w:pPr>
+              <w:spacing w:after="80" w:line="264"/>
+            </w:pPr>
+            <w:r>
+              <w:rPr>
+                <w:rFonts w:ascii="Calibri" w:cs="Calibri" w:eastAsia="Calibri" w:hAnsi="Calibri"/>
+                <w:b/>
+                <w:bCs/>
+                <w:color w:val="FFFFFF"/>
+                <w:sz w:val="19"/>
+                <w:szCs w:val="19"/>
+              </w:rPr>
+              <w:t xml:space="preserve">Vos commentaires</w:t>
+            </w:r>
+          </w:p>
+        </w:tc>
+      </w:tr>
+      <w:tr>
+        <w:tc>
+          <w:tcPr>
+            <w:tcW w:type="dxa" w:w="2300"/>
+            <w:tcBorders>
+              <w:top w:val="single" w:color="D9D5CB" w:sz="4"/>
+              <w:left w:val="single" w:color="D9D5CB" w:sz="4"/>
+              <w:bottom w:val="single" w:color="D9D5CB" w:sz="4"/>
+              <w:right w:val="single" w:color="D9D5CB" w:sz="4"/>
+            </w:tcBorders>
+            <w:tcMar>
+              <w:top w:type="dxa" w:w="60"/>
+              <w:left w:type="dxa" w:w="90"/>
+              <w:bottom w:type="dxa" w:w="60"/>
+              <w:right w:type="dxa" w:w="90"/>
+            </w:tcMar>
+            <w:vAlign w:val="top"/>
+          </w:tcPr>
+          <w:p>
+            <w:pPr>
+              <w:spacing w:after="40"/>
+            </w:pPr>
+            <w:r>
+              <w:rPr>
+                <w:rFonts w:ascii="Calibri" w:cs="Calibri" w:eastAsia="Calibri" w:hAnsi="Calibri"/>
+                <w:b/>
+                <w:bCs/>
+                <w:color w:val="14213D"/>
+                <w:sz w:val="20"/>
+                <w:szCs w:val="20"/>
+              </w:rPr>
+              <w:t xml:space="preserve">Pas d'équipe au planning, une adresse e-mail au lieu du prénom du chef</w:t>
+            </w:r>
+          </w:p>
+        </w:tc>
+        <w:tc>
+          <w:tcPr>
+            <w:tcW w:type="dxa" w:w="4100"/>
+            <w:tcBorders>
+              <w:top w:val="single" w:color="D9D5CB" w:sz="4"/>
+              <w:left w:val="single" w:color="D9D5CB" w:sz="4"/>
+              <w:bottom w:val="single" w:color="D9D5CB" w:sz="4"/>
+              <w:right w:val="single" w:color="D9D5CB" w:sz="4"/>
+            </w:tcBorders>
+            <w:tcMar>
+              <w:top w:type="dxa" w:w="60"/>
+              <w:left w:type="dxa" w:w="90"/>
+              <w:bottom w:type="dxa" w:w="60"/>
+              <w:right w:type="dxa" w:w="90"/>
+            </w:tcMar>
+            <w:vAlign w:val="top"/>
+          </w:tcPr>
+          <w:p>
+            <w:pPr>
+              <w:spacing w:after="40"/>
+            </w:pPr>
+            <w:r>
+              <w:rPr>
+                <w:rFonts w:ascii="Calibri" w:cs="Calibri" w:eastAsia="Calibri" w:hAnsi="Calibri"/>
+                <w:color w:val="14213D"/>
+                <w:sz w:val="19"/>
+                <w:szCs w:val="19"/>
+              </w:rPr>
+              <w:t xml:space="preserve">Cause : une personne dont tu as créé l'accès mais qui ne s'est jamais connectée n'existe que dans les « invitations », que la base ne laissait lire qu'à l'administrateur. Toi tu voyais le chef et l'équipe ; Sofiane, une adresse et personne. Correctif : SQL retours_13-10g.sql — l'annuaire des invités (nom, prénom, poste, type ; pas les droits) lisible par tous les comptes actifs. Le Bureau du chantier se recalcule dès que la liste arrive.</w:t>
+            </w:r>
+          </w:p>
+        </w:tc>
+        <w:tc>
+          <w:tcPr>
+            <w:tcW w:type="dxa" w:w="3700"/>
+            <w:tcBorders>
+              <w:top w:val="single" w:color="D9D5CB" w:sz="4"/>
+              <w:left w:val="single" w:color="D9D5CB" w:sz="4"/>
+              <w:bottom w:val="single" w:color="D9D5CB" w:sz="4"/>
+              <w:right w:val="single" w:color="D9D5CB" w:sz="4"/>
+            </w:tcBorders>
+            <w:tcMar>
+              <w:top w:type="dxa" w:w="60"/>
+              <w:left w:type="dxa" w:w="90"/>
+              <w:bottom w:type="dxa" w:w="60"/>
+              <w:right w:type="dxa" w:w="90"/>
+            </w:tcMar>
+            <w:vAlign w:val="top"/>
+          </w:tcPr>
+          <w:p>
+            <w:pPr>
+              <w:spacing w:after="40"/>
+            </w:pPr>
+            <w:r>
+              <w:rPr>
+                <w:rFonts w:ascii="Calibri" w:cs="Calibri" w:eastAsia="Calibri" w:hAnsi="Calibri"/>
+                <w:color w:val="14213D"/>
+                <w:sz w:val="19"/>
+                <w:szCs w:val="19"/>
+              </w:rPr>
+              <w:t xml:space="preserve">Tant que les gars n'ont pas leur code (🔐) ils restent « invités » : c'est pour ça que tout le monde était concerné.</w:t>
+            </w:r>
+          </w:p>
+        </w:tc>
+        <w:tc>
+          <w:tcPr>
+            <w:tcW w:type="dxa" w:w="1300"/>
+            <w:tcBorders>
+              <w:top w:val="single" w:color="D9D5CB" w:sz="4"/>
+              <w:left w:val="single" w:color="D9D5CB" w:sz="4"/>
+              <w:bottom w:val="single" w:color="D9D5CB" w:sz="4"/>
+              <w:right w:val="single" w:color="D9D5CB" w:sz="4"/>
+            </w:tcBorders>
+            <w:shd w:fill="E6F5EC" w:color="auto" w:val="clear"/>
+            <w:tcMar>
+              <w:top w:type="dxa" w:w="60"/>
+              <w:left w:type="dxa" w:w="90"/>
+              <w:bottom w:type="dxa" w:w="60"/>
+              <w:right w:type="dxa" w:w="90"/>
+            </w:tcMar>
+            <w:vAlign w:val="top"/>
+          </w:tcPr>
+          <w:p>
+            <w:pPr>
+              <w:spacing w:after="40"/>
+            </w:pPr>
+            <w:r>
+              <w:rPr>
+                <w:rFonts w:ascii="Calibri" w:cs="Calibri" w:eastAsia="Calibri" w:hAnsi="Calibri"/>
+                <w:b/>
+                <w:bCs/>
+                <w:color w:val="14213D"/>
+                <w:sz w:val="19"/>
+                <w:szCs w:val="19"/>
+              </w:rPr>
+              <w:t xml:space="preserve">Fait — SQL à passer</w:t>
+            </w:r>
+          </w:p>
+        </w:tc>
+        <w:tc>
+          <w:tcPr>
+            <w:tcW w:type="dxa" w:w="3700"/>
+            <w:tcBorders>
+              <w:top w:val="single" w:color="D9D5CB" w:sz="4"/>
+              <w:left w:val="single" w:color="D9D5CB" w:sz="4"/>
+              <w:bottom w:val="single" w:color="D9D5CB" w:sz="4"/>
+              <w:right w:val="single" w:color="D9D5CB" w:sz="4"/>
+            </w:tcBorders>
+            <w:tcMar>
+              <w:top w:type="dxa" w:w="60"/>
+              <w:left w:type="dxa" w:w="90"/>
+              <w:bottom w:type="dxa" w:w="60"/>
+              <w:right w:type="dxa" w:w="90"/>
+            </w:tcMar>
+            <w:vAlign w:val="top"/>
+          </w:tcPr>
+          <w:p>
+            <w:pPr>
+              <w:spacing w:after="40"/>
+            </w:pPr>
+            <w:r>
+              <w:rPr>
+                <w:rFonts w:ascii="Calibri" w:cs="Calibri" w:eastAsia="Calibri" w:hAnsi="Calibri"/>
+                <w:color w:val="14213D"/>
+                <w:sz w:val="20"/>
+                <w:szCs w:val="20"/>
+              </w:rPr>
+              <w:t xml:space="preserve"/>
+            </w:r>
+          </w:p>
+          <w:p>
+            <w:pPr>
+              <w:spacing w:after="40"/>
+            </w:pPr>
+            <w:r>
+              <w:rPr>
+                <w:rFonts w:ascii="Calibri" w:cs="Calibri" w:eastAsia="Calibri" w:hAnsi="Calibri"/>
+                <w:color w:val="14213D"/>
+                <w:sz w:val="20"/>
+                <w:szCs w:val="20"/>
+              </w:rPr>
+              <w:t xml:space="preserve"/>
+            </w:r>
+          </w:p>
+        </w:tc>
+      </w:tr>
+      <w:tr>
+        <w:tc>
+          <w:tcPr>
+            <w:tcW w:type="dxa" w:w="2300"/>
+            <w:tcBorders>
+              <w:top w:val="single" w:color="D9D5CB" w:sz="4"/>
+              <w:left w:val="single" w:color="D9D5CB" w:sz="4"/>
+              <w:bottom w:val="single" w:color="D9D5CB" w:sz="4"/>
+              <w:right w:val="single" w:color="D9D5CB" w:sz="4"/>
+            </w:tcBorders>
+            <w:tcMar>
+              <w:top w:type="dxa" w:w="60"/>
+              <w:left w:type="dxa" w:w="90"/>
+              <w:bottom w:type="dxa" w:w="60"/>
+              <w:right w:type="dxa" w:w="90"/>
+            </w:tcMar>
+            <w:vAlign w:val="top"/>
+          </w:tcPr>
+          <w:p>
+            <w:pPr>
+              <w:spacing w:after="40"/>
+            </w:pPr>
+            <w:r>
+              <w:rPr>
+                <w:rFonts w:ascii="Calibri" w:cs="Calibri" w:eastAsia="Calibri" w:hAnsi="Calibri"/>
+                <w:b/>
+                <w:bCs/>
+                <w:color w:val="14213D"/>
+                <w:sz w:val="20"/>
+                <w:szCs w:val="20"/>
+              </w:rPr>
+              <w:t xml:space="preserve">Message « pas enregistré sur le serveur » impossible à enlever</w:t>
+            </w:r>
+          </w:p>
+        </w:tc>
+        <w:tc>
+          <w:tcPr>
+            <w:tcW w:type="dxa" w:w="4100"/>
+            <w:tcBorders>
+              <w:top w:val="single" w:color="D9D5CB" w:sz="4"/>
+              <w:left w:val="single" w:color="D9D5CB" w:sz="4"/>
+              <w:bottom w:val="single" w:color="D9D5CB" w:sz="4"/>
+              <w:right w:val="single" w:color="D9D5CB" w:sz="4"/>
+            </w:tcBorders>
+            <w:tcMar>
+              <w:top w:type="dxa" w:w="60"/>
+              <w:left w:type="dxa" w:w="90"/>
+              <w:bottom w:type="dxa" w:w="60"/>
+              <w:right w:type="dxa" w:w="90"/>
+            </w:tcMar>
+            <w:vAlign w:val="top"/>
+          </w:tcPr>
+          <w:p>
+            <w:pPr>
+              <w:spacing w:after="40"/>
+            </w:pPr>
+            <w:r>
+              <w:rPr>
+                <w:rFonts w:ascii="Calibri" w:cs="Calibri" w:eastAsia="Calibri" w:hAnsi="Calibri"/>
+                <w:color w:val="14213D"/>
+                <w:sz w:val="19"/>
+                <w:szCs w:val="19"/>
+              </w:rPr>
+              <w:t xml:space="preserve">Cause : à l'ouverture d'un chantier, l'appli enregistrait toute seule la photo du « tracé marché » ; le serveur le réserve au chef / bureau → refus réessayé en boucle. Désormais : pas d'écriture automatique pour un compte qui n'en a pas le droit ; un refus pour droits n'est plus réessayé en boucle ; dans la fenêtre ⚠️, chaque ligne a « ✕ Abandonner (reprendre la version du serveur) ». Aussi depuis l'accueil : Mon compte → « ⚠️ n enregistrements refusés — voir / abandonner ».</w:t>
+            </w:r>
+          </w:p>
+        </w:tc>
+        <w:tc>
+          <w:tcPr>
+            <w:tcW w:type="dxa" w:w="3700"/>
+            <w:tcBorders>
+              <w:top w:val="single" w:color="D9D5CB" w:sz="4"/>
+              <w:left w:val="single" w:color="D9D5CB" w:sz="4"/>
+              <w:bottom w:val="single" w:color="D9D5CB" w:sz="4"/>
+              <w:right w:val="single" w:color="D9D5CB" w:sz="4"/>
+            </w:tcBorders>
+            <w:tcMar>
+              <w:top w:type="dxa" w:w="60"/>
+              <w:left w:type="dxa" w:w="90"/>
+              <w:bottom w:type="dxa" w:w="60"/>
+              <w:right w:type="dxa" w:w="90"/>
+            </w:tcMar>
+            <w:vAlign w:val="top"/>
+          </w:tcPr>
+          <w:p>
+            <w:pPr>
+              <w:spacing w:after="40"/>
+            </w:pPr>
+            <w:r>
+              <w:rPr>
+                <w:rFonts w:ascii="Calibri" w:cs="Calibri" w:eastAsia="Calibri" w:hAnsi="Calibri"/>
+                <w:color w:val="14213D"/>
+                <w:sz w:val="19"/>
+                <w:szCs w:val="19"/>
+              </w:rPr>
+              <w:t xml:space="preserve">Sur le poste de Sofiane : recharger l'appli, ⚠️ → Abandonner sur ce qui reste.</w:t>
+            </w:r>
+          </w:p>
+        </w:tc>
+        <w:tc>
+          <w:tcPr>
+            <w:tcW w:type="dxa" w:w="1300"/>
+            <w:tcBorders>
+              <w:top w:val="single" w:color="D9D5CB" w:sz="4"/>
+              <w:left w:val="single" w:color="D9D5CB" w:sz="4"/>
+              <w:bottom w:val="single" w:color="D9D5CB" w:sz="4"/>
+              <w:right w:val="single" w:color="D9D5CB" w:sz="4"/>
+            </w:tcBorders>
+            <w:shd w:fill="E6F5EC" w:color="auto" w:val="clear"/>
+            <w:tcMar>
+              <w:top w:type="dxa" w:w="60"/>
+              <w:left w:type="dxa" w:w="90"/>
+              <w:bottom w:type="dxa" w:w="60"/>
+              <w:right w:type="dxa" w:w="90"/>
+            </w:tcMar>
+            <w:vAlign w:val="top"/>
+          </w:tcPr>
+          <w:p>
+            <w:pPr>
+              <w:spacing w:after="40"/>
+            </w:pPr>
+            <w:r>
+              <w:rPr>
+                <w:rFonts w:ascii="Calibri" w:cs="Calibri" w:eastAsia="Calibri" w:hAnsi="Calibri"/>
+                <w:b/>
+                <w:bCs/>
+                <w:color w:val="14213D"/>
+                <w:sz w:val="19"/>
+                <w:szCs w:val="19"/>
+              </w:rPr>
+              <w:t xml:space="preserve">Fait</w:t>
+            </w:r>
+          </w:p>
+        </w:tc>
+        <w:tc>
+          <w:tcPr>
+            <w:tcW w:type="dxa" w:w="3700"/>
+            <w:tcBorders>
+              <w:top w:val="single" w:color="D9D5CB" w:sz="4"/>
+              <w:left w:val="single" w:color="D9D5CB" w:sz="4"/>
+              <w:bottom w:val="single" w:color="D9D5CB" w:sz="4"/>
+              <w:right w:val="single" w:color="D9D5CB" w:sz="4"/>
+            </w:tcBorders>
+            <w:tcMar>
+              <w:top w:type="dxa" w:w="60"/>
+              <w:left w:type="dxa" w:w="90"/>
+              <w:bottom w:type="dxa" w:w="60"/>
+              <w:right w:type="dxa" w:w="90"/>
+            </w:tcMar>
+            <w:vAlign w:val="top"/>
+          </w:tcPr>
+          <w:p>
+            <w:pPr>
+              <w:spacing w:after="40"/>
+            </w:pPr>
+            <w:r>
+              <w:rPr>
+                <w:rFonts w:ascii="Calibri" w:cs="Calibri" w:eastAsia="Calibri" w:hAnsi="Calibri"/>
+                <w:color w:val="14213D"/>
+                <w:sz w:val="20"/>
+                <w:szCs w:val="20"/>
+              </w:rPr>
+              <w:t xml:space="preserve"/>
+            </w:r>
+          </w:p>
+          <w:p>
+            <w:pPr>
+              <w:spacing w:after="40"/>
+            </w:pPr>
+            <w:r>
+              <w:rPr>
+                <w:rFonts w:ascii="Calibri" w:cs="Calibri" w:eastAsia="Calibri" w:hAnsi="Calibri"/>
+                <w:color w:val="14213D"/>
+                <w:sz w:val="20"/>
+                <w:szCs w:val="20"/>
+              </w:rPr>
+              <w:t xml:space="preserve"/>
+            </w:r>
+          </w:p>
+        </w:tc>
+      </w:tr>
+      <w:tr>
+        <w:tc>
+          <w:tcPr>
+            <w:tcW w:type="dxa" w:w="2300"/>
+            <w:tcBorders>
+              <w:top w:val="single" w:color="D9D5CB" w:sz="4"/>
+              <w:left w:val="single" w:color="D9D5CB" w:sz="4"/>
+              <w:bottom w:val="single" w:color="D9D5CB" w:sz="4"/>
+              <w:right w:val="single" w:color="D9D5CB" w:sz="4"/>
+            </w:tcBorders>
+            <w:tcMar>
+              <w:top w:type="dxa" w:w="60"/>
+              <w:left w:type="dxa" w:w="90"/>
+              <w:bottom w:type="dxa" w:w="60"/>
+              <w:right w:type="dxa" w:w="90"/>
+            </w:tcMar>
+            <w:vAlign w:val="top"/>
+          </w:tcPr>
+          <w:p>
+            <w:pPr>
+              <w:spacing w:after="40"/>
+            </w:pPr>
+            <w:r>
+              <w:rPr>
+                <w:rFonts w:ascii="Calibri" w:cs="Calibri" w:eastAsia="Calibri" w:hAnsi="Calibri"/>
+                <w:b/>
+                <w:bCs/>
+                <w:color w:val="14213D"/>
+                <w:sz w:val="20"/>
+                <w:szCs w:val="20"/>
+              </w:rPr>
+              <w:t xml:space="preserve">Paramètres DH différents</w:t>
+            </w:r>
+          </w:p>
+        </w:tc>
+        <w:tc>
+          <w:tcPr>
+            <w:tcW w:type="dxa" w:w="4100"/>
+            <w:tcBorders>
+              <w:top w:val="single" w:color="D9D5CB" w:sz="4"/>
+              <w:left w:val="single" w:color="D9D5CB" w:sz="4"/>
+              <w:bottom w:val="single" w:color="D9D5CB" w:sz="4"/>
+              <w:right w:val="single" w:color="D9D5CB" w:sz="4"/>
+            </w:tcBorders>
+            <w:tcMar>
+              <w:top w:type="dxa" w:w="60"/>
+              <w:left w:type="dxa" w:w="90"/>
+              <w:bottom w:type="dxa" w:w="60"/>
+              <w:right w:type="dxa" w:w="90"/>
+            </w:tcMar>
+            <w:vAlign w:val="top"/>
+          </w:tcPr>
+          <w:p>
+            <w:pPr>
+              <w:spacing w:after="40"/>
+            </w:pPr>
+            <w:r>
+              <w:rPr>
+                <w:rFonts w:ascii="Calibri" w:cs="Calibri" w:eastAsia="Calibri" w:hAnsi="Calibri"/>
+                <w:color w:val="14213D"/>
+                <w:sz w:val="19"/>
+                <w:szCs w:val="19"/>
+              </w:rPr>
+              <w:t xml:space="preserve">Cause : fil (Ω/km), isolement mini, tolérance et fil monté dans un piquage étaient enregistrés sur chaque appareil. Désormais : un réglage SCR commun sur le serveur, lu par tout le monde (copie gardée pour le hors-connexion), en lecture sauf pour l'administrateur.</w:t>
+            </w:r>
+          </w:p>
+        </w:tc>
+        <w:tc>
+          <w:tcPr>
+            <w:tcW w:type="dxa" w:w="3700"/>
+            <w:tcBorders>
+              <w:top w:val="single" w:color="D9D5CB" w:sz="4"/>
+              <w:left w:val="single" w:color="D9D5CB" w:sz="4"/>
+              <w:bottom w:val="single" w:color="D9D5CB" w:sz="4"/>
+              <w:right w:val="single" w:color="D9D5CB" w:sz="4"/>
+            </w:tcBorders>
+            <w:tcMar>
+              <w:top w:type="dxa" w:w="60"/>
+              <w:left w:type="dxa" w:w="90"/>
+              <w:bottom w:type="dxa" w:w="60"/>
+              <w:right w:type="dxa" w:w="90"/>
+            </w:tcMar>
+            <w:vAlign w:val="top"/>
+          </w:tcPr>
+          <w:p>
+            <w:pPr>
+              <w:spacing w:after="40"/>
+            </w:pPr>
+            <w:r>
+              <w:rPr>
+                <w:rFonts w:ascii="Calibri" w:cs="Calibri" w:eastAsia="Calibri" w:hAnsi="Calibri"/>
+                <w:color w:val="14213D"/>
+                <w:sz w:val="19"/>
+                <w:szCs w:val="19"/>
+              </w:rPr>
+              <w:t xml:space="preserve">Ouvre l'onglet DH sur TON appareil : « 📤 Appliquer ces réglages à tout le monde » envoie tes valeurs actuelles. Ensuite, chaque changement que tu fais vaut pour tous.</w:t>
+            </w:r>
+          </w:p>
+        </w:tc>
+        <w:tc>
+          <w:tcPr>
+            <w:tcW w:type="dxa" w:w="1300"/>
+            <w:tcBorders>
+              <w:top w:val="single" w:color="D9D5CB" w:sz="4"/>
+              <w:left w:val="single" w:color="D9D5CB" w:sz="4"/>
+              <w:bottom w:val="single" w:color="D9D5CB" w:sz="4"/>
+              <w:right w:val="single" w:color="D9D5CB" w:sz="4"/>
+            </w:tcBorders>
+            <w:shd w:fill="E6F5EC" w:color="auto" w:val="clear"/>
+            <w:tcMar>
+              <w:top w:type="dxa" w:w="60"/>
+              <w:left w:type="dxa" w:w="90"/>
+              <w:bottom w:type="dxa" w:w="60"/>
+              <w:right w:type="dxa" w:w="90"/>
+            </w:tcMar>
+            <w:vAlign w:val="top"/>
+          </w:tcPr>
+          <w:p>
+            <w:pPr>
+              <w:spacing w:after="40"/>
+            </w:pPr>
+            <w:r>
+              <w:rPr>
+                <w:rFonts w:ascii="Calibri" w:cs="Calibri" w:eastAsia="Calibri" w:hAnsi="Calibri"/>
+                <w:b/>
+                <w:bCs/>
+                <w:color w:val="14213D"/>
+                <w:sz w:val="19"/>
+                <w:szCs w:val="19"/>
+              </w:rPr>
+              <w:t xml:space="preserve">Fait — geste à faire</w:t>
+            </w:r>
+          </w:p>
+        </w:tc>
+        <w:tc>
+          <w:tcPr>
+            <w:tcW w:type="dxa" w:w="3700"/>
+            <w:tcBorders>
+              <w:top w:val="single" w:color="D9D5CB" w:sz="4"/>
+              <w:left w:val="single" w:color="D9D5CB" w:sz="4"/>
+              <w:bottom w:val="single" w:color="D9D5CB" w:sz="4"/>
+              <w:right w:val="single" w:color="D9D5CB" w:sz="4"/>
+            </w:tcBorders>
+            <w:tcMar>
+              <w:top w:type="dxa" w:w="60"/>
+              <w:left w:type="dxa" w:w="90"/>
+              <w:bottom w:type="dxa" w:w="60"/>
+              <w:right w:type="dxa" w:w="90"/>
+            </w:tcMar>
+            <w:vAlign w:val="top"/>
+          </w:tcPr>
+          <w:p>
+            <w:pPr>
+              <w:spacing w:after="40"/>
+            </w:pPr>
+            <w:r>
+              <w:rPr>
+                <w:rFonts w:ascii="Calibri" w:cs="Calibri" w:eastAsia="Calibri" w:hAnsi="Calibri"/>
+                <w:color w:val="14213D"/>
+                <w:sz w:val="20"/>
+                <w:szCs w:val="20"/>
+              </w:rPr>
+              <w:t xml:space="preserve"/>
+            </w:r>
+          </w:p>
+          <w:p>
+            <w:pPr>
+              <w:spacing w:after="40"/>
+            </w:pPr>
+            <w:r>
+              <w:rPr>
+                <w:rFonts w:ascii="Calibri" w:cs="Calibri" w:eastAsia="Calibri" w:hAnsi="Calibri"/>
+                <w:color w:val="14213D"/>
+                <w:sz w:val="20"/>
+                <w:szCs w:val="20"/>
+              </w:rPr>
+              <w:t xml:space="preserve"/>
+            </w:r>
+          </w:p>
+        </w:tc>
+      </w:tr>
+    </w:tbl>
+    <w:p>
+      <w:pPr>
+        <w:pStyle w:val="Heading1"/>
+        <w:spacing w:after="120" w:before="320"/>
+      </w:pPr>
+      <w:r>
+        <w:rPr>
+          <w:rFonts w:ascii="Calibri" w:cs="Calibri" w:eastAsia="Calibri" w:hAnsi="Calibri"/>
+          <w:b/>
+          <w:bCs/>
+          <w:color w:val="EB6834"/>
+          <w:sz w:val="30"/>
+          <w:szCs w:val="30"/>
+        </w:rPr>
+        <w:t xml:space="preserve">Y · Atelier DPGF, devis de référence, comment marche la base de prix (13/10, fin de journée)</w:t>
+      </w:r>
+    </w:p>
+    <w:p>
+      <w:pPr>
+        <w:spacing w:after="80" w:line="264"/>
+      </w:pPr>
+      <w:r>
+        <w:rPr>
+          <w:rFonts w:ascii="Calibri" w:cs="Calibri" w:eastAsia="Calibri" w:hAnsi="Calibri"/>
+          <w:color w:val="6B6B66"/>
+          <w:sz w:val="20"/>
+          <w:szCs w:val="20"/>
+        </w:rPr>
+        <w:t xml:space="preserve">Tes retours sur le chiffrage, deuxième partie. Rien d'ancien n'est retiré : l'ancienne vue du DPGF (sources ligne par ligne) reste dessous, repliée.</w:t>
+      </w:r>
+    </w:p>
+    <w:tbl>
+      <w:tblPr>
+        <w:tblW w:type="dxa" w:w="15100"/>
+        <w:tblBorders>
+          <w:top w:val="single" w:color="auto" w:sz="4"/>
+          <w:left w:val="single" w:color="auto" w:sz="4"/>
+          <w:bottom w:val="single" w:color="auto" w:sz="4"/>
+          <w:right w:val="single" w:color="auto" w:sz="4"/>
+          <w:insideH w:val="single" w:color="auto" w:sz="4"/>
+          <w:insideV w:val="single" w:color="auto" w:sz="4"/>
+        </w:tblBorders>
+      </w:tblPr>
+      <w:tblGrid>
+        <w:gridCol w:w="2300"/>
+        <w:gridCol w:w="4100"/>
+        <w:gridCol w:w="3700"/>
+        <w:gridCol w:w="1300"/>
+        <w:gridCol w:w="3700"/>
+      </w:tblGrid>
+      <w:tr>
+        <w:trPr>
+          <w:tblHeader/>
+        </w:trPr>
+        <w:tc>
+          <w:tcPr>
+            <w:tcW w:type="dxa" w:w="2300"/>
+            <w:tcBorders>
+              <w:top w:val="single" w:color="D9D5CB" w:sz="4"/>
+              <w:left w:val="single" w:color="D9D5CB" w:sz="4"/>
+              <w:bottom w:val="single" w:color="D9D5CB" w:sz="4"/>
+              <w:right w:val="single" w:color="D9D5CB" w:sz="4"/>
+            </w:tcBorders>
+            <w:shd w:fill="14213D" w:color="auto" w:val="clear"/>
+            <w:tcMar>
+              <w:top w:type="dxa" w:w="60"/>
+              <w:left w:type="dxa" w:w="90"/>
+              <w:bottom w:type="dxa" w:w="60"/>
+              <w:right w:type="dxa" w:w="90"/>
+            </w:tcMar>
+            <w:vAlign w:val="top"/>
+          </w:tcPr>
+          <w:p>
+            <w:pPr>
+              <w:spacing w:after="80" w:line="264"/>
+            </w:pPr>
+            <w:r>
+              <w:rPr>
+                <w:rFonts w:ascii="Calibri" w:cs="Calibri" w:eastAsia="Calibri" w:hAnsi="Calibri"/>
+                <w:b/>
+                <w:bCs/>
+                <w:color w:val="FFFFFF"/>
+                <w:sz w:val="19"/>
+                <w:szCs w:val="19"/>
+              </w:rPr>
+              <w:t xml:space="preserve">Fonctionnalité</w:t>
+            </w:r>
+          </w:p>
+        </w:tc>
+        <w:tc>
+          <w:tcPr>
+            <w:tcW w:type="dxa" w:w="4100"/>
+            <w:tcBorders>
+              <w:top w:val="single" w:color="D9D5CB" w:sz="4"/>
+              <w:left w:val="single" w:color="D9D5CB" w:sz="4"/>
+              <w:bottom w:val="single" w:color="D9D5CB" w:sz="4"/>
+              <w:right w:val="single" w:color="D9D5CB" w:sz="4"/>
+            </w:tcBorders>
+            <w:shd w:fill="14213D" w:color="auto" w:val="clear"/>
+            <w:tcMar>
+              <w:top w:type="dxa" w:w="60"/>
+              <w:left w:type="dxa" w:w="90"/>
+              <w:bottom w:type="dxa" w:w="60"/>
+              <w:right w:type="dxa" w:w="90"/>
+            </w:tcMar>
+            <w:vAlign w:val="top"/>
+          </w:tcPr>
+          <w:p>
+            <w:pPr>
+              <w:spacing w:after="80" w:line="264"/>
+            </w:pPr>
+            <w:r>
+              <w:rPr>
+                <w:rFonts w:ascii="Calibri" w:cs="Calibri" w:eastAsia="Calibri" w:hAnsi="Calibri"/>
+                <w:b/>
+                <w:bCs/>
+                <w:color w:val="FFFFFF"/>
+                <w:sz w:val="19"/>
+                <w:szCs w:val="19"/>
+              </w:rPr>
+              <w:t xml:space="preserve">Où la trouver · comment tester</w:t>
+            </w:r>
+          </w:p>
+        </w:tc>
+        <w:tc>
+          <w:tcPr>
+            <w:tcW w:type="dxa" w:w="3700"/>
+            <w:tcBorders>
+              <w:top w:val="single" w:color="D9D5CB" w:sz="4"/>
+              <w:left w:val="single" w:color="D9D5CB" w:sz="4"/>
+              <w:bottom w:val="single" w:color="D9D5CB" w:sz="4"/>
+              <w:right w:val="single" w:color="D9D5CB" w:sz="4"/>
+            </w:tcBorders>
+            <w:shd w:fill="14213D" w:color="auto" w:val="clear"/>
+            <w:tcMar>
+              <w:top w:type="dxa" w:w="60"/>
+              <w:left w:type="dxa" w:w="90"/>
+              <w:bottom w:type="dxa" w:w="60"/>
+              <w:right w:type="dxa" w:w="90"/>
+            </w:tcMar>
+            <w:vAlign w:val="top"/>
+          </w:tcPr>
+          <w:p>
+            <w:pPr>
+              <w:spacing w:after="80" w:line="264"/>
+            </w:pPr>
+            <w:r>
+              <w:rPr>
+                <w:rFonts w:ascii="Calibri" w:cs="Calibri" w:eastAsia="Calibri" w:hAnsi="Calibri"/>
+                <w:b/>
+                <w:bCs/>
+                <w:color w:val="FFFFFF"/>
+                <w:sz w:val="19"/>
+                <w:szCs w:val="19"/>
+              </w:rPr>
+              <w:t xml:space="preserve">Hypothèses · limites · ce que j'ai tranché</w:t>
+            </w:r>
+          </w:p>
+        </w:tc>
+        <w:tc>
+          <w:tcPr>
+            <w:tcW w:type="dxa" w:w="1300"/>
+            <w:tcBorders>
+              <w:top w:val="single" w:color="D9D5CB" w:sz="4"/>
+              <w:left w:val="single" w:color="D9D5CB" w:sz="4"/>
+              <w:bottom w:val="single" w:color="D9D5CB" w:sz="4"/>
+              <w:right w:val="single" w:color="D9D5CB" w:sz="4"/>
+            </w:tcBorders>
+            <w:shd w:fill="14213D" w:color="auto" w:val="clear"/>
+            <w:tcMar>
+              <w:top w:type="dxa" w:w="60"/>
+              <w:left w:type="dxa" w:w="90"/>
+              <w:bottom w:type="dxa" w:w="60"/>
+              <w:right w:type="dxa" w:w="90"/>
+            </w:tcMar>
+            <w:vAlign w:val="top"/>
+          </w:tcPr>
+          <w:p>
+            <w:pPr>
+              <w:spacing w:after="80" w:line="264"/>
+            </w:pPr>
+            <w:r>
+              <w:rPr>
+                <w:rFonts w:ascii="Calibri" w:cs="Calibri" w:eastAsia="Calibri" w:hAnsi="Calibri"/>
+                <w:b/>
+                <w:bCs/>
+                <w:color w:val="FFFFFF"/>
+                <w:sz w:val="19"/>
+                <w:szCs w:val="19"/>
+              </w:rPr>
+              <w:t xml:space="preserve">Statut</w:t>
+            </w:r>
+          </w:p>
+        </w:tc>
+        <w:tc>
+          <w:tcPr>
+            <w:tcW w:type="dxa" w:w="3700"/>
+            <w:tcBorders>
+              <w:top w:val="single" w:color="D9D5CB" w:sz="4"/>
+              <w:left w:val="single" w:color="D9D5CB" w:sz="4"/>
+              <w:bottom w:val="single" w:color="D9D5CB" w:sz="4"/>
+              <w:right w:val="single" w:color="D9D5CB" w:sz="4"/>
+            </w:tcBorders>
+            <w:shd w:fill="14213D" w:color="auto" w:val="clear"/>
+            <w:tcMar>
+              <w:top w:type="dxa" w:w="60"/>
+              <w:left w:type="dxa" w:w="90"/>
+              <w:bottom w:type="dxa" w:w="60"/>
+              <w:right w:type="dxa" w:w="90"/>
+            </w:tcMar>
+            <w:vAlign w:val="top"/>
+          </w:tcPr>
+          <w:p>
+            <w:pPr>
+              <w:spacing w:after="80" w:line="264"/>
+            </w:pPr>
+            <w:r>
+              <w:rPr>
+                <w:rFonts w:ascii="Calibri" w:cs="Calibri" w:eastAsia="Calibri" w:hAnsi="Calibri"/>
+                <w:b/>
+                <w:bCs/>
+                <w:color w:val="FFFFFF"/>
+                <w:sz w:val="19"/>
+                <w:szCs w:val="19"/>
+              </w:rPr>
+              <w:t xml:space="preserve">Vos commentaires</w:t>
+            </w:r>
+          </w:p>
+        </w:tc>
+      </w:tr>
+      <w:tr>
+        <w:tc>
+          <w:tcPr>
+            <w:tcW w:type="dxa" w:w="2300"/>
+            <w:tcBorders>
+              <w:top w:val="single" w:color="D9D5CB" w:sz="4"/>
+              <w:left w:val="single" w:color="D9D5CB" w:sz="4"/>
+              <w:bottom w:val="single" w:color="D9D5CB" w:sz="4"/>
+              <w:right w:val="single" w:color="D9D5CB" w:sz="4"/>
+            </w:tcBorders>
+            <w:tcMar>
+              <w:top w:type="dxa" w:w="60"/>
+              <w:left w:type="dxa" w:w="90"/>
+              <w:bottom w:type="dxa" w:w="60"/>
+              <w:right w:type="dxa" w:w="90"/>
+            </w:tcMar>
+            <w:vAlign w:val="top"/>
+          </w:tcPr>
+          <w:p>
+            <w:pPr>
+              <w:spacing w:after="40"/>
+            </w:pPr>
+            <w:r>
+              <w:rPr>
+                <w:rFonts w:ascii="Calibri" w:cs="Calibri" w:eastAsia="Calibri" w:hAnsi="Calibri"/>
+                <w:b/>
+                <w:bCs/>
+                <w:color w:val="14213D"/>
+                <w:sz w:val="20"/>
+                <w:szCs w:val="20"/>
+              </w:rPr>
+              <w:t xml:space="preserve">Atelier DPGF : tes coûts ↔ la feuille du client</w:t>
+            </w:r>
+          </w:p>
+        </w:tc>
+        <w:tc>
+          <w:tcPr>
+            <w:tcW w:type="dxa" w:w="4100"/>
+            <w:tcBorders>
+              <w:top w:val="single" w:color="D9D5CB" w:sz="4"/>
+              <w:left w:val="single" w:color="D9D5CB" w:sz="4"/>
+              <w:bottom w:val="single" w:color="D9D5CB" w:sz="4"/>
+              <w:right w:val="single" w:color="D9D5CB" w:sz="4"/>
+            </w:tcBorders>
+            <w:tcMar>
+              <w:top w:type="dxa" w:w="60"/>
+              <w:left w:type="dxa" w:w="90"/>
+              <w:bottom w:type="dxa" w:w="60"/>
+              <w:right w:type="dxa" w:w="90"/>
+            </w:tcMar>
+            <w:vAlign w:val="top"/>
+          </w:tcPr>
+          <w:p>
+            <w:pPr>
+              <w:spacing w:after="40"/>
+            </w:pPr>
+            <w:r>
+              <w:rPr>
+                <w:rFonts w:ascii="Calibri" w:cs="Calibri" w:eastAsia="Calibri" w:hAnsi="Calibri"/>
+                <w:color w:val="14213D"/>
+                <w:sz w:val="19"/>
+                <w:szCs w:val="19"/>
+              </w:rPr>
+              <w:t xml:space="preserve">7 · DPGF (après import du fichier du client) → « Atelier DPGF » : à gauche « Nos coûts » par zone (postes, paniers, installations, au prix de vente) avec ce qui est placé et le reste ; à droite la feuille du client (n° de ligne Excel, n°, désignation, unité, quantité, PU proposé, montant).</w:t>
+            </w:r>
+          </w:p>
+        </w:tc>
+        <w:tc>
+          <w:tcPr>
+            <w:tcW w:type="dxa" w:w="3700"/>
+            <w:tcBorders>
+              <w:top w:val="single" w:color="D9D5CB" w:sz="4"/>
+              <w:left w:val="single" w:color="D9D5CB" w:sz="4"/>
+              <w:bottom w:val="single" w:color="D9D5CB" w:sz="4"/>
+              <w:right w:val="single" w:color="D9D5CB" w:sz="4"/>
+            </w:tcBorders>
+            <w:tcMar>
+              <w:top w:type="dxa" w:w="60"/>
+              <w:left w:type="dxa" w:w="90"/>
+              <w:bottom w:type="dxa" w:w="60"/>
+              <w:right w:type="dxa" w:w="90"/>
+            </w:tcMar>
+            <w:vAlign w:val="top"/>
+          </w:tcPr>
+          <w:p>
+            <w:pPr>
+              <w:spacing w:after="40"/>
+            </w:pPr>
+            <w:r>
+              <w:rPr>
+                <w:rFonts w:ascii="Calibri" w:cs="Calibri" w:eastAsia="Calibri" w:hAnsi="Calibri"/>
+                <w:color w:val="14213D"/>
+                <w:sz w:val="19"/>
+                <w:szCs w:val="19"/>
+              </w:rPr>
+              <w:t xml:space="preserve">Filtre « À placer » / « Tout ». Les coûts entièrement placés passent en grisé.</w:t>
+            </w:r>
+          </w:p>
+        </w:tc>
+        <w:tc>
+          <w:tcPr>
+            <w:tcW w:type="dxa" w:w="1300"/>
+            <w:tcBorders>
+              <w:top w:val="single" w:color="D9D5CB" w:sz="4"/>
+              <w:left w:val="single" w:color="D9D5CB" w:sz="4"/>
+              <w:bottom w:val="single" w:color="D9D5CB" w:sz="4"/>
+              <w:right w:val="single" w:color="D9D5CB" w:sz="4"/>
+            </w:tcBorders>
+            <w:shd w:fill="E6F5EC" w:color="auto" w:val="clear"/>
+            <w:tcMar>
+              <w:top w:type="dxa" w:w="60"/>
+              <w:left w:type="dxa" w:w="90"/>
+              <w:bottom w:type="dxa" w:w="60"/>
+              <w:right w:type="dxa" w:w="90"/>
+            </w:tcMar>
+            <w:vAlign w:val="top"/>
+          </w:tcPr>
+          <w:p>
+            <w:pPr>
+              <w:spacing w:after="40"/>
+            </w:pPr>
+            <w:r>
+              <w:rPr>
+                <w:rFonts w:ascii="Calibri" w:cs="Calibri" w:eastAsia="Calibri" w:hAnsi="Calibri"/>
+                <w:b/>
+                <w:bCs/>
+                <w:color w:val="14213D"/>
+                <w:sz w:val="19"/>
+                <w:szCs w:val="19"/>
+              </w:rPr>
+              <w:t xml:space="preserve">Fait</w:t>
+            </w:r>
+          </w:p>
+        </w:tc>
+        <w:tc>
+          <w:tcPr>
+            <w:tcW w:type="dxa" w:w="3700"/>
+            <w:tcBorders>
+              <w:top w:val="single" w:color="D9D5CB" w:sz="4"/>
+              <w:left w:val="single" w:color="D9D5CB" w:sz="4"/>
+              <w:bottom w:val="single" w:color="D9D5CB" w:sz="4"/>
+              <w:right w:val="single" w:color="D9D5CB" w:sz="4"/>
+            </w:tcBorders>
+            <w:tcMar>
+              <w:top w:type="dxa" w:w="60"/>
+              <w:left w:type="dxa" w:w="90"/>
+              <w:bottom w:type="dxa" w:w="60"/>
+              <w:right w:type="dxa" w:w="90"/>
+            </w:tcMar>
+            <w:vAlign w:val="top"/>
+          </w:tcPr>
+          <w:p>
+            <w:pPr>
+              <w:spacing w:after="40"/>
+            </w:pPr>
+            <w:r>
+              <w:rPr>
+                <w:rFonts w:ascii="Calibri" w:cs="Calibri" w:eastAsia="Calibri" w:hAnsi="Calibri"/>
+                <w:color w:val="14213D"/>
+                <w:sz w:val="20"/>
+                <w:szCs w:val="20"/>
+              </w:rPr>
+              <w:t xml:space="preserve"/>
+            </w:r>
+          </w:p>
+          <w:p>
+            <w:pPr>
+              <w:spacing w:after="40"/>
+            </w:pPr>
+            <w:r>
+              <w:rPr>
+                <w:rFonts w:ascii="Calibri" w:cs="Calibri" w:eastAsia="Calibri" w:hAnsi="Calibri"/>
+                <w:color w:val="14213D"/>
+                <w:sz w:val="20"/>
+                <w:szCs w:val="20"/>
+              </w:rPr>
+              <w:t xml:space="preserve"/>
+            </w:r>
+          </w:p>
+        </w:tc>
+      </w:tr>
+      <w:tr>
+        <w:tc>
+          <w:tcPr>
+            <w:tcW w:type="dxa" w:w="2300"/>
+            <w:tcBorders>
+              <w:top w:val="single" w:color="D9D5CB" w:sz="4"/>
+              <w:left w:val="single" w:color="D9D5CB" w:sz="4"/>
+              <w:bottom w:val="single" w:color="D9D5CB" w:sz="4"/>
+              <w:right w:val="single" w:color="D9D5CB" w:sz="4"/>
+            </w:tcBorders>
+            <w:tcMar>
+              <w:top w:type="dxa" w:w="60"/>
+              <w:left w:type="dxa" w:w="90"/>
+              <w:bottom w:type="dxa" w:w="60"/>
+              <w:right w:type="dxa" w:w="90"/>
+            </w:tcMar>
+            <w:vAlign w:val="top"/>
+          </w:tcPr>
+          <w:p>
+            <w:pPr>
+              <w:spacing w:after="40"/>
+            </w:pPr>
+            <w:r>
+              <w:rPr>
+                <w:rFonts w:ascii="Calibri" w:cs="Calibri" w:eastAsia="Calibri" w:hAnsi="Calibri"/>
+                <w:b/>
+                <w:bCs/>
+                <w:color w:val="14213D"/>
+                <w:sz w:val="20"/>
+                <w:szCs w:val="20"/>
+              </w:rPr>
+              <w:t xml:space="preserve">Placer une dépense dans une ligne</w:t>
+            </w:r>
+          </w:p>
+        </w:tc>
+        <w:tc>
+          <w:tcPr>
+            <w:tcW w:type="dxa" w:w="4100"/>
+            <w:tcBorders>
+              <w:top w:val="single" w:color="D9D5CB" w:sz="4"/>
+              <w:left w:val="single" w:color="D9D5CB" w:sz="4"/>
+              <w:bottom w:val="single" w:color="D9D5CB" w:sz="4"/>
+              <w:right w:val="single" w:color="D9D5CB" w:sz="4"/>
+            </w:tcBorders>
+            <w:tcMar>
+              <w:top w:type="dxa" w:w="60"/>
+              <w:left w:type="dxa" w:w="90"/>
+              <w:bottom w:type="dxa" w:w="60"/>
+              <w:right w:type="dxa" w:w="90"/>
+            </w:tcMar>
+            <w:vAlign w:val="top"/>
+          </w:tcPr>
+          <w:p>
+            <w:pPr>
+              <w:spacing w:after="40"/>
+            </w:pPr>
+            <w:r>
+              <w:rPr>
+                <w:rFonts w:ascii="Calibri" w:cs="Calibri" w:eastAsia="Calibri" w:hAnsi="Calibri"/>
+                <w:color w:val="14213D"/>
+                <w:sz w:val="19"/>
+                <w:szCs w:val="19"/>
+              </w:rPr>
+              <w:t xml:space="preserve">Touche un coût, puis la ligne : « Placer » → part du coût (%) → « Diviser par la quantité de : cette ligne » → PU = montant ÷ quantité. L'aperçu donne le PU ajouté et le montant sur la ligne.</w:t>
+            </w:r>
+          </w:p>
+        </w:tc>
+        <w:tc>
+          <w:tcPr>
+            <w:tcW w:type="dxa" w:w="3700"/>
+            <w:tcBorders>
+              <w:top w:val="single" w:color="D9D5CB" w:sz="4"/>
+              <w:left w:val="single" w:color="D9D5CB" w:sz="4"/>
+              <w:bottom w:val="single" w:color="D9D5CB" w:sz="4"/>
+              <w:right w:val="single" w:color="D9D5CB" w:sz="4"/>
+            </w:tcBorders>
+            <w:tcMar>
+              <w:top w:type="dxa" w:w="60"/>
+              <w:left w:type="dxa" w:w="90"/>
+              <w:bottom w:type="dxa" w:w="60"/>
+              <w:right w:type="dxa" w:w="90"/>
+            </w:tcMar>
+            <w:vAlign w:val="top"/>
+          </w:tcPr>
+          <w:p>
+            <w:pPr>
+              <w:spacing w:after="40"/>
+            </w:pPr>
+            <w:r>
+              <w:rPr>
+                <w:rFonts w:ascii="Calibri" w:cs="Calibri" w:eastAsia="Calibri" w:hAnsi="Calibri"/>
+                <w:color w:val="14213D"/>
+                <w:sz w:val="19"/>
+                <w:szCs w:val="19"/>
+              </w:rPr>
+              <w:t xml:space="preserve">Un coût peut se répartir sur plusieurs lignes (50 % ici, 50 % là). Chaque placement s'affiche sur la ligne (✕ pour le retirer).</w:t>
+            </w:r>
+          </w:p>
+        </w:tc>
+        <w:tc>
+          <w:tcPr>
+            <w:tcW w:type="dxa" w:w="1300"/>
+            <w:tcBorders>
+              <w:top w:val="single" w:color="D9D5CB" w:sz="4"/>
+              <w:left w:val="single" w:color="D9D5CB" w:sz="4"/>
+              <w:bottom w:val="single" w:color="D9D5CB" w:sz="4"/>
+              <w:right w:val="single" w:color="D9D5CB" w:sz="4"/>
+            </w:tcBorders>
+            <w:shd w:fill="E6F5EC" w:color="auto" w:val="clear"/>
+            <w:tcMar>
+              <w:top w:type="dxa" w:w="60"/>
+              <w:left w:type="dxa" w:w="90"/>
+              <w:bottom w:type="dxa" w:w="60"/>
+              <w:right w:type="dxa" w:w="90"/>
+            </w:tcMar>
+            <w:vAlign w:val="top"/>
+          </w:tcPr>
+          <w:p>
+            <w:pPr>
+              <w:spacing w:after="40"/>
+            </w:pPr>
+            <w:r>
+              <w:rPr>
+                <w:rFonts w:ascii="Calibri" w:cs="Calibri" w:eastAsia="Calibri" w:hAnsi="Calibri"/>
+                <w:b/>
+                <w:bCs/>
+                <w:color w:val="14213D"/>
+                <w:sz w:val="19"/>
+                <w:szCs w:val="19"/>
+              </w:rPr>
+              <w:t xml:space="preserve">Fait</w:t>
+            </w:r>
+          </w:p>
+        </w:tc>
+        <w:tc>
+          <w:tcPr>
+            <w:tcW w:type="dxa" w:w="3700"/>
+            <w:tcBorders>
+              <w:top w:val="single" w:color="D9D5CB" w:sz="4"/>
+              <w:left w:val="single" w:color="D9D5CB" w:sz="4"/>
+              <w:bottom w:val="single" w:color="D9D5CB" w:sz="4"/>
+              <w:right w:val="single" w:color="D9D5CB" w:sz="4"/>
+            </w:tcBorders>
+            <w:tcMar>
+              <w:top w:type="dxa" w:w="60"/>
+              <w:left w:type="dxa" w:w="90"/>
+              <w:bottom w:type="dxa" w:w="60"/>
+              <w:right w:type="dxa" w:w="90"/>
+            </w:tcMar>
+            <w:vAlign w:val="top"/>
+          </w:tcPr>
+          <w:p>
+            <w:pPr>
+              <w:spacing w:after="40"/>
+            </w:pPr>
+            <w:r>
+              <w:rPr>
+                <w:rFonts w:ascii="Calibri" w:cs="Calibri" w:eastAsia="Calibri" w:hAnsi="Calibri"/>
+                <w:color w:val="14213D"/>
+                <w:sz w:val="20"/>
+                <w:szCs w:val="20"/>
+              </w:rPr>
+              <w:t xml:space="preserve"/>
+            </w:r>
+          </w:p>
+          <w:p>
+            <w:pPr>
+              <w:spacing w:after="40"/>
+            </w:pPr>
+            <w:r>
+              <w:rPr>
+                <w:rFonts w:ascii="Calibri" w:cs="Calibri" w:eastAsia="Calibri" w:hAnsi="Calibri"/>
+                <w:color w:val="14213D"/>
+                <w:sz w:val="20"/>
+                <w:szCs w:val="20"/>
+              </w:rPr>
+              <w:t xml:space="preserve"/>
+            </w:r>
+          </w:p>
+        </w:tc>
+      </w:tr>
+      <w:tr>
+        <w:tc>
+          <w:tcPr>
+            <w:tcW w:type="dxa" w:w="2300"/>
+            <w:tcBorders>
+              <w:top w:val="single" w:color="D9D5CB" w:sz="4"/>
+              <w:left w:val="single" w:color="D9D5CB" w:sz="4"/>
+              <w:bottom w:val="single" w:color="D9D5CB" w:sz="4"/>
+              <w:right w:val="single" w:color="D9D5CB" w:sz="4"/>
+            </w:tcBorders>
+            <w:tcMar>
+              <w:top w:type="dxa" w:w="60"/>
+              <w:left w:type="dxa" w:w="90"/>
+              <w:bottom w:type="dxa" w:w="60"/>
+              <w:right w:type="dxa" w:w="90"/>
+            </w:tcMar>
+            <w:vAlign w:val="top"/>
+          </w:tcPr>
+          <w:p>
+            <w:pPr>
+              <w:spacing w:after="40"/>
+            </w:pPr>
+            <w:r>
+              <w:rPr>
+                <w:rFonts w:ascii="Calibri" w:cs="Calibri" w:eastAsia="Calibri" w:hAnsi="Calibri"/>
+                <w:b/>
+                <w:bCs/>
+                <w:color w:val="14213D"/>
+                <w:sz w:val="20"/>
+                <w:szCs w:val="20"/>
+              </w:rPr>
+              <w:t xml:space="preserve">Diviser par la quantité d'une AUTRE ligne</w:t>
+            </w:r>
+          </w:p>
+        </w:tc>
+        <w:tc>
+          <w:tcPr>
+            <w:tcW w:type="dxa" w:w="4100"/>
+            <w:tcBorders>
+              <w:top w:val="single" w:color="D9D5CB" w:sz="4"/>
+              <w:left w:val="single" w:color="D9D5CB" w:sz="4"/>
+              <w:bottom w:val="single" w:color="D9D5CB" w:sz="4"/>
+              <w:right w:val="single" w:color="D9D5CB" w:sz="4"/>
+            </w:tcBorders>
+            <w:tcMar>
+              <w:top w:type="dxa" w:w="60"/>
+              <w:left w:type="dxa" w:w="90"/>
+              <w:bottom w:type="dxa" w:w="60"/>
+              <w:right w:type="dxa" w:w="90"/>
+            </w:tcMar>
+            <w:vAlign w:val="top"/>
+          </w:tcPr>
+          <w:p>
+            <w:pPr>
+              <w:spacing w:after="40"/>
+            </w:pPr>
+            <w:r>
+              <w:rPr>
+                <w:rFonts w:ascii="Calibri" w:cs="Calibri" w:eastAsia="Calibri" w:hAnsi="Calibri"/>
+                <w:color w:val="14213D"/>
+                <w:sz w:val="19"/>
+                <w:szCs w:val="19"/>
+              </w:rPr>
+              <w:t xml:space="preserve">Même fenêtre « Placer » : « Diviser par la quantité de » → choisis une autre ligne (ex. les ml du réseau) → un taux par unité ajouté au PU de cette ligne (aperçu : « 16 667 € ÷ 1 240 ml = 13,44 €, × 380 ml »).</w:t>
+            </w:r>
+          </w:p>
+        </w:tc>
+        <w:tc>
+          <w:tcPr>
+            <w:tcW w:type="dxa" w:w="3700"/>
+            <w:tcBorders>
+              <w:top w:val="single" w:color="D9D5CB" w:sz="4"/>
+              <w:left w:val="single" w:color="D9D5CB" w:sz="4"/>
+              <w:bottom w:val="single" w:color="D9D5CB" w:sz="4"/>
+              <w:right w:val="single" w:color="D9D5CB" w:sz="4"/>
+            </w:tcBorders>
+            <w:tcMar>
+              <w:top w:type="dxa" w:w="60"/>
+              <w:left w:type="dxa" w:w="90"/>
+              <w:bottom w:type="dxa" w:w="60"/>
+              <w:right w:type="dxa" w:w="90"/>
+            </w:tcMar>
+            <w:vAlign w:val="top"/>
+          </w:tcPr>
+          <w:p>
+            <w:pPr>
+              <w:spacing w:after="40"/>
+            </w:pPr>
+            <w:r>
+              <w:rPr>
+                <w:rFonts w:ascii="Calibri" w:cs="Calibri" w:eastAsia="Calibri" w:hAnsi="Calibri"/>
+                <w:color w:val="14213D"/>
+                <w:sz w:val="19"/>
+                <w:szCs w:val="19"/>
+              </w:rPr>
+              <w:t xml:space="preserve">C'est ta phrase : « cette dépense divisée par la quantité de telle cellule = le PU de telle cellule ».</w:t>
+            </w:r>
+          </w:p>
+        </w:tc>
+        <w:tc>
+          <w:tcPr>
+            <w:tcW w:type="dxa" w:w="1300"/>
+            <w:tcBorders>
+              <w:top w:val="single" w:color="D9D5CB" w:sz="4"/>
+              <w:left w:val="single" w:color="D9D5CB" w:sz="4"/>
+              <w:bottom w:val="single" w:color="D9D5CB" w:sz="4"/>
+              <w:right w:val="single" w:color="D9D5CB" w:sz="4"/>
+            </w:tcBorders>
+            <w:shd w:fill="E6F5EC" w:color="auto" w:val="clear"/>
+            <w:tcMar>
+              <w:top w:type="dxa" w:w="60"/>
+              <w:left w:type="dxa" w:w="90"/>
+              <w:bottom w:type="dxa" w:w="60"/>
+              <w:right w:type="dxa" w:w="90"/>
+            </w:tcMar>
+            <w:vAlign w:val="top"/>
+          </w:tcPr>
+          <w:p>
+            <w:pPr>
+              <w:spacing w:after="40"/>
+            </w:pPr>
+            <w:r>
+              <w:rPr>
+                <w:rFonts w:ascii="Calibri" w:cs="Calibri" w:eastAsia="Calibri" w:hAnsi="Calibri"/>
+                <w:b/>
+                <w:bCs/>
+                <w:color w:val="14213D"/>
+                <w:sz w:val="19"/>
+                <w:szCs w:val="19"/>
+              </w:rPr>
+              <w:t xml:space="preserve">Fait</w:t>
+            </w:r>
+          </w:p>
+        </w:tc>
+        <w:tc>
+          <w:tcPr>
+            <w:tcW w:type="dxa" w:w="3700"/>
+            <w:tcBorders>
+              <w:top w:val="single" w:color="D9D5CB" w:sz="4"/>
+              <w:left w:val="single" w:color="D9D5CB" w:sz="4"/>
+              <w:bottom w:val="single" w:color="D9D5CB" w:sz="4"/>
+              <w:right w:val="single" w:color="D9D5CB" w:sz="4"/>
+            </w:tcBorders>
+            <w:tcMar>
+              <w:top w:type="dxa" w:w="60"/>
+              <w:left w:type="dxa" w:w="90"/>
+              <w:bottom w:type="dxa" w:w="60"/>
+              <w:right w:type="dxa" w:w="90"/>
+            </w:tcMar>
+            <w:vAlign w:val="top"/>
+          </w:tcPr>
+          <w:p>
+            <w:pPr>
+              <w:spacing w:after="40"/>
+            </w:pPr>
+            <w:r>
+              <w:rPr>
+                <w:rFonts w:ascii="Calibri" w:cs="Calibri" w:eastAsia="Calibri" w:hAnsi="Calibri"/>
+                <w:color w:val="14213D"/>
+                <w:sz w:val="20"/>
+                <w:szCs w:val="20"/>
+              </w:rPr>
+              <w:t xml:space="preserve"/>
+            </w:r>
+          </w:p>
+          <w:p>
+            <w:pPr>
+              <w:spacing w:after="40"/>
+            </w:pPr>
+            <w:r>
+              <w:rPr>
+                <w:rFonts w:ascii="Calibri" w:cs="Calibri" w:eastAsia="Calibri" w:hAnsi="Calibri"/>
+                <w:color w:val="14213D"/>
+                <w:sz w:val="20"/>
+                <w:szCs w:val="20"/>
+              </w:rPr>
+              <w:t xml:space="preserve"/>
+            </w:r>
+          </w:p>
+        </w:tc>
+      </w:tr>
+      <w:tr>
+        <w:tc>
+          <w:tcPr>
+            <w:tcW w:type="dxa" w:w="2300"/>
+            <w:tcBorders>
+              <w:top w:val="single" w:color="D9D5CB" w:sz="4"/>
+              <w:left w:val="single" w:color="D9D5CB" w:sz="4"/>
+              <w:bottom w:val="single" w:color="D9D5CB" w:sz="4"/>
+              <w:right w:val="single" w:color="D9D5CB" w:sz="4"/>
+            </w:tcBorders>
+            <w:tcMar>
+              <w:top w:type="dxa" w:w="60"/>
+              <w:left w:type="dxa" w:w="90"/>
+              <w:bottom w:type="dxa" w:w="60"/>
+              <w:right w:type="dxa" w:w="90"/>
+            </w:tcMar>
+            <w:vAlign w:val="top"/>
+          </w:tcPr>
+          <w:p>
+            <w:pPr>
+              <w:spacing w:after="40"/>
+            </w:pPr>
+            <w:r>
+              <w:rPr>
+                <w:rFonts w:ascii="Calibri" w:cs="Calibri" w:eastAsia="Calibri" w:hAnsi="Calibri"/>
+                <w:b/>
+                <w:bCs/>
+                <w:color w:val="14213D"/>
+                <w:sz w:val="20"/>
+                <w:szCs w:val="20"/>
+              </w:rPr>
+              <w:t xml:space="preserve">Le reste, au ml</w:t>
+            </w:r>
+          </w:p>
+        </w:tc>
+        <w:tc>
+          <w:tcPr>
+            <w:tcW w:type="dxa" w:w="4100"/>
+            <w:tcBorders>
+              <w:top w:val="single" w:color="D9D5CB" w:sz="4"/>
+              <w:left w:val="single" w:color="D9D5CB" w:sz="4"/>
+              <w:bottom w:val="single" w:color="D9D5CB" w:sz="4"/>
+              <w:right w:val="single" w:color="D9D5CB" w:sz="4"/>
+            </w:tcBorders>
+            <w:tcMar>
+              <w:top w:type="dxa" w:w="60"/>
+              <w:left w:type="dxa" w:w="90"/>
+              <w:bottom w:type="dxa" w:w="60"/>
+              <w:right w:type="dxa" w:w="90"/>
+            </w:tcMar>
+            <w:vAlign w:val="top"/>
+          </w:tcPr>
+          <w:p>
+            <w:pPr>
+              <w:spacing w:after="40"/>
+            </w:pPr>
+            <w:r>
+              <w:rPr>
+                <w:rFonts w:ascii="Calibri" w:cs="Calibri" w:eastAsia="Calibri" w:hAnsi="Calibri"/>
+                <w:color w:val="14213D"/>
+                <w:sz w:val="19"/>
+                <w:szCs w:val="19"/>
+              </w:rPr>
+              <w:t xml:space="preserve">Case « reste » sur une ligne : elle reçoit sa part de ce qui n'est placé nulle part, au prorata de sa quantité (comme avant).</w:t>
+            </w:r>
+          </w:p>
+        </w:tc>
+        <w:tc>
+          <w:tcPr>
+            <w:tcW w:type="dxa" w:w="3700"/>
+            <w:tcBorders>
+              <w:top w:val="single" w:color="D9D5CB" w:sz="4"/>
+              <w:left w:val="single" w:color="D9D5CB" w:sz="4"/>
+              <w:bottom w:val="single" w:color="D9D5CB" w:sz="4"/>
+              <w:right w:val="single" w:color="D9D5CB" w:sz="4"/>
+            </w:tcBorders>
+            <w:tcMar>
+              <w:top w:type="dxa" w:w="60"/>
+              <w:left w:type="dxa" w:w="90"/>
+              <w:bottom w:type="dxa" w:w="60"/>
+              <w:right w:type="dxa" w:w="90"/>
+            </w:tcMar>
+            <w:vAlign w:val="top"/>
+          </w:tcPr>
+          <w:p>
+            <w:pPr>
+              <w:spacing w:after="40"/>
+            </w:pPr>
+            <w:r>
+              <w:rPr>
+                <w:rFonts w:ascii="Calibri" w:cs="Calibri" w:eastAsia="Calibri" w:hAnsi="Calibri"/>
+                <w:color w:val="14213D"/>
+                <w:sz w:val="19"/>
+                <w:szCs w:val="19"/>
+              </w:rPr>
+              <w:t xml:space="preserve"/>
+            </w:r>
+          </w:p>
+        </w:tc>
+        <w:tc>
+          <w:tcPr>
+            <w:tcW w:type="dxa" w:w="1300"/>
+            <w:tcBorders>
+              <w:top w:val="single" w:color="D9D5CB" w:sz="4"/>
+              <w:left w:val="single" w:color="D9D5CB" w:sz="4"/>
+              <w:bottom w:val="single" w:color="D9D5CB" w:sz="4"/>
+              <w:right w:val="single" w:color="D9D5CB" w:sz="4"/>
+            </w:tcBorders>
+            <w:shd w:fill="E6F5EC" w:color="auto" w:val="clear"/>
+            <w:tcMar>
+              <w:top w:type="dxa" w:w="60"/>
+              <w:left w:type="dxa" w:w="90"/>
+              <w:bottom w:type="dxa" w:w="60"/>
+              <w:right w:type="dxa" w:w="90"/>
+            </w:tcMar>
+            <w:vAlign w:val="top"/>
+          </w:tcPr>
+          <w:p>
+            <w:pPr>
+              <w:spacing w:after="40"/>
+            </w:pPr>
+            <w:r>
+              <w:rPr>
+                <w:rFonts w:ascii="Calibri" w:cs="Calibri" w:eastAsia="Calibri" w:hAnsi="Calibri"/>
+                <w:b/>
+                <w:bCs/>
+                <w:color w:val="14213D"/>
+                <w:sz w:val="19"/>
+                <w:szCs w:val="19"/>
+              </w:rPr>
+              <w:t xml:space="preserve">Fait</w:t>
+            </w:r>
+          </w:p>
+        </w:tc>
+        <w:tc>
+          <w:tcPr>
+            <w:tcW w:type="dxa" w:w="3700"/>
+            <w:tcBorders>
+              <w:top w:val="single" w:color="D9D5CB" w:sz="4"/>
+              <w:left w:val="single" w:color="D9D5CB" w:sz="4"/>
+              <w:bottom w:val="single" w:color="D9D5CB" w:sz="4"/>
+              <w:right w:val="single" w:color="D9D5CB" w:sz="4"/>
+            </w:tcBorders>
+            <w:tcMar>
+              <w:top w:type="dxa" w:w="60"/>
+              <w:left w:type="dxa" w:w="90"/>
+              <w:bottom w:type="dxa" w:w="60"/>
+              <w:right w:type="dxa" w:w="90"/>
+            </w:tcMar>
+            <w:vAlign w:val="top"/>
+          </w:tcPr>
+          <w:p>
+            <w:pPr>
+              <w:spacing w:after="40"/>
+            </w:pPr>
+            <w:r>
+              <w:rPr>
+                <w:rFonts w:ascii="Calibri" w:cs="Calibri" w:eastAsia="Calibri" w:hAnsi="Calibri"/>
+                <w:color w:val="14213D"/>
+                <w:sz w:val="20"/>
+                <w:szCs w:val="20"/>
+              </w:rPr>
+              <w:t xml:space="preserve"/>
+            </w:r>
+          </w:p>
+          <w:p>
+            <w:pPr>
+              <w:spacing w:after="40"/>
+            </w:pPr>
+            <w:r>
+              <w:rPr>
+                <w:rFonts w:ascii="Calibri" w:cs="Calibri" w:eastAsia="Calibri" w:hAnsi="Calibri"/>
+                <w:color w:val="14213D"/>
+                <w:sz w:val="20"/>
+                <w:szCs w:val="20"/>
+              </w:rPr>
+              <w:t xml:space="preserve"/>
+            </w:r>
+          </w:p>
+        </w:tc>
+      </w:tr>
+      <w:tr>
+        <w:tc>
+          <w:tcPr>
+            <w:tcW w:type="dxa" w:w="2300"/>
+            <w:tcBorders>
+              <w:top w:val="single" w:color="D9D5CB" w:sz="4"/>
+              <w:left w:val="single" w:color="D9D5CB" w:sz="4"/>
+              <w:bottom w:val="single" w:color="D9D5CB" w:sz="4"/>
+              <w:right w:val="single" w:color="D9D5CB" w:sz="4"/>
+            </w:tcBorders>
+            <w:tcMar>
+              <w:top w:type="dxa" w:w="60"/>
+              <w:left w:type="dxa" w:w="90"/>
+              <w:bottom w:type="dxa" w:w="60"/>
+              <w:right w:type="dxa" w:w="90"/>
+            </w:tcMar>
+            <w:vAlign w:val="top"/>
+          </w:tcPr>
+          <w:p>
+            <w:pPr>
+              <w:spacing w:after="40"/>
+            </w:pPr>
+            <w:r>
+              <w:rPr>
+                <w:rFonts w:ascii="Calibri" w:cs="Calibri" w:eastAsia="Calibri" w:hAnsi="Calibri"/>
+                <w:b/>
+                <w:bCs/>
+                <w:color w:val="14213D"/>
+                <w:sz w:val="20"/>
+                <w:szCs w:val="20"/>
+              </w:rPr>
+              <w:t xml:space="preserve">Plein écran, autre écran</w:t>
+            </w:r>
+          </w:p>
+        </w:tc>
+        <w:tc>
+          <w:tcPr>
+            <w:tcW w:type="dxa" w:w="4100"/>
+            <w:tcBorders>
+              <w:top w:val="single" w:color="D9D5CB" w:sz="4"/>
+              <w:left w:val="single" w:color="D9D5CB" w:sz="4"/>
+              <w:bottom w:val="single" w:color="D9D5CB" w:sz="4"/>
+              <w:right w:val="single" w:color="D9D5CB" w:sz="4"/>
+            </w:tcBorders>
+            <w:tcMar>
+              <w:top w:type="dxa" w:w="60"/>
+              <w:left w:type="dxa" w:w="90"/>
+              <w:bottom w:type="dxa" w:w="60"/>
+              <w:right w:type="dxa" w:w="90"/>
+            </w:tcMar>
+            <w:vAlign w:val="top"/>
+          </w:tcPr>
+          <w:p>
+            <w:pPr>
+              <w:spacing w:after="40"/>
+            </w:pPr>
+            <w:r>
+              <w:rPr>
+                <w:rFonts w:ascii="Calibri" w:cs="Calibri" w:eastAsia="Calibri" w:hAnsi="Calibri"/>
+                <w:color w:val="14213D"/>
+                <w:sz w:val="19"/>
+                <w:szCs w:val="19"/>
+              </w:rPr>
+              <w:t xml:space="preserve">⤢ Plein écran ; ⧉ Autre écran : la feuille du client s'ouvre dans une fenêtre à glisser sur ton 2e écran — tu touches le coût dans l'appli, la ligne dans la fenêtre, « Placer » s'ouvre là-bas. ↩ ramène la feuille dans l'appli.</w:t>
+            </w:r>
+          </w:p>
+        </w:tc>
+        <w:tc>
+          <w:tcPr>
+            <w:tcW w:type="dxa" w:w="3700"/>
+            <w:tcBorders>
+              <w:top w:val="single" w:color="D9D5CB" w:sz="4"/>
+              <w:left w:val="single" w:color="D9D5CB" w:sz="4"/>
+              <w:bottom w:val="single" w:color="D9D5CB" w:sz="4"/>
+              <w:right w:val="single" w:color="D9D5CB" w:sz="4"/>
+            </w:tcBorders>
+            <w:tcMar>
+              <w:top w:type="dxa" w:w="60"/>
+              <w:left w:type="dxa" w:w="90"/>
+              <w:bottom w:type="dxa" w:w="60"/>
+              <w:right w:type="dxa" w:w="90"/>
+            </w:tcMar>
+            <w:vAlign w:val="top"/>
+          </w:tcPr>
+          <w:p>
+            <w:pPr>
+              <w:spacing w:after="40"/>
+            </w:pPr>
+            <w:r>
+              <w:rPr>
+                <w:rFonts w:ascii="Calibri" w:cs="Calibri" w:eastAsia="Calibri" w:hAnsi="Calibri"/>
+                <w:color w:val="14213D"/>
+                <w:sz w:val="19"/>
+                <w:szCs w:val="19"/>
+              </w:rPr>
+              <w:t xml:space="preserve">Autorise les fenêtres surgissantes pour le site si le navigateur bloque (même chose que pour la Lecture).</w:t>
+            </w:r>
+          </w:p>
+        </w:tc>
+        <w:tc>
+          <w:tcPr>
+            <w:tcW w:type="dxa" w:w="1300"/>
+            <w:tcBorders>
+              <w:top w:val="single" w:color="D9D5CB" w:sz="4"/>
+              <w:left w:val="single" w:color="D9D5CB" w:sz="4"/>
+              <w:bottom w:val="single" w:color="D9D5CB" w:sz="4"/>
+              <w:right w:val="single" w:color="D9D5CB" w:sz="4"/>
+            </w:tcBorders>
+            <w:shd w:fill="E6F5EC" w:color="auto" w:val="clear"/>
+            <w:tcMar>
+              <w:top w:type="dxa" w:w="60"/>
+              <w:left w:type="dxa" w:w="90"/>
+              <w:bottom w:type="dxa" w:w="60"/>
+              <w:right w:type="dxa" w:w="90"/>
+            </w:tcMar>
+            <w:vAlign w:val="top"/>
+          </w:tcPr>
+          <w:p>
+            <w:pPr>
+              <w:spacing w:after="40"/>
+            </w:pPr>
+            <w:r>
+              <w:rPr>
+                <w:rFonts w:ascii="Calibri" w:cs="Calibri" w:eastAsia="Calibri" w:hAnsi="Calibri"/>
+                <w:b/>
+                <w:bCs/>
+                <w:color w:val="14213D"/>
+                <w:sz w:val="19"/>
+                <w:szCs w:val="19"/>
+              </w:rPr>
+              <w:t xml:space="preserve">Fait</w:t>
+            </w:r>
+          </w:p>
+        </w:tc>
+        <w:tc>
+          <w:tcPr>
+            <w:tcW w:type="dxa" w:w="3700"/>
+            <w:tcBorders>
+              <w:top w:val="single" w:color="D9D5CB" w:sz="4"/>
+              <w:left w:val="single" w:color="D9D5CB" w:sz="4"/>
+              <w:bottom w:val="single" w:color="D9D5CB" w:sz="4"/>
+              <w:right w:val="single" w:color="D9D5CB" w:sz="4"/>
+            </w:tcBorders>
+            <w:tcMar>
+              <w:top w:type="dxa" w:w="60"/>
+              <w:left w:type="dxa" w:w="90"/>
+              <w:bottom w:type="dxa" w:w="60"/>
+              <w:right w:type="dxa" w:w="90"/>
+            </w:tcMar>
+            <w:vAlign w:val="top"/>
+          </w:tcPr>
+          <w:p>
+            <w:pPr>
+              <w:spacing w:after="40"/>
+            </w:pPr>
+            <w:r>
+              <w:rPr>
+                <w:rFonts w:ascii="Calibri" w:cs="Calibri" w:eastAsia="Calibri" w:hAnsi="Calibri"/>
+                <w:color w:val="14213D"/>
+                <w:sz w:val="20"/>
+                <w:szCs w:val="20"/>
+              </w:rPr>
+              <w:t xml:space="preserve"/>
+            </w:r>
+          </w:p>
+          <w:p>
+            <w:pPr>
+              <w:spacing w:after="40"/>
+            </w:pPr>
+            <w:r>
+              <w:rPr>
+                <w:rFonts w:ascii="Calibri" w:cs="Calibri" w:eastAsia="Calibri" w:hAnsi="Calibri"/>
+                <w:color w:val="14213D"/>
+                <w:sz w:val="20"/>
+                <w:szCs w:val="20"/>
+              </w:rPr>
+              <w:t xml:space="preserve"/>
+            </w:r>
+          </w:p>
+        </w:tc>
+      </w:tr>
+      <w:tr>
+        <w:tc>
+          <w:tcPr>
+            <w:tcW w:type="dxa" w:w="2300"/>
+            <w:tcBorders>
+              <w:top w:val="single" w:color="D9D5CB" w:sz="4"/>
+              <w:left w:val="single" w:color="D9D5CB" w:sz="4"/>
+              <w:bottom w:val="single" w:color="D9D5CB" w:sz="4"/>
+              <w:right w:val="single" w:color="D9D5CB" w:sz="4"/>
+            </w:tcBorders>
+            <w:tcMar>
+              <w:top w:type="dxa" w:w="60"/>
+              <w:left w:type="dxa" w:w="90"/>
+              <w:bottom w:type="dxa" w:w="60"/>
+              <w:right w:type="dxa" w:w="90"/>
+            </w:tcMar>
+            <w:vAlign w:val="top"/>
+          </w:tcPr>
+          <w:p>
+            <w:pPr>
+              <w:spacing w:after="40"/>
+            </w:pPr>
+            <w:r>
+              <w:rPr>
+                <w:rFonts w:ascii="Calibri" w:cs="Calibri" w:eastAsia="Calibri" w:hAnsi="Calibri"/>
+                <w:b/>
+                <w:bCs/>
+                <w:color w:val="14213D"/>
+                <w:sz w:val="20"/>
+                <w:szCs w:val="20"/>
+              </w:rPr>
+              <w:t xml:space="preserve">Appliquer, exporter</w:t>
+            </w:r>
+          </w:p>
+        </w:tc>
+        <w:tc>
+          <w:tcPr>
+            <w:tcW w:type="dxa" w:w="4100"/>
+            <w:tcBorders>
+              <w:top w:val="single" w:color="D9D5CB" w:sz="4"/>
+              <w:left w:val="single" w:color="D9D5CB" w:sz="4"/>
+              <w:bottom w:val="single" w:color="D9D5CB" w:sz="4"/>
+              <w:right w:val="single" w:color="D9D5CB" w:sz="4"/>
+            </w:tcBorders>
+            <w:tcMar>
+              <w:top w:type="dxa" w:w="60"/>
+              <w:left w:type="dxa" w:w="90"/>
+              <w:bottom w:type="dxa" w:w="60"/>
+              <w:right w:type="dxa" w:w="90"/>
+            </w:tcMar>
+            <w:vAlign w:val="top"/>
+          </w:tcPr>
+          <w:p>
+            <w:pPr>
+              <w:spacing w:after="40"/>
+            </w:pPr>
+            <w:r>
+              <w:rPr>
+                <w:rFonts w:ascii="Calibri" w:cs="Calibri" w:eastAsia="Calibri" w:hAnsi="Calibri"/>
+                <w:color w:val="14213D"/>
+                <w:sz w:val="19"/>
+                <w:szCs w:val="19"/>
+              </w:rPr>
+              <w:t xml:space="preserve">« → Appliquer les PU » écrit le bordereau (le total tombe sur le prix de vente), « ⬇ Excel du client » réécrit son fichier avec tes PU (inchangé).</w:t>
+            </w:r>
+          </w:p>
+        </w:tc>
+        <w:tc>
+          <w:tcPr>
+            <w:tcW w:type="dxa" w:w="3700"/>
+            <w:tcBorders>
+              <w:top w:val="single" w:color="D9D5CB" w:sz="4"/>
+              <w:left w:val="single" w:color="D9D5CB" w:sz="4"/>
+              <w:bottom w:val="single" w:color="D9D5CB" w:sz="4"/>
+              <w:right w:val="single" w:color="D9D5CB" w:sz="4"/>
+            </w:tcBorders>
+            <w:tcMar>
+              <w:top w:type="dxa" w:w="60"/>
+              <w:left w:type="dxa" w:w="90"/>
+              <w:bottom w:type="dxa" w:w="60"/>
+              <w:right w:type="dxa" w:w="90"/>
+            </w:tcMar>
+            <w:vAlign w:val="top"/>
+          </w:tcPr>
+          <w:p>
+            <w:pPr>
+              <w:spacing w:after="40"/>
+            </w:pPr>
+            <w:r>
+              <w:rPr>
+                <w:rFonts w:ascii="Calibri" w:cs="Calibri" w:eastAsia="Calibri" w:hAnsi="Calibri"/>
+                <w:color w:val="14213D"/>
+                <w:sz w:val="19"/>
+                <w:szCs w:val="19"/>
+              </w:rPr>
+              <w:t xml:space="preserve"/>
+            </w:r>
+          </w:p>
+        </w:tc>
+        <w:tc>
+          <w:tcPr>
+            <w:tcW w:type="dxa" w:w="1300"/>
+            <w:tcBorders>
+              <w:top w:val="single" w:color="D9D5CB" w:sz="4"/>
+              <w:left w:val="single" w:color="D9D5CB" w:sz="4"/>
+              <w:bottom w:val="single" w:color="D9D5CB" w:sz="4"/>
+              <w:right w:val="single" w:color="D9D5CB" w:sz="4"/>
+            </w:tcBorders>
+            <w:shd w:fill="E6F5EC" w:color="auto" w:val="clear"/>
+            <w:tcMar>
+              <w:top w:type="dxa" w:w="60"/>
+              <w:left w:type="dxa" w:w="90"/>
+              <w:bottom w:type="dxa" w:w="60"/>
+              <w:right w:type="dxa" w:w="90"/>
+            </w:tcMar>
+            <w:vAlign w:val="top"/>
+          </w:tcPr>
+          <w:p>
+            <w:pPr>
+              <w:spacing w:after="40"/>
+            </w:pPr>
+            <w:r>
+              <w:rPr>
+                <w:rFonts w:ascii="Calibri" w:cs="Calibri" w:eastAsia="Calibri" w:hAnsi="Calibri"/>
+                <w:b/>
+                <w:bCs/>
+                <w:color w:val="14213D"/>
+                <w:sz w:val="19"/>
+                <w:szCs w:val="19"/>
+              </w:rPr>
+              <w:t xml:space="preserve">Fait</w:t>
+            </w:r>
+          </w:p>
+        </w:tc>
+        <w:tc>
+          <w:tcPr>
+            <w:tcW w:type="dxa" w:w="3700"/>
+            <w:tcBorders>
+              <w:top w:val="single" w:color="D9D5CB" w:sz="4"/>
+              <w:left w:val="single" w:color="D9D5CB" w:sz="4"/>
+              <w:bottom w:val="single" w:color="D9D5CB" w:sz="4"/>
+              <w:right w:val="single" w:color="D9D5CB" w:sz="4"/>
+            </w:tcBorders>
+            <w:tcMar>
+              <w:top w:type="dxa" w:w="60"/>
+              <w:left w:type="dxa" w:w="90"/>
+              <w:bottom w:type="dxa" w:w="60"/>
+              <w:right w:type="dxa" w:w="90"/>
+            </w:tcMar>
+            <w:vAlign w:val="top"/>
+          </w:tcPr>
+          <w:p>
+            <w:pPr>
+              <w:spacing w:after="40"/>
+            </w:pPr>
+            <w:r>
+              <w:rPr>
+                <w:rFonts w:ascii="Calibri" w:cs="Calibri" w:eastAsia="Calibri" w:hAnsi="Calibri"/>
+                <w:color w:val="14213D"/>
+                <w:sz w:val="20"/>
+                <w:szCs w:val="20"/>
+              </w:rPr>
+              <w:t xml:space="preserve"/>
+            </w:r>
+          </w:p>
+          <w:p>
+            <w:pPr>
+              <w:spacing w:after="40"/>
+            </w:pPr>
+            <w:r>
+              <w:rPr>
+                <w:rFonts w:ascii="Calibri" w:cs="Calibri" w:eastAsia="Calibri" w:hAnsi="Calibri"/>
+                <w:color w:val="14213D"/>
+                <w:sz w:val="20"/>
+                <w:szCs w:val="20"/>
+              </w:rPr>
+              <w:t xml:space="preserve"/>
+            </w:r>
+          </w:p>
+        </w:tc>
+      </w:tr>
+      <w:tr>
+        <w:tc>
+          <w:tcPr>
+            <w:tcW w:type="dxa" w:w="2300"/>
+            <w:tcBorders>
+              <w:top w:val="single" w:color="D9D5CB" w:sz="4"/>
+              <w:left w:val="single" w:color="D9D5CB" w:sz="4"/>
+              <w:bottom w:val="single" w:color="D9D5CB" w:sz="4"/>
+              <w:right w:val="single" w:color="D9D5CB" w:sz="4"/>
+            </w:tcBorders>
+            <w:tcMar>
+              <w:top w:type="dxa" w:w="60"/>
+              <w:left w:type="dxa" w:w="90"/>
+              <w:bottom w:type="dxa" w:w="60"/>
+              <w:right w:type="dxa" w:w="90"/>
+            </w:tcMar>
+            <w:vAlign w:val="top"/>
+          </w:tcPr>
+          <w:p>
+            <w:pPr>
+              <w:spacing w:after="40"/>
+            </w:pPr>
+            <w:r>
+              <w:rPr>
+                <w:rFonts w:ascii="Calibri" w:cs="Calibri" w:eastAsia="Calibri" w:hAnsi="Calibri"/>
+                <w:b/>
+                <w:bCs/>
+                <w:color w:val="14213D"/>
+                <w:sz w:val="20"/>
+                <w:szCs w:val="20"/>
+              </w:rPr>
+              <w:t xml:space="preserve">Base de prix : comment ça marche</w:t>
+            </w:r>
+          </w:p>
+        </w:tc>
+        <w:tc>
+          <w:tcPr>
+            <w:tcW w:type="dxa" w:w="4100"/>
+            <w:tcBorders>
+              <w:top w:val="single" w:color="D9D5CB" w:sz="4"/>
+              <w:left w:val="single" w:color="D9D5CB" w:sz="4"/>
+              <w:bottom w:val="single" w:color="D9D5CB" w:sz="4"/>
+              <w:right w:val="single" w:color="D9D5CB" w:sz="4"/>
+            </w:tcBorders>
+            <w:tcMar>
+              <w:top w:type="dxa" w:w="60"/>
+              <w:left w:type="dxa" w:w="90"/>
+              <w:bottom w:type="dxa" w:w="60"/>
+              <w:right w:type="dxa" w:w="90"/>
+            </w:tcMar>
+            <w:vAlign w:val="top"/>
+          </w:tcPr>
+          <w:p>
+            <w:pPr>
+              <w:spacing w:after="40"/>
+            </w:pPr>
+            <w:r>
+              <w:rPr>
+                <w:rFonts w:ascii="Calibri" w:cs="Calibri" w:eastAsia="Calibri" w:hAnsi="Calibri"/>
+                <w:color w:val="14213D"/>
+                <w:sz w:val="19"/>
+                <w:szCs w:val="19"/>
+              </w:rPr>
+              <w:t xml:space="preserve">Chiffrage d'une affaire (et page ⚙ Base de prix SCR) : carte « ❓ Comment ça marche ». 🏛 La base SCR est commune à toute l'entreprise (taux, cadences, fournitures, paramètres, paniers) : la modifier change tous les chiffrages. 📁 Dans un dossier, tu retouches un panier (heures, quantités, PU) ou ajoutes un panier libre : ça ne change que ce chiffrage (la valeur de la base reste en gris, « modifié », ↺). 🔁 Réimporter le classeur remplace la base, en gardant les retouches de paniers et les devis liés.</w:t>
+            </w:r>
+          </w:p>
+        </w:tc>
+        <w:tc>
+          <w:tcPr>
+            <w:tcW w:type="dxa" w:w="3700"/>
+            <w:tcBorders>
+              <w:top w:val="single" w:color="D9D5CB" w:sz="4"/>
+              <w:left w:val="single" w:color="D9D5CB" w:sz="4"/>
+              <w:bottom w:val="single" w:color="D9D5CB" w:sz="4"/>
+              <w:right w:val="single" w:color="D9D5CB" w:sz="4"/>
+            </w:tcBorders>
+            <w:tcMar>
+              <w:top w:type="dxa" w:w="60"/>
+              <w:left w:type="dxa" w:w="90"/>
+              <w:bottom w:type="dxa" w:w="60"/>
+              <w:right w:type="dxa" w:w="90"/>
+            </w:tcMar>
+            <w:vAlign w:val="top"/>
+          </w:tcPr>
+          <w:p>
+            <w:pPr>
+              <w:spacing w:after="40"/>
+            </w:pPr>
+            <w:r>
+              <w:rPr>
+                <w:rFonts w:ascii="Calibri" w:cs="Calibri" w:eastAsia="Calibri" w:hAnsi="Calibri"/>
+                <w:color w:val="14213D"/>
+                <w:sz w:val="19"/>
+                <w:szCs w:val="19"/>
+              </w:rPr>
+              <w:t xml:space="preserve">C'était déjà comme ça, mais rien ne le disait.</w:t>
+            </w:r>
+          </w:p>
+        </w:tc>
+        <w:tc>
+          <w:tcPr>
+            <w:tcW w:type="dxa" w:w="1300"/>
+            <w:tcBorders>
+              <w:top w:val="single" w:color="D9D5CB" w:sz="4"/>
+              <w:left w:val="single" w:color="D9D5CB" w:sz="4"/>
+              <w:bottom w:val="single" w:color="D9D5CB" w:sz="4"/>
+              <w:right w:val="single" w:color="D9D5CB" w:sz="4"/>
+            </w:tcBorders>
+            <w:shd w:fill="E6F5EC" w:color="auto" w:val="clear"/>
+            <w:tcMar>
+              <w:top w:type="dxa" w:w="60"/>
+              <w:left w:type="dxa" w:w="90"/>
+              <w:bottom w:type="dxa" w:w="60"/>
+              <w:right w:type="dxa" w:w="90"/>
+            </w:tcMar>
+            <w:vAlign w:val="top"/>
+          </w:tcPr>
+          <w:p>
+            <w:pPr>
+              <w:spacing w:after="40"/>
+            </w:pPr>
+            <w:r>
+              <w:rPr>
+                <w:rFonts w:ascii="Calibri" w:cs="Calibri" w:eastAsia="Calibri" w:hAnsi="Calibri"/>
+                <w:b/>
+                <w:bCs/>
+                <w:color w:val="14213D"/>
+                <w:sz w:val="19"/>
+                <w:szCs w:val="19"/>
+              </w:rPr>
+              <w:t xml:space="preserve">Fait</w:t>
+            </w:r>
+          </w:p>
+        </w:tc>
+        <w:tc>
+          <w:tcPr>
+            <w:tcW w:type="dxa" w:w="3700"/>
+            <w:tcBorders>
+              <w:top w:val="single" w:color="D9D5CB" w:sz="4"/>
+              <w:left w:val="single" w:color="D9D5CB" w:sz="4"/>
+              <w:bottom w:val="single" w:color="D9D5CB" w:sz="4"/>
+              <w:right w:val="single" w:color="D9D5CB" w:sz="4"/>
+            </w:tcBorders>
+            <w:tcMar>
+              <w:top w:type="dxa" w:w="60"/>
+              <w:left w:type="dxa" w:w="90"/>
+              <w:bottom w:type="dxa" w:w="60"/>
+              <w:right w:type="dxa" w:w="90"/>
+            </w:tcMar>
+            <w:vAlign w:val="top"/>
+          </w:tcPr>
+          <w:p>
+            <w:pPr>
+              <w:spacing w:after="40"/>
+            </w:pPr>
+            <w:r>
+              <w:rPr>
+                <w:rFonts w:ascii="Calibri" w:cs="Calibri" w:eastAsia="Calibri" w:hAnsi="Calibri"/>
+                <w:color w:val="14213D"/>
+                <w:sz w:val="20"/>
+                <w:szCs w:val="20"/>
+              </w:rPr>
+              <w:t xml:space="preserve"/>
+            </w:r>
+          </w:p>
+          <w:p>
+            <w:pPr>
+              <w:spacing w:after="40"/>
+            </w:pPr>
+            <w:r>
+              <w:rPr>
+                <w:rFonts w:ascii="Calibri" w:cs="Calibri" w:eastAsia="Calibri" w:hAnsi="Calibri"/>
+                <w:color w:val="14213D"/>
+                <w:sz w:val="20"/>
+                <w:szCs w:val="20"/>
+              </w:rPr>
+              <w:t xml:space="preserve"/>
+            </w:r>
+          </w:p>
+        </w:tc>
+      </w:tr>
+      <w:tr>
+        <w:tc>
+          <w:tcPr>
+            <w:tcW w:type="dxa" w:w="2300"/>
+            <w:tcBorders>
+              <w:top w:val="single" w:color="D9D5CB" w:sz="4"/>
+              <w:left w:val="single" w:color="D9D5CB" w:sz="4"/>
+              <w:bottom w:val="single" w:color="D9D5CB" w:sz="4"/>
+              <w:right w:val="single" w:color="D9D5CB" w:sz="4"/>
+            </w:tcBorders>
+            <w:tcMar>
+              <w:top w:type="dxa" w:w="60"/>
+              <w:left w:type="dxa" w:w="90"/>
+              <w:bottom w:type="dxa" w:w="60"/>
+              <w:right w:type="dxa" w:w="90"/>
+            </w:tcMar>
+            <w:vAlign w:val="top"/>
+          </w:tcPr>
+          <w:p>
+            <w:pPr>
+              <w:spacing w:after="40"/>
+            </w:pPr>
+            <w:r>
+              <w:rPr>
+                <w:rFonts w:ascii="Calibri" w:cs="Calibri" w:eastAsia="Calibri" w:hAnsi="Calibri"/>
+                <w:b/>
+                <w:bCs/>
+                <w:color w:val="14213D"/>
+                <w:sz w:val="20"/>
+                <w:szCs w:val="20"/>
+              </w:rPr>
+              <w:t xml:space="preserve">Devis de référence en face des prix</w:t>
+            </w:r>
+          </w:p>
+        </w:tc>
+        <w:tc>
+          <w:tcPr>
+            <w:tcW w:type="dxa" w:w="4100"/>
+            <w:tcBorders>
+              <w:top w:val="single" w:color="D9D5CB" w:sz="4"/>
+              <w:left w:val="single" w:color="D9D5CB" w:sz="4"/>
+              <w:bottom w:val="single" w:color="D9D5CB" w:sz="4"/>
+              <w:right w:val="single" w:color="D9D5CB" w:sz="4"/>
+            </w:tcBorders>
+            <w:tcMar>
+              <w:top w:type="dxa" w:w="60"/>
+              <w:left w:type="dxa" w:w="90"/>
+              <w:bottom w:type="dxa" w:w="60"/>
+              <w:right w:type="dxa" w:w="90"/>
+            </w:tcMar>
+            <w:vAlign w:val="top"/>
+          </w:tcPr>
+          <w:p>
+            <w:pPr>
+              <w:spacing w:after="40"/>
+            </w:pPr>
+            <w:r>
+              <w:rPr>
+                <w:rFonts w:ascii="Calibri" w:cs="Calibri" w:eastAsia="Calibri" w:hAnsi="Calibri"/>
+                <w:color w:val="14213D"/>
+                <w:sz w:val="19"/>
+                <w:szCs w:val="19"/>
+              </w:rPr>
+              <w:t xml:space="preserve">⚙ Base de prix → 📑 Devis fournisseurs : « 📎 Ajouter un devis » (fichier PDF / Excel / photo, ou lien https ; fournisseur, date). Fournitures et Sous-traitance : colonne « Devis » — « ＋ devis » relie le prix à un devis (et où dedans : page, ligne) ; ensuite 📎 INPAL p. 2 ouvre le devis.</w:t>
+            </w:r>
+          </w:p>
+        </w:tc>
+        <w:tc>
+          <w:tcPr>
+            <w:tcW w:type="dxa" w:w="3700"/>
+            <w:tcBorders>
+              <w:top w:val="single" w:color="D9D5CB" w:sz="4"/>
+              <w:left w:val="single" w:color="D9D5CB" w:sz="4"/>
+              <w:bottom w:val="single" w:color="D9D5CB" w:sz="4"/>
+              <w:right w:val="single" w:color="D9D5CB" w:sz="4"/>
+            </w:tcBorders>
+            <w:tcMar>
+              <w:top w:type="dxa" w:w="60"/>
+              <w:left w:type="dxa" w:w="90"/>
+              <w:bottom w:type="dxa" w:w="60"/>
+              <w:right w:type="dxa" w:w="90"/>
+            </w:tcMar>
+            <w:vAlign w:val="top"/>
+          </w:tcPr>
+          <w:p>
+            <w:pPr>
+              <w:spacing w:after="40"/>
+            </w:pPr>
+            <w:r>
+              <w:rPr>
+                <w:rFonts w:ascii="Calibri" w:cs="Calibri" w:eastAsia="Calibri" w:hAnsi="Calibri"/>
+                <w:color w:val="14213D"/>
+                <w:sz w:val="19"/>
+                <w:szCs w:val="19"/>
+              </w:rPr>
+              <w:t xml:space="preserve">Droit « Base de prix SCR : modifier ». Pas encore dans le détail des paniers d'une zone (dans la base seulement).</w:t>
+            </w:r>
+          </w:p>
+        </w:tc>
+        <w:tc>
+          <w:tcPr>
+            <w:tcW w:type="dxa" w:w="1300"/>
+            <w:tcBorders>
+              <w:top w:val="single" w:color="D9D5CB" w:sz="4"/>
+              <w:left w:val="single" w:color="D9D5CB" w:sz="4"/>
+              <w:bottom w:val="single" w:color="D9D5CB" w:sz="4"/>
+              <w:right w:val="single" w:color="D9D5CB" w:sz="4"/>
+            </w:tcBorders>
+            <w:shd w:fill="E6F5EC" w:color="auto" w:val="clear"/>
+            <w:tcMar>
+              <w:top w:type="dxa" w:w="60"/>
+              <w:left w:type="dxa" w:w="90"/>
+              <w:bottom w:type="dxa" w:w="60"/>
+              <w:right w:type="dxa" w:w="90"/>
+            </w:tcMar>
+            <w:vAlign w:val="top"/>
+          </w:tcPr>
+          <w:p>
+            <w:pPr>
+              <w:spacing w:after="40"/>
+            </w:pPr>
+            <w:r>
+              <w:rPr>
+                <w:rFonts w:ascii="Calibri" w:cs="Calibri" w:eastAsia="Calibri" w:hAnsi="Calibri"/>
+                <w:b/>
+                <w:bCs/>
+                <w:color w:val="14213D"/>
+                <w:sz w:val="19"/>
+                <w:szCs w:val="19"/>
+              </w:rPr>
+              <w:t xml:space="preserve">Fait</w:t>
             </w:r>
           </w:p>
         </w:tc>
@@ -42781,6 +46008,120 @@
           <w:szCs w:val="30"/>
         </w:rPr>
         <w:t xml:space="preserve">Titres de commit (GitHub Desktop)</w:t>
+      </w:r>
+    </w:p>
+    <w:p>
+      <w:pPr>
+        <w:pStyle w:val="ListParagraph"/>
+        <w:numPr>
+          <w:ilvl w:val="0"/>
+          <w:numId w:val="2"/>
+        </w:numPr>
+        <w:spacing w:after="40"/>
+      </w:pPr>
+      <w:r>
+        <w:rPr>
+          <w:rFonts w:ascii="Calibri" w:cs="Calibri" w:eastAsia="Calibri" w:hAnsi="Calibri"/>
+          <w:color w:val="14213D"/>
+          <w:sz w:val="20"/>
+          <w:szCs w:val="20"/>
+        </w:rPr>
+        <w:t xml:space="preserve">(13/10, soir, d'abord) Résumé : Retrait des données internes du dépôt public</w:t>
+      </w:r>
+    </w:p>
+    <w:p>
+      <w:pPr>
+        <w:pStyle w:val="ListParagraph"/>
+        <w:numPr>
+          <w:ilvl w:val="0"/>
+          <w:numId w:val="2"/>
+        </w:numPr>
+        <w:spacing w:after="40"/>
+      </w:pPr>
+      <w:r>
+        <w:rPr>
+          <w:rFonts w:ascii="Calibri" w:cs="Calibri" w:eastAsia="Calibri" w:hAnsi="Calibri"/>
+          <w:color w:val="14213D"/>
+          <w:sz w:val="20"/>
+          <w:szCs w:val="20"/>
+        </w:rPr>
+        <w:t xml:space="preserve">Description : 13/10 — fichiers d'import de données de app/sql rangés hors du dépôt (SCR-PRIVE)</w:t>
+      </w:r>
+    </w:p>
+    <w:p>
+      <w:pPr>
+        <w:pStyle w:val="ListParagraph"/>
+        <w:numPr>
+          <w:ilvl w:val="0"/>
+          <w:numId w:val="2"/>
+        </w:numPr>
+        <w:spacing w:after="40"/>
+      </w:pPr>
+      <w:r>
+        <w:rPr>
+          <w:rFonts w:ascii="Calibri" w:cs="Calibri" w:eastAsia="Calibri" w:hAnsi="Calibri"/>
+          <w:color w:val="14213D"/>
+          <w:sz w:val="20"/>
+          <w:szCs w:val="20"/>
+        </w:rPr>
+        <w:t xml:space="preserve">(13/10, soir) Résumé : Poste de Sofiane : annuaire des invités pour tous, réglages DH communs, refus serveur qu'on peut abandonner</w:t>
+      </w:r>
+    </w:p>
+    <w:p>
+      <w:pPr>
+        <w:pStyle w:val="ListParagraph"/>
+        <w:numPr>
+          <w:ilvl w:val="0"/>
+          <w:numId w:val="2"/>
+        </w:numPr>
+        <w:spacing w:after="40"/>
+      </w:pPr>
+      <w:r>
+        <w:rPr>
+          <w:rFonts w:ascii="Calibri" w:cs="Calibri" w:eastAsia="Calibri" w:hAnsi="Calibri"/>
+          <w:color w:val="14213D"/>
+          <w:sz w:val="20"/>
+          <w:szCs w:val="20"/>
+        </w:rPr>
+        <w:t xml:space="preserve">Description : 13/10 — .gitignore : fichiers de données bloqués ; docs/ : l'appli seule pour GitHub Pages (bascule à faire) ; e2e_sofiane avec un chef fictif ; sql/retours_13-10g.sql (annuaire_invites : nom, prénom, poste des invités pour tout compte actif) + listAccounts ; Bureau recalculé à l'arrivée des comptes et des fiches ; tracé marché / TS : plus d'écriture automatique sans le droit, refus pour droits non réessayés, « Abandonner » par partie et pour le registre ; paramètres DH = réglage SCR commun (app_settings dh_params, administrateur) ; tests e2e_sofiane, e2e_sync § 4c</w:t>
+      </w:r>
+    </w:p>
+    <w:p>
+      <w:pPr>
+        <w:pStyle w:val="ListParagraph"/>
+        <w:numPr>
+          <w:ilvl w:val="0"/>
+          <w:numId w:val="2"/>
+        </w:numPr>
+        <w:spacing w:after="40"/>
+      </w:pPr>
+      <w:r>
+        <w:rPr>
+          <w:rFonts w:ascii="Calibri" w:cs="Calibri" w:eastAsia="Calibri" w:hAnsi="Calibri"/>
+          <w:color w:val="14213D"/>
+          <w:sz w:val="20"/>
+          <w:szCs w:val="20"/>
+        </w:rPr>
+        <w:t xml:space="preserve">(13/10, fin de journée) Résumé : Atelier DPGF (coûts ↔ lignes du client, ÷ quantité d'une autre ligne, 2e écran) + devis de référence en face des prix</w:t>
+      </w:r>
+    </w:p>
+    <w:p>
+      <w:pPr>
+        <w:pStyle w:val="ListParagraph"/>
+        <w:numPr>
+          <w:ilvl w:val="0"/>
+          <w:numId w:val="2"/>
+        </w:numPr>
+        <w:spacing w:after="40"/>
+      </w:pPr>
+      <w:r>
+        <w:rPr>
+          <w:rFonts w:ascii="Calibri" w:cs="Calibri" w:eastAsia="Calibri" w:hAnsi="Calibri"/>
+          <w:color w:val="14213D"/>
+          <w:sz w:val="20"/>
+          <w:szCs w:val="20"/>
+        </w:rPr>
+        <w:t xml:space="preserve">Description : 13/10 — src/dpgfwb.js : nos coûts à gauche, la feuille du client à droite, « Placer » (part, divisée par la quantité de cette ligne ou d'une autre : map[i].srcs[].per), plein écran, autre écran, appliquer / export inchangés ; base de prix : carte « Comment ça marche », bibliothèque de devis fournisseurs (fichier ou lien https), colonne Devis dans Fournitures / Sous-traitance, gardés au réimport ; test e2e_dpgfwb</w:t>
       </w:r>
     </w:p>
     <w:p>

</xml_diff>